<commit_message>
Update dokumentasi file word
</commit_message>
<xml_diff>
--- a/dokumentasi/24382001P_Lorensius Firngadi_IF 23 E_Dokumentasi.docx
+++ b/dokumentasi/24382001P_Lorensius Firngadi_IF 23 E_Dokumentasi.docx
@@ -13,7 +13,6 @@
           <w:lang w:val="en-GB"/>
         </w:rPr>
       </w:pPr>
-      <w:proofErr w:type="spellStart"/>
       <w:r>
         <w:rPr>
           <w:rFonts w:ascii="Times New Roman" w:hAnsi="Times New Roman" w:cs="Times New Roman"/>
@@ -21,69 +20,28 @@
           <w:bCs/>
           <w:lang w:val="en-GB"/>
         </w:rPr>
-        <w:t>Dokumentasi</w:t>
-      </w:r>
-      <w:proofErr w:type="spellEnd"/>
-      <w:r>
+        <w:t>Dokumentasi Project Akhir</w:t>
+      </w:r>
+    </w:p>
+    <w:p>
+      <w:pPr>
+        <w:contextualSpacing/>
+        <w:jc w:val="center"/>
         <w:rPr>
           <w:rFonts w:ascii="Times New Roman" w:hAnsi="Times New Roman" w:cs="Times New Roman"/>
           <w:b/>
           <w:bCs/>
           <w:lang w:val="en-GB"/>
         </w:rPr>
-        <w:t xml:space="preserve"> Project Akhir</w:t>
-      </w:r>
-    </w:p>
-    <w:p>
-      <w:pPr>
-        <w:contextualSpacing/>
-        <w:jc w:val="center"/>
+      </w:pPr>
+      <w:r>
         <w:rPr>
           <w:rFonts w:ascii="Times New Roman" w:hAnsi="Times New Roman" w:cs="Times New Roman"/>
           <w:b/>
           <w:bCs/>
           <w:lang w:val="en-GB"/>
         </w:rPr>
-      </w:pPr>
-      <w:proofErr w:type="spellStart"/>
-      <w:r>
-        <w:rPr>
-          <w:rFonts w:ascii="Times New Roman" w:hAnsi="Times New Roman" w:cs="Times New Roman"/>
-          <w:b/>
-          <w:bCs/>
-          <w:lang w:val="en-GB"/>
-        </w:rPr>
-        <w:t>Pemrograman</w:t>
-      </w:r>
-      <w:proofErr w:type="spellEnd"/>
-      <w:r>
-        <w:rPr>
-          <w:rFonts w:ascii="Times New Roman" w:hAnsi="Times New Roman" w:cs="Times New Roman"/>
-          <w:b/>
-          <w:bCs/>
-          <w:lang w:val="en-GB"/>
-        </w:rPr>
-        <w:t xml:space="preserve"> </w:t>
-      </w:r>
-      <w:proofErr w:type="spellStart"/>
-      <w:r>
-        <w:rPr>
-          <w:rFonts w:ascii="Times New Roman" w:hAnsi="Times New Roman" w:cs="Times New Roman"/>
-          <w:b/>
-          <w:bCs/>
-          <w:lang w:val="en-GB"/>
-        </w:rPr>
-        <w:t>Berorientasi</w:t>
-      </w:r>
-      <w:proofErr w:type="spellEnd"/>
-      <w:r>
-        <w:rPr>
-          <w:rFonts w:ascii="Times New Roman" w:hAnsi="Times New Roman" w:cs="Times New Roman"/>
-          <w:b/>
-          <w:bCs/>
-          <w:lang w:val="en-GB"/>
-        </w:rPr>
-        <w:t xml:space="preserve"> Service</w:t>
+        <w:t>Pemrograman Berorientasi Service</w:t>
       </w:r>
     </w:p>
     <w:p>
@@ -116,23 +74,7 @@
           <w:lang w:val="en-GB"/>
         </w:rPr>
         <w:tab/>
-        <w:t xml:space="preserve">: </w:t>
-      </w:r>
-      <w:proofErr w:type="spellStart"/>
-      <w:r>
-        <w:rPr>
-          <w:rFonts w:ascii="Times New Roman" w:hAnsi="Times New Roman" w:cs="Times New Roman"/>
-          <w:lang w:val="en-GB"/>
-        </w:rPr>
-        <w:t>Lorensius</w:t>
-      </w:r>
-      <w:proofErr w:type="spellEnd"/>
-      <w:r>
-        <w:rPr>
-          <w:rFonts w:ascii="Times New Roman" w:hAnsi="Times New Roman" w:cs="Times New Roman"/>
-          <w:lang w:val="en-GB"/>
-        </w:rPr>
-        <w:t xml:space="preserve"> Firngadi</w:t>
+        <w:t>: Lorensius Firngadi</w:t>
       </w:r>
     </w:p>
     <w:p>
@@ -167,7 +109,6 @@
           <w:lang w:val="en-GB"/>
         </w:rPr>
       </w:pPr>
-      <w:proofErr w:type="spellStart"/>
       <w:r>
         <w:rPr>
           <w:rFonts w:ascii="Times New Roman" w:hAnsi="Times New Roman" w:cs="Times New Roman"/>
@@ -175,7 +116,6 @@
         </w:rPr>
         <w:t>Kelas</w:t>
       </w:r>
-      <w:proofErr w:type="spellEnd"/>
       <w:r>
         <w:rPr>
           <w:rFonts w:ascii="Times New Roman" w:hAnsi="Times New Roman" w:cs="Times New Roman"/>
@@ -198,17 +138,8 @@
           <w:rFonts w:ascii="Times New Roman" w:hAnsi="Times New Roman" w:cs="Times New Roman"/>
           <w:lang w:val="en-GB"/>
         </w:rPr>
-        <w:t xml:space="preserve">Dosen </w:t>
-      </w:r>
-      <w:proofErr w:type="spellStart"/>
-      <w:r>
-        <w:rPr>
-          <w:rFonts w:ascii="Times New Roman" w:hAnsi="Times New Roman" w:cs="Times New Roman"/>
-          <w:lang w:val="en-GB"/>
-        </w:rPr>
-        <w:t>Pengampu</w:t>
-      </w:r>
-      <w:proofErr w:type="spellEnd"/>
+        <w:t>Dosen Pengampu</w:t>
+      </w:r>
       <w:r>
         <w:rPr>
           <w:rFonts w:ascii="Times New Roman" w:hAnsi="Times New Roman" w:cs="Times New Roman"/>
@@ -229,114 +160,32 @@
           <w:rFonts w:ascii="Times New Roman" w:hAnsi="Times New Roman" w:cs="Times New Roman"/>
           <w:lang w:val="en-GB"/>
         </w:rPr>
-        <w:t xml:space="preserve">A. </w:t>
-      </w:r>
-      <w:proofErr w:type="spellStart"/>
-      <w:r>
-        <w:rPr>
-          <w:rFonts w:ascii="Times New Roman" w:hAnsi="Times New Roman" w:cs="Times New Roman"/>
-          <w:lang w:val="en-GB"/>
-        </w:rPr>
-        <w:t>Ferico</w:t>
-      </w:r>
-      <w:proofErr w:type="spellEnd"/>
-      <w:r>
-        <w:rPr>
-          <w:rFonts w:ascii="Times New Roman" w:hAnsi="Times New Roman" w:cs="Times New Roman"/>
-          <w:lang w:val="en-GB"/>
-        </w:rPr>
-        <w:t xml:space="preserve"> Octaviansyah</w:t>
-      </w:r>
-      <w:proofErr w:type="gramStart"/>
-      <w:r>
-        <w:rPr>
-          <w:rFonts w:ascii="Times New Roman" w:hAnsi="Times New Roman" w:cs="Times New Roman"/>
-          <w:lang w:val="en-GB"/>
-        </w:rPr>
-        <w:t>, ,</w:t>
-      </w:r>
-      <w:proofErr w:type="gramEnd"/>
-      <w:r>
-        <w:rPr>
-          <w:rFonts w:ascii="Times New Roman" w:hAnsi="Times New Roman" w:cs="Times New Roman"/>
-          <w:lang w:val="en-GB"/>
-        </w:rPr>
-        <w:t xml:space="preserve"> </w:t>
-      </w:r>
-      <w:proofErr w:type="spellStart"/>
-      <w:proofErr w:type="gramStart"/>
-      <w:r>
-        <w:rPr>
-          <w:rFonts w:ascii="Times New Roman" w:hAnsi="Times New Roman" w:cs="Times New Roman"/>
-          <w:lang w:val="en-GB"/>
-        </w:rPr>
-        <w:t>S.Kom</w:t>
-      </w:r>
-      <w:proofErr w:type="spellEnd"/>
-      <w:proofErr w:type="gramEnd"/>
-      <w:r>
-        <w:rPr>
-          <w:rFonts w:ascii="Times New Roman" w:hAnsi="Times New Roman" w:cs="Times New Roman"/>
-          <w:lang w:val="en-GB"/>
-        </w:rPr>
-        <w:t xml:space="preserve">., </w:t>
-      </w:r>
-      <w:proofErr w:type="spellStart"/>
-      <w:r>
-        <w:rPr>
-          <w:rFonts w:ascii="Times New Roman" w:hAnsi="Times New Roman" w:cs="Times New Roman"/>
-          <w:lang w:val="en-GB"/>
-        </w:rPr>
-        <w:t>M.Kom</w:t>
-      </w:r>
-      <w:proofErr w:type="spellEnd"/>
-      <w:r>
-        <w:rPr>
-          <w:rFonts w:ascii="Times New Roman" w:hAnsi="Times New Roman" w:cs="Times New Roman"/>
-          <w:lang w:val="en-GB"/>
-        </w:rPr>
-        <w:t>.</w:t>
-      </w:r>
-    </w:p>
-    <w:p>
-      <w:pPr>
-        <w:contextualSpacing/>
-        <w:rPr>
-          <w:rFonts w:ascii="Times New Roman" w:hAnsi="Times New Roman" w:cs="Times New Roman"/>
-          <w:lang w:val="en-GB"/>
-        </w:rPr>
-      </w:pPr>
-    </w:p>
-    <w:p>
-      <w:pPr>
-        <w:contextualSpacing/>
-        <w:rPr>
-          <w:rFonts w:ascii="Times New Roman" w:hAnsi="Times New Roman" w:cs="Times New Roman"/>
-          <w:lang w:val="en-GB"/>
-        </w:rPr>
-      </w:pPr>
-      <w:r>
-        <w:rPr>
-          <w:rFonts w:ascii="Times New Roman" w:hAnsi="Times New Roman" w:cs="Times New Roman"/>
-          <w:lang w:val="en-GB"/>
-        </w:rPr>
-        <w:t xml:space="preserve">1. </w:t>
-      </w:r>
-      <w:proofErr w:type="spellStart"/>
-      <w:r>
-        <w:rPr>
-          <w:rFonts w:ascii="Times New Roman" w:hAnsi="Times New Roman" w:cs="Times New Roman"/>
-          <w:lang w:val="en-GB"/>
-        </w:rPr>
-        <w:t>Membuat</w:t>
-      </w:r>
-      <w:proofErr w:type="spellEnd"/>
-      <w:r>
-        <w:rPr>
-          <w:rFonts w:ascii="Times New Roman" w:hAnsi="Times New Roman" w:cs="Times New Roman"/>
-          <w:lang w:val="en-GB"/>
-        </w:rPr>
-        <w:t xml:space="preserve"> R</w:t>
+        <w:t>A. Ferico Octaviansyah, , S.Kom., M.Kom.</w:t>
+      </w:r>
+    </w:p>
+    <w:p>
+      <w:pPr>
+        <w:contextualSpacing/>
+        <w:rPr>
+          <w:rFonts w:ascii="Times New Roman" w:hAnsi="Times New Roman" w:cs="Times New Roman"/>
+          <w:lang w:val="en-GB"/>
+        </w:rPr>
+      </w:pPr>
+    </w:p>
+    <w:p>
+      <w:pPr>
+        <w:contextualSpacing/>
+        <w:rPr>
+          <w:rFonts w:ascii="Times New Roman" w:hAnsi="Times New Roman" w:cs="Times New Roman"/>
+          <w:lang w:val="en-GB"/>
+        </w:rPr>
+      </w:pPr>
+      <w:r>
+        <w:rPr>
+          <w:rFonts w:ascii="Times New Roman" w:hAnsi="Times New Roman" w:cs="Times New Roman"/>
+          <w:lang w:val="en-GB"/>
+        </w:rPr>
+        <w:t>1. Membuat R</w:t>
       </w:r>
       <w:r>
         <w:rPr>
@@ -357,17 +206,8 @@
           <w:rFonts w:ascii="Times New Roman" w:hAnsi="Times New Roman" w:cs="Times New Roman"/>
           <w:lang w:val="en-GB"/>
         </w:rPr>
-        <w:t xml:space="preserve">di Web </w:t>
-      </w:r>
-      <w:proofErr w:type="spellStart"/>
-      <w:r>
-        <w:rPr>
-          <w:rFonts w:ascii="Times New Roman" w:hAnsi="Times New Roman" w:cs="Times New Roman"/>
-          <w:lang w:val="en-GB"/>
-        </w:rPr>
-        <w:t>github</w:t>
-      </w:r>
-      <w:proofErr w:type="spellEnd"/>
+        <w:t>di Web github</w:t>
+      </w:r>
     </w:p>
     <w:p>
       <w:pPr>
@@ -445,236 +285,33 @@
           <w:lang w:val="en-GB"/>
         </w:rPr>
       </w:pPr>
-      <w:proofErr w:type="spellStart"/>
-      <w:r>
-        <w:rPr>
-          <w:rFonts w:ascii="Times New Roman" w:hAnsi="Times New Roman" w:cs="Times New Roman"/>
-          <w:lang w:val="en-GB"/>
-        </w:rPr>
-        <w:t>Untuk</w:t>
-      </w:r>
-      <w:proofErr w:type="spellEnd"/>
-      <w:r>
-        <w:rPr>
-          <w:rFonts w:ascii="Times New Roman" w:hAnsi="Times New Roman" w:cs="Times New Roman"/>
-          <w:lang w:val="en-GB"/>
-        </w:rPr>
-        <w:t xml:space="preserve"> project </w:t>
-      </w:r>
-      <w:proofErr w:type="spellStart"/>
-      <w:r>
-        <w:rPr>
-          <w:rFonts w:ascii="Times New Roman" w:hAnsi="Times New Roman" w:cs="Times New Roman"/>
-          <w:lang w:val="en-GB"/>
-        </w:rPr>
-        <w:t>akhir</w:t>
-      </w:r>
-      <w:proofErr w:type="spellEnd"/>
-      <w:r>
-        <w:rPr>
-          <w:rFonts w:ascii="Times New Roman" w:hAnsi="Times New Roman" w:cs="Times New Roman"/>
-          <w:lang w:val="en-GB"/>
-        </w:rPr>
-        <w:t xml:space="preserve"> </w:t>
-      </w:r>
-      <w:proofErr w:type="spellStart"/>
-      <w:r>
-        <w:rPr>
-          <w:rFonts w:ascii="Times New Roman" w:hAnsi="Times New Roman" w:cs="Times New Roman"/>
-          <w:lang w:val="en-GB"/>
-        </w:rPr>
-        <w:t>mata</w:t>
-      </w:r>
-      <w:proofErr w:type="spellEnd"/>
-      <w:r>
-        <w:rPr>
-          <w:rFonts w:ascii="Times New Roman" w:hAnsi="Times New Roman" w:cs="Times New Roman"/>
-          <w:lang w:val="en-GB"/>
-        </w:rPr>
-        <w:t xml:space="preserve"> </w:t>
-      </w:r>
-      <w:proofErr w:type="spellStart"/>
-      <w:r>
-        <w:rPr>
-          <w:rFonts w:ascii="Times New Roman" w:hAnsi="Times New Roman" w:cs="Times New Roman"/>
-          <w:lang w:val="en-GB"/>
-        </w:rPr>
-        <w:t>kuliah</w:t>
-      </w:r>
-      <w:proofErr w:type="spellEnd"/>
-      <w:r>
-        <w:rPr>
-          <w:rFonts w:ascii="Times New Roman" w:hAnsi="Times New Roman" w:cs="Times New Roman"/>
-          <w:lang w:val="en-GB"/>
-        </w:rPr>
-        <w:t xml:space="preserve"> </w:t>
-      </w:r>
-      <w:proofErr w:type="spellStart"/>
-      <w:r>
-        <w:rPr>
-          <w:rFonts w:ascii="Times New Roman" w:hAnsi="Times New Roman" w:cs="Times New Roman"/>
-          <w:lang w:val="en-GB"/>
-        </w:rPr>
-        <w:t>Pemrograman</w:t>
-      </w:r>
-      <w:proofErr w:type="spellEnd"/>
-      <w:r>
-        <w:rPr>
-          <w:rFonts w:ascii="Times New Roman" w:hAnsi="Times New Roman" w:cs="Times New Roman"/>
-          <w:lang w:val="en-GB"/>
-        </w:rPr>
-        <w:t xml:space="preserve"> </w:t>
-      </w:r>
-      <w:proofErr w:type="spellStart"/>
-      <w:r>
-        <w:rPr>
-          <w:rFonts w:ascii="Times New Roman" w:hAnsi="Times New Roman" w:cs="Times New Roman"/>
-          <w:lang w:val="en-GB"/>
-        </w:rPr>
-        <w:t>Berorientasi</w:t>
-      </w:r>
-      <w:proofErr w:type="spellEnd"/>
-      <w:r>
-        <w:rPr>
-          <w:rFonts w:ascii="Times New Roman" w:hAnsi="Times New Roman" w:cs="Times New Roman"/>
-          <w:lang w:val="en-GB"/>
-        </w:rPr>
-        <w:t xml:space="preserve"> Service</w:t>
-      </w:r>
-      <w:r>
-        <w:rPr>
-          <w:rFonts w:ascii="Times New Roman" w:hAnsi="Times New Roman" w:cs="Times New Roman"/>
-          <w:lang w:val="en-GB"/>
-        </w:rPr>
-        <w:t xml:space="preserve"> </w:t>
-      </w:r>
-      <w:proofErr w:type="spellStart"/>
-      <w:r>
-        <w:rPr>
-          <w:rFonts w:ascii="Times New Roman" w:hAnsi="Times New Roman" w:cs="Times New Roman"/>
-          <w:lang w:val="en-GB"/>
-        </w:rPr>
-        <w:t>ini</w:t>
-      </w:r>
-      <w:proofErr w:type="spellEnd"/>
-      <w:r>
-        <w:rPr>
-          <w:rFonts w:ascii="Times New Roman" w:hAnsi="Times New Roman" w:cs="Times New Roman"/>
-          <w:lang w:val="en-GB"/>
-        </w:rPr>
-        <w:t xml:space="preserve"> </w:t>
-      </w:r>
-      <w:proofErr w:type="spellStart"/>
-      <w:r>
-        <w:rPr>
-          <w:rFonts w:ascii="Times New Roman" w:hAnsi="Times New Roman" w:cs="Times New Roman"/>
-          <w:lang w:val="en-GB"/>
-        </w:rPr>
-        <w:t>memilih</w:t>
-      </w:r>
-      <w:proofErr w:type="spellEnd"/>
-      <w:r>
-        <w:rPr>
-          <w:rFonts w:ascii="Times New Roman" w:hAnsi="Times New Roman" w:cs="Times New Roman"/>
-          <w:lang w:val="en-GB"/>
-        </w:rPr>
-        <w:t xml:space="preserve"> Tema Wisata. </w:t>
-      </w:r>
-      <w:proofErr w:type="spellStart"/>
-      <w:r>
-        <w:rPr>
-          <w:rFonts w:ascii="Times New Roman" w:hAnsi="Times New Roman" w:cs="Times New Roman"/>
-          <w:lang w:val="en-GB"/>
-        </w:rPr>
-        <w:t>Dengan</w:t>
-      </w:r>
-      <w:proofErr w:type="spellEnd"/>
-      <w:r>
-        <w:rPr>
-          <w:rFonts w:ascii="Times New Roman" w:hAnsi="Times New Roman" w:cs="Times New Roman"/>
-          <w:lang w:val="en-GB"/>
-        </w:rPr>
-        <w:t xml:space="preserve"> </w:t>
-      </w:r>
-      <w:proofErr w:type="spellStart"/>
-      <w:r>
-        <w:rPr>
-          <w:rFonts w:ascii="Times New Roman" w:hAnsi="Times New Roman" w:cs="Times New Roman"/>
-          <w:lang w:val="en-GB"/>
-        </w:rPr>
-        <w:t>membatasi</w:t>
-      </w:r>
-      <w:proofErr w:type="spellEnd"/>
-      <w:r>
-        <w:rPr>
-          <w:rFonts w:ascii="Times New Roman" w:hAnsi="Times New Roman" w:cs="Times New Roman"/>
-          <w:lang w:val="en-GB"/>
-        </w:rPr>
-        <w:t xml:space="preserve"> focus pada </w:t>
-      </w:r>
-      <w:proofErr w:type="spellStart"/>
-      <w:r>
-        <w:rPr>
-          <w:rFonts w:ascii="Times New Roman" w:hAnsi="Times New Roman" w:cs="Times New Roman"/>
-          <w:lang w:val="en-GB"/>
-        </w:rPr>
-        <w:t>tempat</w:t>
-      </w:r>
-      <w:proofErr w:type="spellEnd"/>
-      <w:r>
-        <w:rPr>
-          <w:rFonts w:ascii="Times New Roman" w:hAnsi="Times New Roman" w:cs="Times New Roman"/>
-          <w:lang w:val="en-GB"/>
-        </w:rPr>
-        <w:t xml:space="preserve"> </w:t>
-      </w:r>
-      <w:proofErr w:type="spellStart"/>
-      <w:r>
-        <w:rPr>
-          <w:rFonts w:ascii="Times New Roman" w:hAnsi="Times New Roman" w:cs="Times New Roman"/>
-          <w:lang w:val="en-GB"/>
-        </w:rPr>
-        <w:t>provinsi</w:t>
-      </w:r>
-      <w:proofErr w:type="spellEnd"/>
-      <w:r>
-        <w:rPr>
-          <w:rFonts w:ascii="Times New Roman" w:hAnsi="Times New Roman" w:cs="Times New Roman"/>
-          <w:lang w:val="en-GB"/>
-        </w:rPr>
-        <w:t xml:space="preserve"> </w:t>
-      </w:r>
-      <w:proofErr w:type="spellStart"/>
-      <w:r>
-        <w:rPr>
-          <w:rFonts w:ascii="Times New Roman" w:hAnsi="Times New Roman" w:cs="Times New Roman"/>
-          <w:lang w:val="en-GB"/>
-        </w:rPr>
-        <w:t>asal</w:t>
-      </w:r>
-      <w:proofErr w:type="spellEnd"/>
-      <w:r>
-        <w:rPr>
-          <w:rFonts w:ascii="Times New Roman" w:hAnsi="Times New Roman" w:cs="Times New Roman"/>
-          <w:lang w:val="en-GB"/>
-        </w:rPr>
-        <w:t xml:space="preserve"> </w:t>
-      </w:r>
-      <w:proofErr w:type="spellStart"/>
-      <w:r>
-        <w:rPr>
-          <w:rFonts w:ascii="Times New Roman" w:hAnsi="Times New Roman" w:cs="Times New Roman"/>
-          <w:lang w:val="en-GB"/>
-        </w:rPr>
-        <w:t>saya</w:t>
-      </w:r>
-      <w:proofErr w:type="spellEnd"/>
-      <w:r>
-        <w:rPr>
-          <w:rFonts w:ascii="Times New Roman" w:hAnsi="Times New Roman" w:cs="Times New Roman"/>
-          <w:lang w:val="en-GB"/>
-        </w:rPr>
-        <w:t>.</w:t>
+      <w:r>
+        <w:rPr>
+          <w:rFonts w:ascii="Times New Roman" w:hAnsi="Times New Roman" w:cs="Times New Roman"/>
+          <w:lang w:val="en-GB"/>
+        </w:rPr>
+        <w:t xml:space="preserve">Untuk project akhir mata kuliah </w:t>
+      </w:r>
+      <w:r>
+        <w:rPr>
+          <w:rFonts w:ascii="Times New Roman" w:hAnsi="Times New Roman" w:cs="Times New Roman"/>
+          <w:lang w:val="en-GB"/>
+        </w:rPr>
+        <w:t>Pemrograman Berorientasi Service</w:t>
+      </w:r>
+      <w:r>
+        <w:rPr>
+          <w:rFonts w:ascii="Times New Roman" w:hAnsi="Times New Roman" w:cs="Times New Roman"/>
+          <w:lang w:val="en-GB"/>
+        </w:rPr>
+        <w:t xml:space="preserve"> ini </w:t>
+      </w:r>
+      <w:r>
+        <w:rPr>
+          <w:rFonts w:ascii="Times New Roman" w:hAnsi="Times New Roman" w:cs="Times New Roman"/>
+          <w:lang w:val="en-GB"/>
+        </w:rPr>
+        <w:t>memilih Tema Wisata. Dengan membatasi focus pada tempat provinsi asal saya.</w:t>
       </w:r>
     </w:p>
     <w:p>
@@ -695,33 +332,8 @@
           <w:rFonts w:ascii="Times New Roman" w:hAnsi="Times New Roman" w:cs="Times New Roman"/>
           <w:lang w:val="en-GB"/>
         </w:rPr>
-        <w:t xml:space="preserve">Nama </w:t>
-      </w:r>
-      <w:proofErr w:type="gramStart"/>
-      <w:r>
-        <w:rPr>
-          <w:rFonts w:ascii="Times New Roman" w:hAnsi="Times New Roman" w:cs="Times New Roman"/>
-          <w:lang w:val="en-GB"/>
-        </w:rPr>
-        <w:t>Project :</w:t>
-      </w:r>
-      <w:proofErr w:type="gramEnd"/>
-      <w:r>
-        <w:rPr>
-          <w:rFonts w:ascii="Times New Roman" w:hAnsi="Times New Roman" w:cs="Times New Roman"/>
-          <w:lang w:val="en-GB"/>
-        </w:rPr>
-        <w:t xml:space="preserve"> </w:t>
-      </w:r>
-      <w:proofErr w:type="spellStart"/>
-      <w:r>
-        <w:rPr>
-          <w:rFonts w:ascii="Times New Roman" w:hAnsi="Times New Roman" w:cs="Times New Roman"/>
-          <w:lang w:val="en-GB"/>
-        </w:rPr>
-        <w:t>SigerSync</w:t>
-      </w:r>
-      <w:proofErr w:type="spellEnd"/>
+        <w:t>Nama Project : SigerSync</w:t>
+      </w:r>
     </w:p>
     <w:p>
       <w:pPr>
@@ -736,47 +348,13 @@
           <w:lang w:val="en-GB"/>
         </w:rPr>
       </w:pPr>
-      <w:proofErr w:type="spellStart"/>
-      <w:r>
-        <w:rPr>
-          <w:rFonts w:ascii="Times New Roman" w:hAnsi="Times New Roman" w:cs="Times New Roman"/>
-          <w:lang w:val="en-GB"/>
-        </w:rPr>
-        <w:t>Deskripsi</w:t>
-      </w:r>
-      <w:proofErr w:type="spellEnd"/>
-      <w:r>
-        <w:rPr>
-          <w:rFonts w:ascii="Times New Roman" w:hAnsi="Times New Roman" w:cs="Times New Roman"/>
-          <w:lang w:val="en-GB"/>
-        </w:rPr>
-        <w:t xml:space="preserve"> </w:t>
-      </w:r>
-      <w:proofErr w:type="spellStart"/>
-      <w:r>
-        <w:rPr>
-          <w:rFonts w:ascii="Times New Roman" w:hAnsi="Times New Roman" w:cs="Times New Roman"/>
-          <w:lang w:val="en-GB"/>
-        </w:rPr>
-        <w:t>Singkat</w:t>
-      </w:r>
-      <w:proofErr w:type="spellEnd"/>
-      <w:r>
-        <w:rPr>
-          <w:rFonts w:ascii="Times New Roman" w:hAnsi="Times New Roman" w:cs="Times New Roman"/>
-          <w:lang w:val="en-GB"/>
-        </w:rPr>
-        <w:t xml:space="preserve"> </w:t>
-      </w:r>
-      <w:proofErr w:type="gramStart"/>
-      <w:r>
-        <w:rPr>
-          <w:rFonts w:ascii="Times New Roman" w:hAnsi="Times New Roman" w:cs="Times New Roman"/>
-          <w:lang w:val="en-GB"/>
-        </w:rPr>
-        <w:t>Project :</w:t>
-      </w:r>
-      <w:proofErr w:type="gramEnd"/>
+      <w:r>
+        <w:rPr>
+          <w:rFonts w:ascii="Times New Roman" w:hAnsi="Times New Roman" w:cs="Times New Roman"/>
+          <w:lang w:val="en-GB"/>
+        </w:rPr>
+        <w:t>Deskripsi Singkat Project :</w:t>
+      </w:r>
     </w:p>
     <w:p>
       <w:pPr>
@@ -787,293 +365,12 @@
           <w:lang w:val="en-GB"/>
         </w:rPr>
       </w:pPr>
-      <w:proofErr w:type="spellStart"/>
-      <w:r>
-        <w:rPr>
-          <w:rFonts w:ascii="Times New Roman" w:hAnsi="Times New Roman" w:cs="Times New Roman"/>
-          <w:lang w:val="en-GB"/>
-        </w:rPr>
-        <w:t>SigerSync</w:t>
-      </w:r>
-      <w:proofErr w:type="spellEnd"/>
-      <w:r>
-        <w:rPr>
-          <w:rFonts w:ascii="Times New Roman" w:hAnsi="Times New Roman" w:cs="Times New Roman"/>
-          <w:lang w:val="en-GB"/>
-        </w:rPr>
-        <w:t xml:space="preserve"> </w:t>
-      </w:r>
-      <w:proofErr w:type="spellStart"/>
-      <w:r>
-        <w:rPr>
-          <w:rFonts w:ascii="Times New Roman" w:hAnsi="Times New Roman" w:cs="Times New Roman"/>
-          <w:lang w:val="en-GB"/>
-        </w:rPr>
-        <w:t>adalah</w:t>
-      </w:r>
-      <w:proofErr w:type="spellEnd"/>
-      <w:r>
-        <w:rPr>
-          <w:rFonts w:ascii="Times New Roman" w:hAnsi="Times New Roman" w:cs="Times New Roman"/>
-          <w:lang w:val="en-GB"/>
-        </w:rPr>
-        <w:t xml:space="preserve"> </w:t>
-      </w:r>
-      <w:proofErr w:type="spellStart"/>
-      <w:r>
-        <w:rPr>
-          <w:rFonts w:ascii="Times New Roman" w:hAnsi="Times New Roman" w:cs="Times New Roman"/>
-          <w:lang w:val="en-GB"/>
-        </w:rPr>
-        <w:t>aplikasi</w:t>
-      </w:r>
-      <w:proofErr w:type="spellEnd"/>
-      <w:r>
-        <w:rPr>
-          <w:rFonts w:ascii="Times New Roman" w:hAnsi="Times New Roman" w:cs="Times New Roman"/>
-          <w:lang w:val="en-GB"/>
-        </w:rPr>
-        <w:t xml:space="preserve"> </w:t>
-      </w:r>
-      <w:proofErr w:type="spellStart"/>
-      <w:r>
-        <w:rPr>
-          <w:rFonts w:ascii="Times New Roman" w:hAnsi="Times New Roman" w:cs="Times New Roman"/>
-          <w:lang w:val="en-GB"/>
-        </w:rPr>
-        <w:t>berbasis</w:t>
-      </w:r>
-      <w:proofErr w:type="spellEnd"/>
-      <w:r>
-        <w:rPr>
-          <w:rFonts w:ascii="Times New Roman" w:hAnsi="Times New Roman" w:cs="Times New Roman"/>
-          <w:lang w:val="en-GB"/>
-        </w:rPr>
-        <w:t xml:space="preserve"> Service Oriented Architecture (SOA) yang </w:t>
-      </w:r>
-      <w:proofErr w:type="spellStart"/>
-      <w:r>
-        <w:rPr>
-          <w:rFonts w:ascii="Times New Roman" w:hAnsi="Times New Roman" w:cs="Times New Roman"/>
-          <w:lang w:val="en-GB"/>
-        </w:rPr>
-        <w:t>menyajikan</w:t>
-      </w:r>
-      <w:proofErr w:type="spellEnd"/>
-      <w:r>
-        <w:rPr>
-          <w:rFonts w:ascii="Times New Roman" w:hAnsi="Times New Roman" w:cs="Times New Roman"/>
-          <w:lang w:val="en-GB"/>
-        </w:rPr>
-        <w:t xml:space="preserve"> </w:t>
-      </w:r>
-      <w:proofErr w:type="spellStart"/>
-      <w:r>
-        <w:rPr>
-          <w:rFonts w:ascii="Times New Roman" w:hAnsi="Times New Roman" w:cs="Times New Roman"/>
-          <w:lang w:val="en-GB"/>
-        </w:rPr>
-        <w:t>informasi</w:t>
-      </w:r>
-      <w:proofErr w:type="spellEnd"/>
-      <w:r>
-        <w:rPr>
-          <w:rFonts w:ascii="Times New Roman" w:hAnsi="Times New Roman" w:cs="Times New Roman"/>
-          <w:lang w:val="en-GB"/>
-        </w:rPr>
-        <w:t xml:space="preserve"> </w:t>
-      </w:r>
-      <w:proofErr w:type="spellStart"/>
-      <w:r>
-        <w:rPr>
-          <w:rFonts w:ascii="Times New Roman" w:hAnsi="Times New Roman" w:cs="Times New Roman"/>
-          <w:lang w:val="en-GB"/>
-        </w:rPr>
-        <w:t>mengenai</w:t>
-      </w:r>
-      <w:proofErr w:type="spellEnd"/>
-      <w:r>
-        <w:rPr>
-          <w:rFonts w:ascii="Times New Roman" w:hAnsi="Times New Roman" w:cs="Times New Roman"/>
-          <w:lang w:val="en-GB"/>
-        </w:rPr>
-        <w:t xml:space="preserve"> </w:t>
-      </w:r>
-      <w:proofErr w:type="spellStart"/>
-      <w:r>
-        <w:rPr>
-          <w:rFonts w:ascii="Times New Roman" w:hAnsi="Times New Roman" w:cs="Times New Roman"/>
-          <w:lang w:val="en-GB"/>
-        </w:rPr>
-        <w:t>destinasi</w:t>
-      </w:r>
-      <w:proofErr w:type="spellEnd"/>
-      <w:r>
-        <w:rPr>
-          <w:rFonts w:ascii="Times New Roman" w:hAnsi="Times New Roman" w:cs="Times New Roman"/>
-          <w:lang w:val="en-GB"/>
-        </w:rPr>
-        <w:t xml:space="preserve"> </w:t>
-      </w:r>
-      <w:proofErr w:type="spellStart"/>
-      <w:r>
-        <w:rPr>
-          <w:rFonts w:ascii="Times New Roman" w:hAnsi="Times New Roman" w:cs="Times New Roman"/>
-          <w:lang w:val="en-GB"/>
-        </w:rPr>
-        <w:t>wisata</w:t>
-      </w:r>
-      <w:proofErr w:type="spellEnd"/>
-      <w:r>
-        <w:rPr>
-          <w:rFonts w:ascii="Times New Roman" w:hAnsi="Times New Roman" w:cs="Times New Roman"/>
-          <w:lang w:val="en-GB"/>
-        </w:rPr>
-        <w:t xml:space="preserve"> di </w:t>
-      </w:r>
-      <w:proofErr w:type="spellStart"/>
-      <w:r>
-        <w:rPr>
-          <w:rFonts w:ascii="Times New Roman" w:hAnsi="Times New Roman" w:cs="Times New Roman"/>
-          <w:lang w:val="en-GB"/>
-        </w:rPr>
-        <w:t>Provinsi</w:t>
-      </w:r>
-      <w:proofErr w:type="spellEnd"/>
-      <w:r>
-        <w:rPr>
-          <w:rFonts w:ascii="Times New Roman" w:hAnsi="Times New Roman" w:cs="Times New Roman"/>
-          <w:lang w:val="en-GB"/>
-        </w:rPr>
-        <w:t xml:space="preserve"> Lampung.</w:t>
-      </w:r>
-      <w:r>
-        <w:rPr>
-          <w:rFonts w:ascii="Times New Roman" w:hAnsi="Times New Roman" w:cs="Times New Roman"/>
-          <w:lang w:val="en-GB"/>
-        </w:rPr>
-        <w:t xml:space="preserve"> </w:t>
-      </w:r>
-      <w:proofErr w:type="spellStart"/>
-      <w:r>
-        <w:rPr>
-          <w:rFonts w:ascii="Times New Roman" w:hAnsi="Times New Roman" w:cs="Times New Roman"/>
-          <w:lang w:val="en-GB"/>
-        </w:rPr>
-        <w:t>Kategori</w:t>
-      </w:r>
-      <w:proofErr w:type="spellEnd"/>
-      <w:r>
-        <w:rPr>
-          <w:rFonts w:ascii="Times New Roman" w:hAnsi="Times New Roman" w:cs="Times New Roman"/>
-          <w:lang w:val="en-GB"/>
-        </w:rPr>
-        <w:t xml:space="preserve"> </w:t>
-      </w:r>
-      <w:proofErr w:type="spellStart"/>
-      <w:proofErr w:type="gramStart"/>
-      <w:r>
-        <w:rPr>
-          <w:rFonts w:ascii="Times New Roman" w:hAnsi="Times New Roman" w:cs="Times New Roman"/>
-          <w:lang w:val="en-GB"/>
-        </w:rPr>
-        <w:t>Wisata</w:t>
-      </w:r>
-      <w:proofErr w:type="spellEnd"/>
-      <w:r>
-        <w:rPr>
-          <w:rFonts w:ascii="Times New Roman" w:hAnsi="Times New Roman" w:cs="Times New Roman"/>
-          <w:lang w:val="en-GB"/>
-        </w:rPr>
-        <w:t xml:space="preserve"> :</w:t>
-      </w:r>
-      <w:proofErr w:type="gramEnd"/>
-      <w:r>
-        <w:rPr>
-          <w:rFonts w:ascii="Times New Roman" w:hAnsi="Times New Roman" w:cs="Times New Roman"/>
-          <w:lang w:val="en-GB"/>
-        </w:rPr>
-        <w:t xml:space="preserve"> </w:t>
-      </w:r>
-      <w:proofErr w:type="spellStart"/>
-      <w:r>
-        <w:rPr>
-          <w:rFonts w:ascii="Times New Roman" w:hAnsi="Times New Roman" w:cs="Times New Roman"/>
-          <w:lang w:val="en-GB"/>
-        </w:rPr>
-        <w:t>Wisata</w:t>
-      </w:r>
-      <w:proofErr w:type="spellEnd"/>
-      <w:r>
-        <w:rPr>
-          <w:rFonts w:ascii="Times New Roman" w:hAnsi="Times New Roman" w:cs="Times New Roman"/>
-          <w:lang w:val="en-GB"/>
-        </w:rPr>
-        <w:t xml:space="preserve"> Alam, </w:t>
-      </w:r>
-      <w:proofErr w:type="spellStart"/>
-      <w:r>
-        <w:rPr>
-          <w:rFonts w:ascii="Times New Roman" w:hAnsi="Times New Roman" w:cs="Times New Roman"/>
-          <w:lang w:val="en-GB"/>
-        </w:rPr>
-        <w:t>Wisata</w:t>
-      </w:r>
-      <w:proofErr w:type="spellEnd"/>
-      <w:r>
-        <w:rPr>
-          <w:rFonts w:ascii="Times New Roman" w:hAnsi="Times New Roman" w:cs="Times New Roman"/>
-          <w:lang w:val="en-GB"/>
-        </w:rPr>
-        <w:t xml:space="preserve"> </w:t>
-      </w:r>
-      <w:proofErr w:type="spellStart"/>
-      <w:r>
-        <w:rPr>
-          <w:rFonts w:ascii="Times New Roman" w:hAnsi="Times New Roman" w:cs="Times New Roman"/>
-          <w:lang w:val="en-GB"/>
-        </w:rPr>
-        <w:t>Budaya</w:t>
-      </w:r>
-      <w:proofErr w:type="spellEnd"/>
-      <w:r>
-        <w:rPr>
-          <w:rFonts w:ascii="Times New Roman" w:hAnsi="Times New Roman" w:cs="Times New Roman"/>
-          <w:lang w:val="en-GB"/>
-        </w:rPr>
-        <w:t xml:space="preserve">, dan </w:t>
-      </w:r>
-      <w:proofErr w:type="spellStart"/>
-      <w:r>
-        <w:rPr>
-          <w:rFonts w:ascii="Times New Roman" w:hAnsi="Times New Roman" w:cs="Times New Roman"/>
-          <w:lang w:val="en-GB"/>
-        </w:rPr>
-        <w:t>Wisata</w:t>
-      </w:r>
-      <w:proofErr w:type="spellEnd"/>
-      <w:r>
-        <w:rPr>
-          <w:rFonts w:ascii="Times New Roman" w:hAnsi="Times New Roman" w:cs="Times New Roman"/>
-          <w:lang w:val="en-GB"/>
-        </w:rPr>
-        <w:t xml:space="preserve"> </w:t>
-      </w:r>
-      <w:proofErr w:type="spellStart"/>
-      <w:r>
-        <w:rPr>
-          <w:rFonts w:ascii="Times New Roman" w:hAnsi="Times New Roman" w:cs="Times New Roman"/>
-          <w:lang w:val="en-GB"/>
-        </w:rPr>
-        <w:t>Edukasi</w:t>
-      </w:r>
-      <w:proofErr w:type="spellEnd"/>
-      <w:r>
-        <w:rPr>
-          <w:rFonts w:ascii="Times New Roman" w:hAnsi="Times New Roman" w:cs="Times New Roman"/>
-          <w:lang w:val="en-GB"/>
-        </w:rPr>
-        <w:t>.</w:t>
+      <w:r>
+        <w:rPr>
+          <w:rFonts w:ascii="Times New Roman" w:hAnsi="Times New Roman" w:cs="Times New Roman"/>
+          <w:lang w:val="en-GB"/>
+        </w:rPr>
+        <w:t>SigerSync adalah aplikasi berbasis Service Oriented Architecture (SOA) yang menyajikan informasi mengenai destinasi wisata di Provinsi Lampung. Kategori Wisata : Wisata Alam, Wisata Budaya, dan Wisata Edukasi.</w:t>
       </w:r>
     </w:p>
     <w:p>
@@ -1165,33 +462,8 @@
           <w:lang w:val="en-GB"/>
         </w:rPr>
         <w:lastRenderedPageBreak/>
-        <w:t xml:space="preserve">2. </w:t>
-      </w:r>
-      <w:proofErr w:type="spellStart"/>
-      <w:r>
-        <w:rPr>
-          <w:rFonts w:ascii="Times New Roman" w:hAnsi="Times New Roman" w:cs="Times New Roman"/>
-          <w:lang w:val="en-GB"/>
-        </w:rPr>
-        <w:t>Membuat</w:t>
-      </w:r>
-      <w:proofErr w:type="spellEnd"/>
-      <w:r>
-        <w:rPr>
-          <w:rFonts w:ascii="Times New Roman" w:hAnsi="Times New Roman" w:cs="Times New Roman"/>
-          <w:lang w:val="en-GB"/>
-        </w:rPr>
-        <w:t xml:space="preserve"> Folder </w:t>
-      </w:r>
-      <w:proofErr w:type="spellStart"/>
-      <w:r>
-        <w:rPr>
-          <w:rFonts w:ascii="Times New Roman" w:hAnsi="Times New Roman" w:cs="Times New Roman"/>
-          <w:lang w:val="en-GB"/>
-        </w:rPr>
-        <w:t>Dokumentasi</w:t>
-      </w:r>
-      <w:proofErr w:type="spellEnd"/>
+        <w:t>2. Membuat Folder Dokumentasi</w:t>
+      </w:r>
     </w:p>
     <w:p>
       <w:pPr>
@@ -1265,231 +537,14 @@
           <w:rFonts w:ascii="Times New Roman" w:hAnsi="Times New Roman" w:cs="Times New Roman"/>
           <w:lang w:val="en-GB"/>
         </w:rPr>
-        <w:t xml:space="preserve">Langkah </w:t>
-      </w:r>
-      <w:proofErr w:type="spellStart"/>
-      <w:r>
-        <w:rPr>
-          <w:rFonts w:ascii="Times New Roman" w:hAnsi="Times New Roman" w:cs="Times New Roman"/>
-          <w:lang w:val="en-GB"/>
-        </w:rPr>
-        <w:t>pertama</w:t>
-      </w:r>
-      <w:proofErr w:type="spellEnd"/>
-      <w:r>
-        <w:rPr>
-          <w:rFonts w:ascii="Times New Roman" w:hAnsi="Times New Roman" w:cs="Times New Roman"/>
-          <w:lang w:val="en-GB"/>
-        </w:rPr>
-        <w:t xml:space="preserve"> </w:t>
-      </w:r>
-      <w:proofErr w:type="spellStart"/>
-      <w:r>
-        <w:rPr>
-          <w:rFonts w:ascii="Times New Roman" w:hAnsi="Times New Roman" w:cs="Times New Roman"/>
-          <w:lang w:val="en-GB"/>
-        </w:rPr>
-        <w:t>membuat</w:t>
-      </w:r>
-      <w:proofErr w:type="spellEnd"/>
-      <w:r>
-        <w:rPr>
-          <w:rFonts w:ascii="Times New Roman" w:hAnsi="Times New Roman" w:cs="Times New Roman"/>
-          <w:lang w:val="en-GB"/>
-        </w:rPr>
-        <w:t xml:space="preserve"> file </w:t>
-      </w:r>
-      <w:proofErr w:type="spellStart"/>
-      <w:r>
-        <w:rPr>
-          <w:rFonts w:ascii="Times New Roman" w:hAnsi="Times New Roman" w:cs="Times New Roman"/>
-          <w:lang w:val="en-GB"/>
-        </w:rPr>
-        <w:t>dokumetasi</w:t>
-      </w:r>
-      <w:proofErr w:type="spellEnd"/>
-      <w:r>
-        <w:rPr>
-          <w:rFonts w:ascii="Times New Roman" w:hAnsi="Times New Roman" w:cs="Times New Roman"/>
-          <w:lang w:val="en-GB"/>
-        </w:rPr>
-        <w:t xml:space="preserve"> yang </w:t>
-      </w:r>
-      <w:proofErr w:type="spellStart"/>
-      <w:r>
-        <w:rPr>
-          <w:rFonts w:ascii="Times New Roman" w:hAnsi="Times New Roman" w:cs="Times New Roman"/>
-          <w:lang w:val="en-GB"/>
-        </w:rPr>
-        <w:t>berguna</w:t>
-      </w:r>
-      <w:proofErr w:type="spellEnd"/>
-      <w:r>
-        <w:rPr>
-          <w:rFonts w:ascii="Times New Roman" w:hAnsi="Times New Roman" w:cs="Times New Roman"/>
-          <w:lang w:val="en-GB"/>
-        </w:rPr>
-        <w:t xml:space="preserve"> </w:t>
-      </w:r>
-      <w:proofErr w:type="spellStart"/>
-      <w:r>
-        <w:rPr>
-          <w:rFonts w:ascii="Times New Roman" w:hAnsi="Times New Roman" w:cs="Times New Roman"/>
-          <w:lang w:val="en-GB"/>
-        </w:rPr>
-        <w:t>untuk</w:t>
-      </w:r>
-      <w:proofErr w:type="spellEnd"/>
-      <w:r>
-        <w:rPr>
-          <w:rFonts w:ascii="Times New Roman" w:hAnsi="Times New Roman" w:cs="Times New Roman"/>
-          <w:lang w:val="en-GB"/>
-        </w:rPr>
-        <w:t xml:space="preserve"> </w:t>
-      </w:r>
-      <w:proofErr w:type="spellStart"/>
-      <w:r>
-        <w:rPr>
-          <w:rFonts w:ascii="Times New Roman" w:hAnsi="Times New Roman" w:cs="Times New Roman"/>
-          <w:lang w:val="en-GB"/>
-        </w:rPr>
-        <w:t>mengetik</w:t>
-      </w:r>
-      <w:proofErr w:type="spellEnd"/>
-      <w:r>
-        <w:rPr>
-          <w:rFonts w:ascii="Times New Roman" w:hAnsi="Times New Roman" w:cs="Times New Roman"/>
-          <w:lang w:val="en-GB"/>
-        </w:rPr>
-        <w:t xml:space="preserve"> proses </w:t>
-      </w:r>
-      <w:proofErr w:type="spellStart"/>
-      <w:r>
-        <w:rPr>
-          <w:rFonts w:ascii="Times New Roman" w:hAnsi="Times New Roman" w:cs="Times New Roman"/>
-          <w:lang w:val="en-GB"/>
-        </w:rPr>
-        <w:t>dalam</w:t>
-      </w:r>
-      <w:proofErr w:type="spellEnd"/>
-      <w:r>
-        <w:rPr>
-          <w:rFonts w:ascii="Times New Roman" w:hAnsi="Times New Roman" w:cs="Times New Roman"/>
-          <w:lang w:val="en-GB"/>
-        </w:rPr>
-        <w:t xml:space="preserve"> </w:t>
-      </w:r>
-      <w:proofErr w:type="spellStart"/>
-      <w:r>
-        <w:rPr>
-          <w:rFonts w:ascii="Times New Roman" w:hAnsi="Times New Roman" w:cs="Times New Roman"/>
-          <w:lang w:val="en-GB"/>
-        </w:rPr>
-        <w:t>setiap</w:t>
-      </w:r>
-      <w:proofErr w:type="spellEnd"/>
-      <w:r>
-        <w:rPr>
-          <w:rFonts w:ascii="Times New Roman" w:hAnsi="Times New Roman" w:cs="Times New Roman"/>
-          <w:lang w:val="en-GB"/>
-        </w:rPr>
-        <w:t xml:space="preserve"> </w:t>
-      </w:r>
-      <w:proofErr w:type="spellStart"/>
-      <w:r>
-        <w:rPr>
-          <w:rFonts w:ascii="Times New Roman" w:hAnsi="Times New Roman" w:cs="Times New Roman"/>
-          <w:lang w:val="en-GB"/>
-        </w:rPr>
-        <w:t>tahap</w:t>
-      </w:r>
-      <w:proofErr w:type="spellEnd"/>
-      <w:r>
-        <w:rPr>
-          <w:rFonts w:ascii="Times New Roman" w:hAnsi="Times New Roman" w:cs="Times New Roman"/>
-          <w:lang w:val="en-GB"/>
-        </w:rPr>
-        <w:t xml:space="preserve"> </w:t>
-      </w:r>
-      <w:proofErr w:type="spellStart"/>
-      <w:r>
-        <w:rPr>
-          <w:rFonts w:ascii="Times New Roman" w:hAnsi="Times New Roman" w:cs="Times New Roman"/>
-          <w:lang w:val="en-GB"/>
-        </w:rPr>
-        <w:t>dalam</w:t>
-      </w:r>
-      <w:proofErr w:type="spellEnd"/>
-      <w:r>
-        <w:rPr>
-          <w:rFonts w:ascii="Times New Roman" w:hAnsi="Times New Roman" w:cs="Times New Roman"/>
-          <w:lang w:val="en-GB"/>
-        </w:rPr>
-        <w:t xml:space="preserve"> </w:t>
-      </w:r>
-      <w:proofErr w:type="spellStart"/>
-      <w:r>
-        <w:rPr>
-          <w:rFonts w:ascii="Times New Roman" w:hAnsi="Times New Roman" w:cs="Times New Roman"/>
-          <w:lang w:val="en-GB"/>
-        </w:rPr>
-        <w:t>mengerjakan</w:t>
-      </w:r>
-      <w:proofErr w:type="spellEnd"/>
-      <w:r>
-        <w:rPr>
-          <w:rFonts w:ascii="Times New Roman" w:hAnsi="Times New Roman" w:cs="Times New Roman"/>
-          <w:lang w:val="en-GB"/>
-        </w:rPr>
-        <w:t xml:space="preserve"> project </w:t>
-      </w:r>
-      <w:proofErr w:type="spellStart"/>
-      <w:r>
-        <w:rPr>
-          <w:rFonts w:ascii="Times New Roman" w:hAnsi="Times New Roman" w:cs="Times New Roman"/>
-          <w:lang w:val="en-GB"/>
-        </w:rPr>
-        <w:t>ini</w:t>
-      </w:r>
-      <w:proofErr w:type="spellEnd"/>
-      <w:r>
-        <w:rPr>
-          <w:rFonts w:ascii="Times New Roman" w:hAnsi="Times New Roman" w:cs="Times New Roman"/>
-          <w:lang w:val="en-GB"/>
-        </w:rPr>
-        <w:t xml:space="preserve">. </w:t>
-      </w:r>
-      <w:proofErr w:type="spellStart"/>
-      <w:r>
-        <w:rPr>
-          <w:rFonts w:ascii="Times New Roman" w:hAnsi="Times New Roman" w:cs="Times New Roman"/>
-          <w:lang w:val="en-GB"/>
-        </w:rPr>
-        <w:t>Berisi</w:t>
-      </w:r>
-      <w:proofErr w:type="spellEnd"/>
-      <w:r>
-        <w:rPr>
-          <w:rFonts w:ascii="Times New Roman" w:hAnsi="Times New Roman" w:cs="Times New Roman"/>
-          <w:lang w:val="en-GB"/>
-        </w:rPr>
-        <w:t xml:space="preserve"> </w:t>
-      </w:r>
-      <w:proofErr w:type="spellStart"/>
-      <w:r>
-        <w:rPr>
-          <w:rFonts w:ascii="Times New Roman" w:hAnsi="Times New Roman" w:cs="Times New Roman"/>
-          <w:lang w:val="en-GB"/>
-        </w:rPr>
-        <w:t>gambar</w:t>
-      </w:r>
-      <w:proofErr w:type="spellEnd"/>
-      <w:r>
-        <w:rPr>
-          <w:rFonts w:ascii="Times New Roman" w:hAnsi="Times New Roman" w:cs="Times New Roman"/>
-          <w:lang w:val="en-GB"/>
-        </w:rPr>
-        <w:t xml:space="preserve"> </w:t>
+        <w:t xml:space="preserve">Langkah pertama membuat file dokumetasi yang berguna untuk mengetik proses dalam setiap tahap dalam mengerjakan project ini. Berisi </w:t>
+      </w:r>
+      <w:r>
+        <w:rPr>
+          <w:rFonts w:ascii="Times New Roman" w:hAnsi="Times New Roman" w:cs="Times New Roman"/>
+          <w:lang w:val="en-GB"/>
+        </w:rPr>
+        <w:t xml:space="preserve">gambar </w:t>
       </w:r>
       <w:r>
         <w:rPr>
@@ -1503,65 +558,98 @@
           <w:rFonts w:ascii="Times New Roman" w:hAnsi="Times New Roman" w:cs="Times New Roman"/>
           <w:lang w:val="en-GB"/>
         </w:rPr>
-        <w:t xml:space="preserve"> dan </w:t>
-      </w:r>
-      <w:proofErr w:type="spellStart"/>
-      <w:r>
-        <w:rPr>
-          <w:rFonts w:ascii="Times New Roman" w:hAnsi="Times New Roman" w:cs="Times New Roman"/>
-          <w:lang w:val="en-GB"/>
-        </w:rPr>
-        <w:t>penjelasan</w:t>
-      </w:r>
-      <w:proofErr w:type="spellEnd"/>
-      <w:r>
-        <w:rPr>
-          <w:rFonts w:ascii="Times New Roman" w:hAnsi="Times New Roman" w:cs="Times New Roman"/>
-          <w:lang w:val="en-GB"/>
-        </w:rPr>
-        <w:t xml:space="preserve"> </w:t>
-      </w:r>
-      <w:proofErr w:type="spellStart"/>
-      <w:r>
-        <w:rPr>
-          <w:rFonts w:ascii="Times New Roman" w:hAnsi="Times New Roman" w:cs="Times New Roman"/>
-          <w:lang w:val="en-GB"/>
-        </w:rPr>
-        <w:t>kegiatan</w:t>
-      </w:r>
-      <w:proofErr w:type="spellEnd"/>
-      <w:r>
-        <w:rPr>
-          <w:rFonts w:ascii="Times New Roman" w:hAnsi="Times New Roman" w:cs="Times New Roman"/>
-          <w:lang w:val="en-GB"/>
-        </w:rPr>
-        <w:t xml:space="preserve"> yang </w:t>
-      </w:r>
-      <w:proofErr w:type="spellStart"/>
-      <w:r>
-        <w:rPr>
-          <w:rFonts w:ascii="Times New Roman" w:hAnsi="Times New Roman" w:cs="Times New Roman"/>
-          <w:lang w:val="en-GB"/>
-        </w:rPr>
-        <w:t>dilakukan</w:t>
-      </w:r>
-      <w:proofErr w:type="spellEnd"/>
-      <w:r>
-        <w:rPr>
-          <w:rFonts w:ascii="Times New Roman" w:hAnsi="Times New Roman" w:cs="Times New Roman"/>
-          <w:lang w:val="en-GB"/>
-        </w:rPr>
-        <w:t>.</w:t>
-      </w:r>
-    </w:p>
-    <w:p>
-      <w:pPr>
-        <w:contextualSpacing/>
-        <w:rPr>
-          <w:rFonts w:ascii="Times New Roman" w:hAnsi="Times New Roman" w:cs="Times New Roman"/>
-          <w:lang w:val="en-GB"/>
-        </w:rPr>
-      </w:pPr>
+        <w:t xml:space="preserve"> dan penjelasan kegiatan yang dilakukan.</w:t>
+      </w:r>
+    </w:p>
+    <w:p>
+      <w:pPr>
+        <w:contextualSpacing/>
+        <w:rPr>
+          <w:rFonts w:ascii="Times New Roman" w:hAnsi="Times New Roman" w:cs="Times New Roman"/>
+          <w:lang w:val="en-GB"/>
+        </w:rPr>
+      </w:pPr>
+    </w:p>
+    <w:p>
+      <w:pPr>
+        <w:contextualSpacing/>
+        <w:rPr>
+          <w:rFonts w:ascii="Times New Roman" w:hAnsi="Times New Roman" w:cs="Times New Roman"/>
+          <w:lang w:val="en-GB"/>
+        </w:rPr>
+      </w:pPr>
+      <w:r>
+        <w:rPr>
+          <w:rFonts w:ascii="Times New Roman" w:hAnsi="Times New Roman" w:cs="Times New Roman"/>
+          <w:lang w:val="en-GB"/>
+        </w:rPr>
+        <w:t>3. Membuat dokumentasi awal</w:t>
+      </w:r>
+    </w:p>
+    <w:p>
+      <w:pPr>
+        <w:contextualSpacing/>
+        <w:rPr>
+          <w:rFonts w:ascii="Times New Roman" w:hAnsi="Times New Roman" w:cs="Times New Roman"/>
+          <w:lang w:val="en-GB"/>
+        </w:rPr>
+      </w:pPr>
+      <w:r>
+        <w:rPr>
+          <w:noProof/>
+        </w:rPr>
+        <w:drawing>
+          <wp:inline distT="0" distB="0" distL="0" distR="0" wp14:anchorId="42EC602F" wp14:editId="07CF7A2A">
+            <wp:extent cx="5731510" cy="3222625"/>
+            <wp:effectExtent l="0" t="0" r="2540" b="0"/>
+            <wp:docPr id="178982657" name="Picture 1"/>
+            <wp:cNvGraphicFramePr>
+              <a:graphicFrameLocks xmlns:a="http://schemas.openxmlformats.org/drawingml/2006/main" noChangeAspect="1"/>
+            </wp:cNvGraphicFramePr>
+            <a:graphic xmlns:a="http://schemas.openxmlformats.org/drawingml/2006/main">
+              <a:graphicData uri="http://schemas.openxmlformats.org/drawingml/2006/picture">
+                <pic:pic xmlns:pic="http://schemas.openxmlformats.org/drawingml/2006/picture">
+                  <pic:nvPicPr>
+                    <pic:cNvPr id="178982657" name=""/>
+                    <pic:cNvPicPr/>
+                  </pic:nvPicPr>
+                  <pic:blipFill>
+                    <a:blip r:embed="rId7"/>
+                    <a:stretch>
+                      <a:fillRect/>
+                    </a:stretch>
+                  </pic:blipFill>
+                  <pic:spPr>
+                    <a:xfrm>
+                      <a:off x="0" y="0"/>
+                      <a:ext cx="5731510" cy="3222625"/>
+                    </a:xfrm>
+                    <a:prstGeom prst="rect">
+                      <a:avLst/>
+                    </a:prstGeom>
+                  </pic:spPr>
+                </pic:pic>
+              </a:graphicData>
+            </a:graphic>
+          </wp:inline>
+        </w:drawing>
+      </w:r>
+    </w:p>
+    <w:p>
+      <w:pPr>
+        <w:contextualSpacing/>
+        <w:rPr>
+          <w:rFonts w:ascii="Times New Roman" w:hAnsi="Times New Roman" w:cs="Times New Roman"/>
+          <w:lang w:val="en-GB"/>
+        </w:rPr>
+      </w:pPr>
+      <w:r>
+        <w:rPr>
+          <w:rFonts w:ascii="Times New Roman" w:hAnsi="Times New Roman" w:cs="Times New Roman"/>
+          <w:lang w:val="en-GB"/>
+        </w:rPr>
+        <w:t>Dokumentasi awal project untuk Gambaran awal tentang project ini, sehingga siapa saja yang melihat bisa mengerti dan memahami tentang tentang project ini.</w:t>
+      </w:r>
     </w:p>
     <w:sectPr>
       <w:pgSz w:w="11906" w:h="16838"/>

</xml_diff>

<commit_message>
Update dokumentasi pada file word
</commit_message>
<xml_diff>
--- a/dokumentasi/24382001P_Lorensius Firngadi_IF 23 E_Dokumentasi.docx
+++ b/dokumentasi/24382001P_Lorensius Firngadi_IF 23 E_Dokumentasi.docx
@@ -13,6 +13,7 @@
           <w:lang w:val="en-GB"/>
         </w:rPr>
       </w:pPr>
+      <w:proofErr w:type="spellStart"/>
       <w:r>
         <w:rPr>
           <w:rFonts w:ascii="Times New Roman" w:hAnsi="Times New Roman" w:cs="Times New Roman"/>
@@ -20,7 +21,17 @@
           <w:bCs/>
           <w:lang w:val="en-GB"/>
         </w:rPr>
-        <w:t>Dokumentasi Project Akhir</w:t>
+        <w:t>Dokumentasi</w:t>
+      </w:r>
+      <w:proofErr w:type="spellEnd"/>
+      <w:r>
+        <w:rPr>
+          <w:rFonts w:ascii="Times New Roman" w:hAnsi="Times New Roman" w:cs="Times New Roman"/>
+          <w:b/>
+          <w:bCs/>
+          <w:lang w:val="en-GB"/>
+        </w:rPr>
+        <w:t xml:space="preserve"> Project Akhir</w:t>
       </w:r>
     </w:p>
     <w:p>
@@ -34,6 +45,7 @@
           <w:lang w:val="en-GB"/>
         </w:rPr>
       </w:pPr>
+      <w:proofErr w:type="spellStart"/>
       <w:r>
         <w:rPr>
           <w:rFonts w:ascii="Times New Roman" w:hAnsi="Times New Roman" w:cs="Times New Roman"/>
@@ -41,7 +53,37 @@
           <w:bCs/>
           <w:lang w:val="en-GB"/>
         </w:rPr>
-        <w:t>Pemrograman Berorientasi Service</w:t>
+        <w:t>Pemrograman</w:t>
+      </w:r>
+      <w:proofErr w:type="spellEnd"/>
+      <w:r>
+        <w:rPr>
+          <w:rFonts w:ascii="Times New Roman" w:hAnsi="Times New Roman" w:cs="Times New Roman"/>
+          <w:b/>
+          <w:bCs/>
+          <w:lang w:val="en-GB"/>
+        </w:rPr>
+        <w:t xml:space="preserve"> </w:t>
+      </w:r>
+      <w:proofErr w:type="spellStart"/>
+      <w:r>
+        <w:rPr>
+          <w:rFonts w:ascii="Times New Roman" w:hAnsi="Times New Roman" w:cs="Times New Roman"/>
+          <w:b/>
+          <w:bCs/>
+          <w:lang w:val="en-GB"/>
+        </w:rPr>
+        <w:t>Berorientasi</w:t>
+      </w:r>
+      <w:proofErr w:type="spellEnd"/>
+      <w:r>
+        <w:rPr>
+          <w:rFonts w:ascii="Times New Roman" w:hAnsi="Times New Roman" w:cs="Times New Roman"/>
+          <w:b/>
+          <w:bCs/>
+          <w:lang w:val="en-GB"/>
+        </w:rPr>
+        <w:t xml:space="preserve"> Service</w:t>
       </w:r>
     </w:p>
     <w:p>
@@ -74,7 +116,23 @@
           <w:lang w:val="en-GB"/>
         </w:rPr>
         <w:tab/>
-        <w:t>: Lorensius Firngadi</w:t>
+        <w:t xml:space="preserve">: </w:t>
+      </w:r>
+      <w:proofErr w:type="spellStart"/>
+      <w:r>
+        <w:rPr>
+          <w:rFonts w:ascii="Times New Roman" w:hAnsi="Times New Roman" w:cs="Times New Roman"/>
+          <w:lang w:val="en-GB"/>
+        </w:rPr>
+        <w:t>Lorensius</w:t>
+      </w:r>
+      <w:proofErr w:type="spellEnd"/>
+      <w:r>
+        <w:rPr>
+          <w:rFonts w:ascii="Times New Roman" w:hAnsi="Times New Roman" w:cs="Times New Roman"/>
+          <w:lang w:val="en-GB"/>
+        </w:rPr>
+        <w:t xml:space="preserve"> Firngadi</w:t>
       </w:r>
     </w:p>
     <w:p>
@@ -109,6 +167,7 @@
           <w:lang w:val="en-GB"/>
         </w:rPr>
       </w:pPr>
+      <w:proofErr w:type="spellStart"/>
       <w:r>
         <w:rPr>
           <w:rFonts w:ascii="Times New Roman" w:hAnsi="Times New Roman" w:cs="Times New Roman"/>
@@ -116,6 +175,7 @@
         </w:rPr>
         <w:t>Kelas</w:t>
       </w:r>
+      <w:proofErr w:type="spellEnd"/>
       <w:r>
         <w:rPr>
           <w:rFonts w:ascii="Times New Roman" w:hAnsi="Times New Roman" w:cs="Times New Roman"/>
@@ -138,8 +198,17 @@
           <w:rFonts w:ascii="Times New Roman" w:hAnsi="Times New Roman" w:cs="Times New Roman"/>
           <w:lang w:val="en-GB"/>
         </w:rPr>
-        <w:t>Dosen Pengampu</w:t>
-      </w:r>
+        <w:t xml:space="preserve">Dosen </w:t>
+      </w:r>
+      <w:proofErr w:type="spellStart"/>
+      <w:r>
+        <w:rPr>
+          <w:rFonts w:ascii="Times New Roman" w:hAnsi="Times New Roman" w:cs="Times New Roman"/>
+          <w:lang w:val="en-GB"/>
+        </w:rPr>
+        <w:t>Pengampu</w:t>
+      </w:r>
+      <w:proofErr w:type="spellEnd"/>
       <w:r>
         <w:rPr>
           <w:rFonts w:ascii="Times New Roman" w:hAnsi="Times New Roman" w:cs="Times New Roman"/>
@@ -160,7 +229,75 @@
           <w:rFonts w:ascii="Times New Roman" w:hAnsi="Times New Roman" w:cs="Times New Roman"/>
           <w:lang w:val="en-GB"/>
         </w:rPr>
-        <w:t>A. Ferico Octaviansyah, , S.Kom., M.Kom.</w:t>
+        <w:t xml:space="preserve">A. </w:t>
+      </w:r>
+      <w:proofErr w:type="spellStart"/>
+      <w:r>
+        <w:rPr>
+          <w:rFonts w:ascii="Times New Roman" w:hAnsi="Times New Roman" w:cs="Times New Roman"/>
+          <w:lang w:val="en-GB"/>
+        </w:rPr>
+        <w:t>Ferico</w:t>
+      </w:r>
+      <w:proofErr w:type="spellEnd"/>
+      <w:r>
+        <w:rPr>
+          <w:rFonts w:ascii="Times New Roman" w:hAnsi="Times New Roman" w:cs="Times New Roman"/>
+          <w:lang w:val="en-GB"/>
+        </w:rPr>
+        <w:t xml:space="preserve"> Octaviansyah</w:t>
+      </w:r>
+      <w:proofErr w:type="gramStart"/>
+      <w:r>
+        <w:rPr>
+          <w:rFonts w:ascii="Times New Roman" w:hAnsi="Times New Roman" w:cs="Times New Roman"/>
+          <w:lang w:val="en-GB"/>
+        </w:rPr>
+        <w:t>, ,</w:t>
+      </w:r>
+      <w:proofErr w:type="gramEnd"/>
+      <w:r>
+        <w:rPr>
+          <w:rFonts w:ascii="Times New Roman" w:hAnsi="Times New Roman" w:cs="Times New Roman"/>
+          <w:lang w:val="en-GB"/>
+        </w:rPr>
+        <w:t xml:space="preserve"> </w:t>
+      </w:r>
+      <w:proofErr w:type="spellStart"/>
+      <w:proofErr w:type="gramStart"/>
+      <w:r>
+        <w:rPr>
+          <w:rFonts w:ascii="Times New Roman" w:hAnsi="Times New Roman" w:cs="Times New Roman"/>
+          <w:lang w:val="en-GB"/>
+        </w:rPr>
+        <w:t>S.Kom</w:t>
+      </w:r>
+      <w:proofErr w:type="spellEnd"/>
+      <w:proofErr w:type="gramEnd"/>
+      <w:r>
+        <w:rPr>
+          <w:rFonts w:ascii="Times New Roman" w:hAnsi="Times New Roman" w:cs="Times New Roman"/>
+          <w:lang w:val="en-GB"/>
+        </w:rPr>
+        <w:t xml:space="preserve">., </w:t>
+      </w:r>
+      <w:proofErr w:type="spellStart"/>
+      <w:proofErr w:type="gramStart"/>
+      <w:r>
+        <w:rPr>
+          <w:rFonts w:ascii="Times New Roman" w:hAnsi="Times New Roman" w:cs="Times New Roman"/>
+          <w:lang w:val="en-GB"/>
+        </w:rPr>
+        <w:t>M.Kom</w:t>
+      </w:r>
+      <w:proofErr w:type="spellEnd"/>
+      <w:proofErr w:type="gramEnd"/>
+      <w:r>
+        <w:rPr>
+          <w:rFonts w:ascii="Times New Roman" w:hAnsi="Times New Roman" w:cs="Times New Roman"/>
+          <w:lang w:val="en-GB"/>
+        </w:rPr>
+        <w:t>.</w:t>
       </w:r>
     </w:p>
     <w:p>
@@ -185,7 +322,23 @@
           <w:rFonts w:ascii="Times New Roman" w:hAnsi="Times New Roman" w:cs="Times New Roman"/>
           <w:lang w:val="en-GB"/>
         </w:rPr>
-        <w:t>1. Membuat R</w:t>
+        <w:t xml:space="preserve">1. </w:t>
+      </w:r>
+      <w:proofErr w:type="spellStart"/>
+      <w:r>
+        <w:rPr>
+          <w:rFonts w:ascii="Times New Roman" w:hAnsi="Times New Roman" w:cs="Times New Roman"/>
+          <w:lang w:val="en-GB"/>
+        </w:rPr>
+        <w:t>Membuat</w:t>
+      </w:r>
+      <w:proofErr w:type="spellEnd"/>
+      <w:r>
+        <w:rPr>
+          <w:rFonts w:ascii="Times New Roman" w:hAnsi="Times New Roman" w:cs="Times New Roman"/>
+          <w:lang w:val="en-GB"/>
+        </w:rPr>
+        <w:t xml:space="preserve"> R</w:t>
       </w:r>
       <w:r>
         <w:rPr>
@@ -206,8 +359,17 @@
           <w:rFonts w:ascii="Times New Roman" w:hAnsi="Times New Roman" w:cs="Times New Roman"/>
           <w:lang w:val="en-GB"/>
         </w:rPr>
-        <w:t>di Web github</w:t>
-      </w:r>
+        <w:t xml:space="preserve">di Web </w:t>
+      </w:r>
+      <w:proofErr w:type="spellStart"/>
+      <w:r>
+        <w:rPr>
+          <w:rFonts w:ascii="Times New Roman" w:hAnsi="Times New Roman" w:cs="Times New Roman"/>
+          <w:lang w:val="en-GB"/>
+        </w:rPr>
+        <w:t>github</w:t>
+      </w:r>
+      <w:proofErr w:type="spellEnd"/>
     </w:p>
     <w:p>
       <w:pPr>
@@ -285,33 +447,236 @@
           <w:lang w:val="en-GB"/>
         </w:rPr>
       </w:pPr>
-      <w:r>
-        <w:rPr>
-          <w:rFonts w:ascii="Times New Roman" w:hAnsi="Times New Roman" w:cs="Times New Roman"/>
-          <w:lang w:val="en-GB"/>
-        </w:rPr>
-        <w:t xml:space="preserve">Untuk project akhir mata kuliah </w:t>
-      </w:r>
-      <w:r>
-        <w:rPr>
-          <w:rFonts w:ascii="Times New Roman" w:hAnsi="Times New Roman" w:cs="Times New Roman"/>
-          <w:lang w:val="en-GB"/>
-        </w:rPr>
-        <w:t>Pemrograman Berorientasi Service</w:t>
-      </w:r>
-      <w:r>
-        <w:rPr>
-          <w:rFonts w:ascii="Times New Roman" w:hAnsi="Times New Roman" w:cs="Times New Roman"/>
-          <w:lang w:val="en-GB"/>
-        </w:rPr>
-        <w:t xml:space="preserve"> ini </w:t>
-      </w:r>
-      <w:r>
-        <w:rPr>
-          <w:rFonts w:ascii="Times New Roman" w:hAnsi="Times New Roman" w:cs="Times New Roman"/>
-          <w:lang w:val="en-GB"/>
-        </w:rPr>
-        <w:t>memilih Tema Wisata. Dengan membatasi focus pada tempat provinsi asal saya.</w:t>
+      <w:proofErr w:type="spellStart"/>
+      <w:r>
+        <w:rPr>
+          <w:rFonts w:ascii="Times New Roman" w:hAnsi="Times New Roman" w:cs="Times New Roman"/>
+          <w:lang w:val="en-GB"/>
+        </w:rPr>
+        <w:t>Untuk</w:t>
+      </w:r>
+      <w:proofErr w:type="spellEnd"/>
+      <w:r>
+        <w:rPr>
+          <w:rFonts w:ascii="Times New Roman" w:hAnsi="Times New Roman" w:cs="Times New Roman"/>
+          <w:lang w:val="en-GB"/>
+        </w:rPr>
+        <w:t xml:space="preserve"> project </w:t>
+      </w:r>
+      <w:proofErr w:type="spellStart"/>
+      <w:r>
+        <w:rPr>
+          <w:rFonts w:ascii="Times New Roman" w:hAnsi="Times New Roman" w:cs="Times New Roman"/>
+          <w:lang w:val="en-GB"/>
+        </w:rPr>
+        <w:t>akhir</w:t>
+      </w:r>
+      <w:proofErr w:type="spellEnd"/>
+      <w:r>
+        <w:rPr>
+          <w:rFonts w:ascii="Times New Roman" w:hAnsi="Times New Roman" w:cs="Times New Roman"/>
+          <w:lang w:val="en-GB"/>
+        </w:rPr>
+        <w:t xml:space="preserve"> </w:t>
+      </w:r>
+      <w:proofErr w:type="spellStart"/>
+      <w:r>
+        <w:rPr>
+          <w:rFonts w:ascii="Times New Roman" w:hAnsi="Times New Roman" w:cs="Times New Roman"/>
+          <w:lang w:val="en-GB"/>
+        </w:rPr>
+        <w:t>mata</w:t>
+      </w:r>
+      <w:proofErr w:type="spellEnd"/>
+      <w:r>
+        <w:rPr>
+          <w:rFonts w:ascii="Times New Roman" w:hAnsi="Times New Roman" w:cs="Times New Roman"/>
+          <w:lang w:val="en-GB"/>
+        </w:rPr>
+        <w:t xml:space="preserve"> </w:t>
+      </w:r>
+      <w:proofErr w:type="spellStart"/>
+      <w:r>
+        <w:rPr>
+          <w:rFonts w:ascii="Times New Roman" w:hAnsi="Times New Roman" w:cs="Times New Roman"/>
+          <w:lang w:val="en-GB"/>
+        </w:rPr>
+        <w:t>kuliah</w:t>
+      </w:r>
+      <w:proofErr w:type="spellEnd"/>
+      <w:r>
+        <w:rPr>
+          <w:rFonts w:ascii="Times New Roman" w:hAnsi="Times New Roman" w:cs="Times New Roman"/>
+          <w:lang w:val="en-GB"/>
+        </w:rPr>
+        <w:t xml:space="preserve"> </w:t>
+      </w:r>
+      <w:proofErr w:type="spellStart"/>
+      <w:r>
+        <w:rPr>
+          <w:rFonts w:ascii="Times New Roman" w:hAnsi="Times New Roman" w:cs="Times New Roman"/>
+          <w:lang w:val="en-GB"/>
+        </w:rPr>
+        <w:t>Pemrograman</w:t>
+      </w:r>
+      <w:proofErr w:type="spellEnd"/>
+      <w:r>
+        <w:rPr>
+          <w:rFonts w:ascii="Times New Roman" w:hAnsi="Times New Roman" w:cs="Times New Roman"/>
+          <w:lang w:val="en-GB"/>
+        </w:rPr>
+        <w:t xml:space="preserve"> </w:t>
+      </w:r>
+      <w:proofErr w:type="spellStart"/>
+      <w:r>
+        <w:rPr>
+          <w:rFonts w:ascii="Times New Roman" w:hAnsi="Times New Roman" w:cs="Times New Roman"/>
+          <w:lang w:val="en-GB"/>
+        </w:rPr>
+        <w:t>Berorientasi</w:t>
+      </w:r>
+      <w:proofErr w:type="spellEnd"/>
+      <w:r>
+        <w:rPr>
+          <w:rFonts w:ascii="Times New Roman" w:hAnsi="Times New Roman" w:cs="Times New Roman"/>
+          <w:lang w:val="en-GB"/>
+        </w:rPr>
+        <w:t xml:space="preserve"> Service</w:t>
+      </w:r>
+      <w:r>
+        <w:rPr>
+          <w:rFonts w:ascii="Times New Roman" w:hAnsi="Times New Roman" w:cs="Times New Roman"/>
+          <w:lang w:val="en-GB"/>
+        </w:rPr>
+        <w:t xml:space="preserve"> </w:t>
+      </w:r>
+      <w:proofErr w:type="spellStart"/>
+      <w:r>
+        <w:rPr>
+          <w:rFonts w:ascii="Times New Roman" w:hAnsi="Times New Roman" w:cs="Times New Roman"/>
+          <w:lang w:val="en-GB"/>
+        </w:rPr>
+        <w:t>ini</w:t>
+      </w:r>
+      <w:proofErr w:type="spellEnd"/>
+      <w:r>
+        <w:rPr>
+          <w:rFonts w:ascii="Times New Roman" w:hAnsi="Times New Roman" w:cs="Times New Roman"/>
+          <w:lang w:val="en-GB"/>
+        </w:rPr>
+        <w:t xml:space="preserve"> </w:t>
+      </w:r>
+      <w:proofErr w:type="spellStart"/>
+      <w:r>
+        <w:rPr>
+          <w:rFonts w:ascii="Times New Roman" w:hAnsi="Times New Roman" w:cs="Times New Roman"/>
+          <w:lang w:val="en-GB"/>
+        </w:rPr>
+        <w:t>memilih</w:t>
+      </w:r>
+      <w:proofErr w:type="spellEnd"/>
+      <w:r>
+        <w:rPr>
+          <w:rFonts w:ascii="Times New Roman" w:hAnsi="Times New Roman" w:cs="Times New Roman"/>
+          <w:lang w:val="en-GB"/>
+        </w:rPr>
+        <w:t xml:space="preserve"> Tema Wisata. </w:t>
+      </w:r>
+      <w:proofErr w:type="spellStart"/>
+      <w:r>
+        <w:rPr>
+          <w:rFonts w:ascii="Times New Roman" w:hAnsi="Times New Roman" w:cs="Times New Roman"/>
+          <w:lang w:val="en-GB"/>
+        </w:rPr>
+        <w:t>Dengan</w:t>
+      </w:r>
+      <w:proofErr w:type="spellEnd"/>
+      <w:r>
+        <w:rPr>
+          <w:rFonts w:ascii="Times New Roman" w:hAnsi="Times New Roman" w:cs="Times New Roman"/>
+          <w:lang w:val="en-GB"/>
+        </w:rPr>
+        <w:t xml:space="preserve"> </w:t>
+      </w:r>
+      <w:proofErr w:type="spellStart"/>
+      <w:r>
+        <w:rPr>
+          <w:rFonts w:ascii="Times New Roman" w:hAnsi="Times New Roman" w:cs="Times New Roman"/>
+          <w:lang w:val="en-GB"/>
+        </w:rPr>
+        <w:t>membatasi</w:t>
+      </w:r>
+      <w:proofErr w:type="spellEnd"/>
+      <w:r>
+        <w:rPr>
+          <w:rFonts w:ascii="Times New Roman" w:hAnsi="Times New Roman" w:cs="Times New Roman"/>
+          <w:lang w:val="en-GB"/>
+        </w:rPr>
+        <w:t xml:space="preserve"> focus pada </w:t>
+      </w:r>
+      <w:proofErr w:type="spellStart"/>
+      <w:r>
+        <w:rPr>
+          <w:rFonts w:ascii="Times New Roman" w:hAnsi="Times New Roman" w:cs="Times New Roman"/>
+          <w:lang w:val="en-GB"/>
+        </w:rPr>
+        <w:t>tempat</w:t>
+      </w:r>
+      <w:proofErr w:type="spellEnd"/>
+      <w:r>
+        <w:rPr>
+          <w:rFonts w:ascii="Times New Roman" w:hAnsi="Times New Roman" w:cs="Times New Roman"/>
+          <w:lang w:val="en-GB"/>
+        </w:rPr>
+        <w:t xml:space="preserve"> </w:t>
+      </w:r>
+      <w:proofErr w:type="spellStart"/>
+      <w:r>
+        <w:rPr>
+          <w:rFonts w:ascii="Times New Roman" w:hAnsi="Times New Roman" w:cs="Times New Roman"/>
+          <w:lang w:val="en-GB"/>
+        </w:rPr>
+        <w:t>provinsi</w:t>
+      </w:r>
+      <w:proofErr w:type="spellEnd"/>
+      <w:r>
+        <w:rPr>
+          <w:rFonts w:ascii="Times New Roman" w:hAnsi="Times New Roman" w:cs="Times New Roman"/>
+          <w:lang w:val="en-GB"/>
+        </w:rPr>
+        <w:t xml:space="preserve"> </w:t>
+      </w:r>
+      <w:proofErr w:type="spellStart"/>
+      <w:r>
+        <w:rPr>
+          <w:rFonts w:ascii="Times New Roman" w:hAnsi="Times New Roman" w:cs="Times New Roman"/>
+          <w:lang w:val="en-GB"/>
+        </w:rPr>
+        <w:t>asal</w:t>
+      </w:r>
+      <w:proofErr w:type="spellEnd"/>
+      <w:r>
+        <w:rPr>
+          <w:rFonts w:ascii="Times New Roman" w:hAnsi="Times New Roman" w:cs="Times New Roman"/>
+          <w:lang w:val="en-GB"/>
+        </w:rPr>
+        <w:t xml:space="preserve"> </w:t>
+      </w:r>
+      <w:proofErr w:type="spellStart"/>
+      <w:r>
+        <w:rPr>
+          <w:rFonts w:ascii="Times New Roman" w:hAnsi="Times New Roman" w:cs="Times New Roman"/>
+          <w:lang w:val="en-GB"/>
+        </w:rPr>
+        <w:t>saya</w:t>
+      </w:r>
+      <w:proofErr w:type="spellEnd"/>
+      <w:r>
+        <w:rPr>
+          <w:rFonts w:ascii="Times New Roman" w:hAnsi="Times New Roman" w:cs="Times New Roman"/>
+          <w:lang w:val="en-GB"/>
+        </w:rPr>
+        <w:t>.</w:t>
       </w:r>
     </w:p>
     <w:p>
@@ -332,8 +697,33 @@
           <w:rFonts w:ascii="Times New Roman" w:hAnsi="Times New Roman" w:cs="Times New Roman"/>
           <w:lang w:val="en-GB"/>
         </w:rPr>
-        <w:t>Nama Project : SigerSync</w:t>
-      </w:r>
+        <w:t xml:space="preserve">Nama </w:t>
+      </w:r>
+      <w:proofErr w:type="gramStart"/>
+      <w:r>
+        <w:rPr>
+          <w:rFonts w:ascii="Times New Roman" w:hAnsi="Times New Roman" w:cs="Times New Roman"/>
+          <w:lang w:val="en-GB"/>
+        </w:rPr>
+        <w:t>Project :</w:t>
+      </w:r>
+      <w:proofErr w:type="gramEnd"/>
+      <w:r>
+        <w:rPr>
+          <w:rFonts w:ascii="Times New Roman" w:hAnsi="Times New Roman" w:cs="Times New Roman"/>
+          <w:lang w:val="en-GB"/>
+        </w:rPr>
+        <w:t xml:space="preserve"> </w:t>
+      </w:r>
+      <w:proofErr w:type="spellStart"/>
+      <w:r>
+        <w:rPr>
+          <w:rFonts w:ascii="Times New Roman" w:hAnsi="Times New Roman" w:cs="Times New Roman"/>
+          <w:lang w:val="en-GB"/>
+        </w:rPr>
+        <w:t>SigerSync</w:t>
+      </w:r>
+      <w:proofErr w:type="spellEnd"/>
     </w:p>
     <w:p>
       <w:pPr>
@@ -348,13 +738,47 @@
           <w:lang w:val="en-GB"/>
         </w:rPr>
       </w:pPr>
-      <w:r>
-        <w:rPr>
-          <w:rFonts w:ascii="Times New Roman" w:hAnsi="Times New Roman" w:cs="Times New Roman"/>
-          <w:lang w:val="en-GB"/>
-        </w:rPr>
-        <w:t>Deskripsi Singkat Project :</w:t>
-      </w:r>
+      <w:proofErr w:type="spellStart"/>
+      <w:r>
+        <w:rPr>
+          <w:rFonts w:ascii="Times New Roman" w:hAnsi="Times New Roman" w:cs="Times New Roman"/>
+          <w:lang w:val="en-GB"/>
+        </w:rPr>
+        <w:t>Deskripsi</w:t>
+      </w:r>
+      <w:proofErr w:type="spellEnd"/>
+      <w:r>
+        <w:rPr>
+          <w:rFonts w:ascii="Times New Roman" w:hAnsi="Times New Roman" w:cs="Times New Roman"/>
+          <w:lang w:val="en-GB"/>
+        </w:rPr>
+        <w:t xml:space="preserve"> </w:t>
+      </w:r>
+      <w:proofErr w:type="spellStart"/>
+      <w:r>
+        <w:rPr>
+          <w:rFonts w:ascii="Times New Roman" w:hAnsi="Times New Roman" w:cs="Times New Roman"/>
+          <w:lang w:val="en-GB"/>
+        </w:rPr>
+        <w:t>Singkat</w:t>
+      </w:r>
+      <w:proofErr w:type="spellEnd"/>
+      <w:r>
+        <w:rPr>
+          <w:rFonts w:ascii="Times New Roman" w:hAnsi="Times New Roman" w:cs="Times New Roman"/>
+          <w:lang w:val="en-GB"/>
+        </w:rPr>
+        <w:t xml:space="preserve"> </w:t>
+      </w:r>
+      <w:proofErr w:type="gramStart"/>
+      <w:r>
+        <w:rPr>
+          <w:rFonts w:ascii="Times New Roman" w:hAnsi="Times New Roman" w:cs="Times New Roman"/>
+          <w:lang w:val="en-GB"/>
+        </w:rPr>
+        <w:t>Project :</w:t>
+      </w:r>
+      <w:proofErr w:type="gramEnd"/>
     </w:p>
     <w:p>
       <w:pPr>
@@ -365,12 +789,286 @@
           <w:lang w:val="en-GB"/>
         </w:rPr>
       </w:pPr>
-      <w:r>
-        <w:rPr>
-          <w:rFonts w:ascii="Times New Roman" w:hAnsi="Times New Roman" w:cs="Times New Roman"/>
-          <w:lang w:val="en-GB"/>
-        </w:rPr>
-        <w:t>SigerSync adalah aplikasi berbasis Service Oriented Architecture (SOA) yang menyajikan informasi mengenai destinasi wisata di Provinsi Lampung. Kategori Wisata : Wisata Alam, Wisata Budaya, dan Wisata Edukasi.</w:t>
+      <w:proofErr w:type="spellStart"/>
+      <w:r>
+        <w:rPr>
+          <w:rFonts w:ascii="Times New Roman" w:hAnsi="Times New Roman" w:cs="Times New Roman"/>
+          <w:lang w:val="en-GB"/>
+        </w:rPr>
+        <w:t>SigerSync</w:t>
+      </w:r>
+      <w:proofErr w:type="spellEnd"/>
+      <w:r>
+        <w:rPr>
+          <w:rFonts w:ascii="Times New Roman" w:hAnsi="Times New Roman" w:cs="Times New Roman"/>
+          <w:lang w:val="en-GB"/>
+        </w:rPr>
+        <w:t xml:space="preserve"> </w:t>
+      </w:r>
+      <w:proofErr w:type="spellStart"/>
+      <w:r>
+        <w:rPr>
+          <w:rFonts w:ascii="Times New Roman" w:hAnsi="Times New Roman" w:cs="Times New Roman"/>
+          <w:lang w:val="en-GB"/>
+        </w:rPr>
+        <w:t>adalah</w:t>
+      </w:r>
+      <w:proofErr w:type="spellEnd"/>
+      <w:r>
+        <w:rPr>
+          <w:rFonts w:ascii="Times New Roman" w:hAnsi="Times New Roman" w:cs="Times New Roman"/>
+          <w:lang w:val="en-GB"/>
+        </w:rPr>
+        <w:t xml:space="preserve"> </w:t>
+      </w:r>
+      <w:proofErr w:type="spellStart"/>
+      <w:r>
+        <w:rPr>
+          <w:rFonts w:ascii="Times New Roman" w:hAnsi="Times New Roman" w:cs="Times New Roman"/>
+          <w:lang w:val="en-GB"/>
+        </w:rPr>
+        <w:t>aplikasi</w:t>
+      </w:r>
+      <w:proofErr w:type="spellEnd"/>
+      <w:r>
+        <w:rPr>
+          <w:rFonts w:ascii="Times New Roman" w:hAnsi="Times New Roman" w:cs="Times New Roman"/>
+          <w:lang w:val="en-GB"/>
+        </w:rPr>
+        <w:t xml:space="preserve"> </w:t>
+      </w:r>
+      <w:proofErr w:type="spellStart"/>
+      <w:r>
+        <w:rPr>
+          <w:rFonts w:ascii="Times New Roman" w:hAnsi="Times New Roman" w:cs="Times New Roman"/>
+          <w:lang w:val="en-GB"/>
+        </w:rPr>
+        <w:t>berbasis</w:t>
+      </w:r>
+      <w:proofErr w:type="spellEnd"/>
+      <w:r>
+        <w:rPr>
+          <w:rFonts w:ascii="Times New Roman" w:hAnsi="Times New Roman" w:cs="Times New Roman"/>
+          <w:lang w:val="en-GB"/>
+        </w:rPr>
+        <w:t xml:space="preserve"> Service Oriented Architecture (SOA) yang </w:t>
+      </w:r>
+      <w:proofErr w:type="spellStart"/>
+      <w:r>
+        <w:rPr>
+          <w:rFonts w:ascii="Times New Roman" w:hAnsi="Times New Roman" w:cs="Times New Roman"/>
+          <w:lang w:val="en-GB"/>
+        </w:rPr>
+        <w:t>menyajikan</w:t>
+      </w:r>
+      <w:proofErr w:type="spellEnd"/>
+      <w:r>
+        <w:rPr>
+          <w:rFonts w:ascii="Times New Roman" w:hAnsi="Times New Roman" w:cs="Times New Roman"/>
+          <w:lang w:val="en-GB"/>
+        </w:rPr>
+        <w:t xml:space="preserve"> </w:t>
+      </w:r>
+      <w:proofErr w:type="spellStart"/>
+      <w:r>
+        <w:rPr>
+          <w:rFonts w:ascii="Times New Roman" w:hAnsi="Times New Roman" w:cs="Times New Roman"/>
+          <w:lang w:val="en-GB"/>
+        </w:rPr>
+        <w:t>informasi</w:t>
+      </w:r>
+      <w:proofErr w:type="spellEnd"/>
+      <w:r>
+        <w:rPr>
+          <w:rFonts w:ascii="Times New Roman" w:hAnsi="Times New Roman" w:cs="Times New Roman"/>
+          <w:lang w:val="en-GB"/>
+        </w:rPr>
+        <w:t xml:space="preserve"> </w:t>
+      </w:r>
+      <w:proofErr w:type="spellStart"/>
+      <w:r>
+        <w:rPr>
+          <w:rFonts w:ascii="Times New Roman" w:hAnsi="Times New Roman" w:cs="Times New Roman"/>
+          <w:lang w:val="en-GB"/>
+        </w:rPr>
+        <w:t>mengenai</w:t>
+      </w:r>
+      <w:proofErr w:type="spellEnd"/>
+      <w:r>
+        <w:rPr>
+          <w:rFonts w:ascii="Times New Roman" w:hAnsi="Times New Roman" w:cs="Times New Roman"/>
+          <w:lang w:val="en-GB"/>
+        </w:rPr>
+        <w:t xml:space="preserve"> </w:t>
+      </w:r>
+      <w:proofErr w:type="spellStart"/>
+      <w:r>
+        <w:rPr>
+          <w:rFonts w:ascii="Times New Roman" w:hAnsi="Times New Roman" w:cs="Times New Roman"/>
+          <w:lang w:val="en-GB"/>
+        </w:rPr>
+        <w:t>destinasi</w:t>
+      </w:r>
+      <w:proofErr w:type="spellEnd"/>
+      <w:r>
+        <w:rPr>
+          <w:rFonts w:ascii="Times New Roman" w:hAnsi="Times New Roman" w:cs="Times New Roman"/>
+          <w:lang w:val="en-GB"/>
+        </w:rPr>
+        <w:t xml:space="preserve"> </w:t>
+      </w:r>
+      <w:proofErr w:type="spellStart"/>
+      <w:r>
+        <w:rPr>
+          <w:rFonts w:ascii="Times New Roman" w:hAnsi="Times New Roman" w:cs="Times New Roman"/>
+          <w:lang w:val="en-GB"/>
+        </w:rPr>
+        <w:t>wisata</w:t>
+      </w:r>
+      <w:proofErr w:type="spellEnd"/>
+      <w:r>
+        <w:rPr>
+          <w:rFonts w:ascii="Times New Roman" w:hAnsi="Times New Roman" w:cs="Times New Roman"/>
+          <w:lang w:val="en-GB"/>
+        </w:rPr>
+        <w:t xml:space="preserve"> di </w:t>
+      </w:r>
+      <w:proofErr w:type="spellStart"/>
+      <w:r>
+        <w:rPr>
+          <w:rFonts w:ascii="Times New Roman" w:hAnsi="Times New Roman" w:cs="Times New Roman"/>
+          <w:lang w:val="en-GB"/>
+        </w:rPr>
+        <w:t>Provinsi</w:t>
+      </w:r>
+      <w:proofErr w:type="spellEnd"/>
+      <w:r>
+        <w:rPr>
+          <w:rFonts w:ascii="Times New Roman" w:hAnsi="Times New Roman" w:cs="Times New Roman"/>
+          <w:lang w:val="en-GB"/>
+        </w:rPr>
+        <w:t xml:space="preserve"> Lampung. </w:t>
+      </w:r>
+      <w:proofErr w:type="spellStart"/>
+      <w:r>
+        <w:rPr>
+          <w:rFonts w:ascii="Times New Roman" w:hAnsi="Times New Roman" w:cs="Times New Roman"/>
+          <w:lang w:val="en-GB"/>
+        </w:rPr>
+        <w:t>Kategori</w:t>
+      </w:r>
+      <w:proofErr w:type="spellEnd"/>
+      <w:r>
+        <w:rPr>
+          <w:rFonts w:ascii="Times New Roman" w:hAnsi="Times New Roman" w:cs="Times New Roman"/>
+          <w:lang w:val="en-GB"/>
+        </w:rPr>
+        <w:t xml:space="preserve"> </w:t>
+      </w:r>
+      <w:proofErr w:type="spellStart"/>
+      <w:proofErr w:type="gramStart"/>
+      <w:r>
+        <w:rPr>
+          <w:rFonts w:ascii="Times New Roman" w:hAnsi="Times New Roman" w:cs="Times New Roman"/>
+          <w:lang w:val="en-GB"/>
+        </w:rPr>
+        <w:t>Wisata</w:t>
+      </w:r>
+      <w:proofErr w:type="spellEnd"/>
+      <w:r>
+        <w:rPr>
+          <w:rFonts w:ascii="Times New Roman" w:hAnsi="Times New Roman" w:cs="Times New Roman"/>
+          <w:lang w:val="en-GB"/>
+        </w:rPr>
+        <w:t xml:space="preserve"> :</w:t>
+      </w:r>
+      <w:proofErr w:type="gramEnd"/>
+      <w:r>
+        <w:rPr>
+          <w:rFonts w:ascii="Times New Roman" w:hAnsi="Times New Roman" w:cs="Times New Roman"/>
+          <w:lang w:val="en-GB"/>
+        </w:rPr>
+        <w:t xml:space="preserve"> </w:t>
+      </w:r>
+      <w:proofErr w:type="spellStart"/>
+      <w:r>
+        <w:rPr>
+          <w:rFonts w:ascii="Times New Roman" w:hAnsi="Times New Roman" w:cs="Times New Roman"/>
+          <w:lang w:val="en-GB"/>
+        </w:rPr>
+        <w:t>Wisata</w:t>
+      </w:r>
+      <w:proofErr w:type="spellEnd"/>
+      <w:r>
+        <w:rPr>
+          <w:rFonts w:ascii="Times New Roman" w:hAnsi="Times New Roman" w:cs="Times New Roman"/>
+          <w:lang w:val="en-GB"/>
+        </w:rPr>
+        <w:t xml:space="preserve"> Alam, </w:t>
+      </w:r>
+      <w:proofErr w:type="spellStart"/>
+      <w:r>
+        <w:rPr>
+          <w:rFonts w:ascii="Times New Roman" w:hAnsi="Times New Roman" w:cs="Times New Roman"/>
+          <w:lang w:val="en-GB"/>
+        </w:rPr>
+        <w:t>Wisata</w:t>
+      </w:r>
+      <w:proofErr w:type="spellEnd"/>
+      <w:r>
+        <w:rPr>
+          <w:rFonts w:ascii="Times New Roman" w:hAnsi="Times New Roman" w:cs="Times New Roman"/>
+          <w:lang w:val="en-GB"/>
+        </w:rPr>
+        <w:t xml:space="preserve"> </w:t>
+      </w:r>
+      <w:proofErr w:type="spellStart"/>
+      <w:r>
+        <w:rPr>
+          <w:rFonts w:ascii="Times New Roman" w:hAnsi="Times New Roman" w:cs="Times New Roman"/>
+          <w:lang w:val="en-GB"/>
+        </w:rPr>
+        <w:t>Budaya</w:t>
+      </w:r>
+      <w:proofErr w:type="spellEnd"/>
+      <w:r>
+        <w:rPr>
+          <w:rFonts w:ascii="Times New Roman" w:hAnsi="Times New Roman" w:cs="Times New Roman"/>
+          <w:lang w:val="en-GB"/>
+        </w:rPr>
+        <w:t xml:space="preserve">, dan </w:t>
+      </w:r>
+      <w:proofErr w:type="spellStart"/>
+      <w:r>
+        <w:rPr>
+          <w:rFonts w:ascii="Times New Roman" w:hAnsi="Times New Roman" w:cs="Times New Roman"/>
+          <w:lang w:val="en-GB"/>
+        </w:rPr>
+        <w:t>Wisata</w:t>
+      </w:r>
+      <w:proofErr w:type="spellEnd"/>
+      <w:r>
+        <w:rPr>
+          <w:rFonts w:ascii="Times New Roman" w:hAnsi="Times New Roman" w:cs="Times New Roman"/>
+          <w:lang w:val="en-GB"/>
+        </w:rPr>
+        <w:t xml:space="preserve"> </w:t>
+      </w:r>
+      <w:proofErr w:type="spellStart"/>
+      <w:r>
+        <w:rPr>
+          <w:rFonts w:ascii="Times New Roman" w:hAnsi="Times New Roman" w:cs="Times New Roman"/>
+          <w:lang w:val="en-GB"/>
+        </w:rPr>
+        <w:t>Edukasi</w:t>
+      </w:r>
+      <w:proofErr w:type="spellEnd"/>
+      <w:r>
+        <w:rPr>
+          <w:rFonts w:ascii="Times New Roman" w:hAnsi="Times New Roman" w:cs="Times New Roman"/>
+          <w:lang w:val="en-GB"/>
+        </w:rPr>
+        <w:t>.</w:t>
       </w:r>
     </w:p>
     <w:p>
@@ -462,8 +1160,33 @@
           <w:lang w:val="en-GB"/>
         </w:rPr>
         <w:lastRenderedPageBreak/>
-        <w:t>2. Membuat Folder Dokumentasi</w:t>
-      </w:r>
+        <w:t xml:space="preserve">2. </w:t>
+      </w:r>
+      <w:proofErr w:type="spellStart"/>
+      <w:r>
+        <w:rPr>
+          <w:rFonts w:ascii="Times New Roman" w:hAnsi="Times New Roman" w:cs="Times New Roman"/>
+          <w:lang w:val="en-GB"/>
+        </w:rPr>
+        <w:t>Membuat</w:t>
+      </w:r>
+      <w:proofErr w:type="spellEnd"/>
+      <w:r>
+        <w:rPr>
+          <w:rFonts w:ascii="Times New Roman" w:hAnsi="Times New Roman" w:cs="Times New Roman"/>
+          <w:lang w:val="en-GB"/>
+        </w:rPr>
+        <w:t xml:space="preserve"> Folder </w:t>
+      </w:r>
+      <w:proofErr w:type="spellStart"/>
+      <w:r>
+        <w:rPr>
+          <w:rFonts w:ascii="Times New Roman" w:hAnsi="Times New Roman" w:cs="Times New Roman"/>
+          <w:lang w:val="en-GB"/>
+        </w:rPr>
+        <w:t>Dokumentasi</w:t>
+      </w:r>
+      <w:proofErr w:type="spellEnd"/>
     </w:p>
     <w:p>
       <w:pPr>
@@ -537,14 +1260,231 @@
           <w:rFonts w:ascii="Times New Roman" w:hAnsi="Times New Roman" w:cs="Times New Roman"/>
           <w:lang w:val="en-GB"/>
         </w:rPr>
-        <w:t xml:space="preserve">Langkah pertama membuat file dokumetasi yang berguna untuk mengetik proses dalam setiap tahap dalam mengerjakan project ini. Berisi </w:t>
-      </w:r>
-      <w:r>
-        <w:rPr>
-          <w:rFonts w:ascii="Times New Roman" w:hAnsi="Times New Roman" w:cs="Times New Roman"/>
-          <w:lang w:val="en-GB"/>
-        </w:rPr>
-        <w:t xml:space="preserve">gambar </w:t>
+        <w:t xml:space="preserve">Langkah </w:t>
+      </w:r>
+      <w:proofErr w:type="spellStart"/>
+      <w:r>
+        <w:rPr>
+          <w:rFonts w:ascii="Times New Roman" w:hAnsi="Times New Roman" w:cs="Times New Roman"/>
+          <w:lang w:val="en-GB"/>
+        </w:rPr>
+        <w:t>pertama</w:t>
+      </w:r>
+      <w:proofErr w:type="spellEnd"/>
+      <w:r>
+        <w:rPr>
+          <w:rFonts w:ascii="Times New Roman" w:hAnsi="Times New Roman" w:cs="Times New Roman"/>
+          <w:lang w:val="en-GB"/>
+        </w:rPr>
+        <w:t xml:space="preserve"> </w:t>
+      </w:r>
+      <w:proofErr w:type="spellStart"/>
+      <w:r>
+        <w:rPr>
+          <w:rFonts w:ascii="Times New Roman" w:hAnsi="Times New Roman" w:cs="Times New Roman"/>
+          <w:lang w:val="en-GB"/>
+        </w:rPr>
+        <w:t>membuat</w:t>
+      </w:r>
+      <w:proofErr w:type="spellEnd"/>
+      <w:r>
+        <w:rPr>
+          <w:rFonts w:ascii="Times New Roman" w:hAnsi="Times New Roman" w:cs="Times New Roman"/>
+          <w:lang w:val="en-GB"/>
+        </w:rPr>
+        <w:t xml:space="preserve"> file </w:t>
+      </w:r>
+      <w:proofErr w:type="spellStart"/>
+      <w:r>
+        <w:rPr>
+          <w:rFonts w:ascii="Times New Roman" w:hAnsi="Times New Roman" w:cs="Times New Roman"/>
+          <w:lang w:val="en-GB"/>
+        </w:rPr>
+        <w:t>dokumetasi</w:t>
+      </w:r>
+      <w:proofErr w:type="spellEnd"/>
+      <w:r>
+        <w:rPr>
+          <w:rFonts w:ascii="Times New Roman" w:hAnsi="Times New Roman" w:cs="Times New Roman"/>
+          <w:lang w:val="en-GB"/>
+        </w:rPr>
+        <w:t xml:space="preserve"> yang </w:t>
+      </w:r>
+      <w:proofErr w:type="spellStart"/>
+      <w:r>
+        <w:rPr>
+          <w:rFonts w:ascii="Times New Roman" w:hAnsi="Times New Roman" w:cs="Times New Roman"/>
+          <w:lang w:val="en-GB"/>
+        </w:rPr>
+        <w:t>berguna</w:t>
+      </w:r>
+      <w:proofErr w:type="spellEnd"/>
+      <w:r>
+        <w:rPr>
+          <w:rFonts w:ascii="Times New Roman" w:hAnsi="Times New Roman" w:cs="Times New Roman"/>
+          <w:lang w:val="en-GB"/>
+        </w:rPr>
+        <w:t xml:space="preserve"> </w:t>
+      </w:r>
+      <w:proofErr w:type="spellStart"/>
+      <w:r>
+        <w:rPr>
+          <w:rFonts w:ascii="Times New Roman" w:hAnsi="Times New Roman" w:cs="Times New Roman"/>
+          <w:lang w:val="en-GB"/>
+        </w:rPr>
+        <w:t>untuk</w:t>
+      </w:r>
+      <w:proofErr w:type="spellEnd"/>
+      <w:r>
+        <w:rPr>
+          <w:rFonts w:ascii="Times New Roman" w:hAnsi="Times New Roman" w:cs="Times New Roman"/>
+          <w:lang w:val="en-GB"/>
+        </w:rPr>
+        <w:t xml:space="preserve"> </w:t>
+      </w:r>
+      <w:proofErr w:type="spellStart"/>
+      <w:r>
+        <w:rPr>
+          <w:rFonts w:ascii="Times New Roman" w:hAnsi="Times New Roman" w:cs="Times New Roman"/>
+          <w:lang w:val="en-GB"/>
+        </w:rPr>
+        <w:t>mengetik</w:t>
+      </w:r>
+      <w:proofErr w:type="spellEnd"/>
+      <w:r>
+        <w:rPr>
+          <w:rFonts w:ascii="Times New Roman" w:hAnsi="Times New Roman" w:cs="Times New Roman"/>
+          <w:lang w:val="en-GB"/>
+        </w:rPr>
+        <w:t xml:space="preserve"> proses </w:t>
+      </w:r>
+      <w:proofErr w:type="spellStart"/>
+      <w:r>
+        <w:rPr>
+          <w:rFonts w:ascii="Times New Roman" w:hAnsi="Times New Roman" w:cs="Times New Roman"/>
+          <w:lang w:val="en-GB"/>
+        </w:rPr>
+        <w:t>dalam</w:t>
+      </w:r>
+      <w:proofErr w:type="spellEnd"/>
+      <w:r>
+        <w:rPr>
+          <w:rFonts w:ascii="Times New Roman" w:hAnsi="Times New Roman" w:cs="Times New Roman"/>
+          <w:lang w:val="en-GB"/>
+        </w:rPr>
+        <w:t xml:space="preserve"> </w:t>
+      </w:r>
+      <w:proofErr w:type="spellStart"/>
+      <w:r>
+        <w:rPr>
+          <w:rFonts w:ascii="Times New Roman" w:hAnsi="Times New Roman" w:cs="Times New Roman"/>
+          <w:lang w:val="en-GB"/>
+        </w:rPr>
+        <w:t>setiap</w:t>
+      </w:r>
+      <w:proofErr w:type="spellEnd"/>
+      <w:r>
+        <w:rPr>
+          <w:rFonts w:ascii="Times New Roman" w:hAnsi="Times New Roman" w:cs="Times New Roman"/>
+          <w:lang w:val="en-GB"/>
+        </w:rPr>
+        <w:t xml:space="preserve"> </w:t>
+      </w:r>
+      <w:proofErr w:type="spellStart"/>
+      <w:r>
+        <w:rPr>
+          <w:rFonts w:ascii="Times New Roman" w:hAnsi="Times New Roman" w:cs="Times New Roman"/>
+          <w:lang w:val="en-GB"/>
+        </w:rPr>
+        <w:t>tahap</w:t>
+      </w:r>
+      <w:proofErr w:type="spellEnd"/>
+      <w:r>
+        <w:rPr>
+          <w:rFonts w:ascii="Times New Roman" w:hAnsi="Times New Roman" w:cs="Times New Roman"/>
+          <w:lang w:val="en-GB"/>
+        </w:rPr>
+        <w:t xml:space="preserve"> </w:t>
+      </w:r>
+      <w:proofErr w:type="spellStart"/>
+      <w:r>
+        <w:rPr>
+          <w:rFonts w:ascii="Times New Roman" w:hAnsi="Times New Roman" w:cs="Times New Roman"/>
+          <w:lang w:val="en-GB"/>
+        </w:rPr>
+        <w:t>dalam</w:t>
+      </w:r>
+      <w:proofErr w:type="spellEnd"/>
+      <w:r>
+        <w:rPr>
+          <w:rFonts w:ascii="Times New Roman" w:hAnsi="Times New Roman" w:cs="Times New Roman"/>
+          <w:lang w:val="en-GB"/>
+        </w:rPr>
+        <w:t xml:space="preserve"> </w:t>
+      </w:r>
+      <w:proofErr w:type="spellStart"/>
+      <w:r>
+        <w:rPr>
+          <w:rFonts w:ascii="Times New Roman" w:hAnsi="Times New Roman" w:cs="Times New Roman"/>
+          <w:lang w:val="en-GB"/>
+        </w:rPr>
+        <w:t>mengerjakan</w:t>
+      </w:r>
+      <w:proofErr w:type="spellEnd"/>
+      <w:r>
+        <w:rPr>
+          <w:rFonts w:ascii="Times New Roman" w:hAnsi="Times New Roman" w:cs="Times New Roman"/>
+          <w:lang w:val="en-GB"/>
+        </w:rPr>
+        <w:t xml:space="preserve"> project </w:t>
+      </w:r>
+      <w:proofErr w:type="spellStart"/>
+      <w:r>
+        <w:rPr>
+          <w:rFonts w:ascii="Times New Roman" w:hAnsi="Times New Roman" w:cs="Times New Roman"/>
+          <w:lang w:val="en-GB"/>
+        </w:rPr>
+        <w:t>ini</w:t>
+      </w:r>
+      <w:proofErr w:type="spellEnd"/>
+      <w:r>
+        <w:rPr>
+          <w:rFonts w:ascii="Times New Roman" w:hAnsi="Times New Roman" w:cs="Times New Roman"/>
+          <w:lang w:val="en-GB"/>
+        </w:rPr>
+        <w:t xml:space="preserve">. </w:t>
+      </w:r>
+      <w:proofErr w:type="spellStart"/>
+      <w:r>
+        <w:rPr>
+          <w:rFonts w:ascii="Times New Roman" w:hAnsi="Times New Roman" w:cs="Times New Roman"/>
+          <w:lang w:val="en-GB"/>
+        </w:rPr>
+        <w:t>Berisi</w:t>
+      </w:r>
+      <w:proofErr w:type="spellEnd"/>
+      <w:r>
+        <w:rPr>
+          <w:rFonts w:ascii="Times New Roman" w:hAnsi="Times New Roman" w:cs="Times New Roman"/>
+          <w:lang w:val="en-GB"/>
+        </w:rPr>
+        <w:t xml:space="preserve"> </w:t>
+      </w:r>
+      <w:proofErr w:type="spellStart"/>
+      <w:r>
+        <w:rPr>
+          <w:rFonts w:ascii="Times New Roman" w:hAnsi="Times New Roman" w:cs="Times New Roman"/>
+          <w:lang w:val="en-GB"/>
+        </w:rPr>
+        <w:t>gambar</w:t>
+      </w:r>
+      <w:proofErr w:type="spellEnd"/>
+      <w:r>
+        <w:rPr>
+          <w:rFonts w:ascii="Times New Roman" w:hAnsi="Times New Roman" w:cs="Times New Roman"/>
+          <w:lang w:val="en-GB"/>
+        </w:rPr>
+        <w:t xml:space="preserve"> </w:t>
       </w:r>
       <w:r>
         <w:rPr>
@@ -558,7 +1498,55 @@
           <w:rFonts w:ascii="Times New Roman" w:hAnsi="Times New Roman" w:cs="Times New Roman"/>
           <w:lang w:val="en-GB"/>
         </w:rPr>
-        <w:t xml:space="preserve"> dan penjelasan kegiatan yang dilakukan.</w:t>
+        <w:t xml:space="preserve"> dan </w:t>
+      </w:r>
+      <w:proofErr w:type="spellStart"/>
+      <w:r>
+        <w:rPr>
+          <w:rFonts w:ascii="Times New Roman" w:hAnsi="Times New Roman" w:cs="Times New Roman"/>
+          <w:lang w:val="en-GB"/>
+        </w:rPr>
+        <w:t>penjelasan</w:t>
+      </w:r>
+      <w:proofErr w:type="spellEnd"/>
+      <w:r>
+        <w:rPr>
+          <w:rFonts w:ascii="Times New Roman" w:hAnsi="Times New Roman" w:cs="Times New Roman"/>
+          <w:lang w:val="en-GB"/>
+        </w:rPr>
+        <w:t xml:space="preserve"> </w:t>
+      </w:r>
+      <w:proofErr w:type="spellStart"/>
+      <w:r>
+        <w:rPr>
+          <w:rFonts w:ascii="Times New Roman" w:hAnsi="Times New Roman" w:cs="Times New Roman"/>
+          <w:lang w:val="en-GB"/>
+        </w:rPr>
+        <w:t>kegiatan</w:t>
+      </w:r>
+      <w:proofErr w:type="spellEnd"/>
+      <w:r>
+        <w:rPr>
+          <w:rFonts w:ascii="Times New Roman" w:hAnsi="Times New Roman" w:cs="Times New Roman"/>
+          <w:lang w:val="en-GB"/>
+        </w:rPr>
+        <w:t xml:space="preserve"> yang </w:t>
+      </w:r>
+      <w:proofErr w:type="spellStart"/>
+      <w:r>
+        <w:rPr>
+          <w:rFonts w:ascii="Times New Roman" w:hAnsi="Times New Roman" w:cs="Times New Roman"/>
+          <w:lang w:val="en-GB"/>
+        </w:rPr>
+        <w:t>dilakukan</w:t>
+      </w:r>
+      <w:proofErr w:type="spellEnd"/>
+      <w:r>
+        <w:rPr>
+          <w:rFonts w:ascii="Times New Roman" w:hAnsi="Times New Roman" w:cs="Times New Roman"/>
+          <w:lang w:val="en-GB"/>
+        </w:rPr>
+        <w:t>.</w:t>
       </w:r>
     </w:p>
     <w:p>
@@ -583,8 +1571,49 @@
           <w:rFonts w:ascii="Times New Roman" w:hAnsi="Times New Roman" w:cs="Times New Roman"/>
           <w:lang w:val="en-GB"/>
         </w:rPr>
-        <w:t>3. Membuat dokumentasi awal</w:t>
-      </w:r>
+        <w:t xml:space="preserve">3. </w:t>
+      </w:r>
+      <w:proofErr w:type="spellStart"/>
+      <w:r>
+        <w:rPr>
+          <w:rFonts w:ascii="Times New Roman" w:hAnsi="Times New Roman" w:cs="Times New Roman"/>
+          <w:lang w:val="en-GB"/>
+        </w:rPr>
+        <w:t>Membuat</w:t>
+      </w:r>
+      <w:proofErr w:type="spellEnd"/>
+      <w:r>
+        <w:rPr>
+          <w:rFonts w:ascii="Times New Roman" w:hAnsi="Times New Roman" w:cs="Times New Roman"/>
+          <w:lang w:val="en-GB"/>
+        </w:rPr>
+        <w:t xml:space="preserve"> </w:t>
+      </w:r>
+      <w:proofErr w:type="spellStart"/>
+      <w:r>
+        <w:rPr>
+          <w:rFonts w:ascii="Times New Roman" w:hAnsi="Times New Roman" w:cs="Times New Roman"/>
+          <w:lang w:val="en-GB"/>
+        </w:rPr>
+        <w:t>dokumentasi</w:t>
+      </w:r>
+      <w:proofErr w:type="spellEnd"/>
+      <w:r>
+        <w:rPr>
+          <w:rFonts w:ascii="Times New Roman" w:hAnsi="Times New Roman" w:cs="Times New Roman"/>
+          <w:lang w:val="en-GB"/>
+        </w:rPr>
+        <w:t xml:space="preserve"> </w:t>
+      </w:r>
+      <w:proofErr w:type="spellStart"/>
+      <w:r>
+        <w:rPr>
+          <w:rFonts w:ascii="Times New Roman" w:hAnsi="Times New Roman" w:cs="Times New Roman"/>
+          <w:lang w:val="en-GB"/>
+        </w:rPr>
+        <w:t>awal</w:t>
+      </w:r>
+      <w:proofErr w:type="spellEnd"/>
     </w:p>
     <w:p>
       <w:pPr>
@@ -643,12 +1672,1046 @@
           <w:lang w:val="en-GB"/>
         </w:rPr>
       </w:pPr>
-      <w:r>
-        <w:rPr>
-          <w:rFonts w:ascii="Times New Roman" w:hAnsi="Times New Roman" w:cs="Times New Roman"/>
-          <w:lang w:val="en-GB"/>
-        </w:rPr>
-        <w:t>Dokumentasi awal project untuk Gambaran awal tentang project ini, sehingga siapa saja yang melihat bisa mengerti dan memahami tentang tentang project ini.</w:t>
+      <w:proofErr w:type="spellStart"/>
+      <w:r>
+        <w:rPr>
+          <w:rFonts w:ascii="Times New Roman" w:hAnsi="Times New Roman" w:cs="Times New Roman"/>
+          <w:lang w:val="en-GB"/>
+        </w:rPr>
+        <w:t>Dokumentasi</w:t>
+      </w:r>
+      <w:proofErr w:type="spellEnd"/>
+      <w:r>
+        <w:rPr>
+          <w:rFonts w:ascii="Times New Roman" w:hAnsi="Times New Roman" w:cs="Times New Roman"/>
+          <w:lang w:val="en-GB"/>
+        </w:rPr>
+        <w:t xml:space="preserve"> </w:t>
+      </w:r>
+      <w:proofErr w:type="spellStart"/>
+      <w:r>
+        <w:rPr>
+          <w:rFonts w:ascii="Times New Roman" w:hAnsi="Times New Roman" w:cs="Times New Roman"/>
+          <w:lang w:val="en-GB"/>
+        </w:rPr>
+        <w:t>awal</w:t>
+      </w:r>
+      <w:proofErr w:type="spellEnd"/>
+      <w:r>
+        <w:rPr>
+          <w:rFonts w:ascii="Times New Roman" w:hAnsi="Times New Roman" w:cs="Times New Roman"/>
+          <w:lang w:val="en-GB"/>
+        </w:rPr>
+        <w:t xml:space="preserve"> project </w:t>
+      </w:r>
+      <w:proofErr w:type="spellStart"/>
+      <w:r>
+        <w:rPr>
+          <w:rFonts w:ascii="Times New Roman" w:hAnsi="Times New Roman" w:cs="Times New Roman"/>
+          <w:lang w:val="en-GB"/>
+        </w:rPr>
+        <w:t>untuk</w:t>
+      </w:r>
+      <w:proofErr w:type="spellEnd"/>
+      <w:r>
+        <w:rPr>
+          <w:rFonts w:ascii="Times New Roman" w:hAnsi="Times New Roman" w:cs="Times New Roman"/>
+          <w:lang w:val="en-GB"/>
+        </w:rPr>
+        <w:t xml:space="preserve"> Gambaran </w:t>
+      </w:r>
+      <w:proofErr w:type="spellStart"/>
+      <w:r>
+        <w:rPr>
+          <w:rFonts w:ascii="Times New Roman" w:hAnsi="Times New Roman" w:cs="Times New Roman"/>
+          <w:lang w:val="en-GB"/>
+        </w:rPr>
+        <w:t>awal</w:t>
+      </w:r>
+      <w:proofErr w:type="spellEnd"/>
+      <w:r>
+        <w:rPr>
+          <w:rFonts w:ascii="Times New Roman" w:hAnsi="Times New Roman" w:cs="Times New Roman"/>
+          <w:lang w:val="en-GB"/>
+        </w:rPr>
+        <w:t xml:space="preserve"> </w:t>
+      </w:r>
+      <w:proofErr w:type="spellStart"/>
+      <w:r>
+        <w:rPr>
+          <w:rFonts w:ascii="Times New Roman" w:hAnsi="Times New Roman" w:cs="Times New Roman"/>
+          <w:lang w:val="en-GB"/>
+        </w:rPr>
+        <w:t>tentang</w:t>
+      </w:r>
+      <w:proofErr w:type="spellEnd"/>
+      <w:r>
+        <w:rPr>
+          <w:rFonts w:ascii="Times New Roman" w:hAnsi="Times New Roman" w:cs="Times New Roman"/>
+          <w:lang w:val="en-GB"/>
+        </w:rPr>
+        <w:t xml:space="preserve"> project </w:t>
+      </w:r>
+      <w:proofErr w:type="spellStart"/>
+      <w:r>
+        <w:rPr>
+          <w:rFonts w:ascii="Times New Roman" w:hAnsi="Times New Roman" w:cs="Times New Roman"/>
+          <w:lang w:val="en-GB"/>
+        </w:rPr>
+        <w:t>ini</w:t>
+      </w:r>
+      <w:proofErr w:type="spellEnd"/>
+      <w:r>
+        <w:rPr>
+          <w:rFonts w:ascii="Times New Roman" w:hAnsi="Times New Roman" w:cs="Times New Roman"/>
+          <w:lang w:val="en-GB"/>
+        </w:rPr>
+        <w:t xml:space="preserve">, </w:t>
+      </w:r>
+      <w:proofErr w:type="spellStart"/>
+      <w:r>
+        <w:rPr>
+          <w:rFonts w:ascii="Times New Roman" w:hAnsi="Times New Roman" w:cs="Times New Roman"/>
+          <w:lang w:val="en-GB"/>
+        </w:rPr>
+        <w:t>sehingga</w:t>
+      </w:r>
+      <w:proofErr w:type="spellEnd"/>
+      <w:r>
+        <w:rPr>
+          <w:rFonts w:ascii="Times New Roman" w:hAnsi="Times New Roman" w:cs="Times New Roman"/>
+          <w:lang w:val="en-GB"/>
+        </w:rPr>
+        <w:t xml:space="preserve"> </w:t>
+      </w:r>
+      <w:proofErr w:type="spellStart"/>
+      <w:r>
+        <w:rPr>
+          <w:rFonts w:ascii="Times New Roman" w:hAnsi="Times New Roman" w:cs="Times New Roman"/>
+          <w:lang w:val="en-GB"/>
+        </w:rPr>
+        <w:t>siapa</w:t>
+      </w:r>
+      <w:proofErr w:type="spellEnd"/>
+      <w:r>
+        <w:rPr>
+          <w:rFonts w:ascii="Times New Roman" w:hAnsi="Times New Roman" w:cs="Times New Roman"/>
+          <w:lang w:val="en-GB"/>
+        </w:rPr>
+        <w:t xml:space="preserve"> </w:t>
+      </w:r>
+      <w:proofErr w:type="spellStart"/>
+      <w:r>
+        <w:rPr>
+          <w:rFonts w:ascii="Times New Roman" w:hAnsi="Times New Roman" w:cs="Times New Roman"/>
+          <w:lang w:val="en-GB"/>
+        </w:rPr>
+        <w:t>saja</w:t>
+      </w:r>
+      <w:proofErr w:type="spellEnd"/>
+      <w:r>
+        <w:rPr>
+          <w:rFonts w:ascii="Times New Roman" w:hAnsi="Times New Roman" w:cs="Times New Roman"/>
+          <w:lang w:val="en-GB"/>
+        </w:rPr>
+        <w:t xml:space="preserve"> yang </w:t>
+      </w:r>
+      <w:proofErr w:type="spellStart"/>
+      <w:r>
+        <w:rPr>
+          <w:rFonts w:ascii="Times New Roman" w:hAnsi="Times New Roman" w:cs="Times New Roman"/>
+          <w:lang w:val="en-GB"/>
+        </w:rPr>
+        <w:t>melihat</w:t>
+      </w:r>
+      <w:proofErr w:type="spellEnd"/>
+      <w:r>
+        <w:rPr>
+          <w:rFonts w:ascii="Times New Roman" w:hAnsi="Times New Roman" w:cs="Times New Roman"/>
+          <w:lang w:val="en-GB"/>
+        </w:rPr>
+        <w:t xml:space="preserve"> </w:t>
+      </w:r>
+      <w:proofErr w:type="spellStart"/>
+      <w:r>
+        <w:rPr>
+          <w:rFonts w:ascii="Times New Roman" w:hAnsi="Times New Roman" w:cs="Times New Roman"/>
+          <w:lang w:val="en-GB"/>
+        </w:rPr>
+        <w:t>bisa</w:t>
+      </w:r>
+      <w:proofErr w:type="spellEnd"/>
+      <w:r>
+        <w:rPr>
+          <w:rFonts w:ascii="Times New Roman" w:hAnsi="Times New Roman" w:cs="Times New Roman"/>
+          <w:lang w:val="en-GB"/>
+        </w:rPr>
+        <w:t xml:space="preserve"> </w:t>
+      </w:r>
+      <w:proofErr w:type="spellStart"/>
+      <w:r>
+        <w:rPr>
+          <w:rFonts w:ascii="Times New Roman" w:hAnsi="Times New Roman" w:cs="Times New Roman"/>
+          <w:lang w:val="en-GB"/>
+        </w:rPr>
+        <w:t>mengerti</w:t>
+      </w:r>
+      <w:proofErr w:type="spellEnd"/>
+      <w:r>
+        <w:rPr>
+          <w:rFonts w:ascii="Times New Roman" w:hAnsi="Times New Roman" w:cs="Times New Roman"/>
+          <w:lang w:val="en-GB"/>
+        </w:rPr>
+        <w:t xml:space="preserve"> dan </w:t>
+      </w:r>
+      <w:proofErr w:type="spellStart"/>
+      <w:r>
+        <w:rPr>
+          <w:rFonts w:ascii="Times New Roman" w:hAnsi="Times New Roman" w:cs="Times New Roman"/>
+          <w:lang w:val="en-GB"/>
+        </w:rPr>
+        <w:t>memahami</w:t>
+      </w:r>
+      <w:proofErr w:type="spellEnd"/>
+      <w:r>
+        <w:rPr>
+          <w:rFonts w:ascii="Times New Roman" w:hAnsi="Times New Roman" w:cs="Times New Roman"/>
+          <w:lang w:val="en-GB"/>
+        </w:rPr>
+        <w:t xml:space="preserve"> </w:t>
+      </w:r>
+      <w:proofErr w:type="spellStart"/>
+      <w:r>
+        <w:rPr>
+          <w:rFonts w:ascii="Times New Roman" w:hAnsi="Times New Roman" w:cs="Times New Roman"/>
+          <w:lang w:val="en-GB"/>
+        </w:rPr>
+        <w:t>tentang</w:t>
+      </w:r>
+      <w:proofErr w:type="spellEnd"/>
+      <w:r>
+        <w:rPr>
+          <w:rFonts w:ascii="Times New Roman" w:hAnsi="Times New Roman" w:cs="Times New Roman"/>
+          <w:lang w:val="en-GB"/>
+        </w:rPr>
+        <w:t xml:space="preserve"> </w:t>
+      </w:r>
+      <w:proofErr w:type="spellStart"/>
+      <w:r>
+        <w:rPr>
+          <w:rFonts w:ascii="Times New Roman" w:hAnsi="Times New Roman" w:cs="Times New Roman"/>
+          <w:lang w:val="en-GB"/>
+        </w:rPr>
+        <w:t>tentang</w:t>
+      </w:r>
+      <w:proofErr w:type="spellEnd"/>
+      <w:r>
+        <w:rPr>
+          <w:rFonts w:ascii="Times New Roman" w:hAnsi="Times New Roman" w:cs="Times New Roman"/>
+          <w:lang w:val="en-GB"/>
+        </w:rPr>
+        <w:t xml:space="preserve"> project </w:t>
+      </w:r>
+      <w:proofErr w:type="spellStart"/>
+      <w:r>
+        <w:rPr>
+          <w:rFonts w:ascii="Times New Roman" w:hAnsi="Times New Roman" w:cs="Times New Roman"/>
+          <w:lang w:val="en-GB"/>
+        </w:rPr>
+        <w:t>ini</w:t>
+      </w:r>
+      <w:proofErr w:type="spellEnd"/>
+      <w:r>
+        <w:rPr>
+          <w:rFonts w:ascii="Times New Roman" w:hAnsi="Times New Roman" w:cs="Times New Roman"/>
+          <w:lang w:val="en-GB"/>
+        </w:rPr>
+        <w:t>.</w:t>
+      </w:r>
+    </w:p>
+    <w:p>
+      <w:pPr>
+        <w:contextualSpacing/>
+        <w:rPr>
+          <w:rFonts w:ascii="Times New Roman" w:hAnsi="Times New Roman" w:cs="Times New Roman"/>
+          <w:lang w:val="en-GB"/>
+        </w:rPr>
+      </w:pPr>
+    </w:p>
+    <w:p>
+      <w:pPr>
+        <w:contextualSpacing/>
+        <w:rPr>
+          <w:rFonts w:ascii="Times New Roman" w:hAnsi="Times New Roman" w:cs="Times New Roman"/>
+          <w:lang w:val="en-GB"/>
+        </w:rPr>
+      </w:pPr>
+    </w:p>
+    <w:p>
+      <w:pPr>
+        <w:contextualSpacing/>
+        <w:rPr>
+          <w:rFonts w:ascii="Times New Roman" w:hAnsi="Times New Roman" w:cs="Times New Roman"/>
+          <w:lang w:val="en-GB"/>
+        </w:rPr>
+      </w:pPr>
+      <w:r>
+        <w:rPr>
+          <w:rFonts w:ascii="Times New Roman" w:hAnsi="Times New Roman" w:cs="Times New Roman"/>
+          <w:lang w:val="en-GB"/>
+        </w:rPr>
+        <w:lastRenderedPageBreak/>
+        <w:t xml:space="preserve">4. </w:t>
+      </w:r>
+      <w:proofErr w:type="spellStart"/>
+      <w:r>
+        <w:rPr>
+          <w:rFonts w:ascii="Times New Roman" w:hAnsi="Times New Roman" w:cs="Times New Roman"/>
+          <w:lang w:val="en-GB"/>
+        </w:rPr>
+        <w:t>Membuat</w:t>
+      </w:r>
+      <w:proofErr w:type="spellEnd"/>
+      <w:r>
+        <w:rPr>
+          <w:rFonts w:ascii="Times New Roman" w:hAnsi="Times New Roman" w:cs="Times New Roman"/>
+          <w:lang w:val="en-GB"/>
+        </w:rPr>
+        <w:t xml:space="preserve"> </w:t>
+      </w:r>
+      <w:proofErr w:type="gramStart"/>
+      <w:r>
+        <w:rPr>
+          <w:rFonts w:ascii="Times New Roman" w:hAnsi="Times New Roman" w:cs="Times New Roman"/>
+          <w:lang w:val="en-GB"/>
+        </w:rPr>
+        <w:t xml:space="preserve">file </w:t>
+      </w:r>
+      <w:r>
+        <w:rPr>
+          <w:rFonts w:ascii="Times New Roman" w:hAnsi="Times New Roman" w:cs="Times New Roman"/>
+          <w:lang w:val="en-GB"/>
+        </w:rPr>
+        <w:t>.</w:t>
+      </w:r>
+      <w:proofErr w:type="spellStart"/>
+      <w:r>
+        <w:rPr>
+          <w:rFonts w:ascii="Times New Roman" w:hAnsi="Times New Roman" w:cs="Times New Roman"/>
+          <w:lang w:val="en-GB"/>
+        </w:rPr>
+        <w:t>gitignore</w:t>
+      </w:r>
+      <w:proofErr w:type="spellEnd"/>
+      <w:proofErr w:type="gramEnd"/>
+      <w:r>
+        <w:rPr>
+          <w:rFonts w:ascii="Times New Roman" w:hAnsi="Times New Roman" w:cs="Times New Roman"/>
+          <w:lang w:val="en-GB"/>
+        </w:rPr>
+        <w:t xml:space="preserve"> pada folder </w:t>
+      </w:r>
+      <w:proofErr w:type="spellStart"/>
+      <w:r>
+        <w:t>sigersync</w:t>
+      </w:r>
+      <w:proofErr w:type="spellEnd"/>
+      <w:r>
+        <w:t>-backend</w:t>
+      </w:r>
+      <w:r>
+        <w:t>.</w:t>
+      </w:r>
+    </w:p>
+    <w:p>
+      <w:pPr>
+        <w:contextualSpacing/>
+        <w:rPr>
+          <w:rFonts w:ascii="Times New Roman" w:hAnsi="Times New Roman" w:cs="Times New Roman"/>
+          <w:lang w:val="en-GB"/>
+        </w:rPr>
+      </w:pPr>
+      <w:r>
+        <w:rPr>
+          <w:noProof/>
+        </w:rPr>
+        <w:drawing>
+          <wp:inline distT="0" distB="0" distL="0" distR="0" wp14:anchorId="35E29B25" wp14:editId="37BE96D6">
+            <wp:extent cx="5731510" cy="3222625"/>
+            <wp:effectExtent l="0" t="0" r="2540" b="0"/>
+            <wp:docPr id="152212526" name="Picture 1"/>
+            <wp:cNvGraphicFramePr>
+              <a:graphicFrameLocks xmlns:a="http://schemas.openxmlformats.org/drawingml/2006/main" noChangeAspect="1"/>
+            </wp:cNvGraphicFramePr>
+            <a:graphic xmlns:a="http://schemas.openxmlformats.org/drawingml/2006/main">
+              <a:graphicData uri="http://schemas.openxmlformats.org/drawingml/2006/picture">
+                <pic:pic xmlns:pic="http://schemas.openxmlformats.org/drawingml/2006/picture">
+                  <pic:nvPicPr>
+                    <pic:cNvPr id="152212526" name=""/>
+                    <pic:cNvPicPr/>
+                  </pic:nvPicPr>
+                  <pic:blipFill>
+                    <a:blip r:embed="rId8"/>
+                    <a:stretch>
+                      <a:fillRect/>
+                    </a:stretch>
+                  </pic:blipFill>
+                  <pic:spPr>
+                    <a:xfrm>
+                      <a:off x="0" y="0"/>
+                      <a:ext cx="5731510" cy="3222625"/>
+                    </a:xfrm>
+                    <a:prstGeom prst="rect">
+                      <a:avLst/>
+                    </a:prstGeom>
+                  </pic:spPr>
+                </pic:pic>
+              </a:graphicData>
+            </a:graphic>
+          </wp:inline>
+        </w:drawing>
+      </w:r>
+    </w:p>
+    <w:p>
+      <w:pPr>
+        <w:contextualSpacing/>
+        <w:rPr>
+          <w:rFonts w:ascii="Times New Roman" w:hAnsi="Times New Roman" w:cs="Times New Roman"/>
+          <w:lang w:val="en-GB"/>
+        </w:rPr>
+      </w:pPr>
+    </w:p>
+    <w:p>
+      <w:pPr>
+        <w:contextualSpacing/>
+        <w:jc w:val="both"/>
+        <w:rPr>
+          <w:rFonts w:ascii="Times New Roman" w:hAnsi="Times New Roman" w:cs="Times New Roman"/>
+          <w:lang w:val="en-GB"/>
+        </w:rPr>
+      </w:pPr>
+      <w:proofErr w:type="spellStart"/>
+      <w:r>
+        <w:rPr>
+          <w:rFonts w:ascii="Times New Roman" w:hAnsi="Times New Roman" w:cs="Times New Roman"/>
+          <w:lang w:val="en-GB"/>
+        </w:rPr>
+        <w:t>Membuat</w:t>
+      </w:r>
+      <w:proofErr w:type="spellEnd"/>
+      <w:r>
+        <w:rPr>
+          <w:rFonts w:ascii="Times New Roman" w:hAnsi="Times New Roman" w:cs="Times New Roman"/>
+          <w:lang w:val="en-GB"/>
+        </w:rPr>
+        <w:t xml:space="preserve"> </w:t>
+      </w:r>
+      <w:proofErr w:type="gramStart"/>
+      <w:r>
+        <w:rPr>
+          <w:rFonts w:ascii="Times New Roman" w:hAnsi="Times New Roman" w:cs="Times New Roman"/>
+          <w:lang w:val="en-GB"/>
+        </w:rPr>
+        <w:t>file .</w:t>
+      </w:r>
+      <w:proofErr w:type="spellStart"/>
+      <w:r>
+        <w:rPr>
+          <w:rFonts w:ascii="Times New Roman" w:hAnsi="Times New Roman" w:cs="Times New Roman"/>
+          <w:lang w:val="en-GB"/>
+        </w:rPr>
+        <w:t>gitignore</w:t>
+      </w:r>
+      <w:proofErr w:type="spellEnd"/>
+      <w:proofErr w:type="gramEnd"/>
+      <w:r>
+        <w:rPr>
+          <w:rFonts w:ascii="Times New Roman" w:hAnsi="Times New Roman" w:cs="Times New Roman"/>
+          <w:lang w:val="en-GB"/>
+        </w:rPr>
+        <w:t xml:space="preserve"> pada folder </w:t>
+      </w:r>
+      <w:proofErr w:type="spellStart"/>
+      <w:r>
+        <w:rPr>
+          <w:rFonts w:ascii="Times New Roman" w:hAnsi="Times New Roman" w:cs="Times New Roman"/>
+          <w:lang w:val="en-GB"/>
+        </w:rPr>
+        <w:t>sigersync</w:t>
+      </w:r>
+      <w:proofErr w:type="spellEnd"/>
+      <w:r>
+        <w:rPr>
+          <w:rFonts w:ascii="Times New Roman" w:hAnsi="Times New Roman" w:cs="Times New Roman"/>
+          <w:lang w:val="en-GB"/>
+        </w:rPr>
+        <w:t xml:space="preserve">-backend. File </w:t>
+      </w:r>
+      <w:proofErr w:type="spellStart"/>
+      <w:r>
+        <w:rPr>
+          <w:rFonts w:ascii="Times New Roman" w:hAnsi="Times New Roman" w:cs="Times New Roman"/>
+          <w:lang w:val="en-GB"/>
+        </w:rPr>
+        <w:t>ini</w:t>
+      </w:r>
+      <w:proofErr w:type="spellEnd"/>
+      <w:r>
+        <w:rPr>
+          <w:rFonts w:ascii="Times New Roman" w:hAnsi="Times New Roman" w:cs="Times New Roman"/>
+          <w:lang w:val="en-GB"/>
+        </w:rPr>
+        <w:t xml:space="preserve"> </w:t>
+      </w:r>
+      <w:proofErr w:type="spellStart"/>
+      <w:r>
+        <w:rPr>
+          <w:rFonts w:ascii="Times New Roman" w:hAnsi="Times New Roman" w:cs="Times New Roman"/>
+          <w:lang w:val="en-GB"/>
+        </w:rPr>
+        <w:t>memberitahu</w:t>
+      </w:r>
+      <w:proofErr w:type="spellEnd"/>
+      <w:r>
+        <w:rPr>
+          <w:rFonts w:ascii="Times New Roman" w:hAnsi="Times New Roman" w:cs="Times New Roman"/>
+          <w:lang w:val="en-GB"/>
+        </w:rPr>
+        <w:t xml:space="preserve"> Git file mana yang </w:t>
+      </w:r>
+      <w:proofErr w:type="spellStart"/>
+      <w:r>
+        <w:rPr>
+          <w:rFonts w:ascii="Times New Roman" w:hAnsi="Times New Roman" w:cs="Times New Roman"/>
+          <w:lang w:val="en-GB"/>
+        </w:rPr>
+        <w:t>tidak</w:t>
+      </w:r>
+      <w:proofErr w:type="spellEnd"/>
+      <w:r>
+        <w:rPr>
+          <w:rFonts w:ascii="Times New Roman" w:hAnsi="Times New Roman" w:cs="Times New Roman"/>
+          <w:lang w:val="en-GB"/>
+        </w:rPr>
+        <w:t xml:space="preserve"> </w:t>
+      </w:r>
+      <w:proofErr w:type="spellStart"/>
+      <w:r>
+        <w:rPr>
+          <w:rFonts w:ascii="Times New Roman" w:hAnsi="Times New Roman" w:cs="Times New Roman"/>
+          <w:lang w:val="en-GB"/>
+        </w:rPr>
+        <w:t>boleh</w:t>
+      </w:r>
+      <w:proofErr w:type="spellEnd"/>
+      <w:r>
+        <w:rPr>
+          <w:rFonts w:ascii="Times New Roman" w:hAnsi="Times New Roman" w:cs="Times New Roman"/>
+          <w:lang w:val="en-GB"/>
+        </w:rPr>
+        <w:t xml:space="preserve"> di-track. Karena file </w:t>
+      </w:r>
+      <w:proofErr w:type="spellStart"/>
+      <w:r>
+        <w:rPr>
+          <w:rFonts w:ascii="Times New Roman" w:hAnsi="Times New Roman" w:cs="Times New Roman"/>
+          <w:lang w:val="en-GB"/>
+        </w:rPr>
+        <w:t>pendukungnya</w:t>
+      </w:r>
+      <w:proofErr w:type="spellEnd"/>
+      <w:r>
+        <w:rPr>
+          <w:rFonts w:ascii="Times New Roman" w:hAnsi="Times New Roman" w:cs="Times New Roman"/>
+          <w:lang w:val="en-GB"/>
+        </w:rPr>
+        <w:t xml:space="preserve"> </w:t>
+      </w:r>
+      <w:proofErr w:type="spellStart"/>
+      <w:r>
+        <w:rPr>
+          <w:rFonts w:ascii="Times New Roman" w:hAnsi="Times New Roman" w:cs="Times New Roman"/>
+          <w:lang w:val="en-GB"/>
+        </w:rPr>
+        <w:t>bisa</w:t>
+      </w:r>
+      <w:proofErr w:type="spellEnd"/>
+      <w:r>
+        <w:rPr>
+          <w:rFonts w:ascii="Times New Roman" w:hAnsi="Times New Roman" w:cs="Times New Roman"/>
+          <w:lang w:val="en-GB"/>
+        </w:rPr>
+        <w:t xml:space="preserve"> di instal pada masing-masing laptop </w:t>
+      </w:r>
+      <w:proofErr w:type="spellStart"/>
+      <w:r>
+        <w:rPr>
+          <w:rFonts w:ascii="Times New Roman" w:hAnsi="Times New Roman" w:cs="Times New Roman"/>
+          <w:lang w:val="en-GB"/>
+        </w:rPr>
+        <w:t>atau</w:t>
+      </w:r>
+      <w:proofErr w:type="spellEnd"/>
+      <w:r>
+        <w:rPr>
+          <w:rFonts w:ascii="Times New Roman" w:hAnsi="Times New Roman" w:cs="Times New Roman"/>
+          <w:lang w:val="en-GB"/>
+        </w:rPr>
+        <w:t xml:space="preserve"> </w:t>
+      </w:r>
+      <w:proofErr w:type="spellStart"/>
+      <w:r>
+        <w:rPr>
+          <w:rFonts w:ascii="Times New Roman" w:hAnsi="Times New Roman" w:cs="Times New Roman"/>
+          <w:lang w:val="en-GB"/>
+        </w:rPr>
+        <w:t>komputer</w:t>
+      </w:r>
+      <w:proofErr w:type="spellEnd"/>
+      <w:r>
+        <w:rPr>
+          <w:rFonts w:ascii="Times New Roman" w:hAnsi="Times New Roman" w:cs="Times New Roman"/>
+          <w:lang w:val="en-GB"/>
+        </w:rPr>
+        <w:t xml:space="preserve"> pada </w:t>
+      </w:r>
+      <w:proofErr w:type="spellStart"/>
+      <w:r>
+        <w:rPr>
+          <w:rFonts w:ascii="Times New Roman" w:hAnsi="Times New Roman" w:cs="Times New Roman"/>
+          <w:lang w:val="en-GB"/>
+        </w:rPr>
+        <w:t>setiap</w:t>
+      </w:r>
+      <w:proofErr w:type="spellEnd"/>
+      <w:r>
+        <w:rPr>
+          <w:rFonts w:ascii="Times New Roman" w:hAnsi="Times New Roman" w:cs="Times New Roman"/>
+          <w:lang w:val="en-GB"/>
+        </w:rPr>
+        <w:t xml:space="preserve"> </w:t>
+      </w:r>
+      <w:proofErr w:type="spellStart"/>
+      <w:r>
+        <w:rPr>
+          <w:rFonts w:ascii="Times New Roman" w:hAnsi="Times New Roman" w:cs="Times New Roman"/>
+          <w:lang w:val="en-GB"/>
+        </w:rPr>
+        <w:t>anggota</w:t>
+      </w:r>
+      <w:proofErr w:type="spellEnd"/>
+      <w:r>
+        <w:rPr>
+          <w:rFonts w:ascii="Times New Roman" w:hAnsi="Times New Roman" w:cs="Times New Roman"/>
+          <w:lang w:val="en-GB"/>
+        </w:rPr>
+        <w:t xml:space="preserve"> </w:t>
+      </w:r>
+      <w:proofErr w:type="spellStart"/>
+      <w:r>
+        <w:rPr>
+          <w:rFonts w:ascii="Times New Roman" w:hAnsi="Times New Roman" w:cs="Times New Roman"/>
+          <w:lang w:val="en-GB"/>
+        </w:rPr>
+        <w:t>atau</w:t>
+      </w:r>
+      <w:proofErr w:type="spellEnd"/>
+      <w:r>
+        <w:rPr>
+          <w:rFonts w:ascii="Times New Roman" w:hAnsi="Times New Roman" w:cs="Times New Roman"/>
+          <w:lang w:val="en-GB"/>
+        </w:rPr>
+        <w:t xml:space="preserve"> </w:t>
+      </w:r>
+      <w:proofErr w:type="spellStart"/>
+      <w:r>
+        <w:rPr>
+          <w:rFonts w:ascii="Times New Roman" w:hAnsi="Times New Roman" w:cs="Times New Roman"/>
+          <w:lang w:val="en-GB"/>
+        </w:rPr>
+        <w:t>bagi</w:t>
+      </w:r>
+      <w:proofErr w:type="spellEnd"/>
+      <w:r>
+        <w:rPr>
+          <w:rFonts w:ascii="Times New Roman" w:hAnsi="Times New Roman" w:cs="Times New Roman"/>
+          <w:lang w:val="en-GB"/>
+        </w:rPr>
+        <w:t xml:space="preserve"> yang clone project </w:t>
+      </w:r>
+      <w:proofErr w:type="spellStart"/>
+      <w:r>
+        <w:rPr>
+          <w:rFonts w:ascii="Times New Roman" w:hAnsi="Times New Roman" w:cs="Times New Roman"/>
+          <w:lang w:val="en-GB"/>
+        </w:rPr>
+        <w:t>ini</w:t>
+      </w:r>
+      <w:proofErr w:type="spellEnd"/>
+      <w:r>
+        <w:rPr>
+          <w:rFonts w:ascii="Times New Roman" w:hAnsi="Times New Roman" w:cs="Times New Roman"/>
+          <w:lang w:val="en-GB"/>
+        </w:rPr>
+        <w:t xml:space="preserve"> </w:t>
+      </w:r>
+      <w:proofErr w:type="spellStart"/>
+      <w:r>
+        <w:rPr>
+          <w:rFonts w:ascii="Times New Roman" w:hAnsi="Times New Roman" w:cs="Times New Roman"/>
+          <w:lang w:val="en-GB"/>
+        </w:rPr>
+        <w:t>nantinya</w:t>
+      </w:r>
+      <w:proofErr w:type="spellEnd"/>
+      <w:r>
+        <w:rPr>
+          <w:rFonts w:ascii="Times New Roman" w:hAnsi="Times New Roman" w:cs="Times New Roman"/>
+          <w:lang w:val="en-GB"/>
+        </w:rPr>
+        <w:t>.</w:t>
+      </w:r>
+    </w:p>
+    <w:p>
+      <w:pPr>
+        <w:contextualSpacing/>
+        <w:jc w:val="both"/>
+        <w:rPr>
+          <w:rFonts w:ascii="Times New Roman" w:hAnsi="Times New Roman" w:cs="Times New Roman"/>
+          <w:lang w:val="en-GB"/>
+        </w:rPr>
+      </w:pPr>
+    </w:p>
+    <w:p>
+      <w:pPr>
+        <w:contextualSpacing/>
+        <w:jc w:val="both"/>
+        <w:rPr>
+          <w:rFonts w:ascii="Times New Roman" w:hAnsi="Times New Roman" w:cs="Times New Roman"/>
+          <w:lang w:val="en-GB"/>
+        </w:rPr>
+      </w:pPr>
+      <w:proofErr w:type="gramStart"/>
+      <w:r>
+        <w:rPr>
+          <w:rFonts w:ascii="Times New Roman" w:hAnsi="Times New Roman" w:cs="Times New Roman"/>
+          <w:lang w:val="en-GB"/>
+        </w:rPr>
+        <w:t>File .</w:t>
+      </w:r>
+      <w:proofErr w:type="spellStart"/>
+      <w:r>
+        <w:rPr>
+          <w:rFonts w:ascii="Times New Roman" w:hAnsi="Times New Roman" w:cs="Times New Roman"/>
+          <w:lang w:val="en-GB"/>
+        </w:rPr>
+        <w:t>gitignore</w:t>
+      </w:r>
+      <w:proofErr w:type="spellEnd"/>
+      <w:proofErr w:type="gramEnd"/>
+      <w:r>
+        <w:rPr>
+          <w:rFonts w:ascii="Times New Roman" w:hAnsi="Times New Roman" w:cs="Times New Roman"/>
+          <w:lang w:val="en-GB"/>
+        </w:rPr>
+        <w:t xml:space="preserve"> </w:t>
+      </w:r>
+      <w:proofErr w:type="gramStart"/>
+      <w:r>
+        <w:rPr>
+          <w:rFonts w:ascii="Times New Roman" w:hAnsi="Times New Roman" w:cs="Times New Roman"/>
+          <w:lang w:val="en-GB"/>
+        </w:rPr>
+        <w:t xml:space="preserve">sangat  </w:t>
+      </w:r>
+      <w:proofErr w:type="spellStart"/>
+      <w:r>
+        <w:rPr>
+          <w:rFonts w:ascii="Times New Roman" w:hAnsi="Times New Roman" w:cs="Times New Roman"/>
+          <w:lang w:val="en-GB"/>
+        </w:rPr>
+        <w:t>bermanfaat</w:t>
+      </w:r>
+      <w:proofErr w:type="spellEnd"/>
+      <w:proofErr w:type="gramEnd"/>
+      <w:r>
+        <w:rPr>
+          <w:rFonts w:ascii="Times New Roman" w:hAnsi="Times New Roman" w:cs="Times New Roman"/>
+          <w:lang w:val="en-GB"/>
+        </w:rPr>
+        <w:t xml:space="preserve"> </w:t>
+      </w:r>
+      <w:proofErr w:type="spellStart"/>
+      <w:r>
+        <w:rPr>
+          <w:rFonts w:ascii="Times New Roman" w:hAnsi="Times New Roman" w:cs="Times New Roman"/>
+          <w:lang w:val="en-GB"/>
+        </w:rPr>
+        <w:t>karena</w:t>
+      </w:r>
+      <w:proofErr w:type="spellEnd"/>
+      <w:r>
+        <w:rPr>
+          <w:rFonts w:ascii="Times New Roman" w:hAnsi="Times New Roman" w:cs="Times New Roman"/>
+          <w:lang w:val="en-GB"/>
+        </w:rPr>
+        <w:t xml:space="preserve"> file-file yang </w:t>
+      </w:r>
+      <w:proofErr w:type="spellStart"/>
+      <w:r>
+        <w:rPr>
+          <w:rFonts w:ascii="Times New Roman" w:hAnsi="Times New Roman" w:cs="Times New Roman"/>
+          <w:lang w:val="en-GB"/>
+        </w:rPr>
+        <w:t>tidak</w:t>
+      </w:r>
+      <w:proofErr w:type="spellEnd"/>
+      <w:r>
+        <w:rPr>
+          <w:rFonts w:ascii="Times New Roman" w:hAnsi="Times New Roman" w:cs="Times New Roman"/>
+          <w:lang w:val="en-GB"/>
+        </w:rPr>
+        <w:t xml:space="preserve"> </w:t>
+      </w:r>
+      <w:proofErr w:type="spellStart"/>
+      <w:r>
+        <w:rPr>
+          <w:rFonts w:ascii="Times New Roman" w:hAnsi="Times New Roman" w:cs="Times New Roman"/>
+          <w:lang w:val="en-GB"/>
+        </w:rPr>
+        <w:t>penting</w:t>
+      </w:r>
+      <w:proofErr w:type="spellEnd"/>
+      <w:r>
+        <w:rPr>
+          <w:rFonts w:ascii="Times New Roman" w:hAnsi="Times New Roman" w:cs="Times New Roman"/>
+          <w:lang w:val="en-GB"/>
+        </w:rPr>
+        <w:t xml:space="preserve"> </w:t>
+      </w:r>
+      <w:proofErr w:type="spellStart"/>
+      <w:r>
+        <w:rPr>
+          <w:rFonts w:ascii="Times New Roman" w:hAnsi="Times New Roman" w:cs="Times New Roman"/>
+          <w:lang w:val="en-GB"/>
+        </w:rPr>
+        <w:t>tidak</w:t>
+      </w:r>
+      <w:proofErr w:type="spellEnd"/>
+      <w:r>
+        <w:rPr>
+          <w:rFonts w:ascii="Times New Roman" w:hAnsi="Times New Roman" w:cs="Times New Roman"/>
+          <w:lang w:val="en-GB"/>
+        </w:rPr>
+        <w:t xml:space="preserve"> </w:t>
+      </w:r>
+      <w:proofErr w:type="spellStart"/>
+      <w:r>
+        <w:rPr>
+          <w:rFonts w:ascii="Times New Roman" w:hAnsi="Times New Roman" w:cs="Times New Roman"/>
+          <w:lang w:val="en-GB"/>
+        </w:rPr>
+        <w:t>ikut</w:t>
+      </w:r>
+      <w:proofErr w:type="spellEnd"/>
+      <w:r>
+        <w:rPr>
+          <w:rFonts w:ascii="Times New Roman" w:hAnsi="Times New Roman" w:cs="Times New Roman"/>
+          <w:lang w:val="en-GB"/>
+        </w:rPr>
+        <w:t xml:space="preserve"> </w:t>
+      </w:r>
+      <w:proofErr w:type="spellStart"/>
+      <w:r>
+        <w:rPr>
+          <w:rFonts w:ascii="Times New Roman" w:hAnsi="Times New Roman" w:cs="Times New Roman"/>
+          <w:lang w:val="en-GB"/>
+        </w:rPr>
+        <w:t>terupload</w:t>
+      </w:r>
+      <w:proofErr w:type="spellEnd"/>
+      <w:r>
+        <w:rPr>
+          <w:rFonts w:ascii="Times New Roman" w:hAnsi="Times New Roman" w:cs="Times New Roman"/>
+          <w:lang w:val="en-GB"/>
+        </w:rPr>
+        <w:t xml:space="preserve"> </w:t>
+      </w:r>
+      <w:proofErr w:type="spellStart"/>
+      <w:r>
+        <w:rPr>
+          <w:rFonts w:ascii="Times New Roman" w:hAnsi="Times New Roman" w:cs="Times New Roman"/>
+          <w:lang w:val="en-GB"/>
+        </w:rPr>
+        <w:t>ke</w:t>
+      </w:r>
+      <w:proofErr w:type="spellEnd"/>
+      <w:r>
+        <w:rPr>
+          <w:rFonts w:ascii="Times New Roman" w:hAnsi="Times New Roman" w:cs="Times New Roman"/>
+          <w:lang w:val="en-GB"/>
+        </w:rPr>
+        <w:t xml:space="preserve"> </w:t>
+      </w:r>
+      <w:proofErr w:type="spellStart"/>
+      <w:r>
+        <w:rPr>
+          <w:rFonts w:ascii="Times New Roman" w:hAnsi="Times New Roman" w:cs="Times New Roman"/>
+          <w:lang w:val="en-GB"/>
+        </w:rPr>
+        <w:t>github</w:t>
+      </w:r>
+      <w:proofErr w:type="spellEnd"/>
+      <w:r>
+        <w:rPr>
+          <w:rFonts w:ascii="Times New Roman" w:hAnsi="Times New Roman" w:cs="Times New Roman"/>
+          <w:lang w:val="en-GB"/>
+        </w:rPr>
+        <w:t xml:space="preserve"> </w:t>
+      </w:r>
+      <w:proofErr w:type="spellStart"/>
+      <w:r>
+        <w:rPr>
+          <w:rFonts w:ascii="Times New Roman" w:hAnsi="Times New Roman" w:cs="Times New Roman"/>
+          <w:lang w:val="en-GB"/>
+        </w:rPr>
+        <w:t>sehingga</w:t>
+      </w:r>
+      <w:proofErr w:type="spellEnd"/>
+      <w:r>
+        <w:rPr>
+          <w:rFonts w:ascii="Times New Roman" w:hAnsi="Times New Roman" w:cs="Times New Roman"/>
+          <w:lang w:val="en-GB"/>
+        </w:rPr>
+        <w:t xml:space="preserve"> </w:t>
+      </w:r>
+      <w:proofErr w:type="spellStart"/>
+      <w:r>
+        <w:rPr>
+          <w:rFonts w:ascii="Times New Roman" w:hAnsi="Times New Roman" w:cs="Times New Roman"/>
+          <w:lang w:val="en-GB"/>
+        </w:rPr>
+        <w:t>mengurangi</w:t>
+      </w:r>
+      <w:proofErr w:type="spellEnd"/>
+      <w:r>
+        <w:rPr>
+          <w:rFonts w:ascii="Times New Roman" w:hAnsi="Times New Roman" w:cs="Times New Roman"/>
+          <w:lang w:val="en-GB"/>
+        </w:rPr>
+        <w:t xml:space="preserve"> </w:t>
+      </w:r>
+      <w:proofErr w:type="spellStart"/>
+      <w:r>
+        <w:rPr>
+          <w:rFonts w:ascii="Times New Roman" w:hAnsi="Times New Roman" w:cs="Times New Roman"/>
+          <w:lang w:val="en-GB"/>
+        </w:rPr>
+        <w:t>ukuran</w:t>
+      </w:r>
+      <w:proofErr w:type="spellEnd"/>
+      <w:r>
+        <w:rPr>
+          <w:rFonts w:ascii="Times New Roman" w:hAnsi="Times New Roman" w:cs="Times New Roman"/>
+          <w:lang w:val="en-GB"/>
+        </w:rPr>
+        <w:t xml:space="preserve"> file </w:t>
+      </w:r>
+      <w:proofErr w:type="spellStart"/>
+      <w:r>
+        <w:rPr>
+          <w:rFonts w:ascii="Times New Roman" w:hAnsi="Times New Roman" w:cs="Times New Roman"/>
+          <w:lang w:val="en-GB"/>
+        </w:rPr>
+        <w:t>projectnya</w:t>
+      </w:r>
+      <w:proofErr w:type="spellEnd"/>
+      <w:r>
+        <w:rPr>
+          <w:rFonts w:ascii="Times New Roman" w:hAnsi="Times New Roman" w:cs="Times New Roman"/>
+          <w:lang w:val="en-GB"/>
+        </w:rPr>
+        <w:t xml:space="preserve">. Repository </w:t>
+      </w:r>
+      <w:proofErr w:type="spellStart"/>
+      <w:r>
+        <w:rPr>
+          <w:rFonts w:ascii="Times New Roman" w:hAnsi="Times New Roman" w:cs="Times New Roman"/>
+          <w:lang w:val="en-GB"/>
+        </w:rPr>
+        <w:t>tetap</w:t>
+      </w:r>
+      <w:proofErr w:type="spellEnd"/>
+      <w:r>
+        <w:rPr>
+          <w:rFonts w:ascii="Times New Roman" w:hAnsi="Times New Roman" w:cs="Times New Roman"/>
+          <w:lang w:val="en-GB"/>
+        </w:rPr>
+        <w:t xml:space="preserve"> </w:t>
+      </w:r>
+      <w:proofErr w:type="spellStart"/>
+      <w:r>
+        <w:rPr>
+          <w:rFonts w:ascii="Times New Roman" w:hAnsi="Times New Roman" w:cs="Times New Roman"/>
+          <w:lang w:val="en-GB"/>
+        </w:rPr>
+        <w:t>ringan</w:t>
+      </w:r>
+      <w:proofErr w:type="spellEnd"/>
+      <w:r>
+        <w:rPr>
+          <w:rFonts w:ascii="Times New Roman" w:hAnsi="Times New Roman" w:cs="Times New Roman"/>
+          <w:lang w:val="en-GB"/>
+        </w:rPr>
+        <w:t xml:space="preserve"> dan </w:t>
+      </w:r>
+      <w:proofErr w:type="spellStart"/>
+      <w:r>
+        <w:rPr>
+          <w:rFonts w:ascii="Times New Roman" w:hAnsi="Times New Roman" w:cs="Times New Roman"/>
+          <w:lang w:val="en-GB"/>
+        </w:rPr>
+        <w:t>tidak</w:t>
+      </w:r>
+      <w:proofErr w:type="spellEnd"/>
+      <w:r>
+        <w:rPr>
+          <w:rFonts w:ascii="Times New Roman" w:hAnsi="Times New Roman" w:cs="Times New Roman"/>
+          <w:lang w:val="en-GB"/>
+        </w:rPr>
+        <w:t xml:space="preserve"> </w:t>
+      </w:r>
+      <w:proofErr w:type="spellStart"/>
+      <w:r>
+        <w:rPr>
+          <w:rFonts w:ascii="Times New Roman" w:hAnsi="Times New Roman" w:cs="Times New Roman"/>
+          <w:lang w:val="en-GB"/>
+        </w:rPr>
+        <w:t>ada</w:t>
+      </w:r>
+      <w:proofErr w:type="spellEnd"/>
+      <w:r>
+        <w:rPr>
+          <w:rFonts w:ascii="Times New Roman" w:hAnsi="Times New Roman" w:cs="Times New Roman"/>
+          <w:lang w:val="en-GB"/>
+        </w:rPr>
+        <w:t xml:space="preserve"> file </w:t>
+      </w:r>
+      <w:proofErr w:type="spellStart"/>
+      <w:r>
+        <w:rPr>
+          <w:rFonts w:ascii="Times New Roman" w:hAnsi="Times New Roman" w:cs="Times New Roman"/>
+          <w:lang w:val="en-GB"/>
+        </w:rPr>
+        <w:t>sensitif</w:t>
+      </w:r>
+      <w:proofErr w:type="spellEnd"/>
+      <w:r>
+        <w:rPr>
+          <w:rFonts w:ascii="Times New Roman" w:hAnsi="Times New Roman" w:cs="Times New Roman"/>
+          <w:lang w:val="en-GB"/>
+        </w:rPr>
+        <w:t xml:space="preserve"> yang di-commit.</w:t>
       </w:r>
     </w:p>
     <w:sectPr>

</xml_diff>

<commit_message>
Edit tsconfig.json untuk NestJS
</commit_message>
<xml_diff>
--- a/dokumentasi/24382001P_Lorensius Firngadi_IF 23 E_Dokumentasi.docx
+++ b/dokumentasi/24382001P_Lorensius Firngadi_IF 23 E_Dokumentasi.docx
@@ -13,6 +13,7 @@
           <w:lang w:val="en-GB"/>
         </w:rPr>
       </w:pPr>
+      <w:proofErr w:type="spellStart"/>
       <w:r>
         <w:rPr>
           <w:rFonts w:ascii="Times New Roman" w:hAnsi="Times New Roman" w:cs="Times New Roman"/>
@@ -20,28 +21,69 @@
           <w:bCs/>
           <w:lang w:val="en-GB"/>
         </w:rPr>
-        <w:t>Dokumentasi Project Akhir</w:t>
-      </w:r>
-    </w:p>
-    <w:p>
-      <w:pPr>
-        <w:contextualSpacing/>
-        <w:jc w:val="center"/>
+        <w:t>Dokumentasi</w:t>
+      </w:r>
+      <w:proofErr w:type="spellEnd"/>
+      <w:r>
         <w:rPr>
           <w:rFonts w:ascii="Times New Roman" w:hAnsi="Times New Roman" w:cs="Times New Roman"/>
           <w:b/>
           <w:bCs/>
           <w:lang w:val="en-GB"/>
         </w:rPr>
-      </w:pPr>
-      <w:r>
+        <w:t xml:space="preserve"> Project Akhir</w:t>
+      </w:r>
+    </w:p>
+    <w:p>
+      <w:pPr>
+        <w:contextualSpacing/>
+        <w:jc w:val="center"/>
         <w:rPr>
           <w:rFonts w:ascii="Times New Roman" w:hAnsi="Times New Roman" w:cs="Times New Roman"/>
           <w:b/>
           <w:bCs/>
           <w:lang w:val="en-GB"/>
         </w:rPr>
-        <w:t>Pemrograman Berorientasi Service</w:t>
+      </w:pPr>
+      <w:proofErr w:type="spellStart"/>
+      <w:r>
+        <w:rPr>
+          <w:rFonts w:ascii="Times New Roman" w:hAnsi="Times New Roman" w:cs="Times New Roman"/>
+          <w:b/>
+          <w:bCs/>
+          <w:lang w:val="en-GB"/>
+        </w:rPr>
+        <w:t>Pemrograman</w:t>
+      </w:r>
+      <w:proofErr w:type="spellEnd"/>
+      <w:r>
+        <w:rPr>
+          <w:rFonts w:ascii="Times New Roman" w:hAnsi="Times New Roman" w:cs="Times New Roman"/>
+          <w:b/>
+          <w:bCs/>
+          <w:lang w:val="en-GB"/>
+        </w:rPr>
+        <w:t xml:space="preserve"> </w:t>
+      </w:r>
+      <w:proofErr w:type="spellStart"/>
+      <w:r>
+        <w:rPr>
+          <w:rFonts w:ascii="Times New Roman" w:hAnsi="Times New Roman" w:cs="Times New Roman"/>
+          <w:b/>
+          <w:bCs/>
+          <w:lang w:val="en-GB"/>
+        </w:rPr>
+        <w:t>Berorientasi</w:t>
+      </w:r>
+      <w:proofErr w:type="spellEnd"/>
+      <w:r>
+        <w:rPr>
+          <w:rFonts w:ascii="Times New Roman" w:hAnsi="Times New Roman" w:cs="Times New Roman"/>
+          <w:b/>
+          <w:bCs/>
+          <w:lang w:val="en-GB"/>
+        </w:rPr>
+        <w:t xml:space="preserve"> Service</w:t>
       </w:r>
     </w:p>
     <w:p>
@@ -74,7 +116,23 @@
           <w:lang w:val="en-GB"/>
         </w:rPr>
         <w:tab/>
-        <w:t>: Lorensius Firngadi</w:t>
+        <w:t xml:space="preserve">: </w:t>
+      </w:r>
+      <w:proofErr w:type="spellStart"/>
+      <w:r>
+        <w:rPr>
+          <w:rFonts w:ascii="Times New Roman" w:hAnsi="Times New Roman" w:cs="Times New Roman"/>
+          <w:lang w:val="en-GB"/>
+        </w:rPr>
+        <w:t>Lorensius</w:t>
+      </w:r>
+      <w:proofErr w:type="spellEnd"/>
+      <w:r>
+        <w:rPr>
+          <w:rFonts w:ascii="Times New Roman" w:hAnsi="Times New Roman" w:cs="Times New Roman"/>
+          <w:lang w:val="en-GB"/>
+        </w:rPr>
+        <w:t xml:space="preserve"> Firngadi</w:t>
       </w:r>
     </w:p>
     <w:p>
@@ -109,6 +167,7 @@
           <w:lang w:val="en-GB"/>
         </w:rPr>
       </w:pPr>
+      <w:proofErr w:type="spellStart"/>
       <w:r>
         <w:rPr>
           <w:rFonts w:ascii="Times New Roman" w:hAnsi="Times New Roman" w:cs="Times New Roman"/>
@@ -116,6 +175,7 @@
         </w:rPr>
         <w:t>Kelas</w:t>
       </w:r>
+      <w:proofErr w:type="spellEnd"/>
       <w:r>
         <w:rPr>
           <w:rFonts w:ascii="Times New Roman" w:hAnsi="Times New Roman" w:cs="Times New Roman"/>
@@ -138,8 +198,17 @@
           <w:rFonts w:ascii="Times New Roman" w:hAnsi="Times New Roman" w:cs="Times New Roman"/>
           <w:lang w:val="en-GB"/>
         </w:rPr>
-        <w:t>Dosen Pengampu</w:t>
-      </w:r>
+        <w:t xml:space="preserve">Dosen </w:t>
+      </w:r>
+      <w:proofErr w:type="spellStart"/>
+      <w:r>
+        <w:rPr>
+          <w:rFonts w:ascii="Times New Roman" w:hAnsi="Times New Roman" w:cs="Times New Roman"/>
+          <w:lang w:val="en-GB"/>
+        </w:rPr>
+        <w:t>Pengampu</w:t>
+      </w:r>
+      <w:proofErr w:type="spellEnd"/>
       <w:r>
         <w:rPr>
           <w:rFonts w:ascii="Times New Roman" w:hAnsi="Times New Roman" w:cs="Times New Roman"/>
@@ -160,54 +229,136 @@
           <w:rFonts w:ascii="Times New Roman" w:hAnsi="Times New Roman" w:cs="Times New Roman"/>
           <w:lang w:val="en-GB"/>
         </w:rPr>
-        <w:t>A. Ferico Octaviansyah, , S.Kom., M.Kom.</w:t>
-      </w:r>
-    </w:p>
-    <w:p>
-      <w:pPr>
-        <w:contextualSpacing/>
-        <w:rPr>
-          <w:rFonts w:ascii="Times New Roman" w:hAnsi="Times New Roman" w:cs="Times New Roman"/>
-          <w:lang w:val="en-GB"/>
-        </w:rPr>
-      </w:pPr>
-    </w:p>
-    <w:p>
-      <w:pPr>
-        <w:contextualSpacing/>
-        <w:rPr>
-          <w:rFonts w:ascii="Times New Roman" w:hAnsi="Times New Roman" w:cs="Times New Roman"/>
-          <w:lang w:val="en-GB"/>
-        </w:rPr>
-      </w:pPr>
-      <w:r>
-        <w:rPr>
-          <w:rFonts w:ascii="Times New Roman" w:hAnsi="Times New Roman" w:cs="Times New Roman"/>
-          <w:lang w:val="en-GB"/>
-        </w:rPr>
-        <w:t>1. Membuat R</w:t>
-      </w:r>
-      <w:r>
-        <w:rPr>
-          <w:rFonts w:ascii="Times New Roman" w:hAnsi="Times New Roman" w:cs="Times New Roman"/>
-          <w:lang w:val="en-GB"/>
-        </w:rPr>
-        <w:t xml:space="preserve">epository </w:t>
-      </w:r>
-      <w:r>
-        <w:rPr>
-          <w:rFonts w:ascii="Times New Roman" w:hAnsi="Times New Roman" w:cs="Times New Roman"/>
-          <w:lang w:val="en-GB"/>
-        </w:rPr>
-        <w:t xml:space="preserve">Baru </w:t>
-      </w:r>
-      <w:r>
-        <w:rPr>
-          <w:rFonts w:ascii="Times New Roman" w:hAnsi="Times New Roman" w:cs="Times New Roman"/>
-          <w:lang w:val="en-GB"/>
-        </w:rPr>
-        <w:t>di Web github</w:t>
-      </w:r>
+        <w:t xml:space="preserve">A. </w:t>
+      </w:r>
+      <w:proofErr w:type="spellStart"/>
+      <w:r>
+        <w:rPr>
+          <w:rFonts w:ascii="Times New Roman" w:hAnsi="Times New Roman" w:cs="Times New Roman"/>
+          <w:lang w:val="en-GB"/>
+        </w:rPr>
+        <w:t>Ferico</w:t>
+      </w:r>
+      <w:proofErr w:type="spellEnd"/>
+      <w:r>
+        <w:rPr>
+          <w:rFonts w:ascii="Times New Roman" w:hAnsi="Times New Roman" w:cs="Times New Roman"/>
+          <w:lang w:val="en-GB"/>
+        </w:rPr>
+        <w:t xml:space="preserve"> Octaviansyah</w:t>
+      </w:r>
+      <w:proofErr w:type="gramStart"/>
+      <w:r>
+        <w:rPr>
+          <w:rFonts w:ascii="Times New Roman" w:hAnsi="Times New Roman" w:cs="Times New Roman"/>
+          <w:lang w:val="en-GB"/>
+        </w:rPr>
+        <w:t>, ,</w:t>
+      </w:r>
+      <w:proofErr w:type="gramEnd"/>
+      <w:r>
+        <w:rPr>
+          <w:rFonts w:ascii="Times New Roman" w:hAnsi="Times New Roman" w:cs="Times New Roman"/>
+          <w:lang w:val="en-GB"/>
+        </w:rPr>
+        <w:t xml:space="preserve"> </w:t>
+      </w:r>
+      <w:proofErr w:type="spellStart"/>
+      <w:proofErr w:type="gramStart"/>
+      <w:r>
+        <w:rPr>
+          <w:rFonts w:ascii="Times New Roman" w:hAnsi="Times New Roman" w:cs="Times New Roman"/>
+          <w:lang w:val="en-GB"/>
+        </w:rPr>
+        <w:t>S.Kom</w:t>
+      </w:r>
+      <w:proofErr w:type="spellEnd"/>
+      <w:proofErr w:type="gramEnd"/>
+      <w:r>
+        <w:rPr>
+          <w:rFonts w:ascii="Times New Roman" w:hAnsi="Times New Roman" w:cs="Times New Roman"/>
+          <w:lang w:val="en-GB"/>
+        </w:rPr>
+        <w:t xml:space="preserve">., </w:t>
+      </w:r>
+      <w:proofErr w:type="spellStart"/>
+      <w:proofErr w:type="gramStart"/>
+      <w:r>
+        <w:rPr>
+          <w:rFonts w:ascii="Times New Roman" w:hAnsi="Times New Roman" w:cs="Times New Roman"/>
+          <w:lang w:val="en-GB"/>
+        </w:rPr>
+        <w:t>M.Kom</w:t>
+      </w:r>
+      <w:proofErr w:type="spellEnd"/>
+      <w:proofErr w:type="gramEnd"/>
+      <w:r>
+        <w:rPr>
+          <w:rFonts w:ascii="Times New Roman" w:hAnsi="Times New Roman" w:cs="Times New Roman"/>
+          <w:lang w:val="en-GB"/>
+        </w:rPr>
+        <w:t>.</w:t>
+      </w:r>
+    </w:p>
+    <w:p>
+      <w:pPr>
+        <w:contextualSpacing/>
+        <w:rPr>
+          <w:rFonts w:ascii="Times New Roman" w:hAnsi="Times New Roman" w:cs="Times New Roman"/>
+          <w:lang w:val="en-GB"/>
+        </w:rPr>
+      </w:pPr>
+    </w:p>
+    <w:p>
+      <w:pPr>
+        <w:contextualSpacing/>
+        <w:rPr>
+          <w:rFonts w:ascii="Times New Roman" w:hAnsi="Times New Roman" w:cs="Times New Roman"/>
+          <w:b/>
+          <w:bCs/>
+          <w:lang w:val="en-GB"/>
+        </w:rPr>
+      </w:pPr>
+      <w:r>
+        <w:rPr>
+          <w:rFonts w:ascii="Times New Roman" w:hAnsi="Times New Roman" w:cs="Times New Roman"/>
+          <w:b/>
+          <w:bCs/>
+          <w:lang w:val="en-GB"/>
+        </w:rPr>
+        <w:t xml:space="preserve">1. </w:t>
+      </w:r>
+      <w:proofErr w:type="spellStart"/>
+      <w:r>
+        <w:rPr>
+          <w:rFonts w:ascii="Times New Roman" w:hAnsi="Times New Roman" w:cs="Times New Roman"/>
+          <w:b/>
+          <w:bCs/>
+          <w:lang w:val="en-GB"/>
+        </w:rPr>
+        <w:t>Membuat</w:t>
+      </w:r>
+      <w:proofErr w:type="spellEnd"/>
+      <w:r>
+        <w:rPr>
+          <w:rFonts w:ascii="Times New Roman" w:hAnsi="Times New Roman" w:cs="Times New Roman"/>
+          <w:b/>
+          <w:bCs/>
+          <w:lang w:val="en-GB"/>
+        </w:rPr>
+        <w:t xml:space="preserve"> Repository Baru di Web </w:t>
+      </w:r>
+      <w:proofErr w:type="spellStart"/>
+      <w:r>
+        <w:rPr>
+          <w:rFonts w:ascii="Times New Roman" w:hAnsi="Times New Roman" w:cs="Times New Roman"/>
+          <w:b/>
+          <w:bCs/>
+          <w:lang w:val="en-GB"/>
+        </w:rPr>
+        <w:t>github</w:t>
+      </w:r>
+      <w:proofErr w:type="spellEnd"/>
     </w:p>
     <w:p>
       <w:pPr>
@@ -285,33 +436,236 @@
           <w:lang w:val="en-GB"/>
         </w:rPr>
       </w:pPr>
-      <w:r>
-        <w:rPr>
-          <w:rFonts w:ascii="Times New Roman" w:hAnsi="Times New Roman" w:cs="Times New Roman"/>
-          <w:lang w:val="en-GB"/>
-        </w:rPr>
-        <w:t xml:space="preserve">Untuk project akhir mata kuliah </w:t>
-      </w:r>
-      <w:r>
-        <w:rPr>
-          <w:rFonts w:ascii="Times New Roman" w:hAnsi="Times New Roman" w:cs="Times New Roman"/>
-          <w:lang w:val="en-GB"/>
-        </w:rPr>
-        <w:t>Pemrograman Berorientasi Service</w:t>
-      </w:r>
-      <w:r>
-        <w:rPr>
-          <w:rFonts w:ascii="Times New Roman" w:hAnsi="Times New Roman" w:cs="Times New Roman"/>
-          <w:lang w:val="en-GB"/>
-        </w:rPr>
-        <w:t xml:space="preserve"> ini </w:t>
-      </w:r>
-      <w:r>
-        <w:rPr>
-          <w:rFonts w:ascii="Times New Roman" w:hAnsi="Times New Roman" w:cs="Times New Roman"/>
-          <w:lang w:val="en-GB"/>
-        </w:rPr>
-        <w:t>memilih Tema Wisata. Dengan membatasi focus pada tempat provinsi asal saya.</w:t>
+      <w:proofErr w:type="spellStart"/>
+      <w:r>
+        <w:rPr>
+          <w:rFonts w:ascii="Times New Roman" w:hAnsi="Times New Roman" w:cs="Times New Roman"/>
+          <w:lang w:val="en-GB"/>
+        </w:rPr>
+        <w:t>Untuk</w:t>
+      </w:r>
+      <w:proofErr w:type="spellEnd"/>
+      <w:r>
+        <w:rPr>
+          <w:rFonts w:ascii="Times New Roman" w:hAnsi="Times New Roman" w:cs="Times New Roman"/>
+          <w:lang w:val="en-GB"/>
+        </w:rPr>
+        <w:t xml:space="preserve"> project </w:t>
+      </w:r>
+      <w:proofErr w:type="spellStart"/>
+      <w:r>
+        <w:rPr>
+          <w:rFonts w:ascii="Times New Roman" w:hAnsi="Times New Roman" w:cs="Times New Roman"/>
+          <w:lang w:val="en-GB"/>
+        </w:rPr>
+        <w:t>akhir</w:t>
+      </w:r>
+      <w:proofErr w:type="spellEnd"/>
+      <w:r>
+        <w:rPr>
+          <w:rFonts w:ascii="Times New Roman" w:hAnsi="Times New Roman" w:cs="Times New Roman"/>
+          <w:lang w:val="en-GB"/>
+        </w:rPr>
+        <w:t xml:space="preserve"> </w:t>
+      </w:r>
+      <w:proofErr w:type="spellStart"/>
+      <w:r>
+        <w:rPr>
+          <w:rFonts w:ascii="Times New Roman" w:hAnsi="Times New Roman" w:cs="Times New Roman"/>
+          <w:lang w:val="en-GB"/>
+        </w:rPr>
+        <w:t>mata</w:t>
+      </w:r>
+      <w:proofErr w:type="spellEnd"/>
+      <w:r>
+        <w:rPr>
+          <w:rFonts w:ascii="Times New Roman" w:hAnsi="Times New Roman" w:cs="Times New Roman"/>
+          <w:lang w:val="en-GB"/>
+        </w:rPr>
+        <w:t xml:space="preserve"> </w:t>
+      </w:r>
+      <w:proofErr w:type="spellStart"/>
+      <w:r>
+        <w:rPr>
+          <w:rFonts w:ascii="Times New Roman" w:hAnsi="Times New Roman" w:cs="Times New Roman"/>
+          <w:lang w:val="en-GB"/>
+        </w:rPr>
+        <w:t>kuliah</w:t>
+      </w:r>
+      <w:proofErr w:type="spellEnd"/>
+      <w:r>
+        <w:rPr>
+          <w:rFonts w:ascii="Times New Roman" w:hAnsi="Times New Roman" w:cs="Times New Roman"/>
+          <w:lang w:val="en-GB"/>
+        </w:rPr>
+        <w:t xml:space="preserve"> </w:t>
+      </w:r>
+      <w:proofErr w:type="spellStart"/>
+      <w:r>
+        <w:rPr>
+          <w:rFonts w:ascii="Times New Roman" w:hAnsi="Times New Roman" w:cs="Times New Roman"/>
+          <w:lang w:val="en-GB"/>
+        </w:rPr>
+        <w:t>Pemrograman</w:t>
+      </w:r>
+      <w:proofErr w:type="spellEnd"/>
+      <w:r>
+        <w:rPr>
+          <w:rFonts w:ascii="Times New Roman" w:hAnsi="Times New Roman" w:cs="Times New Roman"/>
+          <w:lang w:val="en-GB"/>
+        </w:rPr>
+        <w:t xml:space="preserve"> </w:t>
+      </w:r>
+      <w:proofErr w:type="spellStart"/>
+      <w:r>
+        <w:rPr>
+          <w:rFonts w:ascii="Times New Roman" w:hAnsi="Times New Roman" w:cs="Times New Roman"/>
+          <w:lang w:val="en-GB"/>
+        </w:rPr>
+        <w:t>Berorientasi</w:t>
+      </w:r>
+      <w:proofErr w:type="spellEnd"/>
+      <w:r>
+        <w:rPr>
+          <w:rFonts w:ascii="Times New Roman" w:hAnsi="Times New Roman" w:cs="Times New Roman"/>
+          <w:lang w:val="en-GB"/>
+        </w:rPr>
+        <w:t xml:space="preserve"> Service</w:t>
+      </w:r>
+      <w:r>
+        <w:rPr>
+          <w:rFonts w:ascii="Times New Roman" w:hAnsi="Times New Roman" w:cs="Times New Roman"/>
+          <w:lang w:val="en-GB"/>
+        </w:rPr>
+        <w:t xml:space="preserve"> </w:t>
+      </w:r>
+      <w:proofErr w:type="spellStart"/>
+      <w:r>
+        <w:rPr>
+          <w:rFonts w:ascii="Times New Roman" w:hAnsi="Times New Roman" w:cs="Times New Roman"/>
+          <w:lang w:val="en-GB"/>
+        </w:rPr>
+        <w:t>ini</w:t>
+      </w:r>
+      <w:proofErr w:type="spellEnd"/>
+      <w:r>
+        <w:rPr>
+          <w:rFonts w:ascii="Times New Roman" w:hAnsi="Times New Roman" w:cs="Times New Roman"/>
+          <w:lang w:val="en-GB"/>
+        </w:rPr>
+        <w:t xml:space="preserve"> </w:t>
+      </w:r>
+      <w:proofErr w:type="spellStart"/>
+      <w:r>
+        <w:rPr>
+          <w:rFonts w:ascii="Times New Roman" w:hAnsi="Times New Roman" w:cs="Times New Roman"/>
+          <w:lang w:val="en-GB"/>
+        </w:rPr>
+        <w:t>memilih</w:t>
+      </w:r>
+      <w:proofErr w:type="spellEnd"/>
+      <w:r>
+        <w:rPr>
+          <w:rFonts w:ascii="Times New Roman" w:hAnsi="Times New Roman" w:cs="Times New Roman"/>
+          <w:lang w:val="en-GB"/>
+        </w:rPr>
+        <w:t xml:space="preserve"> Tema Wisata. </w:t>
+      </w:r>
+      <w:proofErr w:type="spellStart"/>
+      <w:r>
+        <w:rPr>
+          <w:rFonts w:ascii="Times New Roman" w:hAnsi="Times New Roman" w:cs="Times New Roman"/>
+          <w:lang w:val="en-GB"/>
+        </w:rPr>
+        <w:t>Dengan</w:t>
+      </w:r>
+      <w:proofErr w:type="spellEnd"/>
+      <w:r>
+        <w:rPr>
+          <w:rFonts w:ascii="Times New Roman" w:hAnsi="Times New Roman" w:cs="Times New Roman"/>
+          <w:lang w:val="en-GB"/>
+        </w:rPr>
+        <w:t xml:space="preserve"> </w:t>
+      </w:r>
+      <w:proofErr w:type="spellStart"/>
+      <w:r>
+        <w:rPr>
+          <w:rFonts w:ascii="Times New Roman" w:hAnsi="Times New Roman" w:cs="Times New Roman"/>
+          <w:lang w:val="en-GB"/>
+        </w:rPr>
+        <w:t>membatasi</w:t>
+      </w:r>
+      <w:proofErr w:type="spellEnd"/>
+      <w:r>
+        <w:rPr>
+          <w:rFonts w:ascii="Times New Roman" w:hAnsi="Times New Roman" w:cs="Times New Roman"/>
+          <w:lang w:val="en-GB"/>
+        </w:rPr>
+        <w:t xml:space="preserve"> focus pada </w:t>
+      </w:r>
+      <w:proofErr w:type="spellStart"/>
+      <w:r>
+        <w:rPr>
+          <w:rFonts w:ascii="Times New Roman" w:hAnsi="Times New Roman" w:cs="Times New Roman"/>
+          <w:lang w:val="en-GB"/>
+        </w:rPr>
+        <w:t>tempat</w:t>
+      </w:r>
+      <w:proofErr w:type="spellEnd"/>
+      <w:r>
+        <w:rPr>
+          <w:rFonts w:ascii="Times New Roman" w:hAnsi="Times New Roman" w:cs="Times New Roman"/>
+          <w:lang w:val="en-GB"/>
+        </w:rPr>
+        <w:t xml:space="preserve"> </w:t>
+      </w:r>
+      <w:proofErr w:type="spellStart"/>
+      <w:r>
+        <w:rPr>
+          <w:rFonts w:ascii="Times New Roman" w:hAnsi="Times New Roman" w:cs="Times New Roman"/>
+          <w:lang w:val="en-GB"/>
+        </w:rPr>
+        <w:t>provinsi</w:t>
+      </w:r>
+      <w:proofErr w:type="spellEnd"/>
+      <w:r>
+        <w:rPr>
+          <w:rFonts w:ascii="Times New Roman" w:hAnsi="Times New Roman" w:cs="Times New Roman"/>
+          <w:lang w:val="en-GB"/>
+        </w:rPr>
+        <w:t xml:space="preserve"> </w:t>
+      </w:r>
+      <w:proofErr w:type="spellStart"/>
+      <w:r>
+        <w:rPr>
+          <w:rFonts w:ascii="Times New Roman" w:hAnsi="Times New Roman" w:cs="Times New Roman"/>
+          <w:lang w:val="en-GB"/>
+        </w:rPr>
+        <w:t>asal</w:t>
+      </w:r>
+      <w:proofErr w:type="spellEnd"/>
+      <w:r>
+        <w:rPr>
+          <w:rFonts w:ascii="Times New Roman" w:hAnsi="Times New Roman" w:cs="Times New Roman"/>
+          <w:lang w:val="en-GB"/>
+        </w:rPr>
+        <w:t xml:space="preserve"> </w:t>
+      </w:r>
+      <w:proofErr w:type="spellStart"/>
+      <w:r>
+        <w:rPr>
+          <w:rFonts w:ascii="Times New Roman" w:hAnsi="Times New Roman" w:cs="Times New Roman"/>
+          <w:lang w:val="en-GB"/>
+        </w:rPr>
+        <w:t>saya</w:t>
+      </w:r>
+      <w:proofErr w:type="spellEnd"/>
+      <w:r>
+        <w:rPr>
+          <w:rFonts w:ascii="Times New Roman" w:hAnsi="Times New Roman" w:cs="Times New Roman"/>
+          <w:lang w:val="en-GB"/>
+        </w:rPr>
+        <w:t>.</w:t>
       </w:r>
     </w:p>
     <w:p>
@@ -332,8 +686,33 @@
           <w:rFonts w:ascii="Times New Roman" w:hAnsi="Times New Roman" w:cs="Times New Roman"/>
           <w:lang w:val="en-GB"/>
         </w:rPr>
-        <w:t>Nama Project : SigerSync</w:t>
-      </w:r>
+        <w:t xml:space="preserve">Nama </w:t>
+      </w:r>
+      <w:proofErr w:type="gramStart"/>
+      <w:r>
+        <w:rPr>
+          <w:rFonts w:ascii="Times New Roman" w:hAnsi="Times New Roman" w:cs="Times New Roman"/>
+          <w:lang w:val="en-GB"/>
+        </w:rPr>
+        <w:t>Project :</w:t>
+      </w:r>
+      <w:proofErr w:type="gramEnd"/>
+      <w:r>
+        <w:rPr>
+          <w:rFonts w:ascii="Times New Roman" w:hAnsi="Times New Roman" w:cs="Times New Roman"/>
+          <w:lang w:val="en-GB"/>
+        </w:rPr>
+        <w:t xml:space="preserve"> </w:t>
+      </w:r>
+      <w:proofErr w:type="spellStart"/>
+      <w:r>
+        <w:rPr>
+          <w:rFonts w:ascii="Times New Roman" w:hAnsi="Times New Roman" w:cs="Times New Roman"/>
+          <w:lang w:val="en-GB"/>
+        </w:rPr>
+        <w:t>SigerSync</w:t>
+      </w:r>
+      <w:proofErr w:type="spellEnd"/>
     </w:p>
     <w:p>
       <w:pPr>
@@ -348,13 +727,47 @@
           <w:lang w:val="en-GB"/>
         </w:rPr>
       </w:pPr>
-      <w:r>
-        <w:rPr>
-          <w:rFonts w:ascii="Times New Roman" w:hAnsi="Times New Roman" w:cs="Times New Roman"/>
-          <w:lang w:val="en-GB"/>
-        </w:rPr>
-        <w:t>Deskripsi Singkat Project :</w:t>
-      </w:r>
+      <w:proofErr w:type="spellStart"/>
+      <w:r>
+        <w:rPr>
+          <w:rFonts w:ascii="Times New Roman" w:hAnsi="Times New Roman" w:cs="Times New Roman"/>
+          <w:lang w:val="en-GB"/>
+        </w:rPr>
+        <w:t>Deskripsi</w:t>
+      </w:r>
+      <w:proofErr w:type="spellEnd"/>
+      <w:r>
+        <w:rPr>
+          <w:rFonts w:ascii="Times New Roman" w:hAnsi="Times New Roman" w:cs="Times New Roman"/>
+          <w:lang w:val="en-GB"/>
+        </w:rPr>
+        <w:t xml:space="preserve"> </w:t>
+      </w:r>
+      <w:proofErr w:type="spellStart"/>
+      <w:r>
+        <w:rPr>
+          <w:rFonts w:ascii="Times New Roman" w:hAnsi="Times New Roman" w:cs="Times New Roman"/>
+          <w:lang w:val="en-GB"/>
+        </w:rPr>
+        <w:t>Singkat</w:t>
+      </w:r>
+      <w:proofErr w:type="spellEnd"/>
+      <w:r>
+        <w:rPr>
+          <w:rFonts w:ascii="Times New Roman" w:hAnsi="Times New Roman" w:cs="Times New Roman"/>
+          <w:lang w:val="en-GB"/>
+        </w:rPr>
+        <w:t xml:space="preserve"> </w:t>
+      </w:r>
+      <w:proofErr w:type="gramStart"/>
+      <w:r>
+        <w:rPr>
+          <w:rFonts w:ascii="Times New Roman" w:hAnsi="Times New Roman" w:cs="Times New Roman"/>
+          <w:lang w:val="en-GB"/>
+        </w:rPr>
+        <w:t>Project :</w:t>
+      </w:r>
+      <w:proofErr w:type="gramEnd"/>
     </w:p>
     <w:p>
       <w:pPr>
@@ -365,12 +778,286 @@
           <w:lang w:val="en-GB"/>
         </w:rPr>
       </w:pPr>
-      <w:r>
-        <w:rPr>
-          <w:rFonts w:ascii="Times New Roman" w:hAnsi="Times New Roman" w:cs="Times New Roman"/>
-          <w:lang w:val="en-GB"/>
-        </w:rPr>
-        <w:t>SigerSync adalah aplikasi berbasis Service Oriented Architecture (SOA) yang menyajikan informasi mengenai destinasi wisata di Provinsi Lampung. Kategori Wisata : Wisata Alam, Wisata Budaya, dan Wisata Edukasi.</w:t>
+      <w:proofErr w:type="spellStart"/>
+      <w:r>
+        <w:rPr>
+          <w:rFonts w:ascii="Times New Roman" w:hAnsi="Times New Roman" w:cs="Times New Roman"/>
+          <w:lang w:val="en-GB"/>
+        </w:rPr>
+        <w:t>SigerSync</w:t>
+      </w:r>
+      <w:proofErr w:type="spellEnd"/>
+      <w:r>
+        <w:rPr>
+          <w:rFonts w:ascii="Times New Roman" w:hAnsi="Times New Roman" w:cs="Times New Roman"/>
+          <w:lang w:val="en-GB"/>
+        </w:rPr>
+        <w:t xml:space="preserve"> </w:t>
+      </w:r>
+      <w:proofErr w:type="spellStart"/>
+      <w:r>
+        <w:rPr>
+          <w:rFonts w:ascii="Times New Roman" w:hAnsi="Times New Roman" w:cs="Times New Roman"/>
+          <w:lang w:val="en-GB"/>
+        </w:rPr>
+        <w:t>adalah</w:t>
+      </w:r>
+      <w:proofErr w:type="spellEnd"/>
+      <w:r>
+        <w:rPr>
+          <w:rFonts w:ascii="Times New Roman" w:hAnsi="Times New Roman" w:cs="Times New Roman"/>
+          <w:lang w:val="en-GB"/>
+        </w:rPr>
+        <w:t xml:space="preserve"> </w:t>
+      </w:r>
+      <w:proofErr w:type="spellStart"/>
+      <w:r>
+        <w:rPr>
+          <w:rFonts w:ascii="Times New Roman" w:hAnsi="Times New Roman" w:cs="Times New Roman"/>
+          <w:lang w:val="en-GB"/>
+        </w:rPr>
+        <w:t>aplikasi</w:t>
+      </w:r>
+      <w:proofErr w:type="spellEnd"/>
+      <w:r>
+        <w:rPr>
+          <w:rFonts w:ascii="Times New Roman" w:hAnsi="Times New Roman" w:cs="Times New Roman"/>
+          <w:lang w:val="en-GB"/>
+        </w:rPr>
+        <w:t xml:space="preserve"> </w:t>
+      </w:r>
+      <w:proofErr w:type="spellStart"/>
+      <w:r>
+        <w:rPr>
+          <w:rFonts w:ascii="Times New Roman" w:hAnsi="Times New Roman" w:cs="Times New Roman"/>
+          <w:lang w:val="en-GB"/>
+        </w:rPr>
+        <w:t>berbasis</w:t>
+      </w:r>
+      <w:proofErr w:type="spellEnd"/>
+      <w:r>
+        <w:rPr>
+          <w:rFonts w:ascii="Times New Roman" w:hAnsi="Times New Roman" w:cs="Times New Roman"/>
+          <w:lang w:val="en-GB"/>
+        </w:rPr>
+        <w:t xml:space="preserve"> Service Oriented Architecture (SOA) yang </w:t>
+      </w:r>
+      <w:proofErr w:type="spellStart"/>
+      <w:r>
+        <w:rPr>
+          <w:rFonts w:ascii="Times New Roman" w:hAnsi="Times New Roman" w:cs="Times New Roman"/>
+          <w:lang w:val="en-GB"/>
+        </w:rPr>
+        <w:t>menyajikan</w:t>
+      </w:r>
+      <w:proofErr w:type="spellEnd"/>
+      <w:r>
+        <w:rPr>
+          <w:rFonts w:ascii="Times New Roman" w:hAnsi="Times New Roman" w:cs="Times New Roman"/>
+          <w:lang w:val="en-GB"/>
+        </w:rPr>
+        <w:t xml:space="preserve"> </w:t>
+      </w:r>
+      <w:proofErr w:type="spellStart"/>
+      <w:r>
+        <w:rPr>
+          <w:rFonts w:ascii="Times New Roman" w:hAnsi="Times New Roman" w:cs="Times New Roman"/>
+          <w:lang w:val="en-GB"/>
+        </w:rPr>
+        <w:t>informasi</w:t>
+      </w:r>
+      <w:proofErr w:type="spellEnd"/>
+      <w:r>
+        <w:rPr>
+          <w:rFonts w:ascii="Times New Roman" w:hAnsi="Times New Roman" w:cs="Times New Roman"/>
+          <w:lang w:val="en-GB"/>
+        </w:rPr>
+        <w:t xml:space="preserve"> </w:t>
+      </w:r>
+      <w:proofErr w:type="spellStart"/>
+      <w:r>
+        <w:rPr>
+          <w:rFonts w:ascii="Times New Roman" w:hAnsi="Times New Roman" w:cs="Times New Roman"/>
+          <w:lang w:val="en-GB"/>
+        </w:rPr>
+        <w:t>mengenai</w:t>
+      </w:r>
+      <w:proofErr w:type="spellEnd"/>
+      <w:r>
+        <w:rPr>
+          <w:rFonts w:ascii="Times New Roman" w:hAnsi="Times New Roman" w:cs="Times New Roman"/>
+          <w:lang w:val="en-GB"/>
+        </w:rPr>
+        <w:t xml:space="preserve"> </w:t>
+      </w:r>
+      <w:proofErr w:type="spellStart"/>
+      <w:r>
+        <w:rPr>
+          <w:rFonts w:ascii="Times New Roman" w:hAnsi="Times New Roman" w:cs="Times New Roman"/>
+          <w:lang w:val="en-GB"/>
+        </w:rPr>
+        <w:t>destinasi</w:t>
+      </w:r>
+      <w:proofErr w:type="spellEnd"/>
+      <w:r>
+        <w:rPr>
+          <w:rFonts w:ascii="Times New Roman" w:hAnsi="Times New Roman" w:cs="Times New Roman"/>
+          <w:lang w:val="en-GB"/>
+        </w:rPr>
+        <w:t xml:space="preserve"> </w:t>
+      </w:r>
+      <w:proofErr w:type="spellStart"/>
+      <w:r>
+        <w:rPr>
+          <w:rFonts w:ascii="Times New Roman" w:hAnsi="Times New Roman" w:cs="Times New Roman"/>
+          <w:lang w:val="en-GB"/>
+        </w:rPr>
+        <w:t>wisata</w:t>
+      </w:r>
+      <w:proofErr w:type="spellEnd"/>
+      <w:r>
+        <w:rPr>
+          <w:rFonts w:ascii="Times New Roman" w:hAnsi="Times New Roman" w:cs="Times New Roman"/>
+          <w:lang w:val="en-GB"/>
+        </w:rPr>
+        <w:t xml:space="preserve"> di </w:t>
+      </w:r>
+      <w:proofErr w:type="spellStart"/>
+      <w:r>
+        <w:rPr>
+          <w:rFonts w:ascii="Times New Roman" w:hAnsi="Times New Roman" w:cs="Times New Roman"/>
+          <w:lang w:val="en-GB"/>
+        </w:rPr>
+        <w:t>Provinsi</w:t>
+      </w:r>
+      <w:proofErr w:type="spellEnd"/>
+      <w:r>
+        <w:rPr>
+          <w:rFonts w:ascii="Times New Roman" w:hAnsi="Times New Roman" w:cs="Times New Roman"/>
+          <w:lang w:val="en-GB"/>
+        </w:rPr>
+        <w:t xml:space="preserve"> Lampung. </w:t>
+      </w:r>
+      <w:proofErr w:type="spellStart"/>
+      <w:r>
+        <w:rPr>
+          <w:rFonts w:ascii="Times New Roman" w:hAnsi="Times New Roman" w:cs="Times New Roman"/>
+          <w:lang w:val="en-GB"/>
+        </w:rPr>
+        <w:t>Kategori</w:t>
+      </w:r>
+      <w:proofErr w:type="spellEnd"/>
+      <w:r>
+        <w:rPr>
+          <w:rFonts w:ascii="Times New Roman" w:hAnsi="Times New Roman" w:cs="Times New Roman"/>
+          <w:lang w:val="en-GB"/>
+        </w:rPr>
+        <w:t xml:space="preserve"> </w:t>
+      </w:r>
+      <w:proofErr w:type="spellStart"/>
+      <w:proofErr w:type="gramStart"/>
+      <w:r>
+        <w:rPr>
+          <w:rFonts w:ascii="Times New Roman" w:hAnsi="Times New Roman" w:cs="Times New Roman"/>
+          <w:lang w:val="en-GB"/>
+        </w:rPr>
+        <w:t>Wisata</w:t>
+      </w:r>
+      <w:proofErr w:type="spellEnd"/>
+      <w:r>
+        <w:rPr>
+          <w:rFonts w:ascii="Times New Roman" w:hAnsi="Times New Roman" w:cs="Times New Roman"/>
+          <w:lang w:val="en-GB"/>
+        </w:rPr>
+        <w:t xml:space="preserve"> :</w:t>
+      </w:r>
+      <w:proofErr w:type="gramEnd"/>
+      <w:r>
+        <w:rPr>
+          <w:rFonts w:ascii="Times New Roman" w:hAnsi="Times New Roman" w:cs="Times New Roman"/>
+          <w:lang w:val="en-GB"/>
+        </w:rPr>
+        <w:t xml:space="preserve"> </w:t>
+      </w:r>
+      <w:proofErr w:type="spellStart"/>
+      <w:r>
+        <w:rPr>
+          <w:rFonts w:ascii="Times New Roman" w:hAnsi="Times New Roman" w:cs="Times New Roman"/>
+          <w:lang w:val="en-GB"/>
+        </w:rPr>
+        <w:t>Wisata</w:t>
+      </w:r>
+      <w:proofErr w:type="spellEnd"/>
+      <w:r>
+        <w:rPr>
+          <w:rFonts w:ascii="Times New Roman" w:hAnsi="Times New Roman" w:cs="Times New Roman"/>
+          <w:lang w:val="en-GB"/>
+        </w:rPr>
+        <w:t xml:space="preserve"> Alam, </w:t>
+      </w:r>
+      <w:proofErr w:type="spellStart"/>
+      <w:r>
+        <w:rPr>
+          <w:rFonts w:ascii="Times New Roman" w:hAnsi="Times New Roman" w:cs="Times New Roman"/>
+          <w:lang w:val="en-GB"/>
+        </w:rPr>
+        <w:t>Wisata</w:t>
+      </w:r>
+      <w:proofErr w:type="spellEnd"/>
+      <w:r>
+        <w:rPr>
+          <w:rFonts w:ascii="Times New Roman" w:hAnsi="Times New Roman" w:cs="Times New Roman"/>
+          <w:lang w:val="en-GB"/>
+        </w:rPr>
+        <w:t xml:space="preserve"> </w:t>
+      </w:r>
+      <w:proofErr w:type="spellStart"/>
+      <w:r>
+        <w:rPr>
+          <w:rFonts w:ascii="Times New Roman" w:hAnsi="Times New Roman" w:cs="Times New Roman"/>
+          <w:lang w:val="en-GB"/>
+        </w:rPr>
+        <w:t>Budaya</w:t>
+      </w:r>
+      <w:proofErr w:type="spellEnd"/>
+      <w:r>
+        <w:rPr>
+          <w:rFonts w:ascii="Times New Roman" w:hAnsi="Times New Roman" w:cs="Times New Roman"/>
+          <w:lang w:val="en-GB"/>
+        </w:rPr>
+        <w:t xml:space="preserve">, dan </w:t>
+      </w:r>
+      <w:proofErr w:type="spellStart"/>
+      <w:r>
+        <w:rPr>
+          <w:rFonts w:ascii="Times New Roman" w:hAnsi="Times New Roman" w:cs="Times New Roman"/>
+          <w:lang w:val="en-GB"/>
+        </w:rPr>
+        <w:t>Wisata</w:t>
+      </w:r>
+      <w:proofErr w:type="spellEnd"/>
+      <w:r>
+        <w:rPr>
+          <w:rFonts w:ascii="Times New Roman" w:hAnsi="Times New Roman" w:cs="Times New Roman"/>
+          <w:lang w:val="en-GB"/>
+        </w:rPr>
+        <w:t xml:space="preserve"> </w:t>
+      </w:r>
+      <w:proofErr w:type="spellStart"/>
+      <w:r>
+        <w:rPr>
+          <w:rFonts w:ascii="Times New Roman" w:hAnsi="Times New Roman" w:cs="Times New Roman"/>
+          <w:lang w:val="en-GB"/>
+        </w:rPr>
+        <w:t>Edukasi</w:t>
+      </w:r>
+      <w:proofErr w:type="spellEnd"/>
+      <w:r>
+        <w:rPr>
+          <w:rFonts w:ascii="Times New Roman" w:hAnsi="Times New Roman" w:cs="Times New Roman"/>
+          <w:lang w:val="en-GB"/>
+        </w:rPr>
+        <w:t>.</w:t>
       </w:r>
     </w:p>
     <w:p>
@@ -453,17 +1140,52 @@
         <w:contextualSpacing/>
         <w:rPr>
           <w:rFonts w:ascii="Times New Roman" w:hAnsi="Times New Roman" w:cs="Times New Roman"/>
-          <w:lang w:val="en-GB"/>
-        </w:rPr>
-      </w:pPr>
-      <w:r>
-        <w:rPr>
-          <w:rFonts w:ascii="Times New Roman" w:hAnsi="Times New Roman" w:cs="Times New Roman"/>
+          <w:b/>
+          <w:bCs/>
+          <w:lang w:val="en-GB"/>
+        </w:rPr>
+      </w:pPr>
+      <w:r>
+        <w:rPr>
+          <w:rFonts w:ascii="Times New Roman" w:hAnsi="Times New Roman" w:cs="Times New Roman"/>
+          <w:b/>
+          <w:bCs/>
           <w:lang w:val="en-GB"/>
         </w:rPr>
         <w:lastRenderedPageBreak/>
-        <w:t>2. Membuat Folder Dokumentasi</w:t>
-      </w:r>
+        <w:t xml:space="preserve">2. </w:t>
+      </w:r>
+      <w:proofErr w:type="spellStart"/>
+      <w:r>
+        <w:rPr>
+          <w:rFonts w:ascii="Times New Roman" w:hAnsi="Times New Roman" w:cs="Times New Roman"/>
+          <w:b/>
+          <w:bCs/>
+          <w:lang w:val="en-GB"/>
+        </w:rPr>
+        <w:t>Membuat</w:t>
+      </w:r>
+      <w:proofErr w:type="spellEnd"/>
+      <w:r>
+        <w:rPr>
+          <w:rFonts w:ascii="Times New Roman" w:hAnsi="Times New Roman" w:cs="Times New Roman"/>
+          <w:b/>
+          <w:bCs/>
+          <w:lang w:val="en-GB"/>
+        </w:rPr>
+        <w:t xml:space="preserve"> Folder </w:t>
+      </w:r>
+      <w:proofErr w:type="spellStart"/>
+      <w:r>
+        <w:rPr>
+          <w:rFonts w:ascii="Times New Roman" w:hAnsi="Times New Roman" w:cs="Times New Roman"/>
+          <w:b/>
+          <w:bCs/>
+          <w:lang w:val="en-GB"/>
+        </w:rPr>
+        <w:t>Dokumentasi</w:t>
+      </w:r>
+      <w:proofErr w:type="spellEnd"/>
     </w:p>
     <w:p>
       <w:pPr>
@@ -537,14 +1259,231 @@
           <w:rFonts w:ascii="Times New Roman" w:hAnsi="Times New Roman" w:cs="Times New Roman"/>
           <w:lang w:val="en-GB"/>
         </w:rPr>
-        <w:t xml:space="preserve">Langkah pertama membuat file dokumetasi yang berguna untuk mengetik proses dalam setiap tahap dalam mengerjakan project ini. Berisi </w:t>
-      </w:r>
-      <w:r>
-        <w:rPr>
-          <w:rFonts w:ascii="Times New Roman" w:hAnsi="Times New Roman" w:cs="Times New Roman"/>
-          <w:lang w:val="en-GB"/>
-        </w:rPr>
-        <w:t xml:space="preserve">gambar </w:t>
+        <w:t xml:space="preserve">Langkah </w:t>
+      </w:r>
+      <w:proofErr w:type="spellStart"/>
+      <w:r>
+        <w:rPr>
+          <w:rFonts w:ascii="Times New Roman" w:hAnsi="Times New Roman" w:cs="Times New Roman"/>
+          <w:lang w:val="en-GB"/>
+        </w:rPr>
+        <w:t>pertama</w:t>
+      </w:r>
+      <w:proofErr w:type="spellEnd"/>
+      <w:r>
+        <w:rPr>
+          <w:rFonts w:ascii="Times New Roman" w:hAnsi="Times New Roman" w:cs="Times New Roman"/>
+          <w:lang w:val="en-GB"/>
+        </w:rPr>
+        <w:t xml:space="preserve"> </w:t>
+      </w:r>
+      <w:proofErr w:type="spellStart"/>
+      <w:r>
+        <w:rPr>
+          <w:rFonts w:ascii="Times New Roman" w:hAnsi="Times New Roman" w:cs="Times New Roman"/>
+          <w:lang w:val="en-GB"/>
+        </w:rPr>
+        <w:t>membuat</w:t>
+      </w:r>
+      <w:proofErr w:type="spellEnd"/>
+      <w:r>
+        <w:rPr>
+          <w:rFonts w:ascii="Times New Roman" w:hAnsi="Times New Roman" w:cs="Times New Roman"/>
+          <w:lang w:val="en-GB"/>
+        </w:rPr>
+        <w:t xml:space="preserve"> file </w:t>
+      </w:r>
+      <w:proofErr w:type="spellStart"/>
+      <w:r>
+        <w:rPr>
+          <w:rFonts w:ascii="Times New Roman" w:hAnsi="Times New Roman" w:cs="Times New Roman"/>
+          <w:lang w:val="en-GB"/>
+        </w:rPr>
+        <w:t>dokumetasi</w:t>
+      </w:r>
+      <w:proofErr w:type="spellEnd"/>
+      <w:r>
+        <w:rPr>
+          <w:rFonts w:ascii="Times New Roman" w:hAnsi="Times New Roman" w:cs="Times New Roman"/>
+          <w:lang w:val="en-GB"/>
+        </w:rPr>
+        <w:t xml:space="preserve"> yang </w:t>
+      </w:r>
+      <w:proofErr w:type="spellStart"/>
+      <w:r>
+        <w:rPr>
+          <w:rFonts w:ascii="Times New Roman" w:hAnsi="Times New Roman" w:cs="Times New Roman"/>
+          <w:lang w:val="en-GB"/>
+        </w:rPr>
+        <w:t>berguna</w:t>
+      </w:r>
+      <w:proofErr w:type="spellEnd"/>
+      <w:r>
+        <w:rPr>
+          <w:rFonts w:ascii="Times New Roman" w:hAnsi="Times New Roman" w:cs="Times New Roman"/>
+          <w:lang w:val="en-GB"/>
+        </w:rPr>
+        <w:t xml:space="preserve"> </w:t>
+      </w:r>
+      <w:proofErr w:type="spellStart"/>
+      <w:r>
+        <w:rPr>
+          <w:rFonts w:ascii="Times New Roman" w:hAnsi="Times New Roman" w:cs="Times New Roman"/>
+          <w:lang w:val="en-GB"/>
+        </w:rPr>
+        <w:t>untuk</w:t>
+      </w:r>
+      <w:proofErr w:type="spellEnd"/>
+      <w:r>
+        <w:rPr>
+          <w:rFonts w:ascii="Times New Roman" w:hAnsi="Times New Roman" w:cs="Times New Roman"/>
+          <w:lang w:val="en-GB"/>
+        </w:rPr>
+        <w:t xml:space="preserve"> </w:t>
+      </w:r>
+      <w:proofErr w:type="spellStart"/>
+      <w:r>
+        <w:rPr>
+          <w:rFonts w:ascii="Times New Roman" w:hAnsi="Times New Roman" w:cs="Times New Roman"/>
+          <w:lang w:val="en-GB"/>
+        </w:rPr>
+        <w:t>mengetik</w:t>
+      </w:r>
+      <w:proofErr w:type="spellEnd"/>
+      <w:r>
+        <w:rPr>
+          <w:rFonts w:ascii="Times New Roman" w:hAnsi="Times New Roman" w:cs="Times New Roman"/>
+          <w:lang w:val="en-GB"/>
+        </w:rPr>
+        <w:t xml:space="preserve"> proses </w:t>
+      </w:r>
+      <w:proofErr w:type="spellStart"/>
+      <w:r>
+        <w:rPr>
+          <w:rFonts w:ascii="Times New Roman" w:hAnsi="Times New Roman" w:cs="Times New Roman"/>
+          <w:lang w:val="en-GB"/>
+        </w:rPr>
+        <w:t>dalam</w:t>
+      </w:r>
+      <w:proofErr w:type="spellEnd"/>
+      <w:r>
+        <w:rPr>
+          <w:rFonts w:ascii="Times New Roman" w:hAnsi="Times New Roman" w:cs="Times New Roman"/>
+          <w:lang w:val="en-GB"/>
+        </w:rPr>
+        <w:t xml:space="preserve"> </w:t>
+      </w:r>
+      <w:proofErr w:type="spellStart"/>
+      <w:r>
+        <w:rPr>
+          <w:rFonts w:ascii="Times New Roman" w:hAnsi="Times New Roman" w:cs="Times New Roman"/>
+          <w:lang w:val="en-GB"/>
+        </w:rPr>
+        <w:t>setiap</w:t>
+      </w:r>
+      <w:proofErr w:type="spellEnd"/>
+      <w:r>
+        <w:rPr>
+          <w:rFonts w:ascii="Times New Roman" w:hAnsi="Times New Roman" w:cs="Times New Roman"/>
+          <w:lang w:val="en-GB"/>
+        </w:rPr>
+        <w:t xml:space="preserve"> </w:t>
+      </w:r>
+      <w:proofErr w:type="spellStart"/>
+      <w:r>
+        <w:rPr>
+          <w:rFonts w:ascii="Times New Roman" w:hAnsi="Times New Roman" w:cs="Times New Roman"/>
+          <w:lang w:val="en-GB"/>
+        </w:rPr>
+        <w:t>tahap</w:t>
+      </w:r>
+      <w:proofErr w:type="spellEnd"/>
+      <w:r>
+        <w:rPr>
+          <w:rFonts w:ascii="Times New Roman" w:hAnsi="Times New Roman" w:cs="Times New Roman"/>
+          <w:lang w:val="en-GB"/>
+        </w:rPr>
+        <w:t xml:space="preserve"> </w:t>
+      </w:r>
+      <w:proofErr w:type="spellStart"/>
+      <w:r>
+        <w:rPr>
+          <w:rFonts w:ascii="Times New Roman" w:hAnsi="Times New Roman" w:cs="Times New Roman"/>
+          <w:lang w:val="en-GB"/>
+        </w:rPr>
+        <w:t>dalam</w:t>
+      </w:r>
+      <w:proofErr w:type="spellEnd"/>
+      <w:r>
+        <w:rPr>
+          <w:rFonts w:ascii="Times New Roman" w:hAnsi="Times New Roman" w:cs="Times New Roman"/>
+          <w:lang w:val="en-GB"/>
+        </w:rPr>
+        <w:t xml:space="preserve"> </w:t>
+      </w:r>
+      <w:proofErr w:type="spellStart"/>
+      <w:r>
+        <w:rPr>
+          <w:rFonts w:ascii="Times New Roman" w:hAnsi="Times New Roman" w:cs="Times New Roman"/>
+          <w:lang w:val="en-GB"/>
+        </w:rPr>
+        <w:t>mengerjakan</w:t>
+      </w:r>
+      <w:proofErr w:type="spellEnd"/>
+      <w:r>
+        <w:rPr>
+          <w:rFonts w:ascii="Times New Roman" w:hAnsi="Times New Roman" w:cs="Times New Roman"/>
+          <w:lang w:val="en-GB"/>
+        </w:rPr>
+        <w:t xml:space="preserve"> project </w:t>
+      </w:r>
+      <w:proofErr w:type="spellStart"/>
+      <w:r>
+        <w:rPr>
+          <w:rFonts w:ascii="Times New Roman" w:hAnsi="Times New Roman" w:cs="Times New Roman"/>
+          <w:lang w:val="en-GB"/>
+        </w:rPr>
+        <w:t>ini</w:t>
+      </w:r>
+      <w:proofErr w:type="spellEnd"/>
+      <w:r>
+        <w:rPr>
+          <w:rFonts w:ascii="Times New Roman" w:hAnsi="Times New Roman" w:cs="Times New Roman"/>
+          <w:lang w:val="en-GB"/>
+        </w:rPr>
+        <w:t xml:space="preserve">. </w:t>
+      </w:r>
+      <w:proofErr w:type="spellStart"/>
+      <w:r>
+        <w:rPr>
+          <w:rFonts w:ascii="Times New Roman" w:hAnsi="Times New Roman" w:cs="Times New Roman"/>
+          <w:lang w:val="en-GB"/>
+        </w:rPr>
+        <w:t>Berisi</w:t>
+      </w:r>
+      <w:proofErr w:type="spellEnd"/>
+      <w:r>
+        <w:rPr>
+          <w:rFonts w:ascii="Times New Roman" w:hAnsi="Times New Roman" w:cs="Times New Roman"/>
+          <w:lang w:val="en-GB"/>
+        </w:rPr>
+        <w:t xml:space="preserve"> </w:t>
+      </w:r>
+      <w:proofErr w:type="spellStart"/>
+      <w:r>
+        <w:rPr>
+          <w:rFonts w:ascii="Times New Roman" w:hAnsi="Times New Roman" w:cs="Times New Roman"/>
+          <w:lang w:val="en-GB"/>
+        </w:rPr>
+        <w:t>gambar</w:t>
+      </w:r>
+      <w:proofErr w:type="spellEnd"/>
+      <w:r>
+        <w:rPr>
+          <w:rFonts w:ascii="Times New Roman" w:hAnsi="Times New Roman" w:cs="Times New Roman"/>
+          <w:lang w:val="en-GB"/>
+        </w:rPr>
+        <w:t xml:space="preserve"> </w:t>
       </w:r>
       <w:r>
         <w:rPr>
@@ -558,33 +1497,136 @@
           <w:rFonts w:ascii="Times New Roman" w:hAnsi="Times New Roman" w:cs="Times New Roman"/>
           <w:lang w:val="en-GB"/>
         </w:rPr>
-        <w:t xml:space="preserve"> dan penjelasan kegiatan yang dilakukan.</w:t>
-      </w:r>
-    </w:p>
-    <w:p>
-      <w:pPr>
-        <w:contextualSpacing/>
-        <w:rPr>
-          <w:rFonts w:ascii="Times New Roman" w:hAnsi="Times New Roman" w:cs="Times New Roman"/>
-          <w:lang w:val="en-GB"/>
-        </w:rPr>
-      </w:pPr>
-    </w:p>
-    <w:p>
-      <w:pPr>
-        <w:contextualSpacing/>
-        <w:rPr>
-          <w:rFonts w:ascii="Times New Roman" w:hAnsi="Times New Roman" w:cs="Times New Roman"/>
-          <w:lang w:val="en-GB"/>
-        </w:rPr>
-      </w:pPr>
-      <w:r>
-        <w:rPr>
-          <w:rFonts w:ascii="Times New Roman" w:hAnsi="Times New Roman" w:cs="Times New Roman"/>
-          <w:lang w:val="en-GB"/>
-        </w:rPr>
-        <w:t>3. Membuat dokumentasi awal</w:t>
-      </w:r>
+        <w:t xml:space="preserve"> dan </w:t>
+      </w:r>
+      <w:proofErr w:type="spellStart"/>
+      <w:r>
+        <w:rPr>
+          <w:rFonts w:ascii="Times New Roman" w:hAnsi="Times New Roman" w:cs="Times New Roman"/>
+          <w:lang w:val="en-GB"/>
+        </w:rPr>
+        <w:t>penjelasan</w:t>
+      </w:r>
+      <w:proofErr w:type="spellEnd"/>
+      <w:r>
+        <w:rPr>
+          <w:rFonts w:ascii="Times New Roman" w:hAnsi="Times New Roman" w:cs="Times New Roman"/>
+          <w:lang w:val="en-GB"/>
+        </w:rPr>
+        <w:t xml:space="preserve"> </w:t>
+      </w:r>
+      <w:proofErr w:type="spellStart"/>
+      <w:r>
+        <w:rPr>
+          <w:rFonts w:ascii="Times New Roman" w:hAnsi="Times New Roman" w:cs="Times New Roman"/>
+          <w:lang w:val="en-GB"/>
+        </w:rPr>
+        <w:t>kegiatan</w:t>
+      </w:r>
+      <w:proofErr w:type="spellEnd"/>
+      <w:r>
+        <w:rPr>
+          <w:rFonts w:ascii="Times New Roman" w:hAnsi="Times New Roman" w:cs="Times New Roman"/>
+          <w:lang w:val="en-GB"/>
+        </w:rPr>
+        <w:t xml:space="preserve"> yang </w:t>
+      </w:r>
+      <w:proofErr w:type="spellStart"/>
+      <w:r>
+        <w:rPr>
+          <w:rFonts w:ascii="Times New Roman" w:hAnsi="Times New Roman" w:cs="Times New Roman"/>
+          <w:lang w:val="en-GB"/>
+        </w:rPr>
+        <w:t>dilakukan</w:t>
+      </w:r>
+      <w:proofErr w:type="spellEnd"/>
+      <w:r>
+        <w:rPr>
+          <w:rFonts w:ascii="Times New Roman" w:hAnsi="Times New Roman" w:cs="Times New Roman"/>
+          <w:lang w:val="en-GB"/>
+        </w:rPr>
+        <w:t>.</w:t>
+      </w:r>
+    </w:p>
+    <w:p>
+      <w:pPr>
+        <w:contextualSpacing/>
+        <w:rPr>
+          <w:rFonts w:ascii="Times New Roman" w:hAnsi="Times New Roman" w:cs="Times New Roman"/>
+          <w:lang w:val="en-GB"/>
+        </w:rPr>
+      </w:pPr>
+    </w:p>
+    <w:p>
+      <w:pPr>
+        <w:contextualSpacing/>
+        <w:rPr>
+          <w:rFonts w:ascii="Times New Roman" w:hAnsi="Times New Roman" w:cs="Times New Roman"/>
+          <w:b/>
+          <w:bCs/>
+          <w:lang w:val="en-GB"/>
+        </w:rPr>
+      </w:pPr>
+      <w:r>
+        <w:rPr>
+          <w:rFonts w:ascii="Times New Roman" w:hAnsi="Times New Roman" w:cs="Times New Roman"/>
+          <w:b/>
+          <w:bCs/>
+          <w:lang w:val="en-GB"/>
+        </w:rPr>
+        <w:t xml:space="preserve">3. </w:t>
+      </w:r>
+      <w:proofErr w:type="spellStart"/>
+      <w:r>
+        <w:rPr>
+          <w:rFonts w:ascii="Times New Roman" w:hAnsi="Times New Roman" w:cs="Times New Roman"/>
+          <w:b/>
+          <w:bCs/>
+          <w:lang w:val="en-GB"/>
+        </w:rPr>
+        <w:t>Membuat</w:t>
+      </w:r>
+      <w:proofErr w:type="spellEnd"/>
+      <w:r>
+        <w:rPr>
+          <w:rFonts w:ascii="Times New Roman" w:hAnsi="Times New Roman" w:cs="Times New Roman"/>
+          <w:b/>
+          <w:bCs/>
+          <w:lang w:val="en-GB"/>
+        </w:rPr>
+        <w:t xml:space="preserve"> </w:t>
+      </w:r>
+      <w:proofErr w:type="spellStart"/>
+      <w:r>
+        <w:rPr>
+          <w:rFonts w:ascii="Times New Roman" w:hAnsi="Times New Roman" w:cs="Times New Roman"/>
+          <w:b/>
+          <w:bCs/>
+          <w:lang w:val="en-GB"/>
+        </w:rPr>
+        <w:t>dokumentasi</w:t>
+      </w:r>
+      <w:proofErr w:type="spellEnd"/>
+      <w:r>
+        <w:rPr>
+          <w:rFonts w:ascii="Times New Roman" w:hAnsi="Times New Roman" w:cs="Times New Roman"/>
+          <w:b/>
+          <w:bCs/>
+          <w:lang w:val="en-GB"/>
+        </w:rPr>
+        <w:t xml:space="preserve"> </w:t>
+      </w:r>
+      <w:proofErr w:type="spellStart"/>
+      <w:r>
+        <w:rPr>
+          <w:rFonts w:ascii="Times New Roman" w:hAnsi="Times New Roman" w:cs="Times New Roman"/>
+          <w:b/>
+          <w:bCs/>
+          <w:lang w:val="en-GB"/>
+        </w:rPr>
+        <w:t>awal</w:t>
+      </w:r>
+      <w:proofErr w:type="spellEnd"/>
     </w:p>
     <w:p>
       <w:pPr>
@@ -643,64 +1685,367 @@
           <w:lang w:val="en-GB"/>
         </w:rPr>
       </w:pPr>
-      <w:r>
-        <w:rPr>
-          <w:rFonts w:ascii="Times New Roman" w:hAnsi="Times New Roman" w:cs="Times New Roman"/>
-          <w:lang w:val="en-GB"/>
-        </w:rPr>
-        <w:t>Dokumentasi awal project untuk Gambaran awal tentang project ini, sehingga siapa saja yang melihat bisa mengerti dan memahami tentang tentang project ini.</w:t>
-      </w:r>
-    </w:p>
-    <w:p>
-      <w:pPr>
-        <w:contextualSpacing/>
-        <w:rPr>
-          <w:rFonts w:ascii="Times New Roman" w:hAnsi="Times New Roman" w:cs="Times New Roman"/>
-          <w:lang w:val="en-GB"/>
-        </w:rPr>
-      </w:pPr>
-    </w:p>
-    <w:p>
-      <w:pPr>
-        <w:contextualSpacing/>
-        <w:rPr>
-          <w:rFonts w:ascii="Times New Roman" w:hAnsi="Times New Roman" w:cs="Times New Roman"/>
-          <w:lang w:val="en-GB"/>
-        </w:rPr>
-      </w:pPr>
-    </w:p>
-    <w:p>
-      <w:pPr>
-        <w:contextualSpacing/>
-        <w:rPr>
-          <w:rFonts w:ascii="Times New Roman" w:hAnsi="Times New Roman" w:cs="Times New Roman"/>
-          <w:lang w:val="en-GB"/>
-        </w:rPr>
-      </w:pPr>
-      <w:r>
-        <w:rPr>
-          <w:rFonts w:ascii="Times New Roman" w:hAnsi="Times New Roman" w:cs="Times New Roman"/>
+      <w:proofErr w:type="spellStart"/>
+      <w:r>
+        <w:rPr>
+          <w:rFonts w:ascii="Times New Roman" w:hAnsi="Times New Roman" w:cs="Times New Roman"/>
+          <w:lang w:val="en-GB"/>
+        </w:rPr>
+        <w:t>Dokumentasi</w:t>
+      </w:r>
+      <w:proofErr w:type="spellEnd"/>
+      <w:r>
+        <w:rPr>
+          <w:rFonts w:ascii="Times New Roman" w:hAnsi="Times New Roman" w:cs="Times New Roman"/>
+          <w:lang w:val="en-GB"/>
+        </w:rPr>
+        <w:t xml:space="preserve"> </w:t>
+      </w:r>
+      <w:proofErr w:type="spellStart"/>
+      <w:r>
+        <w:rPr>
+          <w:rFonts w:ascii="Times New Roman" w:hAnsi="Times New Roman" w:cs="Times New Roman"/>
+          <w:lang w:val="en-GB"/>
+        </w:rPr>
+        <w:t>awal</w:t>
+      </w:r>
+      <w:proofErr w:type="spellEnd"/>
+      <w:r>
+        <w:rPr>
+          <w:rFonts w:ascii="Times New Roman" w:hAnsi="Times New Roman" w:cs="Times New Roman"/>
+          <w:lang w:val="en-GB"/>
+        </w:rPr>
+        <w:t xml:space="preserve"> project </w:t>
+      </w:r>
+      <w:proofErr w:type="spellStart"/>
+      <w:r>
+        <w:rPr>
+          <w:rFonts w:ascii="Times New Roman" w:hAnsi="Times New Roman" w:cs="Times New Roman"/>
+          <w:lang w:val="en-GB"/>
+        </w:rPr>
+        <w:t>untuk</w:t>
+      </w:r>
+      <w:proofErr w:type="spellEnd"/>
+      <w:r>
+        <w:rPr>
+          <w:rFonts w:ascii="Times New Roman" w:hAnsi="Times New Roman" w:cs="Times New Roman"/>
+          <w:lang w:val="en-GB"/>
+        </w:rPr>
+        <w:t xml:space="preserve"> Gambaran </w:t>
+      </w:r>
+      <w:proofErr w:type="spellStart"/>
+      <w:r>
+        <w:rPr>
+          <w:rFonts w:ascii="Times New Roman" w:hAnsi="Times New Roman" w:cs="Times New Roman"/>
+          <w:lang w:val="en-GB"/>
+        </w:rPr>
+        <w:t>awal</w:t>
+      </w:r>
+      <w:proofErr w:type="spellEnd"/>
+      <w:r>
+        <w:rPr>
+          <w:rFonts w:ascii="Times New Roman" w:hAnsi="Times New Roman" w:cs="Times New Roman"/>
+          <w:lang w:val="en-GB"/>
+        </w:rPr>
+        <w:t xml:space="preserve"> </w:t>
+      </w:r>
+      <w:proofErr w:type="spellStart"/>
+      <w:r>
+        <w:rPr>
+          <w:rFonts w:ascii="Times New Roman" w:hAnsi="Times New Roman" w:cs="Times New Roman"/>
+          <w:lang w:val="en-GB"/>
+        </w:rPr>
+        <w:t>tentang</w:t>
+      </w:r>
+      <w:proofErr w:type="spellEnd"/>
+      <w:r>
+        <w:rPr>
+          <w:rFonts w:ascii="Times New Roman" w:hAnsi="Times New Roman" w:cs="Times New Roman"/>
+          <w:lang w:val="en-GB"/>
+        </w:rPr>
+        <w:t xml:space="preserve"> project </w:t>
+      </w:r>
+      <w:proofErr w:type="spellStart"/>
+      <w:r>
+        <w:rPr>
+          <w:rFonts w:ascii="Times New Roman" w:hAnsi="Times New Roman" w:cs="Times New Roman"/>
+          <w:lang w:val="en-GB"/>
+        </w:rPr>
+        <w:t>ini</w:t>
+      </w:r>
+      <w:proofErr w:type="spellEnd"/>
+      <w:r>
+        <w:rPr>
+          <w:rFonts w:ascii="Times New Roman" w:hAnsi="Times New Roman" w:cs="Times New Roman"/>
+          <w:lang w:val="en-GB"/>
+        </w:rPr>
+        <w:t xml:space="preserve">, </w:t>
+      </w:r>
+      <w:proofErr w:type="spellStart"/>
+      <w:r>
+        <w:rPr>
+          <w:rFonts w:ascii="Times New Roman" w:hAnsi="Times New Roman" w:cs="Times New Roman"/>
+          <w:lang w:val="en-GB"/>
+        </w:rPr>
+        <w:t>sehingga</w:t>
+      </w:r>
+      <w:proofErr w:type="spellEnd"/>
+      <w:r>
+        <w:rPr>
+          <w:rFonts w:ascii="Times New Roman" w:hAnsi="Times New Roman" w:cs="Times New Roman"/>
+          <w:lang w:val="en-GB"/>
+        </w:rPr>
+        <w:t xml:space="preserve"> </w:t>
+      </w:r>
+      <w:proofErr w:type="spellStart"/>
+      <w:r>
+        <w:rPr>
+          <w:rFonts w:ascii="Times New Roman" w:hAnsi="Times New Roman" w:cs="Times New Roman"/>
+          <w:lang w:val="en-GB"/>
+        </w:rPr>
+        <w:t>siapa</w:t>
+      </w:r>
+      <w:proofErr w:type="spellEnd"/>
+      <w:r>
+        <w:rPr>
+          <w:rFonts w:ascii="Times New Roman" w:hAnsi="Times New Roman" w:cs="Times New Roman"/>
+          <w:lang w:val="en-GB"/>
+        </w:rPr>
+        <w:t xml:space="preserve"> </w:t>
+      </w:r>
+      <w:proofErr w:type="spellStart"/>
+      <w:r>
+        <w:rPr>
+          <w:rFonts w:ascii="Times New Roman" w:hAnsi="Times New Roman" w:cs="Times New Roman"/>
+          <w:lang w:val="en-GB"/>
+        </w:rPr>
+        <w:t>saja</w:t>
+      </w:r>
+      <w:proofErr w:type="spellEnd"/>
+      <w:r>
+        <w:rPr>
+          <w:rFonts w:ascii="Times New Roman" w:hAnsi="Times New Roman" w:cs="Times New Roman"/>
+          <w:lang w:val="en-GB"/>
+        </w:rPr>
+        <w:t xml:space="preserve"> yang </w:t>
+      </w:r>
+      <w:proofErr w:type="spellStart"/>
+      <w:r>
+        <w:rPr>
+          <w:rFonts w:ascii="Times New Roman" w:hAnsi="Times New Roman" w:cs="Times New Roman"/>
+          <w:lang w:val="en-GB"/>
+        </w:rPr>
+        <w:t>melihat</w:t>
+      </w:r>
+      <w:proofErr w:type="spellEnd"/>
+      <w:r>
+        <w:rPr>
+          <w:rFonts w:ascii="Times New Roman" w:hAnsi="Times New Roman" w:cs="Times New Roman"/>
+          <w:lang w:val="en-GB"/>
+        </w:rPr>
+        <w:t xml:space="preserve"> </w:t>
+      </w:r>
+      <w:proofErr w:type="spellStart"/>
+      <w:r>
+        <w:rPr>
+          <w:rFonts w:ascii="Times New Roman" w:hAnsi="Times New Roman" w:cs="Times New Roman"/>
+          <w:lang w:val="en-GB"/>
+        </w:rPr>
+        <w:t>bisa</w:t>
+      </w:r>
+      <w:proofErr w:type="spellEnd"/>
+      <w:r>
+        <w:rPr>
+          <w:rFonts w:ascii="Times New Roman" w:hAnsi="Times New Roman" w:cs="Times New Roman"/>
+          <w:lang w:val="en-GB"/>
+        </w:rPr>
+        <w:t xml:space="preserve"> </w:t>
+      </w:r>
+      <w:proofErr w:type="spellStart"/>
+      <w:r>
+        <w:rPr>
+          <w:rFonts w:ascii="Times New Roman" w:hAnsi="Times New Roman" w:cs="Times New Roman"/>
+          <w:lang w:val="en-GB"/>
+        </w:rPr>
+        <w:t>mengerti</w:t>
+      </w:r>
+      <w:proofErr w:type="spellEnd"/>
+      <w:r>
+        <w:rPr>
+          <w:rFonts w:ascii="Times New Roman" w:hAnsi="Times New Roman" w:cs="Times New Roman"/>
+          <w:lang w:val="en-GB"/>
+        </w:rPr>
+        <w:t xml:space="preserve"> dan </w:t>
+      </w:r>
+      <w:proofErr w:type="spellStart"/>
+      <w:r>
+        <w:rPr>
+          <w:rFonts w:ascii="Times New Roman" w:hAnsi="Times New Roman" w:cs="Times New Roman"/>
+          <w:lang w:val="en-GB"/>
+        </w:rPr>
+        <w:t>memahami</w:t>
+      </w:r>
+      <w:proofErr w:type="spellEnd"/>
+      <w:r>
+        <w:rPr>
+          <w:rFonts w:ascii="Times New Roman" w:hAnsi="Times New Roman" w:cs="Times New Roman"/>
+          <w:lang w:val="en-GB"/>
+        </w:rPr>
+        <w:t xml:space="preserve"> </w:t>
+      </w:r>
+      <w:proofErr w:type="spellStart"/>
+      <w:r>
+        <w:rPr>
+          <w:rFonts w:ascii="Times New Roman" w:hAnsi="Times New Roman" w:cs="Times New Roman"/>
+          <w:lang w:val="en-GB"/>
+        </w:rPr>
+        <w:t>tentang</w:t>
+      </w:r>
+      <w:proofErr w:type="spellEnd"/>
+      <w:r>
+        <w:rPr>
+          <w:rFonts w:ascii="Times New Roman" w:hAnsi="Times New Roman" w:cs="Times New Roman"/>
+          <w:lang w:val="en-GB"/>
+        </w:rPr>
+        <w:t xml:space="preserve"> </w:t>
+      </w:r>
+      <w:proofErr w:type="spellStart"/>
+      <w:r>
+        <w:rPr>
+          <w:rFonts w:ascii="Times New Roman" w:hAnsi="Times New Roman" w:cs="Times New Roman"/>
+          <w:lang w:val="en-GB"/>
+        </w:rPr>
+        <w:t>tentang</w:t>
+      </w:r>
+      <w:proofErr w:type="spellEnd"/>
+      <w:r>
+        <w:rPr>
+          <w:rFonts w:ascii="Times New Roman" w:hAnsi="Times New Roman" w:cs="Times New Roman"/>
+          <w:lang w:val="en-GB"/>
+        </w:rPr>
+        <w:t xml:space="preserve"> project </w:t>
+      </w:r>
+      <w:proofErr w:type="spellStart"/>
+      <w:r>
+        <w:rPr>
+          <w:rFonts w:ascii="Times New Roman" w:hAnsi="Times New Roman" w:cs="Times New Roman"/>
+          <w:lang w:val="en-GB"/>
+        </w:rPr>
+        <w:t>ini</w:t>
+      </w:r>
+      <w:proofErr w:type="spellEnd"/>
+      <w:r>
+        <w:rPr>
+          <w:rFonts w:ascii="Times New Roman" w:hAnsi="Times New Roman" w:cs="Times New Roman"/>
+          <w:lang w:val="en-GB"/>
+        </w:rPr>
+        <w:t>.</w:t>
+      </w:r>
+    </w:p>
+    <w:p>
+      <w:pPr>
+        <w:contextualSpacing/>
+        <w:rPr>
+          <w:rFonts w:ascii="Times New Roman" w:hAnsi="Times New Roman" w:cs="Times New Roman"/>
+          <w:lang w:val="en-GB"/>
+        </w:rPr>
+      </w:pPr>
+    </w:p>
+    <w:p>
+      <w:pPr>
+        <w:contextualSpacing/>
+        <w:rPr>
+          <w:rFonts w:ascii="Times New Roman" w:hAnsi="Times New Roman" w:cs="Times New Roman"/>
+          <w:lang w:val="en-GB"/>
+        </w:rPr>
+      </w:pPr>
+    </w:p>
+    <w:p>
+      <w:pPr>
+        <w:contextualSpacing/>
+        <w:rPr>
+          <w:rFonts w:ascii="Times New Roman" w:hAnsi="Times New Roman" w:cs="Times New Roman"/>
+          <w:b/>
+          <w:bCs/>
+          <w:lang w:val="en-GB"/>
+        </w:rPr>
+      </w:pPr>
+      <w:r>
+        <w:rPr>
+          <w:rFonts w:ascii="Times New Roman" w:hAnsi="Times New Roman" w:cs="Times New Roman"/>
+          <w:b/>
+          <w:bCs/>
           <w:lang w:val="en-GB"/>
         </w:rPr>
         <w:lastRenderedPageBreak/>
-        <w:t xml:space="preserve">4. Membuat file </w:t>
-      </w:r>
-      <w:r>
-        <w:rPr>
-          <w:rFonts w:ascii="Times New Roman" w:hAnsi="Times New Roman" w:cs="Times New Roman"/>
-          <w:lang w:val="en-GB"/>
-        </w:rPr>
-        <w:t>.gitignore</w:t>
-      </w:r>
-      <w:r>
-        <w:rPr>
-          <w:rFonts w:ascii="Times New Roman" w:hAnsi="Times New Roman" w:cs="Times New Roman"/>
+        <w:t xml:space="preserve">4. </w:t>
+      </w:r>
+      <w:proofErr w:type="spellStart"/>
+      <w:r>
+        <w:rPr>
+          <w:rFonts w:ascii="Times New Roman" w:hAnsi="Times New Roman" w:cs="Times New Roman"/>
+          <w:b/>
+          <w:bCs/>
+          <w:lang w:val="en-GB"/>
+        </w:rPr>
+        <w:t>Membuat</w:t>
+      </w:r>
+      <w:proofErr w:type="spellEnd"/>
+      <w:r>
+        <w:rPr>
+          <w:rFonts w:ascii="Times New Roman" w:hAnsi="Times New Roman" w:cs="Times New Roman"/>
+          <w:b/>
+          <w:bCs/>
+          <w:lang w:val="en-GB"/>
+        </w:rPr>
+        <w:t xml:space="preserve"> </w:t>
+      </w:r>
+      <w:proofErr w:type="gramStart"/>
+      <w:r>
+        <w:rPr>
+          <w:rFonts w:ascii="Times New Roman" w:hAnsi="Times New Roman" w:cs="Times New Roman"/>
+          <w:b/>
+          <w:bCs/>
+          <w:lang w:val="en-GB"/>
+        </w:rPr>
+        <w:t>file .</w:t>
+      </w:r>
+      <w:proofErr w:type="spellStart"/>
+      <w:r>
+        <w:rPr>
+          <w:rFonts w:ascii="Times New Roman" w:hAnsi="Times New Roman" w:cs="Times New Roman"/>
+          <w:b/>
+          <w:bCs/>
+          <w:lang w:val="en-GB"/>
+        </w:rPr>
+        <w:t>gitignore</w:t>
+      </w:r>
+      <w:proofErr w:type="spellEnd"/>
+      <w:proofErr w:type="gramEnd"/>
+      <w:r>
+        <w:rPr>
+          <w:rFonts w:ascii="Times New Roman" w:hAnsi="Times New Roman" w:cs="Times New Roman"/>
+          <w:b/>
+          <w:bCs/>
           <w:lang w:val="en-GB"/>
         </w:rPr>
         <w:t xml:space="preserve"> pada folder </w:t>
       </w:r>
-      <w:r>
-        <w:t>sigersync-backend.</w:t>
+      <w:proofErr w:type="spellStart"/>
+      <w:r>
+        <w:rPr>
+          <w:b/>
+          <w:bCs/>
+        </w:rPr>
+        <w:t>sigersync</w:t>
+      </w:r>
+      <w:proofErr w:type="spellEnd"/>
+      <w:r>
+        <w:rPr>
+          <w:b/>
+          <w:bCs/>
+        </w:rPr>
+        <w:t>-backend.</w:t>
       </w:r>
     </w:p>
     <w:p>
@@ -770,12 +2115,286 @@
           <w:lang w:val="en-GB"/>
         </w:rPr>
       </w:pPr>
-      <w:r>
-        <w:rPr>
-          <w:rFonts w:ascii="Times New Roman" w:hAnsi="Times New Roman" w:cs="Times New Roman"/>
-          <w:lang w:val="en-GB"/>
-        </w:rPr>
-        <w:t>Membuat file .gitignore pada folder sigersync-backend. File ini memberitahu Git file mana yang tidak boleh di-track. Karena file pendukungnya bisa di instal pada masing-masing laptop atau komputer pada setiap anggota atau bagi yang clone project ini nantinya.</w:t>
+      <w:proofErr w:type="spellStart"/>
+      <w:r>
+        <w:rPr>
+          <w:rFonts w:ascii="Times New Roman" w:hAnsi="Times New Roman" w:cs="Times New Roman"/>
+          <w:lang w:val="en-GB"/>
+        </w:rPr>
+        <w:t>Membuat</w:t>
+      </w:r>
+      <w:proofErr w:type="spellEnd"/>
+      <w:r>
+        <w:rPr>
+          <w:rFonts w:ascii="Times New Roman" w:hAnsi="Times New Roman" w:cs="Times New Roman"/>
+          <w:lang w:val="en-GB"/>
+        </w:rPr>
+        <w:t xml:space="preserve"> </w:t>
+      </w:r>
+      <w:proofErr w:type="gramStart"/>
+      <w:r>
+        <w:rPr>
+          <w:rFonts w:ascii="Times New Roman" w:hAnsi="Times New Roman" w:cs="Times New Roman"/>
+          <w:lang w:val="en-GB"/>
+        </w:rPr>
+        <w:t>file .</w:t>
+      </w:r>
+      <w:proofErr w:type="spellStart"/>
+      <w:r>
+        <w:rPr>
+          <w:rFonts w:ascii="Times New Roman" w:hAnsi="Times New Roman" w:cs="Times New Roman"/>
+          <w:lang w:val="en-GB"/>
+        </w:rPr>
+        <w:t>gitignore</w:t>
+      </w:r>
+      <w:proofErr w:type="spellEnd"/>
+      <w:proofErr w:type="gramEnd"/>
+      <w:r>
+        <w:rPr>
+          <w:rFonts w:ascii="Times New Roman" w:hAnsi="Times New Roman" w:cs="Times New Roman"/>
+          <w:lang w:val="en-GB"/>
+        </w:rPr>
+        <w:t xml:space="preserve"> pada folder </w:t>
+      </w:r>
+      <w:proofErr w:type="spellStart"/>
+      <w:r>
+        <w:rPr>
+          <w:rFonts w:ascii="Times New Roman" w:hAnsi="Times New Roman" w:cs="Times New Roman"/>
+          <w:lang w:val="en-GB"/>
+        </w:rPr>
+        <w:t>sigersync</w:t>
+      </w:r>
+      <w:proofErr w:type="spellEnd"/>
+      <w:r>
+        <w:rPr>
+          <w:rFonts w:ascii="Times New Roman" w:hAnsi="Times New Roman" w:cs="Times New Roman"/>
+          <w:lang w:val="en-GB"/>
+        </w:rPr>
+        <w:t xml:space="preserve">-backend. File </w:t>
+      </w:r>
+      <w:proofErr w:type="spellStart"/>
+      <w:r>
+        <w:rPr>
+          <w:rFonts w:ascii="Times New Roman" w:hAnsi="Times New Roman" w:cs="Times New Roman"/>
+          <w:lang w:val="en-GB"/>
+        </w:rPr>
+        <w:t>ini</w:t>
+      </w:r>
+      <w:proofErr w:type="spellEnd"/>
+      <w:r>
+        <w:rPr>
+          <w:rFonts w:ascii="Times New Roman" w:hAnsi="Times New Roman" w:cs="Times New Roman"/>
+          <w:lang w:val="en-GB"/>
+        </w:rPr>
+        <w:t xml:space="preserve"> </w:t>
+      </w:r>
+      <w:proofErr w:type="spellStart"/>
+      <w:r>
+        <w:rPr>
+          <w:rFonts w:ascii="Times New Roman" w:hAnsi="Times New Roman" w:cs="Times New Roman"/>
+          <w:lang w:val="en-GB"/>
+        </w:rPr>
+        <w:t>memberitahu</w:t>
+      </w:r>
+      <w:proofErr w:type="spellEnd"/>
+      <w:r>
+        <w:rPr>
+          <w:rFonts w:ascii="Times New Roman" w:hAnsi="Times New Roman" w:cs="Times New Roman"/>
+          <w:lang w:val="en-GB"/>
+        </w:rPr>
+        <w:t xml:space="preserve"> Git file mana yang </w:t>
+      </w:r>
+      <w:proofErr w:type="spellStart"/>
+      <w:r>
+        <w:rPr>
+          <w:rFonts w:ascii="Times New Roman" w:hAnsi="Times New Roman" w:cs="Times New Roman"/>
+          <w:lang w:val="en-GB"/>
+        </w:rPr>
+        <w:t>tidak</w:t>
+      </w:r>
+      <w:proofErr w:type="spellEnd"/>
+      <w:r>
+        <w:rPr>
+          <w:rFonts w:ascii="Times New Roman" w:hAnsi="Times New Roman" w:cs="Times New Roman"/>
+          <w:lang w:val="en-GB"/>
+        </w:rPr>
+        <w:t xml:space="preserve"> </w:t>
+      </w:r>
+      <w:proofErr w:type="spellStart"/>
+      <w:r>
+        <w:rPr>
+          <w:rFonts w:ascii="Times New Roman" w:hAnsi="Times New Roman" w:cs="Times New Roman"/>
+          <w:lang w:val="en-GB"/>
+        </w:rPr>
+        <w:t>boleh</w:t>
+      </w:r>
+      <w:proofErr w:type="spellEnd"/>
+      <w:r>
+        <w:rPr>
+          <w:rFonts w:ascii="Times New Roman" w:hAnsi="Times New Roman" w:cs="Times New Roman"/>
+          <w:lang w:val="en-GB"/>
+        </w:rPr>
+        <w:t xml:space="preserve"> di-track. Karena file </w:t>
+      </w:r>
+      <w:proofErr w:type="spellStart"/>
+      <w:r>
+        <w:rPr>
+          <w:rFonts w:ascii="Times New Roman" w:hAnsi="Times New Roman" w:cs="Times New Roman"/>
+          <w:lang w:val="en-GB"/>
+        </w:rPr>
+        <w:t>pendukungnya</w:t>
+      </w:r>
+      <w:proofErr w:type="spellEnd"/>
+      <w:r>
+        <w:rPr>
+          <w:rFonts w:ascii="Times New Roman" w:hAnsi="Times New Roman" w:cs="Times New Roman"/>
+          <w:lang w:val="en-GB"/>
+        </w:rPr>
+        <w:t xml:space="preserve"> </w:t>
+      </w:r>
+      <w:proofErr w:type="spellStart"/>
+      <w:r>
+        <w:rPr>
+          <w:rFonts w:ascii="Times New Roman" w:hAnsi="Times New Roman" w:cs="Times New Roman"/>
+          <w:lang w:val="en-GB"/>
+        </w:rPr>
+        <w:t>bisa</w:t>
+      </w:r>
+      <w:proofErr w:type="spellEnd"/>
+      <w:r>
+        <w:rPr>
+          <w:rFonts w:ascii="Times New Roman" w:hAnsi="Times New Roman" w:cs="Times New Roman"/>
+          <w:lang w:val="en-GB"/>
+        </w:rPr>
+        <w:t xml:space="preserve"> di instal pada masing-masing laptop </w:t>
+      </w:r>
+      <w:proofErr w:type="spellStart"/>
+      <w:r>
+        <w:rPr>
+          <w:rFonts w:ascii="Times New Roman" w:hAnsi="Times New Roman" w:cs="Times New Roman"/>
+          <w:lang w:val="en-GB"/>
+        </w:rPr>
+        <w:t>atau</w:t>
+      </w:r>
+      <w:proofErr w:type="spellEnd"/>
+      <w:r>
+        <w:rPr>
+          <w:rFonts w:ascii="Times New Roman" w:hAnsi="Times New Roman" w:cs="Times New Roman"/>
+          <w:lang w:val="en-GB"/>
+        </w:rPr>
+        <w:t xml:space="preserve"> </w:t>
+      </w:r>
+      <w:proofErr w:type="spellStart"/>
+      <w:r>
+        <w:rPr>
+          <w:rFonts w:ascii="Times New Roman" w:hAnsi="Times New Roman" w:cs="Times New Roman"/>
+          <w:lang w:val="en-GB"/>
+        </w:rPr>
+        <w:t>komputer</w:t>
+      </w:r>
+      <w:proofErr w:type="spellEnd"/>
+      <w:r>
+        <w:rPr>
+          <w:rFonts w:ascii="Times New Roman" w:hAnsi="Times New Roman" w:cs="Times New Roman"/>
+          <w:lang w:val="en-GB"/>
+        </w:rPr>
+        <w:t xml:space="preserve"> pada </w:t>
+      </w:r>
+      <w:proofErr w:type="spellStart"/>
+      <w:r>
+        <w:rPr>
+          <w:rFonts w:ascii="Times New Roman" w:hAnsi="Times New Roman" w:cs="Times New Roman"/>
+          <w:lang w:val="en-GB"/>
+        </w:rPr>
+        <w:t>setiap</w:t>
+      </w:r>
+      <w:proofErr w:type="spellEnd"/>
+      <w:r>
+        <w:rPr>
+          <w:rFonts w:ascii="Times New Roman" w:hAnsi="Times New Roman" w:cs="Times New Roman"/>
+          <w:lang w:val="en-GB"/>
+        </w:rPr>
+        <w:t xml:space="preserve"> </w:t>
+      </w:r>
+      <w:proofErr w:type="spellStart"/>
+      <w:r>
+        <w:rPr>
+          <w:rFonts w:ascii="Times New Roman" w:hAnsi="Times New Roman" w:cs="Times New Roman"/>
+          <w:lang w:val="en-GB"/>
+        </w:rPr>
+        <w:t>anggota</w:t>
+      </w:r>
+      <w:proofErr w:type="spellEnd"/>
+      <w:r>
+        <w:rPr>
+          <w:rFonts w:ascii="Times New Roman" w:hAnsi="Times New Roman" w:cs="Times New Roman"/>
+          <w:lang w:val="en-GB"/>
+        </w:rPr>
+        <w:t xml:space="preserve"> </w:t>
+      </w:r>
+      <w:proofErr w:type="spellStart"/>
+      <w:r>
+        <w:rPr>
+          <w:rFonts w:ascii="Times New Roman" w:hAnsi="Times New Roman" w:cs="Times New Roman"/>
+          <w:lang w:val="en-GB"/>
+        </w:rPr>
+        <w:t>atau</w:t>
+      </w:r>
+      <w:proofErr w:type="spellEnd"/>
+      <w:r>
+        <w:rPr>
+          <w:rFonts w:ascii="Times New Roman" w:hAnsi="Times New Roman" w:cs="Times New Roman"/>
+          <w:lang w:val="en-GB"/>
+        </w:rPr>
+        <w:t xml:space="preserve"> </w:t>
+      </w:r>
+      <w:proofErr w:type="spellStart"/>
+      <w:r>
+        <w:rPr>
+          <w:rFonts w:ascii="Times New Roman" w:hAnsi="Times New Roman" w:cs="Times New Roman"/>
+          <w:lang w:val="en-GB"/>
+        </w:rPr>
+        <w:t>bagi</w:t>
+      </w:r>
+      <w:proofErr w:type="spellEnd"/>
+      <w:r>
+        <w:rPr>
+          <w:rFonts w:ascii="Times New Roman" w:hAnsi="Times New Roman" w:cs="Times New Roman"/>
+          <w:lang w:val="en-GB"/>
+        </w:rPr>
+        <w:t xml:space="preserve"> yang clone project </w:t>
+      </w:r>
+      <w:proofErr w:type="spellStart"/>
+      <w:r>
+        <w:rPr>
+          <w:rFonts w:ascii="Times New Roman" w:hAnsi="Times New Roman" w:cs="Times New Roman"/>
+          <w:lang w:val="en-GB"/>
+        </w:rPr>
+        <w:t>ini</w:t>
+      </w:r>
+      <w:proofErr w:type="spellEnd"/>
+      <w:r>
+        <w:rPr>
+          <w:rFonts w:ascii="Times New Roman" w:hAnsi="Times New Roman" w:cs="Times New Roman"/>
+          <w:lang w:val="en-GB"/>
+        </w:rPr>
+        <w:t xml:space="preserve"> </w:t>
+      </w:r>
+      <w:proofErr w:type="spellStart"/>
+      <w:r>
+        <w:rPr>
+          <w:rFonts w:ascii="Times New Roman" w:hAnsi="Times New Roman" w:cs="Times New Roman"/>
+          <w:lang w:val="en-GB"/>
+        </w:rPr>
+        <w:t>nantinya</w:t>
+      </w:r>
+      <w:proofErr w:type="spellEnd"/>
+      <w:r>
+        <w:rPr>
+          <w:rFonts w:ascii="Times New Roman" w:hAnsi="Times New Roman" w:cs="Times New Roman"/>
+          <w:lang w:val="en-GB"/>
+        </w:rPr>
+        <w:t>.</w:t>
       </w:r>
     </w:p>
     <w:p>
@@ -797,12 +2416,327 @@
           <w:lang w:val="en-GB"/>
         </w:rPr>
       </w:pPr>
-      <w:r>
-        <w:rPr>
-          <w:rFonts w:ascii="Times New Roman" w:hAnsi="Times New Roman" w:cs="Times New Roman"/>
-          <w:lang w:val="en-GB"/>
-        </w:rPr>
-        <w:t>File .gitignore sangat  bermanfaat karena file-file yang tidak penting tidak ikut terupload ke github sehingga mengurangi ukuran file projectnya. Repository tetap ringan dan tidak ada file sensitif yang di-commit.</w:t>
+      <w:proofErr w:type="gramStart"/>
+      <w:r>
+        <w:rPr>
+          <w:rFonts w:ascii="Times New Roman" w:hAnsi="Times New Roman" w:cs="Times New Roman"/>
+          <w:lang w:val="en-GB"/>
+        </w:rPr>
+        <w:t>File .</w:t>
+      </w:r>
+      <w:proofErr w:type="spellStart"/>
+      <w:r>
+        <w:rPr>
+          <w:rFonts w:ascii="Times New Roman" w:hAnsi="Times New Roman" w:cs="Times New Roman"/>
+          <w:lang w:val="en-GB"/>
+        </w:rPr>
+        <w:t>gitignore</w:t>
+      </w:r>
+      <w:proofErr w:type="spellEnd"/>
+      <w:proofErr w:type="gramEnd"/>
+      <w:r>
+        <w:rPr>
+          <w:rFonts w:ascii="Times New Roman" w:hAnsi="Times New Roman" w:cs="Times New Roman"/>
+          <w:lang w:val="en-GB"/>
+        </w:rPr>
+        <w:t xml:space="preserve"> </w:t>
+      </w:r>
+      <w:proofErr w:type="gramStart"/>
+      <w:r>
+        <w:rPr>
+          <w:rFonts w:ascii="Times New Roman" w:hAnsi="Times New Roman" w:cs="Times New Roman"/>
+          <w:lang w:val="en-GB"/>
+        </w:rPr>
+        <w:t xml:space="preserve">sangat  </w:t>
+      </w:r>
+      <w:proofErr w:type="spellStart"/>
+      <w:r>
+        <w:rPr>
+          <w:rFonts w:ascii="Times New Roman" w:hAnsi="Times New Roman" w:cs="Times New Roman"/>
+          <w:lang w:val="en-GB"/>
+        </w:rPr>
+        <w:t>bermanfaat</w:t>
+      </w:r>
+      <w:proofErr w:type="spellEnd"/>
+      <w:proofErr w:type="gramEnd"/>
+      <w:r>
+        <w:rPr>
+          <w:rFonts w:ascii="Times New Roman" w:hAnsi="Times New Roman" w:cs="Times New Roman"/>
+          <w:lang w:val="en-GB"/>
+        </w:rPr>
+        <w:t xml:space="preserve"> </w:t>
+      </w:r>
+      <w:proofErr w:type="spellStart"/>
+      <w:r>
+        <w:rPr>
+          <w:rFonts w:ascii="Times New Roman" w:hAnsi="Times New Roman" w:cs="Times New Roman"/>
+          <w:lang w:val="en-GB"/>
+        </w:rPr>
+        <w:t>karena</w:t>
+      </w:r>
+      <w:proofErr w:type="spellEnd"/>
+      <w:r>
+        <w:rPr>
+          <w:rFonts w:ascii="Times New Roman" w:hAnsi="Times New Roman" w:cs="Times New Roman"/>
+          <w:lang w:val="en-GB"/>
+        </w:rPr>
+        <w:t xml:space="preserve"> file-file yang </w:t>
+      </w:r>
+      <w:proofErr w:type="spellStart"/>
+      <w:r>
+        <w:rPr>
+          <w:rFonts w:ascii="Times New Roman" w:hAnsi="Times New Roman" w:cs="Times New Roman"/>
+          <w:lang w:val="en-GB"/>
+        </w:rPr>
+        <w:t>tidak</w:t>
+      </w:r>
+      <w:proofErr w:type="spellEnd"/>
+      <w:r>
+        <w:rPr>
+          <w:rFonts w:ascii="Times New Roman" w:hAnsi="Times New Roman" w:cs="Times New Roman"/>
+          <w:lang w:val="en-GB"/>
+        </w:rPr>
+        <w:t xml:space="preserve"> </w:t>
+      </w:r>
+      <w:proofErr w:type="spellStart"/>
+      <w:r>
+        <w:rPr>
+          <w:rFonts w:ascii="Times New Roman" w:hAnsi="Times New Roman" w:cs="Times New Roman"/>
+          <w:lang w:val="en-GB"/>
+        </w:rPr>
+        <w:t>penting</w:t>
+      </w:r>
+      <w:proofErr w:type="spellEnd"/>
+      <w:r>
+        <w:rPr>
+          <w:rFonts w:ascii="Times New Roman" w:hAnsi="Times New Roman" w:cs="Times New Roman"/>
+          <w:lang w:val="en-GB"/>
+        </w:rPr>
+        <w:t xml:space="preserve"> </w:t>
+      </w:r>
+      <w:proofErr w:type="spellStart"/>
+      <w:r>
+        <w:rPr>
+          <w:rFonts w:ascii="Times New Roman" w:hAnsi="Times New Roman" w:cs="Times New Roman"/>
+          <w:lang w:val="en-GB"/>
+        </w:rPr>
+        <w:t>tidak</w:t>
+      </w:r>
+      <w:proofErr w:type="spellEnd"/>
+      <w:r>
+        <w:rPr>
+          <w:rFonts w:ascii="Times New Roman" w:hAnsi="Times New Roman" w:cs="Times New Roman"/>
+          <w:lang w:val="en-GB"/>
+        </w:rPr>
+        <w:t xml:space="preserve"> </w:t>
+      </w:r>
+      <w:proofErr w:type="spellStart"/>
+      <w:r>
+        <w:rPr>
+          <w:rFonts w:ascii="Times New Roman" w:hAnsi="Times New Roman" w:cs="Times New Roman"/>
+          <w:lang w:val="en-GB"/>
+        </w:rPr>
+        <w:t>ikut</w:t>
+      </w:r>
+      <w:proofErr w:type="spellEnd"/>
+      <w:r>
+        <w:rPr>
+          <w:rFonts w:ascii="Times New Roman" w:hAnsi="Times New Roman" w:cs="Times New Roman"/>
+          <w:lang w:val="en-GB"/>
+        </w:rPr>
+        <w:t xml:space="preserve"> </w:t>
+      </w:r>
+      <w:proofErr w:type="spellStart"/>
+      <w:r>
+        <w:rPr>
+          <w:rFonts w:ascii="Times New Roman" w:hAnsi="Times New Roman" w:cs="Times New Roman"/>
+          <w:lang w:val="en-GB"/>
+        </w:rPr>
+        <w:t>terupload</w:t>
+      </w:r>
+      <w:proofErr w:type="spellEnd"/>
+      <w:r>
+        <w:rPr>
+          <w:rFonts w:ascii="Times New Roman" w:hAnsi="Times New Roman" w:cs="Times New Roman"/>
+          <w:lang w:val="en-GB"/>
+        </w:rPr>
+        <w:t xml:space="preserve"> </w:t>
+      </w:r>
+      <w:proofErr w:type="spellStart"/>
+      <w:r>
+        <w:rPr>
+          <w:rFonts w:ascii="Times New Roman" w:hAnsi="Times New Roman" w:cs="Times New Roman"/>
+          <w:lang w:val="en-GB"/>
+        </w:rPr>
+        <w:t>ke</w:t>
+      </w:r>
+      <w:proofErr w:type="spellEnd"/>
+      <w:r>
+        <w:rPr>
+          <w:rFonts w:ascii="Times New Roman" w:hAnsi="Times New Roman" w:cs="Times New Roman"/>
+          <w:lang w:val="en-GB"/>
+        </w:rPr>
+        <w:t xml:space="preserve"> </w:t>
+      </w:r>
+      <w:proofErr w:type="spellStart"/>
+      <w:r>
+        <w:rPr>
+          <w:rFonts w:ascii="Times New Roman" w:hAnsi="Times New Roman" w:cs="Times New Roman"/>
+          <w:lang w:val="en-GB"/>
+        </w:rPr>
+        <w:t>github</w:t>
+      </w:r>
+      <w:proofErr w:type="spellEnd"/>
+      <w:r>
+        <w:rPr>
+          <w:rFonts w:ascii="Times New Roman" w:hAnsi="Times New Roman" w:cs="Times New Roman"/>
+          <w:lang w:val="en-GB"/>
+        </w:rPr>
+        <w:t xml:space="preserve"> </w:t>
+      </w:r>
+      <w:proofErr w:type="spellStart"/>
+      <w:r>
+        <w:rPr>
+          <w:rFonts w:ascii="Times New Roman" w:hAnsi="Times New Roman" w:cs="Times New Roman"/>
+          <w:lang w:val="en-GB"/>
+        </w:rPr>
+        <w:t>sehingga</w:t>
+      </w:r>
+      <w:proofErr w:type="spellEnd"/>
+      <w:r>
+        <w:rPr>
+          <w:rFonts w:ascii="Times New Roman" w:hAnsi="Times New Roman" w:cs="Times New Roman"/>
+          <w:lang w:val="en-GB"/>
+        </w:rPr>
+        <w:t xml:space="preserve"> </w:t>
+      </w:r>
+      <w:proofErr w:type="spellStart"/>
+      <w:r>
+        <w:rPr>
+          <w:rFonts w:ascii="Times New Roman" w:hAnsi="Times New Roman" w:cs="Times New Roman"/>
+          <w:lang w:val="en-GB"/>
+        </w:rPr>
+        <w:t>mengurangi</w:t>
+      </w:r>
+      <w:proofErr w:type="spellEnd"/>
+      <w:r>
+        <w:rPr>
+          <w:rFonts w:ascii="Times New Roman" w:hAnsi="Times New Roman" w:cs="Times New Roman"/>
+          <w:lang w:val="en-GB"/>
+        </w:rPr>
+        <w:t xml:space="preserve"> </w:t>
+      </w:r>
+      <w:proofErr w:type="spellStart"/>
+      <w:r>
+        <w:rPr>
+          <w:rFonts w:ascii="Times New Roman" w:hAnsi="Times New Roman" w:cs="Times New Roman"/>
+          <w:lang w:val="en-GB"/>
+        </w:rPr>
+        <w:t>ukuran</w:t>
+      </w:r>
+      <w:proofErr w:type="spellEnd"/>
+      <w:r>
+        <w:rPr>
+          <w:rFonts w:ascii="Times New Roman" w:hAnsi="Times New Roman" w:cs="Times New Roman"/>
+          <w:lang w:val="en-GB"/>
+        </w:rPr>
+        <w:t xml:space="preserve"> file </w:t>
+      </w:r>
+      <w:proofErr w:type="spellStart"/>
+      <w:r>
+        <w:rPr>
+          <w:rFonts w:ascii="Times New Roman" w:hAnsi="Times New Roman" w:cs="Times New Roman"/>
+          <w:lang w:val="en-GB"/>
+        </w:rPr>
+        <w:t>projectnya</w:t>
+      </w:r>
+      <w:proofErr w:type="spellEnd"/>
+      <w:r>
+        <w:rPr>
+          <w:rFonts w:ascii="Times New Roman" w:hAnsi="Times New Roman" w:cs="Times New Roman"/>
+          <w:lang w:val="en-GB"/>
+        </w:rPr>
+        <w:t xml:space="preserve">. Repository </w:t>
+      </w:r>
+      <w:proofErr w:type="spellStart"/>
+      <w:r>
+        <w:rPr>
+          <w:rFonts w:ascii="Times New Roman" w:hAnsi="Times New Roman" w:cs="Times New Roman"/>
+          <w:lang w:val="en-GB"/>
+        </w:rPr>
+        <w:t>tetap</w:t>
+      </w:r>
+      <w:proofErr w:type="spellEnd"/>
+      <w:r>
+        <w:rPr>
+          <w:rFonts w:ascii="Times New Roman" w:hAnsi="Times New Roman" w:cs="Times New Roman"/>
+          <w:lang w:val="en-GB"/>
+        </w:rPr>
+        <w:t xml:space="preserve"> </w:t>
+      </w:r>
+      <w:proofErr w:type="spellStart"/>
+      <w:r>
+        <w:rPr>
+          <w:rFonts w:ascii="Times New Roman" w:hAnsi="Times New Roman" w:cs="Times New Roman"/>
+          <w:lang w:val="en-GB"/>
+        </w:rPr>
+        <w:t>ringan</w:t>
+      </w:r>
+      <w:proofErr w:type="spellEnd"/>
+      <w:r>
+        <w:rPr>
+          <w:rFonts w:ascii="Times New Roman" w:hAnsi="Times New Roman" w:cs="Times New Roman"/>
+          <w:lang w:val="en-GB"/>
+        </w:rPr>
+        <w:t xml:space="preserve"> dan </w:t>
+      </w:r>
+      <w:proofErr w:type="spellStart"/>
+      <w:r>
+        <w:rPr>
+          <w:rFonts w:ascii="Times New Roman" w:hAnsi="Times New Roman" w:cs="Times New Roman"/>
+          <w:lang w:val="en-GB"/>
+        </w:rPr>
+        <w:t>tidak</w:t>
+      </w:r>
+      <w:proofErr w:type="spellEnd"/>
+      <w:r>
+        <w:rPr>
+          <w:rFonts w:ascii="Times New Roman" w:hAnsi="Times New Roman" w:cs="Times New Roman"/>
+          <w:lang w:val="en-GB"/>
+        </w:rPr>
+        <w:t xml:space="preserve"> </w:t>
+      </w:r>
+      <w:proofErr w:type="spellStart"/>
+      <w:r>
+        <w:rPr>
+          <w:rFonts w:ascii="Times New Roman" w:hAnsi="Times New Roman" w:cs="Times New Roman"/>
+          <w:lang w:val="en-GB"/>
+        </w:rPr>
+        <w:t>ada</w:t>
+      </w:r>
+      <w:proofErr w:type="spellEnd"/>
+      <w:r>
+        <w:rPr>
+          <w:rFonts w:ascii="Times New Roman" w:hAnsi="Times New Roman" w:cs="Times New Roman"/>
+          <w:lang w:val="en-GB"/>
+        </w:rPr>
+        <w:t xml:space="preserve"> file </w:t>
+      </w:r>
+      <w:proofErr w:type="spellStart"/>
+      <w:r>
+        <w:rPr>
+          <w:rFonts w:ascii="Times New Roman" w:hAnsi="Times New Roman" w:cs="Times New Roman"/>
+          <w:lang w:val="en-GB"/>
+        </w:rPr>
+        <w:t>sensitif</w:t>
+      </w:r>
+      <w:proofErr w:type="spellEnd"/>
+      <w:r>
+        <w:rPr>
+          <w:rFonts w:ascii="Times New Roman" w:hAnsi="Times New Roman" w:cs="Times New Roman"/>
+          <w:lang w:val="en-GB"/>
+        </w:rPr>
+        <w:t xml:space="preserve"> yang di-commit.</w:t>
       </w:r>
     </w:p>
     <w:p>
@@ -1014,7 +2948,25 @@
           <w:b/>
           <w:bCs/>
         </w:rPr>
-        <w:t>Update package.json Scripts</w:t>
+        <w:t xml:space="preserve">Update </w:t>
+      </w:r>
+      <w:proofErr w:type="spellStart"/>
+      <w:proofErr w:type="gramStart"/>
+      <w:r>
+        <w:rPr>
+          <w:b/>
+          <w:bCs/>
+        </w:rPr>
+        <w:t>package.json</w:t>
+      </w:r>
+      <w:proofErr w:type="spellEnd"/>
+      <w:proofErr w:type="gramEnd"/>
+      <w:r>
+        <w:rPr>
+          <w:b/>
+          <w:bCs/>
+        </w:rPr>
+        <w:t xml:space="preserve"> Scripts</w:t>
       </w:r>
     </w:p>
     <w:p>
@@ -1090,12 +3042,69 @@
           <w:lang w:val="en-GB"/>
         </w:rPr>
       </w:pPr>
-      <w:r>
-        <w:rPr>
-          <w:rFonts w:ascii="Times New Roman" w:hAnsi="Times New Roman" w:cs="Times New Roman"/>
-          <w:lang w:val="en-GB"/>
-        </w:rPr>
-        <w:t>Menjalankan Aplikasi Secara Otomatis (Start &amp; Dev)</w:t>
+      <w:proofErr w:type="spellStart"/>
+      <w:r>
+        <w:rPr>
+          <w:rFonts w:ascii="Times New Roman" w:hAnsi="Times New Roman" w:cs="Times New Roman"/>
+          <w:lang w:val="en-GB"/>
+        </w:rPr>
+        <w:t>Menjalankan</w:t>
+      </w:r>
+      <w:proofErr w:type="spellEnd"/>
+      <w:r>
+        <w:rPr>
+          <w:rFonts w:ascii="Times New Roman" w:hAnsi="Times New Roman" w:cs="Times New Roman"/>
+          <w:lang w:val="en-GB"/>
+        </w:rPr>
+        <w:t xml:space="preserve"> </w:t>
+      </w:r>
+      <w:proofErr w:type="spellStart"/>
+      <w:r>
+        <w:rPr>
+          <w:rFonts w:ascii="Times New Roman" w:hAnsi="Times New Roman" w:cs="Times New Roman"/>
+          <w:lang w:val="en-GB"/>
+        </w:rPr>
+        <w:t>Aplikasi</w:t>
+      </w:r>
+      <w:proofErr w:type="spellEnd"/>
+      <w:r>
+        <w:rPr>
+          <w:rFonts w:ascii="Times New Roman" w:hAnsi="Times New Roman" w:cs="Times New Roman"/>
+          <w:lang w:val="en-GB"/>
+        </w:rPr>
+        <w:t xml:space="preserve"> </w:t>
+      </w:r>
+      <w:proofErr w:type="spellStart"/>
+      <w:r>
+        <w:rPr>
+          <w:rFonts w:ascii="Times New Roman" w:hAnsi="Times New Roman" w:cs="Times New Roman"/>
+          <w:lang w:val="en-GB"/>
+        </w:rPr>
+        <w:t>Secara</w:t>
+      </w:r>
+      <w:proofErr w:type="spellEnd"/>
+      <w:r>
+        <w:rPr>
+          <w:rFonts w:ascii="Times New Roman" w:hAnsi="Times New Roman" w:cs="Times New Roman"/>
+          <w:lang w:val="en-GB"/>
+        </w:rPr>
+        <w:t xml:space="preserve"> </w:t>
+      </w:r>
+      <w:proofErr w:type="spellStart"/>
+      <w:r>
+        <w:rPr>
+          <w:rFonts w:ascii="Times New Roman" w:hAnsi="Times New Roman" w:cs="Times New Roman"/>
+          <w:lang w:val="en-GB"/>
+        </w:rPr>
+        <w:t>Otomatis</w:t>
+      </w:r>
+      <w:proofErr w:type="spellEnd"/>
+      <w:r>
+        <w:rPr>
+          <w:rFonts w:ascii="Times New Roman" w:hAnsi="Times New Roman" w:cs="Times New Roman"/>
+          <w:lang w:val="en-GB"/>
+        </w:rPr>
+        <w:t xml:space="preserve"> (Start &amp; Dev)</w:t>
       </w:r>
       <w:r>
         <w:rPr>
@@ -1115,6 +3124,7 @@
           <w:lang w:val="en-GB"/>
         </w:rPr>
       </w:pPr>
+      <w:proofErr w:type="spellStart"/>
       <w:r>
         <w:rPr>
           <w:rFonts w:ascii="Times New Roman" w:hAnsi="Times New Roman" w:cs="Times New Roman"/>
@@ -1127,7 +3137,191 @@
           <w:rFonts w:ascii="Times New Roman" w:hAnsi="Times New Roman" w:cs="Times New Roman"/>
           <w:lang w:val="en-GB"/>
         </w:rPr>
-        <w:t>embuat aplikasi otomatis me-refresh sendiri setiap kali programmer mengubah kode. Jadi, tidak perlu mematikan dan menyalakan manual berkali-kali.</w:t>
+        <w:t>embuat</w:t>
+      </w:r>
+      <w:proofErr w:type="spellEnd"/>
+      <w:r>
+        <w:rPr>
+          <w:rFonts w:ascii="Times New Roman" w:hAnsi="Times New Roman" w:cs="Times New Roman"/>
+          <w:lang w:val="en-GB"/>
+        </w:rPr>
+        <w:t xml:space="preserve"> </w:t>
+      </w:r>
+      <w:proofErr w:type="spellStart"/>
+      <w:r>
+        <w:rPr>
+          <w:rFonts w:ascii="Times New Roman" w:hAnsi="Times New Roman" w:cs="Times New Roman"/>
+          <w:lang w:val="en-GB"/>
+        </w:rPr>
+        <w:t>aplikasi</w:t>
+      </w:r>
+      <w:proofErr w:type="spellEnd"/>
+      <w:r>
+        <w:rPr>
+          <w:rFonts w:ascii="Times New Roman" w:hAnsi="Times New Roman" w:cs="Times New Roman"/>
+          <w:lang w:val="en-GB"/>
+        </w:rPr>
+        <w:t xml:space="preserve"> </w:t>
+      </w:r>
+      <w:proofErr w:type="spellStart"/>
+      <w:r>
+        <w:rPr>
+          <w:rFonts w:ascii="Times New Roman" w:hAnsi="Times New Roman" w:cs="Times New Roman"/>
+          <w:lang w:val="en-GB"/>
+        </w:rPr>
+        <w:t>otomatis</w:t>
+      </w:r>
+      <w:proofErr w:type="spellEnd"/>
+      <w:r>
+        <w:rPr>
+          <w:rFonts w:ascii="Times New Roman" w:hAnsi="Times New Roman" w:cs="Times New Roman"/>
+          <w:lang w:val="en-GB"/>
+        </w:rPr>
+        <w:t xml:space="preserve"> me-refresh </w:t>
+      </w:r>
+      <w:proofErr w:type="spellStart"/>
+      <w:r>
+        <w:rPr>
+          <w:rFonts w:ascii="Times New Roman" w:hAnsi="Times New Roman" w:cs="Times New Roman"/>
+          <w:lang w:val="en-GB"/>
+        </w:rPr>
+        <w:t>sendiri</w:t>
+      </w:r>
+      <w:proofErr w:type="spellEnd"/>
+      <w:r>
+        <w:rPr>
+          <w:rFonts w:ascii="Times New Roman" w:hAnsi="Times New Roman" w:cs="Times New Roman"/>
+          <w:lang w:val="en-GB"/>
+        </w:rPr>
+        <w:t xml:space="preserve"> </w:t>
+      </w:r>
+      <w:proofErr w:type="spellStart"/>
+      <w:r>
+        <w:rPr>
+          <w:rFonts w:ascii="Times New Roman" w:hAnsi="Times New Roman" w:cs="Times New Roman"/>
+          <w:lang w:val="en-GB"/>
+        </w:rPr>
+        <w:t>setiap</w:t>
+      </w:r>
+      <w:proofErr w:type="spellEnd"/>
+      <w:r>
+        <w:rPr>
+          <w:rFonts w:ascii="Times New Roman" w:hAnsi="Times New Roman" w:cs="Times New Roman"/>
+          <w:lang w:val="en-GB"/>
+        </w:rPr>
+        <w:t xml:space="preserve"> kali programmer </w:t>
+      </w:r>
+      <w:proofErr w:type="spellStart"/>
+      <w:r>
+        <w:rPr>
+          <w:rFonts w:ascii="Times New Roman" w:hAnsi="Times New Roman" w:cs="Times New Roman"/>
+          <w:lang w:val="en-GB"/>
+        </w:rPr>
+        <w:t>mengubah</w:t>
+      </w:r>
+      <w:proofErr w:type="spellEnd"/>
+      <w:r>
+        <w:rPr>
+          <w:rFonts w:ascii="Times New Roman" w:hAnsi="Times New Roman" w:cs="Times New Roman"/>
+          <w:lang w:val="en-GB"/>
+        </w:rPr>
+        <w:t xml:space="preserve"> </w:t>
+      </w:r>
+      <w:proofErr w:type="spellStart"/>
+      <w:r>
+        <w:rPr>
+          <w:rFonts w:ascii="Times New Roman" w:hAnsi="Times New Roman" w:cs="Times New Roman"/>
+          <w:lang w:val="en-GB"/>
+        </w:rPr>
+        <w:t>kode</w:t>
+      </w:r>
+      <w:proofErr w:type="spellEnd"/>
+      <w:r>
+        <w:rPr>
+          <w:rFonts w:ascii="Times New Roman" w:hAnsi="Times New Roman" w:cs="Times New Roman"/>
+          <w:lang w:val="en-GB"/>
+        </w:rPr>
+        <w:t xml:space="preserve">. Jadi, </w:t>
+      </w:r>
+      <w:proofErr w:type="spellStart"/>
+      <w:r>
+        <w:rPr>
+          <w:rFonts w:ascii="Times New Roman" w:hAnsi="Times New Roman" w:cs="Times New Roman"/>
+          <w:lang w:val="en-GB"/>
+        </w:rPr>
+        <w:t>tidak</w:t>
+      </w:r>
+      <w:proofErr w:type="spellEnd"/>
+      <w:r>
+        <w:rPr>
+          <w:rFonts w:ascii="Times New Roman" w:hAnsi="Times New Roman" w:cs="Times New Roman"/>
+          <w:lang w:val="en-GB"/>
+        </w:rPr>
+        <w:t xml:space="preserve"> </w:t>
+      </w:r>
+      <w:proofErr w:type="spellStart"/>
+      <w:r>
+        <w:rPr>
+          <w:rFonts w:ascii="Times New Roman" w:hAnsi="Times New Roman" w:cs="Times New Roman"/>
+          <w:lang w:val="en-GB"/>
+        </w:rPr>
+        <w:t>perlu</w:t>
+      </w:r>
+      <w:proofErr w:type="spellEnd"/>
+      <w:r>
+        <w:rPr>
+          <w:rFonts w:ascii="Times New Roman" w:hAnsi="Times New Roman" w:cs="Times New Roman"/>
+          <w:lang w:val="en-GB"/>
+        </w:rPr>
+        <w:t xml:space="preserve"> </w:t>
+      </w:r>
+      <w:proofErr w:type="spellStart"/>
+      <w:r>
+        <w:rPr>
+          <w:rFonts w:ascii="Times New Roman" w:hAnsi="Times New Roman" w:cs="Times New Roman"/>
+          <w:lang w:val="en-GB"/>
+        </w:rPr>
+        <w:t>mematikan</w:t>
+      </w:r>
+      <w:proofErr w:type="spellEnd"/>
+      <w:r>
+        <w:rPr>
+          <w:rFonts w:ascii="Times New Roman" w:hAnsi="Times New Roman" w:cs="Times New Roman"/>
+          <w:lang w:val="en-GB"/>
+        </w:rPr>
+        <w:t xml:space="preserve"> dan </w:t>
+      </w:r>
+      <w:proofErr w:type="spellStart"/>
+      <w:r>
+        <w:rPr>
+          <w:rFonts w:ascii="Times New Roman" w:hAnsi="Times New Roman" w:cs="Times New Roman"/>
+          <w:lang w:val="en-GB"/>
+        </w:rPr>
+        <w:t>menyalakan</w:t>
+      </w:r>
+      <w:proofErr w:type="spellEnd"/>
+      <w:r>
+        <w:rPr>
+          <w:rFonts w:ascii="Times New Roman" w:hAnsi="Times New Roman" w:cs="Times New Roman"/>
+          <w:lang w:val="en-GB"/>
+        </w:rPr>
+        <w:t xml:space="preserve"> manual </w:t>
+      </w:r>
+      <w:proofErr w:type="spellStart"/>
+      <w:r>
+        <w:rPr>
+          <w:rFonts w:ascii="Times New Roman" w:hAnsi="Times New Roman" w:cs="Times New Roman"/>
+          <w:lang w:val="en-GB"/>
+        </w:rPr>
+        <w:t>berkali</w:t>
+      </w:r>
+      <w:proofErr w:type="spellEnd"/>
+      <w:r>
+        <w:rPr>
+          <w:rFonts w:ascii="Times New Roman" w:hAnsi="Times New Roman" w:cs="Times New Roman"/>
+          <w:lang w:val="en-GB"/>
+        </w:rPr>
+        <w:t>-kali.</w:t>
       </w:r>
     </w:p>
     <w:p>
@@ -1143,12 +3337,37 @@
           <w:lang w:val="en-GB"/>
         </w:rPr>
       </w:pPr>
-      <w:r>
-        <w:rPr>
-          <w:rFonts w:ascii="Times New Roman" w:hAnsi="Times New Roman" w:cs="Times New Roman"/>
-          <w:lang w:val="en-GB"/>
-        </w:rPr>
-        <w:t>Membangun Versi Jadi (Build)</w:t>
+      <w:proofErr w:type="spellStart"/>
+      <w:r>
+        <w:rPr>
+          <w:rFonts w:ascii="Times New Roman" w:hAnsi="Times New Roman" w:cs="Times New Roman"/>
+          <w:lang w:val="en-GB"/>
+        </w:rPr>
+        <w:t>Membangun</w:t>
+      </w:r>
+      <w:proofErr w:type="spellEnd"/>
+      <w:r>
+        <w:rPr>
+          <w:rFonts w:ascii="Times New Roman" w:hAnsi="Times New Roman" w:cs="Times New Roman"/>
+          <w:lang w:val="en-GB"/>
+        </w:rPr>
+        <w:t xml:space="preserve"> </w:t>
+      </w:r>
+      <w:proofErr w:type="spellStart"/>
+      <w:r>
+        <w:rPr>
+          <w:rFonts w:ascii="Times New Roman" w:hAnsi="Times New Roman" w:cs="Times New Roman"/>
+          <w:lang w:val="en-GB"/>
+        </w:rPr>
+        <w:t>Versi</w:t>
+      </w:r>
+      <w:proofErr w:type="spellEnd"/>
+      <w:r>
+        <w:rPr>
+          <w:rFonts w:ascii="Times New Roman" w:hAnsi="Times New Roman" w:cs="Times New Roman"/>
+          <w:lang w:val="en-GB"/>
+        </w:rPr>
+        <w:t xml:space="preserve"> Jadi (Build)</w:t>
       </w:r>
       <w:r>
         <w:rPr>
@@ -1171,12 +3390,37 @@
           <w:lang w:val="en-GB"/>
         </w:rPr>
       </w:pPr>
-      <w:r>
-        <w:rPr>
-          <w:rFonts w:ascii="Times New Roman" w:hAnsi="Times New Roman" w:cs="Times New Roman"/>
-          <w:lang w:val="en-GB"/>
-        </w:rPr>
-        <w:t>Asisten Perapih Kode (Lint &amp; Format)</w:t>
+      <w:proofErr w:type="spellStart"/>
+      <w:r>
+        <w:rPr>
+          <w:rFonts w:ascii="Times New Roman" w:hAnsi="Times New Roman" w:cs="Times New Roman"/>
+          <w:lang w:val="en-GB"/>
+        </w:rPr>
+        <w:t>Asisten</w:t>
+      </w:r>
+      <w:proofErr w:type="spellEnd"/>
+      <w:r>
+        <w:rPr>
+          <w:rFonts w:ascii="Times New Roman" w:hAnsi="Times New Roman" w:cs="Times New Roman"/>
+          <w:lang w:val="en-GB"/>
+        </w:rPr>
+        <w:t xml:space="preserve"> </w:t>
+      </w:r>
+      <w:proofErr w:type="spellStart"/>
+      <w:r>
+        <w:rPr>
+          <w:rFonts w:ascii="Times New Roman" w:hAnsi="Times New Roman" w:cs="Times New Roman"/>
+          <w:lang w:val="en-GB"/>
+        </w:rPr>
+        <w:t>Perapih</w:t>
+      </w:r>
+      <w:proofErr w:type="spellEnd"/>
+      <w:r>
+        <w:rPr>
+          <w:rFonts w:ascii="Times New Roman" w:hAnsi="Times New Roman" w:cs="Times New Roman"/>
+          <w:lang w:val="en-GB"/>
+        </w:rPr>
+        <w:t xml:space="preserve"> Kode (Lint &amp; Format)</w:t>
       </w:r>
       <w:r>
         <w:rPr>
@@ -1196,6 +3440,7 @@
           <w:lang w:val="en-GB"/>
         </w:rPr>
       </w:pPr>
+      <w:proofErr w:type="spellStart"/>
       <w:r>
         <w:rPr>
           <w:rFonts w:ascii="Times New Roman" w:hAnsi="Times New Roman" w:cs="Times New Roman"/>
@@ -1208,7 +3453,207 @@
           <w:rFonts w:ascii="Times New Roman" w:hAnsi="Times New Roman" w:cs="Times New Roman"/>
           <w:lang w:val="en-GB"/>
         </w:rPr>
-        <w:t>emeriksa apakah tulisan kodenya berantakan atau ada salah ketik, lalu memperbaikinya secara otomatis agar bersih dan seragam.</w:t>
+        <w:t>emeriksa</w:t>
+      </w:r>
+      <w:proofErr w:type="spellEnd"/>
+      <w:r>
+        <w:rPr>
+          <w:rFonts w:ascii="Times New Roman" w:hAnsi="Times New Roman" w:cs="Times New Roman"/>
+          <w:lang w:val="en-GB"/>
+        </w:rPr>
+        <w:t xml:space="preserve"> </w:t>
+      </w:r>
+      <w:proofErr w:type="spellStart"/>
+      <w:r>
+        <w:rPr>
+          <w:rFonts w:ascii="Times New Roman" w:hAnsi="Times New Roman" w:cs="Times New Roman"/>
+          <w:lang w:val="en-GB"/>
+        </w:rPr>
+        <w:t>apakah</w:t>
+      </w:r>
+      <w:proofErr w:type="spellEnd"/>
+      <w:r>
+        <w:rPr>
+          <w:rFonts w:ascii="Times New Roman" w:hAnsi="Times New Roman" w:cs="Times New Roman"/>
+          <w:lang w:val="en-GB"/>
+        </w:rPr>
+        <w:t xml:space="preserve"> tulisan </w:t>
+      </w:r>
+      <w:proofErr w:type="spellStart"/>
+      <w:r>
+        <w:rPr>
+          <w:rFonts w:ascii="Times New Roman" w:hAnsi="Times New Roman" w:cs="Times New Roman"/>
+          <w:lang w:val="en-GB"/>
+        </w:rPr>
+        <w:t>kodenya</w:t>
+      </w:r>
+      <w:proofErr w:type="spellEnd"/>
+      <w:r>
+        <w:rPr>
+          <w:rFonts w:ascii="Times New Roman" w:hAnsi="Times New Roman" w:cs="Times New Roman"/>
+          <w:lang w:val="en-GB"/>
+        </w:rPr>
+        <w:t xml:space="preserve"> </w:t>
+      </w:r>
+      <w:proofErr w:type="spellStart"/>
+      <w:r>
+        <w:rPr>
+          <w:rFonts w:ascii="Times New Roman" w:hAnsi="Times New Roman" w:cs="Times New Roman"/>
+          <w:lang w:val="en-GB"/>
+        </w:rPr>
+        <w:t>berantakan</w:t>
+      </w:r>
+      <w:proofErr w:type="spellEnd"/>
+      <w:r>
+        <w:rPr>
+          <w:rFonts w:ascii="Times New Roman" w:hAnsi="Times New Roman" w:cs="Times New Roman"/>
+          <w:lang w:val="en-GB"/>
+        </w:rPr>
+        <w:t xml:space="preserve"> </w:t>
+      </w:r>
+      <w:proofErr w:type="spellStart"/>
+      <w:r>
+        <w:rPr>
+          <w:rFonts w:ascii="Times New Roman" w:hAnsi="Times New Roman" w:cs="Times New Roman"/>
+          <w:lang w:val="en-GB"/>
+        </w:rPr>
+        <w:t>atau</w:t>
+      </w:r>
+      <w:proofErr w:type="spellEnd"/>
+      <w:r>
+        <w:rPr>
+          <w:rFonts w:ascii="Times New Roman" w:hAnsi="Times New Roman" w:cs="Times New Roman"/>
+          <w:lang w:val="en-GB"/>
+        </w:rPr>
+        <w:t xml:space="preserve"> </w:t>
+      </w:r>
+      <w:proofErr w:type="spellStart"/>
+      <w:r>
+        <w:rPr>
+          <w:rFonts w:ascii="Times New Roman" w:hAnsi="Times New Roman" w:cs="Times New Roman"/>
+          <w:lang w:val="en-GB"/>
+        </w:rPr>
+        <w:t>ada</w:t>
+      </w:r>
+      <w:proofErr w:type="spellEnd"/>
+      <w:r>
+        <w:rPr>
+          <w:rFonts w:ascii="Times New Roman" w:hAnsi="Times New Roman" w:cs="Times New Roman"/>
+          <w:lang w:val="en-GB"/>
+        </w:rPr>
+        <w:t xml:space="preserve"> salah </w:t>
+      </w:r>
+      <w:proofErr w:type="spellStart"/>
+      <w:r>
+        <w:rPr>
+          <w:rFonts w:ascii="Times New Roman" w:hAnsi="Times New Roman" w:cs="Times New Roman"/>
+          <w:lang w:val="en-GB"/>
+        </w:rPr>
+        <w:t>ketik</w:t>
+      </w:r>
+      <w:proofErr w:type="spellEnd"/>
+      <w:r>
+        <w:rPr>
+          <w:rFonts w:ascii="Times New Roman" w:hAnsi="Times New Roman" w:cs="Times New Roman"/>
+          <w:lang w:val="en-GB"/>
+        </w:rPr>
+        <w:t xml:space="preserve">, </w:t>
+      </w:r>
+      <w:proofErr w:type="spellStart"/>
+      <w:r>
+        <w:rPr>
+          <w:rFonts w:ascii="Times New Roman" w:hAnsi="Times New Roman" w:cs="Times New Roman"/>
+          <w:lang w:val="en-GB"/>
+        </w:rPr>
+        <w:t>lalu</w:t>
+      </w:r>
+      <w:proofErr w:type="spellEnd"/>
+      <w:r>
+        <w:rPr>
+          <w:rFonts w:ascii="Times New Roman" w:hAnsi="Times New Roman" w:cs="Times New Roman"/>
+          <w:lang w:val="en-GB"/>
+        </w:rPr>
+        <w:t xml:space="preserve"> </w:t>
+      </w:r>
+      <w:proofErr w:type="spellStart"/>
+      <w:r>
+        <w:rPr>
+          <w:rFonts w:ascii="Times New Roman" w:hAnsi="Times New Roman" w:cs="Times New Roman"/>
+          <w:lang w:val="en-GB"/>
+        </w:rPr>
+        <w:t>memperbaikinya</w:t>
+      </w:r>
+      <w:proofErr w:type="spellEnd"/>
+      <w:r>
+        <w:rPr>
+          <w:rFonts w:ascii="Times New Roman" w:hAnsi="Times New Roman" w:cs="Times New Roman"/>
+          <w:lang w:val="en-GB"/>
+        </w:rPr>
+        <w:t xml:space="preserve"> </w:t>
+      </w:r>
+      <w:proofErr w:type="spellStart"/>
+      <w:r>
+        <w:rPr>
+          <w:rFonts w:ascii="Times New Roman" w:hAnsi="Times New Roman" w:cs="Times New Roman"/>
+          <w:lang w:val="en-GB"/>
+        </w:rPr>
+        <w:t>secara</w:t>
+      </w:r>
+      <w:proofErr w:type="spellEnd"/>
+      <w:r>
+        <w:rPr>
+          <w:rFonts w:ascii="Times New Roman" w:hAnsi="Times New Roman" w:cs="Times New Roman"/>
+          <w:lang w:val="en-GB"/>
+        </w:rPr>
+        <w:t xml:space="preserve"> </w:t>
+      </w:r>
+      <w:proofErr w:type="spellStart"/>
+      <w:r>
+        <w:rPr>
+          <w:rFonts w:ascii="Times New Roman" w:hAnsi="Times New Roman" w:cs="Times New Roman"/>
+          <w:lang w:val="en-GB"/>
+        </w:rPr>
+        <w:t>otomatis</w:t>
+      </w:r>
+      <w:proofErr w:type="spellEnd"/>
+      <w:r>
+        <w:rPr>
+          <w:rFonts w:ascii="Times New Roman" w:hAnsi="Times New Roman" w:cs="Times New Roman"/>
+          <w:lang w:val="en-GB"/>
+        </w:rPr>
+        <w:t xml:space="preserve"> agar </w:t>
+      </w:r>
+      <w:proofErr w:type="spellStart"/>
+      <w:r>
+        <w:rPr>
+          <w:rFonts w:ascii="Times New Roman" w:hAnsi="Times New Roman" w:cs="Times New Roman"/>
+          <w:lang w:val="en-GB"/>
+        </w:rPr>
+        <w:t>bersih</w:t>
+      </w:r>
+      <w:proofErr w:type="spellEnd"/>
+      <w:r>
+        <w:rPr>
+          <w:rFonts w:ascii="Times New Roman" w:hAnsi="Times New Roman" w:cs="Times New Roman"/>
+          <w:lang w:val="en-GB"/>
+        </w:rPr>
+        <w:t xml:space="preserve"> dan </w:t>
+      </w:r>
+      <w:proofErr w:type="spellStart"/>
+      <w:r>
+        <w:rPr>
+          <w:rFonts w:ascii="Times New Roman" w:hAnsi="Times New Roman" w:cs="Times New Roman"/>
+          <w:lang w:val="en-GB"/>
+        </w:rPr>
+        <w:t>seragam</w:t>
+      </w:r>
+      <w:proofErr w:type="spellEnd"/>
+      <w:r>
+        <w:rPr>
+          <w:rFonts w:ascii="Times New Roman" w:hAnsi="Times New Roman" w:cs="Times New Roman"/>
+          <w:lang w:val="en-GB"/>
+        </w:rPr>
+        <w:t>.</w:t>
       </w:r>
     </w:p>
     <w:p>
@@ -1224,12 +3669,53 @@
           <w:lang w:val="en-GB"/>
         </w:rPr>
       </w:pPr>
-      <w:r>
-        <w:rPr>
-          <w:rFonts w:ascii="Times New Roman" w:hAnsi="Times New Roman" w:cs="Times New Roman"/>
-          <w:lang w:val="en-GB"/>
-        </w:rPr>
-        <w:t>Sistem Pemeriksaan Otomatis (Test)</w:t>
+      <w:proofErr w:type="spellStart"/>
+      <w:r>
+        <w:rPr>
+          <w:rFonts w:ascii="Times New Roman" w:hAnsi="Times New Roman" w:cs="Times New Roman"/>
+          <w:lang w:val="en-GB"/>
+        </w:rPr>
+        <w:t>Sistem</w:t>
+      </w:r>
+      <w:proofErr w:type="spellEnd"/>
+      <w:r>
+        <w:rPr>
+          <w:rFonts w:ascii="Times New Roman" w:hAnsi="Times New Roman" w:cs="Times New Roman"/>
+          <w:lang w:val="en-GB"/>
+        </w:rPr>
+        <w:t xml:space="preserve"> </w:t>
+      </w:r>
+      <w:proofErr w:type="spellStart"/>
+      <w:r>
+        <w:rPr>
+          <w:rFonts w:ascii="Times New Roman" w:hAnsi="Times New Roman" w:cs="Times New Roman"/>
+          <w:lang w:val="en-GB"/>
+        </w:rPr>
+        <w:t>Pemeriksaan</w:t>
+      </w:r>
+      <w:proofErr w:type="spellEnd"/>
+      <w:r>
+        <w:rPr>
+          <w:rFonts w:ascii="Times New Roman" w:hAnsi="Times New Roman" w:cs="Times New Roman"/>
+          <w:lang w:val="en-GB"/>
+        </w:rPr>
+        <w:t xml:space="preserve"> </w:t>
+      </w:r>
+      <w:proofErr w:type="spellStart"/>
+      <w:r>
+        <w:rPr>
+          <w:rFonts w:ascii="Times New Roman" w:hAnsi="Times New Roman" w:cs="Times New Roman"/>
+          <w:lang w:val="en-GB"/>
+        </w:rPr>
+        <w:t>Otomatis</w:t>
+      </w:r>
+      <w:proofErr w:type="spellEnd"/>
+      <w:r>
+        <w:rPr>
+          <w:rFonts w:ascii="Times New Roman" w:hAnsi="Times New Roman" w:cs="Times New Roman"/>
+          <w:lang w:val="en-GB"/>
+        </w:rPr>
+        <w:t xml:space="preserve"> (Test)</w:t>
       </w:r>
       <w:r>
         <w:rPr>

</xml_diff>

<commit_message>
Edit file .env backend
</commit_message>
<xml_diff>
--- a/dokumentasi/24382001P_Lorensius Firngadi_IF 23 E_Dokumentasi.docx
+++ b/dokumentasi/24382001P_Lorensius Firngadi_IF 23 E_Dokumentasi.docx
@@ -2788,13 +2788,6 @@
           <w:lang w:val="en-GB"/>
         </w:rPr>
       </w:pPr>
-      <w:r>
-        <w:rPr>
-          <w:rFonts w:ascii="Times New Roman" w:hAnsi="Times New Roman" w:cs="Times New Roman"/>
-          <w:lang w:val="en-GB"/>
-        </w:rPr>
-        <w:t xml:space="preserve">5. </w:t>
-      </w:r>
     </w:p>
     <w:p>
       <w:pPr>
@@ -2931,51 +2924,92 @@
         <w:contextualSpacing/>
         <w:jc w:val="both"/>
         <w:rPr>
+          <w:rFonts w:ascii="Times New Roman" w:hAnsi="Times New Roman" w:cs="Times New Roman"/>
           <w:b/>
           <w:bCs/>
-        </w:rPr>
-      </w:pPr>
-      <w:r>
-        <w:rPr>
-          <w:rFonts w:ascii="Times New Roman" w:hAnsi="Times New Roman" w:cs="Times New Roman"/>
-          <w:lang w:val="en-GB"/>
-        </w:rPr>
-        <w:lastRenderedPageBreak/>
-        <w:t xml:space="preserve">6. </w:t>
-      </w:r>
-      <w:r>
-        <w:rPr>
+          <w:lang w:val="en-GB"/>
+        </w:rPr>
+      </w:pPr>
+      <w:r>
+        <w:rPr>
+          <w:rFonts w:ascii="Times New Roman" w:hAnsi="Times New Roman" w:cs="Times New Roman"/>
           <w:b/>
           <w:bCs/>
-        </w:rPr>
-        <w:t xml:space="preserve">Update </w:t>
-      </w:r>
-      <w:proofErr w:type="spellStart"/>
-      <w:proofErr w:type="gramStart"/>
-      <w:r>
-        <w:rPr>
+          <w:lang w:val="en-GB"/>
+        </w:rPr>
+        <w:lastRenderedPageBreak/>
+        <w:t xml:space="preserve">5. </w:t>
+      </w:r>
+      <w:r>
+        <w:rPr>
+          <w:rFonts w:ascii="Times New Roman" w:hAnsi="Times New Roman" w:cs="Times New Roman"/>
           <w:b/>
           <w:bCs/>
-        </w:rPr>
-        <w:t>package.json</w:t>
-      </w:r>
-      <w:proofErr w:type="spellEnd"/>
-      <w:proofErr w:type="gramEnd"/>
-      <w:r>
-        <w:rPr>
+          <w:lang w:val="en-GB"/>
+        </w:rPr>
+        <w:t xml:space="preserve">Edit </w:t>
+      </w:r>
+      <w:proofErr w:type="spellStart"/>
+      <w:proofErr w:type="gramStart"/>
+      <w:r>
+        <w:rPr>
+          <w:rFonts w:ascii="Times New Roman" w:hAnsi="Times New Roman" w:cs="Times New Roman"/>
           <w:b/>
           <w:bCs/>
-        </w:rPr>
-        <w:t xml:space="preserve"> Scripts</w:t>
-      </w:r>
+          <w:lang w:val="en-GB"/>
+        </w:rPr>
+        <w:t>tsconfig.json</w:t>
+      </w:r>
+      <w:proofErr w:type="spellEnd"/>
+      <w:proofErr w:type="gramEnd"/>
+      <w:r>
+        <w:rPr>
+          <w:rFonts w:ascii="Times New Roman" w:hAnsi="Times New Roman" w:cs="Times New Roman"/>
+          <w:b/>
+          <w:bCs/>
+          <w:lang w:val="en-GB"/>
+        </w:rPr>
+        <w:t xml:space="preserve"> </w:t>
+      </w:r>
+      <w:proofErr w:type="spellStart"/>
+      <w:r>
+        <w:rPr>
+          <w:rFonts w:ascii="Times New Roman" w:hAnsi="Times New Roman" w:cs="Times New Roman"/>
+          <w:b/>
+          <w:bCs/>
+          <w:lang w:val="en-GB"/>
+        </w:rPr>
+        <w:t>untuk</w:t>
+      </w:r>
+      <w:proofErr w:type="spellEnd"/>
+      <w:r>
+        <w:rPr>
+          <w:rFonts w:ascii="Times New Roman" w:hAnsi="Times New Roman" w:cs="Times New Roman"/>
+          <w:b/>
+          <w:bCs/>
+          <w:lang w:val="en-GB"/>
+        </w:rPr>
+        <w:t xml:space="preserve"> </w:t>
+      </w:r>
+      <w:proofErr w:type="spellStart"/>
+      <w:r>
+        <w:rPr>
+          <w:rFonts w:ascii="Times New Roman" w:hAnsi="Times New Roman" w:cs="Times New Roman"/>
+          <w:b/>
+          <w:bCs/>
+          <w:lang w:val="en-GB"/>
+        </w:rPr>
+        <w:t>NestJS</w:t>
+      </w:r>
+      <w:proofErr w:type="spellEnd"/>
     </w:p>
     <w:p>
       <w:pPr>
         <w:contextualSpacing/>
         <w:jc w:val="both"/>
         <w:rPr>
-          <w:b/>
-          <w:bCs/>
+          <w:rFonts w:ascii="Times New Roman" w:hAnsi="Times New Roman" w:cs="Times New Roman"/>
+          <w:lang w:val="en-GB"/>
         </w:rPr>
       </w:pPr>
     </w:p>
@@ -2984,8 +3018,8 @@
         <w:contextualSpacing/>
         <w:jc w:val="both"/>
         <w:rPr>
-          <w:b/>
-          <w:bCs/>
+          <w:rFonts w:ascii="Times New Roman" w:hAnsi="Times New Roman" w:cs="Times New Roman"/>
+          <w:lang w:val="en-GB"/>
         </w:rPr>
       </w:pPr>
       <w:r>
@@ -2993,10 +3027,10 @@
           <w:noProof/>
         </w:rPr>
         <w:drawing>
-          <wp:inline distT="0" distB="0" distL="0" distR="0" wp14:anchorId="0E5F7419" wp14:editId="434EA4BC">
+          <wp:inline distT="0" distB="0" distL="0" distR="0" wp14:anchorId="22A94F2B" wp14:editId="5C5020F2">
             <wp:extent cx="5731510" cy="3222625"/>
             <wp:effectExtent l="0" t="0" r="2540" b="0"/>
-            <wp:docPr id="417672227" name="Picture 1"/>
+            <wp:docPr id="957612205" name="Picture 1"/>
             <wp:cNvGraphicFramePr>
               <a:graphicFrameLocks xmlns:a="http://schemas.openxmlformats.org/drawingml/2006/main" noChangeAspect="1"/>
             </wp:cNvGraphicFramePr>
@@ -3004,7 +3038,7 @@
               <a:graphicData uri="http://schemas.openxmlformats.org/drawingml/2006/picture">
                 <pic:pic xmlns:pic="http://schemas.openxmlformats.org/drawingml/2006/picture">
                   <pic:nvPicPr>
-                    <pic:cNvPr id="417672227" name=""/>
+                    <pic:cNvPr id="957612205" name=""/>
                     <pic:cNvPicPr/>
                   </pic:nvPicPr>
                   <pic:blipFill>
@@ -3031,6 +3065,1893 @@
     </w:p>
     <w:p>
       <w:pPr>
+        <w:contextualSpacing/>
+        <w:jc w:val="both"/>
+        <w:rPr>
+          <w:rFonts w:ascii="Times New Roman" w:hAnsi="Times New Roman" w:cs="Times New Roman"/>
+          <w:lang w:val="en-GB"/>
+        </w:rPr>
+      </w:pPr>
+    </w:p>
+    <w:p>
+      <w:pPr>
+        <w:contextualSpacing/>
+        <w:jc w:val="both"/>
+        <w:rPr>
+          <w:rFonts w:ascii="Times New Roman" w:hAnsi="Times New Roman" w:cs="Times New Roman"/>
+          <w:lang w:val="en-GB"/>
+        </w:rPr>
+      </w:pPr>
+    </w:p>
+    <w:p>
+      <w:pPr>
+        <w:pStyle w:val="ListParagraph"/>
+        <w:numPr>
+          <w:ilvl w:val="0"/>
+          <w:numId w:val="4"/>
+        </w:numPr>
+        <w:jc w:val="both"/>
+        <w:rPr>
+          <w:rFonts w:ascii="Times New Roman" w:hAnsi="Times New Roman" w:cs="Times New Roman"/>
+          <w:lang w:val="en-GB"/>
+        </w:rPr>
+      </w:pPr>
+      <w:proofErr w:type="spellStart"/>
+      <w:r>
+        <w:rPr>
+          <w:rFonts w:ascii="Times New Roman" w:hAnsi="Times New Roman" w:cs="Times New Roman"/>
+          <w:lang w:val="en-GB"/>
+        </w:rPr>
+        <w:t>Penerjemah</w:t>
+      </w:r>
+      <w:proofErr w:type="spellEnd"/>
+      <w:r>
+        <w:rPr>
+          <w:rFonts w:ascii="Times New Roman" w:hAnsi="Times New Roman" w:cs="Times New Roman"/>
+          <w:lang w:val="en-GB"/>
+        </w:rPr>
+        <w:t xml:space="preserve"> Bahasa (Target &amp; Module):</w:t>
+      </w:r>
+    </w:p>
+    <w:p>
+      <w:pPr>
+        <w:ind w:left="720"/>
+        <w:contextualSpacing/>
+        <w:jc w:val="both"/>
+        <w:rPr>
+          <w:rFonts w:ascii="Times New Roman" w:hAnsi="Times New Roman" w:cs="Times New Roman"/>
+          <w:lang w:val="en-GB"/>
+        </w:rPr>
+      </w:pPr>
+      <w:proofErr w:type="spellStart"/>
+      <w:r>
+        <w:rPr>
+          <w:rFonts w:ascii="Times New Roman" w:hAnsi="Times New Roman" w:cs="Times New Roman"/>
+          <w:lang w:val="en-GB"/>
+        </w:rPr>
+        <w:t>Mengatur</w:t>
+      </w:r>
+      <w:proofErr w:type="spellEnd"/>
+      <w:r>
+        <w:rPr>
+          <w:rFonts w:ascii="Times New Roman" w:hAnsi="Times New Roman" w:cs="Times New Roman"/>
+          <w:lang w:val="en-GB"/>
+        </w:rPr>
+        <w:t xml:space="preserve"> agar </w:t>
+      </w:r>
+      <w:proofErr w:type="spellStart"/>
+      <w:r>
+        <w:rPr>
+          <w:rFonts w:ascii="Times New Roman" w:hAnsi="Times New Roman" w:cs="Times New Roman"/>
+          <w:lang w:val="en-GB"/>
+        </w:rPr>
+        <w:t>kode</w:t>
+      </w:r>
+      <w:proofErr w:type="spellEnd"/>
+      <w:r>
+        <w:rPr>
+          <w:rFonts w:ascii="Times New Roman" w:hAnsi="Times New Roman" w:cs="Times New Roman"/>
+          <w:lang w:val="en-GB"/>
+        </w:rPr>
+        <w:t xml:space="preserve"> TypeScript (</w:t>
+      </w:r>
+      <w:proofErr w:type="spellStart"/>
+      <w:r>
+        <w:rPr>
+          <w:rFonts w:ascii="Times New Roman" w:hAnsi="Times New Roman" w:cs="Times New Roman"/>
+          <w:lang w:val="en-GB"/>
+        </w:rPr>
+        <w:t>bahasa</w:t>
+      </w:r>
+      <w:proofErr w:type="spellEnd"/>
+      <w:r>
+        <w:rPr>
+          <w:rFonts w:ascii="Times New Roman" w:hAnsi="Times New Roman" w:cs="Times New Roman"/>
+          <w:lang w:val="en-GB"/>
+        </w:rPr>
+        <w:t xml:space="preserve"> </w:t>
+      </w:r>
+      <w:proofErr w:type="spellStart"/>
+      <w:r>
+        <w:rPr>
+          <w:rFonts w:ascii="Times New Roman" w:hAnsi="Times New Roman" w:cs="Times New Roman"/>
+          <w:lang w:val="en-GB"/>
+        </w:rPr>
+        <w:t>tingkat</w:t>
+      </w:r>
+      <w:proofErr w:type="spellEnd"/>
+      <w:r>
+        <w:rPr>
+          <w:rFonts w:ascii="Times New Roman" w:hAnsi="Times New Roman" w:cs="Times New Roman"/>
+          <w:lang w:val="en-GB"/>
+        </w:rPr>
+        <w:t xml:space="preserve"> </w:t>
+      </w:r>
+      <w:proofErr w:type="spellStart"/>
+      <w:r>
+        <w:rPr>
+          <w:rFonts w:ascii="Times New Roman" w:hAnsi="Times New Roman" w:cs="Times New Roman"/>
+          <w:lang w:val="en-GB"/>
+        </w:rPr>
+        <w:t>tinggi</w:t>
+      </w:r>
+      <w:proofErr w:type="spellEnd"/>
+      <w:r>
+        <w:rPr>
+          <w:rFonts w:ascii="Times New Roman" w:hAnsi="Times New Roman" w:cs="Times New Roman"/>
+          <w:lang w:val="en-GB"/>
+        </w:rPr>
+        <w:t xml:space="preserve">) </w:t>
+      </w:r>
+      <w:proofErr w:type="spellStart"/>
+      <w:r>
+        <w:rPr>
+          <w:rFonts w:ascii="Times New Roman" w:hAnsi="Times New Roman" w:cs="Times New Roman"/>
+          <w:lang w:val="en-GB"/>
+        </w:rPr>
+        <w:t>diterjemahkan</w:t>
+      </w:r>
+      <w:proofErr w:type="spellEnd"/>
+      <w:r>
+        <w:rPr>
+          <w:rFonts w:ascii="Times New Roman" w:hAnsi="Times New Roman" w:cs="Times New Roman"/>
+          <w:lang w:val="en-GB"/>
+        </w:rPr>
+        <w:t xml:space="preserve"> </w:t>
+      </w:r>
+      <w:proofErr w:type="spellStart"/>
+      <w:r>
+        <w:rPr>
+          <w:rFonts w:ascii="Times New Roman" w:hAnsi="Times New Roman" w:cs="Times New Roman"/>
+          <w:lang w:val="en-GB"/>
+        </w:rPr>
+        <w:t>ke</w:t>
+      </w:r>
+      <w:proofErr w:type="spellEnd"/>
+      <w:r>
+        <w:rPr>
+          <w:rFonts w:ascii="Times New Roman" w:hAnsi="Times New Roman" w:cs="Times New Roman"/>
+          <w:lang w:val="en-GB"/>
+        </w:rPr>
+        <w:t xml:space="preserve"> </w:t>
+      </w:r>
+      <w:proofErr w:type="spellStart"/>
+      <w:r>
+        <w:rPr>
+          <w:rFonts w:ascii="Times New Roman" w:hAnsi="Times New Roman" w:cs="Times New Roman"/>
+          <w:lang w:val="en-GB"/>
+        </w:rPr>
+        <w:t>versi</w:t>
+      </w:r>
+      <w:proofErr w:type="spellEnd"/>
+      <w:r>
+        <w:rPr>
+          <w:rFonts w:ascii="Times New Roman" w:hAnsi="Times New Roman" w:cs="Times New Roman"/>
+          <w:lang w:val="en-GB"/>
+        </w:rPr>
+        <w:t xml:space="preserve"> JavaScript yang </w:t>
+      </w:r>
+      <w:proofErr w:type="spellStart"/>
+      <w:r>
+        <w:rPr>
+          <w:rFonts w:ascii="Times New Roman" w:hAnsi="Times New Roman" w:cs="Times New Roman"/>
+          <w:lang w:val="en-GB"/>
+        </w:rPr>
+        <w:t>stabil</w:t>
+      </w:r>
+      <w:proofErr w:type="spellEnd"/>
+      <w:r>
+        <w:rPr>
+          <w:rFonts w:ascii="Times New Roman" w:hAnsi="Times New Roman" w:cs="Times New Roman"/>
+          <w:lang w:val="en-GB"/>
+        </w:rPr>
+        <w:t xml:space="preserve"> dan </w:t>
+      </w:r>
+      <w:proofErr w:type="spellStart"/>
+      <w:r>
+        <w:rPr>
+          <w:rFonts w:ascii="Times New Roman" w:hAnsi="Times New Roman" w:cs="Times New Roman"/>
+          <w:lang w:val="en-GB"/>
+        </w:rPr>
+        <w:t>bisa</w:t>
+      </w:r>
+      <w:proofErr w:type="spellEnd"/>
+      <w:r>
+        <w:rPr>
+          <w:rFonts w:ascii="Times New Roman" w:hAnsi="Times New Roman" w:cs="Times New Roman"/>
+          <w:lang w:val="en-GB"/>
+        </w:rPr>
+        <w:t xml:space="preserve"> </w:t>
+      </w:r>
+      <w:proofErr w:type="spellStart"/>
+      <w:r>
+        <w:rPr>
+          <w:rFonts w:ascii="Times New Roman" w:hAnsi="Times New Roman" w:cs="Times New Roman"/>
+          <w:lang w:val="en-GB"/>
+        </w:rPr>
+        <w:t>dipahami</w:t>
+      </w:r>
+      <w:proofErr w:type="spellEnd"/>
+      <w:r>
+        <w:rPr>
+          <w:rFonts w:ascii="Times New Roman" w:hAnsi="Times New Roman" w:cs="Times New Roman"/>
+          <w:lang w:val="en-GB"/>
+        </w:rPr>
+        <w:t xml:space="preserve"> oleh server Node.js </w:t>
+      </w:r>
+      <w:proofErr w:type="spellStart"/>
+      <w:r>
+        <w:rPr>
+          <w:rFonts w:ascii="Times New Roman" w:hAnsi="Times New Roman" w:cs="Times New Roman"/>
+          <w:lang w:val="en-GB"/>
+        </w:rPr>
+        <w:t>dengan</w:t>
+      </w:r>
+      <w:proofErr w:type="spellEnd"/>
+      <w:r>
+        <w:rPr>
+          <w:rFonts w:ascii="Times New Roman" w:hAnsi="Times New Roman" w:cs="Times New Roman"/>
+          <w:lang w:val="en-GB"/>
+        </w:rPr>
+        <w:t xml:space="preserve"> </w:t>
+      </w:r>
+      <w:proofErr w:type="spellStart"/>
+      <w:r>
+        <w:rPr>
+          <w:rFonts w:ascii="Times New Roman" w:hAnsi="Times New Roman" w:cs="Times New Roman"/>
+          <w:lang w:val="en-GB"/>
+        </w:rPr>
+        <w:t>lancar</w:t>
+      </w:r>
+      <w:proofErr w:type="spellEnd"/>
+      <w:r>
+        <w:rPr>
+          <w:rFonts w:ascii="Times New Roman" w:hAnsi="Times New Roman" w:cs="Times New Roman"/>
+          <w:lang w:val="en-GB"/>
+        </w:rPr>
+        <w:t>.</w:t>
+      </w:r>
+    </w:p>
+    <w:p>
+      <w:pPr>
+        <w:pStyle w:val="ListParagraph"/>
+        <w:numPr>
+          <w:ilvl w:val="0"/>
+          <w:numId w:val="4"/>
+        </w:numPr>
+        <w:jc w:val="both"/>
+        <w:rPr>
+          <w:rFonts w:ascii="Times New Roman" w:hAnsi="Times New Roman" w:cs="Times New Roman"/>
+          <w:lang w:val="en-GB"/>
+        </w:rPr>
+      </w:pPr>
+      <w:proofErr w:type="spellStart"/>
+      <w:r>
+        <w:rPr>
+          <w:rFonts w:ascii="Times New Roman" w:hAnsi="Times New Roman" w:cs="Times New Roman"/>
+          <w:lang w:val="en-GB"/>
+        </w:rPr>
+        <w:t>Sistem</w:t>
+      </w:r>
+      <w:proofErr w:type="spellEnd"/>
+      <w:r>
+        <w:rPr>
+          <w:rFonts w:ascii="Times New Roman" w:hAnsi="Times New Roman" w:cs="Times New Roman"/>
+          <w:lang w:val="en-GB"/>
+        </w:rPr>
+        <w:t xml:space="preserve"> Alamat Pintar (Path Mapping):</w:t>
+      </w:r>
+    </w:p>
+    <w:p>
+      <w:pPr>
+        <w:ind w:left="720"/>
+        <w:contextualSpacing/>
+        <w:jc w:val="both"/>
+        <w:rPr>
+          <w:rFonts w:ascii="Times New Roman" w:hAnsi="Times New Roman" w:cs="Times New Roman"/>
+          <w:lang w:val="en-GB"/>
+        </w:rPr>
+      </w:pPr>
+      <w:r>
+        <w:rPr>
+          <w:rFonts w:ascii="Times New Roman" w:hAnsi="Times New Roman" w:cs="Times New Roman"/>
+          <w:lang w:val="en-GB"/>
+        </w:rPr>
+        <w:t xml:space="preserve">Kita </w:t>
+      </w:r>
+      <w:proofErr w:type="spellStart"/>
+      <w:r>
+        <w:rPr>
+          <w:rFonts w:ascii="Times New Roman" w:hAnsi="Times New Roman" w:cs="Times New Roman"/>
+          <w:lang w:val="en-GB"/>
+        </w:rPr>
+        <w:t>menambahkan</w:t>
+      </w:r>
+      <w:proofErr w:type="spellEnd"/>
+      <w:r>
+        <w:rPr>
+          <w:rFonts w:ascii="Times New Roman" w:hAnsi="Times New Roman" w:cs="Times New Roman"/>
+          <w:lang w:val="en-GB"/>
+        </w:rPr>
+        <w:t xml:space="preserve"> </w:t>
+      </w:r>
+      <w:proofErr w:type="spellStart"/>
+      <w:r>
+        <w:rPr>
+          <w:rFonts w:ascii="Times New Roman" w:hAnsi="Times New Roman" w:cs="Times New Roman"/>
+          <w:lang w:val="en-GB"/>
+        </w:rPr>
+        <w:t>fitur</w:t>
+      </w:r>
+      <w:proofErr w:type="spellEnd"/>
+      <w:r>
+        <w:rPr>
+          <w:rFonts w:ascii="Times New Roman" w:hAnsi="Times New Roman" w:cs="Times New Roman"/>
+          <w:lang w:val="en-GB"/>
+        </w:rPr>
+        <w:t xml:space="preserve"> @/*. Ini </w:t>
+      </w:r>
+      <w:proofErr w:type="spellStart"/>
+      <w:r>
+        <w:rPr>
+          <w:rFonts w:ascii="Times New Roman" w:hAnsi="Times New Roman" w:cs="Times New Roman"/>
+          <w:lang w:val="en-GB"/>
+        </w:rPr>
+        <w:t>seperti</w:t>
+      </w:r>
+      <w:proofErr w:type="spellEnd"/>
+      <w:r>
+        <w:rPr>
+          <w:rFonts w:ascii="Times New Roman" w:hAnsi="Times New Roman" w:cs="Times New Roman"/>
+          <w:lang w:val="en-GB"/>
+        </w:rPr>
+        <w:t xml:space="preserve"> </w:t>
+      </w:r>
+      <w:proofErr w:type="spellStart"/>
+      <w:r>
+        <w:rPr>
+          <w:rFonts w:ascii="Times New Roman" w:hAnsi="Times New Roman" w:cs="Times New Roman"/>
+          <w:lang w:val="en-GB"/>
+        </w:rPr>
+        <w:t>membuat</w:t>
+      </w:r>
+      <w:proofErr w:type="spellEnd"/>
+      <w:r>
+        <w:rPr>
+          <w:rFonts w:ascii="Times New Roman" w:hAnsi="Times New Roman" w:cs="Times New Roman"/>
+          <w:lang w:val="en-GB"/>
+        </w:rPr>
+        <w:t xml:space="preserve"> </w:t>
+      </w:r>
+      <w:proofErr w:type="spellStart"/>
+      <w:r>
+        <w:rPr>
+          <w:rFonts w:ascii="Times New Roman" w:hAnsi="Times New Roman" w:cs="Times New Roman"/>
+          <w:lang w:val="en-GB"/>
+        </w:rPr>
+        <w:t>panggilan</w:t>
+      </w:r>
+      <w:proofErr w:type="spellEnd"/>
+      <w:r>
+        <w:rPr>
+          <w:rFonts w:ascii="Times New Roman" w:hAnsi="Times New Roman" w:cs="Times New Roman"/>
+          <w:lang w:val="en-GB"/>
+        </w:rPr>
+        <w:t xml:space="preserve"> </w:t>
+      </w:r>
+      <w:proofErr w:type="spellStart"/>
+      <w:r>
+        <w:rPr>
+          <w:rFonts w:ascii="Times New Roman" w:hAnsi="Times New Roman" w:cs="Times New Roman"/>
+          <w:lang w:val="en-GB"/>
+        </w:rPr>
+        <w:t>cepat</w:t>
+      </w:r>
+      <w:proofErr w:type="spellEnd"/>
+      <w:r>
+        <w:rPr>
+          <w:rFonts w:ascii="Times New Roman" w:hAnsi="Times New Roman" w:cs="Times New Roman"/>
+          <w:lang w:val="en-GB"/>
+        </w:rPr>
+        <w:t xml:space="preserve">. Programmer </w:t>
+      </w:r>
+      <w:proofErr w:type="spellStart"/>
+      <w:r>
+        <w:rPr>
+          <w:rFonts w:ascii="Times New Roman" w:hAnsi="Times New Roman" w:cs="Times New Roman"/>
+          <w:lang w:val="en-GB"/>
+        </w:rPr>
+        <w:t>tidak</w:t>
+      </w:r>
+      <w:proofErr w:type="spellEnd"/>
+      <w:r>
+        <w:rPr>
+          <w:rFonts w:ascii="Times New Roman" w:hAnsi="Times New Roman" w:cs="Times New Roman"/>
+          <w:lang w:val="en-GB"/>
+        </w:rPr>
+        <w:t xml:space="preserve"> </w:t>
+      </w:r>
+      <w:proofErr w:type="spellStart"/>
+      <w:r>
+        <w:rPr>
+          <w:rFonts w:ascii="Times New Roman" w:hAnsi="Times New Roman" w:cs="Times New Roman"/>
+          <w:lang w:val="en-GB"/>
+        </w:rPr>
+        <w:t>perlu</w:t>
+      </w:r>
+      <w:proofErr w:type="spellEnd"/>
+      <w:r>
+        <w:rPr>
+          <w:rFonts w:ascii="Times New Roman" w:hAnsi="Times New Roman" w:cs="Times New Roman"/>
+          <w:lang w:val="en-GB"/>
+        </w:rPr>
+        <w:t xml:space="preserve"> </w:t>
+      </w:r>
+      <w:proofErr w:type="spellStart"/>
+      <w:r>
+        <w:rPr>
+          <w:rFonts w:ascii="Times New Roman" w:hAnsi="Times New Roman" w:cs="Times New Roman"/>
+          <w:lang w:val="en-GB"/>
+        </w:rPr>
+        <w:t>menulis</w:t>
+      </w:r>
+      <w:proofErr w:type="spellEnd"/>
+      <w:r>
+        <w:rPr>
+          <w:rFonts w:ascii="Times New Roman" w:hAnsi="Times New Roman" w:cs="Times New Roman"/>
+          <w:lang w:val="en-GB"/>
+        </w:rPr>
+        <w:t xml:space="preserve"> </w:t>
+      </w:r>
+      <w:proofErr w:type="spellStart"/>
+      <w:r>
+        <w:rPr>
+          <w:rFonts w:ascii="Times New Roman" w:hAnsi="Times New Roman" w:cs="Times New Roman"/>
+          <w:lang w:val="en-GB"/>
+        </w:rPr>
+        <w:t>alamat</w:t>
+      </w:r>
+      <w:proofErr w:type="spellEnd"/>
+      <w:r>
+        <w:rPr>
+          <w:rFonts w:ascii="Times New Roman" w:hAnsi="Times New Roman" w:cs="Times New Roman"/>
+          <w:lang w:val="en-GB"/>
+        </w:rPr>
+        <w:t xml:space="preserve"> yang </w:t>
+      </w:r>
+      <w:proofErr w:type="spellStart"/>
+      <w:r>
+        <w:rPr>
+          <w:rFonts w:ascii="Times New Roman" w:hAnsi="Times New Roman" w:cs="Times New Roman"/>
+          <w:lang w:val="en-GB"/>
+        </w:rPr>
+        <w:t>panjang</w:t>
+      </w:r>
+      <w:proofErr w:type="spellEnd"/>
+      <w:r>
+        <w:rPr>
+          <w:rFonts w:ascii="Times New Roman" w:hAnsi="Times New Roman" w:cs="Times New Roman"/>
+          <w:lang w:val="en-GB"/>
+        </w:rPr>
+        <w:t xml:space="preserve"> dan </w:t>
+      </w:r>
+      <w:proofErr w:type="spellStart"/>
+      <w:r>
+        <w:rPr>
+          <w:rFonts w:ascii="Times New Roman" w:hAnsi="Times New Roman" w:cs="Times New Roman"/>
+          <w:lang w:val="en-GB"/>
+        </w:rPr>
+        <w:t>rumit</w:t>
+      </w:r>
+      <w:proofErr w:type="spellEnd"/>
+      <w:r>
+        <w:rPr>
+          <w:rFonts w:ascii="Times New Roman" w:hAnsi="Times New Roman" w:cs="Times New Roman"/>
+          <w:lang w:val="en-GB"/>
+        </w:rPr>
+        <w:t xml:space="preserve"> </w:t>
+      </w:r>
+      <w:proofErr w:type="spellStart"/>
+      <w:r>
+        <w:rPr>
+          <w:rFonts w:ascii="Times New Roman" w:hAnsi="Times New Roman" w:cs="Times New Roman"/>
+          <w:lang w:val="en-GB"/>
+        </w:rPr>
+        <w:t>seperti</w:t>
+      </w:r>
+      <w:proofErr w:type="spellEnd"/>
+      <w:proofErr w:type="gramStart"/>
+      <w:r>
+        <w:rPr>
+          <w:rFonts w:ascii="Times New Roman" w:hAnsi="Times New Roman" w:cs="Times New Roman"/>
+          <w:lang w:val="en-GB"/>
+        </w:rPr>
+        <w:t xml:space="preserve"> ../../..</w:t>
+      </w:r>
+      <w:proofErr w:type="gramEnd"/>
+      <w:r>
+        <w:rPr>
+          <w:rFonts w:ascii="Times New Roman" w:hAnsi="Times New Roman" w:cs="Times New Roman"/>
+          <w:lang w:val="en-GB"/>
+        </w:rPr>
+        <w:t xml:space="preserve">/folder/file, </w:t>
+      </w:r>
+      <w:proofErr w:type="spellStart"/>
+      <w:r>
+        <w:rPr>
+          <w:rFonts w:ascii="Times New Roman" w:hAnsi="Times New Roman" w:cs="Times New Roman"/>
+          <w:lang w:val="en-GB"/>
+        </w:rPr>
+        <w:t>cukup</w:t>
+      </w:r>
+      <w:proofErr w:type="spellEnd"/>
+      <w:r>
+        <w:rPr>
+          <w:rFonts w:ascii="Times New Roman" w:hAnsi="Times New Roman" w:cs="Times New Roman"/>
+          <w:lang w:val="en-GB"/>
+        </w:rPr>
+        <w:t xml:space="preserve"> </w:t>
+      </w:r>
+      <w:proofErr w:type="spellStart"/>
+      <w:r>
+        <w:rPr>
+          <w:rFonts w:ascii="Times New Roman" w:hAnsi="Times New Roman" w:cs="Times New Roman"/>
+          <w:lang w:val="en-GB"/>
+        </w:rPr>
+        <w:t>gunakan</w:t>
+      </w:r>
+      <w:proofErr w:type="spellEnd"/>
+      <w:r>
+        <w:rPr>
+          <w:rFonts w:ascii="Times New Roman" w:hAnsi="Times New Roman" w:cs="Times New Roman"/>
+          <w:lang w:val="en-GB"/>
+        </w:rPr>
+        <w:t xml:space="preserve"> @/folder/file. Ini </w:t>
+      </w:r>
+      <w:proofErr w:type="spellStart"/>
+      <w:r>
+        <w:rPr>
+          <w:rFonts w:ascii="Times New Roman" w:hAnsi="Times New Roman" w:cs="Times New Roman"/>
+          <w:lang w:val="en-GB"/>
+        </w:rPr>
+        <w:t>membuat</w:t>
+      </w:r>
+      <w:proofErr w:type="spellEnd"/>
+      <w:r>
+        <w:rPr>
+          <w:rFonts w:ascii="Times New Roman" w:hAnsi="Times New Roman" w:cs="Times New Roman"/>
+          <w:lang w:val="en-GB"/>
+        </w:rPr>
+        <w:t xml:space="preserve"> </w:t>
+      </w:r>
+      <w:proofErr w:type="spellStart"/>
+      <w:r>
+        <w:rPr>
+          <w:rFonts w:ascii="Times New Roman" w:hAnsi="Times New Roman" w:cs="Times New Roman"/>
+          <w:lang w:val="en-GB"/>
+        </w:rPr>
+        <w:t>kode</w:t>
+      </w:r>
+      <w:proofErr w:type="spellEnd"/>
+      <w:r>
+        <w:rPr>
+          <w:rFonts w:ascii="Times New Roman" w:hAnsi="Times New Roman" w:cs="Times New Roman"/>
+          <w:lang w:val="en-GB"/>
+        </w:rPr>
+        <w:t xml:space="preserve"> </w:t>
+      </w:r>
+      <w:proofErr w:type="spellStart"/>
+      <w:r>
+        <w:rPr>
+          <w:rFonts w:ascii="Times New Roman" w:hAnsi="Times New Roman" w:cs="Times New Roman"/>
+          <w:lang w:val="en-GB"/>
+        </w:rPr>
+        <w:t>jauh</w:t>
+      </w:r>
+      <w:proofErr w:type="spellEnd"/>
+      <w:r>
+        <w:rPr>
+          <w:rFonts w:ascii="Times New Roman" w:hAnsi="Times New Roman" w:cs="Times New Roman"/>
+          <w:lang w:val="en-GB"/>
+        </w:rPr>
+        <w:t xml:space="preserve"> </w:t>
+      </w:r>
+      <w:proofErr w:type="spellStart"/>
+      <w:r>
+        <w:rPr>
+          <w:rFonts w:ascii="Times New Roman" w:hAnsi="Times New Roman" w:cs="Times New Roman"/>
+          <w:lang w:val="en-GB"/>
+        </w:rPr>
+        <w:t>lebih</w:t>
+      </w:r>
+      <w:proofErr w:type="spellEnd"/>
+      <w:r>
+        <w:rPr>
+          <w:rFonts w:ascii="Times New Roman" w:hAnsi="Times New Roman" w:cs="Times New Roman"/>
+          <w:lang w:val="en-GB"/>
+        </w:rPr>
+        <w:t xml:space="preserve"> </w:t>
+      </w:r>
+      <w:proofErr w:type="spellStart"/>
+      <w:r>
+        <w:rPr>
+          <w:rFonts w:ascii="Times New Roman" w:hAnsi="Times New Roman" w:cs="Times New Roman"/>
+          <w:lang w:val="en-GB"/>
+        </w:rPr>
+        <w:t>rapi</w:t>
+      </w:r>
+      <w:proofErr w:type="spellEnd"/>
+      <w:r>
+        <w:rPr>
+          <w:rFonts w:ascii="Times New Roman" w:hAnsi="Times New Roman" w:cs="Times New Roman"/>
+          <w:lang w:val="en-GB"/>
+        </w:rPr>
+        <w:t>.</w:t>
+      </w:r>
+    </w:p>
+    <w:p>
+      <w:pPr>
+        <w:pStyle w:val="ListParagraph"/>
+        <w:numPr>
+          <w:ilvl w:val="0"/>
+          <w:numId w:val="4"/>
+        </w:numPr>
+        <w:jc w:val="both"/>
+        <w:rPr>
+          <w:rFonts w:ascii="Times New Roman" w:hAnsi="Times New Roman" w:cs="Times New Roman"/>
+          <w:lang w:val="en-GB"/>
+        </w:rPr>
+      </w:pPr>
+      <w:r>
+        <w:rPr>
+          <w:rFonts w:ascii="Times New Roman" w:hAnsi="Times New Roman" w:cs="Times New Roman"/>
+          <w:lang w:val="en-GB"/>
+        </w:rPr>
+        <w:t xml:space="preserve">Batas Wilayah </w:t>
+      </w:r>
+      <w:proofErr w:type="spellStart"/>
+      <w:r>
+        <w:rPr>
+          <w:rFonts w:ascii="Times New Roman" w:hAnsi="Times New Roman" w:cs="Times New Roman"/>
+          <w:lang w:val="en-GB"/>
+        </w:rPr>
+        <w:t>Kerja</w:t>
+      </w:r>
+      <w:proofErr w:type="spellEnd"/>
+      <w:r>
+        <w:rPr>
+          <w:rFonts w:ascii="Times New Roman" w:hAnsi="Times New Roman" w:cs="Times New Roman"/>
+          <w:lang w:val="en-GB"/>
+        </w:rPr>
+        <w:t xml:space="preserve"> (Include &amp; Exclude):</w:t>
+      </w:r>
+    </w:p>
+    <w:p>
+      <w:pPr>
+        <w:ind w:left="720"/>
+        <w:contextualSpacing/>
+        <w:jc w:val="both"/>
+        <w:rPr>
+          <w:rFonts w:ascii="Times New Roman" w:hAnsi="Times New Roman" w:cs="Times New Roman"/>
+          <w:lang w:val="en-GB"/>
+        </w:rPr>
+      </w:pPr>
+      <w:proofErr w:type="spellStart"/>
+      <w:r>
+        <w:rPr>
+          <w:rFonts w:ascii="Times New Roman" w:hAnsi="Times New Roman" w:cs="Times New Roman"/>
+          <w:lang w:val="en-GB"/>
+        </w:rPr>
+        <w:t>M</w:t>
+      </w:r>
+      <w:r>
+        <w:rPr>
+          <w:rFonts w:ascii="Times New Roman" w:hAnsi="Times New Roman" w:cs="Times New Roman"/>
+          <w:lang w:val="en-GB"/>
+        </w:rPr>
+        <w:t>emberi</w:t>
+      </w:r>
+      <w:proofErr w:type="spellEnd"/>
+      <w:r>
+        <w:rPr>
+          <w:rFonts w:ascii="Times New Roman" w:hAnsi="Times New Roman" w:cs="Times New Roman"/>
+          <w:lang w:val="en-GB"/>
+        </w:rPr>
+        <w:t xml:space="preserve"> </w:t>
+      </w:r>
+      <w:proofErr w:type="spellStart"/>
+      <w:r>
+        <w:rPr>
+          <w:rFonts w:ascii="Times New Roman" w:hAnsi="Times New Roman" w:cs="Times New Roman"/>
+          <w:lang w:val="en-GB"/>
+        </w:rPr>
+        <w:t>tahu</w:t>
+      </w:r>
+      <w:proofErr w:type="spellEnd"/>
+      <w:r>
+        <w:rPr>
+          <w:rFonts w:ascii="Times New Roman" w:hAnsi="Times New Roman" w:cs="Times New Roman"/>
+          <w:lang w:val="en-GB"/>
+        </w:rPr>
+        <w:t xml:space="preserve"> </w:t>
+      </w:r>
+      <w:proofErr w:type="spellStart"/>
+      <w:r>
+        <w:rPr>
+          <w:rFonts w:ascii="Times New Roman" w:hAnsi="Times New Roman" w:cs="Times New Roman"/>
+          <w:lang w:val="en-GB"/>
+        </w:rPr>
+        <w:t>komputer</w:t>
+      </w:r>
+      <w:proofErr w:type="spellEnd"/>
+      <w:r>
+        <w:rPr>
+          <w:rFonts w:ascii="Times New Roman" w:hAnsi="Times New Roman" w:cs="Times New Roman"/>
+          <w:lang w:val="en-GB"/>
+        </w:rPr>
+        <w:t xml:space="preserve">: Hanya </w:t>
+      </w:r>
+      <w:proofErr w:type="spellStart"/>
+      <w:r>
+        <w:rPr>
+          <w:rFonts w:ascii="Times New Roman" w:hAnsi="Times New Roman" w:cs="Times New Roman"/>
+          <w:lang w:val="en-GB"/>
+        </w:rPr>
+        <w:t>periksa</w:t>
+      </w:r>
+      <w:proofErr w:type="spellEnd"/>
+      <w:r>
+        <w:rPr>
+          <w:rFonts w:ascii="Times New Roman" w:hAnsi="Times New Roman" w:cs="Times New Roman"/>
+          <w:lang w:val="en-GB"/>
+        </w:rPr>
+        <w:t xml:space="preserve"> </w:t>
+      </w:r>
+      <w:proofErr w:type="spellStart"/>
+      <w:r>
+        <w:rPr>
+          <w:rFonts w:ascii="Times New Roman" w:hAnsi="Times New Roman" w:cs="Times New Roman"/>
+          <w:lang w:val="en-GB"/>
+        </w:rPr>
+        <w:t>kode</w:t>
+      </w:r>
+      <w:proofErr w:type="spellEnd"/>
+      <w:r>
+        <w:rPr>
+          <w:rFonts w:ascii="Times New Roman" w:hAnsi="Times New Roman" w:cs="Times New Roman"/>
+          <w:lang w:val="en-GB"/>
+        </w:rPr>
+        <w:t xml:space="preserve"> yang </w:t>
+      </w:r>
+      <w:proofErr w:type="spellStart"/>
+      <w:r>
+        <w:rPr>
+          <w:rFonts w:ascii="Times New Roman" w:hAnsi="Times New Roman" w:cs="Times New Roman"/>
+          <w:lang w:val="en-GB"/>
+        </w:rPr>
+        <w:t>ada</w:t>
+      </w:r>
+      <w:proofErr w:type="spellEnd"/>
+      <w:r>
+        <w:rPr>
+          <w:rFonts w:ascii="Times New Roman" w:hAnsi="Times New Roman" w:cs="Times New Roman"/>
+          <w:lang w:val="en-GB"/>
+        </w:rPr>
+        <w:t xml:space="preserve"> di </w:t>
+      </w:r>
+      <w:proofErr w:type="spellStart"/>
+      <w:r>
+        <w:rPr>
+          <w:rFonts w:ascii="Times New Roman" w:hAnsi="Times New Roman" w:cs="Times New Roman"/>
+          <w:lang w:val="en-GB"/>
+        </w:rPr>
+        <w:t>dalam</w:t>
+      </w:r>
+      <w:proofErr w:type="spellEnd"/>
+      <w:r>
+        <w:rPr>
+          <w:rFonts w:ascii="Times New Roman" w:hAnsi="Times New Roman" w:cs="Times New Roman"/>
+          <w:lang w:val="en-GB"/>
+        </w:rPr>
+        <w:t xml:space="preserve"> folder </w:t>
+      </w:r>
+      <w:proofErr w:type="spellStart"/>
+      <w:r>
+        <w:rPr>
+          <w:rFonts w:ascii="Times New Roman" w:hAnsi="Times New Roman" w:cs="Times New Roman"/>
+          <w:lang w:val="en-GB"/>
+        </w:rPr>
+        <w:t>src</w:t>
+      </w:r>
+      <w:proofErr w:type="spellEnd"/>
+      <w:r>
+        <w:rPr>
+          <w:rFonts w:ascii="Times New Roman" w:hAnsi="Times New Roman" w:cs="Times New Roman"/>
+          <w:lang w:val="en-GB"/>
+        </w:rPr>
+        <w:t xml:space="preserve"> (</w:t>
+      </w:r>
+      <w:proofErr w:type="spellStart"/>
+      <w:r>
+        <w:rPr>
+          <w:rFonts w:ascii="Times New Roman" w:hAnsi="Times New Roman" w:cs="Times New Roman"/>
+          <w:lang w:val="en-GB"/>
+        </w:rPr>
+        <w:t>sumber</w:t>
+      </w:r>
+      <w:proofErr w:type="spellEnd"/>
+      <w:r>
+        <w:rPr>
+          <w:rFonts w:ascii="Times New Roman" w:hAnsi="Times New Roman" w:cs="Times New Roman"/>
+          <w:lang w:val="en-GB"/>
+        </w:rPr>
+        <w:t xml:space="preserve">), </w:t>
+      </w:r>
+      <w:proofErr w:type="spellStart"/>
+      <w:r>
+        <w:rPr>
+          <w:rFonts w:ascii="Times New Roman" w:hAnsi="Times New Roman" w:cs="Times New Roman"/>
+          <w:lang w:val="en-GB"/>
+        </w:rPr>
+        <w:t>tidak</w:t>
+      </w:r>
+      <w:proofErr w:type="spellEnd"/>
+      <w:r>
+        <w:rPr>
+          <w:rFonts w:ascii="Times New Roman" w:hAnsi="Times New Roman" w:cs="Times New Roman"/>
+          <w:lang w:val="en-GB"/>
+        </w:rPr>
+        <w:t xml:space="preserve"> </w:t>
+      </w:r>
+      <w:proofErr w:type="spellStart"/>
+      <w:r>
+        <w:rPr>
+          <w:rFonts w:ascii="Times New Roman" w:hAnsi="Times New Roman" w:cs="Times New Roman"/>
+          <w:lang w:val="en-GB"/>
+        </w:rPr>
+        <w:t>buang-buang</w:t>
+      </w:r>
+      <w:proofErr w:type="spellEnd"/>
+      <w:r>
+        <w:rPr>
+          <w:rFonts w:ascii="Times New Roman" w:hAnsi="Times New Roman" w:cs="Times New Roman"/>
+          <w:lang w:val="en-GB"/>
+        </w:rPr>
+        <w:t xml:space="preserve"> </w:t>
+      </w:r>
+      <w:proofErr w:type="spellStart"/>
+      <w:r>
+        <w:rPr>
+          <w:rFonts w:ascii="Times New Roman" w:hAnsi="Times New Roman" w:cs="Times New Roman"/>
+          <w:lang w:val="en-GB"/>
+        </w:rPr>
+        <w:t>waktu</w:t>
+      </w:r>
+      <w:proofErr w:type="spellEnd"/>
+      <w:r>
+        <w:rPr>
+          <w:rFonts w:ascii="Times New Roman" w:hAnsi="Times New Roman" w:cs="Times New Roman"/>
+          <w:lang w:val="en-GB"/>
+        </w:rPr>
+        <w:t xml:space="preserve"> </w:t>
+      </w:r>
+      <w:proofErr w:type="spellStart"/>
+      <w:r>
+        <w:rPr>
+          <w:rFonts w:ascii="Times New Roman" w:hAnsi="Times New Roman" w:cs="Times New Roman"/>
+          <w:lang w:val="en-GB"/>
+        </w:rPr>
+        <w:t>memeriksa</w:t>
+      </w:r>
+      <w:proofErr w:type="spellEnd"/>
+      <w:r>
+        <w:rPr>
+          <w:rFonts w:ascii="Times New Roman" w:hAnsi="Times New Roman" w:cs="Times New Roman"/>
+          <w:lang w:val="en-GB"/>
+        </w:rPr>
+        <w:t xml:space="preserve"> folder </w:t>
+      </w:r>
+      <w:proofErr w:type="spellStart"/>
+      <w:r>
+        <w:rPr>
+          <w:rFonts w:ascii="Times New Roman" w:hAnsi="Times New Roman" w:cs="Times New Roman"/>
+          <w:lang w:val="en-GB"/>
+        </w:rPr>
+        <w:t>sampah</w:t>
+      </w:r>
+      <w:proofErr w:type="spellEnd"/>
+      <w:r>
+        <w:rPr>
+          <w:rFonts w:ascii="Times New Roman" w:hAnsi="Times New Roman" w:cs="Times New Roman"/>
+          <w:lang w:val="en-GB"/>
+        </w:rPr>
+        <w:t xml:space="preserve"> </w:t>
+      </w:r>
+      <w:proofErr w:type="spellStart"/>
+      <w:r>
+        <w:rPr>
+          <w:rFonts w:ascii="Times New Roman" w:hAnsi="Times New Roman" w:cs="Times New Roman"/>
+          <w:lang w:val="en-GB"/>
+        </w:rPr>
+        <w:t>atau</w:t>
+      </w:r>
+      <w:proofErr w:type="spellEnd"/>
+      <w:r>
+        <w:rPr>
+          <w:rFonts w:ascii="Times New Roman" w:hAnsi="Times New Roman" w:cs="Times New Roman"/>
+          <w:lang w:val="en-GB"/>
+        </w:rPr>
+        <w:t xml:space="preserve"> folder </w:t>
+      </w:r>
+      <w:proofErr w:type="spellStart"/>
+      <w:r>
+        <w:rPr>
+          <w:rFonts w:ascii="Times New Roman" w:hAnsi="Times New Roman" w:cs="Times New Roman"/>
+          <w:lang w:val="en-GB"/>
+        </w:rPr>
+        <w:t>hasil</w:t>
+      </w:r>
+      <w:proofErr w:type="spellEnd"/>
+      <w:r>
+        <w:rPr>
+          <w:rFonts w:ascii="Times New Roman" w:hAnsi="Times New Roman" w:cs="Times New Roman"/>
+          <w:lang w:val="en-GB"/>
+        </w:rPr>
+        <w:t xml:space="preserve"> </w:t>
+      </w:r>
+      <w:proofErr w:type="spellStart"/>
+      <w:r>
+        <w:rPr>
+          <w:rFonts w:ascii="Times New Roman" w:hAnsi="Times New Roman" w:cs="Times New Roman"/>
+          <w:lang w:val="en-GB"/>
+        </w:rPr>
+        <w:t>jadi</w:t>
+      </w:r>
+      <w:proofErr w:type="spellEnd"/>
+      <w:r>
+        <w:rPr>
+          <w:rFonts w:ascii="Times New Roman" w:hAnsi="Times New Roman" w:cs="Times New Roman"/>
+          <w:lang w:val="en-GB"/>
+        </w:rPr>
+        <w:t xml:space="preserve"> (</w:t>
+      </w:r>
+      <w:proofErr w:type="spellStart"/>
+      <w:r>
+        <w:rPr>
+          <w:rFonts w:ascii="Times New Roman" w:hAnsi="Times New Roman" w:cs="Times New Roman"/>
+          <w:lang w:val="en-GB"/>
+        </w:rPr>
+        <w:t>dist</w:t>
+      </w:r>
+      <w:proofErr w:type="spellEnd"/>
+      <w:r>
+        <w:rPr>
+          <w:rFonts w:ascii="Times New Roman" w:hAnsi="Times New Roman" w:cs="Times New Roman"/>
+          <w:lang w:val="en-GB"/>
+        </w:rPr>
+        <w:t xml:space="preserve"> </w:t>
+      </w:r>
+      <w:proofErr w:type="spellStart"/>
+      <w:r>
+        <w:rPr>
+          <w:rFonts w:ascii="Times New Roman" w:hAnsi="Times New Roman" w:cs="Times New Roman"/>
+          <w:lang w:val="en-GB"/>
+        </w:rPr>
+        <w:t>atau</w:t>
+      </w:r>
+      <w:proofErr w:type="spellEnd"/>
+      <w:r>
+        <w:rPr>
+          <w:rFonts w:ascii="Times New Roman" w:hAnsi="Times New Roman" w:cs="Times New Roman"/>
+          <w:lang w:val="en-GB"/>
+        </w:rPr>
+        <w:t xml:space="preserve"> </w:t>
+      </w:r>
+      <w:proofErr w:type="spellStart"/>
+      <w:r>
+        <w:rPr>
+          <w:rFonts w:ascii="Times New Roman" w:hAnsi="Times New Roman" w:cs="Times New Roman"/>
+          <w:lang w:val="en-GB"/>
+        </w:rPr>
+        <w:t>node_modules</w:t>
+      </w:r>
+      <w:proofErr w:type="spellEnd"/>
+      <w:r>
+        <w:rPr>
+          <w:rFonts w:ascii="Times New Roman" w:hAnsi="Times New Roman" w:cs="Times New Roman"/>
+          <w:lang w:val="en-GB"/>
+        </w:rPr>
+        <w:t xml:space="preserve">). Ini </w:t>
+      </w:r>
+      <w:proofErr w:type="spellStart"/>
+      <w:r>
+        <w:rPr>
+          <w:rFonts w:ascii="Times New Roman" w:hAnsi="Times New Roman" w:cs="Times New Roman"/>
+          <w:lang w:val="en-GB"/>
+        </w:rPr>
+        <w:t>membuat</w:t>
+      </w:r>
+      <w:proofErr w:type="spellEnd"/>
+      <w:r>
+        <w:rPr>
+          <w:rFonts w:ascii="Times New Roman" w:hAnsi="Times New Roman" w:cs="Times New Roman"/>
+          <w:lang w:val="en-GB"/>
+        </w:rPr>
+        <w:t xml:space="preserve"> proses loading </w:t>
+      </w:r>
+      <w:proofErr w:type="spellStart"/>
+      <w:r>
+        <w:rPr>
+          <w:rFonts w:ascii="Times New Roman" w:hAnsi="Times New Roman" w:cs="Times New Roman"/>
+          <w:lang w:val="en-GB"/>
+        </w:rPr>
+        <w:t>menjadi</w:t>
+      </w:r>
+      <w:proofErr w:type="spellEnd"/>
+      <w:r>
+        <w:rPr>
+          <w:rFonts w:ascii="Times New Roman" w:hAnsi="Times New Roman" w:cs="Times New Roman"/>
+          <w:lang w:val="en-GB"/>
+        </w:rPr>
+        <w:t xml:space="preserve"> </w:t>
+      </w:r>
+      <w:proofErr w:type="spellStart"/>
+      <w:r>
+        <w:rPr>
+          <w:rFonts w:ascii="Times New Roman" w:hAnsi="Times New Roman" w:cs="Times New Roman"/>
+          <w:lang w:val="en-GB"/>
+        </w:rPr>
+        <w:t>lebih</w:t>
+      </w:r>
+      <w:proofErr w:type="spellEnd"/>
+      <w:r>
+        <w:rPr>
+          <w:rFonts w:ascii="Times New Roman" w:hAnsi="Times New Roman" w:cs="Times New Roman"/>
+          <w:lang w:val="en-GB"/>
+        </w:rPr>
+        <w:t xml:space="preserve"> </w:t>
+      </w:r>
+      <w:proofErr w:type="spellStart"/>
+      <w:r>
+        <w:rPr>
+          <w:rFonts w:ascii="Times New Roman" w:hAnsi="Times New Roman" w:cs="Times New Roman"/>
+          <w:lang w:val="en-GB"/>
+        </w:rPr>
+        <w:t>cepat</w:t>
+      </w:r>
+      <w:proofErr w:type="spellEnd"/>
+      <w:r>
+        <w:rPr>
+          <w:rFonts w:ascii="Times New Roman" w:hAnsi="Times New Roman" w:cs="Times New Roman"/>
+          <w:lang w:val="en-GB"/>
+        </w:rPr>
+        <w:t>.</w:t>
+      </w:r>
+    </w:p>
+    <w:p>
+      <w:pPr>
+        <w:pStyle w:val="ListParagraph"/>
+        <w:numPr>
+          <w:ilvl w:val="0"/>
+          <w:numId w:val="4"/>
+        </w:numPr>
+        <w:jc w:val="both"/>
+        <w:rPr>
+          <w:rFonts w:ascii="Times New Roman" w:hAnsi="Times New Roman" w:cs="Times New Roman"/>
+          <w:lang w:val="en-GB"/>
+        </w:rPr>
+      </w:pPr>
+      <w:proofErr w:type="spellStart"/>
+      <w:r>
+        <w:rPr>
+          <w:rFonts w:ascii="Times New Roman" w:hAnsi="Times New Roman" w:cs="Times New Roman"/>
+          <w:lang w:val="en-GB"/>
+        </w:rPr>
+        <w:t>Izin</w:t>
+      </w:r>
+      <w:proofErr w:type="spellEnd"/>
+      <w:r>
+        <w:rPr>
+          <w:rFonts w:ascii="Times New Roman" w:hAnsi="Times New Roman" w:cs="Times New Roman"/>
+          <w:lang w:val="en-GB"/>
+        </w:rPr>
+        <w:t xml:space="preserve"> Fitur </w:t>
+      </w:r>
+      <w:proofErr w:type="spellStart"/>
+      <w:r>
+        <w:rPr>
+          <w:rFonts w:ascii="Times New Roman" w:hAnsi="Times New Roman" w:cs="Times New Roman"/>
+          <w:lang w:val="en-GB"/>
+        </w:rPr>
+        <w:t>Canggih</w:t>
+      </w:r>
+      <w:proofErr w:type="spellEnd"/>
+      <w:r>
+        <w:rPr>
+          <w:rFonts w:ascii="Times New Roman" w:hAnsi="Times New Roman" w:cs="Times New Roman"/>
+          <w:lang w:val="en-GB"/>
+        </w:rPr>
+        <w:t xml:space="preserve"> (Decorators):</w:t>
+      </w:r>
+    </w:p>
+    <w:p>
+      <w:pPr>
+        <w:ind w:left="720"/>
+        <w:contextualSpacing/>
+        <w:jc w:val="both"/>
+        <w:rPr>
+          <w:rFonts w:ascii="Times New Roman" w:hAnsi="Times New Roman" w:cs="Times New Roman"/>
+          <w:lang w:val="en-GB"/>
+        </w:rPr>
+      </w:pPr>
+      <w:proofErr w:type="spellStart"/>
+      <w:r>
+        <w:rPr>
+          <w:rFonts w:ascii="Times New Roman" w:hAnsi="Times New Roman" w:cs="Times New Roman"/>
+          <w:lang w:val="en-GB"/>
+        </w:rPr>
+        <w:t>Mengaktifkan</w:t>
+      </w:r>
+      <w:proofErr w:type="spellEnd"/>
+      <w:r>
+        <w:rPr>
+          <w:rFonts w:ascii="Times New Roman" w:hAnsi="Times New Roman" w:cs="Times New Roman"/>
+          <w:lang w:val="en-GB"/>
+        </w:rPr>
+        <w:t xml:space="preserve"> </w:t>
+      </w:r>
+      <w:proofErr w:type="spellStart"/>
+      <w:r>
+        <w:rPr>
+          <w:rFonts w:ascii="Times New Roman" w:hAnsi="Times New Roman" w:cs="Times New Roman"/>
+          <w:lang w:val="en-GB"/>
+        </w:rPr>
+        <w:t>fitur</w:t>
+      </w:r>
+      <w:proofErr w:type="spellEnd"/>
+      <w:r>
+        <w:rPr>
+          <w:rFonts w:ascii="Times New Roman" w:hAnsi="Times New Roman" w:cs="Times New Roman"/>
+          <w:lang w:val="en-GB"/>
+        </w:rPr>
+        <w:t xml:space="preserve"> </w:t>
+      </w:r>
+      <w:proofErr w:type="spellStart"/>
+      <w:r>
+        <w:rPr>
+          <w:rFonts w:ascii="Times New Roman" w:hAnsi="Times New Roman" w:cs="Times New Roman"/>
+          <w:lang w:val="en-GB"/>
+        </w:rPr>
+        <w:t>khusus</w:t>
+      </w:r>
+      <w:proofErr w:type="spellEnd"/>
+      <w:r>
+        <w:rPr>
+          <w:rFonts w:ascii="Times New Roman" w:hAnsi="Times New Roman" w:cs="Times New Roman"/>
+          <w:lang w:val="en-GB"/>
+        </w:rPr>
+        <w:t xml:space="preserve"> yang sangat </w:t>
+      </w:r>
+      <w:proofErr w:type="spellStart"/>
+      <w:r>
+        <w:rPr>
+          <w:rFonts w:ascii="Times New Roman" w:hAnsi="Times New Roman" w:cs="Times New Roman"/>
+          <w:lang w:val="en-GB"/>
+        </w:rPr>
+        <w:t>dibutuhkan</w:t>
+      </w:r>
+      <w:proofErr w:type="spellEnd"/>
+      <w:r>
+        <w:rPr>
+          <w:rFonts w:ascii="Times New Roman" w:hAnsi="Times New Roman" w:cs="Times New Roman"/>
+          <w:lang w:val="en-GB"/>
+        </w:rPr>
+        <w:t xml:space="preserve"> oleh </w:t>
+      </w:r>
+      <w:proofErr w:type="spellStart"/>
+      <w:r>
+        <w:rPr>
+          <w:rFonts w:ascii="Times New Roman" w:hAnsi="Times New Roman" w:cs="Times New Roman"/>
+          <w:lang w:val="en-GB"/>
+        </w:rPr>
+        <w:t>NestJS</w:t>
+      </w:r>
+      <w:proofErr w:type="spellEnd"/>
+      <w:r>
+        <w:rPr>
+          <w:rFonts w:ascii="Times New Roman" w:hAnsi="Times New Roman" w:cs="Times New Roman"/>
+          <w:lang w:val="en-GB"/>
+        </w:rPr>
+        <w:t xml:space="preserve"> agar </w:t>
+      </w:r>
+      <w:proofErr w:type="spellStart"/>
+      <w:r>
+        <w:rPr>
+          <w:rFonts w:ascii="Times New Roman" w:hAnsi="Times New Roman" w:cs="Times New Roman"/>
+          <w:lang w:val="en-GB"/>
+        </w:rPr>
+        <w:t>aplikasi</w:t>
+      </w:r>
+      <w:proofErr w:type="spellEnd"/>
+      <w:r>
+        <w:rPr>
+          <w:rFonts w:ascii="Times New Roman" w:hAnsi="Times New Roman" w:cs="Times New Roman"/>
+          <w:lang w:val="en-GB"/>
+        </w:rPr>
+        <w:t xml:space="preserve"> </w:t>
+      </w:r>
+      <w:proofErr w:type="spellStart"/>
+      <w:r>
+        <w:rPr>
+          <w:rFonts w:ascii="Times New Roman" w:hAnsi="Times New Roman" w:cs="Times New Roman"/>
+          <w:lang w:val="en-GB"/>
+        </w:rPr>
+        <w:t>tahu</w:t>
+      </w:r>
+      <w:proofErr w:type="spellEnd"/>
+      <w:r>
+        <w:rPr>
+          <w:rFonts w:ascii="Times New Roman" w:hAnsi="Times New Roman" w:cs="Times New Roman"/>
+          <w:lang w:val="en-GB"/>
+        </w:rPr>
+        <w:t xml:space="preserve"> mana </w:t>
+      </w:r>
+      <w:proofErr w:type="spellStart"/>
+      <w:r>
+        <w:rPr>
+          <w:rFonts w:ascii="Times New Roman" w:hAnsi="Times New Roman" w:cs="Times New Roman"/>
+          <w:lang w:val="en-GB"/>
+        </w:rPr>
+        <w:t>bagian</w:t>
+      </w:r>
+      <w:proofErr w:type="spellEnd"/>
+      <w:r>
+        <w:rPr>
+          <w:rFonts w:ascii="Times New Roman" w:hAnsi="Times New Roman" w:cs="Times New Roman"/>
+          <w:lang w:val="en-GB"/>
+        </w:rPr>
+        <w:t xml:space="preserve"> yang </w:t>
+      </w:r>
+      <w:proofErr w:type="spellStart"/>
+      <w:r>
+        <w:rPr>
+          <w:rFonts w:ascii="Times New Roman" w:hAnsi="Times New Roman" w:cs="Times New Roman"/>
+          <w:lang w:val="en-GB"/>
+        </w:rPr>
+        <w:t>berfungsi</w:t>
+      </w:r>
+      <w:proofErr w:type="spellEnd"/>
+      <w:r>
+        <w:rPr>
+          <w:rFonts w:ascii="Times New Roman" w:hAnsi="Times New Roman" w:cs="Times New Roman"/>
+          <w:lang w:val="en-GB"/>
+        </w:rPr>
+        <w:t xml:space="preserve"> </w:t>
+      </w:r>
+      <w:proofErr w:type="spellStart"/>
+      <w:r>
+        <w:rPr>
+          <w:rFonts w:ascii="Times New Roman" w:hAnsi="Times New Roman" w:cs="Times New Roman"/>
+          <w:lang w:val="en-GB"/>
+        </w:rPr>
+        <w:t>sebagai</w:t>
+      </w:r>
+      <w:proofErr w:type="spellEnd"/>
+      <w:r>
+        <w:rPr>
+          <w:rFonts w:ascii="Times New Roman" w:hAnsi="Times New Roman" w:cs="Times New Roman"/>
+          <w:lang w:val="en-GB"/>
+        </w:rPr>
+        <w:t xml:space="preserve"> </w:t>
+      </w:r>
+      <w:proofErr w:type="spellStart"/>
+      <w:r>
+        <w:rPr>
+          <w:rFonts w:ascii="Times New Roman" w:hAnsi="Times New Roman" w:cs="Times New Roman"/>
+          <w:lang w:val="en-GB"/>
+        </w:rPr>
+        <w:t>Pengatur</w:t>
+      </w:r>
+      <w:proofErr w:type="spellEnd"/>
+      <w:r>
+        <w:rPr>
+          <w:rFonts w:ascii="Times New Roman" w:hAnsi="Times New Roman" w:cs="Times New Roman"/>
+          <w:lang w:val="en-GB"/>
+        </w:rPr>
+        <w:t xml:space="preserve"> (Controller) </w:t>
+      </w:r>
+      <w:proofErr w:type="spellStart"/>
+      <w:r>
+        <w:rPr>
+          <w:rFonts w:ascii="Times New Roman" w:hAnsi="Times New Roman" w:cs="Times New Roman"/>
+          <w:lang w:val="en-GB"/>
+        </w:rPr>
+        <w:t>atau</w:t>
+      </w:r>
+      <w:proofErr w:type="spellEnd"/>
+      <w:r>
+        <w:rPr>
+          <w:rFonts w:ascii="Times New Roman" w:hAnsi="Times New Roman" w:cs="Times New Roman"/>
+          <w:lang w:val="en-GB"/>
+        </w:rPr>
+        <w:t xml:space="preserve"> </w:t>
+      </w:r>
+      <w:proofErr w:type="spellStart"/>
+      <w:r>
+        <w:rPr>
+          <w:rFonts w:ascii="Times New Roman" w:hAnsi="Times New Roman" w:cs="Times New Roman"/>
+          <w:lang w:val="en-GB"/>
+        </w:rPr>
+        <w:t>Pelayan</w:t>
+      </w:r>
+      <w:proofErr w:type="spellEnd"/>
+      <w:r>
+        <w:rPr>
+          <w:rFonts w:ascii="Times New Roman" w:hAnsi="Times New Roman" w:cs="Times New Roman"/>
+          <w:lang w:val="en-GB"/>
+        </w:rPr>
+        <w:t xml:space="preserve"> (Service). </w:t>
+      </w:r>
+      <w:proofErr w:type="spellStart"/>
+      <w:r>
+        <w:rPr>
+          <w:rFonts w:ascii="Times New Roman" w:hAnsi="Times New Roman" w:cs="Times New Roman"/>
+          <w:lang w:val="en-GB"/>
+        </w:rPr>
+        <w:t>Tanpa</w:t>
+      </w:r>
+      <w:proofErr w:type="spellEnd"/>
+      <w:r>
+        <w:rPr>
+          <w:rFonts w:ascii="Times New Roman" w:hAnsi="Times New Roman" w:cs="Times New Roman"/>
+          <w:lang w:val="en-GB"/>
+        </w:rPr>
+        <w:t xml:space="preserve"> </w:t>
+      </w:r>
+      <w:proofErr w:type="spellStart"/>
+      <w:r>
+        <w:rPr>
+          <w:rFonts w:ascii="Times New Roman" w:hAnsi="Times New Roman" w:cs="Times New Roman"/>
+          <w:lang w:val="en-GB"/>
+        </w:rPr>
+        <w:t>ini</w:t>
+      </w:r>
+      <w:proofErr w:type="spellEnd"/>
+      <w:r>
+        <w:rPr>
+          <w:rFonts w:ascii="Times New Roman" w:hAnsi="Times New Roman" w:cs="Times New Roman"/>
+          <w:lang w:val="en-GB"/>
+        </w:rPr>
+        <w:t xml:space="preserve">, </w:t>
+      </w:r>
+      <w:proofErr w:type="spellStart"/>
+      <w:r>
+        <w:rPr>
+          <w:rFonts w:ascii="Times New Roman" w:hAnsi="Times New Roman" w:cs="Times New Roman"/>
+          <w:lang w:val="en-GB"/>
+        </w:rPr>
+        <w:t>aplikasi</w:t>
+      </w:r>
+      <w:proofErr w:type="spellEnd"/>
+      <w:r>
+        <w:rPr>
+          <w:rFonts w:ascii="Times New Roman" w:hAnsi="Times New Roman" w:cs="Times New Roman"/>
+          <w:lang w:val="en-GB"/>
+        </w:rPr>
+        <w:t xml:space="preserve"> </w:t>
+      </w:r>
+      <w:proofErr w:type="spellStart"/>
+      <w:r>
+        <w:rPr>
+          <w:rFonts w:ascii="Times New Roman" w:hAnsi="Times New Roman" w:cs="Times New Roman"/>
+          <w:lang w:val="en-GB"/>
+        </w:rPr>
+        <w:t>NestJS</w:t>
+      </w:r>
+      <w:proofErr w:type="spellEnd"/>
+      <w:r>
+        <w:rPr>
+          <w:rFonts w:ascii="Times New Roman" w:hAnsi="Times New Roman" w:cs="Times New Roman"/>
+          <w:lang w:val="en-GB"/>
+        </w:rPr>
+        <w:t xml:space="preserve"> </w:t>
+      </w:r>
+      <w:proofErr w:type="spellStart"/>
+      <w:r>
+        <w:rPr>
+          <w:rFonts w:ascii="Times New Roman" w:hAnsi="Times New Roman" w:cs="Times New Roman"/>
+          <w:lang w:val="en-GB"/>
+        </w:rPr>
+        <w:t>tidak</w:t>
+      </w:r>
+      <w:proofErr w:type="spellEnd"/>
+      <w:r>
+        <w:rPr>
+          <w:rFonts w:ascii="Times New Roman" w:hAnsi="Times New Roman" w:cs="Times New Roman"/>
+          <w:lang w:val="en-GB"/>
+        </w:rPr>
+        <w:t xml:space="preserve"> </w:t>
+      </w:r>
+      <w:proofErr w:type="spellStart"/>
+      <w:r>
+        <w:rPr>
+          <w:rFonts w:ascii="Times New Roman" w:hAnsi="Times New Roman" w:cs="Times New Roman"/>
+          <w:lang w:val="en-GB"/>
+        </w:rPr>
+        <w:t>akan</w:t>
+      </w:r>
+      <w:proofErr w:type="spellEnd"/>
+      <w:r>
+        <w:rPr>
+          <w:rFonts w:ascii="Times New Roman" w:hAnsi="Times New Roman" w:cs="Times New Roman"/>
+          <w:lang w:val="en-GB"/>
+        </w:rPr>
+        <w:t xml:space="preserve"> </w:t>
+      </w:r>
+      <w:proofErr w:type="spellStart"/>
+      <w:r>
+        <w:rPr>
+          <w:rFonts w:ascii="Times New Roman" w:hAnsi="Times New Roman" w:cs="Times New Roman"/>
+          <w:lang w:val="en-GB"/>
+        </w:rPr>
+        <w:t>bisa</w:t>
+      </w:r>
+      <w:proofErr w:type="spellEnd"/>
+      <w:r>
+        <w:rPr>
+          <w:rFonts w:ascii="Times New Roman" w:hAnsi="Times New Roman" w:cs="Times New Roman"/>
+          <w:lang w:val="en-GB"/>
+        </w:rPr>
+        <w:t xml:space="preserve"> </w:t>
+      </w:r>
+      <w:proofErr w:type="spellStart"/>
+      <w:r>
+        <w:rPr>
+          <w:rFonts w:ascii="Times New Roman" w:hAnsi="Times New Roman" w:cs="Times New Roman"/>
+          <w:lang w:val="en-GB"/>
+        </w:rPr>
+        <w:t>berjalan</w:t>
+      </w:r>
+      <w:proofErr w:type="spellEnd"/>
+      <w:r>
+        <w:rPr>
+          <w:rFonts w:ascii="Times New Roman" w:hAnsi="Times New Roman" w:cs="Times New Roman"/>
+          <w:lang w:val="en-GB"/>
+        </w:rPr>
+        <w:t>.</w:t>
+      </w:r>
+    </w:p>
+    <w:p>
+      <w:pPr>
+        <w:pStyle w:val="ListParagraph"/>
+        <w:numPr>
+          <w:ilvl w:val="0"/>
+          <w:numId w:val="4"/>
+        </w:numPr>
+        <w:jc w:val="both"/>
+        <w:rPr>
+          <w:rFonts w:ascii="Times New Roman" w:hAnsi="Times New Roman" w:cs="Times New Roman"/>
+          <w:lang w:val="en-GB"/>
+        </w:rPr>
+      </w:pPr>
+      <w:proofErr w:type="spellStart"/>
+      <w:r>
+        <w:rPr>
+          <w:rFonts w:ascii="Times New Roman" w:hAnsi="Times New Roman" w:cs="Times New Roman"/>
+          <w:lang w:val="en-GB"/>
+        </w:rPr>
+        <w:t>Penyimpanan</w:t>
+      </w:r>
+      <w:proofErr w:type="spellEnd"/>
+      <w:r>
+        <w:rPr>
+          <w:rFonts w:ascii="Times New Roman" w:hAnsi="Times New Roman" w:cs="Times New Roman"/>
+          <w:lang w:val="en-GB"/>
+        </w:rPr>
+        <w:t xml:space="preserve"> Hasil Jadi (</w:t>
+      </w:r>
+      <w:proofErr w:type="spellStart"/>
+      <w:r>
+        <w:rPr>
+          <w:rFonts w:ascii="Times New Roman" w:hAnsi="Times New Roman" w:cs="Times New Roman"/>
+          <w:lang w:val="en-GB"/>
+        </w:rPr>
+        <w:t>OutDir</w:t>
+      </w:r>
+      <w:proofErr w:type="spellEnd"/>
+      <w:r>
+        <w:rPr>
+          <w:rFonts w:ascii="Times New Roman" w:hAnsi="Times New Roman" w:cs="Times New Roman"/>
+          <w:lang w:val="en-GB"/>
+        </w:rPr>
+        <w:t>):</w:t>
+      </w:r>
+    </w:p>
+    <w:p>
+      <w:pPr>
+        <w:ind w:left="720"/>
+        <w:contextualSpacing/>
+        <w:jc w:val="both"/>
+        <w:rPr>
+          <w:rFonts w:ascii="Times New Roman" w:hAnsi="Times New Roman" w:cs="Times New Roman"/>
+          <w:lang w:val="en-GB"/>
+        </w:rPr>
+      </w:pPr>
+      <w:proofErr w:type="spellStart"/>
+      <w:r>
+        <w:rPr>
+          <w:rFonts w:ascii="Times New Roman" w:hAnsi="Times New Roman" w:cs="Times New Roman"/>
+          <w:lang w:val="en-GB"/>
+        </w:rPr>
+        <w:t>Menentukan</w:t>
+      </w:r>
+      <w:proofErr w:type="spellEnd"/>
+      <w:r>
+        <w:rPr>
+          <w:rFonts w:ascii="Times New Roman" w:hAnsi="Times New Roman" w:cs="Times New Roman"/>
+          <w:lang w:val="en-GB"/>
+        </w:rPr>
+        <w:t xml:space="preserve"> </w:t>
+      </w:r>
+      <w:proofErr w:type="spellStart"/>
+      <w:r>
+        <w:rPr>
+          <w:rFonts w:ascii="Times New Roman" w:hAnsi="Times New Roman" w:cs="Times New Roman"/>
+          <w:lang w:val="en-GB"/>
+        </w:rPr>
+        <w:t>bahwa</w:t>
+      </w:r>
+      <w:proofErr w:type="spellEnd"/>
+      <w:r>
+        <w:rPr>
+          <w:rFonts w:ascii="Times New Roman" w:hAnsi="Times New Roman" w:cs="Times New Roman"/>
+          <w:lang w:val="en-GB"/>
+        </w:rPr>
+        <w:t xml:space="preserve"> </w:t>
+      </w:r>
+      <w:proofErr w:type="spellStart"/>
+      <w:r>
+        <w:rPr>
+          <w:rFonts w:ascii="Times New Roman" w:hAnsi="Times New Roman" w:cs="Times New Roman"/>
+          <w:lang w:val="en-GB"/>
+        </w:rPr>
+        <w:t>semua</w:t>
+      </w:r>
+      <w:proofErr w:type="spellEnd"/>
+      <w:r>
+        <w:rPr>
+          <w:rFonts w:ascii="Times New Roman" w:hAnsi="Times New Roman" w:cs="Times New Roman"/>
+          <w:lang w:val="en-GB"/>
+        </w:rPr>
+        <w:t xml:space="preserve"> </w:t>
+      </w:r>
+      <w:proofErr w:type="spellStart"/>
+      <w:r>
+        <w:rPr>
+          <w:rFonts w:ascii="Times New Roman" w:hAnsi="Times New Roman" w:cs="Times New Roman"/>
+          <w:lang w:val="en-GB"/>
+        </w:rPr>
+        <w:t>kode</w:t>
+      </w:r>
+      <w:proofErr w:type="spellEnd"/>
+      <w:r>
+        <w:rPr>
+          <w:rFonts w:ascii="Times New Roman" w:hAnsi="Times New Roman" w:cs="Times New Roman"/>
+          <w:lang w:val="en-GB"/>
+        </w:rPr>
+        <w:t xml:space="preserve"> yang </w:t>
+      </w:r>
+      <w:proofErr w:type="spellStart"/>
+      <w:r>
+        <w:rPr>
+          <w:rFonts w:ascii="Times New Roman" w:hAnsi="Times New Roman" w:cs="Times New Roman"/>
+          <w:lang w:val="en-GB"/>
+        </w:rPr>
+        <w:t>sudah</w:t>
+      </w:r>
+      <w:proofErr w:type="spellEnd"/>
+      <w:r>
+        <w:rPr>
+          <w:rFonts w:ascii="Times New Roman" w:hAnsi="Times New Roman" w:cs="Times New Roman"/>
+          <w:lang w:val="en-GB"/>
+        </w:rPr>
+        <w:t xml:space="preserve"> </w:t>
+      </w:r>
+      <w:proofErr w:type="spellStart"/>
+      <w:r>
+        <w:rPr>
+          <w:rFonts w:ascii="Times New Roman" w:hAnsi="Times New Roman" w:cs="Times New Roman"/>
+          <w:lang w:val="en-GB"/>
+        </w:rPr>
+        <w:t>siap</w:t>
+      </w:r>
+      <w:proofErr w:type="spellEnd"/>
+      <w:r>
+        <w:rPr>
+          <w:rFonts w:ascii="Times New Roman" w:hAnsi="Times New Roman" w:cs="Times New Roman"/>
+          <w:lang w:val="en-GB"/>
+        </w:rPr>
+        <w:t xml:space="preserve"> (</w:t>
+      </w:r>
+      <w:proofErr w:type="spellStart"/>
+      <w:r>
+        <w:rPr>
+          <w:rFonts w:ascii="Times New Roman" w:hAnsi="Times New Roman" w:cs="Times New Roman"/>
+          <w:lang w:val="en-GB"/>
+        </w:rPr>
+        <w:t>sudah</w:t>
+      </w:r>
+      <w:proofErr w:type="spellEnd"/>
+      <w:r>
+        <w:rPr>
+          <w:rFonts w:ascii="Times New Roman" w:hAnsi="Times New Roman" w:cs="Times New Roman"/>
+          <w:lang w:val="en-GB"/>
+        </w:rPr>
+        <w:t xml:space="preserve"> </w:t>
+      </w:r>
+      <w:proofErr w:type="spellStart"/>
+      <w:r>
+        <w:rPr>
+          <w:rFonts w:ascii="Times New Roman" w:hAnsi="Times New Roman" w:cs="Times New Roman"/>
+          <w:lang w:val="en-GB"/>
+        </w:rPr>
+        <w:t>diterjemahkan</w:t>
+      </w:r>
+      <w:proofErr w:type="spellEnd"/>
+      <w:r>
+        <w:rPr>
+          <w:rFonts w:ascii="Times New Roman" w:hAnsi="Times New Roman" w:cs="Times New Roman"/>
+          <w:lang w:val="en-GB"/>
+        </w:rPr>
+        <w:t xml:space="preserve">) </w:t>
+      </w:r>
+      <w:proofErr w:type="spellStart"/>
+      <w:r>
+        <w:rPr>
+          <w:rFonts w:ascii="Times New Roman" w:hAnsi="Times New Roman" w:cs="Times New Roman"/>
+          <w:lang w:val="en-GB"/>
+        </w:rPr>
+        <w:t>akan</w:t>
+      </w:r>
+      <w:proofErr w:type="spellEnd"/>
+      <w:r>
+        <w:rPr>
+          <w:rFonts w:ascii="Times New Roman" w:hAnsi="Times New Roman" w:cs="Times New Roman"/>
+          <w:lang w:val="en-GB"/>
+        </w:rPr>
+        <w:t xml:space="preserve"> </w:t>
+      </w:r>
+      <w:proofErr w:type="spellStart"/>
+      <w:r>
+        <w:rPr>
+          <w:rFonts w:ascii="Times New Roman" w:hAnsi="Times New Roman" w:cs="Times New Roman"/>
+          <w:lang w:val="en-GB"/>
+        </w:rPr>
+        <w:t>disimpan</w:t>
+      </w:r>
+      <w:proofErr w:type="spellEnd"/>
+      <w:r>
+        <w:rPr>
+          <w:rFonts w:ascii="Times New Roman" w:hAnsi="Times New Roman" w:cs="Times New Roman"/>
+          <w:lang w:val="en-GB"/>
+        </w:rPr>
+        <w:t xml:space="preserve"> </w:t>
+      </w:r>
+      <w:proofErr w:type="spellStart"/>
+      <w:r>
+        <w:rPr>
+          <w:rFonts w:ascii="Times New Roman" w:hAnsi="Times New Roman" w:cs="Times New Roman"/>
+          <w:lang w:val="en-GB"/>
+        </w:rPr>
+        <w:t>rapi</w:t>
+      </w:r>
+      <w:proofErr w:type="spellEnd"/>
+      <w:r>
+        <w:rPr>
+          <w:rFonts w:ascii="Times New Roman" w:hAnsi="Times New Roman" w:cs="Times New Roman"/>
+          <w:lang w:val="en-GB"/>
+        </w:rPr>
+        <w:t xml:space="preserve"> di </w:t>
+      </w:r>
+      <w:proofErr w:type="spellStart"/>
+      <w:r>
+        <w:rPr>
+          <w:rFonts w:ascii="Times New Roman" w:hAnsi="Times New Roman" w:cs="Times New Roman"/>
+          <w:lang w:val="en-GB"/>
+        </w:rPr>
+        <w:t>dalam</w:t>
+      </w:r>
+      <w:proofErr w:type="spellEnd"/>
+      <w:r>
+        <w:rPr>
+          <w:rFonts w:ascii="Times New Roman" w:hAnsi="Times New Roman" w:cs="Times New Roman"/>
+          <w:lang w:val="en-GB"/>
+        </w:rPr>
+        <w:t xml:space="preserve"> </w:t>
+      </w:r>
+      <w:proofErr w:type="spellStart"/>
+      <w:r>
+        <w:rPr>
+          <w:rFonts w:ascii="Times New Roman" w:hAnsi="Times New Roman" w:cs="Times New Roman"/>
+          <w:lang w:val="en-GB"/>
+        </w:rPr>
+        <w:t>satu</w:t>
+      </w:r>
+      <w:proofErr w:type="spellEnd"/>
+      <w:r>
+        <w:rPr>
+          <w:rFonts w:ascii="Times New Roman" w:hAnsi="Times New Roman" w:cs="Times New Roman"/>
+          <w:lang w:val="en-GB"/>
+        </w:rPr>
+        <w:t xml:space="preserve"> folder </w:t>
+      </w:r>
+      <w:proofErr w:type="spellStart"/>
+      <w:r>
+        <w:rPr>
+          <w:rFonts w:ascii="Times New Roman" w:hAnsi="Times New Roman" w:cs="Times New Roman"/>
+          <w:lang w:val="en-GB"/>
+        </w:rPr>
+        <w:t>khusus</w:t>
+      </w:r>
+      <w:proofErr w:type="spellEnd"/>
+      <w:r>
+        <w:rPr>
+          <w:rFonts w:ascii="Times New Roman" w:hAnsi="Times New Roman" w:cs="Times New Roman"/>
+          <w:lang w:val="en-GB"/>
+        </w:rPr>
+        <w:t xml:space="preserve"> </w:t>
+      </w:r>
+      <w:proofErr w:type="spellStart"/>
+      <w:r>
+        <w:rPr>
+          <w:rFonts w:ascii="Times New Roman" w:hAnsi="Times New Roman" w:cs="Times New Roman"/>
+          <w:lang w:val="en-GB"/>
+        </w:rPr>
+        <w:t>bernama</w:t>
+      </w:r>
+      <w:proofErr w:type="spellEnd"/>
+      <w:r>
+        <w:rPr>
+          <w:rFonts w:ascii="Times New Roman" w:hAnsi="Times New Roman" w:cs="Times New Roman"/>
+          <w:lang w:val="en-GB"/>
+        </w:rPr>
+        <w:t xml:space="preserve"> dist.</w:t>
+      </w:r>
+    </w:p>
+    <w:p>
+      <w:pPr>
+        <w:contextualSpacing/>
+        <w:jc w:val="both"/>
+        <w:rPr>
+          <w:b/>
+          <w:bCs/>
+        </w:rPr>
+      </w:pPr>
+      <w:r>
+        <w:rPr>
+          <w:rFonts w:ascii="Times New Roman" w:hAnsi="Times New Roman" w:cs="Times New Roman"/>
+          <w:b/>
+          <w:bCs/>
+          <w:lang w:val="en-GB"/>
+        </w:rPr>
+        <w:lastRenderedPageBreak/>
+        <w:t>6.</w:t>
+      </w:r>
+      <w:r>
+        <w:rPr>
+          <w:rFonts w:ascii="Times New Roman" w:hAnsi="Times New Roman" w:cs="Times New Roman"/>
+          <w:lang w:val="en-GB"/>
+        </w:rPr>
+        <w:t xml:space="preserve"> </w:t>
+      </w:r>
+      <w:r>
+        <w:rPr>
+          <w:b/>
+          <w:bCs/>
+        </w:rPr>
+        <w:t xml:space="preserve">Update </w:t>
+      </w:r>
+      <w:proofErr w:type="spellStart"/>
+      <w:proofErr w:type="gramStart"/>
+      <w:r>
+        <w:rPr>
+          <w:b/>
+          <w:bCs/>
+        </w:rPr>
+        <w:t>package.json</w:t>
+      </w:r>
+      <w:proofErr w:type="spellEnd"/>
+      <w:proofErr w:type="gramEnd"/>
+      <w:r>
+        <w:rPr>
+          <w:b/>
+          <w:bCs/>
+        </w:rPr>
+        <w:t xml:space="preserve"> Scripts</w:t>
+      </w:r>
+    </w:p>
+    <w:p>
+      <w:pPr>
+        <w:contextualSpacing/>
+        <w:jc w:val="both"/>
+        <w:rPr>
+          <w:b/>
+          <w:bCs/>
+        </w:rPr>
+      </w:pPr>
+    </w:p>
+    <w:p>
+      <w:pPr>
+        <w:contextualSpacing/>
+        <w:jc w:val="both"/>
+        <w:rPr>
+          <w:b/>
+          <w:bCs/>
+        </w:rPr>
+      </w:pPr>
+      <w:r>
+        <w:rPr>
+          <w:noProof/>
+        </w:rPr>
+        <w:drawing>
+          <wp:inline distT="0" distB="0" distL="0" distR="0" wp14:anchorId="0E5F7419" wp14:editId="434EA4BC">
+            <wp:extent cx="5731510" cy="3222625"/>
+            <wp:effectExtent l="0" t="0" r="2540" b="0"/>
+            <wp:docPr id="417672227" name="Picture 1"/>
+            <wp:cNvGraphicFramePr>
+              <a:graphicFrameLocks xmlns:a="http://schemas.openxmlformats.org/drawingml/2006/main" noChangeAspect="1"/>
+            </wp:cNvGraphicFramePr>
+            <a:graphic xmlns:a="http://schemas.openxmlformats.org/drawingml/2006/main">
+              <a:graphicData uri="http://schemas.openxmlformats.org/drawingml/2006/picture">
+                <pic:pic xmlns:pic="http://schemas.openxmlformats.org/drawingml/2006/picture">
+                  <pic:nvPicPr>
+                    <pic:cNvPr id="417672227" name=""/>
+                    <pic:cNvPicPr/>
+                  </pic:nvPicPr>
+                  <pic:blipFill>
+                    <a:blip r:embed="rId10"/>
+                    <a:stretch>
+                      <a:fillRect/>
+                    </a:stretch>
+                  </pic:blipFill>
+                  <pic:spPr>
+                    <a:xfrm>
+                      <a:off x="0" y="0"/>
+                      <a:ext cx="5731510" cy="3222625"/>
+                    </a:xfrm>
+                    <a:prstGeom prst="rect">
+                      <a:avLst/>
+                    </a:prstGeom>
+                  </pic:spPr>
+                </pic:pic>
+              </a:graphicData>
+            </a:graphic>
+          </wp:inline>
+        </w:drawing>
+      </w:r>
+    </w:p>
+    <w:p>
+      <w:pPr>
         <w:pStyle w:val="ListParagraph"/>
         <w:numPr>
           <w:ilvl w:val="0"/>
@@ -4106,6 +6027,119 @@
       </w:rPr>
     </w:lvl>
   </w:abstractNum>
+  <w:abstractNum w:abstractNumId="3" w15:restartNumberingAfterBreak="0">
+    <w:nsid w:val="737805E1"/>
+    <w:multiLevelType w:val="hybridMultilevel"/>
+    <w:tmpl w:val="8DF2E322"/>
+    <w:lvl w:ilvl="0" w:tplc="38090001">
+      <w:start w:val="1"/>
+      <w:numFmt w:val="bullet"/>
+      <w:lvlText w:val=""/>
+      <w:lvlJc w:val="left"/>
+      <w:pPr>
+        <w:ind w:left="720" w:hanging="360"/>
+      </w:pPr>
+      <w:rPr>
+        <w:rFonts w:ascii="Symbol" w:hAnsi="Symbol" w:hint="default"/>
+      </w:rPr>
+    </w:lvl>
+    <w:lvl w:ilvl="1" w:tplc="38090003" w:tentative="1">
+      <w:start w:val="1"/>
+      <w:numFmt w:val="bullet"/>
+      <w:lvlText w:val="o"/>
+      <w:lvlJc w:val="left"/>
+      <w:pPr>
+        <w:ind w:left="1440" w:hanging="360"/>
+      </w:pPr>
+      <w:rPr>
+        <w:rFonts w:ascii="Courier New" w:hAnsi="Courier New" w:cs="Courier New" w:hint="default"/>
+      </w:rPr>
+    </w:lvl>
+    <w:lvl w:ilvl="2" w:tplc="38090005" w:tentative="1">
+      <w:start w:val="1"/>
+      <w:numFmt w:val="bullet"/>
+      <w:lvlText w:val=""/>
+      <w:lvlJc w:val="left"/>
+      <w:pPr>
+        <w:ind w:left="2160" w:hanging="360"/>
+      </w:pPr>
+      <w:rPr>
+        <w:rFonts w:ascii="Wingdings" w:hAnsi="Wingdings" w:hint="default"/>
+      </w:rPr>
+    </w:lvl>
+    <w:lvl w:ilvl="3" w:tplc="38090001" w:tentative="1">
+      <w:start w:val="1"/>
+      <w:numFmt w:val="bullet"/>
+      <w:lvlText w:val=""/>
+      <w:lvlJc w:val="left"/>
+      <w:pPr>
+        <w:ind w:left="2880" w:hanging="360"/>
+      </w:pPr>
+      <w:rPr>
+        <w:rFonts w:ascii="Symbol" w:hAnsi="Symbol" w:hint="default"/>
+      </w:rPr>
+    </w:lvl>
+    <w:lvl w:ilvl="4" w:tplc="38090003" w:tentative="1">
+      <w:start w:val="1"/>
+      <w:numFmt w:val="bullet"/>
+      <w:lvlText w:val="o"/>
+      <w:lvlJc w:val="left"/>
+      <w:pPr>
+        <w:ind w:left="3600" w:hanging="360"/>
+      </w:pPr>
+      <w:rPr>
+        <w:rFonts w:ascii="Courier New" w:hAnsi="Courier New" w:cs="Courier New" w:hint="default"/>
+      </w:rPr>
+    </w:lvl>
+    <w:lvl w:ilvl="5" w:tplc="38090005" w:tentative="1">
+      <w:start w:val="1"/>
+      <w:numFmt w:val="bullet"/>
+      <w:lvlText w:val=""/>
+      <w:lvlJc w:val="left"/>
+      <w:pPr>
+        <w:ind w:left="4320" w:hanging="360"/>
+      </w:pPr>
+      <w:rPr>
+        <w:rFonts w:ascii="Wingdings" w:hAnsi="Wingdings" w:hint="default"/>
+      </w:rPr>
+    </w:lvl>
+    <w:lvl w:ilvl="6" w:tplc="38090001" w:tentative="1">
+      <w:start w:val="1"/>
+      <w:numFmt w:val="bullet"/>
+      <w:lvlText w:val=""/>
+      <w:lvlJc w:val="left"/>
+      <w:pPr>
+        <w:ind w:left="5040" w:hanging="360"/>
+      </w:pPr>
+      <w:rPr>
+        <w:rFonts w:ascii="Symbol" w:hAnsi="Symbol" w:hint="default"/>
+      </w:rPr>
+    </w:lvl>
+    <w:lvl w:ilvl="7" w:tplc="38090003" w:tentative="1">
+      <w:start w:val="1"/>
+      <w:numFmt w:val="bullet"/>
+      <w:lvlText w:val="o"/>
+      <w:lvlJc w:val="left"/>
+      <w:pPr>
+        <w:ind w:left="5760" w:hanging="360"/>
+      </w:pPr>
+      <w:rPr>
+        <w:rFonts w:ascii="Courier New" w:hAnsi="Courier New" w:cs="Courier New" w:hint="default"/>
+      </w:rPr>
+    </w:lvl>
+    <w:lvl w:ilvl="8" w:tplc="38090005" w:tentative="1">
+      <w:start w:val="1"/>
+      <w:numFmt w:val="bullet"/>
+      <w:lvlText w:val=""/>
+      <w:lvlJc w:val="left"/>
+      <w:pPr>
+        <w:ind w:left="6480" w:hanging="360"/>
+      </w:pPr>
+      <w:rPr>
+        <w:rFonts w:ascii="Wingdings" w:hAnsi="Wingdings" w:hint="default"/>
+      </w:rPr>
+    </w:lvl>
+  </w:abstractNum>
   <w:num w:numId="1" w16cid:durableId="517813677">
     <w:abstractNumId w:val="1"/>
   </w:num>
@@ -4114,6 +6148,9 @@
   </w:num>
   <w:num w:numId="3" w16cid:durableId="134505">
     <w:abstractNumId w:val="0"/>
+  </w:num>
+  <w:num w:numId="4" w16cid:durableId="1666083322">
+    <w:abstractNumId w:val="3"/>
   </w:num>
 </w:numbering>
 </file>

</xml_diff>

<commit_message>
Update file word dokumentasi
</commit_message>
<xml_diff>
--- a/dokumentasi/24382001P_Lorensius Firngadi_IF 23 E_Dokumentasi.docx
+++ b/dokumentasi/24382001P_Lorensius Firngadi_IF 23 E_Dokumentasi.docx
@@ -245,26 +245,9 @@
           <w:rFonts w:ascii="Times New Roman" w:hAnsi="Times New Roman" w:cs="Times New Roman"/>
           <w:lang w:val="en-GB"/>
         </w:rPr>
-        <w:t xml:space="preserve"> Octaviansyah</w:t>
-      </w:r>
-      <w:proofErr w:type="gramStart"/>
-      <w:r>
-        <w:rPr>
-          <w:rFonts w:ascii="Times New Roman" w:hAnsi="Times New Roman" w:cs="Times New Roman"/>
-          <w:lang w:val="en-GB"/>
-        </w:rPr>
-        <w:t>, ,</w:t>
-      </w:r>
-      <w:proofErr w:type="gramEnd"/>
-      <w:r>
-        <w:rPr>
-          <w:rFonts w:ascii="Times New Roman" w:hAnsi="Times New Roman" w:cs="Times New Roman"/>
-          <w:lang w:val="en-GB"/>
-        </w:rPr>
-        <w:t xml:space="preserve"> </w:t>
-      </w:r>
-      <w:proofErr w:type="spellStart"/>
-      <w:proofErr w:type="gramStart"/>
+        <w:t xml:space="preserve"> Octaviansyah, , </w:t>
+      </w:r>
+      <w:proofErr w:type="spellStart"/>
       <w:r>
         <w:rPr>
           <w:rFonts w:ascii="Times New Roman" w:hAnsi="Times New Roman" w:cs="Times New Roman"/>
@@ -273,7 +256,6 @@
         <w:t>S.Kom</w:t>
       </w:r>
       <w:proofErr w:type="spellEnd"/>
-      <w:proofErr w:type="gramEnd"/>
       <w:r>
         <w:rPr>
           <w:rFonts w:ascii="Times New Roman" w:hAnsi="Times New Roman" w:cs="Times New Roman"/>
@@ -282,7 +264,6 @@
         <w:t xml:space="preserve">., </w:t>
       </w:r>
       <w:proofErr w:type="spellStart"/>
-      <w:proofErr w:type="gramStart"/>
       <w:r>
         <w:rPr>
           <w:rFonts w:ascii="Times New Roman" w:hAnsi="Times New Roman" w:cs="Times New Roman"/>
@@ -291,7 +272,6 @@
         <w:t>M.Kom</w:t>
       </w:r>
       <w:proofErr w:type="spellEnd"/>
-      <w:proofErr w:type="gramEnd"/>
       <w:r>
         <w:rPr>
           <w:rFonts w:ascii="Times New Roman" w:hAnsi="Times New Roman" w:cs="Times New Roman"/>
@@ -686,23 +666,7 @@
           <w:rFonts w:ascii="Times New Roman" w:hAnsi="Times New Roman" w:cs="Times New Roman"/>
           <w:lang w:val="en-GB"/>
         </w:rPr>
-        <w:t xml:space="preserve">Nama </w:t>
-      </w:r>
-      <w:proofErr w:type="gramStart"/>
-      <w:r>
-        <w:rPr>
-          <w:rFonts w:ascii="Times New Roman" w:hAnsi="Times New Roman" w:cs="Times New Roman"/>
-          <w:lang w:val="en-GB"/>
-        </w:rPr>
-        <w:t>Project :</w:t>
-      </w:r>
-      <w:proofErr w:type="gramEnd"/>
-      <w:r>
-        <w:rPr>
-          <w:rFonts w:ascii="Times New Roman" w:hAnsi="Times New Roman" w:cs="Times New Roman"/>
-          <w:lang w:val="en-GB"/>
-        </w:rPr>
-        <w:t xml:space="preserve"> </w:t>
+        <w:t xml:space="preserve">Nama Project : </w:t>
       </w:r>
       <w:proofErr w:type="spellStart"/>
       <w:r>
@@ -757,17 +721,8 @@
           <w:rFonts w:ascii="Times New Roman" w:hAnsi="Times New Roman" w:cs="Times New Roman"/>
           <w:lang w:val="en-GB"/>
         </w:rPr>
-        <w:t xml:space="preserve"> </w:t>
-      </w:r>
-      <w:proofErr w:type="gramStart"/>
-      <w:r>
-        <w:rPr>
-          <w:rFonts w:ascii="Times New Roman" w:hAnsi="Times New Roman" w:cs="Times New Roman"/>
-          <w:lang w:val="en-GB"/>
-        </w:rPr>
-        <w:t>Project :</w:t>
-      </w:r>
-      <w:proofErr w:type="gramEnd"/>
+        <w:t xml:space="preserve"> Project :</w:t>
+      </w:r>
     </w:p>
     <w:p>
       <w:pPr>
@@ -955,7 +910,6 @@
         <w:t xml:space="preserve"> </w:t>
       </w:r>
       <w:proofErr w:type="spellStart"/>
-      <w:proofErr w:type="gramStart"/>
       <w:r>
         <w:rPr>
           <w:rFonts w:ascii="Times New Roman" w:hAnsi="Times New Roman" w:cs="Times New Roman"/>
@@ -969,15 +923,7 @@
           <w:rFonts w:ascii="Times New Roman" w:hAnsi="Times New Roman" w:cs="Times New Roman"/>
           <w:lang w:val="en-GB"/>
         </w:rPr>
-        <w:t xml:space="preserve"> :</w:t>
-      </w:r>
-      <w:proofErr w:type="gramEnd"/>
-      <w:r>
-        <w:rPr>
-          <w:rFonts w:ascii="Times New Roman" w:hAnsi="Times New Roman" w:cs="Times New Roman"/>
-          <w:lang w:val="en-GB"/>
-        </w:rPr>
-        <w:t xml:space="preserve"> </w:t>
+        <w:t xml:space="preserve"> : </w:t>
       </w:r>
       <w:proofErr w:type="spellStart"/>
       <w:r>
@@ -1998,9 +1944,9 @@
           <w:bCs/>
           <w:lang w:val="en-GB"/>
         </w:rPr>
-        <w:t xml:space="preserve"> </w:t>
-      </w:r>
-      <w:proofErr w:type="gramStart"/>
+        <w:t xml:space="preserve"> file .</w:t>
+      </w:r>
+      <w:proofErr w:type="spellStart"/>
       <w:r>
         <w:rPr>
           <w:rFonts w:ascii="Times New Roman" w:hAnsi="Times New Roman" w:cs="Times New Roman"/>
@@ -2008,20 +1954,9 @@
           <w:bCs/>
           <w:lang w:val="en-GB"/>
         </w:rPr>
-        <w:t>file .</w:t>
-      </w:r>
-      <w:proofErr w:type="spellStart"/>
-      <w:r>
-        <w:rPr>
-          <w:rFonts w:ascii="Times New Roman" w:hAnsi="Times New Roman" w:cs="Times New Roman"/>
-          <w:b/>
-          <w:bCs/>
-          <w:lang w:val="en-GB"/>
-        </w:rPr>
         <w:t>gitignore</w:t>
       </w:r>
       <w:proofErr w:type="spellEnd"/>
-      <w:proofErr w:type="gramEnd"/>
       <w:r>
         <w:rPr>
           <w:rFonts w:ascii="Times New Roman" w:hAnsi="Times New Roman" w:cs="Times New Roman"/>
@@ -2129,15 +2064,7 @@
           <w:rFonts w:ascii="Times New Roman" w:hAnsi="Times New Roman" w:cs="Times New Roman"/>
           <w:lang w:val="en-GB"/>
         </w:rPr>
-        <w:t xml:space="preserve"> </w:t>
-      </w:r>
-      <w:proofErr w:type="gramStart"/>
-      <w:r>
-        <w:rPr>
-          <w:rFonts w:ascii="Times New Roman" w:hAnsi="Times New Roman" w:cs="Times New Roman"/>
-          <w:lang w:val="en-GB"/>
-        </w:rPr>
-        <w:t>file .</w:t>
+        <w:t xml:space="preserve"> file .</w:t>
       </w:r>
       <w:proofErr w:type="spellStart"/>
       <w:r>
@@ -2148,7 +2075,6 @@
         <w:t>gitignore</w:t>
       </w:r>
       <w:proofErr w:type="spellEnd"/>
-      <w:proofErr w:type="gramEnd"/>
       <w:r>
         <w:rPr>
           <w:rFonts w:ascii="Times New Roman" w:hAnsi="Times New Roman" w:cs="Times New Roman"/>
@@ -2416,7 +2342,6 @@
           <w:lang w:val="en-GB"/>
         </w:rPr>
       </w:pPr>
-      <w:proofErr w:type="gramStart"/>
       <w:r>
         <w:rPr>
           <w:rFonts w:ascii="Times New Roman" w:hAnsi="Times New Roman" w:cs="Times New Roman"/>
@@ -2433,21 +2358,12 @@
         <w:t>gitignore</w:t>
       </w:r>
       <w:proofErr w:type="spellEnd"/>
-      <w:proofErr w:type="gramEnd"/>
-      <w:r>
-        <w:rPr>
-          <w:rFonts w:ascii="Times New Roman" w:hAnsi="Times New Roman" w:cs="Times New Roman"/>
-          <w:lang w:val="en-GB"/>
-        </w:rPr>
-        <w:t xml:space="preserve"> </w:t>
-      </w:r>
-      <w:proofErr w:type="gramStart"/>
-      <w:r>
-        <w:rPr>
-          <w:rFonts w:ascii="Times New Roman" w:hAnsi="Times New Roman" w:cs="Times New Roman"/>
-          <w:lang w:val="en-GB"/>
-        </w:rPr>
-        <w:t xml:space="preserve">sangat  </w:t>
+      <w:r>
+        <w:rPr>
+          <w:rFonts w:ascii="Times New Roman" w:hAnsi="Times New Roman" w:cs="Times New Roman"/>
+          <w:lang w:val="en-GB"/>
+        </w:rPr>
+        <w:t xml:space="preserve"> sangat  </w:t>
       </w:r>
       <w:proofErr w:type="spellStart"/>
       <w:r>
@@ -2458,7 +2374,6 @@
         <w:t>bermanfaat</w:t>
       </w:r>
       <w:proofErr w:type="spellEnd"/>
-      <w:proofErr w:type="gramEnd"/>
       <w:r>
         <w:rPr>
           <w:rFonts w:ascii="Times New Roman" w:hAnsi="Times New Roman" w:cs="Times New Roman"/>
@@ -2950,7 +2865,6 @@
         <w:t xml:space="preserve">Edit </w:t>
       </w:r>
       <w:proofErr w:type="spellStart"/>
-      <w:proofErr w:type="gramStart"/>
       <w:r>
         <w:rPr>
           <w:rFonts w:ascii="Times New Roman" w:hAnsi="Times New Roman" w:cs="Times New Roman"/>
@@ -2961,7 +2875,6 @@
         <w:t>tsconfig.json</w:t>
       </w:r>
       <w:proofErr w:type="spellEnd"/>
-      <w:proofErr w:type="gramEnd"/>
       <w:r>
         <w:rPr>
           <w:rFonts w:ascii="Times New Roman" w:hAnsi="Times New Roman" w:cs="Times New Roman"/>
@@ -3580,21 +3493,12 @@
         <w:t>seperti</w:t>
       </w:r>
       <w:proofErr w:type="spellEnd"/>
-      <w:proofErr w:type="gramStart"/>
-      <w:r>
-        <w:rPr>
-          <w:rFonts w:ascii="Times New Roman" w:hAnsi="Times New Roman" w:cs="Times New Roman"/>
-          <w:lang w:val="en-GB"/>
-        </w:rPr>
-        <w:t xml:space="preserve"> ../../..</w:t>
-      </w:r>
-      <w:proofErr w:type="gramEnd"/>
-      <w:r>
-        <w:rPr>
-          <w:rFonts w:ascii="Times New Roman" w:hAnsi="Times New Roman" w:cs="Times New Roman"/>
-          <w:lang w:val="en-GB"/>
-        </w:rPr>
-        <w:t xml:space="preserve">/folder/file, </w:t>
+      <w:r>
+        <w:rPr>
+          <w:rFonts w:ascii="Times New Roman" w:hAnsi="Times New Roman" w:cs="Times New Roman"/>
+          <w:lang w:val="en-GB"/>
+        </w:rPr>
+        <w:t xml:space="preserve"> ../../../folder/file, </w:t>
       </w:r>
       <w:proofErr w:type="spellStart"/>
       <w:r>
@@ -4872,7 +4776,6 @@
         <w:t xml:space="preserve">Update </w:t>
       </w:r>
       <w:proofErr w:type="spellStart"/>
-      <w:proofErr w:type="gramStart"/>
       <w:r>
         <w:rPr>
           <w:b/>
@@ -4881,7 +4784,6 @@
         <w:t>package.json</w:t>
       </w:r>
       <w:proofErr w:type="spellEnd"/>
-      <w:proofErr w:type="gramEnd"/>
       <w:r>
         <w:rPr>
           <w:b/>
@@ -5675,6 +5577,495 @@
           <w:lang w:val="en-GB"/>
         </w:rPr>
       </w:pPr>
+    </w:p>
+    <w:p>
+      <w:pPr>
+        <w:contextualSpacing/>
+        <w:jc w:val="both"/>
+        <w:rPr>
+          <w:rFonts w:ascii="Times New Roman" w:hAnsi="Times New Roman" w:cs="Times New Roman"/>
+          <w:lang w:val="en-GB"/>
+        </w:rPr>
+      </w:pPr>
+    </w:p>
+    <w:p>
+      <w:pPr>
+        <w:contextualSpacing/>
+        <w:jc w:val="both"/>
+        <w:rPr>
+          <w:rFonts w:ascii="Times New Roman" w:hAnsi="Times New Roman" w:cs="Times New Roman"/>
+          <w:lang w:val="en-GB"/>
+        </w:rPr>
+      </w:pPr>
+    </w:p>
+    <w:p>
+      <w:pPr>
+        <w:contextualSpacing/>
+        <w:jc w:val="both"/>
+        <w:rPr>
+          <w:rFonts w:ascii="Times New Roman" w:hAnsi="Times New Roman" w:cs="Times New Roman"/>
+          <w:lang w:val="en-GB"/>
+        </w:rPr>
+      </w:pPr>
+    </w:p>
+    <w:p>
+      <w:pPr>
+        <w:contextualSpacing/>
+        <w:jc w:val="both"/>
+        <w:rPr>
+          <w:rFonts w:ascii="Times New Roman" w:hAnsi="Times New Roman" w:cs="Times New Roman"/>
+          <w:lang w:val="en-GB"/>
+        </w:rPr>
+      </w:pPr>
+    </w:p>
+    <w:p>
+      <w:pPr>
+        <w:contextualSpacing/>
+        <w:jc w:val="both"/>
+        <w:rPr>
+          <w:rFonts w:ascii="Times New Roman" w:hAnsi="Times New Roman" w:cs="Times New Roman"/>
+          <w:lang w:val="en-GB"/>
+        </w:rPr>
+      </w:pPr>
+    </w:p>
+    <w:p>
+      <w:pPr>
+        <w:contextualSpacing/>
+        <w:jc w:val="both"/>
+        <w:rPr>
+          <w:rFonts w:ascii="Times New Roman" w:hAnsi="Times New Roman" w:cs="Times New Roman"/>
+          <w:lang w:val="en-GB"/>
+        </w:rPr>
+      </w:pPr>
+    </w:p>
+    <w:p>
+      <w:pPr>
+        <w:contextualSpacing/>
+        <w:jc w:val="both"/>
+        <w:rPr>
+          <w:rFonts w:ascii="Times New Roman" w:hAnsi="Times New Roman" w:cs="Times New Roman"/>
+          <w:lang w:val="en-GB"/>
+        </w:rPr>
+      </w:pPr>
+    </w:p>
+    <w:p>
+      <w:pPr>
+        <w:contextualSpacing/>
+        <w:jc w:val="both"/>
+        <w:rPr>
+          <w:rFonts w:ascii="Times New Roman" w:hAnsi="Times New Roman" w:cs="Times New Roman"/>
+          <w:lang w:val="en-GB"/>
+        </w:rPr>
+      </w:pPr>
+    </w:p>
+    <w:p>
+      <w:pPr>
+        <w:contextualSpacing/>
+        <w:jc w:val="both"/>
+        <w:rPr>
+          <w:rFonts w:ascii="Times New Roman" w:hAnsi="Times New Roman" w:cs="Times New Roman"/>
+          <w:lang w:val="en-GB"/>
+        </w:rPr>
+      </w:pPr>
+    </w:p>
+    <w:p>
+      <w:pPr>
+        <w:contextualSpacing/>
+        <w:jc w:val="both"/>
+        <w:rPr>
+          <w:rFonts w:ascii="Times New Roman" w:hAnsi="Times New Roman" w:cs="Times New Roman"/>
+          <w:lang w:val="en-GB"/>
+        </w:rPr>
+      </w:pPr>
+    </w:p>
+    <w:p>
+      <w:pPr>
+        <w:contextualSpacing/>
+        <w:jc w:val="both"/>
+        <w:rPr>
+          <w:rFonts w:ascii="Times New Roman" w:hAnsi="Times New Roman" w:cs="Times New Roman"/>
+          <w:lang w:val="en-GB"/>
+        </w:rPr>
+      </w:pPr>
+    </w:p>
+    <w:p>
+      <w:pPr>
+        <w:contextualSpacing/>
+        <w:jc w:val="both"/>
+        <w:rPr>
+          <w:rFonts w:ascii="Times New Roman" w:hAnsi="Times New Roman" w:cs="Times New Roman"/>
+          <w:lang w:val="en-GB"/>
+        </w:rPr>
+      </w:pPr>
+    </w:p>
+    <w:p>
+      <w:pPr>
+        <w:contextualSpacing/>
+        <w:jc w:val="both"/>
+        <w:rPr>
+          <w:rFonts w:ascii="Times New Roman" w:hAnsi="Times New Roman" w:cs="Times New Roman"/>
+          <w:b/>
+          <w:bCs/>
+          <w:lang w:val="en-GB"/>
+        </w:rPr>
+      </w:pPr>
+      <w:r>
+        <w:rPr>
+          <w:rFonts w:ascii="Times New Roman" w:hAnsi="Times New Roman" w:cs="Times New Roman"/>
+          <w:b/>
+          <w:bCs/>
+          <w:lang w:val="en-GB"/>
+        </w:rPr>
+        <w:t xml:space="preserve">7. </w:t>
+      </w:r>
+      <w:proofErr w:type="spellStart"/>
+      <w:r>
+        <w:rPr>
+          <w:rFonts w:ascii="Times New Roman" w:hAnsi="Times New Roman" w:cs="Times New Roman"/>
+          <w:b/>
+          <w:bCs/>
+          <w:lang w:val="en-GB"/>
+        </w:rPr>
+        <w:t>Membuat</w:t>
+      </w:r>
+      <w:proofErr w:type="spellEnd"/>
+      <w:r>
+        <w:rPr>
+          <w:rFonts w:ascii="Times New Roman" w:hAnsi="Times New Roman" w:cs="Times New Roman"/>
+          <w:b/>
+          <w:bCs/>
+          <w:lang w:val="en-GB"/>
+        </w:rPr>
+        <w:t xml:space="preserve"> Database di </w:t>
+      </w:r>
+      <w:proofErr w:type="spellStart"/>
+      <w:r>
+        <w:rPr>
+          <w:rFonts w:ascii="Times New Roman" w:hAnsi="Times New Roman" w:cs="Times New Roman"/>
+          <w:b/>
+          <w:bCs/>
+          <w:lang w:val="en-GB"/>
+        </w:rPr>
+        <w:t>pgAdmin</w:t>
+      </w:r>
+      <w:proofErr w:type="spellEnd"/>
+    </w:p>
+    <w:p>
+      <w:pPr>
+        <w:contextualSpacing/>
+        <w:jc w:val="both"/>
+        <w:rPr>
+          <w:rFonts w:ascii="Times New Roman" w:hAnsi="Times New Roman" w:cs="Times New Roman"/>
+          <w:b/>
+          <w:bCs/>
+          <w:lang w:val="en-GB"/>
+        </w:rPr>
+      </w:pPr>
+    </w:p>
+    <w:p>
+      <w:pPr>
+        <w:contextualSpacing/>
+        <w:jc w:val="both"/>
+        <w:rPr>
+          <w:rFonts w:ascii="Times New Roman" w:hAnsi="Times New Roman" w:cs="Times New Roman"/>
+          <w:lang w:val="en-GB"/>
+        </w:rPr>
+      </w:pPr>
+      <w:r>
+        <w:rPr>
+          <w:noProof/>
+        </w:rPr>
+        <w:drawing>
+          <wp:inline distT="0" distB="0" distL="0" distR="0" wp14:anchorId="39587A1D" wp14:editId="2A1AF2DF">
+            <wp:extent cx="5731510" cy="3222625"/>
+            <wp:effectExtent l="0" t="0" r="2540" b="0"/>
+            <wp:docPr id="171528506" name="Picture 1"/>
+            <wp:cNvGraphicFramePr>
+              <a:graphicFrameLocks xmlns:a="http://schemas.openxmlformats.org/drawingml/2006/main" noChangeAspect="1"/>
+            </wp:cNvGraphicFramePr>
+            <a:graphic xmlns:a="http://schemas.openxmlformats.org/drawingml/2006/main">
+              <a:graphicData uri="http://schemas.openxmlformats.org/drawingml/2006/picture">
+                <pic:pic xmlns:pic="http://schemas.openxmlformats.org/drawingml/2006/picture">
+                  <pic:nvPicPr>
+                    <pic:cNvPr id="171528506" name=""/>
+                    <pic:cNvPicPr/>
+                  </pic:nvPicPr>
+                  <pic:blipFill>
+                    <a:blip r:embed="rId11"/>
+                    <a:stretch>
+                      <a:fillRect/>
+                    </a:stretch>
+                  </pic:blipFill>
+                  <pic:spPr>
+                    <a:xfrm>
+                      <a:off x="0" y="0"/>
+                      <a:ext cx="5731510" cy="3222625"/>
+                    </a:xfrm>
+                    <a:prstGeom prst="rect">
+                      <a:avLst/>
+                    </a:prstGeom>
+                  </pic:spPr>
+                </pic:pic>
+              </a:graphicData>
+            </a:graphic>
+          </wp:inline>
+        </w:drawing>
+      </w:r>
+    </w:p>
+    <w:p>
+      <w:pPr>
+        <w:contextualSpacing/>
+        <w:jc w:val="both"/>
+        <w:rPr>
+          <w:rFonts w:ascii="Times New Roman" w:hAnsi="Times New Roman" w:cs="Times New Roman"/>
+          <w:lang w:val="en-GB"/>
+        </w:rPr>
+      </w:pPr>
+    </w:p>
+    <w:p>
+      <w:pPr>
+        <w:contextualSpacing/>
+        <w:jc w:val="both"/>
+        <w:rPr>
+          <w:rFonts w:ascii="Times New Roman" w:hAnsi="Times New Roman" w:cs="Times New Roman"/>
+          <w:lang w:val="en-GB"/>
+        </w:rPr>
+      </w:pPr>
+      <w:proofErr w:type="spellStart"/>
+      <w:r>
+        <w:rPr>
+          <w:rFonts w:ascii="Times New Roman" w:hAnsi="Times New Roman" w:cs="Times New Roman"/>
+          <w:lang w:val="en-GB"/>
+        </w:rPr>
+        <w:t>Membuat</w:t>
+      </w:r>
+      <w:proofErr w:type="spellEnd"/>
+      <w:r>
+        <w:rPr>
+          <w:rFonts w:ascii="Times New Roman" w:hAnsi="Times New Roman" w:cs="Times New Roman"/>
+          <w:lang w:val="en-GB"/>
+        </w:rPr>
+        <w:t xml:space="preserve"> database PostgreSQL </w:t>
+      </w:r>
+      <w:proofErr w:type="spellStart"/>
+      <w:r>
+        <w:rPr>
+          <w:rFonts w:ascii="Times New Roman" w:hAnsi="Times New Roman" w:cs="Times New Roman"/>
+          <w:lang w:val="en-GB"/>
+        </w:rPr>
+        <w:t>bernama</w:t>
+      </w:r>
+      <w:proofErr w:type="spellEnd"/>
+      <w:r>
+        <w:rPr>
+          <w:rFonts w:ascii="Times New Roman" w:hAnsi="Times New Roman" w:cs="Times New Roman"/>
+          <w:lang w:val="en-GB"/>
+        </w:rPr>
+        <w:t xml:space="preserve"> `</w:t>
+      </w:r>
+      <w:proofErr w:type="spellStart"/>
+      <w:r>
+        <w:rPr>
+          <w:rFonts w:ascii="Times New Roman" w:hAnsi="Times New Roman" w:cs="Times New Roman"/>
+          <w:lang w:val="en-GB"/>
+        </w:rPr>
+        <w:t>sigersync_db</w:t>
+      </w:r>
+      <w:proofErr w:type="spellEnd"/>
+      <w:r>
+        <w:rPr>
+          <w:rFonts w:ascii="Times New Roman" w:hAnsi="Times New Roman" w:cs="Times New Roman"/>
+          <w:lang w:val="en-GB"/>
+        </w:rPr>
+        <w:t xml:space="preserve">` </w:t>
+      </w:r>
+      <w:proofErr w:type="spellStart"/>
+      <w:r>
+        <w:rPr>
+          <w:rFonts w:ascii="Times New Roman" w:hAnsi="Times New Roman" w:cs="Times New Roman"/>
+          <w:lang w:val="en-GB"/>
+        </w:rPr>
+        <w:t>menggunakan</w:t>
+      </w:r>
+      <w:proofErr w:type="spellEnd"/>
+      <w:r>
+        <w:rPr>
+          <w:rFonts w:ascii="Times New Roman" w:hAnsi="Times New Roman" w:cs="Times New Roman"/>
+          <w:lang w:val="en-GB"/>
+        </w:rPr>
+        <w:t xml:space="preserve"> PostgreSQL Shell (</w:t>
+      </w:r>
+      <w:proofErr w:type="spellStart"/>
+      <w:r>
+        <w:rPr>
+          <w:rFonts w:ascii="Times New Roman" w:hAnsi="Times New Roman" w:cs="Times New Roman"/>
+          <w:lang w:val="en-GB"/>
+        </w:rPr>
+        <w:t>psql</w:t>
+      </w:r>
+      <w:proofErr w:type="spellEnd"/>
+      <w:r>
+        <w:rPr>
+          <w:rFonts w:ascii="Times New Roman" w:hAnsi="Times New Roman" w:cs="Times New Roman"/>
+          <w:lang w:val="en-GB"/>
+        </w:rPr>
+        <w:t xml:space="preserve">) </w:t>
+      </w:r>
+      <w:proofErr w:type="spellStart"/>
+      <w:r>
+        <w:rPr>
+          <w:rFonts w:ascii="Times New Roman" w:hAnsi="Times New Roman" w:cs="Times New Roman"/>
+          <w:lang w:val="en-GB"/>
+        </w:rPr>
+        <w:t>atau</w:t>
+      </w:r>
+      <w:proofErr w:type="spellEnd"/>
+      <w:r>
+        <w:rPr>
+          <w:rFonts w:ascii="Times New Roman" w:hAnsi="Times New Roman" w:cs="Times New Roman"/>
+          <w:lang w:val="en-GB"/>
+        </w:rPr>
+        <w:t xml:space="preserve"> </w:t>
+      </w:r>
+      <w:proofErr w:type="spellStart"/>
+      <w:r>
+        <w:rPr>
+          <w:rFonts w:ascii="Times New Roman" w:hAnsi="Times New Roman" w:cs="Times New Roman"/>
+          <w:lang w:val="en-GB"/>
+        </w:rPr>
+        <w:t>pgAdmin</w:t>
+      </w:r>
+      <w:proofErr w:type="spellEnd"/>
+      <w:r>
+        <w:rPr>
+          <w:rFonts w:ascii="Times New Roman" w:hAnsi="Times New Roman" w:cs="Times New Roman"/>
+          <w:lang w:val="en-GB"/>
+        </w:rPr>
+        <w:t xml:space="preserve"> </w:t>
+      </w:r>
+      <w:proofErr w:type="spellStart"/>
+      <w:r>
+        <w:rPr>
+          <w:rFonts w:ascii="Times New Roman" w:hAnsi="Times New Roman" w:cs="Times New Roman"/>
+          <w:lang w:val="en-GB"/>
+        </w:rPr>
+        <w:t>untuk</w:t>
+      </w:r>
+      <w:proofErr w:type="spellEnd"/>
+      <w:r>
+        <w:rPr>
+          <w:rFonts w:ascii="Times New Roman" w:hAnsi="Times New Roman" w:cs="Times New Roman"/>
+          <w:lang w:val="en-GB"/>
+        </w:rPr>
+        <w:t xml:space="preserve"> </w:t>
+      </w:r>
+      <w:proofErr w:type="spellStart"/>
+      <w:r>
+        <w:rPr>
+          <w:rFonts w:ascii="Times New Roman" w:hAnsi="Times New Roman" w:cs="Times New Roman"/>
+          <w:lang w:val="en-GB"/>
+        </w:rPr>
+        <w:t>digunakan</w:t>
+      </w:r>
+      <w:proofErr w:type="spellEnd"/>
+      <w:r>
+        <w:rPr>
+          <w:rFonts w:ascii="Times New Roman" w:hAnsi="Times New Roman" w:cs="Times New Roman"/>
+          <w:lang w:val="en-GB"/>
+        </w:rPr>
+        <w:t xml:space="preserve"> </w:t>
+      </w:r>
+      <w:proofErr w:type="spellStart"/>
+      <w:r>
+        <w:rPr>
+          <w:rFonts w:ascii="Times New Roman" w:hAnsi="Times New Roman" w:cs="Times New Roman"/>
+          <w:lang w:val="en-GB"/>
+        </w:rPr>
+        <w:t>sebagai</w:t>
+      </w:r>
+      <w:proofErr w:type="spellEnd"/>
+      <w:r>
+        <w:rPr>
+          <w:rFonts w:ascii="Times New Roman" w:hAnsi="Times New Roman" w:cs="Times New Roman"/>
+          <w:lang w:val="en-GB"/>
+        </w:rPr>
+        <w:t xml:space="preserve"> </w:t>
+      </w:r>
+      <w:proofErr w:type="spellStart"/>
+      <w:r>
+        <w:rPr>
+          <w:rFonts w:ascii="Times New Roman" w:hAnsi="Times New Roman" w:cs="Times New Roman"/>
+          <w:lang w:val="en-GB"/>
+        </w:rPr>
+        <w:t>penyimpanan</w:t>
+      </w:r>
+      <w:proofErr w:type="spellEnd"/>
+      <w:r>
+        <w:rPr>
+          <w:rFonts w:ascii="Times New Roman" w:hAnsi="Times New Roman" w:cs="Times New Roman"/>
+          <w:lang w:val="en-GB"/>
+        </w:rPr>
+        <w:t xml:space="preserve"> data </w:t>
+      </w:r>
+      <w:proofErr w:type="spellStart"/>
+      <w:r>
+        <w:rPr>
+          <w:rFonts w:ascii="Times New Roman" w:hAnsi="Times New Roman" w:cs="Times New Roman"/>
+          <w:lang w:val="en-GB"/>
+        </w:rPr>
+        <w:t>aplikasi</w:t>
+      </w:r>
+      <w:proofErr w:type="spellEnd"/>
+      <w:r>
+        <w:rPr>
+          <w:rFonts w:ascii="Times New Roman" w:hAnsi="Times New Roman" w:cs="Times New Roman"/>
+          <w:lang w:val="en-GB"/>
+        </w:rPr>
+        <w:t xml:space="preserve"> </w:t>
+      </w:r>
+      <w:proofErr w:type="spellStart"/>
+      <w:r>
+        <w:rPr>
+          <w:rFonts w:ascii="Times New Roman" w:hAnsi="Times New Roman" w:cs="Times New Roman"/>
+          <w:lang w:val="en-GB"/>
+        </w:rPr>
+        <w:t>sigersync</w:t>
+      </w:r>
+      <w:proofErr w:type="spellEnd"/>
+      <w:r>
+        <w:rPr>
+          <w:rFonts w:ascii="Times New Roman" w:hAnsi="Times New Roman" w:cs="Times New Roman"/>
+          <w:lang w:val="en-GB"/>
+        </w:rPr>
+        <w:t>.</w:t>
+      </w:r>
+    </w:p>
+    <w:p>
+      <w:pPr>
+        <w:contextualSpacing/>
+        <w:jc w:val="both"/>
+        <w:rPr>
+          <w:rFonts w:ascii="Times New Roman" w:hAnsi="Times New Roman" w:cs="Times New Roman"/>
+          <w:lang w:val="en-GB"/>
+        </w:rPr>
+      </w:pPr>
+    </w:p>
+    <w:p>
+      <w:pPr>
+        <w:contextualSpacing/>
+        <w:jc w:val="both"/>
+        <w:rPr>
+          <w:rFonts w:ascii="Times New Roman" w:hAnsi="Times New Roman" w:cs="Times New Roman"/>
+          <w:lang w:val="en-GB"/>
+        </w:rPr>
+      </w:pPr>
+      <w:r>
+        <w:rPr>
+          <w:rFonts w:ascii="Times New Roman" w:hAnsi="Times New Roman" w:cs="Times New Roman"/>
+          <w:lang w:val="en-GB"/>
+        </w:rPr>
+        <w:t xml:space="preserve">8. </w:t>
+      </w:r>
     </w:p>
     <w:sectPr>
       <w:pgSz w:w="11906" w:h="16838"/>

</xml_diff>

<commit_message>
Menalankan ulang Prisma Migration
</commit_message>
<xml_diff>
--- a/dokumentasi/24382001P_Lorensius Firngadi_IF 23 E_Dokumentasi.docx
+++ b/dokumentasi/24382001P_Lorensius Firngadi_IF 23 E_Dokumentasi.docx
@@ -4927,14 +4927,7 @@
           <w:rFonts w:ascii="Times New Roman" w:hAnsi="Times New Roman" w:cs="Times New Roman"/>
           <w:lang w:val="en-GB"/>
         </w:rPr>
-        <w:t xml:space="preserve"> (Start &amp; Dev)</w:t>
-      </w:r>
-      <w:r>
-        <w:rPr>
-          <w:rFonts w:ascii="Times New Roman" w:hAnsi="Times New Roman" w:cs="Times New Roman"/>
-          <w:lang w:val="en-GB"/>
-        </w:rPr>
-        <w:t>.</w:t>
+        <w:t xml:space="preserve"> (Start &amp; Dev).</w:t>
       </w:r>
     </w:p>
     <w:p>
@@ -5190,14 +5183,7 @@
           <w:rFonts w:ascii="Times New Roman" w:hAnsi="Times New Roman" w:cs="Times New Roman"/>
           <w:lang w:val="en-GB"/>
         </w:rPr>
-        <w:t xml:space="preserve"> Jadi (Build)</w:t>
-      </w:r>
-      <w:r>
-        <w:rPr>
-          <w:rFonts w:ascii="Times New Roman" w:hAnsi="Times New Roman" w:cs="Times New Roman"/>
-          <w:lang w:val="en-GB"/>
-        </w:rPr>
-        <w:t>.</w:t>
+        <w:t xml:space="preserve"> Jadi (Build).</w:t>
       </w:r>
     </w:p>
     <w:p>
@@ -5243,14 +5229,7 @@
           <w:rFonts w:ascii="Times New Roman" w:hAnsi="Times New Roman" w:cs="Times New Roman"/>
           <w:lang w:val="en-GB"/>
         </w:rPr>
-        <w:t xml:space="preserve"> Kode (Lint &amp; Format)</w:t>
-      </w:r>
-      <w:r>
-        <w:rPr>
-          <w:rFonts w:ascii="Times New Roman" w:hAnsi="Times New Roman" w:cs="Times New Roman"/>
-          <w:lang w:val="en-GB"/>
-        </w:rPr>
-        <w:t>.</w:t>
+        <w:t xml:space="preserve"> Kode (Lint &amp; Format).</w:t>
       </w:r>
     </w:p>
     <w:p>
@@ -5538,14 +5517,7 @@
           <w:rFonts w:ascii="Times New Roman" w:hAnsi="Times New Roman" w:cs="Times New Roman"/>
           <w:lang w:val="en-GB"/>
         </w:rPr>
-        <w:t xml:space="preserve"> (Test)</w:t>
-      </w:r>
-      <w:r>
-        <w:rPr>
-          <w:rFonts w:ascii="Times New Roman" w:hAnsi="Times New Roman" w:cs="Times New Roman"/>
-          <w:lang w:val="en-GB"/>
-        </w:rPr>
-        <w:t>.</w:t>
+        <w:t xml:space="preserve"> (Test).</w:t>
       </w:r>
     </w:p>
     <w:p>
@@ -6053,19 +6025,1536 @@
     <w:p>
       <w:pPr>
         <w:contextualSpacing/>
+      </w:pPr>
+      <w:r>
+        <w:rPr>
+          <w:rFonts w:ascii="Times New Roman" w:hAnsi="Times New Roman" w:cs="Times New Roman"/>
+          <w:lang w:val="en-GB"/>
+        </w:rPr>
+        <w:t xml:space="preserve">8. </w:t>
+      </w:r>
+      <w:proofErr w:type="spellStart"/>
+      <w:r>
+        <w:rPr>
+          <w:b/>
+          <w:bCs/>
+        </w:rPr>
+        <w:t>Definisikan</w:t>
+      </w:r>
+      <w:proofErr w:type="spellEnd"/>
+      <w:r>
+        <w:rPr>
+          <w:b/>
+          <w:bCs/>
+        </w:rPr>
+        <w:t xml:space="preserve"> Database Schema</w:t>
+      </w:r>
+    </w:p>
+    <w:p>
+      <w:pPr>
+        <w:contextualSpacing/>
         <w:jc w:val="both"/>
         <w:rPr>
           <w:rFonts w:ascii="Times New Roman" w:hAnsi="Times New Roman" w:cs="Times New Roman"/>
           <w:lang w:val="en-GB"/>
         </w:rPr>
       </w:pPr>
-      <w:r>
-        <w:rPr>
-          <w:rFonts w:ascii="Times New Roman" w:hAnsi="Times New Roman" w:cs="Times New Roman"/>
-          <w:lang w:val="en-GB"/>
-        </w:rPr>
-        <w:t xml:space="preserve">8. </w:t>
-      </w:r>
+    </w:p>
+    <w:p>
+      <w:pPr>
+        <w:contextualSpacing/>
+        <w:jc w:val="both"/>
+        <w:rPr>
+          <w:rFonts w:ascii="Times New Roman" w:hAnsi="Times New Roman" w:cs="Times New Roman"/>
+          <w:lang w:val="en-GB"/>
+        </w:rPr>
+      </w:pPr>
+      <w:r>
+        <w:rPr>
+          <w:noProof/>
+        </w:rPr>
+        <w:drawing>
+          <wp:inline distT="0" distB="0" distL="0" distR="0" wp14:anchorId="4E96841E" wp14:editId="03870F7B">
+            <wp:extent cx="5731510" cy="3222625"/>
+            <wp:effectExtent l="0" t="0" r="2540" b="0"/>
+            <wp:docPr id="2132850516" name="Picture 1"/>
+            <wp:cNvGraphicFramePr>
+              <a:graphicFrameLocks xmlns:a="http://schemas.openxmlformats.org/drawingml/2006/main" noChangeAspect="1"/>
+            </wp:cNvGraphicFramePr>
+            <a:graphic xmlns:a="http://schemas.openxmlformats.org/drawingml/2006/main">
+              <a:graphicData uri="http://schemas.openxmlformats.org/drawingml/2006/picture">
+                <pic:pic xmlns:pic="http://schemas.openxmlformats.org/drawingml/2006/picture">
+                  <pic:nvPicPr>
+                    <pic:cNvPr id="2132850516" name=""/>
+                    <pic:cNvPicPr/>
+                  </pic:nvPicPr>
+                  <pic:blipFill>
+                    <a:blip r:embed="rId12"/>
+                    <a:stretch>
+                      <a:fillRect/>
+                    </a:stretch>
+                  </pic:blipFill>
+                  <pic:spPr>
+                    <a:xfrm>
+                      <a:off x="0" y="0"/>
+                      <a:ext cx="5731510" cy="3222625"/>
+                    </a:xfrm>
+                    <a:prstGeom prst="rect">
+                      <a:avLst/>
+                    </a:prstGeom>
+                  </pic:spPr>
+                </pic:pic>
+              </a:graphicData>
+            </a:graphic>
+          </wp:inline>
+        </w:drawing>
+      </w:r>
+    </w:p>
+    <w:p>
+      <w:pPr>
+        <w:contextualSpacing/>
+        <w:jc w:val="both"/>
+        <w:rPr>
+          <w:rFonts w:ascii="Times New Roman" w:hAnsi="Times New Roman" w:cs="Times New Roman"/>
+          <w:lang w:val="en-GB"/>
+        </w:rPr>
+      </w:pPr>
+    </w:p>
+    <w:p>
+      <w:pPr>
+        <w:pStyle w:val="ListParagraph"/>
+        <w:numPr>
+          <w:ilvl w:val="0"/>
+          <w:numId w:val="3"/>
+        </w:numPr>
+        <w:jc w:val="both"/>
+        <w:rPr>
+          <w:rFonts w:ascii="Times New Roman" w:hAnsi="Times New Roman" w:cs="Times New Roman"/>
+          <w:lang w:val="en-GB"/>
+        </w:rPr>
+      </w:pPr>
+      <w:r>
+        <w:rPr>
+          <w:rFonts w:ascii="Times New Roman" w:hAnsi="Times New Roman" w:cs="Times New Roman"/>
+          <w:lang w:val="en-GB"/>
+        </w:rPr>
+        <w:lastRenderedPageBreak/>
+        <w:t>User (</w:t>
+      </w:r>
+      <w:proofErr w:type="spellStart"/>
+      <w:r>
+        <w:rPr>
+          <w:rFonts w:ascii="Times New Roman" w:hAnsi="Times New Roman" w:cs="Times New Roman"/>
+          <w:lang w:val="en-GB"/>
+        </w:rPr>
+        <w:t>Pengguna</w:t>
+      </w:r>
+      <w:proofErr w:type="spellEnd"/>
+      <w:r>
+        <w:rPr>
+          <w:rFonts w:ascii="Times New Roman" w:hAnsi="Times New Roman" w:cs="Times New Roman"/>
+          <w:lang w:val="en-GB"/>
+        </w:rPr>
+        <w:t xml:space="preserve">): </w:t>
+      </w:r>
+      <w:proofErr w:type="spellStart"/>
+      <w:r>
+        <w:rPr>
+          <w:rFonts w:ascii="Times New Roman" w:hAnsi="Times New Roman" w:cs="Times New Roman"/>
+          <w:lang w:val="en-GB"/>
+        </w:rPr>
+        <w:t>Menyimpan</w:t>
+      </w:r>
+      <w:proofErr w:type="spellEnd"/>
+      <w:r>
+        <w:rPr>
+          <w:rFonts w:ascii="Times New Roman" w:hAnsi="Times New Roman" w:cs="Times New Roman"/>
+          <w:lang w:val="en-GB"/>
+        </w:rPr>
+        <w:t xml:space="preserve"> </w:t>
+      </w:r>
+      <w:proofErr w:type="spellStart"/>
+      <w:r>
+        <w:rPr>
+          <w:rFonts w:ascii="Times New Roman" w:hAnsi="Times New Roman" w:cs="Times New Roman"/>
+          <w:lang w:val="en-GB"/>
+        </w:rPr>
+        <w:t>identitas</w:t>
+      </w:r>
+      <w:proofErr w:type="spellEnd"/>
+      <w:r>
+        <w:rPr>
+          <w:rFonts w:ascii="Times New Roman" w:hAnsi="Times New Roman" w:cs="Times New Roman"/>
+          <w:lang w:val="en-GB"/>
+        </w:rPr>
+        <w:t xml:space="preserve"> orang yang </w:t>
+      </w:r>
+      <w:proofErr w:type="spellStart"/>
+      <w:r>
+        <w:rPr>
+          <w:rFonts w:ascii="Times New Roman" w:hAnsi="Times New Roman" w:cs="Times New Roman"/>
+          <w:lang w:val="en-GB"/>
+        </w:rPr>
+        <w:t>masuk</w:t>
+      </w:r>
+      <w:proofErr w:type="spellEnd"/>
+      <w:r>
+        <w:rPr>
+          <w:rFonts w:ascii="Times New Roman" w:hAnsi="Times New Roman" w:cs="Times New Roman"/>
+          <w:lang w:val="en-GB"/>
+        </w:rPr>
+        <w:t xml:space="preserve"> </w:t>
+      </w:r>
+      <w:proofErr w:type="spellStart"/>
+      <w:r>
+        <w:rPr>
+          <w:rFonts w:ascii="Times New Roman" w:hAnsi="Times New Roman" w:cs="Times New Roman"/>
+          <w:lang w:val="en-GB"/>
+        </w:rPr>
+        <w:t>ke</w:t>
+      </w:r>
+      <w:proofErr w:type="spellEnd"/>
+      <w:r>
+        <w:rPr>
+          <w:rFonts w:ascii="Times New Roman" w:hAnsi="Times New Roman" w:cs="Times New Roman"/>
+          <w:lang w:val="en-GB"/>
+        </w:rPr>
+        <w:t xml:space="preserve"> </w:t>
+      </w:r>
+      <w:proofErr w:type="spellStart"/>
+      <w:r>
+        <w:rPr>
+          <w:rFonts w:ascii="Times New Roman" w:hAnsi="Times New Roman" w:cs="Times New Roman"/>
+          <w:lang w:val="en-GB"/>
+        </w:rPr>
+        <w:t>aplikasi</w:t>
+      </w:r>
+      <w:proofErr w:type="spellEnd"/>
+      <w:r>
+        <w:rPr>
+          <w:rFonts w:ascii="Times New Roman" w:hAnsi="Times New Roman" w:cs="Times New Roman"/>
+          <w:lang w:val="en-GB"/>
+        </w:rPr>
+        <w:t xml:space="preserve">, </w:t>
+      </w:r>
+      <w:proofErr w:type="spellStart"/>
+      <w:r>
+        <w:rPr>
+          <w:rFonts w:ascii="Times New Roman" w:hAnsi="Times New Roman" w:cs="Times New Roman"/>
+          <w:lang w:val="en-GB"/>
+        </w:rPr>
+        <w:t>seperti</w:t>
+      </w:r>
+      <w:proofErr w:type="spellEnd"/>
+      <w:r>
+        <w:rPr>
+          <w:rFonts w:ascii="Times New Roman" w:hAnsi="Times New Roman" w:cs="Times New Roman"/>
+          <w:lang w:val="en-GB"/>
+        </w:rPr>
+        <w:t xml:space="preserve"> nama, email, </w:t>
+      </w:r>
+      <w:proofErr w:type="spellStart"/>
+      <w:r>
+        <w:rPr>
+          <w:rFonts w:ascii="Times New Roman" w:hAnsi="Times New Roman" w:cs="Times New Roman"/>
+          <w:lang w:val="en-GB"/>
+        </w:rPr>
+        <w:t>foto</w:t>
+      </w:r>
+      <w:proofErr w:type="spellEnd"/>
+      <w:r>
+        <w:rPr>
+          <w:rFonts w:ascii="Times New Roman" w:hAnsi="Times New Roman" w:cs="Times New Roman"/>
+          <w:lang w:val="en-GB"/>
+        </w:rPr>
+        <w:t xml:space="preserve"> </w:t>
+      </w:r>
+      <w:proofErr w:type="spellStart"/>
+      <w:r>
+        <w:rPr>
+          <w:rFonts w:ascii="Times New Roman" w:hAnsi="Times New Roman" w:cs="Times New Roman"/>
+          <w:lang w:val="en-GB"/>
+        </w:rPr>
+        <w:t>profil</w:t>
+      </w:r>
+      <w:proofErr w:type="spellEnd"/>
+      <w:r>
+        <w:rPr>
+          <w:rFonts w:ascii="Times New Roman" w:hAnsi="Times New Roman" w:cs="Times New Roman"/>
+          <w:lang w:val="en-GB"/>
+        </w:rPr>
+        <w:t xml:space="preserve">, dan </w:t>
+      </w:r>
+      <w:proofErr w:type="spellStart"/>
+      <w:r>
+        <w:rPr>
+          <w:rFonts w:ascii="Times New Roman" w:hAnsi="Times New Roman" w:cs="Times New Roman"/>
+          <w:lang w:val="en-GB"/>
+        </w:rPr>
+        <w:t>perannya</w:t>
+      </w:r>
+      <w:proofErr w:type="spellEnd"/>
+      <w:r>
+        <w:rPr>
+          <w:rFonts w:ascii="Times New Roman" w:hAnsi="Times New Roman" w:cs="Times New Roman"/>
+          <w:lang w:val="en-GB"/>
+        </w:rPr>
+        <w:t xml:space="preserve"> (</w:t>
+      </w:r>
+      <w:proofErr w:type="spellStart"/>
+      <w:r>
+        <w:rPr>
+          <w:rFonts w:ascii="Times New Roman" w:hAnsi="Times New Roman" w:cs="Times New Roman"/>
+          <w:lang w:val="en-GB"/>
+        </w:rPr>
+        <w:t>apakah</w:t>
+      </w:r>
+      <w:proofErr w:type="spellEnd"/>
+      <w:r>
+        <w:rPr>
+          <w:rFonts w:ascii="Times New Roman" w:hAnsi="Times New Roman" w:cs="Times New Roman"/>
+          <w:lang w:val="en-GB"/>
+        </w:rPr>
+        <w:t xml:space="preserve"> Admin </w:t>
+      </w:r>
+      <w:proofErr w:type="spellStart"/>
+      <w:r>
+        <w:rPr>
+          <w:rFonts w:ascii="Times New Roman" w:hAnsi="Times New Roman" w:cs="Times New Roman"/>
+          <w:lang w:val="en-GB"/>
+        </w:rPr>
+        <w:t>atau</w:t>
+      </w:r>
+      <w:proofErr w:type="spellEnd"/>
+      <w:r>
+        <w:rPr>
+          <w:rFonts w:ascii="Times New Roman" w:hAnsi="Times New Roman" w:cs="Times New Roman"/>
+          <w:lang w:val="en-GB"/>
+        </w:rPr>
+        <w:t xml:space="preserve"> </w:t>
+      </w:r>
+      <w:proofErr w:type="spellStart"/>
+      <w:r>
+        <w:rPr>
+          <w:rFonts w:ascii="Times New Roman" w:hAnsi="Times New Roman" w:cs="Times New Roman"/>
+          <w:lang w:val="en-GB"/>
+        </w:rPr>
+        <w:t>Pengguna</w:t>
+      </w:r>
+      <w:proofErr w:type="spellEnd"/>
+      <w:r>
+        <w:rPr>
+          <w:rFonts w:ascii="Times New Roman" w:hAnsi="Times New Roman" w:cs="Times New Roman"/>
+          <w:lang w:val="en-GB"/>
+        </w:rPr>
+        <w:t xml:space="preserve"> </w:t>
+      </w:r>
+      <w:proofErr w:type="spellStart"/>
+      <w:r>
+        <w:rPr>
+          <w:rFonts w:ascii="Times New Roman" w:hAnsi="Times New Roman" w:cs="Times New Roman"/>
+          <w:lang w:val="en-GB"/>
+        </w:rPr>
+        <w:t>biasa</w:t>
+      </w:r>
+      <w:proofErr w:type="spellEnd"/>
+      <w:r>
+        <w:rPr>
+          <w:rFonts w:ascii="Times New Roman" w:hAnsi="Times New Roman" w:cs="Times New Roman"/>
+          <w:lang w:val="en-GB"/>
+        </w:rPr>
+        <w:t>).</w:t>
+      </w:r>
+    </w:p>
+    <w:p>
+      <w:pPr>
+        <w:pStyle w:val="ListParagraph"/>
+        <w:numPr>
+          <w:ilvl w:val="0"/>
+          <w:numId w:val="3"/>
+        </w:numPr>
+        <w:jc w:val="both"/>
+        <w:rPr>
+          <w:rFonts w:ascii="Times New Roman" w:hAnsi="Times New Roman" w:cs="Times New Roman"/>
+          <w:lang w:val="en-GB"/>
+        </w:rPr>
+      </w:pPr>
+      <w:r>
+        <w:rPr>
+          <w:rFonts w:ascii="Times New Roman" w:hAnsi="Times New Roman" w:cs="Times New Roman"/>
+          <w:lang w:val="en-GB"/>
+        </w:rPr>
+        <w:t>Category (</w:t>
+      </w:r>
+      <w:proofErr w:type="spellStart"/>
+      <w:r>
+        <w:rPr>
+          <w:rFonts w:ascii="Times New Roman" w:hAnsi="Times New Roman" w:cs="Times New Roman"/>
+          <w:lang w:val="en-GB"/>
+        </w:rPr>
+        <w:t>Kategori</w:t>
+      </w:r>
+      <w:proofErr w:type="spellEnd"/>
+      <w:r>
+        <w:rPr>
+          <w:rFonts w:ascii="Times New Roman" w:hAnsi="Times New Roman" w:cs="Times New Roman"/>
+          <w:lang w:val="en-GB"/>
+        </w:rPr>
+        <w:t xml:space="preserve">): </w:t>
+      </w:r>
+      <w:proofErr w:type="spellStart"/>
+      <w:r>
+        <w:rPr>
+          <w:rFonts w:ascii="Times New Roman" w:hAnsi="Times New Roman" w:cs="Times New Roman"/>
+          <w:lang w:val="en-GB"/>
+        </w:rPr>
+        <w:t>Berfungsi</w:t>
+      </w:r>
+      <w:proofErr w:type="spellEnd"/>
+      <w:r>
+        <w:rPr>
+          <w:rFonts w:ascii="Times New Roman" w:hAnsi="Times New Roman" w:cs="Times New Roman"/>
+          <w:lang w:val="en-GB"/>
+        </w:rPr>
+        <w:t xml:space="preserve"> </w:t>
+      </w:r>
+      <w:proofErr w:type="spellStart"/>
+      <w:r>
+        <w:rPr>
+          <w:rFonts w:ascii="Times New Roman" w:hAnsi="Times New Roman" w:cs="Times New Roman"/>
+          <w:lang w:val="en-GB"/>
+        </w:rPr>
+        <w:t>sebagai</w:t>
+      </w:r>
+      <w:proofErr w:type="spellEnd"/>
+      <w:r>
+        <w:rPr>
+          <w:rFonts w:ascii="Times New Roman" w:hAnsi="Times New Roman" w:cs="Times New Roman"/>
+          <w:lang w:val="en-GB"/>
+        </w:rPr>
+        <w:t xml:space="preserve"> label </w:t>
+      </w:r>
+      <w:proofErr w:type="spellStart"/>
+      <w:r>
+        <w:rPr>
+          <w:rFonts w:ascii="Times New Roman" w:hAnsi="Times New Roman" w:cs="Times New Roman"/>
+          <w:lang w:val="en-GB"/>
+        </w:rPr>
+        <w:t>untuk</w:t>
+      </w:r>
+      <w:proofErr w:type="spellEnd"/>
+      <w:r>
+        <w:rPr>
+          <w:rFonts w:ascii="Times New Roman" w:hAnsi="Times New Roman" w:cs="Times New Roman"/>
+          <w:lang w:val="en-GB"/>
+        </w:rPr>
+        <w:t xml:space="preserve"> </w:t>
+      </w:r>
+      <w:proofErr w:type="spellStart"/>
+      <w:r>
+        <w:rPr>
+          <w:rFonts w:ascii="Times New Roman" w:hAnsi="Times New Roman" w:cs="Times New Roman"/>
+          <w:lang w:val="en-GB"/>
+        </w:rPr>
+        <w:t>mengelompokkan</w:t>
+      </w:r>
+      <w:proofErr w:type="spellEnd"/>
+      <w:r>
+        <w:rPr>
+          <w:rFonts w:ascii="Times New Roman" w:hAnsi="Times New Roman" w:cs="Times New Roman"/>
+          <w:lang w:val="en-GB"/>
+        </w:rPr>
+        <w:t xml:space="preserve"> </w:t>
+      </w:r>
+      <w:proofErr w:type="spellStart"/>
+      <w:r>
+        <w:rPr>
+          <w:rFonts w:ascii="Times New Roman" w:hAnsi="Times New Roman" w:cs="Times New Roman"/>
+          <w:lang w:val="en-GB"/>
+        </w:rPr>
+        <w:t>tempat</w:t>
+      </w:r>
+      <w:proofErr w:type="spellEnd"/>
+      <w:r>
+        <w:rPr>
+          <w:rFonts w:ascii="Times New Roman" w:hAnsi="Times New Roman" w:cs="Times New Roman"/>
+          <w:lang w:val="en-GB"/>
+        </w:rPr>
+        <w:t xml:space="preserve">, </w:t>
+      </w:r>
+      <w:proofErr w:type="spellStart"/>
+      <w:r>
+        <w:rPr>
+          <w:rFonts w:ascii="Times New Roman" w:hAnsi="Times New Roman" w:cs="Times New Roman"/>
+          <w:lang w:val="en-GB"/>
+        </w:rPr>
+        <w:t>misalnya</w:t>
+      </w:r>
+      <w:proofErr w:type="spellEnd"/>
+      <w:r>
+        <w:rPr>
+          <w:rFonts w:ascii="Times New Roman" w:hAnsi="Times New Roman" w:cs="Times New Roman"/>
+          <w:lang w:val="en-GB"/>
+        </w:rPr>
+        <w:t xml:space="preserve"> </w:t>
+      </w:r>
+      <w:proofErr w:type="spellStart"/>
+      <w:r>
+        <w:rPr>
+          <w:rFonts w:ascii="Times New Roman" w:hAnsi="Times New Roman" w:cs="Times New Roman"/>
+          <w:lang w:val="en-GB"/>
+        </w:rPr>
+        <w:t>kategori</w:t>
+      </w:r>
+      <w:proofErr w:type="spellEnd"/>
+      <w:r>
+        <w:rPr>
+          <w:rFonts w:ascii="Times New Roman" w:hAnsi="Times New Roman" w:cs="Times New Roman"/>
+          <w:lang w:val="en-GB"/>
+        </w:rPr>
+        <w:t xml:space="preserve"> </w:t>
+      </w:r>
+      <w:proofErr w:type="spellStart"/>
+      <w:r>
+        <w:rPr>
+          <w:rFonts w:ascii="Times New Roman" w:hAnsi="Times New Roman" w:cs="Times New Roman"/>
+          <w:lang w:val="en-GB"/>
+        </w:rPr>
+        <w:t>Wisata</w:t>
+      </w:r>
+      <w:proofErr w:type="spellEnd"/>
+      <w:r>
+        <w:rPr>
+          <w:rFonts w:ascii="Times New Roman" w:hAnsi="Times New Roman" w:cs="Times New Roman"/>
+          <w:lang w:val="en-GB"/>
+        </w:rPr>
+        <w:t xml:space="preserve"> Alam, </w:t>
+      </w:r>
+      <w:proofErr w:type="spellStart"/>
+      <w:r>
+        <w:rPr>
+          <w:rFonts w:ascii="Times New Roman" w:hAnsi="Times New Roman" w:cs="Times New Roman"/>
+          <w:lang w:val="en-GB"/>
+        </w:rPr>
+        <w:t>Kuliner</w:t>
+      </w:r>
+      <w:proofErr w:type="spellEnd"/>
+      <w:r>
+        <w:rPr>
+          <w:rFonts w:ascii="Times New Roman" w:hAnsi="Times New Roman" w:cs="Times New Roman"/>
+          <w:lang w:val="en-GB"/>
+        </w:rPr>
+        <w:t xml:space="preserve">, </w:t>
+      </w:r>
+      <w:proofErr w:type="spellStart"/>
+      <w:r>
+        <w:rPr>
+          <w:rFonts w:ascii="Times New Roman" w:hAnsi="Times New Roman" w:cs="Times New Roman"/>
+          <w:lang w:val="en-GB"/>
+        </w:rPr>
+        <w:t>atau</w:t>
+      </w:r>
+      <w:proofErr w:type="spellEnd"/>
+      <w:r>
+        <w:rPr>
+          <w:rFonts w:ascii="Times New Roman" w:hAnsi="Times New Roman" w:cs="Times New Roman"/>
+          <w:lang w:val="en-GB"/>
+        </w:rPr>
+        <w:t xml:space="preserve"> </w:t>
+      </w:r>
+      <w:proofErr w:type="spellStart"/>
+      <w:r>
+        <w:rPr>
+          <w:rFonts w:ascii="Times New Roman" w:hAnsi="Times New Roman" w:cs="Times New Roman"/>
+          <w:lang w:val="en-GB"/>
+        </w:rPr>
+        <w:t>Budaya</w:t>
+      </w:r>
+      <w:proofErr w:type="spellEnd"/>
+      <w:r>
+        <w:rPr>
+          <w:rFonts w:ascii="Times New Roman" w:hAnsi="Times New Roman" w:cs="Times New Roman"/>
+          <w:lang w:val="en-GB"/>
+        </w:rPr>
+        <w:t>.</w:t>
+      </w:r>
+    </w:p>
+    <w:p>
+      <w:pPr>
+        <w:pStyle w:val="ListParagraph"/>
+        <w:numPr>
+          <w:ilvl w:val="0"/>
+          <w:numId w:val="3"/>
+        </w:numPr>
+        <w:jc w:val="both"/>
+        <w:rPr>
+          <w:rFonts w:ascii="Times New Roman" w:hAnsi="Times New Roman" w:cs="Times New Roman"/>
+          <w:lang w:val="en-GB"/>
+        </w:rPr>
+      </w:pPr>
+      <w:r>
+        <w:rPr>
+          <w:rFonts w:ascii="Times New Roman" w:hAnsi="Times New Roman" w:cs="Times New Roman"/>
+          <w:lang w:val="en-GB"/>
+        </w:rPr>
+        <w:t>Destination (</w:t>
+      </w:r>
+      <w:proofErr w:type="spellStart"/>
+      <w:r>
+        <w:rPr>
+          <w:rFonts w:ascii="Times New Roman" w:hAnsi="Times New Roman" w:cs="Times New Roman"/>
+          <w:lang w:val="en-GB"/>
+        </w:rPr>
+        <w:t>Destinasi</w:t>
+      </w:r>
+      <w:proofErr w:type="spellEnd"/>
+      <w:r>
+        <w:rPr>
+          <w:rFonts w:ascii="Times New Roman" w:hAnsi="Times New Roman" w:cs="Times New Roman"/>
+          <w:lang w:val="en-GB"/>
+        </w:rPr>
+        <w:t>/</w:t>
+      </w:r>
+      <w:proofErr w:type="spellStart"/>
+      <w:r>
+        <w:rPr>
+          <w:rFonts w:ascii="Times New Roman" w:hAnsi="Times New Roman" w:cs="Times New Roman"/>
+          <w:lang w:val="en-GB"/>
+        </w:rPr>
+        <w:t>Tempat</w:t>
+      </w:r>
+      <w:proofErr w:type="spellEnd"/>
+      <w:r>
+        <w:rPr>
+          <w:rFonts w:ascii="Times New Roman" w:hAnsi="Times New Roman" w:cs="Times New Roman"/>
+          <w:lang w:val="en-GB"/>
+        </w:rPr>
+        <w:t xml:space="preserve">): Inti </w:t>
+      </w:r>
+      <w:proofErr w:type="spellStart"/>
+      <w:r>
+        <w:rPr>
+          <w:rFonts w:ascii="Times New Roman" w:hAnsi="Times New Roman" w:cs="Times New Roman"/>
+          <w:lang w:val="en-GB"/>
+        </w:rPr>
+        <w:t>dari</w:t>
+      </w:r>
+      <w:proofErr w:type="spellEnd"/>
+      <w:r>
+        <w:rPr>
+          <w:rFonts w:ascii="Times New Roman" w:hAnsi="Times New Roman" w:cs="Times New Roman"/>
+          <w:lang w:val="en-GB"/>
+        </w:rPr>
+        <w:t xml:space="preserve"> </w:t>
+      </w:r>
+      <w:proofErr w:type="spellStart"/>
+      <w:r>
+        <w:rPr>
+          <w:rFonts w:ascii="Times New Roman" w:hAnsi="Times New Roman" w:cs="Times New Roman"/>
+          <w:lang w:val="en-GB"/>
+        </w:rPr>
+        <w:t>aplikasi</w:t>
+      </w:r>
+      <w:proofErr w:type="spellEnd"/>
+      <w:r>
+        <w:rPr>
+          <w:rFonts w:ascii="Times New Roman" w:hAnsi="Times New Roman" w:cs="Times New Roman"/>
+          <w:lang w:val="en-GB"/>
+        </w:rPr>
+        <w:t xml:space="preserve">, </w:t>
+      </w:r>
+      <w:proofErr w:type="spellStart"/>
+      <w:r>
+        <w:rPr>
+          <w:rFonts w:ascii="Times New Roman" w:hAnsi="Times New Roman" w:cs="Times New Roman"/>
+          <w:lang w:val="en-GB"/>
+        </w:rPr>
+        <w:t>yaitu</w:t>
+      </w:r>
+      <w:proofErr w:type="spellEnd"/>
+      <w:r>
+        <w:rPr>
+          <w:rFonts w:ascii="Times New Roman" w:hAnsi="Times New Roman" w:cs="Times New Roman"/>
+          <w:lang w:val="en-GB"/>
+        </w:rPr>
+        <w:t xml:space="preserve"> data </w:t>
+      </w:r>
+      <w:proofErr w:type="spellStart"/>
+      <w:r>
+        <w:rPr>
+          <w:rFonts w:ascii="Times New Roman" w:hAnsi="Times New Roman" w:cs="Times New Roman"/>
+          <w:lang w:val="en-GB"/>
+        </w:rPr>
+        <w:t>mengenai</w:t>
+      </w:r>
+      <w:proofErr w:type="spellEnd"/>
+      <w:r>
+        <w:rPr>
+          <w:rFonts w:ascii="Times New Roman" w:hAnsi="Times New Roman" w:cs="Times New Roman"/>
+          <w:lang w:val="en-GB"/>
+        </w:rPr>
+        <w:t xml:space="preserve"> </w:t>
+      </w:r>
+      <w:proofErr w:type="spellStart"/>
+      <w:r>
+        <w:rPr>
+          <w:rFonts w:ascii="Times New Roman" w:hAnsi="Times New Roman" w:cs="Times New Roman"/>
+          <w:lang w:val="en-GB"/>
+        </w:rPr>
+        <w:t>tempat-tempat</w:t>
+      </w:r>
+      <w:proofErr w:type="spellEnd"/>
+      <w:r>
+        <w:rPr>
+          <w:rFonts w:ascii="Times New Roman" w:hAnsi="Times New Roman" w:cs="Times New Roman"/>
+          <w:lang w:val="en-GB"/>
+        </w:rPr>
+        <w:t xml:space="preserve"> yang </w:t>
+      </w:r>
+      <w:proofErr w:type="spellStart"/>
+      <w:r>
+        <w:rPr>
+          <w:rFonts w:ascii="Times New Roman" w:hAnsi="Times New Roman" w:cs="Times New Roman"/>
+          <w:lang w:val="en-GB"/>
+        </w:rPr>
+        <w:t>dikelola</w:t>
+      </w:r>
+      <w:proofErr w:type="spellEnd"/>
+      <w:r>
+        <w:rPr>
+          <w:rFonts w:ascii="Times New Roman" w:hAnsi="Times New Roman" w:cs="Times New Roman"/>
+          <w:lang w:val="en-GB"/>
+        </w:rPr>
+        <w:t xml:space="preserve"> (nama </w:t>
+      </w:r>
+      <w:proofErr w:type="spellStart"/>
+      <w:r>
+        <w:rPr>
+          <w:rFonts w:ascii="Times New Roman" w:hAnsi="Times New Roman" w:cs="Times New Roman"/>
+          <w:lang w:val="en-GB"/>
+        </w:rPr>
+        <w:t>tempat</w:t>
+      </w:r>
+      <w:proofErr w:type="spellEnd"/>
+      <w:r>
+        <w:rPr>
+          <w:rFonts w:ascii="Times New Roman" w:hAnsi="Times New Roman" w:cs="Times New Roman"/>
+          <w:lang w:val="en-GB"/>
+        </w:rPr>
+        <w:t xml:space="preserve">, </w:t>
+      </w:r>
+      <w:proofErr w:type="spellStart"/>
+      <w:r>
+        <w:rPr>
+          <w:rFonts w:ascii="Times New Roman" w:hAnsi="Times New Roman" w:cs="Times New Roman"/>
+          <w:lang w:val="en-GB"/>
+        </w:rPr>
+        <w:t>lokasi</w:t>
+      </w:r>
+      <w:proofErr w:type="spellEnd"/>
+      <w:r>
+        <w:rPr>
+          <w:rFonts w:ascii="Times New Roman" w:hAnsi="Times New Roman" w:cs="Times New Roman"/>
+          <w:lang w:val="en-GB"/>
+        </w:rPr>
+        <w:t xml:space="preserve">, </w:t>
+      </w:r>
+      <w:proofErr w:type="spellStart"/>
+      <w:r>
+        <w:rPr>
+          <w:rFonts w:ascii="Times New Roman" w:hAnsi="Times New Roman" w:cs="Times New Roman"/>
+          <w:lang w:val="en-GB"/>
+        </w:rPr>
+        <w:t>deskripsi</w:t>
+      </w:r>
+      <w:proofErr w:type="spellEnd"/>
+      <w:r>
+        <w:rPr>
+          <w:rFonts w:ascii="Times New Roman" w:hAnsi="Times New Roman" w:cs="Times New Roman"/>
+          <w:lang w:val="en-GB"/>
+        </w:rPr>
+        <w:t xml:space="preserve">, dan </w:t>
+      </w:r>
+      <w:proofErr w:type="spellStart"/>
+      <w:r>
+        <w:rPr>
+          <w:rFonts w:ascii="Times New Roman" w:hAnsi="Times New Roman" w:cs="Times New Roman"/>
+          <w:lang w:val="en-GB"/>
+        </w:rPr>
+        <w:t>foto</w:t>
+      </w:r>
+      <w:proofErr w:type="spellEnd"/>
+      <w:r>
+        <w:rPr>
+          <w:rFonts w:ascii="Times New Roman" w:hAnsi="Times New Roman" w:cs="Times New Roman"/>
+          <w:lang w:val="en-GB"/>
+        </w:rPr>
+        <w:t>).</w:t>
+      </w:r>
+    </w:p>
+    <w:p>
+      <w:pPr>
+        <w:pStyle w:val="ListParagraph"/>
+        <w:numPr>
+          <w:ilvl w:val="0"/>
+          <w:numId w:val="3"/>
+        </w:numPr>
+        <w:jc w:val="both"/>
+        <w:rPr>
+          <w:rFonts w:ascii="Times New Roman" w:hAnsi="Times New Roman" w:cs="Times New Roman"/>
+          <w:lang w:val="en-GB"/>
+        </w:rPr>
+      </w:pPr>
+      <w:r>
+        <w:rPr>
+          <w:rFonts w:ascii="Times New Roman" w:hAnsi="Times New Roman" w:cs="Times New Roman"/>
+          <w:lang w:val="en-GB"/>
+        </w:rPr>
+        <w:t>Review (</w:t>
+      </w:r>
+      <w:proofErr w:type="spellStart"/>
+      <w:r>
+        <w:rPr>
+          <w:rFonts w:ascii="Times New Roman" w:hAnsi="Times New Roman" w:cs="Times New Roman"/>
+          <w:lang w:val="en-GB"/>
+        </w:rPr>
+        <w:t>Ulasan</w:t>
+      </w:r>
+      <w:proofErr w:type="spellEnd"/>
+      <w:r>
+        <w:rPr>
+          <w:rFonts w:ascii="Times New Roman" w:hAnsi="Times New Roman" w:cs="Times New Roman"/>
+          <w:lang w:val="en-GB"/>
+        </w:rPr>
+        <w:t xml:space="preserve">): </w:t>
+      </w:r>
+      <w:proofErr w:type="spellStart"/>
+      <w:r>
+        <w:rPr>
+          <w:rFonts w:ascii="Times New Roman" w:hAnsi="Times New Roman" w:cs="Times New Roman"/>
+          <w:lang w:val="en-GB"/>
+        </w:rPr>
+        <w:t>Tempat</w:t>
+      </w:r>
+      <w:proofErr w:type="spellEnd"/>
+      <w:r>
+        <w:rPr>
+          <w:rFonts w:ascii="Times New Roman" w:hAnsi="Times New Roman" w:cs="Times New Roman"/>
+          <w:lang w:val="en-GB"/>
+        </w:rPr>
+        <w:t xml:space="preserve"> </w:t>
+      </w:r>
+      <w:proofErr w:type="spellStart"/>
+      <w:r>
+        <w:rPr>
+          <w:rFonts w:ascii="Times New Roman" w:hAnsi="Times New Roman" w:cs="Times New Roman"/>
+          <w:lang w:val="en-GB"/>
+        </w:rPr>
+        <w:t>menampung</w:t>
+      </w:r>
+      <w:proofErr w:type="spellEnd"/>
+      <w:r>
+        <w:rPr>
+          <w:rFonts w:ascii="Times New Roman" w:hAnsi="Times New Roman" w:cs="Times New Roman"/>
+          <w:lang w:val="en-GB"/>
+        </w:rPr>
+        <w:t xml:space="preserve"> </w:t>
+      </w:r>
+      <w:proofErr w:type="spellStart"/>
+      <w:r>
+        <w:rPr>
+          <w:rFonts w:ascii="Times New Roman" w:hAnsi="Times New Roman" w:cs="Times New Roman"/>
+          <w:lang w:val="en-GB"/>
+        </w:rPr>
+        <w:t>komentar</w:t>
+      </w:r>
+      <w:proofErr w:type="spellEnd"/>
+      <w:r>
+        <w:rPr>
+          <w:rFonts w:ascii="Times New Roman" w:hAnsi="Times New Roman" w:cs="Times New Roman"/>
+          <w:lang w:val="en-GB"/>
+        </w:rPr>
+        <w:t xml:space="preserve"> dan rating </w:t>
+      </w:r>
+      <w:proofErr w:type="spellStart"/>
+      <w:r>
+        <w:rPr>
+          <w:rFonts w:ascii="Times New Roman" w:hAnsi="Times New Roman" w:cs="Times New Roman"/>
+          <w:lang w:val="en-GB"/>
+        </w:rPr>
+        <w:t>bintang</w:t>
+      </w:r>
+      <w:proofErr w:type="spellEnd"/>
+      <w:r>
+        <w:rPr>
+          <w:rFonts w:ascii="Times New Roman" w:hAnsi="Times New Roman" w:cs="Times New Roman"/>
+          <w:lang w:val="en-GB"/>
+        </w:rPr>
+        <w:t xml:space="preserve"> yang </w:t>
+      </w:r>
+      <w:proofErr w:type="spellStart"/>
+      <w:r>
+        <w:rPr>
+          <w:rFonts w:ascii="Times New Roman" w:hAnsi="Times New Roman" w:cs="Times New Roman"/>
+          <w:lang w:val="en-GB"/>
+        </w:rPr>
+        <w:t>diberikan</w:t>
+      </w:r>
+      <w:proofErr w:type="spellEnd"/>
+      <w:r>
+        <w:rPr>
+          <w:rFonts w:ascii="Times New Roman" w:hAnsi="Times New Roman" w:cs="Times New Roman"/>
+          <w:lang w:val="en-GB"/>
+        </w:rPr>
+        <w:t xml:space="preserve"> </w:t>
+      </w:r>
+      <w:proofErr w:type="spellStart"/>
+      <w:r>
+        <w:rPr>
+          <w:rFonts w:ascii="Times New Roman" w:hAnsi="Times New Roman" w:cs="Times New Roman"/>
+          <w:lang w:val="en-GB"/>
+        </w:rPr>
+        <w:t>pengguna</w:t>
+      </w:r>
+      <w:proofErr w:type="spellEnd"/>
+      <w:r>
+        <w:rPr>
+          <w:rFonts w:ascii="Times New Roman" w:hAnsi="Times New Roman" w:cs="Times New Roman"/>
+          <w:lang w:val="en-GB"/>
+        </w:rPr>
+        <w:t xml:space="preserve"> </w:t>
+      </w:r>
+      <w:proofErr w:type="spellStart"/>
+      <w:r>
+        <w:rPr>
+          <w:rFonts w:ascii="Times New Roman" w:hAnsi="Times New Roman" w:cs="Times New Roman"/>
+          <w:lang w:val="en-GB"/>
+        </w:rPr>
+        <w:t>untuk</w:t>
+      </w:r>
+      <w:proofErr w:type="spellEnd"/>
+      <w:r>
+        <w:rPr>
+          <w:rFonts w:ascii="Times New Roman" w:hAnsi="Times New Roman" w:cs="Times New Roman"/>
+          <w:lang w:val="en-GB"/>
+        </w:rPr>
+        <w:t xml:space="preserve"> </w:t>
+      </w:r>
+      <w:proofErr w:type="spellStart"/>
+      <w:r>
+        <w:rPr>
+          <w:rFonts w:ascii="Times New Roman" w:hAnsi="Times New Roman" w:cs="Times New Roman"/>
+          <w:lang w:val="en-GB"/>
+        </w:rPr>
+        <w:t>suatu</w:t>
+      </w:r>
+      <w:proofErr w:type="spellEnd"/>
+      <w:r>
+        <w:rPr>
+          <w:rFonts w:ascii="Times New Roman" w:hAnsi="Times New Roman" w:cs="Times New Roman"/>
+          <w:lang w:val="en-GB"/>
+        </w:rPr>
+        <w:t xml:space="preserve"> </w:t>
+      </w:r>
+      <w:proofErr w:type="spellStart"/>
+      <w:r>
+        <w:rPr>
+          <w:rFonts w:ascii="Times New Roman" w:hAnsi="Times New Roman" w:cs="Times New Roman"/>
+          <w:lang w:val="en-GB"/>
+        </w:rPr>
+        <w:t>destinasi</w:t>
+      </w:r>
+      <w:proofErr w:type="spellEnd"/>
+      <w:r>
+        <w:rPr>
+          <w:rFonts w:ascii="Times New Roman" w:hAnsi="Times New Roman" w:cs="Times New Roman"/>
+          <w:lang w:val="en-GB"/>
+        </w:rPr>
+        <w:t>.</w:t>
+      </w:r>
+    </w:p>
+    <w:p>
+      <w:pPr>
+        <w:pStyle w:val="ListParagraph"/>
+        <w:numPr>
+          <w:ilvl w:val="0"/>
+          <w:numId w:val="3"/>
+        </w:numPr>
+        <w:jc w:val="both"/>
+        <w:rPr>
+          <w:rFonts w:ascii="Times New Roman" w:hAnsi="Times New Roman" w:cs="Times New Roman"/>
+          <w:lang w:val="en-GB"/>
+        </w:rPr>
+      </w:pPr>
+      <w:r>
+        <w:rPr>
+          <w:rFonts w:ascii="Times New Roman" w:hAnsi="Times New Roman" w:cs="Times New Roman"/>
+          <w:lang w:val="en-GB"/>
+        </w:rPr>
+        <w:t>Bookmark (</w:t>
+      </w:r>
+      <w:proofErr w:type="spellStart"/>
+      <w:r>
+        <w:rPr>
+          <w:rFonts w:ascii="Times New Roman" w:hAnsi="Times New Roman" w:cs="Times New Roman"/>
+          <w:lang w:val="en-GB"/>
+        </w:rPr>
+        <w:t>Simpan</w:t>
+      </w:r>
+      <w:proofErr w:type="spellEnd"/>
+      <w:r>
+        <w:rPr>
+          <w:rFonts w:ascii="Times New Roman" w:hAnsi="Times New Roman" w:cs="Times New Roman"/>
+          <w:lang w:val="en-GB"/>
+        </w:rPr>
+        <w:t xml:space="preserve">): Fitur </w:t>
+      </w:r>
+      <w:proofErr w:type="spellStart"/>
+      <w:r>
+        <w:rPr>
+          <w:rFonts w:ascii="Times New Roman" w:hAnsi="Times New Roman" w:cs="Times New Roman"/>
+          <w:lang w:val="en-GB"/>
+        </w:rPr>
+        <w:t>bagi</w:t>
+      </w:r>
+      <w:proofErr w:type="spellEnd"/>
+      <w:r>
+        <w:rPr>
+          <w:rFonts w:ascii="Times New Roman" w:hAnsi="Times New Roman" w:cs="Times New Roman"/>
+          <w:lang w:val="en-GB"/>
+        </w:rPr>
+        <w:t xml:space="preserve"> </w:t>
+      </w:r>
+      <w:proofErr w:type="spellStart"/>
+      <w:r>
+        <w:rPr>
+          <w:rFonts w:ascii="Times New Roman" w:hAnsi="Times New Roman" w:cs="Times New Roman"/>
+          <w:lang w:val="en-GB"/>
+        </w:rPr>
+        <w:t>pengguna</w:t>
+      </w:r>
+      <w:proofErr w:type="spellEnd"/>
+      <w:r>
+        <w:rPr>
+          <w:rFonts w:ascii="Times New Roman" w:hAnsi="Times New Roman" w:cs="Times New Roman"/>
+          <w:lang w:val="en-GB"/>
+        </w:rPr>
+        <w:t xml:space="preserve"> </w:t>
+      </w:r>
+      <w:proofErr w:type="spellStart"/>
+      <w:r>
+        <w:rPr>
+          <w:rFonts w:ascii="Times New Roman" w:hAnsi="Times New Roman" w:cs="Times New Roman"/>
+          <w:lang w:val="en-GB"/>
+        </w:rPr>
+        <w:t>untuk</w:t>
+      </w:r>
+      <w:proofErr w:type="spellEnd"/>
+      <w:r>
+        <w:rPr>
+          <w:rFonts w:ascii="Times New Roman" w:hAnsi="Times New Roman" w:cs="Times New Roman"/>
+          <w:lang w:val="en-GB"/>
+        </w:rPr>
+        <w:t xml:space="preserve"> </w:t>
+      </w:r>
+      <w:proofErr w:type="spellStart"/>
+      <w:r>
+        <w:rPr>
+          <w:rFonts w:ascii="Times New Roman" w:hAnsi="Times New Roman" w:cs="Times New Roman"/>
+          <w:lang w:val="en-GB"/>
+        </w:rPr>
+        <w:t>menandai</w:t>
+      </w:r>
+      <w:proofErr w:type="spellEnd"/>
+      <w:r>
+        <w:rPr>
+          <w:rFonts w:ascii="Times New Roman" w:hAnsi="Times New Roman" w:cs="Times New Roman"/>
+          <w:lang w:val="en-GB"/>
+        </w:rPr>
+        <w:t xml:space="preserve"> </w:t>
+      </w:r>
+      <w:proofErr w:type="spellStart"/>
+      <w:r>
+        <w:rPr>
+          <w:rFonts w:ascii="Times New Roman" w:hAnsi="Times New Roman" w:cs="Times New Roman"/>
+          <w:lang w:val="en-GB"/>
+        </w:rPr>
+        <w:t>atau</w:t>
+      </w:r>
+      <w:proofErr w:type="spellEnd"/>
+      <w:r>
+        <w:rPr>
+          <w:rFonts w:ascii="Times New Roman" w:hAnsi="Times New Roman" w:cs="Times New Roman"/>
+          <w:lang w:val="en-GB"/>
+        </w:rPr>
+        <w:t xml:space="preserve"> </w:t>
+      </w:r>
+      <w:proofErr w:type="spellStart"/>
+      <w:r>
+        <w:rPr>
+          <w:rFonts w:ascii="Times New Roman" w:hAnsi="Times New Roman" w:cs="Times New Roman"/>
+          <w:lang w:val="en-GB"/>
+        </w:rPr>
+        <w:t>menyimpan</w:t>
+      </w:r>
+      <w:proofErr w:type="spellEnd"/>
+      <w:r>
+        <w:rPr>
+          <w:rFonts w:ascii="Times New Roman" w:hAnsi="Times New Roman" w:cs="Times New Roman"/>
+          <w:lang w:val="en-GB"/>
+        </w:rPr>
+        <w:t xml:space="preserve"> </w:t>
+      </w:r>
+      <w:proofErr w:type="spellStart"/>
+      <w:r>
+        <w:rPr>
+          <w:rFonts w:ascii="Times New Roman" w:hAnsi="Times New Roman" w:cs="Times New Roman"/>
+          <w:lang w:val="en-GB"/>
+        </w:rPr>
+        <w:t>tempat-tempat</w:t>
+      </w:r>
+      <w:proofErr w:type="spellEnd"/>
+      <w:r>
+        <w:rPr>
+          <w:rFonts w:ascii="Times New Roman" w:hAnsi="Times New Roman" w:cs="Times New Roman"/>
+          <w:lang w:val="en-GB"/>
+        </w:rPr>
+        <w:t xml:space="preserve"> </w:t>
+      </w:r>
+      <w:proofErr w:type="spellStart"/>
+      <w:r>
+        <w:rPr>
+          <w:rFonts w:ascii="Times New Roman" w:hAnsi="Times New Roman" w:cs="Times New Roman"/>
+          <w:lang w:val="en-GB"/>
+        </w:rPr>
+        <w:t>favorit</w:t>
+      </w:r>
+      <w:proofErr w:type="spellEnd"/>
+      <w:r>
+        <w:rPr>
+          <w:rFonts w:ascii="Times New Roman" w:hAnsi="Times New Roman" w:cs="Times New Roman"/>
+          <w:lang w:val="en-GB"/>
+        </w:rPr>
+        <w:t xml:space="preserve"> agar </w:t>
+      </w:r>
+      <w:proofErr w:type="spellStart"/>
+      <w:r>
+        <w:rPr>
+          <w:rFonts w:ascii="Times New Roman" w:hAnsi="Times New Roman" w:cs="Times New Roman"/>
+          <w:lang w:val="en-GB"/>
+        </w:rPr>
+        <w:t>mudah</w:t>
+      </w:r>
+      <w:proofErr w:type="spellEnd"/>
+      <w:r>
+        <w:rPr>
+          <w:rFonts w:ascii="Times New Roman" w:hAnsi="Times New Roman" w:cs="Times New Roman"/>
+          <w:lang w:val="en-GB"/>
+        </w:rPr>
+        <w:t xml:space="preserve"> </w:t>
+      </w:r>
+      <w:proofErr w:type="spellStart"/>
+      <w:r>
+        <w:rPr>
+          <w:rFonts w:ascii="Times New Roman" w:hAnsi="Times New Roman" w:cs="Times New Roman"/>
+          <w:lang w:val="en-GB"/>
+        </w:rPr>
+        <w:t>ditemukan</w:t>
+      </w:r>
+      <w:proofErr w:type="spellEnd"/>
+      <w:r>
+        <w:rPr>
+          <w:rFonts w:ascii="Times New Roman" w:hAnsi="Times New Roman" w:cs="Times New Roman"/>
+          <w:lang w:val="en-GB"/>
+        </w:rPr>
+        <w:t xml:space="preserve"> </w:t>
+      </w:r>
+      <w:proofErr w:type="spellStart"/>
+      <w:r>
+        <w:rPr>
+          <w:rFonts w:ascii="Times New Roman" w:hAnsi="Times New Roman" w:cs="Times New Roman"/>
+          <w:lang w:val="en-GB"/>
+        </w:rPr>
+        <w:t>kembali</w:t>
+      </w:r>
+      <w:proofErr w:type="spellEnd"/>
+      <w:r>
+        <w:rPr>
+          <w:rFonts w:ascii="Times New Roman" w:hAnsi="Times New Roman" w:cs="Times New Roman"/>
+          <w:lang w:val="en-GB"/>
+        </w:rPr>
+        <w:t xml:space="preserve"> </w:t>
+      </w:r>
+      <w:proofErr w:type="spellStart"/>
+      <w:r>
+        <w:rPr>
+          <w:rFonts w:ascii="Times New Roman" w:hAnsi="Times New Roman" w:cs="Times New Roman"/>
+          <w:lang w:val="en-GB"/>
+        </w:rPr>
+        <w:t>nanti</w:t>
+      </w:r>
+      <w:proofErr w:type="spellEnd"/>
+      <w:r>
+        <w:rPr>
+          <w:rFonts w:ascii="Times New Roman" w:hAnsi="Times New Roman" w:cs="Times New Roman"/>
+          <w:lang w:val="en-GB"/>
+        </w:rPr>
+        <w:t>.</w:t>
+      </w:r>
+    </w:p>
+    <w:p>
+      <w:pPr>
+        <w:contextualSpacing/>
+        <w:jc w:val="both"/>
+        <w:rPr>
+          <w:rFonts w:ascii="Times New Roman" w:hAnsi="Times New Roman" w:cs="Times New Roman"/>
+          <w:lang w:val="en-GB"/>
+        </w:rPr>
+      </w:pPr>
+    </w:p>
+    <w:p>
+      <w:pPr>
+        <w:contextualSpacing/>
+        <w:jc w:val="both"/>
+        <w:rPr>
+          <w:rFonts w:ascii="Times New Roman" w:hAnsi="Times New Roman" w:cs="Times New Roman"/>
+          <w:lang w:val="en-GB"/>
+        </w:rPr>
+      </w:pPr>
+      <w:r>
+        <w:rPr>
+          <w:rFonts w:ascii="Times New Roman" w:hAnsi="Times New Roman" w:cs="Times New Roman"/>
+          <w:lang w:val="en-GB"/>
+        </w:rPr>
+        <w:t xml:space="preserve">9.  </w:t>
+      </w:r>
+      <w:r>
+        <w:rPr>
+          <w:rFonts w:ascii="Times New Roman" w:hAnsi="Times New Roman" w:cs="Times New Roman"/>
+          <w:lang w:val="en-GB"/>
+        </w:rPr>
+        <w:t xml:space="preserve">Edit file </w:t>
+      </w:r>
+      <w:proofErr w:type="spellStart"/>
+      <w:r>
+        <w:rPr>
+          <w:rFonts w:ascii="Times New Roman" w:hAnsi="Times New Roman" w:cs="Times New Roman"/>
+          <w:lang w:val="en-GB"/>
+        </w:rPr>
+        <w:t>prisma</w:t>
+      </w:r>
+      <w:proofErr w:type="spellEnd"/>
+      <w:r>
+        <w:rPr>
+          <w:rFonts w:ascii="Times New Roman" w:hAnsi="Times New Roman" w:cs="Times New Roman"/>
+          <w:lang w:val="en-GB"/>
+        </w:rPr>
+        <w:t>/</w:t>
+      </w:r>
+      <w:proofErr w:type="spellStart"/>
+      <w:r>
+        <w:rPr>
+          <w:rFonts w:ascii="Times New Roman" w:hAnsi="Times New Roman" w:cs="Times New Roman"/>
+          <w:lang w:val="en-GB"/>
+        </w:rPr>
+        <w:t>schema.prisma</w:t>
+      </w:r>
+      <w:proofErr w:type="spellEnd"/>
+    </w:p>
+    <w:p>
+      <w:pPr>
+        <w:contextualSpacing/>
+        <w:jc w:val="both"/>
+        <w:rPr>
+          <w:rFonts w:ascii="Times New Roman" w:hAnsi="Times New Roman" w:cs="Times New Roman"/>
+          <w:lang w:val="en-GB"/>
+        </w:rPr>
+      </w:pPr>
+      <w:r>
+        <w:rPr>
+          <w:noProof/>
+        </w:rPr>
+        <w:drawing>
+          <wp:inline distT="0" distB="0" distL="0" distR="0" wp14:anchorId="126D6B2F" wp14:editId="63E7C11B">
+            <wp:extent cx="5731510" cy="3222625"/>
+            <wp:effectExtent l="0" t="0" r="2540" b="0"/>
+            <wp:docPr id="152285527" name="Picture 1"/>
+            <wp:cNvGraphicFramePr>
+              <a:graphicFrameLocks xmlns:a="http://schemas.openxmlformats.org/drawingml/2006/main" noChangeAspect="1"/>
+            </wp:cNvGraphicFramePr>
+            <a:graphic xmlns:a="http://schemas.openxmlformats.org/drawingml/2006/main">
+              <a:graphicData uri="http://schemas.openxmlformats.org/drawingml/2006/picture">
+                <pic:pic xmlns:pic="http://schemas.openxmlformats.org/drawingml/2006/picture">
+                  <pic:nvPicPr>
+                    <pic:cNvPr id="152285527" name=""/>
+                    <pic:cNvPicPr/>
+                  </pic:nvPicPr>
+                  <pic:blipFill>
+                    <a:blip r:embed="rId13"/>
+                    <a:stretch>
+                      <a:fillRect/>
+                    </a:stretch>
+                  </pic:blipFill>
+                  <pic:spPr>
+                    <a:xfrm>
+                      <a:off x="0" y="0"/>
+                      <a:ext cx="5731510" cy="3222625"/>
+                    </a:xfrm>
+                    <a:prstGeom prst="rect">
+                      <a:avLst/>
+                    </a:prstGeom>
+                  </pic:spPr>
+                </pic:pic>
+              </a:graphicData>
+            </a:graphic>
+          </wp:inline>
+        </w:drawing>
+      </w:r>
+    </w:p>
+    <w:p>
+      <w:pPr>
+        <w:contextualSpacing/>
+        <w:jc w:val="both"/>
+        <w:rPr>
+          <w:rFonts w:ascii="Times New Roman" w:hAnsi="Times New Roman" w:cs="Times New Roman"/>
+          <w:lang w:val="en-GB"/>
+        </w:rPr>
+      </w:pPr>
+    </w:p>
+    <w:p>
+      <w:pPr>
+        <w:contextualSpacing/>
+        <w:jc w:val="both"/>
+        <w:rPr>
+          <w:rFonts w:ascii="Times New Roman" w:hAnsi="Times New Roman" w:cs="Times New Roman"/>
+          <w:lang w:val="en-GB"/>
+        </w:rPr>
+      </w:pPr>
+      <w:proofErr w:type="spellStart"/>
+      <w:r>
+        <w:rPr>
+          <w:rFonts w:ascii="Times New Roman" w:hAnsi="Times New Roman" w:cs="Times New Roman"/>
+          <w:lang w:val="en-GB"/>
+        </w:rPr>
+        <w:t>M</w:t>
+      </w:r>
+      <w:r>
+        <w:rPr>
+          <w:rFonts w:ascii="Times New Roman" w:hAnsi="Times New Roman" w:cs="Times New Roman"/>
+          <w:lang w:val="en-GB"/>
+        </w:rPr>
+        <w:t>enggunakan</w:t>
+      </w:r>
+      <w:proofErr w:type="spellEnd"/>
+      <w:r>
+        <w:rPr>
+          <w:rFonts w:ascii="Times New Roman" w:hAnsi="Times New Roman" w:cs="Times New Roman"/>
+          <w:lang w:val="en-GB"/>
+        </w:rPr>
+        <w:t xml:space="preserve"> </w:t>
+      </w:r>
+      <w:proofErr w:type="spellStart"/>
+      <w:r>
+        <w:rPr>
+          <w:rFonts w:ascii="Times New Roman" w:hAnsi="Times New Roman" w:cs="Times New Roman"/>
+          <w:lang w:val="en-GB"/>
+        </w:rPr>
+        <w:t>versi</w:t>
+      </w:r>
+      <w:proofErr w:type="spellEnd"/>
+      <w:r>
+        <w:rPr>
+          <w:rFonts w:ascii="Times New Roman" w:hAnsi="Times New Roman" w:cs="Times New Roman"/>
+          <w:lang w:val="en-GB"/>
+        </w:rPr>
+        <w:t xml:space="preserve"> </w:t>
+      </w:r>
+      <w:proofErr w:type="spellStart"/>
+      <w:r>
+        <w:rPr>
+          <w:rFonts w:ascii="Times New Roman" w:hAnsi="Times New Roman" w:cs="Times New Roman"/>
+          <w:lang w:val="en-GB"/>
+        </w:rPr>
+        <w:t>terbaru</w:t>
+      </w:r>
+      <w:proofErr w:type="spellEnd"/>
+      <w:r>
+        <w:rPr>
+          <w:rFonts w:ascii="Times New Roman" w:hAnsi="Times New Roman" w:cs="Times New Roman"/>
+          <w:lang w:val="en-GB"/>
+        </w:rPr>
+        <w:t xml:space="preserve"> (7.x), </w:t>
+      </w:r>
+      <w:proofErr w:type="spellStart"/>
+      <w:r>
+        <w:rPr>
+          <w:rFonts w:ascii="Times New Roman" w:hAnsi="Times New Roman" w:cs="Times New Roman"/>
+          <w:lang w:val="en-GB"/>
+        </w:rPr>
+        <w:t>harus</w:t>
+      </w:r>
+      <w:proofErr w:type="spellEnd"/>
+      <w:r>
+        <w:rPr>
+          <w:rFonts w:ascii="Times New Roman" w:hAnsi="Times New Roman" w:cs="Times New Roman"/>
+          <w:lang w:val="en-GB"/>
+        </w:rPr>
+        <w:t xml:space="preserve"> </w:t>
+      </w:r>
+      <w:proofErr w:type="spellStart"/>
+      <w:r>
+        <w:rPr>
+          <w:rFonts w:ascii="Times New Roman" w:hAnsi="Times New Roman" w:cs="Times New Roman"/>
+          <w:lang w:val="en-GB"/>
+        </w:rPr>
+        <w:t>mengikuti</w:t>
+      </w:r>
+      <w:proofErr w:type="spellEnd"/>
+      <w:r>
+        <w:rPr>
+          <w:rFonts w:ascii="Times New Roman" w:hAnsi="Times New Roman" w:cs="Times New Roman"/>
+          <w:lang w:val="en-GB"/>
+        </w:rPr>
+        <w:t xml:space="preserve"> </w:t>
+      </w:r>
+      <w:proofErr w:type="spellStart"/>
+      <w:r>
+        <w:rPr>
+          <w:rFonts w:ascii="Times New Roman" w:hAnsi="Times New Roman" w:cs="Times New Roman"/>
+          <w:lang w:val="en-GB"/>
+        </w:rPr>
+        <w:t>aturan</w:t>
+      </w:r>
+      <w:proofErr w:type="spellEnd"/>
+      <w:r>
+        <w:rPr>
+          <w:rFonts w:ascii="Times New Roman" w:hAnsi="Times New Roman" w:cs="Times New Roman"/>
+          <w:lang w:val="en-GB"/>
+        </w:rPr>
+        <w:t xml:space="preserve"> </w:t>
+      </w:r>
+      <w:proofErr w:type="spellStart"/>
+      <w:r>
+        <w:rPr>
+          <w:rFonts w:ascii="Times New Roman" w:hAnsi="Times New Roman" w:cs="Times New Roman"/>
+          <w:lang w:val="en-GB"/>
+        </w:rPr>
+        <w:t>baru</w:t>
+      </w:r>
+      <w:proofErr w:type="spellEnd"/>
+      <w:r>
+        <w:rPr>
+          <w:rFonts w:ascii="Times New Roman" w:hAnsi="Times New Roman" w:cs="Times New Roman"/>
+          <w:lang w:val="en-GB"/>
+        </w:rPr>
+        <w:t xml:space="preserve"> </w:t>
+      </w:r>
+      <w:proofErr w:type="spellStart"/>
+      <w:r>
+        <w:rPr>
+          <w:rFonts w:ascii="Times New Roman" w:hAnsi="Times New Roman" w:cs="Times New Roman"/>
+          <w:lang w:val="en-GB"/>
+        </w:rPr>
+        <w:t>dengan</w:t>
+      </w:r>
+      <w:proofErr w:type="spellEnd"/>
+      <w:r>
+        <w:rPr>
+          <w:rFonts w:ascii="Times New Roman" w:hAnsi="Times New Roman" w:cs="Times New Roman"/>
+          <w:lang w:val="en-GB"/>
+        </w:rPr>
+        <w:t xml:space="preserve"> </w:t>
+      </w:r>
+      <w:proofErr w:type="spellStart"/>
+      <w:r>
+        <w:rPr>
+          <w:rFonts w:ascii="Times New Roman" w:hAnsi="Times New Roman" w:cs="Times New Roman"/>
+          <w:lang w:val="en-GB"/>
+        </w:rPr>
+        <w:t>memindahkan</w:t>
+      </w:r>
+      <w:proofErr w:type="spellEnd"/>
+      <w:r>
+        <w:rPr>
+          <w:rFonts w:ascii="Times New Roman" w:hAnsi="Times New Roman" w:cs="Times New Roman"/>
+          <w:lang w:val="en-GB"/>
+        </w:rPr>
+        <w:t xml:space="preserve"> </w:t>
+      </w:r>
+      <w:proofErr w:type="spellStart"/>
+      <w:r>
+        <w:rPr>
+          <w:rFonts w:ascii="Times New Roman" w:hAnsi="Times New Roman" w:cs="Times New Roman"/>
+          <w:lang w:val="en-GB"/>
+        </w:rPr>
+        <w:t>pengaturan</w:t>
+      </w:r>
+      <w:proofErr w:type="spellEnd"/>
+      <w:r>
+        <w:rPr>
+          <w:rFonts w:ascii="Times New Roman" w:hAnsi="Times New Roman" w:cs="Times New Roman"/>
+          <w:lang w:val="en-GB"/>
+        </w:rPr>
+        <w:t xml:space="preserve"> </w:t>
+      </w:r>
+      <w:proofErr w:type="spellStart"/>
+      <w:r>
+        <w:rPr>
+          <w:rFonts w:ascii="Times New Roman" w:hAnsi="Times New Roman" w:cs="Times New Roman"/>
+          <w:lang w:val="en-GB"/>
+        </w:rPr>
+        <w:t>koneksi</w:t>
+      </w:r>
+      <w:proofErr w:type="spellEnd"/>
+      <w:r>
+        <w:rPr>
+          <w:rFonts w:ascii="Times New Roman" w:hAnsi="Times New Roman" w:cs="Times New Roman"/>
+          <w:lang w:val="en-GB"/>
+        </w:rPr>
+        <w:t xml:space="preserve"> </w:t>
+      </w:r>
+      <w:proofErr w:type="spellStart"/>
+      <w:r>
+        <w:rPr>
+          <w:rFonts w:ascii="Times New Roman" w:hAnsi="Times New Roman" w:cs="Times New Roman"/>
+          <w:lang w:val="en-GB"/>
+        </w:rPr>
+        <w:t>ke</w:t>
+      </w:r>
+      <w:proofErr w:type="spellEnd"/>
+      <w:r>
+        <w:rPr>
+          <w:rFonts w:ascii="Times New Roman" w:hAnsi="Times New Roman" w:cs="Times New Roman"/>
+          <w:lang w:val="en-GB"/>
+        </w:rPr>
+        <w:t xml:space="preserve"> file </w:t>
+      </w:r>
+      <w:proofErr w:type="spellStart"/>
+      <w:r>
+        <w:rPr>
+          <w:rFonts w:ascii="Times New Roman" w:hAnsi="Times New Roman" w:cs="Times New Roman"/>
+          <w:lang w:val="en-GB"/>
+        </w:rPr>
+        <w:t>terpisah</w:t>
+      </w:r>
+      <w:proofErr w:type="spellEnd"/>
+      <w:r>
+        <w:rPr>
+          <w:rFonts w:ascii="Times New Roman" w:hAnsi="Times New Roman" w:cs="Times New Roman"/>
+          <w:lang w:val="en-GB"/>
+        </w:rPr>
+        <w:t>.</w:t>
+      </w:r>
+    </w:p>
+    <w:p>
+      <w:pPr>
+        <w:contextualSpacing/>
+        <w:jc w:val="both"/>
+        <w:rPr>
+          <w:rFonts w:ascii="Times New Roman" w:hAnsi="Times New Roman" w:cs="Times New Roman"/>
+          <w:lang w:val="en-GB"/>
+        </w:rPr>
+      </w:pPr>
     </w:p>
     <w:sectPr>
       <w:pgSz w:w="11906" w:h="16838"/>
@@ -6082,7 +7571,7 @@
   <w:abstractNum w:abstractNumId="0" w15:restartNumberingAfterBreak="0">
     <w:nsid w:val="359E1A57"/>
     <w:multiLevelType w:val="hybridMultilevel"/>
-    <w:tmpl w:val="403E0740"/>
+    <w:tmpl w:val="1B6C6A10"/>
     <w:lvl w:ilvl="0" w:tplc="38090001">
       <w:start w:val="1"/>
       <w:numFmt w:val="bullet"/>

</xml_diff>

<commit_message>
Perbaikan struktur folder kategori ke folder service
</commit_message>
<xml_diff>
--- a/dokumentasi/24382001P_Lorensius Firngadi_IF 23 E_Dokumentasi.docx
+++ b/dokumentasi/24382001P_Lorensius Firngadi_IF 23 E_Dokumentasi.docx
@@ -245,26 +245,9 @@
           <w:rFonts w:ascii="Times New Roman" w:hAnsi="Times New Roman" w:cs="Times New Roman"/>
           <w:lang w:val="en-GB"/>
         </w:rPr>
-        <w:t xml:space="preserve"> Octaviansyah</w:t>
-      </w:r>
-      <w:proofErr w:type="gramStart"/>
-      <w:r>
-        <w:rPr>
-          <w:rFonts w:ascii="Times New Roman" w:hAnsi="Times New Roman" w:cs="Times New Roman"/>
-          <w:lang w:val="en-GB"/>
-        </w:rPr>
-        <w:t>, ,</w:t>
-      </w:r>
-      <w:proofErr w:type="gramEnd"/>
-      <w:r>
-        <w:rPr>
-          <w:rFonts w:ascii="Times New Roman" w:hAnsi="Times New Roman" w:cs="Times New Roman"/>
-          <w:lang w:val="en-GB"/>
-        </w:rPr>
-        <w:t xml:space="preserve"> </w:t>
-      </w:r>
-      <w:proofErr w:type="spellStart"/>
-      <w:proofErr w:type="gramStart"/>
+        <w:t xml:space="preserve"> Octaviansyah, , </w:t>
+      </w:r>
+      <w:proofErr w:type="spellStart"/>
       <w:r>
         <w:rPr>
           <w:rFonts w:ascii="Times New Roman" w:hAnsi="Times New Roman" w:cs="Times New Roman"/>
@@ -273,7 +256,6 @@
         <w:t>S.Kom</w:t>
       </w:r>
       <w:proofErr w:type="spellEnd"/>
-      <w:proofErr w:type="gramEnd"/>
       <w:r>
         <w:rPr>
           <w:rFonts w:ascii="Times New Roman" w:hAnsi="Times New Roman" w:cs="Times New Roman"/>
@@ -282,7 +264,6 @@
         <w:t xml:space="preserve">., </w:t>
       </w:r>
       <w:proofErr w:type="spellStart"/>
-      <w:proofErr w:type="gramStart"/>
       <w:r>
         <w:rPr>
           <w:rFonts w:ascii="Times New Roman" w:hAnsi="Times New Roman" w:cs="Times New Roman"/>
@@ -291,7 +272,6 @@
         <w:t>M.Kom</w:t>
       </w:r>
       <w:proofErr w:type="spellEnd"/>
-      <w:proofErr w:type="gramEnd"/>
       <w:r>
         <w:rPr>
           <w:rFonts w:ascii="Times New Roman" w:hAnsi="Times New Roman" w:cs="Times New Roman"/>
@@ -686,23 +666,7 @@
           <w:rFonts w:ascii="Times New Roman" w:hAnsi="Times New Roman" w:cs="Times New Roman"/>
           <w:lang w:val="en-GB"/>
         </w:rPr>
-        <w:t xml:space="preserve">Nama </w:t>
-      </w:r>
-      <w:proofErr w:type="gramStart"/>
-      <w:r>
-        <w:rPr>
-          <w:rFonts w:ascii="Times New Roman" w:hAnsi="Times New Roman" w:cs="Times New Roman"/>
-          <w:lang w:val="en-GB"/>
-        </w:rPr>
-        <w:t>Project :</w:t>
-      </w:r>
-      <w:proofErr w:type="gramEnd"/>
-      <w:r>
-        <w:rPr>
-          <w:rFonts w:ascii="Times New Roman" w:hAnsi="Times New Roman" w:cs="Times New Roman"/>
-          <w:lang w:val="en-GB"/>
-        </w:rPr>
-        <w:t xml:space="preserve"> </w:t>
+        <w:t xml:space="preserve">Nama Project : </w:t>
       </w:r>
       <w:proofErr w:type="spellStart"/>
       <w:r>
@@ -757,17 +721,8 @@
           <w:rFonts w:ascii="Times New Roman" w:hAnsi="Times New Roman" w:cs="Times New Roman"/>
           <w:lang w:val="en-GB"/>
         </w:rPr>
-        <w:t xml:space="preserve"> </w:t>
-      </w:r>
-      <w:proofErr w:type="gramStart"/>
-      <w:r>
-        <w:rPr>
-          <w:rFonts w:ascii="Times New Roman" w:hAnsi="Times New Roman" w:cs="Times New Roman"/>
-          <w:lang w:val="en-GB"/>
-        </w:rPr>
-        <w:t>Project :</w:t>
-      </w:r>
-      <w:proofErr w:type="gramEnd"/>
+        <w:t xml:space="preserve"> Project :</w:t>
+      </w:r>
     </w:p>
     <w:p>
       <w:pPr>
@@ -955,7 +910,6 @@
         <w:t xml:space="preserve"> </w:t>
       </w:r>
       <w:proofErr w:type="spellStart"/>
-      <w:proofErr w:type="gramStart"/>
       <w:r>
         <w:rPr>
           <w:rFonts w:ascii="Times New Roman" w:hAnsi="Times New Roman" w:cs="Times New Roman"/>
@@ -969,15 +923,7 @@
           <w:rFonts w:ascii="Times New Roman" w:hAnsi="Times New Roman" w:cs="Times New Roman"/>
           <w:lang w:val="en-GB"/>
         </w:rPr>
-        <w:t xml:space="preserve"> :</w:t>
-      </w:r>
-      <w:proofErr w:type="gramEnd"/>
-      <w:r>
-        <w:rPr>
-          <w:rFonts w:ascii="Times New Roman" w:hAnsi="Times New Roman" w:cs="Times New Roman"/>
-          <w:lang w:val="en-GB"/>
-        </w:rPr>
-        <w:t xml:space="preserve"> </w:t>
+        <w:t xml:space="preserve"> : </w:t>
       </w:r>
       <w:proofErr w:type="spellStart"/>
       <w:r>
@@ -1998,9 +1944,9 @@
           <w:bCs/>
           <w:lang w:val="en-GB"/>
         </w:rPr>
-        <w:t xml:space="preserve"> </w:t>
-      </w:r>
-      <w:proofErr w:type="gramStart"/>
+        <w:t xml:space="preserve"> file .</w:t>
+      </w:r>
+      <w:proofErr w:type="spellStart"/>
       <w:r>
         <w:rPr>
           <w:rFonts w:ascii="Times New Roman" w:hAnsi="Times New Roman" w:cs="Times New Roman"/>
@@ -2008,20 +1954,9 @@
           <w:bCs/>
           <w:lang w:val="en-GB"/>
         </w:rPr>
-        <w:t>file .</w:t>
-      </w:r>
-      <w:proofErr w:type="spellStart"/>
-      <w:r>
-        <w:rPr>
-          <w:rFonts w:ascii="Times New Roman" w:hAnsi="Times New Roman" w:cs="Times New Roman"/>
-          <w:b/>
-          <w:bCs/>
-          <w:lang w:val="en-GB"/>
-        </w:rPr>
         <w:t>gitignore</w:t>
       </w:r>
       <w:proofErr w:type="spellEnd"/>
-      <w:proofErr w:type="gramEnd"/>
       <w:r>
         <w:rPr>
           <w:rFonts w:ascii="Times New Roman" w:hAnsi="Times New Roman" w:cs="Times New Roman"/>
@@ -2129,15 +2064,7 @@
           <w:rFonts w:ascii="Times New Roman" w:hAnsi="Times New Roman" w:cs="Times New Roman"/>
           <w:lang w:val="en-GB"/>
         </w:rPr>
-        <w:t xml:space="preserve"> </w:t>
-      </w:r>
-      <w:proofErr w:type="gramStart"/>
-      <w:r>
-        <w:rPr>
-          <w:rFonts w:ascii="Times New Roman" w:hAnsi="Times New Roman" w:cs="Times New Roman"/>
-          <w:lang w:val="en-GB"/>
-        </w:rPr>
-        <w:t>file .</w:t>
+        <w:t xml:space="preserve"> file .</w:t>
       </w:r>
       <w:proofErr w:type="spellStart"/>
       <w:r>
@@ -2148,7 +2075,6 @@
         <w:t>gitignore</w:t>
       </w:r>
       <w:proofErr w:type="spellEnd"/>
-      <w:proofErr w:type="gramEnd"/>
       <w:r>
         <w:rPr>
           <w:rFonts w:ascii="Times New Roman" w:hAnsi="Times New Roman" w:cs="Times New Roman"/>
@@ -2416,7 +2342,6 @@
           <w:lang w:val="en-GB"/>
         </w:rPr>
       </w:pPr>
-      <w:proofErr w:type="gramStart"/>
       <w:r>
         <w:rPr>
           <w:rFonts w:ascii="Times New Roman" w:hAnsi="Times New Roman" w:cs="Times New Roman"/>
@@ -2433,21 +2358,12 @@
         <w:t>gitignore</w:t>
       </w:r>
       <w:proofErr w:type="spellEnd"/>
-      <w:proofErr w:type="gramEnd"/>
-      <w:r>
-        <w:rPr>
-          <w:rFonts w:ascii="Times New Roman" w:hAnsi="Times New Roman" w:cs="Times New Roman"/>
-          <w:lang w:val="en-GB"/>
-        </w:rPr>
-        <w:t xml:space="preserve"> </w:t>
-      </w:r>
-      <w:proofErr w:type="gramStart"/>
-      <w:r>
-        <w:rPr>
-          <w:rFonts w:ascii="Times New Roman" w:hAnsi="Times New Roman" w:cs="Times New Roman"/>
-          <w:lang w:val="en-GB"/>
-        </w:rPr>
-        <w:t xml:space="preserve">sangat  </w:t>
+      <w:r>
+        <w:rPr>
+          <w:rFonts w:ascii="Times New Roman" w:hAnsi="Times New Roman" w:cs="Times New Roman"/>
+          <w:lang w:val="en-GB"/>
+        </w:rPr>
+        <w:t xml:space="preserve"> sangat  </w:t>
       </w:r>
       <w:proofErr w:type="spellStart"/>
       <w:r>
@@ -2458,7 +2374,6 @@
         <w:t>bermanfaat</w:t>
       </w:r>
       <w:proofErr w:type="spellEnd"/>
-      <w:proofErr w:type="gramEnd"/>
       <w:r>
         <w:rPr>
           <w:rFonts w:ascii="Times New Roman" w:hAnsi="Times New Roman" w:cs="Times New Roman"/>
@@ -2950,7 +2865,6 @@
         <w:t xml:space="preserve">Edit </w:t>
       </w:r>
       <w:proofErr w:type="spellStart"/>
-      <w:proofErr w:type="gramStart"/>
       <w:r>
         <w:rPr>
           <w:rFonts w:ascii="Times New Roman" w:hAnsi="Times New Roman" w:cs="Times New Roman"/>
@@ -2961,7 +2875,6 @@
         <w:t>tsconfig.json</w:t>
       </w:r>
       <w:proofErr w:type="spellEnd"/>
-      <w:proofErr w:type="gramEnd"/>
       <w:r>
         <w:rPr>
           <w:rFonts w:ascii="Times New Roman" w:hAnsi="Times New Roman" w:cs="Times New Roman"/>
@@ -3580,21 +3493,12 @@
         <w:t>seperti</w:t>
       </w:r>
       <w:proofErr w:type="spellEnd"/>
-      <w:proofErr w:type="gramStart"/>
-      <w:r>
-        <w:rPr>
-          <w:rFonts w:ascii="Times New Roman" w:hAnsi="Times New Roman" w:cs="Times New Roman"/>
-          <w:lang w:val="en-GB"/>
-        </w:rPr>
-        <w:t xml:space="preserve"> ../../..</w:t>
-      </w:r>
-      <w:proofErr w:type="gramEnd"/>
-      <w:r>
-        <w:rPr>
-          <w:rFonts w:ascii="Times New Roman" w:hAnsi="Times New Roman" w:cs="Times New Roman"/>
-          <w:lang w:val="en-GB"/>
-        </w:rPr>
-        <w:t xml:space="preserve">/folder/file, </w:t>
+      <w:r>
+        <w:rPr>
+          <w:rFonts w:ascii="Times New Roman" w:hAnsi="Times New Roman" w:cs="Times New Roman"/>
+          <w:lang w:val="en-GB"/>
+        </w:rPr>
+        <w:t xml:space="preserve"> ../../../folder/file, </w:t>
       </w:r>
       <w:proofErr w:type="spellStart"/>
       <w:r>
@@ -4872,7 +4776,6 @@
         <w:t xml:space="preserve">Update </w:t>
       </w:r>
       <w:proofErr w:type="spellStart"/>
-      <w:proofErr w:type="gramStart"/>
       <w:r>
         <w:rPr>
           <w:b/>
@@ -4881,7 +4784,6 @@
         <w:t>package.json</w:t>
       </w:r>
       <w:proofErr w:type="spellEnd"/>
-      <w:proofErr w:type="gramEnd"/>
       <w:r>
         <w:rPr>
           <w:b/>
@@ -7824,7 +7726,6 @@
         <w:t xml:space="preserve"> File </w:t>
       </w:r>
       <w:proofErr w:type="spellStart"/>
-      <w:proofErr w:type="gramStart"/>
       <w:r>
         <w:rPr>
           <w:rFonts w:ascii="Times New Roman" w:hAnsi="Times New Roman" w:cs="Times New Roman"/>
@@ -7832,17 +7733,7 @@
           <w:bCs/>
           <w:lang w:val="en-GB"/>
         </w:rPr>
-        <w:t>prisma.service</w:t>
-      </w:r>
-      <w:proofErr w:type="gramEnd"/>
-      <w:r>
-        <w:rPr>
-          <w:rFonts w:ascii="Times New Roman" w:hAnsi="Times New Roman" w:cs="Times New Roman"/>
-          <w:b/>
-          <w:bCs/>
-          <w:lang w:val="en-GB"/>
-        </w:rPr>
-        <w:t>.ts</w:t>
+        <w:t>prisma.service.ts</w:t>
       </w:r>
       <w:proofErr w:type="spellEnd"/>
     </w:p>
@@ -9264,23 +9155,7 @@
           <w:rFonts w:ascii="Times New Roman" w:hAnsi="Times New Roman" w:cs="Times New Roman"/>
           <w:lang w:val="en-GB"/>
         </w:rPr>
-        <w:t xml:space="preserve">  id: </w:t>
-      </w:r>
-      <w:proofErr w:type="gramStart"/>
-      <w:r>
-        <w:rPr>
-          <w:rFonts w:ascii="Times New Roman" w:hAnsi="Times New Roman" w:cs="Times New Roman"/>
-          <w:lang w:val="en-GB"/>
-        </w:rPr>
-        <w:t xml:space="preserve">string;   </w:t>
-      </w:r>
-      <w:proofErr w:type="gramEnd"/>
-      <w:r>
-        <w:rPr>
-          <w:rFonts w:ascii="Times New Roman" w:hAnsi="Times New Roman" w:cs="Times New Roman"/>
-          <w:lang w:val="en-GB"/>
-        </w:rPr>
-        <w:t xml:space="preserve">         # KTP/ID </w:t>
+        <w:t xml:space="preserve">  id: string;            # KTP/ID </w:t>
       </w:r>
       <w:proofErr w:type="spellStart"/>
       <w:r>
@@ -9361,23 +9236,7 @@
           <w:rFonts w:ascii="Times New Roman" w:hAnsi="Times New Roman" w:cs="Times New Roman"/>
           <w:lang w:val="en-GB"/>
         </w:rPr>
-        <w:t xml:space="preserve">  name: </w:t>
-      </w:r>
-      <w:proofErr w:type="gramStart"/>
-      <w:r>
-        <w:rPr>
-          <w:rFonts w:ascii="Times New Roman" w:hAnsi="Times New Roman" w:cs="Times New Roman"/>
-          <w:lang w:val="en-GB"/>
-        </w:rPr>
-        <w:t xml:space="preserve">string;   </w:t>
-      </w:r>
-      <w:proofErr w:type="gramEnd"/>
-      <w:r>
-        <w:rPr>
-          <w:rFonts w:ascii="Times New Roman" w:hAnsi="Times New Roman" w:cs="Times New Roman"/>
-          <w:lang w:val="en-GB"/>
-        </w:rPr>
-        <w:t xml:space="preserve">       # Nama </w:t>
+        <w:t xml:space="preserve">  name: string;          # Nama </w:t>
       </w:r>
       <w:proofErr w:type="spellStart"/>
       <w:r>
@@ -9442,23 +9301,7 @@
           <w:rFonts w:ascii="Times New Roman" w:hAnsi="Times New Roman" w:cs="Times New Roman"/>
           <w:lang w:val="en-GB"/>
         </w:rPr>
-        <w:t xml:space="preserve">  slug: </w:t>
-      </w:r>
-      <w:proofErr w:type="gramStart"/>
-      <w:r>
-        <w:rPr>
-          <w:rFonts w:ascii="Times New Roman" w:hAnsi="Times New Roman" w:cs="Times New Roman"/>
-          <w:lang w:val="en-GB"/>
-        </w:rPr>
-        <w:t xml:space="preserve">string;   </w:t>
-      </w:r>
-      <w:proofErr w:type="gramEnd"/>
-      <w:r>
-        <w:rPr>
-          <w:rFonts w:ascii="Times New Roman" w:hAnsi="Times New Roman" w:cs="Times New Roman"/>
-          <w:lang w:val="en-GB"/>
-        </w:rPr>
-        <w:t xml:space="preserve">       # Nama </w:t>
+        <w:t xml:space="preserve">  slug: string;          # Nama </w:t>
       </w:r>
       <w:proofErr w:type="spellStart"/>
       <w:r>
@@ -9555,96 +9398,598 @@
           <w:rFonts w:ascii="Times New Roman" w:hAnsi="Times New Roman" w:cs="Times New Roman"/>
           <w:lang w:val="en-GB"/>
         </w:rPr>
+        <w:t xml:space="preserve">  description?: string;  # </w:t>
+      </w:r>
+      <w:proofErr w:type="spellStart"/>
+      <w:r>
+        <w:rPr>
+          <w:rFonts w:ascii="Times New Roman" w:hAnsi="Times New Roman" w:cs="Times New Roman"/>
+          <w:lang w:val="en-GB"/>
+        </w:rPr>
+        <w:t>Penjelasan</w:t>
+      </w:r>
+      <w:proofErr w:type="spellEnd"/>
+      <w:r>
+        <w:rPr>
+          <w:rFonts w:ascii="Times New Roman" w:hAnsi="Times New Roman" w:cs="Times New Roman"/>
+          <w:lang w:val="en-GB"/>
+        </w:rPr>
+        <w:t xml:space="preserve"> </w:t>
+      </w:r>
+      <w:proofErr w:type="spellStart"/>
+      <w:r>
+        <w:rPr>
+          <w:rFonts w:ascii="Times New Roman" w:hAnsi="Times New Roman" w:cs="Times New Roman"/>
+          <w:lang w:val="en-GB"/>
+        </w:rPr>
+        <w:t>singkat</w:t>
+      </w:r>
+      <w:proofErr w:type="spellEnd"/>
+      <w:r>
+        <w:rPr>
+          <w:rFonts w:ascii="Times New Roman" w:hAnsi="Times New Roman" w:cs="Times New Roman"/>
+          <w:lang w:val="en-GB"/>
+        </w:rPr>
+        <w:t xml:space="preserve"> (</w:t>
+      </w:r>
+      <w:proofErr w:type="spellStart"/>
+      <w:r>
+        <w:rPr>
+          <w:rFonts w:ascii="Times New Roman" w:hAnsi="Times New Roman" w:cs="Times New Roman"/>
+          <w:lang w:val="en-GB"/>
+        </w:rPr>
+        <w:t>tanda</w:t>
+      </w:r>
+      <w:proofErr w:type="spellEnd"/>
+      <w:r>
+        <w:rPr>
+          <w:rFonts w:ascii="Times New Roman" w:hAnsi="Times New Roman" w:cs="Times New Roman"/>
+          <w:lang w:val="en-GB"/>
+        </w:rPr>
+        <w:t xml:space="preserve"> ? </w:t>
+      </w:r>
+      <w:proofErr w:type="spellStart"/>
+      <w:r>
+        <w:rPr>
+          <w:rFonts w:ascii="Times New Roman" w:hAnsi="Times New Roman" w:cs="Times New Roman"/>
+          <w:lang w:val="en-GB"/>
+        </w:rPr>
+        <w:t>artinya</w:t>
+      </w:r>
+      <w:proofErr w:type="spellEnd"/>
+      <w:r>
+        <w:rPr>
+          <w:rFonts w:ascii="Times New Roman" w:hAnsi="Times New Roman" w:cs="Times New Roman"/>
+          <w:lang w:val="en-GB"/>
+        </w:rPr>
+        <w:t xml:space="preserve"> </w:t>
+      </w:r>
+      <w:proofErr w:type="spellStart"/>
+      <w:r>
+        <w:rPr>
+          <w:rFonts w:ascii="Times New Roman" w:hAnsi="Times New Roman" w:cs="Times New Roman"/>
+          <w:lang w:val="en-GB"/>
+        </w:rPr>
+        <w:t>boleh</w:t>
+      </w:r>
+      <w:proofErr w:type="spellEnd"/>
+      <w:r>
+        <w:rPr>
+          <w:rFonts w:ascii="Times New Roman" w:hAnsi="Times New Roman" w:cs="Times New Roman"/>
+          <w:lang w:val="en-GB"/>
+        </w:rPr>
+        <w:t xml:space="preserve"> </w:t>
+      </w:r>
+      <w:proofErr w:type="spellStart"/>
+      <w:r>
+        <w:rPr>
+          <w:rFonts w:ascii="Times New Roman" w:hAnsi="Times New Roman" w:cs="Times New Roman"/>
+          <w:lang w:val="en-GB"/>
+        </w:rPr>
+        <w:t>kosong</w:t>
+      </w:r>
+      <w:proofErr w:type="spellEnd"/>
+      <w:r>
+        <w:rPr>
+          <w:rFonts w:ascii="Times New Roman" w:hAnsi="Times New Roman" w:cs="Times New Roman"/>
+          <w:lang w:val="en-GB"/>
+        </w:rPr>
+        <w:t>).</w:t>
+      </w:r>
+    </w:p>
+    <w:p>
+      <w:pPr>
+        <w:contextualSpacing/>
+        <w:jc w:val="both"/>
+        <w:rPr>
+          <w:rFonts w:ascii="Times New Roman" w:hAnsi="Times New Roman" w:cs="Times New Roman"/>
+          <w:lang w:val="en-GB"/>
+        </w:rPr>
+      </w:pPr>
+      <w:r>
+        <w:rPr>
+          <w:rFonts w:ascii="Times New Roman" w:hAnsi="Times New Roman" w:cs="Times New Roman"/>
+          <w:lang w:val="en-GB"/>
+        </w:rPr>
+        <w:t xml:space="preserve">  icon?: string;         # </w:t>
+      </w:r>
+      <w:proofErr w:type="spellStart"/>
+      <w:r>
+        <w:rPr>
+          <w:rFonts w:ascii="Times New Roman" w:hAnsi="Times New Roman" w:cs="Times New Roman"/>
+          <w:lang w:val="en-GB"/>
+        </w:rPr>
+        <w:t>Simbol</w:t>
+      </w:r>
+      <w:proofErr w:type="spellEnd"/>
+      <w:r>
+        <w:rPr>
+          <w:rFonts w:ascii="Times New Roman" w:hAnsi="Times New Roman" w:cs="Times New Roman"/>
+          <w:lang w:val="en-GB"/>
+        </w:rPr>
+        <w:t xml:space="preserve"> </w:t>
+      </w:r>
+      <w:proofErr w:type="spellStart"/>
+      <w:r>
+        <w:rPr>
+          <w:rFonts w:ascii="Times New Roman" w:hAnsi="Times New Roman" w:cs="Times New Roman"/>
+          <w:lang w:val="en-GB"/>
+        </w:rPr>
+        <w:t>atau</w:t>
+      </w:r>
+      <w:proofErr w:type="spellEnd"/>
+      <w:r>
+        <w:rPr>
+          <w:rFonts w:ascii="Times New Roman" w:hAnsi="Times New Roman" w:cs="Times New Roman"/>
+          <w:lang w:val="en-GB"/>
+        </w:rPr>
+        <w:t xml:space="preserve"> </w:t>
+      </w:r>
+      <w:proofErr w:type="spellStart"/>
+      <w:r>
+        <w:rPr>
+          <w:rFonts w:ascii="Times New Roman" w:hAnsi="Times New Roman" w:cs="Times New Roman"/>
+          <w:lang w:val="en-GB"/>
+        </w:rPr>
+        <w:t>gambar</w:t>
+      </w:r>
+      <w:proofErr w:type="spellEnd"/>
+      <w:r>
+        <w:rPr>
+          <w:rFonts w:ascii="Times New Roman" w:hAnsi="Times New Roman" w:cs="Times New Roman"/>
+          <w:lang w:val="en-GB"/>
+        </w:rPr>
+        <w:t xml:space="preserve"> </w:t>
+      </w:r>
+      <w:proofErr w:type="spellStart"/>
+      <w:r>
+        <w:rPr>
+          <w:rFonts w:ascii="Times New Roman" w:hAnsi="Times New Roman" w:cs="Times New Roman"/>
+          <w:lang w:val="en-GB"/>
+        </w:rPr>
+        <w:t>kecil</w:t>
+      </w:r>
+      <w:proofErr w:type="spellEnd"/>
+      <w:r>
+        <w:rPr>
+          <w:rFonts w:ascii="Times New Roman" w:hAnsi="Times New Roman" w:cs="Times New Roman"/>
+          <w:lang w:val="en-GB"/>
+        </w:rPr>
+        <w:t xml:space="preserve"> </w:t>
+      </w:r>
+      <w:proofErr w:type="spellStart"/>
+      <w:r>
+        <w:rPr>
+          <w:rFonts w:ascii="Times New Roman" w:hAnsi="Times New Roman" w:cs="Times New Roman"/>
+          <w:lang w:val="en-GB"/>
+        </w:rPr>
+        <w:t>untuk</w:t>
+      </w:r>
+      <w:proofErr w:type="spellEnd"/>
+      <w:r>
+        <w:rPr>
+          <w:rFonts w:ascii="Times New Roman" w:hAnsi="Times New Roman" w:cs="Times New Roman"/>
+          <w:lang w:val="en-GB"/>
+        </w:rPr>
+        <w:t xml:space="preserve"> </w:t>
+      </w:r>
+      <w:proofErr w:type="spellStart"/>
+      <w:r>
+        <w:rPr>
+          <w:rFonts w:ascii="Times New Roman" w:hAnsi="Times New Roman" w:cs="Times New Roman"/>
+          <w:lang w:val="en-GB"/>
+        </w:rPr>
+        <w:t>kategori</w:t>
+      </w:r>
+      <w:proofErr w:type="spellEnd"/>
+      <w:r>
+        <w:rPr>
+          <w:rFonts w:ascii="Times New Roman" w:hAnsi="Times New Roman" w:cs="Times New Roman"/>
+          <w:lang w:val="en-GB"/>
+        </w:rPr>
+        <w:t>.</w:t>
+      </w:r>
+    </w:p>
+    <w:p>
+      <w:pPr>
+        <w:contextualSpacing/>
+        <w:jc w:val="both"/>
+        <w:rPr>
+          <w:rFonts w:ascii="Times New Roman" w:hAnsi="Times New Roman" w:cs="Times New Roman"/>
+          <w:lang w:val="en-GB"/>
+        </w:rPr>
+      </w:pPr>
+      <w:r>
+        <w:rPr>
+          <w:rFonts w:ascii="Times New Roman" w:hAnsi="Times New Roman" w:cs="Times New Roman"/>
+          <w:lang w:val="en-GB"/>
+        </w:rPr>
         <w:t xml:space="preserve">  </w:t>
       </w:r>
-      <w:proofErr w:type="gramStart"/>
-      <w:r>
-        <w:rPr>
-          <w:rFonts w:ascii="Times New Roman" w:hAnsi="Times New Roman" w:cs="Times New Roman"/>
-          <w:lang w:val="en-GB"/>
-        </w:rPr>
-        <w:t>description?:</w:t>
-      </w:r>
-      <w:proofErr w:type="gramEnd"/>
-      <w:r>
-        <w:rPr>
-          <w:rFonts w:ascii="Times New Roman" w:hAnsi="Times New Roman" w:cs="Times New Roman"/>
-          <w:lang w:val="en-GB"/>
-        </w:rPr>
-        <w:t xml:space="preserve"> </w:t>
-      </w:r>
-      <w:proofErr w:type="gramStart"/>
-      <w:r>
-        <w:rPr>
-          <w:rFonts w:ascii="Times New Roman" w:hAnsi="Times New Roman" w:cs="Times New Roman"/>
-          <w:lang w:val="en-GB"/>
-        </w:rPr>
-        <w:t>string;  #</w:t>
-      </w:r>
-      <w:proofErr w:type="gramEnd"/>
-      <w:r>
-        <w:rPr>
-          <w:rFonts w:ascii="Times New Roman" w:hAnsi="Times New Roman" w:cs="Times New Roman"/>
-          <w:lang w:val="en-GB"/>
-        </w:rPr>
-        <w:t xml:space="preserve"> </w:t>
-      </w:r>
-      <w:proofErr w:type="spellStart"/>
-      <w:r>
-        <w:rPr>
-          <w:rFonts w:ascii="Times New Roman" w:hAnsi="Times New Roman" w:cs="Times New Roman"/>
-          <w:lang w:val="en-GB"/>
-        </w:rPr>
-        <w:t>Penjelasan</w:t>
-      </w:r>
-      <w:proofErr w:type="spellEnd"/>
-      <w:r>
-        <w:rPr>
-          <w:rFonts w:ascii="Times New Roman" w:hAnsi="Times New Roman" w:cs="Times New Roman"/>
-          <w:lang w:val="en-GB"/>
-        </w:rPr>
-        <w:t xml:space="preserve"> </w:t>
-      </w:r>
-      <w:proofErr w:type="spellStart"/>
-      <w:r>
-        <w:rPr>
-          <w:rFonts w:ascii="Times New Roman" w:hAnsi="Times New Roman" w:cs="Times New Roman"/>
-          <w:lang w:val="en-GB"/>
-        </w:rPr>
-        <w:t>singkat</w:t>
-      </w:r>
-      <w:proofErr w:type="spellEnd"/>
-      <w:r>
-        <w:rPr>
-          <w:rFonts w:ascii="Times New Roman" w:hAnsi="Times New Roman" w:cs="Times New Roman"/>
-          <w:lang w:val="en-GB"/>
-        </w:rPr>
-        <w:t xml:space="preserve"> (</w:t>
-      </w:r>
-      <w:proofErr w:type="spellStart"/>
-      <w:proofErr w:type="gramStart"/>
-      <w:r>
-        <w:rPr>
-          <w:rFonts w:ascii="Times New Roman" w:hAnsi="Times New Roman" w:cs="Times New Roman"/>
-          <w:lang w:val="en-GB"/>
-        </w:rPr>
-        <w:t>tanda</w:t>
-      </w:r>
-      <w:proofErr w:type="spellEnd"/>
-      <w:r>
-        <w:rPr>
-          <w:rFonts w:ascii="Times New Roman" w:hAnsi="Times New Roman" w:cs="Times New Roman"/>
-          <w:lang w:val="en-GB"/>
-        </w:rPr>
-        <w:t xml:space="preserve"> ?</w:t>
-      </w:r>
-      <w:proofErr w:type="gramEnd"/>
-      <w:r>
-        <w:rPr>
-          <w:rFonts w:ascii="Times New Roman" w:hAnsi="Times New Roman" w:cs="Times New Roman"/>
-          <w:lang w:val="en-GB"/>
-        </w:rPr>
-        <w:t xml:space="preserve"> </w:t>
+      <w:proofErr w:type="spellStart"/>
+      <w:r>
+        <w:rPr>
+          <w:rFonts w:ascii="Times New Roman" w:hAnsi="Times New Roman" w:cs="Times New Roman"/>
+          <w:lang w:val="en-GB"/>
+        </w:rPr>
+        <w:t>createdAt</w:t>
+      </w:r>
+      <w:proofErr w:type="spellEnd"/>
+      <w:r>
+        <w:rPr>
+          <w:rFonts w:ascii="Times New Roman" w:hAnsi="Times New Roman" w:cs="Times New Roman"/>
+          <w:lang w:val="en-GB"/>
+        </w:rPr>
+        <w:t xml:space="preserve">: Date;       # </w:t>
+      </w:r>
+      <w:proofErr w:type="spellStart"/>
+      <w:r>
+        <w:rPr>
+          <w:rFonts w:ascii="Times New Roman" w:hAnsi="Times New Roman" w:cs="Times New Roman"/>
+          <w:lang w:val="en-GB"/>
+        </w:rPr>
+        <w:t>Catatan</w:t>
+      </w:r>
+      <w:proofErr w:type="spellEnd"/>
+      <w:r>
+        <w:rPr>
+          <w:rFonts w:ascii="Times New Roman" w:hAnsi="Times New Roman" w:cs="Times New Roman"/>
+          <w:lang w:val="en-GB"/>
+        </w:rPr>
+        <w:t xml:space="preserve"> </w:t>
+      </w:r>
+      <w:proofErr w:type="spellStart"/>
+      <w:r>
+        <w:rPr>
+          <w:rFonts w:ascii="Times New Roman" w:hAnsi="Times New Roman" w:cs="Times New Roman"/>
+          <w:lang w:val="en-GB"/>
+        </w:rPr>
+        <w:t>waktu</w:t>
+      </w:r>
+      <w:proofErr w:type="spellEnd"/>
+      <w:r>
+        <w:rPr>
+          <w:rFonts w:ascii="Times New Roman" w:hAnsi="Times New Roman" w:cs="Times New Roman"/>
+          <w:lang w:val="en-GB"/>
+        </w:rPr>
+        <w:t xml:space="preserve"> </w:t>
+      </w:r>
+      <w:proofErr w:type="spellStart"/>
+      <w:r>
+        <w:rPr>
+          <w:rFonts w:ascii="Times New Roman" w:hAnsi="Times New Roman" w:cs="Times New Roman"/>
+          <w:lang w:val="en-GB"/>
+        </w:rPr>
+        <w:t>kapan</w:t>
+      </w:r>
+      <w:proofErr w:type="spellEnd"/>
+      <w:r>
+        <w:rPr>
+          <w:rFonts w:ascii="Times New Roman" w:hAnsi="Times New Roman" w:cs="Times New Roman"/>
+          <w:lang w:val="en-GB"/>
+        </w:rPr>
+        <w:t xml:space="preserve"> </w:t>
+      </w:r>
+      <w:proofErr w:type="spellStart"/>
+      <w:r>
+        <w:rPr>
+          <w:rFonts w:ascii="Times New Roman" w:hAnsi="Times New Roman" w:cs="Times New Roman"/>
+          <w:lang w:val="en-GB"/>
+        </w:rPr>
+        <w:t>kategori</w:t>
+      </w:r>
+      <w:proofErr w:type="spellEnd"/>
+      <w:r>
+        <w:rPr>
+          <w:rFonts w:ascii="Times New Roman" w:hAnsi="Times New Roman" w:cs="Times New Roman"/>
+          <w:lang w:val="en-GB"/>
+        </w:rPr>
+        <w:t xml:space="preserve"> </w:t>
+      </w:r>
+      <w:proofErr w:type="spellStart"/>
+      <w:r>
+        <w:rPr>
+          <w:rFonts w:ascii="Times New Roman" w:hAnsi="Times New Roman" w:cs="Times New Roman"/>
+          <w:lang w:val="en-GB"/>
+        </w:rPr>
+        <w:t>ini</w:t>
+      </w:r>
+      <w:proofErr w:type="spellEnd"/>
+      <w:r>
+        <w:rPr>
+          <w:rFonts w:ascii="Times New Roman" w:hAnsi="Times New Roman" w:cs="Times New Roman"/>
+          <w:lang w:val="en-GB"/>
+        </w:rPr>
+        <w:t xml:space="preserve"> </w:t>
+      </w:r>
+      <w:proofErr w:type="spellStart"/>
+      <w:r>
+        <w:rPr>
+          <w:rFonts w:ascii="Times New Roman" w:hAnsi="Times New Roman" w:cs="Times New Roman"/>
+          <w:lang w:val="en-GB"/>
+        </w:rPr>
+        <w:t>dibuat</w:t>
+      </w:r>
+      <w:proofErr w:type="spellEnd"/>
+      <w:r>
+        <w:rPr>
+          <w:rFonts w:ascii="Times New Roman" w:hAnsi="Times New Roman" w:cs="Times New Roman"/>
+          <w:lang w:val="en-GB"/>
+        </w:rPr>
+        <w:t>.</w:t>
+      </w:r>
+    </w:p>
+    <w:p>
+      <w:pPr>
+        <w:contextualSpacing/>
+        <w:jc w:val="both"/>
+        <w:rPr>
+          <w:rFonts w:ascii="Times New Roman" w:hAnsi="Times New Roman" w:cs="Times New Roman"/>
+          <w:lang w:val="en-GB"/>
+        </w:rPr>
+      </w:pPr>
+      <w:r>
+        <w:rPr>
+          <w:rFonts w:ascii="Times New Roman" w:hAnsi="Times New Roman" w:cs="Times New Roman"/>
+          <w:lang w:val="en-GB"/>
+        </w:rPr>
+        <w:t xml:space="preserve">  </w:t>
+      </w:r>
+      <w:proofErr w:type="spellStart"/>
+      <w:r>
+        <w:rPr>
+          <w:rFonts w:ascii="Times New Roman" w:hAnsi="Times New Roman" w:cs="Times New Roman"/>
+          <w:lang w:val="en-GB"/>
+        </w:rPr>
+        <w:t>updatedAt</w:t>
+      </w:r>
+      <w:proofErr w:type="spellEnd"/>
+      <w:r>
+        <w:rPr>
+          <w:rFonts w:ascii="Times New Roman" w:hAnsi="Times New Roman" w:cs="Times New Roman"/>
+          <w:lang w:val="en-GB"/>
+        </w:rPr>
+        <w:t xml:space="preserve">: Date;       # </w:t>
+      </w:r>
+      <w:proofErr w:type="spellStart"/>
+      <w:r>
+        <w:rPr>
+          <w:rFonts w:ascii="Times New Roman" w:hAnsi="Times New Roman" w:cs="Times New Roman"/>
+          <w:lang w:val="en-GB"/>
+        </w:rPr>
+        <w:t>Catatan</w:t>
+      </w:r>
+      <w:proofErr w:type="spellEnd"/>
+      <w:r>
+        <w:rPr>
+          <w:rFonts w:ascii="Times New Roman" w:hAnsi="Times New Roman" w:cs="Times New Roman"/>
+          <w:lang w:val="en-GB"/>
+        </w:rPr>
+        <w:t xml:space="preserve"> </w:t>
+      </w:r>
+      <w:proofErr w:type="spellStart"/>
+      <w:r>
+        <w:rPr>
+          <w:rFonts w:ascii="Times New Roman" w:hAnsi="Times New Roman" w:cs="Times New Roman"/>
+          <w:lang w:val="en-GB"/>
+        </w:rPr>
+        <w:t>waktu</w:t>
+      </w:r>
+      <w:proofErr w:type="spellEnd"/>
+      <w:r>
+        <w:rPr>
+          <w:rFonts w:ascii="Times New Roman" w:hAnsi="Times New Roman" w:cs="Times New Roman"/>
+          <w:lang w:val="en-GB"/>
+        </w:rPr>
+        <w:t xml:space="preserve"> </w:t>
+      </w:r>
+      <w:proofErr w:type="spellStart"/>
+      <w:r>
+        <w:rPr>
+          <w:rFonts w:ascii="Times New Roman" w:hAnsi="Times New Roman" w:cs="Times New Roman"/>
+          <w:lang w:val="en-GB"/>
+        </w:rPr>
+        <w:t>kapan</w:t>
+      </w:r>
+      <w:proofErr w:type="spellEnd"/>
+      <w:r>
+        <w:rPr>
+          <w:rFonts w:ascii="Times New Roman" w:hAnsi="Times New Roman" w:cs="Times New Roman"/>
+          <w:lang w:val="en-GB"/>
+        </w:rPr>
+        <w:t xml:space="preserve"> </w:t>
+      </w:r>
+      <w:proofErr w:type="spellStart"/>
+      <w:r>
+        <w:rPr>
+          <w:rFonts w:ascii="Times New Roman" w:hAnsi="Times New Roman" w:cs="Times New Roman"/>
+          <w:lang w:val="en-GB"/>
+        </w:rPr>
+        <w:t>terakhir</w:t>
+      </w:r>
+      <w:proofErr w:type="spellEnd"/>
+      <w:r>
+        <w:rPr>
+          <w:rFonts w:ascii="Times New Roman" w:hAnsi="Times New Roman" w:cs="Times New Roman"/>
+          <w:lang w:val="en-GB"/>
+        </w:rPr>
+        <w:t xml:space="preserve"> kali data </w:t>
+      </w:r>
+      <w:proofErr w:type="spellStart"/>
+      <w:r>
+        <w:rPr>
+          <w:rFonts w:ascii="Times New Roman" w:hAnsi="Times New Roman" w:cs="Times New Roman"/>
+          <w:lang w:val="en-GB"/>
+        </w:rPr>
+        <w:t>diubah</w:t>
+      </w:r>
+      <w:proofErr w:type="spellEnd"/>
+      <w:r>
+        <w:rPr>
+          <w:rFonts w:ascii="Times New Roman" w:hAnsi="Times New Roman" w:cs="Times New Roman"/>
+          <w:lang w:val="en-GB"/>
+        </w:rPr>
+        <w:t>.</w:t>
+      </w:r>
+    </w:p>
+    <w:p>
+      <w:pPr>
+        <w:contextualSpacing/>
+        <w:jc w:val="both"/>
+        <w:rPr>
+          <w:rFonts w:ascii="Times New Roman" w:hAnsi="Times New Roman" w:cs="Times New Roman"/>
+          <w:lang w:val="en-GB"/>
+        </w:rPr>
+      </w:pPr>
+    </w:p>
+    <w:p>
+      <w:pPr>
+        <w:contextualSpacing/>
+        <w:jc w:val="both"/>
+        <w:rPr>
+          <w:rFonts w:ascii="Times New Roman" w:hAnsi="Times New Roman" w:cs="Times New Roman"/>
+          <w:lang w:val="en-GB"/>
+        </w:rPr>
+      </w:pPr>
+      <w:r>
+        <w:rPr>
+          <w:rFonts w:ascii="Times New Roman" w:hAnsi="Times New Roman" w:cs="Times New Roman"/>
+          <w:lang w:val="en-GB"/>
+        </w:rPr>
+        <w:t xml:space="preserve">  # Constructor </w:t>
+      </w:r>
+      <w:proofErr w:type="spellStart"/>
+      <w:r>
+        <w:rPr>
+          <w:rFonts w:ascii="Times New Roman" w:hAnsi="Times New Roman" w:cs="Times New Roman"/>
+          <w:lang w:val="en-GB"/>
+        </w:rPr>
+        <w:t>adalah</w:t>
+      </w:r>
+      <w:proofErr w:type="spellEnd"/>
+      <w:r>
+        <w:rPr>
+          <w:rFonts w:ascii="Times New Roman" w:hAnsi="Times New Roman" w:cs="Times New Roman"/>
+          <w:lang w:val="en-GB"/>
+        </w:rPr>
+        <w:t xml:space="preserve"> </w:t>
+      </w:r>
+      <w:proofErr w:type="spellStart"/>
+      <w:r>
+        <w:rPr>
+          <w:rFonts w:ascii="Times New Roman" w:hAnsi="Times New Roman" w:cs="Times New Roman"/>
+          <w:lang w:val="en-GB"/>
+        </w:rPr>
+        <w:t>mesin</w:t>
+      </w:r>
+      <w:proofErr w:type="spellEnd"/>
+      <w:r>
+        <w:rPr>
+          <w:rFonts w:ascii="Times New Roman" w:hAnsi="Times New Roman" w:cs="Times New Roman"/>
+          <w:lang w:val="en-GB"/>
+        </w:rPr>
+        <w:t xml:space="preserve"> </w:t>
+      </w:r>
+      <w:proofErr w:type="spellStart"/>
+      <w:r>
+        <w:rPr>
+          <w:rFonts w:ascii="Times New Roman" w:hAnsi="Times New Roman" w:cs="Times New Roman"/>
+          <w:lang w:val="en-GB"/>
+        </w:rPr>
+        <w:t>pembuat</w:t>
+      </w:r>
+      <w:proofErr w:type="spellEnd"/>
+      <w:r>
+        <w:rPr>
+          <w:rFonts w:ascii="Times New Roman" w:hAnsi="Times New Roman" w:cs="Times New Roman"/>
+          <w:lang w:val="en-GB"/>
+        </w:rPr>
+        <w:t xml:space="preserve"> </w:t>
+      </w:r>
+      <w:proofErr w:type="spellStart"/>
+      <w:r>
+        <w:rPr>
+          <w:rFonts w:ascii="Times New Roman" w:hAnsi="Times New Roman" w:cs="Times New Roman"/>
+          <w:lang w:val="en-GB"/>
+        </w:rPr>
+        <w:t>objek</w:t>
+      </w:r>
+      <w:proofErr w:type="spellEnd"/>
+      <w:r>
+        <w:rPr>
+          <w:rFonts w:ascii="Times New Roman" w:hAnsi="Times New Roman" w:cs="Times New Roman"/>
+          <w:lang w:val="en-GB"/>
+        </w:rPr>
+        <w:t xml:space="preserve"> </w:t>
+      </w:r>
+      <w:proofErr w:type="spellStart"/>
+      <w:r>
+        <w:rPr>
+          <w:rFonts w:ascii="Times New Roman" w:hAnsi="Times New Roman" w:cs="Times New Roman"/>
+          <w:lang w:val="en-GB"/>
+        </w:rPr>
+        <w:t>otomatis</w:t>
+      </w:r>
+      <w:proofErr w:type="spellEnd"/>
+      <w:r>
+        <w:rPr>
+          <w:rFonts w:ascii="Times New Roman" w:hAnsi="Times New Roman" w:cs="Times New Roman"/>
+          <w:lang w:val="en-GB"/>
+        </w:rPr>
+        <w:t>.</w:t>
+      </w:r>
+    </w:p>
+    <w:p>
+      <w:pPr>
+        <w:contextualSpacing/>
+        <w:jc w:val="both"/>
+        <w:rPr>
+          <w:rFonts w:ascii="Times New Roman" w:hAnsi="Times New Roman" w:cs="Times New Roman"/>
+          <w:lang w:val="en-GB"/>
+        </w:rPr>
+      </w:pPr>
+      <w:r>
+        <w:rPr>
+          <w:rFonts w:ascii="Times New Roman" w:hAnsi="Times New Roman" w:cs="Times New Roman"/>
+          <w:lang w:val="en-GB"/>
+        </w:rPr>
+        <w:t xml:space="preserve">  # Partial&lt;</w:t>
+      </w:r>
+      <w:proofErr w:type="spellStart"/>
+      <w:r>
+        <w:rPr>
+          <w:rFonts w:ascii="Times New Roman" w:hAnsi="Times New Roman" w:cs="Times New Roman"/>
+          <w:lang w:val="en-GB"/>
+        </w:rPr>
+        <w:t>KategoriEntity</w:t>
+      </w:r>
+      <w:proofErr w:type="spellEnd"/>
+      <w:r>
+        <w:rPr>
+          <w:rFonts w:ascii="Times New Roman" w:hAnsi="Times New Roman" w:cs="Times New Roman"/>
+          <w:lang w:val="en-GB"/>
+        </w:rPr>
+        <w:t xml:space="preserve">&gt; </w:t>
       </w:r>
       <w:proofErr w:type="spellStart"/>
       <w:r>
@@ -9668,31 +10013,95 @@
           <w:rFonts w:ascii="Times New Roman" w:hAnsi="Times New Roman" w:cs="Times New Roman"/>
           <w:lang w:val="en-GB"/>
         </w:rPr>
-        <w:t>boleh</w:t>
-      </w:r>
-      <w:proofErr w:type="spellEnd"/>
-      <w:r>
-        <w:rPr>
-          <w:rFonts w:ascii="Times New Roman" w:hAnsi="Times New Roman" w:cs="Times New Roman"/>
-          <w:lang w:val="en-GB"/>
-        </w:rPr>
-        <w:t xml:space="preserve"> </w:t>
-      </w:r>
-      <w:proofErr w:type="spellStart"/>
-      <w:r>
-        <w:rPr>
-          <w:rFonts w:ascii="Times New Roman" w:hAnsi="Times New Roman" w:cs="Times New Roman"/>
-          <w:lang w:val="en-GB"/>
-        </w:rPr>
-        <w:t>kosong</w:t>
-      </w:r>
-      <w:proofErr w:type="spellEnd"/>
-      <w:r>
-        <w:rPr>
-          <w:rFonts w:ascii="Times New Roman" w:hAnsi="Times New Roman" w:cs="Times New Roman"/>
-          <w:lang w:val="en-GB"/>
-        </w:rPr>
-        <w:t>).</w:t>
+        <w:t>kita</w:t>
+      </w:r>
+      <w:proofErr w:type="spellEnd"/>
+      <w:r>
+        <w:rPr>
+          <w:rFonts w:ascii="Times New Roman" w:hAnsi="Times New Roman" w:cs="Times New Roman"/>
+          <w:lang w:val="en-GB"/>
+        </w:rPr>
+        <w:t xml:space="preserve"> </w:t>
+      </w:r>
+      <w:proofErr w:type="spellStart"/>
+      <w:r>
+        <w:rPr>
+          <w:rFonts w:ascii="Times New Roman" w:hAnsi="Times New Roman" w:cs="Times New Roman"/>
+          <w:lang w:val="en-GB"/>
+        </w:rPr>
+        <w:t>bisa</w:t>
+      </w:r>
+      <w:proofErr w:type="spellEnd"/>
+      <w:r>
+        <w:rPr>
+          <w:rFonts w:ascii="Times New Roman" w:hAnsi="Times New Roman" w:cs="Times New Roman"/>
+          <w:lang w:val="en-GB"/>
+        </w:rPr>
+        <w:t xml:space="preserve"> </w:t>
+      </w:r>
+      <w:proofErr w:type="spellStart"/>
+      <w:r>
+        <w:rPr>
+          <w:rFonts w:ascii="Times New Roman" w:hAnsi="Times New Roman" w:cs="Times New Roman"/>
+          <w:lang w:val="en-GB"/>
+        </w:rPr>
+        <w:t>memasukkan</w:t>
+      </w:r>
+      <w:proofErr w:type="spellEnd"/>
+      <w:r>
+        <w:rPr>
+          <w:rFonts w:ascii="Times New Roman" w:hAnsi="Times New Roman" w:cs="Times New Roman"/>
+          <w:lang w:val="en-GB"/>
+        </w:rPr>
+        <w:t xml:space="preserve"> data </w:t>
+      </w:r>
+      <w:proofErr w:type="spellStart"/>
+      <w:r>
+        <w:rPr>
+          <w:rFonts w:ascii="Times New Roman" w:hAnsi="Times New Roman" w:cs="Times New Roman"/>
+          <w:lang w:val="en-GB"/>
+        </w:rPr>
+        <w:t>meskipun</w:t>
+      </w:r>
+      <w:proofErr w:type="spellEnd"/>
+      <w:r>
+        <w:rPr>
+          <w:rFonts w:ascii="Times New Roman" w:hAnsi="Times New Roman" w:cs="Times New Roman"/>
+          <w:lang w:val="en-GB"/>
+        </w:rPr>
+        <w:t xml:space="preserve"> </w:t>
+      </w:r>
+      <w:proofErr w:type="spellStart"/>
+      <w:r>
+        <w:rPr>
+          <w:rFonts w:ascii="Times New Roman" w:hAnsi="Times New Roman" w:cs="Times New Roman"/>
+          <w:lang w:val="en-GB"/>
+        </w:rPr>
+        <w:t>tidak</w:t>
+      </w:r>
+      <w:proofErr w:type="spellEnd"/>
+      <w:r>
+        <w:rPr>
+          <w:rFonts w:ascii="Times New Roman" w:hAnsi="Times New Roman" w:cs="Times New Roman"/>
+          <w:lang w:val="en-GB"/>
+        </w:rPr>
+        <w:t xml:space="preserve"> </w:t>
+      </w:r>
+      <w:proofErr w:type="spellStart"/>
+      <w:r>
+        <w:rPr>
+          <w:rFonts w:ascii="Times New Roman" w:hAnsi="Times New Roman" w:cs="Times New Roman"/>
+          <w:lang w:val="en-GB"/>
+        </w:rPr>
+        <w:t>lengkap</w:t>
+      </w:r>
+      <w:proofErr w:type="spellEnd"/>
+      <w:r>
+        <w:rPr>
+          <w:rFonts w:ascii="Times New Roman" w:hAnsi="Times New Roman" w:cs="Times New Roman"/>
+          <w:lang w:val="en-GB"/>
+        </w:rPr>
+        <w:t>.</w:t>
       </w:r>
     </w:p>
     <w:p>
@@ -9709,55 +10118,104 @@
           <w:rFonts w:ascii="Times New Roman" w:hAnsi="Times New Roman" w:cs="Times New Roman"/>
           <w:lang w:val="en-GB"/>
         </w:rPr>
-        <w:t xml:space="preserve">  </w:t>
-      </w:r>
-      <w:proofErr w:type="gramStart"/>
-      <w:r>
-        <w:rPr>
-          <w:rFonts w:ascii="Times New Roman" w:hAnsi="Times New Roman" w:cs="Times New Roman"/>
-          <w:lang w:val="en-GB"/>
-        </w:rPr>
-        <w:t>icon?:</w:t>
-      </w:r>
-      <w:proofErr w:type="gramEnd"/>
-      <w:r>
-        <w:rPr>
-          <w:rFonts w:ascii="Times New Roman" w:hAnsi="Times New Roman" w:cs="Times New Roman"/>
-          <w:lang w:val="en-GB"/>
-        </w:rPr>
-        <w:t xml:space="preserve"> </w:t>
-      </w:r>
-      <w:proofErr w:type="gramStart"/>
-      <w:r>
-        <w:rPr>
-          <w:rFonts w:ascii="Times New Roman" w:hAnsi="Times New Roman" w:cs="Times New Roman"/>
-          <w:lang w:val="en-GB"/>
-        </w:rPr>
-        <w:t xml:space="preserve">string;   </w:t>
-      </w:r>
-      <w:proofErr w:type="gramEnd"/>
-      <w:r>
-        <w:rPr>
-          <w:rFonts w:ascii="Times New Roman" w:hAnsi="Times New Roman" w:cs="Times New Roman"/>
-          <w:lang w:val="en-GB"/>
-        </w:rPr>
-        <w:t xml:space="preserve">      # </w:t>
-      </w:r>
-      <w:proofErr w:type="spellStart"/>
-      <w:r>
-        <w:rPr>
-          <w:rFonts w:ascii="Times New Roman" w:hAnsi="Times New Roman" w:cs="Times New Roman"/>
-          <w:lang w:val="en-GB"/>
-        </w:rPr>
-        <w:t>Simbol</w:t>
-      </w:r>
-      <w:proofErr w:type="spellEnd"/>
-      <w:r>
-        <w:rPr>
-          <w:rFonts w:ascii="Times New Roman" w:hAnsi="Times New Roman" w:cs="Times New Roman"/>
-          <w:lang w:val="en-GB"/>
-        </w:rPr>
-        <w:t xml:space="preserve"> </w:t>
+        <w:t xml:space="preserve">  constructor(data: Partial&lt;</w:t>
+      </w:r>
+      <w:proofErr w:type="spellStart"/>
+      <w:r>
+        <w:rPr>
+          <w:rFonts w:ascii="Times New Roman" w:hAnsi="Times New Roman" w:cs="Times New Roman"/>
+          <w:lang w:val="en-GB"/>
+        </w:rPr>
+        <w:t>KategoriEntity</w:t>
+      </w:r>
+      <w:proofErr w:type="spellEnd"/>
+      <w:r>
+        <w:rPr>
+          <w:rFonts w:ascii="Times New Roman" w:hAnsi="Times New Roman" w:cs="Times New Roman"/>
+          <w:lang w:val="en-GB"/>
+        </w:rPr>
+        <w:t>&gt;) {</w:t>
+      </w:r>
+    </w:p>
+    <w:p>
+      <w:pPr>
+        <w:contextualSpacing/>
+        <w:jc w:val="both"/>
+        <w:rPr>
+          <w:rFonts w:ascii="Times New Roman" w:hAnsi="Times New Roman" w:cs="Times New Roman"/>
+          <w:lang w:val="en-GB"/>
+        </w:rPr>
+      </w:pPr>
+      <w:r>
+        <w:rPr>
+          <w:rFonts w:ascii="Times New Roman" w:hAnsi="Times New Roman" w:cs="Times New Roman"/>
+          <w:lang w:val="en-GB"/>
+        </w:rPr>
+        <w:t xml:space="preserve">    # </w:t>
+      </w:r>
+      <w:proofErr w:type="spellStart"/>
+      <w:r>
+        <w:rPr>
+          <w:rFonts w:ascii="Times New Roman" w:hAnsi="Times New Roman" w:cs="Times New Roman"/>
+          <w:lang w:val="en-GB"/>
+        </w:rPr>
+        <w:t>Object.assign</w:t>
+      </w:r>
+      <w:proofErr w:type="spellEnd"/>
+      <w:r>
+        <w:rPr>
+          <w:rFonts w:ascii="Times New Roman" w:hAnsi="Times New Roman" w:cs="Times New Roman"/>
+          <w:lang w:val="en-GB"/>
+        </w:rPr>
+        <w:t xml:space="preserve"> </w:t>
+      </w:r>
+      <w:proofErr w:type="spellStart"/>
+      <w:r>
+        <w:rPr>
+          <w:rFonts w:ascii="Times New Roman" w:hAnsi="Times New Roman" w:cs="Times New Roman"/>
+          <w:lang w:val="en-GB"/>
+        </w:rPr>
+        <w:t>berfungsi</w:t>
+      </w:r>
+      <w:proofErr w:type="spellEnd"/>
+      <w:r>
+        <w:rPr>
+          <w:rFonts w:ascii="Times New Roman" w:hAnsi="Times New Roman" w:cs="Times New Roman"/>
+          <w:lang w:val="en-GB"/>
+        </w:rPr>
+        <w:t xml:space="preserve"> </w:t>
+      </w:r>
+      <w:proofErr w:type="spellStart"/>
+      <w:r>
+        <w:rPr>
+          <w:rFonts w:ascii="Times New Roman" w:hAnsi="Times New Roman" w:cs="Times New Roman"/>
+          <w:lang w:val="en-GB"/>
+        </w:rPr>
+        <w:t>untuk</w:t>
+      </w:r>
+      <w:proofErr w:type="spellEnd"/>
+      <w:r>
+        <w:rPr>
+          <w:rFonts w:ascii="Times New Roman" w:hAnsi="Times New Roman" w:cs="Times New Roman"/>
+          <w:lang w:val="en-GB"/>
+        </w:rPr>
+        <w:t xml:space="preserve"> '</w:t>
+      </w:r>
+      <w:proofErr w:type="spellStart"/>
+      <w:r>
+        <w:rPr>
+          <w:rFonts w:ascii="Times New Roman" w:hAnsi="Times New Roman" w:cs="Times New Roman"/>
+          <w:lang w:val="en-GB"/>
+        </w:rPr>
+        <w:t>memberikan</w:t>
+      </w:r>
+      <w:proofErr w:type="spellEnd"/>
+      <w:r>
+        <w:rPr>
+          <w:rFonts w:ascii="Times New Roman" w:hAnsi="Times New Roman" w:cs="Times New Roman"/>
+          <w:lang w:val="en-GB"/>
+        </w:rPr>
+        <w:t xml:space="preserve">' </w:t>
       </w:r>
       <w:proofErr w:type="spellStart"/>
       <w:r>
@@ -9781,63 +10239,31 @@
           <w:rFonts w:ascii="Times New Roman" w:hAnsi="Times New Roman" w:cs="Times New Roman"/>
           <w:lang w:val="en-GB"/>
         </w:rPr>
-        <w:t>gambar</w:t>
-      </w:r>
-      <w:proofErr w:type="spellEnd"/>
-      <w:r>
-        <w:rPr>
-          <w:rFonts w:ascii="Times New Roman" w:hAnsi="Times New Roman" w:cs="Times New Roman"/>
-          <w:lang w:val="en-GB"/>
-        </w:rPr>
-        <w:t xml:space="preserve"> </w:t>
-      </w:r>
-      <w:proofErr w:type="spellStart"/>
-      <w:r>
-        <w:rPr>
-          <w:rFonts w:ascii="Times New Roman" w:hAnsi="Times New Roman" w:cs="Times New Roman"/>
-          <w:lang w:val="en-GB"/>
-        </w:rPr>
-        <w:t>kecil</w:t>
-      </w:r>
-      <w:proofErr w:type="spellEnd"/>
-      <w:r>
-        <w:rPr>
-          <w:rFonts w:ascii="Times New Roman" w:hAnsi="Times New Roman" w:cs="Times New Roman"/>
-          <w:lang w:val="en-GB"/>
-        </w:rPr>
-        <w:t xml:space="preserve"> </w:t>
-      </w:r>
-      <w:proofErr w:type="spellStart"/>
-      <w:r>
-        <w:rPr>
-          <w:rFonts w:ascii="Times New Roman" w:hAnsi="Times New Roman" w:cs="Times New Roman"/>
-          <w:lang w:val="en-GB"/>
-        </w:rPr>
-        <w:t>untuk</w:t>
-      </w:r>
-      <w:proofErr w:type="spellEnd"/>
-      <w:r>
-        <w:rPr>
-          <w:rFonts w:ascii="Times New Roman" w:hAnsi="Times New Roman" w:cs="Times New Roman"/>
-          <w:lang w:val="en-GB"/>
-        </w:rPr>
-        <w:t xml:space="preserve"> </w:t>
-      </w:r>
-      <w:proofErr w:type="spellStart"/>
-      <w:r>
-        <w:rPr>
-          <w:rFonts w:ascii="Times New Roman" w:hAnsi="Times New Roman" w:cs="Times New Roman"/>
-          <w:lang w:val="en-GB"/>
-        </w:rPr>
-        <w:t>kategori</w:t>
-      </w:r>
-      <w:proofErr w:type="spellEnd"/>
-      <w:r>
-        <w:rPr>
-          <w:rFonts w:ascii="Times New Roman" w:hAnsi="Times New Roman" w:cs="Times New Roman"/>
-          <w:lang w:val="en-GB"/>
-        </w:rPr>
-        <w:t>.</w:t>
+        <w:t>mengisi</w:t>
+      </w:r>
+      <w:proofErr w:type="spellEnd"/>
+      <w:r>
+        <w:rPr>
+          <w:rFonts w:ascii="Times New Roman" w:hAnsi="Times New Roman" w:cs="Times New Roman"/>
+          <w:lang w:val="en-GB"/>
+        </w:rPr>
+        <w:t xml:space="preserve"> </w:t>
+      </w:r>
+      <w:proofErr w:type="spellStart"/>
+      <w:r>
+        <w:rPr>
+          <w:rFonts w:ascii="Times New Roman" w:hAnsi="Times New Roman" w:cs="Times New Roman"/>
+          <w:lang w:val="en-GB"/>
+        </w:rPr>
+        <w:t>kolom-kolom</w:t>
+      </w:r>
+      <w:proofErr w:type="spellEnd"/>
+      <w:r>
+        <w:rPr>
+          <w:rFonts w:ascii="Times New Roman" w:hAnsi="Times New Roman" w:cs="Times New Roman"/>
+          <w:lang w:val="en-GB"/>
+        </w:rPr>
+        <w:t xml:space="preserve"> </w:t>
       </w:r>
     </w:p>
     <w:p>
@@ -9854,727 +10280,7 @@
           <w:rFonts w:ascii="Times New Roman" w:hAnsi="Times New Roman" w:cs="Times New Roman"/>
           <w:lang w:val="en-GB"/>
         </w:rPr>
-        <w:t xml:space="preserve">  </w:t>
-      </w:r>
-      <w:proofErr w:type="spellStart"/>
-      <w:r>
-        <w:rPr>
-          <w:rFonts w:ascii="Times New Roman" w:hAnsi="Times New Roman" w:cs="Times New Roman"/>
-          <w:lang w:val="en-GB"/>
-        </w:rPr>
-        <w:t>createdAt</w:t>
-      </w:r>
-      <w:proofErr w:type="spellEnd"/>
-      <w:r>
-        <w:rPr>
-          <w:rFonts w:ascii="Times New Roman" w:hAnsi="Times New Roman" w:cs="Times New Roman"/>
-          <w:lang w:val="en-GB"/>
-        </w:rPr>
-        <w:t xml:space="preserve">: </w:t>
-      </w:r>
-      <w:proofErr w:type="gramStart"/>
-      <w:r>
-        <w:rPr>
-          <w:rFonts w:ascii="Times New Roman" w:hAnsi="Times New Roman" w:cs="Times New Roman"/>
-          <w:lang w:val="en-GB"/>
-        </w:rPr>
-        <w:t xml:space="preserve">Date;   </w:t>
-      </w:r>
-      <w:proofErr w:type="gramEnd"/>
-      <w:r>
-        <w:rPr>
-          <w:rFonts w:ascii="Times New Roman" w:hAnsi="Times New Roman" w:cs="Times New Roman"/>
-          <w:lang w:val="en-GB"/>
-        </w:rPr>
-        <w:t xml:space="preserve">    # </w:t>
-      </w:r>
-      <w:proofErr w:type="spellStart"/>
-      <w:r>
-        <w:rPr>
-          <w:rFonts w:ascii="Times New Roman" w:hAnsi="Times New Roman" w:cs="Times New Roman"/>
-          <w:lang w:val="en-GB"/>
-        </w:rPr>
-        <w:t>Catatan</w:t>
-      </w:r>
-      <w:proofErr w:type="spellEnd"/>
-      <w:r>
-        <w:rPr>
-          <w:rFonts w:ascii="Times New Roman" w:hAnsi="Times New Roman" w:cs="Times New Roman"/>
-          <w:lang w:val="en-GB"/>
-        </w:rPr>
-        <w:t xml:space="preserve"> </w:t>
-      </w:r>
-      <w:proofErr w:type="spellStart"/>
-      <w:r>
-        <w:rPr>
-          <w:rFonts w:ascii="Times New Roman" w:hAnsi="Times New Roman" w:cs="Times New Roman"/>
-          <w:lang w:val="en-GB"/>
-        </w:rPr>
-        <w:t>waktu</w:t>
-      </w:r>
-      <w:proofErr w:type="spellEnd"/>
-      <w:r>
-        <w:rPr>
-          <w:rFonts w:ascii="Times New Roman" w:hAnsi="Times New Roman" w:cs="Times New Roman"/>
-          <w:lang w:val="en-GB"/>
-        </w:rPr>
-        <w:t xml:space="preserve"> </w:t>
-      </w:r>
-      <w:proofErr w:type="spellStart"/>
-      <w:r>
-        <w:rPr>
-          <w:rFonts w:ascii="Times New Roman" w:hAnsi="Times New Roman" w:cs="Times New Roman"/>
-          <w:lang w:val="en-GB"/>
-        </w:rPr>
-        <w:t>kapan</w:t>
-      </w:r>
-      <w:proofErr w:type="spellEnd"/>
-      <w:r>
-        <w:rPr>
-          <w:rFonts w:ascii="Times New Roman" w:hAnsi="Times New Roman" w:cs="Times New Roman"/>
-          <w:lang w:val="en-GB"/>
-        </w:rPr>
-        <w:t xml:space="preserve"> </w:t>
-      </w:r>
-      <w:proofErr w:type="spellStart"/>
-      <w:r>
-        <w:rPr>
-          <w:rFonts w:ascii="Times New Roman" w:hAnsi="Times New Roman" w:cs="Times New Roman"/>
-          <w:lang w:val="en-GB"/>
-        </w:rPr>
-        <w:t>kategori</w:t>
-      </w:r>
-      <w:proofErr w:type="spellEnd"/>
-      <w:r>
-        <w:rPr>
-          <w:rFonts w:ascii="Times New Roman" w:hAnsi="Times New Roman" w:cs="Times New Roman"/>
-          <w:lang w:val="en-GB"/>
-        </w:rPr>
-        <w:t xml:space="preserve"> </w:t>
-      </w:r>
-      <w:proofErr w:type="spellStart"/>
-      <w:r>
-        <w:rPr>
-          <w:rFonts w:ascii="Times New Roman" w:hAnsi="Times New Roman" w:cs="Times New Roman"/>
-          <w:lang w:val="en-GB"/>
-        </w:rPr>
-        <w:t>ini</w:t>
-      </w:r>
-      <w:proofErr w:type="spellEnd"/>
-      <w:r>
-        <w:rPr>
-          <w:rFonts w:ascii="Times New Roman" w:hAnsi="Times New Roman" w:cs="Times New Roman"/>
-          <w:lang w:val="en-GB"/>
-        </w:rPr>
-        <w:t xml:space="preserve"> </w:t>
-      </w:r>
-      <w:proofErr w:type="spellStart"/>
-      <w:r>
-        <w:rPr>
-          <w:rFonts w:ascii="Times New Roman" w:hAnsi="Times New Roman" w:cs="Times New Roman"/>
-          <w:lang w:val="en-GB"/>
-        </w:rPr>
-        <w:t>dibuat</w:t>
-      </w:r>
-      <w:proofErr w:type="spellEnd"/>
-      <w:r>
-        <w:rPr>
-          <w:rFonts w:ascii="Times New Roman" w:hAnsi="Times New Roman" w:cs="Times New Roman"/>
-          <w:lang w:val="en-GB"/>
-        </w:rPr>
-        <w:t>.</w:t>
-      </w:r>
-    </w:p>
-    <w:p>
-      <w:pPr>
-        <w:contextualSpacing/>
-        <w:jc w:val="both"/>
-        <w:rPr>
-          <w:rFonts w:ascii="Times New Roman" w:hAnsi="Times New Roman" w:cs="Times New Roman"/>
-          <w:lang w:val="en-GB"/>
-        </w:rPr>
-      </w:pPr>
-      <w:r>
-        <w:rPr>
-          <w:rFonts w:ascii="Times New Roman" w:hAnsi="Times New Roman" w:cs="Times New Roman"/>
-          <w:lang w:val="en-GB"/>
-        </w:rPr>
-        <w:t xml:space="preserve">  </w:t>
-      </w:r>
-      <w:proofErr w:type="spellStart"/>
-      <w:r>
-        <w:rPr>
-          <w:rFonts w:ascii="Times New Roman" w:hAnsi="Times New Roman" w:cs="Times New Roman"/>
-          <w:lang w:val="en-GB"/>
-        </w:rPr>
-        <w:t>updatedAt</w:t>
-      </w:r>
-      <w:proofErr w:type="spellEnd"/>
-      <w:r>
-        <w:rPr>
-          <w:rFonts w:ascii="Times New Roman" w:hAnsi="Times New Roman" w:cs="Times New Roman"/>
-          <w:lang w:val="en-GB"/>
-        </w:rPr>
-        <w:t xml:space="preserve">: </w:t>
-      </w:r>
-      <w:proofErr w:type="gramStart"/>
-      <w:r>
-        <w:rPr>
-          <w:rFonts w:ascii="Times New Roman" w:hAnsi="Times New Roman" w:cs="Times New Roman"/>
-          <w:lang w:val="en-GB"/>
-        </w:rPr>
-        <w:t xml:space="preserve">Date;   </w:t>
-      </w:r>
-      <w:proofErr w:type="gramEnd"/>
-      <w:r>
-        <w:rPr>
-          <w:rFonts w:ascii="Times New Roman" w:hAnsi="Times New Roman" w:cs="Times New Roman"/>
-          <w:lang w:val="en-GB"/>
-        </w:rPr>
-        <w:t xml:space="preserve">    # </w:t>
-      </w:r>
-      <w:proofErr w:type="spellStart"/>
-      <w:r>
-        <w:rPr>
-          <w:rFonts w:ascii="Times New Roman" w:hAnsi="Times New Roman" w:cs="Times New Roman"/>
-          <w:lang w:val="en-GB"/>
-        </w:rPr>
-        <w:t>Catatan</w:t>
-      </w:r>
-      <w:proofErr w:type="spellEnd"/>
-      <w:r>
-        <w:rPr>
-          <w:rFonts w:ascii="Times New Roman" w:hAnsi="Times New Roman" w:cs="Times New Roman"/>
-          <w:lang w:val="en-GB"/>
-        </w:rPr>
-        <w:t xml:space="preserve"> </w:t>
-      </w:r>
-      <w:proofErr w:type="spellStart"/>
-      <w:r>
-        <w:rPr>
-          <w:rFonts w:ascii="Times New Roman" w:hAnsi="Times New Roman" w:cs="Times New Roman"/>
-          <w:lang w:val="en-GB"/>
-        </w:rPr>
-        <w:t>waktu</w:t>
-      </w:r>
-      <w:proofErr w:type="spellEnd"/>
-      <w:r>
-        <w:rPr>
-          <w:rFonts w:ascii="Times New Roman" w:hAnsi="Times New Roman" w:cs="Times New Roman"/>
-          <w:lang w:val="en-GB"/>
-        </w:rPr>
-        <w:t xml:space="preserve"> </w:t>
-      </w:r>
-      <w:proofErr w:type="spellStart"/>
-      <w:r>
-        <w:rPr>
-          <w:rFonts w:ascii="Times New Roman" w:hAnsi="Times New Roman" w:cs="Times New Roman"/>
-          <w:lang w:val="en-GB"/>
-        </w:rPr>
-        <w:t>kapan</w:t>
-      </w:r>
-      <w:proofErr w:type="spellEnd"/>
-      <w:r>
-        <w:rPr>
-          <w:rFonts w:ascii="Times New Roman" w:hAnsi="Times New Roman" w:cs="Times New Roman"/>
-          <w:lang w:val="en-GB"/>
-        </w:rPr>
-        <w:t xml:space="preserve"> </w:t>
-      </w:r>
-      <w:proofErr w:type="spellStart"/>
-      <w:r>
-        <w:rPr>
-          <w:rFonts w:ascii="Times New Roman" w:hAnsi="Times New Roman" w:cs="Times New Roman"/>
-          <w:lang w:val="en-GB"/>
-        </w:rPr>
-        <w:t>terakhir</w:t>
-      </w:r>
-      <w:proofErr w:type="spellEnd"/>
-      <w:r>
-        <w:rPr>
-          <w:rFonts w:ascii="Times New Roman" w:hAnsi="Times New Roman" w:cs="Times New Roman"/>
-          <w:lang w:val="en-GB"/>
-        </w:rPr>
-        <w:t xml:space="preserve"> kali data </w:t>
-      </w:r>
-      <w:proofErr w:type="spellStart"/>
-      <w:r>
-        <w:rPr>
-          <w:rFonts w:ascii="Times New Roman" w:hAnsi="Times New Roman" w:cs="Times New Roman"/>
-          <w:lang w:val="en-GB"/>
-        </w:rPr>
-        <w:t>diubah</w:t>
-      </w:r>
-      <w:proofErr w:type="spellEnd"/>
-      <w:r>
-        <w:rPr>
-          <w:rFonts w:ascii="Times New Roman" w:hAnsi="Times New Roman" w:cs="Times New Roman"/>
-          <w:lang w:val="en-GB"/>
-        </w:rPr>
-        <w:t>.</w:t>
-      </w:r>
-    </w:p>
-    <w:p>
-      <w:pPr>
-        <w:contextualSpacing/>
-        <w:jc w:val="both"/>
-        <w:rPr>
-          <w:rFonts w:ascii="Times New Roman" w:hAnsi="Times New Roman" w:cs="Times New Roman"/>
-          <w:lang w:val="en-GB"/>
-        </w:rPr>
-      </w:pPr>
-    </w:p>
-    <w:p>
-      <w:pPr>
-        <w:contextualSpacing/>
-        <w:jc w:val="both"/>
-        <w:rPr>
-          <w:rFonts w:ascii="Times New Roman" w:hAnsi="Times New Roman" w:cs="Times New Roman"/>
-          <w:lang w:val="en-GB"/>
-        </w:rPr>
-      </w:pPr>
-      <w:r>
-        <w:rPr>
-          <w:rFonts w:ascii="Times New Roman" w:hAnsi="Times New Roman" w:cs="Times New Roman"/>
-          <w:lang w:val="en-GB"/>
-        </w:rPr>
-        <w:t xml:space="preserve">  # Constructor </w:t>
-      </w:r>
-      <w:proofErr w:type="spellStart"/>
-      <w:r>
-        <w:rPr>
-          <w:rFonts w:ascii="Times New Roman" w:hAnsi="Times New Roman" w:cs="Times New Roman"/>
-          <w:lang w:val="en-GB"/>
-        </w:rPr>
-        <w:t>adalah</w:t>
-      </w:r>
-      <w:proofErr w:type="spellEnd"/>
-      <w:r>
-        <w:rPr>
-          <w:rFonts w:ascii="Times New Roman" w:hAnsi="Times New Roman" w:cs="Times New Roman"/>
-          <w:lang w:val="en-GB"/>
-        </w:rPr>
-        <w:t xml:space="preserve"> </w:t>
-      </w:r>
-      <w:proofErr w:type="spellStart"/>
-      <w:r>
-        <w:rPr>
-          <w:rFonts w:ascii="Times New Roman" w:hAnsi="Times New Roman" w:cs="Times New Roman"/>
-          <w:lang w:val="en-GB"/>
-        </w:rPr>
-        <w:t>mesin</w:t>
-      </w:r>
-      <w:proofErr w:type="spellEnd"/>
-      <w:r>
-        <w:rPr>
-          <w:rFonts w:ascii="Times New Roman" w:hAnsi="Times New Roman" w:cs="Times New Roman"/>
-          <w:lang w:val="en-GB"/>
-        </w:rPr>
-        <w:t xml:space="preserve"> </w:t>
-      </w:r>
-      <w:proofErr w:type="spellStart"/>
-      <w:r>
-        <w:rPr>
-          <w:rFonts w:ascii="Times New Roman" w:hAnsi="Times New Roman" w:cs="Times New Roman"/>
-          <w:lang w:val="en-GB"/>
-        </w:rPr>
-        <w:t>pembuat</w:t>
-      </w:r>
-      <w:proofErr w:type="spellEnd"/>
-      <w:r>
-        <w:rPr>
-          <w:rFonts w:ascii="Times New Roman" w:hAnsi="Times New Roman" w:cs="Times New Roman"/>
-          <w:lang w:val="en-GB"/>
-        </w:rPr>
-        <w:t xml:space="preserve"> </w:t>
-      </w:r>
-      <w:proofErr w:type="spellStart"/>
-      <w:r>
-        <w:rPr>
-          <w:rFonts w:ascii="Times New Roman" w:hAnsi="Times New Roman" w:cs="Times New Roman"/>
-          <w:lang w:val="en-GB"/>
-        </w:rPr>
-        <w:t>objek</w:t>
-      </w:r>
-      <w:proofErr w:type="spellEnd"/>
-      <w:r>
-        <w:rPr>
-          <w:rFonts w:ascii="Times New Roman" w:hAnsi="Times New Roman" w:cs="Times New Roman"/>
-          <w:lang w:val="en-GB"/>
-        </w:rPr>
-        <w:t xml:space="preserve"> </w:t>
-      </w:r>
-      <w:proofErr w:type="spellStart"/>
-      <w:r>
-        <w:rPr>
-          <w:rFonts w:ascii="Times New Roman" w:hAnsi="Times New Roman" w:cs="Times New Roman"/>
-          <w:lang w:val="en-GB"/>
-        </w:rPr>
-        <w:t>otomatis</w:t>
-      </w:r>
-      <w:proofErr w:type="spellEnd"/>
-      <w:r>
-        <w:rPr>
-          <w:rFonts w:ascii="Times New Roman" w:hAnsi="Times New Roman" w:cs="Times New Roman"/>
-          <w:lang w:val="en-GB"/>
-        </w:rPr>
-        <w:t>.</w:t>
-      </w:r>
-    </w:p>
-    <w:p>
-      <w:pPr>
-        <w:contextualSpacing/>
-        <w:jc w:val="both"/>
-        <w:rPr>
-          <w:rFonts w:ascii="Times New Roman" w:hAnsi="Times New Roman" w:cs="Times New Roman"/>
-          <w:lang w:val="en-GB"/>
-        </w:rPr>
-      </w:pPr>
-      <w:r>
-        <w:rPr>
-          <w:rFonts w:ascii="Times New Roman" w:hAnsi="Times New Roman" w:cs="Times New Roman"/>
-          <w:lang w:val="en-GB"/>
-        </w:rPr>
-        <w:t xml:space="preserve">  # Partial&lt;</w:t>
-      </w:r>
-      <w:proofErr w:type="spellStart"/>
-      <w:r>
-        <w:rPr>
-          <w:rFonts w:ascii="Times New Roman" w:hAnsi="Times New Roman" w:cs="Times New Roman"/>
-          <w:lang w:val="en-GB"/>
-        </w:rPr>
-        <w:t>KategoriEntity</w:t>
-      </w:r>
-      <w:proofErr w:type="spellEnd"/>
-      <w:r>
-        <w:rPr>
-          <w:rFonts w:ascii="Times New Roman" w:hAnsi="Times New Roman" w:cs="Times New Roman"/>
-          <w:lang w:val="en-GB"/>
-        </w:rPr>
-        <w:t xml:space="preserve">&gt; </w:t>
-      </w:r>
-      <w:proofErr w:type="spellStart"/>
-      <w:r>
-        <w:rPr>
-          <w:rFonts w:ascii="Times New Roman" w:hAnsi="Times New Roman" w:cs="Times New Roman"/>
-          <w:lang w:val="en-GB"/>
-        </w:rPr>
-        <w:t>artinya</w:t>
-      </w:r>
-      <w:proofErr w:type="spellEnd"/>
-      <w:r>
-        <w:rPr>
-          <w:rFonts w:ascii="Times New Roman" w:hAnsi="Times New Roman" w:cs="Times New Roman"/>
-          <w:lang w:val="en-GB"/>
-        </w:rPr>
-        <w:t xml:space="preserve"> </w:t>
-      </w:r>
-      <w:proofErr w:type="spellStart"/>
-      <w:r>
-        <w:rPr>
-          <w:rFonts w:ascii="Times New Roman" w:hAnsi="Times New Roman" w:cs="Times New Roman"/>
-          <w:lang w:val="en-GB"/>
-        </w:rPr>
-        <w:t>kita</w:t>
-      </w:r>
-      <w:proofErr w:type="spellEnd"/>
-      <w:r>
-        <w:rPr>
-          <w:rFonts w:ascii="Times New Roman" w:hAnsi="Times New Roman" w:cs="Times New Roman"/>
-          <w:lang w:val="en-GB"/>
-        </w:rPr>
-        <w:t xml:space="preserve"> </w:t>
-      </w:r>
-      <w:proofErr w:type="spellStart"/>
-      <w:r>
-        <w:rPr>
-          <w:rFonts w:ascii="Times New Roman" w:hAnsi="Times New Roman" w:cs="Times New Roman"/>
-          <w:lang w:val="en-GB"/>
-        </w:rPr>
-        <w:t>bisa</w:t>
-      </w:r>
-      <w:proofErr w:type="spellEnd"/>
-      <w:r>
-        <w:rPr>
-          <w:rFonts w:ascii="Times New Roman" w:hAnsi="Times New Roman" w:cs="Times New Roman"/>
-          <w:lang w:val="en-GB"/>
-        </w:rPr>
-        <w:t xml:space="preserve"> </w:t>
-      </w:r>
-      <w:proofErr w:type="spellStart"/>
-      <w:r>
-        <w:rPr>
-          <w:rFonts w:ascii="Times New Roman" w:hAnsi="Times New Roman" w:cs="Times New Roman"/>
-          <w:lang w:val="en-GB"/>
-        </w:rPr>
-        <w:t>memasukkan</w:t>
-      </w:r>
-      <w:proofErr w:type="spellEnd"/>
-      <w:r>
-        <w:rPr>
-          <w:rFonts w:ascii="Times New Roman" w:hAnsi="Times New Roman" w:cs="Times New Roman"/>
-          <w:lang w:val="en-GB"/>
-        </w:rPr>
-        <w:t xml:space="preserve"> data </w:t>
-      </w:r>
-      <w:proofErr w:type="spellStart"/>
-      <w:r>
-        <w:rPr>
-          <w:rFonts w:ascii="Times New Roman" w:hAnsi="Times New Roman" w:cs="Times New Roman"/>
-          <w:lang w:val="en-GB"/>
-        </w:rPr>
-        <w:t>meskipun</w:t>
-      </w:r>
-      <w:proofErr w:type="spellEnd"/>
-      <w:r>
-        <w:rPr>
-          <w:rFonts w:ascii="Times New Roman" w:hAnsi="Times New Roman" w:cs="Times New Roman"/>
-          <w:lang w:val="en-GB"/>
-        </w:rPr>
-        <w:t xml:space="preserve"> </w:t>
-      </w:r>
-      <w:proofErr w:type="spellStart"/>
-      <w:r>
-        <w:rPr>
-          <w:rFonts w:ascii="Times New Roman" w:hAnsi="Times New Roman" w:cs="Times New Roman"/>
-          <w:lang w:val="en-GB"/>
-        </w:rPr>
-        <w:t>tidak</w:t>
-      </w:r>
-      <w:proofErr w:type="spellEnd"/>
-      <w:r>
-        <w:rPr>
-          <w:rFonts w:ascii="Times New Roman" w:hAnsi="Times New Roman" w:cs="Times New Roman"/>
-          <w:lang w:val="en-GB"/>
-        </w:rPr>
-        <w:t xml:space="preserve"> </w:t>
-      </w:r>
-      <w:proofErr w:type="spellStart"/>
-      <w:r>
-        <w:rPr>
-          <w:rFonts w:ascii="Times New Roman" w:hAnsi="Times New Roman" w:cs="Times New Roman"/>
-          <w:lang w:val="en-GB"/>
-        </w:rPr>
-        <w:t>lengkap</w:t>
-      </w:r>
-      <w:proofErr w:type="spellEnd"/>
-      <w:r>
-        <w:rPr>
-          <w:rFonts w:ascii="Times New Roman" w:hAnsi="Times New Roman" w:cs="Times New Roman"/>
-          <w:lang w:val="en-GB"/>
-        </w:rPr>
-        <w:t>.</w:t>
-      </w:r>
-    </w:p>
-    <w:p>
-      <w:pPr>
-        <w:contextualSpacing/>
-        <w:jc w:val="both"/>
-        <w:rPr>
-          <w:rFonts w:ascii="Times New Roman" w:hAnsi="Times New Roman" w:cs="Times New Roman"/>
-          <w:lang w:val="en-GB"/>
-        </w:rPr>
-      </w:pPr>
-      <w:r>
-        <w:rPr>
-          <w:rFonts w:ascii="Times New Roman" w:hAnsi="Times New Roman" w:cs="Times New Roman"/>
-          <w:lang w:val="en-GB"/>
-        </w:rPr>
-        <w:t xml:space="preserve">  </w:t>
-      </w:r>
-      <w:proofErr w:type="gramStart"/>
-      <w:r>
-        <w:rPr>
-          <w:rFonts w:ascii="Times New Roman" w:hAnsi="Times New Roman" w:cs="Times New Roman"/>
-          <w:lang w:val="en-GB"/>
-        </w:rPr>
-        <w:t>constructor(</w:t>
-      </w:r>
-      <w:proofErr w:type="gramEnd"/>
-      <w:r>
-        <w:rPr>
-          <w:rFonts w:ascii="Times New Roman" w:hAnsi="Times New Roman" w:cs="Times New Roman"/>
-          <w:lang w:val="en-GB"/>
-        </w:rPr>
-        <w:t>data: Partial&lt;</w:t>
-      </w:r>
-      <w:proofErr w:type="spellStart"/>
-      <w:r>
-        <w:rPr>
-          <w:rFonts w:ascii="Times New Roman" w:hAnsi="Times New Roman" w:cs="Times New Roman"/>
-          <w:lang w:val="en-GB"/>
-        </w:rPr>
-        <w:t>KategoriEntity</w:t>
-      </w:r>
-      <w:proofErr w:type="spellEnd"/>
-      <w:r>
-        <w:rPr>
-          <w:rFonts w:ascii="Times New Roman" w:hAnsi="Times New Roman" w:cs="Times New Roman"/>
-          <w:lang w:val="en-GB"/>
-        </w:rPr>
-        <w:t>&gt;) {</w:t>
-      </w:r>
-    </w:p>
-    <w:p>
-      <w:pPr>
-        <w:contextualSpacing/>
-        <w:jc w:val="both"/>
-        <w:rPr>
-          <w:rFonts w:ascii="Times New Roman" w:hAnsi="Times New Roman" w:cs="Times New Roman"/>
-          <w:lang w:val="en-GB"/>
-        </w:rPr>
-      </w:pPr>
-      <w:r>
-        <w:rPr>
-          <w:rFonts w:ascii="Times New Roman" w:hAnsi="Times New Roman" w:cs="Times New Roman"/>
-          <w:lang w:val="en-GB"/>
-        </w:rPr>
-        <w:t xml:space="preserve">    # </w:t>
-      </w:r>
-      <w:proofErr w:type="spellStart"/>
-      <w:r>
-        <w:rPr>
-          <w:rFonts w:ascii="Times New Roman" w:hAnsi="Times New Roman" w:cs="Times New Roman"/>
-          <w:lang w:val="en-GB"/>
-        </w:rPr>
-        <w:t>Object.assign</w:t>
-      </w:r>
-      <w:proofErr w:type="spellEnd"/>
-      <w:r>
-        <w:rPr>
-          <w:rFonts w:ascii="Times New Roman" w:hAnsi="Times New Roman" w:cs="Times New Roman"/>
-          <w:lang w:val="en-GB"/>
-        </w:rPr>
-        <w:t xml:space="preserve"> </w:t>
-      </w:r>
-      <w:proofErr w:type="spellStart"/>
-      <w:r>
-        <w:rPr>
-          <w:rFonts w:ascii="Times New Roman" w:hAnsi="Times New Roman" w:cs="Times New Roman"/>
-          <w:lang w:val="en-GB"/>
-        </w:rPr>
-        <w:t>berfungsi</w:t>
-      </w:r>
-      <w:proofErr w:type="spellEnd"/>
-      <w:r>
-        <w:rPr>
-          <w:rFonts w:ascii="Times New Roman" w:hAnsi="Times New Roman" w:cs="Times New Roman"/>
-          <w:lang w:val="en-GB"/>
-        </w:rPr>
-        <w:t xml:space="preserve"> </w:t>
-      </w:r>
-      <w:proofErr w:type="spellStart"/>
-      <w:r>
-        <w:rPr>
-          <w:rFonts w:ascii="Times New Roman" w:hAnsi="Times New Roman" w:cs="Times New Roman"/>
-          <w:lang w:val="en-GB"/>
-        </w:rPr>
-        <w:t>untuk</w:t>
-      </w:r>
-      <w:proofErr w:type="spellEnd"/>
-      <w:r>
-        <w:rPr>
-          <w:rFonts w:ascii="Times New Roman" w:hAnsi="Times New Roman" w:cs="Times New Roman"/>
-          <w:lang w:val="en-GB"/>
-        </w:rPr>
-        <w:t xml:space="preserve"> '</w:t>
-      </w:r>
-      <w:proofErr w:type="spellStart"/>
-      <w:r>
-        <w:rPr>
-          <w:rFonts w:ascii="Times New Roman" w:hAnsi="Times New Roman" w:cs="Times New Roman"/>
-          <w:lang w:val="en-GB"/>
-        </w:rPr>
-        <w:t>memberikan</w:t>
-      </w:r>
-      <w:proofErr w:type="spellEnd"/>
-      <w:r>
-        <w:rPr>
-          <w:rFonts w:ascii="Times New Roman" w:hAnsi="Times New Roman" w:cs="Times New Roman"/>
-          <w:lang w:val="en-GB"/>
-        </w:rPr>
-        <w:t xml:space="preserve">' </w:t>
-      </w:r>
-      <w:proofErr w:type="spellStart"/>
-      <w:r>
-        <w:rPr>
-          <w:rFonts w:ascii="Times New Roman" w:hAnsi="Times New Roman" w:cs="Times New Roman"/>
-          <w:lang w:val="en-GB"/>
-        </w:rPr>
-        <w:t>atau</w:t>
-      </w:r>
-      <w:proofErr w:type="spellEnd"/>
-      <w:r>
-        <w:rPr>
-          <w:rFonts w:ascii="Times New Roman" w:hAnsi="Times New Roman" w:cs="Times New Roman"/>
-          <w:lang w:val="en-GB"/>
-        </w:rPr>
-        <w:t xml:space="preserve"> </w:t>
-      </w:r>
-      <w:proofErr w:type="spellStart"/>
-      <w:r>
-        <w:rPr>
-          <w:rFonts w:ascii="Times New Roman" w:hAnsi="Times New Roman" w:cs="Times New Roman"/>
-          <w:lang w:val="en-GB"/>
-        </w:rPr>
-        <w:t>mengisi</w:t>
-      </w:r>
-      <w:proofErr w:type="spellEnd"/>
-      <w:r>
-        <w:rPr>
-          <w:rFonts w:ascii="Times New Roman" w:hAnsi="Times New Roman" w:cs="Times New Roman"/>
-          <w:lang w:val="en-GB"/>
-        </w:rPr>
-        <w:t xml:space="preserve"> </w:t>
-      </w:r>
-      <w:proofErr w:type="spellStart"/>
-      <w:r>
-        <w:rPr>
-          <w:rFonts w:ascii="Times New Roman" w:hAnsi="Times New Roman" w:cs="Times New Roman"/>
-          <w:lang w:val="en-GB"/>
-        </w:rPr>
-        <w:t>kolom-kolom</w:t>
-      </w:r>
-      <w:proofErr w:type="spellEnd"/>
-      <w:r>
-        <w:rPr>
-          <w:rFonts w:ascii="Times New Roman" w:hAnsi="Times New Roman" w:cs="Times New Roman"/>
-          <w:lang w:val="en-GB"/>
-        </w:rPr>
-        <w:t xml:space="preserve"> </w:t>
-      </w:r>
-    </w:p>
-    <w:p>
-      <w:pPr>
-        <w:contextualSpacing/>
-        <w:jc w:val="both"/>
-        <w:rPr>
-          <w:rFonts w:ascii="Times New Roman" w:hAnsi="Times New Roman" w:cs="Times New Roman"/>
-          <w:lang w:val="en-GB"/>
-        </w:rPr>
-      </w:pPr>
-      <w:r>
-        <w:rPr>
-          <w:rFonts w:ascii="Times New Roman" w:hAnsi="Times New Roman" w:cs="Times New Roman"/>
-          <w:lang w:val="en-GB"/>
-        </w:rPr>
-        <w:t xml:space="preserve">    # </w:t>
-      </w:r>
-      <w:proofErr w:type="gramStart"/>
-      <w:r>
-        <w:rPr>
-          <w:rFonts w:ascii="Times New Roman" w:hAnsi="Times New Roman" w:cs="Times New Roman"/>
-          <w:lang w:val="en-GB"/>
-        </w:rPr>
-        <w:t>di</w:t>
-      </w:r>
-      <w:proofErr w:type="gramEnd"/>
-      <w:r>
-        <w:rPr>
-          <w:rFonts w:ascii="Times New Roman" w:hAnsi="Times New Roman" w:cs="Times New Roman"/>
-          <w:lang w:val="en-GB"/>
-        </w:rPr>
-        <w:t xml:space="preserve"> </w:t>
+        <w:t xml:space="preserve">    # di </w:t>
       </w:r>
       <w:proofErr w:type="spellStart"/>
       <w:r>
@@ -10825,7 +10531,6 @@
         <w:t xml:space="preserve"> </w:t>
       </w:r>
       <w:proofErr w:type="spellStart"/>
-      <w:proofErr w:type="gramStart"/>
       <w:r>
         <w:rPr>
           <w:rFonts w:ascii="Times New Roman" w:hAnsi="Times New Roman" w:cs="Times New Roman"/>
@@ -10834,7 +10539,6 @@
         <w:t>kategori.harga</w:t>
       </w:r>
       <w:proofErr w:type="spellEnd"/>
-      <w:proofErr w:type="gramEnd"/>
       <w:r>
         <w:rPr>
           <w:rFonts w:ascii="Times New Roman" w:hAnsi="Times New Roman" w:cs="Times New Roman"/>
@@ -11819,7 +11523,6 @@
           <w:lang w:val="en-GB"/>
         </w:rPr>
       </w:pPr>
-      <w:proofErr w:type="gramStart"/>
       <w:r>
         <w:rPr>
           <w:rFonts w:ascii="Times New Roman" w:hAnsi="Times New Roman" w:cs="Times New Roman"/>
@@ -11827,7 +11530,6 @@
         </w:rPr>
         <w:t>Kode :</w:t>
       </w:r>
-      <w:proofErr w:type="gramEnd"/>
     </w:p>
     <w:p>
       <w:pPr>
@@ -11843,15 +11545,7 @@
           <w:rFonts w:ascii="Times New Roman" w:hAnsi="Times New Roman" w:cs="Times New Roman"/>
           <w:lang w:val="en-GB"/>
         </w:rPr>
-        <w:t xml:space="preserve">import </w:t>
-      </w:r>
-      <w:proofErr w:type="gramStart"/>
-      <w:r>
-        <w:rPr>
-          <w:rFonts w:ascii="Times New Roman" w:hAnsi="Times New Roman" w:cs="Times New Roman"/>
-          <w:lang w:val="en-GB"/>
-        </w:rPr>
-        <w:t xml:space="preserve">{ </w:t>
+        <w:t xml:space="preserve">import { </w:t>
       </w:r>
       <w:proofErr w:type="spellStart"/>
       <w:r>
@@ -11862,7 +11556,6 @@
         <w:t>IsString</w:t>
       </w:r>
       <w:proofErr w:type="spellEnd"/>
-      <w:proofErr w:type="gramEnd"/>
       <w:r>
         <w:rPr>
           <w:rFonts w:ascii="Times New Roman" w:hAnsi="Times New Roman" w:cs="Times New Roman"/>
@@ -11919,7 +11612,6 @@
         <w:t xml:space="preserve">, </w:t>
       </w:r>
       <w:proofErr w:type="spellStart"/>
-      <w:proofErr w:type="gramStart"/>
       <w:r>
         <w:rPr>
           <w:rFonts w:ascii="Times New Roman" w:hAnsi="Times New Roman" w:cs="Times New Roman"/>
@@ -11933,15 +11625,7 @@
           <w:rFonts w:ascii="Times New Roman" w:hAnsi="Times New Roman" w:cs="Times New Roman"/>
           <w:lang w:val="en-GB"/>
         </w:rPr>
-        <w:t xml:space="preserve"> }</w:t>
-      </w:r>
-      <w:proofErr w:type="gramEnd"/>
-      <w:r>
-        <w:rPr>
-          <w:rFonts w:ascii="Times New Roman" w:hAnsi="Times New Roman" w:cs="Times New Roman"/>
-          <w:lang w:val="en-GB"/>
-        </w:rPr>
-        <w:t xml:space="preserve"> from 'class-validator';</w:t>
+        <w:t xml:space="preserve"> } from 'class-validator';</w:t>
       </w:r>
     </w:p>
     <w:p>
@@ -12147,23 +11831,7 @@
           <w:rFonts w:ascii="Times New Roman" w:hAnsi="Times New Roman" w:cs="Times New Roman"/>
           <w:lang w:val="en-GB"/>
         </w:rPr>
-        <w:t xml:space="preserve">  @</w:t>
-      </w:r>
-      <w:proofErr w:type="gramStart"/>
-      <w:r>
-        <w:rPr>
-          <w:rFonts w:ascii="Times New Roman" w:hAnsi="Times New Roman" w:cs="Times New Roman"/>
-          <w:lang w:val="en-GB"/>
-        </w:rPr>
-        <w:t>IsString(</w:t>
-      </w:r>
-      <w:proofErr w:type="gramEnd"/>
-      <w:r>
-        <w:rPr>
-          <w:rFonts w:ascii="Times New Roman" w:hAnsi="Times New Roman" w:cs="Times New Roman"/>
-          <w:lang w:val="en-GB"/>
-        </w:rPr>
-        <w:t xml:space="preserve">)      # Harus </w:t>
+        <w:t xml:space="preserve">  @IsString()      # Harus </w:t>
       </w:r>
       <w:proofErr w:type="spellStart"/>
       <w:r>
@@ -12212,23 +11880,7 @@
           <w:rFonts w:ascii="Times New Roman" w:hAnsi="Times New Roman" w:cs="Times New Roman"/>
           <w:lang w:val="en-GB"/>
         </w:rPr>
-        <w:t xml:space="preserve">  @</w:t>
-      </w:r>
-      <w:proofErr w:type="gramStart"/>
-      <w:r>
-        <w:rPr>
-          <w:rFonts w:ascii="Times New Roman" w:hAnsi="Times New Roman" w:cs="Times New Roman"/>
-          <w:lang w:val="en-GB"/>
-        </w:rPr>
-        <w:t>IsNotEmpty(</w:t>
-      </w:r>
-      <w:proofErr w:type="gramEnd"/>
-      <w:r>
-        <w:rPr>
-          <w:rFonts w:ascii="Times New Roman" w:hAnsi="Times New Roman" w:cs="Times New Roman"/>
-          <w:lang w:val="en-GB"/>
-        </w:rPr>
-        <w:t xml:space="preserve">)   # Tidak </w:t>
+        <w:t xml:space="preserve">  @IsNotEmpty()   # Tidak </w:t>
       </w:r>
       <w:proofErr w:type="spellStart"/>
       <w:r>
@@ -12325,23 +11977,7 @@
           <w:rFonts w:ascii="Times New Roman" w:hAnsi="Times New Roman" w:cs="Times New Roman"/>
           <w:lang w:val="en-GB"/>
         </w:rPr>
-        <w:t xml:space="preserve">  @</w:t>
-      </w:r>
-      <w:proofErr w:type="gramStart"/>
-      <w:r>
-        <w:rPr>
-          <w:rFonts w:ascii="Times New Roman" w:hAnsi="Times New Roman" w:cs="Times New Roman"/>
-          <w:lang w:val="en-GB"/>
-        </w:rPr>
-        <w:t>MinLength(</w:t>
-      </w:r>
-      <w:proofErr w:type="gramEnd"/>
-      <w:r>
-        <w:rPr>
-          <w:rFonts w:ascii="Times New Roman" w:hAnsi="Times New Roman" w:cs="Times New Roman"/>
-          <w:lang w:val="en-GB"/>
-        </w:rPr>
-        <w:t xml:space="preserve">2)   # Minimal </w:t>
+        <w:t xml:space="preserve">  @MinLength(2)   # Minimal </w:t>
       </w:r>
       <w:proofErr w:type="spellStart"/>
       <w:r>
@@ -12470,23 +12106,7 @@
           <w:rFonts w:ascii="Times New Roman" w:hAnsi="Times New Roman" w:cs="Times New Roman"/>
           <w:lang w:val="en-GB"/>
         </w:rPr>
-        <w:t xml:space="preserve">  @</w:t>
-      </w:r>
-      <w:proofErr w:type="gramStart"/>
-      <w:r>
-        <w:rPr>
-          <w:rFonts w:ascii="Times New Roman" w:hAnsi="Times New Roman" w:cs="Times New Roman"/>
-          <w:lang w:val="en-GB"/>
-        </w:rPr>
-        <w:t>MaxLength(</w:t>
-      </w:r>
-      <w:proofErr w:type="gramEnd"/>
-      <w:r>
-        <w:rPr>
-          <w:rFonts w:ascii="Times New Roman" w:hAnsi="Times New Roman" w:cs="Times New Roman"/>
-          <w:lang w:val="en-GB"/>
-        </w:rPr>
-        <w:t xml:space="preserve">100) # </w:t>
+        <w:t xml:space="preserve">  @MaxLength(100) # </w:t>
       </w:r>
       <w:proofErr w:type="spellStart"/>
       <w:r>
@@ -12594,23 +12214,7 @@
           <w:rFonts w:ascii="Times New Roman" w:hAnsi="Times New Roman" w:cs="Times New Roman"/>
           <w:lang w:val="en-GB"/>
         </w:rPr>
-        <w:t xml:space="preserve">  @</w:t>
-      </w:r>
-      <w:proofErr w:type="gramStart"/>
-      <w:r>
-        <w:rPr>
-          <w:rFonts w:ascii="Times New Roman" w:hAnsi="Times New Roman" w:cs="Times New Roman"/>
-          <w:lang w:val="en-GB"/>
-        </w:rPr>
-        <w:t>IsString(</w:t>
-      </w:r>
-      <w:proofErr w:type="gramEnd"/>
-      <w:r>
-        <w:rPr>
-          <w:rFonts w:ascii="Times New Roman" w:hAnsi="Times New Roman" w:cs="Times New Roman"/>
-          <w:lang w:val="en-GB"/>
-        </w:rPr>
-        <w:t xml:space="preserve">)      # Harus </w:t>
+        <w:t xml:space="preserve">  @IsString()      # Harus </w:t>
       </w:r>
       <w:proofErr w:type="spellStart"/>
       <w:r>
@@ -12659,23 +12263,7 @@
           <w:rFonts w:ascii="Times New Roman" w:hAnsi="Times New Roman" w:cs="Times New Roman"/>
           <w:lang w:val="en-GB"/>
         </w:rPr>
-        <w:t xml:space="preserve">  @</w:t>
-      </w:r>
-      <w:proofErr w:type="gramStart"/>
-      <w:r>
-        <w:rPr>
-          <w:rFonts w:ascii="Times New Roman" w:hAnsi="Times New Roman" w:cs="Times New Roman"/>
-          <w:lang w:val="en-GB"/>
-        </w:rPr>
-        <w:t>IsNotEmpty(</w:t>
-      </w:r>
-      <w:proofErr w:type="gramEnd"/>
-      <w:r>
-        <w:rPr>
-          <w:rFonts w:ascii="Times New Roman" w:hAnsi="Times New Roman" w:cs="Times New Roman"/>
-          <w:lang w:val="en-GB"/>
-        </w:rPr>
-        <w:t xml:space="preserve">)   # Wajib </w:t>
+        <w:t xml:space="preserve">  @IsNotEmpty()   # Wajib </w:t>
       </w:r>
       <w:proofErr w:type="spellStart"/>
       <w:r>
@@ -12772,23 +12360,7 @@
           <w:rFonts w:ascii="Times New Roman" w:hAnsi="Times New Roman" w:cs="Times New Roman"/>
           <w:lang w:val="en-GB"/>
         </w:rPr>
-        <w:t xml:space="preserve">  @</w:t>
-      </w:r>
-      <w:proofErr w:type="gramStart"/>
-      <w:r>
-        <w:rPr>
-          <w:rFonts w:ascii="Times New Roman" w:hAnsi="Times New Roman" w:cs="Times New Roman"/>
-          <w:lang w:val="en-GB"/>
-        </w:rPr>
-        <w:t>MinLength(</w:t>
-      </w:r>
-      <w:proofErr w:type="gramEnd"/>
-      <w:r>
-        <w:rPr>
-          <w:rFonts w:ascii="Times New Roman" w:hAnsi="Times New Roman" w:cs="Times New Roman"/>
-          <w:lang w:val="en-GB"/>
-        </w:rPr>
-        <w:t>2)</w:t>
+        <w:t xml:space="preserve">  @MinLength(2)</w:t>
       </w:r>
     </w:p>
     <w:p>
@@ -12805,23 +12377,7 @@
           <w:rFonts w:ascii="Times New Roman" w:hAnsi="Times New Roman" w:cs="Times New Roman"/>
           <w:lang w:val="en-GB"/>
         </w:rPr>
-        <w:t xml:space="preserve">  @</w:t>
-      </w:r>
-      <w:proofErr w:type="gramStart"/>
-      <w:r>
-        <w:rPr>
-          <w:rFonts w:ascii="Times New Roman" w:hAnsi="Times New Roman" w:cs="Times New Roman"/>
-          <w:lang w:val="en-GB"/>
-        </w:rPr>
-        <w:t>MaxLength(</w:t>
-      </w:r>
-      <w:proofErr w:type="gramEnd"/>
-      <w:r>
-        <w:rPr>
-          <w:rFonts w:ascii="Times New Roman" w:hAnsi="Times New Roman" w:cs="Times New Roman"/>
-          <w:lang w:val="en-GB"/>
-        </w:rPr>
-        <w:t>100)</w:t>
+        <w:t xml:space="preserve">  @MaxLength(100)</w:t>
       </w:r>
     </w:p>
     <w:p>
@@ -12865,23 +12421,7 @@
           <w:rFonts w:ascii="Times New Roman" w:hAnsi="Times New Roman" w:cs="Times New Roman"/>
           <w:lang w:val="en-GB"/>
         </w:rPr>
-        <w:t xml:space="preserve">  @</w:t>
-      </w:r>
-      <w:proofErr w:type="gramStart"/>
-      <w:r>
-        <w:rPr>
-          <w:rFonts w:ascii="Times New Roman" w:hAnsi="Times New Roman" w:cs="Times New Roman"/>
-          <w:lang w:val="en-GB"/>
-        </w:rPr>
-        <w:t>IsString(</w:t>
-      </w:r>
-      <w:proofErr w:type="gramEnd"/>
-      <w:r>
-        <w:rPr>
-          <w:rFonts w:ascii="Times New Roman" w:hAnsi="Times New Roman" w:cs="Times New Roman"/>
-          <w:lang w:val="en-GB"/>
-        </w:rPr>
-        <w:t xml:space="preserve">)      # Harus </w:t>
+        <w:t xml:space="preserve">  @IsString()      # Harus </w:t>
       </w:r>
       <w:proofErr w:type="spellStart"/>
       <w:r>
@@ -12930,23 +12470,7 @@
           <w:rFonts w:ascii="Times New Roman" w:hAnsi="Times New Roman" w:cs="Times New Roman"/>
           <w:lang w:val="en-GB"/>
         </w:rPr>
-        <w:t xml:space="preserve">  @</w:t>
-      </w:r>
-      <w:proofErr w:type="gramStart"/>
-      <w:r>
-        <w:rPr>
-          <w:rFonts w:ascii="Times New Roman" w:hAnsi="Times New Roman" w:cs="Times New Roman"/>
-          <w:lang w:val="en-GB"/>
-        </w:rPr>
-        <w:t>IsOptional(</w:t>
-      </w:r>
-      <w:proofErr w:type="gramEnd"/>
-      <w:r>
-        <w:rPr>
-          <w:rFonts w:ascii="Times New Roman" w:hAnsi="Times New Roman" w:cs="Times New Roman"/>
-          <w:lang w:val="en-GB"/>
-        </w:rPr>
-        <w:t>)   # BOLEH KOSONG (</w:t>
+        <w:t xml:space="preserve">  @IsOptional()   # BOLEH KOSONG (</w:t>
       </w:r>
       <w:proofErr w:type="spellStart"/>
       <w:r>
@@ -13011,23 +12535,7 @@
           <w:rFonts w:ascii="Times New Roman" w:hAnsi="Times New Roman" w:cs="Times New Roman"/>
           <w:lang w:val="en-GB"/>
         </w:rPr>
-        <w:t xml:space="preserve">  @</w:t>
-      </w:r>
-      <w:proofErr w:type="gramStart"/>
-      <w:r>
-        <w:rPr>
-          <w:rFonts w:ascii="Times New Roman" w:hAnsi="Times New Roman" w:cs="Times New Roman"/>
-          <w:lang w:val="en-GB"/>
-        </w:rPr>
-        <w:t>MaxLength(</w:t>
-      </w:r>
-      <w:proofErr w:type="gramEnd"/>
-      <w:r>
-        <w:rPr>
-          <w:rFonts w:ascii="Times New Roman" w:hAnsi="Times New Roman" w:cs="Times New Roman"/>
-          <w:lang w:val="en-GB"/>
-        </w:rPr>
-        <w:t xml:space="preserve">500) # Jika </w:t>
+        <w:t xml:space="preserve">  @MaxLength(500) # Jika </w:t>
       </w:r>
       <w:proofErr w:type="spellStart"/>
       <w:r>
@@ -13141,23 +12649,7 @@
           <w:lang w:val="en-GB"/>
         </w:rPr>
         <w:lastRenderedPageBreak/>
-        <w:t xml:space="preserve">  </w:t>
-      </w:r>
-      <w:proofErr w:type="gramStart"/>
-      <w:r>
-        <w:rPr>
-          <w:rFonts w:ascii="Times New Roman" w:hAnsi="Times New Roman" w:cs="Times New Roman"/>
-          <w:lang w:val="en-GB"/>
-        </w:rPr>
-        <w:t>description?:</w:t>
-      </w:r>
-      <w:proofErr w:type="gramEnd"/>
-      <w:r>
-        <w:rPr>
-          <w:rFonts w:ascii="Times New Roman" w:hAnsi="Times New Roman" w:cs="Times New Roman"/>
-          <w:lang w:val="en-GB"/>
-        </w:rPr>
-        <w:t xml:space="preserve"> string;</w:t>
+        <w:t xml:space="preserve">  description?: string;</w:t>
       </w:r>
     </w:p>
     <w:p>
@@ -13184,23 +12676,7 @@
           <w:rFonts w:ascii="Times New Roman" w:hAnsi="Times New Roman" w:cs="Times New Roman"/>
           <w:lang w:val="en-GB"/>
         </w:rPr>
-        <w:t xml:space="preserve">  @</w:t>
-      </w:r>
-      <w:proofErr w:type="gramStart"/>
-      <w:r>
-        <w:rPr>
-          <w:rFonts w:ascii="Times New Roman" w:hAnsi="Times New Roman" w:cs="Times New Roman"/>
-          <w:lang w:val="en-GB"/>
-        </w:rPr>
-        <w:t>IsString(</w:t>
-      </w:r>
-      <w:proofErr w:type="gramEnd"/>
-      <w:r>
-        <w:rPr>
-          <w:rFonts w:ascii="Times New Roman" w:hAnsi="Times New Roman" w:cs="Times New Roman"/>
-          <w:lang w:val="en-GB"/>
-        </w:rPr>
-        <w:t>)</w:t>
+        <w:t xml:space="preserve">  @IsString()</w:t>
       </w:r>
     </w:p>
     <w:p>
@@ -13217,23 +12693,7 @@
           <w:rFonts w:ascii="Times New Roman" w:hAnsi="Times New Roman" w:cs="Times New Roman"/>
           <w:lang w:val="en-GB"/>
         </w:rPr>
-        <w:t xml:space="preserve">  @</w:t>
-      </w:r>
-      <w:proofErr w:type="gramStart"/>
-      <w:r>
-        <w:rPr>
-          <w:rFonts w:ascii="Times New Roman" w:hAnsi="Times New Roman" w:cs="Times New Roman"/>
-          <w:lang w:val="en-GB"/>
-        </w:rPr>
-        <w:t>IsOptional(</w:t>
-      </w:r>
-      <w:proofErr w:type="gramEnd"/>
-      <w:r>
-        <w:rPr>
-          <w:rFonts w:ascii="Times New Roman" w:hAnsi="Times New Roman" w:cs="Times New Roman"/>
-          <w:lang w:val="en-GB"/>
-        </w:rPr>
-        <w:t>)   # BOLEH KOSONG (</w:t>
+        <w:t xml:space="preserve">  @IsOptional()   # BOLEH KOSONG (</w:t>
       </w:r>
       <w:proofErr w:type="spellStart"/>
       <w:r>
@@ -13314,23 +12774,7 @@
           <w:rFonts w:ascii="Times New Roman" w:hAnsi="Times New Roman" w:cs="Times New Roman"/>
           <w:lang w:val="en-GB"/>
         </w:rPr>
-        <w:t xml:space="preserve">  </w:t>
-      </w:r>
-      <w:proofErr w:type="gramStart"/>
-      <w:r>
-        <w:rPr>
-          <w:rFonts w:ascii="Times New Roman" w:hAnsi="Times New Roman" w:cs="Times New Roman"/>
-          <w:lang w:val="en-GB"/>
-        </w:rPr>
-        <w:t>icon?:</w:t>
-      </w:r>
-      <w:proofErr w:type="gramEnd"/>
-      <w:r>
-        <w:rPr>
-          <w:rFonts w:ascii="Times New Roman" w:hAnsi="Times New Roman" w:cs="Times New Roman"/>
-          <w:lang w:val="en-GB"/>
-        </w:rPr>
-        <w:t xml:space="preserve"> string;</w:t>
+        <w:t xml:space="preserve">  icon?: string;</w:t>
       </w:r>
     </w:p>
     <w:p>
@@ -14102,6 +13546,919 @@
           <w:lang w:val="en-GB"/>
         </w:rPr>
         <w:t>.</w:t>
+      </w:r>
+    </w:p>
+    <w:p>
+      <w:pPr>
+        <w:jc w:val="both"/>
+        <w:rPr>
+          <w:rFonts w:ascii="Times New Roman" w:hAnsi="Times New Roman" w:cs="Times New Roman"/>
+          <w:lang w:val="en-GB"/>
+        </w:rPr>
+      </w:pPr>
+    </w:p>
+    <w:p>
+      <w:pPr>
+        <w:jc w:val="both"/>
+        <w:rPr>
+          <w:rFonts w:ascii="Times New Roman" w:hAnsi="Times New Roman" w:cs="Times New Roman"/>
+          <w:b/>
+          <w:bCs/>
+          <w:lang w:val="en-GB"/>
+        </w:rPr>
+      </w:pPr>
+      <w:r>
+        <w:rPr>
+          <w:rFonts w:ascii="Times New Roman" w:hAnsi="Times New Roman" w:cs="Times New Roman"/>
+          <w:b/>
+          <w:bCs/>
+          <w:lang w:val="en-GB"/>
+        </w:rPr>
+        <w:t xml:space="preserve">14. </w:t>
+      </w:r>
+      <w:proofErr w:type="spellStart"/>
+      <w:r>
+        <w:rPr>
+          <w:rFonts w:ascii="Times New Roman" w:hAnsi="Times New Roman" w:cs="Times New Roman"/>
+          <w:b/>
+          <w:bCs/>
+          <w:lang w:val="en-GB"/>
+        </w:rPr>
+        <w:t>Membuat</w:t>
+      </w:r>
+      <w:proofErr w:type="spellEnd"/>
+      <w:r>
+        <w:rPr>
+          <w:rFonts w:ascii="Times New Roman" w:hAnsi="Times New Roman" w:cs="Times New Roman"/>
+          <w:b/>
+          <w:bCs/>
+          <w:lang w:val="en-GB"/>
+        </w:rPr>
+        <w:t xml:space="preserve"> file </w:t>
+      </w:r>
+      <w:r>
+        <w:rPr>
+          <w:rFonts w:ascii="Times New Roman" w:hAnsi="Times New Roman" w:cs="Times New Roman"/>
+          <w:b/>
+          <w:bCs/>
+          <w:lang w:val="en-GB"/>
+        </w:rPr>
+        <w:t>update-</w:t>
+      </w:r>
+      <w:proofErr w:type="spellStart"/>
+      <w:r>
+        <w:rPr>
+          <w:rFonts w:ascii="Times New Roman" w:hAnsi="Times New Roman" w:cs="Times New Roman"/>
+          <w:b/>
+          <w:bCs/>
+          <w:lang w:val="en-GB"/>
+        </w:rPr>
+        <w:t>kategori.dto.ts</w:t>
+      </w:r>
+      <w:proofErr w:type="spellEnd"/>
+    </w:p>
+    <w:p>
+      <w:pPr>
+        <w:jc w:val="both"/>
+        <w:rPr>
+          <w:rFonts w:ascii="Times New Roman" w:hAnsi="Times New Roman" w:cs="Times New Roman"/>
+          <w:lang w:val="en-GB"/>
+        </w:rPr>
+      </w:pPr>
+      <w:r>
+        <w:rPr>
+          <w:noProof/>
+        </w:rPr>
+        <w:drawing>
+          <wp:inline distT="0" distB="0" distL="0" distR="0" wp14:anchorId="218FDDEC" wp14:editId="7629F80C">
+            <wp:extent cx="5731510" cy="3222625"/>
+            <wp:effectExtent l="0" t="0" r="2540" b="0"/>
+            <wp:docPr id="417068477" name="Picture 1"/>
+            <wp:cNvGraphicFramePr>
+              <a:graphicFrameLocks xmlns:a="http://schemas.openxmlformats.org/drawingml/2006/main" noChangeAspect="1"/>
+            </wp:cNvGraphicFramePr>
+            <a:graphic xmlns:a="http://schemas.openxmlformats.org/drawingml/2006/main">
+              <a:graphicData uri="http://schemas.openxmlformats.org/drawingml/2006/picture">
+                <pic:pic xmlns:pic="http://schemas.openxmlformats.org/drawingml/2006/picture">
+                  <pic:nvPicPr>
+                    <pic:cNvPr id="417068477" name=""/>
+                    <pic:cNvPicPr/>
+                  </pic:nvPicPr>
+                  <pic:blipFill>
+                    <a:blip r:embed="rId18"/>
+                    <a:stretch>
+                      <a:fillRect/>
+                    </a:stretch>
+                  </pic:blipFill>
+                  <pic:spPr>
+                    <a:xfrm>
+                      <a:off x="0" y="0"/>
+                      <a:ext cx="5731510" cy="3222625"/>
+                    </a:xfrm>
+                    <a:prstGeom prst="rect">
+                      <a:avLst/>
+                    </a:prstGeom>
+                  </pic:spPr>
+                </pic:pic>
+              </a:graphicData>
+            </a:graphic>
+          </wp:inline>
+        </w:drawing>
+      </w:r>
+    </w:p>
+    <w:p>
+      <w:pPr>
+        <w:jc w:val="both"/>
+        <w:rPr>
+          <w:rFonts w:ascii="Times New Roman" w:hAnsi="Times New Roman" w:cs="Times New Roman"/>
+          <w:lang w:val="en-GB"/>
+        </w:rPr>
+      </w:pPr>
+      <w:proofErr w:type="spellStart"/>
+      <w:r>
+        <w:rPr>
+          <w:rFonts w:ascii="Times New Roman" w:hAnsi="Times New Roman" w:cs="Times New Roman"/>
+          <w:lang w:val="en-GB"/>
+        </w:rPr>
+        <w:t>UpdateKategoriDTO</w:t>
+      </w:r>
+      <w:proofErr w:type="spellEnd"/>
+      <w:r>
+        <w:rPr>
+          <w:rFonts w:ascii="Times New Roman" w:hAnsi="Times New Roman" w:cs="Times New Roman"/>
+          <w:lang w:val="en-GB"/>
+        </w:rPr>
+        <w:t xml:space="preserve"> </w:t>
+      </w:r>
+      <w:proofErr w:type="spellStart"/>
+      <w:r>
+        <w:rPr>
+          <w:rFonts w:ascii="Times New Roman" w:hAnsi="Times New Roman" w:cs="Times New Roman"/>
+          <w:lang w:val="en-GB"/>
+        </w:rPr>
+        <w:t>digunakan</w:t>
+      </w:r>
+      <w:proofErr w:type="spellEnd"/>
+      <w:r>
+        <w:rPr>
+          <w:rFonts w:ascii="Times New Roman" w:hAnsi="Times New Roman" w:cs="Times New Roman"/>
+          <w:lang w:val="en-GB"/>
+        </w:rPr>
+        <w:t xml:space="preserve"> </w:t>
+      </w:r>
+      <w:proofErr w:type="spellStart"/>
+      <w:r>
+        <w:rPr>
+          <w:rFonts w:ascii="Times New Roman" w:hAnsi="Times New Roman" w:cs="Times New Roman"/>
+          <w:lang w:val="en-GB"/>
+        </w:rPr>
+        <w:t>saat</w:t>
+      </w:r>
+      <w:proofErr w:type="spellEnd"/>
+      <w:r>
+        <w:rPr>
+          <w:rFonts w:ascii="Times New Roman" w:hAnsi="Times New Roman" w:cs="Times New Roman"/>
+          <w:lang w:val="en-GB"/>
+        </w:rPr>
+        <w:t xml:space="preserve"> </w:t>
+      </w:r>
+      <w:proofErr w:type="spellStart"/>
+      <w:r>
+        <w:rPr>
+          <w:rFonts w:ascii="Times New Roman" w:hAnsi="Times New Roman" w:cs="Times New Roman"/>
+          <w:lang w:val="en-GB"/>
+        </w:rPr>
+        <w:t>kita</w:t>
+      </w:r>
+      <w:proofErr w:type="spellEnd"/>
+      <w:r>
+        <w:rPr>
+          <w:rFonts w:ascii="Times New Roman" w:hAnsi="Times New Roman" w:cs="Times New Roman"/>
+          <w:lang w:val="en-GB"/>
+        </w:rPr>
+        <w:t xml:space="preserve"> </w:t>
+      </w:r>
+      <w:proofErr w:type="spellStart"/>
+      <w:r>
+        <w:rPr>
+          <w:rFonts w:ascii="Times New Roman" w:hAnsi="Times New Roman" w:cs="Times New Roman"/>
+          <w:lang w:val="en-GB"/>
+        </w:rPr>
+        <w:t>ingin</w:t>
+      </w:r>
+      <w:proofErr w:type="spellEnd"/>
+      <w:r>
+        <w:rPr>
+          <w:rFonts w:ascii="Times New Roman" w:hAnsi="Times New Roman" w:cs="Times New Roman"/>
+          <w:lang w:val="en-GB"/>
+        </w:rPr>
+        <w:t xml:space="preserve"> </w:t>
+      </w:r>
+      <w:proofErr w:type="spellStart"/>
+      <w:r>
+        <w:rPr>
+          <w:rFonts w:ascii="Times New Roman" w:hAnsi="Times New Roman" w:cs="Times New Roman"/>
+          <w:lang w:val="en-GB"/>
+        </w:rPr>
+        <w:t>mengubah</w:t>
+      </w:r>
+      <w:proofErr w:type="spellEnd"/>
+      <w:r>
+        <w:rPr>
+          <w:rFonts w:ascii="Times New Roman" w:hAnsi="Times New Roman" w:cs="Times New Roman"/>
+          <w:lang w:val="en-GB"/>
+        </w:rPr>
+        <w:t xml:space="preserve"> data yang </w:t>
+      </w:r>
+      <w:proofErr w:type="spellStart"/>
+      <w:r>
+        <w:rPr>
+          <w:rFonts w:ascii="Times New Roman" w:hAnsi="Times New Roman" w:cs="Times New Roman"/>
+          <w:lang w:val="en-GB"/>
+        </w:rPr>
+        <w:t>sudah</w:t>
+      </w:r>
+      <w:proofErr w:type="spellEnd"/>
+      <w:r>
+        <w:rPr>
+          <w:rFonts w:ascii="Times New Roman" w:hAnsi="Times New Roman" w:cs="Times New Roman"/>
+          <w:lang w:val="en-GB"/>
+        </w:rPr>
+        <w:t xml:space="preserve"> </w:t>
+      </w:r>
+      <w:proofErr w:type="spellStart"/>
+      <w:r>
+        <w:rPr>
+          <w:rFonts w:ascii="Times New Roman" w:hAnsi="Times New Roman" w:cs="Times New Roman"/>
+          <w:lang w:val="en-GB"/>
+        </w:rPr>
+        <w:t>ada</w:t>
+      </w:r>
+      <w:proofErr w:type="spellEnd"/>
+      <w:r>
+        <w:rPr>
+          <w:rFonts w:ascii="Times New Roman" w:hAnsi="Times New Roman" w:cs="Times New Roman"/>
+          <w:lang w:val="en-GB"/>
+        </w:rPr>
+        <w:t>.</w:t>
+      </w:r>
+    </w:p>
+    <w:p>
+      <w:pPr>
+        <w:pStyle w:val="ListParagraph"/>
+        <w:numPr>
+          <w:ilvl w:val="0"/>
+          <w:numId w:val="8"/>
+        </w:numPr>
+        <w:jc w:val="both"/>
+        <w:rPr>
+          <w:rFonts w:ascii="Times New Roman" w:hAnsi="Times New Roman" w:cs="Times New Roman"/>
+          <w:lang w:val="en-GB"/>
+        </w:rPr>
+      </w:pPr>
+      <w:r>
+        <w:rPr>
+          <w:rFonts w:ascii="Times New Roman" w:hAnsi="Times New Roman" w:cs="Times New Roman"/>
+          <w:lang w:val="en-GB"/>
+        </w:rPr>
+        <w:t xml:space="preserve">Tidak </w:t>
+      </w:r>
+      <w:proofErr w:type="spellStart"/>
+      <w:r>
+        <w:rPr>
+          <w:rFonts w:ascii="Times New Roman" w:hAnsi="Times New Roman" w:cs="Times New Roman"/>
+          <w:lang w:val="en-GB"/>
+        </w:rPr>
+        <w:t>ada</w:t>
+      </w:r>
+      <w:proofErr w:type="spellEnd"/>
+      <w:r>
+        <w:rPr>
+          <w:rFonts w:ascii="Times New Roman" w:hAnsi="Times New Roman" w:cs="Times New Roman"/>
+          <w:lang w:val="en-GB"/>
+        </w:rPr>
+        <w:t xml:space="preserve"> @IsNotEmpty: Karena </w:t>
+      </w:r>
+      <w:proofErr w:type="spellStart"/>
+      <w:r>
+        <w:rPr>
+          <w:rFonts w:ascii="Times New Roman" w:hAnsi="Times New Roman" w:cs="Times New Roman"/>
+          <w:lang w:val="en-GB"/>
+        </w:rPr>
+        <w:t>saat</w:t>
+      </w:r>
+      <w:proofErr w:type="spellEnd"/>
+      <w:r>
+        <w:rPr>
+          <w:rFonts w:ascii="Times New Roman" w:hAnsi="Times New Roman" w:cs="Times New Roman"/>
+          <w:lang w:val="en-GB"/>
+        </w:rPr>
+        <w:t xml:space="preserve"> </w:t>
+      </w:r>
+      <w:proofErr w:type="spellStart"/>
+      <w:r>
+        <w:rPr>
+          <w:rFonts w:ascii="Times New Roman" w:hAnsi="Times New Roman" w:cs="Times New Roman"/>
+          <w:lang w:val="en-GB"/>
+        </w:rPr>
+        <w:t>mengedit</w:t>
+      </w:r>
+      <w:proofErr w:type="spellEnd"/>
+      <w:r>
+        <w:rPr>
+          <w:rFonts w:ascii="Times New Roman" w:hAnsi="Times New Roman" w:cs="Times New Roman"/>
+          <w:lang w:val="en-GB"/>
+        </w:rPr>
+        <w:t xml:space="preserve">,  </w:t>
+      </w:r>
+      <w:proofErr w:type="spellStart"/>
+      <w:r>
+        <w:rPr>
+          <w:rFonts w:ascii="Times New Roman" w:hAnsi="Times New Roman" w:cs="Times New Roman"/>
+          <w:lang w:val="en-GB"/>
+        </w:rPr>
+        <w:t>tidak</w:t>
+      </w:r>
+      <w:proofErr w:type="spellEnd"/>
+      <w:r>
+        <w:rPr>
+          <w:rFonts w:ascii="Times New Roman" w:hAnsi="Times New Roman" w:cs="Times New Roman"/>
+          <w:lang w:val="en-GB"/>
+        </w:rPr>
+        <w:t xml:space="preserve"> </w:t>
+      </w:r>
+      <w:proofErr w:type="spellStart"/>
+      <w:r>
+        <w:rPr>
+          <w:rFonts w:ascii="Times New Roman" w:hAnsi="Times New Roman" w:cs="Times New Roman"/>
+          <w:lang w:val="en-GB"/>
+        </w:rPr>
+        <w:t>dipaksa</w:t>
+      </w:r>
+      <w:proofErr w:type="spellEnd"/>
+      <w:r>
+        <w:rPr>
+          <w:rFonts w:ascii="Times New Roman" w:hAnsi="Times New Roman" w:cs="Times New Roman"/>
+          <w:lang w:val="en-GB"/>
+        </w:rPr>
+        <w:t xml:space="preserve"> </w:t>
+      </w:r>
+      <w:proofErr w:type="spellStart"/>
+      <w:r>
+        <w:rPr>
+          <w:rFonts w:ascii="Times New Roman" w:hAnsi="Times New Roman" w:cs="Times New Roman"/>
+          <w:lang w:val="en-GB"/>
+        </w:rPr>
+        <w:t>mengisi</w:t>
+      </w:r>
+      <w:proofErr w:type="spellEnd"/>
+      <w:r>
+        <w:rPr>
+          <w:rFonts w:ascii="Times New Roman" w:hAnsi="Times New Roman" w:cs="Times New Roman"/>
+          <w:lang w:val="en-GB"/>
+        </w:rPr>
+        <w:t xml:space="preserve"> </w:t>
+      </w:r>
+      <w:proofErr w:type="spellStart"/>
+      <w:r>
+        <w:rPr>
+          <w:rFonts w:ascii="Times New Roman" w:hAnsi="Times New Roman" w:cs="Times New Roman"/>
+          <w:lang w:val="en-GB"/>
+        </w:rPr>
+        <w:t>semua</w:t>
+      </w:r>
+      <w:proofErr w:type="spellEnd"/>
+      <w:r>
+        <w:rPr>
+          <w:rFonts w:ascii="Times New Roman" w:hAnsi="Times New Roman" w:cs="Times New Roman"/>
+          <w:lang w:val="en-GB"/>
+        </w:rPr>
+        <w:t xml:space="preserve"> </w:t>
+      </w:r>
+      <w:proofErr w:type="spellStart"/>
+      <w:r>
+        <w:rPr>
+          <w:rFonts w:ascii="Times New Roman" w:hAnsi="Times New Roman" w:cs="Times New Roman"/>
+          <w:lang w:val="en-GB"/>
+        </w:rPr>
+        <w:t>kolom</w:t>
+      </w:r>
+      <w:proofErr w:type="spellEnd"/>
+      <w:r>
+        <w:rPr>
+          <w:rFonts w:ascii="Times New Roman" w:hAnsi="Times New Roman" w:cs="Times New Roman"/>
+          <w:lang w:val="en-GB"/>
+        </w:rPr>
+        <w:t xml:space="preserve">. </w:t>
+      </w:r>
+      <w:r>
+        <w:rPr>
+          <w:rFonts w:ascii="Times New Roman" w:hAnsi="Times New Roman" w:cs="Times New Roman"/>
+          <w:lang w:val="en-GB"/>
+        </w:rPr>
+        <w:t>H</w:t>
+      </w:r>
+      <w:r>
+        <w:rPr>
+          <w:rFonts w:ascii="Times New Roman" w:hAnsi="Times New Roman" w:cs="Times New Roman"/>
+          <w:lang w:val="en-GB"/>
+        </w:rPr>
+        <w:t xml:space="preserve">anya </w:t>
+      </w:r>
+      <w:proofErr w:type="spellStart"/>
+      <w:r>
+        <w:rPr>
+          <w:rFonts w:ascii="Times New Roman" w:hAnsi="Times New Roman" w:cs="Times New Roman"/>
+          <w:lang w:val="en-GB"/>
+        </w:rPr>
+        <w:t>mengirimkan</w:t>
+      </w:r>
+      <w:proofErr w:type="spellEnd"/>
+      <w:r>
+        <w:rPr>
+          <w:rFonts w:ascii="Times New Roman" w:hAnsi="Times New Roman" w:cs="Times New Roman"/>
+          <w:lang w:val="en-GB"/>
+        </w:rPr>
+        <w:t xml:space="preserve"> </w:t>
+      </w:r>
+      <w:proofErr w:type="spellStart"/>
+      <w:r>
+        <w:rPr>
+          <w:rFonts w:ascii="Times New Roman" w:hAnsi="Times New Roman" w:cs="Times New Roman"/>
+          <w:lang w:val="en-GB"/>
+        </w:rPr>
+        <w:t>bagian</w:t>
+      </w:r>
+      <w:proofErr w:type="spellEnd"/>
+      <w:r>
+        <w:rPr>
+          <w:rFonts w:ascii="Times New Roman" w:hAnsi="Times New Roman" w:cs="Times New Roman"/>
+          <w:lang w:val="en-GB"/>
+        </w:rPr>
+        <w:t xml:space="preserve"> yang </w:t>
+      </w:r>
+      <w:proofErr w:type="spellStart"/>
+      <w:r>
+        <w:rPr>
+          <w:rFonts w:ascii="Times New Roman" w:hAnsi="Times New Roman" w:cs="Times New Roman"/>
+          <w:lang w:val="en-GB"/>
+        </w:rPr>
+        <w:t>ingin</w:t>
+      </w:r>
+      <w:proofErr w:type="spellEnd"/>
+      <w:r>
+        <w:rPr>
+          <w:rFonts w:ascii="Times New Roman" w:hAnsi="Times New Roman" w:cs="Times New Roman"/>
+          <w:lang w:val="en-GB"/>
+        </w:rPr>
+        <w:t xml:space="preserve"> </w:t>
+      </w:r>
+      <w:proofErr w:type="spellStart"/>
+      <w:r>
+        <w:rPr>
+          <w:rFonts w:ascii="Times New Roman" w:hAnsi="Times New Roman" w:cs="Times New Roman"/>
+          <w:lang w:val="en-GB"/>
+        </w:rPr>
+        <w:t>diganti</w:t>
+      </w:r>
+      <w:proofErr w:type="spellEnd"/>
+      <w:r>
+        <w:rPr>
+          <w:rFonts w:ascii="Times New Roman" w:hAnsi="Times New Roman" w:cs="Times New Roman"/>
+          <w:lang w:val="en-GB"/>
+        </w:rPr>
+        <w:t xml:space="preserve"> </w:t>
+      </w:r>
+      <w:proofErr w:type="spellStart"/>
+      <w:r>
+        <w:rPr>
+          <w:rFonts w:ascii="Times New Roman" w:hAnsi="Times New Roman" w:cs="Times New Roman"/>
+          <w:lang w:val="en-GB"/>
+        </w:rPr>
+        <w:t>saja</w:t>
+      </w:r>
+      <w:proofErr w:type="spellEnd"/>
+      <w:r>
+        <w:rPr>
+          <w:rFonts w:ascii="Times New Roman" w:hAnsi="Times New Roman" w:cs="Times New Roman"/>
+          <w:lang w:val="en-GB"/>
+        </w:rPr>
+        <w:t>.</w:t>
+      </w:r>
+    </w:p>
+    <w:p>
+      <w:pPr>
+        <w:pStyle w:val="ListParagraph"/>
+        <w:numPr>
+          <w:ilvl w:val="0"/>
+          <w:numId w:val="8"/>
+        </w:numPr>
+        <w:jc w:val="both"/>
+        <w:rPr>
+          <w:rFonts w:ascii="Times New Roman" w:hAnsi="Times New Roman" w:cs="Times New Roman"/>
+          <w:lang w:val="en-GB"/>
+        </w:rPr>
+      </w:pPr>
+      <w:r>
+        <w:rPr>
+          <w:rFonts w:ascii="Times New Roman" w:hAnsi="Times New Roman" w:cs="Times New Roman"/>
+          <w:lang w:val="en-GB"/>
+        </w:rPr>
+        <w:t xml:space="preserve">Tanda Tanya (?): Di </w:t>
+      </w:r>
+      <w:proofErr w:type="spellStart"/>
+      <w:r>
+        <w:rPr>
+          <w:rFonts w:ascii="Times New Roman" w:hAnsi="Times New Roman" w:cs="Times New Roman"/>
+          <w:lang w:val="en-GB"/>
+        </w:rPr>
+        <w:t>belakang</w:t>
+      </w:r>
+      <w:proofErr w:type="spellEnd"/>
+      <w:r>
+        <w:rPr>
+          <w:rFonts w:ascii="Times New Roman" w:hAnsi="Times New Roman" w:cs="Times New Roman"/>
+          <w:lang w:val="en-GB"/>
+        </w:rPr>
+        <w:t xml:space="preserve"> nama </w:t>
+      </w:r>
+      <w:proofErr w:type="spellStart"/>
+      <w:r>
+        <w:rPr>
+          <w:rFonts w:ascii="Times New Roman" w:hAnsi="Times New Roman" w:cs="Times New Roman"/>
+          <w:lang w:val="en-GB"/>
+        </w:rPr>
+        <w:t>kolom</w:t>
+      </w:r>
+      <w:proofErr w:type="spellEnd"/>
+      <w:r>
+        <w:rPr>
+          <w:rFonts w:ascii="Times New Roman" w:hAnsi="Times New Roman" w:cs="Times New Roman"/>
+          <w:lang w:val="en-GB"/>
+        </w:rPr>
+        <w:t xml:space="preserve"> (</w:t>
+      </w:r>
+      <w:proofErr w:type="spellStart"/>
+      <w:r>
+        <w:rPr>
+          <w:rFonts w:ascii="Times New Roman" w:hAnsi="Times New Roman" w:cs="Times New Roman"/>
+          <w:lang w:val="en-GB"/>
+        </w:rPr>
+        <w:t>seperti</w:t>
+      </w:r>
+      <w:proofErr w:type="spellEnd"/>
+      <w:r>
+        <w:rPr>
+          <w:rFonts w:ascii="Times New Roman" w:hAnsi="Times New Roman" w:cs="Times New Roman"/>
+          <w:lang w:val="en-GB"/>
+        </w:rPr>
+        <w:t xml:space="preserve"> name?: string) </w:t>
+      </w:r>
+      <w:proofErr w:type="spellStart"/>
+      <w:r>
+        <w:rPr>
+          <w:rFonts w:ascii="Times New Roman" w:hAnsi="Times New Roman" w:cs="Times New Roman"/>
+          <w:lang w:val="en-GB"/>
+        </w:rPr>
+        <w:t>menandakan</w:t>
+      </w:r>
+      <w:proofErr w:type="spellEnd"/>
+      <w:r>
+        <w:rPr>
+          <w:rFonts w:ascii="Times New Roman" w:hAnsi="Times New Roman" w:cs="Times New Roman"/>
+          <w:lang w:val="en-GB"/>
+        </w:rPr>
+        <w:t xml:space="preserve"> </w:t>
+      </w:r>
+      <w:proofErr w:type="spellStart"/>
+      <w:r>
+        <w:rPr>
+          <w:rFonts w:ascii="Times New Roman" w:hAnsi="Times New Roman" w:cs="Times New Roman"/>
+          <w:lang w:val="en-GB"/>
+        </w:rPr>
+        <w:t>bahwa</w:t>
+      </w:r>
+      <w:proofErr w:type="spellEnd"/>
+      <w:r>
+        <w:rPr>
+          <w:rFonts w:ascii="Times New Roman" w:hAnsi="Times New Roman" w:cs="Times New Roman"/>
+          <w:lang w:val="en-GB"/>
+        </w:rPr>
+        <w:t xml:space="preserve"> </w:t>
+      </w:r>
+      <w:proofErr w:type="spellStart"/>
+      <w:r>
+        <w:rPr>
+          <w:rFonts w:ascii="Times New Roman" w:hAnsi="Times New Roman" w:cs="Times New Roman"/>
+          <w:lang w:val="en-GB"/>
+        </w:rPr>
+        <w:t>sistem</w:t>
+      </w:r>
+      <w:proofErr w:type="spellEnd"/>
+      <w:r>
+        <w:rPr>
+          <w:rFonts w:ascii="Times New Roman" w:hAnsi="Times New Roman" w:cs="Times New Roman"/>
+          <w:lang w:val="en-GB"/>
+        </w:rPr>
+        <w:t xml:space="preserve"> </w:t>
+      </w:r>
+      <w:proofErr w:type="spellStart"/>
+      <w:r>
+        <w:rPr>
+          <w:rFonts w:ascii="Times New Roman" w:hAnsi="Times New Roman" w:cs="Times New Roman"/>
+          <w:lang w:val="en-GB"/>
+        </w:rPr>
+        <w:t>tidak</w:t>
+      </w:r>
+      <w:proofErr w:type="spellEnd"/>
+      <w:r>
+        <w:rPr>
+          <w:rFonts w:ascii="Times New Roman" w:hAnsi="Times New Roman" w:cs="Times New Roman"/>
+          <w:lang w:val="en-GB"/>
+        </w:rPr>
+        <w:t xml:space="preserve"> </w:t>
+      </w:r>
+      <w:proofErr w:type="spellStart"/>
+      <w:r>
+        <w:rPr>
+          <w:rFonts w:ascii="Times New Roman" w:hAnsi="Times New Roman" w:cs="Times New Roman"/>
+          <w:lang w:val="en-GB"/>
+        </w:rPr>
+        <w:t>akan</w:t>
+      </w:r>
+      <w:proofErr w:type="spellEnd"/>
+      <w:r>
+        <w:rPr>
+          <w:rFonts w:ascii="Times New Roman" w:hAnsi="Times New Roman" w:cs="Times New Roman"/>
+          <w:lang w:val="en-GB"/>
+        </w:rPr>
+        <w:t xml:space="preserve"> </w:t>
+      </w:r>
+      <w:proofErr w:type="spellStart"/>
+      <w:r>
+        <w:rPr>
+          <w:rFonts w:ascii="Times New Roman" w:hAnsi="Times New Roman" w:cs="Times New Roman"/>
+          <w:lang w:val="en-GB"/>
+        </w:rPr>
+        <w:t>protes</w:t>
+      </w:r>
+      <w:proofErr w:type="spellEnd"/>
+      <w:r>
+        <w:rPr>
+          <w:rFonts w:ascii="Times New Roman" w:hAnsi="Times New Roman" w:cs="Times New Roman"/>
+          <w:lang w:val="en-GB"/>
+        </w:rPr>
+        <w:t xml:space="preserve"> </w:t>
+      </w:r>
+      <w:proofErr w:type="spellStart"/>
+      <w:r>
+        <w:rPr>
+          <w:rFonts w:ascii="Times New Roman" w:hAnsi="Times New Roman" w:cs="Times New Roman"/>
+          <w:lang w:val="en-GB"/>
+        </w:rPr>
+        <w:t>jika</w:t>
+      </w:r>
+      <w:proofErr w:type="spellEnd"/>
+      <w:r>
+        <w:rPr>
+          <w:rFonts w:ascii="Times New Roman" w:hAnsi="Times New Roman" w:cs="Times New Roman"/>
+          <w:lang w:val="en-GB"/>
+        </w:rPr>
+        <w:t xml:space="preserve"> data </w:t>
+      </w:r>
+      <w:proofErr w:type="spellStart"/>
+      <w:r>
+        <w:rPr>
+          <w:rFonts w:ascii="Times New Roman" w:hAnsi="Times New Roman" w:cs="Times New Roman"/>
+          <w:lang w:val="en-GB"/>
+        </w:rPr>
+        <w:t>tersebut</w:t>
+      </w:r>
+      <w:proofErr w:type="spellEnd"/>
+      <w:r>
+        <w:rPr>
+          <w:rFonts w:ascii="Times New Roman" w:hAnsi="Times New Roman" w:cs="Times New Roman"/>
+          <w:lang w:val="en-GB"/>
+        </w:rPr>
+        <w:t xml:space="preserve"> </w:t>
+      </w:r>
+      <w:proofErr w:type="spellStart"/>
+      <w:r>
+        <w:rPr>
+          <w:rFonts w:ascii="Times New Roman" w:hAnsi="Times New Roman" w:cs="Times New Roman"/>
+          <w:lang w:val="en-GB"/>
+        </w:rPr>
+        <w:t>tidak</w:t>
+      </w:r>
+      <w:proofErr w:type="spellEnd"/>
+      <w:r>
+        <w:rPr>
+          <w:rFonts w:ascii="Times New Roman" w:hAnsi="Times New Roman" w:cs="Times New Roman"/>
+          <w:lang w:val="en-GB"/>
+        </w:rPr>
+        <w:t xml:space="preserve"> </w:t>
+      </w:r>
+      <w:proofErr w:type="spellStart"/>
+      <w:r>
+        <w:rPr>
+          <w:rFonts w:ascii="Times New Roman" w:hAnsi="Times New Roman" w:cs="Times New Roman"/>
+          <w:lang w:val="en-GB"/>
+        </w:rPr>
+        <w:t>ada</w:t>
+      </w:r>
+      <w:proofErr w:type="spellEnd"/>
+      <w:r>
+        <w:rPr>
+          <w:rFonts w:ascii="Times New Roman" w:hAnsi="Times New Roman" w:cs="Times New Roman"/>
+          <w:lang w:val="en-GB"/>
+        </w:rPr>
+        <w:t xml:space="preserve"> </w:t>
+      </w:r>
+      <w:proofErr w:type="spellStart"/>
+      <w:r>
+        <w:rPr>
+          <w:rFonts w:ascii="Times New Roman" w:hAnsi="Times New Roman" w:cs="Times New Roman"/>
+          <w:lang w:val="en-GB"/>
+        </w:rPr>
+        <w:t>dalam</w:t>
+      </w:r>
+      <w:proofErr w:type="spellEnd"/>
+      <w:r>
+        <w:rPr>
+          <w:rFonts w:ascii="Times New Roman" w:hAnsi="Times New Roman" w:cs="Times New Roman"/>
+          <w:lang w:val="en-GB"/>
+        </w:rPr>
+        <w:t xml:space="preserve"> </w:t>
+      </w:r>
+      <w:proofErr w:type="spellStart"/>
+      <w:r>
+        <w:rPr>
+          <w:rFonts w:ascii="Times New Roman" w:hAnsi="Times New Roman" w:cs="Times New Roman"/>
+          <w:lang w:val="en-GB"/>
+        </w:rPr>
+        <w:t>kiriman</w:t>
+      </w:r>
+      <w:proofErr w:type="spellEnd"/>
+      <w:r>
+        <w:rPr>
+          <w:rFonts w:ascii="Times New Roman" w:hAnsi="Times New Roman" w:cs="Times New Roman"/>
+          <w:lang w:val="en-GB"/>
+        </w:rPr>
+        <w:t xml:space="preserve"> </w:t>
+      </w:r>
+      <w:proofErr w:type="spellStart"/>
+      <w:r>
+        <w:rPr>
+          <w:rFonts w:ascii="Times New Roman" w:hAnsi="Times New Roman" w:cs="Times New Roman"/>
+          <w:lang w:val="en-GB"/>
+        </w:rPr>
+        <w:t>pengguna</w:t>
+      </w:r>
+      <w:proofErr w:type="spellEnd"/>
+      <w:r>
+        <w:rPr>
+          <w:rFonts w:ascii="Times New Roman" w:hAnsi="Times New Roman" w:cs="Times New Roman"/>
+          <w:lang w:val="en-GB"/>
+        </w:rPr>
+        <w:t>.</w:t>
+      </w:r>
+    </w:p>
+    <w:p>
+      <w:pPr>
+        <w:jc w:val="both"/>
+        <w:rPr>
+          <w:rFonts w:ascii="Times New Roman" w:hAnsi="Times New Roman" w:cs="Times New Roman"/>
+          <w:lang w:val="en-GB"/>
+        </w:rPr>
+      </w:pPr>
+      <w:r>
+        <w:rPr>
+          <w:rFonts w:ascii="Times New Roman" w:hAnsi="Times New Roman" w:cs="Times New Roman"/>
+          <w:lang w:val="en-GB"/>
+        </w:rPr>
+        <w:t xml:space="preserve">Kode </w:t>
+      </w:r>
+      <w:proofErr w:type="spellStart"/>
+      <w:r>
+        <w:rPr>
+          <w:rFonts w:ascii="Times New Roman" w:hAnsi="Times New Roman" w:cs="Times New Roman"/>
+          <w:lang w:val="en-GB"/>
+        </w:rPr>
+        <w:t>ini</w:t>
+      </w:r>
+      <w:proofErr w:type="spellEnd"/>
+      <w:r>
+        <w:rPr>
+          <w:rFonts w:ascii="Times New Roman" w:hAnsi="Times New Roman" w:cs="Times New Roman"/>
+          <w:lang w:val="en-GB"/>
+        </w:rPr>
+        <w:t xml:space="preserve"> </w:t>
+      </w:r>
+      <w:proofErr w:type="spellStart"/>
+      <w:r>
+        <w:rPr>
+          <w:rFonts w:ascii="Times New Roman" w:hAnsi="Times New Roman" w:cs="Times New Roman"/>
+          <w:lang w:val="en-GB"/>
+        </w:rPr>
+        <w:t>memastikan</w:t>
+      </w:r>
+      <w:proofErr w:type="spellEnd"/>
+      <w:r>
+        <w:rPr>
+          <w:rFonts w:ascii="Times New Roman" w:hAnsi="Times New Roman" w:cs="Times New Roman"/>
+          <w:lang w:val="en-GB"/>
+        </w:rPr>
+        <w:t xml:space="preserve"> proses Edit Data berjalan </w:t>
+      </w:r>
+      <w:proofErr w:type="spellStart"/>
+      <w:r>
+        <w:rPr>
+          <w:rFonts w:ascii="Times New Roman" w:hAnsi="Times New Roman" w:cs="Times New Roman"/>
+          <w:lang w:val="en-GB"/>
+        </w:rPr>
+        <w:t>fleksibel</w:t>
+      </w:r>
+      <w:proofErr w:type="spellEnd"/>
+      <w:r>
+        <w:rPr>
+          <w:rFonts w:ascii="Times New Roman" w:hAnsi="Times New Roman" w:cs="Times New Roman"/>
+          <w:lang w:val="en-GB"/>
+        </w:rPr>
+        <w:t xml:space="preserve"> </w:t>
+      </w:r>
+      <w:proofErr w:type="spellStart"/>
+      <w:r>
+        <w:rPr>
+          <w:rFonts w:ascii="Times New Roman" w:hAnsi="Times New Roman" w:cs="Times New Roman"/>
+          <w:lang w:val="en-GB"/>
+        </w:rPr>
+        <w:t>tapi</w:t>
+      </w:r>
+      <w:proofErr w:type="spellEnd"/>
+      <w:r>
+        <w:rPr>
+          <w:rFonts w:ascii="Times New Roman" w:hAnsi="Times New Roman" w:cs="Times New Roman"/>
+          <w:lang w:val="en-GB"/>
+        </w:rPr>
+        <w:t xml:space="preserve"> </w:t>
+      </w:r>
+      <w:proofErr w:type="spellStart"/>
+      <w:r>
+        <w:rPr>
+          <w:rFonts w:ascii="Times New Roman" w:hAnsi="Times New Roman" w:cs="Times New Roman"/>
+          <w:lang w:val="en-GB"/>
+        </w:rPr>
+        <w:t>tetap</w:t>
+      </w:r>
+      <w:proofErr w:type="spellEnd"/>
+      <w:r>
+        <w:rPr>
+          <w:rFonts w:ascii="Times New Roman" w:hAnsi="Times New Roman" w:cs="Times New Roman"/>
+          <w:lang w:val="en-GB"/>
+        </w:rPr>
+        <w:t xml:space="preserve"> </w:t>
+      </w:r>
+      <w:proofErr w:type="spellStart"/>
+      <w:r>
+        <w:rPr>
+          <w:rFonts w:ascii="Times New Roman" w:hAnsi="Times New Roman" w:cs="Times New Roman"/>
+          <w:lang w:val="en-GB"/>
+        </w:rPr>
+        <w:t>aman</w:t>
+      </w:r>
+      <w:proofErr w:type="spellEnd"/>
+      <w:r>
+        <w:rPr>
+          <w:rFonts w:ascii="Times New Roman" w:hAnsi="Times New Roman" w:cs="Times New Roman"/>
+          <w:lang w:val="en-GB"/>
+        </w:rPr>
+        <w:t>.</w:t>
+      </w:r>
+    </w:p>
+    <w:p>
+      <w:pPr>
+        <w:jc w:val="both"/>
+        <w:rPr>
+          <w:rFonts w:ascii="Times New Roman" w:hAnsi="Times New Roman" w:cs="Times New Roman"/>
+          <w:lang w:val="en-GB"/>
+        </w:rPr>
+      </w:pPr>
+    </w:p>
+    <w:p>
+      <w:pPr>
+        <w:jc w:val="both"/>
+        <w:rPr>
+          <w:rFonts w:ascii="Times New Roman" w:hAnsi="Times New Roman" w:cs="Times New Roman"/>
+          <w:lang w:val="en-GB"/>
+        </w:rPr>
+      </w:pPr>
+      <w:r>
+        <w:rPr>
+          <w:rFonts w:ascii="Times New Roman" w:hAnsi="Times New Roman" w:cs="Times New Roman"/>
+          <w:lang w:val="en-GB"/>
+        </w:rPr>
+        <w:lastRenderedPageBreak/>
+        <w:t xml:space="preserve">15. </w:t>
       </w:r>
     </w:p>
     <w:sectPr>
@@ -14117,9 +14474,9 @@
 <file path=word/numbering.xml><?xml version="1.0" encoding="utf-8"?>
 <w:numbering xmlns:wpc="http://schemas.microsoft.com/office/word/2010/wordprocessingCanvas" xmlns:cx="http://schemas.microsoft.com/office/drawing/2014/chartex" xmlns:cx1="http://schemas.microsoft.com/office/drawing/2015/9/8/chartex" xmlns:cx2="http://schemas.microsoft.com/office/drawing/2015/10/21/chartex" xmlns:cx3="http://schemas.microsoft.com/office/drawing/2016/5/9/chartex" xmlns:cx4="http://schemas.microsoft.com/office/drawing/2016/5/10/chartex" xmlns:cx5="http://schemas.microsoft.com/office/drawing/2016/5/11/chartex" xmlns:cx6="http://schemas.microsoft.com/office/drawing/2016/5/12/chartex" xmlns:cx7="http://schemas.microsoft.com/office/drawing/2016/5/13/chartex" xmlns:cx8="http://schemas.microsoft.com/office/drawing/2016/5/14/chartex" xmlns:mc="http://schemas.openxmlformats.org/markup-compatibility/2006" xmlns:aink="http://schemas.microsoft.com/office/drawing/2016/ink" xmlns:am3d="http://schemas.microsoft.com/office/drawing/2017/model3d" xmlns:o="urn:schemas-microsoft-com:office:office" xmlns:oel="http://schemas.microsoft.com/office/2019/extlst" xmlns:r="http://schemas.openxmlformats.org/officeDocument/2006/relationships" xmlns:m="http://schemas.openxmlformats.org/officeDocument/2006/math" xmlns:v="urn:schemas-microsoft-com:vml" xmlns:wp14="http://schemas.microsoft.com/office/word/2010/wordprocessingDrawing" xmlns:wp="http://schemas.openxmlformats.org/drawingml/2006/wordprocessingDrawing" xmlns:w10="urn:schemas-microsoft-com:office:word" xmlns:w="http://schemas.openxmlformats.org/wordprocessingml/2006/main" xmlns:w14="http://schemas.microsoft.com/office/word/2010/wordml" xmlns:w15="http://schemas.microsoft.com/office/word/2012/wordml" xmlns:w16cex="http://schemas.microsoft.com/office/word/2018/wordml/cex" xmlns:w16cid="http://schemas.microsoft.com/office/word/2016/wordml/cid" xmlns:w16="http://schemas.microsoft.com/office/word/2018/wordml" xmlns:w16du="http://schemas.microsoft.com/office/word/2023/wordml/word16du" xmlns:w16sdtdh="http://schemas.microsoft.com/office/word/2020/wordml/sdtdatahash" xmlns:w16sdtfl="http://schemas.microsoft.com/office/word/2024/wordml/sdtformatlock" xmlns:w16se="http://schemas.microsoft.com/office/word/2015/wordml/symex" xmlns:wpg="http://schemas.microsoft.com/office/word/2010/wordprocessingGroup" xmlns:wpi="http://schemas.microsoft.com/office/word/2010/wordprocessingInk" xmlns:wne="http://schemas.microsoft.com/office/word/2006/wordml" xmlns:wps="http://schemas.microsoft.com/office/word/2010/wordprocessingShape" mc:Ignorable="w14 w15 w16se w16cid w16 w16cex w16sdtdh w16sdtfl w16du wp14">
   <w:abstractNum w:abstractNumId="0" w15:restartNumberingAfterBreak="0">
-    <w:nsid w:val="181470EA"/>
+    <w:nsid w:val="048647D7"/>
     <w:multiLevelType w:val="hybridMultilevel"/>
-    <w:tmpl w:val="44EC6C34"/>
+    <w:tmpl w:val="6C9C2CF6"/>
     <w:lvl w:ilvl="0" w:tplc="38090001">
       <w:start w:val="1"/>
       <w:numFmt w:val="bullet"/>
@@ -14230,9 +14587,9 @@
     </w:lvl>
   </w:abstractNum>
   <w:abstractNum w:abstractNumId="1" w15:restartNumberingAfterBreak="0">
-    <w:nsid w:val="34990981"/>
+    <w:nsid w:val="181470EA"/>
     <w:multiLevelType w:val="hybridMultilevel"/>
-    <w:tmpl w:val="79D8D03C"/>
+    <w:tmpl w:val="44EC6C34"/>
     <w:lvl w:ilvl="0" w:tplc="38090001">
       <w:start w:val="1"/>
       <w:numFmt w:val="bullet"/>
@@ -14343,9 +14700,9 @@
     </w:lvl>
   </w:abstractNum>
   <w:abstractNum w:abstractNumId="2" w15:restartNumberingAfterBreak="0">
-    <w:nsid w:val="359E1A57"/>
+    <w:nsid w:val="34990981"/>
     <w:multiLevelType w:val="hybridMultilevel"/>
-    <w:tmpl w:val="1B6C6A10"/>
+    <w:tmpl w:val="79D8D03C"/>
     <w:lvl w:ilvl="0" w:tplc="38090001">
       <w:start w:val="1"/>
       <w:numFmt w:val="bullet"/>
@@ -14456,9 +14813,9 @@
     </w:lvl>
   </w:abstractNum>
   <w:abstractNum w:abstractNumId="3" w15:restartNumberingAfterBreak="0">
-    <w:nsid w:val="64A022BC"/>
+    <w:nsid w:val="359E1A57"/>
     <w:multiLevelType w:val="hybridMultilevel"/>
-    <w:tmpl w:val="7466E2BA"/>
+    <w:tmpl w:val="1B6C6A10"/>
     <w:lvl w:ilvl="0" w:tplc="38090001">
       <w:start w:val="1"/>
       <w:numFmt w:val="bullet"/>
@@ -14569,9 +14926,9 @@
     </w:lvl>
   </w:abstractNum>
   <w:abstractNum w:abstractNumId="4" w15:restartNumberingAfterBreak="0">
-    <w:nsid w:val="673C435B"/>
+    <w:nsid w:val="64A022BC"/>
     <w:multiLevelType w:val="hybridMultilevel"/>
-    <w:tmpl w:val="846CCAA0"/>
+    <w:tmpl w:val="7466E2BA"/>
     <w:lvl w:ilvl="0" w:tplc="38090001">
       <w:start w:val="1"/>
       <w:numFmt w:val="bullet"/>
@@ -14682,9 +15039,9 @@
     </w:lvl>
   </w:abstractNum>
   <w:abstractNum w:abstractNumId="5" w15:restartNumberingAfterBreak="0">
-    <w:nsid w:val="6CA82C32"/>
+    <w:nsid w:val="673C435B"/>
     <w:multiLevelType w:val="hybridMultilevel"/>
-    <w:tmpl w:val="ABCC36BA"/>
+    <w:tmpl w:val="846CCAA0"/>
     <w:lvl w:ilvl="0" w:tplc="38090001">
       <w:start w:val="1"/>
       <w:numFmt w:val="bullet"/>
@@ -14795,9 +15152,9 @@
     </w:lvl>
   </w:abstractNum>
   <w:abstractNum w:abstractNumId="6" w15:restartNumberingAfterBreak="0">
-    <w:nsid w:val="737805E1"/>
+    <w:nsid w:val="6CA82C32"/>
     <w:multiLevelType w:val="hybridMultilevel"/>
-    <w:tmpl w:val="8DF2E322"/>
+    <w:tmpl w:val="ABCC36BA"/>
     <w:lvl w:ilvl="0" w:tplc="38090001">
       <w:start w:val="1"/>
       <w:numFmt w:val="bullet"/>
@@ -14907,26 +15264,142 @@
       </w:rPr>
     </w:lvl>
   </w:abstractNum>
+  <w:abstractNum w:abstractNumId="7" w15:restartNumberingAfterBreak="0">
+    <w:nsid w:val="737805E1"/>
+    <w:multiLevelType w:val="hybridMultilevel"/>
+    <w:tmpl w:val="8DF2E322"/>
+    <w:lvl w:ilvl="0" w:tplc="38090001">
+      <w:start w:val="1"/>
+      <w:numFmt w:val="bullet"/>
+      <w:lvlText w:val=""/>
+      <w:lvlJc w:val="left"/>
+      <w:pPr>
+        <w:ind w:left="720" w:hanging="360"/>
+      </w:pPr>
+      <w:rPr>
+        <w:rFonts w:ascii="Symbol" w:hAnsi="Symbol" w:hint="default"/>
+      </w:rPr>
+    </w:lvl>
+    <w:lvl w:ilvl="1" w:tplc="38090003" w:tentative="1">
+      <w:start w:val="1"/>
+      <w:numFmt w:val="bullet"/>
+      <w:lvlText w:val="o"/>
+      <w:lvlJc w:val="left"/>
+      <w:pPr>
+        <w:ind w:left="1440" w:hanging="360"/>
+      </w:pPr>
+      <w:rPr>
+        <w:rFonts w:ascii="Courier New" w:hAnsi="Courier New" w:cs="Courier New" w:hint="default"/>
+      </w:rPr>
+    </w:lvl>
+    <w:lvl w:ilvl="2" w:tplc="38090005" w:tentative="1">
+      <w:start w:val="1"/>
+      <w:numFmt w:val="bullet"/>
+      <w:lvlText w:val=""/>
+      <w:lvlJc w:val="left"/>
+      <w:pPr>
+        <w:ind w:left="2160" w:hanging="360"/>
+      </w:pPr>
+      <w:rPr>
+        <w:rFonts w:ascii="Wingdings" w:hAnsi="Wingdings" w:hint="default"/>
+      </w:rPr>
+    </w:lvl>
+    <w:lvl w:ilvl="3" w:tplc="38090001" w:tentative="1">
+      <w:start w:val="1"/>
+      <w:numFmt w:val="bullet"/>
+      <w:lvlText w:val=""/>
+      <w:lvlJc w:val="left"/>
+      <w:pPr>
+        <w:ind w:left="2880" w:hanging="360"/>
+      </w:pPr>
+      <w:rPr>
+        <w:rFonts w:ascii="Symbol" w:hAnsi="Symbol" w:hint="default"/>
+      </w:rPr>
+    </w:lvl>
+    <w:lvl w:ilvl="4" w:tplc="38090003" w:tentative="1">
+      <w:start w:val="1"/>
+      <w:numFmt w:val="bullet"/>
+      <w:lvlText w:val="o"/>
+      <w:lvlJc w:val="left"/>
+      <w:pPr>
+        <w:ind w:left="3600" w:hanging="360"/>
+      </w:pPr>
+      <w:rPr>
+        <w:rFonts w:ascii="Courier New" w:hAnsi="Courier New" w:cs="Courier New" w:hint="default"/>
+      </w:rPr>
+    </w:lvl>
+    <w:lvl w:ilvl="5" w:tplc="38090005" w:tentative="1">
+      <w:start w:val="1"/>
+      <w:numFmt w:val="bullet"/>
+      <w:lvlText w:val=""/>
+      <w:lvlJc w:val="left"/>
+      <w:pPr>
+        <w:ind w:left="4320" w:hanging="360"/>
+      </w:pPr>
+      <w:rPr>
+        <w:rFonts w:ascii="Wingdings" w:hAnsi="Wingdings" w:hint="default"/>
+      </w:rPr>
+    </w:lvl>
+    <w:lvl w:ilvl="6" w:tplc="38090001" w:tentative="1">
+      <w:start w:val="1"/>
+      <w:numFmt w:val="bullet"/>
+      <w:lvlText w:val=""/>
+      <w:lvlJc w:val="left"/>
+      <w:pPr>
+        <w:ind w:left="5040" w:hanging="360"/>
+      </w:pPr>
+      <w:rPr>
+        <w:rFonts w:ascii="Symbol" w:hAnsi="Symbol" w:hint="default"/>
+      </w:rPr>
+    </w:lvl>
+    <w:lvl w:ilvl="7" w:tplc="38090003" w:tentative="1">
+      <w:start w:val="1"/>
+      <w:numFmt w:val="bullet"/>
+      <w:lvlText w:val="o"/>
+      <w:lvlJc w:val="left"/>
+      <w:pPr>
+        <w:ind w:left="5760" w:hanging="360"/>
+      </w:pPr>
+      <w:rPr>
+        <w:rFonts w:ascii="Courier New" w:hAnsi="Courier New" w:cs="Courier New" w:hint="default"/>
+      </w:rPr>
+    </w:lvl>
+    <w:lvl w:ilvl="8" w:tplc="38090005" w:tentative="1">
+      <w:start w:val="1"/>
+      <w:numFmt w:val="bullet"/>
+      <w:lvlText w:val=""/>
+      <w:lvlJc w:val="left"/>
+      <w:pPr>
+        <w:ind w:left="6480" w:hanging="360"/>
+      </w:pPr>
+      <w:rPr>
+        <w:rFonts w:ascii="Wingdings" w:hAnsi="Wingdings" w:hint="default"/>
+      </w:rPr>
+    </w:lvl>
+  </w:abstractNum>
   <w:num w:numId="1" w16cid:durableId="517813677">
+    <w:abstractNumId w:val="5"/>
+  </w:num>
+  <w:num w:numId="2" w16cid:durableId="857735407">
+    <w:abstractNumId w:val="6"/>
+  </w:num>
+  <w:num w:numId="3" w16cid:durableId="134505">
+    <w:abstractNumId w:val="3"/>
+  </w:num>
+  <w:num w:numId="4" w16cid:durableId="1666083322">
+    <w:abstractNumId w:val="7"/>
+  </w:num>
+  <w:num w:numId="5" w16cid:durableId="864251512">
+    <w:abstractNumId w:val="2"/>
+  </w:num>
+  <w:num w:numId="6" w16cid:durableId="1060862237">
+    <w:abstractNumId w:val="1"/>
+  </w:num>
+  <w:num w:numId="7" w16cid:durableId="1772166354">
     <w:abstractNumId w:val="4"/>
   </w:num>
-  <w:num w:numId="2" w16cid:durableId="857735407">
-    <w:abstractNumId w:val="5"/>
-  </w:num>
-  <w:num w:numId="3" w16cid:durableId="134505">
-    <w:abstractNumId w:val="2"/>
-  </w:num>
-  <w:num w:numId="4" w16cid:durableId="1666083322">
-    <w:abstractNumId w:val="6"/>
-  </w:num>
-  <w:num w:numId="5" w16cid:durableId="864251512">
-    <w:abstractNumId w:val="1"/>
-  </w:num>
-  <w:num w:numId="6" w16cid:durableId="1060862237">
+  <w:num w:numId="8" w16cid:durableId="71900298">
     <w:abstractNumId w:val="0"/>
-  </w:num>
-  <w:num w:numId="7" w16cid:durableId="1772166354">
-    <w:abstractNumId w:val="3"/>
   </w:num>
 </w:numbering>
 </file>

</xml_diff>

<commit_message>
Membuat file conflict-kategori.util.ts untuk menstandardisasi penanganan error
</commit_message>
<xml_diff>
--- a/dokumentasi/24382001P_Lorensius Firngadi_IF 23 E_Dokumentasi.docx
+++ b/dokumentasi/24382001P_Lorensius Firngadi_IF 23 E_Dokumentasi.docx
@@ -245,26 +245,9 @@
           <w:rFonts w:ascii="Times New Roman" w:hAnsi="Times New Roman" w:cs="Times New Roman"/>
           <w:lang w:val="en-GB"/>
         </w:rPr>
-        <w:t xml:space="preserve"> Octaviansyah</w:t>
-      </w:r>
-      <w:proofErr w:type="gramStart"/>
-      <w:r>
-        <w:rPr>
-          <w:rFonts w:ascii="Times New Roman" w:hAnsi="Times New Roman" w:cs="Times New Roman"/>
-          <w:lang w:val="en-GB"/>
-        </w:rPr>
-        <w:t>, ,</w:t>
-      </w:r>
-      <w:proofErr w:type="gramEnd"/>
-      <w:r>
-        <w:rPr>
-          <w:rFonts w:ascii="Times New Roman" w:hAnsi="Times New Roman" w:cs="Times New Roman"/>
-          <w:lang w:val="en-GB"/>
-        </w:rPr>
-        <w:t xml:space="preserve"> </w:t>
-      </w:r>
-      <w:proofErr w:type="spellStart"/>
-      <w:proofErr w:type="gramStart"/>
+        <w:t xml:space="preserve"> Octaviansyah, , </w:t>
+      </w:r>
+      <w:proofErr w:type="spellStart"/>
       <w:r>
         <w:rPr>
           <w:rFonts w:ascii="Times New Roman" w:hAnsi="Times New Roman" w:cs="Times New Roman"/>
@@ -273,7 +256,6 @@
         <w:t>S.Kom</w:t>
       </w:r>
       <w:proofErr w:type="spellEnd"/>
-      <w:proofErr w:type="gramEnd"/>
       <w:r>
         <w:rPr>
           <w:rFonts w:ascii="Times New Roman" w:hAnsi="Times New Roman" w:cs="Times New Roman"/>
@@ -282,7 +264,6 @@
         <w:t xml:space="preserve">., </w:t>
       </w:r>
       <w:proofErr w:type="spellStart"/>
-      <w:proofErr w:type="gramStart"/>
       <w:r>
         <w:rPr>
           <w:rFonts w:ascii="Times New Roman" w:hAnsi="Times New Roman" w:cs="Times New Roman"/>
@@ -291,7 +272,6 @@
         <w:t>M.Kom</w:t>
       </w:r>
       <w:proofErr w:type="spellEnd"/>
-      <w:proofErr w:type="gramEnd"/>
       <w:r>
         <w:rPr>
           <w:rFonts w:ascii="Times New Roman" w:hAnsi="Times New Roman" w:cs="Times New Roman"/>
@@ -686,23 +666,7 @@
           <w:rFonts w:ascii="Times New Roman" w:hAnsi="Times New Roman" w:cs="Times New Roman"/>
           <w:lang w:val="en-GB"/>
         </w:rPr>
-        <w:t xml:space="preserve">Nama </w:t>
-      </w:r>
-      <w:proofErr w:type="gramStart"/>
-      <w:r>
-        <w:rPr>
-          <w:rFonts w:ascii="Times New Roman" w:hAnsi="Times New Roman" w:cs="Times New Roman"/>
-          <w:lang w:val="en-GB"/>
-        </w:rPr>
-        <w:t>Project :</w:t>
-      </w:r>
-      <w:proofErr w:type="gramEnd"/>
-      <w:r>
-        <w:rPr>
-          <w:rFonts w:ascii="Times New Roman" w:hAnsi="Times New Roman" w:cs="Times New Roman"/>
-          <w:lang w:val="en-GB"/>
-        </w:rPr>
-        <w:t xml:space="preserve"> </w:t>
+        <w:t xml:space="preserve">Nama Project : </w:t>
       </w:r>
       <w:proofErr w:type="spellStart"/>
       <w:r>
@@ -757,17 +721,8 @@
           <w:rFonts w:ascii="Times New Roman" w:hAnsi="Times New Roman" w:cs="Times New Roman"/>
           <w:lang w:val="en-GB"/>
         </w:rPr>
-        <w:t xml:space="preserve"> </w:t>
-      </w:r>
-      <w:proofErr w:type="gramStart"/>
-      <w:r>
-        <w:rPr>
-          <w:rFonts w:ascii="Times New Roman" w:hAnsi="Times New Roman" w:cs="Times New Roman"/>
-          <w:lang w:val="en-GB"/>
-        </w:rPr>
-        <w:t>Project :</w:t>
-      </w:r>
-      <w:proofErr w:type="gramEnd"/>
+        <w:t xml:space="preserve"> Project :</w:t>
+      </w:r>
     </w:p>
     <w:p>
       <w:pPr>
@@ -955,7 +910,6 @@
         <w:t xml:space="preserve"> </w:t>
       </w:r>
       <w:proofErr w:type="spellStart"/>
-      <w:proofErr w:type="gramStart"/>
       <w:r>
         <w:rPr>
           <w:rFonts w:ascii="Times New Roman" w:hAnsi="Times New Roman" w:cs="Times New Roman"/>
@@ -969,15 +923,7 @@
           <w:rFonts w:ascii="Times New Roman" w:hAnsi="Times New Roman" w:cs="Times New Roman"/>
           <w:lang w:val="en-GB"/>
         </w:rPr>
-        <w:t xml:space="preserve"> :</w:t>
-      </w:r>
-      <w:proofErr w:type="gramEnd"/>
-      <w:r>
-        <w:rPr>
-          <w:rFonts w:ascii="Times New Roman" w:hAnsi="Times New Roman" w:cs="Times New Roman"/>
-          <w:lang w:val="en-GB"/>
-        </w:rPr>
-        <w:t xml:space="preserve"> </w:t>
+        <w:t xml:space="preserve"> : </w:t>
       </w:r>
       <w:proofErr w:type="spellStart"/>
       <w:r>
@@ -1998,9 +1944,9 @@
           <w:bCs/>
           <w:lang w:val="en-GB"/>
         </w:rPr>
-        <w:t xml:space="preserve"> </w:t>
-      </w:r>
-      <w:proofErr w:type="gramStart"/>
+        <w:t xml:space="preserve"> file .</w:t>
+      </w:r>
+      <w:proofErr w:type="spellStart"/>
       <w:r>
         <w:rPr>
           <w:rFonts w:ascii="Times New Roman" w:hAnsi="Times New Roman" w:cs="Times New Roman"/>
@@ -2008,20 +1954,9 @@
           <w:bCs/>
           <w:lang w:val="en-GB"/>
         </w:rPr>
-        <w:t>file .</w:t>
-      </w:r>
-      <w:proofErr w:type="spellStart"/>
-      <w:r>
-        <w:rPr>
-          <w:rFonts w:ascii="Times New Roman" w:hAnsi="Times New Roman" w:cs="Times New Roman"/>
-          <w:b/>
-          <w:bCs/>
-          <w:lang w:val="en-GB"/>
-        </w:rPr>
         <w:t>gitignore</w:t>
       </w:r>
       <w:proofErr w:type="spellEnd"/>
-      <w:proofErr w:type="gramEnd"/>
       <w:r>
         <w:rPr>
           <w:rFonts w:ascii="Times New Roman" w:hAnsi="Times New Roman" w:cs="Times New Roman"/>
@@ -2129,15 +2064,7 @@
           <w:rFonts w:ascii="Times New Roman" w:hAnsi="Times New Roman" w:cs="Times New Roman"/>
           <w:lang w:val="en-GB"/>
         </w:rPr>
-        <w:t xml:space="preserve"> </w:t>
-      </w:r>
-      <w:proofErr w:type="gramStart"/>
-      <w:r>
-        <w:rPr>
-          <w:rFonts w:ascii="Times New Roman" w:hAnsi="Times New Roman" w:cs="Times New Roman"/>
-          <w:lang w:val="en-GB"/>
-        </w:rPr>
-        <w:t>file .</w:t>
+        <w:t xml:space="preserve"> file .</w:t>
       </w:r>
       <w:proofErr w:type="spellStart"/>
       <w:r>
@@ -2148,7 +2075,6 @@
         <w:t>gitignore</w:t>
       </w:r>
       <w:proofErr w:type="spellEnd"/>
-      <w:proofErr w:type="gramEnd"/>
       <w:r>
         <w:rPr>
           <w:rFonts w:ascii="Times New Roman" w:hAnsi="Times New Roman" w:cs="Times New Roman"/>
@@ -2416,7 +2342,6 @@
           <w:lang w:val="en-GB"/>
         </w:rPr>
       </w:pPr>
-      <w:proofErr w:type="gramStart"/>
       <w:r>
         <w:rPr>
           <w:rFonts w:ascii="Times New Roman" w:hAnsi="Times New Roman" w:cs="Times New Roman"/>
@@ -2433,21 +2358,12 @@
         <w:t>gitignore</w:t>
       </w:r>
       <w:proofErr w:type="spellEnd"/>
-      <w:proofErr w:type="gramEnd"/>
-      <w:r>
-        <w:rPr>
-          <w:rFonts w:ascii="Times New Roman" w:hAnsi="Times New Roman" w:cs="Times New Roman"/>
-          <w:lang w:val="en-GB"/>
-        </w:rPr>
-        <w:t xml:space="preserve"> </w:t>
-      </w:r>
-      <w:proofErr w:type="gramStart"/>
-      <w:r>
-        <w:rPr>
-          <w:rFonts w:ascii="Times New Roman" w:hAnsi="Times New Roman" w:cs="Times New Roman"/>
-          <w:lang w:val="en-GB"/>
-        </w:rPr>
-        <w:t xml:space="preserve">sangat  </w:t>
+      <w:r>
+        <w:rPr>
+          <w:rFonts w:ascii="Times New Roman" w:hAnsi="Times New Roman" w:cs="Times New Roman"/>
+          <w:lang w:val="en-GB"/>
+        </w:rPr>
+        <w:t xml:space="preserve"> sangat  </w:t>
       </w:r>
       <w:proofErr w:type="spellStart"/>
       <w:r>
@@ -2458,7 +2374,6 @@
         <w:t>bermanfaat</w:t>
       </w:r>
       <w:proofErr w:type="spellEnd"/>
-      <w:proofErr w:type="gramEnd"/>
       <w:r>
         <w:rPr>
           <w:rFonts w:ascii="Times New Roman" w:hAnsi="Times New Roman" w:cs="Times New Roman"/>
@@ -2950,7 +2865,6 @@
         <w:t xml:space="preserve">Edit </w:t>
       </w:r>
       <w:proofErr w:type="spellStart"/>
-      <w:proofErr w:type="gramStart"/>
       <w:r>
         <w:rPr>
           <w:rFonts w:ascii="Times New Roman" w:hAnsi="Times New Roman" w:cs="Times New Roman"/>
@@ -2961,7 +2875,6 @@
         <w:t>tsconfig.json</w:t>
       </w:r>
       <w:proofErr w:type="spellEnd"/>
-      <w:proofErr w:type="gramEnd"/>
       <w:r>
         <w:rPr>
           <w:rFonts w:ascii="Times New Roman" w:hAnsi="Times New Roman" w:cs="Times New Roman"/>
@@ -3580,21 +3493,12 @@
         <w:t>seperti</w:t>
       </w:r>
       <w:proofErr w:type="spellEnd"/>
-      <w:proofErr w:type="gramStart"/>
-      <w:r>
-        <w:rPr>
-          <w:rFonts w:ascii="Times New Roman" w:hAnsi="Times New Roman" w:cs="Times New Roman"/>
-          <w:lang w:val="en-GB"/>
-        </w:rPr>
-        <w:t xml:space="preserve"> ../../..</w:t>
-      </w:r>
-      <w:proofErr w:type="gramEnd"/>
-      <w:r>
-        <w:rPr>
-          <w:rFonts w:ascii="Times New Roman" w:hAnsi="Times New Roman" w:cs="Times New Roman"/>
-          <w:lang w:val="en-GB"/>
-        </w:rPr>
-        <w:t xml:space="preserve">/folder/file, </w:t>
+      <w:r>
+        <w:rPr>
+          <w:rFonts w:ascii="Times New Roman" w:hAnsi="Times New Roman" w:cs="Times New Roman"/>
+          <w:lang w:val="en-GB"/>
+        </w:rPr>
+        <w:t xml:space="preserve"> ../../../folder/file, </w:t>
       </w:r>
       <w:proofErr w:type="spellStart"/>
       <w:r>
@@ -4872,7 +4776,6 @@
         <w:t xml:space="preserve">Update </w:t>
       </w:r>
       <w:proofErr w:type="spellStart"/>
-      <w:proofErr w:type="gramStart"/>
       <w:r>
         <w:rPr>
           <w:b/>
@@ -4881,7 +4784,6 @@
         <w:t>package.json</w:t>
       </w:r>
       <w:proofErr w:type="spellEnd"/>
-      <w:proofErr w:type="gramEnd"/>
       <w:r>
         <w:rPr>
           <w:b/>
@@ -7824,7 +7726,6 @@
         <w:t xml:space="preserve"> File </w:t>
       </w:r>
       <w:proofErr w:type="spellStart"/>
-      <w:proofErr w:type="gramStart"/>
       <w:r>
         <w:rPr>
           <w:rFonts w:ascii="Times New Roman" w:hAnsi="Times New Roman" w:cs="Times New Roman"/>
@@ -7832,17 +7733,7 @@
           <w:bCs/>
           <w:lang w:val="en-GB"/>
         </w:rPr>
-        <w:t>prisma.service</w:t>
-      </w:r>
-      <w:proofErr w:type="gramEnd"/>
-      <w:r>
-        <w:rPr>
-          <w:rFonts w:ascii="Times New Roman" w:hAnsi="Times New Roman" w:cs="Times New Roman"/>
-          <w:b/>
-          <w:bCs/>
-          <w:lang w:val="en-GB"/>
-        </w:rPr>
-        <w:t>.ts</w:t>
+        <w:t>prisma.service.ts</w:t>
       </w:r>
       <w:proofErr w:type="spellEnd"/>
     </w:p>
@@ -9264,23 +9155,7 @@
           <w:rFonts w:ascii="Times New Roman" w:hAnsi="Times New Roman" w:cs="Times New Roman"/>
           <w:lang w:val="en-GB"/>
         </w:rPr>
-        <w:t xml:space="preserve">  id: </w:t>
-      </w:r>
-      <w:proofErr w:type="gramStart"/>
-      <w:r>
-        <w:rPr>
-          <w:rFonts w:ascii="Times New Roman" w:hAnsi="Times New Roman" w:cs="Times New Roman"/>
-          <w:lang w:val="en-GB"/>
-        </w:rPr>
-        <w:t xml:space="preserve">string;   </w:t>
-      </w:r>
-      <w:proofErr w:type="gramEnd"/>
-      <w:r>
-        <w:rPr>
-          <w:rFonts w:ascii="Times New Roman" w:hAnsi="Times New Roman" w:cs="Times New Roman"/>
-          <w:lang w:val="en-GB"/>
-        </w:rPr>
-        <w:t xml:space="preserve">         # KTP/ID </w:t>
+        <w:t xml:space="preserve">  id: string;            # KTP/ID </w:t>
       </w:r>
       <w:proofErr w:type="spellStart"/>
       <w:r>
@@ -9361,23 +9236,7 @@
           <w:rFonts w:ascii="Times New Roman" w:hAnsi="Times New Roman" w:cs="Times New Roman"/>
           <w:lang w:val="en-GB"/>
         </w:rPr>
-        <w:t xml:space="preserve">  name: </w:t>
-      </w:r>
-      <w:proofErr w:type="gramStart"/>
-      <w:r>
-        <w:rPr>
-          <w:rFonts w:ascii="Times New Roman" w:hAnsi="Times New Roman" w:cs="Times New Roman"/>
-          <w:lang w:val="en-GB"/>
-        </w:rPr>
-        <w:t xml:space="preserve">string;   </w:t>
-      </w:r>
-      <w:proofErr w:type="gramEnd"/>
-      <w:r>
-        <w:rPr>
-          <w:rFonts w:ascii="Times New Roman" w:hAnsi="Times New Roman" w:cs="Times New Roman"/>
-          <w:lang w:val="en-GB"/>
-        </w:rPr>
-        <w:t xml:space="preserve">       # Nama </w:t>
+        <w:t xml:space="preserve">  name: string;          # Nama </w:t>
       </w:r>
       <w:proofErr w:type="spellStart"/>
       <w:r>
@@ -9442,23 +9301,7 @@
           <w:rFonts w:ascii="Times New Roman" w:hAnsi="Times New Roman" w:cs="Times New Roman"/>
           <w:lang w:val="en-GB"/>
         </w:rPr>
-        <w:t xml:space="preserve">  slug: </w:t>
-      </w:r>
-      <w:proofErr w:type="gramStart"/>
-      <w:r>
-        <w:rPr>
-          <w:rFonts w:ascii="Times New Roman" w:hAnsi="Times New Roman" w:cs="Times New Roman"/>
-          <w:lang w:val="en-GB"/>
-        </w:rPr>
-        <w:t xml:space="preserve">string;   </w:t>
-      </w:r>
-      <w:proofErr w:type="gramEnd"/>
-      <w:r>
-        <w:rPr>
-          <w:rFonts w:ascii="Times New Roman" w:hAnsi="Times New Roman" w:cs="Times New Roman"/>
-          <w:lang w:val="en-GB"/>
-        </w:rPr>
-        <w:t xml:space="preserve">       # Nama </w:t>
+        <w:t xml:space="preserve">  slug: string;          # Nama </w:t>
       </w:r>
       <w:proofErr w:type="spellStart"/>
       <w:r>
@@ -9523,96 +9366,582 @@
           <w:rFonts w:ascii="Times New Roman" w:hAnsi="Times New Roman" w:cs="Times New Roman"/>
           <w:lang w:val="en-GB"/>
         </w:rPr>
+        <w:t xml:space="preserve">  description?: string;  # </w:t>
+      </w:r>
+      <w:proofErr w:type="spellStart"/>
+      <w:r>
+        <w:rPr>
+          <w:rFonts w:ascii="Times New Roman" w:hAnsi="Times New Roman" w:cs="Times New Roman"/>
+          <w:lang w:val="en-GB"/>
+        </w:rPr>
+        <w:t>Penjelasan</w:t>
+      </w:r>
+      <w:proofErr w:type="spellEnd"/>
+      <w:r>
+        <w:rPr>
+          <w:rFonts w:ascii="Times New Roman" w:hAnsi="Times New Roman" w:cs="Times New Roman"/>
+          <w:lang w:val="en-GB"/>
+        </w:rPr>
+        <w:t xml:space="preserve"> </w:t>
+      </w:r>
+      <w:proofErr w:type="spellStart"/>
+      <w:r>
+        <w:rPr>
+          <w:rFonts w:ascii="Times New Roman" w:hAnsi="Times New Roman" w:cs="Times New Roman"/>
+          <w:lang w:val="en-GB"/>
+        </w:rPr>
+        <w:t>singkat</w:t>
+      </w:r>
+      <w:proofErr w:type="spellEnd"/>
+      <w:r>
+        <w:rPr>
+          <w:rFonts w:ascii="Times New Roman" w:hAnsi="Times New Roman" w:cs="Times New Roman"/>
+          <w:lang w:val="en-GB"/>
+        </w:rPr>
+        <w:t xml:space="preserve"> (</w:t>
+      </w:r>
+      <w:proofErr w:type="spellStart"/>
+      <w:r>
+        <w:rPr>
+          <w:rFonts w:ascii="Times New Roman" w:hAnsi="Times New Roman" w:cs="Times New Roman"/>
+          <w:lang w:val="en-GB"/>
+        </w:rPr>
+        <w:t>tanda</w:t>
+      </w:r>
+      <w:proofErr w:type="spellEnd"/>
+      <w:r>
+        <w:rPr>
+          <w:rFonts w:ascii="Times New Roman" w:hAnsi="Times New Roman" w:cs="Times New Roman"/>
+          <w:lang w:val="en-GB"/>
+        </w:rPr>
+        <w:t xml:space="preserve"> ? </w:t>
+      </w:r>
+      <w:proofErr w:type="spellStart"/>
+      <w:r>
+        <w:rPr>
+          <w:rFonts w:ascii="Times New Roman" w:hAnsi="Times New Roman" w:cs="Times New Roman"/>
+          <w:lang w:val="en-GB"/>
+        </w:rPr>
+        <w:t>artinya</w:t>
+      </w:r>
+      <w:proofErr w:type="spellEnd"/>
+      <w:r>
+        <w:rPr>
+          <w:rFonts w:ascii="Times New Roman" w:hAnsi="Times New Roman" w:cs="Times New Roman"/>
+          <w:lang w:val="en-GB"/>
+        </w:rPr>
+        <w:t xml:space="preserve"> </w:t>
+      </w:r>
+      <w:proofErr w:type="spellStart"/>
+      <w:r>
+        <w:rPr>
+          <w:rFonts w:ascii="Times New Roman" w:hAnsi="Times New Roman" w:cs="Times New Roman"/>
+          <w:lang w:val="en-GB"/>
+        </w:rPr>
+        <w:t>boleh</w:t>
+      </w:r>
+      <w:proofErr w:type="spellEnd"/>
+      <w:r>
+        <w:rPr>
+          <w:rFonts w:ascii="Times New Roman" w:hAnsi="Times New Roman" w:cs="Times New Roman"/>
+          <w:lang w:val="en-GB"/>
+        </w:rPr>
+        <w:t xml:space="preserve"> </w:t>
+      </w:r>
+      <w:proofErr w:type="spellStart"/>
+      <w:r>
+        <w:rPr>
+          <w:rFonts w:ascii="Times New Roman" w:hAnsi="Times New Roman" w:cs="Times New Roman"/>
+          <w:lang w:val="en-GB"/>
+        </w:rPr>
+        <w:t>kosong</w:t>
+      </w:r>
+      <w:proofErr w:type="spellEnd"/>
+      <w:r>
+        <w:rPr>
+          <w:rFonts w:ascii="Times New Roman" w:hAnsi="Times New Roman" w:cs="Times New Roman"/>
+          <w:lang w:val="en-GB"/>
+        </w:rPr>
+        <w:t>).</w:t>
+      </w:r>
+    </w:p>
+    <w:p>
+      <w:pPr>
+        <w:contextualSpacing/>
+        <w:jc w:val="both"/>
+        <w:rPr>
+          <w:rFonts w:ascii="Times New Roman" w:hAnsi="Times New Roman" w:cs="Times New Roman"/>
+          <w:lang w:val="en-GB"/>
+        </w:rPr>
+      </w:pPr>
+      <w:r>
+        <w:rPr>
+          <w:rFonts w:ascii="Times New Roman" w:hAnsi="Times New Roman" w:cs="Times New Roman"/>
+          <w:lang w:val="en-GB"/>
+        </w:rPr>
+        <w:t xml:space="preserve">  icon?: string;         # </w:t>
+      </w:r>
+      <w:proofErr w:type="spellStart"/>
+      <w:r>
+        <w:rPr>
+          <w:rFonts w:ascii="Times New Roman" w:hAnsi="Times New Roman" w:cs="Times New Roman"/>
+          <w:lang w:val="en-GB"/>
+        </w:rPr>
+        <w:t>Simbol</w:t>
+      </w:r>
+      <w:proofErr w:type="spellEnd"/>
+      <w:r>
+        <w:rPr>
+          <w:rFonts w:ascii="Times New Roman" w:hAnsi="Times New Roman" w:cs="Times New Roman"/>
+          <w:lang w:val="en-GB"/>
+        </w:rPr>
+        <w:t xml:space="preserve"> </w:t>
+      </w:r>
+      <w:proofErr w:type="spellStart"/>
+      <w:r>
+        <w:rPr>
+          <w:rFonts w:ascii="Times New Roman" w:hAnsi="Times New Roman" w:cs="Times New Roman"/>
+          <w:lang w:val="en-GB"/>
+        </w:rPr>
+        <w:t>atau</w:t>
+      </w:r>
+      <w:proofErr w:type="spellEnd"/>
+      <w:r>
+        <w:rPr>
+          <w:rFonts w:ascii="Times New Roman" w:hAnsi="Times New Roman" w:cs="Times New Roman"/>
+          <w:lang w:val="en-GB"/>
+        </w:rPr>
+        <w:t xml:space="preserve"> </w:t>
+      </w:r>
+      <w:proofErr w:type="spellStart"/>
+      <w:r>
+        <w:rPr>
+          <w:rFonts w:ascii="Times New Roman" w:hAnsi="Times New Roman" w:cs="Times New Roman"/>
+          <w:lang w:val="en-GB"/>
+        </w:rPr>
+        <w:t>gambar</w:t>
+      </w:r>
+      <w:proofErr w:type="spellEnd"/>
+      <w:r>
+        <w:rPr>
+          <w:rFonts w:ascii="Times New Roman" w:hAnsi="Times New Roman" w:cs="Times New Roman"/>
+          <w:lang w:val="en-GB"/>
+        </w:rPr>
+        <w:t xml:space="preserve"> </w:t>
+      </w:r>
+      <w:proofErr w:type="spellStart"/>
+      <w:r>
+        <w:rPr>
+          <w:rFonts w:ascii="Times New Roman" w:hAnsi="Times New Roman" w:cs="Times New Roman"/>
+          <w:lang w:val="en-GB"/>
+        </w:rPr>
+        <w:t>kecil</w:t>
+      </w:r>
+      <w:proofErr w:type="spellEnd"/>
+      <w:r>
+        <w:rPr>
+          <w:rFonts w:ascii="Times New Roman" w:hAnsi="Times New Roman" w:cs="Times New Roman"/>
+          <w:lang w:val="en-GB"/>
+        </w:rPr>
+        <w:t xml:space="preserve"> </w:t>
+      </w:r>
+      <w:proofErr w:type="spellStart"/>
+      <w:r>
+        <w:rPr>
+          <w:rFonts w:ascii="Times New Roman" w:hAnsi="Times New Roman" w:cs="Times New Roman"/>
+          <w:lang w:val="en-GB"/>
+        </w:rPr>
+        <w:t>untuk</w:t>
+      </w:r>
+      <w:proofErr w:type="spellEnd"/>
+      <w:r>
+        <w:rPr>
+          <w:rFonts w:ascii="Times New Roman" w:hAnsi="Times New Roman" w:cs="Times New Roman"/>
+          <w:lang w:val="en-GB"/>
+        </w:rPr>
+        <w:t xml:space="preserve"> </w:t>
+      </w:r>
+      <w:proofErr w:type="spellStart"/>
+      <w:r>
+        <w:rPr>
+          <w:rFonts w:ascii="Times New Roman" w:hAnsi="Times New Roman" w:cs="Times New Roman"/>
+          <w:lang w:val="en-GB"/>
+        </w:rPr>
+        <w:t>kategori</w:t>
+      </w:r>
+      <w:proofErr w:type="spellEnd"/>
+      <w:r>
+        <w:rPr>
+          <w:rFonts w:ascii="Times New Roman" w:hAnsi="Times New Roman" w:cs="Times New Roman"/>
+          <w:lang w:val="en-GB"/>
+        </w:rPr>
+        <w:t>.</w:t>
+      </w:r>
+    </w:p>
+    <w:p>
+      <w:pPr>
+        <w:contextualSpacing/>
+        <w:jc w:val="both"/>
+        <w:rPr>
+          <w:rFonts w:ascii="Times New Roman" w:hAnsi="Times New Roman" w:cs="Times New Roman"/>
+          <w:lang w:val="en-GB"/>
+        </w:rPr>
+      </w:pPr>
+      <w:r>
+        <w:rPr>
+          <w:rFonts w:ascii="Times New Roman" w:hAnsi="Times New Roman" w:cs="Times New Roman"/>
+          <w:lang w:val="en-GB"/>
+        </w:rPr>
         <w:t xml:space="preserve">  </w:t>
       </w:r>
-      <w:proofErr w:type="gramStart"/>
-      <w:r>
-        <w:rPr>
-          <w:rFonts w:ascii="Times New Roman" w:hAnsi="Times New Roman" w:cs="Times New Roman"/>
-          <w:lang w:val="en-GB"/>
-        </w:rPr>
-        <w:t>description?:</w:t>
-      </w:r>
-      <w:proofErr w:type="gramEnd"/>
-      <w:r>
-        <w:rPr>
-          <w:rFonts w:ascii="Times New Roman" w:hAnsi="Times New Roman" w:cs="Times New Roman"/>
-          <w:lang w:val="en-GB"/>
-        </w:rPr>
-        <w:t xml:space="preserve"> </w:t>
-      </w:r>
-      <w:proofErr w:type="gramStart"/>
-      <w:r>
-        <w:rPr>
-          <w:rFonts w:ascii="Times New Roman" w:hAnsi="Times New Roman" w:cs="Times New Roman"/>
-          <w:lang w:val="en-GB"/>
-        </w:rPr>
-        <w:t>string;  #</w:t>
-      </w:r>
-      <w:proofErr w:type="gramEnd"/>
-      <w:r>
-        <w:rPr>
-          <w:rFonts w:ascii="Times New Roman" w:hAnsi="Times New Roman" w:cs="Times New Roman"/>
-          <w:lang w:val="en-GB"/>
-        </w:rPr>
-        <w:t xml:space="preserve"> </w:t>
-      </w:r>
-      <w:proofErr w:type="spellStart"/>
-      <w:r>
-        <w:rPr>
-          <w:rFonts w:ascii="Times New Roman" w:hAnsi="Times New Roman" w:cs="Times New Roman"/>
-          <w:lang w:val="en-GB"/>
-        </w:rPr>
-        <w:t>Penjelasan</w:t>
-      </w:r>
-      <w:proofErr w:type="spellEnd"/>
-      <w:r>
-        <w:rPr>
-          <w:rFonts w:ascii="Times New Roman" w:hAnsi="Times New Roman" w:cs="Times New Roman"/>
-          <w:lang w:val="en-GB"/>
-        </w:rPr>
-        <w:t xml:space="preserve"> </w:t>
-      </w:r>
-      <w:proofErr w:type="spellStart"/>
-      <w:r>
-        <w:rPr>
-          <w:rFonts w:ascii="Times New Roman" w:hAnsi="Times New Roman" w:cs="Times New Roman"/>
-          <w:lang w:val="en-GB"/>
-        </w:rPr>
-        <w:t>singkat</w:t>
-      </w:r>
-      <w:proofErr w:type="spellEnd"/>
-      <w:r>
-        <w:rPr>
-          <w:rFonts w:ascii="Times New Roman" w:hAnsi="Times New Roman" w:cs="Times New Roman"/>
-          <w:lang w:val="en-GB"/>
-        </w:rPr>
-        <w:t xml:space="preserve"> (</w:t>
-      </w:r>
-      <w:proofErr w:type="spellStart"/>
-      <w:proofErr w:type="gramStart"/>
-      <w:r>
-        <w:rPr>
-          <w:rFonts w:ascii="Times New Roman" w:hAnsi="Times New Roman" w:cs="Times New Roman"/>
-          <w:lang w:val="en-GB"/>
-        </w:rPr>
-        <w:t>tanda</w:t>
-      </w:r>
-      <w:proofErr w:type="spellEnd"/>
-      <w:r>
-        <w:rPr>
-          <w:rFonts w:ascii="Times New Roman" w:hAnsi="Times New Roman" w:cs="Times New Roman"/>
-          <w:lang w:val="en-GB"/>
-        </w:rPr>
-        <w:t xml:space="preserve"> ?</w:t>
-      </w:r>
-      <w:proofErr w:type="gramEnd"/>
-      <w:r>
-        <w:rPr>
-          <w:rFonts w:ascii="Times New Roman" w:hAnsi="Times New Roman" w:cs="Times New Roman"/>
-          <w:lang w:val="en-GB"/>
-        </w:rPr>
-        <w:t xml:space="preserve"> </w:t>
+      <w:proofErr w:type="spellStart"/>
+      <w:r>
+        <w:rPr>
+          <w:rFonts w:ascii="Times New Roman" w:hAnsi="Times New Roman" w:cs="Times New Roman"/>
+          <w:lang w:val="en-GB"/>
+        </w:rPr>
+        <w:t>createdAt</w:t>
+      </w:r>
+      <w:proofErr w:type="spellEnd"/>
+      <w:r>
+        <w:rPr>
+          <w:rFonts w:ascii="Times New Roman" w:hAnsi="Times New Roman" w:cs="Times New Roman"/>
+          <w:lang w:val="en-GB"/>
+        </w:rPr>
+        <w:t xml:space="preserve">: Date;       # </w:t>
+      </w:r>
+      <w:proofErr w:type="spellStart"/>
+      <w:r>
+        <w:rPr>
+          <w:rFonts w:ascii="Times New Roman" w:hAnsi="Times New Roman" w:cs="Times New Roman"/>
+          <w:lang w:val="en-GB"/>
+        </w:rPr>
+        <w:t>Catatan</w:t>
+      </w:r>
+      <w:proofErr w:type="spellEnd"/>
+      <w:r>
+        <w:rPr>
+          <w:rFonts w:ascii="Times New Roman" w:hAnsi="Times New Roman" w:cs="Times New Roman"/>
+          <w:lang w:val="en-GB"/>
+        </w:rPr>
+        <w:t xml:space="preserve"> </w:t>
+      </w:r>
+      <w:proofErr w:type="spellStart"/>
+      <w:r>
+        <w:rPr>
+          <w:rFonts w:ascii="Times New Roman" w:hAnsi="Times New Roman" w:cs="Times New Roman"/>
+          <w:lang w:val="en-GB"/>
+        </w:rPr>
+        <w:t>waktu</w:t>
+      </w:r>
+      <w:proofErr w:type="spellEnd"/>
+      <w:r>
+        <w:rPr>
+          <w:rFonts w:ascii="Times New Roman" w:hAnsi="Times New Roman" w:cs="Times New Roman"/>
+          <w:lang w:val="en-GB"/>
+        </w:rPr>
+        <w:t xml:space="preserve"> </w:t>
+      </w:r>
+      <w:proofErr w:type="spellStart"/>
+      <w:r>
+        <w:rPr>
+          <w:rFonts w:ascii="Times New Roman" w:hAnsi="Times New Roman" w:cs="Times New Roman"/>
+          <w:lang w:val="en-GB"/>
+        </w:rPr>
+        <w:t>kapan</w:t>
+      </w:r>
+      <w:proofErr w:type="spellEnd"/>
+      <w:r>
+        <w:rPr>
+          <w:rFonts w:ascii="Times New Roman" w:hAnsi="Times New Roman" w:cs="Times New Roman"/>
+          <w:lang w:val="en-GB"/>
+        </w:rPr>
+        <w:t xml:space="preserve"> </w:t>
+      </w:r>
+      <w:proofErr w:type="spellStart"/>
+      <w:r>
+        <w:rPr>
+          <w:rFonts w:ascii="Times New Roman" w:hAnsi="Times New Roman" w:cs="Times New Roman"/>
+          <w:lang w:val="en-GB"/>
+        </w:rPr>
+        <w:t>kategori</w:t>
+      </w:r>
+      <w:proofErr w:type="spellEnd"/>
+      <w:r>
+        <w:rPr>
+          <w:rFonts w:ascii="Times New Roman" w:hAnsi="Times New Roman" w:cs="Times New Roman"/>
+          <w:lang w:val="en-GB"/>
+        </w:rPr>
+        <w:t xml:space="preserve"> </w:t>
+      </w:r>
+      <w:proofErr w:type="spellStart"/>
+      <w:r>
+        <w:rPr>
+          <w:rFonts w:ascii="Times New Roman" w:hAnsi="Times New Roman" w:cs="Times New Roman"/>
+          <w:lang w:val="en-GB"/>
+        </w:rPr>
+        <w:t>ini</w:t>
+      </w:r>
+      <w:proofErr w:type="spellEnd"/>
+      <w:r>
+        <w:rPr>
+          <w:rFonts w:ascii="Times New Roman" w:hAnsi="Times New Roman" w:cs="Times New Roman"/>
+          <w:lang w:val="en-GB"/>
+        </w:rPr>
+        <w:t xml:space="preserve"> </w:t>
+      </w:r>
+      <w:proofErr w:type="spellStart"/>
+      <w:r>
+        <w:rPr>
+          <w:rFonts w:ascii="Times New Roman" w:hAnsi="Times New Roman" w:cs="Times New Roman"/>
+          <w:lang w:val="en-GB"/>
+        </w:rPr>
+        <w:t>dibuat</w:t>
+      </w:r>
+      <w:proofErr w:type="spellEnd"/>
+      <w:r>
+        <w:rPr>
+          <w:rFonts w:ascii="Times New Roman" w:hAnsi="Times New Roman" w:cs="Times New Roman"/>
+          <w:lang w:val="en-GB"/>
+        </w:rPr>
+        <w:t>.</w:t>
+      </w:r>
+    </w:p>
+    <w:p>
+      <w:pPr>
+        <w:contextualSpacing/>
+        <w:jc w:val="both"/>
+        <w:rPr>
+          <w:rFonts w:ascii="Times New Roman" w:hAnsi="Times New Roman" w:cs="Times New Roman"/>
+          <w:lang w:val="en-GB"/>
+        </w:rPr>
+      </w:pPr>
+      <w:r>
+        <w:rPr>
+          <w:rFonts w:ascii="Times New Roman" w:hAnsi="Times New Roman" w:cs="Times New Roman"/>
+          <w:lang w:val="en-GB"/>
+        </w:rPr>
+        <w:t xml:space="preserve">  </w:t>
+      </w:r>
+      <w:proofErr w:type="spellStart"/>
+      <w:r>
+        <w:rPr>
+          <w:rFonts w:ascii="Times New Roman" w:hAnsi="Times New Roman" w:cs="Times New Roman"/>
+          <w:lang w:val="en-GB"/>
+        </w:rPr>
+        <w:t>updatedAt</w:t>
+      </w:r>
+      <w:proofErr w:type="spellEnd"/>
+      <w:r>
+        <w:rPr>
+          <w:rFonts w:ascii="Times New Roman" w:hAnsi="Times New Roman" w:cs="Times New Roman"/>
+          <w:lang w:val="en-GB"/>
+        </w:rPr>
+        <w:t xml:space="preserve">: Date;       # </w:t>
+      </w:r>
+      <w:proofErr w:type="spellStart"/>
+      <w:r>
+        <w:rPr>
+          <w:rFonts w:ascii="Times New Roman" w:hAnsi="Times New Roman" w:cs="Times New Roman"/>
+          <w:lang w:val="en-GB"/>
+        </w:rPr>
+        <w:t>Catatan</w:t>
+      </w:r>
+      <w:proofErr w:type="spellEnd"/>
+      <w:r>
+        <w:rPr>
+          <w:rFonts w:ascii="Times New Roman" w:hAnsi="Times New Roman" w:cs="Times New Roman"/>
+          <w:lang w:val="en-GB"/>
+        </w:rPr>
+        <w:t xml:space="preserve"> </w:t>
+      </w:r>
+      <w:proofErr w:type="spellStart"/>
+      <w:r>
+        <w:rPr>
+          <w:rFonts w:ascii="Times New Roman" w:hAnsi="Times New Roman" w:cs="Times New Roman"/>
+          <w:lang w:val="en-GB"/>
+        </w:rPr>
+        <w:t>waktu</w:t>
+      </w:r>
+      <w:proofErr w:type="spellEnd"/>
+      <w:r>
+        <w:rPr>
+          <w:rFonts w:ascii="Times New Roman" w:hAnsi="Times New Roman" w:cs="Times New Roman"/>
+          <w:lang w:val="en-GB"/>
+        </w:rPr>
+        <w:t xml:space="preserve"> kapan </w:t>
+      </w:r>
+      <w:proofErr w:type="spellStart"/>
+      <w:r>
+        <w:rPr>
+          <w:rFonts w:ascii="Times New Roman" w:hAnsi="Times New Roman" w:cs="Times New Roman"/>
+          <w:lang w:val="en-GB"/>
+        </w:rPr>
+        <w:t>terakhir</w:t>
+      </w:r>
+      <w:proofErr w:type="spellEnd"/>
+      <w:r>
+        <w:rPr>
+          <w:rFonts w:ascii="Times New Roman" w:hAnsi="Times New Roman" w:cs="Times New Roman"/>
+          <w:lang w:val="en-GB"/>
+        </w:rPr>
+        <w:t xml:space="preserve"> kali data </w:t>
+      </w:r>
+      <w:proofErr w:type="spellStart"/>
+      <w:r>
+        <w:rPr>
+          <w:rFonts w:ascii="Times New Roman" w:hAnsi="Times New Roman" w:cs="Times New Roman"/>
+          <w:lang w:val="en-GB"/>
+        </w:rPr>
+        <w:t>diubah</w:t>
+      </w:r>
+      <w:proofErr w:type="spellEnd"/>
+      <w:r>
+        <w:rPr>
+          <w:rFonts w:ascii="Times New Roman" w:hAnsi="Times New Roman" w:cs="Times New Roman"/>
+          <w:lang w:val="en-GB"/>
+        </w:rPr>
+        <w:t>.</w:t>
+      </w:r>
+    </w:p>
+    <w:p>
+      <w:pPr>
+        <w:contextualSpacing/>
+        <w:jc w:val="both"/>
+        <w:rPr>
+          <w:rFonts w:ascii="Times New Roman" w:hAnsi="Times New Roman" w:cs="Times New Roman"/>
+          <w:lang w:val="en-GB"/>
+        </w:rPr>
+      </w:pPr>
+    </w:p>
+    <w:p>
+      <w:pPr>
+        <w:contextualSpacing/>
+        <w:jc w:val="both"/>
+        <w:rPr>
+          <w:rFonts w:ascii="Times New Roman" w:hAnsi="Times New Roman" w:cs="Times New Roman"/>
+          <w:lang w:val="en-GB"/>
+        </w:rPr>
+      </w:pPr>
+      <w:r>
+        <w:rPr>
+          <w:rFonts w:ascii="Times New Roman" w:hAnsi="Times New Roman" w:cs="Times New Roman"/>
+          <w:lang w:val="en-GB"/>
+        </w:rPr>
+        <w:t xml:space="preserve">  # Constructor </w:t>
+      </w:r>
+      <w:proofErr w:type="spellStart"/>
+      <w:r>
+        <w:rPr>
+          <w:rFonts w:ascii="Times New Roman" w:hAnsi="Times New Roman" w:cs="Times New Roman"/>
+          <w:lang w:val="en-GB"/>
+        </w:rPr>
+        <w:t>adalah</w:t>
+      </w:r>
+      <w:proofErr w:type="spellEnd"/>
+      <w:r>
+        <w:rPr>
+          <w:rFonts w:ascii="Times New Roman" w:hAnsi="Times New Roman" w:cs="Times New Roman"/>
+          <w:lang w:val="en-GB"/>
+        </w:rPr>
+        <w:t xml:space="preserve"> </w:t>
+      </w:r>
+      <w:proofErr w:type="spellStart"/>
+      <w:r>
+        <w:rPr>
+          <w:rFonts w:ascii="Times New Roman" w:hAnsi="Times New Roman" w:cs="Times New Roman"/>
+          <w:lang w:val="en-GB"/>
+        </w:rPr>
+        <w:t>mesin</w:t>
+      </w:r>
+      <w:proofErr w:type="spellEnd"/>
+      <w:r>
+        <w:rPr>
+          <w:rFonts w:ascii="Times New Roman" w:hAnsi="Times New Roman" w:cs="Times New Roman"/>
+          <w:lang w:val="en-GB"/>
+        </w:rPr>
+        <w:t xml:space="preserve"> </w:t>
+      </w:r>
+      <w:proofErr w:type="spellStart"/>
+      <w:r>
+        <w:rPr>
+          <w:rFonts w:ascii="Times New Roman" w:hAnsi="Times New Roman" w:cs="Times New Roman"/>
+          <w:lang w:val="en-GB"/>
+        </w:rPr>
+        <w:t>pembuat</w:t>
+      </w:r>
+      <w:proofErr w:type="spellEnd"/>
+      <w:r>
+        <w:rPr>
+          <w:rFonts w:ascii="Times New Roman" w:hAnsi="Times New Roman" w:cs="Times New Roman"/>
+          <w:lang w:val="en-GB"/>
+        </w:rPr>
+        <w:t xml:space="preserve"> </w:t>
+      </w:r>
+      <w:proofErr w:type="spellStart"/>
+      <w:r>
+        <w:rPr>
+          <w:rFonts w:ascii="Times New Roman" w:hAnsi="Times New Roman" w:cs="Times New Roman"/>
+          <w:lang w:val="en-GB"/>
+        </w:rPr>
+        <w:t>objek</w:t>
+      </w:r>
+      <w:proofErr w:type="spellEnd"/>
+      <w:r>
+        <w:rPr>
+          <w:rFonts w:ascii="Times New Roman" w:hAnsi="Times New Roman" w:cs="Times New Roman"/>
+          <w:lang w:val="en-GB"/>
+        </w:rPr>
+        <w:t xml:space="preserve"> </w:t>
+      </w:r>
+      <w:proofErr w:type="spellStart"/>
+      <w:r>
+        <w:rPr>
+          <w:rFonts w:ascii="Times New Roman" w:hAnsi="Times New Roman" w:cs="Times New Roman"/>
+          <w:lang w:val="en-GB"/>
+        </w:rPr>
+        <w:t>otomatis</w:t>
+      </w:r>
+      <w:proofErr w:type="spellEnd"/>
+      <w:r>
+        <w:rPr>
+          <w:rFonts w:ascii="Times New Roman" w:hAnsi="Times New Roman" w:cs="Times New Roman"/>
+          <w:lang w:val="en-GB"/>
+        </w:rPr>
+        <w:t>.</w:t>
+      </w:r>
+    </w:p>
+    <w:p>
+      <w:pPr>
+        <w:contextualSpacing/>
+        <w:jc w:val="both"/>
+        <w:rPr>
+          <w:rFonts w:ascii="Times New Roman" w:hAnsi="Times New Roman" w:cs="Times New Roman"/>
+          <w:lang w:val="en-GB"/>
+        </w:rPr>
+      </w:pPr>
+      <w:r>
+        <w:rPr>
+          <w:rFonts w:ascii="Times New Roman" w:hAnsi="Times New Roman" w:cs="Times New Roman"/>
+          <w:lang w:val="en-GB"/>
+        </w:rPr>
+        <w:t xml:space="preserve">  # Partial&lt;</w:t>
+      </w:r>
+      <w:proofErr w:type="spellStart"/>
+      <w:r>
+        <w:rPr>
+          <w:rFonts w:ascii="Times New Roman" w:hAnsi="Times New Roman" w:cs="Times New Roman"/>
+          <w:lang w:val="en-GB"/>
+        </w:rPr>
+        <w:t>KategoriEntity</w:t>
+      </w:r>
+      <w:proofErr w:type="spellEnd"/>
+      <w:r>
+        <w:rPr>
+          <w:rFonts w:ascii="Times New Roman" w:hAnsi="Times New Roman" w:cs="Times New Roman"/>
+          <w:lang w:val="en-GB"/>
+        </w:rPr>
+        <w:t xml:space="preserve">&gt; </w:t>
       </w:r>
       <w:proofErr w:type="spellStart"/>
       <w:r>
@@ -9636,31 +9965,95 @@
           <w:rFonts w:ascii="Times New Roman" w:hAnsi="Times New Roman" w:cs="Times New Roman"/>
           <w:lang w:val="en-GB"/>
         </w:rPr>
-        <w:t>boleh</w:t>
-      </w:r>
-      <w:proofErr w:type="spellEnd"/>
-      <w:r>
-        <w:rPr>
-          <w:rFonts w:ascii="Times New Roman" w:hAnsi="Times New Roman" w:cs="Times New Roman"/>
-          <w:lang w:val="en-GB"/>
-        </w:rPr>
-        <w:t xml:space="preserve"> </w:t>
-      </w:r>
-      <w:proofErr w:type="spellStart"/>
-      <w:r>
-        <w:rPr>
-          <w:rFonts w:ascii="Times New Roman" w:hAnsi="Times New Roman" w:cs="Times New Roman"/>
-          <w:lang w:val="en-GB"/>
-        </w:rPr>
-        <w:t>kosong</w:t>
-      </w:r>
-      <w:proofErr w:type="spellEnd"/>
-      <w:r>
-        <w:rPr>
-          <w:rFonts w:ascii="Times New Roman" w:hAnsi="Times New Roman" w:cs="Times New Roman"/>
-          <w:lang w:val="en-GB"/>
-        </w:rPr>
-        <w:t>).</w:t>
+        <w:t>kita</w:t>
+      </w:r>
+      <w:proofErr w:type="spellEnd"/>
+      <w:r>
+        <w:rPr>
+          <w:rFonts w:ascii="Times New Roman" w:hAnsi="Times New Roman" w:cs="Times New Roman"/>
+          <w:lang w:val="en-GB"/>
+        </w:rPr>
+        <w:t xml:space="preserve"> </w:t>
+      </w:r>
+      <w:proofErr w:type="spellStart"/>
+      <w:r>
+        <w:rPr>
+          <w:rFonts w:ascii="Times New Roman" w:hAnsi="Times New Roman" w:cs="Times New Roman"/>
+          <w:lang w:val="en-GB"/>
+        </w:rPr>
+        <w:t>bisa</w:t>
+      </w:r>
+      <w:proofErr w:type="spellEnd"/>
+      <w:r>
+        <w:rPr>
+          <w:rFonts w:ascii="Times New Roman" w:hAnsi="Times New Roman" w:cs="Times New Roman"/>
+          <w:lang w:val="en-GB"/>
+        </w:rPr>
+        <w:t xml:space="preserve"> </w:t>
+      </w:r>
+      <w:proofErr w:type="spellStart"/>
+      <w:r>
+        <w:rPr>
+          <w:rFonts w:ascii="Times New Roman" w:hAnsi="Times New Roman" w:cs="Times New Roman"/>
+          <w:lang w:val="en-GB"/>
+        </w:rPr>
+        <w:t>memasukkan</w:t>
+      </w:r>
+      <w:proofErr w:type="spellEnd"/>
+      <w:r>
+        <w:rPr>
+          <w:rFonts w:ascii="Times New Roman" w:hAnsi="Times New Roman" w:cs="Times New Roman"/>
+          <w:lang w:val="en-GB"/>
+        </w:rPr>
+        <w:t xml:space="preserve"> data </w:t>
+      </w:r>
+      <w:proofErr w:type="spellStart"/>
+      <w:r>
+        <w:rPr>
+          <w:rFonts w:ascii="Times New Roman" w:hAnsi="Times New Roman" w:cs="Times New Roman"/>
+          <w:lang w:val="en-GB"/>
+        </w:rPr>
+        <w:t>meskipun</w:t>
+      </w:r>
+      <w:proofErr w:type="spellEnd"/>
+      <w:r>
+        <w:rPr>
+          <w:rFonts w:ascii="Times New Roman" w:hAnsi="Times New Roman" w:cs="Times New Roman"/>
+          <w:lang w:val="en-GB"/>
+        </w:rPr>
+        <w:t xml:space="preserve"> </w:t>
+      </w:r>
+      <w:proofErr w:type="spellStart"/>
+      <w:r>
+        <w:rPr>
+          <w:rFonts w:ascii="Times New Roman" w:hAnsi="Times New Roman" w:cs="Times New Roman"/>
+          <w:lang w:val="en-GB"/>
+        </w:rPr>
+        <w:t>tidak</w:t>
+      </w:r>
+      <w:proofErr w:type="spellEnd"/>
+      <w:r>
+        <w:rPr>
+          <w:rFonts w:ascii="Times New Roman" w:hAnsi="Times New Roman" w:cs="Times New Roman"/>
+          <w:lang w:val="en-GB"/>
+        </w:rPr>
+        <w:t xml:space="preserve"> </w:t>
+      </w:r>
+      <w:proofErr w:type="spellStart"/>
+      <w:r>
+        <w:rPr>
+          <w:rFonts w:ascii="Times New Roman" w:hAnsi="Times New Roman" w:cs="Times New Roman"/>
+          <w:lang w:val="en-GB"/>
+        </w:rPr>
+        <w:t>lengkap</w:t>
+      </w:r>
+      <w:proofErr w:type="spellEnd"/>
+      <w:r>
+        <w:rPr>
+          <w:rFonts w:ascii="Times New Roman" w:hAnsi="Times New Roman" w:cs="Times New Roman"/>
+          <w:lang w:val="en-GB"/>
+        </w:rPr>
+        <w:t>.</w:t>
       </w:r>
     </w:p>
     <w:p>
@@ -9677,55 +10070,104 @@
           <w:rFonts w:ascii="Times New Roman" w:hAnsi="Times New Roman" w:cs="Times New Roman"/>
           <w:lang w:val="en-GB"/>
         </w:rPr>
-        <w:t xml:space="preserve">  </w:t>
-      </w:r>
-      <w:proofErr w:type="gramStart"/>
-      <w:r>
-        <w:rPr>
-          <w:rFonts w:ascii="Times New Roman" w:hAnsi="Times New Roman" w:cs="Times New Roman"/>
-          <w:lang w:val="en-GB"/>
-        </w:rPr>
-        <w:t>icon?:</w:t>
-      </w:r>
-      <w:proofErr w:type="gramEnd"/>
-      <w:r>
-        <w:rPr>
-          <w:rFonts w:ascii="Times New Roman" w:hAnsi="Times New Roman" w:cs="Times New Roman"/>
-          <w:lang w:val="en-GB"/>
-        </w:rPr>
-        <w:t xml:space="preserve"> </w:t>
-      </w:r>
-      <w:proofErr w:type="gramStart"/>
-      <w:r>
-        <w:rPr>
-          <w:rFonts w:ascii="Times New Roman" w:hAnsi="Times New Roman" w:cs="Times New Roman"/>
-          <w:lang w:val="en-GB"/>
-        </w:rPr>
-        <w:t xml:space="preserve">string;   </w:t>
-      </w:r>
-      <w:proofErr w:type="gramEnd"/>
-      <w:r>
-        <w:rPr>
-          <w:rFonts w:ascii="Times New Roman" w:hAnsi="Times New Roman" w:cs="Times New Roman"/>
-          <w:lang w:val="en-GB"/>
-        </w:rPr>
-        <w:t xml:space="preserve">      # </w:t>
-      </w:r>
-      <w:proofErr w:type="spellStart"/>
-      <w:r>
-        <w:rPr>
-          <w:rFonts w:ascii="Times New Roman" w:hAnsi="Times New Roman" w:cs="Times New Roman"/>
-          <w:lang w:val="en-GB"/>
-        </w:rPr>
-        <w:t>Simbol</w:t>
-      </w:r>
-      <w:proofErr w:type="spellEnd"/>
-      <w:r>
-        <w:rPr>
-          <w:rFonts w:ascii="Times New Roman" w:hAnsi="Times New Roman" w:cs="Times New Roman"/>
-          <w:lang w:val="en-GB"/>
-        </w:rPr>
-        <w:t xml:space="preserve"> </w:t>
+        <w:t xml:space="preserve">  constructor(data: Partial&lt;</w:t>
+      </w:r>
+      <w:proofErr w:type="spellStart"/>
+      <w:r>
+        <w:rPr>
+          <w:rFonts w:ascii="Times New Roman" w:hAnsi="Times New Roman" w:cs="Times New Roman"/>
+          <w:lang w:val="en-GB"/>
+        </w:rPr>
+        <w:t>KategoriEntity</w:t>
+      </w:r>
+      <w:proofErr w:type="spellEnd"/>
+      <w:r>
+        <w:rPr>
+          <w:rFonts w:ascii="Times New Roman" w:hAnsi="Times New Roman" w:cs="Times New Roman"/>
+          <w:lang w:val="en-GB"/>
+        </w:rPr>
+        <w:t>&gt;) {</w:t>
+      </w:r>
+    </w:p>
+    <w:p>
+      <w:pPr>
+        <w:contextualSpacing/>
+        <w:jc w:val="both"/>
+        <w:rPr>
+          <w:rFonts w:ascii="Times New Roman" w:hAnsi="Times New Roman" w:cs="Times New Roman"/>
+          <w:lang w:val="en-GB"/>
+        </w:rPr>
+      </w:pPr>
+      <w:r>
+        <w:rPr>
+          <w:rFonts w:ascii="Times New Roman" w:hAnsi="Times New Roman" w:cs="Times New Roman"/>
+          <w:lang w:val="en-GB"/>
+        </w:rPr>
+        <w:t xml:space="preserve">    # </w:t>
+      </w:r>
+      <w:proofErr w:type="spellStart"/>
+      <w:r>
+        <w:rPr>
+          <w:rFonts w:ascii="Times New Roman" w:hAnsi="Times New Roman" w:cs="Times New Roman"/>
+          <w:lang w:val="en-GB"/>
+        </w:rPr>
+        <w:t>Object.assign</w:t>
+      </w:r>
+      <w:proofErr w:type="spellEnd"/>
+      <w:r>
+        <w:rPr>
+          <w:rFonts w:ascii="Times New Roman" w:hAnsi="Times New Roman" w:cs="Times New Roman"/>
+          <w:lang w:val="en-GB"/>
+        </w:rPr>
+        <w:t xml:space="preserve"> </w:t>
+      </w:r>
+      <w:proofErr w:type="spellStart"/>
+      <w:r>
+        <w:rPr>
+          <w:rFonts w:ascii="Times New Roman" w:hAnsi="Times New Roman" w:cs="Times New Roman"/>
+          <w:lang w:val="en-GB"/>
+        </w:rPr>
+        <w:t>berfungsi</w:t>
+      </w:r>
+      <w:proofErr w:type="spellEnd"/>
+      <w:r>
+        <w:rPr>
+          <w:rFonts w:ascii="Times New Roman" w:hAnsi="Times New Roman" w:cs="Times New Roman"/>
+          <w:lang w:val="en-GB"/>
+        </w:rPr>
+        <w:t xml:space="preserve"> </w:t>
+      </w:r>
+      <w:proofErr w:type="spellStart"/>
+      <w:r>
+        <w:rPr>
+          <w:rFonts w:ascii="Times New Roman" w:hAnsi="Times New Roman" w:cs="Times New Roman"/>
+          <w:lang w:val="en-GB"/>
+        </w:rPr>
+        <w:t>untuk</w:t>
+      </w:r>
+      <w:proofErr w:type="spellEnd"/>
+      <w:r>
+        <w:rPr>
+          <w:rFonts w:ascii="Times New Roman" w:hAnsi="Times New Roman" w:cs="Times New Roman"/>
+          <w:lang w:val="en-GB"/>
+        </w:rPr>
+        <w:t xml:space="preserve"> '</w:t>
+      </w:r>
+      <w:proofErr w:type="spellStart"/>
+      <w:r>
+        <w:rPr>
+          <w:rFonts w:ascii="Times New Roman" w:hAnsi="Times New Roman" w:cs="Times New Roman"/>
+          <w:lang w:val="en-GB"/>
+        </w:rPr>
+        <w:t>memberikan</w:t>
+      </w:r>
+      <w:proofErr w:type="spellEnd"/>
+      <w:r>
+        <w:rPr>
+          <w:rFonts w:ascii="Times New Roman" w:hAnsi="Times New Roman" w:cs="Times New Roman"/>
+          <w:lang w:val="en-GB"/>
+        </w:rPr>
+        <w:t xml:space="preserve">' </w:t>
       </w:r>
       <w:proofErr w:type="spellStart"/>
       <w:r>
@@ -9749,63 +10191,31 @@
           <w:rFonts w:ascii="Times New Roman" w:hAnsi="Times New Roman" w:cs="Times New Roman"/>
           <w:lang w:val="en-GB"/>
         </w:rPr>
-        <w:t>gambar</w:t>
-      </w:r>
-      <w:proofErr w:type="spellEnd"/>
-      <w:r>
-        <w:rPr>
-          <w:rFonts w:ascii="Times New Roman" w:hAnsi="Times New Roman" w:cs="Times New Roman"/>
-          <w:lang w:val="en-GB"/>
-        </w:rPr>
-        <w:t xml:space="preserve"> </w:t>
-      </w:r>
-      <w:proofErr w:type="spellStart"/>
-      <w:r>
-        <w:rPr>
-          <w:rFonts w:ascii="Times New Roman" w:hAnsi="Times New Roman" w:cs="Times New Roman"/>
-          <w:lang w:val="en-GB"/>
-        </w:rPr>
-        <w:t>kecil</w:t>
-      </w:r>
-      <w:proofErr w:type="spellEnd"/>
-      <w:r>
-        <w:rPr>
-          <w:rFonts w:ascii="Times New Roman" w:hAnsi="Times New Roman" w:cs="Times New Roman"/>
-          <w:lang w:val="en-GB"/>
-        </w:rPr>
-        <w:t xml:space="preserve"> </w:t>
-      </w:r>
-      <w:proofErr w:type="spellStart"/>
-      <w:r>
-        <w:rPr>
-          <w:rFonts w:ascii="Times New Roman" w:hAnsi="Times New Roman" w:cs="Times New Roman"/>
-          <w:lang w:val="en-GB"/>
-        </w:rPr>
-        <w:t>untuk</w:t>
-      </w:r>
-      <w:proofErr w:type="spellEnd"/>
-      <w:r>
-        <w:rPr>
-          <w:rFonts w:ascii="Times New Roman" w:hAnsi="Times New Roman" w:cs="Times New Roman"/>
-          <w:lang w:val="en-GB"/>
-        </w:rPr>
-        <w:t xml:space="preserve"> </w:t>
-      </w:r>
-      <w:proofErr w:type="spellStart"/>
-      <w:r>
-        <w:rPr>
-          <w:rFonts w:ascii="Times New Roman" w:hAnsi="Times New Roman" w:cs="Times New Roman"/>
-          <w:lang w:val="en-GB"/>
-        </w:rPr>
-        <w:t>kategori</w:t>
-      </w:r>
-      <w:proofErr w:type="spellEnd"/>
-      <w:r>
-        <w:rPr>
-          <w:rFonts w:ascii="Times New Roman" w:hAnsi="Times New Roman" w:cs="Times New Roman"/>
-          <w:lang w:val="en-GB"/>
-        </w:rPr>
-        <w:t>.</w:t>
+        <w:t>mengisi</w:t>
+      </w:r>
+      <w:proofErr w:type="spellEnd"/>
+      <w:r>
+        <w:rPr>
+          <w:rFonts w:ascii="Times New Roman" w:hAnsi="Times New Roman" w:cs="Times New Roman"/>
+          <w:lang w:val="en-GB"/>
+        </w:rPr>
+        <w:t xml:space="preserve"> </w:t>
+      </w:r>
+      <w:proofErr w:type="spellStart"/>
+      <w:r>
+        <w:rPr>
+          <w:rFonts w:ascii="Times New Roman" w:hAnsi="Times New Roman" w:cs="Times New Roman"/>
+          <w:lang w:val="en-GB"/>
+        </w:rPr>
+        <w:t>kolom-kolom</w:t>
+      </w:r>
+      <w:proofErr w:type="spellEnd"/>
+      <w:r>
+        <w:rPr>
+          <w:rFonts w:ascii="Times New Roman" w:hAnsi="Times New Roman" w:cs="Times New Roman"/>
+          <w:lang w:val="en-GB"/>
+        </w:rPr>
+        <w:t xml:space="preserve"> </w:t>
       </w:r>
     </w:p>
     <w:p>
@@ -9822,711 +10232,7 @@
           <w:rFonts w:ascii="Times New Roman" w:hAnsi="Times New Roman" w:cs="Times New Roman"/>
           <w:lang w:val="en-GB"/>
         </w:rPr>
-        <w:t xml:space="preserve">  </w:t>
-      </w:r>
-      <w:proofErr w:type="spellStart"/>
-      <w:r>
-        <w:rPr>
-          <w:rFonts w:ascii="Times New Roman" w:hAnsi="Times New Roman" w:cs="Times New Roman"/>
-          <w:lang w:val="en-GB"/>
-        </w:rPr>
-        <w:t>createdAt</w:t>
-      </w:r>
-      <w:proofErr w:type="spellEnd"/>
-      <w:r>
-        <w:rPr>
-          <w:rFonts w:ascii="Times New Roman" w:hAnsi="Times New Roman" w:cs="Times New Roman"/>
-          <w:lang w:val="en-GB"/>
-        </w:rPr>
-        <w:t xml:space="preserve">: </w:t>
-      </w:r>
-      <w:proofErr w:type="gramStart"/>
-      <w:r>
-        <w:rPr>
-          <w:rFonts w:ascii="Times New Roman" w:hAnsi="Times New Roman" w:cs="Times New Roman"/>
-          <w:lang w:val="en-GB"/>
-        </w:rPr>
-        <w:t xml:space="preserve">Date;   </w:t>
-      </w:r>
-      <w:proofErr w:type="gramEnd"/>
-      <w:r>
-        <w:rPr>
-          <w:rFonts w:ascii="Times New Roman" w:hAnsi="Times New Roman" w:cs="Times New Roman"/>
-          <w:lang w:val="en-GB"/>
-        </w:rPr>
-        <w:t xml:space="preserve">    # </w:t>
-      </w:r>
-      <w:proofErr w:type="spellStart"/>
-      <w:r>
-        <w:rPr>
-          <w:rFonts w:ascii="Times New Roman" w:hAnsi="Times New Roman" w:cs="Times New Roman"/>
-          <w:lang w:val="en-GB"/>
-        </w:rPr>
-        <w:t>Catatan</w:t>
-      </w:r>
-      <w:proofErr w:type="spellEnd"/>
-      <w:r>
-        <w:rPr>
-          <w:rFonts w:ascii="Times New Roman" w:hAnsi="Times New Roman" w:cs="Times New Roman"/>
-          <w:lang w:val="en-GB"/>
-        </w:rPr>
-        <w:t xml:space="preserve"> </w:t>
-      </w:r>
-      <w:proofErr w:type="spellStart"/>
-      <w:r>
-        <w:rPr>
-          <w:rFonts w:ascii="Times New Roman" w:hAnsi="Times New Roman" w:cs="Times New Roman"/>
-          <w:lang w:val="en-GB"/>
-        </w:rPr>
-        <w:t>waktu</w:t>
-      </w:r>
-      <w:proofErr w:type="spellEnd"/>
-      <w:r>
-        <w:rPr>
-          <w:rFonts w:ascii="Times New Roman" w:hAnsi="Times New Roman" w:cs="Times New Roman"/>
-          <w:lang w:val="en-GB"/>
-        </w:rPr>
-        <w:t xml:space="preserve"> </w:t>
-      </w:r>
-      <w:proofErr w:type="spellStart"/>
-      <w:r>
-        <w:rPr>
-          <w:rFonts w:ascii="Times New Roman" w:hAnsi="Times New Roman" w:cs="Times New Roman"/>
-          <w:lang w:val="en-GB"/>
-        </w:rPr>
-        <w:t>kapan</w:t>
-      </w:r>
-      <w:proofErr w:type="spellEnd"/>
-      <w:r>
-        <w:rPr>
-          <w:rFonts w:ascii="Times New Roman" w:hAnsi="Times New Roman" w:cs="Times New Roman"/>
-          <w:lang w:val="en-GB"/>
-        </w:rPr>
-        <w:t xml:space="preserve"> </w:t>
-      </w:r>
-      <w:proofErr w:type="spellStart"/>
-      <w:r>
-        <w:rPr>
-          <w:rFonts w:ascii="Times New Roman" w:hAnsi="Times New Roman" w:cs="Times New Roman"/>
-          <w:lang w:val="en-GB"/>
-        </w:rPr>
-        <w:t>kategori</w:t>
-      </w:r>
-      <w:proofErr w:type="spellEnd"/>
-      <w:r>
-        <w:rPr>
-          <w:rFonts w:ascii="Times New Roman" w:hAnsi="Times New Roman" w:cs="Times New Roman"/>
-          <w:lang w:val="en-GB"/>
-        </w:rPr>
-        <w:t xml:space="preserve"> </w:t>
-      </w:r>
-      <w:proofErr w:type="spellStart"/>
-      <w:r>
-        <w:rPr>
-          <w:rFonts w:ascii="Times New Roman" w:hAnsi="Times New Roman" w:cs="Times New Roman"/>
-          <w:lang w:val="en-GB"/>
-        </w:rPr>
-        <w:t>ini</w:t>
-      </w:r>
-      <w:proofErr w:type="spellEnd"/>
-      <w:r>
-        <w:rPr>
-          <w:rFonts w:ascii="Times New Roman" w:hAnsi="Times New Roman" w:cs="Times New Roman"/>
-          <w:lang w:val="en-GB"/>
-        </w:rPr>
-        <w:t xml:space="preserve"> </w:t>
-      </w:r>
-      <w:proofErr w:type="spellStart"/>
-      <w:r>
-        <w:rPr>
-          <w:rFonts w:ascii="Times New Roman" w:hAnsi="Times New Roman" w:cs="Times New Roman"/>
-          <w:lang w:val="en-GB"/>
-        </w:rPr>
-        <w:t>dibuat</w:t>
-      </w:r>
-      <w:proofErr w:type="spellEnd"/>
-      <w:r>
-        <w:rPr>
-          <w:rFonts w:ascii="Times New Roman" w:hAnsi="Times New Roman" w:cs="Times New Roman"/>
-          <w:lang w:val="en-GB"/>
-        </w:rPr>
-        <w:t>.</w:t>
-      </w:r>
-    </w:p>
-    <w:p>
-      <w:pPr>
-        <w:contextualSpacing/>
-        <w:jc w:val="both"/>
-        <w:rPr>
-          <w:rFonts w:ascii="Times New Roman" w:hAnsi="Times New Roman" w:cs="Times New Roman"/>
-          <w:lang w:val="en-GB"/>
-        </w:rPr>
-      </w:pPr>
-      <w:r>
-        <w:rPr>
-          <w:rFonts w:ascii="Times New Roman" w:hAnsi="Times New Roman" w:cs="Times New Roman"/>
-          <w:lang w:val="en-GB"/>
-        </w:rPr>
-        <w:t xml:space="preserve">  </w:t>
-      </w:r>
-      <w:proofErr w:type="spellStart"/>
-      <w:r>
-        <w:rPr>
-          <w:rFonts w:ascii="Times New Roman" w:hAnsi="Times New Roman" w:cs="Times New Roman"/>
-          <w:lang w:val="en-GB"/>
-        </w:rPr>
-        <w:t>updatedAt</w:t>
-      </w:r>
-      <w:proofErr w:type="spellEnd"/>
-      <w:r>
-        <w:rPr>
-          <w:rFonts w:ascii="Times New Roman" w:hAnsi="Times New Roman" w:cs="Times New Roman"/>
-          <w:lang w:val="en-GB"/>
-        </w:rPr>
-        <w:t xml:space="preserve">: </w:t>
-      </w:r>
-      <w:proofErr w:type="gramStart"/>
-      <w:r>
-        <w:rPr>
-          <w:rFonts w:ascii="Times New Roman" w:hAnsi="Times New Roman" w:cs="Times New Roman"/>
-          <w:lang w:val="en-GB"/>
-        </w:rPr>
-        <w:t xml:space="preserve">Date;   </w:t>
-      </w:r>
-      <w:proofErr w:type="gramEnd"/>
-      <w:r>
-        <w:rPr>
-          <w:rFonts w:ascii="Times New Roman" w:hAnsi="Times New Roman" w:cs="Times New Roman"/>
-          <w:lang w:val="en-GB"/>
-        </w:rPr>
-        <w:t xml:space="preserve">    # </w:t>
-      </w:r>
-      <w:proofErr w:type="spellStart"/>
-      <w:r>
-        <w:rPr>
-          <w:rFonts w:ascii="Times New Roman" w:hAnsi="Times New Roman" w:cs="Times New Roman"/>
-          <w:lang w:val="en-GB"/>
-        </w:rPr>
-        <w:t>Catatan</w:t>
-      </w:r>
-      <w:proofErr w:type="spellEnd"/>
-      <w:r>
-        <w:rPr>
-          <w:rFonts w:ascii="Times New Roman" w:hAnsi="Times New Roman" w:cs="Times New Roman"/>
-          <w:lang w:val="en-GB"/>
-        </w:rPr>
-        <w:t xml:space="preserve"> </w:t>
-      </w:r>
-      <w:proofErr w:type="spellStart"/>
-      <w:r>
-        <w:rPr>
-          <w:rFonts w:ascii="Times New Roman" w:hAnsi="Times New Roman" w:cs="Times New Roman"/>
-          <w:lang w:val="en-GB"/>
-        </w:rPr>
-        <w:t>waktu</w:t>
-      </w:r>
-      <w:proofErr w:type="spellEnd"/>
-      <w:r>
-        <w:rPr>
-          <w:rFonts w:ascii="Times New Roman" w:hAnsi="Times New Roman" w:cs="Times New Roman"/>
-          <w:lang w:val="en-GB"/>
-        </w:rPr>
-        <w:t xml:space="preserve"> kapan </w:t>
-      </w:r>
-      <w:proofErr w:type="spellStart"/>
-      <w:r>
-        <w:rPr>
-          <w:rFonts w:ascii="Times New Roman" w:hAnsi="Times New Roman" w:cs="Times New Roman"/>
-          <w:lang w:val="en-GB"/>
-        </w:rPr>
-        <w:t>terakhir</w:t>
-      </w:r>
-      <w:proofErr w:type="spellEnd"/>
-      <w:r>
-        <w:rPr>
-          <w:rFonts w:ascii="Times New Roman" w:hAnsi="Times New Roman" w:cs="Times New Roman"/>
-          <w:lang w:val="en-GB"/>
-        </w:rPr>
-        <w:t xml:space="preserve"> kali data </w:t>
-      </w:r>
-      <w:proofErr w:type="spellStart"/>
-      <w:r>
-        <w:rPr>
-          <w:rFonts w:ascii="Times New Roman" w:hAnsi="Times New Roman" w:cs="Times New Roman"/>
-          <w:lang w:val="en-GB"/>
-        </w:rPr>
-        <w:t>diubah</w:t>
-      </w:r>
-      <w:proofErr w:type="spellEnd"/>
-      <w:r>
-        <w:rPr>
-          <w:rFonts w:ascii="Times New Roman" w:hAnsi="Times New Roman" w:cs="Times New Roman"/>
-          <w:lang w:val="en-GB"/>
-        </w:rPr>
-        <w:t>.</w:t>
-      </w:r>
-    </w:p>
-    <w:p>
-      <w:pPr>
-        <w:contextualSpacing/>
-        <w:jc w:val="both"/>
-        <w:rPr>
-          <w:rFonts w:ascii="Times New Roman" w:hAnsi="Times New Roman" w:cs="Times New Roman"/>
-          <w:lang w:val="en-GB"/>
-        </w:rPr>
-      </w:pPr>
-    </w:p>
-    <w:p>
-      <w:pPr>
-        <w:contextualSpacing/>
-        <w:jc w:val="both"/>
-        <w:rPr>
-          <w:rFonts w:ascii="Times New Roman" w:hAnsi="Times New Roman" w:cs="Times New Roman"/>
-          <w:lang w:val="en-GB"/>
-        </w:rPr>
-      </w:pPr>
-      <w:r>
-        <w:rPr>
-          <w:rFonts w:ascii="Times New Roman" w:hAnsi="Times New Roman" w:cs="Times New Roman"/>
-          <w:lang w:val="en-GB"/>
-        </w:rPr>
-        <w:t xml:space="preserve">  # Constructor </w:t>
-      </w:r>
-      <w:proofErr w:type="spellStart"/>
-      <w:r>
-        <w:rPr>
-          <w:rFonts w:ascii="Times New Roman" w:hAnsi="Times New Roman" w:cs="Times New Roman"/>
-          <w:lang w:val="en-GB"/>
-        </w:rPr>
-        <w:t>adalah</w:t>
-      </w:r>
-      <w:proofErr w:type="spellEnd"/>
-      <w:r>
-        <w:rPr>
-          <w:rFonts w:ascii="Times New Roman" w:hAnsi="Times New Roman" w:cs="Times New Roman"/>
-          <w:lang w:val="en-GB"/>
-        </w:rPr>
-        <w:t xml:space="preserve"> </w:t>
-      </w:r>
-      <w:proofErr w:type="spellStart"/>
-      <w:r>
-        <w:rPr>
-          <w:rFonts w:ascii="Times New Roman" w:hAnsi="Times New Roman" w:cs="Times New Roman"/>
-          <w:lang w:val="en-GB"/>
-        </w:rPr>
-        <w:t>mesin</w:t>
-      </w:r>
-      <w:proofErr w:type="spellEnd"/>
-      <w:r>
-        <w:rPr>
-          <w:rFonts w:ascii="Times New Roman" w:hAnsi="Times New Roman" w:cs="Times New Roman"/>
-          <w:lang w:val="en-GB"/>
-        </w:rPr>
-        <w:t xml:space="preserve"> </w:t>
-      </w:r>
-      <w:proofErr w:type="spellStart"/>
-      <w:r>
-        <w:rPr>
-          <w:rFonts w:ascii="Times New Roman" w:hAnsi="Times New Roman" w:cs="Times New Roman"/>
-          <w:lang w:val="en-GB"/>
-        </w:rPr>
-        <w:t>pembuat</w:t>
-      </w:r>
-      <w:proofErr w:type="spellEnd"/>
-      <w:r>
-        <w:rPr>
-          <w:rFonts w:ascii="Times New Roman" w:hAnsi="Times New Roman" w:cs="Times New Roman"/>
-          <w:lang w:val="en-GB"/>
-        </w:rPr>
-        <w:t xml:space="preserve"> </w:t>
-      </w:r>
-      <w:proofErr w:type="spellStart"/>
-      <w:r>
-        <w:rPr>
-          <w:rFonts w:ascii="Times New Roman" w:hAnsi="Times New Roman" w:cs="Times New Roman"/>
-          <w:lang w:val="en-GB"/>
-        </w:rPr>
-        <w:t>objek</w:t>
-      </w:r>
-      <w:proofErr w:type="spellEnd"/>
-      <w:r>
-        <w:rPr>
-          <w:rFonts w:ascii="Times New Roman" w:hAnsi="Times New Roman" w:cs="Times New Roman"/>
-          <w:lang w:val="en-GB"/>
-        </w:rPr>
-        <w:t xml:space="preserve"> </w:t>
-      </w:r>
-      <w:proofErr w:type="spellStart"/>
-      <w:r>
-        <w:rPr>
-          <w:rFonts w:ascii="Times New Roman" w:hAnsi="Times New Roman" w:cs="Times New Roman"/>
-          <w:lang w:val="en-GB"/>
-        </w:rPr>
-        <w:t>otomatis</w:t>
-      </w:r>
-      <w:proofErr w:type="spellEnd"/>
-      <w:r>
-        <w:rPr>
-          <w:rFonts w:ascii="Times New Roman" w:hAnsi="Times New Roman" w:cs="Times New Roman"/>
-          <w:lang w:val="en-GB"/>
-        </w:rPr>
-        <w:t>.</w:t>
-      </w:r>
-    </w:p>
-    <w:p>
-      <w:pPr>
-        <w:contextualSpacing/>
-        <w:jc w:val="both"/>
-        <w:rPr>
-          <w:rFonts w:ascii="Times New Roman" w:hAnsi="Times New Roman" w:cs="Times New Roman"/>
-          <w:lang w:val="en-GB"/>
-        </w:rPr>
-      </w:pPr>
-      <w:r>
-        <w:rPr>
-          <w:rFonts w:ascii="Times New Roman" w:hAnsi="Times New Roman" w:cs="Times New Roman"/>
-          <w:lang w:val="en-GB"/>
-        </w:rPr>
-        <w:t xml:space="preserve">  # Partial&lt;</w:t>
-      </w:r>
-      <w:proofErr w:type="spellStart"/>
-      <w:r>
-        <w:rPr>
-          <w:rFonts w:ascii="Times New Roman" w:hAnsi="Times New Roman" w:cs="Times New Roman"/>
-          <w:lang w:val="en-GB"/>
-        </w:rPr>
-        <w:t>KategoriEntity</w:t>
-      </w:r>
-      <w:proofErr w:type="spellEnd"/>
-      <w:r>
-        <w:rPr>
-          <w:rFonts w:ascii="Times New Roman" w:hAnsi="Times New Roman" w:cs="Times New Roman"/>
-          <w:lang w:val="en-GB"/>
-        </w:rPr>
-        <w:t xml:space="preserve">&gt; </w:t>
-      </w:r>
-      <w:proofErr w:type="spellStart"/>
-      <w:r>
-        <w:rPr>
-          <w:rFonts w:ascii="Times New Roman" w:hAnsi="Times New Roman" w:cs="Times New Roman"/>
-          <w:lang w:val="en-GB"/>
-        </w:rPr>
-        <w:t>artinya</w:t>
-      </w:r>
-      <w:proofErr w:type="spellEnd"/>
-      <w:r>
-        <w:rPr>
-          <w:rFonts w:ascii="Times New Roman" w:hAnsi="Times New Roman" w:cs="Times New Roman"/>
-          <w:lang w:val="en-GB"/>
-        </w:rPr>
-        <w:t xml:space="preserve"> </w:t>
-      </w:r>
-      <w:proofErr w:type="spellStart"/>
-      <w:r>
-        <w:rPr>
-          <w:rFonts w:ascii="Times New Roman" w:hAnsi="Times New Roman" w:cs="Times New Roman"/>
-          <w:lang w:val="en-GB"/>
-        </w:rPr>
-        <w:t>kita</w:t>
-      </w:r>
-      <w:proofErr w:type="spellEnd"/>
-      <w:r>
-        <w:rPr>
-          <w:rFonts w:ascii="Times New Roman" w:hAnsi="Times New Roman" w:cs="Times New Roman"/>
-          <w:lang w:val="en-GB"/>
-        </w:rPr>
-        <w:t xml:space="preserve"> </w:t>
-      </w:r>
-      <w:proofErr w:type="spellStart"/>
-      <w:r>
-        <w:rPr>
-          <w:rFonts w:ascii="Times New Roman" w:hAnsi="Times New Roman" w:cs="Times New Roman"/>
-          <w:lang w:val="en-GB"/>
-        </w:rPr>
-        <w:t>bisa</w:t>
-      </w:r>
-      <w:proofErr w:type="spellEnd"/>
-      <w:r>
-        <w:rPr>
-          <w:rFonts w:ascii="Times New Roman" w:hAnsi="Times New Roman" w:cs="Times New Roman"/>
-          <w:lang w:val="en-GB"/>
-        </w:rPr>
-        <w:t xml:space="preserve"> </w:t>
-      </w:r>
-      <w:proofErr w:type="spellStart"/>
-      <w:r>
-        <w:rPr>
-          <w:rFonts w:ascii="Times New Roman" w:hAnsi="Times New Roman" w:cs="Times New Roman"/>
-          <w:lang w:val="en-GB"/>
-        </w:rPr>
-        <w:t>memasukkan</w:t>
-      </w:r>
-      <w:proofErr w:type="spellEnd"/>
-      <w:r>
-        <w:rPr>
-          <w:rFonts w:ascii="Times New Roman" w:hAnsi="Times New Roman" w:cs="Times New Roman"/>
-          <w:lang w:val="en-GB"/>
-        </w:rPr>
-        <w:t xml:space="preserve"> data </w:t>
-      </w:r>
-      <w:proofErr w:type="spellStart"/>
-      <w:r>
-        <w:rPr>
-          <w:rFonts w:ascii="Times New Roman" w:hAnsi="Times New Roman" w:cs="Times New Roman"/>
-          <w:lang w:val="en-GB"/>
-        </w:rPr>
-        <w:t>meskipun</w:t>
-      </w:r>
-      <w:proofErr w:type="spellEnd"/>
-      <w:r>
-        <w:rPr>
-          <w:rFonts w:ascii="Times New Roman" w:hAnsi="Times New Roman" w:cs="Times New Roman"/>
-          <w:lang w:val="en-GB"/>
-        </w:rPr>
-        <w:t xml:space="preserve"> </w:t>
-      </w:r>
-      <w:proofErr w:type="spellStart"/>
-      <w:r>
-        <w:rPr>
-          <w:rFonts w:ascii="Times New Roman" w:hAnsi="Times New Roman" w:cs="Times New Roman"/>
-          <w:lang w:val="en-GB"/>
-        </w:rPr>
-        <w:t>tidak</w:t>
-      </w:r>
-      <w:proofErr w:type="spellEnd"/>
-      <w:r>
-        <w:rPr>
-          <w:rFonts w:ascii="Times New Roman" w:hAnsi="Times New Roman" w:cs="Times New Roman"/>
-          <w:lang w:val="en-GB"/>
-        </w:rPr>
-        <w:t xml:space="preserve"> </w:t>
-      </w:r>
-      <w:proofErr w:type="spellStart"/>
-      <w:r>
-        <w:rPr>
-          <w:rFonts w:ascii="Times New Roman" w:hAnsi="Times New Roman" w:cs="Times New Roman"/>
-          <w:lang w:val="en-GB"/>
-        </w:rPr>
-        <w:t>lengkap</w:t>
-      </w:r>
-      <w:proofErr w:type="spellEnd"/>
-      <w:r>
-        <w:rPr>
-          <w:rFonts w:ascii="Times New Roman" w:hAnsi="Times New Roman" w:cs="Times New Roman"/>
-          <w:lang w:val="en-GB"/>
-        </w:rPr>
-        <w:t>.</w:t>
-      </w:r>
-    </w:p>
-    <w:p>
-      <w:pPr>
-        <w:contextualSpacing/>
-        <w:jc w:val="both"/>
-        <w:rPr>
-          <w:rFonts w:ascii="Times New Roman" w:hAnsi="Times New Roman" w:cs="Times New Roman"/>
-          <w:lang w:val="en-GB"/>
-        </w:rPr>
-      </w:pPr>
-      <w:r>
-        <w:rPr>
-          <w:rFonts w:ascii="Times New Roman" w:hAnsi="Times New Roman" w:cs="Times New Roman"/>
-          <w:lang w:val="en-GB"/>
-        </w:rPr>
-        <w:t xml:space="preserve">  </w:t>
-      </w:r>
-      <w:proofErr w:type="gramStart"/>
-      <w:r>
-        <w:rPr>
-          <w:rFonts w:ascii="Times New Roman" w:hAnsi="Times New Roman" w:cs="Times New Roman"/>
-          <w:lang w:val="en-GB"/>
-        </w:rPr>
-        <w:t>constructor(</w:t>
-      </w:r>
-      <w:proofErr w:type="gramEnd"/>
-      <w:r>
-        <w:rPr>
-          <w:rFonts w:ascii="Times New Roman" w:hAnsi="Times New Roman" w:cs="Times New Roman"/>
-          <w:lang w:val="en-GB"/>
-        </w:rPr>
-        <w:t>data: Partial&lt;</w:t>
-      </w:r>
-      <w:proofErr w:type="spellStart"/>
-      <w:r>
-        <w:rPr>
-          <w:rFonts w:ascii="Times New Roman" w:hAnsi="Times New Roman" w:cs="Times New Roman"/>
-          <w:lang w:val="en-GB"/>
-        </w:rPr>
-        <w:t>KategoriEntity</w:t>
-      </w:r>
-      <w:proofErr w:type="spellEnd"/>
-      <w:r>
-        <w:rPr>
-          <w:rFonts w:ascii="Times New Roman" w:hAnsi="Times New Roman" w:cs="Times New Roman"/>
-          <w:lang w:val="en-GB"/>
-        </w:rPr>
-        <w:t>&gt;) {</w:t>
-      </w:r>
-    </w:p>
-    <w:p>
-      <w:pPr>
-        <w:contextualSpacing/>
-        <w:jc w:val="both"/>
-        <w:rPr>
-          <w:rFonts w:ascii="Times New Roman" w:hAnsi="Times New Roman" w:cs="Times New Roman"/>
-          <w:lang w:val="en-GB"/>
-        </w:rPr>
-      </w:pPr>
-      <w:r>
-        <w:rPr>
-          <w:rFonts w:ascii="Times New Roman" w:hAnsi="Times New Roman" w:cs="Times New Roman"/>
-          <w:lang w:val="en-GB"/>
-        </w:rPr>
-        <w:t xml:space="preserve">    # </w:t>
-      </w:r>
-      <w:proofErr w:type="spellStart"/>
-      <w:r>
-        <w:rPr>
-          <w:rFonts w:ascii="Times New Roman" w:hAnsi="Times New Roman" w:cs="Times New Roman"/>
-          <w:lang w:val="en-GB"/>
-        </w:rPr>
-        <w:t>Object.assign</w:t>
-      </w:r>
-      <w:proofErr w:type="spellEnd"/>
-      <w:r>
-        <w:rPr>
-          <w:rFonts w:ascii="Times New Roman" w:hAnsi="Times New Roman" w:cs="Times New Roman"/>
-          <w:lang w:val="en-GB"/>
-        </w:rPr>
-        <w:t xml:space="preserve"> </w:t>
-      </w:r>
-      <w:proofErr w:type="spellStart"/>
-      <w:r>
-        <w:rPr>
-          <w:rFonts w:ascii="Times New Roman" w:hAnsi="Times New Roman" w:cs="Times New Roman"/>
-          <w:lang w:val="en-GB"/>
-        </w:rPr>
-        <w:t>berfungsi</w:t>
-      </w:r>
-      <w:proofErr w:type="spellEnd"/>
-      <w:r>
-        <w:rPr>
-          <w:rFonts w:ascii="Times New Roman" w:hAnsi="Times New Roman" w:cs="Times New Roman"/>
-          <w:lang w:val="en-GB"/>
-        </w:rPr>
-        <w:t xml:space="preserve"> </w:t>
-      </w:r>
-      <w:proofErr w:type="spellStart"/>
-      <w:r>
-        <w:rPr>
-          <w:rFonts w:ascii="Times New Roman" w:hAnsi="Times New Roman" w:cs="Times New Roman"/>
-          <w:lang w:val="en-GB"/>
-        </w:rPr>
-        <w:t>untuk</w:t>
-      </w:r>
-      <w:proofErr w:type="spellEnd"/>
-      <w:r>
-        <w:rPr>
-          <w:rFonts w:ascii="Times New Roman" w:hAnsi="Times New Roman" w:cs="Times New Roman"/>
-          <w:lang w:val="en-GB"/>
-        </w:rPr>
-        <w:t xml:space="preserve"> '</w:t>
-      </w:r>
-      <w:proofErr w:type="spellStart"/>
-      <w:r>
-        <w:rPr>
-          <w:rFonts w:ascii="Times New Roman" w:hAnsi="Times New Roman" w:cs="Times New Roman"/>
-          <w:lang w:val="en-GB"/>
-        </w:rPr>
-        <w:t>memberikan</w:t>
-      </w:r>
-      <w:proofErr w:type="spellEnd"/>
-      <w:r>
-        <w:rPr>
-          <w:rFonts w:ascii="Times New Roman" w:hAnsi="Times New Roman" w:cs="Times New Roman"/>
-          <w:lang w:val="en-GB"/>
-        </w:rPr>
-        <w:t xml:space="preserve">' </w:t>
-      </w:r>
-      <w:proofErr w:type="spellStart"/>
-      <w:r>
-        <w:rPr>
-          <w:rFonts w:ascii="Times New Roman" w:hAnsi="Times New Roman" w:cs="Times New Roman"/>
-          <w:lang w:val="en-GB"/>
-        </w:rPr>
-        <w:t>atau</w:t>
-      </w:r>
-      <w:proofErr w:type="spellEnd"/>
-      <w:r>
-        <w:rPr>
-          <w:rFonts w:ascii="Times New Roman" w:hAnsi="Times New Roman" w:cs="Times New Roman"/>
-          <w:lang w:val="en-GB"/>
-        </w:rPr>
-        <w:t xml:space="preserve"> </w:t>
-      </w:r>
-      <w:proofErr w:type="spellStart"/>
-      <w:r>
-        <w:rPr>
-          <w:rFonts w:ascii="Times New Roman" w:hAnsi="Times New Roman" w:cs="Times New Roman"/>
-          <w:lang w:val="en-GB"/>
-        </w:rPr>
-        <w:t>mengisi</w:t>
-      </w:r>
-      <w:proofErr w:type="spellEnd"/>
-      <w:r>
-        <w:rPr>
-          <w:rFonts w:ascii="Times New Roman" w:hAnsi="Times New Roman" w:cs="Times New Roman"/>
-          <w:lang w:val="en-GB"/>
-        </w:rPr>
-        <w:t xml:space="preserve"> </w:t>
-      </w:r>
-      <w:proofErr w:type="spellStart"/>
-      <w:r>
-        <w:rPr>
-          <w:rFonts w:ascii="Times New Roman" w:hAnsi="Times New Roman" w:cs="Times New Roman"/>
-          <w:lang w:val="en-GB"/>
-        </w:rPr>
-        <w:t>kolom-kolom</w:t>
-      </w:r>
-      <w:proofErr w:type="spellEnd"/>
-      <w:r>
-        <w:rPr>
-          <w:rFonts w:ascii="Times New Roman" w:hAnsi="Times New Roman" w:cs="Times New Roman"/>
-          <w:lang w:val="en-GB"/>
-        </w:rPr>
-        <w:t xml:space="preserve"> </w:t>
-      </w:r>
-    </w:p>
-    <w:p>
-      <w:pPr>
-        <w:contextualSpacing/>
-        <w:jc w:val="both"/>
-        <w:rPr>
-          <w:rFonts w:ascii="Times New Roman" w:hAnsi="Times New Roman" w:cs="Times New Roman"/>
-          <w:lang w:val="en-GB"/>
-        </w:rPr>
-      </w:pPr>
-      <w:r>
-        <w:rPr>
-          <w:rFonts w:ascii="Times New Roman" w:hAnsi="Times New Roman" w:cs="Times New Roman"/>
-          <w:lang w:val="en-GB"/>
-        </w:rPr>
-        <w:t xml:space="preserve">    # </w:t>
-      </w:r>
-      <w:proofErr w:type="gramStart"/>
-      <w:r>
-        <w:rPr>
-          <w:rFonts w:ascii="Times New Roman" w:hAnsi="Times New Roman" w:cs="Times New Roman"/>
-          <w:lang w:val="en-GB"/>
-        </w:rPr>
-        <w:t>di</w:t>
-      </w:r>
-      <w:proofErr w:type="gramEnd"/>
-      <w:r>
-        <w:rPr>
-          <w:rFonts w:ascii="Times New Roman" w:hAnsi="Times New Roman" w:cs="Times New Roman"/>
-          <w:lang w:val="en-GB"/>
-        </w:rPr>
-        <w:t xml:space="preserve"> </w:t>
+        <w:t xml:space="preserve">    # di </w:t>
       </w:r>
       <w:proofErr w:type="spellStart"/>
       <w:r>
@@ -10777,7 +10483,6 @@
         <w:t xml:space="preserve"> </w:t>
       </w:r>
       <w:proofErr w:type="spellStart"/>
-      <w:proofErr w:type="gramStart"/>
       <w:r>
         <w:rPr>
           <w:rFonts w:ascii="Times New Roman" w:hAnsi="Times New Roman" w:cs="Times New Roman"/>
@@ -10786,7 +10491,6 @@
         <w:t>kategori.harga</w:t>
       </w:r>
       <w:proofErr w:type="spellEnd"/>
-      <w:proofErr w:type="gramEnd"/>
       <w:r>
         <w:rPr>
           <w:rFonts w:ascii="Times New Roman" w:hAnsi="Times New Roman" w:cs="Times New Roman"/>
@@ -11762,7 +11466,6 @@
           <w:lang w:val="en-GB"/>
         </w:rPr>
       </w:pPr>
-      <w:proofErr w:type="gramStart"/>
       <w:r>
         <w:rPr>
           <w:rFonts w:ascii="Times New Roman" w:hAnsi="Times New Roman" w:cs="Times New Roman"/>
@@ -11770,7 +11473,6 @@
         </w:rPr>
         <w:t>Kode :</w:t>
       </w:r>
-      <w:proofErr w:type="gramEnd"/>
     </w:p>
     <w:p>
       <w:pPr>
@@ -11786,15 +11488,7 @@
           <w:rFonts w:ascii="Times New Roman" w:hAnsi="Times New Roman" w:cs="Times New Roman"/>
           <w:lang w:val="en-GB"/>
         </w:rPr>
-        <w:t xml:space="preserve">import </w:t>
-      </w:r>
-      <w:proofErr w:type="gramStart"/>
-      <w:r>
-        <w:rPr>
-          <w:rFonts w:ascii="Times New Roman" w:hAnsi="Times New Roman" w:cs="Times New Roman"/>
-          <w:lang w:val="en-GB"/>
-        </w:rPr>
-        <w:t xml:space="preserve">{ </w:t>
+        <w:t xml:space="preserve">import { </w:t>
       </w:r>
       <w:proofErr w:type="spellStart"/>
       <w:r>
@@ -11805,7 +11499,6 @@
         <w:t>IsString</w:t>
       </w:r>
       <w:proofErr w:type="spellEnd"/>
-      <w:proofErr w:type="gramEnd"/>
       <w:r>
         <w:rPr>
           <w:rFonts w:ascii="Times New Roman" w:hAnsi="Times New Roman" w:cs="Times New Roman"/>
@@ -11862,7 +11555,6 @@
         <w:t xml:space="preserve">, </w:t>
       </w:r>
       <w:proofErr w:type="spellStart"/>
-      <w:proofErr w:type="gramStart"/>
       <w:r>
         <w:rPr>
           <w:rFonts w:ascii="Times New Roman" w:hAnsi="Times New Roman" w:cs="Times New Roman"/>
@@ -11876,15 +11568,7 @@
           <w:rFonts w:ascii="Times New Roman" w:hAnsi="Times New Roman" w:cs="Times New Roman"/>
           <w:lang w:val="en-GB"/>
         </w:rPr>
-        <w:t xml:space="preserve"> }</w:t>
-      </w:r>
-      <w:proofErr w:type="gramEnd"/>
-      <w:r>
-        <w:rPr>
-          <w:rFonts w:ascii="Times New Roman" w:hAnsi="Times New Roman" w:cs="Times New Roman"/>
-          <w:lang w:val="en-GB"/>
-        </w:rPr>
-        <w:t xml:space="preserve"> from 'class-validator';</w:t>
+        <w:t xml:space="preserve"> } from 'class-validator';</w:t>
       </w:r>
     </w:p>
     <w:p>
@@ -12090,23 +11774,7 @@
           <w:rFonts w:ascii="Times New Roman" w:hAnsi="Times New Roman" w:cs="Times New Roman"/>
           <w:lang w:val="en-GB"/>
         </w:rPr>
-        <w:t xml:space="preserve">  @</w:t>
-      </w:r>
-      <w:proofErr w:type="gramStart"/>
-      <w:r>
-        <w:rPr>
-          <w:rFonts w:ascii="Times New Roman" w:hAnsi="Times New Roman" w:cs="Times New Roman"/>
-          <w:lang w:val="en-GB"/>
-        </w:rPr>
-        <w:t>IsString(</w:t>
-      </w:r>
-      <w:proofErr w:type="gramEnd"/>
-      <w:r>
-        <w:rPr>
-          <w:rFonts w:ascii="Times New Roman" w:hAnsi="Times New Roman" w:cs="Times New Roman"/>
-          <w:lang w:val="en-GB"/>
-        </w:rPr>
-        <w:t xml:space="preserve">)      # Harus </w:t>
+        <w:t xml:space="preserve">  @IsString()      # Harus </w:t>
       </w:r>
       <w:proofErr w:type="spellStart"/>
       <w:r>
@@ -12155,23 +11823,7 @@
           <w:rFonts w:ascii="Times New Roman" w:hAnsi="Times New Roman" w:cs="Times New Roman"/>
           <w:lang w:val="en-GB"/>
         </w:rPr>
-        <w:t xml:space="preserve">  @</w:t>
-      </w:r>
-      <w:proofErr w:type="gramStart"/>
-      <w:r>
-        <w:rPr>
-          <w:rFonts w:ascii="Times New Roman" w:hAnsi="Times New Roman" w:cs="Times New Roman"/>
-          <w:lang w:val="en-GB"/>
-        </w:rPr>
-        <w:t>IsNotEmpty(</w:t>
-      </w:r>
-      <w:proofErr w:type="gramEnd"/>
-      <w:r>
-        <w:rPr>
-          <w:rFonts w:ascii="Times New Roman" w:hAnsi="Times New Roman" w:cs="Times New Roman"/>
-          <w:lang w:val="en-GB"/>
-        </w:rPr>
-        <w:t xml:space="preserve">)   # Tidak </w:t>
+        <w:t xml:space="preserve">  @IsNotEmpty()   # Tidak </w:t>
       </w:r>
       <w:proofErr w:type="spellStart"/>
       <w:r>
@@ -12268,23 +11920,7 @@
           <w:rFonts w:ascii="Times New Roman" w:hAnsi="Times New Roman" w:cs="Times New Roman"/>
           <w:lang w:val="en-GB"/>
         </w:rPr>
-        <w:t xml:space="preserve">  @</w:t>
-      </w:r>
-      <w:proofErr w:type="gramStart"/>
-      <w:r>
-        <w:rPr>
-          <w:rFonts w:ascii="Times New Roman" w:hAnsi="Times New Roman" w:cs="Times New Roman"/>
-          <w:lang w:val="en-GB"/>
-        </w:rPr>
-        <w:t>MinLength(</w:t>
-      </w:r>
-      <w:proofErr w:type="gramEnd"/>
-      <w:r>
-        <w:rPr>
-          <w:rFonts w:ascii="Times New Roman" w:hAnsi="Times New Roman" w:cs="Times New Roman"/>
-          <w:lang w:val="en-GB"/>
-        </w:rPr>
-        <w:t xml:space="preserve">2)   # Minimal </w:t>
+        <w:t xml:space="preserve">  @MinLength(2)   # Minimal </w:t>
       </w:r>
       <w:proofErr w:type="spellStart"/>
       <w:r>
@@ -12413,23 +12049,7 @@
           <w:rFonts w:ascii="Times New Roman" w:hAnsi="Times New Roman" w:cs="Times New Roman"/>
           <w:lang w:val="en-GB"/>
         </w:rPr>
-        <w:t xml:space="preserve">  @</w:t>
-      </w:r>
-      <w:proofErr w:type="gramStart"/>
-      <w:r>
-        <w:rPr>
-          <w:rFonts w:ascii="Times New Roman" w:hAnsi="Times New Roman" w:cs="Times New Roman"/>
-          <w:lang w:val="en-GB"/>
-        </w:rPr>
-        <w:t>MaxLength(</w:t>
-      </w:r>
-      <w:proofErr w:type="gramEnd"/>
-      <w:r>
-        <w:rPr>
-          <w:rFonts w:ascii="Times New Roman" w:hAnsi="Times New Roman" w:cs="Times New Roman"/>
-          <w:lang w:val="en-GB"/>
-        </w:rPr>
-        <w:t xml:space="preserve">100) # </w:t>
+        <w:t xml:space="preserve">  @MaxLength(100) # </w:t>
       </w:r>
       <w:proofErr w:type="spellStart"/>
       <w:r>
@@ -12537,23 +12157,7 @@
           <w:rFonts w:ascii="Times New Roman" w:hAnsi="Times New Roman" w:cs="Times New Roman"/>
           <w:lang w:val="en-GB"/>
         </w:rPr>
-        <w:t xml:space="preserve">  @</w:t>
-      </w:r>
-      <w:proofErr w:type="gramStart"/>
-      <w:r>
-        <w:rPr>
-          <w:rFonts w:ascii="Times New Roman" w:hAnsi="Times New Roman" w:cs="Times New Roman"/>
-          <w:lang w:val="en-GB"/>
-        </w:rPr>
-        <w:t>IsString(</w:t>
-      </w:r>
-      <w:proofErr w:type="gramEnd"/>
-      <w:r>
-        <w:rPr>
-          <w:rFonts w:ascii="Times New Roman" w:hAnsi="Times New Roman" w:cs="Times New Roman"/>
-          <w:lang w:val="en-GB"/>
-        </w:rPr>
-        <w:t xml:space="preserve">)      # Harus </w:t>
+        <w:t xml:space="preserve">  @IsString()      # Harus </w:t>
       </w:r>
       <w:proofErr w:type="spellStart"/>
       <w:r>
@@ -12602,23 +12206,7 @@
           <w:rFonts w:ascii="Times New Roman" w:hAnsi="Times New Roman" w:cs="Times New Roman"/>
           <w:lang w:val="en-GB"/>
         </w:rPr>
-        <w:t xml:space="preserve">  @</w:t>
-      </w:r>
-      <w:proofErr w:type="gramStart"/>
-      <w:r>
-        <w:rPr>
-          <w:rFonts w:ascii="Times New Roman" w:hAnsi="Times New Roman" w:cs="Times New Roman"/>
-          <w:lang w:val="en-GB"/>
-        </w:rPr>
-        <w:t>IsNotEmpty(</w:t>
-      </w:r>
-      <w:proofErr w:type="gramEnd"/>
-      <w:r>
-        <w:rPr>
-          <w:rFonts w:ascii="Times New Roman" w:hAnsi="Times New Roman" w:cs="Times New Roman"/>
-          <w:lang w:val="en-GB"/>
-        </w:rPr>
-        <w:t xml:space="preserve">)   # Wajib </w:t>
+        <w:t xml:space="preserve">  @IsNotEmpty()   # Wajib </w:t>
       </w:r>
       <w:proofErr w:type="spellStart"/>
       <w:r>
@@ -12715,23 +12303,7 @@
           <w:rFonts w:ascii="Times New Roman" w:hAnsi="Times New Roman" w:cs="Times New Roman"/>
           <w:lang w:val="en-GB"/>
         </w:rPr>
-        <w:t xml:space="preserve">  @</w:t>
-      </w:r>
-      <w:proofErr w:type="gramStart"/>
-      <w:r>
-        <w:rPr>
-          <w:rFonts w:ascii="Times New Roman" w:hAnsi="Times New Roman" w:cs="Times New Roman"/>
-          <w:lang w:val="en-GB"/>
-        </w:rPr>
-        <w:t>MinLength(</w:t>
-      </w:r>
-      <w:proofErr w:type="gramEnd"/>
-      <w:r>
-        <w:rPr>
-          <w:rFonts w:ascii="Times New Roman" w:hAnsi="Times New Roman" w:cs="Times New Roman"/>
-          <w:lang w:val="en-GB"/>
-        </w:rPr>
-        <w:t>2)</w:t>
+        <w:t xml:space="preserve">  @MinLength(2)</w:t>
       </w:r>
     </w:p>
     <w:p>
@@ -12748,23 +12320,7 @@
           <w:rFonts w:ascii="Times New Roman" w:hAnsi="Times New Roman" w:cs="Times New Roman"/>
           <w:lang w:val="en-GB"/>
         </w:rPr>
-        <w:t xml:space="preserve">  @</w:t>
-      </w:r>
-      <w:proofErr w:type="gramStart"/>
-      <w:r>
-        <w:rPr>
-          <w:rFonts w:ascii="Times New Roman" w:hAnsi="Times New Roman" w:cs="Times New Roman"/>
-          <w:lang w:val="en-GB"/>
-        </w:rPr>
-        <w:t>MaxLength(</w:t>
-      </w:r>
-      <w:proofErr w:type="gramEnd"/>
-      <w:r>
-        <w:rPr>
-          <w:rFonts w:ascii="Times New Roman" w:hAnsi="Times New Roman" w:cs="Times New Roman"/>
-          <w:lang w:val="en-GB"/>
-        </w:rPr>
-        <w:t>100)</w:t>
+        <w:t xml:space="preserve">  @MaxLength(100)</w:t>
       </w:r>
     </w:p>
     <w:p>
@@ -12808,23 +12364,7 @@
           <w:rFonts w:ascii="Times New Roman" w:hAnsi="Times New Roman" w:cs="Times New Roman"/>
           <w:lang w:val="en-GB"/>
         </w:rPr>
-        <w:t xml:space="preserve">  @</w:t>
-      </w:r>
-      <w:proofErr w:type="gramStart"/>
-      <w:r>
-        <w:rPr>
-          <w:rFonts w:ascii="Times New Roman" w:hAnsi="Times New Roman" w:cs="Times New Roman"/>
-          <w:lang w:val="en-GB"/>
-        </w:rPr>
-        <w:t>IsString(</w:t>
-      </w:r>
-      <w:proofErr w:type="gramEnd"/>
-      <w:r>
-        <w:rPr>
-          <w:rFonts w:ascii="Times New Roman" w:hAnsi="Times New Roman" w:cs="Times New Roman"/>
-          <w:lang w:val="en-GB"/>
-        </w:rPr>
-        <w:t xml:space="preserve">)      # Harus </w:t>
+        <w:t xml:space="preserve">  @IsString()      # Harus </w:t>
       </w:r>
       <w:proofErr w:type="spellStart"/>
       <w:r>
@@ -12873,23 +12413,7 @@
           <w:rFonts w:ascii="Times New Roman" w:hAnsi="Times New Roman" w:cs="Times New Roman"/>
           <w:lang w:val="en-GB"/>
         </w:rPr>
-        <w:t xml:space="preserve">  @</w:t>
-      </w:r>
-      <w:proofErr w:type="gramStart"/>
-      <w:r>
-        <w:rPr>
-          <w:rFonts w:ascii="Times New Roman" w:hAnsi="Times New Roman" w:cs="Times New Roman"/>
-          <w:lang w:val="en-GB"/>
-        </w:rPr>
-        <w:t>IsOptional(</w:t>
-      </w:r>
-      <w:proofErr w:type="gramEnd"/>
-      <w:r>
-        <w:rPr>
-          <w:rFonts w:ascii="Times New Roman" w:hAnsi="Times New Roman" w:cs="Times New Roman"/>
-          <w:lang w:val="en-GB"/>
-        </w:rPr>
-        <w:t>)   # BOLEH KOSONG (</w:t>
+        <w:t xml:space="preserve">  @IsOptional()   # BOLEH KOSONG (</w:t>
       </w:r>
       <w:proofErr w:type="spellStart"/>
       <w:r>
@@ -12954,23 +12478,7 @@
           <w:rFonts w:ascii="Times New Roman" w:hAnsi="Times New Roman" w:cs="Times New Roman"/>
           <w:lang w:val="en-GB"/>
         </w:rPr>
-        <w:t xml:space="preserve">  @</w:t>
-      </w:r>
-      <w:proofErr w:type="gramStart"/>
-      <w:r>
-        <w:rPr>
-          <w:rFonts w:ascii="Times New Roman" w:hAnsi="Times New Roman" w:cs="Times New Roman"/>
-          <w:lang w:val="en-GB"/>
-        </w:rPr>
-        <w:t>MaxLength(</w:t>
-      </w:r>
-      <w:proofErr w:type="gramEnd"/>
-      <w:r>
-        <w:rPr>
-          <w:rFonts w:ascii="Times New Roman" w:hAnsi="Times New Roman" w:cs="Times New Roman"/>
-          <w:lang w:val="en-GB"/>
-        </w:rPr>
-        <w:t xml:space="preserve">500) # Jika </w:t>
+        <w:t xml:space="preserve">  @MaxLength(500) # Jika </w:t>
       </w:r>
       <w:proofErr w:type="spellStart"/>
       <w:r>
@@ -13084,23 +12592,7 @@
           <w:lang w:val="en-GB"/>
         </w:rPr>
         <w:lastRenderedPageBreak/>
-        <w:t xml:space="preserve">  </w:t>
-      </w:r>
-      <w:proofErr w:type="gramStart"/>
-      <w:r>
-        <w:rPr>
-          <w:rFonts w:ascii="Times New Roman" w:hAnsi="Times New Roman" w:cs="Times New Roman"/>
-          <w:lang w:val="en-GB"/>
-        </w:rPr>
-        <w:t>description?:</w:t>
-      </w:r>
-      <w:proofErr w:type="gramEnd"/>
-      <w:r>
-        <w:rPr>
-          <w:rFonts w:ascii="Times New Roman" w:hAnsi="Times New Roman" w:cs="Times New Roman"/>
-          <w:lang w:val="en-GB"/>
-        </w:rPr>
-        <w:t xml:space="preserve"> string;</w:t>
+        <w:t xml:space="preserve">  description?: string;</w:t>
       </w:r>
     </w:p>
     <w:p>
@@ -13127,23 +12619,7 @@
           <w:rFonts w:ascii="Times New Roman" w:hAnsi="Times New Roman" w:cs="Times New Roman"/>
           <w:lang w:val="en-GB"/>
         </w:rPr>
-        <w:t xml:space="preserve">  @</w:t>
-      </w:r>
-      <w:proofErr w:type="gramStart"/>
-      <w:r>
-        <w:rPr>
-          <w:rFonts w:ascii="Times New Roman" w:hAnsi="Times New Roman" w:cs="Times New Roman"/>
-          <w:lang w:val="en-GB"/>
-        </w:rPr>
-        <w:t>IsString(</w:t>
-      </w:r>
-      <w:proofErr w:type="gramEnd"/>
-      <w:r>
-        <w:rPr>
-          <w:rFonts w:ascii="Times New Roman" w:hAnsi="Times New Roman" w:cs="Times New Roman"/>
-          <w:lang w:val="en-GB"/>
-        </w:rPr>
-        <w:t>)</w:t>
+        <w:t xml:space="preserve">  @IsString()</w:t>
       </w:r>
     </w:p>
     <w:p>
@@ -13160,23 +12636,7 @@
           <w:rFonts w:ascii="Times New Roman" w:hAnsi="Times New Roman" w:cs="Times New Roman"/>
           <w:lang w:val="en-GB"/>
         </w:rPr>
-        <w:t xml:space="preserve">  @</w:t>
-      </w:r>
-      <w:proofErr w:type="gramStart"/>
-      <w:r>
-        <w:rPr>
-          <w:rFonts w:ascii="Times New Roman" w:hAnsi="Times New Roman" w:cs="Times New Roman"/>
-          <w:lang w:val="en-GB"/>
-        </w:rPr>
-        <w:t>IsOptional(</w:t>
-      </w:r>
-      <w:proofErr w:type="gramEnd"/>
-      <w:r>
-        <w:rPr>
-          <w:rFonts w:ascii="Times New Roman" w:hAnsi="Times New Roman" w:cs="Times New Roman"/>
-          <w:lang w:val="en-GB"/>
-        </w:rPr>
-        <w:t>)   # BOLEH KOSONG (</w:t>
+        <w:t xml:space="preserve">  @IsOptional()   # BOLEH KOSONG (</w:t>
       </w:r>
       <w:proofErr w:type="spellStart"/>
       <w:r>
@@ -13257,23 +12717,7 @@
           <w:rFonts w:ascii="Times New Roman" w:hAnsi="Times New Roman" w:cs="Times New Roman"/>
           <w:lang w:val="en-GB"/>
         </w:rPr>
-        <w:t xml:space="preserve">  </w:t>
-      </w:r>
-      <w:proofErr w:type="gramStart"/>
-      <w:r>
-        <w:rPr>
-          <w:rFonts w:ascii="Times New Roman" w:hAnsi="Times New Roman" w:cs="Times New Roman"/>
-          <w:lang w:val="en-GB"/>
-        </w:rPr>
-        <w:t>icon?:</w:t>
-      </w:r>
-      <w:proofErr w:type="gramEnd"/>
-      <w:r>
-        <w:rPr>
-          <w:rFonts w:ascii="Times New Roman" w:hAnsi="Times New Roman" w:cs="Times New Roman"/>
-          <w:lang w:val="en-GB"/>
-        </w:rPr>
-        <w:t xml:space="preserve"> string;</w:t>
+        <w:t xml:space="preserve">  icon?: string;</w:t>
       </w:r>
     </w:p>
     <w:p>
@@ -14346,7 +13790,6 @@
         <w:t xml:space="preserve"> </w:t>
       </w:r>
       <w:proofErr w:type="spellStart"/>
-      <w:proofErr w:type="gramStart"/>
       <w:r>
         <w:rPr>
           <w:rFonts w:ascii="Times New Roman" w:hAnsi="Times New Roman" w:cs="Times New Roman"/>
@@ -14371,7 +13814,6 @@
         <w:t>tidak</w:t>
       </w:r>
       <w:proofErr w:type="spellEnd"/>
-      <w:proofErr w:type="gramEnd"/>
       <w:r>
         <w:rPr>
           <w:rFonts w:ascii="Times New Roman" w:hAnsi="Times New Roman" w:cs="Times New Roman"/>
@@ -14604,23 +14046,7 @@
           <w:rFonts w:ascii="Times New Roman" w:hAnsi="Times New Roman" w:cs="Times New Roman"/>
           <w:lang w:val="en-GB"/>
         </w:rPr>
-        <w:t xml:space="preserve"> </w:t>
-      </w:r>
-      <w:proofErr w:type="gramStart"/>
-      <w:r>
-        <w:rPr>
-          <w:rFonts w:ascii="Times New Roman" w:hAnsi="Times New Roman" w:cs="Times New Roman"/>
-          <w:lang w:val="en-GB"/>
-        </w:rPr>
-        <w:t>name?:</w:t>
-      </w:r>
-      <w:proofErr w:type="gramEnd"/>
-      <w:r>
-        <w:rPr>
-          <w:rFonts w:ascii="Times New Roman" w:hAnsi="Times New Roman" w:cs="Times New Roman"/>
-          <w:lang w:val="en-GB"/>
-        </w:rPr>
-        <w:t xml:space="preserve"> string) </w:t>
+        <w:t xml:space="preserve"> name?: string) </w:t>
       </w:r>
       <w:proofErr w:type="spellStart"/>
       <w:r>
@@ -14973,12 +14399,16 @@
         <w:jc w:val="both"/>
         <w:rPr>
           <w:rFonts w:ascii="Times New Roman" w:hAnsi="Times New Roman" w:cs="Times New Roman"/>
-          <w:lang w:val="en-GB"/>
-        </w:rPr>
-      </w:pPr>
-      <w:r>
-        <w:rPr>
-          <w:rFonts w:ascii="Times New Roman" w:hAnsi="Times New Roman" w:cs="Times New Roman"/>
+          <w:b/>
+          <w:bCs/>
+          <w:lang w:val="en-GB"/>
+        </w:rPr>
+      </w:pPr>
+      <w:r>
+        <w:rPr>
+          <w:rFonts w:ascii="Times New Roman" w:hAnsi="Times New Roman" w:cs="Times New Roman"/>
+          <w:b/>
+          <w:bCs/>
           <w:lang w:val="en-GB"/>
         </w:rPr>
         <w:lastRenderedPageBreak/>
@@ -14987,17 +14417,25 @@
       <w:r>
         <w:rPr>
           <w:rFonts w:ascii="Times New Roman" w:hAnsi="Times New Roman" w:cs="Times New Roman"/>
+          <w:b/>
+          <w:bCs/>
           <w:lang w:val="en-GB"/>
         </w:rPr>
         <w:t>Mem</w:t>
       </w:r>
       <w:r>
+        <w:rPr>
+          <w:b/>
+          <w:bCs/>
+        </w:rPr>
         <w:t>b</w:t>
       </w:r>
       <w:proofErr w:type="spellStart"/>
       <w:r>
         <w:rPr>
           <w:rFonts w:ascii="Times New Roman" w:hAnsi="Times New Roman" w:cs="Times New Roman"/>
+          <w:b/>
+          <w:bCs/>
           <w:lang w:val="en-GB"/>
         </w:rPr>
         <w:t>uat</w:t>
@@ -15006,10 +14444,69 @@
       <w:r>
         <w:rPr>
           <w:rFonts w:ascii="Times New Roman" w:hAnsi="Times New Roman" w:cs="Times New Roman"/>
+          <w:b/>
+          <w:bCs/>
           <w:lang w:val="en-GB"/>
         </w:rPr>
         <w:t xml:space="preserve"> Error Handling Utils</w:t>
       </w:r>
+    </w:p>
+    <w:p>
+      <w:pPr>
+        <w:jc w:val="both"/>
+        <w:rPr>
+          <w:rFonts w:ascii="Times New Roman" w:hAnsi="Times New Roman" w:cs="Times New Roman"/>
+          <w:lang w:val="en-GB"/>
+        </w:rPr>
+      </w:pPr>
+      <w:r>
+        <w:rPr>
+          <w:rFonts w:ascii="Times New Roman" w:hAnsi="Times New Roman" w:cs="Times New Roman"/>
+          <w:lang w:val="en-GB"/>
+        </w:rPr>
+        <w:t xml:space="preserve">File : </w:t>
+      </w:r>
+      <w:proofErr w:type="spellStart"/>
+      <w:r>
+        <w:rPr>
+          <w:rFonts w:ascii="Times New Roman" w:hAnsi="Times New Roman" w:cs="Times New Roman"/>
+          <w:lang w:val="en-GB"/>
+        </w:rPr>
+        <w:t>src</w:t>
+      </w:r>
+      <w:proofErr w:type="spellEnd"/>
+      <w:r>
+        <w:rPr>
+          <w:rFonts w:ascii="Times New Roman" w:hAnsi="Times New Roman" w:cs="Times New Roman"/>
+          <w:lang w:val="en-GB"/>
+        </w:rPr>
+        <w:t>/services/</w:t>
+      </w:r>
+      <w:proofErr w:type="spellStart"/>
+      <w:r>
+        <w:rPr>
+          <w:rFonts w:ascii="Times New Roman" w:hAnsi="Times New Roman" w:cs="Times New Roman"/>
+          <w:lang w:val="en-GB"/>
+        </w:rPr>
+        <w:t>kategori</w:t>
+      </w:r>
+      <w:proofErr w:type="spellEnd"/>
+      <w:r>
+        <w:rPr>
+          <w:rFonts w:ascii="Times New Roman" w:hAnsi="Times New Roman" w:cs="Times New Roman"/>
+          <w:lang w:val="en-GB"/>
+        </w:rPr>
+        <w:t>/utils/conflict-</w:t>
+      </w:r>
+      <w:proofErr w:type="spellStart"/>
+      <w:r>
+        <w:rPr>
+          <w:rFonts w:ascii="Times New Roman" w:hAnsi="Times New Roman" w:cs="Times New Roman"/>
+          <w:lang w:val="en-GB"/>
+        </w:rPr>
+        <w:t>kategori.util.ts</w:t>
+      </w:r>
+      <w:proofErr w:type="spellEnd"/>
     </w:p>
     <w:p>
       <w:pPr>
@@ -15084,15 +14581,7 @@
           <w:rFonts w:ascii="Times New Roman" w:hAnsi="Times New Roman" w:cs="Times New Roman"/>
           <w:lang w:val="en-GB"/>
         </w:rPr>
-        <w:t xml:space="preserve">import </w:t>
-      </w:r>
-      <w:proofErr w:type="gramStart"/>
-      <w:r>
-        <w:rPr>
-          <w:rFonts w:ascii="Times New Roman" w:hAnsi="Times New Roman" w:cs="Times New Roman"/>
-          <w:lang w:val="en-GB"/>
-        </w:rPr>
-        <w:t xml:space="preserve">{ </w:t>
+        <w:t xml:space="preserve">import { </w:t>
       </w:r>
       <w:proofErr w:type="spellStart"/>
       <w:r>
@@ -15103,7 +14592,6 @@
         <w:t>ConflictException</w:t>
       </w:r>
       <w:proofErr w:type="spellEnd"/>
-      <w:proofErr w:type="gramEnd"/>
       <w:r>
         <w:rPr>
           <w:rFonts w:ascii="Times New Roman" w:hAnsi="Times New Roman" w:cs="Times New Roman"/>
@@ -15743,7 +15231,6 @@
         <w:t xml:space="preserve">  static </w:t>
       </w:r>
       <w:proofErr w:type="spellStart"/>
-      <w:proofErr w:type="gramStart"/>
       <w:r>
         <w:rPr>
           <w:rFonts w:ascii="Times New Roman" w:hAnsi="Times New Roman" w:cs="Times New Roman"/>
@@ -15757,15 +15244,7 @@
           <w:rFonts w:ascii="Times New Roman" w:hAnsi="Times New Roman" w:cs="Times New Roman"/>
           <w:lang w:val="en-GB"/>
         </w:rPr>
-        <w:t>(</w:t>
-      </w:r>
-      <w:proofErr w:type="gramEnd"/>
-      <w:r>
-        <w:rPr>
-          <w:rFonts w:ascii="Times New Roman" w:hAnsi="Times New Roman" w:cs="Times New Roman"/>
-          <w:lang w:val="en-GB"/>
-        </w:rPr>
-        <w:t>name: string): never {</w:t>
+        <w:t>(name: string): never {</w:t>
       </w:r>
     </w:p>
     <w:p>
@@ -16014,7 +15493,6 @@
         <w:t xml:space="preserve">    throw new </w:t>
       </w:r>
       <w:proofErr w:type="spellStart"/>
-      <w:proofErr w:type="gramStart"/>
       <w:r>
         <w:rPr>
           <w:rFonts w:ascii="Times New Roman" w:hAnsi="Times New Roman" w:cs="Times New Roman"/>
@@ -16030,7 +15508,6 @@
         </w:rPr>
         <w:t>(</w:t>
       </w:r>
-      <w:proofErr w:type="gramEnd"/>
     </w:p>
     <w:p>
       <w:pPr>
@@ -16293,7 +15770,6 @@
         <w:t xml:space="preserve">  static </w:t>
       </w:r>
       <w:proofErr w:type="spellStart"/>
-      <w:proofErr w:type="gramStart"/>
       <w:r>
         <w:rPr>
           <w:rFonts w:ascii="Times New Roman" w:hAnsi="Times New Roman" w:cs="Times New Roman"/>
@@ -16307,15 +15783,7 @@
           <w:rFonts w:ascii="Times New Roman" w:hAnsi="Times New Roman" w:cs="Times New Roman"/>
           <w:lang w:val="en-GB"/>
         </w:rPr>
-        <w:t>(</w:t>
-      </w:r>
-      <w:proofErr w:type="gramEnd"/>
-      <w:r>
-        <w:rPr>
-          <w:rFonts w:ascii="Times New Roman" w:hAnsi="Times New Roman" w:cs="Times New Roman"/>
-          <w:lang w:val="en-GB"/>
-        </w:rPr>
-        <w:t>slug: string): never {</w:t>
+        <w:t>(slug: string): never {</w:t>
       </w:r>
     </w:p>
     <w:p>
@@ -16418,7 +15886,6 @@
         <w:t xml:space="preserve">    throw new </w:t>
       </w:r>
       <w:proofErr w:type="spellStart"/>
-      <w:proofErr w:type="gramStart"/>
       <w:r>
         <w:rPr>
           <w:rFonts w:ascii="Times New Roman" w:hAnsi="Times New Roman" w:cs="Times New Roman"/>
@@ -16434,7 +15901,6 @@
         </w:rPr>
         <w:t>(</w:t>
       </w:r>
-      <w:proofErr w:type="gramEnd"/>
     </w:p>
     <w:p>
       <w:pPr>
@@ -16729,7 +16195,6 @@
         <w:t xml:space="preserve">  static </w:t>
       </w:r>
       <w:proofErr w:type="spellStart"/>
-      <w:proofErr w:type="gramStart"/>
       <w:r>
         <w:rPr>
           <w:rFonts w:ascii="Times New Roman" w:hAnsi="Times New Roman" w:cs="Times New Roman"/>
@@ -16743,15 +16208,7 @@
           <w:rFonts w:ascii="Times New Roman" w:hAnsi="Times New Roman" w:cs="Times New Roman"/>
           <w:lang w:val="en-GB"/>
         </w:rPr>
-        <w:t>(</w:t>
-      </w:r>
-      <w:proofErr w:type="gramEnd"/>
-      <w:r>
-        <w:rPr>
-          <w:rFonts w:ascii="Times New Roman" w:hAnsi="Times New Roman" w:cs="Times New Roman"/>
-          <w:lang w:val="en-GB"/>
-        </w:rPr>
-        <w:t>field: string): never {</w:t>
+        <w:t>(field: string): never {</w:t>
       </w:r>
     </w:p>
     <w:p>
@@ -16769,10 +16226,10 @@
           <w:rFonts w:ascii="Times New Roman" w:hAnsi="Times New Roman" w:cs="Times New Roman"/>
           <w:lang w:val="en-GB"/>
         </w:rPr>
+        <w:lastRenderedPageBreak/>
         <w:t xml:space="preserve">    throw new </w:t>
       </w:r>
       <w:proofErr w:type="spellStart"/>
-      <w:proofErr w:type="gramStart"/>
       <w:r>
         <w:rPr>
           <w:rFonts w:ascii="Times New Roman" w:hAnsi="Times New Roman" w:cs="Times New Roman"/>
@@ -16788,7 +16245,6 @@
         </w:rPr>
         <w:t>(</w:t>
       </w:r>
-      <w:proofErr w:type="gramEnd"/>
     </w:p>
     <w:p>
       <w:pPr>
@@ -16805,7 +16261,6 @@
           <w:rFonts w:ascii="Times New Roman" w:hAnsi="Times New Roman" w:cs="Times New Roman"/>
           <w:lang w:val="en-GB"/>
         </w:rPr>
-        <w:lastRenderedPageBreak/>
         <w:t xml:space="preserve">      `</w:t>
       </w:r>
       <w:proofErr w:type="spellStart"/>
@@ -17175,6 +16630,1266 @@
         </w:rPr>
         <w:t>).</w:t>
       </w:r>
+    </w:p>
+    <w:p>
+      <w:pPr>
+        <w:jc w:val="both"/>
+        <w:rPr>
+          <w:rFonts w:ascii="Times New Roman" w:hAnsi="Times New Roman" w:cs="Times New Roman"/>
+          <w:lang w:val="en-GB"/>
+        </w:rPr>
+      </w:pPr>
+    </w:p>
+    <w:p>
+      <w:pPr>
+        <w:jc w:val="both"/>
+        <w:rPr>
+          <w:rFonts w:ascii="Times New Roman" w:hAnsi="Times New Roman" w:cs="Times New Roman"/>
+          <w:b/>
+          <w:bCs/>
+          <w:lang w:val="en-GB"/>
+        </w:rPr>
+      </w:pPr>
+      <w:r>
+        <w:rPr>
+          <w:rFonts w:ascii="Times New Roman" w:hAnsi="Times New Roman" w:cs="Times New Roman"/>
+          <w:b/>
+          <w:bCs/>
+          <w:lang w:val="en-GB"/>
+        </w:rPr>
+        <w:t xml:space="preserve">16. </w:t>
+      </w:r>
+      <w:proofErr w:type="spellStart"/>
+      <w:r>
+        <w:rPr>
+          <w:rFonts w:ascii="Times New Roman" w:hAnsi="Times New Roman" w:cs="Times New Roman"/>
+          <w:b/>
+          <w:bCs/>
+          <w:lang w:val="en-GB"/>
+        </w:rPr>
+        <w:t>Membuat</w:t>
+      </w:r>
+      <w:proofErr w:type="spellEnd"/>
+      <w:r>
+        <w:rPr>
+          <w:rFonts w:ascii="Times New Roman" w:hAnsi="Times New Roman" w:cs="Times New Roman"/>
+          <w:b/>
+          <w:bCs/>
+          <w:lang w:val="en-GB"/>
+        </w:rPr>
+        <w:t xml:space="preserve"> </w:t>
+      </w:r>
+      <w:r>
+        <w:rPr>
+          <w:rFonts w:ascii="Times New Roman" w:hAnsi="Times New Roman" w:cs="Times New Roman"/>
+          <w:b/>
+          <w:bCs/>
+          <w:lang w:val="en-GB"/>
+        </w:rPr>
+        <w:t xml:space="preserve">Utility Class </w:t>
+      </w:r>
+      <w:proofErr w:type="spellStart"/>
+      <w:r>
+        <w:rPr>
+          <w:rFonts w:ascii="Times New Roman" w:hAnsi="Times New Roman" w:cs="Times New Roman"/>
+          <w:b/>
+          <w:bCs/>
+          <w:lang w:val="en-GB"/>
+        </w:rPr>
+        <w:t>dalam</w:t>
+      </w:r>
+      <w:proofErr w:type="spellEnd"/>
+      <w:r>
+        <w:rPr>
+          <w:rFonts w:ascii="Times New Roman" w:hAnsi="Times New Roman" w:cs="Times New Roman"/>
+          <w:b/>
+          <w:bCs/>
+          <w:lang w:val="en-GB"/>
+        </w:rPr>
+        <w:t xml:space="preserve"> framework </w:t>
+      </w:r>
+      <w:proofErr w:type="spellStart"/>
+      <w:r>
+        <w:rPr>
+          <w:rFonts w:ascii="Times New Roman" w:hAnsi="Times New Roman" w:cs="Times New Roman"/>
+          <w:b/>
+          <w:bCs/>
+          <w:lang w:val="en-GB"/>
+        </w:rPr>
+        <w:t>NestJS</w:t>
+      </w:r>
+      <w:proofErr w:type="spellEnd"/>
+    </w:p>
+    <w:p>
+      <w:pPr>
+        <w:jc w:val="both"/>
+        <w:rPr>
+          <w:rFonts w:ascii="Times New Roman" w:hAnsi="Times New Roman" w:cs="Times New Roman"/>
+          <w:b/>
+          <w:bCs/>
+          <w:lang w:val="en-GB"/>
+        </w:rPr>
+      </w:pPr>
+      <w:r>
+        <w:rPr>
+          <w:rFonts w:ascii="Times New Roman" w:hAnsi="Times New Roman" w:cs="Times New Roman"/>
+          <w:lang w:val="en-GB"/>
+        </w:rPr>
+        <w:t>File</w:t>
+      </w:r>
+      <w:r>
+        <w:rPr>
+          <w:rFonts w:ascii="Times New Roman" w:hAnsi="Times New Roman" w:cs="Times New Roman"/>
+          <w:b/>
+          <w:bCs/>
+          <w:lang w:val="en-GB"/>
+        </w:rPr>
+        <w:t xml:space="preserve"> : </w:t>
+      </w:r>
+      <w:proofErr w:type="spellStart"/>
+      <w:r>
+        <w:t>src</w:t>
+      </w:r>
+      <w:proofErr w:type="spellEnd"/>
+      <w:r>
+        <w:t>/services/</w:t>
+      </w:r>
+      <w:proofErr w:type="spellStart"/>
+      <w:r>
+        <w:t>kategori</w:t>
+      </w:r>
+      <w:proofErr w:type="spellEnd"/>
+      <w:r>
+        <w:t>/utils/not-exist-</w:t>
+      </w:r>
+      <w:proofErr w:type="spellStart"/>
+      <w:r>
+        <w:t>kategori.util.ts</w:t>
+      </w:r>
+      <w:proofErr w:type="spellEnd"/>
+    </w:p>
+    <w:p>
+      <w:pPr>
+        <w:jc w:val="both"/>
+        <w:rPr>
+          <w:rFonts w:ascii="Times New Roman" w:hAnsi="Times New Roman" w:cs="Times New Roman"/>
+          <w:lang w:val="en-GB"/>
+        </w:rPr>
+      </w:pPr>
+      <w:r>
+        <w:rPr>
+          <w:noProof/>
+        </w:rPr>
+        <w:drawing>
+          <wp:inline distT="0" distB="0" distL="0" distR="0" wp14:anchorId="103FF235" wp14:editId="4C498637">
+            <wp:extent cx="5731510" cy="3222625"/>
+            <wp:effectExtent l="0" t="0" r="2540" b="0"/>
+            <wp:docPr id="702378776" name="Picture 1"/>
+            <wp:cNvGraphicFramePr>
+              <a:graphicFrameLocks xmlns:a="http://schemas.openxmlformats.org/drawingml/2006/main" noChangeAspect="1"/>
+            </wp:cNvGraphicFramePr>
+            <a:graphic xmlns:a="http://schemas.openxmlformats.org/drawingml/2006/main">
+              <a:graphicData uri="http://schemas.openxmlformats.org/drawingml/2006/picture">
+                <pic:pic xmlns:pic="http://schemas.openxmlformats.org/drawingml/2006/picture">
+                  <pic:nvPicPr>
+                    <pic:cNvPr id="702378776" name=""/>
+                    <pic:cNvPicPr/>
+                  </pic:nvPicPr>
+                  <pic:blipFill>
+                    <a:blip r:embed="rId20"/>
+                    <a:stretch>
+                      <a:fillRect/>
+                    </a:stretch>
+                  </pic:blipFill>
+                  <pic:spPr>
+                    <a:xfrm>
+                      <a:off x="0" y="0"/>
+                      <a:ext cx="5731510" cy="3222625"/>
+                    </a:xfrm>
+                    <a:prstGeom prst="rect">
+                      <a:avLst/>
+                    </a:prstGeom>
+                  </pic:spPr>
+                </pic:pic>
+              </a:graphicData>
+            </a:graphic>
+          </wp:inline>
+        </w:drawing>
+      </w:r>
+    </w:p>
+    <w:p>
+      <w:pPr>
+        <w:jc w:val="both"/>
+        <w:rPr>
+          <w:rFonts w:ascii="Times New Roman" w:hAnsi="Times New Roman" w:cs="Times New Roman"/>
+          <w:lang w:val="en-GB"/>
+        </w:rPr>
+      </w:pPr>
+      <w:r>
+        <w:rPr>
+          <w:rFonts w:ascii="Times New Roman" w:hAnsi="Times New Roman" w:cs="Times New Roman"/>
+          <w:lang w:val="en-GB"/>
+        </w:rPr>
+        <w:t xml:space="preserve">Utility Class </w:t>
+      </w:r>
+      <w:proofErr w:type="spellStart"/>
+      <w:r>
+        <w:rPr>
+          <w:rFonts w:ascii="Times New Roman" w:hAnsi="Times New Roman" w:cs="Times New Roman"/>
+          <w:lang w:val="en-GB"/>
+        </w:rPr>
+        <w:t>dalam</w:t>
+      </w:r>
+      <w:proofErr w:type="spellEnd"/>
+      <w:r>
+        <w:rPr>
+          <w:rFonts w:ascii="Times New Roman" w:hAnsi="Times New Roman" w:cs="Times New Roman"/>
+          <w:lang w:val="en-GB"/>
+        </w:rPr>
+        <w:t xml:space="preserve"> framework </w:t>
+      </w:r>
+      <w:proofErr w:type="spellStart"/>
+      <w:r>
+        <w:rPr>
+          <w:rFonts w:ascii="Times New Roman" w:hAnsi="Times New Roman" w:cs="Times New Roman"/>
+          <w:lang w:val="en-GB"/>
+        </w:rPr>
+        <w:t>NestJS</w:t>
+      </w:r>
+      <w:proofErr w:type="spellEnd"/>
+      <w:r>
+        <w:rPr>
+          <w:rFonts w:ascii="Times New Roman" w:hAnsi="Times New Roman" w:cs="Times New Roman"/>
+          <w:lang w:val="en-GB"/>
+        </w:rPr>
+        <w:t xml:space="preserve"> yang </w:t>
+      </w:r>
+      <w:proofErr w:type="spellStart"/>
+      <w:r>
+        <w:rPr>
+          <w:rFonts w:ascii="Times New Roman" w:hAnsi="Times New Roman" w:cs="Times New Roman"/>
+          <w:lang w:val="en-GB"/>
+        </w:rPr>
+        <w:t>berfungsi</w:t>
+      </w:r>
+      <w:proofErr w:type="spellEnd"/>
+      <w:r>
+        <w:rPr>
+          <w:rFonts w:ascii="Times New Roman" w:hAnsi="Times New Roman" w:cs="Times New Roman"/>
+          <w:lang w:val="en-GB"/>
+        </w:rPr>
+        <w:t xml:space="preserve"> </w:t>
+      </w:r>
+      <w:proofErr w:type="spellStart"/>
+      <w:r>
+        <w:rPr>
+          <w:rFonts w:ascii="Times New Roman" w:hAnsi="Times New Roman" w:cs="Times New Roman"/>
+          <w:lang w:val="en-GB"/>
+        </w:rPr>
+        <w:t>untuk</w:t>
+      </w:r>
+      <w:proofErr w:type="spellEnd"/>
+      <w:r>
+        <w:rPr>
+          <w:rFonts w:ascii="Times New Roman" w:hAnsi="Times New Roman" w:cs="Times New Roman"/>
+          <w:lang w:val="en-GB"/>
+        </w:rPr>
+        <w:t xml:space="preserve"> </w:t>
+      </w:r>
+      <w:proofErr w:type="spellStart"/>
+      <w:r>
+        <w:rPr>
+          <w:rFonts w:ascii="Times New Roman" w:hAnsi="Times New Roman" w:cs="Times New Roman"/>
+          <w:lang w:val="en-GB"/>
+        </w:rPr>
+        <w:t>menstandardisasi</w:t>
+      </w:r>
+      <w:proofErr w:type="spellEnd"/>
+      <w:r>
+        <w:rPr>
+          <w:rFonts w:ascii="Times New Roman" w:hAnsi="Times New Roman" w:cs="Times New Roman"/>
+          <w:lang w:val="en-GB"/>
+        </w:rPr>
+        <w:t xml:space="preserve"> </w:t>
+      </w:r>
+      <w:proofErr w:type="spellStart"/>
+      <w:r>
+        <w:rPr>
+          <w:rFonts w:ascii="Times New Roman" w:hAnsi="Times New Roman" w:cs="Times New Roman"/>
+          <w:lang w:val="en-GB"/>
+        </w:rPr>
+        <w:t>penanganan</w:t>
+      </w:r>
+      <w:proofErr w:type="spellEnd"/>
+      <w:r>
+        <w:rPr>
+          <w:rFonts w:ascii="Times New Roman" w:hAnsi="Times New Roman" w:cs="Times New Roman"/>
+          <w:lang w:val="en-GB"/>
+        </w:rPr>
+        <w:t xml:space="preserve"> error (Exception Handling) </w:t>
+      </w:r>
+      <w:proofErr w:type="spellStart"/>
+      <w:r>
+        <w:rPr>
+          <w:rFonts w:ascii="Times New Roman" w:hAnsi="Times New Roman" w:cs="Times New Roman"/>
+          <w:lang w:val="en-GB"/>
+        </w:rPr>
+        <w:t>ketika</w:t>
+      </w:r>
+      <w:proofErr w:type="spellEnd"/>
+      <w:r>
+        <w:rPr>
+          <w:rFonts w:ascii="Times New Roman" w:hAnsi="Times New Roman" w:cs="Times New Roman"/>
+          <w:lang w:val="en-GB"/>
+        </w:rPr>
+        <w:t xml:space="preserve"> data </w:t>
+      </w:r>
+      <w:proofErr w:type="spellStart"/>
+      <w:r>
+        <w:rPr>
+          <w:rFonts w:ascii="Times New Roman" w:hAnsi="Times New Roman" w:cs="Times New Roman"/>
+          <w:lang w:val="en-GB"/>
+        </w:rPr>
+        <w:t>Kategori</w:t>
+      </w:r>
+      <w:proofErr w:type="spellEnd"/>
+      <w:r>
+        <w:rPr>
+          <w:rFonts w:ascii="Times New Roman" w:hAnsi="Times New Roman" w:cs="Times New Roman"/>
+          <w:lang w:val="en-GB"/>
+        </w:rPr>
+        <w:t xml:space="preserve"> </w:t>
+      </w:r>
+      <w:proofErr w:type="spellStart"/>
+      <w:r>
+        <w:rPr>
+          <w:rFonts w:ascii="Times New Roman" w:hAnsi="Times New Roman" w:cs="Times New Roman"/>
+          <w:lang w:val="en-GB"/>
+        </w:rPr>
+        <w:t>tidak</w:t>
+      </w:r>
+      <w:proofErr w:type="spellEnd"/>
+      <w:r>
+        <w:rPr>
+          <w:rFonts w:ascii="Times New Roman" w:hAnsi="Times New Roman" w:cs="Times New Roman"/>
+          <w:lang w:val="en-GB"/>
+        </w:rPr>
+        <w:t xml:space="preserve"> </w:t>
+      </w:r>
+      <w:proofErr w:type="spellStart"/>
+      <w:r>
+        <w:rPr>
+          <w:rFonts w:ascii="Times New Roman" w:hAnsi="Times New Roman" w:cs="Times New Roman"/>
+          <w:lang w:val="en-GB"/>
+        </w:rPr>
+        <w:t>ditemukan</w:t>
+      </w:r>
+      <w:proofErr w:type="spellEnd"/>
+      <w:r>
+        <w:rPr>
+          <w:rFonts w:ascii="Times New Roman" w:hAnsi="Times New Roman" w:cs="Times New Roman"/>
+          <w:lang w:val="en-GB"/>
+        </w:rPr>
+        <w:t>.</w:t>
+      </w:r>
+    </w:p>
+    <w:p>
+      <w:pPr>
+        <w:jc w:val="both"/>
+        <w:rPr>
+          <w:rFonts w:ascii="Times New Roman" w:hAnsi="Times New Roman" w:cs="Times New Roman"/>
+          <w:lang w:val="en-GB"/>
+        </w:rPr>
+      </w:pPr>
+      <w:proofErr w:type="spellStart"/>
+      <w:r>
+        <w:rPr>
+          <w:rFonts w:ascii="Times New Roman" w:hAnsi="Times New Roman" w:cs="Times New Roman"/>
+          <w:lang w:val="en-GB"/>
+        </w:rPr>
+        <w:t>Berikut</w:t>
+      </w:r>
+      <w:proofErr w:type="spellEnd"/>
+      <w:r>
+        <w:rPr>
+          <w:rFonts w:ascii="Times New Roman" w:hAnsi="Times New Roman" w:cs="Times New Roman"/>
+          <w:lang w:val="en-GB"/>
+        </w:rPr>
+        <w:t xml:space="preserve"> </w:t>
+      </w:r>
+      <w:proofErr w:type="spellStart"/>
+      <w:r>
+        <w:rPr>
+          <w:rFonts w:ascii="Times New Roman" w:hAnsi="Times New Roman" w:cs="Times New Roman"/>
+          <w:lang w:val="en-GB"/>
+        </w:rPr>
+        <w:t>poin-poin</w:t>
+      </w:r>
+      <w:proofErr w:type="spellEnd"/>
+      <w:r>
+        <w:rPr>
+          <w:rFonts w:ascii="Times New Roman" w:hAnsi="Times New Roman" w:cs="Times New Roman"/>
+          <w:lang w:val="en-GB"/>
+        </w:rPr>
+        <w:t xml:space="preserve"> </w:t>
+      </w:r>
+      <w:proofErr w:type="spellStart"/>
+      <w:r>
+        <w:rPr>
+          <w:rFonts w:ascii="Times New Roman" w:hAnsi="Times New Roman" w:cs="Times New Roman"/>
+          <w:lang w:val="en-GB"/>
+        </w:rPr>
+        <w:t>fungsinya</w:t>
+      </w:r>
+      <w:proofErr w:type="spellEnd"/>
+      <w:r>
+        <w:rPr>
+          <w:rFonts w:ascii="Times New Roman" w:hAnsi="Times New Roman" w:cs="Times New Roman"/>
+          <w:lang w:val="en-GB"/>
+        </w:rPr>
+        <w:t xml:space="preserve"> :</w:t>
+      </w:r>
+    </w:p>
+    <w:p>
+      <w:pPr>
+        <w:pStyle w:val="ListParagraph"/>
+        <w:numPr>
+          <w:ilvl w:val="0"/>
+          <w:numId w:val="9"/>
+        </w:numPr>
+        <w:jc w:val="both"/>
+        <w:rPr>
+          <w:rFonts w:ascii="Times New Roman" w:hAnsi="Times New Roman" w:cs="Times New Roman"/>
+          <w:lang w:val="en-GB"/>
+        </w:rPr>
+      </w:pPr>
+      <w:proofErr w:type="spellStart"/>
+      <w:r>
+        <w:rPr>
+          <w:rFonts w:ascii="Times New Roman" w:hAnsi="Times New Roman" w:cs="Times New Roman"/>
+          <w:lang w:val="en-GB"/>
+        </w:rPr>
+        <w:t>Sentralisasi</w:t>
+      </w:r>
+      <w:proofErr w:type="spellEnd"/>
+      <w:r>
+        <w:rPr>
+          <w:rFonts w:ascii="Times New Roman" w:hAnsi="Times New Roman" w:cs="Times New Roman"/>
+          <w:lang w:val="en-GB"/>
+        </w:rPr>
+        <w:t xml:space="preserve"> Error: </w:t>
+      </w:r>
+      <w:proofErr w:type="spellStart"/>
+      <w:r>
+        <w:rPr>
+          <w:rFonts w:ascii="Times New Roman" w:hAnsi="Times New Roman" w:cs="Times New Roman"/>
+          <w:lang w:val="en-GB"/>
+        </w:rPr>
+        <w:t>Mengumpulkan</w:t>
+      </w:r>
+      <w:proofErr w:type="spellEnd"/>
+      <w:r>
+        <w:rPr>
+          <w:rFonts w:ascii="Times New Roman" w:hAnsi="Times New Roman" w:cs="Times New Roman"/>
+          <w:lang w:val="en-GB"/>
+        </w:rPr>
+        <w:t xml:space="preserve"> </w:t>
+      </w:r>
+      <w:proofErr w:type="spellStart"/>
+      <w:r>
+        <w:rPr>
+          <w:rFonts w:ascii="Times New Roman" w:hAnsi="Times New Roman" w:cs="Times New Roman"/>
+          <w:lang w:val="en-GB"/>
+        </w:rPr>
+        <w:t>semua</w:t>
+      </w:r>
+      <w:proofErr w:type="spellEnd"/>
+      <w:r>
+        <w:rPr>
+          <w:rFonts w:ascii="Times New Roman" w:hAnsi="Times New Roman" w:cs="Times New Roman"/>
+          <w:lang w:val="en-GB"/>
+        </w:rPr>
+        <w:t xml:space="preserve"> </w:t>
+      </w:r>
+      <w:proofErr w:type="spellStart"/>
+      <w:r>
+        <w:rPr>
+          <w:rFonts w:ascii="Times New Roman" w:hAnsi="Times New Roman" w:cs="Times New Roman"/>
+          <w:lang w:val="en-GB"/>
+        </w:rPr>
+        <w:t>logika</w:t>
+      </w:r>
+      <w:proofErr w:type="spellEnd"/>
+      <w:r>
+        <w:rPr>
+          <w:rFonts w:ascii="Times New Roman" w:hAnsi="Times New Roman" w:cs="Times New Roman"/>
+          <w:lang w:val="en-GB"/>
+        </w:rPr>
+        <w:t xml:space="preserve"> </w:t>
+      </w:r>
+      <w:proofErr w:type="spellStart"/>
+      <w:r>
+        <w:rPr>
+          <w:rFonts w:ascii="Times New Roman" w:hAnsi="Times New Roman" w:cs="Times New Roman"/>
+          <w:lang w:val="en-GB"/>
+        </w:rPr>
+        <w:t>pesan</w:t>
+      </w:r>
+      <w:proofErr w:type="spellEnd"/>
+      <w:r>
+        <w:rPr>
+          <w:rFonts w:ascii="Times New Roman" w:hAnsi="Times New Roman" w:cs="Times New Roman"/>
+          <w:lang w:val="en-GB"/>
+        </w:rPr>
+        <w:t xml:space="preserve"> </w:t>
+      </w:r>
+      <w:proofErr w:type="spellStart"/>
+      <w:r>
+        <w:rPr>
+          <w:rFonts w:ascii="Times New Roman" w:hAnsi="Times New Roman" w:cs="Times New Roman"/>
+          <w:lang w:val="en-GB"/>
+        </w:rPr>
+        <w:t>kesalahan</w:t>
+      </w:r>
+      <w:proofErr w:type="spellEnd"/>
+      <w:r>
+        <w:rPr>
+          <w:rFonts w:ascii="Times New Roman" w:hAnsi="Times New Roman" w:cs="Times New Roman"/>
+          <w:lang w:val="en-GB"/>
+        </w:rPr>
+        <w:t xml:space="preserve"> </w:t>
+      </w:r>
+      <w:proofErr w:type="spellStart"/>
+      <w:r>
+        <w:rPr>
+          <w:rFonts w:ascii="Times New Roman" w:hAnsi="Times New Roman" w:cs="Times New Roman"/>
+          <w:lang w:val="en-GB"/>
+        </w:rPr>
+        <w:t>Kategori</w:t>
+      </w:r>
+      <w:proofErr w:type="spellEnd"/>
+      <w:r>
+        <w:rPr>
+          <w:rFonts w:ascii="Times New Roman" w:hAnsi="Times New Roman" w:cs="Times New Roman"/>
+          <w:lang w:val="en-GB"/>
+        </w:rPr>
+        <w:t xml:space="preserve"> Tidak </w:t>
+      </w:r>
+      <w:proofErr w:type="spellStart"/>
+      <w:r>
+        <w:rPr>
+          <w:rFonts w:ascii="Times New Roman" w:hAnsi="Times New Roman" w:cs="Times New Roman"/>
+          <w:lang w:val="en-GB"/>
+        </w:rPr>
+        <w:t>Ditemukan</w:t>
+      </w:r>
+      <w:proofErr w:type="spellEnd"/>
+      <w:r>
+        <w:rPr>
+          <w:rFonts w:ascii="Times New Roman" w:hAnsi="Times New Roman" w:cs="Times New Roman"/>
+          <w:lang w:val="en-GB"/>
+        </w:rPr>
+        <w:t xml:space="preserve"> di </w:t>
+      </w:r>
+      <w:proofErr w:type="spellStart"/>
+      <w:r>
+        <w:rPr>
+          <w:rFonts w:ascii="Times New Roman" w:hAnsi="Times New Roman" w:cs="Times New Roman"/>
+          <w:lang w:val="en-GB"/>
+        </w:rPr>
+        <w:t>satu</w:t>
+      </w:r>
+      <w:proofErr w:type="spellEnd"/>
+      <w:r>
+        <w:rPr>
+          <w:rFonts w:ascii="Times New Roman" w:hAnsi="Times New Roman" w:cs="Times New Roman"/>
+          <w:lang w:val="en-GB"/>
+        </w:rPr>
+        <w:t xml:space="preserve"> </w:t>
+      </w:r>
+      <w:proofErr w:type="spellStart"/>
+      <w:r>
+        <w:rPr>
+          <w:rFonts w:ascii="Times New Roman" w:hAnsi="Times New Roman" w:cs="Times New Roman"/>
+          <w:lang w:val="en-GB"/>
+        </w:rPr>
+        <w:t>tempat</w:t>
+      </w:r>
+      <w:proofErr w:type="spellEnd"/>
+      <w:r>
+        <w:rPr>
+          <w:rFonts w:ascii="Times New Roman" w:hAnsi="Times New Roman" w:cs="Times New Roman"/>
+          <w:lang w:val="en-GB"/>
+        </w:rPr>
+        <w:t xml:space="preserve"> agar </w:t>
+      </w:r>
+      <w:proofErr w:type="spellStart"/>
+      <w:r>
+        <w:rPr>
+          <w:rFonts w:ascii="Times New Roman" w:hAnsi="Times New Roman" w:cs="Times New Roman"/>
+          <w:lang w:val="en-GB"/>
+        </w:rPr>
+        <w:t>kode</w:t>
+      </w:r>
+      <w:proofErr w:type="spellEnd"/>
+      <w:r>
+        <w:rPr>
+          <w:rFonts w:ascii="Times New Roman" w:hAnsi="Times New Roman" w:cs="Times New Roman"/>
+          <w:lang w:val="en-GB"/>
+        </w:rPr>
+        <w:t xml:space="preserve"> </w:t>
+      </w:r>
+      <w:proofErr w:type="spellStart"/>
+      <w:r>
+        <w:rPr>
+          <w:rFonts w:ascii="Times New Roman" w:hAnsi="Times New Roman" w:cs="Times New Roman"/>
+          <w:lang w:val="en-GB"/>
+        </w:rPr>
+        <w:t>lebih</w:t>
+      </w:r>
+      <w:proofErr w:type="spellEnd"/>
+      <w:r>
+        <w:rPr>
+          <w:rFonts w:ascii="Times New Roman" w:hAnsi="Times New Roman" w:cs="Times New Roman"/>
+          <w:lang w:val="en-GB"/>
+        </w:rPr>
+        <w:t xml:space="preserve"> </w:t>
+      </w:r>
+      <w:proofErr w:type="spellStart"/>
+      <w:r>
+        <w:rPr>
+          <w:rFonts w:ascii="Times New Roman" w:hAnsi="Times New Roman" w:cs="Times New Roman"/>
+          <w:lang w:val="en-GB"/>
+        </w:rPr>
+        <w:t>rapi</w:t>
+      </w:r>
+      <w:proofErr w:type="spellEnd"/>
+      <w:r>
+        <w:rPr>
+          <w:rFonts w:ascii="Times New Roman" w:hAnsi="Times New Roman" w:cs="Times New Roman"/>
+          <w:lang w:val="en-GB"/>
+        </w:rPr>
+        <w:t xml:space="preserve"> (clean code).</w:t>
+      </w:r>
+    </w:p>
+    <w:p>
+      <w:pPr>
+        <w:pStyle w:val="ListParagraph"/>
+        <w:numPr>
+          <w:ilvl w:val="0"/>
+          <w:numId w:val="9"/>
+        </w:numPr>
+        <w:jc w:val="both"/>
+        <w:rPr>
+          <w:rFonts w:ascii="Times New Roman" w:hAnsi="Times New Roman" w:cs="Times New Roman"/>
+          <w:lang w:val="en-GB"/>
+        </w:rPr>
+      </w:pPr>
+      <w:proofErr w:type="spellStart"/>
+      <w:r>
+        <w:rPr>
+          <w:rFonts w:ascii="Times New Roman" w:hAnsi="Times New Roman" w:cs="Times New Roman"/>
+          <w:lang w:val="en-GB"/>
+        </w:rPr>
+        <w:t>Validasi</w:t>
+      </w:r>
+      <w:proofErr w:type="spellEnd"/>
+      <w:r>
+        <w:rPr>
+          <w:rFonts w:ascii="Times New Roman" w:hAnsi="Times New Roman" w:cs="Times New Roman"/>
+          <w:lang w:val="en-GB"/>
+        </w:rPr>
+        <w:t xml:space="preserve"> Konsisten: </w:t>
+      </w:r>
+      <w:proofErr w:type="spellStart"/>
+      <w:r>
+        <w:rPr>
+          <w:rFonts w:ascii="Times New Roman" w:hAnsi="Times New Roman" w:cs="Times New Roman"/>
+          <w:lang w:val="en-GB"/>
+        </w:rPr>
+        <w:t>Memastikan</w:t>
+      </w:r>
+      <w:proofErr w:type="spellEnd"/>
+      <w:r>
+        <w:rPr>
+          <w:rFonts w:ascii="Times New Roman" w:hAnsi="Times New Roman" w:cs="Times New Roman"/>
+          <w:lang w:val="en-GB"/>
+        </w:rPr>
+        <w:t xml:space="preserve"> </w:t>
+      </w:r>
+      <w:proofErr w:type="spellStart"/>
+      <w:r>
+        <w:rPr>
+          <w:rFonts w:ascii="Times New Roman" w:hAnsi="Times New Roman" w:cs="Times New Roman"/>
+          <w:lang w:val="en-GB"/>
+        </w:rPr>
+        <w:t>pesan</w:t>
+      </w:r>
+      <w:proofErr w:type="spellEnd"/>
+      <w:r>
+        <w:rPr>
+          <w:rFonts w:ascii="Times New Roman" w:hAnsi="Times New Roman" w:cs="Times New Roman"/>
+          <w:lang w:val="en-GB"/>
+        </w:rPr>
+        <w:t xml:space="preserve"> error yang </w:t>
+      </w:r>
+      <w:proofErr w:type="spellStart"/>
+      <w:r>
+        <w:rPr>
+          <w:rFonts w:ascii="Times New Roman" w:hAnsi="Times New Roman" w:cs="Times New Roman"/>
+          <w:lang w:val="en-GB"/>
+        </w:rPr>
+        <w:t>dikirim</w:t>
+      </w:r>
+      <w:proofErr w:type="spellEnd"/>
+      <w:r>
+        <w:rPr>
+          <w:rFonts w:ascii="Times New Roman" w:hAnsi="Times New Roman" w:cs="Times New Roman"/>
+          <w:lang w:val="en-GB"/>
+        </w:rPr>
+        <w:t xml:space="preserve"> </w:t>
+      </w:r>
+      <w:proofErr w:type="spellStart"/>
+      <w:r>
+        <w:rPr>
+          <w:rFonts w:ascii="Times New Roman" w:hAnsi="Times New Roman" w:cs="Times New Roman"/>
+          <w:lang w:val="en-GB"/>
+        </w:rPr>
+        <w:t>ke</w:t>
+      </w:r>
+      <w:proofErr w:type="spellEnd"/>
+      <w:r>
+        <w:rPr>
+          <w:rFonts w:ascii="Times New Roman" w:hAnsi="Times New Roman" w:cs="Times New Roman"/>
+          <w:lang w:val="en-GB"/>
+        </w:rPr>
+        <w:t xml:space="preserve"> </w:t>
+      </w:r>
+      <w:proofErr w:type="spellStart"/>
+      <w:r>
+        <w:rPr>
+          <w:rFonts w:ascii="Times New Roman" w:hAnsi="Times New Roman" w:cs="Times New Roman"/>
+          <w:lang w:val="en-GB"/>
+        </w:rPr>
+        <w:t>pengguna</w:t>
+      </w:r>
+      <w:proofErr w:type="spellEnd"/>
+      <w:r>
+        <w:rPr>
+          <w:rFonts w:ascii="Times New Roman" w:hAnsi="Times New Roman" w:cs="Times New Roman"/>
+          <w:lang w:val="en-GB"/>
+        </w:rPr>
+        <w:t xml:space="preserve"> </w:t>
+      </w:r>
+      <w:proofErr w:type="spellStart"/>
+      <w:r>
+        <w:rPr>
+          <w:rFonts w:ascii="Times New Roman" w:hAnsi="Times New Roman" w:cs="Times New Roman"/>
+          <w:lang w:val="en-GB"/>
+        </w:rPr>
+        <w:t>selalu</w:t>
+      </w:r>
+      <w:proofErr w:type="spellEnd"/>
+      <w:r>
+        <w:rPr>
+          <w:rFonts w:ascii="Times New Roman" w:hAnsi="Times New Roman" w:cs="Times New Roman"/>
+          <w:lang w:val="en-GB"/>
+        </w:rPr>
+        <w:t xml:space="preserve"> </w:t>
+      </w:r>
+      <w:proofErr w:type="spellStart"/>
+      <w:r>
+        <w:rPr>
+          <w:rFonts w:ascii="Times New Roman" w:hAnsi="Times New Roman" w:cs="Times New Roman"/>
+          <w:lang w:val="en-GB"/>
+        </w:rPr>
+        <w:t>seragam</w:t>
+      </w:r>
+      <w:proofErr w:type="spellEnd"/>
+      <w:r>
+        <w:rPr>
+          <w:rFonts w:ascii="Times New Roman" w:hAnsi="Times New Roman" w:cs="Times New Roman"/>
+          <w:lang w:val="en-GB"/>
+        </w:rPr>
+        <w:t xml:space="preserve">, </w:t>
+      </w:r>
+      <w:proofErr w:type="spellStart"/>
+      <w:r>
+        <w:rPr>
+          <w:rFonts w:ascii="Times New Roman" w:hAnsi="Times New Roman" w:cs="Times New Roman"/>
+          <w:lang w:val="en-GB"/>
+        </w:rPr>
+        <w:t>baik</w:t>
+      </w:r>
+      <w:proofErr w:type="spellEnd"/>
+      <w:r>
+        <w:rPr>
+          <w:rFonts w:ascii="Times New Roman" w:hAnsi="Times New Roman" w:cs="Times New Roman"/>
+          <w:lang w:val="en-GB"/>
+        </w:rPr>
+        <w:t xml:space="preserve"> </w:t>
+      </w:r>
+      <w:proofErr w:type="spellStart"/>
+      <w:r>
+        <w:rPr>
+          <w:rFonts w:ascii="Times New Roman" w:hAnsi="Times New Roman" w:cs="Times New Roman"/>
+          <w:lang w:val="en-GB"/>
+        </w:rPr>
+        <w:t>berdasarkan</w:t>
+      </w:r>
+      <w:proofErr w:type="spellEnd"/>
+      <w:r>
+        <w:rPr>
+          <w:rFonts w:ascii="Times New Roman" w:hAnsi="Times New Roman" w:cs="Times New Roman"/>
+          <w:lang w:val="en-GB"/>
+        </w:rPr>
+        <w:t xml:space="preserve"> ID, Nama, Slug, </w:t>
+      </w:r>
+      <w:proofErr w:type="spellStart"/>
+      <w:r>
+        <w:rPr>
+          <w:rFonts w:ascii="Times New Roman" w:hAnsi="Times New Roman" w:cs="Times New Roman"/>
+          <w:lang w:val="en-GB"/>
+        </w:rPr>
+        <w:t>maupun</w:t>
+      </w:r>
+      <w:proofErr w:type="spellEnd"/>
+      <w:r>
+        <w:rPr>
+          <w:rFonts w:ascii="Times New Roman" w:hAnsi="Times New Roman" w:cs="Times New Roman"/>
+          <w:lang w:val="en-GB"/>
+        </w:rPr>
+        <w:t xml:space="preserve"> </w:t>
+      </w:r>
+      <w:proofErr w:type="spellStart"/>
+      <w:r>
+        <w:rPr>
+          <w:rFonts w:ascii="Times New Roman" w:hAnsi="Times New Roman" w:cs="Times New Roman"/>
+          <w:lang w:val="en-GB"/>
+        </w:rPr>
+        <w:t>saat</w:t>
+      </w:r>
+      <w:proofErr w:type="spellEnd"/>
+      <w:r>
+        <w:rPr>
+          <w:rFonts w:ascii="Times New Roman" w:hAnsi="Times New Roman" w:cs="Times New Roman"/>
+          <w:lang w:val="en-GB"/>
+        </w:rPr>
+        <w:t xml:space="preserve"> Daftar </w:t>
+      </w:r>
+      <w:proofErr w:type="spellStart"/>
+      <w:r>
+        <w:rPr>
+          <w:rFonts w:ascii="Times New Roman" w:hAnsi="Times New Roman" w:cs="Times New Roman"/>
+          <w:lang w:val="en-GB"/>
+        </w:rPr>
+        <w:t>Kosong</w:t>
+      </w:r>
+      <w:proofErr w:type="spellEnd"/>
+      <w:r>
+        <w:rPr>
+          <w:rFonts w:ascii="Times New Roman" w:hAnsi="Times New Roman" w:cs="Times New Roman"/>
+          <w:lang w:val="en-GB"/>
+        </w:rPr>
+        <w:t>.</w:t>
+      </w:r>
+    </w:p>
+    <w:p>
+      <w:pPr>
+        <w:pStyle w:val="ListParagraph"/>
+        <w:numPr>
+          <w:ilvl w:val="0"/>
+          <w:numId w:val="9"/>
+        </w:numPr>
+        <w:jc w:val="both"/>
+        <w:rPr>
+          <w:rFonts w:ascii="Times New Roman" w:hAnsi="Times New Roman" w:cs="Times New Roman"/>
+          <w:lang w:val="en-GB"/>
+        </w:rPr>
+      </w:pPr>
+      <w:proofErr w:type="spellStart"/>
+      <w:r>
+        <w:rPr>
+          <w:rFonts w:ascii="Times New Roman" w:hAnsi="Times New Roman" w:cs="Times New Roman"/>
+          <w:lang w:val="en-GB"/>
+        </w:rPr>
+        <w:t>Otomatisasi</w:t>
+      </w:r>
+      <w:proofErr w:type="spellEnd"/>
+      <w:r>
+        <w:rPr>
+          <w:rFonts w:ascii="Times New Roman" w:hAnsi="Times New Roman" w:cs="Times New Roman"/>
+          <w:lang w:val="en-GB"/>
+        </w:rPr>
+        <w:t xml:space="preserve"> Status HTTP: </w:t>
+      </w:r>
+      <w:proofErr w:type="spellStart"/>
+      <w:r>
+        <w:rPr>
+          <w:rFonts w:ascii="Times New Roman" w:hAnsi="Times New Roman" w:cs="Times New Roman"/>
+          <w:lang w:val="en-GB"/>
+        </w:rPr>
+        <w:t>Menggunakan</w:t>
+      </w:r>
+      <w:proofErr w:type="spellEnd"/>
+      <w:r>
+        <w:rPr>
+          <w:rFonts w:ascii="Times New Roman" w:hAnsi="Times New Roman" w:cs="Times New Roman"/>
+          <w:lang w:val="en-GB"/>
+        </w:rPr>
+        <w:t xml:space="preserve"> </w:t>
+      </w:r>
+      <w:proofErr w:type="spellStart"/>
+      <w:r>
+        <w:rPr>
+          <w:rFonts w:ascii="Times New Roman" w:hAnsi="Times New Roman" w:cs="Times New Roman"/>
+          <w:lang w:val="en-GB"/>
+        </w:rPr>
+        <w:t>NotFoundException</w:t>
+      </w:r>
+      <w:proofErr w:type="spellEnd"/>
+      <w:r>
+        <w:rPr>
+          <w:rFonts w:ascii="Times New Roman" w:hAnsi="Times New Roman" w:cs="Times New Roman"/>
+          <w:lang w:val="en-GB"/>
+        </w:rPr>
+        <w:t xml:space="preserve"> yang </w:t>
+      </w:r>
+      <w:proofErr w:type="spellStart"/>
+      <w:r>
+        <w:rPr>
+          <w:rFonts w:ascii="Times New Roman" w:hAnsi="Times New Roman" w:cs="Times New Roman"/>
+          <w:lang w:val="en-GB"/>
+        </w:rPr>
+        <w:t>secara</w:t>
+      </w:r>
+      <w:proofErr w:type="spellEnd"/>
+      <w:r>
+        <w:rPr>
+          <w:rFonts w:ascii="Times New Roman" w:hAnsi="Times New Roman" w:cs="Times New Roman"/>
+          <w:lang w:val="en-GB"/>
+        </w:rPr>
+        <w:t xml:space="preserve"> </w:t>
+      </w:r>
+      <w:proofErr w:type="spellStart"/>
+      <w:r>
+        <w:rPr>
+          <w:rFonts w:ascii="Times New Roman" w:hAnsi="Times New Roman" w:cs="Times New Roman"/>
+          <w:lang w:val="en-GB"/>
+        </w:rPr>
+        <w:t>otomatis</w:t>
+      </w:r>
+      <w:proofErr w:type="spellEnd"/>
+      <w:r>
+        <w:rPr>
+          <w:rFonts w:ascii="Times New Roman" w:hAnsi="Times New Roman" w:cs="Times New Roman"/>
+          <w:lang w:val="en-GB"/>
+        </w:rPr>
+        <w:t xml:space="preserve"> </w:t>
+      </w:r>
+      <w:proofErr w:type="spellStart"/>
+      <w:r>
+        <w:rPr>
+          <w:rFonts w:ascii="Times New Roman" w:hAnsi="Times New Roman" w:cs="Times New Roman"/>
+          <w:lang w:val="en-GB"/>
+        </w:rPr>
+        <w:t>akan</w:t>
+      </w:r>
+      <w:proofErr w:type="spellEnd"/>
+      <w:r>
+        <w:rPr>
+          <w:rFonts w:ascii="Times New Roman" w:hAnsi="Times New Roman" w:cs="Times New Roman"/>
+          <w:lang w:val="en-GB"/>
+        </w:rPr>
+        <w:t xml:space="preserve"> </w:t>
+      </w:r>
+      <w:proofErr w:type="spellStart"/>
+      <w:r>
+        <w:rPr>
+          <w:rFonts w:ascii="Times New Roman" w:hAnsi="Times New Roman" w:cs="Times New Roman"/>
+          <w:lang w:val="en-GB"/>
+        </w:rPr>
+        <w:t>mengirimkan</w:t>
+      </w:r>
+      <w:proofErr w:type="spellEnd"/>
+      <w:r>
+        <w:rPr>
+          <w:rFonts w:ascii="Times New Roman" w:hAnsi="Times New Roman" w:cs="Times New Roman"/>
+          <w:lang w:val="en-GB"/>
+        </w:rPr>
+        <w:t xml:space="preserve"> status HTTP 404 </w:t>
+      </w:r>
+      <w:proofErr w:type="spellStart"/>
+      <w:r>
+        <w:rPr>
+          <w:rFonts w:ascii="Times New Roman" w:hAnsi="Times New Roman" w:cs="Times New Roman"/>
+          <w:lang w:val="en-GB"/>
+        </w:rPr>
+        <w:t>kepada</w:t>
+      </w:r>
+      <w:proofErr w:type="spellEnd"/>
+      <w:r>
+        <w:rPr>
+          <w:rFonts w:ascii="Times New Roman" w:hAnsi="Times New Roman" w:cs="Times New Roman"/>
+          <w:lang w:val="en-GB"/>
+        </w:rPr>
+        <w:t xml:space="preserve"> client.</w:t>
+      </w:r>
+    </w:p>
+    <w:p>
+      <w:pPr>
+        <w:pStyle w:val="ListParagraph"/>
+        <w:numPr>
+          <w:ilvl w:val="0"/>
+          <w:numId w:val="9"/>
+        </w:numPr>
+        <w:jc w:val="both"/>
+        <w:rPr>
+          <w:rFonts w:ascii="Times New Roman" w:hAnsi="Times New Roman" w:cs="Times New Roman"/>
+          <w:lang w:val="en-GB"/>
+        </w:rPr>
+      </w:pPr>
+      <w:r>
+        <w:rPr>
+          <w:rFonts w:ascii="Times New Roman" w:hAnsi="Times New Roman" w:cs="Times New Roman"/>
+          <w:lang w:val="en-GB"/>
+        </w:rPr>
+        <w:t xml:space="preserve">Reusable: </w:t>
+      </w:r>
+      <w:proofErr w:type="spellStart"/>
+      <w:r>
+        <w:rPr>
+          <w:rFonts w:ascii="Times New Roman" w:hAnsi="Times New Roman" w:cs="Times New Roman"/>
+          <w:lang w:val="en-GB"/>
+        </w:rPr>
+        <w:t>Fungsi</w:t>
+      </w:r>
+      <w:proofErr w:type="spellEnd"/>
+      <w:r>
+        <w:rPr>
+          <w:rFonts w:ascii="Times New Roman" w:hAnsi="Times New Roman" w:cs="Times New Roman"/>
+          <w:lang w:val="en-GB"/>
+        </w:rPr>
+        <w:t xml:space="preserve"> </w:t>
+      </w:r>
+      <w:proofErr w:type="spellStart"/>
+      <w:r>
+        <w:rPr>
+          <w:rFonts w:ascii="Times New Roman" w:hAnsi="Times New Roman" w:cs="Times New Roman"/>
+          <w:lang w:val="en-GB"/>
+        </w:rPr>
+        <w:t>bersifat</w:t>
+      </w:r>
+      <w:proofErr w:type="spellEnd"/>
+      <w:r>
+        <w:rPr>
+          <w:rFonts w:ascii="Times New Roman" w:hAnsi="Times New Roman" w:cs="Times New Roman"/>
+          <w:lang w:val="en-GB"/>
+        </w:rPr>
+        <w:t xml:space="preserve"> static, </w:t>
+      </w:r>
+      <w:proofErr w:type="spellStart"/>
+      <w:r>
+        <w:rPr>
+          <w:rFonts w:ascii="Times New Roman" w:hAnsi="Times New Roman" w:cs="Times New Roman"/>
+          <w:lang w:val="en-GB"/>
+        </w:rPr>
+        <w:t>sehingga</w:t>
+      </w:r>
+      <w:proofErr w:type="spellEnd"/>
+      <w:r>
+        <w:rPr>
+          <w:rFonts w:ascii="Times New Roman" w:hAnsi="Times New Roman" w:cs="Times New Roman"/>
+          <w:lang w:val="en-GB"/>
+        </w:rPr>
+        <w:t xml:space="preserve"> </w:t>
+      </w:r>
+      <w:proofErr w:type="spellStart"/>
+      <w:r>
+        <w:rPr>
+          <w:rFonts w:ascii="Times New Roman" w:hAnsi="Times New Roman" w:cs="Times New Roman"/>
+          <w:lang w:val="en-GB"/>
+        </w:rPr>
+        <w:t>bisa</w:t>
+      </w:r>
+      <w:proofErr w:type="spellEnd"/>
+      <w:r>
+        <w:rPr>
+          <w:rFonts w:ascii="Times New Roman" w:hAnsi="Times New Roman" w:cs="Times New Roman"/>
+          <w:lang w:val="en-GB"/>
+        </w:rPr>
+        <w:t xml:space="preserve"> </w:t>
+      </w:r>
+      <w:proofErr w:type="spellStart"/>
+      <w:r>
+        <w:rPr>
+          <w:rFonts w:ascii="Times New Roman" w:hAnsi="Times New Roman" w:cs="Times New Roman"/>
+          <w:lang w:val="en-GB"/>
+        </w:rPr>
+        <w:t>langsung</w:t>
+      </w:r>
+      <w:proofErr w:type="spellEnd"/>
+      <w:r>
+        <w:rPr>
+          <w:rFonts w:ascii="Times New Roman" w:hAnsi="Times New Roman" w:cs="Times New Roman"/>
+          <w:lang w:val="en-GB"/>
+        </w:rPr>
+        <w:t xml:space="preserve"> </w:t>
+      </w:r>
+      <w:proofErr w:type="spellStart"/>
+      <w:r>
+        <w:rPr>
+          <w:rFonts w:ascii="Times New Roman" w:hAnsi="Times New Roman" w:cs="Times New Roman"/>
+          <w:lang w:val="en-GB"/>
+        </w:rPr>
+        <w:t>dipanggil</w:t>
+      </w:r>
+      <w:proofErr w:type="spellEnd"/>
+      <w:r>
+        <w:rPr>
+          <w:rFonts w:ascii="Times New Roman" w:hAnsi="Times New Roman" w:cs="Times New Roman"/>
+          <w:lang w:val="en-GB"/>
+        </w:rPr>
+        <w:t xml:space="preserve"> di Service </w:t>
+      </w:r>
+      <w:proofErr w:type="spellStart"/>
+      <w:r>
+        <w:rPr>
+          <w:rFonts w:ascii="Times New Roman" w:hAnsi="Times New Roman" w:cs="Times New Roman"/>
+          <w:lang w:val="en-GB"/>
+        </w:rPr>
+        <w:t>atau</w:t>
+      </w:r>
+      <w:proofErr w:type="spellEnd"/>
+      <w:r>
+        <w:rPr>
+          <w:rFonts w:ascii="Times New Roman" w:hAnsi="Times New Roman" w:cs="Times New Roman"/>
+          <w:lang w:val="en-GB"/>
+        </w:rPr>
+        <w:t xml:space="preserve"> Controller mana pun </w:t>
+      </w:r>
+      <w:proofErr w:type="spellStart"/>
+      <w:r>
+        <w:rPr>
+          <w:rFonts w:ascii="Times New Roman" w:hAnsi="Times New Roman" w:cs="Times New Roman"/>
+          <w:lang w:val="en-GB"/>
+        </w:rPr>
+        <w:t>tanpa</w:t>
+      </w:r>
+      <w:proofErr w:type="spellEnd"/>
+      <w:r>
+        <w:rPr>
+          <w:rFonts w:ascii="Times New Roman" w:hAnsi="Times New Roman" w:cs="Times New Roman"/>
+          <w:lang w:val="en-GB"/>
+        </w:rPr>
+        <w:t xml:space="preserve"> </w:t>
+      </w:r>
+      <w:proofErr w:type="spellStart"/>
+      <w:r>
+        <w:rPr>
+          <w:rFonts w:ascii="Times New Roman" w:hAnsi="Times New Roman" w:cs="Times New Roman"/>
+          <w:lang w:val="en-GB"/>
+        </w:rPr>
+        <w:t>perlu</w:t>
+      </w:r>
+      <w:proofErr w:type="spellEnd"/>
+      <w:r>
+        <w:rPr>
+          <w:rFonts w:ascii="Times New Roman" w:hAnsi="Times New Roman" w:cs="Times New Roman"/>
+          <w:lang w:val="en-GB"/>
+        </w:rPr>
+        <w:t xml:space="preserve"> </w:t>
+      </w:r>
+      <w:proofErr w:type="spellStart"/>
+      <w:r>
+        <w:rPr>
+          <w:rFonts w:ascii="Times New Roman" w:hAnsi="Times New Roman" w:cs="Times New Roman"/>
+          <w:lang w:val="en-GB"/>
+        </w:rPr>
+        <w:t>instansiasi</w:t>
+      </w:r>
+      <w:proofErr w:type="spellEnd"/>
+      <w:r>
+        <w:rPr>
+          <w:rFonts w:ascii="Times New Roman" w:hAnsi="Times New Roman" w:cs="Times New Roman"/>
+          <w:lang w:val="en-GB"/>
+        </w:rPr>
+        <w:t xml:space="preserve"> class (</w:t>
+      </w:r>
+      <w:proofErr w:type="spellStart"/>
+      <w:r>
+        <w:rPr>
+          <w:rFonts w:ascii="Times New Roman" w:hAnsi="Times New Roman" w:cs="Times New Roman"/>
+          <w:lang w:val="en-GB"/>
+        </w:rPr>
+        <w:t>langsung</w:t>
+      </w:r>
+      <w:proofErr w:type="spellEnd"/>
+      <w:r>
+        <w:rPr>
+          <w:rFonts w:ascii="Times New Roman" w:hAnsi="Times New Roman" w:cs="Times New Roman"/>
+          <w:lang w:val="en-GB"/>
+        </w:rPr>
+        <w:t xml:space="preserve"> </w:t>
+      </w:r>
+      <w:proofErr w:type="spellStart"/>
+      <w:r>
+        <w:rPr>
+          <w:rFonts w:ascii="Times New Roman" w:hAnsi="Times New Roman" w:cs="Times New Roman"/>
+          <w:lang w:val="en-GB"/>
+        </w:rPr>
+        <w:t>panggil</w:t>
+      </w:r>
+      <w:proofErr w:type="spellEnd"/>
+      <w:r>
+        <w:rPr>
+          <w:rFonts w:ascii="Times New Roman" w:hAnsi="Times New Roman" w:cs="Times New Roman"/>
+          <w:lang w:val="en-GB"/>
+        </w:rPr>
+        <w:t xml:space="preserve"> </w:t>
+      </w:r>
+      <w:proofErr w:type="spellStart"/>
+      <w:r>
+        <w:rPr>
+          <w:rFonts w:ascii="Times New Roman" w:hAnsi="Times New Roman" w:cs="Times New Roman"/>
+          <w:lang w:val="en-GB"/>
+        </w:rPr>
+        <w:t>KategoriNotExistUtil.namaFungsi</w:t>
+      </w:r>
+      <w:proofErr w:type="spellEnd"/>
+      <w:r>
+        <w:rPr>
+          <w:rFonts w:ascii="Times New Roman" w:hAnsi="Times New Roman" w:cs="Times New Roman"/>
+          <w:lang w:val="en-GB"/>
+        </w:rPr>
+        <w:t>()).</w:t>
+      </w:r>
+    </w:p>
+    <w:p>
+      <w:pPr>
+        <w:jc w:val="both"/>
+        <w:rPr>
+          <w:rFonts w:ascii="Times New Roman" w:hAnsi="Times New Roman" w:cs="Times New Roman"/>
+          <w:lang w:val="en-GB"/>
+        </w:rPr>
+      </w:pPr>
+      <w:r>
+        <w:rPr>
+          <w:rFonts w:ascii="Times New Roman" w:hAnsi="Times New Roman" w:cs="Times New Roman"/>
+          <w:lang w:val="en-GB"/>
+        </w:rPr>
+        <w:lastRenderedPageBreak/>
+        <w:t xml:space="preserve">17. </w:t>
+      </w:r>
+    </w:p>
+    <w:p>
+      <w:pPr>
+        <w:jc w:val="both"/>
+        <w:rPr>
+          <w:rFonts w:ascii="Times New Roman" w:hAnsi="Times New Roman" w:cs="Times New Roman"/>
+          <w:lang w:val="en-GB"/>
+        </w:rPr>
+      </w:pPr>
     </w:p>
     <w:p>
       <w:pPr>
@@ -17650,9 +18365,9 @@
     </w:lvl>
   </w:abstractNum>
   <w:abstractNum w:abstractNumId="4" w15:restartNumberingAfterBreak="0">
-    <w:nsid w:val="64A022BC"/>
+    <w:nsid w:val="4453613F"/>
     <w:multiLevelType w:val="hybridMultilevel"/>
-    <w:tmpl w:val="7466E2BA"/>
+    <w:tmpl w:val="DDEA1E44"/>
     <w:lvl w:ilvl="0" w:tplc="38090001">
       <w:start w:val="1"/>
       <w:numFmt w:val="bullet"/>
@@ -17763,9 +18478,9 @@
     </w:lvl>
   </w:abstractNum>
   <w:abstractNum w:abstractNumId="5" w15:restartNumberingAfterBreak="0">
-    <w:nsid w:val="673C435B"/>
+    <w:nsid w:val="64A022BC"/>
     <w:multiLevelType w:val="hybridMultilevel"/>
-    <w:tmpl w:val="846CCAA0"/>
+    <w:tmpl w:val="7466E2BA"/>
     <w:lvl w:ilvl="0" w:tplc="38090001">
       <w:start w:val="1"/>
       <w:numFmt w:val="bullet"/>
@@ -17876,9 +18591,9 @@
     </w:lvl>
   </w:abstractNum>
   <w:abstractNum w:abstractNumId="6" w15:restartNumberingAfterBreak="0">
-    <w:nsid w:val="6CA82C32"/>
+    <w:nsid w:val="673C435B"/>
     <w:multiLevelType w:val="hybridMultilevel"/>
-    <w:tmpl w:val="ABCC36BA"/>
+    <w:tmpl w:val="846CCAA0"/>
     <w:lvl w:ilvl="0" w:tplc="38090001">
       <w:start w:val="1"/>
       <w:numFmt w:val="bullet"/>
@@ -17989,9 +18704,9 @@
     </w:lvl>
   </w:abstractNum>
   <w:abstractNum w:abstractNumId="7" w15:restartNumberingAfterBreak="0">
-    <w:nsid w:val="737805E1"/>
+    <w:nsid w:val="6CA82C32"/>
     <w:multiLevelType w:val="hybridMultilevel"/>
-    <w:tmpl w:val="8DF2E322"/>
+    <w:tmpl w:val="ABCC36BA"/>
     <w:lvl w:ilvl="0" w:tplc="38090001">
       <w:start w:val="1"/>
       <w:numFmt w:val="bullet"/>
@@ -18101,17 +18816,130 @@
       </w:rPr>
     </w:lvl>
   </w:abstractNum>
+  <w:abstractNum w:abstractNumId="8" w15:restartNumberingAfterBreak="0">
+    <w:nsid w:val="737805E1"/>
+    <w:multiLevelType w:val="hybridMultilevel"/>
+    <w:tmpl w:val="8DF2E322"/>
+    <w:lvl w:ilvl="0" w:tplc="38090001">
+      <w:start w:val="1"/>
+      <w:numFmt w:val="bullet"/>
+      <w:lvlText w:val=""/>
+      <w:lvlJc w:val="left"/>
+      <w:pPr>
+        <w:ind w:left="720" w:hanging="360"/>
+      </w:pPr>
+      <w:rPr>
+        <w:rFonts w:ascii="Symbol" w:hAnsi="Symbol" w:hint="default"/>
+      </w:rPr>
+    </w:lvl>
+    <w:lvl w:ilvl="1" w:tplc="38090003" w:tentative="1">
+      <w:start w:val="1"/>
+      <w:numFmt w:val="bullet"/>
+      <w:lvlText w:val="o"/>
+      <w:lvlJc w:val="left"/>
+      <w:pPr>
+        <w:ind w:left="1440" w:hanging="360"/>
+      </w:pPr>
+      <w:rPr>
+        <w:rFonts w:ascii="Courier New" w:hAnsi="Courier New" w:cs="Courier New" w:hint="default"/>
+      </w:rPr>
+    </w:lvl>
+    <w:lvl w:ilvl="2" w:tplc="38090005" w:tentative="1">
+      <w:start w:val="1"/>
+      <w:numFmt w:val="bullet"/>
+      <w:lvlText w:val=""/>
+      <w:lvlJc w:val="left"/>
+      <w:pPr>
+        <w:ind w:left="2160" w:hanging="360"/>
+      </w:pPr>
+      <w:rPr>
+        <w:rFonts w:ascii="Wingdings" w:hAnsi="Wingdings" w:hint="default"/>
+      </w:rPr>
+    </w:lvl>
+    <w:lvl w:ilvl="3" w:tplc="38090001" w:tentative="1">
+      <w:start w:val="1"/>
+      <w:numFmt w:val="bullet"/>
+      <w:lvlText w:val=""/>
+      <w:lvlJc w:val="left"/>
+      <w:pPr>
+        <w:ind w:left="2880" w:hanging="360"/>
+      </w:pPr>
+      <w:rPr>
+        <w:rFonts w:ascii="Symbol" w:hAnsi="Symbol" w:hint="default"/>
+      </w:rPr>
+    </w:lvl>
+    <w:lvl w:ilvl="4" w:tplc="38090003" w:tentative="1">
+      <w:start w:val="1"/>
+      <w:numFmt w:val="bullet"/>
+      <w:lvlText w:val="o"/>
+      <w:lvlJc w:val="left"/>
+      <w:pPr>
+        <w:ind w:left="3600" w:hanging="360"/>
+      </w:pPr>
+      <w:rPr>
+        <w:rFonts w:ascii="Courier New" w:hAnsi="Courier New" w:cs="Courier New" w:hint="default"/>
+      </w:rPr>
+    </w:lvl>
+    <w:lvl w:ilvl="5" w:tplc="38090005" w:tentative="1">
+      <w:start w:val="1"/>
+      <w:numFmt w:val="bullet"/>
+      <w:lvlText w:val=""/>
+      <w:lvlJc w:val="left"/>
+      <w:pPr>
+        <w:ind w:left="4320" w:hanging="360"/>
+      </w:pPr>
+      <w:rPr>
+        <w:rFonts w:ascii="Wingdings" w:hAnsi="Wingdings" w:hint="default"/>
+      </w:rPr>
+    </w:lvl>
+    <w:lvl w:ilvl="6" w:tplc="38090001" w:tentative="1">
+      <w:start w:val="1"/>
+      <w:numFmt w:val="bullet"/>
+      <w:lvlText w:val=""/>
+      <w:lvlJc w:val="left"/>
+      <w:pPr>
+        <w:ind w:left="5040" w:hanging="360"/>
+      </w:pPr>
+      <w:rPr>
+        <w:rFonts w:ascii="Symbol" w:hAnsi="Symbol" w:hint="default"/>
+      </w:rPr>
+    </w:lvl>
+    <w:lvl w:ilvl="7" w:tplc="38090003" w:tentative="1">
+      <w:start w:val="1"/>
+      <w:numFmt w:val="bullet"/>
+      <w:lvlText w:val="o"/>
+      <w:lvlJc w:val="left"/>
+      <w:pPr>
+        <w:ind w:left="5760" w:hanging="360"/>
+      </w:pPr>
+      <w:rPr>
+        <w:rFonts w:ascii="Courier New" w:hAnsi="Courier New" w:cs="Courier New" w:hint="default"/>
+      </w:rPr>
+    </w:lvl>
+    <w:lvl w:ilvl="8" w:tplc="38090005" w:tentative="1">
+      <w:start w:val="1"/>
+      <w:numFmt w:val="bullet"/>
+      <w:lvlText w:val=""/>
+      <w:lvlJc w:val="left"/>
+      <w:pPr>
+        <w:ind w:left="6480" w:hanging="360"/>
+      </w:pPr>
+      <w:rPr>
+        <w:rFonts w:ascii="Wingdings" w:hAnsi="Wingdings" w:hint="default"/>
+      </w:rPr>
+    </w:lvl>
+  </w:abstractNum>
   <w:num w:numId="1" w16cid:durableId="517813677">
-    <w:abstractNumId w:val="5"/>
+    <w:abstractNumId w:val="6"/>
   </w:num>
   <w:num w:numId="2" w16cid:durableId="857735407">
-    <w:abstractNumId w:val="6"/>
+    <w:abstractNumId w:val="7"/>
   </w:num>
   <w:num w:numId="3" w16cid:durableId="134505">
     <w:abstractNumId w:val="3"/>
   </w:num>
   <w:num w:numId="4" w16cid:durableId="1666083322">
-    <w:abstractNumId w:val="7"/>
+    <w:abstractNumId w:val="8"/>
   </w:num>
   <w:num w:numId="5" w16cid:durableId="864251512">
     <w:abstractNumId w:val="2"/>
@@ -18120,10 +18948,13 @@
     <w:abstractNumId w:val="1"/>
   </w:num>
   <w:num w:numId="7" w16cid:durableId="1772166354">
-    <w:abstractNumId w:val="4"/>
+    <w:abstractNumId w:val="5"/>
   </w:num>
   <w:num w:numId="8" w16cid:durableId="71900298">
     <w:abstractNumId w:val="0"/>
+  </w:num>
+  <w:num w:numId="9" w16cid:durableId="641693388">
+    <w:abstractNumId w:val="4"/>
   </w:num>
 </w:numbering>
 </file>

</xml_diff>

<commit_message>
Update koding file kategori.service.ts
</commit_message>
<xml_diff>
--- a/dokumentasi/24382001P_Lorensius Firngadi_IF 23 E_Dokumentasi.docx
+++ b/dokumentasi/24382001P_Lorensius Firngadi_IF 23 E_Dokumentasi.docx
@@ -245,9 +245,26 @@
           <w:rFonts w:ascii="Times New Roman" w:hAnsi="Times New Roman" w:cs="Times New Roman"/>
           <w:lang w:val="en-GB"/>
         </w:rPr>
-        <w:t xml:space="preserve"> Octaviansyah, , </w:t>
-      </w:r>
-      <w:proofErr w:type="spellStart"/>
+        <w:t xml:space="preserve"> Octaviansyah</w:t>
+      </w:r>
+      <w:proofErr w:type="gramStart"/>
+      <w:r>
+        <w:rPr>
+          <w:rFonts w:ascii="Times New Roman" w:hAnsi="Times New Roman" w:cs="Times New Roman"/>
+          <w:lang w:val="en-GB"/>
+        </w:rPr>
+        <w:t>, ,</w:t>
+      </w:r>
+      <w:proofErr w:type="gramEnd"/>
+      <w:r>
+        <w:rPr>
+          <w:rFonts w:ascii="Times New Roman" w:hAnsi="Times New Roman" w:cs="Times New Roman"/>
+          <w:lang w:val="en-GB"/>
+        </w:rPr>
+        <w:t xml:space="preserve"> </w:t>
+      </w:r>
+      <w:proofErr w:type="spellStart"/>
+      <w:proofErr w:type="gramStart"/>
       <w:r>
         <w:rPr>
           <w:rFonts w:ascii="Times New Roman" w:hAnsi="Times New Roman" w:cs="Times New Roman"/>
@@ -256,6 +273,7 @@
         <w:t>S.Kom</w:t>
       </w:r>
       <w:proofErr w:type="spellEnd"/>
+      <w:proofErr w:type="gramEnd"/>
       <w:r>
         <w:rPr>
           <w:rFonts w:ascii="Times New Roman" w:hAnsi="Times New Roman" w:cs="Times New Roman"/>
@@ -264,6 +282,7 @@
         <w:t xml:space="preserve">., </w:t>
       </w:r>
       <w:proofErr w:type="spellStart"/>
+      <w:proofErr w:type="gramStart"/>
       <w:r>
         <w:rPr>
           <w:rFonts w:ascii="Times New Roman" w:hAnsi="Times New Roman" w:cs="Times New Roman"/>
@@ -272,6 +291,7 @@
         <w:t>M.Kom</w:t>
       </w:r>
       <w:proofErr w:type="spellEnd"/>
+      <w:proofErr w:type="gramEnd"/>
       <w:r>
         <w:rPr>
           <w:rFonts w:ascii="Times New Roman" w:hAnsi="Times New Roman" w:cs="Times New Roman"/>
@@ -666,7 +686,23 @@
           <w:rFonts w:ascii="Times New Roman" w:hAnsi="Times New Roman" w:cs="Times New Roman"/>
           <w:lang w:val="en-GB"/>
         </w:rPr>
-        <w:t xml:space="preserve">Nama Project : </w:t>
+        <w:t xml:space="preserve">Nama </w:t>
+      </w:r>
+      <w:proofErr w:type="gramStart"/>
+      <w:r>
+        <w:rPr>
+          <w:rFonts w:ascii="Times New Roman" w:hAnsi="Times New Roman" w:cs="Times New Roman"/>
+          <w:lang w:val="en-GB"/>
+        </w:rPr>
+        <w:t>Project :</w:t>
+      </w:r>
+      <w:proofErr w:type="gramEnd"/>
+      <w:r>
+        <w:rPr>
+          <w:rFonts w:ascii="Times New Roman" w:hAnsi="Times New Roman" w:cs="Times New Roman"/>
+          <w:lang w:val="en-GB"/>
+        </w:rPr>
+        <w:t xml:space="preserve"> </w:t>
       </w:r>
       <w:proofErr w:type="spellStart"/>
       <w:r>
@@ -721,8 +757,17 @@
           <w:rFonts w:ascii="Times New Roman" w:hAnsi="Times New Roman" w:cs="Times New Roman"/>
           <w:lang w:val="en-GB"/>
         </w:rPr>
-        <w:t xml:space="preserve"> Project :</w:t>
-      </w:r>
+        <w:t xml:space="preserve"> </w:t>
+      </w:r>
+      <w:proofErr w:type="gramStart"/>
+      <w:r>
+        <w:rPr>
+          <w:rFonts w:ascii="Times New Roman" w:hAnsi="Times New Roman" w:cs="Times New Roman"/>
+          <w:lang w:val="en-GB"/>
+        </w:rPr>
+        <w:t>Project :</w:t>
+      </w:r>
+      <w:proofErr w:type="gramEnd"/>
     </w:p>
     <w:p>
       <w:pPr>
@@ -910,6 +955,7 @@
         <w:t xml:space="preserve"> </w:t>
       </w:r>
       <w:proofErr w:type="spellStart"/>
+      <w:proofErr w:type="gramStart"/>
       <w:r>
         <w:rPr>
           <w:rFonts w:ascii="Times New Roman" w:hAnsi="Times New Roman" w:cs="Times New Roman"/>
@@ -923,7 +969,15 @@
           <w:rFonts w:ascii="Times New Roman" w:hAnsi="Times New Roman" w:cs="Times New Roman"/>
           <w:lang w:val="en-GB"/>
         </w:rPr>
-        <w:t xml:space="preserve"> : </w:t>
+        <w:t xml:space="preserve"> :</w:t>
+      </w:r>
+      <w:proofErr w:type="gramEnd"/>
+      <w:r>
+        <w:rPr>
+          <w:rFonts w:ascii="Times New Roman" w:hAnsi="Times New Roman" w:cs="Times New Roman"/>
+          <w:lang w:val="en-GB"/>
+        </w:rPr>
+        <w:t xml:space="preserve"> </w:t>
       </w:r>
       <w:proofErr w:type="spellStart"/>
       <w:r>
@@ -1944,9 +1998,9 @@
           <w:bCs/>
           <w:lang w:val="en-GB"/>
         </w:rPr>
-        <w:t xml:space="preserve"> file .</w:t>
-      </w:r>
-      <w:proofErr w:type="spellStart"/>
+        <w:t xml:space="preserve"> </w:t>
+      </w:r>
+      <w:proofErr w:type="gramStart"/>
       <w:r>
         <w:rPr>
           <w:rFonts w:ascii="Times New Roman" w:hAnsi="Times New Roman" w:cs="Times New Roman"/>
@@ -1954,9 +2008,20 @@
           <w:bCs/>
           <w:lang w:val="en-GB"/>
         </w:rPr>
+        <w:t>file .</w:t>
+      </w:r>
+      <w:proofErr w:type="spellStart"/>
+      <w:r>
+        <w:rPr>
+          <w:rFonts w:ascii="Times New Roman" w:hAnsi="Times New Roman" w:cs="Times New Roman"/>
+          <w:b/>
+          <w:bCs/>
+          <w:lang w:val="en-GB"/>
+        </w:rPr>
         <w:t>gitignore</w:t>
       </w:r>
       <w:proofErr w:type="spellEnd"/>
+      <w:proofErr w:type="gramEnd"/>
       <w:r>
         <w:rPr>
           <w:rFonts w:ascii="Times New Roman" w:hAnsi="Times New Roman" w:cs="Times New Roman"/>
@@ -2064,7 +2129,15 @@
           <w:rFonts w:ascii="Times New Roman" w:hAnsi="Times New Roman" w:cs="Times New Roman"/>
           <w:lang w:val="en-GB"/>
         </w:rPr>
-        <w:t xml:space="preserve"> file .</w:t>
+        <w:t xml:space="preserve"> </w:t>
+      </w:r>
+      <w:proofErr w:type="gramStart"/>
+      <w:r>
+        <w:rPr>
+          <w:rFonts w:ascii="Times New Roman" w:hAnsi="Times New Roman" w:cs="Times New Roman"/>
+          <w:lang w:val="en-GB"/>
+        </w:rPr>
+        <w:t>file .</w:t>
       </w:r>
       <w:proofErr w:type="spellStart"/>
       <w:r>
@@ -2075,6 +2148,7 @@
         <w:t>gitignore</w:t>
       </w:r>
       <w:proofErr w:type="spellEnd"/>
+      <w:proofErr w:type="gramEnd"/>
       <w:r>
         <w:rPr>
           <w:rFonts w:ascii="Times New Roman" w:hAnsi="Times New Roman" w:cs="Times New Roman"/>
@@ -2342,6 +2416,7 @@
           <w:lang w:val="en-GB"/>
         </w:rPr>
       </w:pPr>
+      <w:proofErr w:type="gramStart"/>
       <w:r>
         <w:rPr>
           <w:rFonts w:ascii="Times New Roman" w:hAnsi="Times New Roman" w:cs="Times New Roman"/>
@@ -2358,12 +2433,21 @@
         <w:t>gitignore</w:t>
       </w:r>
       <w:proofErr w:type="spellEnd"/>
-      <w:r>
-        <w:rPr>
-          <w:rFonts w:ascii="Times New Roman" w:hAnsi="Times New Roman" w:cs="Times New Roman"/>
-          <w:lang w:val="en-GB"/>
-        </w:rPr>
-        <w:t xml:space="preserve"> sangat  </w:t>
+      <w:proofErr w:type="gramEnd"/>
+      <w:r>
+        <w:rPr>
+          <w:rFonts w:ascii="Times New Roman" w:hAnsi="Times New Roman" w:cs="Times New Roman"/>
+          <w:lang w:val="en-GB"/>
+        </w:rPr>
+        <w:t xml:space="preserve"> </w:t>
+      </w:r>
+      <w:proofErr w:type="gramStart"/>
+      <w:r>
+        <w:rPr>
+          <w:rFonts w:ascii="Times New Roman" w:hAnsi="Times New Roman" w:cs="Times New Roman"/>
+          <w:lang w:val="en-GB"/>
+        </w:rPr>
+        <w:t xml:space="preserve">sangat  </w:t>
       </w:r>
       <w:proofErr w:type="spellStart"/>
       <w:r>
@@ -2374,6 +2458,7 @@
         <w:t>bermanfaat</w:t>
       </w:r>
       <w:proofErr w:type="spellEnd"/>
+      <w:proofErr w:type="gramEnd"/>
       <w:r>
         <w:rPr>
           <w:rFonts w:ascii="Times New Roman" w:hAnsi="Times New Roman" w:cs="Times New Roman"/>
@@ -2865,6 +2950,7 @@
         <w:t xml:space="preserve">Edit </w:t>
       </w:r>
       <w:proofErr w:type="spellStart"/>
+      <w:proofErr w:type="gramStart"/>
       <w:r>
         <w:rPr>
           <w:rFonts w:ascii="Times New Roman" w:hAnsi="Times New Roman" w:cs="Times New Roman"/>
@@ -2875,6 +2961,7 @@
         <w:t>tsconfig.json</w:t>
       </w:r>
       <w:proofErr w:type="spellEnd"/>
+      <w:proofErr w:type="gramEnd"/>
       <w:r>
         <w:rPr>
           <w:rFonts w:ascii="Times New Roman" w:hAnsi="Times New Roman" w:cs="Times New Roman"/>
@@ -3493,12 +3580,21 @@
         <w:t>seperti</w:t>
       </w:r>
       <w:proofErr w:type="spellEnd"/>
-      <w:r>
-        <w:rPr>
-          <w:rFonts w:ascii="Times New Roman" w:hAnsi="Times New Roman" w:cs="Times New Roman"/>
-          <w:lang w:val="en-GB"/>
-        </w:rPr>
-        <w:t xml:space="preserve"> ../../../folder/file, </w:t>
+      <w:proofErr w:type="gramStart"/>
+      <w:r>
+        <w:rPr>
+          <w:rFonts w:ascii="Times New Roman" w:hAnsi="Times New Roman" w:cs="Times New Roman"/>
+          <w:lang w:val="en-GB"/>
+        </w:rPr>
+        <w:t xml:space="preserve"> ../../..</w:t>
+      </w:r>
+      <w:proofErr w:type="gramEnd"/>
+      <w:r>
+        <w:rPr>
+          <w:rFonts w:ascii="Times New Roman" w:hAnsi="Times New Roman" w:cs="Times New Roman"/>
+          <w:lang w:val="en-GB"/>
+        </w:rPr>
+        <w:t xml:space="preserve">/folder/file, </w:t>
       </w:r>
       <w:proofErr w:type="spellStart"/>
       <w:r>
@@ -4776,6 +4872,7 @@
         <w:t xml:space="preserve">Update </w:t>
       </w:r>
       <w:proofErr w:type="spellStart"/>
+      <w:proofErr w:type="gramStart"/>
       <w:r>
         <w:rPr>
           <w:b/>
@@ -4784,6 +4881,7 @@
         <w:t>package.json</w:t>
       </w:r>
       <w:proofErr w:type="spellEnd"/>
+      <w:proofErr w:type="gramEnd"/>
       <w:r>
         <w:rPr>
           <w:b/>
@@ -7726,6 +7824,7 @@
         <w:t xml:space="preserve"> File </w:t>
       </w:r>
       <w:proofErr w:type="spellStart"/>
+      <w:proofErr w:type="gramStart"/>
       <w:r>
         <w:rPr>
           <w:rFonts w:ascii="Times New Roman" w:hAnsi="Times New Roman" w:cs="Times New Roman"/>
@@ -7733,7 +7832,17 @@
           <w:bCs/>
           <w:lang w:val="en-GB"/>
         </w:rPr>
-        <w:t>prisma.service.ts</w:t>
+        <w:t>prisma.service</w:t>
+      </w:r>
+      <w:proofErr w:type="gramEnd"/>
+      <w:r>
+        <w:rPr>
+          <w:rFonts w:ascii="Times New Roman" w:hAnsi="Times New Roman" w:cs="Times New Roman"/>
+          <w:b/>
+          <w:bCs/>
+          <w:lang w:val="en-GB"/>
+        </w:rPr>
+        <w:t>.ts</w:t>
       </w:r>
       <w:proofErr w:type="spellEnd"/>
     </w:p>
@@ -9155,7 +9264,23 @@
           <w:rFonts w:ascii="Times New Roman" w:hAnsi="Times New Roman" w:cs="Times New Roman"/>
           <w:lang w:val="en-GB"/>
         </w:rPr>
-        <w:t xml:space="preserve">  id: string;            # KTP/ID </w:t>
+        <w:t xml:space="preserve">  id: </w:t>
+      </w:r>
+      <w:proofErr w:type="gramStart"/>
+      <w:r>
+        <w:rPr>
+          <w:rFonts w:ascii="Times New Roman" w:hAnsi="Times New Roman" w:cs="Times New Roman"/>
+          <w:lang w:val="en-GB"/>
+        </w:rPr>
+        <w:t xml:space="preserve">string;   </w:t>
+      </w:r>
+      <w:proofErr w:type="gramEnd"/>
+      <w:r>
+        <w:rPr>
+          <w:rFonts w:ascii="Times New Roman" w:hAnsi="Times New Roman" w:cs="Times New Roman"/>
+          <w:lang w:val="en-GB"/>
+        </w:rPr>
+        <w:t xml:space="preserve">         # KTP/ID </w:t>
       </w:r>
       <w:proofErr w:type="spellStart"/>
       <w:r>
@@ -9236,7 +9361,23 @@
           <w:rFonts w:ascii="Times New Roman" w:hAnsi="Times New Roman" w:cs="Times New Roman"/>
           <w:lang w:val="en-GB"/>
         </w:rPr>
-        <w:t xml:space="preserve">  name: string;          # Nama </w:t>
+        <w:t xml:space="preserve">  name: </w:t>
+      </w:r>
+      <w:proofErr w:type="gramStart"/>
+      <w:r>
+        <w:rPr>
+          <w:rFonts w:ascii="Times New Roman" w:hAnsi="Times New Roman" w:cs="Times New Roman"/>
+          <w:lang w:val="en-GB"/>
+        </w:rPr>
+        <w:t xml:space="preserve">string;   </w:t>
+      </w:r>
+      <w:proofErr w:type="gramEnd"/>
+      <w:r>
+        <w:rPr>
+          <w:rFonts w:ascii="Times New Roman" w:hAnsi="Times New Roman" w:cs="Times New Roman"/>
+          <w:lang w:val="en-GB"/>
+        </w:rPr>
+        <w:t xml:space="preserve">       # Nama </w:t>
       </w:r>
       <w:proofErr w:type="spellStart"/>
       <w:r>
@@ -9301,7 +9442,23 @@
           <w:rFonts w:ascii="Times New Roman" w:hAnsi="Times New Roman" w:cs="Times New Roman"/>
           <w:lang w:val="en-GB"/>
         </w:rPr>
-        <w:t xml:space="preserve">  slug: string;          # Nama </w:t>
+        <w:t xml:space="preserve">  slug: </w:t>
+      </w:r>
+      <w:proofErr w:type="gramStart"/>
+      <w:r>
+        <w:rPr>
+          <w:rFonts w:ascii="Times New Roman" w:hAnsi="Times New Roman" w:cs="Times New Roman"/>
+          <w:lang w:val="en-GB"/>
+        </w:rPr>
+        <w:t xml:space="preserve">string;   </w:t>
+      </w:r>
+      <w:proofErr w:type="gramEnd"/>
+      <w:r>
+        <w:rPr>
+          <w:rFonts w:ascii="Times New Roman" w:hAnsi="Times New Roman" w:cs="Times New Roman"/>
+          <w:lang w:val="en-GB"/>
+        </w:rPr>
+        <w:t xml:space="preserve">       # Nama </w:t>
       </w:r>
       <w:proofErr w:type="spellStart"/>
       <w:r>
@@ -9366,7 +9523,39 @@
           <w:rFonts w:ascii="Times New Roman" w:hAnsi="Times New Roman" w:cs="Times New Roman"/>
           <w:lang w:val="en-GB"/>
         </w:rPr>
-        <w:t xml:space="preserve">  description?: string;  # </w:t>
+        <w:t xml:space="preserve">  </w:t>
+      </w:r>
+      <w:proofErr w:type="gramStart"/>
+      <w:r>
+        <w:rPr>
+          <w:rFonts w:ascii="Times New Roman" w:hAnsi="Times New Roman" w:cs="Times New Roman"/>
+          <w:lang w:val="en-GB"/>
+        </w:rPr>
+        <w:t>description?:</w:t>
+      </w:r>
+      <w:proofErr w:type="gramEnd"/>
+      <w:r>
+        <w:rPr>
+          <w:rFonts w:ascii="Times New Roman" w:hAnsi="Times New Roman" w:cs="Times New Roman"/>
+          <w:lang w:val="en-GB"/>
+        </w:rPr>
+        <w:t xml:space="preserve"> </w:t>
+      </w:r>
+      <w:proofErr w:type="gramStart"/>
+      <w:r>
+        <w:rPr>
+          <w:rFonts w:ascii="Times New Roman" w:hAnsi="Times New Roman" w:cs="Times New Roman"/>
+          <w:lang w:val="en-GB"/>
+        </w:rPr>
+        <w:t>string;  #</w:t>
+      </w:r>
+      <w:proofErr w:type="gramEnd"/>
+      <w:r>
+        <w:rPr>
+          <w:rFonts w:ascii="Times New Roman" w:hAnsi="Times New Roman" w:cs="Times New Roman"/>
+          <w:lang w:val="en-GB"/>
+        </w:rPr>
+        <w:t xml:space="preserve"> </w:t>
       </w:r>
       <w:proofErr w:type="spellStart"/>
       <w:r>
@@ -9401,6 +9590,7 @@
         <w:t xml:space="preserve"> (</w:t>
       </w:r>
       <w:proofErr w:type="spellStart"/>
+      <w:proofErr w:type="gramStart"/>
       <w:r>
         <w:rPr>
           <w:rFonts w:ascii="Times New Roman" w:hAnsi="Times New Roman" w:cs="Times New Roman"/>
@@ -9414,7 +9604,15 @@
           <w:rFonts w:ascii="Times New Roman" w:hAnsi="Times New Roman" w:cs="Times New Roman"/>
           <w:lang w:val="en-GB"/>
         </w:rPr>
-        <w:t xml:space="preserve"> ? </w:t>
+        <w:t xml:space="preserve"> ?</w:t>
+      </w:r>
+      <w:proofErr w:type="gramEnd"/>
+      <w:r>
+        <w:rPr>
+          <w:rFonts w:ascii="Times New Roman" w:hAnsi="Times New Roman" w:cs="Times New Roman"/>
+          <w:lang w:val="en-GB"/>
+        </w:rPr>
+        <w:t xml:space="preserve"> </w:t>
       </w:r>
       <w:proofErr w:type="spellStart"/>
       <w:r>
@@ -9479,7 +9677,39 @@
           <w:rFonts w:ascii="Times New Roman" w:hAnsi="Times New Roman" w:cs="Times New Roman"/>
           <w:lang w:val="en-GB"/>
         </w:rPr>
-        <w:t xml:space="preserve">  icon?: string;         # </w:t>
+        <w:t xml:space="preserve">  </w:t>
+      </w:r>
+      <w:proofErr w:type="gramStart"/>
+      <w:r>
+        <w:rPr>
+          <w:rFonts w:ascii="Times New Roman" w:hAnsi="Times New Roman" w:cs="Times New Roman"/>
+          <w:lang w:val="en-GB"/>
+        </w:rPr>
+        <w:t>icon?:</w:t>
+      </w:r>
+      <w:proofErr w:type="gramEnd"/>
+      <w:r>
+        <w:rPr>
+          <w:rFonts w:ascii="Times New Roman" w:hAnsi="Times New Roman" w:cs="Times New Roman"/>
+          <w:lang w:val="en-GB"/>
+        </w:rPr>
+        <w:t xml:space="preserve"> </w:t>
+      </w:r>
+      <w:proofErr w:type="gramStart"/>
+      <w:r>
+        <w:rPr>
+          <w:rFonts w:ascii="Times New Roman" w:hAnsi="Times New Roman" w:cs="Times New Roman"/>
+          <w:lang w:val="en-GB"/>
+        </w:rPr>
+        <w:t xml:space="preserve">string;   </w:t>
+      </w:r>
+      <w:proofErr w:type="gramEnd"/>
+      <w:r>
+        <w:rPr>
+          <w:rFonts w:ascii="Times New Roman" w:hAnsi="Times New Roman" w:cs="Times New Roman"/>
+          <w:lang w:val="en-GB"/>
+        </w:rPr>
+        <w:t xml:space="preserve">      # </w:t>
       </w:r>
       <w:proofErr w:type="spellStart"/>
       <w:r>
@@ -9608,7 +9838,23 @@
           <w:rFonts w:ascii="Times New Roman" w:hAnsi="Times New Roman" w:cs="Times New Roman"/>
           <w:lang w:val="en-GB"/>
         </w:rPr>
-        <w:t xml:space="preserve">: Date;       # </w:t>
+        <w:t xml:space="preserve">: </w:t>
+      </w:r>
+      <w:proofErr w:type="gramStart"/>
+      <w:r>
+        <w:rPr>
+          <w:rFonts w:ascii="Times New Roman" w:hAnsi="Times New Roman" w:cs="Times New Roman"/>
+          <w:lang w:val="en-GB"/>
+        </w:rPr>
+        <w:t xml:space="preserve">Date;   </w:t>
+      </w:r>
+      <w:proofErr w:type="gramEnd"/>
+      <w:r>
+        <w:rPr>
+          <w:rFonts w:ascii="Times New Roman" w:hAnsi="Times New Roman" w:cs="Times New Roman"/>
+          <w:lang w:val="en-GB"/>
+        </w:rPr>
+        <w:t xml:space="preserve">    # </w:t>
       </w:r>
       <w:proofErr w:type="spellStart"/>
       <w:r>
@@ -9737,7 +9983,23 @@
           <w:rFonts w:ascii="Times New Roman" w:hAnsi="Times New Roman" w:cs="Times New Roman"/>
           <w:lang w:val="en-GB"/>
         </w:rPr>
-        <w:t xml:space="preserve">: Date;       # </w:t>
+        <w:t xml:space="preserve">: </w:t>
+      </w:r>
+      <w:proofErr w:type="gramStart"/>
+      <w:r>
+        <w:rPr>
+          <w:rFonts w:ascii="Times New Roman" w:hAnsi="Times New Roman" w:cs="Times New Roman"/>
+          <w:lang w:val="en-GB"/>
+        </w:rPr>
+        <w:t xml:space="preserve">Date;   </w:t>
+      </w:r>
+      <w:proofErr w:type="gramEnd"/>
+      <w:r>
+        <w:rPr>
+          <w:rFonts w:ascii="Times New Roman" w:hAnsi="Times New Roman" w:cs="Times New Roman"/>
+          <w:lang w:val="en-GB"/>
+        </w:rPr>
+        <w:t xml:space="preserve">    # </w:t>
       </w:r>
       <w:proofErr w:type="spellStart"/>
       <w:r>
@@ -10070,7 +10332,23 @@
           <w:rFonts w:ascii="Times New Roman" w:hAnsi="Times New Roman" w:cs="Times New Roman"/>
           <w:lang w:val="en-GB"/>
         </w:rPr>
-        <w:t xml:space="preserve">  constructor(data: Partial&lt;</w:t>
+        <w:t xml:space="preserve">  </w:t>
+      </w:r>
+      <w:proofErr w:type="gramStart"/>
+      <w:r>
+        <w:rPr>
+          <w:rFonts w:ascii="Times New Roman" w:hAnsi="Times New Roman" w:cs="Times New Roman"/>
+          <w:lang w:val="en-GB"/>
+        </w:rPr>
+        <w:t>constructor(</w:t>
+      </w:r>
+      <w:proofErr w:type="gramEnd"/>
+      <w:r>
+        <w:rPr>
+          <w:rFonts w:ascii="Times New Roman" w:hAnsi="Times New Roman" w:cs="Times New Roman"/>
+          <w:lang w:val="en-GB"/>
+        </w:rPr>
+        <w:t>data: Partial&lt;</w:t>
       </w:r>
       <w:proofErr w:type="spellStart"/>
       <w:r>
@@ -10232,7 +10510,23 @@
           <w:rFonts w:ascii="Times New Roman" w:hAnsi="Times New Roman" w:cs="Times New Roman"/>
           <w:lang w:val="en-GB"/>
         </w:rPr>
-        <w:t xml:space="preserve">    # di </w:t>
+        <w:t xml:space="preserve">    # </w:t>
+      </w:r>
+      <w:proofErr w:type="gramStart"/>
+      <w:r>
+        <w:rPr>
+          <w:rFonts w:ascii="Times New Roman" w:hAnsi="Times New Roman" w:cs="Times New Roman"/>
+          <w:lang w:val="en-GB"/>
+        </w:rPr>
+        <w:t>di</w:t>
+      </w:r>
+      <w:proofErr w:type="gramEnd"/>
+      <w:r>
+        <w:rPr>
+          <w:rFonts w:ascii="Times New Roman" w:hAnsi="Times New Roman" w:cs="Times New Roman"/>
+          <w:lang w:val="en-GB"/>
+        </w:rPr>
+        <w:t xml:space="preserve"> </w:t>
       </w:r>
       <w:proofErr w:type="spellStart"/>
       <w:r>
@@ -10483,6 +10777,7 @@
         <w:t xml:space="preserve"> </w:t>
       </w:r>
       <w:proofErr w:type="spellStart"/>
+      <w:proofErr w:type="gramStart"/>
       <w:r>
         <w:rPr>
           <w:rFonts w:ascii="Times New Roman" w:hAnsi="Times New Roman" w:cs="Times New Roman"/>
@@ -10491,6 +10786,7 @@
         <w:t>kategori.harga</w:t>
       </w:r>
       <w:proofErr w:type="spellEnd"/>
+      <w:proofErr w:type="gramEnd"/>
       <w:r>
         <w:rPr>
           <w:rFonts w:ascii="Times New Roman" w:hAnsi="Times New Roman" w:cs="Times New Roman"/>
@@ -11466,6 +11762,7 @@
           <w:lang w:val="en-GB"/>
         </w:rPr>
       </w:pPr>
+      <w:proofErr w:type="gramStart"/>
       <w:r>
         <w:rPr>
           <w:rFonts w:ascii="Times New Roman" w:hAnsi="Times New Roman" w:cs="Times New Roman"/>
@@ -11473,6 +11770,7 @@
         </w:rPr>
         <w:t>Kode :</w:t>
       </w:r>
+      <w:proofErr w:type="gramEnd"/>
     </w:p>
     <w:p>
       <w:pPr>
@@ -11488,7 +11786,15 @@
           <w:rFonts w:ascii="Times New Roman" w:hAnsi="Times New Roman" w:cs="Times New Roman"/>
           <w:lang w:val="en-GB"/>
         </w:rPr>
-        <w:t xml:space="preserve">import { </w:t>
+        <w:t xml:space="preserve">import </w:t>
+      </w:r>
+      <w:proofErr w:type="gramStart"/>
+      <w:r>
+        <w:rPr>
+          <w:rFonts w:ascii="Times New Roman" w:hAnsi="Times New Roman" w:cs="Times New Roman"/>
+          <w:lang w:val="en-GB"/>
+        </w:rPr>
+        <w:t xml:space="preserve">{ </w:t>
       </w:r>
       <w:proofErr w:type="spellStart"/>
       <w:r>
@@ -11499,6 +11805,7 @@
         <w:t>IsString</w:t>
       </w:r>
       <w:proofErr w:type="spellEnd"/>
+      <w:proofErr w:type="gramEnd"/>
       <w:r>
         <w:rPr>
           <w:rFonts w:ascii="Times New Roman" w:hAnsi="Times New Roman" w:cs="Times New Roman"/>
@@ -11555,6 +11862,7 @@
         <w:t xml:space="preserve">, </w:t>
       </w:r>
       <w:proofErr w:type="spellStart"/>
+      <w:proofErr w:type="gramStart"/>
       <w:r>
         <w:rPr>
           <w:rFonts w:ascii="Times New Roman" w:hAnsi="Times New Roman" w:cs="Times New Roman"/>
@@ -11568,7 +11876,15 @@
           <w:rFonts w:ascii="Times New Roman" w:hAnsi="Times New Roman" w:cs="Times New Roman"/>
           <w:lang w:val="en-GB"/>
         </w:rPr>
-        <w:t xml:space="preserve"> } from 'class-validator';</w:t>
+        <w:t xml:space="preserve"> }</w:t>
+      </w:r>
+      <w:proofErr w:type="gramEnd"/>
+      <w:r>
+        <w:rPr>
+          <w:rFonts w:ascii="Times New Roman" w:hAnsi="Times New Roman" w:cs="Times New Roman"/>
+          <w:lang w:val="en-GB"/>
+        </w:rPr>
+        <w:t xml:space="preserve"> from 'class-validator';</w:t>
       </w:r>
     </w:p>
     <w:p>
@@ -11774,7 +12090,23 @@
           <w:rFonts w:ascii="Times New Roman" w:hAnsi="Times New Roman" w:cs="Times New Roman"/>
           <w:lang w:val="en-GB"/>
         </w:rPr>
-        <w:t xml:space="preserve">  @IsString()      # Harus </w:t>
+        <w:t xml:space="preserve">  @</w:t>
+      </w:r>
+      <w:proofErr w:type="gramStart"/>
+      <w:r>
+        <w:rPr>
+          <w:rFonts w:ascii="Times New Roman" w:hAnsi="Times New Roman" w:cs="Times New Roman"/>
+          <w:lang w:val="en-GB"/>
+        </w:rPr>
+        <w:t>IsString(</w:t>
+      </w:r>
+      <w:proofErr w:type="gramEnd"/>
+      <w:r>
+        <w:rPr>
+          <w:rFonts w:ascii="Times New Roman" w:hAnsi="Times New Roman" w:cs="Times New Roman"/>
+          <w:lang w:val="en-GB"/>
+        </w:rPr>
+        <w:t xml:space="preserve">)      # Harus </w:t>
       </w:r>
       <w:proofErr w:type="spellStart"/>
       <w:r>
@@ -11823,7 +12155,23 @@
           <w:rFonts w:ascii="Times New Roman" w:hAnsi="Times New Roman" w:cs="Times New Roman"/>
           <w:lang w:val="en-GB"/>
         </w:rPr>
-        <w:t xml:space="preserve">  @IsNotEmpty()   # Tidak </w:t>
+        <w:t xml:space="preserve">  @</w:t>
+      </w:r>
+      <w:proofErr w:type="gramStart"/>
+      <w:r>
+        <w:rPr>
+          <w:rFonts w:ascii="Times New Roman" w:hAnsi="Times New Roman" w:cs="Times New Roman"/>
+          <w:lang w:val="en-GB"/>
+        </w:rPr>
+        <w:t>IsNotEmpty(</w:t>
+      </w:r>
+      <w:proofErr w:type="gramEnd"/>
+      <w:r>
+        <w:rPr>
+          <w:rFonts w:ascii="Times New Roman" w:hAnsi="Times New Roman" w:cs="Times New Roman"/>
+          <w:lang w:val="en-GB"/>
+        </w:rPr>
+        <w:t xml:space="preserve">)   # Tidak </w:t>
       </w:r>
       <w:proofErr w:type="spellStart"/>
       <w:r>
@@ -11920,7 +12268,23 @@
           <w:rFonts w:ascii="Times New Roman" w:hAnsi="Times New Roman" w:cs="Times New Roman"/>
           <w:lang w:val="en-GB"/>
         </w:rPr>
-        <w:t xml:space="preserve">  @MinLength(2)   # Minimal </w:t>
+        <w:t xml:space="preserve">  @</w:t>
+      </w:r>
+      <w:proofErr w:type="gramStart"/>
+      <w:r>
+        <w:rPr>
+          <w:rFonts w:ascii="Times New Roman" w:hAnsi="Times New Roman" w:cs="Times New Roman"/>
+          <w:lang w:val="en-GB"/>
+        </w:rPr>
+        <w:t>MinLength(</w:t>
+      </w:r>
+      <w:proofErr w:type="gramEnd"/>
+      <w:r>
+        <w:rPr>
+          <w:rFonts w:ascii="Times New Roman" w:hAnsi="Times New Roman" w:cs="Times New Roman"/>
+          <w:lang w:val="en-GB"/>
+        </w:rPr>
+        <w:t xml:space="preserve">2)   # Minimal </w:t>
       </w:r>
       <w:proofErr w:type="spellStart"/>
       <w:r>
@@ -12049,7 +12413,23 @@
           <w:rFonts w:ascii="Times New Roman" w:hAnsi="Times New Roman" w:cs="Times New Roman"/>
           <w:lang w:val="en-GB"/>
         </w:rPr>
-        <w:t xml:space="preserve">  @MaxLength(100) # </w:t>
+        <w:t xml:space="preserve">  @</w:t>
+      </w:r>
+      <w:proofErr w:type="gramStart"/>
+      <w:r>
+        <w:rPr>
+          <w:rFonts w:ascii="Times New Roman" w:hAnsi="Times New Roman" w:cs="Times New Roman"/>
+          <w:lang w:val="en-GB"/>
+        </w:rPr>
+        <w:t>MaxLength(</w:t>
+      </w:r>
+      <w:proofErr w:type="gramEnd"/>
+      <w:r>
+        <w:rPr>
+          <w:rFonts w:ascii="Times New Roman" w:hAnsi="Times New Roman" w:cs="Times New Roman"/>
+          <w:lang w:val="en-GB"/>
+        </w:rPr>
+        <w:t xml:space="preserve">100) # </w:t>
       </w:r>
       <w:proofErr w:type="spellStart"/>
       <w:r>
@@ -12157,7 +12537,23 @@
           <w:rFonts w:ascii="Times New Roman" w:hAnsi="Times New Roman" w:cs="Times New Roman"/>
           <w:lang w:val="en-GB"/>
         </w:rPr>
-        <w:t xml:space="preserve">  @IsString()      # Harus </w:t>
+        <w:t xml:space="preserve">  @</w:t>
+      </w:r>
+      <w:proofErr w:type="gramStart"/>
+      <w:r>
+        <w:rPr>
+          <w:rFonts w:ascii="Times New Roman" w:hAnsi="Times New Roman" w:cs="Times New Roman"/>
+          <w:lang w:val="en-GB"/>
+        </w:rPr>
+        <w:t>IsString(</w:t>
+      </w:r>
+      <w:proofErr w:type="gramEnd"/>
+      <w:r>
+        <w:rPr>
+          <w:rFonts w:ascii="Times New Roman" w:hAnsi="Times New Roman" w:cs="Times New Roman"/>
+          <w:lang w:val="en-GB"/>
+        </w:rPr>
+        <w:t xml:space="preserve">)      # Harus </w:t>
       </w:r>
       <w:proofErr w:type="spellStart"/>
       <w:r>
@@ -12206,7 +12602,23 @@
           <w:rFonts w:ascii="Times New Roman" w:hAnsi="Times New Roman" w:cs="Times New Roman"/>
           <w:lang w:val="en-GB"/>
         </w:rPr>
-        <w:t xml:space="preserve">  @IsNotEmpty()   # Wajib </w:t>
+        <w:t xml:space="preserve">  @</w:t>
+      </w:r>
+      <w:proofErr w:type="gramStart"/>
+      <w:r>
+        <w:rPr>
+          <w:rFonts w:ascii="Times New Roman" w:hAnsi="Times New Roman" w:cs="Times New Roman"/>
+          <w:lang w:val="en-GB"/>
+        </w:rPr>
+        <w:t>IsNotEmpty(</w:t>
+      </w:r>
+      <w:proofErr w:type="gramEnd"/>
+      <w:r>
+        <w:rPr>
+          <w:rFonts w:ascii="Times New Roman" w:hAnsi="Times New Roman" w:cs="Times New Roman"/>
+          <w:lang w:val="en-GB"/>
+        </w:rPr>
+        <w:t xml:space="preserve">)   # Wajib </w:t>
       </w:r>
       <w:proofErr w:type="spellStart"/>
       <w:r>
@@ -12303,7 +12715,23 @@
           <w:rFonts w:ascii="Times New Roman" w:hAnsi="Times New Roman" w:cs="Times New Roman"/>
           <w:lang w:val="en-GB"/>
         </w:rPr>
-        <w:t xml:space="preserve">  @MinLength(2)</w:t>
+        <w:t xml:space="preserve">  @</w:t>
+      </w:r>
+      <w:proofErr w:type="gramStart"/>
+      <w:r>
+        <w:rPr>
+          <w:rFonts w:ascii="Times New Roman" w:hAnsi="Times New Roman" w:cs="Times New Roman"/>
+          <w:lang w:val="en-GB"/>
+        </w:rPr>
+        <w:t>MinLength(</w:t>
+      </w:r>
+      <w:proofErr w:type="gramEnd"/>
+      <w:r>
+        <w:rPr>
+          <w:rFonts w:ascii="Times New Roman" w:hAnsi="Times New Roman" w:cs="Times New Roman"/>
+          <w:lang w:val="en-GB"/>
+        </w:rPr>
+        <w:t>2)</w:t>
       </w:r>
     </w:p>
     <w:p>
@@ -12320,7 +12748,23 @@
           <w:rFonts w:ascii="Times New Roman" w:hAnsi="Times New Roman" w:cs="Times New Roman"/>
           <w:lang w:val="en-GB"/>
         </w:rPr>
-        <w:t xml:space="preserve">  @MaxLength(100)</w:t>
+        <w:t xml:space="preserve">  @</w:t>
+      </w:r>
+      <w:proofErr w:type="gramStart"/>
+      <w:r>
+        <w:rPr>
+          <w:rFonts w:ascii="Times New Roman" w:hAnsi="Times New Roman" w:cs="Times New Roman"/>
+          <w:lang w:val="en-GB"/>
+        </w:rPr>
+        <w:t>MaxLength(</w:t>
+      </w:r>
+      <w:proofErr w:type="gramEnd"/>
+      <w:r>
+        <w:rPr>
+          <w:rFonts w:ascii="Times New Roman" w:hAnsi="Times New Roman" w:cs="Times New Roman"/>
+          <w:lang w:val="en-GB"/>
+        </w:rPr>
+        <w:t>100)</w:t>
       </w:r>
     </w:p>
     <w:p>
@@ -12364,7 +12808,23 @@
           <w:rFonts w:ascii="Times New Roman" w:hAnsi="Times New Roman" w:cs="Times New Roman"/>
           <w:lang w:val="en-GB"/>
         </w:rPr>
-        <w:t xml:space="preserve">  @IsString()      # Harus </w:t>
+        <w:t xml:space="preserve">  @</w:t>
+      </w:r>
+      <w:proofErr w:type="gramStart"/>
+      <w:r>
+        <w:rPr>
+          <w:rFonts w:ascii="Times New Roman" w:hAnsi="Times New Roman" w:cs="Times New Roman"/>
+          <w:lang w:val="en-GB"/>
+        </w:rPr>
+        <w:t>IsString(</w:t>
+      </w:r>
+      <w:proofErr w:type="gramEnd"/>
+      <w:r>
+        <w:rPr>
+          <w:rFonts w:ascii="Times New Roman" w:hAnsi="Times New Roman" w:cs="Times New Roman"/>
+          <w:lang w:val="en-GB"/>
+        </w:rPr>
+        <w:t xml:space="preserve">)      # Harus </w:t>
       </w:r>
       <w:proofErr w:type="spellStart"/>
       <w:r>
@@ -12413,7 +12873,23 @@
           <w:rFonts w:ascii="Times New Roman" w:hAnsi="Times New Roman" w:cs="Times New Roman"/>
           <w:lang w:val="en-GB"/>
         </w:rPr>
-        <w:t xml:space="preserve">  @IsOptional()   # BOLEH KOSONG (</w:t>
+        <w:t xml:space="preserve">  @</w:t>
+      </w:r>
+      <w:proofErr w:type="gramStart"/>
+      <w:r>
+        <w:rPr>
+          <w:rFonts w:ascii="Times New Roman" w:hAnsi="Times New Roman" w:cs="Times New Roman"/>
+          <w:lang w:val="en-GB"/>
+        </w:rPr>
+        <w:t>IsOptional(</w:t>
+      </w:r>
+      <w:proofErr w:type="gramEnd"/>
+      <w:r>
+        <w:rPr>
+          <w:rFonts w:ascii="Times New Roman" w:hAnsi="Times New Roman" w:cs="Times New Roman"/>
+          <w:lang w:val="en-GB"/>
+        </w:rPr>
+        <w:t>)   # BOLEH KOSONG (</w:t>
       </w:r>
       <w:proofErr w:type="spellStart"/>
       <w:r>
@@ -12478,7 +12954,23 @@
           <w:rFonts w:ascii="Times New Roman" w:hAnsi="Times New Roman" w:cs="Times New Roman"/>
           <w:lang w:val="en-GB"/>
         </w:rPr>
-        <w:t xml:space="preserve">  @MaxLength(500) # Jika </w:t>
+        <w:t xml:space="preserve">  @</w:t>
+      </w:r>
+      <w:proofErr w:type="gramStart"/>
+      <w:r>
+        <w:rPr>
+          <w:rFonts w:ascii="Times New Roman" w:hAnsi="Times New Roman" w:cs="Times New Roman"/>
+          <w:lang w:val="en-GB"/>
+        </w:rPr>
+        <w:t>MaxLength(</w:t>
+      </w:r>
+      <w:proofErr w:type="gramEnd"/>
+      <w:r>
+        <w:rPr>
+          <w:rFonts w:ascii="Times New Roman" w:hAnsi="Times New Roman" w:cs="Times New Roman"/>
+          <w:lang w:val="en-GB"/>
+        </w:rPr>
+        <w:t xml:space="preserve">500) # Jika </w:t>
       </w:r>
       <w:proofErr w:type="spellStart"/>
       <w:r>
@@ -12592,7 +13084,23 @@
           <w:lang w:val="en-GB"/>
         </w:rPr>
         <w:lastRenderedPageBreak/>
-        <w:t xml:space="preserve">  description?: string;</w:t>
+        <w:t xml:space="preserve">  </w:t>
+      </w:r>
+      <w:proofErr w:type="gramStart"/>
+      <w:r>
+        <w:rPr>
+          <w:rFonts w:ascii="Times New Roman" w:hAnsi="Times New Roman" w:cs="Times New Roman"/>
+          <w:lang w:val="en-GB"/>
+        </w:rPr>
+        <w:t>description?:</w:t>
+      </w:r>
+      <w:proofErr w:type="gramEnd"/>
+      <w:r>
+        <w:rPr>
+          <w:rFonts w:ascii="Times New Roman" w:hAnsi="Times New Roman" w:cs="Times New Roman"/>
+          <w:lang w:val="en-GB"/>
+        </w:rPr>
+        <w:t xml:space="preserve"> string;</w:t>
       </w:r>
     </w:p>
     <w:p>
@@ -12619,7 +13127,23 @@
           <w:rFonts w:ascii="Times New Roman" w:hAnsi="Times New Roman" w:cs="Times New Roman"/>
           <w:lang w:val="en-GB"/>
         </w:rPr>
-        <w:t xml:space="preserve">  @IsString()</w:t>
+        <w:t xml:space="preserve">  @</w:t>
+      </w:r>
+      <w:proofErr w:type="gramStart"/>
+      <w:r>
+        <w:rPr>
+          <w:rFonts w:ascii="Times New Roman" w:hAnsi="Times New Roman" w:cs="Times New Roman"/>
+          <w:lang w:val="en-GB"/>
+        </w:rPr>
+        <w:t>IsString(</w:t>
+      </w:r>
+      <w:proofErr w:type="gramEnd"/>
+      <w:r>
+        <w:rPr>
+          <w:rFonts w:ascii="Times New Roman" w:hAnsi="Times New Roman" w:cs="Times New Roman"/>
+          <w:lang w:val="en-GB"/>
+        </w:rPr>
+        <w:t>)</w:t>
       </w:r>
     </w:p>
     <w:p>
@@ -12636,7 +13160,23 @@
           <w:rFonts w:ascii="Times New Roman" w:hAnsi="Times New Roman" w:cs="Times New Roman"/>
           <w:lang w:val="en-GB"/>
         </w:rPr>
-        <w:t xml:space="preserve">  @IsOptional()   # BOLEH KOSONG (</w:t>
+        <w:t xml:space="preserve">  @</w:t>
+      </w:r>
+      <w:proofErr w:type="gramStart"/>
+      <w:r>
+        <w:rPr>
+          <w:rFonts w:ascii="Times New Roman" w:hAnsi="Times New Roman" w:cs="Times New Roman"/>
+          <w:lang w:val="en-GB"/>
+        </w:rPr>
+        <w:t>IsOptional(</w:t>
+      </w:r>
+      <w:proofErr w:type="gramEnd"/>
+      <w:r>
+        <w:rPr>
+          <w:rFonts w:ascii="Times New Roman" w:hAnsi="Times New Roman" w:cs="Times New Roman"/>
+          <w:lang w:val="en-GB"/>
+        </w:rPr>
+        <w:t>)   # BOLEH KOSONG (</w:t>
       </w:r>
       <w:proofErr w:type="spellStart"/>
       <w:r>
@@ -12717,7 +13257,23 @@
           <w:rFonts w:ascii="Times New Roman" w:hAnsi="Times New Roman" w:cs="Times New Roman"/>
           <w:lang w:val="en-GB"/>
         </w:rPr>
-        <w:t xml:space="preserve">  icon?: string;</w:t>
+        <w:t xml:space="preserve">  </w:t>
+      </w:r>
+      <w:proofErr w:type="gramStart"/>
+      <w:r>
+        <w:rPr>
+          <w:rFonts w:ascii="Times New Roman" w:hAnsi="Times New Roman" w:cs="Times New Roman"/>
+          <w:lang w:val="en-GB"/>
+        </w:rPr>
+        <w:t>icon?:</w:t>
+      </w:r>
+      <w:proofErr w:type="gramEnd"/>
+      <w:r>
+        <w:rPr>
+          <w:rFonts w:ascii="Times New Roman" w:hAnsi="Times New Roman" w:cs="Times New Roman"/>
+          <w:lang w:val="en-GB"/>
+        </w:rPr>
+        <w:t xml:space="preserve"> string;</w:t>
       </w:r>
     </w:p>
     <w:p>
@@ -13790,6 +14346,7 @@
         <w:t xml:space="preserve"> </w:t>
       </w:r>
       <w:proofErr w:type="spellStart"/>
+      <w:proofErr w:type="gramStart"/>
       <w:r>
         <w:rPr>
           <w:rFonts w:ascii="Times New Roman" w:hAnsi="Times New Roman" w:cs="Times New Roman"/>
@@ -13814,6 +14371,7 @@
         <w:t>tidak</w:t>
       </w:r>
       <w:proofErr w:type="spellEnd"/>
+      <w:proofErr w:type="gramEnd"/>
       <w:r>
         <w:rPr>
           <w:rFonts w:ascii="Times New Roman" w:hAnsi="Times New Roman" w:cs="Times New Roman"/>
@@ -14046,7 +14604,23 @@
           <w:rFonts w:ascii="Times New Roman" w:hAnsi="Times New Roman" w:cs="Times New Roman"/>
           <w:lang w:val="en-GB"/>
         </w:rPr>
-        <w:t xml:space="preserve"> name?: string) </w:t>
+        <w:t xml:space="preserve"> </w:t>
+      </w:r>
+      <w:proofErr w:type="gramStart"/>
+      <w:r>
+        <w:rPr>
+          <w:rFonts w:ascii="Times New Roman" w:hAnsi="Times New Roman" w:cs="Times New Roman"/>
+          <w:lang w:val="en-GB"/>
+        </w:rPr>
+        <w:t>name?:</w:t>
+      </w:r>
+      <w:proofErr w:type="gramEnd"/>
+      <w:r>
+        <w:rPr>
+          <w:rFonts w:ascii="Times New Roman" w:hAnsi="Times New Roman" w:cs="Times New Roman"/>
+          <w:lang w:val="en-GB"/>
+        </w:rPr>
+        <w:t xml:space="preserve"> string) </w:t>
       </w:r>
       <w:proofErr w:type="spellStart"/>
       <w:r>
@@ -14459,12 +15033,21 @@
           <w:lang w:val="en-GB"/>
         </w:rPr>
       </w:pPr>
-      <w:r>
-        <w:rPr>
-          <w:rFonts w:ascii="Times New Roman" w:hAnsi="Times New Roman" w:cs="Times New Roman"/>
-          <w:lang w:val="en-GB"/>
-        </w:rPr>
-        <w:t xml:space="preserve">File : </w:t>
+      <w:proofErr w:type="gramStart"/>
+      <w:r>
+        <w:rPr>
+          <w:rFonts w:ascii="Times New Roman" w:hAnsi="Times New Roman" w:cs="Times New Roman"/>
+          <w:lang w:val="en-GB"/>
+        </w:rPr>
+        <w:t>File :</w:t>
+      </w:r>
+      <w:proofErr w:type="gramEnd"/>
+      <w:r>
+        <w:rPr>
+          <w:rFonts w:ascii="Times New Roman" w:hAnsi="Times New Roman" w:cs="Times New Roman"/>
+          <w:lang w:val="en-GB"/>
+        </w:rPr>
+        <w:t xml:space="preserve"> </w:t>
       </w:r>
       <w:proofErr w:type="spellStart"/>
       <w:r>
@@ -14581,7 +15164,15 @@
           <w:rFonts w:ascii="Times New Roman" w:hAnsi="Times New Roman" w:cs="Times New Roman"/>
           <w:lang w:val="en-GB"/>
         </w:rPr>
-        <w:t xml:space="preserve">import { </w:t>
+        <w:t xml:space="preserve">import </w:t>
+      </w:r>
+      <w:proofErr w:type="gramStart"/>
+      <w:r>
+        <w:rPr>
+          <w:rFonts w:ascii="Times New Roman" w:hAnsi="Times New Roman" w:cs="Times New Roman"/>
+          <w:lang w:val="en-GB"/>
+        </w:rPr>
+        <w:t xml:space="preserve">{ </w:t>
       </w:r>
       <w:proofErr w:type="spellStart"/>
       <w:r>
@@ -14592,6 +15183,7 @@
         <w:t>ConflictException</w:t>
       </w:r>
       <w:proofErr w:type="spellEnd"/>
+      <w:proofErr w:type="gramEnd"/>
       <w:r>
         <w:rPr>
           <w:rFonts w:ascii="Times New Roman" w:hAnsi="Times New Roman" w:cs="Times New Roman"/>
@@ -15231,6 +15823,7 @@
         <w:t xml:space="preserve">  static </w:t>
       </w:r>
       <w:proofErr w:type="spellStart"/>
+      <w:proofErr w:type="gramStart"/>
       <w:r>
         <w:rPr>
           <w:rFonts w:ascii="Times New Roman" w:hAnsi="Times New Roman" w:cs="Times New Roman"/>
@@ -15244,7 +15837,15 @@
           <w:rFonts w:ascii="Times New Roman" w:hAnsi="Times New Roman" w:cs="Times New Roman"/>
           <w:lang w:val="en-GB"/>
         </w:rPr>
-        <w:t>(name: string): never {</w:t>
+        <w:t>(</w:t>
+      </w:r>
+      <w:proofErr w:type="gramEnd"/>
+      <w:r>
+        <w:rPr>
+          <w:rFonts w:ascii="Times New Roman" w:hAnsi="Times New Roman" w:cs="Times New Roman"/>
+          <w:lang w:val="en-GB"/>
+        </w:rPr>
+        <w:t>name: string): never {</w:t>
       </w:r>
     </w:p>
     <w:p>
@@ -15493,6 +16094,7 @@
         <w:t xml:space="preserve">    throw new </w:t>
       </w:r>
       <w:proofErr w:type="spellStart"/>
+      <w:proofErr w:type="gramStart"/>
       <w:r>
         <w:rPr>
           <w:rFonts w:ascii="Times New Roman" w:hAnsi="Times New Roman" w:cs="Times New Roman"/>
@@ -15508,6 +16110,7 @@
         </w:rPr>
         <w:t>(</w:t>
       </w:r>
+      <w:proofErr w:type="gramEnd"/>
     </w:p>
     <w:p>
       <w:pPr>
@@ -15770,6 +16373,7 @@
         <w:t xml:space="preserve">  static </w:t>
       </w:r>
       <w:proofErr w:type="spellStart"/>
+      <w:proofErr w:type="gramStart"/>
       <w:r>
         <w:rPr>
           <w:rFonts w:ascii="Times New Roman" w:hAnsi="Times New Roman" w:cs="Times New Roman"/>
@@ -15783,7 +16387,15 @@
           <w:rFonts w:ascii="Times New Roman" w:hAnsi="Times New Roman" w:cs="Times New Roman"/>
           <w:lang w:val="en-GB"/>
         </w:rPr>
-        <w:t>(slug: string): never {</w:t>
+        <w:t>(</w:t>
+      </w:r>
+      <w:proofErr w:type="gramEnd"/>
+      <w:r>
+        <w:rPr>
+          <w:rFonts w:ascii="Times New Roman" w:hAnsi="Times New Roman" w:cs="Times New Roman"/>
+          <w:lang w:val="en-GB"/>
+        </w:rPr>
+        <w:t>slug: string): never {</w:t>
       </w:r>
     </w:p>
     <w:p>
@@ -15886,6 +16498,7 @@
         <w:t xml:space="preserve">    throw new </w:t>
       </w:r>
       <w:proofErr w:type="spellStart"/>
+      <w:proofErr w:type="gramStart"/>
       <w:r>
         <w:rPr>
           <w:rFonts w:ascii="Times New Roman" w:hAnsi="Times New Roman" w:cs="Times New Roman"/>
@@ -15901,6 +16514,7 @@
         </w:rPr>
         <w:t>(</w:t>
       </w:r>
+      <w:proofErr w:type="gramEnd"/>
     </w:p>
     <w:p>
       <w:pPr>
@@ -16195,6 +16809,7 @@
         <w:t xml:space="preserve">  static </w:t>
       </w:r>
       <w:proofErr w:type="spellStart"/>
+      <w:proofErr w:type="gramStart"/>
       <w:r>
         <w:rPr>
           <w:rFonts w:ascii="Times New Roman" w:hAnsi="Times New Roman" w:cs="Times New Roman"/>
@@ -16208,7 +16823,15 @@
           <w:rFonts w:ascii="Times New Roman" w:hAnsi="Times New Roman" w:cs="Times New Roman"/>
           <w:lang w:val="en-GB"/>
         </w:rPr>
-        <w:t>(field: string): never {</w:t>
+        <w:t>(</w:t>
+      </w:r>
+      <w:proofErr w:type="gramEnd"/>
+      <w:r>
+        <w:rPr>
+          <w:rFonts w:ascii="Times New Roman" w:hAnsi="Times New Roman" w:cs="Times New Roman"/>
+          <w:lang w:val="en-GB"/>
+        </w:rPr>
+        <w:t>field: string): never {</w:t>
       </w:r>
     </w:p>
     <w:p>
@@ -16230,6 +16853,7 @@
         <w:t xml:space="preserve">    throw new </w:t>
       </w:r>
       <w:proofErr w:type="spellStart"/>
+      <w:proofErr w:type="gramStart"/>
       <w:r>
         <w:rPr>
           <w:rFonts w:ascii="Times New Roman" w:hAnsi="Times New Roman" w:cs="Times New Roman"/>
@@ -16245,6 +16869,7 @@
         </w:rPr>
         <w:t>(</w:t>
       </w:r>
+      <w:proofErr w:type="gramEnd"/>
     </w:p>
     <w:p>
       <w:pPr>
@@ -16730,6 +17355,7 @@
           <w:lang w:val="en-GB"/>
         </w:rPr>
       </w:pPr>
+      <w:proofErr w:type="gramStart"/>
       <w:r>
         <w:rPr>
           <w:rFonts w:ascii="Times New Roman" w:hAnsi="Times New Roman" w:cs="Times New Roman"/>
@@ -16744,7 +17370,17 @@
           <w:bCs/>
           <w:lang w:val="en-GB"/>
         </w:rPr>
-        <w:t xml:space="preserve"> : </w:t>
+        <w:t xml:space="preserve"> :</w:t>
+      </w:r>
+      <w:proofErr w:type="gramEnd"/>
+      <w:r>
+        <w:rPr>
+          <w:rFonts w:ascii="Times New Roman" w:hAnsi="Times New Roman" w:cs="Times New Roman"/>
+          <w:b/>
+          <w:bCs/>
+          <w:lang w:val="en-GB"/>
+        </w:rPr>
+        <w:t xml:space="preserve"> </w:t>
       </w:r>
       <w:proofErr w:type="spellStart"/>
       <w:r>
@@ -17034,6 +17670,7 @@
         <w:t xml:space="preserve"> </w:t>
       </w:r>
       <w:proofErr w:type="spellStart"/>
+      <w:proofErr w:type="gramStart"/>
       <w:r>
         <w:rPr>
           <w:rFonts w:ascii="Times New Roman" w:hAnsi="Times New Roman" w:cs="Times New Roman"/>
@@ -17049,6 +17686,7 @@
         </w:rPr>
         <w:t xml:space="preserve"> :</w:t>
       </w:r>
+      <w:proofErr w:type="gramEnd"/>
     </w:p>
     <w:p>
       <w:pPr>
@@ -17880,6 +18518,1068 @@
         </w:rPr>
         <w:lastRenderedPageBreak/>
         <w:t xml:space="preserve">17. </w:t>
+      </w:r>
+      <w:proofErr w:type="spellStart"/>
+      <w:r>
+        <w:rPr>
+          <w:rFonts w:ascii="Times New Roman" w:hAnsi="Times New Roman" w:cs="Times New Roman"/>
+          <w:lang w:val="en-GB"/>
+        </w:rPr>
+        <w:t>Membuat</w:t>
+      </w:r>
+      <w:proofErr w:type="spellEnd"/>
+      <w:r>
+        <w:rPr>
+          <w:rFonts w:ascii="Times New Roman" w:hAnsi="Times New Roman" w:cs="Times New Roman"/>
+          <w:lang w:val="en-GB"/>
+        </w:rPr>
+        <w:t xml:space="preserve"> </w:t>
+      </w:r>
+      <w:proofErr w:type="spellStart"/>
+      <w:r>
+        <w:rPr>
+          <w:rFonts w:ascii="Times New Roman" w:hAnsi="Times New Roman" w:cs="Times New Roman"/>
+          <w:lang w:val="en-GB"/>
+        </w:rPr>
+        <w:t>Kategori</w:t>
+      </w:r>
+      <w:proofErr w:type="spellEnd"/>
+      <w:r>
+        <w:rPr>
+          <w:rFonts w:ascii="Times New Roman" w:hAnsi="Times New Roman" w:cs="Times New Roman"/>
+          <w:lang w:val="en-GB"/>
+        </w:rPr>
+        <w:t xml:space="preserve"> Service</w:t>
+      </w:r>
+    </w:p>
+    <w:p>
+      <w:pPr>
+        <w:jc w:val="both"/>
+      </w:pPr>
+      <w:proofErr w:type="gramStart"/>
+      <w:r>
+        <w:rPr>
+          <w:rFonts w:ascii="Times New Roman" w:hAnsi="Times New Roman" w:cs="Times New Roman"/>
+          <w:lang w:val="en-GB"/>
+        </w:rPr>
+        <w:t>File :</w:t>
+      </w:r>
+      <w:proofErr w:type="gramEnd"/>
+      <w:r>
+        <w:rPr>
+          <w:rFonts w:ascii="Times New Roman" w:hAnsi="Times New Roman" w:cs="Times New Roman"/>
+          <w:lang w:val="en-GB"/>
+        </w:rPr>
+        <w:t xml:space="preserve"> </w:t>
+      </w:r>
+      <w:proofErr w:type="spellStart"/>
+      <w:r>
+        <w:t>src</w:t>
+      </w:r>
+      <w:proofErr w:type="spellEnd"/>
+      <w:r>
+        <w:t>/services/</w:t>
+      </w:r>
+      <w:proofErr w:type="spellStart"/>
+      <w:r>
+        <w:t>kategori</w:t>
+      </w:r>
+      <w:proofErr w:type="spellEnd"/>
+      <w:r>
+        <w:t>/</w:t>
+      </w:r>
+      <w:proofErr w:type="spellStart"/>
+      <w:r>
+        <w:t>kategori.service.ts</w:t>
+      </w:r>
+      <w:proofErr w:type="spellEnd"/>
+    </w:p>
+    <w:p>
+      <w:pPr>
+        <w:jc w:val="both"/>
+        <w:rPr>
+          <w:rFonts w:ascii="Times New Roman" w:hAnsi="Times New Roman" w:cs="Times New Roman"/>
+          <w:lang w:val="en-GB"/>
+        </w:rPr>
+      </w:pPr>
+      <w:r>
+        <w:rPr>
+          <w:noProof/>
+        </w:rPr>
+        <w:drawing>
+          <wp:inline distT="0" distB="0" distL="0" distR="0" wp14:anchorId="5597E38E" wp14:editId="2A29ACED">
+            <wp:extent cx="5731510" cy="3222625"/>
+            <wp:effectExtent l="0" t="0" r="2540" b="0"/>
+            <wp:docPr id="253779688" name="Picture 1"/>
+            <wp:cNvGraphicFramePr>
+              <a:graphicFrameLocks xmlns:a="http://schemas.openxmlformats.org/drawingml/2006/main" noChangeAspect="1"/>
+            </wp:cNvGraphicFramePr>
+            <a:graphic xmlns:a="http://schemas.openxmlformats.org/drawingml/2006/main">
+              <a:graphicData uri="http://schemas.openxmlformats.org/drawingml/2006/picture">
+                <pic:pic xmlns:pic="http://schemas.openxmlformats.org/drawingml/2006/picture">
+                  <pic:nvPicPr>
+                    <pic:cNvPr id="253779688" name=""/>
+                    <pic:cNvPicPr/>
+                  </pic:nvPicPr>
+                  <pic:blipFill>
+                    <a:blip r:embed="rId21"/>
+                    <a:stretch>
+                      <a:fillRect/>
+                    </a:stretch>
+                  </pic:blipFill>
+                  <pic:spPr>
+                    <a:xfrm>
+                      <a:off x="0" y="0"/>
+                      <a:ext cx="5731510" cy="3222625"/>
+                    </a:xfrm>
+                    <a:prstGeom prst="rect">
+                      <a:avLst/>
+                    </a:prstGeom>
+                  </pic:spPr>
+                </pic:pic>
+              </a:graphicData>
+            </a:graphic>
+          </wp:inline>
+        </w:drawing>
+      </w:r>
+    </w:p>
+    <w:p>
+      <w:pPr>
+        <w:jc w:val="both"/>
+        <w:rPr>
+          <w:rFonts w:ascii="Times New Roman" w:hAnsi="Times New Roman" w:cs="Times New Roman"/>
+          <w:lang w:val="en-GB"/>
+        </w:rPr>
+      </w:pPr>
+      <w:proofErr w:type="spellStart"/>
+      <w:r>
+        <w:rPr>
+          <w:rFonts w:ascii="Times New Roman" w:hAnsi="Times New Roman" w:cs="Times New Roman"/>
+          <w:lang w:val="en-GB"/>
+        </w:rPr>
+        <w:t>KategoriService</w:t>
+      </w:r>
+      <w:proofErr w:type="spellEnd"/>
+      <w:r>
+        <w:rPr>
+          <w:rFonts w:ascii="Times New Roman" w:hAnsi="Times New Roman" w:cs="Times New Roman"/>
+          <w:lang w:val="en-GB"/>
+        </w:rPr>
+        <w:t xml:space="preserve"> </w:t>
+      </w:r>
+      <w:proofErr w:type="spellStart"/>
+      <w:r>
+        <w:rPr>
+          <w:rFonts w:ascii="Times New Roman" w:hAnsi="Times New Roman" w:cs="Times New Roman"/>
+          <w:lang w:val="en-GB"/>
+        </w:rPr>
+        <w:t>adalah</w:t>
+      </w:r>
+      <w:proofErr w:type="spellEnd"/>
+      <w:r>
+        <w:rPr>
+          <w:rFonts w:ascii="Times New Roman" w:hAnsi="Times New Roman" w:cs="Times New Roman"/>
+          <w:lang w:val="en-GB"/>
+        </w:rPr>
+        <w:t xml:space="preserve"> class yang </w:t>
+      </w:r>
+      <w:proofErr w:type="spellStart"/>
+      <w:r>
+        <w:rPr>
+          <w:rFonts w:ascii="Times New Roman" w:hAnsi="Times New Roman" w:cs="Times New Roman"/>
+          <w:lang w:val="en-GB"/>
+        </w:rPr>
+        <w:t>menangani</w:t>
+      </w:r>
+      <w:proofErr w:type="spellEnd"/>
+      <w:r>
+        <w:rPr>
+          <w:rFonts w:ascii="Times New Roman" w:hAnsi="Times New Roman" w:cs="Times New Roman"/>
+          <w:lang w:val="en-GB"/>
+        </w:rPr>
+        <w:t xml:space="preserve"> </w:t>
+      </w:r>
+      <w:proofErr w:type="spellStart"/>
+      <w:r>
+        <w:rPr>
+          <w:rFonts w:ascii="Times New Roman" w:hAnsi="Times New Roman" w:cs="Times New Roman"/>
+          <w:lang w:val="en-GB"/>
+        </w:rPr>
+        <w:t>logika</w:t>
+      </w:r>
+      <w:proofErr w:type="spellEnd"/>
+      <w:r>
+        <w:rPr>
+          <w:rFonts w:ascii="Times New Roman" w:hAnsi="Times New Roman" w:cs="Times New Roman"/>
+          <w:lang w:val="en-GB"/>
+        </w:rPr>
+        <w:t xml:space="preserve"> </w:t>
+      </w:r>
+      <w:proofErr w:type="spellStart"/>
+      <w:r>
+        <w:rPr>
+          <w:rFonts w:ascii="Times New Roman" w:hAnsi="Times New Roman" w:cs="Times New Roman"/>
+          <w:lang w:val="en-GB"/>
+        </w:rPr>
+        <w:t>bisnis</w:t>
+      </w:r>
+      <w:proofErr w:type="spellEnd"/>
+      <w:r>
+        <w:rPr>
+          <w:rFonts w:ascii="Times New Roman" w:hAnsi="Times New Roman" w:cs="Times New Roman"/>
+          <w:lang w:val="en-GB"/>
+        </w:rPr>
+        <w:t xml:space="preserve"> (CRUD) </w:t>
+      </w:r>
+      <w:proofErr w:type="spellStart"/>
+      <w:r>
+        <w:rPr>
+          <w:rFonts w:ascii="Times New Roman" w:hAnsi="Times New Roman" w:cs="Times New Roman"/>
+          <w:lang w:val="en-GB"/>
+        </w:rPr>
+        <w:t>untuk</w:t>
+      </w:r>
+      <w:proofErr w:type="spellEnd"/>
+      <w:r>
+        <w:rPr>
+          <w:rFonts w:ascii="Times New Roman" w:hAnsi="Times New Roman" w:cs="Times New Roman"/>
+          <w:lang w:val="en-GB"/>
+        </w:rPr>
+        <w:t xml:space="preserve"> data </w:t>
+      </w:r>
+      <w:proofErr w:type="spellStart"/>
+      <w:r>
+        <w:rPr>
+          <w:rFonts w:ascii="Times New Roman" w:hAnsi="Times New Roman" w:cs="Times New Roman"/>
+          <w:lang w:val="en-GB"/>
+        </w:rPr>
+        <w:t>kategori</w:t>
+      </w:r>
+      <w:proofErr w:type="spellEnd"/>
+      <w:r>
+        <w:rPr>
+          <w:rFonts w:ascii="Times New Roman" w:hAnsi="Times New Roman" w:cs="Times New Roman"/>
+          <w:lang w:val="en-GB"/>
+        </w:rPr>
+        <w:t xml:space="preserve">. </w:t>
+      </w:r>
+      <w:proofErr w:type="spellStart"/>
+      <w:r>
+        <w:rPr>
+          <w:rFonts w:ascii="Times New Roman" w:hAnsi="Times New Roman" w:cs="Times New Roman"/>
+          <w:lang w:val="en-GB"/>
+        </w:rPr>
+        <w:t>Fungsinya</w:t>
+      </w:r>
+      <w:proofErr w:type="spellEnd"/>
+      <w:r>
+        <w:rPr>
+          <w:rFonts w:ascii="Times New Roman" w:hAnsi="Times New Roman" w:cs="Times New Roman"/>
+          <w:lang w:val="en-GB"/>
+        </w:rPr>
+        <w:t xml:space="preserve"> </w:t>
+      </w:r>
+      <w:proofErr w:type="spellStart"/>
+      <w:r>
+        <w:rPr>
+          <w:rFonts w:ascii="Times New Roman" w:hAnsi="Times New Roman" w:cs="Times New Roman"/>
+          <w:lang w:val="en-GB"/>
+        </w:rPr>
+        <w:t>meliputi</w:t>
+      </w:r>
+      <w:proofErr w:type="spellEnd"/>
+      <w:r>
+        <w:rPr>
+          <w:rFonts w:ascii="Times New Roman" w:hAnsi="Times New Roman" w:cs="Times New Roman"/>
+          <w:lang w:val="en-GB"/>
+        </w:rPr>
+        <w:t>:</w:t>
+      </w:r>
+    </w:p>
+    <w:p>
+      <w:pPr>
+        <w:pStyle w:val="ListParagraph"/>
+        <w:numPr>
+          <w:ilvl w:val="0"/>
+          <w:numId w:val="10"/>
+        </w:numPr>
+        <w:jc w:val="both"/>
+        <w:rPr>
+          <w:rFonts w:ascii="Times New Roman" w:hAnsi="Times New Roman" w:cs="Times New Roman"/>
+          <w:lang w:val="en-GB"/>
+        </w:rPr>
+      </w:pPr>
+      <w:r>
+        <w:rPr>
+          <w:rFonts w:ascii="Times New Roman" w:hAnsi="Times New Roman" w:cs="Times New Roman"/>
+          <w:lang w:val="en-GB"/>
+        </w:rPr>
+        <w:t xml:space="preserve">Create: </w:t>
+      </w:r>
+      <w:proofErr w:type="spellStart"/>
+      <w:r>
+        <w:rPr>
+          <w:rFonts w:ascii="Times New Roman" w:hAnsi="Times New Roman" w:cs="Times New Roman"/>
+          <w:lang w:val="en-GB"/>
+        </w:rPr>
+        <w:t>Menambah</w:t>
+      </w:r>
+      <w:proofErr w:type="spellEnd"/>
+      <w:r>
+        <w:rPr>
+          <w:rFonts w:ascii="Times New Roman" w:hAnsi="Times New Roman" w:cs="Times New Roman"/>
+          <w:lang w:val="en-GB"/>
+        </w:rPr>
+        <w:t xml:space="preserve"> </w:t>
+      </w:r>
+      <w:proofErr w:type="spellStart"/>
+      <w:r>
+        <w:rPr>
+          <w:rFonts w:ascii="Times New Roman" w:hAnsi="Times New Roman" w:cs="Times New Roman"/>
+          <w:lang w:val="en-GB"/>
+        </w:rPr>
+        <w:t>kategori</w:t>
+      </w:r>
+      <w:proofErr w:type="spellEnd"/>
+      <w:r>
+        <w:rPr>
+          <w:rFonts w:ascii="Times New Roman" w:hAnsi="Times New Roman" w:cs="Times New Roman"/>
+          <w:lang w:val="en-GB"/>
+        </w:rPr>
+        <w:t xml:space="preserve"> </w:t>
+      </w:r>
+      <w:proofErr w:type="spellStart"/>
+      <w:r>
+        <w:rPr>
+          <w:rFonts w:ascii="Times New Roman" w:hAnsi="Times New Roman" w:cs="Times New Roman"/>
+          <w:lang w:val="en-GB"/>
+        </w:rPr>
+        <w:t>baru</w:t>
+      </w:r>
+      <w:proofErr w:type="spellEnd"/>
+      <w:r>
+        <w:rPr>
+          <w:rFonts w:ascii="Times New Roman" w:hAnsi="Times New Roman" w:cs="Times New Roman"/>
+          <w:lang w:val="en-GB"/>
+        </w:rPr>
+        <w:t xml:space="preserve"> </w:t>
+      </w:r>
+      <w:proofErr w:type="spellStart"/>
+      <w:r>
+        <w:rPr>
+          <w:rFonts w:ascii="Times New Roman" w:hAnsi="Times New Roman" w:cs="Times New Roman"/>
+          <w:lang w:val="en-GB"/>
+        </w:rPr>
+        <w:t>dengan</w:t>
+      </w:r>
+      <w:proofErr w:type="spellEnd"/>
+      <w:r>
+        <w:rPr>
+          <w:rFonts w:ascii="Times New Roman" w:hAnsi="Times New Roman" w:cs="Times New Roman"/>
+          <w:lang w:val="en-GB"/>
+        </w:rPr>
+        <w:t xml:space="preserve"> </w:t>
+      </w:r>
+      <w:proofErr w:type="spellStart"/>
+      <w:r>
+        <w:rPr>
+          <w:rFonts w:ascii="Times New Roman" w:hAnsi="Times New Roman" w:cs="Times New Roman"/>
+          <w:lang w:val="en-GB"/>
+        </w:rPr>
+        <w:t>validasi</w:t>
+      </w:r>
+      <w:proofErr w:type="spellEnd"/>
+      <w:r>
+        <w:rPr>
+          <w:rFonts w:ascii="Times New Roman" w:hAnsi="Times New Roman" w:cs="Times New Roman"/>
+          <w:lang w:val="en-GB"/>
+        </w:rPr>
+        <w:t xml:space="preserve"> agar name dan slug </w:t>
+      </w:r>
+      <w:proofErr w:type="spellStart"/>
+      <w:r>
+        <w:rPr>
+          <w:rFonts w:ascii="Times New Roman" w:hAnsi="Times New Roman" w:cs="Times New Roman"/>
+          <w:lang w:val="en-GB"/>
+        </w:rPr>
+        <w:t>tidak</w:t>
+      </w:r>
+      <w:proofErr w:type="spellEnd"/>
+      <w:r>
+        <w:rPr>
+          <w:rFonts w:ascii="Times New Roman" w:hAnsi="Times New Roman" w:cs="Times New Roman"/>
+          <w:lang w:val="en-GB"/>
+        </w:rPr>
+        <w:t xml:space="preserve"> </w:t>
+      </w:r>
+      <w:proofErr w:type="spellStart"/>
+      <w:r>
+        <w:rPr>
+          <w:rFonts w:ascii="Times New Roman" w:hAnsi="Times New Roman" w:cs="Times New Roman"/>
+          <w:lang w:val="en-GB"/>
+        </w:rPr>
+        <w:t>duplikat</w:t>
+      </w:r>
+      <w:proofErr w:type="spellEnd"/>
+      <w:r>
+        <w:rPr>
+          <w:rFonts w:ascii="Times New Roman" w:hAnsi="Times New Roman" w:cs="Times New Roman"/>
+          <w:lang w:val="en-GB"/>
+        </w:rPr>
+        <w:t>.</w:t>
+      </w:r>
+    </w:p>
+    <w:p>
+      <w:pPr>
+        <w:pStyle w:val="ListParagraph"/>
+        <w:numPr>
+          <w:ilvl w:val="0"/>
+          <w:numId w:val="10"/>
+        </w:numPr>
+        <w:jc w:val="both"/>
+        <w:rPr>
+          <w:rFonts w:ascii="Times New Roman" w:hAnsi="Times New Roman" w:cs="Times New Roman"/>
+          <w:lang w:val="en-GB"/>
+        </w:rPr>
+      </w:pPr>
+      <w:r>
+        <w:rPr>
+          <w:rFonts w:ascii="Times New Roman" w:hAnsi="Times New Roman" w:cs="Times New Roman"/>
+          <w:lang w:val="en-GB"/>
+        </w:rPr>
+        <w:t xml:space="preserve">Read: </w:t>
+      </w:r>
+      <w:proofErr w:type="spellStart"/>
+      <w:r>
+        <w:rPr>
+          <w:rFonts w:ascii="Times New Roman" w:hAnsi="Times New Roman" w:cs="Times New Roman"/>
+          <w:lang w:val="en-GB"/>
+        </w:rPr>
+        <w:t>Mengambil</w:t>
+      </w:r>
+      <w:proofErr w:type="spellEnd"/>
+      <w:r>
+        <w:rPr>
+          <w:rFonts w:ascii="Times New Roman" w:hAnsi="Times New Roman" w:cs="Times New Roman"/>
+          <w:lang w:val="en-GB"/>
+        </w:rPr>
+        <w:t xml:space="preserve"> </w:t>
+      </w:r>
+      <w:proofErr w:type="spellStart"/>
+      <w:r>
+        <w:rPr>
+          <w:rFonts w:ascii="Times New Roman" w:hAnsi="Times New Roman" w:cs="Times New Roman"/>
+          <w:lang w:val="en-GB"/>
+        </w:rPr>
+        <w:t>semua</w:t>
+      </w:r>
+      <w:proofErr w:type="spellEnd"/>
+      <w:r>
+        <w:rPr>
+          <w:rFonts w:ascii="Times New Roman" w:hAnsi="Times New Roman" w:cs="Times New Roman"/>
+          <w:lang w:val="en-GB"/>
+        </w:rPr>
+        <w:t xml:space="preserve"> data </w:t>
+      </w:r>
+      <w:proofErr w:type="spellStart"/>
+      <w:r>
+        <w:rPr>
+          <w:rFonts w:ascii="Times New Roman" w:hAnsi="Times New Roman" w:cs="Times New Roman"/>
+          <w:lang w:val="en-GB"/>
+        </w:rPr>
+        <w:t>atau</w:t>
+      </w:r>
+      <w:proofErr w:type="spellEnd"/>
+      <w:r>
+        <w:rPr>
+          <w:rFonts w:ascii="Times New Roman" w:hAnsi="Times New Roman" w:cs="Times New Roman"/>
+          <w:lang w:val="en-GB"/>
+        </w:rPr>
+        <w:t xml:space="preserve"> </w:t>
+      </w:r>
+      <w:proofErr w:type="spellStart"/>
+      <w:r>
+        <w:rPr>
+          <w:rFonts w:ascii="Times New Roman" w:hAnsi="Times New Roman" w:cs="Times New Roman"/>
+          <w:lang w:val="en-GB"/>
+        </w:rPr>
+        <w:t>mencari</w:t>
+      </w:r>
+      <w:proofErr w:type="spellEnd"/>
+      <w:r>
+        <w:rPr>
+          <w:rFonts w:ascii="Times New Roman" w:hAnsi="Times New Roman" w:cs="Times New Roman"/>
+          <w:lang w:val="en-GB"/>
+        </w:rPr>
+        <w:t xml:space="preserve"> data </w:t>
+      </w:r>
+      <w:proofErr w:type="spellStart"/>
+      <w:r>
+        <w:rPr>
+          <w:rFonts w:ascii="Times New Roman" w:hAnsi="Times New Roman" w:cs="Times New Roman"/>
+          <w:lang w:val="en-GB"/>
+        </w:rPr>
+        <w:t>spesifik</w:t>
+      </w:r>
+      <w:proofErr w:type="spellEnd"/>
+      <w:r>
+        <w:rPr>
+          <w:rFonts w:ascii="Times New Roman" w:hAnsi="Times New Roman" w:cs="Times New Roman"/>
+          <w:lang w:val="en-GB"/>
+        </w:rPr>
+        <w:t xml:space="preserve"> (</w:t>
+      </w:r>
+      <w:proofErr w:type="spellStart"/>
+      <w:r>
+        <w:rPr>
+          <w:rFonts w:ascii="Times New Roman" w:hAnsi="Times New Roman" w:cs="Times New Roman"/>
+          <w:lang w:val="en-GB"/>
+        </w:rPr>
+        <w:t>berdasarkan</w:t>
+      </w:r>
+      <w:proofErr w:type="spellEnd"/>
+      <w:r>
+        <w:rPr>
+          <w:rFonts w:ascii="Times New Roman" w:hAnsi="Times New Roman" w:cs="Times New Roman"/>
+          <w:lang w:val="en-GB"/>
+        </w:rPr>
+        <w:t xml:space="preserve"> ID/Slug) </w:t>
+      </w:r>
+      <w:proofErr w:type="spellStart"/>
+      <w:r>
+        <w:rPr>
+          <w:rFonts w:ascii="Times New Roman" w:hAnsi="Times New Roman" w:cs="Times New Roman"/>
+          <w:lang w:val="en-GB"/>
+        </w:rPr>
+        <w:t>dengan</w:t>
+      </w:r>
+      <w:proofErr w:type="spellEnd"/>
+      <w:r>
+        <w:rPr>
+          <w:rFonts w:ascii="Times New Roman" w:hAnsi="Times New Roman" w:cs="Times New Roman"/>
+          <w:lang w:val="en-GB"/>
+        </w:rPr>
+        <w:t xml:space="preserve"> </w:t>
+      </w:r>
+      <w:proofErr w:type="spellStart"/>
+      <w:r>
+        <w:rPr>
+          <w:rFonts w:ascii="Times New Roman" w:hAnsi="Times New Roman" w:cs="Times New Roman"/>
+          <w:lang w:val="en-GB"/>
+        </w:rPr>
+        <w:t>proteksi</w:t>
+      </w:r>
+      <w:proofErr w:type="spellEnd"/>
+      <w:r>
+        <w:rPr>
+          <w:rFonts w:ascii="Times New Roman" w:hAnsi="Times New Roman" w:cs="Times New Roman"/>
+          <w:lang w:val="en-GB"/>
+        </w:rPr>
+        <w:t xml:space="preserve"> error 404 </w:t>
+      </w:r>
+      <w:proofErr w:type="spellStart"/>
+      <w:r>
+        <w:rPr>
+          <w:rFonts w:ascii="Times New Roman" w:hAnsi="Times New Roman" w:cs="Times New Roman"/>
+          <w:lang w:val="en-GB"/>
+        </w:rPr>
+        <w:t>jika</w:t>
+      </w:r>
+      <w:proofErr w:type="spellEnd"/>
+      <w:r>
+        <w:rPr>
+          <w:rFonts w:ascii="Times New Roman" w:hAnsi="Times New Roman" w:cs="Times New Roman"/>
+          <w:lang w:val="en-GB"/>
+        </w:rPr>
+        <w:t xml:space="preserve"> </w:t>
+      </w:r>
+      <w:proofErr w:type="spellStart"/>
+      <w:r>
+        <w:rPr>
+          <w:rFonts w:ascii="Times New Roman" w:hAnsi="Times New Roman" w:cs="Times New Roman"/>
+          <w:lang w:val="en-GB"/>
+        </w:rPr>
+        <w:t>tidak</w:t>
+      </w:r>
+      <w:proofErr w:type="spellEnd"/>
+      <w:r>
+        <w:rPr>
+          <w:rFonts w:ascii="Times New Roman" w:hAnsi="Times New Roman" w:cs="Times New Roman"/>
+          <w:lang w:val="en-GB"/>
+        </w:rPr>
+        <w:t xml:space="preserve"> </w:t>
+      </w:r>
+      <w:proofErr w:type="spellStart"/>
+      <w:r>
+        <w:rPr>
+          <w:rFonts w:ascii="Times New Roman" w:hAnsi="Times New Roman" w:cs="Times New Roman"/>
+          <w:lang w:val="en-GB"/>
+        </w:rPr>
+        <w:t>ditemukan</w:t>
+      </w:r>
+      <w:proofErr w:type="spellEnd"/>
+      <w:r>
+        <w:rPr>
+          <w:rFonts w:ascii="Times New Roman" w:hAnsi="Times New Roman" w:cs="Times New Roman"/>
+          <w:lang w:val="en-GB"/>
+        </w:rPr>
+        <w:t>.</w:t>
+      </w:r>
+    </w:p>
+    <w:p>
+      <w:pPr>
+        <w:pStyle w:val="ListParagraph"/>
+        <w:numPr>
+          <w:ilvl w:val="0"/>
+          <w:numId w:val="10"/>
+        </w:numPr>
+        <w:jc w:val="both"/>
+        <w:rPr>
+          <w:rFonts w:ascii="Times New Roman" w:hAnsi="Times New Roman" w:cs="Times New Roman"/>
+          <w:lang w:val="en-GB"/>
+        </w:rPr>
+      </w:pPr>
+      <w:r>
+        <w:rPr>
+          <w:rFonts w:ascii="Times New Roman" w:hAnsi="Times New Roman" w:cs="Times New Roman"/>
+          <w:lang w:val="en-GB"/>
+        </w:rPr>
+        <w:t xml:space="preserve">Update: </w:t>
+      </w:r>
+      <w:proofErr w:type="spellStart"/>
+      <w:r>
+        <w:rPr>
+          <w:rFonts w:ascii="Times New Roman" w:hAnsi="Times New Roman" w:cs="Times New Roman"/>
+          <w:lang w:val="en-GB"/>
+        </w:rPr>
+        <w:t>Memperbarui</w:t>
+      </w:r>
+      <w:proofErr w:type="spellEnd"/>
+      <w:r>
+        <w:rPr>
+          <w:rFonts w:ascii="Times New Roman" w:hAnsi="Times New Roman" w:cs="Times New Roman"/>
+          <w:lang w:val="en-GB"/>
+        </w:rPr>
+        <w:t xml:space="preserve"> data </w:t>
+      </w:r>
+      <w:proofErr w:type="spellStart"/>
+      <w:r>
+        <w:rPr>
+          <w:rFonts w:ascii="Times New Roman" w:hAnsi="Times New Roman" w:cs="Times New Roman"/>
+          <w:lang w:val="en-GB"/>
+        </w:rPr>
+        <w:t>kategori</w:t>
+      </w:r>
+      <w:proofErr w:type="spellEnd"/>
+      <w:r>
+        <w:rPr>
+          <w:rFonts w:ascii="Times New Roman" w:hAnsi="Times New Roman" w:cs="Times New Roman"/>
+          <w:lang w:val="en-GB"/>
+        </w:rPr>
+        <w:t xml:space="preserve"> </w:t>
+      </w:r>
+      <w:proofErr w:type="spellStart"/>
+      <w:r>
+        <w:rPr>
+          <w:rFonts w:ascii="Times New Roman" w:hAnsi="Times New Roman" w:cs="Times New Roman"/>
+          <w:lang w:val="en-GB"/>
+        </w:rPr>
+        <w:t>dengan</w:t>
+      </w:r>
+      <w:proofErr w:type="spellEnd"/>
+      <w:r>
+        <w:rPr>
+          <w:rFonts w:ascii="Times New Roman" w:hAnsi="Times New Roman" w:cs="Times New Roman"/>
+          <w:lang w:val="en-GB"/>
+        </w:rPr>
+        <w:t xml:space="preserve"> </w:t>
+      </w:r>
+      <w:proofErr w:type="spellStart"/>
+      <w:r>
+        <w:rPr>
+          <w:rFonts w:ascii="Times New Roman" w:hAnsi="Times New Roman" w:cs="Times New Roman"/>
+          <w:lang w:val="en-GB"/>
+        </w:rPr>
+        <w:t>pengecekan</w:t>
+      </w:r>
+      <w:proofErr w:type="spellEnd"/>
+      <w:r>
+        <w:rPr>
+          <w:rFonts w:ascii="Times New Roman" w:hAnsi="Times New Roman" w:cs="Times New Roman"/>
+          <w:lang w:val="en-GB"/>
+        </w:rPr>
+        <w:t xml:space="preserve"> </w:t>
+      </w:r>
+      <w:proofErr w:type="spellStart"/>
+      <w:r>
+        <w:rPr>
+          <w:rFonts w:ascii="Times New Roman" w:hAnsi="Times New Roman" w:cs="Times New Roman"/>
+          <w:lang w:val="en-GB"/>
+        </w:rPr>
+        <w:t>apakah</w:t>
+      </w:r>
+      <w:proofErr w:type="spellEnd"/>
+      <w:r>
+        <w:rPr>
+          <w:rFonts w:ascii="Times New Roman" w:hAnsi="Times New Roman" w:cs="Times New Roman"/>
+          <w:lang w:val="en-GB"/>
+        </w:rPr>
+        <w:t xml:space="preserve"> data yang </w:t>
+      </w:r>
+      <w:proofErr w:type="spellStart"/>
+      <w:r>
+        <w:rPr>
+          <w:rFonts w:ascii="Times New Roman" w:hAnsi="Times New Roman" w:cs="Times New Roman"/>
+          <w:lang w:val="en-GB"/>
+        </w:rPr>
+        <w:t>diubah</w:t>
+      </w:r>
+      <w:proofErr w:type="spellEnd"/>
+      <w:r>
+        <w:rPr>
+          <w:rFonts w:ascii="Times New Roman" w:hAnsi="Times New Roman" w:cs="Times New Roman"/>
+          <w:lang w:val="en-GB"/>
+        </w:rPr>
+        <w:t xml:space="preserve"> </w:t>
+      </w:r>
+      <w:proofErr w:type="spellStart"/>
+      <w:r>
+        <w:rPr>
+          <w:rFonts w:ascii="Times New Roman" w:hAnsi="Times New Roman" w:cs="Times New Roman"/>
+          <w:lang w:val="en-GB"/>
+        </w:rPr>
+        <w:t>bentrok</w:t>
+      </w:r>
+      <w:proofErr w:type="spellEnd"/>
+      <w:r>
+        <w:rPr>
+          <w:rFonts w:ascii="Times New Roman" w:hAnsi="Times New Roman" w:cs="Times New Roman"/>
+          <w:lang w:val="en-GB"/>
+        </w:rPr>
+        <w:t xml:space="preserve"> </w:t>
+      </w:r>
+      <w:proofErr w:type="spellStart"/>
+      <w:r>
+        <w:rPr>
+          <w:rFonts w:ascii="Times New Roman" w:hAnsi="Times New Roman" w:cs="Times New Roman"/>
+          <w:lang w:val="en-GB"/>
+        </w:rPr>
+        <w:t>dengan</w:t>
+      </w:r>
+      <w:proofErr w:type="spellEnd"/>
+      <w:r>
+        <w:rPr>
+          <w:rFonts w:ascii="Times New Roman" w:hAnsi="Times New Roman" w:cs="Times New Roman"/>
+          <w:lang w:val="en-GB"/>
+        </w:rPr>
+        <w:t xml:space="preserve"> data lain.</w:t>
+      </w:r>
+    </w:p>
+    <w:p>
+      <w:pPr>
+        <w:pStyle w:val="ListParagraph"/>
+        <w:numPr>
+          <w:ilvl w:val="0"/>
+          <w:numId w:val="10"/>
+        </w:numPr>
+        <w:jc w:val="both"/>
+        <w:rPr>
+          <w:rFonts w:ascii="Times New Roman" w:hAnsi="Times New Roman" w:cs="Times New Roman"/>
+          <w:lang w:val="en-GB"/>
+        </w:rPr>
+      </w:pPr>
+      <w:r>
+        <w:rPr>
+          <w:rFonts w:ascii="Times New Roman" w:hAnsi="Times New Roman" w:cs="Times New Roman"/>
+          <w:lang w:val="en-GB"/>
+        </w:rPr>
+        <w:t xml:space="preserve">Delete: </w:t>
+      </w:r>
+      <w:proofErr w:type="spellStart"/>
+      <w:r>
+        <w:rPr>
+          <w:rFonts w:ascii="Times New Roman" w:hAnsi="Times New Roman" w:cs="Times New Roman"/>
+          <w:lang w:val="en-GB"/>
+        </w:rPr>
+        <w:t>Menghapus</w:t>
+      </w:r>
+      <w:proofErr w:type="spellEnd"/>
+      <w:r>
+        <w:rPr>
+          <w:rFonts w:ascii="Times New Roman" w:hAnsi="Times New Roman" w:cs="Times New Roman"/>
+          <w:lang w:val="en-GB"/>
+        </w:rPr>
+        <w:t xml:space="preserve"> data </w:t>
+      </w:r>
+      <w:proofErr w:type="spellStart"/>
+      <w:r>
+        <w:rPr>
+          <w:rFonts w:ascii="Times New Roman" w:hAnsi="Times New Roman" w:cs="Times New Roman"/>
+          <w:lang w:val="en-GB"/>
+        </w:rPr>
+        <w:t>kategori</w:t>
+      </w:r>
+      <w:proofErr w:type="spellEnd"/>
+      <w:r>
+        <w:rPr>
+          <w:rFonts w:ascii="Times New Roman" w:hAnsi="Times New Roman" w:cs="Times New Roman"/>
+          <w:lang w:val="en-GB"/>
+        </w:rPr>
+        <w:t xml:space="preserve"> </w:t>
+      </w:r>
+      <w:proofErr w:type="spellStart"/>
+      <w:r>
+        <w:rPr>
+          <w:rFonts w:ascii="Times New Roman" w:hAnsi="Times New Roman" w:cs="Times New Roman"/>
+          <w:lang w:val="en-GB"/>
+        </w:rPr>
+        <w:t>setelah</w:t>
+      </w:r>
+      <w:proofErr w:type="spellEnd"/>
+      <w:r>
+        <w:rPr>
+          <w:rFonts w:ascii="Times New Roman" w:hAnsi="Times New Roman" w:cs="Times New Roman"/>
+          <w:lang w:val="en-GB"/>
+        </w:rPr>
+        <w:t xml:space="preserve"> </w:t>
+      </w:r>
+      <w:proofErr w:type="spellStart"/>
+      <w:r>
+        <w:rPr>
+          <w:rFonts w:ascii="Times New Roman" w:hAnsi="Times New Roman" w:cs="Times New Roman"/>
+          <w:lang w:val="en-GB"/>
+        </w:rPr>
+        <w:t>memastikan</w:t>
+      </w:r>
+      <w:proofErr w:type="spellEnd"/>
+      <w:r>
+        <w:rPr>
+          <w:rFonts w:ascii="Times New Roman" w:hAnsi="Times New Roman" w:cs="Times New Roman"/>
+          <w:lang w:val="en-GB"/>
+        </w:rPr>
+        <w:t xml:space="preserve"> data </w:t>
+      </w:r>
+      <w:proofErr w:type="spellStart"/>
+      <w:r>
+        <w:rPr>
+          <w:rFonts w:ascii="Times New Roman" w:hAnsi="Times New Roman" w:cs="Times New Roman"/>
+          <w:lang w:val="en-GB"/>
+        </w:rPr>
+        <w:t>tersebut</w:t>
+      </w:r>
+      <w:proofErr w:type="spellEnd"/>
+      <w:r>
+        <w:rPr>
+          <w:rFonts w:ascii="Times New Roman" w:hAnsi="Times New Roman" w:cs="Times New Roman"/>
+          <w:lang w:val="en-GB"/>
+        </w:rPr>
+        <w:t xml:space="preserve"> </w:t>
+      </w:r>
+      <w:proofErr w:type="spellStart"/>
+      <w:r>
+        <w:rPr>
+          <w:rFonts w:ascii="Times New Roman" w:hAnsi="Times New Roman" w:cs="Times New Roman"/>
+          <w:lang w:val="en-GB"/>
+        </w:rPr>
+        <w:t>memang</w:t>
+      </w:r>
+      <w:proofErr w:type="spellEnd"/>
+      <w:r>
+        <w:rPr>
+          <w:rFonts w:ascii="Times New Roman" w:hAnsi="Times New Roman" w:cs="Times New Roman"/>
+          <w:lang w:val="en-GB"/>
+        </w:rPr>
+        <w:t xml:space="preserve"> </w:t>
+      </w:r>
+      <w:proofErr w:type="spellStart"/>
+      <w:r>
+        <w:rPr>
+          <w:rFonts w:ascii="Times New Roman" w:hAnsi="Times New Roman" w:cs="Times New Roman"/>
+          <w:lang w:val="en-GB"/>
+        </w:rPr>
+        <w:t>ada</w:t>
+      </w:r>
+      <w:proofErr w:type="spellEnd"/>
+      <w:r>
+        <w:rPr>
+          <w:rFonts w:ascii="Times New Roman" w:hAnsi="Times New Roman" w:cs="Times New Roman"/>
+          <w:lang w:val="en-GB"/>
+        </w:rPr>
+        <w:t xml:space="preserve"> di database.</w:t>
+      </w:r>
+    </w:p>
+    <w:p>
+      <w:pPr>
+        <w:pStyle w:val="ListParagraph"/>
+        <w:numPr>
+          <w:ilvl w:val="0"/>
+          <w:numId w:val="10"/>
+        </w:numPr>
+        <w:jc w:val="both"/>
+        <w:rPr>
+          <w:rFonts w:ascii="Times New Roman" w:hAnsi="Times New Roman" w:cs="Times New Roman"/>
+          <w:lang w:val="en-GB"/>
+        </w:rPr>
+      </w:pPr>
+      <w:proofErr w:type="spellStart"/>
+      <w:r>
+        <w:rPr>
+          <w:rFonts w:ascii="Times New Roman" w:hAnsi="Times New Roman" w:cs="Times New Roman"/>
+          <w:lang w:val="en-GB"/>
+        </w:rPr>
+        <w:t>Transformasi</w:t>
+      </w:r>
+      <w:proofErr w:type="spellEnd"/>
+      <w:r>
+        <w:rPr>
+          <w:rFonts w:ascii="Times New Roman" w:hAnsi="Times New Roman" w:cs="Times New Roman"/>
+          <w:lang w:val="en-GB"/>
+        </w:rPr>
+        <w:t xml:space="preserve">: </w:t>
+      </w:r>
+      <w:proofErr w:type="spellStart"/>
+      <w:r>
+        <w:rPr>
+          <w:rFonts w:ascii="Times New Roman" w:hAnsi="Times New Roman" w:cs="Times New Roman"/>
+          <w:lang w:val="en-GB"/>
+        </w:rPr>
+        <w:t>Mengubah</w:t>
+      </w:r>
+      <w:proofErr w:type="spellEnd"/>
+      <w:r>
+        <w:rPr>
+          <w:rFonts w:ascii="Times New Roman" w:hAnsi="Times New Roman" w:cs="Times New Roman"/>
+          <w:lang w:val="en-GB"/>
+        </w:rPr>
+        <w:t xml:space="preserve"> data </w:t>
+      </w:r>
+      <w:proofErr w:type="spellStart"/>
+      <w:r>
+        <w:rPr>
+          <w:rFonts w:ascii="Times New Roman" w:hAnsi="Times New Roman" w:cs="Times New Roman"/>
+          <w:lang w:val="en-GB"/>
+        </w:rPr>
+        <w:t>mentah</w:t>
+      </w:r>
+      <w:proofErr w:type="spellEnd"/>
+      <w:r>
+        <w:rPr>
+          <w:rFonts w:ascii="Times New Roman" w:hAnsi="Times New Roman" w:cs="Times New Roman"/>
+          <w:lang w:val="en-GB"/>
+        </w:rPr>
+        <w:t xml:space="preserve"> </w:t>
+      </w:r>
+      <w:proofErr w:type="spellStart"/>
+      <w:r>
+        <w:rPr>
+          <w:rFonts w:ascii="Times New Roman" w:hAnsi="Times New Roman" w:cs="Times New Roman"/>
+          <w:lang w:val="en-GB"/>
+        </w:rPr>
+        <w:t>dari</w:t>
+      </w:r>
+      <w:proofErr w:type="spellEnd"/>
+      <w:r>
+        <w:rPr>
+          <w:rFonts w:ascii="Times New Roman" w:hAnsi="Times New Roman" w:cs="Times New Roman"/>
+          <w:lang w:val="en-GB"/>
+        </w:rPr>
+        <w:t xml:space="preserve"> database </w:t>
+      </w:r>
+      <w:proofErr w:type="spellStart"/>
+      <w:r>
+        <w:rPr>
+          <w:rFonts w:ascii="Times New Roman" w:hAnsi="Times New Roman" w:cs="Times New Roman"/>
+          <w:lang w:val="en-GB"/>
+        </w:rPr>
+        <w:t>menjadi</w:t>
+      </w:r>
+      <w:proofErr w:type="spellEnd"/>
+      <w:r>
+        <w:rPr>
+          <w:rFonts w:ascii="Times New Roman" w:hAnsi="Times New Roman" w:cs="Times New Roman"/>
+          <w:lang w:val="en-GB"/>
+        </w:rPr>
+        <w:t xml:space="preserve"> </w:t>
+      </w:r>
+      <w:proofErr w:type="spellStart"/>
+      <w:r>
+        <w:rPr>
+          <w:rFonts w:ascii="Times New Roman" w:hAnsi="Times New Roman" w:cs="Times New Roman"/>
+          <w:lang w:val="en-GB"/>
+        </w:rPr>
+        <w:t>objek</w:t>
+      </w:r>
+      <w:proofErr w:type="spellEnd"/>
+      <w:r>
+        <w:rPr>
+          <w:rFonts w:ascii="Times New Roman" w:hAnsi="Times New Roman" w:cs="Times New Roman"/>
+          <w:lang w:val="en-GB"/>
+        </w:rPr>
+        <w:t xml:space="preserve"> </w:t>
+      </w:r>
+      <w:proofErr w:type="spellStart"/>
+      <w:r>
+        <w:rPr>
+          <w:rFonts w:ascii="Times New Roman" w:hAnsi="Times New Roman" w:cs="Times New Roman"/>
+          <w:lang w:val="en-GB"/>
+        </w:rPr>
+        <w:t>KategoriEntity</w:t>
+      </w:r>
+      <w:proofErr w:type="spellEnd"/>
+      <w:r>
+        <w:rPr>
+          <w:rFonts w:ascii="Times New Roman" w:hAnsi="Times New Roman" w:cs="Times New Roman"/>
+          <w:lang w:val="en-GB"/>
+        </w:rPr>
+        <w:t xml:space="preserve"> </w:t>
+      </w:r>
+      <w:proofErr w:type="spellStart"/>
+      <w:r>
+        <w:rPr>
+          <w:rFonts w:ascii="Times New Roman" w:hAnsi="Times New Roman" w:cs="Times New Roman"/>
+          <w:lang w:val="en-GB"/>
+        </w:rPr>
+        <w:t>sebelum</w:t>
+      </w:r>
+      <w:proofErr w:type="spellEnd"/>
+      <w:r>
+        <w:rPr>
+          <w:rFonts w:ascii="Times New Roman" w:hAnsi="Times New Roman" w:cs="Times New Roman"/>
+          <w:lang w:val="en-GB"/>
+        </w:rPr>
+        <w:t xml:space="preserve"> </w:t>
+      </w:r>
+      <w:proofErr w:type="spellStart"/>
+      <w:r>
+        <w:rPr>
+          <w:rFonts w:ascii="Times New Roman" w:hAnsi="Times New Roman" w:cs="Times New Roman"/>
+          <w:lang w:val="en-GB"/>
+        </w:rPr>
+        <w:t>dikirim</w:t>
+      </w:r>
+      <w:proofErr w:type="spellEnd"/>
+      <w:r>
+        <w:rPr>
+          <w:rFonts w:ascii="Times New Roman" w:hAnsi="Times New Roman" w:cs="Times New Roman"/>
+          <w:lang w:val="en-GB"/>
+        </w:rPr>
+        <w:t xml:space="preserve"> </w:t>
+      </w:r>
+      <w:proofErr w:type="spellStart"/>
+      <w:r>
+        <w:rPr>
+          <w:rFonts w:ascii="Times New Roman" w:hAnsi="Times New Roman" w:cs="Times New Roman"/>
+          <w:lang w:val="en-GB"/>
+        </w:rPr>
+        <w:t>ke</w:t>
+      </w:r>
+      <w:proofErr w:type="spellEnd"/>
+      <w:r>
+        <w:rPr>
+          <w:rFonts w:ascii="Times New Roman" w:hAnsi="Times New Roman" w:cs="Times New Roman"/>
+          <w:lang w:val="en-GB"/>
+        </w:rPr>
+        <w:t xml:space="preserve"> client.</w:t>
       </w:r>
     </w:p>
     <w:p>
@@ -18026,9 +19726,9 @@
     </w:lvl>
   </w:abstractNum>
   <w:abstractNum w:abstractNumId="1" w15:restartNumberingAfterBreak="0">
-    <w:nsid w:val="181470EA"/>
+    <w:nsid w:val="0C6B1486"/>
     <w:multiLevelType w:val="hybridMultilevel"/>
-    <w:tmpl w:val="44EC6C34"/>
+    <w:tmpl w:val="F8CC45BE"/>
     <w:lvl w:ilvl="0" w:tplc="38090001">
       <w:start w:val="1"/>
       <w:numFmt w:val="bullet"/>
@@ -18139,9 +19839,9 @@
     </w:lvl>
   </w:abstractNum>
   <w:abstractNum w:abstractNumId="2" w15:restartNumberingAfterBreak="0">
-    <w:nsid w:val="34990981"/>
+    <w:nsid w:val="181470EA"/>
     <w:multiLevelType w:val="hybridMultilevel"/>
-    <w:tmpl w:val="79D8D03C"/>
+    <w:tmpl w:val="44EC6C34"/>
     <w:lvl w:ilvl="0" w:tplc="38090001">
       <w:start w:val="1"/>
       <w:numFmt w:val="bullet"/>
@@ -18252,9 +19952,9 @@
     </w:lvl>
   </w:abstractNum>
   <w:abstractNum w:abstractNumId="3" w15:restartNumberingAfterBreak="0">
-    <w:nsid w:val="359E1A57"/>
+    <w:nsid w:val="34990981"/>
     <w:multiLevelType w:val="hybridMultilevel"/>
-    <w:tmpl w:val="1B6C6A10"/>
+    <w:tmpl w:val="79D8D03C"/>
     <w:lvl w:ilvl="0" w:tplc="38090001">
       <w:start w:val="1"/>
       <w:numFmt w:val="bullet"/>
@@ -18365,9 +20065,9 @@
     </w:lvl>
   </w:abstractNum>
   <w:abstractNum w:abstractNumId="4" w15:restartNumberingAfterBreak="0">
-    <w:nsid w:val="4453613F"/>
+    <w:nsid w:val="359E1A57"/>
     <w:multiLevelType w:val="hybridMultilevel"/>
-    <w:tmpl w:val="DDEA1E44"/>
+    <w:tmpl w:val="1B6C6A10"/>
     <w:lvl w:ilvl="0" w:tplc="38090001">
       <w:start w:val="1"/>
       <w:numFmt w:val="bullet"/>
@@ -18478,9 +20178,9 @@
     </w:lvl>
   </w:abstractNum>
   <w:abstractNum w:abstractNumId="5" w15:restartNumberingAfterBreak="0">
-    <w:nsid w:val="64A022BC"/>
+    <w:nsid w:val="4453613F"/>
     <w:multiLevelType w:val="hybridMultilevel"/>
-    <w:tmpl w:val="7466E2BA"/>
+    <w:tmpl w:val="DDEA1E44"/>
     <w:lvl w:ilvl="0" w:tplc="38090001">
       <w:start w:val="1"/>
       <w:numFmt w:val="bullet"/>
@@ -18591,9 +20291,9 @@
     </w:lvl>
   </w:abstractNum>
   <w:abstractNum w:abstractNumId="6" w15:restartNumberingAfterBreak="0">
-    <w:nsid w:val="673C435B"/>
+    <w:nsid w:val="64A022BC"/>
     <w:multiLevelType w:val="hybridMultilevel"/>
-    <w:tmpl w:val="846CCAA0"/>
+    <w:tmpl w:val="7466E2BA"/>
     <w:lvl w:ilvl="0" w:tplc="38090001">
       <w:start w:val="1"/>
       <w:numFmt w:val="bullet"/>
@@ -18704,9 +20404,9 @@
     </w:lvl>
   </w:abstractNum>
   <w:abstractNum w:abstractNumId="7" w15:restartNumberingAfterBreak="0">
-    <w:nsid w:val="6CA82C32"/>
+    <w:nsid w:val="673C435B"/>
     <w:multiLevelType w:val="hybridMultilevel"/>
-    <w:tmpl w:val="ABCC36BA"/>
+    <w:tmpl w:val="846CCAA0"/>
     <w:lvl w:ilvl="0" w:tplc="38090001">
       <w:start w:val="1"/>
       <w:numFmt w:val="bullet"/>
@@ -18817,9 +20517,9 @@
     </w:lvl>
   </w:abstractNum>
   <w:abstractNum w:abstractNumId="8" w15:restartNumberingAfterBreak="0">
-    <w:nsid w:val="737805E1"/>
+    <w:nsid w:val="6CA82C32"/>
     <w:multiLevelType w:val="hybridMultilevel"/>
-    <w:tmpl w:val="8DF2E322"/>
+    <w:tmpl w:val="ABCC36BA"/>
     <w:lvl w:ilvl="0" w:tplc="38090001">
       <w:start w:val="1"/>
       <w:numFmt w:val="bullet"/>
@@ -18929,32 +20629,148 @@
       </w:rPr>
     </w:lvl>
   </w:abstractNum>
+  <w:abstractNum w:abstractNumId="9" w15:restartNumberingAfterBreak="0">
+    <w:nsid w:val="737805E1"/>
+    <w:multiLevelType w:val="hybridMultilevel"/>
+    <w:tmpl w:val="8DF2E322"/>
+    <w:lvl w:ilvl="0" w:tplc="38090001">
+      <w:start w:val="1"/>
+      <w:numFmt w:val="bullet"/>
+      <w:lvlText w:val=""/>
+      <w:lvlJc w:val="left"/>
+      <w:pPr>
+        <w:ind w:left="720" w:hanging="360"/>
+      </w:pPr>
+      <w:rPr>
+        <w:rFonts w:ascii="Symbol" w:hAnsi="Symbol" w:hint="default"/>
+      </w:rPr>
+    </w:lvl>
+    <w:lvl w:ilvl="1" w:tplc="38090003" w:tentative="1">
+      <w:start w:val="1"/>
+      <w:numFmt w:val="bullet"/>
+      <w:lvlText w:val="o"/>
+      <w:lvlJc w:val="left"/>
+      <w:pPr>
+        <w:ind w:left="1440" w:hanging="360"/>
+      </w:pPr>
+      <w:rPr>
+        <w:rFonts w:ascii="Courier New" w:hAnsi="Courier New" w:cs="Courier New" w:hint="default"/>
+      </w:rPr>
+    </w:lvl>
+    <w:lvl w:ilvl="2" w:tplc="38090005" w:tentative="1">
+      <w:start w:val="1"/>
+      <w:numFmt w:val="bullet"/>
+      <w:lvlText w:val=""/>
+      <w:lvlJc w:val="left"/>
+      <w:pPr>
+        <w:ind w:left="2160" w:hanging="360"/>
+      </w:pPr>
+      <w:rPr>
+        <w:rFonts w:ascii="Wingdings" w:hAnsi="Wingdings" w:hint="default"/>
+      </w:rPr>
+    </w:lvl>
+    <w:lvl w:ilvl="3" w:tplc="38090001" w:tentative="1">
+      <w:start w:val="1"/>
+      <w:numFmt w:val="bullet"/>
+      <w:lvlText w:val=""/>
+      <w:lvlJc w:val="left"/>
+      <w:pPr>
+        <w:ind w:left="2880" w:hanging="360"/>
+      </w:pPr>
+      <w:rPr>
+        <w:rFonts w:ascii="Symbol" w:hAnsi="Symbol" w:hint="default"/>
+      </w:rPr>
+    </w:lvl>
+    <w:lvl w:ilvl="4" w:tplc="38090003" w:tentative="1">
+      <w:start w:val="1"/>
+      <w:numFmt w:val="bullet"/>
+      <w:lvlText w:val="o"/>
+      <w:lvlJc w:val="left"/>
+      <w:pPr>
+        <w:ind w:left="3600" w:hanging="360"/>
+      </w:pPr>
+      <w:rPr>
+        <w:rFonts w:ascii="Courier New" w:hAnsi="Courier New" w:cs="Courier New" w:hint="default"/>
+      </w:rPr>
+    </w:lvl>
+    <w:lvl w:ilvl="5" w:tplc="38090005" w:tentative="1">
+      <w:start w:val="1"/>
+      <w:numFmt w:val="bullet"/>
+      <w:lvlText w:val=""/>
+      <w:lvlJc w:val="left"/>
+      <w:pPr>
+        <w:ind w:left="4320" w:hanging="360"/>
+      </w:pPr>
+      <w:rPr>
+        <w:rFonts w:ascii="Wingdings" w:hAnsi="Wingdings" w:hint="default"/>
+      </w:rPr>
+    </w:lvl>
+    <w:lvl w:ilvl="6" w:tplc="38090001" w:tentative="1">
+      <w:start w:val="1"/>
+      <w:numFmt w:val="bullet"/>
+      <w:lvlText w:val=""/>
+      <w:lvlJc w:val="left"/>
+      <w:pPr>
+        <w:ind w:left="5040" w:hanging="360"/>
+      </w:pPr>
+      <w:rPr>
+        <w:rFonts w:ascii="Symbol" w:hAnsi="Symbol" w:hint="default"/>
+      </w:rPr>
+    </w:lvl>
+    <w:lvl w:ilvl="7" w:tplc="38090003" w:tentative="1">
+      <w:start w:val="1"/>
+      <w:numFmt w:val="bullet"/>
+      <w:lvlText w:val="o"/>
+      <w:lvlJc w:val="left"/>
+      <w:pPr>
+        <w:ind w:left="5760" w:hanging="360"/>
+      </w:pPr>
+      <w:rPr>
+        <w:rFonts w:ascii="Courier New" w:hAnsi="Courier New" w:cs="Courier New" w:hint="default"/>
+      </w:rPr>
+    </w:lvl>
+    <w:lvl w:ilvl="8" w:tplc="38090005" w:tentative="1">
+      <w:start w:val="1"/>
+      <w:numFmt w:val="bullet"/>
+      <w:lvlText w:val=""/>
+      <w:lvlJc w:val="left"/>
+      <w:pPr>
+        <w:ind w:left="6480" w:hanging="360"/>
+      </w:pPr>
+      <w:rPr>
+        <w:rFonts w:ascii="Wingdings" w:hAnsi="Wingdings" w:hint="default"/>
+      </w:rPr>
+    </w:lvl>
+  </w:abstractNum>
   <w:num w:numId="1" w16cid:durableId="517813677">
-    <w:abstractNumId w:val="6"/>
+    <w:abstractNumId w:val="7"/>
   </w:num>
   <w:num w:numId="2" w16cid:durableId="857735407">
-    <w:abstractNumId w:val="7"/>
+    <w:abstractNumId w:val="8"/>
   </w:num>
   <w:num w:numId="3" w16cid:durableId="134505">
+    <w:abstractNumId w:val="4"/>
+  </w:num>
+  <w:num w:numId="4" w16cid:durableId="1666083322">
+    <w:abstractNumId w:val="9"/>
+  </w:num>
+  <w:num w:numId="5" w16cid:durableId="864251512">
     <w:abstractNumId w:val="3"/>
   </w:num>
-  <w:num w:numId="4" w16cid:durableId="1666083322">
-    <w:abstractNumId w:val="8"/>
-  </w:num>
-  <w:num w:numId="5" w16cid:durableId="864251512">
+  <w:num w:numId="6" w16cid:durableId="1060862237">
     <w:abstractNumId w:val="2"/>
   </w:num>
-  <w:num w:numId="6" w16cid:durableId="1060862237">
-    <w:abstractNumId w:val="1"/>
-  </w:num>
   <w:num w:numId="7" w16cid:durableId="1772166354">
-    <w:abstractNumId w:val="5"/>
+    <w:abstractNumId w:val="6"/>
   </w:num>
   <w:num w:numId="8" w16cid:durableId="71900298">
     <w:abstractNumId w:val="0"/>
   </w:num>
   <w:num w:numId="9" w16cid:durableId="641693388">
-    <w:abstractNumId w:val="4"/>
+    <w:abstractNumId w:val="5"/>
+  </w:num>
+  <w:num w:numId="10" w16cid:durableId="1858039568">
+    <w:abstractNumId w:val="1"/>
   </w:num>
 </w:numbering>
 </file>

</xml_diff>

<commit_message>
Membuat file jest.config.js untuk setup test
</commit_message>
<xml_diff>
--- a/dokumentasi/24382001P_Lorensius Firngadi_IF 23 E_Dokumentasi.docx
+++ b/dokumentasi/24382001P_Lorensius Firngadi_IF 23 E_Dokumentasi.docx
@@ -19801,7 +19801,23 @@
           <w:rFonts w:ascii="Times New Roman" w:hAnsi="Times New Roman" w:cs="Times New Roman"/>
           <w:lang w:val="en-GB"/>
         </w:rPr>
-        <w:t xml:space="preserve"> Utama atau Pintu </w:t>
+        <w:t xml:space="preserve"> Utama </w:t>
+      </w:r>
+      <w:proofErr w:type="spellStart"/>
+      <w:r>
+        <w:rPr>
+          <w:rFonts w:ascii="Times New Roman" w:hAnsi="Times New Roman" w:cs="Times New Roman"/>
+          <w:lang w:val="en-GB"/>
+        </w:rPr>
+        <w:t>atau</w:t>
+      </w:r>
+      <w:proofErr w:type="spellEnd"/>
+      <w:r>
+        <w:rPr>
+          <w:rFonts w:ascii="Times New Roman" w:hAnsi="Times New Roman" w:cs="Times New Roman"/>
+          <w:lang w:val="en-GB"/>
+        </w:rPr>
+        <w:t xml:space="preserve"> Pintu </w:t>
       </w:r>
       <w:proofErr w:type="spellStart"/>
       <w:r>
@@ -19817,15 +19833,31 @@
           <w:rFonts w:ascii="Times New Roman" w:hAnsi="Times New Roman" w:cs="Times New Roman"/>
           <w:lang w:val="en-GB"/>
         </w:rPr>
-        <w:t xml:space="preserve"> untuk s</w:t>
-      </w:r>
-      <w:proofErr w:type="spellStart"/>
-      <w:r>
-        <w:rPr>
-          <w:rFonts w:ascii="Times New Roman" w:hAnsi="Times New Roman" w:cs="Times New Roman"/>
-          <w:lang w:val="en-GB"/>
-        </w:rPr>
-        <w:t>emua</w:t>
+        <w:t xml:space="preserve"> </w:t>
+      </w:r>
+      <w:proofErr w:type="spellStart"/>
+      <w:r>
+        <w:rPr>
+          <w:rFonts w:ascii="Times New Roman" w:hAnsi="Times New Roman" w:cs="Times New Roman"/>
+          <w:lang w:val="en-GB"/>
+        </w:rPr>
+        <w:t>untuk</w:t>
+      </w:r>
+      <w:proofErr w:type="spellEnd"/>
+      <w:r>
+        <w:rPr>
+          <w:rFonts w:ascii="Times New Roman" w:hAnsi="Times New Roman" w:cs="Times New Roman"/>
+          <w:lang w:val="en-GB"/>
+        </w:rPr>
+        <w:t xml:space="preserve"> </w:t>
+      </w:r>
+      <w:proofErr w:type="spellStart"/>
+      <w:r>
+        <w:rPr>
+          <w:rFonts w:ascii="Times New Roman" w:hAnsi="Times New Roman" w:cs="Times New Roman"/>
+          <w:lang w:val="en-GB"/>
+        </w:rPr>
+        <w:t>semua</w:t>
       </w:r>
       <w:proofErr w:type="spellEnd"/>
       <w:r>
@@ -20679,6 +20711,2176 @@
           <w:lang w:val="en-GB"/>
         </w:rPr>
       </w:pPr>
+      <w:r>
+        <w:rPr>
+          <w:rFonts w:ascii="Times New Roman" w:hAnsi="Times New Roman" w:cs="Times New Roman"/>
+          <w:lang w:val="en-GB"/>
+        </w:rPr>
+        <w:t>19.</w:t>
+      </w:r>
+      <w:r>
+        <w:t xml:space="preserve"> </w:t>
+      </w:r>
+      <w:proofErr w:type="spellStart"/>
+      <w:r>
+        <w:rPr>
+          <w:rFonts w:ascii="Times New Roman" w:hAnsi="Times New Roman" w:cs="Times New Roman"/>
+          <w:lang w:val="en-GB"/>
+        </w:rPr>
+        <w:t>Memb</w:t>
+      </w:r>
+      <w:r>
+        <w:rPr>
+          <w:rFonts w:ascii="Times New Roman" w:hAnsi="Times New Roman" w:cs="Times New Roman"/>
+          <w:lang w:val="en-GB"/>
+        </w:rPr>
+        <w:t>uat</w:t>
+      </w:r>
+      <w:proofErr w:type="spellEnd"/>
+      <w:r>
+        <w:rPr>
+          <w:rFonts w:ascii="Times New Roman" w:hAnsi="Times New Roman" w:cs="Times New Roman"/>
+          <w:lang w:val="en-GB"/>
+        </w:rPr>
+        <w:t xml:space="preserve"> </w:t>
+      </w:r>
+      <w:proofErr w:type="spellStart"/>
+      <w:r>
+        <w:rPr>
+          <w:rFonts w:ascii="Times New Roman" w:hAnsi="Times New Roman" w:cs="Times New Roman"/>
+          <w:lang w:val="en-GB"/>
+        </w:rPr>
+        <w:t>Kategori</w:t>
+      </w:r>
+      <w:proofErr w:type="spellEnd"/>
+      <w:r>
+        <w:rPr>
+          <w:rFonts w:ascii="Times New Roman" w:hAnsi="Times New Roman" w:cs="Times New Roman"/>
+          <w:lang w:val="en-GB"/>
+        </w:rPr>
+        <w:t xml:space="preserve"> Module</w:t>
+      </w:r>
+    </w:p>
+    <w:p>
+      <w:pPr>
+        <w:jc w:val="both"/>
+      </w:pPr>
+      <w:proofErr w:type="gramStart"/>
+      <w:r>
+        <w:rPr>
+          <w:rFonts w:ascii="Times New Roman" w:hAnsi="Times New Roman" w:cs="Times New Roman"/>
+          <w:lang w:val="en-GB"/>
+        </w:rPr>
+        <w:t>File :</w:t>
+      </w:r>
+      <w:proofErr w:type="gramEnd"/>
+      <w:r>
+        <w:rPr>
+          <w:rFonts w:ascii="Times New Roman" w:hAnsi="Times New Roman" w:cs="Times New Roman"/>
+          <w:lang w:val="en-GB"/>
+        </w:rPr>
+        <w:t xml:space="preserve"> </w:t>
+      </w:r>
+      <w:proofErr w:type="spellStart"/>
+      <w:r>
+        <w:t>src</w:t>
+      </w:r>
+      <w:proofErr w:type="spellEnd"/>
+      <w:r>
+        <w:t>/services/</w:t>
+      </w:r>
+      <w:proofErr w:type="spellStart"/>
+      <w:r>
+        <w:t>kategori</w:t>
+      </w:r>
+      <w:proofErr w:type="spellEnd"/>
+      <w:r>
+        <w:t>/</w:t>
+      </w:r>
+      <w:proofErr w:type="spellStart"/>
+      <w:r>
+        <w:t>kategori.module.ts</w:t>
+      </w:r>
+      <w:proofErr w:type="spellEnd"/>
+    </w:p>
+    <w:p>
+      <w:pPr>
+        <w:jc w:val="both"/>
+      </w:pPr>
+      <w:r>
+        <w:rPr>
+          <w:noProof/>
+        </w:rPr>
+        <w:lastRenderedPageBreak/>
+        <w:drawing>
+          <wp:inline distT="0" distB="0" distL="0" distR="0" wp14:anchorId="2D2DC140" wp14:editId="65C2FA66">
+            <wp:extent cx="5731510" cy="3222625"/>
+            <wp:effectExtent l="0" t="0" r="2540" b="0"/>
+            <wp:docPr id="964480042" name="Picture 1"/>
+            <wp:cNvGraphicFramePr>
+              <a:graphicFrameLocks xmlns:a="http://schemas.openxmlformats.org/drawingml/2006/main" noChangeAspect="1"/>
+            </wp:cNvGraphicFramePr>
+            <a:graphic xmlns:a="http://schemas.openxmlformats.org/drawingml/2006/main">
+              <a:graphicData uri="http://schemas.openxmlformats.org/drawingml/2006/picture">
+                <pic:pic xmlns:pic="http://schemas.openxmlformats.org/drawingml/2006/picture">
+                  <pic:nvPicPr>
+                    <pic:cNvPr id="964480042" name=""/>
+                    <pic:cNvPicPr/>
+                  </pic:nvPicPr>
+                  <pic:blipFill>
+                    <a:blip r:embed="rId23"/>
+                    <a:stretch>
+                      <a:fillRect/>
+                    </a:stretch>
+                  </pic:blipFill>
+                  <pic:spPr>
+                    <a:xfrm>
+                      <a:off x="0" y="0"/>
+                      <a:ext cx="5731510" cy="3222625"/>
+                    </a:xfrm>
+                    <a:prstGeom prst="rect">
+                      <a:avLst/>
+                    </a:prstGeom>
+                  </pic:spPr>
+                </pic:pic>
+              </a:graphicData>
+            </a:graphic>
+          </wp:inline>
+        </w:drawing>
+      </w:r>
+    </w:p>
+    <w:p>
+      <w:pPr>
+        <w:jc w:val="both"/>
+      </w:pPr>
+    </w:p>
+    <w:p>
+      <w:pPr>
+        <w:pStyle w:val="ListParagraph"/>
+        <w:numPr>
+          <w:ilvl w:val="0"/>
+          <w:numId w:val="12"/>
+        </w:numPr>
+        <w:jc w:val="both"/>
+        <w:rPr>
+          <w:rFonts w:ascii="Times New Roman" w:hAnsi="Times New Roman" w:cs="Times New Roman"/>
+          <w:lang w:val="en-GB"/>
+        </w:rPr>
+      </w:pPr>
+      <w:proofErr w:type="spellStart"/>
+      <w:r>
+        <w:rPr>
+          <w:rFonts w:ascii="Times New Roman" w:hAnsi="Times New Roman" w:cs="Times New Roman"/>
+          <w:lang w:val="en-GB"/>
+        </w:rPr>
+        <w:t>Koneksi</w:t>
+      </w:r>
+      <w:proofErr w:type="spellEnd"/>
+      <w:r>
+        <w:rPr>
+          <w:rFonts w:ascii="Times New Roman" w:hAnsi="Times New Roman" w:cs="Times New Roman"/>
+          <w:lang w:val="en-GB"/>
+        </w:rPr>
+        <w:t xml:space="preserve"> </w:t>
+      </w:r>
+      <w:proofErr w:type="spellStart"/>
+      <w:r>
+        <w:rPr>
+          <w:rFonts w:ascii="Times New Roman" w:hAnsi="Times New Roman" w:cs="Times New Roman"/>
+          <w:lang w:val="en-GB"/>
+        </w:rPr>
+        <w:t>Otomatis</w:t>
+      </w:r>
+      <w:proofErr w:type="spellEnd"/>
+      <w:r>
+        <w:rPr>
+          <w:rFonts w:ascii="Times New Roman" w:hAnsi="Times New Roman" w:cs="Times New Roman"/>
+          <w:lang w:val="en-GB"/>
+        </w:rPr>
+        <w:t xml:space="preserve">: </w:t>
+      </w:r>
+      <w:proofErr w:type="spellStart"/>
+      <w:r>
+        <w:rPr>
+          <w:rFonts w:ascii="Times New Roman" w:hAnsi="Times New Roman" w:cs="Times New Roman"/>
+          <w:lang w:val="en-GB"/>
+        </w:rPr>
+        <w:t>NestJS</w:t>
+      </w:r>
+      <w:proofErr w:type="spellEnd"/>
+      <w:r>
+        <w:rPr>
+          <w:rFonts w:ascii="Times New Roman" w:hAnsi="Times New Roman" w:cs="Times New Roman"/>
+          <w:lang w:val="en-GB"/>
+        </w:rPr>
+        <w:t xml:space="preserve"> </w:t>
+      </w:r>
+      <w:proofErr w:type="spellStart"/>
+      <w:r>
+        <w:rPr>
+          <w:rFonts w:ascii="Times New Roman" w:hAnsi="Times New Roman" w:cs="Times New Roman"/>
+          <w:lang w:val="en-GB"/>
+        </w:rPr>
+        <w:t>akan</w:t>
+      </w:r>
+      <w:proofErr w:type="spellEnd"/>
+      <w:r>
+        <w:rPr>
+          <w:rFonts w:ascii="Times New Roman" w:hAnsi="Times New Roman" w:cs="Times New Roman"/>
+          <w:lang w:val="en-GB"/>
+        </w:rPr>
+        <w:t xml:space="preserve"> </w:t>
+      </w:r>
+      <w:proofErr w:type="spellStart"/>
+      <w:r>
+        <w:rPr>
+          <w:rFonts w:ascii="Times New Roman" w:hAnsi="Times New Roman" w:cs="Times New Roman"/>
+          <w:lang w:val="en-GB"/>
+        </w:rPr>
+        <w:t>otomatis</w:t>
+      </w:r>
+      <w:proofErr w:type="spellEnd"/>
+      <w:r>
+        <w:rPr>
+          <w:rFonts w:ascii="Times New Roman" w:hAnsi="Times New Roman" w:cs="Times New Roman"/>
+          <w:lang w:val="en-GB"/>
+        </w:rPr>
+        <w:t xml:space="preserve"> </w:t>
+      </w:r>
+      <w:proofErr w:type="spellStart"/>
+      <w:r>
+        <w:rPr>
+          <w:rFonts w:ascii="Times New Roman" w:hAnsi="Times New Roman" w:cs="Times New Roman"/>
+          <w:lang w:val="en-GB"/>
+        </w:rPr>
+        <w:t>menghubungkan</w:t>
+      </w:r>
+      <w:proofErr w:type="spellEnd"/>
+      <w:r>
+        <w:rPr>
+          <w:rFonts w:ascii="Times New Roman" w:hAnsi="Times New Roman" w:cs="Times New Roman"/>
+          <w:lang w:val="en-GB"/>
+        </w:rPr>
+        <w:t xml:space="preserve"> Controller </w:t>
+      </w:r>
+      <w:proofErr w:type="spellStart"/>
+      <w:r>
+        <w:rPr>
+          <w:rFonts w:ascii="Times New Roman" w:hAnsi="Times New Roman" w:cs="Times New Roman"/>
+          <w:lang w:val="en-GB"/>
+        </w:rPr>
+        <w:t>dengan</w:t>
+      </w:r>
+      <w:proofErr w:type="spellEnd"/>
+      <w:r>
+        <w:rPr>
+          <w:rFonts w:ascii="Times New Roman" w:hAnsi="Times New Roman" w:cs="Times New Roman"/>
+          <w:lang w:val="en-GB"/>
+        </w:rPr>
+        <w:t xml:space="preserve"> Service dan Database </w:t>
+      </w:r>
+      <w:proofErr w:type="spellStart"/>
+      <w:r>
+        <w:rPr>
+          <w:rFonts w:ascii="Times New Roman" w:hAnsi="Times New Roman" w:cs="Times New Roman"/>
+          <w:lang w:val="en-GB"/>
+        </w:rPr>
+        <w:t>berdasarkan</w:t>
+      </w:r>
+      <w:proofErr w:type="spellEnd"/>
+      <w:r>
+        <w:rPr>
+          <w:rFonts w:ascii="Times New Roman" w:hAnsi="Times New Roman" w:cs="Times New Roman"/>
+          <w:lang w:val="en-GB"/>
+        </w:rPr>
+        <w:t xml:space="preserve"> daftar yang </w:t>
+      </w:r>
+      <w:proofErr w:type="spellStart"/>
+      <w:r>
+        <w:rPr>
+          <w:rFonts w:ascii="Times New Roman" w:hAnsi="Times New Roman" w:cs="Times New Roman"/>
+          <w:lang w:val="en-GB"/>
+        </w:rPr>
+        <w:t>ada</w:t>
+      </w:r>
+      <w:proofErr w:type="spellEnd"/>
+      <w:r>
+        <w:rPr>
+          <w:rFonts w:ascii="Times New Roman" w:hAnsi="Times New Roman" w:cs="Times New Roman"/>
+          <w:lang w:val="en-GB"/>
+        </w:rPr>
+        <w:t xml:space="preserve"> di </w:t>
+      </w:r>
+      <w:proofErr w:type="spellStart"/>
+      <w:r>
+        <w:rPr>
+          <w:rFonts w:ascii="Times New Roman" w:hAnsi="Times New Roman" w:cs="Times New Roman"/>
+          <w:lang w:val="en-GB"/>
+        </w:rPr>
+        <w:t>sini</w:t>
+      </w:r>
+      <w:proofErr w:type="spellEnd"/>
+      <w:r>
+        <w:rPr>
+          <w:rFonts w:ascii="Times New Roman" w:hAnsi="Times New Roman" w:cs="Times New Roman"/>
+          <w:lang w:val="en-GB"/>
+        </w:rPr>
+        <w:t>.</w:t>
+      </w:r>
+    </w:p>
+    <w:p>
+      <w:pPr>
+        <w:pStyle w:val="ListParagraph"/>
+        <w:numPr>
+          <w:ilvl w:val="0"/>
+          <w:numId w:val="12"/>
+        </w:numPr>
+        <w:jc w:val="both"/>
+        <w:rPr>
+          <w:rFonts w:ascii="Times New Roman" w:hAnsi="Times New Roman" w:cs="Times New Roman"/>
+          <w:lang w:val="en-GB"/>
+        </w:rPr>
+      </w:pPr>
+      <w:proofErr w:type="spellStart"/>
+      <w:r>
+        <w:rPr>
+          <w:rFonts w:ascii="Times New Roman" w:hAnsi="Times New Roman" w:cs="Times New Roman"/>
+          <w:lang w:val="en-GB"/>
+        </w:rPr>
+        <w:t>Modularitas</w:t>
+      </w:r>
+      <w:proofErr w:type="spellEnd"/>
+      <w:r>
+        <w:rPr>
+          <w:rFonts w:ascii="Times New Roman" w:hAnsi="Times New Roman" w:cs="Times New Roman"/>
+          <w:lang w:val="en-GB"/>
+        </w:rPr>
+        <w:t xml:space="preserve">: Jika </w:t>
+      </w:r>
+      <w:proofErr w:type="spellStart"/>
+      <w:r>
+        <w:rPr>
+          <w:rFonts w:ascii="Times New Roman" w:hAnsi="Times New Roman" w:cs="Times New Roman"/>
+          <w:lang w:val="en-GB"/>
+        </w:rPr>
+        <w:t>suatu</w:t>
+      </w:r>
+      <w:proofErr w:type="spellEnd"/>
+      <w:r>
+        <w:rPr>
+          <w:rFonts w:ascii="Times New Roman" w:hAnsi="Times New Roman" w:cs="Times New Roman"/>
+          <w:lang w:val="en-GB"/>
+        </w:rPr>
+        <w:t xml:space="preserve"> </w:t>
+      </w:r>
+      <w:proofErr w:type="spellStart"/>
+      <w:r>
+        <w:rPr>
+          <w:rFonts w:ascii="Times New Roman" w:hAnsi="Times New Roman" w:cs="Times New Roman"/>
+          <w:lang w:val="en-GB"/>
+        </w:rPr>
+        <w:t>saat</w:t>
+      </w:r>
+      <w:proofErr w:type="spellEnd"/>
+      <w:r>
+        <w:rPr>
+          <w:rFonts w:ascii="Times New Roman" w:hAnsi="Times New Roman" w:cs="Times New Roman"/>
+          <w:lang w:val="en-GB"/>
+        </w:rPr>
+        <w:t xml:space="preserve"> </w:t>
+      </w:r>
+      <w:proofErr w:type="spellStart"/>
+      <w:r>
+        <w:rPr>
+          <w:rFonts w:ascii="Times New Roman" w:hAnsi="Times New Roman" w:cs="Times New Roman"/>
+          <w:lang w:val="en-GB"/>
+        </w:rPr>
+        <w:t>ingin</w:t>
+      </w:r>
+      <w:proofErr w:type="spellEnd"/>
+      <w:r>
+        <w:rPr>
+          <w:rFonts w:ascii="Times New Roman" w:hAnsi="Times New Roman" w:cs="Times New Roman"/>
+          <w:lang w:val="en-GB"/>
+        </w:rPr>
+        <w:t xml:space="preserve"> </w:t>
+      </w:r>
+      <w:proofErr w:type="spellStart"/>
+      <w:r>
+        <w:rPr>
+          <w:rFonts w:ascii="Times New Roman" w:hAnsi="Times New Roman" w:cs="Times New Roman"/>
+          <w:lang w:val="en-GB"/>
+        </w:rPr>
+        <w:t>memindahkan</w:t>
+      </w:r>
+      <w:proofErr w:type="spellEnd"/>
+      <w:r>
+        <w:rPr>
+          <w:rFonts w:ascii="Times New Roman" w:hAnsi="Times New Roman" w:cs="Times New Roman"/>
+          <w:lang w:val="en-GB"/>
+        </w:rPr>
+        <w:t xml:space="preserve"> </w:t>
+      </w:r>
+      <w:proofErr w:type="spellStart"/>
+      <w:r>
+        <w:rPr>
+          <w:rFonts w:ascii="Times New Roman" w:hAnsi="Times New Roman" w:cs="Times New Roman"/>
+          <w:lang w:val="en-GB"/>
+        </w:rPr>
+        <w:t>fitur</w:t>
+      </w:r>
+      <w:proofErr w:type="spellEnd"/>
+      <w:r>
+        <w:rPr>
+          <w:rFonts w:ascii="Times New Roman" w:hAnsi="Times New Roman" w:cs="Times New Roman"/>
+          <w:lang w:val="en-GB"/>
+        </w:rPr>
+        <w:t xml:space="preserve"> </w:t>
+      </w:r>
+      <w:proofErr w:type="spellStart"/>
+      <w:r>
+        <w:rPr>
+          <w:rFonts w:ascii="Times New Roman" w:hAnsi="Times New Roman" w:cs="Times New Roman"/>
+          <w:lang w:val="en-GB"/>
+        </w:rPr>
+        <w:t>Kategori</w:t>
+      </w:r>
+      <w:proofErr w:type="spellEnd"/>
+      <w:r>
+        <w:rPr>
+          <w:rFonts w:ascii="Times New Roman" w:hAnsi="Times New Roman" w:cs="Times New Roman"/>
+          <w:lang w:val="en-GB"/>
+        </w:rPr>
+        <w:t xml:space="preserve"> </w:t>
+      </w:r>
+      <w:proofErr w:type="spellStart"/>
+      <w:r>
+        <w:rPr>
+          <w:rFonts w:ascii="Times New Roman" w:hAnsi="Times New Roman" w:cs="Times New Roman"/>
+          <w:lang w:val="en-GB"/>
+        </w:rPr>
+        <w:t>ke</w:t>
+      </w:r>
+      <w:proofErr w:type="spellEnd"/>
+      <w:r>
+        <w:rPr>
+          <w:rFonts w:ascii="Times New Roman" w:hAnsi="Times New Roman" w:cs="Times New Roman"/>
+          <w:lang w:val="en-GB"/>
+        </w:rPr>
+        <w:t xml:space="preserve"> </w:t>
+      </w:r>
+      <w:proofErr w:type="spellStart"/>
+      <w:r>
+        <w:rPr>
+          <w:rFonts w:ascii="Times New Roman" w:hAnsi="Times New Roman" w:cs="Times New Roman"/>
+          <w:lang w:val="en-GB"/>
+        </w:rPr>
+        <w:t>aplikasi</w:t>
+      </w:r>
+      <w:proofErr w:type="spellEnd"/>
+      <w:r>
+        <w:rPr>
+          <w:rFonts w:ascii="Times New Roman" w:hAnsi="Times New Roman" w:cs="Times New Roman"/>
+          <w:lang w:val="en-GB"/>
+        </w:rPr>
+        <w:t xml:space="preserve"> </w:t>
+      </w:r>
+      <w:proofErr w:type="spellStart"/>
+      <w:r>
+        <w:rPr>
+          <w:rFonts w:ascii="Times New Roman" w:hAnsi="Times New Roman" w:cs="Times New Roman"/>
+          <w:lang w:val="en-GB"/>
+        </w:rPr>
+        <w:t>lain</w:t>
+      </w:r>
+      <w:proofErr w:type="spellEnd"/>
+      <w:r>
+        <w:rPr>
+          <w:rFonts w:ascii="Times New Roman" w:hAnsi="Times New Roman" w:cs="Times New Roman"/>
+          <w:lang w:val="en-GB"/>
+        </w:rPr>
+        <w:t>,</w:t>
+      </w:r>
+      <w:r>
+        <w:rPr>
+          <w:rFonts w:ascii="Times New Roman" w:hAnsi="Times New Roman" w:cs="Times New Roman"/>
+          <w:lang w:val="en-GB"/>
+        </w:rPr>
+        <w:t xml:space="preserve"> </w:t>
+      </w:r>
+      <w:proofErr w:type="spellStart"/>
+      <w:r>
+        <w:rPr>
+          <w:rFonts w:ascii="Times New Roman" w:hAnsi="Times New Roman" w:cs="Times New Roman"/>
+          <w:lang w:val="en-GB"/>
+        </w:rPr>
+        <w:t>cukup</w:t>
+      </w:r>
+      <w:proofErr w:type="spellEnd"/>
+      <w:r>
+        <w:rPr>
+          <w:rFonts w:ascii="Times New Roman" w:hAnsi="Times New Roman" w:cs="Times New Roman"/>
+          <w:lang w:val="en-GB"/>
+        </w:rPr>
+        <w:t xml:space="preserve"> </w:t>
+      </w:r>
+      <w:proofErr w:type="spellStart"/>
+      <w:r>
+        <w:rPr>
+          <w:rFonts w:ascii="Times New Roman" w:hAnsi="Times New Roman" w:cs="Times New Roman"/>
+          <w:lang w:val="en-GB"/>
+        </w:rPr>
+        <w:t>me</w:t>
+      </w:r>
+      <w:r>
+        <w:rPr>
+          <w:rFonts w:ascii="Times New Roman" w:hAnsi="Times New Roman" w:cs="Times New Roman"/>
+          <w:lang w:val="en-GB"/>
+        </w:rPr>
+        <w:t>nggunakan</w:t>
+      </w:r>
+      <w:proofErr w:type="spellEnd"/>
+      <w:r>
+        <w:rPr>
+          <w:rFonts w:ascii="Times New Roman" w:hAnsi="Times New Roman" w:cs="Times New Roman"/>
+          <w:lang w:val="en-GB"/>
+        </w:rPr>
+        <w:t xml:space="preserve"> </w:t>
+      </w:r>
+      <w:proofErr w:type="spellStart"/>
+      <w:r>
+        <w:rPr>
+          <w:rFonts w:ascii="Times New Roman" w:hAnsi="Times New Roman" w:cs="Times New Roman"/>
+          <w:lang w:val="en-GB"/>
+        </w:rPr>
+        <w:t>satu</w:t>
+      </w:r>
+      <w:proofErr w:type="spellEnd"/>
+      <w:r>
+        <w:rPr>
+          <w:rFonts w:ascii="Times New Roman" w:hAnsi="Times New Roman" w:cs="Times New Roman"/>
+          <w:lang w:val="en-GB"/>
+        </w:rPr>
+        <w:t xml:space="preserve"> Module </w:t>
+      </w:r>
+      <w:proofErr w:type="spellStart"/>
+      <w:r>
+        <w:rPr>
+          <w:rFonts w:ascii="Times New Roman" w:hAnsi="Times New Roman" w:cs="Times New Roman"/>
+          <w:lang w:val="en-GB"/>
+        </w:rPr>
+        <w:t>ini</w:t>
+      </w:r>
+      <w:proofErr w:type="spellEnd"/>
+      <w:r>
+        <w:rPr>
+          <w:rFonts w:ascii="Times New Roman" w:hAnsi="Times New Roman" w:cs="Times New Roman"/>
+          <w:lang w:val="en-GB"/>
+        </w:rPr>
+        <w:t xml:space="preserve"> </w:t>
+      </w:r>
+      <w:proofErr w:type="spellStart"/>
+      <w:r>
+        <w:rPr>
+          <w:rFonts w:ascii="Times New Roman" w:hAnsi="Times New Roman" w:cs="Times New Roman"/>
+          <w:lang w:val="en-GB"/>
+        </w:rPr>
+        <w:t>saja</w:t>
+      </w:r>
+      <w:proofErr w:type="spellEnd"/>
+      <w:r>
+        <w:rPr>
+          <w:rFonts w:ascii="Times New Roman" w:hAnsi="Times New Roman" w:cs="Times New Roman"/>
+          <w:lang w:val="en-GB"/>
+        </w:rPr>
+        <w:t>.</w:t>
+      </w:r>
+    </w:p>
+    <w:p>
+      <w:pPr>
+        <w:pStyle w:val="ListParagraph"/>
+        <w:numPr>
+          <w:ilvl w:val="0"/>
+          <w:numId w:val="12"/>
+        </w:numPr>
+        <w:jc w:val="both"/>
+        <w:rPr>
+          <w:rFonts w:ascii="Times New Roman" w:hAnsi="Times New Roman" w:cs="Times New Roman"/>
+          <w:lang w:val="en-GB"/>
+        </w:rPr>
+      </w:pPr>
+      <w:r>
+        <w:rPr>
+          <w:rFonts w:ascii="Times New Roman" w:hAnsi="Times New Roman" w:cs="Times New Roman"/>
+          <w:lang w:val="en-GB"/>
+        </w:rPr>
+        <w:t>Pusat Pe</w:t>
+      </w:r>
+      <w:proofErr w:type="spellStart"/>
+      <w:r>
+        <w:rPr>
+          <w:rFonts w:ascii="Times New Roman" w:hAnsi="Times New Roman" w:cs="Times New Roman"/>
+          <w:lang w:val="en-GB"/>
+        </w:rPr>
+        <w:t>ngaturan</w:t>
+      </w:r>
+      <w:proofErr w:type="spellEnd"/>
+      <w:r>
+        <w:rPr>
+          <w:rFonts w:ascii="Times New Roman" w:hAnsi="Times New Roman" w:cs="Times New Roman"/>
+          <w:lang w:val="en-GB"/>
+        </w:rPr>
+        <w:t xml:space="preserve"> yang </w:t>
+      </w:r>
+      <w:proofErr w:type="spellStart"/>
+      <w:r>
+        <w:rPr>
+          <w:rFonts w:ascii="Times New Roman" w:hAnsi="Times New Roman" w:cs="Times New Roman"/>
+          <w:lang w:val="en-GB"/>
+        </w:rPr>
+        <w:t>memberi</w:t>
+      </w:r>
+      <w:proofErr w:type="spellEnd"/>
+      <w:r>
+        <w:rPr>
+          <w:rFonts w:ascii="Times New Roman" w:hAnsi="Times New Roman" w:cs="Times New Roman"/>
+          <w:lang w:val="en-GB"/>
+        </w:rPr>
+        <w:t xml:space="preserve"> </w:t>
+      </w:r>
+      <w:proofErr w:type="spellStart"/>
+      <w:r>
+        <w:rPr>
+          <w:rFonts w:ascii="Times New Roman" w:hAnsi="Times New Roman" w:cs="Times New Roman"/>
+          <w:lang w:val="en-GB"/>
+        </w:rPr>
+        <w:t>tahu</w:t>
+      </w:r>
+      <w:proofErr w:type="spellEnd"/>
+      <w:r>
+        <w:rPr>
+          <w:rFonts w:ascii="Times New Roman" w:hAnsi="Times New Roman" w:cs="Times New Roman"/>
+          <w:lang w:val="en-GB"/>
+        </w:rPr>
+        <w:t xml:space="preserve"> </w:t>
+      </w:r>
+      <w:proofErr w:type="spellStart"/>
+      <w:r>
+        <w:rPr>
+          <w:rFonts w:ascii="Times New Roman" w:hAnsi="Times New Roman" w:cs="Times New Roman"/>
+          <w:lang w:val="en-GB"/>
+        </w:rPr>
+        <w:t>aplikasi</w:t>
+      </w:r>
+      <w:proofErr w:type="spellEnd"/>
+      <w:r>
+        <w:rPr>
+          <w:rFonts w:ascii="Times New Roman" w:hAnsi="Times New Roman" w:cs="Times New Roman"/>
+          <w:lang w:val="en-GB"/>
+        </w:rPr>
+        <w:t xml:space="preserve"> </w:t>
+      </w:r>
+      <w:proofErr w:type="spellStart"/>
+      <w:r>
+        <w:rPr>
+          <w:rFonts w:ascii="Times New Roman" w:hAnsi="Times New Roman" w:cs="Times New Roman"/>
+          <w:lang w:val="en-GB"/>
+        </w:rPr>
+        <w:t>bagaimana</w:t>
+      </w:r>
+      <w:proofErr w:type="spellEnd"/>
+      <w:r>
+        <w:rPr>
+          <w:rFonts w:ascii="Times New Roman" w:hAnsi="Times New Roman" w:cs="Times New Roman"/>
+          <w:lang w:val="en-GB"/>
+        </w:rPr>
+        <w:t xml:space="preserve"> </w:t>
+      </w:r>
+      <w:proofErr w:type="spellStart"/>
+      <w:r>
+        <w:rPr>
+          <w:rFonts w:ascii="Times New Roman" w:hAnsi="Times New Roman" w:cs="Times New Roman"/>
+          <w:lang w:val="en-GB"/>
+        </w:rPr>
+        <w:t>cara</w:t>
+      </w:r>
+      <w:proofErr w:type="spellEnd"/>
+      <w:r>
+        <w:rPr>
+          <w:rFonts w:ascii="Times New Roman" w:hAnsi="Times New Roman" w:cs="Times New Roman"/>
+          <w:lang w:val="en-GB"/>
+        </w:rPr>
+        <w:t xml:space="preserve"> </w:t>
+      </w:r>
+      <w:proofErr w:type="spellStart"/>
+      <w:r>
+        <w:rPr>
+          <w:rFonts w:ascii="Times New Roman" w:hAnsi="Times New Roman" w:cs="Times New Roman"/>
+          <w:lang w:val="en-GB"/>
+        </w:rPr>
+        <w:t>merakit</w:t>
+      </w:r>
+      <w:proofErr w:type="spellEnd"/>
+      <w:r>
+        <w:rPr>
+          <w:rFonts w:ascii="Times New Roman" w:hAnsi="Times New Roman" w:cs="Times New Roman"/>
+          <w:lang w:val="en-GB"/>
+        </w:rPr>
+        <w:t xml:space="preserve"> </w:t>
+      </w:r>
+      <w:proofErr w:type="spellStart"/>
+      <w:r>
+        <w:rPr>
+          <w:rFonts w:ascii="Times New Roman" w:hAnsi="Times New Roman" w:cs="Times New Roman"/>
+          <w:lang w:val="en-GB"/>
+        </w:rPr>
+        <w:t>bagian-bagian</w:t>
+      </w:r>
+      <w:proofErr w:type="spellEnd"/>
+      <w:r>
+        <w:rPr>
+          <w:rFonts w:ascii="Times New Roman" w:hAnsi="Times New Roman" w:cs="Times New Roman"/>
+          <w:lang w:val="en-GB"/>
+        </w:rPr>
+        <w:t xml:space="preserve"> </w:t>
+      </w:r>
+      <w:proofErr w:type="spellStart"/>
+      <w:r>
+        <w:rPr>
+          <w:rFonts w:ascii="Times New Roman" w:hAnsi="Times New Roman" w:cs="Times New Roman"/>
+          <w:lang w:val="en-GB"/>
+        </w:rPr>
+        <w:t>fitur</w:t>
+      </w:r>
+      <w:proofErr w:type="spellEnd"/>
+      <w:r>
+        <w:rPr>
+          <w:rFonts w:ascii="Times New Roman" w:hAnsi="Times New Roman" w:cs="Times New Roman"/>
+          <w:lang w:val="en-GB"/>
+        </w:rPr>
+        <w:t xml:space="preserve"> </w:t>
+      </w:r>
+      <w:proofErr w:type="spellStart"/>
+      <w:r>
+        <w:rPr>
+          <w:rFonts w:ascii="Times New Roman" w:hAnsi="Times New Roman" w:cs="Times New Roman"/>
+          <w:lang w:val="en-GB"/>
+        </w:rPr>
+        <w:t>Kategori</w:t>
+      </w:r>
+      <w:proofErr w:type="spellEnd"/>
+      <w:r>
+        <w:rPr>
+          <w:rFonts w:ascii="Times New Roman" w:hAnsi="Times New Roman" w:cs="Times New Roman"/>
+          <w:lang w:val="en-GB"/>
+        </w:rPr>
+        <w:t xml:space="preserve"> agar </w:t>
+      </w:r>
+      <w:proofErr w:type="spellStart"/>
+      <w:r>
+        <w:rPr>
+          <w:rFonts w:ascii="Times New Roman" w:hAnsi="Times New Roman" w:cs="Times New Roman"/>
+          <w:lang w:val="en-GB"/>
+        </w:rPr>
+        <w:t>bisa</w:t>
+      </w:r>
+      <w:proofErr w:type="spellEnd"/>
+      <w:r>
+        <w:rPr>
+          <w:rFonts w:ascii="Times New Roman" w:hAnsi="Times New Roman" w:cs="Times New Roman"/>
+          <w:lang w:val="en-GB"/>
+        </w:rPr>
+        <w:t xml:space="preserve"> </w:t>
+      </w:r>
+      <w:proofErr w:type="spellStart"/>
+      <w:r>
+        <w:rPr>
+          <w:rFonts w:ascii="Times New Roman" w:hAnsi="Times New Roman" w:cs="Times New Roman"/>
+          <w:lang w:val="en-GB"/>
+        </w:rPr>
+        <w:t>bekerja</w:t>
+      </w:r>
+      <w:proofErr w:type="spellEnd"/>
+      <w:r>
+        <w:rPr>
+          <w:rFonts w:ascii="Times New Roman" w:hAnsi="Times New Roman" w:cs="Times New Roman"/>
+          <w:lang w:val="en-GB"/>
+        </w:rPr>
+        <w:t xml:space="preserve"> </w:t>
+      </w:r>
+      <w:proofErr w:type="spellStart"/>
+      <w:r>
+        <w:rPr>
+          <w:rFonts w:ascii="Times New Roman" w:hAnsi="Times New Roman" w:cs="Times New Roman"/>
+          <w:lang w:val="en-GB"/>
+        </w:rPr>
+        <w:t>bersama-sama</w:t>
+      </w:r>
+      <w:proofErr w:type="spellEnd"/>
+      <w:r>
+        <w:rPr>
+          <w:rFonts w:ascii="Times New Roman" w:hAnsi="Times New Roman" w:cs="Times New Roman"/>
+          <w:lang w:val="en-GB"/>
+        </w:rPr>
+        <w:t>.</w:t>
+      </w:r>
+    </w:p>
+    <w:p>
+      <w:pPr>
+        <w:jc w:val="both"/>
+        <w:rPr>
+          <w:rFonts w:ascii="Times New Roman" w:hAnsi="Times New Roman" w:cs="Times New Roman"/>
+          <w:lang w:val="en-GB"/>
+        </w:rPr>
+      </w:pPr>
+    </w:p>
+    <w:p>
+      <w:pPr>
+        <w:jc w:val="both"/>
+        <w:rPr>
+          <w:rFonts w:ascii="Times New Roman" w:hAnsi="Times New Roman" w:cs="Times New Roman"/>
+          <w:lang w:val="en-GB"/>
+        </w:rPr>
+      </w:pPr>
+      <w:r>
+        <w:rPr>
+          <w:rFonts w:ascii="Times New Roman" w:hAnsi="Times New Roman" w:cs="Times New Roman"/>
+          <w:lang w:val="en-GB"/>
+        </w:rPr>
+        <w:t>20.</w:t>
+      </w:r>
+      <w:r>
+        <w:rPr>
+          <w:rFonts w:ascii="Times New Roman" w:hAnsi="Times New Roman" w:cs="Times New Roman"/>
+          <w:lang w:val="en-GB"/>
+        </w:rPr>
+        <w:t xml:space="preserve"> </w:t>
+      </w:r>
+      <w:proofErr w:type="spellStart"/>
+      <w:r>
+        <w:rPr>
+          <w:rFonts w:ascii="Times New Roman" w:hAnsi="Times New Roman" w:cs="Times New Roman"/>
+          <w:lang w:val="en-GB"/>
+        </w:rPr>
+        <w:t>Membuat</w:t>
+      </w:r>
+      <w:proofErr w:type="spellEnd"/>
+      <w:r>
+        <w:rPr>
+          <w:rFonts w:ascii="Times New Roman" w:hAnsi="Times New Roman" w:cs="Times New Roman"/>
+          <w:lang w:val="en-GB"/>
+        </w:rPr>
+        <w:t xml:space="preserve"> </w:t>
+      </w:r>
+      <w:r>
+        <w:rPr>
+          <w:rFonts w:ascii="Times New Roman" w:hAnsi="Times New Roman" w:cs="Times New Roman"/>
+          <w:lang w:val="en-GB"/>
+        </w:rPr>
+        <w:t>Setup Tests</w:t>
+      </w:r>
+    </w:p>
+    <w:p>
+      <w:pPr>
+        <w:jc w:val="both"/>
+        <w:rPr>
+          <w:rFonts w:ascii="Times New Roman" w:hAnsi="Times New Roman" w:cs="Times New Roman"/>
+          <w:lang w:val="en-GB"/>
+        </w:rPr>
+      </w:pPr>
+      <w:proofErr w:type="gramStart"/>
+      <w:r>
+        <w:rPr>
+          <w:rFonts w:ascii="Times New Roman" w:hAnsi="Times New Roman" w:cs="Times New Roman"/>
+          <w:lang w:val="en-GB"/>
+        </w:rPr>
+        <w:t>File :</w:t>
+      </w:r>
+      <w:proofErr w:type="gramEnd"/>
+      <w:r>
+        <w:rPr>
+          <w:rFonts w:ascii="Times New Roman" w:hAnsi="Times New Roman" w:cs="Times New Roman"/>
+          <w:lang w:val="en-GB"/>
+        </w:rPr>
+        <w:t xml:space="preserve"> </w:t>
+      </w:r>
+      <w:r>
+        <w:t>jest.config.js</w:t>
+      </w:r>
+      <w:r>
+        <w:rPr>
+          <w:rFonts w:ascii="Times New Roman" w:hAnsi="Times New Roman" w:cs="Times New Roman"/>
+          <w:lang w:val="en-GB"/>
+        </w:rPr>
+        <w:t xml:space="preserve"> </w:t>
+      </w:r>
+    </w:p>
+    <w:p>
+      <w:pPr>
+        <w:jc w:val="both"/>
+        <w:rPr>
+          <w:rFonts w:ascii="Times New Roman" w:hAnsi="Times New Roman" w:cs="Times New Roman"/>
+          <w:lang w:val="en-GB"/>
+        </w:rPr>
+      </w:pPr>
+    </w:p>
+    <w:p>
+      <w:pPr>
+        <w:jc w:val="both"/>
+        <w:rPr>
+          <w:rFonts w:ascii="Times New Roman" w:hAnsi="Times New Roman" w:cs="Times New Roman"/>
+          <w:lang w:val="en-GB"/>
+        </w:rPr>
+      </w:pPr>
+      <w:r>
+        <w:rPr>
+          <w:noProof/>
+        </w:rPr>
+        <w:lastRenderedPageBreak/>
+        <w:drawing>
+          <wp:inline distT="0" distB="0" distL="0" distR="0" wp14:anchorId="3CB296EA" wp14:editId="08CC5C56">
+            <wp:extent cx="5731510" cy="3222625"/>
+            <wp:effectExtent l="0" t="0" r="2540" b="0"/>
+            <wp:docPr id="1152171744" name="Picture 1"/>
+            <wp:cNvGraphicFramePr>
+              <a:graphicFrameLocks xmlns:a="http://schemas.openxmlformats.org/drawingml/2006/main" noChangeAspect="1"/>
+            </wp:cNvGraphicFramePr>
+            <a:graphic xmlns:a="http://schemas.openxmlformats.org/drawingml/2006/main">
+              <a:graphicData uri="http://schemas.openxmlformats.org/drawingml/2006/picture">
+                <pic:pic xmlns:pic="http://schemas.openxmlformats.org/drawingml/2006/picture">
+                  <pic:nvPicPr>
+                    <pic:cNvPr id="1152171744" name=""/>
+                    <pic:cNvPicPr/>
+                  </pic:nvPicPr>
+                  <pic:blipFill>
+                    <a:blip r:embed="rId24"/>
+                    <a:stretch>
+                      <a:fillRect/>
+                    </a:stretch>
+                  </pic:blipFill>
+                  <pic:spPr>
+                    <a:xfrm>
+                      <a:off x="0" y="0"/>
+                      <a:ext cx="5731510" cy="3222625"/>
+                    </a:xfrm>
+                    <a:prstGeom prst="rect">
+                      <a:avLst/>
+                    </a:prstGeom>
+                  </pic:spPr>
+                </pic:pic>
+              </a:graphicData>
+            </a:graphic>
+          </wp:inline>
+        </w:drawing>
+      </w:r>
+    </w:p>
+    <w:p>
+      <w:pPr>
+        <w:jc w:val="both"/>
+        <w:rPr>
+          <w:rFonts w:ascii="Times New Roman" w:hAnsi="Times New Roman" w:cs="Times New Roman"/>
+          <w:lang w:val="en-GB"/>
+        </w:rPr>
+      </w:pPr>
+      <w:r>
+        <w:rPr>
+          <w:rFonts w:ascii="Times New Roman" w:hAnsi="Times New Roman" w:cs="Times New Roman"/>
+          <w:lang w:val="en-GB"/>
+        </w:rPr>
+        <w:t xml:space="preserve">File </w:t>
+      </w:r>
+      <w:proofErr w:type="spellStart"/>
+      <w:r>
+        <w:rPr>
+          <w:rFonts w:ascii="Times New Roman" w:hAnsi="Times New Roman" w:cs="Times New Roman"/>
+          <w:lang w:val="en-GB"/>
+        </w:rPr>
+        <w:t>ini</w:t>
+      </w:r>
+      <w:proofErr w:type="spellEnd"/>
+      <w:r>
+        <w:rPr>
+          <w:rFonts w:ascii="Times New Roman" w:hAnsi="Times New Roman" w:cs="Times New Roman"/>
+          <w:lang w:val="en-GB"/>
+        </w:rPr>
+        <w:t xml:space="preserve"> </w:t>
+      </w:r>
+      <w:proofErr w:type="spellStart"/>
+      <w:r>
+        <w:rPr>
+          <w:rFonts w:ascii="Times New Roman" w:hAnsi="Times New Roman" w:cs="Times New Roman"/>
+          <w:lang w:val="en-GB"/>
+        </w:rPr>
+        <w:t>adalah</w:t>
+      </w:r>
+      <w:proofErr w:type="spellEnd"/>
+      <w:r>
+        <w:rPr>
+          <w:rFonts w:ascii="Times New Roman" w:hAnsi="Times New Roman" w:cs="Times New Roman"/>
+          <w:lang w:val="en-GB"/>
+        </w:rPr>
+        <w:t xml:space="preserve"> </w:t>
+      </w:r>
+      <w:proofErr w:type="spellStart"/>
+      <w:r>
+        <w:rPr>
+          <w:rFonts w:ascii="Times New Roman" w:hAnsi="Times New Roman" w:cs="Times New Roman"/>
+          <w:lang w:val="en-GB"/>
+        </w:rPr>
+        <w:t>pengaturan</w:t>
+      </w:r>
+      <w:proofErr w:type="spellEnd"/>
+      <w:r>
+        <w:rPr>
+          <w:rFonts w:ascii="Times New Roman" w:hAnsi="Times New Roman" w:cs="Times New Roman"/>
+          <w:lang w:val="en-GB"/>
+        </w:rPr>
+        <w:t xml:space="preserve"> </w:t>
+      </w:r>
+      <w:proofErr w:type="spellStart"/>
+      <w:r>
+        <w:rPr>
+          <w:rFonts w:ascii="Times New Roman" w:hAnsi="Times New Roman" w:cs="Times New Roman"/>
+          <w:lang w:val="en-GB"/>
+        </w:rPr>
+        <w:t>mesin</w:t>
+      </w:r>
+      <w:proofErr w:type="spellEnd"/>
+      <w:r>
+        <w:rPr>
+          <w:rFonts w:ascii="Times New Roman" w:hAnsi="Times New Roman" w:cs="Times New Roman"/>
+          <w:lang w:val="en-GB"/>
+        </w:rPr>
+        <w:t xml:space="preserve"> </w:t>
+      </w:r>
+      <w:proofErr w:type="spellStart"/>
+      <w:r>
+        <w:rPr>
+          <w:rFonts w:ascii="Times New Roman" w:hAnsi="Times New Roman" w:cs="Times New Roman"/>
+          <w:lang w:val="en-GB"/>
+        </w:rPr>
+        <w:t>pemeriksa</w:t>
+      </w:r>
+      <w:proofErr w:type="spellEnd"/>
+      <w:r>
+        <w:rPr>
+          <w:rFonts w:ascii="Times New Roman" w:hAnsi="Times New Roman" w:cs="Times New Roman"/>
+          <w:lang w:val="en-GB"/>
+        </w:rPr>
+        <w:t>,</w:t>
+      </w:r>
+      <w:r>
+        <w:rPr>
+          <w:rFonts w:ascii="Times New Roman" w:hAnsi="Times New Roman" w:cs="Times New Roman"/>
+          <w:lang w:val="en-GB"/>
+        </w:rPr>
+        <w:t xml:space="preserve"> </w:t>
+      </w:r>
+      <w:proofErr w:type="spellStart"/>
+      <w:r>
+        <w:rPr>
+          <w:rFonts w:ascii="Times New Roman" w:hAnsi="Times New Roman" w:cs="Times New Roman"/>
+          <w:lang w:val="en-GB"/>
+        </w:rPr>
+        <w:t>menentukan</w:t>
+      </w:r>
+      <w:proofErr w:type="spellEnd"/>
+      <w:r>
+        <w:rPr>
+          <w:rFonts w:ascii="Times New Roman" w:hAnsi="Times New Roman" w:cs="Times New Roman"/>
+          <w:lang w:val="en-GB"/>
+        </w:rPr>
+        <w:t xml:space="preserve"> </w:t>
+      </w:r>
+      <w:proofErr w:type="spellStart"/>
+      <w:r>
+        <w:rPr>
+          <w:rFonts w:ascii="Times New Roman" w:hAnsi="Times New Roman" w:cs="Times New Roman"/>
+          <w:lang w:val="en-GB"/>
+        </w:rPr>
+        <w:t>dokumen</w:t>
+      </w:r>
+      <w:proofErr w:type="spellEnd"/>
+      <w:r>
+        <w:rPr>
+          <w:rFonts w:ascii="Times New Roman" w:hAnsi="Times New Roman" w:cs="Times New Roman"/>
+          <w:lang w:val="en-GB"/>
+        </w:rPr>
+        <w:t xml:space="preserve"> mana yang </w:t>
+      </w:r>
+      <w:proofErr w:type="spellStart"/>
+      <w:r>
+        <w:rPr>
+          <w:rFonts w:ascii="Times New Roman" w:hAnsi="Times New Roman" w:cs="Times New Roman"/>
+          <w:lang w:val="en-GB"/>
+        </w:rPr>
+        <w:t>harus</w:t>
+      </w:r>
+      <w:proofErr w:type="spellEnd"/>
+      <w:r>
+        <w:rPr>
+          <w:rFonts w:ascii="Times New Roman" w:hAnsi="Times New Roman" w:cs="Times New Roman"/>
+          <w:lang w:val="en-GB"/>
+        </w:rPr>
+        <w:t xml:space="preserve"> </w:t>
+      </w:r>
+      <w:proofErr w:type="spellStart"/>
+      <w:r>
+        <w:rPr>
+          <w:rFonts w:ascii="Times New Roman" w:hAnsi="Times New Roman" w:cs="Times New Roman"/>
+          <w:lang w:val="en-GB"/>
+        </w:rPr>
+        <w:t>diperiksa</w:t>
+      </w:r>
+      <w:proofErr w:type="spellEnd"/>
+      <w:r>
+        <w:rPr>
+          <w:rFonts w:ascii="Times New Roman" w:hAnsi="Times New Roman" w:cs="Times New Roman"/>
+          <w:lang w:val="en-GB"/>
+        </w:rPr>
+        <w:t xml:space="preserve">, </w:t>
+      </w:r>
+      <w:proofErr w:type="spellStart"/>
+      <w:r>
+        <w:rPr>
+          <w:rFonts w:ascii="Times New Roman" w:hAnsi="Times New Roman" w:cs="Times New Roman"/>
+          <w:lang w:val="en-GB"/>
+        </w:rPr>
+        <w:t>cara</w:t>
+      </w:r>
+      <w:proofErr w:type="spellEnd"/>
+      <w:r>
+        <w:rPr>
+          <w:rFonts w:ascii="Times New Roman" w:hAnsi="Times New Roman" w:cs="Times New Roman"/>
+          <w:lang w:val="en-GB"/>
+        </w:rPr>
+        <w:t xml:space="preserve"> </w:t>
+      </w:r>
+      <w:proofErr w:type="spellStart"/>
+      <w:r>
+        <w:rPr>
+          <w:rFonts w:ascii="Times New Roman" w:hAnsi="Times New Roman" w:cs="Times New Roman"/>
+          <w:lang w:val="en-GB"/>
+        </w:rPr>
+        <w:t>membacanya</w:t>
+      </w:r>
+      <w:proofErr w:type="spellEnd"/>
+      <w:r>
+        <w:rPr>
+          <w:rFonts w:ascii="Times New Roman" w:hAnsi="Times New Roman" w:cs="Times New Roman"/>
+          <w:lang w:val="en-GB"/>
+        </w:rPr>
+        <w:t xml:space="preserve">, dan di mana </w:t>
+      </w:r>
+      <w:proofErr w:type="spellStart"/>
+      <w:r>
+        <w:rPr>
+          <w:rFonts w:ascii="Times New Roman" w:hAnsi="Times New Roman" w:cs="Times New Roman"/>
+          <w:lang w:val="en-GB"/>
+        </w:rPr>
+        <w:t>harus</w:t>
+      </w:r>
+      <w:proofErr w:type="spellEnd"/>
+      <w:r>
+        <w:rPr>
+          <w:rFonts w:ascii="Times New Roman" w:hAnsi="Times New Roman" w:cs="Times New Roman"/>
+          <w:lang w:val="en-GB"/>
+        </w:rPr>
+        <w:t xml:space="preserve"> </w:t>
+      </w:r>
+      <w:proofErr w:type="spellStart"/>
+      <w:r>
+        <w:rPr>
+          <w:rFonts w:ascii="Times New Roman" w:hAnsi="Times New Roman" w:cs="Times New Roman"/>
+          <w:lang w:val="en-GB"/>
+        </w:rPr>
+        <w:t>menyimpan</w:t>
+      </w:r>
+      <w:proofErr w:type="spellEnd"/>
+      <w:r>
+        <w:rPr>
+          <w:rFonts w:ascii="Times New Roman" w:hAnsi="Times New Roman" w:cs="Times New Roman"/>
+          <w:lang w:val="en-GB"/>
+        </w:rPr>
+        <w:t xml:space="preserve"> </w:t>
+      </w:r>
+      <w:proofErr w:type="spellStart"/>
+      <w:r>
+        <w:rPr>
+          <w:rFonts w:ascii="Times New Roman" w:hAnsi="Times New Roman" w:cs="Times New Roman"/>
+          <w:lang w:val="en-GB"/>
+        </w:rPr>
+        <w:t>laporan</w:t>
+      </w:r>
+      <w:proofErr w:type="spellEnd"/>
+      <w:r>
+        <w:rPr>
+          <w:rFonts w:ascii="Times New Roman" w:hAnsi="Times New Roman" w:cs="Times New Roman"/>
+          <w:lang w:val="en-GB"/>
+        </w:rPr>
+        <w:t xml:space="preserve"> </w:t>
+      </w:r>
+      <w:proofErr w:type="spellStart"/>
+      <w:r>
+        <w:rPr>
+          <w:rFonts w:ascii="Times New Roman" w:hAnsi="Times New Roman" w:cs="Times New Roman"/>
+          <w:lang w:val="en-GB"/>
+        </w:rPr>
+        <w:t>hasilnya</w:t>
+      </w:r>
+      <w:proofErr w:type="spellEnd"/>
+      <w:r>
+        <w:rPr>
+          <w:rFonts w:ascii="Times New Roman" w:hAnsi="Times New Roman" w:cs="Times New Roman"/>
+          <w:lang w:val="en-GB"/>
+        </w:rPr>
+        <w:t>.</w:t>
+      </w:r>
+    </w:p>
+    <w:p>
+      <w:pPr>
+        <w:pStyle w:val="ListParagraph"/>
+        <w:numPr>
+          <w:ilvl w:val="0"/>
+          <w:numId w:val="13"/>
+        </w:numPr>
+        <w:jc w:val="both"/>
+        <w:rPr>
+          <w:rFonts w:ascii="Times New Roman" w:hAnsi="Times New Roman" w:cs="Times New Roman"/>
+          <w:lang w:val="en-GB"/>
+        </w:rPr>
+      </w:pPr>
+      <w:proofErr w:type="spellStart"/>
+      <w:r>
+        <w:rPr>
+          <w:rFonts w:ascii="Times New Roman" w:hAnsi="Times New Roman" w:cs="Times New Roman"/>
+          <w:lang w:val="en-GB"/>
+        </w:rPr>
+        <w:t>Pendeteksi</w:t>
+      </w:r>
+      <w:proofErr w:type="spellEnd"/>
+      <w:r>
+        <w:rPr>
+          <w:rFonts w:ascii="Times New Roman" w:hAnsi="Times New Roman" w:cs="Times New Roman"/>
+          <w:lang w:val="en-GB"/>
+        </w:rPr>
+        <w:t xml:space="preserve"> Bug </w:t>
+      </w:r>
+      <w:proofErr w:type="spellStart"/>
+      <w:r>
+        <w:rPr>
+          <w:rFonts w:ascii="Times New Roman" w:hAnsi="Times New Roman" w:cs="Times New Roman"/>
+          <w:lang w:val="en-GB"/>
+        </w:rPr>
+        <w:t>Otomatis</w:t>
+      </w:r>
+      <w:proofErr w:type="spellEnd"/>
+      <w:r>
+        <w:rPr>
+          <w:rFonts w:ascii="Times New Roman" w:hAnsi="Times New Roman" w:cs="Times New Roman"/>
+          <w:lang w:val="en-GB"/>
+        </w:rPr>
+        <w:t xml:space="preserve">: </w:t>
+      </w:r>
+      <w:proofErr w:type="spellStart"/>
+      <w:r>
+        <w:rPr>
+          <w:rFonts w:ascii="Times New Roman" w:hAnsi="Times New Roman" w:cs="Times New Roman"/>
+          <w:lang w:val="en-GB"/>
+        </w:rPr>
+        <w:t>tidak</w:t>
+      </w:r>
+      <w:proofErr w:type="spellEnd"/>
+      <w:r>
+        <w:rPr>
+          <w:rFonts w:ascii="Times New Roman" w:hAnsi="Times New Roman" w:cs="Times New Roman"/>
+          <w:lang w:val="en-GB"/>
+        </w:rPr>
+        <w:t xml:space="preserve"> </w:t>
+      </w:r>
+      <w:proofErr w:type="spellStart"/>
+      <w:r>
+        <w:rPr>
+          <w:rFonts w:ascii="Times New Roman" w:hAnsi="Times New Roman" w:cs="Times New Roman"/>
+          <w:lang w:val="en-GB"/>
+        </w:rPr>
+        <w:t>perlu</w:t>
+      </w:r>
+      <w:proofErr w:type="spellEnd"/>
+      <w:r>
+        <w:rPr>
+          <w:rFonts w:ascii="Times New Roman" w:hAnsi="Times New Roman" w:cs="Times New Roman"/>
+          <w:lang w:val="en-GB"/>
+        </w:rPr>
+        <w:t xml:space="preserve"> </w:t>
+      </w:r>
+      <w:proofErr w:type="spellStart"/>
+      <w:r>
+        <w:rPr>
+          <w:rFonts w:ascii="Times New Roman" w:hAnsi="Times New Roman" w:cs="Times New Roman"/>
+          <w:lang w:val="en-GB"/>
+        </w:rPr>
+        <w:t>mencoba</w:t>
+      </w:r>
+      <w:proofErr w:type="spellEnd"/>
+      <w:r>
+        <w:rPr>
+          <w:rFonts w:ascii="Times New Roman" w:hAnsi="Times New Roman" w:cs="Times New Roman"/>
+          <w:lang w:val="en-GB"/>
+        </w:rPr>
+        <w:t xml:space="preserve"> </w:t>
+      </w:r>
+      <w:proofErr w:type="spellStart"/>
+      <w:r>
+        <w:rPr>
+          <w:rFonts w:ascii="Times New Roman" w:hAnsi="Times New Roman" w:cs="Times New Roman"/>
+          <w:lang w:val="en-GB"/>
+        </w:rPr>
+        <w:t>aplikasi</w:t>
+      </w:r>
+      <w:proofErr w:type="spellEnd"/>
+      <w:r>
+        <w:rPr>
+          <w:rFonts w:ascii="Times New Roman" w:hAnsi="Times New Roman" w:cs="Times New Roman"/>
+          <w:lang w:val="en-GB"/>
+        </w:rPr>
+        <w:t xml:space="preserve"> </w:t>
+      </w:r>
+      <w:proofErr w:type="spellStart"/>
+      <w:r>
+        <w:rPr>
+          <w:rFonts w:ascii="Times New Roman" w:hAnsi="Times New Roman" w:cs="Times New Roman"/>
+          <w:lang w:val="en-GB"/>
+        </w:rPr>
+        <w:t>secara</w:t>
+      </w:r>
+      <w:proofErr w:type="spellEnd"/>
+      <w:r>
+        <w:rPr>
+          <w:rFonts w:ascii="Times New Roman" w:hAnsi="Times New Roman" w:cs="Times New Roman"/>
+          <w:lang w:val="en-GB"/>
+        </w:rPr>
+        <w:t xml:space="preserve"> manual </w:t>
+      </w:r>
+      <w:proofErr w:type="spellStart"/>
+      <w:r>
+        <w:rPr>
+          <w:rFonts w:ascii="Times New Roman" w:hAnsi="Times New Roman" w:cs="Times New Roman"/>
+          <w:lang w:val="en-GB"/>
+        </w:rPr>
+        <w:t>satu</w:t>
+      </w:r>
+      <w:proofErr w:type="spellEnd"/>
+      <w:r>
+        <w:rPr>
+          <w:rFonts w:ascii="Times New Roman" w:hAnsi="Times New Roman" w:cs="Times New Roman"/>
+          <w:lang w:val="en-GB"/>
+        </w:rPr>
+        <w:t xml:space="preserve"> per </w:t>
+      </w:r>
+      <w:proofErr w:type="spellStart"/>
+      <w:r>
+        <w:rPr>
+          <w:rFonts w:ascii="Times New Roman" w:hAnsi="Times New Roman" w:cs="Times New Roman"/>
+          <w:lang w:val="en-GB"/>
+        </w:rPr>
+        <w:t>satu</w:t>
+      </w:r>
+      <w:proofErr w:type="spellEnd"/>
+      <w:r>
+        <w:rPr>
+          <w:rFonts w:ascii="Times New Roman" w:hAnsi="Times New Roman" w:cs="Times New Roman"/>
+          <w:lang w:val="en-GB"/>
+        </w:rPr>
+        <w:t xml:space="preserve">. </w:t>
+      </w:r>
+      <w:proofErr w:type="spellStart"/>
+      <w:r>
+        <w:rPr>
+          <w:rFonts w:ascii="Times New Roman" w:hAnsi="Times New Roman" w:cs="Times New Roman"/>
+          <w:lang w:val="en-GB"/>
+        </w:rPr>
+        <w:t>Mesin</w:t>
+      </w:r>
+      <w:proofErr w:type="spellEnd"/>
+      <w:r>
+        <w:rPr>
+          <w:rFonts w:ascii="Times New Roman" w:hAnsi="Times New Roman" w:cs="Times New Roman"/>
+          <w:lang w:val="en-GB"/>
+        </w:rPr>
+        <w:t xml:space="preserve"> </w:t>
+      </w:r>
+      <w:proofErr w:type="spellStart"/>
+      <w:r>
+        <w:rPr>
+          <w:rFonts w:ascii="Times New Roman" w:hAnsi="Times New Roman" w:cs="Times New Roman"/>
+          <w:lang w:val="en-GB"/>
+        </w:rPr>
+        <w:t>ini</w:t>
+      </w:r>
+      <w:proofErr w:type="spellEnd"/>
+      <w:r>
+        <w:rPr>
+          <w:rFonts w:ascii="Times New Roman" w:hAnsi="Times New Roman" w:cs="Times New Roman"/>
+          <w:lang w:val="en-GB"/>
+        </w:rPr>
+        <w:t xml:space="preserve"> </w:t>
+      </w:r>
+      <w:proofErr w:type="spellStart"/>
+      <w:r>
+        <w:rPr>
+          <w:rFonts w:ascii="Times New Roman" w:hAnsi="Times New Roman" w:cs="Times New Roman"/>
+          <w:lang w:val="en-GB"/>
+        </w:rPr>
+        <w:t>akan</w:t>
+      </w:r>
+      <w:proofErr w:type="spellEnd"/>
+      <w:r>
+        <w:rPr>
+          <w:rFonts w:ascii="Times New Roman" w:hAnsi="Times New Roman" w:cs="Times New Roman"/>
+          <w:lang w:val="en-GB"/>
+        </w:rPr>
+        <w:t xml:space="preserve"> </w:t>
+      </w:r>
+      <w:proofErr w:type="spellStart"/>
+      <w:r>
+        <w:rPr>
+          <w:rFonts w:ascii="Times New Roman" w:hAnsi="Times New Roman" w:cs="Times New Roman"/>
+          <w:lang w:val="en-GB"/>
+        </w:rPr>
+        <w:t>menjalankan</w:t>
+      </w:r>
+      <w:proofErr w:type="spellEnd"/>
+      <w:r>
+        <w:rPr>
+          <w:rFonts w:ascii="Times New Roman" w:hAnsi="Times New Roman" w:cs="Times New Roman"/>
+          <w:lang w:val="en-GB"/>
+        </w:rPr>
+        <w:t xml:space="preserve"> </w:t>
+      </w:r>
+      <w:proofErr w:type="spellStart"/>
+      <w:r>
+        <w:rPr>
+          <w:rFonts w:ascii="Times New Roman" w:hAnsi="Times New Roman" w:cs="Times New Roman"/>
+          <w:lang w:val="en-GB"/>
+        </w:rPr>
+        <w:t>ribuan</w:t>
+      </w:r>
+      <w:proofErr w:type="spellEnd"/>
+      <w:r>
+        <w:rPr>
+          <w:rFonts w:ascii="Times New Roman" w:hAnsi="Times New Roman" w:cs="Times New Roman"/>
+          <w:lang w:val="en-GB"/>
+        </w:rPr>
+        <w:t xml:space="preserve"> </w:t>
+      </w:r>
+      <w:proofErr w:type="spellStart"/>
+      <w:r>
+        <w:rPr>
+          <w:rFonts w:ascii="Times New Roman" w:hAnsi="Times New Roman" w:cs="Times New Roman"/>
+          <w:lang w:val="en-GB"/>
+        </w:rPr>
+        <w:t>tes</w:t>
+      </w:r>
+      <w:proofErr w:type="spellEnd"/>
+      <w:r>
+        <w:rPr>
+          <w:rFonts w:ascii="Times New Roman" w:hAnsi="Times New Roman" w:cs="Times New Roman"/>
+          <w:lang w:val="en-GB"/>
+        </w:rPr>
+        <w:t xml:space="preserve"> </w:t>
+      </w:r>
+      <w:proofErr w:type="spellStart"/>
+      <w:r>
+        <w:rPr>
+          <w:rFonts w:ascii="Times New Roman" w:hAnsi="Times New Roman" w:cs="Times New Roman"/>
+          <w:lang w:val="en-GB"/>
+        </w:rPr>
+        <w:t>dalam</w:t>
+      </w:r>
+      <w:proofErr w:type="spellEnd"/>
+      <w:r>
+        <w:rPr>
+          <w:rFonts w:ascii="Times New Roman" w:hAnsi="Times New Roman" w:cs="Times New Roman"/>
+          <w:lang w:val="en-GB"/>
+        </w:rPr>
+        <w:t xml:space="preserve"> </w:t>
+      </w:r>
+      <w:proofErr w:type="spellStart"/>
+      <w:r>
+        <w:rPr>
+          <w:rFonts w:ascii="Times New Roman" w:hAnsi="Times New Roman" w:cs="Times New Roman"/>
+          <w:lang w:val="en-GB"/>
+        </w:rPr>
+        <w:t>hitungan</w:t>
+      </w:r>
+      <w:proofErr w:type="spellEnd"/>
+      <w:r>
+        <w:rPr>
+          <w:rFonts w:ascii="Times New Roman" w:hAnsi="Times New Roman" w:cs="Times New Roman"/>
+          <w:lang w:val="en-GB"/>
+        </w:rPr>
+        <w:t xml:space="preserve"> </w:t>
+      </w:r>
+      <w:proofErr w:type="spellStart"/>
+      <w:r>
+        <w:rPr>
+          <w:rFonts w:ascii="Times New Roman" w:hAnsi="Times New Roman" w:cs="Times New Roman"/>
+          <w:lang w:val="en-GB"/>
+        </w:rPr>
+        <w:t>detik</w:t>
+      </w:r>
+      <w:proofErr w:type="spellEnd"/>
+      <w:r>
+        <w:rPr>
+          <w:rFonts w:ascii="Times New Roman" w:hAnsi="Times New Roman" w:cs="Times New Roman"/>
+          <w:lang w:val="en-GB"/>
+        </w:rPr>
+        <w:t>.</w:t>
+      </w:r>
+    </w:p>
+    <w:p>
+      <w:pPr>
+        <w:pStyle w:val="ListParagraph"/>
+        <w:numPr>
+          <w:ilvl w:val="0"/>
+          <w:numId w:val="13"/>
+        </w:numPr>
+        <w:jc w:val="both"/>
+        <w:rPr>
+          <w:rFonts w:ascii="Times New Roman" w:hAnsi="Times New Roman" w:cs="Times New Roman"/>
+          <w:lang w:val="en-GB"/>
+        </w:rPr>
+      </w:pPr>
+      <w:proofErr w:type="spellStart"/>
+      <w:r>
+        <w:rPr>
+          <w:rFonts w:ascii="Times New Roman" w:hAnsi="Times New Roman" w:cs="Times New Roman"/>
+          <w:lang w:val="en-GB"/>
+        </w:rPr>
+        <w:t>Laporan</w:t>
+      </w:r>
+      <w:proofErr w:type="spellEnd"/>
+      <w:r>
+        <w:rPr>
+          <w:rFonts w:ascii="Times New Roman" w:hAnsi="Times New Roman" w:cs="Times New Roman"/>
+          <w:lang w:val="en-GB"/>
+        </w:rPr>
+        <w:t xml:space="preserve"> Kesehatan (Coverage): </w:t>
+      </w:r>
+      <w:proofErr w:type="spellStart"/>
+      <w:r>
+        <w:rPr>
+          <w:rFonts w:ascii="Times New Roman" w:hAnsi="Times New Roman" w:cs="Times New Roman"/>
+          <w:lang w:val="en-GB"/>
+        </w:rPr>
+        <w:t>Memberi</w:t>
+      </w:r>
+      <w:proofErr w:type="spellEnd"/>
+      <w:r>
+        <w:rPr>
+          <w:rFonts w:ascii="Times New Roman" w:hAnsi="Times New Roman" w:cs="Times New Roman"/>
+          <w:lang w:val="en-GB"/>
+        </w:rPr>
+        <w:t xml:space="preserve"> </w:t>
+      </w:r>
+      <w:proofErr w:type="spellStart"/>
+      <w:proofErr w:type="gramStart"/>
+      <w:r>
+        <w:rPr>
+          <w:rFonts w:ascii="Times New Roman" w:hAnsi="Times New Roman" w:cs="Times New Roman"/>
+          <w:lang w:val="en-GB"/>
+        </w:rPr>
+        <w:t>tahu</w:t>
+      </w:r>
+      <w:proofErr w:type="spellEnd"/>
+      <w:r>
+        <w:rPr>
+          <w:rFonts w:ascii="Times New Roman" w:hAnsi="Times New Roman" w:cs="Times New Roman"/>
+          <w:lang w:val="en-GB"/>
+        </w:rPr>
+        <w:t xml:space="preserve"> :</w:t>
+      </w:r>
+      <w:proofErr w:type="gramEnd"/>
+      <w:r>
+        <w:rPr>
+          <w:rFonts w:ascii="Times New Roman" w:hAnsi="Times New Roman" w:cs="Times New Roman"/>
+          <w:lang w:val="en-GB"/>
+        </w:rPr>
+        <w:t xml:space="preserve"> Kode Anda </w:t>
+      </w:r>
+      <w:proofErr w:type="spellStart"/>
+      <w:r>
+        <w:rPr>
+          <w:rFonts w:ascii="Times New Roman" w:hAnsi="Times New Roman" w:cs="Times New Roman"/>
+          <w:lang w:val="en-GB"/>
+        </w:rPr>
+        <w:t>sudah</w:t>
+      </w:r>
+      <w:proofErr w:type="spellEnd"/>
+      <w:r>
+        <w:rPr>
+          <w:rFonts w:ascii="Times New Roman" w:hAnsi="Times New Roman" w:cs="Times New Roman"/>
+          <w:lang w:val="en-GB"/>
+        </w:rPr>
+        <w:t xml:space="preserve"> 80% </w:t>
+      </w:r>
+      <w:proofErr w:type="spellStart"/>
+      <w:r>
+        <w:rPr>
+          <w:rFonts w:ascii="Times New Roman" w:hAnsi="Times New Roman" w:cs="Times New Roman"/>
+          <w:lang w:val="en-GB"/>
+        </w:rPr>
+        <w:t>aman</w:t>
+      </w:r>
+      <w:proofErr w:type="spellEnd"/>
+      <w:r>
+        <w:rPr>
+          <w:rFonts w:ascii="Times New Roman" w:hAnsi="Times New Roman" w:cs="Times New Roman"/>
+          <w:lang w:val="en-GB"/>
+        </w:rPr>
+        <w:t xml:space="preserve">, </w:t>
+      </w:r>
+      <w:proofErr w:type="spellStart"/>
+      <w:r>
+        <w:rPr>
+          <w:rFonts w:ascii="Times New Roman" w:hAnsi="Times New Roman" w:cs="Times New Roman"/>
+          <w:lang w:val="en-GB"/>
+        </w:rPr>
+        <w:t>tapi</w:t>
+      </w:r>
+      <w:proofErr w:type="spellEnd"/>
+      <w:r>
+        <w:rPr>
+          <w:rFonts w:ascii="Times New Roman" w:hAnsi="Times New Roman" w:cs="Times New Roman"/>
+          <w:lang w:val="en-GB"/>
+        </w:rPr>
+        <w:t xml:space="preserve"> </w:t>
+      </w:r>
+      <w:proofErr w:type="spellStart"/>
+      <w:r>
+        <w:rPr>
+          <w:rFonts w:ascii="Times New Roman" w:hAnsi="Times New Roman" w:cs="Times New Roman"/>
+          <w:lang w:val="en-GB"/>
+        </w:rPr>
+        <w:t>ada</w:t>
+      </w:r>
+      <w:proofErr w:type="spellEnd"/>
+      <w:r>
+        <w:rPr>
+          <w:rFonts w:ascii="Times New Roman" w:hAnsi="Times New Roman" w:cs="Times New Roman"/>
+          <w:lang w:val="en-GB"/>
+        </w:rPr>
+        <w:t xml:space="preserve"> 20% </w:t>
+      </w:r>
+      <w:proofErr w:type="spellStart"/>
+      <w:r>
+        <w:rPr>
+          <w:rFonts w:ascii="Times New Roman" w:hAnsi="Times New Roman" w:cs="Times New Roman"/>
+          <w:lang w:val="en-GB"/>
+        </w:rPr>
+        <w:t>bagian</w:t>
+      </w:r>
+      <w:proofErr w:type="spellEnd"/>
+      <w:r>
+        <w:rPr>
+          <w:rFonts w:ascii="Times New Roman" w:hAnsi="Times New Roman" w:cs="Times New Roman"/>
+          <w:lang w:val="en-GB"/>
+        </w:rPr>
+        <w:t xml:space="preserve"> yang </w:t>
+      </w:r>
+      <w:proofErr w:type="spellStart"/>
+      <w:r>
+        <w:rPr>
+          <w:rFonts w:ascii="Times New Roman" w:hAnsi="Times New Roman" w:cs="Times New Roman"/>
+          <w:lang w:val="en-GB"/>
+        </w:rPr>
+        <w:t>belum</w:t>
+      </w:r>
+      <w:proofErr w:type="spellEnd"/>
+      <w:r>
+        <w:rPr>
+          <w:rFonts w:ascii="Times New Roman" w:hAnsi="Times New Roman" w:cs="Times New Roman"/>
+          <w:lang w:val="en-GB"/>
+        </w:rPr>
+        <w:t xml:space="preserve"> </w:t>
+      </w:r>
+      <w:proofErr w:type="spellStart"/>
+      <w:r>
+        <w:rPr>
+          <w:rFonts w:ascii="Times New Roman" w:hAnsi="Times New Roman" w:cs="Times New Roman"/>
+          <w:lang w:val="en-GB"/>
+        </w:rPr>
+        <w:t>dites</w:t>
+      </w:r>
+      <w:proofErr w:type="spellEnd"/>
+      <w:r>
+        <w:rPr>
+          <w:rFonts w:ascii="Times New Roman" w:hAnsi="Times New Roman" w:cs="Times New Roman"/>
+          <w:lang w:val="en-GB"/>
+        </w:rPr>
+        <w:t xml:space="preserve"> dan </w:t>
+      </w:r>
+      <w:proofErr w:type="spellStart"/>
+      <w:r>
+        <w:rPr>
+          <w:rFonts w:ascii="Times New Roman" w:hAnsi="Times New Roman" w:cs="Times New Roman"/>
+          <w:lang w:val="en-GB"/>
+        </w:rPr>
+        <w:t>berisiko</w:t>
+      </w:r>
+      <w:proofErr w:type="spellEnd"/>
+      <w:r>
+        <w:rPr>
+          <w:rFonts w:ascii="Times New Roman" w:hAnsi="Times New Roman" w:cs="Times New Roman"/>
+          <w:lang w:val="en-GB"/>
+        </w:rPr>
+        <w:t xml:space="preserve"> </w:t>
+      </w:r>
+      <w:proofErr w:type="spellStart"/>
+      <w:r>
+        <w:rPr>
+          <w:rFonts w:ascii="Times New Roman" w:hAnsi="Times New Roman" w:cs="Times New Roman"/>
+          <w:lang w:val="en-GB"/>
+        </w:rPr>
+        <w:t>rusak</w:t>
+      </w:r>
+      <w:proofErr w:type="spellEnd"/>
+      <w:r>
+        <w:rPr>
+          <w:rFonts w:ascii="Times New Roman" w:hAnsi="Times New Roman" w:cs="Times New Roman"/>
+          <w:lang w:val="en-GB"/>
+        </w:rPr>
+        <w:t>.</w:t>
+      </w:r>
+    </w:p>
+    <w:p>
+      <w:pPr>
+        <w:pStyle w:val="ListParagraph"/>
+        <w:numPr>
+          <w:ilvl w:val="0"/>
+          <w:numId w:val="13"/>
+        </w:numPr>
+        <w:jc w:val="both"/>
+        <w:rPr>
+          <w:rFonts w:ascii="Times New Roman" w:hAnsi="Times New Roman" w:cs="Times New Roman"/>
+          <w:lang w:val="en-GB"/>
+        </w:rPr>
+      </w:pPr>
+      <w:proofErr w:type="spellStart"/>
+      <w:r>
+        <w:rPr>
+          <w:rFonts w:ascii="Times New Roman" w:hAnsi="Times New Roman" w:cs="Times New Roman"/>
+          <w:lang w:val="en-GB"/>
+        </w:rPr>
+        <w:t>Standarisasi</w:t>
+      </w:r>
+      <w:proofErr w:type="spellEnd"/>
+      <w:r>
+        <w:rPr>
+          <w:rFonts w:ascii="Times New Roman" w:hAnsi="Times New Roman" w:cs="Times New Roman"/>
+          <w:lang w:val="en-GB"/>
+        </w:rPr>
+        <w:t xml:space="preserve">: </w:t>
+      </w:r>
+      <w:proofErr w:type="spellStart"/>
+      <w:r>
+        <w:rPr>
+          <w:rFonts w:ascii="Times New Roman" w:hAnsi="Times New Roman" w:cs="Times New Roman"/>
+          <w:lang w:val="en-GB"/>
+        </w:rPr>
+        <w:t>Memastikan</w:t>
+      </w:r>
+      <w:proofErr w:type="spellEnd"/>
+      <w:r>
+        <w:rPr>
+          <w:rFonts w:ascii="Times New Roman" w:hAnsi="Times New Roman" w:cs="Times New Roman"/>
+          <w:lang w:val="en-GB"/>
+        </w:rPr>
+        <w:t xml:space="preserve"> </w:t>
+      </w:r>
+      <w:proofErr w:type="spellStart"/>
+      <w:r>
+        <w:rPr>
+          <w:rFonts w:ascii="Times New Roman" w:hAnsi="Times New Roman" w:cs="Times New Roman"/>
+          <w:lang w:val="en-GB"/>
+        </w:rPr>
+        <w:t>semua</w:t>
+      </w:r>
+      <w:proofErr w:type="spellEnd"/>
+      <w:r>
+        <w:rPr>
+          <w:rFonts w:ascii="Times New Roman" w:hAnsi="Times New Roman" w:cs="Times New Roman"/>
+          <w:lang w:val="en-GB"/>
+        </w:rPr>
+        <w:t xml:space="preserve"> </w:t>
+      </w:r>
+      <w:proofErr w:type="spellStart"/>
+      <w:r>
+        <w:rPr>
+          <w:rFonts w:ascii="Times New Roman" w:hAnsi="Times New Roman" w:cs="Times New Roman"/>
+          <w:lang w:val="en-GB"/>
+        </w:rPr>
+        <w:t>tim</w:t>
+      </w:r>
+      <w:proofErr w:type="spellEnd"/>
+      <w:r>
+        <w:rPr>
+          <w:rFonts w:ascii="Times New Roman" w:hAnsi="Times New Roman" w:cs="Times New Roman"/>
+          <w:lang w:val="en-GB"/>
+        </w:rPr>
+        <w:t xml:space="preserve"> </w:t>
+      </w:r>
+      <w:proofErr w:type="spellStart"/>
+      <w:r>
+        <w:rPr>
+          <w:rFonts w:ascii="Times New Roman" w:hAnsi="Times New Roman" w:cs="Times New Roman"/>
+          <w:lang w:val="en-GB"/>
+        </w:rPr>
+        <w:t>pengembang</w:t>
+      </w:r>
+      <w:proofErr w:type="spellEnd"/>
+      <w:r>
+        <w:rPr>
+          <w:rFonts w:ascii="Times New Roman" w:hAnsi="Times New Roman" w:cs="Times New Roman"/>
+          <w:lang w:val="en-GB"/>
+        </w:rPr>
+        <w:t xml:space="preserve"> (programmer) </w:t>
+      </w:r>
+      <w:proofErr w:type="spellStart"/>
+      <w:r>
+        <w:rPr>
+          <w:rFonts w:ascii="Times New Roman" w:hAnsi="Times New Roman" w:cs="Times New Roman"/>
+          <w:lang w:val="en-GB"/>
+        </w:rPr>
+        <w:t>menggunakan</w:t>
+      </w:r>
+      <w:proofErr w:type="spellEnd"/>
+      <w:r>
+        <w:rPr>
+          <w:rFonts w:ascii="Times New Roman" w:hAnsi="Times New Roman" w:cs="Times New Roman"/>
+          <w:lang w:val="en-GB"/>
+        </w:rPr>
+        <w:t xml:space="preserve"> </w:t>
+      </w:r>
+      <w:proofErr w:type="spellStart"/>
+      <w:r>
+        <w:rPr>
+          <w:rFonts w:ascii="Times New Roman" w:hAnsi="Times New Roman" w:cs="Times New Roman"/>
+          <w:lang w:val="en-GB"/>
+        </w:rPr>
+        <w:t>cara</w:t>
+      </w:r>
+      <w:proofErr w:type="spellEnd"/>
+      <w:r>
+        <w:rPr>
+          <w:rFonts w:ascii="Times New Roman" w:hAnsi="Times New Roman" w:cs="Times New Roman"/>
+          <w:lang w:val="en-GB"/>
+        </w:rPr>
+        <w:t xml:space="preserve"> yang </w:t>
+      </w:r>
+      <w:proofErr w:type="spellStart"/>
+      <w:r>
+        <w:rPr>
+          <w:rFonts w:ascii="Times New Roman" w:hAnsi="Times New Roman" w:cs="Times New Roman"/>
+          <w:lang w:val="en-GB"/>
+        </w:rPr>
+        <w:t>sama</w:t>
+      </w:r>
+      <w:proofErr w:type="spellEnd"/>
+      <w:r>
+        <w:rPr>
+          <w:rFonts w:ascii="Times New Roman" w:hAnsi="Times New Roman" w:cs="Times New Roman"/>
+          <w:lang w:val="en-GB"/>
+        </w:rPr>
+        <w:t xml:space="preserve"> </w:t>
+      </w:r>
+      <w:proofErr w:type="spellStart"/>
+      <w:r>
+        <w:rPr>
+          <w:rFonts w:ascii="Times New Roman" w:hAnsi="Times New Roman" w:cs="Times New Roman"/>
+          <w:lang w:val="en-GB"/>
+        </w:rPr>
+        <w:t>dalam</w:t>
+      </w:r>
+      <w:proofErr w:type="spellEnd"/>
+      <w:r>
+        <w:rPr>
+          <w:rFonts w:ascii="Times New Roman" w:hAnsi="Times New Roman" w:cs="Times New Roman"/>
+          <w:lang w:val="en-GB"/>
+        </w:rPr>
+        <w:t xml:space="preserve"> </w:t>
+      </w:r>
+      <w:proofErr w:type="spellStart"/>
+      <w:r>
+        <w:rPr>
+          <w:rFonts w:ascii="Times New Roman" w:hAnsi="Times New Roman" w:cs="Times New Roman"/>
+          <w:lang w:val="en-GB"/>
+        </w:rPr>
+        <w:t>menguji</w:t>
+      </w:r>
+      <w:proofErr w:type="spellEnd"/>
+      <w:r>
+        <w:rPr>
+          <w:rFonts w:ascii="Times New Roman" w:hAnsi="Times New Roman" w:cs="Times New Roman"/>
+          <w:lang w:val="en-GB"/>
+        </w:rPr>
+        <w:t xml:space="preserve"> </w:t>
+      </w:r>
+      <w:proofErr w:type="spellStart"/>
+      <w:r>
+        <w:rPr>
+          <w:rFonts w:ascii="Times New Roman" w:hAnsi="Times New Roman" w:cs="Times New Roman"/>
+          <w:lang w:val="en-GB"/>
+        </w:rPr>
+        <w:t>kode</w:t>
+      </w:r>
+      <w:proofErr w:type="spellEnd"/>
+      <w:r>
+        <w:rPr>
+          <w:rFonts w:ascii="Times New Roman" w:hAnsi="Times New Roman" w:cs="Times New Roman"/>
+          <w:lang w:val="en-GB"/>
+        </w:rPr>
+        <w:t xml:space="preserve"> </w:t>
+      </w:r>
+      <w:proofErr w:type="spellStart"/>
+      <w:r>
+        <w:rPr>
+          <w:rFonts w:ascii="Times New Roman" w:hAnsi="Times New Roman" w:cs="Times New Roman"/>
+          <w:lang w:val="en-GB"/>
+        </w:rPr>
+        <w:t>mereka</w:t>
+      </w:r>
+      <w:proofErr w:type="spellEnd"/>
+      <w:r>
+        <w:rPr>
+          <w:rFonts w:ascii="Times New Roman" w:hAnsi="Times New Roman" w:cs="Times New Roman"/>
+          <w:lang w:val="en-GB"/>
+        </w:rPr>
+        <w:t>.</w:t>
+      </w:r>
+    </w:p>
+    <w:p>
+      <w:pPr>
+        <w:pStyle w:val="ListParagraph"/>
+        <w:numPr>
+          <w:ilvl w:val="0"/>
+          <w:numId w:val="13"/>
+        </w:numPr>
+        <w:jc w:val="both"/>
+        <w:rPr>
+          <w:rFonts w:ascii="Times New Roman" w:hAnsi="Times New Roman" w:cs="Times New Roman"/>
+          <w:lang w:val="en-GB"/>
+        </w:rPr>
+      </w:pPr>
+      <w:proofErr w:type="spellStart"/>
+      <w:r>
+        <w:rPr>
+          <w:rFonts w:ascii="Times New Roman" w:hAnsi="Times New Roman" w:cs="Times New Roman"/>
+          <w:lang w:val="en-GB"/>
+        </w:rPr>
+        <w:t>Sebagai</w:t>
+      </w:r>
+      <w:proofErr w:type="spellEnd"/>
+      <w:r>
+        <w:rPr>
+          <w:rFonts w:ascii="Times New Roman" w:hAnsi="Times New Roman" w:cs="Times New Roman"/>
+          <w:lang w:val="en-GB"/>
+        </w:rPr>
+        <w:t xml:space="preserve"> </w:t>
+      </w:r>
+      <w:proofErr w:type="spellStart"/>
+      <w:r>
+        <w:rPr>
+          <w:rFonts w:ascii="Times New Roman" w:hAnsi="Times New Roman" w:cs="Times New Roman"/>
+          <w:lang w:val="en-GB"/>
+        </w:rPr>
+        <w:t>Instruksi</w:t>
+      </w:r>
+      <w:proofErr w:type="spellEnd"/>
+      <w:r>
+        <w:rPr>
+          <w:rFonts w:ascii="Times New Roman" w:hAnsi="Times New Roman" w:cs="Times New Roman"/>
+          <w:lang w:val="en-GB"/>
+        </w:rPr>
+        <w:t xml:space="preserve"> </w:t>
+      </w:r>
+      <w:proofErr w:type="spellStart"/>
+      <w:r>
+        <w:rPr>
+          <w:rFonts w:ascii="Times New Roman" w:hAnsi="Times New Roman" w:cs="Times New Roman"/>
+          <w:lang w:val="en-GB"/>
+        </w:rPr>
+        <w:t>Kerja</w:t>
+      </w:r>
+      <w:proofErr w:type="spellEnd"/>
+      <w:r>
+        <w:rPr>
+          <w:rFonts w:ascii="Times New Roman" w:hAnsi="Times New Roman" w:cs="Times New Roman"/>
+          <w:lang w:val="en-GB"/>
+        </w:rPr>
+        <w:t xml:space="preserve"> </w:t>
+      </w:r>
+      <w:proofErr w:type="spellStart"/>
+      <w:r>
+        <w:rPr>
+          <w:rFonts w:ascii="Times New Roman" w:hAnsi="Times New Roman" w:cs="Times New Roman"/>
+          <w:lang w:val="en-GB"/>
+        </w:rPr>
+        <w:t>bagi</w:t>
+      </w:r>
+      <w:proofErr w:type="spellEnd"/>
+      <w:r>
+        <w:rPr>
+          <w:rFonts w:ascii="Times New Roman" w:hAnsi="Times New Roman" w:cs="Times New Roman"/>
+          <w:lang w:val="en-GB"/>
+        </w:rPr>
+        <w:t xml:space="preserve"> </w:t>
+      </w:r>
+      <w:proofErr w:type="spellStart"/>
+      <w:r>
+        <w:rPr>
+          <w:rFonts w:ascii="Times New Roman" w:hAnsi="Times New Roman" w:cs="Times New Roman"/>
+          <w:lang w:val="en-GB"/>
+        </w:rPr>
+        <w:t>alat</w:t>
+      </w:r>
+      <w:proofErr w:type="spellEnd"/>
+      <w:r>
+        <w:rPr>
+          <w:rFonts w:ascii="Times New Roman" w:hAnsi="Times New Roman" w:cs="Times New Roman"/>
+          <w:lang w:val="en-GB"/>
+        </w:rPr>
+        <w:t xml:space="preserve"> </w:t>
+      </w:r>
+      <w:proofErr w:type="spellStart"/>
+      <w:r>
+        <w:rPr>
+          <w:rFonts w:ascii="Times New Roman" w:hAnsi="Times New Roman" w:cs="Times New Roman"/>
+          <w:lang w:val="en-GB"/>
+        </w:rPr>
+        <w:t>pengetesan</w:t>
+      </w:r>
+      <w:proofErr w:type="spellEnd"/>
+      <w:r>
+        <w:rPr>
+          <w:rFonts w:ascii="Times New Roman" w:hAnsi="Times New Roman" w:cs="Times New Roman"/>
+          <w:lang w:val="en-GB"/>
+        </w:rPr>
+        <w:t xml:space="preserve"> agar proses </w:t>
+      </w:r>
+      <w:proofErr w:type="spellStart"/>
+      <w:r>
+        <w:rPr>
+          <w:rFonts w:ascii="Times New Roman" w:hAnsi="Times New Roman" w:cs="Times New Roman"/>
+          <w:lang w:val="en-GB"/>
+        </w:rPr>
+        <w:t>pengecekan</w:t>
+      </w:r>
+      <w:proofErr w:type="spellEnd"/>
+      <w:r>
+        <w:rPr>
+          <w:rFonts w:ascii="Times New Roman" w:hAnsi="Times New Roman" w:cs="Times New Roman"/>
+          <w:lang w:val="en-GB"/>
+        </w:rPr>
+        <w:t xml:space="preserve"> </w:t>
+      </w:r>
+      <w:proofErr w:type="spellStart"/>
+      <w:r>
+        <w:rPr>
+          <w:rFonts w:ascii="Times New Roman" w:hAnsi="Times New Roman" w:cs="Times New Roman"/>
+          <w:lang w:val="en-GB"/>
+        </w:rPr>
+        <w:t>kualitas</w:t>
+      </w:r>
+      <w:proofErr w:type="spellEnd"/>
+      <w:r>
+        <w:rPr>
+          <w:rFonts w:ascii="Times New Roman" w:hAnsi="Times New Roman" w:cs="Times New Roman"/>
+          <w:lang w:val="en-GB"/>
+        </w:rPr>
+        <w:t xml:space="preserve"> </w:t>
+      </w:r>
+      <w:proofErr w:type="spellStart"/>
+      <w:r>
+        <w:rPr>
+          <w:rFonts w:ascii="Times New Roman" w:hAnsi="Times New Roman" w:cs="Times New Roman"/>
+          <w:lang w:val="en-GB"/>
+        </w:rPr>
+        <w:t>kode</w:t>
+      </w:r>
+      <w:proofErr w:type="spellEnd"/>
+      <w:r>
+        <w:rPr>
+          <w:rFonts w:ascii="Times New Roman" w:hAnsi="Times New Roman" w:cs="Times New Roman"/>
+          <w:lang w:val="en-GB"/>
+        </w:rPr>
+        <w:t xml:space="preserve"> </w:t>
+      </w:r>
+      <w:proofErr w:type="spellStart"/>
+      <w:r>
+        <w:rPr>
+          <w:rFonts w:ascii="Times New Roman" w:hAnsi="Times New Roman" w:cs="Times New Roman"/>
+          <w:lang w:val="en-GB"/>
+        </w:rPr>
+        <w:t>berjalan</w:t>
+      </w:r>
+      <w:proofErr w:type="spellEnd"/>
+      <w:r>
+        <w:rPr>
+          <w:rFonts w:ascii="Times New Roman" w:hAnsi="Times New Roman" w:cs="Times New Roman"/>
+          <w:lang w:val="en-GB"/>
+        </w:rPr>
+        <w:t xml:space="preserve"> </w:t>
+      </w:r>
+      <w:proofErr w:type="spellStart"/>
+      <w:r>
+        <w:rPr>
+          <w:rFonts w:ascii="Times New Roman" w:hAnsi="Times New Roman" w:cs="Times New Roman"/>
+          <w:lang w:val="en-GB"/>
+        </w:rPr>
+        <w:t>otomatis</w:t>
+      </w:r>
+      <w:proofErr w:type="spellEnd"/>
+      <w:r>
+        <w:rPr>
+          <w:rFonts w:ascii="Times New Roman" w:hAnsi="Times New Roman" w:cs="Times New Roman"/>
+          <w:lang w:val="en-GB"/>
+        </w:rPr>
+        <w:t xml:space="preserve">, </w:t>
+      </w:r>
+      <w:proofErr w:type="spellStart"/>
+      <w:r>
+        <w:rPr>
+          <w:rFonts w:ascii="Times New Roman" w:hAnsi="Times New Roman" w:cs="Times New Roman"/>
+          <w:lang w:val="en-GB"/>
+        </w:rPr>
+        <w:t>cepat</w:t>
+      </w:r>
+      <w:proofErr w:type="spellEnd"/>
+      <w:r>
+        <w:rPr>
+          <w:rFonts w:ascii="Times New Roman" w:hAnsi="Times New Roman" w:cs="Times New Roman"/>
+          <w:lang w:val="en-GB"/>
+        </w:rPr>
+        <w:t xml:space="preserve">, dan </w:t>
+      </w:r>
+      <w:proofErr w:type="spellStart"/>
+      <w:r>
+        <w:rPr>
+          <w:rFonts w:ascii="Times New Roman" w:hAnsi="Times New Roman" w:cs="Times New Roman"/>
+          <w:lang w:val="en-GB"/>
+        </w:rPr>
+        <w:t>akurat</w:t>
+      </w:r>
+      <w:proofErr w:type="spellEnd"/>
+      <w:r>
+        <w:rPr>
+          <w:rFonts w:ascii="Times New Roman" w:hAnsi="Times New Roman" w:cs="Times New Roman"/>
+          <w:lang w:val="en-GB"/>
+        </w:rPr>
+        <w:t>.</w:t>
+      </w:r>
     </w:p>
     <w:sectPr>
       <w:pgSz w:w="11906" w:h="16838"/>
@@ -21484,9 +23686,9 @@
     </w:lvl>
   </w:abstractNum>
   <w:abstractNum w:abstractNumId="7" w15:restartNumberingAfterBreak="0">
-    <w:nsid w:val="64A022BC"/>
+    <w:nsid w:val="54237FD4"/>
     <w:multiLevelType w:val="hybridMultilevel"/>
-    <w:tmpl w:val="7466E2BA"/>
+    <w:tmpl w:val="65E0B44E"/>
     <w:lvl w:ilvl="0" w:tplc="38090001">
       <w:start w:val="1"/>
       <w:numFmt w:val="bullet"/>
@@ -21597,9 +23799,9 @@
     </w:lvl>
   </w:abstractNum>
   <w:abstractNum w:abstractNumId="8" w15:restartNumberingAfterBreak="0">
-    <w:nsid w:val="673C435B"/>
+    <w:nsid w:val="5899391A"/>
     <w:multiLevelType w:val="hybridMultilevel"/>
-    <w:tmpl w:val="846CCAA0"/>
+    <w:tmpl w:val="A74802F8"/>
     <w:lvl w:ilvl="0" w:tplc="38090001">
       <w:start w:val="1"/>
       <w:numFmt w:val="bullet"/>
@@ -21710,9 +23912,9 @@
     </w:lvl>
   </w:abstractNum>
   <w:abstractNum w:abstractNumId="9" w15:restartNumberingAfterBreak="0">
-    <w:nsid w:val="6CA82C32"/>
+    <w:nsid w:val="64A022BC"/>
     <w:multiLevelType w:val="hybridMultilevel"/>
-    <w:tmpl w:val="ABCC36BA"/>
+    <w:tmpl w:val="7466E2BA"/>
     <w:lvl w:ilvl="0" w:tplc="38090001">
       <w:start w:val="1"/>
       <w:numFmt w:val="bullet"/>
@@ -21823,9 +24025,9 @@
     </w:lvl>
   </w:abstractNum>
   <w:abstractNum w:abstractNumId="10" w15:restartNumberingAfterBreak="0">
-    <w:nsid w:val="737805E1"/>
+    <w:nsid w:val="673C435B"/>
     <w:multiLevelType w:val="hybridMultilevel"/>
-    <w:tmpl w:val="8DF2E322"/>
+    <w:tmpl w:val="846CCAA0"/>
     <w:lvl w:ilvl="0" w:tplc="38090001">
       <w:start w:val="1"/>
       <w:numFmt w:val="bullet"/>
@@ -21935,17 +24137,243 @@
       </w:rPr>
     </w:lvl>
   </w:abstractNum>
+  <w:abstractNum w:abstractNumId="11" w15:restartNumberingAfterBreak="0">
+    <w:nsid w:val="6CA82C32"/>
+    <w:multiLevelType w:val="hybridMultilevel"/>
+    <w:tmpl w:val="ABCC36BA"/>
+    <w:lvl w:ilvl="0" w:tplc="38090001">
+      <w:start w:val="1"/>
+      <w:numFmt w:val="bullet"/>
+      <w:lvlText w:val=""/>
+      <w:lvlJc w:val="left"/>
+      <w:pPr>
+        <w:ind w:left="720" w:hanging="360"/>
+      </w:pPr>
+      <w:rPr>
+        <w:rFonts w:ascii="Symbol" w:hAnsi="Symbol" w:hint="default"/>
+      </w:rPr>
+    </w:lvl>
+    <w:lvl w:ilvl="1" w:tplc="38090003" w:tentative="1">
+      <w:start w:val="1"/>
+      <w:numFmt w:val="bullet"/>
+      <w:lvlText w:val="o"/>
+      <w:lvlJc w:val="left"/>
+      <w:pPr>
+        <w:ind w:left="1440" w:hanging="360"/>
+      </w:pPr>
+      <w:rPr>
+        <w:rFonts w:ascii="Courier New" w:hAnsi="Courier New" w:cs="Courier New" w:hint="default"/>
+      </w:rPr>
+    </w:lvl>
+    <w:lvl w:ilvl="2" w:tplc="38090005" w:tentative="1">
+      <w:start w:val="1"/>
+      <w:numFmt w:val="bullet"/>
+      <w:lvlText w:val=""/>
+      <w:lvlJc w:val="left"/>
+      <w:pPr>
+        <w:ind w:left="2160" w:hanging="360"/>
+      </w:pPr>
+      <w:rPr>
+        <w:rFonts w:ascii="Wingdings" w:hAnsi="Wingdings" w:hint="default"/>
+      </w:rPr>
+    </w:lvl>
+    <w:lvl w:ilvl="3" w:tplc="38090001" w:tentative="1">
+      <w:start w:val="1"/>
+      <w:numFmt w:val="bullet"/>
+      <w:lvlText w:val=""/>
+      <w:lvlJc w:val="left"/>
+      <w:pPr>
+        <w:ind w:left="2880" w:hanging="360"/>
+      </w:pPr>
+      <w:rPr>
+        <w:rFonts w:ascii="Symbol" w:hAnsi="Symbol" w:hint="default"/>
+      </w:rPr>
+    </w:lvl>
+    <w:lvl w:ilvl="4" w:tplc="38090003" w:tentative="1">
+      <w:start w:val="1"/>
+      <w:numFmt w:val="bullet"/>
+      <w:lvlText w:val="o"/>
+      <w:lvlJc w:val="left"/>
+      <w:pPr>
+        <w:ind w:left="3600" w:hanging="360"/>
+      </w:pPr>
+      <w:rPr>
+        <w:rFonts w:ascii="Courier New" w:hAnsi="Courier New" w:cs="Courier New" w:hint="default"/>
+      </w:rPr>
+    </w:lvl>
+    <w:lvl w:ilvl="5" w:tplc="38090005" w:tentative="1">
+      <w:start w:val="1"/>
+      <w:numFmt w:val="bullet"/>
+      <w:lvlText w:val=""/>
+      <w:lvlJc w:val="left"/>
+      <w:pPr>
+        <w:ind w:left="4320" w:hanging="360"/>
+      </w:pPr>
+      <w:rPr>
+        <w:rFonts w:ascii="Wingdings" w:hAnsi="Wingdings" w:hint="default"/>
+      </w:rPr>
+    </w:lvl>
+    <w:lvl w:ilvl="6" w:tplc="38090001" w:tentative="1">
+      <w:start w:val="1"/>
+      <w:numFmt w:val="bullet"/>
+      <w:lvlText w:val=""/>
+      <w:lvlJc w:val="left"/>
+      <w:pPr>
+        <w:ind w:left="5040" w:hanging="360"/>
+      </w:pPr>
+      <w:rPr>
+        <w:rFonts w:ascii="Symbol" w:hAnsi="Symbol" w:hint="default"/>
+      </w:rPr>
+    </w:lvl>
+    <w:lvl w:ilvl="7" w:tplc="38090003" w:tentative="1">
+      <w:start w:val="1"/>
+      <w:numFmt w:val="bullet"/>
+      <w:lvlText w:val="o"/>
+      <w:lvlJc w:val="left"/>
+      <w:pPr>
+        <w:ind w:left="5760" w:hanging="360"/>
+      </w:pPr>
+      <w:rPr>
+        <w:rFonts w:ascii="Courier New" w:hAnsi="Courier New" w:cs="Courier New" w:hint="default"/>
+      </w:rPr>
+    </w:lvl>
+    <w:lvl w:ilvl="8" w:tplc="38090005" w:tentative="1">
+      <w:start w:val="1"/>
+      <w:numFmt w:val="bullet"/>
+      <w:lvlText w:val=""/>
+      <w:lvlJc w:val="left"/>
+      <w:pPr>
+        <w:ind w:left="6480" w:hanging="360"/>
+      </w:pPr>
+      <w:rPr>
+        <w:rFonts w:ascii="Wingdings" w:hAnsi="Wingdings" w:hint="default"/>
+      </w:rPr>
+    </w:lvl>
+  </w:abstractNum>
+  <w:abstractNum w:abstractNumId="12" w15:restartNumberingAfterBreak="0">
+    <w:nsid w:val="737805E1"/>
+    <w:multiLevelType w:val="hybridMultilevel"/>
+    <w:tmpl w:val="8DF2E322"/>
+    <w:lvl w:ilvl="0" w:tplc="38090001">
+      <w:start w:val="1"/>
+      <w:numFmt w:val="bullet"/>
+      <w:lvlText w:val=""/>
+      <w:lvlJc w:val="left"/>
+      <w:pPr>
+        <w:ind w:left="720" w:hanging="360"/>
+      </w:pPr>
+      <w:rPr>
+        <w:rFonts w:ascii="Symbol" w:hAnsi="Symbol" w:hint="default"/>
+      </w:rPr>
+    </w:lvl>
+    <w:lvl w:ilvl="1" w:tplc="38090003" w:tentative="1">
+      <w:start w:val="1"/>
+      <w:numFmt w:val="bullet"/>
+      <w:lvlText w:val="o"/>
+      <w:lvlJc w:val="left"/>
+      <w:pPr>
+        <w:ind w:left="1440" w:hanging="360"/>
+      </w:pPr>
+      <w:rPr>
+        <w:rFonts w:ascii="Courier New" w:hAnsi="Courier New" w:cs="Courier New" w:hint="default"/>
+      </w:rPr>
+    </w:lvl>
+    <w:lvl w:ilvl="2" w:tplc="38090005" w:tentative="1">
+      <w:start w:val="1"/>
+      <w:numFmt w:val="bullet"/>
+      <w:lvlText w:val=""/>
+      <w:lvlJc w:val="left"/>
+      <w:pPr>
+        <w:ind w:left="2160" w:hanging="360"/>
+      </w:pPr>
+      <w:rPr>
+        <w:rFonts w:ascii="Wingdings" w:hAnsi="Wingdings" w:hint="default"/>
+      </w:rPr>
+    </w:lvl>
+    <w:lvl w:ilvl="3" w:tplc="38090001" w:tentative="1">
+      <w:start w:val="1"/>
+      <w:numFmt w:val="bullet"/>
+      <w:lvlText w:val=""/>
+      <w:lvlJc w:val="left"/>
+      <w:pPr>
+        <w:ind w:left="2880" w:hanging="360"/>
+      </w:pPr>
+      <w:rPr>
+        <w:rFonts w:ascii="Symbol" w:hAnsi="Symbol" w:hint="default"/>
+      </w:rPr>
+    </w:lvl>
+    <w:lvl w:ilvl="4" w:tplc="38090003" w:tentative="1">
+      <w:start w:val="1"/>
+      <w:numFmt w:val="bullet"/>
+      <w:lvlText w:val="o"/>
+      <w:lvlJc w:val="left"/>
+      <w:pPr>
+        <w:ind w:left="3600" w:hanging="360"/>
+      </w:pPr>
+      <w:rPr>
+        <w:rFonts w:ascii="Courier New" w:hAnsi="Courier New" w:cs="Courier New" w:hint="default"/>
+      </w:rPr>
+    </w:lvl>
+    <w:lvl w:ilvl="5" w:tplc="38090005" w:tentative="1">
+      <w:start w:val="1"/>
+      <w:numFmt w:val="bullet"/>
+      <w:lvlText w:val=""/>
+      <w:lvlJc w:val="left"/>
+      <w:pPr>
+        <w:ind w:left="4320" w:hanging="360"/>
+      </w:pPr>
+      <w:rPr>
+        <w:rFonts w:ascii="Wingdings" w:hAnsi="Wingdings" w:hint="default"/>
+      </w:rPr>
+    </w:lvl>
+    <w:lvl w:ilvl="6" w:tplc="38090001" w:tentative="1">
+      <w:start w:val="1"/>
+      <w:numFmt w:val="bullet"/>
+      <w:lvlText w:val=""/>
+      <w:lvlJc w:val="left"/>
+      <w:pPr>
+        <w:ind w:left="5040" w:hanging="360"/>
+      </w:pPr>
+      <w:rPr>
+        <w:rFonts w:ascii="Symbol" w:hAnsi="Symbol" w:hint="default"/>
+      </w:rPr>
+    </w:lvl>
+    <w:lvl w:ilvl="7" w:tplc="38090003" w:tentative="1">
+      <w:start w:val="1"/>
+      <w:numFmt w:val="bullet"/>
+      <w:lvlText w:val="o"/>
+      <w:lvlJc w:val="left"/>
+      <w:pPr>
+        <w:ind w:left="5760" w:hanging="360"/>
+      </w:pPr>
+      <w:rPr>
+        <w:rFonts w:ascii="Courier New" w:hAnsi="Courier New" w:cs="Courier New" w:hint="default"/>
+      </w:rPr>
+    </w:lvl>
+    <w:lvl w:ilvl="8" w:tplc="38090005" w:tentative="1">
+      <w:start w:val="1"/>
+      <w:numFmt w:val="bullet"/>
+      <w:lvlText w:val=""/>
+      <w:lvlJc w:val="left"/>
+      <w:pPr>
+        <w:ind w:left="6480" w:hanging="360"/>
+      </w:pPr>
+      <w:rPr>
+        <w:rFonts w:ascii="Wingdings" w:hAnsi="Wingdings" w:hint="default"/>
+      </w:rPr>
+    </w:lvl>
+  </w:abstractNum>
   <w:num w:numId="1" w16cid:durableId="517813677">
-    <w:abstractNumId w:val="8"/>
+    <w:abstractNumId w:val="10"/>
   </w:num>
   <w:num w:numId="2" w16cid:durableId="857735407">
-    <w:abstractNumId w:val="9"/>
+    <w:abstractNumId w:val="11"/>
   </w:num>
   <w:num w:numId="3" w16cid:durableId="134505">
     <w:abstractNumId w:val="4"/>
   </w:num>
   <w:num w:numId="4" w16cid:durableId="1666083322">
-    <w:abstractNumId w:val="10"/>
+    <w:abstractNumId w:val="12"/>
   </w:num>
   <w:num w:numId="5" w16cid:durableId="864251512">
     <w:abstractNumId w:val="3"/>
@@ -21954,7 +24382,7 @@
     <w:abstractNumId w:val="2"/>
   </w:num>
   <w:num w:numId="7" w16cid:durableId="1772166354">
-    <w:abstractNumId w:val="7"/>
+    <w:abstractNumId w:val="9"/>
   </w:num>
   <w:num w:numId="8" w16cid:durableId="71900298">
     <w:abstractNumId w:val="0"/>
@@ -21967,6 +24395,12 @@
   </w:num>
   <w:num w:numId="11" w16cid:durableId="1497767422">
     <w:abstractNumId w:val="5"/>
+  </w:num>
+  <w:num w:numId="12" w16cid:durableId="999893496">
+    <w:abstractNumId w:val="8"/>
+  </w:num>
+  <w:num w:numId="13" w16cid:durableId="412312991">
+    <w:abstractNumId w:val="7"/>
   </w:num>
 </w:numbering>
 </file>

</xml_diff>

<commit_message>
Membuat file jest-e2e.json untuk pengujian
</commit_message>
<xml_diff>
--- a/dokumentasi/24382001P_Lorensius Firngadi_IF 23 E_Dokumentasi.docx
+++ b/dokumentasi/24382001P_Lorensius Firngadi_IF 23 E_Dokumentasi.docx
@@ -245,26 +245,9 @@
           <w:rFonts w:ascii="Times New Roman" w:hAnsi="Times New Roman" w:cs="Times New Roman"/>
           <w:lang w:val="en-GB"/>
         </w:rPr>
-        <w:t xml:space="preserve"> Octaviansyah</w:t>
-      </w:r>
-      <w:proofErr w:type="gramStart"/>
-      <w:r>
-        <w:rPr>
-          <w:rFonts w:ascii="Times New Roman" w:hAnsi="Times New Roman" w:cs="Times New Roman"/>
-          <w:lang w:val="en-GB"/>
-        </w:rPr>
-        <w:t>, ,</w:t>
-      </w:r>
-      <w:proofErr w:type="gramEnd"/>
-      <w:r>
-        <w:rPr>
-          <w:rFonts w:ascii="Times New Roman" w:hAnsi="Times New Roman" w:cs="Times New Roman"/>
-          <w:lang w:val="en-GB"/>
-        </w:rPr>
-        <w:t xml:space="preserve"> </w:t>
-      </w:r>
-      <w:proofErr w:type="spellStart"/>
-      <w:proofErr w:type="gramStart"/>
+        <w:t xml:space="preserve"> Octaviansyah, , </w:t>
+      </w:r>
+      <w:proofErr w:type="spellStart"/>
       <w:r>
         <w:rPr>
           <w:rFonts w:ascii="Times New Roman" w:hAnsi="Times New Roman" w:cs="Times New Roman"/>
@@ -273,7 +256,6 @@
         <w:t>S.Kom</w:t>
       </w:r>
       <w:proofErr w:type="spellEnd"/>
-      <w:proofErr w:type="gramEnd"/>
       <w:r>
         <w:rPr>
           <w:rFonts w:ascii="Times New Roman" w:hAnsi="Times New Roman" w:cs="Times New Roman"/>
@@ -282,7 +264,6 @@
         <w:t xml:space="preserve">., </w:t>
       </w:r>
       <w:proofErr w:type="spellStart"/>
-      <w:proofErr w:type="gramStart"/>
       <w:r>
         <w:rPr>
           <w:rFonts w:ascii="Times New Roman" w:hAnsi="Times New Roman" w:cs="Times New Roman"/>
@@ -291,7 +272,6 @@
         <w:t>M.Kom</w:t>
       </w:r>
       <w:proofErr w:type="spellEnd"/>
-      <w:proofErr w:type="gramEnd"/>
       <w:r>
         <w:rPr>
           <w:rFonts w:ascii="Times New Roman" w:hAnsi="Times New Roman" w:cs="Times New Roman"/>
@@ -686,23 +666,7 @@
           <w:rFonts w:ascii="Times New Roman" w:hAnsi="Times New Roman" w:cs="Times New Roman"/>
           <w:lang w:val="en-GB"/>
         </w:rPr>
-        <w:t xml:space="preserve">Nama </w:t>
-      </w:r>
-      <w:proofErr w:type="gramStart"/>
-      <w:r>
-        <w:rPr>
-          <w:rFonts w:ascii="Times New Roman" w:hAnsi="Times New Roman" w:cs="Times New Roman"/>
-          <w:lang w:val="en-GB"/>
-        </w:rPr>
-        <w:t>Project :</w:t>
-      </w:r>
-      <w:proofErr w:type="gramEnd"/>
-      <w:r>
-        <w:rPr>
-          <w:rFonts w:ascii="Times New Roman" w:hAnsi="Times New Roman" w:cs="Times New Roman"/>
-          <w:lang w:val="en-GB"/>
-        </w:rPr>
-        <w:t xml:space="preserve"> </w:t>
+        <w:t xml:space="preserve">Nama Project : </w:t>
       </w:r>
       <w:proofErr w:type="spellStart"/>
       <w:r>
@@ -757,17 +721,8 @@
           <w:rFonts w:ascii="Times New Roman" w:hAnsi="Times New Roman" w:cs="Times New Roman"/>
           <w:lang w:val="en-GB"/>
         </w:rPr>
-        <w:t xml:space="preserve"> </w:t>
-      </w:r>
-      <w:proofErr w:type="gramStart"/>
-      <w:r>
-        <w:rPr>
-          <w:rFonts w:ascii="Times New Roman" w:hAnsi="Times New Roman" w:cs="Times New Roman"/>
-          <w:lang w:val="en-GB"/>
-        </w:rPr>
-        <w:t>Project :</w:t>
-      </w:r>
-      <w:proofErr w:type="gramEnd"/>
+        <w:t xml:space="preserve"> Project :</w:t>
+      </w:r>
     </w:p>
     <w:p>
       <w:pPr>
@@ -955,7 +910,6 @@
         <w:t xml:space="preserve"> </w:t>
       </w:r>
       <w:proofErr w:type="spellStart"/>
-      <w:proofErr w:type="gramStart"/>
       <w:r>
         <w:rPr>
           <w:rFonts w:ascii="Times New Roman" w:hAnsi="Times New Roman" w:cs="Times New Roman"/>
@@ -969,15 +923,7 @@
           <w:rFonts w:ascii="Times New Roman" w:hAnsi="Times New Roman" w:cs="Times New Roman"/>
           <w:lang w:val="en-GB"/>
         </w:rPr>
-        <w:t xml:space="preserve"> :</w:t>
-      </w:r>
-      <w:proofErr w:type="gramEnd"/>
-      <w:r>
-        <w:rPr>
-          <w:rFonts w:ascii="Times New Roman" w:hAnsi="Times New Roman" w:cs="Times New Roman"/>
-          <w:lang w:val="en-GB"/>
-        </w:rPr>
-        <w:t xml:space="preserve"> </w:t>
+        <w:t xml:space="preserve"> : </w:t>
       </w:r>
       <w:proofErr w:type="spellStart"/>
       <w:r>
@@ -1998,9 +1944,9 @@
           <w:bCs/>
           <w:lang w:val="en-GB"/>
         </w:rPr>
-        <w:t xml:space="preserve"> </w:t>
-      </w:r>
-      <w:proofErr w:type="gramStart"/>
+        <w:t xml:space="preserve"> file .</w:t>
+      </w:r>
+      <w:proofErr w:type="spellStart"/>
       <w:r>
         <w:rPr>
           <w:rFonts w:ascii="Times New Roman" w:hAnsi="Times New Roman" w:cs="Times New Roman"/>
@@ -2008,20 +1954,9 @@
           <w:bCs/>
           <w:lang w:val="en-GB"/>
         </w:rPr>
-        <w:t>file .</w:t>
-      </w:r>
-      <w:proofErr w:type="spellStart"/>
-      <w:r>
-        <w:rPr>
-          <w:rFonts w:ascii="Times New Roman" w:hAnsi="Times New Roman" w:cs="Times New Roman"/>
-          <w:b/>
-          <w:bCs/>
-          <w:lang w:val="en-GB"/>
-        </w:rPr>
         <w:t>gitignore</w:t>
       </w:r>
       <w:proofErr w:type="spellEnd"/>
-      <w:proofErr w:type="gramEnd"/>
       <w:r>
         <w:rPr>
           <w:rFonts w:ascii="Times New Roman" w:hAnsi="Times New Roman" w:cs="Times New Roman"/>
@@ -2129,15 +2064,7 @@
           <w:rFonts w:ascii="Times New Roman" w:hAnsi="Times New Roman" w:cs="Times New Roman"/>
           <w:lang w:val="en-GB"/>
         </w:rPr>
-        <w:t xml:space="preserve"> </w:t>
-      </w:r>
-      <w:proofErr w:type="gramStart"/>
-      <w:r>
-        <w:rPr>
-          <w:rFonts w:ascii="Times New Roman" w:hAnsi="Times New Roman" w:cs="Times New Roman"/>
-          <w:lang w:val="en-GB"/>
-        </w:rPr>
-        <w:t>file .</w:t>
+        <w:t xml:space="preserve"> file .</w:t>
       </w:r>
       <w:proofErr w:type="spellStart"/>
       <w:r>
@@ -2148,7 +2075,6 @@
         <w:t>gitignore</w:t>
       </w:r>
       <w:proofErr w:type="spellEnd"/>
-      <w:proofErr w:type="gramEnd"/>
       <w:r>
         <w:rPr>
           <w:rFonts w:ascii="Times New Roman" w:hAnsi="Times New Roman" w:cs="Times New Roman"/>
@@ -2416,7 +2342,6 @@
           <w:lang w:val="en-GB"/>
         </w:rPr>
       </w:pPr>
-      <w:proofErr w:type="gramStart"/>
       <w:r>
         <w:rPr>
           <w:rFonts w:ascii="Times New Roman" w:hAnsi="Times New Roman" w:cs="Times New Roman"/>
@@ -2433,21 +2358,12 @@
         <w:t>gitignore</w:t>
       </w:r>
       <w:proofErr w:type="spellEnd"/>
-      <w:proofErr w:type="gramEnd"/>
-      <w:r>
-        <w:rPr>
-          <w:rFonts w:ascii="Times New Roman" w:hAnsi="Times New Roman" w:cs="Times New Roman"/>
-          <w:lang w:val="en-GB"/>
-        </w:rPr>
-        <w:t xml:space="preserve"> </w:t>
-      </w:r>
-      <w:proofErr w:type="gramStart"/>
-      <w:r>
-        <w:rPr>
-          <w:rFonts w:ascii="Times New Roman" w:hAnsi="Times New Roman" w:cs="Times New Roman"/>
-          <w:lang w:val="en-GB"/>
-        </w:rPr>
-        <w:t xml:space="preserve">sangat  </w:t>
+      <w:r>
+        <w:rPr>
+          <w:rFonts w:ascii="Times New Roman" w:hAnsi="Times New Roman" w:cs="Times New Roman"/>
+          <w:lang w:val="en-GB"/>
+        </w:rPr>
+        <w:t xml:space="preserve"> sangat  </w:t>
       </w:r>
       <w:proofErr w:type="spellStart"/>
       <w:r>
@@ -2458,7 +2374,6 @@
         <w:t>bermanfaat</w:t>
       </w:r>
       <w:proofErr w:type="spellEnd"/>
-      <w:proofErr w:type="gramEnd"/>
       <w:r>
         <w:rPr>
           <w:rFonts w:ascii="Times New Roman" w:hAnsi="Times New Roman" w:cs="Times New Roman"/>
@@ -2950,7 +2865,6 @@
         <w:t xml:space="preserve">Edit </w:t>
       </w:r>
       <w:proofErr w:type="spellStart"/>
-      <w:proofErr w:type="gramStart"/>
       <w:r>
         <w:rPr>
           <w:rFonts w:ascii="Times New Roman" w:hAnsi="Times New Roman" w:cs="Times New Roman"/>
@@ -2961,7 +2875,6 @@
         <w:t>tsconfig.json</w:t>
       </w:r>
       <w:proofErr w:type="spellEnd"/>
-      <w:proofErr w:type="gramEnd"/>
       <w:r>
         <w:rPr>
           <w:rFonts w:ascii="Times New Roman" w:hAnsi="Times New Roman" w:cs="Times New Roman"/>
@@ -3580,21 +3493,12 @@
         <w:t>seperti</w:t>
       </w:r>
       <w:proofErr w:type="spellEnd"/>
-      <w:proofErr w:type="gramStart"/>
-      <w:r>
-        <w:rPr>
-          <w:rFonts w:ascii="Times New Roman" w:hAnsi="Times New Roman" w:cs="Times New Roman"/>
-          <w:lang w:val="en-GB"/>
-        </w:rPr>
-        <w:t xml:space="preserve"> ../../..</w:t>
-      </w:r>
-      <w:proofErr w:type="gramEnd"/>
-      <w:r>
-        <w:rPr>
-          <w:rFonts w:ascii="Times New Roman" w:hAnsi="Times New Roman" w:cs="Times New Roman"/>
-          <w:lang w:val="en-GB"/>
-        </w:rPr>
-        <w:t xml:space="preserve">/folder/file, </w:t>
+      <w:r>
+        <w:rPr>
+          <w:rFonts w:ascii="Times New Roman" w:hAnsi="Times New Roman" w:cs="Times New Roman"/>
+          <w:lang w:val="en-GB"/>
+        </w:rPr>
+        <w:t xml:space="preserve"> ../../../folder/file, </w:t>
       </w:r>
       <w:proofErr w:type="spellStart"/>
       <w:r>
@@ -4872,7 +4776,6 @@
         <w:t xml:space="preserve">Update </w:t>
       </w:r>
       <w:proofErr w:type="spellStart"/>
-      <w:proofErr w:type="gramStart"/>
       <w:r>
         <w:rPr>
           <w:b/>
@@ -4881,7 +4784,6 @@
         <w:t>package.json</w:t>
       </w:r>
       <w:proofErr w:type="spellEnd"/>
-      <w:proofErr w:type="gramEnd"/>
       <w:r>
         <w:rPr>
           <w:b/>
@@ -7824,7 +7726,6 @@
         <w:t xml:space="preserve"> File </w:t>
       </w:r>
       <w:proofErr w:type="spellStart"/>
-      <w:proofErr w:type="gramStart"/>
       <w:r>
         <w:rPr>
           <w:rFonts w:ascii="Times New Roman" w:hAnsi="Times New Roman" w:cs="Times New Roman"/>
@@ -7832,17 +7733,7 @@
           <w:bCs/>
           <w:lang w:val="en-GB"/>
         </w:rPr>
-        <w:t>prisma.service</w:t>
-      </w:r>
-      <w:proofErr w:type="gramEnd"/>
-      <w:r>
-        <w:rPr>
-          <w:rFonts w:ascii="Times New Roman" w:hAnsi="Times New Roman" w:cs="Times New Roman"/>
-          <w:b/>
-          <w:bCs/>
-          <w:lang w:val="en-GB"/>
-        </w:rPr>
-        <w:t>.ts</w:t>
+        <w:t>prisma.service.ts</w:t>
       </w:r>
       <w:proofErr w:type="spellEnd"/>
     </w:p>
@@ -9264,23 +9155,7 @@
           <w:rFonts w:ascii="Times New Roman" w:hAnsi="Times New Roman" w:cs="Times New Roman"/>
           <w:lang w:val="en-GB"/>
         </w:rPr>
-        <w:t xml:space="preserve">  id: </w:t>
-      </w:r>
-      <w:proofErr w:type="gramStart"/>
-      <w:r>
-        <w:rPr>
-          <w:rFonts w:ascii="Times New Roman" w:hAnsi="Times New Roman" w:cs="Times New Roman"/>
-          <w:lang w:val="en-GB"/>
-        </w:rPr>
-        <w:t xml:space="preserve">string;   </w:t>
-      </w:r>
-      <w:proofErr w:type="gramEnd"/>
-      <w:r>
-        <w:rPr>
-          <w:rFonts w:ascii="Times New Roman" w:hAnsi="Times New Roman" w:cs="Times New Roman"/>
-          <w:lang w:val="en-GB"/>
-        </w:rPr>
-        <w:t xml:space="preserve">         # KTP/ID </w:t>
+        <w:t xml:space="preserve">  id: string;            # KTP/ID </w:t>
       </w:r>
       <w:proofErr w:type="spellStart"/>
       <w:r>
@@ -9361,23 +9236,7 @@
           <w:rFonts w:ascii="Times New Roman" w:hAnsi="Times New Roman" w:cs="Times New Roman"/>
           <w:lang w:val="en-GB"/>
         </w:rPr>
-        <w:t xml:space="preserve">  name: </w:t>
-      </w:r>
-      <w:proofErr w:type="gramStart"/>
-      <w:r>
-        <w:rPr>
-          <w:rFonts w:ascii="Times New Roman" w:hAnsi="Times New Roman" w:cs="Times New Roman"/>
-          <w:lang w:val="en-GB"/>
-        </w:rPr>
-        <w:t xml:space="preserve">string;   </w:t>
-      </w:r>
-      <w:proofErr w:type="gramEnd"/>
-      <w:r>
-        <w:rPr>
-          <w:rFonts w:ascii="Times New Roman" w:hAnsi="Times New Roman" w:cs="Times New Roman"/>
-          <w:lang w:val="en-GB"/>
-        </w:rPr>
-        <w:t xml:space="preserve">       # Nama </w:t>
+        <w:t xml:space="preserve">  name: string;          # Nama </w:t>
       </w:r>
       <w:proofErr w:type="spellStart"/>
       <w:r>
@@ -9442,23 +9301,7 @@
           <w:rFonts w:ascii="Times New Roman" w:hAnsi="Times New Roman" w:cs="Times New Roman"/>
           <w:lang w:val="en-GB"/>
         </w:rPr>
-        <w:t xml:space="preserve">  slug: </w:t>
-      </w:r>
-      <w:proofErr w:type="gramStart"/>
-      <w:r>
-        <w:rPr>
-          <w:rFonts w:ascii="Times New Roman" w:hAnsi="Times New Roman" w:cs="Times New Roman"/>
-          <w:lang w:val="en-GB"/>
-        </w:rPr>
-        <w:t xml:space="preserve">string;   </w:t>
-      </w:r>
-      <w:proofErr w:type="gramEnd"/>
-      <w:r>
-        <w:rPr>
-          <w:rFonts w:ascii="Times New Roman" w:hAnsi="Times New Roman" w:cs="Times New Roman"/>
-          <w:lang w:val="en-GB"/>
-        </w:rPr>
-        <w:t xml:space="preserve">       # Nama </w:t>
+        <w:t xml:space="preserve">  slug: string;          # Nama </w:t>
       </w:r>
       <w:proofErr w:type="spellStart"/>
       <w:r>
@@ -9523,96 +9366,582 @@
           <w:rFonts w:ascii="Times New Roman" w:hAnsi="Times New Roman" w:cs="Times New Roman"/>
           <w:lang w:val="en-GB"/>
         </w:rPr>
+        <w:t xml:space="preserve">  description?: string;  # </w:t>
+      </w:r>
+      <w:proofErr w:type="spellStart"/>
+      <w:r>
+        <w:rPr>
+          <w:rFonts w:ascii="Times New Roman" w:hAnsi="Times New Roman" w:cs="Times New Roman"/>
+          <w:lang w:val="en-GB"/>
+        </w:rPr>
+        <w:t>Penjelasan</w:t>
+      </w:r>
+      <w:proofErr w:type="spellEnd"/>
+      <w:r>
+        <w:rPr>
+          <w:rFonts w:ascii="Times New Roman" w:hAnsi="Times New Roman" w:cs="Times New Roman"/>
+          <w:lang w:val="en-GB"/>
+        </w:rPr>
+        <w:t xml:space="preserve"> </w:t>
+      </w:r>
+      <w:proofErr w:type="spellStart"/>
+      <w:r>
+        <w:rPr>
+          <w:rFonts w:ascii="Times New Roman" w:hAnsi="Times New Roman" w:cs="Times New Roman"/>
+          <w:lang w:val="en-GB"/>
+        </w:rPr>
+        <w:t>singkat</w:t>
+      </w:r>
+      <w:proofErr w:type="spellEnd"/>
+      <w:r>
+        <w:rPr>
+          <w:rFonts w:ascii="Times New Roman" w:hAnsi="Times New Roman" w:cs="Times New Roman"/>
+          <w:lang w:val="en-GB"/>
+        </w:rPr>
+        <w:t xml:space="preserve"> (</w:t>
+      </w:r>
+      <w:proofErr w:type="spellStart"/>
+      <w:r>
+        <w:rPr>
+          <w:rFonts w:ascii="Times New Roman" w:hAnsi="Times New Roman" w:cs="Times New Roman"/>
+          <w:lang w:val="en-GB"/>
+        </w:rPr>
+        <w:t>tanda</w:t>
+      </w:r>
+      <w:proofErr w:type="spellEnd"/>
+      <w:r>
+        <w:rPr>
+          <w:rFonts w:ascii="Times New Roman" w:hAnsi="Times New Roman" w:cs="Times New Roman"/>
+          <w:lang w:val="en-GB"/>
+        </w:rPr>
+        <w:t xml:space="preserve"> ? </w:t>
+      </w:r>
+      <w:proofErr w:type="spellStart"/>
+      <w:r>
+        <w:rPr>
+          <w:rFonts w:ascii="Times New Roman" w:hAnsi="Times New Roman" w:cs="Times New Roman"/>
+          <w:lang w:val="en-GB"/>
+        </w:rPr>
+        <w:t>artinya</w:t>
+      </w:r>
+      <w:proofErr w:type="spellEnd"/>
+      <w:r>
+        <w:rPr>
+          <w:rFonts w:ascii="Times New Roman" w:hAnsi="Times New Roman" w:cs="Times New Roman"/>
+          <w:lang w:val="en-GB"/>
+        </w:rPr>
+        <w:t xml:space="preserve"> </w:t>
+      </w:r>
+      <w:proofErr w:type="spellStart"/>
+      <w:r>
+        <w:rPr>
+          <w:rFonts w:ascii="Times New Roman" w:hAnsi="Times New Roman" w:cs="Times New Roman"/>
+          <w:lang w:val="en-GB"/>
+        </w:rPr>
+        <w:t>boleh</w:t>
+      </w:r>
+      <w:proofErr w:type="spellEnd"/>
+      <w:r>
+        <w:rPr>
+          <w:rFonts w:ascii="Times New Roman" w:hAnsi="Times New Roman" w:cs="Times New Roman"/>
+          <w:lang w:val="en-GB"/>
+        </w:rPr>
+        <w:t xml:space="preserve"> </w:t>
+      </w:r>
+      <w:proofErr w:type="spellStart"/>
+      <w:r>
+        <w:rPr>
+          <w:rFonts w:ascii="Times New Roman" w:hAnsi="Times New Roman" w:cs="Times New Roman"/>
+          <w:lang w:val="en-GB"/>
+        </w:rPr>
+        <w:t>kosong</w:t>
+      </w:r>
+      <w:proofErr w:type="spellEnd"/>
+      <w:r>
+        <w:rPr>
+          <w:rFonts w:ascii="Times New Roman" w:hAnsi="Times New Roman" w:cs="Times New Roman"/>
+          <w:lang w:val="en-GB"/>
+        </w:rPr>
+        <w:t>).</w:t>
+      </w:r>
+    </w:p>
+    <w:p>
+      <w:pPr>
+        <w:contextualSpacing/>
+        <w:jc w:val="both"/>
+        <w:rPr>
+          <w:rFonts w:ascii="Times New Roman" w:hAnsi="Times New Roman" w:cs="Times New Roman"/>
+          <w:lang w:val="en-GB"/>
+        </w:rPr>
+      </w:pPr>
+      <w:r>
+        <w:rPr>
+          <w:rFonts w:ascii="Times New Roman" w:hAnsi="Times New Roman" w:cs="Times New Roman"/>
+          <w:lang w:val="en-GB"/>
+        </w:rPr>
+        <w:t xml:space="preserve">  icon?: string;         # </w:t>
+      </w:r>
+      <w:proofErr w:type="spellStart"/>
+      <w:r>
+        <w:rPr>
+          <w:rFonts w:ascii="Times New Roman" w:hAnsi="Times New Roman" w:cs="Times New Roman"/>
+          <w:lang w:val="en-GB"/>
+        </w:rPr>
+        <w:t>Simbol</w:t>
+      </w:r>
+      <w:proofErr w:type="spellEnd"/>
+      <w:r>
+        <w:rPr>
+          <w:rFonts w:ascii="Times New Roman" w:hAnsi="Times New Roman" w:cs="Times New Roman"/>
+          <w:lang w:val="en-GB"/>
+        </w:rPr>
+        <w:t xml:space="preserve"> </w:t>
+      </w:r>
+      <w:proofErr w:type="spellStart"/>
+      <w:r>
+        <w:rPr>
+          <w:rFonts w:ascii="Times New Roman" w:hAnsi="Times New Roman" w:cs="Times New Roman"/>
+          <w:lang w:val="en-GB"/>
+        </w:rPr>
+        <w:t>atau</w:t>
+      </w:r>
+      <w:proofErr w:type="spellEnd"/>
+      <w:r>
+        <w:rPr>
+          <w:rFonts w:ascii="Times New Roman" w:hAnsi="Times New Roman" w:cs="Times New Roman"/>
+          <w:lang w:val="en-GB"/>
+        </w:rPr>
+        <w:t xml:space="preserve"> </w:t>
+      </w:r>
+      <w:proofErr w:type="spellStart"/>
+      <w:r>
+        <w:rPr>
+          <w:rFonts w:ascii="Times New Roman" w:hAnsi="Times New Roman" w:cs="Times New Roman"/>
+          <w:lang w:val="en-GB"/>
+        </w:rPr>
+        <w:t>gambar</w:t>
+      </w:r>
+      <w:proofErr w:type="spellEnd"/>
+      <w:r>
+        <w:rPr>
+          <w:rFonts w:ascii="Times New Roman" w:hAnsi="Times New Roman" w:cs="Times New Roman"/>
+          <w:lang w:val="en-GB"/>
+        </w:rPr>
+        <w:t xml:space="preserve"> </w:t>
+      </w:r>
+      <w:proofErr w:type="spellStart"/>
+      <w:r>
+        <w:rPr>
+          <w:rFonts w:ascii="Times New Roman" w:hAnsi="Times New Roman" w:cs="Times New Roman"/>
+          <w:lang w:val="en-GB"/>
+        </w:rPr>
+        <w:t>kecil</w:t>
+      </w:r>
+      <w:proofErr w:type="spellEnd"/>
+      <w:r>
+        <w:rPr>
+          <w:rFonts w:ascii="Times New Roman" w:hAnsi="Times New Roman" w:cs="Times New Roman"/>
+          <w:lang w:val="en-GB"/>
+        </w:rPr>
+        <w:t xml:space="preserve"> </w:t>
+      </w:r>
+      <w:proofErr w:type="spellStart"/>
+      <w:r>
+        <w:rPr>
+          <w:rFonts w:ascii="Times New Roman" w:hAnsi="Times New Roman" w:cs="Times New Roman"/>
+          <w:lang w:val="en-GB"/>
+        </w:rPr>
+        <w:t>untuk</w:t>
+      </w:r>
+      <w:proofErr w:type="spellEnd"/>
+      <w:r>
+        <w:rPr>
+          <w:rFonts w:ascii="Times New Roman" w:hAnsi="Times New Roman" w:cs="Times New Roman"/>
+          <w:lang w:val="en-GB"/>
+        </w:rPr>
+        <w:t xml:space="preserve"> </w:t>
+      </w:r>
+      <w:proofErr w:type="spellStart"/>
+      <w:r>
+        <w:rPr>
+          <w:rFonts w:ascii="Times New Roman" w:hAnsi="Times New Roman" w:cs="Times New Roman"/>
+          <w:lang w:val="en-GB"/>
+        </w:rPr>
+        <w:t>kategori</w:t>
+      </w:r>
+      <w:proofErr w:type="spellEnd"/>
+      <w:r>
+        <w:rPr>
+          <w:rFonts w:ascii="Times New Roman" w:hAnsi="Times New Roman" w:cs="Times New Roman"/>
+          <w:lang w:val="en-GB"/>
+        </w:rPr>
+        <w:t>.</w:t>
+      </w:r>
+    </w:p>
+    <w:p>
+      <w:pPr>
+        <w:contextualSpacing/>
+        <w:jc w:val="both"/>
+        <w:rPr>
+          <w:rFonts w:ascii="Times New Roman" w:hAnsi="Times New Roman" w:cs="Times New Roman"/>
+          <w:lang w:val="en-GB"/>
+        </w:rPr>
+      </w:pPr>
+      <w:r>
+        <w:rPr>
+          <w:rFonts w:ascii="Times New Roman" w:hAnsi="Times New Roman" w:cs="Times New Roman"/>
+          <w:lang w:val="en-GB"/>
+        </w:rPr>
         <w:t xml:space="preserve">  </w:t>
       </w:r>
-      <w:proofErr w:type="gramStart"/>
-      <w:r>
-        <w:rPr>
-          <w:rFonts w:ascii="Times New Roman" w:hAnsi="Times New Roman" w:cs="Times New Roman"/>
-          <w:lang w:val="en-GB"/>
-        </w:rPr>
-        <w:t>description?:</w:t>
-      </w:r>
-      <w:proofErr w:type="gramEnd"/>
-      <w:r>
-        <w:rPr>
-          <w:rFonts w:ascii="Times New Roman" w:hAnsi="Times New Roman" w:cs="Times New Roman"/>
-          <w:lang w:val="en-GB"/>
-        </w:rPr>
-        <w:t xml:space="preserve"> </w:t>
-      </w:r>
-      <w:proofErr w:type="gramStart"/>
-      <w:r>
-        <w:rPr>
-          <w:rFonts w:ascii="Times New Roman" w:hAnsi="Times New Roman" w:cs="Times New Roman"/>
-          <w:lang w:val="en-GB"/>
-        </w:rPr>
-        <w:t>string;  #</w:t>
-      </w:r>
-      <w:proofErr w:type="gramEnd"/>
-      <w:r>
-        <w:rPr>
-          <w:rFonts w:ascii="Times New Roman" w:hAnsi="Times New Roman" w:cs="Times New Roman"/>
-          <w:lang w:val="en-GB"/>
-        </w:rPr>
-        <w:t xml:space="preserve"> </w:t>
-      </w:r>
-      <w:proofErr w:type="spellStart"/>
-      <w:r>
-        <w:rPr>
-          <w:rFonts w:ascii="Times New Roman" w:hAnsi="Times New Roman" w:cs="Times New Roman"/>
-          <w:lang w:val="en-GB"/>
-        </w:rPr>
-        <w:t>Penjelasan</w:t>
-      </w:r>
-      <w:proofErr w:type="spellEnd"/>
-      <w:r>
-        <w:rPr>
-          <w:rFonts w:ascii="Times New Roman" w:hAnsi="Times New Roman" w:cs="Times New Roman"/>
-          <w:lang w:val="en-GB"/>
-        </w:rPr>
-        <w:t xml:space="preserve"> </w:t>
-      </w:r>
-      <w:proofErr w:type="spellStart"/>
-      <w:r>
-        <w:rPr>
-          <w:rFonts w:ascii="Times New Roman" w:hAnsi="Times New Roman" w:cs="Times New Roman"/>
-          <w:lang w:val="en-GB"/>
-        </w:rPr>
-        <w:t>singkat</w:t>
-      </w:r>
-      <w:proofErr w:type="spellEnd"/>
-      <w:r>
-        <w:rPr>
-          <w:rFonts w:ascii="Times New Roman" w:hAnsi="Times New Roman" w:cs="Times New Roman"/>
-          <w:lang w:val="en-GB"/>
-        </w:rPr>
-        <w:t xml:space="preserve"> (</w:t>
-      </w:r>
-      <w:proofErr w:type="spellStart"/>
-      <w:proofErr w:type="gramStart"/>
-      <w:r>
-        <w:rPr>
-          <w:rFonts w:ascii="Times New Roman" w:hAnsi="Times New Roman" w:cs="Times New Roman"/>
-          <w:lang w:val="en-GB"/>
-        </w:rPr>
-        <w:t>tanda</w:t>
-      </w:r>
-      <w:proofErr w:type="spellEnd"/>
-      <w:r>
-        <w:rPr>
-          <w:rFonts w:ascii="Times New Roman" w:hAnsi="Times New Roman" w:cs="Times New Roman"/>
-          <w:lang w:val="en-GB"/>
-        </w:rPr>
-        <w:t xml:space="preserve"> ?</w:t>
-      </w:r>
-      <w:proofErr w:type="gramEnd"/>
-      <w:r>
-        <w:rPr>
-          <w:rFonts w:ascii="Times New Roman" w:hAnsi="Times New Roman" w:cs="Times New Roman"/>
-          <w:lang w:val="en-GB"/>
-        </w:rPr>
-        <w:t xml:space="preserve"> </w:t>
+      <w:proofErr w:type="spellStart"/>
+      <w:r>
+        <w:rPr>
+          <w:rFonts w:ascii="Times New Roman" w:hAnsi="Times New Roman" w:cs="Times New Roman"/>
+          <w:lang w:val="en-GB"/>
+        </w:rPr>
+        <w:t>createdAt</w:t>
+      </w:r>
+      <w:proofErr w:type="spellEnd"/>
+      <w:r>
+        <w:rPr>
+          <w:rFonts w:ascii="Times New Roman" w:hAnsi="Times New Roman" w:cs="Times New Roman"/>
+          <w:lang w:val="en-GB"/>
+        </w:rPr>
+        <w:t xml:space="preserve">: Date;       # </w:t>
+      </w:r>
+      <w:proofErr w:type="spellStart"/>
+      <w:r>
+        <w:rPr>
+          <w:rFonts w:ascii="Times New Roman" w:hAnsi="Times New Roman" w:cs="Times New Roman"/>
+          <w:lang w:val="en-GB"/>
+        </w:rPr>
+        <w:t>Catatan</w:t>
+      </w:r>
+      <w:proofErr w:type="spellEnd"/>
+      <w:r>
+        <w:rPr>
+          <w:rFonts w:ascii="Times New Roman" w:hAnsi="Times New Roman" w:cs="Times New Roman"/>
+          <w:lang w:val="en-GB"/>
+        </w:rPr>
+        <w:t xml:space="preserve"> </w:t>
+      </w:r>
+      <w:proofErr w:type="spellStart"/>
+      <w:r>
+        <w:rPr>
+          <w:rFonts w:ascii="Times New Roman" w:hAnsi="Times New Roman" w:cs="Times New Roman"/>
+          <w:lang w:val="en-GB"/>
+        </w:rPr>
+        <w:t>waktu</w:t>
+      </w:r>
+      <w:proofErr w:type="spellEnd"/>
+      <w:r>
+        <w:rPr>
+          <w:rFonts w:ascii="Times New Roman" w:hAnsi="Times New Roman" w:cs="Times New Roman"/>
+          <w:lang w:val="en-GB"/>
+        </w:rPr>
+        <w:t xml:space="preserve"> </w:t>
+      </w:r>
+      <w:proofErr w:type="spellStart"/>
+      <w:r>
+        <w:rPr>
+          <w:rFonts w:ascii="Times New Roman" w:hAnsi="Times New Roman" w:cs="Times New Roman"/>
+          <w:lang w:val="en-GB"/>
+        </w:rPr>
+        <w:t>kapan</w:t>
+      </w:r>
+      <w:proofErr w:type="spellEnd"/>
+      <w:r>
+        <w:rPr>
+          <w:rFonts w:ascii="Times New Roman" w:hAnsi="Times New Roman" w:cs="Times New Roman"/>
+          <w:lang w:val="en-GB"/>
+        </w:rPr>
+        <w:t xml:space="preserve"> </w:t>
+      </w:r>
+      <w:proofErr w:type="spellStart"/>
+      <w:r>
+        <w:rPr>
+          <w:rFonts w:ascii="Times New Roman" w:hAnsi="Times New Roman" w:cs="Times New Roman"/>
+          <w:lang w:val="en-GB"/>
+        </w:rPr>
+        <w:t>kategori</w:t>
+      </w:r>
+      <w:proofErr w:type="spellEnd"/>
+      <w:r>
+        <w:rPr>
+          <w:rFonts w:ascii="Times New Roman" w:hAnsi="Times New Roman" w:cs="Times New Roman"/>
+          <w:lang w:val="en-GB"/>
+        </w:rPr>
+        <w:t xml:space="preserve"> </w:t>
+      </w:r>
+      <w:proofErr w:type="spellStart"/>
+      <w:r>
+        <w:rPr>
+          <w:rFonts w:ascii="Times New Roman" w:hAnsi="Times New Roman" w:cs="Times New Roman"/>
+          <w:lang w:val="en-GB"/>
+        </w:rPr>
+        <w:t>ini</w:t>
+      </w:r>
+      <w:proofErr w:type="spellEnd"/>
+      <w:r>
+        <w:rPr>
+          <w:rFonts w:ascii="Times New Roman" w:hAnsi="Times New Roman" w:cs="Times New Roman"/>
+          <w:lang w:val="en-GB"/>
+        </w:rPr>
+        <w:t xml:space="preserve"> </w:t>
+      </w:r>
+      <w:proofErr w:type="spellStart"/>
+      <w:r>
+        <w:rPr>
+          <w:rFonts w:ascii="Times New Roman" w:hAnsi="Times New Roman" w:cs="Times New Roman"/>
+          <w:lang w:val="en-GB"/>
+        </w:rPr>
+        <w:t>dibuat</w:t>
+      </w:r>
+      <w:proofErr w:type="spellEnd"/>
+      <w:r>
+        <w:rPr>
+          <w:rFonts w:ascii="Times New Roman" w:hAnsi="Times New Roman" w:cs="Times New Roman"/>
+          <w:lang w:val="en-GB"/>
+        </w:rPr>
+        <w:t>.</w:t>
+      </w:r>
+    </w:p>
+    <w:p>
+      <w:pPr>
+        <w:contextualSpacing/>
+        <w:jc w:val="both"/>
+        <w:rPr>
+          <w:rFonts w:ascii="Times New Roman" w:hAnsi="Times New Roman" w:cs="Times New Roman"/>
+          <w:lang w:val="en-GB"/>
+        </w:rPr>
+      </w:pPr>
+      <w:r>
+        <w:rPr>
+          <w:rFonts w:ascii="Times New Roman" w:hAnsi="Times New Roman" w:cs="Times New Roman"/>
+          <w:lang w:val="en-GB"/>
+        </w:rPr>
+        <w:t xml:space="preserve">  </w:t>
+      </w:r>
+      <w:proofErr w:type="spellStart"/>
+      <w:r>
+        <w:rPr>
+          <w:rFonts w:ascii="Times New Roman" w:hAnsi="Times New Roman" w:cs="Times New Roman"/>
+          <w:lang w:val="en-GB"/>
+        </w:rPr>
+        <w:t>updatedAt</w:t>
+      </w:r>
+      <w:proofErr w:type="spellEnd"/>
+      <w:r>
+        <w:rPr>
+          <w:rFonts w:ascii="Times New Roman" w:hAnsi="Times New Roman" w:cs="Times New Roman"/>
+          <w:lang w:val="en-GB"/>
+        </w:rPr>
+        <w:t xml:space="preserve">: Date;       # </w:t>
+      </w:r>
+      <w:proofErr w:type="spellStart"/>
+      <w:r>
+        <w:rPr>
+          <w:rFonts w:ascii="Times New Roman" w:hAnsi="Times New Roman" w:cs="Times New Roman"/>
+          <w:lang w:val="en-GB"/>
+        </w:rPr>
+        <w:t>Catatan</w:t>
+      </w:r>
+      <w:proofErr w:type="spellEnd"/>
+      <w:r>
+        <w:rPr>
+          <w:rFonts w:ascii="Times New Roman" w:hAnsi="Times New Roman" w:cs="Times New Roman"/>
+          <w:lang w:val="en-GB"/>
+        </w:rPr>
+        <w:t xml:space="preserve"> </w:t>
+      </w:r>
+      <w:proofErr w:type="spellStart"/>
+      <w:r>
+        <w:rPr>
+          <w:rFonts w:ascii="Times New Roman" w:hAnsi="Times New Roman" w:cs="Times New Roman"/>
+          <w:lang w:val="en-GB"/>
+        </w:rPr>
+        <w:t>waktu</w:t>
+      </w:r>
+      <w:proofErr w:type="spellEnd"/>
+      <w:r>
+        <w:rPr>
+          <w:rFonts w:ascii="Times New Roman" w:hAnsi="Times New Roman" w:cs="Times New Roman"/>
+          <w:lang w:val="en-GB"/>
+        </w:rPr>
+        <w:t xml:space="preserve"> kapan </w:t>
+      </w:r>
+      <w:proofErr w:type="spellStart"/>
+      <w:r>
+        <w:rPr>
+          <w:rFonts w:ascii="Times New Roman" w:hAnsi="Times New Roman" w:cs="Times New Roman"/>
+          <w:lang w:val="en-GB"/>
+        </w:rPr>
+        <w:t>terakhir</w:t>
+      </w:r>
+      <w:proofErr w:type="spellEnd"/>
+      <w:r>
+        <w:rPr>
+          <w:rFonts w:ascii="Times New Roman" w:hAnsi="Times New Roman" w:cs="Times New Roman"/>
+          <w:lang w:val="en-GB"/>
+        </w:rPr>
+        <w:t xml:space="preserve"> kali data </w:t>
+      </w:r>
+      <w:proofErr w:type="spellStart"/>
+      <w:r>
+        <w:rPr>
+          <w:rFonts w:ascii="Times New Roman" w:hAnsi="Times New Roman" w:cs="Times New Roman"/>
+          <w:lang w:val="en-GB"/>
+        </w:rPr>
+        <w:t>diubah</w:t>
+      </w:r>
+      <w:proofErr w:type="spellEnd"/>
+      <w:r>
+        <w:rPr>
+          <w:rFonts w:ascii="Times New Roman" w:hAnsi="Times New Roman" w:cs="Times New Roman"/>
+          <w:lang w:val="en-GB"/>
+        </w:rPr>
+        <w:t>.</w:t>
+      </w:r>
+    </w:p>
+    <w:p>
+      <w:pPr>
+        <w:contextualSpacing/>
+        <w:jc w:val="both"/>
+        <w:rPr>
+          <w:rFonts w:ascii="Times New Roman" w:hAnsi="Times New Roman" w:cs="Times New Roman"/>
+          <w:lang w:val="en-GB"/>
+        </w:rPr>
+      </w:pPr>
+    </w:p>
+    <w:p>
+      <w:pPr>
+        <w:contextualSpacing/>
+        <w:jc w:val="both"/>
+        <w:rPr>
+          <w:rFonts w:ascii="Times New Roman" w:hAnsi="Times New Roman" w:cs="Times New Roman"/>
+          <w:lang w:val="en-GB"/>
+        </w:rPr>
+      </w:pPr>
+      <w:r>
+        <w:rPr>
+          <w:rFonts w:ascii="Times New Roman" w:hAnsi="Times New Roman" w:cs="Times New Roman"/>
+          <w:lang w:val="en-GB"/>
+        </w:rPr>
+        <w:t xml:space="preserve">  # Constructor </w:t>
+      </w:r>
+      <w:proofErr w:type="spellStart"/>
+      <w:r>
+        <w:rPr>
+          <w:rFonts w:ascii="Times New Roman" w:hAnsi="Times New Roman" w:cs="Times New Roman"/>
+          <w:lang w:val="en-GB"/>
+        </w:rPr>
+        <w:t>adalah</w:t>
+      </w:r>
+      <w:proofErr w:type="spellEnd"/>
+      <w:r>
+        <w:rPr>
+          <w:rFonts w:ascii="Times New Roman" w:hAnsi="Times New Roman" w:cs="Times New Roman"/>
+          <w:lang w:val="en-GB"/>
+        </w:rPr>
+        <w:t xml:space="preserve"> </w:t>
+      </w:r>
+      <w:proofErr w:type="spellStart"/>
+      <w:r>
+        <w:rPr>
+          <w:rFonts w:ascii="Times New Roman" w:hAnsi="Times New Roman" w:cs="Times New Roman"/>
+          <w:lang w:val="en-GB"/>
+        </w:rPr>
+        <w:t>mesin</w:t>
+      </w:r>
+      <w:proofErr w:type="spellEnd"/>
+      <w:r>
+        <w:rPr>
+          <w:rFonts w:ascii="Times New Roman" w:hAnsi="Times New Roman" w:cs="Times New Roman"/>
+          <w:lang w:val="en-GB"/>
+        </w:rPr>
+        <w:t xml:space="preserve"> </w:t>
+      </w:r>
+      <w:proofErr w:type="spellStart"/>
+      <w:r>
+        <w:rPr>
+          <w:rFonts w:ascii="Times New Roman" w:hAnsi="Times New Roman" w:cs="Times New Roman"/>
+          <w:lang w:val="en-GB"/>
+        </w:rPr>
+        <w:t>pembuat</w:t>
+      </w:r>
+      <w:proofErr w:type="spellEnd"/>
+      <w:r>
+        <w:rPr>
+          <w:rFonts w:ascii="Times New Roman" w:hAnsi="Times New Roman" w:cs="Times New Roman"/>
+          <w:lang w:val="en-GB"/>
+        </w:rPr>
+        <w:t xml:space="preserve"> </w:t>
+      </w:r>
+      <w:proofErr w:type="spellStart"/>
+      <w:r>
+        <w:rPr>
+          <w:rFonts w:ascii="Times New Roman" w:hAnsi="Times New Roman" w:cs="Times New Roman"/>
+          <w:lang w:val="en-GB"/>
+        </w:rPr>
+        <w:t>objek</w:t>
+      </w:r>
+      <w:proofErr w:type="spellEnd"/>
+      <w:r>
+        <w:rPr>
+          <w:rFonts w:ascii="Times New Roman" w:hAnsi="Times New Roman" w:cs="Times New Roman"/>
+          <w:lang w:val="en-GB"/>
+        </w:rPr>
+        <w:t xml:space="preserve"> </w:t>
+      </w:r>
+      <w:proofErr w:type="spellStart"/>
+      <w:r>
+        <w:rPr>
+          <w:rFonts w:ascii="Times New Roman" w:hAnsi="Times New Roman" w:cs="Times New Roman"/>
+          <w:lang w:val="en-GB"/>
+        </w:rPr>
+        <w:t>otomatis</w:t>
+      </w:r>
+      <w:proofErr w:type="spellEnd"/>
+      <w:r>
+        <w:rPr>
+          <w:rFonts w:ascii="Times New Roman" w:hAnsi="Times New Roman" w:cs="Times New Roman"/>
+          <w:lang w:val="en-GB"/>
+        </w:rPr>
+        <w:t>.</w:t>
+      </w:r>
+    </w:p>
+    <w:p>
+      <w:pPr>
+        <w:contextualSpacing/>
+        <w:jc w:val="both"/>
+        <w:rPr>
+          <w:rFonts w:ascii="Times New Roman" w:hAnsi="Times New Roman" w:cs="Times New Roman"/>
+          <w:lang w:val="en-GB"/>
+        </w:rPr>
+      </w:pPr>
+      <w:r>
+        <w:rPr>
+          <w:rFonts w:ascii="Times New Roman" w:hAnsi="Times New Roman" w:cs="Times New Roman"/>
+          <w:lang w:val="en-GB"/>
+        </w:rPr>
+        <w:t xml:space="preserve">  # Partial&lt;</w:t>
+      </w:r>
+      <w:proofErr w:type="spellStart"/>
+      <w:r>
+        <w:rPr>
+          <w:rFonts w:ascii="Times New Roman" w:hAnsi="Times New Roman" w:cs="Times New Roman"/>
+          <w:lang w:val="en-GB"/>
+        </w:rPr>
+        <w:t>KategoriEntity</w:t>
+      </w:r>
+      <w:proofErr w:type="spellEnd"/>
+      <w:r>
+        <w:rPr>
+          <w:rFonts w:ascii="Times New Roman" w:hAnsi="Times New Roman" w:cs="Times New Roman"/>
+          <w:lang w:val="en-GB"/>
+        </w:rPr>
+        <w:t xml:space="preserve">&gt; </w:t>
       </w:r>
       <w:proofErr w:type="spellStart"/>
       <w:r>
@@ -9636,31 +9965,95 @@
           <w:rFonts w:ascii="Times New Roman" w:hAnsi="Times New Roman" w:cs="Times New Roman"/>
           <w:lang w:val="en-GB"/>
         </w:rPr>
-        <w:t>boleh</w:t>
-      </w:r>
-      <w:proofErr w:type="spellEnd"/>
-      <w:r>
-        <w:rPr>
-          <w:rFonts w:ascii="Times New Roman" w:hAnsi="Times New Roman" w:cs="Times New Roman"/>
-          <w:lang w:val="en-GB"/>
-        </w:rPr>
-        <w:t xml:space="preserve"> </w:t>
-      </w:r>
-      <w:proofErr w:type="spellStart"/>
-      <w:r>
-        <w:rPr>
-          <w:rFonts w:ascii="Times New Roman" w:hAnsi="Times New Roman" w:cs="Times New Roman"/>
-          <w:lang w:val="en-GB"/>
-        </w:rPr>
-        <w:t>kosong</w:t>
-      </w:r>
-      <w:proofErr w:type="spellEnd"/>
-      <w:r>
-        <w:rPr>
-          <w:rFonts w:ascii="Times New Roman" w:hAnsi="Times New Roman" w:cs="Times New Roman"/>
-          <w:lang w:val="en-GB"/>
-        </w:rPr>
-        <w:t>).</w:t>
+        <w:t>kita</w:t>
+      </w:r>
+      <w:proofErr w:type="spellEnd"/>
+      <w:r>
+        <w:rPr>
+          <w:rFonts w:ascii="Times New Roman" w:hAnsi="Times New Roman" w:cs="Times New Roman"/>
+          <w:lang w:val="en-GB"/>
+        </w:rPr>
+        <w:t xml:space="preserve"> </w:t>
+      </w:r>
+      <w:proofErr w:type="spellStart"/>
+      <w:r>
+        <w:rPr>
+          <w:rFonts w:ascii="Times New Roman" w:hAnsi="Times New Roman" w:cs="Times New Roman"/>
+          <w:lang w:val="en-GB"/>
+        </w:rPr>
+        <w:t>bisa</w:t>
+      </w:r>
+      <w:proofErr w:type="spellEnd"/>
+      <w:r>
+        <w:rPr>
+          <w:rFonts w:ascii="Times New Roman" w:hAnsi="Times New Roman" w:cs="Times New Roman"/>
+          <w:lang w:val="en-GB"/>
+        </w:rPr>
+        <w:t xml:space="preserve"> </w:t>
+      </w:r>
+      <w:proofErr w:type="spellStart"/>
+      <w:r>
+        <w:rPr>
+          <w:rFonts w:ascii="Times New Roman" w:hAnsi="Times New Roman" w:cs="Times New Roman"/>
+          <w:lang w:val="en-GB"/>
+        </w:rPr>
+        <w:t>memasukkan</w:t>
+      </w:r>
+      <w:proofErr w:type="spellEnd"/>
+      <w:r>
+        <w:rPr>
+          <w:rFonts w:ascii="Times New Roman" w:hAnsi="Times New Roman" w:cs="Times New Roman"/>
+          <w:lang w:val="en-GB"/>
+        </w:rPr>
+        <w:t xml:space="preserve"> data </w:t>
+      </w:r>
+      <w:proofErr w:type="spellStart"/>
+      <w:r>
+        <w:rPr>
+          <w:rFonts w:ascii="Times New Roman" w:hAnsi="Times New Roman" w:cs="Times New Roman"/>
+          <w:lang w:val="en-GB"/>
+        </w:rPr>
+        <w:t>meskipun</w:t>
+      </w:r>
+      <w:proofErr w:type="spellEnd"/>
+      <w:r>
+        <w:rPr>
+          <w:rFonts w:ascii="Times New Roman" w:hAnsi="Times New Roman" w:cs="Times New Roman"/>
+          <w:lang w:val="en-GB"/>
+        </w:rPr>
+        <w:t xml:space="preserve"> </w:t>
+      </w:r>
+      <w:proofErr w:type="spellStart"/>
+      <w:r>
+        <w:rPr>
+          <w:rFonts w:ascii="Times New Roman" w:hAnsi="Times New Roman" w:cs="Times New Roman"/>
+          <w:lang w:val="en-GB"/>
+        </w:rPr>
+        <w:t>tidak</w:t>
+      </w:r>
+      <w:proofErr w:type="spellEnd"/>
+      <w:r>
+        <w:rPr>
+          <w:rFonts w:ascii="Times New Roman" w:hAnsi="Times New Roman" w:cs="Times New Roman"/>
+          <w:lang w:val="en-GB"/>
+        </w:rPr>
+        <w:t xml:space="preserve"> </w:t>
+      </w:r>
+      <w:proofErr w:type="spellStart"/>
+      <w:r>
+        <w:rPr>
+          <w:rFonts w:ascii="Times New Roman" w:hAnsi="Times New Roman" w:cs="Times New Roman"/>
+          <w:lang w:val="en-GB"/>
+        </w:rPr>
+        <w:t>lengkap</w:t>
+      </w:r>
+      <w:proofErr w:type="spellEnd"/>
+      <w:r>
+        <w:rPr>
+          <w:rFonts w:ascii="Times New Roman" w:hAnsi="Times New Roman" w:cs="Times New Roman"/>
+          <w:lang w:val="en-GB"/>
+        </w:rPr>
+        <w:t>.</w:t>
       </w:r>
     </w:p>
     <w:p>
@@ -9677,55 +10070,104 @@
           <w:rFonts w:ascii="Times New Roman" w:hAnsi="Times New Roman" w:cs="Times New Roman"/>
           <w:lang w:val="en-GB"/>
         </w:rPr>
-        <w:t xml:space="preserve">  </w:t>
-      </w:r>
-      <w:proofErr w:type="gramStart"/>
-      <w:r>
-        <w:rPr>
-          <w:rFonts w:ascii="Times New Roman" w:hAnsi="Times New Roman" w:cs="Times New Roman"/>
-          <w:lang w:val="en-GB"/>
-        </w:rPr>
-        <w:t>icon?:</w:t>
-      </w:r>
-      <w:proofErr w:type="gramEnd"/>
-      <w:r>
-        <w:rPr>
-          <w:rFonts w:ascii="Times New Roman" w:hAnsi="Times New Roman" w:cs="Times New Roman"/>
-          <w:lang w:val="en-GB"/>
-        </w:rPr>
-        <w:t xml:space="preserve"> </w:t>
-      </w:r>
-      <w:proofErr w:type="gramStart"/>
-      <w:r>
-        <w:rPr>
-          <w:rFonts w:ascii="Times New Roman" w:hAnsi="Times New Roman" w:cs="Times New Roman"/>
-          <w:lang w:val="en-GB"/>
-        </w:rPr>
-        <w:t xml:space="preserve">string;   </w:t>
-      </w:r>
-      <w:proofErr w:type="gramEnd"/>
-      <w:r>
-        <w:rPr>
-          <w:rFonts w:ascii="Times New Roman" w:hAnsi="Times New Roman" w:cs="Times New Roman"/>
-          <w:lang w:val="en-GB"/>
-        </w:rPr>
-        <w:t xml:space="preserve">      # </w:t>
-      </w:r>
-      <w:proofErr w:type="spellStart"/>
-      <w:r>
-        <w:rPr>
-          <w:rFonts w:ascii="Times New Roman" w:hAnsi="Times New Roman" w:cs="Times New Roman"/>
-          <w:lang w:val="en-GB"/>
-        </w:rPr>
-        <w:t>Simbol</w:t>
-      </w:r>
-      <w:proofErr w:type="spellEnd"/>
-      <w:r>
-        <w:rPr>
-          <w:rFonts w:ascii="Times New Roman" w:hAnsi="Times New Roman" w:cs="Times New Roman"/>
-          <w:lang w:val="en-GB"/>
-        </w:rPr>
-        <w:t xml:space="preserve"> </w:t>
+        <w:t xml:space="preserve">  constructor(data: Partial&lt;</w:t>
+      </w:r>
+      <w:proofErr w:type="spellStart"/>
+      <w:r>
+        <w:rPr>
+          <w:rFonts w:ascii="Times New Roman" w:hAnsi="Times New Roman" w:cs="Times New Roman"/>
+          <w:lang w:val="en-GB"/>
+        </w:rPr>
+        <w:t>KategoriEntity</w:t>
+      </w:r>
+      <w:proofErr w:type="spellEnd"/>
+      <w:r>
+        <w:rPr>
+          <w:rFonts w:ascii="Times New Roman" w:hAnsi="Times New Roman" w:cs="Times New Roman"/>
+          <w:lang w:val="en-GB"/>
+        </w:rPr>
+        <w:t>&gt;) {</w:t>
+      </w:r>
+    </w:p>
+    <w:p>
+      <w:pPr>
+        <w:contextualSpacing/>
+        <w:jc w:val="both"/>
+        <w:rPr>
+          <w:rFonts w:ascii="Times New Roman" w:hAnsi="Times New Roman" w:cs="Times New Roman"/>
+          <w:lang w:val="en-GB"/>
+        </w:rPr>
+      </w:pPr>
+      <w:r>
+        <w:rPr>
+          <w:rFonts w:ascii="Times New Roman" w:hAnsi="Times New Roman" w:cs="Times New Roman"/>
+          <w:lang w:val="en-GB"/>
+        </w:rPr>
+        <w:t xml:space="preserve">    # </w:t>
+      </w:r>
+      <w:proofErr w:type="spellStart"/>
+      <w:r>
+        <w:rPr>
+          <w:rFonts w:ascii="Times New Roman" w:hAnsi="Times New Roman" w:cs="Times New Roman"/>
+          <w:lang w:val="en-GB"/>
+        </w:rPr>
+        <w:t>Object.assign</w:t>
+      </w:r>
+      <w:proofErr w:type="spellEnd"/>
+      <w:r>
+        <w:rPr>
+          <w:rFonts w:ascii="Times New Roman" w:hAnsi="Times New Roman" w:cs="Times New Roman"/>
+          <w:lang w:val="en-GB"/>
+        </w:rPr>
+        <w:t xml:space="preserve"> </w:t>
+      </w:r>
+      <w:proofErr w:type="spellStart"/>
+      <w:r>
+        <w:rPr>
+          <w:rFonts w:ascii="Times New Roman" w:hAnsi="Times New Roman" w:cs="Times New Roman"/>
+          <w:lang w:val="en-GB"/>
+        </w:rPr>
+        <w:t>berfungsi</w:t>
+      </w:r>
+      <w:proofErr w:type="spellEnd"/>
+      <w:r>
+        <w:rPr>
+          <w:rFonts w:ascii="Times New Roman" w:hAnsi="Times New Roman" w:cs="Times New Roman"/>
+          <w:lang w:val="en-GB"/>
+        </w:rPr>
+        <w:t xml:space="preserve"> </w:t>
+      </w:r>
+      <w:proofErr w:type="spellStart"/>
+      <w:r>
+        <w:rPr>
+          <w:rFonts w:ascii="Times New Roman" w:hAnsi="Times New Roman" w:cs="Times New Roman"/>
+          <w:lang w:val="en-GB"/>
+        </w:rPr>
+        <w:t>untuk</w:t>
+      </w:r>
+      <w:proofErr w:type="spellEnd"/>
+      <w:r>
+        <w:rPr>
+          <w:rFonts w:ascii="Times New Roman" w:hAnsi="Times New Roman" w:cs="Times New Roman"/>
+          <w:lang w:val="en-GB"/>
+        </w:rPr>
+        <w:t xml:space="preserve"> '</w:t>
+      </w:r>
+      <w:proofErr w:type="spellStart"/>
+      <w:r>
+        <w:rPr>
+          <w:rFonts w:ascii="Times New Roman" w:hAnsi="Times New Roman" w:cs="Times New Roman"/>
+          <w:lang w:val="en-GB"/>
+        </w:rPr>
+        <w:t>memberikan</w:t>
+      </w:r>
+      <w:proofErr w:type="spellEnd"/>
+      <w:r>
+        <w:rPr>
+          <w:rFonts w:ascii="Times New Roman" w:hAnsi="Times New Roman" w:cs="Times New Roman"/>
+          <w:lang w:val="en-GB"/>
+        </w:rPr>
+        <w:t xml:space="preserve">' </w:t>
       </w:r>
       <w:proofErr w:type="spellStart"/>
       <w:r>
@@ -9749,63 +10191,31 @@
           <w:rFonts w:ascii="Times New Roman" w:hAnsi="Times New Roman" w:cs="Times New Roman"/>
           <w:lang w:val="en-GB"/>
         </w:rPr>
-        <w:t>gambar</w:t>
-      </w:r>
-      <w:proofErr w:type="spellEnd"/>
-      <w:r>
-        <w:rPr>
-          <w:rFonts w:ascii="Times New Roman" w:hAnsi="Times New Roman" w:cs="Times New Roman"/>
-          <w:lang w:val="en-GB"/>
-        </w:rPr>
-        <w:t xml:space="preserve"> </w:t>
-      </w:r>
-      <w:proofErr w:type="spellStart"/>
-      <w:r>
-        <w:rPr>
-          <w:rFonts w:ascii="Times New Roman" w:hAnsi="Times New Roman" w:cs="Times New Roman"/>
-          <w:lang w:val="en-GB"/>
-        </w:rPr>
-        <w:t>kecil</w:t>
-      </w:r>
-      <w:proofErr w:type="spellEnd"/>
-      <w:r>
-        <w:rPr>
-          <w:rFonts w:ascii="Times New Roman" w:hAnsi="Times New Roman" w:cs="Times New Roman"/>
-          <w:lang w:val="en-GB"/>
-        </w:rPr>
-        <w:t xml:space="preserve"> </w:t>
-      </w:r>
-      <w:proofErr w:type="spellStart"/>
-      <w:r>
-        <w:rPr>
-          <w:rFonts w:ascii="Times New Roman" w:hAnsi="Times New Roman" w:cs="Times New Roman"/>
-          <w:lang w:val="en-GB"/>
-        </w:rPr>
-        <w:t>untuk</w:t>
-      </w:r>
-      <w:proofErr w:type="spellEnd"/>
-      <w:r>
-        <w:rPr>
-          <w:rFonts w:ascii="Times New Roman" w:hAnsi="Times New Roman" w:cs="Times New Roman"/>
-          <w:lang w:val="en-GB"/>
-        </w:rPr>
-        <w:t xml:space="preserve"> </w:t>
-      </w:r>
-      <w:proofErr w:type="spellStart"/>
-      <w:r>
-        <w:rPr>
-          <w:rFonts w:ascii="Times New Roman" w:hAnsi="Times New Roman" w:cs="Times New Roman"/>
-          <w:lang w:val="en-GB"/>
-        </w:rPr>
-        <w:t>kategori</w:t>
-      </w:r>
-      <w:proofErr w:type="spellEnd"/>
-      <w:r>
-        <w:rPr>
-          <w:rFonts w:ascii="Times New Roman" w:hAnsi="Times New Roman" w:cs="Times New Roman"/>
-          <w:lang w:val="en-GB"/>
-        </w:rPr>
-        <w:t>.</w:t>
+        <w:t>mengisi</w:t>
+      </w:r>
+      <w:proofErr w:type="spellEnd"/>
+      <w:r>
+        <w:rPr>
+          <w:rFonts w:ascii="Times New Roman" w:hAnsi="Times New Roman" w:cs="Times New Roman"/>
+          <w:lang w:val="en-GB"/>
+        </w:rPr>
+        <w:t xml:space="preserve"> </w:t>
+      </w:r>
+      <w:proofErr w:type="spellStart"/>
+      <w:r>
+        <w:rPr>
+          <w:rFonts w:ascii="Times New Roman" w:hAnsi="Times New Roman" w:cs="Times New Roman"/>
+          <w:lang w:val="en-GB"/>
+        </w:rPr>
+        <w:t>kolom-kolom</w:t>
+      </w:r>
+      <w:proofErr w:type="spellEnd"/>
+      <w:r>
+        <w:rPr>
+          <w:rFonts w:ascii="Times New Roman" w:hAnsi="Times New Roman" w:cs="Times New Roman"/>
+          <w:lang w:val="en-GB"/>
+        </w:rPr>
+        <w:t xml:space="preserve"> </w:t>
       </w:r>
     </w:p>
     <w:p>
@@ -9822,711 +10232,7 @@
           <w:rFonts w:ascii="Times New Roman" w:hAnsi="Times New Roman" w:cs="Times New Roman"/>
           <w:lang w:val="en-GB"/>
         </w:rPr>
-        <w:t xml:space="preserve">  </w:t>
-      </w:r>
-      <w:proofErr w:type="spellStart"/>
-      <w:r>
-        <w:rPr>
-          <w:rFonts w:ascii="Times New Roman" w:hAnsi="Times New Roman" w:cs="Times New Roman"/>
-          <w:lang w:val="en-GB"/>
-        </w:rPr>
-        <w:t>createdAt</w:t>
-      </w:r>
-      <w:proofErr w:type="spellEnd"/>
-      <w:r>
-        <w:rPr>
-          <w:rFonts w:ascii="Times New Roman" w:hAnsi="Times New Roman" w:cs="Times New Roman"/>
-          <w:lang w:val="en-GB"/>
-        </w:rPr>
-        <w:t xml:space="preserve">: </w:t>
-      </w:r>
-      <w:proofErr w:type="gramStart"/>
-      <w:r>
-        <w:rPr>
-          <w:rFonts w:ascii="Times New Roman" w:hAnsi="Times New Roman" w:cs="Times New Roman"/>
-          <w:lang w:val="en-GB"/>
-        </w:rPr>
-        <w:t xml:space="preserve">Date;   </w:t>
-      </w:r>
-      <w:proofErr w:type="gramEnd"/>
-      <w:r>
-        <w:rPr>
-          <w:rFonts w:ascii="Times New Roman" w:hAnsi="Times New Roman" w:cs="Times New Roman"/>
-          <w:lang w:val="en-GB"/>
-        </w:rPr>
-        <w:t xml:space="preserve">    # </w:t>
-      </w:r>
-      <w:proofErr w:type="spellStart"/>
-      <w:r>
-        <w:rPr>
-          <w:rFonts w:ascii="Times New Roman" w:hAnsi="Times New Roman" w:cs="Times New Roman"/>
-          <w:lang w:val="en-GB"/>
-        </w:rPr>
-        <w:t>Catatan</w:t>
-      </w:r>
-      <w:proofErr w:type="spellEnd"/>
-      <w:r>
-        <w:rPr>
-          <w:rFonts w:ascii="Times New Roman" w:hAnsi="Times New Roman" w:cs="Times New Roman"/>
-          <w:lang w:val="en-GB"/>
-        </w:rPr>
-        <w:t xml:space="preserve"> </w:t>
-      </w:r>
-      <w:proofErr w:type="spellStart"/>
-      <w:r>
-        <w:rPr>
-          <w:rFonts w:ascii="Times New Roman" w:hAnsi="Times New Roman" w:cs="Times New Roman"/>
-          <w:lang w:val="en-GB"/>
-        </w:rPr>
-        <w:t>waktu</w:t>
-      </w:r>
-      <w:proofErr w:type="spellEnd"/>
-      <w:r>
-        <w:rPr>
-          <w:rFonts w:ascii="Times New Roman" w:hAnsi="Times New Roman" w:cs="Times New Roman"/>
-          <w:lang w:val="en-GB"/>
-        </w:rPr>
-        <w:t xml:space="preserve"> </w:t>
-      </w:r>
-      <w:proofErr w:type="spellStart"/>
-      <w:r>
-        <w:rPr>
-          <w:rFonts w:ascii="Times New Roman" w:hAnsi="Times New Roman" w:cs="Times New Roman"/>
-          <w:lang w:val="en-GB"/>
-        </w:rPr>
-        <w:t>kapan</w:t>
-      </w:r>
-      <w:proofErr w:type="spellEnd"/>
-      <w:r>
-        <w:rPr>
-          <w:rFonts w:ascii="Times New Roman" w:hAnsi="Times New Roman" w:cs="Times New Roman"/>
-          <w:lang w:val="en-GB"/>
-        </w:rPr>
-        <w:t xml:space="preserve"> </w:t>
-      </w:r>
-      <w:proofErr w:type="spellStart"/>
-      <w:r>
-        <w:rPr>
-          <w:rFonts w:ascii="Times New Roman" w:hAnsi="Times New Roman" w:cs="Times New Roman"/>
-          <w:lang w:val="en-GB"/>
-        </w:rPr>
-        <w:t>kategori</w:t>
-      </w:r>
-      <w:proofErr w:type="spellEnd"/>
-      <w:r>
-        <w:rPr>
-          <w:rFonts w:ascii="Times New Roman" w:hAnsi="Times New Roman" w:cs="Times New Roman"/>
-          <w:lang w:val="en-GB"/>
-        </w:rPr>
-        <w:t xml:space="preserve"> </w:t>
-      </w:r>
-      <w:proofErr w:type="spellStart"/>
-      <w:r>
-        <w:rPr>
-          <w:rFonts w:ascii="Times New Roman" w:hAnsi="Times New Roman" w:cs="Times New Roman"/>
-          <w:lang w:val="en-GB"/>
-        </w:rPr>
-        <w:t>ini</w:t>
-      </w:r>
-      <w:proofErr w:type="spellEnd"/>
-      <w:r>
-        <w:rPr>
-          <w:rFonts w:ascii="Times New Roman" w:hAnsi="Times New Roman" w:cs="Times New Roman"/>
-          <w:lang w:val="en-GB"/>
-        </w:rPr>
-        <w:t xml:space="preserve"> </w:t>
-      </w:r>
-      <w:proofErr w:type="spellStart"/>
-      <w:r>
-        <w:rPr>
-          <w:rFonts w:ascii="Times New Roman" w:hAnsi="Times New Roman" w:cs="Times New Roman"/>
-          <w:lang w:val="en-GB"/>
-        </w:rPr>
-        <w:t>dibuat</w:t>
-      </w:r>
-      <w:proofErr w:type="spellEnd"/>
-      <w:r>
-        <w:rPr>
-          <w:rFonts w:ascii="Times New Roman" w:hAnsi="Times New Roman" w:cs="Times New Roman"/>
-          <w:lang w:val="en-GB"/>
-        </w:rPr>
-        <w:t>.</w:t>
-      </w:r>
-    </w:p>
-    <w:p>
-      <w:pPr>
-        <w:contextualSpacing/>
-        <w:jc w:val="both"/>
-        <w:rPr>
-          <w:rFonts w:ascii="Times New Roman" w:hAnsi="Times New Roman" w:cs="Times New Roman"/>
-          <w:lang w:val="en-GB"/>
-        </w:rPr>
-      </w:pPr>
-      <w:r>
-        <w:rPr>
-          <w:rFonts w:ascii="Times New Roman" w:hAnsi="Times New Roman" w:cs="Times New Roman"/>
-          <w:lang w:val="en-GB"/>
-        </w:rPr>
-        <w:t xml:space="preserve">  </w:t>
-      </w:r>
-      <w:proofErr w:type="spellStart"/>
-      <w:r>
-        <w:rPr>
-          <w:rFonts w:ascii="Times New Roman" w:hAnsi="Times New Roman" w:cs="Times New Roman"/>
-          <w:lang w:val="en-GB"/>
-        </w:rPr>
-        <w:t>updatedAt</w:t>
-      </w:r>
-      <w:proofErr w:type="spellEnd"/>
-      <w:r>
-        <w:rPr>
-          <w:rFonts w:ascii="Times New Roman" w:hAnsi="Times New Roman" w:cs="Times New Roman"/>
-          <w:lang w:val="en-GB"/>
-        </w:rPr>
-        <w:t xml:space="preserve">: </w:t>
-      </w:r>
-      <w:proofErr w:type="gramStart"/>
-      <w:r>
-        <w:rPr>
-          <w:rFonts w:ascii="Times New Roman" w:hAnsi="Times New Roman" w:cs="Times New Roman"/>
-          <w:lang w:val="en-GB"/>
-        </w:rPr>
-        <w:t xml:space="preserve">Date;   </w:t>
-      </w:r>
-      <w:proofErr w:type="gramEnd"/>
-      <w:r>
-        <w:rPr>
-          <w:rFonts w:ascii="Times New Roman" w:hAnsi="Times New Roman" w:cs="Times New Roman"/>
-          <w:lang w:val="en-GB"/>
-        </w:rPr>
-        <w:t xml:space="preserve">    # </w:t>
-      </w:r>
-      <w:proofErr w:type="spellStart"/>
-      <w:r>
-        <w:rPr>
-          <w:rFonts w:ascii="Times New Roman" w:hAnsi="Times New Roman" w:cs="Times New Roman"/>
-          <w:lang w:val="en-GB"/>
-        </w:rPr>
-        <w:t>Catatan</w:t>
-      </w:r>
-      <w:proofErr w:type="spellEnd"/>
-      <w:r>
-        <w:rPr>
-          <w:rFonts w:ascii="Times New Roman" w:hAnsi="Times New Roman" w:cs="Times New Roman"/>
-          <w:lang w:val="en-GB"/>
-        </w:rPr>
-        <w:t xml:space="preserve"> </w:t>
-      </w:r>
-      <w:proofErr w:type="spellStart"/>
-      <w:r>
-        <w:rPr>
-          <w:rFonts w:ascii="Times New Roman" w:hAnsi="Times New Roman" w:cs="Times New Roman"/>
-          <w:lang w:val="en-GB"/>
-        </w:rPr>
-        <w:t>waktu</w:t>
-      </w:r>
-      <w:proofErr w:type="spellEnd"/>
-      <w:r>
-        <w:rPr>
-          <w:rFonts w:ascii="Times New Roman" w:hAnsi="Times New Roman" w:cs="Times New Roman"/>
-          <w:lang w:val="en-GB"/>
-        </w:rPr>
-        <w:t xml:space="preserve"> kapan </w:t>
-      </w:r>
-      <w:proofErr w:type="spellStart"/>
-      <w:r>
-        <w:rPr>
-          <w:rFonts w:ascii="Times New Roman" w:hAnsi="Times New Roman" w:cs="Times New Roman"/>
-          <w:lang w:val="en-GB"/>
-        </w:rPr>
-        <w:t>terakhir</w:t>
-      </w:r>
-      <w:proofErr w:type="spellEnd"/>
-      <w:r>
-        <w:rPr>
-          <w:rFonts w:ascii="Times New Roman" w:hAnsi="Times New Roman" w:cs="Times New Roman"/>
-          <w:lang w:val="en-GB"/>
-        </w:rPr>
-        <w:t xml:space="preserve"> kali data </w:t>
-      </w:r>
-      <w:proofErr w:type="spellStart"/>
-      <w:r>
-        <w:rPr>
-          <w:rFonts w:ascii="Times New Roman" w:hAnsi="Times New Roman" w:cs="Times New Roman"/>
-          <w:lang w:val="en-GB"/>
-        </w:rPr>
-        <w:t>diubah</w:t>
-      </w:r>
-      <w:proofErr w:type="spellEnd"/>
-      <w:r>
-        <w:rPr>
-          <w:rFonts w:ascii="Times New Roman" w:hAnsi="Times New Roman" w:cs="Times New Roman"/>
-          <w:lang w:val="en-GB"/>
-        </w:rPr>
-        <w:t>.</w:t>
-      </w:r>
-    </w:p>
-    <w:p>
-      <w:pPr>
-        <w:contextualSpacing/>
-        <w:jc w:val="both"/>
-        <w:rPr>
-          <w:rFonts w:ascii="Times New Roman" w:hAnsi="Times New Roman" w:cs="Times New Roman"/>
-          <w:lang w:val="en-GB"/>
-        </w:rPr>
-      </w:pPr>
-    </w:p>
-    <w:p>
-      <w:pPr>
-        <w:contextualSpacing/>
-        <w:jc w:val="both"/>
-        <w:rPr>
-          <w:rFonts w:ascii="Times New Roman" w:hAnsi="Times New Roman" w:cs="Times New Roman"/>
-          <w:lang w:val="en-GB"/>
-        </w:rPr>
-      </w:pPr>
-      <w:r>
-        <w:rPr>
-          <w:rFonts w:ascii="Times New Roman" w:hAnsi="Times New Roman" w:cs="Times New Roman"/>
-          <w:lang w:val="en-GB"/>
-        </w:rPr>
-        <w:t xml:space="preserve">  # Constructor </w:t>
-      </w:r>
-      <w:proofErr w:type="spellStart"/>
-      <w:r>
-        <w:rPr>
-          <w:rFonts w:ascii="Times New Roman" w:hAnsi="Times New Roman" w:cs="Times New Roman"/>
-          <w:lang w:val="en-GB"/>
-        </w:rPr>
-        <w:t>adalah</w:t>
-      </w:r>
-      <w:proofErr w:type="spellEnd"/>
-      <w:r>
-        <w:rPr>
-          <w:rFonts w:ascii="Times New Roman" w:hAnsi="Times New Roman" w:cs="Times New Roman"/>
-          <w:lang w:val="en-GB"/>
-        </w:rPr>
-        <w:t xml:space="preserve"> </w:t>
-      </w:r>
-      <w:proofErr w:type="spellStart"/>
-      <w:r>
-        <w:rPr>
-          <w:rFonts w:ascii="Times New Roman" w:hAnsi="Times New Roman" w:cs="Times New Roman"/>
-          <w:lang w:val="en-GB"/>
-        </w:rPr>
-        <w:t>mesin</w:t>
-      </w:r>
-      <w:proofErr w:type="spellEnd"/>
-      <w:r>
-        <w:rPr>
-          <w:rFonts w:ascii="Times New Roman" w:hAnsi="Times New Roman" w:cs="Times New Roman"/>
-          <w:lang w:val="en-GB"/>
-        </w:rPr>
-        <w:t xml:space="preserve"> </w:t>
-      </w:r>
-      <w:proofErr w:type="spellStart"/>
-      <w:r>
-        <w:rPr>
-          <w:rFonts w:ascii="Times New Roman" w:hAnsi="Times New Roman" w:cs="Times New Roman"/>
-          <w:lang w:val="en-GB"/>
-        </w:rPr>
-        <w:t>pembuat</w:t>
-      </w:r>
-      <w:proofErr w:type="spellEnd"/>
-      <w:r>
-        <w:rPr>
-          <w:rFonts w:ascii="Times New Roman" w:hAnsi="Times New Roman" w:cs="Times New Roman"/>
-          <w:lang w:val="en-GB"/>
-        </w:rPr>
-        <w:t xml:space="preserve"> </w:t>
-      </w:r>
-      <w:proofErr w:type="spellStart"/>
-      <w:r>
-        <w:rPr>
-          <w:rFonts w:ascii="Times New Roman" w:hAnsi="Times New Roman" w:cs="Times New Roman"/>
-          <w:lang w:val="en-GB"/>
-        </w:rPr>
-        <w:t>objek</w:t>
-      </w:r>
-      <w:proofErr w:type="spellEnd"/>
-      <w:r>
-        <w:rPr>
-          <w:rFonts w:ascii="Times New Roman" w:hAnsi="Times New Roman" w:cs="Times New Roman"/>
-          <w:lang w:val="en-GB"/>
-        </w:rPr>
-        <w:t xml:space="preserve"> </w:t>
-      </w:r>
-      <w:proofErr w:type="spellStart"/>
-      <w:r>
-        <w:rPr>
-          <w:rFonts w:ascii="Times New Roman" w:hAnsi="Times New Roman" w:cs="Times New Roman"/>
-          <w:lang w:val="en-GB"/>
-        </w:rPr>
-        <w:t>otomatis</w:t>
-      </w:r>
-      <w:proofErr w:type="spellEnd"/>
-      <w:r>
-        <w:rPr>
-          <w:rFonts w:ascii="Times New Roman" w:hAnsi="Times New Roman" w:cs="Times New Roman"/>
-          <w:lang w:val="en-GB"/>
-        </w:rPr>
-        <w:t>.</w:t>
-      </w:r>
-    </w:p>
-    <w:p>
-      <w:pPr>
-        <w:contextualSpacing/>
-        <w:jc w:val="both"/>
-        <w:rPr>
-          <w:rFonts w:ascii="Times New Roman" w:hAnsi="Times New Roman" w:cs="Times New Roman"/>
-          <w:lang w:val="en-GB"/>
-        </w:rPr>
-      </w:pPr>
-      <w:r>
-        <w:rPr>
-          <w:rFonts w:ascii="Times New Roman" w:hAnsi="Times New Roman" w:cs="Times New Roman"/>
-          <w:lang w:val="en-GB"/>
-        </w:rPr>
-        <w:t xml:space="preserve">  # Partial&lt;</w:t>
-      </w:r>
-      <w:proofErr w:type="spellStart"/>
-      <w:r>
-        <w:rPr>
-          <w:rFonts w:ascii="Times New Roman" w:hAnsi="Times New Roman" w:cs="Times New Roman"/>
-          <w:lang w:val="en-GB"/>
-        </w:rPr>
-        <w:t>KategoriEntity</w:t>
-      </w:r>
-      <w:proofErr w:type="spellEnd"/>
-      <w:r>
-        <w:rPr>
-          <w:rFonts w:ascii="Times New Roman" w:hAnsi="Times New Roman" w:cs="Times New Roman"/>
-          <w:lang w:val="en-GB"/>
-        </w:rPr>
-        <w:t xml:space="preserve">&gt; </w:t>
-      </w:r>
-      <w:proofErr w:type="spellStart"/>
-      <w:r>
-        <w:rPr>
-          <w:rFonts w:ascii="Times New Roman" w:hAnsi="Times New Roman" w:cs="Times New Roman"/>
-          <w:lang w:val="en-GB"/>
-        </w:rPr>
-        <w:t>artinya</w:t>
-      </w:r>
-      <w:proofErr w:type="spellEnd"/>
-      <w:r>
-        <w:rPr>
-          <w:rFonts w:ascii="Times New Roman" w:hAnsi="Times New Roman" w:cs="Times New Roman"/>
-          <w:lang w:val="en-GB"/>
-        </w:rPr>
-        <w:t xml:space="preserve"> </w:t>
-      </w:r>
-      <w:proofErr w:type="spellStart"/>
-      <w:r>
-        <w:rPr>
-          <w:rFonts w:ascii="Times New Roman" w:hAnsi="Times New Roman" w:cs="Times New Roman"/>
-          <w:lang w:val="en-GB"/>
-        </w:rPr>
-        <w:t>kita</w:t>
-      </w:r>
-      <w:proofErr w:type="spellEnd"/>
-      <w:r>
-        <w:rPr>
-          <w:rFonts w:ascii="Times New Roman" w:hAnsi="Times New Roman" w:cs="Times New Roman"/>
-          <w:lang w:val="en-GB"/>
-        </w:rPr>
-        <w:t xml:space="preserve"> </w:t>
-      </w:r>
-      <w:proofErr w:type="spellStart"/>
-      <w:r>
-        <w:rPr>
-          <w:rFonts w:ascii="Times New Roman" w:hAnsi="Times New Roman" w:cs="Times New Roman"/>
-          <w:lang w:val="en-GB"/>
-        </w:rPr>
-        <w:t>bisa</w:t>
-      </w:r>
-      <w:proofErr w:type="spellEnd"/>
-      <w:r>
-        <w:rPr>
-          <w:rFonts w:ascii="Times New Roman" w:hAnsi="Times New Roman" w:cs="Times New Roman"/>
-          <w:lang w:val="en-GB"/>
-        </w:rPr>
-        <w:t xml:space="preserve"> </w:t>
-      </w:r>
-      <w:proofErr w:type="spellStart"/>
-      <w:r>
-        <w:rPr>
-          <w:rFonts w:ascii="Times New Roman" w:hAnsi="Times New Roman" w:cs="Times New Roman"/>
-          <w:lang w:val="en-GB"/>
-        </w:rPr>
-        <w:t>memasukkan</w:t>
-      </w:r>
-      <w:proofErr w:type="spellEnd"/>
-      <w:r>
-        <w:rPr>
-          <w:rFonts w:ascii="Times New Roman" w:hAnsi="Times New Roman" w:cs="Times New Roman"/>
-          <w:lang w:val="en-GB"/>
-        </w:rPr>
-        <w:t xml:space="preserve"> data </w:t>
-      </w:r>
-      <w:proofErr w:type="spellStart"/>
-      <w:r>
-        <w:rPr>
-          <w:rFonts w:ascii="Times New Roman" w:hAnsi="Times New Roman" w:cs="Times New Roman"/>
-          <w:lang w:val="en-GB"/>
-        </w:rPr>
-        <w:t>meskipun</w:t>
-      </w:r>
-      <w:proofErr w:type="spellEnd"/>
-      <w:r>
-        <w:rPr>
-          <w:rFonts w:ascii="Times New Roman" w:hAnsi="Times New Roman" w:cs="Times New Roman"/>
-          <w:lang w:val="en-GB"/>
-        </w:rPr>
-        <w:t xml:space="preserve"> </w:t>
-      </w:r>
-      <w:proofErr w:type="spellStart"/>
-      <w:r>
-        <w:rPr>
-          <w:rFonts w:ascii="Times New Roman" w:hAnsi="Times New Roman" w:cs="Times New Roman"/>
-          <w:lang w:val="en-GB"/>
-        </w:rPr>
-        <w:t>tidak</w:t>
-      </w:r>
-      <w:proofErr w:type="spellEnd"/>
-      <w:r>
-        <w:rPr>
-          <w:rFonts w:ascii="Times New Roman" w:hAnsi="Times New Roman" w:cs="Times New Roman"/>
-          <w:lang w:val="en-GB"/>
-        </w:rPr>
-        <w:t xml:space="preserve"> </w:t>
-      </w:r>
-      <w:proofErr w:type="spellStart"/>
-      <w:r>
-        <w:rPr>
-          <w:rFonts w:ascii="Times New Roman" w:hAnsi="Times New Roman" w:cs="Times New Roman"/>
-          <w:lang w:val="en-GB"/>
-        </w:rPr>
-        <w:t>lengkap</w:t>
-      </w:r>
-      <w:proofErr w:type="spellEnd"/>
-      <w:r>
-        <w:rPr>
-          <w:rFonts w:ascii="Times New Roman" w:hAnsi="Times New Roman" w:cs="Times New Roman"/>
-          <w:lang w:val="en-GB"/>
-        </w:rPr>
-        <w:t>.</w:t>
-      </w:r>
-    </w:p>
-    <w:p>
-      <w:pPr>
-        <w:contextualSpacing/>
-        <w:jc w:val="both"/>
-        <w:rPr>
-          <w:rFonts w:ascii="Times New Roman" w:hAnsi="Times New Roman" w:cs="Times New Roman"/>
-          <w:lang w:val="en-GB"/>
-        </w:rPr>
-      </w:pPr>
-      <w:r>
-        <w:rPr>
-          <w:rFonts w:ascii="Times New Roman" w:hAnsi="Times New Roman" w:cs="Times New Roman"/>
-          <w:lang w:val="en-GB"/>
-        </w:rPr>
-        <w:t xml:space="preserve">  </w:t>
-      </w:r>
-      <w:proofErr w:type="gramStart"/>
-      <w:r>
-        <w:rPr>
-          <w:rFonts w:ascii="Times New Roman" w:hAnsi="Times New Roman" w:cs="Times New Roman"/>
-          <w:lang w:val="en-GB"/>
-        </w:rPr>
-        <w:t>constructor(</w:t>
-      </w:r>
-      <w:proofErr w:type="gramEnd"/>
-      <w:r>
-        <w:rPr>
-          <w:rFonts w:ascii="Times New Roman" w:hAnsi="Times New Roman" w:cs="Times New Roman"/>
-          <w:lang w:val="en-GB"/>
-        </w:rPr>
-        <w:t>data: Partial&lt;</w:t>
-      </w:r>
-      <w:proofErr w:type="spellStart"/>
-      <w:r>
-        <w:rPr>
-          <w:rFonts w:ascii="Times New Roman" w:hAnsi="Times New Roman" w:cs="Times New Roman"/>
-          <w:lang w:val="en-GB"/>
-        </w:rPr>
-        <w:t>KategoriEntity</w:t>
-      </w:r>
-      <w:proofErr w:type="spellEnd"/>
-      <w:r>
-        <w:rPr>
-          <w:rFonts w:ascii="Times New Roman" w:hAnsi="Times New Roman" w:cs="Times New Roman"/>
-          <w:lang w:val="en-GB"/>
-        </w:rPr>
-        <w:t>&gt;) {</w:t>
-      </w:r>
-    </w:p>
-    <w:p>
-      <w:pPr>
-        <w:contextualSpacing/>
-        <w:jc w:val="both"/>
-        <w:rPr>
-          <w:rFonts w:ascii="Times New Roman" w:hAnsi="Times New Roman" w:cs="Times New Roman"/>
-          <w:lang w:val="en-GB"/>
-        </w:rPr>
-      </w:pPr>
-      <w:r>
-        <w:rPr>
-          <w:rFonts w:ascii="Times New Roman" w:hAnsi="Times New Roman" w:cs="Times New Roman"/>
-          <w:lang w:val="en-GB"/>
-        </w:rPr>
-        <w:t xml:space="preserve">    # </w:t>
-      </w:r>
-      <w:proofErr w:type="spellStart"/>
-      <w:r>
-        <w:rPr>
-          <w:rFonts w:ascii="Times New Roman" w:hAnsi="Times New Roman" w:cs="Times New Roman"/>
-          <w:lang w:val="en-GB"/>
-        </w:rPr>
-        <w:t>Object.assign</w:t>
-      </w:r>
-      <w:proofErr w:type="spellEnd"/>
-      <w:r>
-        <w:rPr>
-          <w:rFonts w:ascii="Times New Roman" w:hAnsi="Times New Roman" w:cs="Times New Roman"/>
-          <w:lang w:val="en-GB"/>
-        </w:rPr>
-        <w:t xml:space="preserve"> </w:t>
-      </w:r>
-      <w:proofErr w:type="spellStart"/>
-      <w:r>
-        <w:rPr>
-          <w:rFonts w:ascii="Times New Roman" w:hAnsi="Times New Roman" w:cs="Times New Roman"/>
-          <w:lang w:val="en-GB"/>
-        </w:rPr>
-        <w:t>berfungsi</w:t>
-      </w:r>
-      <w:proofErr w:type="spellEnd"/>
-      <w:r>
-        <w:rPr>
-          <w:rFonts w:ascii="Times New Roman" w:hAnsi="Times New Roman" w:cs="Times New Roman"/>
-          <w:lang w:val="en-GB"/>
-        </w:rPr>
-        <w:t xml:space="preserve"> </w:t>
-      </w:r>
-      <w:proofErr w:type="spellStart"/>
-      <w:r>
-        <w:rPr>
-          <w:rFonts w:ascii="Times New Roman" w:hAnsi="Times New Roman" w:cs="Times New Roman"/>
-          <w:lang w:val="en-GB"/>
-        </w:rPr>
-        <w:t>untuk</w:t>
-      </w:r>
-      <w:proofErr w:type="spellEnd"/>
-      <w:r>
-        <w:rPr>
-          <w:rFonts w:ascii="Times New Roman" w:hAnsi="Times New Roman" w:cs="Times New Roman"/>
-          <w:lang w:val="en-GB"/>
-        </w:rPr>
-        <w:t xml:space="preserve"> '</w:t>
-      </w:r>
-      <w:proofErr w:type="spellStart"/>
-      <w:r>
-        <w:rPr>
-          <w:rFonts w:ascii="Times New Roman" w:hAnsi="Times New Roman" w:cs="Times New Roman"/>
-          <w:lang w:val="en-GB"/>
-        </w:rPr>
-        <w:t>memberikan</w:t>
-      </w:r>
-      <w:proofErr w:type="spellEnd"/>
-      <w:r>
-        <w:rPr>
-          <w:rFonts w:ascii="Times New Roman" w:hAnsi="Times New Roman" w:cs="Times New Roman"/>
-          <w:lang w:val="en-GB"/>
-        </w:rPr>
-        <w:t xml:space="preserve">' </w:t>
-      </w:r>
-      <w:proofErr w:type="spellStart"/>
-      <w:r>
-        <w:rPr>
-          <w:rFonts w:ascii="Times New Roman" w:hAnsi="Times New Roman" w:cs="Times New Roman"/>
-          <w:lang w:val="en-GB"/>
-        </w:rPr>
-        <w:t>atau</w:t>
-      </w:r>
-      <w:proofErr w:type="spellEnd"/>
-      <w:r>
-        <w:rPr>
-          <w:rFonts w:ascii="Times New Roman" w:hAnsi="Times New Roman" w:cs="Times New Roman"/>
-          <w:lang w:val="en-GB"/>
-        </w:rPr>
-        <w:t xml:space="preserve"> </w:t>
-      </w:r>
-      <w:proofErr w:type="spellStart"/>
-      <w:r>
-        <w:rPr>
-          <w:rFonts w:ascii="Times New Roman" w:hAnsi="Times New Roman" w:cs="Times New Roman"/>
-          <w:lang w:val="en-GB"/>
-        </w:rPr>
-        <w:t>mengisi</w:t>
-      </w:r>
-      <w:proofErr w:type="spellEnd"/>
-      <w:r>
-        <w:rPr>
-          <w:rFonts w:ascii="Times New Roman" w:hAnsi="Times New Roman" w:cs="Times New Roman"/>
-          <w:lang w:val="en-GB"/>
-        </w:rPr>
-        <w:t xml:space="preserve"> </w:t>
-      </w:r>
-      <w:proofErr w:type="spellStart"/>
-      <w:r>
-        <w:rPr>
-          <w:rFonts w:ascii="Times New Roman" w:hAnsi="Times New Roman" w:cs="Times New Roman"/>
-          <w:lang w:val="en-GB"/>
-        </w:rPr>
-        <w:t>kolom-kolom</w:t>
-      </w:r>
-      <w:proofErr w:type="spellEnd"/>
-      <w:r>
-        <w:rPr>
-          <w:rFonts w:ascii="Times New Roman" w:hAnsi="Times New Roman" w:cs="Times New Roman"/>
-          <w:lang w:val="en-GB"/>
-        </w:rPr>
-        <w:t xml:space="preserve"> </w:t>
-      </w:r>
-    </w:p>
-    <w:p>
-      <w:pPr>
-        <w:contextualSpacing/>
-        <w:jc w:val="both"/>
-        <w:rPr>
-          <w:rFonts w:ascii="Times New Roman" w:hAnsi="Times New Roman" w:cs="Times New Roman"/>
-          <w:lang w:val="en-GB"/>
-        </w:rPr>
-      </w:pPr>
-      <w:r>
-        <w:rPr>
-          <w:rFonts w:ascii="Times New Roman" w:hAnsi="Times New Roman" w:cs="Times New Roman"/>
-          <w:lang w:val="en-GB"/>
-        </w:rPr>
-        <w:t xml:space="preserve">    # </w:t>
-      </w:r>
-      <w:proofErr w:type="gramStart"/>
-      <w:r>
-        <w:rPr>
-          <w:rFonts w:ascii="Times New Roman" w:hAnsi="Times New Roman" w:cs="Times New Roman"/>
-          <w:lang w:val="en-GB"/>
-        </w:rPr>
-        <w:t>di</w:t>
-      </w:r>
-      <w:proofErr w:type="gramEnd"/>
-      <w:r>
-        <w:rPr>
-          <w:rFonts w:ascii="Times New Roman" w:hAnsi="Times New Roman" w:cs="Times New Roman"/>
-          <w:lang w:val="en-GB"/>
-        </w:rPr>
-        <w:t xml:space="preserve"> </w:t>
+        <w:t xml:space="preserve">    # di </w:t>
       </w:r>
       <w:proofErr w:type="spellStart"/>
       <w:r>
@@ -10777,7 +10483,6 @@
         <w:t xml:space="preserve"> </w:t>
       </w:r>
       <w:proofErr w:type="spellStart"/>
-      <w:proofErr w:type="gramStart"/>
       <w:r>
         <w:rPr>
           <w:rFonts w:ascii="Times New Roman" w:hAnsi="Times New Roman" w:cs="Times New Roman"/>
@@ -10786,7 +10491,6 @@
         <w:t>kategori.harga</w:t>
       </w:r>
       <w:proofErr w:type="spellEnd"/>
-      <w:proofErr w:type="gramEnd"/>
       <w:r>
         <w:rPr>
           <w:rFonts w:ascii="Times New Roman" w:hAnsi="Times New Roman" w:cs="Times New Roman"/>
@@ -11762,7 +11466,6 @@
           <w:lang w:val="en-GB"/>
         </w:rPr>
       </w:pPr>
-      <w:proofErr w:type="gramStart"/>
       <w:r>
         <w:rPr>
           <w:rFonts w:ascii="Times New Roman" w:hAnsi="Times New Roman" w:cs="Times New Roman"/>
@@ -11770,7 +11473,6 @@
         </w:rPr>
         <w:t>Kode :</w:t>
       </w:r>
-      <w:proofErr w:type="gramEnd"/>
     </w:p>
     <w:p>
       <w:pPr>
@@ -11786,15 +11488,7 @@
           <w:rFonts w:ascii="Times New Roman" w:hAnsi="Times New Roman" w:cs="Times New Roman"/>
           <w:lang w:val="en-GB"/>
         </w:rPr>
-        <w:t xml:space="preserve">import </w:t>
-      </w:r>
-      <w:proofErr w:type="gramStart"/>
-      <w:r>
-        <w:rPr>
-          <w:rFonts w:ascii="Times New Roman" w:hAnsi="Times New Roman" w:cs="Times New Roman"/>
-          <w:lang w:val="en-GB"/>
-        </w:rPr>
-        <w:t xml:space="preserve">{ </w:t>
+        <w:t xml:space="preserve">import { </w:t>
       </w:r>
       <w:proofErr w:type="spellStart"/>
       <w:r>
@@ -11805,7 +11499,6 @@
         <w:t>IsString</w:t>
       </w:r>
       <w:proofErr w:type="spellEnd"/>
-      <w:proofErr w:type="gramEnd"/>
       <w:r>
         <w:rPr>
           <w:rFonts w:ascii="Times New Roman" w:hAnsi="Times New Roman" w:cs="Times New Roman"/>
@@ -11862,7 +11555,6 @@
         <w:t xml:space="preserve">, </w:t>
       </w:r>
       <w:proofErr w:type="spellStart"/>
-      <w:proofErr w:type="gramStart"/>
       <w:r>
         <w:rPr>
           <w:rFonts w:ascii="Times New Roman" w:hAnsi="Times New Roman" w:cs="Times New Roman"/>
@@ -11876,15 +11568,7 @@
           <w:rFonts w:ascii="Times New Roman" w:hAnsi="Times New Roman" w:cs="Times New Roman"/>
           <w:lang w:val="en-GB"/>
         </w:rPr>
-        <w:t xml:space="preserve"> }</w:t>
-      </w:r>
-      <w:proofErr w:type="gramEnd"/>
-      <w:r>
-        <w:rPr>
-          <w:rFonts w:ascii="Times New Roman" w:hAnsi="Times New Roman" w:cs="Times New Roman"/>
-          <w:lang w:val="en-GB"/>
-        </w:rPr>
-        <w:t xml:space="preserve"> from 'class-validator';</w:t>
+        <w:t xml:space="preserve"> } from 'class-validator';</w:t>
       </w:r>
     </w:p>
     <w:p>
@@ -12090,23 +11774,7 @@
           <w:rFonts w:ascii="Times New Roman" w:hAnsi="Times New Roman" w:cs="Times New Roman"/>
           <w:lang w:val="en-GB"/>
         </w:rPr>
-        <w:t xml:space="preserve">  @</w:t>
-      </w:r>
-      <w:proofErr w:type="gramStart"/>
-      <w:r>
-        <w:rPr>
-          <w:rFonts w:ascii="Times New Roman" w:hAnsi="Times New Roman" w:cs="Times New Roman"/>
-          <w:lang w:val="en-GB"/>
-        </w:rPr>
-        <w:t>IsString(</w:t>
-      </w:r>
-      <w:proofErr w:type="gramEnd"/>
-      <w:r>
-        <w:rPr>
-          <w:rFonts w:ascii="Times New Roman" w:hAnsi="Times New Roman" w:cs="Times New Roman"/>
-          <w:lang w:val="en-GB"/>
-        </w:rPr>
-        <w:t xml:space="preserve">)      # Harus </w:t>
+        <w:t xml:space="preserve">  @IsString()      # Harus </w:t>
       </w:r>
       <w:proofErr w:type="spellStart"/>
       <w:r>
@@ -12155,23 +11823,7 @@
           <w:rFonts w:ascii="Times New Roman" w:hAnsi="Times New Roman" w:cs="Times New Roman"/>
           <w:lang w:val="en-GB"/>
         </w:rPr>
-        <w:t xml:space="preserve">  @</w:t>
-      </w:r>
-      <w:proofErr w:type="gramStart"/>
-      <w:r>
-        <w:rPr>
-          <w:rFonts w:ascii="Times New Roman" w:hAnsi="Times New Roman" w:cs="Times New Roman"/>
-          <w:lang w:val="en-GB"/>
-        </w:rPr>
-        <w:t>IsNotEmpty(</w:t>
-      </w:r>
-      <w:proofErr w:type="gramEnd"/>
-      <w:r>
-        <w:rPr>
-          <w:rFonts w:ascii="Times New Roman" w:hAnsi="Times New Roman" w:cs="Times New Roman"/>
-          <w:lang w:val="en-GB"/>
-        </w:rPr>
-        <w:t xml:space="preserve">)   # Tidak </w:t>
+        <w:t xml:space="preserve">  @IsNotEmpty()   # Tidak </w:t>
       </w:r>
       <w:proofErr w:type="spellStart"/>
       <w:r>
@@ -12268,23 +11920,7 @@
           <w:rFonts w:ascii="Times New Roman" w:hAnsi="Times New Roman" w:cs="Times New Roman"/>
           <w:lang w:val="en-GB"/>
         </w:rPr>
-        <w:t xml:space="preserve">  @</w:t>
-      </w:r>
-      <w:proofErr w:type="gramStart"/>
-      <w:r>
-        <w:rPr>
-          <w:rFonts w:ascii="Times New Roman" w:hAnsi="Times New Roman" w:cs="Times New Roman"/>
-          <w:lang w:val="en-GB"/>
-        </w:rPr>
-        <w:t>MinLength(</w:t>
-      </w:r>
-      <w:proofErr w:type="gramEnd"/>
-      <w:r>
-        <w:rPr>
-          <w:rFonts w:ascii="Times New Roman" w:hAnsi="Times New Roman" w:cs="Times New Roman"/>
-          <w:lang w:val="en-GB"/>
-        </w:rPr>
-        <w:t xml:space="preserve">2)   # Minimal </w:t>
+        <w:t xml:space="preserve">  @MinLength(2)   # Minimal </w:t>
       </w:r>
       <w:proofErr w:type="spellStart"/>
       <w:r>
@@ -12413,23 +12049,7 @@
           <w:rFonts w:ascii="Times New Roman" w:hAnsi="Times New Roman" w:cs="Times New Roman"/>
           <w:lang w:val="en-GB"/>
         </w:rPr>
-        <w:t xml:space="preserve">  @</w:t>
-      </w:r>
-      <w:proofErr w:type="gramStart"/>
-      <w:r>
-        <w:rPr>
-          <w:rFonts w:ascii="Times New Roman" w:hAnsi="Times New Roman" w:cs="Times New Roman"/>
-          <w:lang w:val="en-GB"/>
-        </w:rPr>
-        <w:t>MaxLength(</w:t>
-      </w:r>
-      <w:proofErr w:type="gramEnd"/>
-      <w:r>
-        <w:rPr>
-          <w:rFonts w:ascii="Times New Roman" w:hAnsi="Times New Roman" w:cs="Times New Roman"/>
-          <w:lang w:val="en-GB"/>
-        </w:rPr>
-        <w:t xml:space="preserve">100) # </w:t>
+        <w:t xml:space="preserve">  @MaxLength(100) # </w:t>
       </w:r>
       <w:proofErr w:type="spellStart"/>
       <w:r>
@@ -12537,23 +12157,7 @@
           <w:rFonts w:ascii="Times New Roman" w:hAnsi="Times New Roman" w:cs="Times New Roman"/>
           <w:lang w:val="en-GB"/>
         </w:rPr>
-        <w:t xml:space="preserve">  @</w:t>
-      </w:r>
-      <w:proofErr w:type="gramStart"/>
-      <w:r>
-        <w:rPr>
-          <w:rFonts w:ascii="Times New Roman" w:hAnsi="Times New Roman" w:cs="Times New Roman"/>
-          <w:lang w:val="en-GB"/>
-        </w:rPr>
-        <w:t>IsString(</w:t>
-      </w:r>
-      <w:proofErr w:type="gramEnd"/>
-      <w:r>
-        <w:rPr>
-          <w:rFonts w:ascii="Times New Roman" w:hAnsi="Times New Roman" w:cs="Times New Roman"/>
-          <w:lang w:val="en-GB"/>
-        </w:rPr>
-        <w:t xml:space="preserve">)      # Harus </w:t>
+        <w:t xml:space="preserve">  @IsString()      # Harus </w:t>
       </w:r>
       <w:proofErr w:type="spellStart"/>
       <w:r>
@@ -12602,23 +12206,7 @@
           <w:rFonts w:ascii="Times New Roman" w:hAnsi="Times New Roman" w:cs="Times New Roman"/>
           <w:lang w:val="en-GB"/>
         </w:rPr>
-        <w:t xml:space="preserve">  @</w:t>
-      </w:r>
-      <w:proofErr w:type="gramStart"/>
-      <w:r>
-        <w:rPr>
-          <w:rFonts w:ascii="Times New Roman" w:hAnsi="Times New Roman" w:cs="Times New Roman"/>
-          <w:lang w:val="en-GB"/>
-        </w:rPr>
-        <w:t>IsNotEmpty(</w:t>
-      </w:r>
-      <w:proofErr w:type="gramEnd"/>
-      <w:r>
-        <w:rPr>
-          <w:rFonts w:ascii="Times New Roman" w:hAnsi="Times New Roman" w:cs="Times New Roman"/>
-          <w:lang w:val="en-GB"/>
-        </w:rPr>
-        <w:t xml:space="preserve">)   # Wajib </w:t>
+        <w:t xml:space="preserve">  @IsNotEmpty()   # Wajib </w:t>
       </w:r>
       <w:proofErr w:type="spellStart"/>
       <w:r>
@@ -12715,23 +12303,7 @@
           <w:rFonts w:ascii="Times New Roman" w:hAnsi="Times New Roman" w:cs="Times New Roman"/>
           <w:lang w:val="en-GB"/>
         </w:rPr>
-        <w:t xml:space="preserve">  @</w:t>
-      </w:r>
-      <w:proofErr w:type="gramStart"/>
-      <w:r>
-        <w:rPr>
-          <w:rFonts w:ascii="Times New Roman" w:hAnsi="Times New Roman" w:cs="Times New Roman"/>
-          <w:lang w:val="en-GB"/>
-        </w:rPr>
-        <w:t>MinLength(</w:t>
-      </w:r>
-      <w:proofErr w:type="gramEnd"/>
-      <w:r>
-        <w:rPr>
-          <w:rFonts w:ascii="Times New Roman" w:hAnsi="Times New Roman" w:cs="Times New Roman"/>
-          <w:lang w:val="en-GB"/>
-        </w:rPr>
-        <w:t>2)</w:t>
+        <w:t xml:space="preserve">  @MinLength(2)</w:t>
       </w:r>
     </w:p>
     <w:p>
@@ -12748,23 +12320,7 @@
           <w:rFonts w:ascii="Times New Roman" w:hAnsi="Times New Roman" w:cs="Times New Roman"/>
           <w:lang w:val="en-GB"/>
         </w:rPr>
-        <w:t xml:space="preserve">  @</w:t>
-      </w:r>
-      <w:proofErr w:type="gramStart"/>
-      <w:r>
-        <w:rPr>
-          <w:rFonts w:ascii="Times New Roman" w:hAnsi="Times New Roman" w:cs="Times New Roman"/>
-          <w:lang w:val="en-GB"/>
-        </w:rPr>
-        <w:t>MaxLength(</w:t>
-      </w:r>
-      <w:proofErr w:type="gramEnd"/>
-      <w:r>
-        <w:rPr>
-          <w:rFonts w:ascii="Times New Roman" w:hAnsi="Times New Roman" w:cs="Times New Roman"/>
-          <w:lang w:val="en-GB"/>
-        </w:rPr>
-        <w:t>100)</w:t>
+        <w:t xml:space="preserve">  @MaxLength(100)</w:t>
       </w:r>
     </w:p>
     <w:p>
@@ -12808,23 +12364,7 @@
           <w:rFonts w:ascii="Times New Roman" w:hAnsi="Times New Roman" w:cs="Times New Roman"/>
           <w:lang w:val="en-GB"/>
         </w:rPr>
-        <w:t xml:space="preserve">  @</w:t>
-      </w:r>
-      <w:proofErr w:type="gramStart"/>
-      <w:r>
-        <w:rPr>
-          <w:rFonts w:ascii="Times New Roman" w:hAnsi="Times New Roman" w:cs="Times New Roman"/>
-          <w:lang w:val="en-GB"/>
-        </w:rPr>
-        <w:t>IsString(</w:t>
-      </w:r>
-      <w:proofErr w:type="gramEnd"/>
-      <w:r>
-        <w:rPr>
-          <w:rFonts w:ascii="Times New Roman" w:hAnsi="Times New Roman" w:cs="Times New Roman"/>
-          <w:lang w:val="en-GB"/>
-        </w:rPr>
-        <w:t xml:space="preserve">)      # Harus </w:t>
+        <w:t xml:space="preserve">  @IsString()      # Harus </w:t>
       </w:r>
       <w:proofErr w:type="spellStart"/>
       <w:r>
@@ -12873,23 +12413,7 @@
           <w:rFonts w:ascii="Times New Roman" w:hAnsi="Times New Roman" w:cs="Times New Roman"/>
           <w:lang w:val="en-GB"/>
         </w:rPr>
-        <w:t xml:space="preserve">  @</w:t>
-      </w:r>
-      <w:proofErr w:type="gramStart"/>
-      <w:r>
-        <w:rPr>
-          <w:rFonts w:ascii="Times New Roman" w:hAnsi="Times New Roman" w:cs="Times New Roman"/>
-          <w:lang w:val="en-GB"/>
-        </w:rPr>
-        <w:t>IsOptional(</w:t>
-      </w:r>
-      <w:proofErr w:type="gramEnd"/>
-      <w:r>
-        <w:rPr>
-          <w:rFonts w:ascii="Times New Roman" w:hAnsi="Times New Roman" w:cs="Times New Roman"/>
-          <w:lang w:val="en-GB"/>
-        </w:rPr>
-        <w:t>)   # BOLEH KOSONG (</w:t>
+        <w:t xml:space="preserve">  @IsOptional()   # BOLEH KOSONG (</w:t>
       </w:r>
       <w:proofErr w:type="spellStart"/>
       <w:r>
@@ -12954,23 +12478,7 @@
           <w:rFonts w:ascii="Times New Roman" w:hAnsi="Times New Roman" w:cs="Times New Roman"/>
           <w:lang w:val="en-GB"/>
         </w:rPr>
-        <w:t xml:space="preserve">  @</w:t>
-      </w:r>
-      <w:proofErr w:type="gramStart"/>
-      <w:r>
-        <w:rPr>
-          <w:rFonts w:ascii="Times New Roman" w:hAnsi="Times New Roman" w:cs="Times New Roman"/>
-          <w:lang w:val="en-GB"/>
-        </w:rPr>
-        <w:t>MaxLength(</w:t>
-      </w:r>
-      <w:proofErr w:type="gramEnd"/>
-      <w:r>
-        <w:rPr>
-          <w:rFonts w:ascii="Times New Roman" w:hAnsi="Times New Roman" w:cs="Times New Roman"/>
-          <w:lang w:val="en-GB"/>
-        </w:rPr>
-        <w:t xml:space="preserve">500) # Jika </w:t>
+        <w:t xml:space="preserve">  @MaxLength(500) # Jika </w:t>
       </w:r>
       <w:proofErr w:type="spellStart"/>
       <w:r>
@@ -13084,23 +12592,7 @@
           <w:lang w:val="en-GB"/>
         </w:rPr>
         <w:lastRenderedPageBreak/>
-        <w:t xml:space="preserve">  </w:t>
-      </w:r>
-      <w:proofErr w:type="gramStart"/>
-      <w:r>
-        <w:rPr>
-          <w:rFonts w:ascii="Times New Roman" w:hAnsi="Times New Roman" w:cs="Times New Roman"/>
-          <w:lang w:val="en-GB"/>
-        </w:rPr>
-        <w:t>description?:</w:t>
-      </w:r>
-      <w:proofErr w:type="gramEnd"/>
-      <w:r>
-        <w:rPr>
-          <w:rFonts w:ascii="Times New Roman" w:hAnsi="Times New Roman" w:cs="Times New Roman"/>
-          <w:lang w:val="en-GB"/>
-        </w:rPr>
-        <w:t xml:space="preserve"> string;</w:t>
+        <w:t xml:space="preserve">  description?: string;</w:t>
       </w:r>
     </w:p>
     <w:p>
@@ -13127,23 +12619,7 @@
           <w:rFonts w:ascii="Times New Roman" w:hAnsi="Times New Roman" w:cs="Times New Roman"/>
           <w:lang w:val="en-GB"/>
         </w:rPr>
-        <w:t xml:space="preserve">  @</w:t>
-      </w:r>
-      <w:proofErr w:type="gramStart"/>
-      <w:r>
-        <w:rPr>
-          <w:rFonts w:ascii="Times New Roman" w:hAnsi="Times New Roman" w:cs="Times New Roman"/>
-          <w:lang w:val="en-GB"/>
-        </w:rPr>
-        <w:t>IsString(</w:t>
-      </w:r>
-      <w:proofErr w:type="gramEnd"/>
-      <w:r>
-        <w:rPr>
-          <w:rFonts w:ascii="Times New Roman" w:hAnsi="Times New Roman" w:cs="Times New Roman"/>
-          <w:lang w:val="en-GB"/>
-        </w:rPr>
-        <w:t>)</w:t>
+        <w:t xml:space="preserve">  @IsString()</w:t>
       </w:r>
     </w:p>
     <w:p>
@@ -13160,23 +12636,7 @@
           <w:rFonts w:ascii="Times New Roman" w:hAnsi="Times New Roman" w:cs="Times New Roman"/>
           <w:lang w:val="en-GB"/>
         </w:rPr>
-        <w:t xml:space="preserve">  @</w:t>
-      </w:r>
-      <w:proofErr w:type="gramStart"/>
-      <w:r>
-        <w:rPr>
-          <w:rFonts w:ascii="Times New Roman" w:hAnsi="Times New Roman" w:cs="Times New Roman"/>
-          <w:lang w:val="en-GB"/>
-        </w:rPr>
-        <w:t>IsOptional(</w:t>
-      </w:r>
-      <w:proofErr w:type="gramEnd"/>
-      <w:r>
-        <w:rPr>
-          <w:rFonts w:ascii="Times New Roman" w:hAnsi="Times New Roman" w:cs="Times New Roman"/>
-          <w:lang w:val="en-GB"/>
-        </w:rPr>
-        <w:t>)   # BOLEH KOSONG (</w:t>
+        <w:t xml:space="preserve">  @IsOptional()   # BOLEH KOSONG (</w:t>
       </w:r>
       <w:proofErr w:type="spellStart"/>
       <w:r>
@@ -13257,23 +12717,7 @@
           <w:rFonts w:ascii="Times New Roman" w:hAnsi="Times New Roman" w:cs="Times New Roman"/>
           <w:lang w:val="en-GB"/>
         </w:rPr>
-        <w:t xml:space="preserve">  </w:t>
-      </w:r>
-      <w:proofErr w:type="gramStart"/>
-      <w:r>
-        <w:rPr>
-          <w:rFonts w:ascii="Times New Roman" w:hAnsi="Times New Roman" w:cs="Times New Roman"/>
-          <w:lang w:val="en-GB"/>
-        </w:rPr>
-        <w:t>icon?:</w:t>
-      </w:r>
-      <w:proofErr w:type="gramEnd"/>
-      <w:r>
-        <w:rPr>
-          <w:rFonts w:ascii="Times New Roman" w:hAnsi="Times New Roman" w:cs="Times New Roman"/>
-          <w:lang w:val="en-GB"/>
-        </w:rPr>
-        <w:t xml:space="preserve"> string;</w:t>
+        <w:t xml:space="preserve">  icon?: string;</w:t>
       </w:r>
     </w:p>
     <w:p>
@@ -14346,7 +13790,6 @@
         <w:t xml:space="preserve"> </w:t>
       </w:r>
       <w:proofErr w:type="spellStart"/>
-      <w:proofErr w:type="gramStart"/>
       <w:r>
         <w:rPr>
           <w:rFonts w:ascii="Times New Roman" w:hAnsi="Times New Roman" w:cs="Times New Roman"/>
@@ -14371,7 +13814,6 @@
         <w:t>tidak</w:t>
       </w:r>
       <w:proofErr w:type="spellEnd"/>
-      <w:proofErr w:type="gramEnd"/>
       <w:r>
         <w:rPr>
           <w:rFonts w:ascii="Times New Roman" w:hAnsi="Times New Roman" w:cs="Times New Roman"/>
@@ -14604,23 +14046,7 @@
           <w:rFonts w:ascii="Times New Roman" w:hAnsi="Times New Roman" w:cs="Times New Roman"/>
           <w:lang w:val="en-GB"/>
         </w:rPr>
-        <w:t xml:space="preserve"> </w:t>
-      </w:r>
-      <w:proofErr w:type="gramStart"/>
-      <w:r>
-        <w:rPr>
-          <w:rFonts w:ascii="Times New Roman" w:hAnsi="Times New Roman" w:cs="Times New Roman"/>
-          <w:lang w:val="en-GB"/>
-        </w:rPr>
-        <w:t>name?:</w:t>
-      </w:r>
-      <w:proofErr w:type="gramEnd"/>
-      <w:r>
-        <w:rPr>
-          <w:rFonts w:ascii="Times New Roman" w:hAnsi="Times New Roman" w:cs="Times New Roman"/>
-          <w:lang w:val="en-GB"/>
-        </w:rPr>
-        <w:t xml:space="preserve"> string) </w:t>
+        <w:t xml:space="preserve"> name?: string) </w:t>
       </w:r>
       <w:proofErr w:type="spellStart"/>
       <w:r>
@@ -15033,21 +14459,12 @@
           <w:lang w:val="en-GB"/>
         </w:rPr>
       </w:pPr>
-      <w:proofErr w:type="gramStart"/>
-      <w:r>
-        <w:rPr>
-          <w:rFonts w:ascii="Times New Roman" w:hAnsi="Times New Roman" w:cs="Times New Roman"/>
-          <w:lang w:val="en-GB"/>
-        </w:rPr>
-        <w:t>File :</w:t>
-      </w:r>
-      <w:proofErr w:type="gramEnd"/>
-      <w:r>
-        <w:rPr>
-          <w:rFonts w:ascii="Times New Roman" w:hAnsi="Times New Roman" w:cs="Times New Roman"/>
-          <w:lang w:val="en-GB"/>
-        </w:rPr>
-        <w:t xml:space="preserve"> </w:t>
+      <w:r>
+        <w:rPr>
+          <w:rFonts w:ascii="Times New Roman" w:hAnsi="Times New Roman" w:cs="Times New Roman"/>
+          <w:lang w:val="en-GB"/>
+        </w:rPr>
+        <w:t xml:space="preserve">File : </w:t>
       </w:r>
       <w:proofErr w:type="spellStart"/>
       <w:r>
@@ -15164,15 +14581,7 @@
           <w:rFonts w:ascii="Times New Roman" w:hAnsi="Times New Roman" w:cs="Times New Roman"/>
           <w:lang w:val="en-GB"/>
         </w:rPr>
-        <w:t xml:space="preserve">import </w:t>
-      </w:r>
-      <w:proofErr w:type="gramStart"/>
-      <w:r>
-        <w:rPr>
-          <w:rFonts w:ascii="Times New Roman" w:hAnsi="Times New Roman" w:cs="Times New Roman"/>
-          <w:lang w:val="en-GB"/>
-        </w:rPr>
-        <w:t xml:space="preserve">{ </w:t>
+        <w:t xml:space="preserve">import { </w:t>
       </w:r>
       <w:proofErr w:type="spellStart"/>
       <w:r>
@@ -15183,7 +14592,6 @@
         <w:t>ConflictException</w:t>
       </w:r>
       <w:proofErr w:type="spellEnd"/>
-      <w:proofErr w:type="gramEnd"/>
       <w:r>
         <w:rPr>
           <w:rFonts w:ascii="Times New Roman" w:hAnsi="Times New Roman" w:cs="Times New Roman"/>
@@ -15823,7 +15231,6 @@
         <w:t xml:space="preserve">  static </w:t>
       </w:r>
       <w:proofErr w:type="spellStart"/>
-      <w:proofErr w:type="gramStart"/>
       <w:r>
         <w:rPr>
           <w:rFonts w:ascii="Times New Roman" w:hAnsi="Times New Roman" w:cs="Times New Roman"/>
@@ -15837,15 +15244,7 @@
           <w:rFonts w:ascii="Times New Roman" w:hAnsi="Times New Roman" w:cs="Times New Roman"/>
           <w:lang w:val="en-GB"/>
         </w:rPr>
-        <w:t>(</w:t>
-      </w:r>
-      <w:proofErr w:type="gramEnd"/>
-      <w:r>
-        <w:rPr>
-          <w:rFonts w:ascii="Times New Roman" w:hAnsi="Times New Roman" w:cs="Times New Roman"/>
-          <w:lang w:val="en-GB"/>
-        </w:rPr>
-        <w:t>name: string): never {</w:t>
+        <w:t>(name: string): never {</w:t>
       </w:r>
     </w:p>
     <w:p>
@@ -16094,7 +15493,6 @@
         <w:t xml:space="preserve">    throw new </w:t>
       </w:r>
       <w:proofErr w:type="spellStart"/>
-      <w:proofErr w:type="gramStart"/>
       <w:r>
         <w:rPr>
           <w:rFonts w:ascii="Times New Roman" w:hAnsi="Times New Roman" w:cs="Times New Roman"/>
@@ -16110,7 +15508,6 @@
         </w:rPr>
         <w:t>(</w:t>
       </w:r>
-      <w:proofErr w:type="gramEnd"/>
     </w:p>
     <w:p>
       <w:pPr>
@@ -16373,7 +15770,6 @@
         <w:t xml:space="preserve">  static </w:t>
       </w:r>
       <w:proofErr w:type="spellStart"/>
-      <w:proofErr w:type="gramStart"/>
       <w:r>
         <w:rPr>
           <w:rFonts w:ascii="Times New Roman" w:hAnsi="Times New Roman" w:cs="Times New Roman"/>
@@ -16387,15 +15783,7 @@
           <w:rFonts w:ascii="Times New Roman" w:hAnsi="Times New Roman" w:cs="Times New Roman"/>
           <w:lang w:val="en-GB"/>
         </w:rPr>
-        <w:t>(</w:t>
-      </w:r>
-      <w:proofErr w:type="gramEnd"/>
-      <w:r>
-        <w:rPr>
-          <w:rFonts w:ascii="Times New Roman" w:hAnsi="Times New Roman" w:cs="Times New Roman"/>
-          <w:lang w:val="en-GB"/>
-        </w:rPr>
-        <w:t>slug: string): never {</w:t>
+        <w:t>(slug: string): never {</w:t>
       </w:r>
     </w:p>
     <w:p>
@@ -16498,7 +15886,6 @@
         <w:t xml:space="preserve">    throw new </w:t>
       </w:r>
       <w:proofErr w:type="spellStart"/>
-      <w:proofErr w:type="gramStart"/>
       <w:r>
         <w:rPr>
           <w:rFonts w:ascii="Times New Roman" w:hAnsi="Times New Roman" w:cs="Times New Roman"/>
@@ -16514,7 +15901,6 @@
         </w:rPr>
         <w:t>(</w:t>
       </w:r>
-      <w:proofErr w:type="gramEnd"/>
     </w:p>
     <w:p>
       <w:pPr>
@@ -16809,7 +16195,6 @@
         <w:t xml:space="preserve">  static </w:t>
       </w:r>
       <w:proofErr w:type="spellStart"/>
-      <w:proofErr w:type="gramStart"/>
       <w:r>
         <w:rPr>
           <w:rFonts w:ascii="Times New Roman" w:hAnsi="Times New Roman" w:cs="Times New Roman"/>
@@ -16823,15 +16208,7 @@
           <w:rFonts w:ascii="Times New Roman" w:hAnsi="Times New Roman" w:cs="Times New Roman"/>
           <w:lang w:val="en-GB"/>
         </w:rPr>
-        <w:t>(</w:t>
-      </w:r>
-      <w:proofErr w:type="gramEnd"/>
-      <w:r>
-        <w:rPr>
-          <w:rFonts w:ascii="Times New Roman" w:hAnsi="Times New Roman" w:cs="Times New Roman"/>
-          <w:lang w:val="en-GB"/>
-        </w:rPr>
-        <w:t>field: string): never {</w:t>
+        <w:t>(field: string): never {</w:t>
       </w:r>
     </w:p>
     <w:p>
@@ -16853,7 +16230,6 @@
         <w:t xml:space="preserve">    throw new </w:t>
       </w:r>
       <w:proofErr w:type="spellStart"/>
-      <w:proofErr w:type="gramStart"/>
       <w:r>
         <w:rPr>
           <w:rFonts w:ascii="Times New Roman" w:hAnsi="Times New Roman" w:cs="Times New Roman"/>
@@ -16869,7 +16245,6 @@
         </w:rPr>
         <w:t>(</w:t>
       </w:r>
-      <w:proofErr w:type="gramEnd"/>
     </w:p>
     <w:p>
       <w:pPr>
@@ -17346,7 +16721,6 @@
           <w:lang w:val="en-GB"/>
         </w:rPr>
       </w:pPr>
-      <w:proofErr w:type="gramStart"/>
       <w:r>
         <w:rPr>
           <w:rFonts w:ascii="Times New Roman" w:hAnsi="Times New Roman" w:cs="Times New Roman"/>
@@ -17361,17 +16735,7 @@
           <w:bCs/>
           <w:lang w:val="en-GB"/>
         </w:rPr>
-        <w:t xml:space="preserve"> :</w:t>
-      </w:r>
-      <w:proofErr w:type="gramEnd"/>
-      <w:r>
-        <w:rPr>
-          <w:rFonts w:ascii="Times New Roman" w:hAnsi="Times New Roman" w:cs="Times New Roman"/>
-          <w:b/>
-          <w:bCs/>
-          <w:lang w:val="en-GB"/>
-        </w:rPr>
-        <w:t xml:space="preserve"> </w:t>
+        <w:t xml:space="preserve"> : </w:t>
       </w:r>
       <w:proofErr w:type="spellStart"/>
       <w:r>
@@ -17661,7 +17025,6 @@
         <w:t xml:space="preserve"> </w:t>
       </w:r>
       <w:proofErr w:type="spellStart"/>
-      <w:proofErr w:type="gramStart"/>
       <w:r>
         <w:rPr>
           <w:rFonts w:ascii="Times New Roman" w:hAnsi="Times New Roman" w:cs="Times New Roman"/>
@@ -17677,7 +17040,6 @@
         </w:rPr>
         <w:t xml:space="preserve"> :</w:t>
       </w:r>
-      <w:proofErr w:type="gramEnd"/>
     </w:p>
     <w:p>
       <w:pPr>
@@ -18547,21 +17909,12 @@
       <w:pPr>
         <w:jc w:val="both"/>
       </w:pPr>
-      <w:proofErr w:type="gramStart"/>
-      <w:r>
-        <w:rPr>
-          <w:rFonts w:ascii="Times New Roman" w:hAnsi="Times New Roman" w:cs="Times New Roman"/>
-          <w:lang w:val="en-GB"/>
-        </w:rPr>
-        <w:t>File :</w:t>
-      </w:r>
-      <w:proofErr w:type="gramEnd"/>
-      <w:r>
-        <w:rPr>
-          <w:rFonts w:ascii="Times New Roman" w:hAnsi="Times New Roman" w:cs="Times New Roman"/>
-          <w:lang w:val="en-GB"/>
-        </w:rPr>
-        <w:t xml:space="preserve"> </w:t>
+      <w:r>
+        <w:rPr>
+          <w:rFonts w:ascii="Times New Roman" w:hAnsi="Times New Roman" w:cs="Times New Roman"/>
+          <w:lang w:val="en-GB"/>
+        </w:rPr>
+        <w:t xml:space="preserve">File : </w:t>
       </w:r>
       <w:proofErr w:type="spellStart"/>
       <w:r>
@@ -19634,21 +18987,12 @@
       <w:pPr>
         <w:jc w:val="both"/>
       </w:pPr>
-      <w:proofErr w:type="gramStart"/>
-      <w:r>
-        <w:rPr>
-          <w:rFonts w:ascii="Times New Roman" w:hAnsi="Times New Roman" w:cs="Times New Roman"/>
-          <w:lang w:val="en-GB"/>
-        </w:rPr>
-        <w:t>File :</w:t>
-      </w:r>
-      <w:proofErr w:type="gramEnd"/>
-      <w:r>
-        <w:rPr>
-          <w:rFonts w:ascii="Times New Roman" w:hAnsi="Times New Roman" w:cs="Times New Roman"/>
-          <w:lang w:val="en-GB"/>
-        </w:rPr>
-        <w:t xml:space="preserve"> </w:t>
+      <w:r>
+        <w:rPr>
+          <w:rFonts w:ascii="Times New Roman" w:hAnsi="Times New Roman" w:cs="Times New Roman"/>
+          <w:lang w:val="en-GB"/>
+        </w:rPr>
+        <w:t xml:space="preserve">File : </w:t>
       </w:r>
       <w:proofErr w:type="spellStart"/>
       <w:r>
@@ -20765,21 +20109,12 @@
       <w:pPr>
         <w:jc w:val="both"/>
       </w:pPr>
-      <w:proofErr w:type="gramStart"/>
-      <w:r>
-        <w:rPr>
-          <w:rFonts w:ascii="Times New Roman" w:hAnsi="Times New Roman" w:cs="Times New Roman"/>
-          <w:lang w:val="en-GB"/>
-        </w:rPr>
-        <w:t>File :</w:t>
-      </w:r>
-      <w:proofErr w:type="gramEnd"/>
-      <w:r>
-        <w:rPr>
-          <w:rFonts w:ascii="Times New Roman" w:hAnsi="Times New Roman" w:cs="Times New Roman"/>
-          <w:lang w:val="en-GB"/>
-        </w:rPr>
-        <w:t xml:space="preserve"> </w:t>
+      <w:r>
+        <w:rPr>
+          <w:rFonts w:ascii="Times New Roman" w:hAnsi="Times New Roman" w:cs="Times New Roman"/>
+          <w:lang w:val="en-GB"/>
+        </w:rPr>
+        <w:t xml:space="preserve">File : </w:t>
       </w:r>
       <w:proofErr w:type="spellStart"/>
       <w:r>
@@ -21588,21 +20923,12 @@
           <w:lang w:val="en-GB"/>
         </w:rPr>
       </w:pPr>
-      <w:proofErr w:type="gramStart"/>
-      <w:r>
-        <w:rPr>
-          <w:rFonts w:ascii="Times New Roman" w:hAnsi="Times New Roman" w:cs="Times New Roman"/>
-          <w:lang w:val="en-GB"/>
-        </w:rPr>
-        <w:t>File :</w:t>
-      </w:r>
-      <w:proofErr w:type="gramEnd"/>
-      <w:r>
-        <w:rPr>
-          <w:rFonts w:ascii="Times New Roman" w:hAnsi="Times New Roman" w:cs="Times New Roman"/>
-          <w:lang w:val="en-GB"/>
-        </w:rPr>
-        <w:t xml:space="preserve"> </w:t>
+      <w:r>
+        <w:rPr>
+          <w:rFonts w:ascii="Times New Roman" w:hAnsi="Times New Roman" w:cs="Times New Roman"/>
+          <w:lang w:val="en-GB"/>
+        </w:rPr>
+        <w:t xml:space="preserve">File : </w:t>
       </w:r>
       <w:r>
         <w:t>jest.config.js</w:t>
@@ -22285,7 +21611,6 @@
         <w:t xml:space="preserve"> </w:t>
       </w:r>
       <w:proofErr w:type="spellStart"/>
-      <w:proofErr w:type="gramStart"/>
       <w:r>
         <w:rPr>
           <w:rFonts w:ascii="Times New Roman" w:hAnsi="Times New Roman" w:cs="Times New Roman"/>
@@ -22299,15 +21624,7 @@
           <w:rFonts w:ascii="Times New Roman" w:hAnsi="Times New Roman" w:cs="Times New Roman"/>
           <w:lang w:val="en-GB"/>
         </w:rPr>
-        <w:t xml:space="preserve"> :</w:t>
-      </w:r>
-      <w:proofErr w:type="gramEnd"/>
-      <w:r>
-        <w:rPr>
-          <w:rFonts w:ascii="Times New Roman" w:hAnsi="Times New Roman" w:cs="Times New Roman"/>
-          <w:lang w:val="en-GB"/>
-        </w:rPr>
-        <w:t xml:space="preserve"> Kode Anda </w:t>
+        <w:t xml:space="preserve"> : Kode Anda </w:t>
       </w:r>
       <w:proofErr w:type="spellStart"/>
       <w:r>
@@ -22872,6 +22189,430 @@
           <w:lang w:val="en-GB"/>
         </w:rPr>
         <w:t>akurat</w:t>
+      </w:r>
+      <w:proofErr w:type="spellEnd"/>
+      <w:r>
+        <w:rPr>
+          <w:rFonts w:ascii="Times New Roman" w:hAnsi="Times New Roman" w:cs="Times New Roman"/>
+          <w:lang w:val="en-GB"/>
+        </w:rPr>
+        <w:t>.</w:t>
+      </w:r>
+    </w:p>
+    <w:p>
+      <w:pPr>
+        <w:jc w:val="both"/>
+        <w:rPr>
+          <w:rFonts w:ascii="Times New Roman" w:hAnsi="Times New Roman" w:cs="Times New Roman"/>
+          <w:lang w:val="en-GB"/>
+        </w:rPr>
+      </w:pPr>
+    </w:p>
+    <w:p>
+      <w:pPr>
+        <w:jc w:val="both"/>
+      </w:pPr>
+      <w:r>
+        <w:rPr>
+          <w:rFonts w:ascii="Times New Roman" w:hAnsi="Times New Roman" w:cs="Times New Roman"/>
+          <w:lang w:val="en-GB"/>
+        </w:rPr>
+        <w:t xml:space="preserve">21. </w:t>
+      </w:r>
+      <w:proofErr w:type="spellStart"/>
+      <w:r>
+        <w:rPr>
+          <w:rFonts w:ascii="Times New Roman" w:hAnsi="Times New Roman" w:cs="Times New Roman"/>
+          <w:lang w:val="en-GB"/>
+        </w:rPr>
+        <w:t>Membuat</w:t>
+      </w:r>
+      <w:proofErr w:type="spellEnd"/>
+      <w:r>
+        <w:rPr>
+          <w:rFonts w:ascii="Times New Roman" w:hAnsi="Times New Roman" w:cs="Times New Roman"/>
+          <w:lang w:val="en-GB"/>
+        </w:rPr>
+        <w:t xml:space="preserve"> file </w:t>
+      </w:r>
+      <w:r>
+        <w:t>jest-e2e.json</w:t>
+      </w:r>
+    </w:p>
+    <w:p>
+      <w:pPr>
+        <w:jc w:val="both"/>
+      </w:pPr>
+      <w:r>
+        <w:t xml:space="preserve">File :  </w:t>
+      </w:r>
+      <w:r>
+        <w:t>test/jest-e2e.json</w:t>
+      </w:r>
+    </w:p>
+    <w:p>
+      <w:pPr>
+        <w:jc w:val="both"/>
+      </w:pPr>
+      <w:r>
+        <w:rPr>
+          <w:noProof/>
+        </w:rPr>
+        <w:lastRenderedPageBreak/>
+        <w:drawing>
+          <wp:inline distT="0" distB="0" distL="0" distR="0" wp14:anchorId="17E0AF3E" wp14:editId="0015F4D7">
+            <wp:extent cx="5731510" cy="3222625"/>
+            <wp:effectExtent l="0" t="0" r="2540" b="0"/>
+            <wp:docPr id="1026689093" name="Picture 1"/>
+            <wp:cNvGraphicFramePr>
+              <a:graphicFrameLocks xmlns:a="http://schemas.openxmlformats.org/drawingml/2006/main" noChangeAspect="1"/>
+            </wp:cNvGraphicFramePr>
+            <a:graphic xmlns:a="http://schemas.openxmlformats.org/drawingml/2006/main">
+              <a:graphicData uri="http://schemas.openxmlformats.org/drawingml/2006/picture">
+                <pic:pic xmlns:pic="http://schemas.openxmlformats.org/drawingml/2006/picture">
+                  <pic:nvPicPr>
+                    <pic:cNvPr id="1026689093" name=""/>
+                    <pic:cNvPicPr/>
+                  </pic:nvPicPr>
+                  <pic:blipFill>
+                    <a:blip r:embed="rId25"/>
+                    <a:stretch>
+                      <a:fillRect/>
+                    </a:stretch>
+                  </pic:blipFill>
+                  <pic:spPr>
+                    <a:xfrm>
+                      <a:off x="0" y="0"/>
+                      <a:ext cx="5731510" cy="3222625"/>
+                    </a:xfrm>
+                    <a:prstGeom prst="rect">
+                      <a:avLst/>
+                    </a:prstGeom>
+                  </pic:spPr>
+                </pic:pic>
+              </a:graphicData>
+            </a:graphic>
+          </wp:inline>
+        </w:drawing>
+      </w:r>
+    </w:p>
+    <w:p>
+      <w:pPr>
+        <w:jc w:val="both"/>
+        <w:rPr>
+          <w:rFonts w:ascii="Times New Roman" w:hAnsi="Times New Roman" w:cs="Times New Roman"/>
+          <w:lang w:val="en-GB"/>
+        </w:rPr>
+      </w:pPr>
+      <w:r>
+        <w:rPr>
+          <w:rFonts w:ascii="Times New Roman" w:hAnsi="Times New Roman" w:cs="Times New Roman"/>
+          <w:lang w:val="en-GB"/>
+        </w:rPr>
+        <w:t xml:space="preserve">file jest-e2e.json. Ini </w:t>
+      </w:r>
+      <w:proofErr w:type="spellStart"/>
+      <w:r>
+        <w:rPr>
+          <w:rFonts w:ascii="Times New Roman" w:hAnsi="Times New Roman" w:cs="Times New Roman"/>
+          <w:lang w:val="en-GB"/>
+        </w:rPr>
+        <w:t>adalah</w:t>
+      </w:r>
+      <w:proofErr w:type="spellEnd"/>
+      <w:r>
+        <w:rPr>
+          <w:rFonts w:ascii="Times New Roman" w:hAnsi="Times New Roman" w:cs="Times New Roman"/>
+          <w:lang w:val="en-GB"/>
+        </w:rPr>
+        <w:t xml:space="preserve"> </w:t>
+      </w:r>
+      <w:proofErr w:type="spellStart"/>
+      <w:r>
+        <w:rPr>
+          <w:rFonts w:ascii="Times New Roman" w:hAnsi="Times New Roman" w:cs="Times New Roman"/>
+          <w:lang w:val="en-GB"/>
+        </w:rPr>
+        <w:t>pengaturan</w:t>
+      </w:r>
+      <w:proofErr w:type="spellEnd"/>
+      <w:r>
+        <w:rPr>
+          <w:rFonts w:ascii="Times New Roman" w:hAnsi="Times New Roman" w:cs="Times New Roman"/>
+          <w:lang w:val="en-GB"/>
+        </w:rPr>
+        <w:t xml:space="preserve"> </w:t>
+      </w:r>
+      <w:proofErr w:type="spellStart"/>
+      <w:r>
+        <w:rPr>
+          <w:rFonts w:ascii="Times New Roman" w:hAnsi="Times New Roman" w:cs="Times New Roman"/>
+          <w:lang w:val="en-GB"/>
+        </w:rPr>
+        <w:t>khusus</w:t>
+      </w:r>
+      <w:proofErr w:type="spellEnd"/>
+      <w:r>
+        <w:rPr>
+          <w:rFonts w:ascii="Times New Roman" w:hAnsi="Times New Roman" w:cs="Times New Roman"/>
+          <w:lang w:val="en-GB"/>
+        </w:rPr>
+        <w:t xml:space="preserve"> </w:t>
+      </w:r>
+      <w:proofErr w:type="spellStart"/>
+      <w:r>
+        <w:rPr>
+          <w:rFonts w:ascii="Times New Roman" w:hAnsi="Times New Roman" w:cs="Times New Roman"/>
+          <w:lang w:val="en-GB"/>
+        </w:rPr>
+        <w:t>untuk</w:t>
+      </w:r>
+      <w:proofErr w:type="spellEnd"/>
+      <w:r>
+        <w:rPr>
+          <w:rFonts w:ascii="Times New Roman" w:hAnsi="Times New Roman" w:cs="Times New Roman"/>
+          <w:lang w:val="en-GB"/>
+        </w:rPr>
+        <w:t xml:space="preserve"> E2E Testing (End-to-End Testing).</w:t>
+      </w:r>
+    </w:p>
+    <w:p>
+      <w:pPr>
+        <w:jc w:val="both"/>
+        <w:rPr>
+          <w:rFonts w:ascii="Times New Roman" w:hAnsi="Times New Roman" w:cs="Times New Roman"/>
+          <w:lang w:val="en-GB"/>
+        </w:rPr>
+      </w:pPr>
+      <w:proofErr w:type="spellStart"/>
+      <w:r>
+        <w:rPr>
+          <w:rFonts w:ascii="Times New Roman" w:hAnsi="Times New Roman" w:cs="Times New Roman"/>
+          <w:lang w:val="en-GB"/>
+        </w:rPr>
+        <w:t>Instruksi</w:t>
+      </w:r>
+      <w:proofErr w:type="spellEnd"/>
+      <w:r>
+        <w:rPr>
+          <w:rFonts w:ascii="Times New Roman" w:hAnsi="Times New Roman" w:cs="Times New Roman"/>
+          <w:lang w:val="en-GB"/>
+        </w:rPr>
+        <w:t xml:space="preserve"> </w:t>
+      </w:r>
+      <w:proofErr w:type="spellStart"/>
+      <w:r>
+        <w:rPr>
+          <w:rFonts w:ascii="Times New Roman" w:hAnsi="Times New Roman" w:cs="Times New Roman"/>
+          <w:lang w:val="en-GB"/>
+        </w:rPr>
+        <w:t>p</w:t>
+      </w:r>
+      <w:r>
+        <w:rPr>
+          <w:rFonts w:ascii="Times New Roman" w:hAnsi="Times New Roman" w:cs="Times New Roman"/>
+          <w:lang w:val="en-GB"/>
+        </w:rPr>
+        <w:t>engujian</w:t>
+      </w:r>
+      <w:proofErr w:type="spellEnd"/>
+      <w:r>
+        <w:rPr>
+          <w:rFonts w:ascii="Times New Roman" w:hAnsi="Times New Roman" w:cs="Times New Roman"/>
+          <w:lang w:val="en-GB"/>
+        </w:rPr>
+        <w:t xml:space="preserve"> </w:t>
+      </w:r>
+      <w:proofErr w:type="spellStart"/>
+      <w:r>
+        <w:rPr>
+          <w:rFonts w:ascii="Times New Roman" w:hAnsi="Times New Roman" w:cs="Times New Roman"/>
+          <w:lang w:val="en-GB"/>
+        </w:rPr>
+        <w:t>m</w:t>
+      </w:r>
+      <w:r>
+        <w:rPr>
+          <w:rFonts w:ascii="Times New Roman" w:hAnsi="Times New Roman" w:cs="Times New Roman"/>
+          <w:lang w:val="en-GB"/>
+        </w:rPr>
+        <w:t>enyeluruh</w:t>
+      </w:r>
+      <w:proofErr w:type="spellEnd"/>
+      <w:r>
+        <w:rPr>
+          <w:rFonts w:ascii="Times New Roman" w:hAnsi="Times New Roman" w:cs="Times New Roman"/>
+          <w:lang w:val="en-GB"/>
+        </w:rPr>
+        <w:t xml:space="preserve"> </w:t>
+      </w:r>
+      <w:proofErr w:type="spellStart"/>
+      <w:r>
+        <w:rPr>
+          <w:rFonts w:ascii="Times New Roman" w:hAnsi="Times New Roman" w:cs="Times New Roman"/>
+          <w:lang w:val="en-GB"/>
+        </w:rPr>
+        <w:t>untuk</w:t>
+      </w:r>
+      <w:proofErr w:type="spellEnd"/>
+      <w:r>
+        <w:rPr>
+          <w:rFonts w:ascii="Times New Roman" w:hAnsi="Times New Roman" w:cs="Times New Roman"/>
+          <w:lang w:val="en-GB"/>
+        </w:rPr>
+        <w:t xml:space="preserve"> </w:t>
+      </w:r>
+      <w:proofErr w:type="spellStart"/>
+      <w:r>
+        <w:rPr>
+          <w:rFonts w:ascii="Times New Roman" w:hAnsi="Times New Roman" w:cs="Times New Roman"/>
+          <w:lang w:val="en-GB"/>
+        </w:rPr>
+        <w:t>memastikan</w:t>
+      </w:r>
+      <w:proofErr w:type="spellEnd"/>
+      <w:r>
+        <w:rPr>
+          <w:rFonts w:ascii="Times New Roman" w:hAnsi="Times New Roman" w:cs="Times New Roman"/>
+          <w:lang w:val="en-GB"/>
+        </w:rPr>
+        <w:t xml:space="preserve"> </w:t>
+      </w:r>
+      <w:proofErr w:type="spellStart"/>
+      <w:r>
+        <w:rPr>
+          <w:rFonts w:ascii="Times New Roman" w:hAnsi="Times New Roman" w:cs="Times New Roman"/>
+          <w:lang w:val="en-GB"/>
+        </w:rPr>
+        <w:t>semua</w:t>
+      </w:r>
+      <w:proofErr w:type="spellEnd"/>
+      <w:r>
+        <w:rPr>
+          <w:rFonts w:ascii="Times New Roman" w:hAnsi="Times New Roman" w:cs="Times New Roman"/>
+          <w:lang w:val="en-GB"/>
+        </w:rPr>
+        <w:t xml:space="preserve"> </w:t>
+      </w:r>
+      <w:proofErr w:type="spellStart"/>
+      <w:r>
+        <w:rPr>
+          <w:rFonts w:ascii="Times New Roman" w:hAnsi="Times New Roman" w:cs="Times New Roman"/>
+          <w:lang w:val="en-GB"/>
+        </w:rPr>
+        <w:t>bagian</w:t>
+      </w:r>
+      <w:proofErr w:type="spellEnd"/>
+      <w:r>
+        <w:rPr>
+          <w:rFonts w:ascii="Times New Roman" w:hAnsi="Times New Roman" w:cs="Times New Roman"/>
+          <w:lang w:val="en-GB"/>
+        </w:rPr>
+        <w:t xml:space="preserve"> </w:t>
+      </w:r>
+      <w:proofErr w:type="spellStart"/>
+      <w:r>
+        <w:rPr>
+          <w:rFonts w:ascii="Times New Roman" w:hAnsi="Times New Roman" w:cs="Times New Roman"/>
+          <w:lang w:val="en-GB"/>
+        </w:rPr>
+        <w:t>aplikasi</w:t>
+      </w:r>
+      <w:proofErr w:type="spellEnd"/>
+      <w:r>
+        <w:rPr>
+          <w:rFonts w:ascii="Times New Roman" w:hAnsi="Times New Roman" w:cs="Times New Roman"/>
+          <w:lang w:val="en-GB"/>
+        </w:rPr>
+        <w:t xml:space="preserve"> (Controller, Service, Database) </w:t>
+      </w:r>
+      <w:proofErr w:type="spellStart"/>
+      <w:r>
+        <w:rPr>
+          <w:rFonts w:ascii="Times New Roman" w:hAnsi="Times New Roman" w:cs="Times New Roman"/>
+          <w:lang w:val="en-GB"/>
+        </w:rPr>
+        <w:t>sudah</w:t>
+      </w:r>
+      <w:proofErr w:type="spellEnd"/>
+      <w:r>
+        <w:rPr>
+          <w:rFonts w:ascii="Times New Roman" w:hAnsi="Times New Roman" w:cs="Times New Roman"/>
+          <w:lang w:val="en-GB"/>
+        </w:rPr>
+        <w:t xml:space="preserve"> </w:t>
+      </w:r>
+      <w:proofErr w:type="spellStart"/>
+      <w:r>
+        <w:rPr>
+          <w:rFonts w:ascii="Times New Roman" w:hAnsi="Times New Roman" w:cs="Times New Roman"/>
+          <w:lang w:val="en-GB"/>
+        </w:rPr>
+        <w:t>bekerja</w:t>
+      </w:r>
+      <w:proofErr w:type="spellEnd"/>
+      <w:r>
+        <w:rPr>
+          <w:rFonts w:ascii="Times New Roman" w:hAnsi="Times New Roman" w:cs="Times New Roman"/>
+          <w:lang w:val="en-GB"/>
+        </w:rPr>
+        <w:t xml:space="preserve"> </w:t>
+      </w:r>
+      <w:proofErr w:type="spellStart"/>
+      <w:r>
+        <w:rPr>
+          <w:rFonts w:ascii="Times New Roman" w:hAnsi="Times New Roman" w:cs="Times New Roman"/>
+          <w:lang w:val="en-GB"/>
+        </w:rPr>
+        <w:t>sama</w:t>
+      </w:r>
+      <w:proofErr w:type="spellEnd"/>
+      <w:r>
+        <w:rPr>
+          <w:rFonts w:ascii="Times New Roman" w:hAnsi="Times New Roman" w:cs="Times New Roman"/>
+          <w:lang w:val="en-GB"/>
+        </w:rPr>
+        <w:t xml:space="preserve"> </w:t>
+      </w:r>
+      <w:proofErr w:type="spellStart"/>
+      <w:r>
+        <w:rPr>
+          <w:rFonts w:ascii="Times New Roman" w:hAnsi="Times New Roman" w:cs="Times New Roman"/>
+          <w:lang w:val="en-GB"/>
+        </w:rPr>
+        <w:t>dengan</w:t>
+      </w:r>
+      <w:proofErr w:type="spellEnd"/>
+      <w:r>
+        <w:rPr>
+          <w:rFonts w:ascii="Times New Roman" w:hAnsi="Times New Roman" w:cs="Times New Roman"/>
+          <w:lang w:val="en-GB"/>
+        </w:rPr>
+        <w:t xml:space="preserve"> </w:t>
+      </w:r>
+      <w:proofErr w:type="spellStart"/>
+      <w:r>
+        <w:rPr>
+          <w:rFonts w:ascii="Times New Roman" w:hAnsi="Times New Roman" w:cs="Times New Roman"/>
+          <w:lang w:val="en-GB"/>
+        </w:rPr>
+        <w:t>kompak</w:t>
+      </w:r>
+      <w:proofErr w:type="spellEnd"/>
+      <w:r>
+        <w:rPr>
+          <w:rFonts w:ascii="Times New Roman" w:hAnsi="Times New Roman" w:cs="Times New Roman"/>
+          <w:lang w:val="en-GB"/>
+        </w:rPr>
+        <w:t xml:space="preserve"> dan </w:t>
+      </w:r>
+      <w:proofErr w:type="spellStart"/>
+      <w:r>
+        <w:rPr>
+          <w:rFonts w:ascii="Times New Roman" w:hAnsi="Times New Roman" w:cs="Times New Roman"/>
+          <w:lang w:val="en-GB"/>
+        </w:rPr>
+        <w:t>benar</w:t>
       </w:r>
       <w:proofErr w:type="spellEnd"/>
       <w:r>

</xml_diff>

<commit_message>
Membuat unit test untuk Kategori Service
</commit_message>
<xml_diff>
--- a/dokumentasi/24382001P_Lorensius Firngadi_IF 23 E_Dokumentasi.docx
+++ b/dokumentasi/24382001P_Lorensius Firngadi_IF 23 E_Dokumentasi.docx
@@ -245,9 +245,26 @@
           <w:rFonts w:ascii="Times New Roman" w:hAnsi="Times New Roman" w:cs="Times New Roman"/>
           <w:lang w:val="en-GB"/>
         </w:rPr>
-        <w:t xml:space="preserve"> Octaviansyah, , </w:t>
-      </w:r>
-      <w:proofErr w:type="spellStart"/>
+        <w:t xml:space="preserve"> Octaviansyah</w:t>
+      </w:r>
+      <w:proofErr w:type="gramStart"/>
+      <w:r>
+        <w:rPr>
+          <w:rFonts w:ascii="Times New Roman" w:hAnsi="Times New Roman" w:cs="Times New Roman"/>
+          <w:lang w:val="en-GB"/>
+        </w:rPr>
+        <w:t>, ,</w:t>
+      </w:r>
+      <w:proofErr w:type="gramEnd"/>
+      <w:r>
+        <w:rPr>
+          <w:rFonts w:ascii="Times New Roman" w:hAnsi="Times New Roman" w:cs="Times New Roman"/>
+          <w:lang w:val="en-GB"/>
+        </w:rPr>
+        <w:t xml:space="preserve"> </w:t>
+      </w:r>
+      <w:proofErr w:type="spellStart"/>
+      <w:proofErr w:type="gramStart"/>
       <w:r>
         <w:rPr>
           <w:rFonts w:ascii="Times New Roman" w:hAnsi="Times New Roman" w:cs="Times New Roman"/>
@@ -256,6 +273,7 @@
         <w:t>S.Kom</w:t>
       </w:r>
       <w:proofErr w:type="spellEnd"/>
+      <w:proofErr w:type="gramEnd"/>
       <w:r>
         <w:rPr>
           <w:rFonts w:ascii="Times New Roman" w:hAnsi="Times New Roman" w:cs="Times New Roman"/>
@@ -264,6 +282,7 @@
         <w:t xml:space="preserve">., </w:t>
       </w:r>
       <w:proofErr w:type="spellStart"/>
+      <w:proofErr w:type="gramStart"/>
       <w:r>
         <w:rPr>
           <w:rFonts w:ascii="Times New Roman" w:hAnsi="Times New Roman" w:cs="Times New Roman"/>
@@ -272,6 +291,7 @@
         <w:t>M.Kom</w:t>
       </w:r>
       <w:proofErr w:type="spellEnd"/>
+      <w:proofErr w:type="gramEnd"/>
       <w:r>
         <w:rPr>
           <w:rFonts w:ascii="Times New Roman" w:hAnsi="Times New Roman" w:cs="Times New Roman"/>
@@ -666,7 +686,23 @@
           <w:rFonts w:ascii="Times New Roman" w:hAnsi="Times New Roman" w:cs="Times New Roman"/>
           <w:lang w:val="en-GB"/>
         </w:rPr>
-        <w:t xml:space="preserve">Nama Project : </w:t>
+        <w:t xml:space="preserve">Nama </w:t>
+      </w:r>
+      <w:proofErr w:type="gramStart"/>
+      <w:r>
+        <w:rPr>
+          <w:rFonts w:ascii="Times New Roman" w:hAnsi="Times New Roman" w:cs="Times New Roman"/>
+          <w:lang w:val="en-GB"/>
+        </w:rPr>
+        <w:t>Project :</w:t>
+      </w:r>
+      <w:proofErr w:type="gramEnd"/>
+      <w:r>
+        <w:rPr>
+          <w:rFonts w:ascii="Times New Roman" w:hAnsi="Times New Roman" w:cs="Times New Roman"/>
+          <w:lang w:val="en-GB"/>
+        </w:rPr>
+        <w:t xml:space="preserve"> </w:t>
       </w:r>
       <w:proofErr w:type="spellStart"/>
       <w:r>
@@ -721,8 +757,17 @@
           <w:rFonts w:ascii="Times New Roman" w:hAnsi="Times New Roman" w:cs="Times New Roman"/>
           <w:lang w:val="en-GB"/>
         </w:rPr>
-        <w:t xml:space="preserve"> Project :</w:t>
-      </w:r>
+        <w:t xml:space="preserve"> </w:t>
+      </w:r>
+      <w:proofErr w:type="gramStart"/>
+      <w:r>
+        <w:rPr>
+          <w:rFonts w:ascii="Times New Roman" w:hAnsi="Times New Roman" w:cs="Times New Roman"/>
+          <w:lang w:val="en-GB"/>
+        </w:rPr>
+        <w:t>Project :</w:t>
+      </w:r>
+      <w:proofErr w:type="gramEnd"/>
     </w:p>
     <w:p>
       <w:pPr>
@@ -910,6 +955,7 @@
         <w:t xml:space="preserve"> </w:t>
       </w:r>
       <w:proofErr w:type="spellStart"/>
+      <w:proofErr w:type="gramStart"/>
       <w:r>
         <w:rPr>
           <w:rFonts w:ascii="Times New Roman" w:hAnsi="Times New Roman" w:cs="Times New Roman"/>
@@ -923,7 +969,15 @@
           <w:rFonts w:ascii="Times New Roman" w:hAnsi="Times New Roman" w:cs="Times New Roman"/>
           <w:lang w:val="en-GB"/>
         </w:rPr>
-        <w:t xml:space="preserve"> : </w:t>
+        <w:t xml:space="preserve"> :</w:t>
+      </w:r>
+      <w:proofErr w:type="gramEnd"/>
+      <w:r>
+        <w:rPr>
+          <w:rFonts w:ascii="Times New Roman" w:hAnsi="Times New Roman" w:cs="Times New Roman"/>
+          <w:lang w:val="en-GB"/>
+        </w:rPr>
+        <w:t xml:space="preserve"> </w:t>
       </w:r>
       <w:proofErr w:type="spellStart"/>
       <w:r>
@@ -1944,9 +1998,9 @@
           <w:bCs/>
           <w:lang w:val="en-GB"/>
         </w:rPr>
-        <w:t xml:space="preserve"> file .</w:t>
-      </w:r>
-      <w:proofErr w:type="spellStart"/>
+        <w:t xml:space="preserve"> </w:t>
+      </w:r>
+      <w:proofErr w:type="gramStart"/>
       <w:r>
         <w:rPr>
           <w:rFonts w:ascii="Times New Roman" w:hAnsi="Times New Roman" w:cs="Times New Roman"/>
@@ -1954,9 +2008,20 @@
           <w:bCs/>
           <w:lang w:val="en-GB"/>
         </w:rPr>
+        <w:t>file .</w:t>
+      </w:r>
+      <w:proofErr w:type="spellStart"/>
+      <w:r>
+        <w:rPr>
+          <w:rFonts w:ascii="Times New Roman" w:hAnsi="Times New Roman" w:cs="Times New Roman"/>
+          <w:b/>
+          <w:bCs/>
+          <w:lang w:val="en-GB"/>
+        </w:rPr>
         <w:t>gitignore</w:t>
       </w:r>
       <w:proofErr w:type="spellEnd"/>
+      <w:proofErr w:type="gramEnd"/>
       <w:r>
         <w:rPr>
           <w:rFonts w:ascii="Times New Roman" w:hAnsi="Times New Roman" w:cs="Times New Roman"/>
@@ -2064,7 +2129,15 @@
           <w:rFonts w:ascii="Times New Roman" w:hAnsi="Times New Roman" w:cs="Times New Roman"/>
           <w:lang w:val="en-GB"/>
         </w:rPr>
-        <w:t xml:space="preserve"> file .</w:t>
+        <w:t xml:space="preserve"> </w:t>
+      </w:r>
+      <w:proofErr w:type="gramStart"/>
+      <w:r>
+        <w:rPr>
+          <w:rFonts w:ascii="Times New Roman" w:hAnsi="Times New Roman" w:cs="Times New Roman"/>
+          <w:lang w:val="en-GB"/>
+        </w:rPr>
+        <w:t>file .</w:t>
       </w:r>
       <w:proofErr w:type="spellStart"/>
       <w:r>
@@ -2075,6 +2148,7 @@
         <w:t>gitignore</w:t>
       </w:r>
       <w:proofErr w:type="spellEnd"/>
+      <w:proofErr w:type="gramEnd"/>
       <w:r>
         <w:rPr>
           <w:rFonts w:ascii="Times New Roman" w:hAnsi="Times New Roman" w:cs="Times New Roman"/>
@@ -2342,6 +2416,7 @@
           <w:lang w:val="en-GB"/>
         </w:rPr>
       </w:pPr>
+      <w:proofErr w:type="gramStart"/>
       <w:r>
         <w:rPr>
           <w:rFonts w:ascii="Times New Roman" w:hAnsi="Times New Roman" w:cs="Times New Roman"/>
@@ -2358,12 +2433,21 @@
         <w:t>gitignore</w:t>
       </w:r>
       <w:proofErr w:type="spellEnd"/>
-      <w:r>
-        <w:rPr>
-          <w:rFonts w:ascii="Times New Roman" w:hAnsi="Times New Roman" w:cs="Times New Roman"/>
-          <w:lang w:val="en-GB"/>
-        </w:rPr>
-        <w:t xml:space="preserve"> sangat  </w:t>
+      <w:proofErr w:type="gramEnd"/>
+      <w:r>
+        <w:rPr>
+          <w:rFonts w:ascii="Times New Roman" w:hAnsi="Times New Roman" w:cs="Times New Roman"/>
+          <w:lang w:val="en-GB"/>
+        </w:rPr>
+        <w:t xml:space="preserve"> </w:t>
+      </w:r>
+      <w:proofErr w:type="gramStart"/>
+      <w:r>
+        <w:rPr>
+          <w:rFonts w:ascii="Times New Roman" w:hAnsi="Times New Roman" w:cs="Times New Roman"/>
+          <w:lang w:val="en-GB"/>
+        </w:rPr>
+        <w:t xml:space="preserve">sangat  </w:t>
       </w:r>
       <w:proofErr w:type="spellStart"/>
       <w:r>
@@ -2374,6 +2458,7 @@
         <w:t>bermanfaat</w:t>
       </w:r>
       <w:proofErr w:type="spellEnd"/>
+      <w:proofErr w:type="gramEnd"/>
       <w:r>
         <w:rPr>
           <w:rFonts w:ascii="Times New Roman" w:hAnsi="Times New Roman" w:cs="Times New Roman"/>
@@ -2865,6 +2950,7 @@
         <w:t xml:space="preserve">Edit </w:t>
       </w:r>
       <w:proofErr w:type="spellStart"/>
+      <w:proofErr w:type="gramStart"/>
       <w:r>
         <w:rPr>
           <w:rFonts w:ascii="Times New Roman" w:hAnsi="Times New Roman" w:cs="Times New Roman"/>
@@ -2875,6 +2961,7 @@
         <w:t>tsconfig.json</w:t>
       </w:r>
       <w:proofErr w:type="spellEnd"/>
+      <w:proofErr w:type="gramEnd"/>
       <w:r>
         <w:rPr>
           <w:rFonts w:ascii="Times New Roman" w:hAnsi="Times New Roman" w:cs="Times New Roman"/>
@@ -3493,12 +3580,21 @@
         <w:t>seperti</w:t>
       </w:r>
       <w:proofErr w:type="spellEnd"/>
-      <w:r>
-        <w:rPr>
-          <w:rFonts w:ascii="Times New Roman" w:hAnsi="Times New Roman" w:cs="Times New Roman"/>
-          <w:lang w:val="en-GB"/>
-        </w:rPr>
-        <w:t xml:space="preserve"> ../../../folder/file, </w:t>
+      <w:proofErr w:type="gramStart"/>
+      <w:r>
+        <w:rPr>
+          <w:rFonts w:ascii="Times New Roman" w:hAnsi="Times New Roman" w:cs="Times New Roman"/>
+          <w:lang w:val="en-GB"/>
+        </w:rPr>
+        <w:t xml:space="preserve"> ../../..</w:t>
+      </w:r>
+      <w:proofErr w:type="gramEnd"/>
+      <w:r>
+        <w:rPr>
+          <w:rFonts w:ascii="Times New Roman" w:hAnsi="Times New Roman" w:cs="Times New Roman"/>
+          <w:lang w:val="en-GB"/>
+        </w:rPr>
+        <w:t xml:space="preserve">/folder/file, </w:t>
       </w:r>
       <w:proofErr w:type="spellStart"/>
       <w:r>
@@ -4776,6 +4872,7 @@
         <w:t xml:space="preserve">Update </w:t>
       </w:r>
       <w:proofErr w:type="spellStart"/>
+      <w:proofErr w:type="gramStart"/>
       <w:r>
         <w:rPr>
           <w:b/>
@@ -4784,6 +4881,7 @@
         <w:t>package.json</w:t>
       </w:r>
       <w:proofErr w:type="spellEnd"/>
+      <w:proofErr w:type="gramEnd"/>
       <w:r>
         <w:rPr>
           <w:b/>
@@ -7726,6 +7824,7 @@
         <w:t xml:space="preserve"> File </w:t>
       </w:r>
       <w:proofErr w:type="spellStart"/>
+      <w:proofErr w:type="gramStart"/>
       <w:r>
         <w:rPr>
           <w:rFonts w:ascii="Times New Roman" w:hAnsi="Times New Roman" w:cs="Times New Roman"/>
@@ -7733,7 +7832,17 @@
           <w:bCs/>
           <w:lang w:val="en-GB"/>
         </w:rPr>
-        <w:t>prisma.service.ts</w:t>
+        <w:t>prisma.service</w:t>
+      </w:r>
+      <w:proofErr w:type="gramEnd"/>
+      <w:r>
+        <w:rPr>
+          <w:rFonts w:ascii="Times New Roman" w:hAnsi="Times New Roman" w:cs="Times New Roman"/>
+          <w:b/>
+          <w:bCs/>
+          <w:lang w:val="en-GB"/>
+        </w:rPr>
+        <w:t>.ts</w:t>
       </w:r>
       <w:proofErr w:type="spellEnd"/>
     </w:p>
@@ -9155,7 +9264,23 @@
           <w:rFonts w:ascii="Times New Roman" w:hAnsi="Times New Roman" w:cs="Times New Roman"/>
           <w:lang w:val="en-GB"/>
         </w:rPr>
-        <w:t xml:space="preserve">  id: string;            # KTP/ID </w:t>
+        <w:t xml:space="preserve">  id: </w:t>
+      </w:r>
+      <w:proofErr w:type="gramStart"/>
+      <w:r>
+        <w:rPr>
+          <w:rFonts w:ascii="Times New Roman" w:hAnsi="Times New Roman" w:cs="Times New Roman"/>
+          <w:lang w:val="en-GB"/>
+        </w:rPr>
+        <w:t xml:space="preserve">string;   </w:t>
+      </w:r>
+      <w:proofErr w:type="gramEnd"/>
+      <w:r>
+        <w:rPr>
+          <w:rFonts w:ascii="Times New Roman" w:hAnsi="Times New Roman" w:cs="Times New Roman"/>
+          <w:lang w:val="en-GB"/>
+        </w:rPr>
+        <w:t xml:space="preserve">         # KTP/ID </w:t>
       </w:r>
       <w:proofErr w:type="spellStart"/>
       <w:r>
@@ -9236,7 +9361,23 @@
           <w:rFonts w:ascii="Times New Roman" w:hAnsi="Times New Roman" w:cs="Times New Roman"/>
           <w:lang w:val="en-GB"/>
         </w:rPr>
-        <w:t xml:space="preserve">  name: string;          # Nama </w:t>
+        <w:t xml:space="preserve">  name: </w:t>
+      </w:r>
+      <w:proofErr w:type="gramStart"/>
+      <w:r>
+        <w:rPr>
+          <w:rFonts w:ascii="Times New Roman" w:hAnsi="Times New Roman" w:cs="Times New Roman"/>
+          <w:lang w:val="en-GB"/>
+        </w:rPr>
+        <w:t xml:space="preserve">string;   </w:t>
+      </w:r>
+      <w:proofErr w:type="gramEnd"/>
+      <w:r>
+        <w:rPr>
+          <w:rFonts w:ascii="Times New Roman" w:hAnsi="Times New Roman" w:cs="Times New Roman"/>
+          <w:lang w:val="en-GB"/>
+        </w:rPr>
+        <w:t xml:space="preserve">       # Nama </w:t>
       </w:r>
       <w:proofErr w:type="spellStart"/>
       <w:r>
@@ -9301,7 +9442,23 @@
           <w:rFonts w:ascii="Times New Roman" w:hAnsi="Times New Roman" w:cs="Times New Roman"/>
           <w:lang w:val="en-GB"/>
         </w:rPr>
-        <w:t xml:space="preserve">  slug: string;          # Nama </w:t>
+        <w:t xml:space="preserve">  slug: </w:t>
+      </w:r>
+      <w:proofErr w:type="gramStart"/>
+      <w:r>
+        <w:rPr>
+          <w:rFonts w:ascii="Times New Roman" w:hAnsi="Times New Roman" w:cs="Times New Roman"/>
+          <w:lang w:val="en-GB"/>
+        </w:rPr>
+        <w:t xml:space="preserve">string;   </w:t>
+      </w:r>
+      <w:proofErr w:type="gramEnd"/>
+      <w:r>
+        <w:rPr>
+          <w:rFonts w:ascii="Times New Roman" w:hAnsi="Times New Roman" w:cs="Times New Roman"/>
+          <w:lang w:val="en-GB"/>
+        </w:rPr>
+        <w:t xml:space="preserve">       # Nama </w:t>
       </w:r>
       <w:proofErr w:type="spellStart"/>
       <w:r>
@@ -9366,7 +9523,39 @@
           <w:rFonts w:ascii="Times New Roman" w:hAnsi="Times New Roman" w:cs="Times New Roman"/>
           <w:lang w:val="en-GB"/>
         </w:rPr>
-        <w:t xml:space="preserve">  description?: string;  # </w:t>
+        <w:t xml:space="preserve">  </w:t>
+      </w:r>
+      <w:proofErr w:type="gramStart"/>
+      <w:r>
+        <w:rPr>
+          <w:rFonts w:ascii="Times New Roman" w:hAnsi="Times New Roman" w:cs="Times New Roman"/>
+          <w:lang w:val="en-GB"/>
+        </w:rPr>
+        <w:t>description?:</w:t>
+      </w:r>
+      <w:proofErr w:type="gramEnd"/>
+      <w:r>
+        <w:rPr>
+          <w:rFonts w:ascii="Times New Roman" w:hAnsi="Times New Roman" w:cs="Times New Roman"/>
+          <w:lang w:val="en-GB"/>
+        </w:rPr>
+        <w:t xml:space="preserve"> </w:t>
+      </w:r>
+      <w:proofErr w:type="gramStart"/>
+      <w:r>
+        <w:rPr>
+          <w:rFonts w:ascii="Times New Roman" w:hAnsi="Times New Roman" w:cs="Times New Roman"/>
+          <w:lang w:val="en-GB"/>
+        </w:rPr>
+        <w:t>string;  #</w:t>
+      </w:r>
+      <w:proofErr w:type="gramEnd"/>
+      <w:r>
+        <w:rPr>
+          <w:rFonts w:ascii="Times New Roman" w:hAnsi="Times New Roman" w:cs="Times New Roman"/>
+          <w:lang w:val="en-GB"/>
+        </w:rPr>
+        <w:t xml:space="preserve"> </w:t>
       </w:r>
       <w:proofErr w:type="spellStart"/>
       <w:r>
@@ -9401,6 +9590,7 @@
         <w:t xml:space="preserve"> (</w:t>
       </w:r>
       <w:proofErr w:type="spellStart"/>
+      <w:proofErr w:type="gramStart"/>
       <w:r>
         <w:rPr>
           <w:rFonts w:ascii="Times New Roman" w:hAnsi="Times New Roman" w:cs="Times New Roman"/>
@@ -9414,7 +9604,15 @@
           <w:rFonts w:ascii="Times New Roman" w:hAnsi="Times New Roman" w:cs="Times New Roman"/>
           <w:lang w:val="en-GB"/>
         </w:rPr>
-        <w:t xml:space="preserve"> ? </w:t>
+        <w:t xml:space="preserve"> ?</w:t>
+      </w:r>
+      <w:proofErr w:type="gramEnd"/>
+      <w:r>
+        <w:rPr>
+          <w:rFonts w:ascii="Times New Roman" w:hAnsi="Times New Roman" w:cs="Times New Roman"/>
+          <w:lang w:val="en-GB"/>
+        </w:rPr>
+        <w:t xml:space="preserve"> </w:t>
       </w:r>
       <w:proofErr w:type="spellStart"/>
       <w:r>
@@ -9479,7 +9677,39 @@
           <w:rFonts w:ascii="Times New Roman" w:hAnsi="Times New Roman" w:cs="Times New Roman"/>
           <w:lang w:val="en-GB"/>
         </w:rPr>
-        <w:t xml:space="preserve">  icon?: string;         # </w:t>
+        <w:t xml:space="preserve">  </w:t>
+      </w:r>
+      <w:proofErr w:type="gramStart"/>
+      <w:r>
+        <w:rPr>
+          <w:rFonts w:ascii="Times New Roman" w:hAnsi="Times New Roman" w:cs="Times New Roman"/>
+          <w:lang w:val="en-GB"/>
+        </w:rPr>
+        <w:t>icon?:</w:t>
+      </w:r>
+      <w:proofErr w:type="gramEnd"/>
+      <w:r>
+        <w:rPr>
+          <w:rFonts w:ascii="Times New Roman" w:hAnsi="Times New Roman" w:cs="Times New Roman"/>
+          <w:lang w:val="en-GB"/>
+        </w:rPr>
+        <w:t xml:space="preserve"> </w:t>
+      </w:r>
+      <w:proofErr w:type="gramStart"/>
+      <w:r>
+        <w:rPr>
+          <w:rFonts w:ascii="Times New Roman" w:hAnsi="Times New Roman" w:cs="Times New Roman"/>
+          <w:lang w:val="en-GB"/>
+        </w:rPr>
+        <w:t xml:space="preserve">string;   </w:t>
+      </w:r>
+      <w:proofErr w:type="gramEnd"/>
+      <w:r>
+        <w:rPr>
+          <w:rFonts w:ascii="Times New Roman" w:hAnsi="Times New Roman" w:cs="Times New Roman"/>
+          <w:lang w:val="en-GB"/>
+        </w:rPr>
+        <w:t xml:space="preserve">      # </w:t>
       </w:r>
       <w:proofErr w:type="spellStart"/>
       <w:r>
@@ -9608,7 +9838,23 @@
           <w:rFonts w:ascii="Times New Roman" w:hAnsi="Times New Roman" w:cs="Times New Roman"/>
           <w:lang w:val="en-GB"/>
         </w:rPr>
-        <w:t xml:space="preserve">: Date;       # </w:t>
+        <w:t xml:space="preserve">: </w:t>
+      </w:r>
+      <w:proofErr w:type="gramStart"/>
+      <w:r>
+        <w:rPr>
+          <w:rFonts w:ascii="Times New Roman" w:hAnsi="Times New Roman" w:cs="Times New Roman"/>
+          <w:lang w:val="en-GB"/>
+        </w:rPr>
+        <w:t xml:space="preserve">Date;   </w:t>
+      </w:r>
+      <w:proofErr w:type="gramEnd"/>
+      <w:r>
+        <w:rPr>
+          <w:rFonts w:ascii="Times New Roman" w:hAnsi="Times New Roman" w:cs="Times New Roman"/>
+          <w:lang w:val="en-GB"/>
+        </w:rPr>
+        <w:t xml:space="preserve">    # </w:t>
       </w:r>
       <w:proofErr w:type="spellStart"/>
       <w:r>
@@ -9737,7 +9983,23 @@
           <w:rFonts w:ascii="Times New Roman" w:hAnsi="Times New Roman" w:cs="Times New Roman"/>
           <w:lang w:val="en-GB"/>
         </w:rPr>
-        <w:t xml:space="preserve">: Date;       # </w:t>
+        <w:t xml:space="preserve">: </w:t>
+      </w:r>
+      <w:proofErr w:type="gramStart"/>
+      <w:r>
+        <w:rPr>
+          <w:rFonts w:ascii="Times New Roman" w:hAnsi="Times New Roman" w:cs="Times New Roman"/>
+          <w:lang w:val="en-GB"/>
+        </w:rPr>
+        <w:t xml:space="preserve">Date;   </w:t>
+      </w:r>
+      <w:proofErr w:type="gramEnd"/>
+      <w:r>
+        <w:rPr>
+          <w:rFonts w:ascii="Times New Roman" w:hAnsi="Times New Roman" w:cs="Times New Roman"/>
+          <w:lang w:val="en-GB"/>
+        </w:rPr>
+        <w:t xml:space="preserve">    # </w:t>
       </w:r>
       <w:proofErr w:type="spellStart"/>
       <w:r>
@@ -10070,7 +10332,23 @@
           <w:rFonts w:ascii="Times New Roman" w:hAnsi="Times New Roman" w:cs="Times New Roman"/>
           <w:lang w:val="en-GB"/>
         </w:rPr>
-        <w:t xml:space="preserve">  constructor(data: Partial&lt;</w:t>
+        <w:t xml:space="preserve">  </w:t>
+      </w:r>
+      <w:proofErr w:type="gramStart"/>
+      <w:r>
+        <w:rPr>
+          <w:rFonts w:ascii="Times New Roman" w:hAnsi="Times New Roman" w:cs="Times New Roman"/>
+          <w:lang w:val="en-GB"/>
+        </w:rPr>
+        <w:t>constructor(</w:t>
+      </w:r>
+      <w:proofErr w:type="gramEnd"/>
+      <w:r>
+        <w:rPr>
+          <w:rFonts w:ascii="Times New Roman" w:hAnsi="Times New Roman" w:cs="Times New Roman"/>
+          <w:lang w:val="en-GB"/>
+        </w:rPr>
+        <w:t>data: Partial&lt;</w:t>
       </w:r>
       <w:proofErr w:type="spellStart"/>
       <w:r>
@@ -10232,7 +10510,23 @@
           <w:rFonts w:ascii="Times New Roman" w:hAnsi="Times New Roman" w:cs="Times New Roman"/>
           <w:lang w:val="en-GB"/>
         </w:rPr>
-        <w:t xml:space="preserve">    # di </w:t>
+        <w:t xml:space="preserve">    # </w:t>
+      </w:r>
+      <w:proofErr w:type="gramStart"/>
+      <w:r>
+        <w:rPr>
+          <w:rFonts w:ascii="Times New Roman" w:hAnsi="Times New Roman" w:cs="Times New Roman"/>
+          <w:lang w:val="en-GB"/>
+        </w:rPr>
+        <w:t>di</w:t>
+      </w:r>
+      <w:proofErr w:type="gramEnd"/>
+      <w:r>
+        <w:rPr>
+          <w:rFonts w:ascii="Times New Roman" w:hAnsi="Times New Roman" w:cs="Times New Roman"/>
+          <w:lang w:val="en-GB"/>
+        </w:rPr>
+        <w:t xml:space="preserve"> </w:t>
       </w:r>
       <w:proofErr w:type="spellStart"/>
       <w:r>
@@ -10483,6 +10777,7 @@
         <w:t xml:space="preserve"> </w:t>
       </w:r>
       <w:proofErr w:type="spellStart"/>
+      <w:proofErr w:type="gramStart"/>
       <w:r>
         <w:rPr>
           <w:rFonts w:ascii="Times New Roman" w:hAnsi="Times New Roman" w:cs="Times New Roman"/>
@@ -10491,6 +10786,7 @@
         <w:t>kategori.harga</w:t>
       </w:r>
       <w:proofErr w:type="spellEnd"/>
+      <w:proofErr w:type="gramEnd"/>
       <w:r>
         <w:rPr>
           <w:rFonts w:ascii="Times New Roman" w:hAnsi="Times New Roman" w:cs="Times New Roman"/>
@@ -11466,6 +11762,7 @@
           <w:lang w:val="en-GB"/>
         </w:rPr>
       </w:pPr>
+      <w:proofErr w:type="gramStart"/>
       <w:r>
         <w:rPr>
           <w:rFonts w:ascii="Times New Roman" w:hAnsi="Times New Roman" w:cs="Times New Roman"/>
@@ -11473,6 +11770,7 @@
         </w:rPr>
         <w:t>Kode :</w:t>
       </w:r>
+      <w:proofErr w:type="gramEnd"/>
     </w:p>
     <w:p>
       <w:pPr>
@@ -11488,7 +11786,15 @@
           <w:rFonts w:ascii="Times New Roman" w:hAnsi="Times New Roman" w:cs="Times New Roman"/>
           <w:lang w:val="en-GB"/>
         </w:rPr>
-        <w:t xml:space="preserve">import { </w:t>
+        <w:t xml:space="preserve">import </w:t>
+      </w:r>
+      <w:proofErr w:type="gramStart"/>
+      <w:r>
+        <w:rPr>
+          <w:rFonts w:ascii="Times New Roman" w:hAnsi="Times New Roman" w:cs="Times New Roman"/>
+          <w:lang w:val="en-GB"/>
+        </w:rPr>
+        <w:t xml:space="preserve">{ </w:t>
       </w:r>
       <w:proofErr w:type="spellStart"/>
       <w:r>
@@ -11499,6 +11805,7 @@
         <w:t>IsString</w:t>
       </w:r>
       <w:proofErr w:type="spellEnd"/>
+      <w:proofErr w:type="gramEnd"/>
       <w:r>
         <w:rPr>
           <w:rFonts w:ascii="Times New Roman" w:hAnsi="Times New Roman" w:cs="Times New Roman"/>
@@ -11555,6 +11862,7 @@
         <w:t xml:space="preserve">, </w:t>
       </w:r>
       <w:proofErr w:type="spellStart"/>
+      <w:proofErr w:type="gramStart"/>
       <w:r>
         <w:rPr>
           <w:rFonts w:ascii="Times New Roman" w:hAnsi="Times New Roman" w:cs="Times New Roman"/>
@@ -11568,7 +11876,15 @@
           <w:rFonts w:ascii="Times New Roman" w:hAnsi="Times New Roman" w:cs="Times New Roman"/>
           <w:lang w:val="en-GB"/>
         </w:rPr>
-        <w:t xml:space="preserve"> } from 'class-validator';</w:t>
+        <w:t xml:space="preserve"> }</w:t>
+      </w:r>
+      <w:proofErr w:type="gramEnd"/>
+      <w:r>
+        <w:rPr>
+          <w:rFonts w:ascii="Times New Roman" w:hAnsi="Times New Roman" w:cs="Times New Roman"/>
+          <w:lang w:val="en-GB"/>
+        </w:rPr>
+        <w:t xml:space="preserve"> from 'class-validator';</w:t>
       </w:r>
     </w:p>
     <w:p>
@@ -11774,7 +12090,23 @@
           <w:rFonts w:ascii="Times New Roman" w:hAnsi="Times New Roman" w:cs="Times New Roman"/>
           <w:lang w:val="en-GB"/>
         </w:rPr>
-        <w:t xml:space="preserve">  @IsString()      # Harus </w:t>
+        <w:t xml:space="preserve">  @</w:t>
+      </w:r>
+      <w:proofErr w:type="gramStart"/>
+      <w:r>
+        <w:rPr>
+          <w:rFonts w:ascii="Times New Roman" w:hAnsi="Times New Roman" w:cs="Times New Roman"/>
+          <w:lang w:val="en-GB"/>
+        </w:rPr>
+        <w:t>IsString(</w:t>
+      </w:r>
+      <w:proofErr w:type="gramEnd"/>
+      <w:r>
+        <w:rPr>
+          <w:rFonts w:ascii="Times New Roman" w:hAnsi="Times New Roman" w:cs="Times New Roman"/>
+          <w:lang w:val="en-GB"/>
+        </w:rPr>
+        <w:t xml:space="preserve">)      # Harus </w:t>
       </w:r>
       <w:proofErr w:type="spellStart"/>
       <w:r>
@@ -11823,7 +12155,23 @@
           <w:rFonts w:ascii="Times New Roman" w:hAnsi="Times New Roman" w:cs="Times New Roman"/>
           <w:lang w:val="en-GB"/>
         </w:rPr>
-        <w:t xml:space="preserve">  @IsNotEmpty()   # Tidak </w:t>
+        <w:t xml:space="preserve">  @</w:t>
+      </w:r>
+      <w:proofErr w:type="gramStart"/>
+      <w:r>
+        <w:rPr>
+          <w:rFonts w:ascii="Times New Roman" w:hAnsi="Times New Roman" w:cs="Times New Roman"/>
+          <w:lang w:val="en-GB"/>
+        </w:rPr>
+        <w:t>IsNotEmpty(</w:t>
+      </w:r>
+      <w:proofErr w:type="gramEnd"/>
+      <w:r>
+        <w:rPr>
+          <w:rFonts w:ascii="Times New Roman" w:hAnsi="Times New Roman" w:cs="Times New Roman"/>
+          <w:lang w:val="en-GB"/>
+        </w:rPr>
+        <w:t xml:space="preserve">)   # Tidak </w:t>
       </w:r>
       <w:proofErr w:type="spellStart"/>
       <w:r>
@@ -11920,7 +12268,23 @@
           <w:rFonts w:ascii="Times New Roman" w:hAnsi="Times New Roman" w:cs="Times New Roman"/>
           <w:lang w:val="en-GB"/>
         </w:rPr>
-        <w:t xml:space="preserve">  @MinLength(2)   # Minimal </w:t>
+        <w:t xml:space="preserve">  @</w:t>
+      </w:r>
+      <w:proofErr w:type="gramStart"/>
+      <w:r>
+        <w:rPr>
+          <w:rFonts w:ascii="Times New Roman" w:hAnsi="Times New Roman" w:cs="Times New Roman"/>
+          <w:lang w:val="en-GB"/>
+        </w:rPr>
+        <w:t>MinLength(</w:t>
+      </w:r>
+      <w:proofErr w:type="gramEnd"/>
+      <w:r>
+        <w:rPr>
+          <w:rFonts w:ascii="Times New Roman" w:hAnsi="Times New Roman" w:cs="Times New Roman"/>
+          <w:lang w:val="en-GB"/>
+        </w:rPr>
+        <w:t xml:space="preserve">2)   # Minimal </w:t>
       </w:r>
       <w:proofErr w:type="spellStart"/>
       <w:r>
@@ -12049,7 +12413,23 @@
           <w:rFonts w:ascii="Times New Roman" w:hAnsi="Times New Roman" w:cs="Times New Roman"/>
           <w:lang w:val="en-GB"/>
         </w:rPr>
-        <w:t xml:space="preserve">  @MaxLength(100) # </w:t>
+        <w:t xml:space="preserve">  @</w:t>
+      </w:r>
+      <w:proofErr w:type="gramStart"/>
+      <w:r>
+        <w:rPr>
+          <w:rFonts w:ascii="Times New Roman" w:hAnsi="Times New Roman" w:cs="Times New Roman"/>
+          <w:lang w:val="en-GB"/>
+        </w:rPr>
+        <w:t>MaxLength(</w:t>
+      </w:r>
+      <w:proofErr w:type="gramEnd"/>
+      <w:r>
+        <w:rPr>
+          <w:rFonts w:ascii="Times New Roman" w:hAnsi="Times New Roman" w:cs="Times New Roman"/>
+          <w:lang w:val="en-GB"/>
+        </w:rPr>
+        <w:t xml:space="preserve">100) # </w:t>
       </w:r>
       <w:proofErr w:type="spellStart"/>
       <w:r>
@@ -12157,7 +12537,23 @@
           <w:rFonts w:ascii="Times New Roman" w:hAnsi="Times New Roman" w:cs="Times New Roman"/>
           <w:lang w:val="en-GB"/>
         </w:rPr>
-        <w:t xml:space="preserve">  @IsString()      # Harus </w:t>
+        <w:t xml:space="preserve">  @</w:t>
+      </w:r>
+      <w:proofErr w:type="gramStart"/>
+      <w:r>
+        <w:rPr>
+          <w:rFonts w:ascii="Times New Roman" w:hAnsi="Times New Roman" w:cs="Times New Roman"/>
+          <w:lang w:val="en-GB"/>
+        </w:rPr>
+        <w:t>IsString(</w:t>
+      </w:r>
+      <w:proofErr w:type="gramEnd"/>
+      <w:r>
+        <w:rPr>
+          <w:rFonts w:ascii="Times New Roman" w:hAnsi="Times New Roman" w:cs="Times New Roman"/>
+          <w:lang w:val="en-GB"/>
+        </w:rPr>
+        <w:t xml:space="preserve">)      # Harus </w:t>
       </w:r>
       <w:proofErr w:type="spellStart"/>
       <w:r>
@@ -12206,7 +12602,23 @@
           <w:rFonts w:ascii="Times New Roman" w:hAnsi="Times New Roman" w:cs="Times New Roman"/>
           <w:lang w:val="en-GB"/>
         </w:rPr>
-        <w:t xml:space="preserve">  @IsNotEmpty()   # Wajib </w:t>
+        <w:t xml:space="preserve">  @</w:t>
+      </w:r>
+      <w:proofErr w:type="gramStart"/>
+      <w:r>
+        <w:rPr>
+          <w:rFonts w:ascii="Times New Roman" w:hAnsi="Times New Roman" w:cs="Times New Roman"/>
+          <w:lang w:val="en-GB"/>
+        </w:rPr>
+        <w:t>IsNotEmpty(</w:t>
+      </w:r>
+      <w:proofErr w:type="gramEnd"/>
+      <w:r>
+        <w:rPr>
+          <w:rFonts w:ascii="Times New Roman" w:hAnsi="Times New Roman" w:cs="Times New Roman"/>
+          <w:lang w:val="en-GB"/>
+        </w:rPr>
+        <w:t xml:space="preserve">)   # Wajib </w:t>
       </w:r>
       <w:proofErr w:type="spellStart"/>
       <w:r>
@@ -12303,7 +12715,23 @@
           <w:rFonts w:ascii="Times New Roman" w:hAnsi="Times New Roman" w:cs="Times New Roman"/>
           <w:lang w:val="en-GB"/>
         </w:rPr>
-        <w:t xml:space="preserve">  @MinLength(2)</w:t>
+        <w:t xml:space="preserve">  @</w:t>
+      </w:r>
+      <w:proofErr w:type="gramStart"/>
+      <w:r>
+        <w:rPr>
+          <w:rFonts w:ascii="Times New Roman" w:hAnsi="Times New Roman" w:cs="Times New Roman"/>
+          <w:lang w:val="en-GB"/>
+        </w:rPr>
+        <w:t>MinLength(</w:t>
+      </w:r>
+      <w:proofErr w:type="gramEnd"/>
+      <w:r>
+        <w:rPr>
+          <w:rFonts w:ascii="Times New Roman" w:hAnsi="Times New Roman" w:cs="Times New Roman"/>
+          <w:lang w:val="en-GB"/>
+        </w:rPr>
+        <w:t>2)</w:t>
       </w:r>
     </w:p>
     <w:p>
@@ -12320,7 +12748,23 @@
           <w:rFonts w:ascii="Times New Roman" w:hAnsi="Times New Roman" w:cs="Times New Roman"/>
           <w:lang w:val="en-GB"/>
         </w:rPr>
-        <w:t xml:space="preserve">  @MaxLength(100)</w:t>
+        <w:t xml:space="preserve">  @</w:t>
+      </w:r>
+      <w:proofErr w:type="gramStart"/>
+      <w:r>
+        <w:rPr>
+          <w:rFonts w:ascii="Times New Roman" w:hAnsi="Times New Roman" w:cs="Times New Roman"/>
+          <w:lang w:val="en-GB"/>
+        </w:rPr>
+        <w:t>MaxLength(</w:t>
+      </w:r>
+      <w:proofErr w:type="gramEnd"/>
+      <w:r>
+        <w:rPr>
+          <w:rFonts w:ascii="Times New Roman" w:hAnsi="Times New Roman" w:cs="Times New Roman"/>
+          <w:lang w:val="en-GB"/>
+        </w:rPr>
+        <w:t>100)</w:t>
       </w:r>
     </w:p>
     <w:p>
@@ -12364,7 +12808,23 @@
           <w:rFonts w:ascii="Times New Roman" w:hAnsi="Times New Roman" w:cs="Times New Roman"/>
           <w:lang w:val="en-GB"/>
         </w:rPr>
-        <w:t xml:space="preserve">  @IsString()      # Harus </w:t>
+        <w:t xml:space="preserve">  @</w:t>
+      </w:r>
+      <w:proofErr w:type="gramStart"/>
+      <w:r>
+        <w:rPr>
+          <w:rFonts w:ascii="Times New Roman" w:hAnsi="Times New Roman" w:cs="Times New Roman"/>
+          <w:lang w:val="en-GB"/>
+        </w:rPr>
+        <w:t>IsString(</w:t>
+      </w:r>
+      <w:proofErr w:type="gramEnd"/>
+      <w:r>
+        <w:rPr>
+          <w:rFonts w:ascii="Times New Roman" w:hAnsi="Times New Roman" w:cs="Times New Roman"/>
+          <w:lang w:val="en-GB"/>
+        </w:rPr>
+        <w:t xml:space="preserve">)      # Harus </w:t>
       </w:r>
       <w:proofErr w:type="spellStart"/>
       <w:r>
@@ -12413,7 +12873,23 @@
           <w:rFonts w:ascii="Times New Roman" w:hAnsi="Times New Roman" w:cs="Times New Roman"/>
           <w:lang w:val="en-GB"/>
         </w:rPr>
-        <w:t xml:space="preserve">  @IsOptional()   # BOLEH KOSONG (</w:t>
+        <w:t xml:space="preserve">  @</w:t>
+      </w:r>
+      <w:proofErr w:type="gramStart"/>
+      <w:r>
+        <w:rPr>
+          <w:rFonts w:ascii="Times New Roman" w:hAnsi="Times New Roman" w:cs="Times New Roman"/>
+          <w:lang w:val="en-GB"/>
+        </w:rPr>
+        <w:t>IsOptional(</w:t>
+      </w:r>
+      <w:proofErr w:type="gramEnd"/>
+      <w:r>
+        <w:rPr>
+          <w:rFonts w:ascii="Times New Roman" w:hAnsi="Times New Roman" w:cs="Times New Roman"/>
+          <w:lang w:val="en-GB"/>
+        </w:rPr>
+        <w:t>)   # BOLEH KOSONG (</w:t>
       </w:r>
       <w:proofErr w:type="spellStart"/>
       <w:r>
@@ -12478,7 +12954,23 @@
           <w:rFonts w:ascii="Times New Roman" w:hAnsi="Times New Roman" w:cs="Times New Roman"/>
           <w:lang w:val="en-GB"/>
         </w:rPr>
-        <w:t xml:space="preserve">  @MaxLength(500) # Jika </w:t>
+        <w:t xml:space="preserve">  @</w:t>
+      </w:r>
+      <w:proofErr w:type="gramStart"/>
+      <w:r>
+        <w:rPr>
+          <w:rFonts w:ascii="Times New Roman" w:hAnsi="Times New Roman" w:cs="Times New Roman"/>
+          <w:lang w:val="en-GB"/>
+        </w:rPr>
+        <w:t>MaxLength(</w:t>
+      </w:r>
+      <w:proofErr w:type="gramEnd"/>
+      <w:r>
+        <w:rPr>
+          <w:rFonts w:ascii="Times New Roman" w:hAnsi="Times New Roman" w:cs="Times New Roman"/>
+          <w:lang w:val="en-GB"/>
+        </w:rPr>
+        <w:t xml:space="preserve">500) # Jika </w:t>
       </w:r>
       <w:proofErr w:type="spellStart"/>
       <w:r>
@@ -12592,7 +13084,23 @@
           <w:lang w:val="en-GB"/>
         </w:rPr>
         <w:lastRenderedPageBreak/>
-        <w:t xml:space="preserve">  description?: string;</w:t>
+        <w:t xml:space="preserve">  </w:t>
+      </w:r>
+      <w:proofErr w:type="gramStart"/>
+      <w:r>
+        <w:rPr>
+          <w:rFonts w:ascii="Times New Roman" w:hAnsi="Times New Roman" w:cs="Times New Roman"/>
+          <w:lang w:val="en-GB"/>
+        </w:rPr>
+        <w:t>description?:</w:t>
+      </w:r>
+      <w:proofErr w:type="gramEnd"/>
+      <w:r>
+        <w:rPr>
+          <w:rFonts w:ascii="Times New Roman" w:hAnsi="Times New Roman" w:cs="Times New Roman"/>
+          <w:lang w:val="en-GB"/>
+        </w:rPr>
+        <w:t xml:space="preserve"> string;</w:t>
       </w:r>
     </w:p>
     <w:p>
@@ -12619,7 +13127,23 @@
           <w:rFonts w:ascii="Times New Roman" w:hAnsi="Times New Roman" w:cs="Times New Roman"/>
           <w:lang w:val="en-GB"/>
         </w:rPr>
-        <w:t xml:space="preserve">  @IsString()</w:t>
+        <w:t xml:space="preserve">  @</w:t>
+      </w:r>
+      <w:proofErr w:type="gramStart"/>
+      <w:r>
+        <w:rPr>
+          <w:rFonts w:ascii="Times New Roman" w:hAnsi="Times New Roman" w:cs="Times New Roman"/>
+          <w:lang w:val="en-GB"/>
+        </w:rPr>
+        <w:t>IsString(</w:t>
+      </w:r>
+      <w:proofErr w:type="gramEnd"/>
+      <w:r>
+        <w:rPr>
+          <w:rFonts w:ascii="Times New Roman" w:hAnsi="Times New Roman" w:cs="Times New Roman"/>
+          <w:lang w:val="en-GB"/>
+        </w:rPr>
+        <w:t>)</w:t>
       </w:r>
     </w:p>
     <w:p>
@@ -12636,7 +13160,23 @@
           <w:rFonts w:ascii="Times New Roman" w:hAnsi="Times New Roman" w:cs="Times New Roman"/>
           <w:lang w:val="en-GB"/>
         </w:rPr>
-        <w:t xml:space="preserve">  @IsOptional()   # BOLEH KOSONG (</w:t>
+        <w:t xml:space="preserve">  @</w:t>
+      </w:r>
+      <w:proofErr w:type="gramStart"/>
+      <w:r>
+        <w:rPr>
+          <w:rFonts w:ascii="Times New Roman" w:hAnsi="Times New Roman" w:cs="Times New Roman"/>
+          <w:lang w:val="en-GB"/>
+        </w:rPr>
+        <w:t>IsOptional(</w:t>
+      </w:r>
+      <w:proofErr w:type="gramEnd"/>
+      <w:r>
+        <w:rPr>
+          <w:rFonts w:ascii="Times New Roman" w:hAnsi="Times New Roman" w:cs="Times New Roman"/>
+          <w:lang w:val="en-GB"/>
+        </w:rPr>
+        <w:t>)   # BOLEH KOSONG (</w:t>
       </w:r>
       <w:proofErr w:type="spellStart"/>
       <w:r>
@@ -12717,7 +13257,23 @@
           <w:rFonts w:ascii="Times New Roman" w:hAnsi="Times New Roman" w:cs="Times New Roman"/>
           <w:lang w:val="en-GB"/>
         </w:rPr>
-        <w:t xml:space="preserve">  icon?: string;</w:t>
+        <w:t xml:space="preserve">  </w:t>
+      </w:r>
+      <w:proofErr w:type="gramStart"/>
+      <w:r>
+        <w:rPr>
+          <w:rFonts w:ascii="Times New Roman" w:hAnsi="Times New Roman" w:cs="Times New Roman"/>
+          <w:lang w:val="en-GB"/>
+        </w:rPr>
+        <w:t>icon?:</w:t>
+      </w:r>
+      <w:proofErr w:type="gramEnd"/>
+      <w:r>
+        <w:rPr>
+          <w:rFonts w:ascii="Times New Roman" w:hAnsi="Times New Roman" w:cs="Times New Roman"/>
+          <w:lang w:val="en-GB"/>
+        </w:rPr>
+        <w:t xml:space="preserve"> string;</w:t>
       </w:r>
     </w:p>
     <w:p>
@@ -13790,6 +14346,7 @@
         <w:t xml:space="preserve"> </w:t>
       </w:r>
       <w:proofErr w:type="spellStart"/>
+      <w:proofErr w:type="gramStart"/>
       <w:r>
         <w:rPr>
           <w:rFonts w:ascii="Times New Roman" w:hAnsi="Times New Roman" w:cs="Times New Roman"/>
@@ -13814,6 +14371,7 @@
         <w:t>tidak</w:t>
       </w:r>
       <w:proofErr w:type="spellEnd"/>
+      <w:proofErr w:type="gramEnd"/>
       <w:r>
         <w:rPr>
           <w:rFonts w:ascii="Times New Roman" w:hAnsi="Times New Roman" w:cs="Times New Roman"/>
@@ -14046,7 +14604,23 @@
           <w:rFonts w:ascii="Times New Roman" w:hAnsi="Times New Roman" w:cs="Times New Roman"/>
           <w:lang w:val="en-GB"/>
         </w:rPr>
-        <w:t xml:space="preserve"> name?: string) </w:t>
+        <w:t xml:space="preserve"> </w:t>
+      </w:r>
+      <w:proofErr w:type="gramStart"/>
+      <w:r>
+        <w:rPr>
+          <w:rFonts w:ascii="Times New Roman" w:hAnsi="Times New Roman" w:cs="Times New Roman"/>
+          <w:lang w:val="en-GB"/>
+        </w:rPr>
+        <w:t>name?:</w:t>
+      </w:r>
+      <w:proofErr w:type="gramEnd"/>
+      <w:r>
+        <w:rPr>
+          <w:rFonts w:ascii="Times New Roman" w:hAnsi="Times New Roman" w:cs="Times New Roman"/>
+          <w:lang w:val="en-GB"/>
+        </w:rPr>
+        <w:t xml:space="preserve"> string) </w:t>
       </w:r>
       <w:proofErr w:type="spellStart"/>
       <w:r>
@@ -14459,12 +15033,21 @@
           <w:lang w:val="en-GB"/>
         </w:rPr>
       </w:pPr>
-      <w:r>
-        <w:rPr>
-          <w:rFonts w:ascii="Times New Roman" w:hAnsi="Times New Roman" w:cs="Times New Roman"/>
-          <w:lang w:val="en-GB"/>
-        </w:rPr>
-        <w:t xml:space="preserve">File : </w:t>
+      <w:proofErr w:type="gramStart"/>
+      <w:r>
+        <w:rPr>
+          <w:rFonts w:ascii="Times New Roman" w:hAnsi="Times New Roman" w:cs="Times New Roman"/>
+          <w:lang w:val="en-GB"/>
+        </w:rPr>
+        <w:t>File :</w:t>
+      </w:r>
+      <w:proofErr w:type="gramEnd"/>
+      <w:r>
+        <w:rPr>
+          <w:rFonts w:ascii="Times New Roman" w:hAnsi="Times New Roman" w:cs="Times New Roman"/>
+          <w:lang w:val="en-GB"/>
+        </w:rPr>
+        <w:t xml:space="preserve"> </w:t>
       </w:r>
       <w:proofErr w:type="spellStart"/>
       <w:r>
@@ -14581,7 +15164,15 @@
           <w:rFonts w:ascii="Times New Roman" w:hAnsi="Times New Roman" w:cs="Times New Roman"/>
           <w:lang w:val="en-GB"/>
         </w:rPr>
-        <w:t xml:space="preserve">import { </w:t>
+        <w:t xml:space="preserve">import </w:t>
+      </w:r>
+      <w:proofErr w:type="gramStart"/>
+      <w:r>
+        <w:rPr>
+          <w:rFonts w:ascii="Times New Roman" w:hAnsi="Times New Roman" w:cs="Times New Roman"/>
+          <w:lang w:val="en-GB"/>
+        </w:rPr>
+        <w:t xml:space="preserve">{ </w:t>
       </w:r>
       <w:proofErr w:type="spellStart"/>
       <w:r>
@@ -14592,6 +15183,7 @@
         <w:t>ConflictException</w:t>
       </w:r>
       <w:proofErr w:type="spellEnd"/>
+      <w:proofErr w:type="gramEnd"/>
       <w:r>
         <w:rPr>
           <w:rFonts w:ascii="Times New Roman" w:hAnsi="Times New Roman" w:cs="Times New Roman"/>
@@ -15231,6 +15823,7 @@
         <w:t xml:space="preserve">  static </w:t>
       </w:r>
       <w:proofErr w:type="spellStart"/>
+      <w:proofErr w:type="gramStart"/>
       <w:r>
         <w:rPr>
           <w:rFonts w:ascii="Times New Roman" w:hAnsi="Times New Roman" w:cs="Times New Roman"/>
@@ -15244,7 +15837,15 @@
           <w:rFonts w:ascii="Times New Roman" w:hAnsi="Times New Roman" w:cs="Times New Roman"/>
           <w:lang w:val="en-GB"/>
         </w:rPr>
-        <w:t>(name: string): never {</w:t>
+        <w:t>(</w:t>
+      </w:r>
+      <w:proofErr w:type="gramEnd"/>
+      <w:r>
+        <w:rPr>
+          <w:rFonts w:ascii="Times New Roman" w:hAnsi="Times New Roman" w:cs="Times New Roman"/>
+          <w:lang w:val="en-GB"/>
+        </w:rPr>
+        <w:t>name: string): never {</w:t>
       </w:r>
     </w:p>
     <w:p>
@@ -15493,6 +16094,7 @@
         <w:t xml:space="preserve">    throw new </w:t>
       </w:r>
       <w:proofErr w:type="spellStart"/>
+      <w:proofErr w:type="gramStart"/>
       <w:r>
         <w:rPr>
           <w:rFonts w:ascii="Times New Roman" w:hAnsi="Times New Roman" w:cs="Times New Roman"/>
@@ -15508,6 +16110,7 @@
         </w:rPr>
         <w:t>(</w:t>
       </w:r>
+      <w:proofErr w:type="gramEnd"/>
     </w:p>
     <w:p>
       <w:pPr>
@@ -15770,6 +16373,7 @@
         <w:t xml:space="preserve">  static </w:t>
       </w:r>
       <w:proofErr w:type="spellStart"/>
+      <w:proofErr w:type="gramStart"/>
       <w:r>
         <w:rPr>
           <w:rFonts w:ascii="Times New Roman" w:hAnsi="Times New Roman" w:cs="Times New Roman"/>
@@ -15783,7 +16387,15 @@
           <w:rFonts w:ascii="Times New Roman" w:hAnsi="Times New Roman" w:cs="Times New Roman"/>
           <w:lang w:val="en-GB"/>
         </w:rPr>
-        <w:t>(slug: string): never {</w:t>
+        <w:t>(</w:t>
+      </w:r>
+      <w:proofErr w:type="gramEnd"/>
+      <w:r>
+        <w:rPr>
+          <w:rFonts w:ascii="Times New Roman" w:hAnsi="Times New Roman" w:cs="Times New Roman"/>
+          <w:lang w:val="en-GB"/>
+        </w:rPr>
+        <w:t>slug: string): never {</w:t>
       </w:r>
     </w:p>
     <w:p>
@@ -15886,6 +16498,7 @@
         <w:t xml:space="preserve">    throw new </w:t>
       </w:r>
       <w:proofErr w:type="spellStart"/>
+      <w:proofErr w:type="gramStart"/>
       <w:r>
         <w:rPr>
           <w:rFonts w:ascii="Times New Roman" w:hAnsi="Times New Roman" w:cs="Times New Roman"/>
@@ -15901,6 +16514,7 @@
         </w:rPr>
         <w:t>(</w:t>
       </w:r>
+      <w:proofErr w:type="gramEnd"/>
     </w:p>
     <w:p>
       <w:pPr>
@@ -16195,6 +16809,7 @@
         <w:t xml:space="preserve">  static </w:t>
       </w:r>
       <w:proofErr w:type="spellStart"/>
+      <w:proofErr w:type="gramStart"/>
       <w:r>
         <w:rPr>
           <w:rFonts w:ascii="Times New Roman" w:hAnsi="Times New Roman" w:cs="Times New Roman"/>
@@ -16208,7 +16823,15 @@
           <w:rFonts w:ascii="Times New Roman" w:hAnsi="Times New Roman" w:cs="Times New Roman"/>
           <w:lang w:val="en-GB"/>
         </w:rPr>
-        <w:t>(field: string): never {</w:t>
+        <w:t>(</w:t>
+      </w:r>
+      <w:proofErr w:type="gramEnd"/>
+      <w:r>
+        <w:rPr>
+          <w:rFonts w:ascii="Times New Roman" w:hAnsi="Times New Roman" w:cs="Times New Roman"/>
+          <w:lang w:val="en-GB"/>
+        </w:rPr>
+        <w:t>field: string): never {</w:t>
       </w:r>
     </w:p>
     <w:p>
@@ -16230,6 +16853,7 @@
         <w:t xml:space="preserve">    throw new </w:t>
       </w:r>
       <w:proofErr w:type="spellStart"/>
+      <w:proofErr w:type="gramStart"/>
       <w:r>
         <w:rPr>
           <w:rFonts w:ascii="Times New Roman" w:hAnsi="Times New Roman" w:cs="Times New Roman"/>
@@ -16245,6 +16869,7 @@
         </w:rPr>
         <w:t>(</w:t>
       </w:r>
+      <w:proofErr w:type="gramEnd"/>
     </w:p>
     <w:p>
       <w:pPr>
@@ -16721,6 +17346,7 @@
           <w:lang w:val="en-GB"/>
         </w:rPr>
       </w:pPr>
+      <w:proofErr w:type="gramStart"/>
       <w:r>
         <w:rPr>
           <w:rFonts w:ascii="Times New Roman" w:hAnsi="Times New Roman" w:cs="Times New Roman"/>
@@ -16735,7 +17361,17 @@
           <w:bCs/>
           <w:lang w:val="en-GB"/>
         </w:rPr>
-        <w:t xml:space="preserve"> : </w:t>
+        <w:t xml:space="preserve"> :</w:t>
+      </w:r>
+      <w:proofErr w:type="gramEnd"/>
+      <w:r>
+        <w:rPr>
+          <w:rFonts w:ascii="Times New Roman" w:hAnsi="Times New Roman" w:cs="Times New Roman"/>
+          <w:b/>
+          <w:bCs/>
+          <w:lang w:val="en-GB"/>
+        </w:rPr>
+        <w:t xml:space="preserve"> </w:t>
       </w:r>
       <w:proofErr w:type="spellStart"/>
       <w:r>
@@ -17025,6 +17661,7 @@
         <w:t xml:space="preserve"> </w:t>
       </w:r>
       <w:proofErr w:type="spellStart"/>
+      <w:proofErr w:type="gramStart"/>
       <w:r>
         <w:rPr>
           <w:rFonts w:ascii="Times New Roman" w:hAnsi="Times New Roman" w:cs="Times New Roman"/>
@@ -17040,6 +17677,7 @@
         </w:rPr>
         <w:t xml:space="preserve"> :</w:t>
       </w:r>
+      <w:proofErr w:type="gramEnd"/>
     </w:p>
     <w:p>
       <w:pPr>
@@ -17909,12 +18547,21 @@
       <w:pPr>
         <w:jc w:val="both"/>
       </w:pPr>
-      <w:r>
-        <w:rPr>
-          <w:rFonts w:ascii="Times New Roman" w:hAnsi="Times New Roman" w:cs="Times New Roman"/>
-          <w:lang w:val="en-GB"/>
-        </w:rPr>
-        <w:t xml:space="preserve">File : </w:t>
+      <w:proofErr w:type="gramStart"/>
+      <w:r>
+        <w:rPr>
+          <w:rFonts w:ascii="Times New Roman" w:hAnsi="Times New Roman" w:cs="Times New Roman"/>
+          <w:lang w:val="en-GB"/>
+        </w:rPr>
+        <w:t>File :</w:t>
+      </w:r>
+      <w:proofErr w:type="gramEnd"/>
+      <w:r>
+        <w:rPr>
+          <w:rFonts w:ascii="Times New Roman" w:hAnsi="Times New Roman" w:cs="Times New Roman"/>
+          <w:lang w:val="en-GB"/>
+        </w:rPr>
+        <w:t xml:space="preserve"> </w:t>
       </w:r>
       <w:proofErr w:type="spellStart"/>
       <w:r>
@@ -18987,12 +19634,21 @@
       <w:pPr>
         <w:jc w:val="both"/>
       </w:pPr>
-      <w:r>
-        <w:rPr>
-          <w:rFonts w:ascii="Times New Roman" w:hAnsi="Times New Roman" w:cs="Times New Roman"/>
-          <w:lang w:val="en-GB"/>
-        </w:rPr>
-        <w:t xml:space="preserve">File : </w:t>
+      <w:proofErr w:type="gramStart"/>
+      <w:r>
+        <w:rPr>
+          <w:rFonts w:ascii="Times New Roman" w:hAnsi="Times New Roman" w:cs="Times New Roman"/>
+          <w:lang w:val="en-GB"/>
+        </w:rPr>
+        <w:t>File :</w:t>
+      </w:r>
+      <w:proofErr w:type="gramEnd"/>
+      <w:r>
+        <w:rPr>
+          <w:rFonts w:ascii="Times New Roman" w:hAnsi="Times New Roman" w:cs="Times New Roman"/>
+          <w:lang w:val="en-GB"/>
+        </w:rPr>
+        <w:t xml:space="preserve"> </w:t>
       </w:r>
       <w:proofErr w:type="spellStart"/>
       <w:r>
@@ -20109,12 +20765,21 @@
       <w:pPr>
         <w:jc w:val="both"/>
       </w:pPr>
-      <w:r>
-        <w:rPr>
-          <w:rFonts w:ascii="Times New Roman" w:hAnsi="Times New Roman" w:cs="Times New Roman"/>
-          <w:lang w:val="en-GB"/>
-        </w:rPr>
-        <w:t xml:space="preserve">File : </w:t>
+      <w:proofErr w:type="gramStart"/>
+      <w:r>
+        <w:rPr>
+          <w:rFonts w:ascii="Times New Roman" w:hAnsi="Times New Roman" w:cs="Times New Roman"/>
+          <w:lang w:val="en-GB"/>
+        </w:rPr>
+        <w:t>File :</w:t>
+      </w:r>
+      <w:proofErr w:type="gramEnd"/>
+      <w:r>
+        <w:rPr>
+          <w:rFonts w:ascii="Times New Roman" w:hAnsi="Times New Roman" w:cs="Times New Roman"/>
+          <w:lang w:val="en-GB"/>
+        </w:rPr>
+        <w:t xml:space="preserve"> </w:t>
       </w:r>
       <w:proofErr w:type="spellStart"/>
       <w:r>
@@ -20923,12 +21588,21 @@
           <w:lang w:val="en-GB"/>
         </w:rPr>
       </w:pPr>
-      <w:r>
-        <w:rPr>
-          <w:rFonts w:ascii="Times New Roman" w:hAnsi="Times New Roman" w:cs="Times New Roman"/>
-          <w:lang w:val="en-GB"/>
-        </w:rPr>
-        <w:t xml:space="preserve">File : </w:t>
+      <w:proofErr w:type="gramStart"/>
+      <w:r>
+        <w:rPr>
+          <w:rFonts w:ascii="Times New Roman" w:hAnsi="Times New Roman" w:cs="Times New Roman"/>
+          <w:lang w:val="en-GB"/>
+        </w:rPr>
+        <w:t>File :</w:t>
+      </w:r>
+      <w:proofErr w:type="gramEnd"/>
+      <w:r>
+        <w:rPr>
+          <w:rFonts w:ascii="Times New Roman" w:hAnsi="Times New Roman" w:cs="Times New Roman"/>
+          <w:lang w:val="en-GB"/>
+        </w:rPr>
+        <w:t xml:space="preserve"> </w:t>
       </w:r>
       <w:r>
         <w:t>jest.config.js</w:t>
@@ -21611,6 +22285,7 @@
         <w:t xml:space="preserve"> </w:t>
       </w:r>
       <w:proofErr w:type="spellStart"/>
+      <w:proofErr w:type="gramStart"/>
       <w:r>
         <w:rPr>
           <w:rFonts w:ascii="Times New Roman" w:hAnsi="Times New Roman" w:cs="Times New Roman"/>
@@ -21624,7 +22299,15 @@
           <w:rFonts w:ascii="Times New Roman" w:hAnsi="Times New Roman" w:cs="Times New Roman"/>
           <w:lang w:val="en-GB"/>
         </w:rPr>
-        <w:t xml:space="preserve"> : Kode Anda </w:t>
+        <w:t xml:space="preserve"> :</w:t>
+      </w:r>
+      <w:proofErr w:type="gramEnd"/>
+      <w:r>
+        <w:rPr>
+          <w:rFonts w:ascii="Times New Roman" w:hAnsi="Times New Roman" w:cs="Times New Roman"/>
+          <w:lang w:val="en-GB"/>
+        </w:rPr>
+        <w:t xml:space="preserve"> Kode Anda </w:t>
       </w:r>
       <w:proofErr w:type="spellStart"/>
       <w:r>
@@ -22243,8 +22926,13 @@
       <w:pPr>
         <w:jc w:val="both"/>
       </w:pPr>
-      <w:r>
-        <w:t xml:space="preserve">File :  </w:t>
+      <w:proofErr w:type="gramStart"/>
+      <w:r>
+        <w:t>File :</w:t>
+      </w:r>
+      <w:proofErr w:type="gramEnd"/>
+      <w:r>
+        <w:t xml:space="preserve">  </w:t>
       </w:r>
       <w:r>
         <w:t>test/jest-e2e.json</w:t>
@@ -22622,6 +23310,170 @@
         </w:rPr>
         <w:t>.</w:t>
       </w:r>
+    </w:p>
+    <w:p>
+      <w:pPr>
+        <w:jc w:val="both"/>
+        <w:rPr>
+          <w:rFonts w:ascii="Times New Roman" w:hAnsi="Times New Roman" w:cs="Times New Roman"/>
+          <w:lang w:val="en-GB"/>
+        </w:rPr>
+      </w:pPr>
+    </w:p>
+    <w:p>
+      <w:pPr>
+        <w:jc w:val="both"/>
+        <w:rPr>
+          <w:rFonts w:ascii="Times New Roman" w:hAnsi="Times New Roman" w:cs="Times New Roman"/>
+          <w:lang w:val="en-GB"/>
+        </w:rPr>
+      </w:pPr>
+      <w:r>
+        <w:rPr>
+          <w:rFonts w:ascii="Times New Roman" w:hAnsi="Times New Roman" w:cs="Times New Roman"/>
+          <w:lang w:val="en-GB"/>
+        </w:rPr>
+        <w:t xml:space="preserve">22. </w:t>
+      </w:r>
+      <w:proofErr w:type="spellStart"/>
+      <w:r>
+        <w:rPr>
+          <w:rFonts w:ascii="Times New Roman" w:hAnsi="Times New Roman" w:cs="Times New Roman"/>
+          <w:lang w:val="en-GB"/>
+        </w:rPr>
+        <w:t>Memb</w:t>
+      </w:r>
+      <w:r>
+        <w:rPr>
+          <w:rFonts w:ascii="Times New Roman" w:hAnsi="Times New Roman" w:cs="Times New Roman"/>
+          <w:lang w:val="en-GB"/>
+        </w:rPr>
+        <w:t>uat</w:t>
+      </w:r>
+      <w:proofErr w:type="spellEnd"/>
+      <w:r>
+        <w:rPr>
+          <w:rFonts w:ascii="Times New Roman" w:hAnsi="Times New Roman" w:cs="Times New Roman"/>
+          <w:lang w:val="en-GB"/>
+        </w:rPr>
+        <w:t xml:space="preserve"> Unit Test </w:t>
+      </w:r>
+      <w:proofErr w:type="spellStart"/>
+      <w:r>
+        <w:rPr>
+          <w:rFonts w:ascii="Times New Roman" w:hAnsi="Times New Roman" w:cs="Times New Roman"/>
+          <w:lang w:val="en-GB"/>
+        </w:rPr>
+        <w:t>untuk</w:t>
+      </w:r>
+      <w:proofErr w:type="spellEnd"/>
+      <w:r>
+        <w:rPr>
+          <w:rFonts w:ascii="Times New Roman" w:hAnsi="Times New Roman" w:cs="Times New Roman"/>
+          <w:lang w:val="en-GB"/>
+        </w:rPr>
+        <w:t xml:space="preserve"> </w:t>
+      </w:r>
+      <w:proofErr w:type="spellStart"/>
+      <w:r>
+        <w:rPr>
+          <w:rFonts w:ascii="Times New Roman" w:hAnsi="Times New Roman" w:cs="Times New Roman"/>
+          <w:lang w:val="en-GB"/>
+        </w:rPr>
+        <w:t>Kategori</w:t>
+      </w:r>
+      <w:proofErr w:type="spellEnd"/>
+      <w:r>
+        <w:rPr>
+          <w:rFonts w:ascii="Times New Roman" w:hAnsi="Times New Roman" w:cs="Times New Roman"/>
+          <w:lang w:val="en-GB"/>
+        </w:rPr>
+        <w:t xml:space="preserve"> Service</w:t>
+      </w:r>
+    </w:p>
+    <w:p>
+      <w:pPr>
+        <w:jc w:val="both"/>
+        <w:rPr>
+          <w:rFonts w:ascii="Times New Roman" w:hAnsi="Times New Roman" w:cs="Times New Roman"/>
+          <w:lang w:val="en-GB"/>
+        </w:rPr>
+      </w:pPr>
+      <w:proofErr w:type="gramStart"/>
+      <w:r>
+        <w:rPr>
+          <w:rFonts w:ascii="Times New Roman" w:hAnsi="Times New Roman" w:cs="Times New Roman"/>
+          <w:lang w:val="en-GB"/>
+        </w:rPr>
+        <w:t>File :</w:t>
+      </w:r>
+      <w:proofErr w:type="gramEnd"/>
+      <w:r>
+        <w:rPr>
+          <w:rFonts w:ascii="Times New Roman" w:hAnsi="Times New Roman" w:cs="Times New Roman"/>
+          <w:lang w:val="en-GB"/>
+        </w:rPr>
+        <w:t xml:space="preserve"> </w:t>
+      </w:r>
+      <w:proofErr w:type="spellStart"/>
+      <w:r>
+        <w:rPr>
+          <w:rFonts w:ascii="Times New Roman" w:hAnsi="Times New Roman" w:cs="Times New Roman"/>
+          <w:lang w:val="en-GB"/>
+        </w:rPr>
+        <w:t>src</w:t>
+      </w:r>
+      <w:proofErr w:type="spellEnd"/>
+      <w:r>
+        <w:rPr>
+          <w:rFonts w:ascii="Times New Roman" w:hAnsi="Times New Roman" w:cs="Times New Roman"/>
+          <w:lang w:val="en-GB"/>
+        </w:rPr>
+        <w:t>/services/</w:t>
+      </w:r>
+      <w:proofErr w:type="spellStart"/>
+      <w:r>
+        <w:rPr>
+          <w:rFonts w:ascii="Times New Roman" w:hAnsi="Times New Roman" w:cs="Times New Roman"/>
+          <w:lang w:val="en-GB"/>
+        </w:rPr>
+        <w:t>kategori</w:t>
+      </w:r>
+      <w:proofErr w:type="spellEnd"/>
+      <w:r>
+        <w:rPr>
+          <w:rFonts w:ascii="Times New Roman" w:hAnsi="Times New Roman" w:cs="Times New Roman"/>
+          <w:lang w:val="en-GB"/>
+        </w:rPr>
+        <w:t>/</w:t>
+      </w:r>
+      <w:proofErr w:type="spellStart"/>
+      <w:r>
+        <w:rPr>
+          <w:rFonts w:ascii="Times New Roman" w:hAnsi="Times New Roman" w:cs="Times New Roman"/>
+          <w:lang w:val="en-GB"/>
+        </w:rPr>
+        <w:t>kategori.service.spec.ts</w:t>
+      </w:r>
+      <w:proofErr w:type="spellEnd"/>
+    </w:p>
+    <w:p>
+      <w:pPr>
+        <w:jc w:val="both"/>
+        <w:rPr>
+          <w:rFonts w:ascii="Times New Roman" w:hAnsi="Times New Roman" w:cs="Times New Roman"/>
+          <w:lang w:val="en-GB"/>
+        </w:rPr>
+      </w:pPr>
+    </w:p>
+    <w:p>
+      <w:pPr>
+        <w:jc w:val="both"/>
+        <w:rPr>
+          <w:rFonts w:ascii="Times New Roman" w:hAnsi="Times New Roman" w:cs="Times New Roman"/>
+          <w:lang w:val="en-GB"/>
+        </w:rPr>
+      </w:pPr>
     </w:p>
     <w:sectPr>
       <w:pgSz w:w="11906" w:h="16838"/>

</xml_diff>

<commit_message>
Perbaikan kode pada tsconfig.json
</commit_message>
<xml_diff>
--- a/dokumentasi/24382001P_Lorensius Firngadi_IF 23 E_Dokumentasi.docx
+++ b/dokumentasi/24382001P_Lorensius Firngadi_IF 23 E_Dokumentasi.docx
@@ -245,26 +245,9 @@
           <w:rFonts w:ascii="Times New Roman" w:hAnsi="Times New Roman" w:cs="Times New Roman"/>
           <w:lang w:val="en-GB"/>
         </w:rPr>
-        <w:t xml:space="preserve"> Octaviansyah</w:t>
-      </w:r>
-      <w:proofErr w:type="gramStart"/>
-      <w:r>
-        <w:rPr>
-          <w:rFonts w:ascii="Times New Roman" w:hAnsi="Times New Roman" w:cs="Times New Roman"/>
-          <w:lang w:val="en-GB"/>
-        </w:rPr>
-        <w:t>, ,</w:t>
-      </w:r>
-      <w:proofErr w:type="gramEnd"/>
-      <w:r>
-        <w:rPr>
-          <w:rFonts w:ascii="Times New Roman" w:hAnsi="Times New Roman" w:cs="Times New Roman"/>
-          <w:lang w:val="en-GB"/>
-        </w:rPr>
-        <w:t xml:space="preserve"> </w:t>
-      </w:r>
-      <w:proofErr w:type="spellStart"/>
-      <w:proofErr w:type="gramStart"/>
+        <w:t xml:space="preserve"> Octaviansyah, , </w:t>
+      </w:r>
+      <w:proofErr w:type="spellStart"/>
       <w:r>
         <w:rPr>
           <w:rFonts w:ascii="Times New Roman" w:hAnsi="Times New Roman" w:cs="Times New Roman"/>
@@ -273,7 +256,6 @@
         <w:t>S.Kom</w:t>
       </w:r>
       <w:proofErr w:type="spellEnd"/>
-      <w:proofErr w:type="gramEnd"/>
       <w:r>
         <w:rPr>
           <w:rFonts w:ascii="Times New Roman" w:hAnsi="Times New Roman" w:cs="Times New Roman"/>
@@ -282,7 +264,6 @@
         <w:t xml:space="preserve">., </w:t>
       </w:r>
       <w:proofErr w:type="spellStart"/>
-      <w:proofErr w:type="gramStart"/>
       <w:r>
         <w:rPr>
           <w:rFonts w:ascii="Times New Roman" w:hAnsi="Times New Roman" w:cs="Times New Roman"/>
@@ -291,7 +272,6 @@
         <w:t>M.Kom</w:t>
       </w:r>
       <w:proofErr w:type="spellEnd"/>
-      <w:proofErr w:type="gramEnd"/>
       <w:r>
         <w:rPr>
           <w:rFonts w:ascii="Times New Roman" w:hAnsi="Times New Roman" w:cs="Times New Roman"/>
@@ -686,23 +666,7 @@
           <w:rFonts w:ascii="Times New Roman" w:hAnsi="Times New Roman" w:cs="Times New Roman"/>
           <w:lang w:val="en-GB"/>
         </w:rPr>
-        <w:t xml:space="preserve">Nama </w:t>
-      </w:r>
-      <w:proofErr w:type="gramStart"/>
-      <w:r>
-        <w:rPr>
-          <w:rFonts w:ascii="Times New Roman" w:hAnsi="Times New Roman" w:cs="Times New Roman"/>
-          <w:lang w:val="en-GB"/>
-        </w:rPr>
-        <w:t>Project :</w:t>
-      </w:r>
-      <w:proofErr w:type="gramEnd"/>
-      <w:r>
-        <w:rPr>
-          <w:rFonts w:ascii="Times New Roman" w:hAnsi="Times New Roman" w:cs="Times New Roman"/>
-          <w:lang w:val="en-GB"/>
-        </w:rPr>
-        <w:t xml:space="preserve"> </w:t>
+        <w:t xml:space="preserve">Nama Project : </w:t>
       </w:r>
       <w:proofErr w:type="spellStart"/>
       <w:r>
@@ -757,17 +721,8 @@
           <w:rFonts w:ascii="Times New Roman" w:hAnsi="Times New Roman" w:cs="Times New Roman"/>
           <w:lang w:val="en-GB"/>
         </w:rPr>
-        <w:t xml:space="preserve"> </w:t>
-      </w:r>
-      <w:proofErr w:type="gramStart"/>
-      <w:r>
-        <w:rPr>
-          <w:rFonts w:ascii="Times New Roman" w:hAnsi="Times New Roman" w:cs="Times New Roman"/>
-          <w:lang w:val="en-GB"/>
-        </w:rPr>
-        <w:t>Project :</w:t>
-      </w:r>
-      <w:proofErr w:type="gramEnd"/>
+        <w:t xml:space="preserve"> Project :</w:t>
+      </w:r>
     </w:p>
     <w:p>
       <w:pPr>
@@ -955,7 +910,6 @@
         <w:t xml:space="preserve"> </w:t>
       </w:r>
       <w:proofErr w:type="spellStart"/>
-      <w:proofErr w:type="gramStart"/>
       <w:r>
         <w:rPr>
           <w:rFonts w:ascii="Times New Roman" w:hAnsi="Times New Roman" w:cs="Times New Roman"/>
@@ -969,15 +923,7 @@
           <w:rFonts w:ascii="Times New Roman" w:hAnsi="Times New Roman" w:cs="Times New Roman"/>
           <w:lang w:val="en-GB"/>
         </w:rPr>
-        <w:t xml:space="preserve"> :</w:t>
-      </w:r>
-      <w:proofErr w:type="gramEnd"/>
-      <w:r>
-        <w:rPr>
-          <w:rFonts w:ascii="Times New Roman" w:hAnsi="Times New Roman" w:cs="Times New Roman"/>
-          <w:lang w:val="en-GB"/>
-        </w:rPr>
-        <w:t xml:space="preserve"> </w:t>
+        <w:t xml:space="preserve"> : </w:t>
       </w:r>
       <w:proofErr w:type="spellStart"/>
       <w:r>
@@ -1998,9 +1944,9 @@
           <w:bCs/>
           <w:lang w:val="en-GB"/>
         </w:rPr>
-        <w:t xml:space="preserve"> </w:t>
-      </w:r>
-      <w:proofErr w:type="gramStart"/>
+        <w:t xml:space="preserve"> file .</w:t>
+      </w:r>
+      <w:proofErr w:type="spellStart"/>
       <w:r>
         <w:rPr>
           <w:rFonts w:ascii="Times New Roman" w:hAnsi="Times New Roman" w:cs="Times New Roman"/>
@@ -2008,20 +1954,9 @@
           <w:bCs/>
           <w:lang w:val="en-GB"/>
         </w:rPr>
-        <w:t>file .</w:t>
-      </w:r>
-      <w:proofErr w:type="spellStart"/>
-      <w:r>
-        <w:rPr>
-          <w:rFonts w:ascii="Times New Roman" w:hAnsi="Times New Roman" w:cs="Times New Roman"/>
-          <w:b/>
-          <w:bCs/>
-          <w:lang w:val="en-GB"/>
-        </w:rPr>
         <w:t>gitignore</w:t>
       </w:r>
       <w:proofErr w:type="spellEnd"/>
-      <w:proofErr w:type="gramEnd"/>
       <w:r>
         <w:rPr>
           <w:rFonts w:ascii="Times New Roman" w:hAnsi="Times New Roman" w:cs="Times New Roman"/>
@@ -2129,15 +2064,7 @@
           <w:rFonts w:ascii="Times New Roman" w:hAnsi="Times New Roman" w:cs="Times New Roman"/>
           <w:lang w:val="en-GB"/>
         </w:rPr>
-        <w:t xml:space="preserve"> </w:t>
-      </w:r>
-      <w:proofErr w:type="gramStart"/>
-      <w:r>
-        <w:rPr>
-          <w:rFonts w:ascii="Times New Roman" w:hAnsi="Times New Roman" w:cs="Times New Roman"/>
-          <w:lang w:val="en-GB"/>
-        </w:rPr>
-        <w:t>file .</w:t>
+        <w:t xml:space="preserve"> file .</w:t>
       </w:r>
       <w:proofErr w:type="spellStart"/>
       <w:r>
@@ -2148,7 +2075,6 @@
         <w:t>gitignore</w:t>
       </w:r>
       <w:proofErr w:type="spellEnd"/>
-      <w:proofErr w:type="gramEnd"/>
       <w:r>
         <w:rPr>
           <w:rFonts w:ascii="Times New Roman" w:hAnsi="Times New Roman" w:cs="Times New Roman"/>
@@ -2416,7 +2342,6 @@
           <w:lang w:val="en-GB"/>
         </w:rPr>
       </w:pPr>
-      <w:proofErr w:type="gramStart"/>
       <w:r>
         <w:rPr>
           <w:rFonts w:ascii="Times New Roman" w:hAnsi="Times New Roman" w:cs="Times New Roman"/>
@@ -2433,21 +2358,12 @@
         <w:t>gitignore</w:t>
       </w:r>
       <w:proofErr w:type="spellEnd"/>
-      <w:proofErr w:type="gramEnd"/>
-      <w:r>
-        <w:rPr>
-          <w:rFonts w:ascii="Times New Roman" w:hAnsi="Times New Roman" w:cs="Times New Roman"/>
-          <w:lang w:val="en-GB"/>
-        </w:rPr>
-        <w:t xml:space="preserve"> </w:t>
-      </w:r>
-      <w:proofErr w:type="gramStart"/>
-      <w:r>
-        <w:rPr>
-          <w:rFonts w:ascii="Times New Roman" w:hAnsi="Times New Roman" w:cs="Times New Roman"/>
-          <w:lang w:val="en-GB"/>
-        </w:rPr>
-        <w:t xml:space="preserve">sangat  </w:t>
+      <w:r>
+        <w:rPr>
+          <w:rFonts w:ascii="Times New Roman" w:hAnsi="Times New Roman" w:cs="Times New Roman"/>
+          <w:lang w:val="en-GB"/>
+        </w:rPr>
+        <w:t xml:space="preserve"> sangat  </w:t>
       </w:r>
       <w:proofErr w:type="spellStart"/>
       <w:r>
@@ -2458,7 +2374,6 @@
         <w:t>bermanfaat</w:t>
       </w:r>
       <w:proofErr w:type="spellEnd"/>
-      <w:proofErr w:type="gramEnd"/>
       <w:r>
         <w:rPr>
           <w:rFonts w:ascii="Times New Roman" w:hAnsi="Times New Roman" w:cs="Times New Roman"/>
@@ -2950,7 +2865,6 @@
         <w:t xml:space="preserve">Edit </w:t>
       </w:r>
       <w:proofErr w:type="spellStart"/>
-      <w:proofErr w:type="gramStart"/>
       <w:r>
         <w:rPr>
           <w:rFonts w:ascii="Times New Roman" w:hAnsi="Times New Roman" w:cs="Times New Roman"/>
@@ -2961,7 +2875,6 @@
         <w:t>tsconfig.json</w:t>
       </w:r>
       <w:proofErr w:type="spellEnd"/>
-      <w:proofErr w:type="gramEnd"/>
       <w:r>
         <w:rPr>
           <w:rFonts w:ascii="Times New Roman" w:hAnsi="Times New Roman" w:cs="Times New Roman"/>
@@ -3580,21 +3493,12 @@
         <w:t>seperti</w:t>
       </w:r>
       <w:proofErr w:type="spellEnd"/>
-      <w:proofErr w:type="gramStart"/>
-      <w:r>
-        <w:rPr>
-          <w:rFonts w:ascii="Times New Roman" w:hAnsi="Times New Roman" w:cs="Times New Roman"/>
-          <w:lang w:val="en-GB"/>
-        </w:rPr>
-        <w:t xml:space="preserve"> ../../..</w:t>
-      </w:r>
-      <w:proofErr w:type="gramEnd"/>
-      <w:r>
-        <w:rPr>
-          <w:rFonts w:ascii="Times New Roman" w:hAnsi="Times New Roman" w:cs="Times New Roman"/>
-          <w:lang w:val="en-GB"/>
-        </w:rPr>
-        <w:t xml:space="preserve">/folder/file, </w:t>
+      <w:r>
+        <w:rPr>
+          <w:rFonts w:ascii="Times New Roman" w:hAnsi="Times New Roman" w:cs="Times New Roman"/>
+          <w:lang w:val="en-GB"/>
+        </w:rPr>
+        <w:t xml:space="preserve"> ../../../folder/file, </w:t>
       </w:r>
       <w:proofErr w:type="spellStart"/>
       <w:r>
@@ -4872,7 +4776,6 @@
         <w:t xml:space="preserve">Update </w:t>
       </w:r>
       <w:proofErr w:type="spellStart"/>
-      <w:proofErr w:type="gramStart"/>
       <w:r>
         <w:rPr>
           <w:b/>
@@ -4881,7 +4784,6 @@
         <w:t>package.json</w:t>
       </w:r>
       <w:proofErr w:type="spellEnd"/>
-      <w:proofErr w:type="gramEnd"/>
       <w:r>
         <w:rPr>
           <w:b/>
@@ -7824,7 +7726,6 @@
         <w:t xml:space="preserve"> File </w:t>
       </w:r>
       <w:proofErr w:type="spellStart"/>
-      <w:proofErr w:type="gramStart"/>
       <w:r>
         <w:rPr>
           <w:rFonts w:ascii="Times New Roman" w:hAnsi="Times New Roman" w:cs="Times New Roman"/>
@@ -7832,17 +7733,7 @@
           <w:bCs/>
           <w:lang w:val="en-GB"/>
         </w:rPr>
-        <w:t>prisma.service</w:t>
-      </w:r>
-      <w:proofErr w:type="gramEnd"/>
-      <w:r>
-        <w:rPr>
-          <w:rFonts w:ascii="Times New Roman" w:hAnsi="Times New Roman" w:cs="Times New Roman"/>
-          <w:b/>
-          <w:bCs/>
-          <w:lang w:val="en-GB"/>
-        </w:rPr>
-        <w:t>.ts</w:t>
+        <w:t>prisma.service.ts</w:t>
       </w:r>
       <w:proofErr w:type="spellEnd"/>
     </w:p>
@@ -9264,23 +9155,7 @@
           <w:rFonts w:ascii="Times New Roman" w:hAnsi="Times New Roman" w:cs="Times New Roman"/>
           <w:lang w:val="en-GB"/>
         </w:rPr>
-        <w:t xml:space="preserve">  id: </w:t>
-      </w:r>
-      <w:proofErr w:type="gramStart"/>
-      <w:r>
-        <w:rPr>
-          <w:rFonts w:ascii="Times New Roman" w:hAnsi="Times New Roman" w:cs="Times New Roman"/>
-          <w:lang w:val="en-GB"/>
-        </w:rPr>
-        <w:t xml:space="preserve">string;   </w:t>
-      </w:r>
-      <w:proofErr w:type="gramEnd"/>
-      <w:r>
-        <w:rPr>
-          <w:rFonts w:ascii="Times New Roman" w:hAnsi="Times New Roman" w:cs="Times New Roman"/>
-          <w:lang w:val="en-GB"/>
-        </w:rPr>
-        <w:t xml:space="preserve">         # KTP/ID </w:t>
+        <w:t xml:space="preserve">  id: string;            # KTP/ID </w:t>
       </w:r>
       <w:proofErr w:type="spellStart"/>
       <w:r>
@@ -9361,23 +9236,7 @@
           <w:rFonts w:ascii="Times New Roman" w:hAnsi="Times New Roman" w:cs="Times New Roman"/>
           <w:lang w:val="en-GB"/>
         </w:rPr>
-        <w:t xml:space="preserve">  name: </w:t>
-      </w:r>
-      <w:proofErr w:type="gramStart"/>
-      <w:r>
-        <w:rPr>
-          <w:rFonts w:ascii="Times New Roman" w:hAnsi="Times New Roman" w:cs="Times New Roman"/>
-          <w:lang w:val="en-GB"/>
-        </w:rPr>
-        <w:t xml:space="preserve">string;   </w:t>
-      </w:r>
-      <w:proofErr w:type="gramEnd"/>
-      <w:r>
-        <w:rPr>
-          <w:rFonts w:ascii="Times New Roman" w:hAnsi="Times New Roman" w:cs="Times New Roman"/>
-          <w:lang w:val="en-GB"/>
-        </w:rPr>
-        <w:t xml:space="preserve">       # Nama </w:t>
+        <w:t xml:space="preserve">  name: string;          # Nama </w:t>
       </w:r>
       <w:proofErr w:type="spellStart"/>
       <w:r>
@@ -9442,23 +9301,7 @@
           <w:rFonts w:ascii="Times New Roman" w:hAnsi="Times New Roman" w:cs="Times New Roman"/>
           <w:lang w:val="en-GB"/>
         </w:rPr>
-        <w:t xml:space="preserve">  slug: </w:t>
-      </w:r>
-      <w:proofErr w:type="gramStart"/>
-      <w:r>
-        <w:rPr>
-          <w:rFonts w:ascii="Times New Roman" w:hAnsi="Times New Roman" w:cs="Times New Roman"/>
-          <w:lang w:val="en-GB"/>
-        </w:rPr>
-        <w:t xml:space="preserve">string;   </w:t>
-      </w:r>
-      <w:proofErr w:type="gramEnd"/>
-      <w:r>
-        <w:rPr>
-          <w:rFonts w:ascii="Times New Roman" w:hAnsi="Times New Roman" w:cs="Times New Roman"/>
-          <w:lang w:val="en-GB"/>
-        </w:rPr>
-        <w:t xml:space="preserve">       # Nama </w:t>
+        <w:t xml:space="preserve">  slug: string;          # Nama </w:t>
       </w:r>
       <w:proofErr w:type="spellStart"/>
       <w:r>
@@ -9523,96 +9366,582 @@
           <w:rFonts w:ascii="Times New Roman" w:hAnsi="Times New Roman" w:cs="Times New Roman"/>
           <w:lang w:val="en-GB"/>
         </w:rPr>
+        <w:t xml:space="preserve">  description?: string;  # </w:t>
+      </w:r>
+      <w:proofErr w:type="spellStart"/>
+      <w:r>
+        <w:rPr>
+          <w:rFonts w:ascii="Times New Roman" w:hAnsi="Times New Roman" w:cs="Times New Roman"/>
+          <w:lang w:val="en-GB"/>
+        </w:rPr>
+        <w:t>Penjelasan</w:t>
+      </w:r>
+      <w:proofErr w:type="spellEnd"/>
+      <w:r>
+        <w:rPr>
+          <w:rFonts w:ascii="Times New Roman" w:hAnsi="Times New Roman" w:cs="Times New Roman"/>
+          <w:lang w:val="en-GB"/>
+        </w:rPr>
+        <w:t xml:space="preserve"> </w:t>
+      </w:r>
+      <w:proofErr w:type="spellStart"/>
+      <w:r>
+        <w:rPr>
+          <w:rFonts w:ascii="Times New Roman" w:hAnsi="Times New Roman" w:cs="Times New Roman"/>
+          <w:lang w:val="en-GB"/>
+        </w:rPr>
+        <w:t>singkat</w:t>
+      </w:r>
+      <w:proofErr w:type="spellEnd"/>
+      <w:r>
+        <w:rPr>
+          <w:rFonts w:ascii="Times New Roman" w:hAnsi="Times New Roman" w:cs="Times New Roman"/>
+          <w:lang w:val="en-GB"/>
+        </w:rPr>
+        <w:t xml:space="preserve"> (</w:t>
+      </w:r>
+      <w:proofErr w:type="spellStart"/>
+      <w:r>
+        <w:rPr>
+          <w:rFonts w:ascii="Times New Roman" w:hAnsi="Times New Roman" w:cs="Times New Roman"/>
+          <w:lang w:val="en-GB"/>
+        </w:rPr>
+        <w:t>tanda</w:t>
+      </w:r>
+      <w:proofErr w:type="spellEnd"/>
+      <w:r>
+        <w:rPr>
+          <w:rFonts w:ascii="Times New Roman" w:hAnsi="Times New Roman" w:cs="Times New Roman"/>
+          <w:lang w:val="en-GB"/>
+        </w:rPr>
+        <w:t xml:space="preserve"> ? </w:t>
+      </w:r>
+      <w:proofErr w:type="spellStart"/>
+      <w:r>
+        <w:rPr>
+          <w:rFonts w:ascii="Times New Roman" w:hAnsi="Times New Roman" w:cs="Times New Roman"/>
+          <w:lang w:val="en-GB"/>
+        </w:rPr>
+        <w:t>artinya</w:t>
+      </w:r>
+      <w:proofErr w:type="spellEnd"/>
+      <w:r>
+        <w:rPr>
+          <w:rFonts w:ascii="Times New Roman" w:hAnsi="Times New Roman" w:cs="Times New Roman"/>
+          <w:lang w:val="en-GB"/>
+        </w:rPr>
+        <w:t xml:space="preserve"> </w:t>
+      </w:r>
+      <w:proofErr w:type="spellStart"/>
+      <w:r>
+        <w:rPr>
+          <w:rFonts w:ascii="Times New Roman" w:hAnsi="Times New Roman" w:cs="Times New Roman"/>
+          <w:lang w:val="en-GB"/>
+        </w:rPr>
+        <w:t>boleh</w:t>
+      </w:r>
+      <w:proofErr w:type="spellEnd"/>
+      <w:r>
+        <w:rPr>
+          <w:rFonts w:ascii="Times New Roman" w:hAnsi="Times New Roman" w:cs="Times New Roman"/>
+          <w:lang w:val="en-GB"/>
+        </w:rPr>
+        <w:t xml:space="preserve"> </w:t>
+      </w:r>
+      <w:proofErr w:type="spellStart"/>
+      <w:r>
+        <w:rPr>
+          <w:rFonts w:ascii="Times New Roman" w:hAnsi="Times New Roman" w:cs="Times New Roman"/>
+          <w:lang w:val="en-GB"/>
+        </w:rPr>
+        <w:t>kosong</w:t>
+      </w:r>
+      <w:proofErr w:type="spellEnd"/>
+      <w:r>
+        <w:rPr>
+          <w:rFonts w:ascii="Times New Roman" w:hAnsi="Times New Roman" w:cs="Times New Roman"/>
+          <w:lang w:val="en-GB"/>
+        </w:rPr>
+        <w:t>).</w:t>
+      </w:r>
+    </w:p>
+    <w:p>
+      <w:pPr>
+        <w:contextualSpacing/>
+        <w:jc w:val="both"/>
+        <w:rPr>
+          <w:rFonts w:ascii="Times New Roman" w:hAnsi="Times New Roman" w:cs="Times New Roman"/>
+          <w:lang w:val="en-GB"/>
+        </w:rPr>
+      </w:pPr>
+      <w:r>
+        <w:rPr>
+          <w:rFonts w:ascii="Times New Roman" w:hAnsi="Times New Roman" w:cs="Times New Roman"/>
+          <w:lang w:val="en-GB"/>
+        </w:rPr>
+        <w:t xml:space="preserve">  icon?: string;         # </w:t>
+      </w:r>
+      <w:proofErr w:type="spellStart"/>
+      <w:r>
+        <w:rPr>
+          <w:rFonts w:ascii="Times New Roman" w:hAnsi="Times New Roman" w:cs="Times New Roman"/>
+          <w:lang w:val="en-GB"/>
+        </w:rPr>
+        <w:t>Simbol</w:t>
+      </w:r>
+      <w:proofErr w:type="spellEnd"/>
+      <w:r>
+        <w:rPr>
+          <w:rFonts w:ascii="Times New Roman" w:hAnsi="Times New Roman" w:cs="Times New Roman"/>
+          <w:lang w:val="en-GB"/>
+        </w:rPr>
+        <w:t xml:space="preserve"> </w:t>
+      </w:r>
+      <w:proofErr w:type="spellStart"/>
+      <w:r>
+        <w:rPr>
+          <w:rFonts w:ascii="Times New Roman" w:hAnsi="Times New Roman" w:cs="Times New Roman"/>
+          <w:lang w:val="en-GB"/>
+        </w:rPr>
+        <w:t>atau</w:t>
+      </w:r>
+      <w:proofErr w:type="spellEnd"/>
+      <w:r>
+        <w:rPr>
+          <w:rFonts w:ascii="Times New Roman" w:hAnsi="Times New Roman" w:cs="Times New Roman"/>
+          <w:lang w:val="en-GB"/>
+        </w:rPr>
+        <w:t xml:space="preserve"> </w:t>
+      </w:r>
+      <w:proofErr w:type="spellStart"/>
+      <w:r>
+        <w:rPr>
+          <w:rFonts w:ascii="Times New Roman" w:hAnsi="Times New Roman" w:cs="Times New Roman"/>
+          <w:lang w:val="en-GB"/>
+        </w:rPr>
+        <w:t>gambar</w:t>
+      </w:r>
+      <w:proofErr w:type="spellEnd"/>
+      <w:r>
+        <w:rPr>
+          <w:rFonts w:ascii="Times New Roman" w:hAnsi="Times New Roman" w:cs="Times New Roman"/>
+          <w:lang w:val="en-GB"/>
+        </w:rPr>
+        <w:t xml:space="preserve"> </w:t>
+      </w:r>
+      <w:proofErr w:type="spellStart"/>
+      <w:r>
+        <w:rPr>
+          <w:rFonts w:ascii="Times New Roman" w:hAnsi="Times New Roman" w:cs="Times New Roman"/>
+          <w:lang w:val="en-GB"/>
+        </w:rPr>
+        <w:t>kecil</w:t>
+      </w:r>
+      <w:proofErr w:type="spellEnd"/>
+      <w:r>
+        <w:rPr>
+          <w:rFonts w:ascii="Times New Roman" w:hAnsi="Times New Roman" w:cs="Times New Roman"/>
+          <w:lang w:val="en-GB"/>
+        </w:rPr>
+        <w:t xml:space="preserve"> </w:t>
+      </w:r>
+      <w:proofErr w:type="spellStart"/>
+      <w:r>
+        <w:rPr>
+          <w:rFonts w:ascii="Times New Roman" w:hAnsi="Times New Roman" w:cs="Times New Roman"/>
+          <w:lang w:val="en-GB"/>
+        </w:rPr>
+        <w:t>untuk</w:t>
+      </w:r>
+      <w:proofErr w:type="spellEnd"/>
+      <w:r>
+        <w:rPr>
+          <w:rFonts w:ascii="Times New Roman" w:hAnsi="Times New Roman" w:cs="Times New Roman"/>
+          <w:lang w:val="en-GB"/>
+        </w:rPr>
+        <w:t xml:space="preserve"> </w:t>
+      </w:r>
+      <w:proofErr w:type="spellStart"/>
+      <w:r>
+        <w:rPr>
+          <w:rFonts w:ascii="Times New Roman" w:hAnsi="Times New Roman" w:cs="Times New Roman"/>
+          <w:lang w:val="en-GB"/>
+        </w:rPr>
+        <w:t>kategori</w:t>
+      </w:r>
+      <w:proofErr w:type="spellEnd"/>
+      <w:r>
+        <w:rPr>
+          <w:rFonts w:ascii="Times New Roman" w:hAnsi="Times New Roman" w:cs="Times New Roman"/>
+          <w:lang w:val="en-GB"/>
+        </w:rPr>
+        <w:t>.</w:t>
+      </w:r>
+    </w:p>
+    <w:p>
+      <w:pPr>
+        <w:contextualSpacing/>
+        <w:jc w:val="both"/>
+        <w:rPr>
+          <w:rFonts w:ascii="Times New Roman" w:hAnsi="Times New Roman" w:cs="Times New Roman"/>
+          <w:lang w:val="en-GB"/>
+        </w:rPr>
+      </w:pPr>
+      <w:r>
+        <w:rPr>
+          <w:rFonts w:ascii="Times New Roman" w:hAnsi="Times New Roman" w:cs="Times New Roman"/>
+          <w:lang w:val="en-GB"/>
+        </w:rPr>
         <w:t xml:space="preserve">  </w:t>
       </w:r>
-      <w:proofErr w:type="gramStart"/>
-      <w:r>
-        <w:rPr>
-          <w:rFonts w:ascii="Times New Roman" w:hAnsi="Times New Roman" w:cs="Times New Roman"/>
-          <w:lang w:val="en-GB"/>
-        </w:rPr>
-        <w:t>description?:</w:t>
-      </w:r>
-      <w:proofErr w:type="gramEnd"/>
-      <w:r>
-        <w:rPr>
-          <w:rFonts w:ascii="Times New Roman" w:hAnsi="Times New Roman" w:cs="Times New Roman"/>
-          <w:lang w:val="en-GB"/>
-        </w:rPr>
-        <w:t xml:space="preserve"> </w:t>
-      </w:r>
-      <w:proofErr w:type="gramStart"/>
-      <w:r>
-        <w:rPr>
-          <w:rFonts w:ascii="Times New Roman" w:hAnsi="Times New Roman" w:cs="Times New Roman"/>
-          <w:lang w:val="en-GB"/>
-        </w:rPr>
-        <w:t>string;  #</w:t>
-      </w:r>
-      <w:proofErr w:type="gramEnd"/>
-      <w:r>
-        <w:rPr>
-          <w:rFonts w:ascii="Times New Roman" w:hAnsi="Times New Roman" w:cs="Times New Roman"/>
-          <w:lang w:val="en-GB"/>
-        </w:rPr>
-        <w:t xml:space="preserve"> </w:t>
-      </w:r>
-      <w:proofErr w:type="spellStart"/>
-      <w:r>
-        <w:rPr>
-          <w:rFonts w:ascii="Times New Roman" w:hAnsi="Times New Roman" w:cs="Times New Roman"/>
-          <w:lang w:val="en-GB"/>
-        </w:rPr>
-        <w:t>Penjelasan</w:t>
-      </w:r>
-      <w:proofErr w:type="spellEnd"/>
-      <w:r>
-        <w:rPr>
-          <w:rFonts w:ascii="Times New Roman" w:hAnsi="Times New Roman" w:cs="Times New Roman"/>
-          <w:lang w:val="en-GB"/>
-        </w:rPr>
-        <w:t xml:space="preserve"> </w:t>
-      </w:r>
-      <w:proofErr w:type="spellStart"/>
-      <w:r>
-        <w:rPr>
-          <w:rFonts w:ascii="Times New Roman" w:hAnsi="Times New Roman" w:cs="Times New Roman"/>
-          <w:lang w:val="en-GB"/>
-        </w:rPr>
-        <w:t>singkat</w:t>
-      </w:r>
-      <w:proofErr w:type="spellEnd"/>
-      <w:r>
-        <w:rPr>
-          <w:rFonts w:ascii="Times New Roman" w:hAnsi="Times New Roman" w:cs="Times New Roman"/>
-          <w:lang w:val="en-GB"/>
-        </w:rPr>
-        <w:t xml:space="preserve"> (</w:t>
-      </w:r>
-      <w:proofErr w:type="spellStart"/>
-      <w:proofErr w:type="gramStart"/>
-      <w:r>
-        <w:rPr>
-          <w:rFonts w:ascii="Times New Roman" w:hAnsi="Times New Roman" w:cs="Times New Roman"/>
-          <w:lang w:val="en-GB"/>
-        </w:rPr>
-        <w:t>tanda</w:t>
-      </w:r>
-      <w:proofErr w:type="spellEnd"/>
-      <w:r>
-        <w:rPr>
-          <w:rFonts w:ascii="Times New Roman" w:hAnsi="Times New Roman" w:cs="Times New Roman"/>
-          <w:lang w:val="en-GB"/>
-        </w:rPr>
-        <w:t xml:space="preserve"> ?</w:t>
-      </w:r>
-      <w:proofErr w:type="gramEnd"/>
-      <w:r>
-        <w:rPr>
-          <w:rFonts w:ascii="Times New Roman" w:hAnsi="Times New Roman" w:cs="Times New Roman"/>
-          <w:lang w:val="en-GB"/>
-        </w:rPr>
-        <w:t xml:space="preserve"> </w:t>
+      <w:proofErr w:type="spellStart"/>
+      <w:r>
+        <w:rPr>
+          <w:rFonts w:ascii="Times New Roman" w:hAnsi="Times New Roman" w:cs="Times New Roman"/>
+          <w:lang w:val="en-GB"/>
+        </w:rPr>
+        <w:t>createdAt</w:t>
+      </w:r>
+      <w:proofErr w:type="spellEnd"/>
+      <w:r>
+        <w:rPr>
+          <w:rFonts w:ascii="Times New Roman" w:hAnsi="Times New Roman" w:cs="Times New Roman"/>
+          <w:lang w:val="en-GB"/>
+        </w:rPr>
+        <w:t xml:space="preserve">: Date;       # </w:t>
+      </w:r>
+      <w:proofErr w:type="spellStart"/>
+      <w:r>
+        <w:rPr>
+          <w:rFonts w:ascii="Times New Roman" w:hAnsi="Times New Roman" w:cs="Times New Roman"/>
+          <w:lang w:val="en-GB"/>
+        </w:rPr>
+        <w:t>Catatan</w:t>
+      </w:r>
+      <w:proofErr w:type="spellEnd"/>
+      <w:r>
+        <w:rPr>
+          <w:rFonts w:ascii="Times New Roman" w:hAnsi="Times New Roman" w:cs="Times New Roman"/>
+          <w:lang w:val="en-GB"/>
+        </w:rPr>
+        <w:t xml:space="preserve"> </w:t>
+      </w:r>
+      <w:proofErr w:type="spellStart"/>
+      <w:r>
+        <w:rPr>
+          <w:rFonts w:ascii="Times New Roman" w:hAnsi="Times New Roman" w:cs="Times New Roman"/>
+          <w:lang w:val="en-GB"/>
+        </w:rPr>
+        <w:t>waktu</w:t>
+      </w:r>
+      <w:proofErr w:type="spellEnd"/>
+      <w:r>
+        <w:rPr>
+          <w:rFonts w:ascii="Times New Roman" w:hAnsi="Times New Roman" w:cs="Times New Roman"/>
+          <w:lang w:val="en-GB"/>
+        </w:rPr>
+        <w:t xml:space="preserve"> </w:t>
+      </w:r>
+      <w:proofErr w:type="spellStart"/>
+      <w:r>
+        <w:rPr>
+          <w:rFonts w:ascii="Times New Roman" w:hAnsi="Times New Roman" w:cs="Times New Roman"/>
+          <w:lang w:val="en-GB"/>
+        </w:rPr>
+        <w:t>kapan</w:t>
+      </w:r>
+      <w:proofErr w:type="spellEnd"/>
+      <w:r>
+        <w:rPr>
+          <w:rFonts w:ascii="Times New Roman" w:hAnsi="Times New Roman" w:cs="Times New Roman"/>
+          <w:lang w:val="en-GB"/>
+        </w:rPr>
+        <w:t xml:space="preserve"> </w:t>
+      </w:r>
+      <w:proofErr w:type="spellStart"/>
+      <w:r>
+        <w:rPr>
+          <w:rFonts w:ascii="Times New Roman" w:hAnsi="Times New Roman" w:cs="Times New Roman"/>
+          <w:lang w:val="en-GB"/>
+        </w:rPr>
+        <w:t>kategori</w:t>
+      </w:r>
+      <w:proofErr w:type="spellEnd"/>
+      <w:r>
+        <w:rPr>
+          <w:rFonts w:ascii="Times New Roman" w:hAnsi="Times New Roman" w:cs="Times New Roman"/>
+          <w:lang w:val="en-GB"/>
+        </w:rPr>
+        <w:t xml:space="preserve"> </w:t>
+      </w:r>
+      <w:proofErr w:type="spellStart"/>
+      <w:r>
+        <w:rPr>
+          <w:rFonts w:ascii="Times New Roman" w:hAnsi="Times New Roman" w:cs="Times New Roman"/>
+          <w:lang w:val="en-GB"/>
+        </w:rPr>
+        <w:t>ini</w:t>
+      </w:r>
+      <w:proofErr w:type="spellEnd"/>
+      <w:r>
+        <w:rPr>
+          <w:rFonts w:ascii="Times New Roman" w:hAnsi="Times New Roman" w:cs="Times New Roman"/>
+          <w:lang w:val="en-GB"/>
+        </w:rPr>
+        <w:t xml:space="preserve"> </w:t>
+      </w:r>
+      <w:proofErr w:type="spellStart"/>
+      <w:r>
+        <w:rPr>
+          <w:rFonts w:ascii="Times New Roman" w:hAnsi="Times New Roman" w:cs="Times New Roman"/>
+          <w:lang w:val="en-GB"/>
+        </w:rPr>
+        <w:t>dibuat</w:t>
+      </w:r>
+      <w:proofErr w:type="spellEnd"/>
+      <w:r>
+        <w:rPr>
+          <w:rFonts w:ascii="Times New Roman" w:hAnsi="Times New Roman" w:cs="Times New Roman"/>
+          <w:lang w:val="en-GB"/>
+        </w:rPr>
+        <w:t>.</w:t>
+      </w:r>
+    </w:p>
+    <w:p>
+      <w:pPr>
+        <w:contextualSpacing/>
+        <w:jc w:val="both"/>
+        <w:rPr>
+          <w:rFonts w:ascii="Times New Roman" w:hAnsi="Times New Roman" w:cs="Times New Roman"/>
+          <w:lang w:val="en-GB"/>
+        </w:rPr>
+      </w:pPr>
+      <w:r>
+        <w:rPr>
+          <w:rFonts w:ascii="Times New Roman" w:hAnsi="Times New Roman" w:cs="Times New Roman"/>
+          <w:lang w:val="en-GB"/>
+        </w:rPr>
+        <w:t xml:space="preserve">  </w:t>
+      </w:r>
+      <w:proofErr w:type="spellStart"/>
+      <w:r>
+        <w:rPr>
+          <w:rFonts w:ascii="Times New Roman" w:hAnsi="Times New Roman" w:cs="Times New Roman"/>
+          <w:lang w:val="en-GB"/>
+        </w:rPr>
+        <w:t>updatedAt</w:t>
+      </w:r>
+      <w:proofErr w:type="spellEnd"/>
+      <w:r>
+        <w:rPr>
+          <w:rFonts w:ascii="Times New Roman" w:hAnsi="Times New Roman" w:cs="Times New Roman"/>
+          <w:lang w:val="en-GB"/>
+        </w:rPr>
+        <w:t xml:space="preserve">: Date;       # </w:t>
+      </w:r>
+      <w:proofErr w:type="spellStart"/>
+      <w:r>
+        <w:rPr>
+          <w:rFonts w:ascii="Times New Roman" w:hAnsi="Times New Roman" w:cs="Times New Roman"/>
+          <w:lang w:val="en-GB"/>
+        </w:rPr>
+        <w:t>Catatan</w:t>
+      </w:r>
+      <w:proofErr w:type="spellEnd"/>
+      <w:r>
+        <w:rPr>
+          <w:rFonts w:ascii="Times New Roman" w:hAnsi="Times New Roman" w:cs="Times New Roman"/>
+          <w:lang w:val="en-GB"/>
+        </w:rPr>
+        <w:t xml:space="preserve"> </w:t>
+      </w:r>
+      <w:proofErr w:type="spellStart"/>
+      <w:r>
+        <w:rPr>
+          <w:rFonts w:ascii="Times New Roman" w:hAnsi="Times New Roman" w:cs="Times New Roman"/>
+          <w:lang w:val="en-GB"/>
+        </w:rPr>
+        <w:t>waktu</w:t>
+      </w:r>
+      <w:proofErr w:type="spellEnd"/>
+      <w:r>
+        <w:rPr>
+          <w:rFonts w:ascii="Times New Roman" w:hAnsi="Times New Roman" w:cs="Times New Roman"/>
+          <w:lang w:val="en-GB"/>
+        </w:rPr>
+        <w:t xml:space="preserve"> kapan </w:t>
+      </w:r>
+      <w:proofErr w:type="spellStart"/>
+      <w:r>
+        <w:rPr>
+          <w:rFonts w:ascii="Times New Roman" w:hAnsi="Times New Roman" w:cs="Times New Roman"/>
+          <w:lang w:val="en-GB"/>
+        </w:rPr>
+        <w:t>terakhir</w:t>
+      </w:r>
+      <w:proofErr w:type="spellEnd"/>
+      <w:r>
+        <w:rPr>
+          <w:rFonts w:ascii="Times New Roman" w:hAnsi="Times New Roman" w:cs="Times New Roman"/>
+          <w:lang w:val="en-GB"/>
+        </w:rPr>
+        <w:t xml:space="preserve"> kali data </w:t>
+      </w:r>
+      <w:proofErr w:type="spellStart"/>
+      <w:r>
+        <w:rPr>
+          <w:rFonts w:ascii="Times New Roman" w:hAnsi="Times New Roman" w:cs="Times New Roman"/>
+          <w:lang w:val="en-GB"/>
+        </w:rPr>
+        <w:t>diubah</w:t>
+      </w:r>
+      <w:proofErr w:type="spellEnd"/>
+      <w:r>
+        <w:rPr>
+          <w:rFonts w:ascii="Times New Roman" w:hAnsi="Times New Roman" w:cs="Times New Roman"/>
+          <w:lang w:val="en-GB"/>
+        </w:rPr>
+        <w:t>.</w:t>
+      </w:r>
+    </w:p>
+    <w:p>
+      <w:pPr>
+        <w:contextualSpacing/>
+        <w:jc w:val="both"/>
+        <w:rPr>
+          <w:rFonts w:ascii="Times New Roman" w:hAnsi="Times New Roman" w:cs="Times New Roman"/>
+          <w:lang w:val="en-GB"/>
+        </w:rPr>
+      </w:pPr>
+    </w:p>
+    <w:p>
+      <w:pPr>
+        <w:contextualSpacing/>
+        <w:jc w:val="both"/>
+        <w:rPr>
+          <w:rFonts w:ascii="Times New Roman" w:hAnsi="Times New Roman" w:cs="Times New Roman"/>
+          <w:lang w:val="en-GB"/>
+        </w:rPr>
+      </w:pPr>
+      <w:r>
+        <w:rPr>
+          <w:rFonts w:ascii="Times New Roman" w:hAnsi="Times New Roman" w:cs="Times New Roman"/>
+          <w:lang w:val="en-GB"/>
+        </w:rPr>
+        <w:t xml:space="preserve">  # Constructor </w:t>
+      </w:r>
+      <w:proofErr w:type="spellStart"/>
+      <w:r>
+        <w:rPr>
+          <w:rFonts w:ascii="Times New Roman" w:hAnsi="Times New Roman" w:cs="Times New Roman"/>
+          <w:lang w:val="en-GB"/>
+        </w:rPr>
+        <w:t>adalah</w:t>
+      </w:r>
+      <w:proofErr w:type="spellEnd"/>
+      <w:r>
+        <w:rPr>
+          <w:rFonts w:ascii="Times New Roman" w:hAnsi="Times New Roman" w:cs="Times New Roman"/>
+          <w:lang w:val="en-GB"/>
+        </w:rPr>
+        <w:t xml:space="preserve"> </w:t>
+      </w:r>
+      <w:proofErr w:type="spellStart"/>
+      <w:r>
+        <w:rPr>
+          <w:rFonts w:ascii="Times New Roman" w:hAnsi="Times New Roman" w:cs="Times New Roman"/>
+          <w:lang w:val="en-GB"/>
+        </w:rPr>
+        <w:t>mesin</w:t>
+      </w:r>
+      <w:proofErr w:type="spellEnd"/>
+      <w:r>
+        <w:rPr>
+          <w:rFonts w:ascii="Times New Roman" w:hAnsi="Times New Roman" w:cs="Times New Roman"/>
+          <w:lang w:val="en-GB"/>
+        </w:rPr>
+        <w:t xml:space="preserve"> </w:t>
+      </w:r>
+      <w:proofErr w:type="spellStart"/>
+      <w:r>
+        <w:rPr>
+          <w:rFonts w:ascii="Times New Roman" w:hAnsi="Times New Roman" w:cs="Times New Roman"/>
+          <w:lang w:val="en-GB"/>
+        </w:rPr>
+        <w:t>pembuat</w:t>
+      </w:r>
+      <w:proofErr w:type="spellEnd"/>
+      <w:r>
+        <w:rPr>
+          <w:rFonts w:ascii="Times New Roman" w:hAnsi="Times New Roman" w:cs="Times New Roman"/>
+          <w:lang w:val="en-GB"/>
+        </w:rPr>
+        <w:t xml:space="preserve"> </w:t>
+      </w:r>
+      <w:proofErr w:type="spellStart"/>
+      <w:r>
+        <w:rPr>
+          <w:rFonts w:ascii="Times New Roman" w:hAnsi="Times New Roman" w:cs="Times New Roman"/>
+          <w:lang w:val="en-GB"/>
+        </w:rPr>
+        <w:t>objek</w:t>
+      </w:r>
+      <w:proofErr w:type="spellEnd"/>
+      <w:r>
+        <w:rPr>
+          <w:rFonts w:ascii="Times New Roman" w:hAnsi="Times New Roman" w:cs="Times New Roman"/>
+          <w:lang w:val="en-GB"/>
+        </w:rPr>
+        <w:t xml:space="preserve"> </w:t>
+      </w:r>
+      <w:proofErr w:type="spellStart"/>
+      <w:r>
+        <w:rPr>
+          <w:rFonts w:ascii="Times New Roman" w:hAnsi="Times New Roman" w:cs="Times New Roman"/>
+          <w:lang w:val="en-GB"/>
+        </w:rPr>
+        <w:t>otomatis</w:t>
+      </w:r>
+      <w:proofErr w:type="spellEnd"/>
+      <w:r>
+        <w:rPr>
+          <w:rFonts w:ascii="Times New Roman" w:hAnsi="Times New Roman" w:cs="Times New Roman"/>
+          <w:lang w:val="en-GB"/>
+        </w:rPr>
+        <w:t>.</w:t>
+      </w:r>
+    </w:p>
+    <w:p>
+      <w:pPr>
+        <w:contextualSpacing/>
+        <w:jc w:val="both"/>
+        <w:rPr>
+          <w:rFonts w:ascii="Times New Roman" w:hAnsi="Times New Roman" w:cs="Times New Roman"/>
+          <w:lang w:val="en-GB"/>
+        </w:rPr>
+      </w:pPr>
+      <w:r>
+        <w:rPr>
+          <w:rFonts w:ascii="Times New Roman" w:hAnsi="Times New Roman" w:cs="Times New Roman"/>
+          <w:lang w:val="en-GB"/>
+        </w:rPr>
+        <w:t xml:space="preserve">  # Partial&lt;</w:t>
+      </w:r>
+      <w:proofErr w:type="spellStart"/>
+      <w:r>
+        <w:rPr>
+          <w:rFonts w:ascii="Times New Roman" w:hAnsi="Times New Roman" w:cs="Times New Roman"/>
+          <w:lang w:val="en-GB"/>
+        </w:rPr>
+        <w:t>KategoriEntity</w:t>
+      </w:r>
+      <w:proofErr w:type="spellEnd"/>
+      <w:r>
+        <w:rPr>
+          <w:rFonts w:ascii="Times New Roman" w:hAnsi="Times New Roman" w:cs="Times New Roman"/>
+          <w:lang w:val="en-GB"/>
+        </w:rPr>
+        <w:t xml:space="preserve">&gt; </w:t>
       </w:r>
       <w:proofErr w:type="spellStart"/>
       <w:r>
@@ -9636,31 +9965,95 @@
           <w:rFonts w:ascii="Times New Roman" w:hAnsi="Times New Roman" w:cs="Times New Roman"/>
           <w:lang w:val="en-GB"/>
         </w:rPr>
-        <w:t>boleh</w:t>
-      </w:r>
-      <w:proofErr w:type="spellEnd"/>
-      <w:r>
-        <w:rPr>
-          <w:rFonts w:ascii="Times New Roman" w:hAnsi="Times New Roman" w:cs="Times New Roman"/>
-          <w:lang w:val="en-GB"/>
-        </w:rPr>
-        <w:t xml:space="preserve"> </w:t>
-      </w:r>
-      <w:proofErr w:type="spellStart"/>
-      <w:r>
-        <w:rPr>
-          <w:rFonts w:ascii="Times New Roman" w:hAnsi="Times New Roman" w:cs="Times New Roman"/>
-          <w:lang w:val="en-GB"/>
-        </w:rPr>
-        <w:t>kosong</w:t>
-      </w:r>
-      <w:proofErr w:type="spellEnd"/>
-      <w:r>
-        <w:rPr>
-          <w:rFonts w:ascii="Times New Roman" w:hAnsi="Times New Roman" w:cs="Times New Roman"/>
-          <w:lang w:val="en-GB"/>
-        </w:rPr>
-        <w:t>).</w:t>
+        <w:t>kita</w:t>
+      </w:r>
+      <w:proofErr w:type="spellEnd"/>
+      <w:r>
+        <w:rPr>
+          <w:rFonts w:ascii="Times New Roman" w:hAnsi="Times New Roman" w:cs="Times New Roman"/>
+          <w:lang w:val="en-GB"/>
+        </w:rPr>
+        <w:t xml:space="preserve"> </w:t>
+      </w:r>
+      <w:proofErr w:type="spellStart"/>
+      <w:r>
+        <w:rPr>
+          <w:rFonts w:ascii="Times New Roman" w:hAnsi="Times New Roman" w:cs="Times New Roman"/>
+          <w:lang w:val="en-GB"/>
+        </w:rPr>
+        <w:t>bisa</w:t>
+      </w:r>
+      <w:proofErr w:type="spellEnd"/>
+      <w:r>
+        <w:rPr>
+          <w:rFonts w:ascii="Times New Roman" w:hAnsi="Times New Roman" w:cs="Times New Roman"/>
+          <w:lang w:val="en-GB"/>
+        </w:rPr>
+        <w:t xml:space="preserve"> </w:t>
+      </w:r>
+      <w:proofErr w:type="spellStart"/>
+      <w:r>
+        <w:rPr>
+          <w:rFonts w:ascii="Times New Roman" w:hAnsi="Times New Roman" w:cs="Times New Roman"/>
+          <w:lang w:val="en-GB"/>
+        </w:rPr>
+        <w:t>memasukkan</w:t>
+      </w:r>
+      <w:proofErr w:type="spellEnd"/>
+      <w:r>
+        <w:rPr>
+          <w:rFonts w:ascii="Times New Roman" w:hAnsi="Times New Roman" w:cs="Times New Roman"/>
+          <w:lang w:val="en-GB"/>
+        </w:rPr>
+        <w:t xml:space="preserve"> data </w:t>
+      </w:r>
+      <w:proofErr w:type="spellStart"/>
+      <w:r>
+        <w:rPr>
+          <w:rFonts w:ascii="Times New Roman" w:hAnsi="Times New Roman" w:cs="Times New Roman"/>
+          <w:lang w:val="en-GB"/>
+        </w:rPr>
+        <w:t>meskipun</w:t>
+      </w:r>
+      <w:proofErr w:type="spellEnd"/>
+      <w:r>
+        <w:rPr>
+          <w:rFonts w:ascii="Times New Roman" w:hAnsi="Times New Roman" w:cs="Times New Roman"/>
+          <w:lang w:val="en-GB"/>
+        </w:rPr>
+        <w:t xml:space="preserve"> </w:t>
+      </w:r>
+      <w:proofErr w:type="spellStart"/>
+      <w:r>
+        <w:rPr>
+          <w:rFonts w:ascii="Times New Roman" w:hAnsi="Times New Roman" w:cs="Times New Roman"/>
+          <w:lang w:val="en-GB"/>
+        </w:rPr>
+        <w:t>tidak</w:t>
+      </w:r>
+      <w:proofErr w:type="spellEnd"/>
+      <w:r>
+        <w:rPr>
+          <w:rFonts w:ascii="Times New Roman" w:hAnsi="Times New Roman" w:cs="Times New Roman"/>
+          <w:lang w:val="en-GB"/>
+        </w:rPr>
+        <w:t xml:space="preserve"> </w:t>
+      </w:r>
+      <w:proofErr w:type="spellStart"/>
+      <w:r>
+        <w:rPr>
+          <w:rFonts w:ascii="Times New Roman" w:hAnsi="Times New Roman" w:cs="Times New Roman"/>
+          <w:lang w:val="en-GB"/>
+        </w:rPr>
+        <w:t>lengkap</w:t>
+      </w:r>
+      <w:proofErr w:type="spellEnd"/>
+      <w:r>
+        <w:rPr>
+          <w:rFonts w:ascii="Times New Roman" w:hAnsi="Times New Roman" w:cs="Times New Roman"/>
+          <w:lang w:val="en-GB"/>
+        </w:rPr>
+        <w:t>.</w:t>
       </w:r>
     </w:p>
     <w:p>
@@ -9677,55 +10070,104 @@
           <w:rFonts w:ascii="Times New Roman" w:hAnsi="Times New Roman" w:cs="Times New Roman"/>
           <w:lang w:val="en-GB"/>
         </w:rPr>
-        <w:t xml:space="preserve">  </w:t>
-      </w:r>
-      <w:proofErr w:type="gramStart"/>
-      <w:r>
-        <w:rPr>
-          <w:rFonts w:ascii="Times New Roman" w:hAnsi="Times New Roman" w:cs="Times New Roman"/>
-          <w:lang w:val="en-GB"/>
-        </w:rPr>
-        <w:t>icon?:</w:t>
-      </w:r>
-      <w:proofErr w:type="gramEnd"/>
-      <w:r>
-        <w:rPr>
-          <w:rFonts w:ascii="Times New Roman" w:hAnsi="Times New Roman" w:cs="Times New Roman"/>
-          <w:lang w:val="en-GB"/>
-        </w:rPr>
-        <w:t xml:space="preserve"> </w:t>
-      </w:r>
-      <w:proofErr w:type="gramStart"/>
-      <w:r>
-        <w:rPr>
-          <w:rFonts w:ascii="Times New Roman" w:hAnsi="Times New Roman" w:cs="Times New Roman"/>
-          <w:lang w:val="en-GB"/>
-        </w:rPr>
-        <w:t xml:space="preserve">string;   </w:t>
-      </w:r>
-      <w:proofErr w:type="gramEnd"/>
-      <w:r>
-        <w:rPr>
-          <w:rFonts w:ascii="Times New Roman" w:hAnsi="Times New Roman" w:cs="Times New Roman"/>
-          <w:lang w:val="en-GB"/>
-        </w:rPr>
-        <w:t xml:space="preserve">      # </w:t>
-      </w:r>
-      <w:proofErr w:type="spellStart"/>
-      <w:r>
-        <w:rPr>
-          <w:rFonts w:ascii="Times New Roman" w:hAnsi="Times New Roman" w:cs="Times New Roman"/>
-          <w:lang w:val="en-GB"/>
-        </w:rPr>
-        <w:t>Simbol</w:t>
-      </w:r>
-      <w:proofErr w:type="spellEnd"/>
-      <w:r>
-        <w:rPr>
-          <w:rFonts w:ascii="Times New Roman" w:hAnsi="Times New Roman" w:cs="Times New Roman"/>
-          <w:lang w:val="en-GB"/>
-        </w:rPr>
-        <w:t xml:space="preserve"> </w:t>
+        <w:t xml:space="preserve">  constructor(data: Partial&lt;</w:t>
+      </w:r>
+      <w:proofErr w:type="spellStart"/>
+      <w:r>
+        <w:rPr>
+          <w:rFonts w:ascii="Times New Roman" w:hAnsi="Times New Roman" w:cs="Times New Roman"/>
+          <w:lang w:val="en-GB"/>
+        </w:rPr>
+        <w:t>KategoriEntity</w:t>
+      </w:r>
+      <w:proofErr w:type="spellEnd"/>
+      <w:r>
+        <w:rPr>
+          <w:rFonts w:ascii="Times New Roman" w:hAnsi="Times New Roman" w:cs="Times New Roman"/>
+          <w:lang w:val="en-GB"/>
+        </w:rPr>
+        <w:t>&gt;) {</w:t>
+      </w:r>
+    </w:p>
+    <w:p>
+      <w:pPr>
+        <w:contextualSpacing/>
+        <w:jc w:val="both"/>
+        <w:rPr>
+          <w:rFonts w:ascii="Times New Roman" w:hAnsi="Times New Roman" w:cs="Times New Roman"/>
+          <w:lang w:val="en-GB"/>
+        </w:rPr>
+      </w:pPr>
+      <w:r>
+        <w:rPr>
+          <w:rFonts w:ascii="Times New Roman" w:hAnsi="Times New Roman" w:cs="Times New Roman"/>
+          <w:lang w:val="en-GB"/>
+        </w:rPr>
+        <w:t xml:space="preserve">    # </w:t>
+      </w:r>
+      <w:proofErr w:type="spellStart"/>
+      <w:r>
+        <w:rPr>
+          <w:rFonts w:ascii="Times New Roman" w:hAnsi="Times New Roman" w:cs="Times New Roman"/>
+          <w:lang w:val="en-GB"/>
+        </w:rPr>
+        <w:t>Object.assign</w:t>
+      </w:r>
+      <w:proofErr w:type="spellEnd"/>
+      <w:r>
+        <w:rPr>
+          <w:rFonts w:ascii="Times New Roman" w:hAnsi="Times New Roman" w:cs="Times New Roman"/>
+          <w:lang w:val="en-GB"/>
+        </w:rPr>
+        <w:t xml:space="preserve"> </w:t>
+      </w:r>
+      <w:proofErr w:type="spellStart"/>
+      <w:r>
+        <w:rPr>
+          <w:rFonts w:ascii="Times New Roman" w:hAnsi="Times New Roman" w:cs="Times New Roman"/>
+          <w:lang w:val="en-GB"/>
+        </w:rPr>
+        <w:t>berfungsi</w:t>
+      </w:r>
+      <w:proofErr w:type="spellEnd"/>
+      <w:r>
+        <w:rPr>
+          <w:rFonts w:ascii="Times New Roman" w:hAnsi="Times New Roman" w:cs="Times New Roman"/>
+          <w:lang w:val="en-GB"/>
+        </w:rPr>
+        <w:t xml:space="preserve"> </w:t>
+      </w:r>
+      <w:proofErr w:type="spellStart"/>
+      <w:r>
+        <w:rPr>
+          <w:rFonts w:ascii="Times New Roman" w:hAnsi="Times New Roman" w:cs="Times New Roman"/>
+          <w:lang w:val="en-GB"/>
+        </w:rPr>
+        <w:t>untuk</w:t>
+      </w:r>
+      <w:proofErr w:type="spellEnd"/>
+      <w:r>
+        <w:rPr>
+          <w:rFonts w:ascii="Times New Roman" w:hAnsi="Times New Roman" w:cs="Times New Roman"/>
+          <w:lang w:val="en-GB"/>
+        </w:rPr>
+        <w:t xml:space="preserve"> '</w:t>
+      </w:r>
+      <w:proofErr w:type="spellStart"/>
+      <w:r>
+        <w:rPr>
+          <w:rFonts w:ascii="Times New Roman" w:hAnsi="Times New Roman" w:cs="Times New Roman"/>
+          <w:lang w:val="en-GB"/>
+        </w:rPr>
+        <w:t>memberikan</w:t>
+      </w:r>
+      <w:proofErr w:type="spellEnd"/>
+      <w:r>
+        <w:rPr>
+          <w:rFonts w:ascii="Times New Roman" w:hAnsi="Times New Roman" w:cs="Times New Roman"/>
+          <w:lang w:val="en-GB"/>
+        </w:rPr>
+        <w:t xml:space="preserve">' </w:t>
       </w:r>
       <w:proofErr w:type="spellStart"/>
       <w:r>
@@ -9749,63 +10191,31 @@
           <w:rFonts w:ascii="Times New Roman" w:hAnsi="Times New Roman" w:cs="Times New Roman"/>
           <w:lang w:val="en-GB"/>
         </w:rPr>
-        <w:t>gambar</w:t>
-      </w:r>
-      <w:proofErr w:type="spellEnd"/>
-      <w:r>
-        <w:rPr>
-          <w:rFonts w:ascii="Times New Roman" w:hAnsi="Times New Roman" w:cs="Times New Roman"/>
-          <w:lang w:val="en-GB"/>
-        </w:rPr>
-        <w:t xml:space="preserve"> </w:t>
-      </w:r>
-      <w:proofErr w:type="spellStart"/>
-      <w:r>
-        <w:rPr>
-          <w:rFonts w:ascii="Times New Roman" w:hAnsi="Times New Roman" w:cs="Times New Roman"/>
-          <w:lang w:val="en-GB"/>
-        </w:rPr>
-        <w:t>kecil</w:t>
-      </w:r>
-      <w:proofErr w:type="spellEnd"/>
-      <w:r>
-        <w:rPr>
-          <w:rFonts w:ascii="Times New Roman" w:hAnsi="Times New Roman" w:cs="Times New Roman"/>
-          <w:lang w:val="en-GB"/>
-        </w:rPr>
-        <w:t xml:space="preserve"> </w:t>
-      </w:r>
-      <w:proofErr w:type="spellStart"/>
-      <w:r>
-        <w:rPr>
-          <w:rFonts w:ascii="Times New Roman" w:hAnsi="Times New Roman" w:cs="Times New Roman"/>
-          <w:lang w:val="en-GB"/>
-        </w:rPr>
-        <w:t>untuk</w:t>
-      </w:r>
-      <w:proofErr w:type="spellEnd"/>
-      <w:r>
-        <w:rPr>
-          <w:rFonts w:ascii="Times New Roman" w:hAnsi="Times New Roman" w:cs="Times New Roman"/>
-          <w:lang w:val="en-GB"/>
-        </w:rPr>
-        <w:t xml:space="preserve"> </w:t>
-      </w:r>
-      <w:proofErr w:type="spellStart"/>
-      <w:r>
-        <w:rPr>
-          <w:rFonts w:ascii="Times New Roman" w:hAnsi="Times New Roman" w:cs="Times New Roman"/>
-          <w:lang w:val="en-GB"/>
-        </w:rPr>
-        <w:t>kategori</w:t>
-      </w:r>
-      <w:proofErr w:type="spellEnd"/>
-      <w:r>
-        <w:rPr>
-          <w:rFonts w:ascii="Times New Roman" w:hAnsi="Times New Roman" w:cs="Times New Roman"/>
-          <w:lang w:val="en-GB"/>
-        </w:rPr>
-        <w:t>.</w:t>
+        <w:t>mengisi</w:t>
+      </w:r>
+      <w:proofErr w:type="spellEnd"/>
+      <w:r>
+        <w:rPr>
+          <w:rFonts w:ascii="Times New Roman" w:hAnsi="Times New Roman" w:cs="Times New Roman"/>
+          <w:lang w:val="en-GB"/>
+        </w:rPr>
+        <w:t xml:space="preserve"> </w:t>
+      </w:r>
+      <w:proofErr w:type="spellStart"/>
+      <w:r>
+        <w:rPr>
+          <w:rFonts w:ascii="Times New Roman" w:hAnsi="Times New Roman" w:cs="Times New Roman"/>
+          <w:lang w:val="en-GB"/>
+        </w:rPr>
+        <w:t>kolom-kolom</w:t>
+      </w:r>
+      <w:proofErr w:type="spellEnd"/>
+      <w:r>
+        <w:rPr>
+          <w:rFonts w:ascii="Times New Roman" w:hAnsi="Times New Roman" w:cs="Times New Roman"/>
+          <w:lang w:val="en-GB"/>
+        </w:rPr>
+        <w:t xml:space="preserve"> </w:t>
       </w:r>
     </w:p>
     <w:p>
@@ -9822,711 +10232,7 @@
           <w:rFonts w:ascii="Times New Roman" w:hAnsi="Times New Roman" w:cs="Times New Roman"/>
           <w:lang w:val="en-GB"/>
         </w:rPr>
-        <w:t xml:space="preserve">  </w:t>
-      </w:r>
-      <w:proofErr w:type="spellStart"/>
-      <w:r>
-        <w:rPr>
-          <w:rFonts w:ascii="Times New Roman" w:hAnsi="Times New Roman" w:cs="Times New Roman"/>
-          <w:lang w:val="en-GB"/>
-        </w:rPr>
-        <w:t>createdAt</w:t>
-      </w:r>
-      <w:proofErr w:type="spellEnd"/>
-      <w:r>
-        <w:rPr>
-          <w:rFonts w:ascii="Times New Roman" w:hAnsi="Times New Roman" w:cs="Times New Roman"/>
-          <w:lang w:val="en-GB"/>
-        </w:rPr>
-        <w:t xml:space="preserve">: </w:t>
-      </w:r>
-      <w:proofErr w:type="gramStart"/>
-      <w:r>
-        <w:rPr>
-          <w:rFonts w:ascii="Times New Roman" w:hAnsi="Times New Roman" w:cs="Times New Roman"/>
-          <w:lang w:val="en-GB"/>
-        </w:rPr>
-        <w:t xml:space="preserve">Date;   </w:t>
-      </w:r>
-      <w:proofErr w:type="gramEnd"/>
-      <w:r>
-        <w:rPr>
-          <w:rFonts w:ascii="Times New Roman" w:hAnsi="Times New Roman" w:cs="Times New Roman"/>
-          <w:lang w:val="en-GB"/>
-        </w:rPr>
-        <w:t xml:space="preserve">    # </w:t>
-      </w:r>
-      <w:proofErr w:type="spellStart"/>
-      <w:r>
-        <w:rPr>
-          <w:rFonts w:ascii="Times New Roman" w:hAnsi="Times New Roman" w:cs="Times New Roman"/>
-          <w:lang w:val="en-GB"/>
-        </w:rPr>
-        <w:t>Catatan</w:t>
-      </w:r>
-      <w:proofErr w:type="spellEnd"/>
-      <w:r>
-        <w:rPr>
-          <w:rFonts w:ascii="Times New Roman" w:hAnsi="Times New Roman" w:cs="Times New Roman"/>
-          <w:lang w:val="en-GB"/>
-        </w:rPr>
-        <w:t xml:space="preserve"> </w:t>
-      </w:r>
-      <w:proofErr w:type="spellStart"/>
-      <w:r>
-        <w:rPr>
-          <w:rFonts w:ascii="Times New Roman" w:hAnsi="Times New Roman" w:cs="Times New Roman"/>
-          <w:lang w:val="en-GB"/>
-        </w:rPr>
-        <w:t>waktu</w:t>
-      </w:r>
-      <w:proofErr w:type="spellEnd"/>
-      <w:r>
-        <w:rPr>
-          <w:rFonts w:ascii="Times New Roman" w:hAnsi="Times New Roman" w:cs="Times New Roman"/>
-          <w:lang w:val="en-GB"/>
-        </w:rPr>
-        <w:t xml:space="preserve"> </w:t>
-      </w:r>
-      <w:proofErr w:type="spellStart"/>
-      <w:r>
-        <w:rPr>
-          <w:rFonts w:ascii="Times New Roman" w:hAnsi="Times New Roman" w:cs="Times New Roman"/>
-          <w:lang w:val="en-GB"/>
-        </w:rPr>
-        <w:t>kapan</w:t>
-      </w:r>
-      <w:proofErr w:type="spellEnd"/>
-      <w:r>
-        <w:rPr>
-          <w:rFonts w:ascii="Times New Roman" w:hAnsi="Times New Roman" w:cs="Times New Roman"/>
-          <w:lang w:val="en-GB"/>
-        </w:rPr>
-        <w:t xml:space="preserve"> </w:t>
-      </w:r>
-      <w:proofErr w:type="spellStart"/>
-      <w:r>
-        <w:rPr>
-          <w:rFonts w:ascii="Times New Roman" w:hAnsi="Times New Roman" w:cs="Times New Roman"/>
-          <w:lang w:val="en-GB"/>
-        </w:rPr>
-        <w:t>kategori</w:t>
-      </w:r>
-      <w:proofErr w:type="spellEnd"/>
-      <w:r>
-        <w:rPr>
-          <w:rFonts w:ascii="Times New Roman" w:hAnsi="Times New Roman" w:cs="Times New Roman"/>
-          <w:lang w:val="en-GB"/>
-        </w:rPr>
-        <w:t xml:space="preserve"> </w:t>
-      </w:r>
-      <w:proofErr w:type="spellStart"/>
-      <w:r>
-        <w:rPr>
-          <w:rFonts w:ascii="Times New Roman" w:hAnsi="Times New Roman" w:cs="Times New Roman"/>
-          <w:lang w:val="en-GB"/>
-        </w:rPr>
-        <w:t>ini</w:t>
-      </w:r>
-      <w:proofErr w:type="spellEnd"/>
-      <w:r>
-        <w:rPr>
-          <w:rFonts w:ascii="Times New Roman" w:hAnsi="Times New Roman" w:cs="Times New Roman"/>
-          <w:lang w:val="en-GB"/>
-        </w:rPr>
-        <w:t xml:space="preserve"> </w:t>
-      </w:r>
-      <w:proofErr w:type="spellStart"/>
-      <w:r>
-        <w:rPr>
-          <w:rFonts w:ascii="Times New Roman" w:hAnsi="Times New Roman" w:cs="Times New Roman"/>
-          <w:lang w:val="en-GB"/>
-        </w:rPr>
-        <w:t>dibuat</w:t>
-      </w:r>
-      <w:proofErr w:type="spellEnd"/>
-      <w:r>
-        <w:rPr>
-          <w:rFonts w:ascii="Times New Roman" w:hAnsi="Times New Roman" w:cs="Times New Roman"/>
-          <w:lang w:val="en-GB"/>
-        </w:rPr>
-        <w:t>.</w:t>
-      </w:r>
-    </w:p>
-    <w:p>
-      <w:pPr>
-        <w:contextualSpacing/>
-        <w:jc w:val="both"/>
-        <w:rPr>
-          <w:rFonts w:ascii="Times New Roman" w:hAnsi="Times New Roman" w:cs="Times New Roman"/>
-          <w:lang w:val="en-GB"/>
-        </w:rPr>
-      </w:pPr>
-      <w:r>
-        <w:rPr>
-          <w:rFonts w:ascii="Times New Roman" w:hAnsi="Times New Roman" w:cs="Times New Roman"/>
-          <w:lang w:val="en-GB"/>
-        </w:rPr>
-        <w:t xml:space="preserve">  </w:t>
-      </w:r>
-      <w:proofErr w:type="spellStart"/>
-      <w:r>
-        <w:rPr>
-          <w:rFonts w:ascii="Times New Roman" w:hAnsi="Times New Roman" w:cs="Times New Roman"/>
-          <w:lang w:val="en-GB"/>
-        </w:rPr>
-        <w:t>updatedAt</w:t>
-      </w:r>
-      <w:proofErr w:type="spellEnd"/>
-      <w:r>
-        <w:rPr>
-          <w:rFonts w:ascii="Times New Roman" w:hAnsi="Times New Roman" w:cs="Times New Roman"/>
-          <w:lang w:val="en-GB"/>
-        </w:rPr>
-        <w:t xml:space="preserve">: </w:t>
-      </w:r>
-      <w:proofErr w:type="gramStart"/>
-      <w:r>
-        <w:rPr>
-          <w:rFonts w:ascii="Times New Roman" w:hAnsi="Times New Roman" w:cs="Times New Roman"/>
-          <w:lang w:val="en-GB"/>
-        </w:rPr>
-        <w:t xml:space="preserve">Date;   </w:t>
-      </w:r>
-      <w:proofErr w:type="gramEnd"/>
-      <w:r>
-        <w:rPr>
-          <w:rFonts w:ascii="Times New Roman" w:hAnsi="Times New Roman" w:cs="Times New Roman"/>
-          <w:lang w:val="en-GB"/>
-        </w:rPr>
-        <w:t xml:space="preserve">    # </w:t>
-      </w:r>
-      <w:proofErr w:type="spellStart"/>
-      <w:r>
-        <w:rPr>
-          <w:rFonts w:ascii="Times New Roman" w:hAnsi="Times New Roman" w:cs="Times New Roman"/>
-          <w:lang w:val="en-GB"/>
-        </w:rPr>
-        <w:t>Catatan</w:t>
-      </w:r>
-      <w:proofErr w:type="spellEnd"/>
-      <w:r>
-        <w:rPr>
-          <w:rFonts w:ascii="Times New Roman" w:hAnsi="Times New Roman" w:cs="Times New Roman"/>
-          <w:lang w:val="en-GB"/>
-        </w:rPr>
-        <w:t xml:space="preserve"> </w:t>
-      </w:r>
-      <w:proofErr w:type="spellStart"/>
-      <w:r>
-        <w:rPr>
-          <w:rFonts w:ascii="Times New Roman" w:hAnsi="Times New Roman" w:cs="Times New Roman"/>
-          <w:lang w:val="en-GB"/>
-        </w:rPr>
-        <w:t>waktu</w:t>
-      </w:r>
-      <w:proofErr w:type="spellEnd"/>
-      <w:r>
-        <w:rPr>
-          <w:rFonts w:ascii="Times New Roman" w:hAnsi="Times New Roman" w:cs="Times New Roman"/>
-          <w:lang w:val="en-GB"/>
-        </w:rPr>
-        <w:t xml:space="preserve"> kapan </w:t>
-      </w:r>
-      <w:proofErr w:type="spellStart"/>
-      <w:r>
-        <w:rPr>
-          <w:rFonts w:ascii="Times New Roman" w:hAnsi="Times New Roman" w:cs="Times New Roman"/>
-          <w:lang w:val="en-GB"/>
-        </w:rPr>
-        <w:t>terakhir</w:t>
-      </w:r>
-      <w:proofErr w:type="spellEnd"/>
-      <w:r>
-        <w:rPr>
-          <w:rFonts w:ascii="Times New Roman" w:hAnsi="Times New Roman" w:cs="Times New Roman"/>
-          <w:lang w:val="en-GB"/>
-        </w:rPr>
-        <w:t xml:space="preserve"> kali data </w:t>
-      </w:r>
-      <w:proofErr w:type="spellStart"/>
-      <w:r>
-        <w:rPr>
-          <w:rFonts w:ascii="Times New Roman" w:hAnsi="Times New Roman" w:cs="Times New Roman"/>
-          <w:lang w:val="en-GB"/>
-        </w:rPr>
-        <w:t>diubah</w:t>
-      </w:r>
-      <w:proofErr w:type="spellEnd"/>
-      <w:r>
-        <w:rPr>
-          <w:rFonts w:ascii="Times New Roman" w:hAnsi="Times New Roman" w:cs="Times New Roman"/>
-          <w:lang w:val="en-GB"/>
-        </w:rPr>
-        <w:t>.</w:t>
-      </w:r>
-    </w:p>
-    <w:p>
-      <w:pPr>
-        <w:contextualSpacing/>
-        <w:jc w:val="both"/>
-        <w:rPr>
-          <w:rFonts w:ascii="Times New Roman" w:hAnsi="Times New Roman" w:cs="Times New Roman"/>
-          <w:lang w:val="en-GB"/>
-        </w:rPr>
-      </w:pPr>
-    </w:p>
-    <w:p>
-      <w:pPr>
-        <w:contextualSpacing/>
-        <w:jc w:val="both"/>
-        <w:rPr>
-          <w:rFonts w:ascii="Times New Roman" w:hAnsi="Times New Roman" w:cs="Times New Roman"/>
-          <w:lang w:val="en-GB"/>
-        </w:rPr>
-      </w:pPr>
-      <w:r>
-        <w:rPr>
-          <w:rFonts w:ascii="Times New Roman" w:hAnsi="Times New Roman" w:cs="Times New Roman"/>
-          <w:lang w:val="en-GB"/>
-        </w:rPr>
-        <w:t xml:space="preserve">  # Constructor </w:t>
-      </w:r>
-      <w:proofErr w:type="spellStart"/>
-      <w:r>
-        <w:rPr>
-          <w:rFonts w:ascii="Times New Roman" w:hAnsi="Times New Roman" w:cs="Times New Roman"/>
-          <w:lang w:val="en-GB"/>
-        </w:rPr>
-        <w:t>adalah</w:t>
-      </w:r>
-      <w:proofErr w:type="spellEnd"/>
-      <w:r>
-        <w:rPr>
-          <w:rFonts w:ascii="Times New Roman" w:hAnsi="Times New Roman" w:cs="Times New Roman"/>
-          <w:lang w:val="en-GB"/>
-        </w:rPr>
-        <w:t xml:space="preserve"> </w:t>
-      </w:r>
-      <w:proofErr w:type="spellStart"/>
-      <w:r>
-        <w:rPr>
-          <w:rFonts w:ascii="Times New Roman" w:hAnsi="Times New Roman" w:cs="Times New Roman"/>
-          <w:lang w:val="en-GB"/>
-        </w:rPr>
-        <w:t>mesin</w:t>
-      </w:r>
-      <w:proofErr w:type="spellEnd"/>
-      <w:r>
-        <w:rPr>
-          <w:rFonts w:ascii="Times New Roman" w:hAnsi="Times New Roman" w:cs="Times New Roman"/>
-          <w:lang w:val="en-GB"/>
-        </w:rPr>
-        <w:t xml:space="preserve"> </w:t>
-      </w:r>
-      <w:proofErr w:type="spellStart"/>
-      <w:r>
-        <w:rPr>
-          <w:rFonts w:ascii="Times New Roman" w:hAnsi="Times New Roman" w:cs="Times New Roman"/>
-          <w:lang w:val="en-GB"/>
-        </w:rPr>
-        <w:t>pembuat</w:t>
-      </w:r>
-      <w:proofErr w:type="spellEnd"/>
-      <w:r>
-        <w:rPr>
-          <w:rFonts w:ascii="Times New Roman" w:hAnsi="Times New Roman" w:cs="Times New Roman"/>
-          <w:lang w:val="en-GB"/>
-        </w:rPr>
-        <w:t xml:space="preserve"> </w:t>
-      </w:r>
-      <w:proofErr w:type="spellStart"/>
-      <w:r>
-        <w:rPr>
-          <w:rFonts w:ascii="Times New Roman" w:hAnsi="Times New Roman" w:cs="Times New Roman"/>
-          <w:lang w:val="en-GB"/>
-        </w:rPr>
-        <w:t>objek</w:t>
-      </w:r>
-      <w:proofErr w:type="spellEnd"/>
-      <w:r>
-        <w:rPr>
-          <w:rFonts w:ascii="Times New Roman" w:hAnsi="Times New Roman" w:cs="Times New Roman"/>
-          <w:lang w:val="en-GB"/>
-        </w:rPr>
-        <w:t xml:space="preserve"> </w:t>
-      </w:r>
-      <w:proofErr w:type="spellStart"/>
-      <w:r>
-        <w:rPr>
-          <w:rFonts w:ascii="Times New Roman" w:hAnsi="Times New Roman" w:cs="Times New Roman"/>
-          <w:lang w:val="en-GB"/>
-        </w:rPr>
-        <w:t>otomatis</w:t>
-      </w:r>
-      <w:proofErr w:type="spellEnd"/>
-      <w:r>
-        <w:rPr>
-          <w:rFonts w:ascii="Times New Roman" w:hAnsi="Times New Roman" w:cs="Times New Roman"/>
-          <w:lang w:val="en-GB"/>
-        </w:rPr>
-        <w:t>.</w:t>
-      </w:r>
-    </w:p>
-    <w:p>
-      <w:pPr>
-        <w:contextualSpacing/>
-        <w:jc w:val="both"/>
-        <w:rPr>
-          <w:rFonts w:ascii="Times New Roman" w:hAnsi="Times New Roman" w:cs="Times New Roman"/>
-          <w:lang w:val="en-GB"/>
-        </w:rPr>
-      </w:pPr>
-      <w:r>
-        <w:rPr>
-          <w:rFonts w:ascii="Times New Roman" w:hAnsi="Times New Roman" w:cs="Times New Roman"/>
-          <w:lang w:val="en-GB"/>
-        </w:rPr>
-        <w:t xml:space="preserve">  # Partial&lt;</w:t>
-      </w:r>
-      <w:proofErr w:type="spellStart"/>
-      <w:r>
-        <w:rPr>
-          <w:rFonts w:ascii="Times New Roman" w:hAnsi="Times New Roman" w:cs="Times New Roman"/>
-          <w:lang w:val="en-GB"/>
-        </w:rPr>
-        <w:t>KategoriEntity</w:t>
-      </w:r>
-      <w:proofErr w:type="spellEnd"/>
-      <w:r>
-        <w:rPr>
-          <w:rFonts w:ascii="Times New Roman" w:hAnsi="Times New Roman" w:cs="Times New Roman"/>
-          <w:lang w:val="en-GB"/>
-        </w:rPr>
-        <w:t xml:space="preserve">&gt; </w:t>
-      </w:r>
-      <w:proofErr w:type="spellStart"/>
-      <w:r>
-        <w:rPr>
-          <w:rFonts w:ascii="Times New Roman" w:hAnsi="Times New Roman" w:cs="Times New Roman"/>
-          <w:lang w:val="en-GB"/>
-        </w:rPr>
-        <w:t>artinya</w:t>
-      </w:r>
-      <w:proofErr w:type="spellEnd"/>
-      <w:r>
-        <w:rPr>
-          <w:rFonts w:ascii="Times New Roman" w:hAnsi="Times New Roman" w:cs="Times New Roman"/>
-          <w:lang w:val="en-GB"/>
-        </w:rPr>
-        <w:t xml:space="preserve"> </w:t>
-      </w:r>
-      <w:proofErr w:type="spellStart"/>
-      <w:r>
-        <w:rPr>
-          <w:rFonts w:ascii="Times New Roman" w:hAnsi="Times New Roman" w:cs="Times New Roman"/>
-          <w:lang w:val="en-GB"/>
-        </w:rPr>
-        <w:t>kita</w:t>
-      </w:r>
-      <w:proofErr w:type="spellEnd"/>
-      <w:r>
-        <w:rPr>
-          <w:rFonts w:ascii="Times New Roman" w:hAnsi="Times New Roman" w:cs="Times New Roman"/>
-          <w:lang w:val="en-GB"/>
-        </w:rPr>
-        <w:t xml:space="preserve"> </w:t>
-      </w:r>
-      <w:proofErr w:type="spellStart"/>
-      <w:r>
-        <w:rPr>
-          <w:rFonts w:ascii="Times New Roman" w:hAnsi="Times New Roman" w:cs="Times New Roman"/>
-          <w:lang w:val="en-GB"/>
-        </w:rPr>
-        <w:t>bisa</w:t>
-      </w:r>
-      <w:proofErr w:type="spellEnd"/>
-      <w:r>
-        <w:rPr>
-          <w:rFonts w:ascii="Times New Roman" w:hAnsi="Times New Roman" w:cs="Times New Roman"/>
-          <w:lang w:val="en-GB"/>
-        </w:rPr>
-        <w:t xml:space="preserve"> </w:t>
-      </w:r>
-      <w:proofErr w:type="spellStart"/>
-      <w:r>
-        <w:rPr>
-          <w:rFonts w:ascii="Times New Roman" w:hAnsi="Times New Roman" w:cs="Times New Roman"/>
-          <w:lang w:val="en-GB"/>
-        </w:rPr>
-        <w:t>memasukkan</w:t>
-      </w:r>
-      <w:proofErr w:type="spellEnd"/>
-      <w:r>
-        <w:rPr>
-          <w:rFonts w:ascii="Times New Roman" w:hAnsi="Times New Roman" w:cs="Times New Roman"/>
-          <w:lang w:val="en-GB"/>
-        </w:rPr>
-        <w:t xml:space="preserve"> data </w:t>
-      </w:r>
-      <w:proofErr w:type="spellStart"/>
-      <w:r>
-        <w:rPr>
-          <w:rFonts w:ascii="Times New Roman" w:hAnsi="Times New Roman" w:cs="Times New Roman"/>
-          <w:lang w:val="en-GB"/>
-        </w:rPr>
-        <w:t>meskipun</w:t>
-      </w:r>
-      <w:proofErr w:type="spellEnd"/>
-      <w:r>
-        <w:rPr>
-          <w:rFonts w:ascii="Times New Roman" w:hAnsi="Times New Roman" w:cs="Times New Roman"/>
-          <w:lang w:val="en-GB"/>
-        </w:rPr>
-        <w:t xml:space="preserve"> </w:t>
-      </w:r>
-      <w:proofErr w:type="spellStart"/>
-      <w:r>
-        <w:rPr>
-          <w:rFonts w:ascii="Times New Roman" w:hAnsi="Times New Roman" w:cs="Times New Roman"/>
-          <w:lang w:val="en-GB"/>
-        </w:rPr>
-        <w:t>tidak</w:t>
-      </w:r>
-      <w:proofErr w:type="spellEnd"/>
-      <w:r>
-        <w:rPr>
-          <w:rFonts w:ascii="Times New Roman" w:hAnsi="Times New Roman" w:cs="Times New Roman"/>
-          <w:lang w:val="en-GB"/>
-        </w:rPr>
-        <w:t xml:space="preserve"> </w:t>
-      </w:r>
-      <w:proofErr w:type="spellStart"/>
-      <w:r>
-        <w:rPr>
-          <w:rFonts w:ascii="Times New Roman" w:hAnsi="Times New Roman" w:cs="Times New Roman"/>
-          <w:lang w:val="en-GB"/>
-        </w:rPr>
-        <w:t>lengkap</w:t>
-      </w:r>
-      <w:proofErr w:type="spellEnd"/>
-      <w:r>
-        <w:rPr>
-          <w:rFonts w:ascii="Times New Roman" w:hAnsi="Times New Roman" w:cs="Times New Roman"/>
-          <w:lang w:val="en-GB"/>
-        </w:rPr>
-        <w:t>.</w:t>
-      </w:r>
-    </w:p>
-    <w:p>
-      <w:pPr>
-        <w:contextualSpacing/>
-        <w:jc w:val="both"/>
-        <w:rPr>
-          <w:rFonts w:ascii="Times New Roman" w:hAnsi="Times New Roman" w:cs="Times New Roman"/>
-          <w:lang w:val="en-GB"/>
-        </w:rPr>
-      </w:pPr>
-      <w:r>
-        <w:rPr>
-          <w:rFonts w:ascii="Times New Roman" w:hAnsi="Times New Roman" w:cs="Times New Roman"/>
-          <w:lang w:val="en-GB"/>
-        </w:rPr>
-        <w:t xml:space="preserve">  </w:t>
-      </w:r>
-      <w:proofErr w:type="gramStart"/>
-      <w:r>
-        <w:rPr>
-          <w:rFonts w:ascii="Times New Roman" w:hAnsi="Times New Roman" w:cs="Times New Roman"/>
-          <w:lang w:val="en-GB"/>
-        </w:rPr>
-        <w:t>constructor(</w:t>
-      </w:r>
-      <w:proofErr w:type="gramEnd"/>
-      <w:r>
-        <w:rPr>
-          <w:rFonts w:ascii="Times New Roman" w:hAnsi="Times New Roman" w:cs="Times New Roman"/>
-          <w:lang w:val="en-GB"/>
-        </w:rPr>
-        <w:t>data: Partial&lt;</w:t>
-      </w:r>
-      <w:proofErr w:type="spellStart"/>
-      <w:r>
-        <w:rPr>
-          <w:rFonts w:ascii="Times New Roman" w:hAnsi="Times New Roman" w:cs="Times New Roman"/>
-          <w:lang w:val="en-GB"/>
-        </w:rPr>
-        <w:t>KategoriEntity</w:t>
-      </w:r>
-      <w:proofErr w:type="spellEnd"/>
-      <w:r>
-        <w:rPr>
-          <w:rFonts w:ascii="Times New Roman" w:hAnsi="Times New Roman" w:cs="Times New Roman"/>
-          <w:lang w:val="en-GB"/>
-        </w:rPr>
-        <w:t>&gt;) {</w:t>
-      </w:r>
-    </w:p>
-    <w:p>
-      <w:pPr>
-        <w:contextualSpacing/>
-        <w:jc w:val="both"/>
-        <w:rPr>
-          <w:rFonts w:ascii="Times New Roman" w:hAnsi="Times New Roman" w:cs="Times New Roman"/>
-          <w:lang w:val="en-GB"/>
-        </w:rPr>
-      </w:pPr>
-      <w:r>
-        <w:rPr>
-          <w:rFonts w:ascii="Times New Roman" w:hAnsi="Times New Roman" w:cs="Times New Roman"/>
-          <w:lang w:val="en-GB"/>
-        </w:rPr>
-        <w:t xml:space="preserve">    # </w:t>
-      </w:r>
-      <w:proofErr w:type="spellStart"/>
-      <w:r>
-        <w:rPr>
-          <w:rFonts w:ascii="Times New Roman" w:hAnsi="Times New Roman" w:cs="Times New Roman"/>
-          <w:lang w:val="en-GB"/>
-        </w:rPr>
-        <w:t>Object.assign</w:t>
-      </w:r>
-      <w:proofErr w:type="spellEnd"/>
-      <w:r>
-        <w:rPr>
-          <w:rFonts w:ascii="Times New Roman" w:hAnsi="Times New Roman" w:cs="Times New Roman"/>
-          <w:lang w:val="en-GB"/>
-        </w:rPr>
-        <w:t xml:space="preserve"> </w:t>
-      </w:r>
-      <w:proofErr w:type="spellStart"/>
-      <w:r>
-        <w:rPr>
-          <w:rFonts w:ascii="Times New Roman" w:hAnsi="Times New Roman" w:cs="Times New Roman"/>
-          <w:lang w:val="en-GB"/>
-        </w:rPr>
-        <w:t>berfungsi</w:t>
-      </w:r>
-      <w:proofErr w:type="spellEnd"/>
-      <w:r>
-        <w:rPr>
-          <w:rFonts w:ascii="Times New Roman" w:hAnsi="Times New Roman" w:cs="Times New Roman"/>
-          <w:lang w:val="en-GB"/>
-        </w:rPr>
-        <w:t xml:space="preserve"> </w:t>
-      </w:r>
-      <w:proofErr w:type="spellStart"/>
-      <w:r>
-        <w:rPr>
-          <w:rFonts w:ascii="Times New Roman" w:hAnsi="Times New Roman" w:cs="Times New Roman"/>
-          <w:lang w:val="en-GB"/>
-        </w:rPr>
-        <w:t>untuk</w:t>
-      </w:r>
-      <w:proofErr w:type="spellEnd"/>
-      <w:r>
-        <w:rPr>
-          <w:rFonts w:ascii="Times New Roman" w:hAnsi="Times New Roman" w:cs="Times New Roman"/>
-          <w:lang w:val="en-GB"/>
-        </w:rPr>
-        <w:t xml:space="preserve"> '</w:t>
-      </w:r>
-      <w:proofErr w:type="spellStart"/>
-      <w:r>
-        <w:rPr>
-          <w:rFonts w:ascii="Times New Roman" w:hAnsi="Times New Roman" w:cs="Times New Roman"/>
-          <w:lang w:val="en-GB"/>
-        </w:rPr>
-        <w:t>memberikan</w:t>
-      </w:r>
-      <w:proofErr w:type="spellEnd"/>
-      <w:r>
-        <w:rPr>
-          <w:rFonts w:ascii="Times New Roman" w:hAnsi="Times New Roman" w:cs="Times New Roman"/>
-          <w:lang w:val="en-GB"/>
-        </w:rPr>
-        <w:t xml:space="preserve">' </w:t>
-      </w:r>
-      <w:proofErr w:type="spellStart"/>
-      <w:r>
-        <w:rPr>
-          <w:rFonts w:ascii="Times New Roman" w:hAnsi="Times New Roman" w:cs="Times New Roman"/>
-          <w:lang w:val="en-GB"/>
-        </w:rPr>
-        <w:t>atau</w:t>
-      </w:r>
-      <w:proofErr w:type="spellEnd"/>
-      <w:r>
-        <w:rPr>
-          <w:rFonts w:ascii="Times New Roman" w:hAnsi="Times New Roman" w:cs="Times New Roman"/>
-          <w:lang w:val="en-GB"/>
-        </w:rPr>
-        <w:t xml:space="preserve"> </w:t>
-      </w:r>
-      <w:proofErr w:type="spellStart"/>
-      <w:r>
-        <w:rPr>
-          <w:rFonts w:ascii="Times New Roman" w:hAnsi="Times New Roman" w:cs="Times New Roman"/>
-          <w:lang w:val="en-GB"/>
-        </w:rPr>
-        <w:t>mengisi</w:t>
-      </w:r>
-      <w:proofErr w:type="spellEnd"/>
-      <w:r>
-        <w:rPr>
-          <w:rFonts w:ascii="Times New Roman" w:hAnsi="Times New Roman" w:cs="Times New Roman"/>
-          <w:lang w:val="en-GB"/>
-        </w:rPr>
-        <w:t xml:space="preserve"> </w:t>
-      </w:r>
-      <w:proofErr w:type="spellStart"/>
-      <w:r>
-        <w:rPr>
-          <w:rFonts w:ascii="Times New Roman" w:hAnsi="Times New Roman" w:cs="Times New Roman"/>
-          <w:lang w:val="en-GB"/>
-        </w:rPr>
-        <w:t>kolom-kolom</w:t>
-      </w:r>
-      <w:proofErr w:type="spellEnd"/>
-      <w:r>
-        <w:rPr>
-          <w:rFonts w:ascii="Times New Roman" w:hAnsi="Times New Roman" w:cs="Times New Roman"/>
-          <w:lang w:val="en-GB"/>
-        </w:rPr>
-        <w:t xml:space="preserve"> </w:t>
-      </w:r>
-    </w:p>
-    <w:p>
-      <w:pPr>
-        <w:contextualSpacing/>
-        <w:jc w:val="both"/>
-        <w:rPr>
-          <w:rFonts w:ascii="Times New Roman" w:hAnsi="Times New Roman" w:cs="Times New Roman"/>
-          <w:lang w:val="en-GB"/>
-        </w:rPr>
-      </w:pPr>
-      <w:r>
-        <w:rPr>
-          <w:rFonts w:ascii="Times New Roman" w:hAnsi="Times New Roman" w:cs="Times New Roman"/>
-          <w:lang w:val="en-GB"/>
-        </w:rPr>
-        <w:t xml:space="preserve">    # </w:t>
-      </w:r>
-      <w:proofErr w:type="gramStart"/>
-      <w:r>
-        <w:rPr>
-          <w:rFonts w:ascii="Times New Roman" w:hAnsi="Times New Roman" w:cs="Times New Roman"/>
-          <w:lang w:val="en-GB"/>
-        </w:rPr>
-        <w:t>di</w:t>
-      </w:r>
-      <w:proofErr w:type="gramEnd"/>
-      <w:r>
-        <w:rPr>
-          <w:rFonts w:ascii="Times New Roman" w:hAnsi="Times New Roman" w:cs="Times New Roman"/>
-          <w:lang w:val="en-GB"/>
-        </w:rPr>
-        <w:t xml:space="preserve"> </w:t>
+        <w:t xml:space="preserve">    # di </w:t>
       </w:r>
       <w:proofErr w:type="spellStart"/>
       <w:r>
@@ -10777,7 +10483,6 @@
         <w:t xml:space="preserve"> </w:t>
       </w:r>
       <w:proofErr w:type="spellStart"/>
-      <w:proofErr w:type="gramStart"/>
       <w:r>
         <w:rPr>
           <w:rFonts w:ascii="Times New Roman" w:hAnsi="Times New Roman" w:cs="Times New Roman"/>
@@ -10786,7 +10491,6 @@
         <w:t>kategori.harga</w:t>
       </w:r>
       <w:proofErr w:type="spellEnd"/>
-      <w:proofErr w:type="gramEnd"/>
       <w:r>
         <w:rPr>
           <w:rFonts w:ascii="Times New Roman" w:hAnsi="Times New Roman" w:cs="Times New Roman"/>
@@ -11762,7 +11466,6 @@
           <w:lang w:val="en-GB"/>
         </w:rPr>
       </w:pPr>
-      <w:proofErr w:type="gramStart"/>
       <w:r>
         <w:rPr>
           <w:rFonts w:ascii="Times New Roman" w:hAnsi="Times New Roman" w:cs="Times New Roman"/>
@@ -11770,7 +11473,6 @@
         </w:rPr>
         <w:t>Kode :</w:t>
       </w:r>
-      <w:proofErr w:type="gramEnd"/>
     </w:p>
     <w:p>
       <w:pPr>
@@ -11786,15 +11488,7 @@
           <w:rFonts w:ascii="Times New Roman" w:hAnsi="Times New Roman" w:cs="Times New Roman"/>
           <w:lang w:val="en-GB"/>
         </w:rPr>
-        <w:t xml:space="preserve">import </w:t>
-      </w:r>
-      <w:proofErr w:type="gramStart"/>
-      <w:r>
-        <w:rPr>
-          <w:rFonts w:ascii="Times New Roman" w:hAnsi="Times New Roman" w:cs="Times New Roman"/>
-          <w:lang w:val="en-GB"/>
-        </w:rPr>
-        <w:t xml:space="preserve">{ </w:t>
+        <w:t xml:space="preserve">import { </w:t>
       </w:r>
       <w:proofErr w:type="spellStart"/>
       <w:r>
@@ -11805,7 +11499,6 @@
         <w:t>IsString</w:t>
       </w:r>
       <w:proofErr w:type="spellEnd"/>
-      <w:proofErr w:type="gramEnd"/>
       <w:r>
         <w:rPr>
           <w:rFonts w:ascii="Times New Roman" w:hAnsi="Times New Roman" w:cs="Times New Roman"/>
@@ -11862,7 +11555,6 @@
         <w:t xml:space="preserve">, </w:t>
       </w:r>
       <w:proofErr w:type="spellStart"/>
-      <w:proofErr w:type="gramStart"/>
       <w:r>
         <w:rPr>
           <w:rFonts w:ascii="Times New Roman" w:hAnsi="Times New Roman" w:cs="Times New Roman"/>
@@ -11876,15 +11568,7 @@
           <w:rFonts w:ascii="Times New Roman" w:hAnsi="Times New Roman" w:cs="Times New Roman"/>
           <w:lang w:val="en-GB"/>
         </w:rPr>
-        <w:t xml:space="preserve"> }</w:t>
-      </w:r>
-      <w:proofErr w:type="gramEnd"/>
-      <w:r>
-        <w:rPr>
-          <w:rFonts w:ascii="Times New Roman" w:hAnsi="Times New Roman" w:cs="Times New Roman"/>
-          <w:lang w:val="en-GB"/>
-        </w:rPr>
-        <w:t xml:space="preserve"> from 'class-validator';</w:t>
+        <w:t xml:space="preserve"> } from 'class-validator';</w:t>
       </w:r>
     </w:p>
     <w:p>
@@ -12090,23 +11774,7 @@
           <w:rFonts w:ascii="Times New Roman" w:hAnsi="Times New Roman" w:cs="Times New Roman"/>
           <w:lang w:val="en-GB"/>
         </w:rPr>
-        <w:t xml:space="preserve">  @</w:t>
-      </w:r>
-      <w:proofErr w:type="gramStart"/>
-      <w:r>
-        <w:rPr>
-          <w:rFonts w:ascii="Times New Roman" w:hAnsi="Times New Roman" w:cs="Times New Roman"/>
-          <w:lang w:val="en-GB"/>
-        </w:rPr>
-        <w:t>IsString(</w:t>
-      </w:r>
-      <w:proofErr w:type="gramEnd"/>
-      <w:r>
-        <w:rPr>
-          <w:rFonts w:ascii="Times New Roman" w:hAnsi="Times New Roman" w:cs="Times New Roman"/>
-          <w:lang w:val="en-GB"/>
-        </w:rPr>
-        <w:t xml:space="preserve">)      # Harus </w:t>
+        <w:t xml:space="preserve">  @IsString()      # Harus </w:t>
       </w:r>
       <w:proofErr w:type="spellStart"/>
       <w:r>
@@ -12155,23 +11823,7 @@
           <w:rFonts w:ascii="Times New Roman" w:hAnsi="Times New Roman" w:cs="Times New Roman"/>
           <w:lang w:val="en-GB"/>
         </w:rPr>
-        <w:t xml:space="preserve">  @</w:t>
-      </w:r>
-      <w:proofErr w:type="gramStart"/>
-      <w:r>
-        <w:rPr>
-          <w:rFonts w:ascii="Times New Roman" w:hAnsi="Times New Roman" w:cs="Times New Roman"/>
-          <w:lang w:val="en-GB"/>
-        </w:rPr>
-        <w:t>IsNotEmpty(</w:t>
-      </w:r>
-      <w:proofErr w:type="gramEnd"/>
-      <w:r>
-        <w:rPr>
-          <w:rFonts w:ascii="Times New Roman" w:hAnsi="Times New Roman" w:cs="Times New Roman"/>
-          <w:lang w:val="en-GB"/>
-        </w:rPr>
-        <w:t xml:space="preserve">)   # Tidak </w:t>
+        <w:t xml:space="preserve">  @IsNotEmpty()   # Tidak </w:t>
       </w:r>
       <w:proofErr w:type="spellStart"/>
       <w:r>
@@ -12268,23 +11920,7 @@
           <w:rFonts w:ascii="Times New Roman" w:hAnsi="Times New Roman" w:cs="Times New Roman"/>
           <w:lang w:val="en-GB"/>
         </w:rPr>
-        <w:t xml:space="preserve">  @</w:t>
-      </w:r>
-      <w:proofErr w:type="gramStart"/>
-      <w:r>
-        <w:rPr>
-          <w:rFonts w:ascii="Times New Roman" w:hAnsi="Times New Roman" w:cs="Times New Roman"/>
-          <w:lang w:val="en-GB"/>
-        </w:rPr>
-        <w:t>MinLength(</w:t>
-      </w:r>
-      <w:proofErr w:type="gramEnd"/>
-      <w:r>
-        <w:rPr>
-          <w:rFonts w:ascii="Times New Roman" w:hAnsi="Times New Roman" w:cs="Times New Roman"/>
-          <w:lang w:val="en-GB"/>
-        </w:rPr>
-        <w:t xml:space="preserve">2)   # Minimal </w:t>
+        <w:t xml:space="preserve">  @MinLength(2)   # Minimal </w:t>
       </w:r>
       <w:proofErr w:type="spellStart"/>
       <w:r>
@@ -12413,23 +12049,7 @@
           <w:rFonts w:ascii="Times New Roman" w:hAnsi="Times New Roman" w:cs="Times New Roman"/>
           <w:lang w:val="en-GB"/>
         </w:rPr>
-        <w:t xml:space="preserve">  @</w:t>
-      </w:r>
-      <w:proofErr w:type="gramStart"/>
-      <w:r>
-        <w:rPr>
-          <w:rFonts w:ascii="Times New Roman" w:hAnsi="Times New Roman" w:cs="Times New Roman"/>
-          <w:lang w:val="en-GB"/>
-        </w:rPr>
-        <w:t>MaxLength(</w:t>
-      </w:r>
-      <w:proofErr w:type="gramEnd"/>
-      <w:r>
-        <w:rPr>
-          <w:rFonts w:ascii="Times New Roman" w:hAnsi="Times New Roman" w:cs="Times New Roman"/>
-          <w:lang w:val="en-GB"/>
-        </w:rPr>
-        <w:t xml:space="preserve">100) # </w:t>
+        <w:t xml:space="preserve">  @MaxLength(100) # </w:t>
       </w:r>
       <w:proofErr w:type="spellStart"/>
       <w:r>
@@ -12537,23 +12157,7 @@
           <w:rFonts w:ascii="Times New Roman" w:hAnsi="Times New Roman" w:cs="Times New Roman"/>
           <w:lang w:val="en-GB"/>
         </w:rPr>
-        <w:t xml:space="preserve">  @</w:t>
-      </w:r>
-      <w:proofErr w:type="gramStart"/>
-      <w:r>
-        <w:rPr>
-          <w:rFonts w:ascii="Times New Roman" w:hAnsi="Times New Roman" w:cs="Times New Roman"/>
-          <w:lang w:val="en-GB"/>
-        </w:rPr>
-        <w:t>IsString(</w:t>
-      </w:r>
-      <w:proofErr w:type="gramEnd"/>
-      <w:r>
-        <w:rPr>
-          <w:rFonts w:ascii="Times New Roman" w:hAnsi="Times New Roman" w:cs="Times New Roman"/>
-          <w:lang w:val="en-GB"/>
-        </w:rPr>
-        <w:t xml:space="preserve">)      # Harus </w:t>
+        <w:t xml:space="preserve">  @IsString()      # Harus </w:t>
       </w:r>
       <w:proofErr w:type="spellStart"/>
       <w:r>
@@ -12602,23 +12206,7 @@
           <w:rFonts w:ascii="Times New Roman" w:hAnsi="Times New Roman" w:cs="Times New Roman"/>
           <w:lang w:val="en-GB"/>
         </w:rPr>
-        <w:t xml:space="preserve">  @</w:t>
-      </w:r>
-      <w:proofErr w:type="gramStart"/>
-      <w:r>
-        <w:rPr>
-          <w:rFonts w:ascii="Times New Roman" w:hAnsi="Times New Roman" w:cs="Times New Roman"/>
-          <w:lang w:val="en-GB"/>
-        </w:rPr>
-        <w:t>IsNotEmpty(</w:t>
-      </w:r>
-      <w:proofErr w:type="gramEnd"/>
-      <w:r>
-        <w:rPr>
-          <w:rFonts w:ascii="Times New Roman" w:hAnsi="Times New Roman" w:cs="Times New Roman"/>
-          <w:lang w:val="en-GB"/>
-        </w:rPr>
-        <w:t xml:space="preserve">)   # Wajib </w:t>
+        <w:t xml:space="preserve">  @IsNotEmpty()   # Wajib </w:t>
       </w:r>
       <w:proofErr w:type="spellStart"/>
       <w:r>
@@ -12715,23 +12303,7 @@
           <w:rFonts w:ascii="Times New Roman" w:hAnsi="Times New Roman" w:cs="Times New Roman"/>
           <w:lang w:val="en-GB"/>
         </w:rPr>
-        <w:t xml:space="preserve">  @</w:t>
-      </w:r>
-      <w:proofErr w:type="gramStart"/>
-      <w:r>
-        <w:rPr>
-          <w:rFonts w:ascii="Times New Roman" w:hAnsi="Times New Roman" w:cs="Times New Roman"/>
-          <w:lang w:val="en-GB"/>
-        </w:rPr>
-        <w:t>MinLength(</w:t>
-      </w:r>
-      <w:proofErr w:type="gramEnd"/>
-      <w:r>
-        <w:rPr>
-          <w:rFonts w:ascii="Times New Roman" w:hAnsi="Times New Roman" w:cs="Times New Roman"/>
-          <w:lang w:val="en-GB"/>
-        </w:rPr>
-        <w:t>2)</w:t>
+        <w:t xml:space="preserve">  @MinLength(2)</w:t>
       </w:r>
     </w:p>
     <w:p>
@@ -12748,23 +12320,7 @@
           <w:rFonts w:ascii="Times New Roman" w:hAnsi="Times New Roman" w:cs="Times New Roman"/>
           <w:lang w:val="en-GB"/>
         </w:rPr>
-        <w:t xml:space="preserve">  @</w:t>
-      </w:r>
-      <w:proofErr w:type="gramStart"/>
-      <w:r>
-        <w:rPr>
-          <w:rFonts w:ascii="Times New Roman" w:hAnsi="Times New Roman" w:cs="Times New Roman"/>
-          <w:lang w:val="en-GB"/>
-        </w:rPr>
-        <w:t>MaxLength(</w:t>
-      </w:r>
-      <w:proofErr w:type="gramEnd"/>
-      <w:r>
-        <w:rPr>
-          <w:rFonts w:ascii="Times New Roman" w:hAnsi="Times New Roman" w:cs="Times New Roman"/>
-          <w:lang w:val="en-GB"/>
-        </w:rPr>
-        <w:t>100)</w:t>
+        <w:t xml:space="preserve">  @MaxLength(100)</w:t>
       </w:r>
     </w:p>
     <w:p>
@@ -12808,23 +12364,7 @@
           <w:rFonts w:ascii="Times New Roman" w:hAnsi="Times New Roman" w:cs="Times New Roman"/>
           <w:lang w:val="en-GB"/>
         </w:rPr>
-        <w:t xml:space="preserve">  @</w:t>
-      </w:r>
-      <w:proofErr w:type="gramStart"/>
-      <w:r>
-        <w:rPr>
-          <w:rFonts w:ascii="Times New Roman" w:hAnsi="Times New Roman" w:cs="Times New Roman"/>
-          <w:lang w:val="en-GB"/>
-        </w:rPr>
-        <w:t>IsString(</w:t>
-      </w:r>
-      <w:proofErr w:type="gramEnd"/>
-      <w:r>
-        <w:rPr>
-          <w:rFonts w:ascii="Times New Roman" w:hAnsi="Times New Roman" w:cs="Times New Roman"/>
-          <w:lang w:val="en-GB"/>
-        </w:rPr>
-        <w:t xml:space="preserve">)      # Harus </w:t>
+        <w:t xml:space="preserve">  @IsString()      # Harus </w:t>
       </w:r>
       <w:proofErr w:type="spellStart"/>
       <w:r>
@@ -12873,23 +12413,7 @@
           <w:rFonts w:ascii="Times New Roman" w:hAnsi="Times New Roman" w:cs="Times New Roman"/>
           <w:lang w:val="en-GB"/>
         </w:rPr>
-        <w:t xml:space="preserve">  @</w:t>
-      </w:r>
-      <w:proofErr w:type="gramStart"/>
-      <w:r>
-        <w:rPr>
-          <w:rFonts w:ascii="Times New Roman" w:hAnsi="Times New Roman" w:cs="Times New Roman"/>
-          <w:lang w:val="en-GB"/>
-        </w:rPr>
-        <w:t>IsOptional(</w:t>
-      </w:r>
-      <w:proofErr w:type="gramEnd"/>
-      <w:r>
-        <w:rPr>
-          <w:rFonts w:ascii="Times New Roman" w:hAnsi="Times New Roman" w:cs="Times New Roman"/>
-          <w:lang w:val="en-GB"/>
-        </w:rPr>
-        <w:t>)   # BOLEH KOSONG (</w:t>
+        <w:t xml:space="preserve">  @IsOptional()   # BOLEH KOSONG (</w:t>
       </w:r>
       <w:proofErr w:type="spellStart"/>
       <w:r>
@@ -12954,23 +12478,7 @@
           <w:rFonts w:ascii="Times New Roman" w:hAnsi="Times New Roman" w:cs="Times New Roman"/>
           <w:lang w:val="en-GB"/>
         </w:rPr>
-        <w:t xml:space="preserve">  @</w:t>
-      </w:r>
-      <w:proofErr w:type="gramStart"/>
-      <w:r>
-        <w:rPr>
-          <w:rFonts w:ascii="Times New Roman" w:hAnsi="Times New Roman" w:cs="Times New Roman"/>
-          <w:lang w:val="en-GB"/>
-        </w:rPr>
-        <w:t>MaxLength(</w:t>
-      </w:r>
-      <w:proofErr w:type="gramEnd"/>
-      <w:r>
-        <w:rPr>
-          <w:rFonts w:ascii="Times New Roman" w:hAnsi="Times New Roman" w:cs="Times New Roman"/>
-          <w:lang w:val="en-GB"/>
-        </w:rPr>
-        <w:t xml:space="preserve">500) # Jika </w:t>
+        <w:t xml:space="preserve">  @MaxLength(500) # Jika </w:t>
       </w:r>
       <w:proofErr w:type="spellStart"/>
       <w:r>
@@ -13084,23 +12592,7 @@
           <w:lang w:val="en-GB"/>
         </w:rPr>
         <w:lastRenderedPageBreak/>
-        <w:t xml:space="preserve">  </w:t>
-      </w:r>
-      <w:proofErr w:type="gramStart"/>
-      <w:r>
-        <w:rPr>
-          <w:rFonts w:ascii="Times New Roman" w:hAnsi="Times New Roman" w:cs="Times New Roman"/>
-          <w:lang w:val="en-GB"/>
-        </w:rPr>
-        <w:t>description?:</w:t>
-      </w:r>
-      <w:proofErr w:type="gramEnd"/>
-      <w:r>
-        <w:rPr>
-          <w:rFonts w:ascii="Times New Roman" w:hAnsi="Times New Roman" w:cs="Times New Roman"/>
-          <w:lang w:val="en-GB"/>
-        </w:rPr>
-        <w:t xml:space="preserve"> string;</w:t>
+        <w:t xml:space="preserve">  description?: string;</w:t>
       </w:r>
     </w:p>
     <w:p>
@@ -13127,23 +12619,7 @@
           <w:rFonts w:ascii="Times New Roman" w:hAnsi="Times New Roman" w:cs="Times New Roman"/>
           <w:lang w:val="en-GB"/>
         </w:rPr>
-        <w:t xml:space="preserve">  @</w:t>
-      </w:r>
-      <w:proofErr w:type="gramStart"/>
-      <w:r>
-        <w:rPr>
-          <w:rFonts w:ascii="Times New Roman" w:hAnsi="Times New Roman" w:cs="Times New Roman"/>
-          <w:lang w:val="en-GB"/>
-        </w:rPr>
-        <w:t>IsString(</w:t>
-      </w:r>
-      <w:proofErr w:type="gramEnd"/>
-      <w:r>
-        <w:rPr>
-          <w:rFonts w:ascii="Times New Roman" w:hAnsi="Times New Roman" w:cs="Times New Roman"/>
-          <w:lang w:val="en-GB"/>
-        </w:rPr>
-        <w:t>)</w:t>
+        <w:t xml:space="preserve">  @IsString()</w:t>
       </w:r>
     </w:p>
     <w:p>
@@ -13160,23 +12636,7 @@
           <w:rFonts w:ascii="Times New Roman" w:hAnsi="Times New Roman" w:cs="Times New Roman"/>
           <w:lang w:val="en-GB"/>
         </w:rPr>
-        <w:t xml:space="preserve">  @</w:t>
-      </w:r>
-      <w:proofErr w:type="gramStart"/>
-      <w:r>
-        <w:rPr>
-          <w:rFonts w:ascii="Times New Roman" w:hAnsi="Times New Roman" w:cs="Times New Roman"/>
-          <w:lang w:val="en-GB"/>
-        </w:rPr>
-        <w:t>IsOptional(</w:t>
-      </w:r>
-      <w:proofErr w:type="gramEnd"/>
-      <w:r>
-        <w:rPr>
-          <w:rFonts w:ascii="Times New Roman" w:hAnsi="Times New Roman" w:cs="Times New Roman"/>
-          <w:lang w:val="en-GB"/>
-        </w:rPr>
-        <w:t>)   # BOLEH KOSONG (</w:t>
+        <w:t xml:space="preserve">  @IsOptional()   # BOLEH KOSONG (</w:t>
       </w:r>
       <w:proofErr w:type="spellStart"/>
       <w:r>
@@ -13257,23 +12717,7 @@
           <w:rFonts w:ascii="Times New Roman" w:hAnsi="Times New Roman" w:cs="Times New Roman"/>
           <w:lang w:val="en-GB"/>
         </w:rPr>
-        <w:t xml:space="preserve">  </w:t>
-      </w:r>
-      <w:proofErr w:type="gramStart"/>
-      <w:r>
-        <w:rPr>
-          <w:rFonts w:ascii="Times New Roman" w:hAnsi="Times New Roman" w:cs="Times New Roman"/>
-          <w:lang w:val="en-GB"/>
-        </w:rPr>
-        <w:t>icon?:</w:t>
-      </w:r>
-      <w:proofErr w:type="gramEnd"/>
-      <w:r>
-        <w:rPr>
-          <w:rFonts w:ascii="Times New Roman" w:hAnsi="Times New Roman" w:cs="Times New Roman"/>
-          <w:lang w:val="en-GB"/>
-        </w:rPr>
-        <w:t xml:space="preserve"> string;</w:t>
+        <w:t xml:space="preserve">  icon?: string;</w:t>
       </w:r>
     </w:p>
     <w:p>
@@ -14346,7 +13790,6 @@
         <w:t xml:space="preserve"> </w:t>
       </w:r>
       <w:proofErr w:type="spellStart"/>
-      <w:proofErr w:type="gramStart"/>
       <w:r>
         <w:rPr>
           <w:rFonts w:ascii="Times New Roman" w:hAnsi="Times New Roman" w:cs="Times New Roman"/>
@@ -14371,7 +13814,6 @@
         <w:t>tidak</w:t>
       </w:r>
       <w:proofErr w:type="spellEnd"/>
-      <w:proofErr w:type="gramEnd"/>
       <w:r>
         <w:rPr>
           <w:rFonts w:ascii="Times New Roman" w:hAnsi="Times New Roman" w:cs="Times New Roman"/>
@@ -14604,23 +14046,7 @@
           <w:rFonts w:ascii="Times New Roman" w:hAnsi="Times New Roman" w:cs="Times New Roman"/>
           <w:lang w:val="en-GB"/>
         </w:rPr>
-        <w:t xml:space="preserve"> </w:t>
-      </w:r>
-      <w:proofErr w:type="gramStart"/>
-      <w:r>
-        <w:rPr>
-          <w:rFonts w:ascii="Times New Roman" w:hAnsi="Times New Roman" w:cs="Times New Roman"/>
-          <w:lang w:val="en-GB"/>
-        </w:rPr>
-        <w:t>name?:</w:t>
-      </w:r>
-      <w:proofErr w:type="gramEnd"/>
-      <w:r>
-        <w:rPr>
-          <w:rFonts w:ascii="Times New Roman" w:hAnsi="Times New Roman" w:cs="Times New Roman"/>
-          <w:lang w:val="en-GB"/>
-        </w:rPr>
-        <w:t xml:space="preserve"> string) </w:t>
+        <w:t xml:space="preserve"> name?: string) </w:t>
       </w:r>
       <w:proofErr w:type="spellStart"/>
       <w:r>
@@ -15033,21 +14459,12 @@
           <w:lang w:val="en-GB"/>
         </w:rPr>
       </w:pPr>
-      <w:proofErr w:type="gramStart"/>
-      <w:r>
-        <w:rPr>
-          <w:rFonts w:ascii="Times New Roman" w:hAnsi="Times New Roman" w:cs="Times New Roman"/>
-          <w:lang w:val="en-GB"/>
-        </w:rPr>
-        <w:t>File :</w:t>
-      </w:r>
-      <w:proofErr w:type="gramEnd"/>
-      <w:r>
-        <w:rPr>
-          <w:rFonts w:ascii="Times New Roman" w:hAnsi="Times New Roman" w:cs="Times New Roman"/>
-          <w:lang w:val="en-GB"/>
-        </w:rPr>
-        <w:t xml:space="preserve"> </w:t>
+      <w:r>
+        <w:rPr>
+          <w:rFonts w:ascii="Times New Roman" w:hAnsi="Times New Roman" w:cs="Times New Roman"/>
+          <w:lang w:val="en-GB"/>
+        </w:rPr>
+        <w:t xml:space="preserve">File : </w:t>
       </w:r>
       <w:proofErr w:type="spellStart"/>
       <w:r>
@@ -15164,15 +14581,7 @@
           <w:rFonts w:ascii="Times New Roman" w:hAnsi="Times New Roman" w:cs="Times New Roman"/>
           <w:lang w:val="en-GB"/>
         </w:rPr>
-        <w:t xml:space="preserve">import </w:t>
-      </w:r>
-      <w:proofErr w:type="gramStart"/>
-      <w:r>
-        <w:rPr>
-          <w:rFonts w:ascii="Times New Roman" w:hAnsi="Times New Roman" w:cs="Times New Roman"/>
-          <w:lang w:val="en-GB"/>
-        </w:rPr>
-        <w:t xml:space="preserve">{ </w:t>
+        <w:t xml:space="preserve">import { </w:t>
       </w:r>
       <w:proofErr w:type="spellStart"/>
       <w:r>
@@ -15183,7 +14592,6 @@
         <w:t>ConflictException</w:t>
       </w:r>
       <w:proofErr w:type="spellEnd"/>
-      <w:proofErr w:type="gramEnd"/>
       <w:r>
         <w:rPr>
           <w:rFonts w:ascii="Times New Roman" w:hAnsi="Times New Roman" w:cs="Times New Roman"/>
@@ -15823,7 +15231,6 @@
         <w:t xml:space="preserve">  static </w:t>
       </w:r>
       <w:proofErr w:type="spellStart"/>
-      <w:proofErr w:type="gramStart"/>
       <w:r>
         <w:rPr>
           <w:rFonts w:ascii="Times New Roman" w:hAnsi="Times New Roman" w:cs="Times New Roman"/>
@@ -15837,15 +15244,7 @@
           <w:rFonts w:ascii="Times New Roman" w:hAnsi="Times New Roman" w:cs="Times New Roman"/>
           <w:lang w:val="en-GB"/>
         </w:rPr>
-        <w:t>(</w:t>
-      </w:r>
-      <w:proofErr w:type="gramEnd"/>
-      <w:r>
-        <w:rPr>
-          <w:rFonts w:ascii="Times New Roman" w:hAnsi="Times New Roman" w:cs="Times New Roman"/>
-          <w:lang w:val="en-GB"/>
-        </w:rPr>
-        <w:t>name: string): never {</w:t>
+        <w:t>(name: string): never {</w:t>
       </w:r>
     </w:p>
     <w:p>
@@ -16094,7 +15493,6 @@
         <w:t xml:space="preserve">    throw new </w:t>
       </w:r>
       <w:proofErr w:type="spellStart"/>
-      <w:proofErr w:type="gramStart"/>
       <w:r>
         <w:rPr>
           <w:rFonts w:ascii="Times New Roman" w:hAnsi="Times New Roman" w:cs="Times New Roman"/>
@@ -16110,7 +15508,6 @@
         </w:rPr>
         <w:t>(</w:t>
       </w:r>
-      <w:proofErr w:type="gramEnd"/>
     </w:p>
     <w:p>
       <w:pPr>
@@ -16373,7 +15770,6 @@
         <w:t xml:space="preserve">  static </w:t>
       </w:r>
       <w:proofErr w:type="spellStart"/>
-      <w:proofErr w:type="gramStart"/>
       <w:r>
         <w:rPr>
           <w:rFonts w:ascii="Times New Roman" w:hAnsi="Times New Roman" w:cs="Times New Roman"/>
@@ -16387,15 +15783,7 @@
           <w:rFonts w:ascii="Times New Roman" w:hAnsi="Times New Roman" w:cs="Times New Roman"/>
           <w:lang w:val="en-GB"/>
         </w:rPr>
-        <w:t>(</w:t>
-      </w:r>
-      <w:proofErr w:type="gramEnd"/>
-      <w:r>
-        <w:rPr>
-          <w:rFonts w:ascii="Times New Roman" w:hAnsi="Times New Roman" w:cs="Times New Roman"/>
-          <w:lang w:val="en-GB"/>
-        </w:rPr>
-        <w:t>slug: string): never {</w:t>
+        <w:t>(slug: string): never {</w:t>
       </w:r>
     </w:p>
     <w:p>
@@ -16498,7 +15886,6 @@
         <w:t xml:space="preserve">    throw new </w:t>
       </w:r>
       <w:proofErr w:type="spellStart"/>
-      <w:proofErr w:type="gramStart"/>
       <w:r>
         <w:rPr>
           <w:rFonts w:ascii="Times New Roman" w:hAnsi="Times New Roman" w:cs="Times New Roman"/>
@@ -16514,7 +15901,6 @@
         </w:rPr>
         <w:t>(</w:t>
       </w:r>
-      <w:proofErr w:type="gramEnd"/>
     </w:p>
     <w:p>
       <w:pPr>
@@ -16809,7 +16195,6 @@
         <w:t xml:space="preserve">  static </w:t>
       </w:r>
       <w:proofErr w:type="spellStart"/>
-      <w:proofErr w:type="gramStart"/>
       <w:r>
         <w:rPr>
           <w:rFonts w:ascii="Times New Roman" w:hAnsi="Times New Roman" w:cs="Times New Roman"/>
@@ -16823,15 +16208,7 @@
           <w:rFonts w:ascii="Times New Roman" w:hAnsi="Times New Roman" w:cs="Times New Roman"/>
           <w:lang w:val="en-GB"/>
         </w:rPr>
-        <w:t>(</w:t>
-      </w:r>
-      <w:proofErr w:type="gramEnd"/>
-      <w:r>
-        <w:rPr>
-          <w:rFonts w:ascii="Times New Roman" w:hAnsi="Times New Roman" w:cs="Times New Roman"/>
-          <w:lang w:val="en-GB"/>
-        </w:rPr>
-        <w:t>field: string): never {</w:t>
+        <w:t>(field: string): never {</w:t>
       </w:r>
     </w:p>
     <w:p>
@@ -16853,7 +16230,6 @@
         <w:t xml:space="preserve">    throw new </w:t>
       </w:r>
       <w:proofErr w:type="spellStart"/>
-      <w:proofErr w:type="gramStart"/>
       <w:r>
         <w:rPr>
           <w:rFonts w:ascii="Times New Roman" w:hAnsi="Times New Roman" w:cs="Times New Roman"/>
@@ -16869,7 +16245,6 @@
         </w:rPr>
         <w:t>(</w:t>
       </w:r>
-      <w:proofErr w:type="gramEnd"/>
     </w:p>
     <w:p>
       <w:pPr>
@@ -17346,7 +16721,6 @@
           <w:lang w:val="en-GB"/>
         </w:rPr>
       </w:pPr>
-      <w:proofErr w:type="gramStart"/>
       <w:r>
         <w:rPr>
           <w:rFonts w:ascii="Times New Roman" w:hAnsi="Times New Roman" w:cs="Times New Roman"/>
@@ -17361,17 +16735,7 @@
           <w:bCs/>
           <w:lang w:val="en-GB"/>
         </w:rPr>
-        <w:t xml:space="preserve"> :</w:t>
-      </w:r>
-      <w:proofErr w:type="gramEnd"/>
-      <w:r>
-        <w:rPr>
-          <w:rFonts w:ascii="Times New Roman" w:hAnsi="Times New Roman" w:cs="Times New Roman"/>
-          <w:b/>
-          <w:bCs/>
-          <w:lang w:val="en-GB"/>
-        </w:rPr>
-        <w:t xml:space="preserve"> </w:t>
+        <w:t xml:space="preserve"> : </w:t>
       </w:r>
       <w:proofErr w:type="spellStart"/>
       <w:r>
@@ -17661,7 +17025,6 @@
         <w:t xml:space="preserve"> </w:t>
       </w:r>
       <w:proofErr w:type="spellStart"/>
-      <w:proofErr w:type="gramStart"/>
       <w:r>
         <w:rPr>
           <w:rFonts w:ascii="Times New Roman" w:hAnsi="Times New Roman" w:cs="Times New Roman"/>
@@ -17677,7 +17040,6 @@
         </w:rPr>
         <w:t xml:space="preserve"> :</w:t>
       </w:r>
-      <w:proofErr w:type="gramEnd"/>
     </w:p>
     <w:p>
       <w:pPr>
@@ -18547,21 +17909,12 @@
       <w:pPr>
         <w:jc w:val="both"/>
       </w:pPr>
-      <w:proofErr w:type="gramStart"/>
-      <w:r>
-        <w:rPr>
-          <w:rFonts w:ascii="Times New Roman" w:hAnsi="Times New Roman" w:cs="Times New Roman"/>
-          <w:lang w:val="en-GB"/>
-        </w:rPr>
-        <w:t>File :</w:t>
-      </w:r>
-      <w:proofErr w:type="gramEnd"/>
-      <w:r>
-        <w:rPr>
-          <w:rFonts w:ascii="Times New Roman" w:hAnsi="Times New Roman" w:cs="Times New Roman"/>
-          <w:lang w:val="en-GB"/>
-        </w:rPr>
-        <w:t xml:space="preserve"> </w:t>
+      <w:r>
+        <w:rPr>
+          <w:rFonts w:ascii="Times New Roman" w:hAnsi="Times New Roman" w:cs="Times New Roman"/>
+          <w:lang w:val="en-GB"/>
+        </w:rPr>
+        <w:t xml:space="preserve">File : </w:t>
       </w:r>
       <w:proofErr w:type="spellStart"/>
       <w:r>
@@ -19634,21 +18987,12 @@
       <w:pPr>
         <w:jc w:val="both"/>
       </w:pPr>
-      <w:proofErr w:type="gramStart"/>
-      <w:r>
-        <w:rPr>
-          <w:rFonts w:ascii="Times New Roman" w:hAnsi="Times New Roman" w:cs="Times New Roman"/>
-          <w:lang w:val="en-GB"/>
-        </w:rPr>
-        <w:t>File :</w:t>
-      </w:r>
-      <w:proofErr w:type="gramEnd"/>
-      <w:r>
-        <w:rPr>
-          <w:rFonts w:ascii="Times New Roman" w:hAnsi="Times New Roman" w:cs="Times New Roman"/>
-          <w:lang w:val="en-GB"/>
-        </w:rPr>
-        <w:t xml:space="preserve"> </w:t>
+      <w:r>
+        <w:rPr>
+          <w:rFonts w:ascii="Times New Roman" w:hAnsi="Times New Roman" w:cs="Times New Roman"/>
+          <w:lang w:val="en-GB"/>
+        </w:rPr>
+        <w:t xml:space="preserve">File : </w:t>
       </w:r>
       <w:proofErr w:type="spellStart"/>
       <w:r>
@@ -20765,21 +20109,12 @@
       <w:pPr>
         <w:jc w:val="both"/>
       </w:pPr>
-      <w:proofErr w:type="gramStart"/>
-      <w:r>
-        <w:rPr>
-          <w:rFonts w:ascii="Times New Roman" w:hAnsi="Times New Roman" w:cs="Times New Roman"/>
-          <w:lang w:val="en-GB"/>
-        </w:rPr>
-        <w:t>File :</w:t>
-      </w:r>
-      <w:proofErr w:type="gramEnd"/>
-      <w:r>
-        <w:rPr>
-          <w:rFonts w:ascii="Times New Roman" w:hAnsi="Times New Roman" w:cs="Times New Roman"/>
-          <w:lang w:val="en-GB"/>
-        </w:rPr>
-        <w:t xml:space="preserve"> </w:t>
+      <w:r>
+        <w:rPr>
+          <w:rFonts w:ascii="Times New Roman" w:hAnsi="Times New Roman" w:cs="Times New Roman"/>
+          <w:lang w:val="en-GB"/>
+        </w:rPr>
+        <w:t xml:space="preserve">File : </w:t>
       </w:r>
       <w:proofErr w:type="spellStart"/>
       <w:r>
@@ -21588,21 +20923,12 @@
           <w:lang w:val="en-GB"/>
         </w:rPr>
       </w:pPr>
-      <w:proofErr w:type="gramStart"/>
-      <w:r>
-        <w:rPr>
-          <w:rFonts w:ascii="Times New Roman" w:hAnsi="Times New Roman" w:cs="Times New Roman"/>
-          <w:lang w:val="en-GB"/>
-        </w:rPr>
-        <w:t>File :</w:t>
-      </w:r>
-      <w:proofErr w:type="gramEnd"/>
-      <w:r>
-        <w:rPr>
-          <w:rFonts w:ascii="Times New Roman" w:hAnsi="Times New Roman" w:cs="Times New Roman"/>
-          <w:lang w:val="en-GB"/>
-        </w:rPr>
-        <w:t xml:space="preserve"> </w:t>
+      <w:r>
+        <w:rPr>
+          <w:rFonts w:ascii="Times New Roman" w:hAnsi="Times New Roman" w:cs="Times New Roman"/>
+          <w:lang w:val="en-GB"/>
+        </w:rPr>
+        <w:t xml:space="preserve">File : </w:t>
       </w:r>
       <w:r>
         <w:t>jest.config.js</w:t>
@@ -22285,7 +21611,6 @@
         <w:t xml:space="preserve"> </w:t>
       </w:r>
       <w:proofErr w:type="spellStart"/>
-      <w:proofErr w:type="gramStart"/>
       <w:r>
         <w:rPr>
           <w:rFonts w:ascii="Times New Roman" w:hAnsi="Times New Roman" w:cs="Times New Roman"/>
@@ -22299,15 +21624,7 @@
           <w:rFonts w:ascii="Times New Roman" w:hAnsi="Times New Roman" w:cs="Times New Roman"/>
           <w:lang w:val="en-GB"/>
         </w:rPr>
-        <w:t xml:space="preserve"> :</w:t>
-      </w:r>
-      <w:proofErr w:type="gramEnd"/>
-      <w:r>
-        <w:rPr>
-          <w:rFonts w:ascii="Times New Roman" w:hAnsi="Times New Roman" w:cs="Times New Roman"/>
-          <w:lang w:val="en-GB"/>
-        </w:rPr>
-        <w:t xml:space="preserve"> Kode Anda </w:t>
+        <w:t xml:space="preserve"> : Kode Anda </w:t>
       </w:r>
       <w:proofErr w:type="spellStart"/>
       <w:r>
@@ -22926,13 +22243,8 @@
       <w:pPr>
         <w:jc w:val="both"/>
       </w:pPr>
-      <w:proofErr w:type="gramStart"/>
-      <w:r>
-        <w:t>File :</w:t>
-      </w:r>
-      <w:proofErr w:type="gramEnd"/>
-      <w:r>
-        <w:t xml:space="preserve">  </w:t>
+      <w:r>
+        <w:t xml:space="preserve">File :  </w:t>
       </w:r>
       <w:r>
         <w:t>test/jest-e2e.json</w:t>
@@ -23399,21 +22711,12 @@
           <w:lang w:val="en-GB"/>
         </w:rPr>
       </w:pPr>
-      <w:proofErr w:type="gramStart"/>
-      <w:r>
-        <w:rPr>
-          <w:rFonts w:ascii="Times New Roman" w:hAnsi="Times New Roman" w:cs="Times New Roman"/>
-          <w:lang w:val="en-GB"/>
-        </w:rPr>
-        <w:t>File :</w:t>
-      </w:r>
-      <w:proofErr w:type="gramEnd"/>
-      <w:r>
-        <w:rPr>
-          <w:rFonts w:ascii="Times New Roman" w:hAnsi="Times New Roman" w:cs="Times New Roman"/>
-          <w:lang w:val="en-GB"/>
-        </w:rPr>
-        <w:t xml:space="preserve"> </w:t>
+      <w:r>
+        <w:rPr>
+          <w:rFonts w:ascii="Times New Roman" w:hAnsi="Times New Roman" w:cs="Times New Roman"/>
+          <w:lang w:val="en-GB"/>
+        </w:rPr>
+        <w:t xml:space="preserve">File : </w:t>
       </w:r>
       <w:proofErr w:type="spellStart"/>
       <w:r>
@@ -23465,15 +22768,611 @@
           <w:lang w:val="en-GB"/>
         </w:rPr>
       </w:pPr>
-    </w:p>
-    <w:p>
-      <w:pPr>
-        <w:jc w:val="both"/>
-        <w:rPr>
-          <w:rFonts w:ascii="Times New Roman" w:hAnsi="Times New Roman" w:cs="Times New Roman"/>
-          <w:lang w:val="en-GB"/>
-        </w:rPr>
-      </w:pPr>
+      <w:r>
+        <w:rPr>
+          <w:noProof/>
+        </w:rPr>
+        <w:drawing>
+          <wp:inline distT="0" distB="0" distL="0" distR="0" wp14:anchorId="51E7A450" wp14:editId="3D41DE83">
+            <wp:extent cx="5731510" cy="3222625"/>
+            <wp:effectExtent l="0" t="0" r="2540" b="0"/>
+            <wp:docPr id="911972891" name="Picture 1"/>
+            <wp:cNvGraphicFramePr>
+              <a:graphicFrameLocks xmlns:a="http://schemas.openxmlformats.org/drawingml/2006/main" noChangeAspect="1"/>
+            </wp:cNvGraphicFramePr>
+            <a:graphic xmlns:a="http://schemas.openxmlformats.org/drawingml/2006/main">
+              <a:graphicData uri="http://schemas.openxmlformats.org/drawingml/2006/picture">
+                <pic:pic xmlns:pic="http://schemas.openxmlformats.org/drawingml/2006/picture">
+                  <pic:nvPicPr>
+                    <pic:cNvPr id="911972891" name=""/>
+                    <pic:cNvPicPr/>
+                  </pic:nvPicPr>
+                  <pic:blipFill>
+                    <a:blip r:embed="rId26"/>
+                    <a:stretch>
+                      <a:fillRect/>
+                    </a:stretch>
+                  </pic:blipFill>
+                  <pic:spPr>
+                    <a:xfrm>
+                      <a:off x="0" y="0"/>
+                      <a:ext cx="5731510" cy="3222625"/>
+                    </a:xfrm>
+                    <a:prstGeom prst="rect">
+                      <a:avLst/>
+                    </a:prstGeom>
+                  </pic:spPr>
+                </pic:pic>
+              </a:graphicData>
+            </a:graphic>
+          </wp:inline>
+        </w:drawing>
+      </w:r>
+    </w:p>
+    <w:p>
+      <w:pPr>
+        <w:jc w:val="both"/>
+        <w:rPr>
+          <w:rFonts w:ascii="Times New Roman" w:hAnsi="Times New Roman" w:cs="Times New Roman"/>
+          <w:lang w:val="en-GB"/>
+        </w:rPr>
+      </w:pPr>
+    </w:p>
+    <w:p>
+      <w:pPr>
+        <w:jc w:val="both"/>
+        <w:rPr>
+          <w:rFonts w:ascii="Times New Roman" w:hAnsi="Times New Roman" w:cs="Times New Roman"/>
+          <w:lang w:val="en-GB"/>
+        </w:rPr>
+      </w:pPr>
+      <w:proofErr w:type="spellStart"/>
+      <w:r>
+        <w:rPr>
+          <w:rFonts w:ascii="Times New Roman" w:hAnsi="Times New Roman" w:cs="Times New Roman"/>
+          <w:lang w:val="en-GB"/>
+        </w:rPr>
+        <w:lastRenderedPageBreak/>
+        <w:t>Untuk</w:t>
+      </w:r>
+      <w:proofErr w:type="spellEnd"/>
+      <w:r>
+        <w:rPr>
+          <w:rFonts w:ascii="Times New Roman" w:hAnsi="Times New Roman" w:cs="Times New Roman"/>
+          <w:lang w:val="en-GB"/>
+        </w:rPr>
+        <w:t xml:space="preserve"> m</w:t>
+      </w:r>
+      <w:proofErr w:type="spellStart"/>
+      <w:r>
+        <w:rPr>
+          <w:rFonts w:ascii="Times New Roman" w:hAnsi="Times New Roman" w:cs="Times New Roman"/>
+          <w:lang w:val="en-GB"/>
+        </w:rPr>
+        <w:t>emperbaikinya</w:t>
+      </w:r>
+      <w:proofErr w:type="spellEnd"/>
+      <w:r>
+        <w:rPr>
+          <w:rFonts w:ascii="Times New Roman" w:hAnsi="Times New Roman" w:cs="Times New Roman"/>
+          <w:lang w:val="en-GB"/>
+        </w:rPr>
+        <w:t xml:space="preserve"> </w:t>
+      </w:r>
+      <w:proofErr w:type="spellStart"/>
+      <w:r>
+        <w:rPr>
+          <w:rFonts w:ascii="Times New Roman" w:hAnsi="Times New Roman" w:cs="Times New Roman"/>
+          <w:lang w:val="en-GB"/>
+        </w:rPr>
+        <w:t>sebelum</w:t>
+      </w:r>
+      <w:proofErr w:type="spellEnd"/>
+      <w:r>
+        <w:rPr>
+          <w:rFonts w:ascii="Times New Roman" w:hAnsi="Times New Roman" w:cs="Times New Roman"/>
+          <w:lang w:val="en-GB"/>
+        </w:rPr>
+        <w:t xml:space="preserve"> </w:t>
+      </w:r>
+      <w:proofErr w:type="spellStart"/>
+      <w:r>
+        <w:rPr>
+          <w:rFonts w:ascii="Times New Roman" w:hAnsi="Times New Roman" w:cs="Times New Roman"/>
+          <w:lang w:val="en-GB"/>
+        </w:rPr>
+        <w:t>aplikasi</w:t>
+      </w:r>
+      <w:proofErr w:type="spellEnd"/>
+      <w:r>
+        <w:rPr>
+          <w:rFonts w:ascii="Times New Roman" w:hAnsi="Times New Roman" w:cs="Times New Roman"/>
+          <w:lang w:val="en-GB"/>
+        </w:rPr>
+        <w:t xml:space="preserve"> </w:t>
+      </w:r>
+      <w:proofErr w:type="spellStart"/>
+      <w:r>
+        <w:rPr>
+          <w:rFonts w:ascii="Times New Roman" w:hAnsi="Times New Roman" w:cs="Times New Roman"/>
+          <w:lang w:val="en-GB"/>
+        </w:rPr>
+        <w:t>dirilis</w:t>
+      </w:r>
+      <w:proofErr w:type="spellEnd"/>
+      <w:r>
+        <w:rPr>
+          <w:rFonts w:ascii="Times New Roman" w:hAnsi="Times New Roman" w:cs="Times New Roman"/>
+          <w:lang w:val="en-GB"/>
+        </w:rPr>
+        <w:t>.</w:t>
+      </w:r>
+    </w:p>
+    <w:p>
+      <w:pPr>
+        <w:jc w:val="both"/>
+        <w:rPr>
+          <w:rFonts w:ascii="Times New Roman" w:hAnsi="Times New Roman" w:cs="Times New Roman"/>
+          <w:lang w:val="en-GB"/>
+        </w:rPr>
+      </w:pPr>
+      <w:proofErr w:type="spellStart"/>
+      <w:r>
+        <w:rPr>
+          <w:rFonts w:ascii="Times New Roman" w:hAnsi="Times New Roman" w:cs="Times New Roman"/>
+          <w:lang w:val="en-GB"/>
+        </w:rPr>
+        <w:t>Dokumentasi</w:t>
+      </w:r>
+      <w:proofErr w:type="spellEnd"/>
+      <w:r>
+        <w:rPr>
+          <w:rFonts w:ascii="Times New Roman" w:hAnsi="Times New Roman" w:cs="Times New Roman"/>
+          <w:lang w:val="en-GB"/>
+        </w:rPr>
+        <w:t xml:space="preserve"> Cara Kerja: </w:t>
+      </w:r>
+      <w:proofErr w:type="spellStart"/>
+      <w:r>
+        <w:rPr>
+          <w:rFonts w:ascii="Times New Roman" w:hAnsi="Times New Roman" w:cs="Times New Roman"/>
+          <w:lang w:val="en-GB"/>
+        </w:rPr>
+        <w:t>Siapapun</w:t>
+      </w:r>
+      <w:proofErr w:type="spellEnd"/>
+      <w:r>
+        <w:rPr>
+          <w:rFonts w:ascii="Times New Roman" w:hAnsi="Times New Roman" w:cs="Times New Roman"/>
+          <w:lang w:val="en-GB"/>
+        </w:rPr>
+        <w:t xml:space="preserve"> yang </w:t>
+      </w:r>
+      <w:proofErr w:type="spellStart"/>
+      <w:r>
+        <w:rPr>
+          <w:rFonts w:ascii="Times New Roman" w:hAnsi="Times New Roman" w:cs="Times New Roman"/>
+          <w:lang w:val="en-GB"/>
+        </w:rPr>
+        <w:t>membaca</w:t>
+      </w:r>
+      <w:proofErr w:type="spellEnd"/>
+      <w:r>
+        <w:rPr>
+          <w:rFonts w:ascii="Times New Roman" w:hAnsi="Times New Roman" w:cs="Times New Roman"/>
+          <w:lang w:val="en-GB"/>
+        </w:rPr>
+        <w:t xml:space="preserve"> </w:t>
+      </w:r>
+      <w:proofErr w:type="spellStart"/>
+      <w:r>
+        <w:rPr>
+          <w:rFonts w:ascii="Times New Roman" w:hAnsi="Times New Roman" w:cs="Times New Roman"/>
+          <w:lang w:val="en-GB"/>
+        </w:rPr>
+        <w:t>kode</w:t>
+      </w:r>
+      <w:proofErr w:type="spellEnd"/>
+      <w:r>
+        <w:rPr>
+          <w:rFonts w:ascii="Times New Roman" w:hAnsi="Times New Roman" w:cs="Times New Roman"/>
+          <w:lang w:val="en-GB"/>
+        </w:rPr>
+        <w:t xml:space="preserve"> </w:t>
+      </w:r>
+      <w:proofErr w:type="spellStart"/>
+      <w:r>
+        <w:rPr>
+          <w:rFonts w:ascii="Times New Roman" w:hAnsi="Times New Roman" w:cs="Times New Roman"/>
+          <w:lang w:val="en-GB"/>
+        </w:rPr>
+        <w:t>ini</w:t>
+      </w:r>
+      <w:proofErr w:type="spellEnd"/>
+      <w:r>
+        <w:rPr>
+          <w:rFonts w:ascii="Times New Roman" w:hAnsi="Times New Roman" w:cs="Times New Roman"/>
+          <w:lang w:val="en-GB"/>
+        </w:rPr>
+        <w:t xml:space="preserve"> </w:t>
+      </w:r>
+      <w:proofErr w:type="spellStart"/>
+      <w:r>
+        <w:rPr>
+          <w:rFonts w:ascii="Times New Roman" w:hAnsi="Times New Roman" w:cs="Times New Roman"/>
+          <w:lang w:val="en-GB"/>
+        </w:rPr>
+        <w:t>akan</w:t>
+      </w:r>
+      <w:proofErr w:type="spellEnd"/>
+      <w:r>
+        <w:rPr>
+          <w:rFonts w:ascii="Times New Roman" w:hAnsi="Times New Roman" w:cs="Times New Roman"/>
+          <w:lang w:val="en-GB"/>
+        </w:rPr>
+        <w:t xml:space="preserve"> </w:t>
+      </w:r>
+      <w:proofErr w:type="spellStart"/>
+      <w:r>
+        <w:rPr>
+          <w:rFonts w:ascii="Times New Roman" w:hAnsi="Times New Roman" w:cs="Times New Roman"/>
+          <w:lang w:val="en-GB"/>
+        </w:rPr>
+        <w:t>langsung</w:t>
+      </w:r>
+      <w:proofErr w:type="spellEnd"/>
+      <w:r>
+        <w:rPr>
+          <w:rFonts w:ascii="Times New Roman" w:hAnsi="Times New Roman" w:cs="Times New Roman"/>
+          <w:lang w:val="en-GB"/>
+        </w:rPr>
+        <w:t xml:space="preserve"> </w:t>
+      </w:r>
+      <w:proofErr w:type="spellStart"/>
+      <w:r>
+        <w:rPr>
+          <w:rFonts w:ascii="Times New Roman" w:hAnsi="Times New Roman" w:cs="Times New Roman"/>
+          <w:lang w:val="en-GB"/>
+        </w:rPr>
+        <w:t>paham</w:t>
+      </w:r>
+      <w:proofErr w:type="spellEnd"/>
+      <w:r>
+        <w:rPr>
+          <w:rFonts w:ascii="Times New Roman" w:hAnsi="Times New Roman" w:cs="Times New Roman"/>
+          <w:lang w:val="en-GB"/>
+        </w:rPr>
+        <w:t xml:space="preserve">: "Oh, </w:t>
+      </w:r>
+      <w:proofErr w:type="spellStart"/>
+      <w:r>
+        <w:rPr>
+          <w:rFonts w:ascii="Times New Roman" w:hAnsi="Times New Roman" w:cs="Times New Roman"/>
+          <w:lang w:val="en-GB"/>
+        </w:rPr>
+        <w:t>kalau</w:t>
+      </w:r>
+      <w:proofErr w:type="spellEnd"/>
+      <w:r>
+        <w:rPr>
+          <w:rFonts w:ascii="Times New Roman" w:hAnsi="Times New Roman" w:cs="Times New Roman"/>
+          <w:lang w:val="en-GB"/>
+        </w:rPr>
+        <w:t xml:space="preserve"> </w:t>
+      </w:r>
+      <w:proofErr w:type="spellStart"/>
+      <w:r>
+        <w:rPr>
+          <w:rFonts w:ascii="Times New Roman" w:hAnsi="Times New Roman" w:cs="Times New Roman"/>
+          <w:lang w:val="en-GB"/>
+        </w:rPr>
+        <w:t>nambah</w:t>
+      </w:r>
+      <w:proofErr w:type="spellEnd"/>
+      <w:r>
+        <w:rPr>
+          <w:rFonts w:ascii="Times New Roman" w:hAnsi="Times New Roman" w:cs="Times New Roman"/>
+          <w:lang w:val="en-GB"/>
+        </w:rPr>
+        <w:t xml:space="preserve"> </w:t>
+      </w:r>
+      <w:proofErr w:type="spellStart"/>
+      <w:r>
+        <w:rPr>
+          <w:rFonts w:ascii="Times New Roman" w:hAnsi="Times New Roman" w:cs="Times New Roman"/>
+          <w:lang w:val="en-GB"/>
+        </w:rPr>
+        <w:t>kategori</w:t>
+      </w:r>
+      <w:proofErr w:type="spellEnd"/>
+      <w:r>
+        <w:rPr>
+          <w:rFonts w:ascii="Times New Roman" w:hAnsi="Times New Roman" w:cs="Times New Roman"/>
+          <w:lang w:val="en-GB"/>
+        </w:rPr>
+        <w:t xml:space="preserve">, </w:t>
+      </w:r>
+      <w:proofErr w:type="spellStart"/>
+      <w:r>
+        <w:rPr>
+          <w:rFonts w:ascii="Times New Roman" w:hAnsi="Times New Roman" w:cs="Times New Roman"/>
+          <w:lang w:val="en-GB"/>
+        </w:rPr>
+        <w:t>namanya</w:t>
+      </w:r>
+      <w:proofErr w:type="spellEnd"/>
+      <w:r>
+        <w:rPr>
+          <w:rFonts w:ascii="Times New Roman" w:hAnsi="Times New Roman" w:cs="Times New Roman"/>
+          <w:lang w:val="en-GB"/>
+        </w:rPr>
+        <w:t xml:space="preserve"> </w:t>
+      </w:r>
+      <w:proofErr w:type="spellStart"/>
+      <w:r>
+        <w:rPr>
+          <w:rFonts w:ascii="Times New Roman" w:hAnsi="Times New Roman" w:cs="Times New Roman"/>
+          <w:lang w:val="en-GB"/>
+        </w:rPr>
+        <w:t>tidak</w:t>
+      </w:r>
+      <w:proofErr w:type="spellEnd"/>
+      <w:r>
+        <w:rPr>
+          <w:rFonts w:ascii="Times New Roman" w:hAnsi="Times New Roman" w:cs="Times New Roman"/>
+          <w:lang w:val="en-GB"/>
+        </w:rPr>
+        <w:t xml:space="preserve"> </w:t>
+      </w:r>
+      <w:proofErr w:type="spellStart"/>
+      <w:r>
+        <w:rPr>
+          <w:rFonts w:ascii="Times New Roman" w:hAnsi="Times New Roman" w:cs="Times New Roman"/>
+          <w:lang w:val="en-GB"/>
+        </w:rPr>
+        <w:t>boleh</w:t>
+      </w:r>
+      <w:proofErr w:type="spellEnd"/>
+      <w:r>
+        <w:rPr>
+          <w:rFonts w:ascii="Times New Roman" w:hAnsi="Times New Roman" w:cs="Times New Roman"/>
+          <w:lang w:val="en-GB"/>
+        </w:rPr>
+        <w:t xml:space="preserve"> </w:t>
+      </w:r>
+      <w:proofErr w:type="spellStart"/>
+      <w:r>
+        <w:rPr>
+          <w:rFonts w:ascii="Times New Roman" w:hAnsi="Times New Roman" w:cs="Times New Roman"/>
+          <w:lang w:val="en-GB"/>
+        </w:rPr>
+        <w:t>sama</w:t>
+      </w:r>
+      <w:proofErr w:type="spellEnd"/>
+      <w:r>
+        <w:rPr>
+          <w:rFonts w:ascii="Times New Roman" w:hAnsi="Times New Roman" w:cs="Times New Roman"/>
+          <w:lang w:val="en-GB"/>
+        </w:rPr>
+        <w:t>."</w:t>
+      </w:r>
+    </w:p>
+    <w:p>
+      <w:pPr>
+        <w:jc w:val="both"/>
+        <w:rPr>
+          <w:rFonts w:ascii="Times New Roman" w:hAnsi="Times New Roman" w:cs="Times New Roman"/>
+          <w:lang w:val="en-GB"/>
+        </w:rPr>
+      </w:pPr>
+      <w:proofErr w:type="spellStart"/>
+      <w:r>
+        <w:rPr>
+          <w:rFonts w:ascii="Times New Roman" w:hAnsi="Times New Roman" w:cs="Times New Roman"/>
+          <w:lang w:val="en-GB"/>
+        </w:rPr>
+        <w:t>Kepercayaan</w:t>
+      </w:r>
+      <w:proofErr w:type="spellEnd"/>
+      <w:r>
+        <w:rPr>
+          <w:rFonts w:ascii="Times New Roman" w:hAnsi="Times New Roman" w:cs="Times New Roman"/>
+          <w:lang w:val="en-GB"/>
+        </w:rPr>
+        <w:t xml:space="preserve"> Diri: Anda </w:t>
+      </w:r>
+      <w:proofErr w:type="spellStart"/>
+      <w:r>
+        <w:rPr>
+          <w:rFonts w:ascii="Times New Roman" w:hAnsi="Times New Roman" w:cs="Times New Roman"/>
+          <w:lang w:val="en-GB"/>
+        </w:rPr>
+        <w:t>jadi</w:t>
+      </w:r>
+      <w:proofErr w:type="spellEnd"/>
+      <w:r>
+        <w:rPr>
+          <w:rFonts w:ascii="Times New Roman" w:hAnsi="Times New Roman" w:cs="Times New Roman"/>
+          <w:lang w:val="en-GB"/>
+        </w:rPr>
+        <w:t xml:space="preserve"> </w:t>
+      </w:r>
+      <w:proofErr w:type="spellStart"/>
+      <w:r>
+        <w:rPr>
+          <w:rFonts w:ascii="Times New Roman" w:hAnsi="Times New Roman" w:cs="Times New Roman"/>
+          <w:lang w:val="en-GB"/>
+        </w:rPr>
+        <w:t>yakin</w:t>
+      </w:r>
+      <w:proofErr w:type="spellEnd"/>
+      <w:r>
+        <w:rPr>
+          <w:rFonts w:ascii="Times New Roman" w:hAnsi="Times New Roman" w:cs="Times New Roman"/>
+          <w:lang w:val="en-GB"/>
+        </w:rPr>
+        <w:t xml:space="preserve"> </w:t>
+      </w:r>
+      <w:proofErr w:type="spellStart"/>
+      <w:r>
+        <w:rPr>
+          <w:rFonts w:ascii="Times New Roman" w:hAnsi="Times New Roman" w:cs="Times New Roman"/>
+          <w:lang w:val="en-GB"/>
+        </w:rPr>
+        <w:t>bahwa</w:t>
+      </w:r>
+      <w:proofErr w:type="spellEnd"/>
+      <w:r>
+        <w:rPr>
+          <w:rFonts w:ascii="Times New Roman" w:hAnsi="Times New Roman" w:cs="Times New Roman"/>
+          <w:lang w:val="en-GB"/>
+        </w:rPr>
+        <w:t xml:space="preserve"> </w:t>
+      </w:r>
+      <w:proofErr w:type="spellStart"/>
+      <w:r>
+        <w:rPr>
+          <w:rFonts w:ascii="Times New Roman" w:hAnsi="Times New Roman" w:cs="Times New Roman"/>
+          <w:lang w:val="en-GB"/>
+        </w:rPr>
+        <w:t>fitur</w:t>
+      </w:r>
+      <w:proofErr w:type="spellEnd"/>
+      <w:r>
+        <w:rPr>
+          <w:rFonts w:ascii="Times New Roman" w:hAnsi="Times New Roman" w:cs="Times New Roman"/>
+          <w:lang w:val="en-GB"/>
+        </w:rPr>
+        <w:t xml:space="preserve"> Anda </w:t>
+      </w:r>
+      <w:proofErr w:type="spellStart"/>
+      <w:r>
+        <w:rPr>
+          <w:rFonts w:ascii="Times New Roman" w:hAnsi="Times New Roman" w:cs="Times New Roman"/>
+          <w:lang w:val="en-GB"/>
+        </w:rPr>
+        <w:t>sudah</w:t>
+      </w:r>
+      <w:proofErr w:type="spellEnd"/>
+      <w:r>
+        <w:rPr>
+          <w:rFonts w:ascii="Times New Roman" w:hAnsi="Times New Roman" w:cs="Times New Roman"/>
+          <w:lang w:val="en-GB"/>
+        </w:rPr>
+        <w:t xml:space="preserve"> 100% </w:t>
+      </w:r>
+      <w:proofErr w:type="spellStart"/>
+      <w:r>
+        <w:rPr>
+          <w:rFonts w:ascii="Times New Roman" w:hAnsi="Times New Roman" w:cs="Times New Roman"/>
+          <w:lang w:val="en-GB"/>
+        </w:rPr>
+        <w:t>benar</w:t>
+      </w:r>
+      <w:proofErr w:type="spellEnd"/>
+      <w:r>
+        <w:rPr>
+          <w:rFonts w:ascii="Times New Roman" w:hAnsi="Times New Roman" w:cs="Times New Roman"/>
+          <w:lang w:val="en-GB"/>
+        </w:rPr>
+        <w:t xml:space="preserve"> </w:t>
+      </w:r>
+      <w:proofErr w:type="spellStart"/>
+      <w:r>
+        <w:rPr>
+          <w:rFonts w:ascii="Times New Roman" w:hAnsi="Times New Roman" w:cs="Times New Roman"/>
+          <w:lang w:val="en-GB"/>
+        </w:rPr>
+        <w:t>tanpa</w:t>
+      </w:r>
+      <w:proofErr w:type="spellEnd"/>
+      <w:r>
+        <w:rPr>
+          <w:rFonts w:ascii="Times New Roman" w:hAnsi="Times New Roman" w:cs="Times New Roman"/>
+          <w:lang w:val="en-GB"/>
+        </w:rPr>
+        <w:t xml:space="preserve"> </w:t>
+      </w:r>
+      <w:proofErr w:type="spellStart"/>
+      <w:r>
+        <w:rPr>
+          <w:rFonts w:ascii="Times New Roman" w:hAnsi="Times New Roman" w:cs="Times New Roman"/>
+          <w:lang w:val="en-GB"/>
+        </w:rPr>
+        <w:t>harus</w:t>
+      </w:r>
+      <w:proofErr w:type="spellEnd"/>
+      <w:r>
+        <w:rPr>
+          <w:rFonts w:ascii="Times New Roman" w:hAnsi="Times New Roman" w:cs="Times New Roman"/>
+          <w:lang w:val="en-GB"/>
+        </w:rPr>
+        <w:t xml:space="preserve"> </w:t>
+      </w:r>
+      <w:proofErr w:type="spellStart"/>
+      <w:r>
+        <w:rPr>
+          <w:rFonts w:ascii="Times New Roman" w:hAnsi="Times New Roman" w:cs="Times New Roman"/>
+          <w:lang w:val="en-GB"/>
+        </w:rPr>
+        <w:t>mencoba</w:t>
+      </w:r>
+      <w:proofErr w:type="spellEnd"/>
+      <w:r>
+        <w:rPr>
+          <w:rFonts w:ascii="Times New Roman" w:hAnsi="Times New Roman" w:cs="Times New Roman"/>
+          <w:lang w:val="en-GB"/>
+        </w:rPr>
+        <w:t xml:space="preserve"> </w:t>
+      </w:r>
+      <w:proofErr w:type="spellStart"/>
+      <w:r>
+        <w:rPr>
+          <w:rFonts w:ascii="Times New Roman" w:hAnsi="Times New Roman" w:cs="Times New Roman"/>
+          <w:lang w:val="en-GB"/>
+        </w:rPr>
+        <w:t>klik-klik</w:t>
+      </w:r>
+      <w:proofErr w:type="spellEnd"/>
+      <w:r>
+        <w:rPr>
+          <w:rFonts w:ascii="Times New Roman" w:hAnsi="Times New Roman" w:cs="Times New Roman"/>
+          <w:lang w:val="en-GB"/>
+        </w:rPr>
+        <w:t xml:space="preserve"> manual di </w:t>
+      </w:r>
+      <w:proofErr w:type="spellStart"/>
+      <w:r>
+        <w:rPr>
+          <w:rFonts w:ascii="Times New Roman" w:hAnsi="Times New Roman" w:cs="Times New Roman"/>
+          <w:lang w:val="en-GB"/>
+        </w:rPr>
+        <w:t>aplikasi</w:t>
+      </w:r>
+      <w:proofErr w:type="spellEnd"/>
+      <w:r>
+        <w:rPr>
+          <w:rFonts w:ascii="Times New Roman" w:hAnsi="Times New Roman" w:cs="Times New Roman"/>
+          <w:lang w:val="en-GB"/>
+        </w:rPr>
+        <w:t xml:space="preserve"> </w:t>
+      </w:r>
+      <w:proofErr w:type="spellStart"/>
+      <w:r>
+        <w:rPr>
+          <w:rFonts w:ascii="Times New Roman" w:hAnsi="Times New Roman" w:cs="Times New Roman"/>
+          <w:lang w:val="en-GB"/>
+        </w:rPr>
+        <w:t>berulang</w:t>
+      </w:r>
+      <w:proofErr w:type="spellEnd"/>
+      <w:r>
+        <w:rPr>
+          <w:rFonts w:ascii="Times New Roman" w:hAnsi="Times New Roman" w:cs="Times New Roman"/>
+          <w:lang w:val="en-GB"/>
+        </w:rPr>
+        <w:t xml:space="preserve"> kali.</w:t>
+      </w:r>
     </w:p>
     <w:sectPr>
       <w:pgSz w:w="11906" w:h="16838"/>

</xml_diff>

<commit_message>
Perbaikan struktur file app.controller.ts
</commit_message>
<xml_diff>
--- a/dokumentasi/24382001P_Lorensius Firngadi_IF 23 E_Dokumentasi.docx
+++ b/dokumentasi/24382001P_Lorensius Firngadi_IF 23 E_Dokumentasi.docx
@@ -20534,14 +20534,7 @@
           <w:rFonts w:ascii="Times New Roman" w:hAnsi="Times New Roman" w:cs="Times New Roman"/>
           <w:lang w:val="en-GB"/>
         </w:rPr>
-        <w:t>,</w:t>
-      </w:r>
-      <w:r>
-        <w:rPr>
-          <w:rFonts w:ascii="Times New Roman" w:hAnsi="Times New Roman" w:cs="Times New Roman"/>
-          <w:lang w:val="en-GB"/>
-        </w:rPr>
-        <w:t xml:space="preserve"> </w:t>
+        <w:t xml:space="preserve">, </w:t>
       </w:r>
       <w:proofErr w:type="spellStart"/>
       <w:r>
@@ -20565,14 +20558,7 @@
           <w:rFonts w:ascii="Times New Roman" w:hAnsi="Times New Roman" w:cs="Times New Roman"/>
           <w:lang w:val="en-GB"/>
         </w:rPr>
-        <w:t>me</w:t>
-      </w:r>
-      <w:r>
-        <w:rPr>
-          <w:rFonts w:ascii="Times New Roman" w:hAnsi="Times New Roman" w:cs="Times New Roman"/>
-          <w:lang w:val="en-GB"/>
-        </w:rPr>
-        <w:t>nggunakan</w:t>
+        <w:t>menggunakan</w:t>
       </w:r>
       <w:proofErr w:type="spellEnd"/>
       <w:r>
@@ -20649,15 +20635,15 @@
           <w:rFonts w:ascii="Times New Roman" w:hAnsi="Times New Roman" w:cs="Times New Roman"/>
           <w:lang w:val="en-GB"/>
         </w:rPr>
-        <w:t>Pusat Pe</w:t>
-      </w:r>
-      <w:proofErr w:type="spellStart"/>
-      <w:r>
-        <w:rPr>
-          <w:rFonts w:ascii="Times New Roman" w:hAnsi="Times New Roman" w:cs="Times New Roman"/>
-          <w:lang w:val="en-GB"/>
-        </w:rPr>
-        <w:t>ngaturan</w:t>
+        <w:t xml:space="preserve">Pusat </w:t>
+      </w:r>
+      <w:proofErr w:type="spellStart"/>
+      <w:r>
+        <w:rPr>
+          <w:rFonts w:ascii="Times New Roman" w:hAnsi="Times New Roman" w:cs="Times New Roman"/>
+          <w:lang w:val="en-GB"/>
+        </w:rPr>
+        <w:t>Pengaturan</w:t>
       </w:r>
       <w:proofErr w:type="spellEnd"/>
       <w:r>
@@ -22841,15 +22827,15 @@
           <w:rFonts w:ascii="Times New Roman" w:hAnsi="Times New Roman" w:cs="Times New Roman"/>
           <w:lang w:val="en-GB"/>
         </w:rPr>
-        <w:t xml:space="preserve"> m</w:t>
-      </w:r>
-      <w:proofErr w:type="spellStart"/>
-      <w:r>
-        <w:rPr>
-          <w:rFonts w:ascii="Times New Roman" w:hAnsi="Times New Roman" w:cs="Times New Roman"/>
-          <w:lang w:val="en-GB"/>
-        </w:rPr>
-        <w:t>emperbaikinya</w:t>
+        <w:t xml:space="preserve"> </w:t>
+      </w:r>
+      <w:proofErr w:type="spellStart"/>
+      <w:r>
+        <w:rPr>
+          <w:rFonts w:ascii="Times New Roman" w:hAnsi="Times New Roman" w:cs="Times New Roman"/>
+          <w:lang w:val="en-GB"/>
+        </w:rPr>
+        <w:t>memperbaikinya</w:t>
       </w:r>
       <w:proofErr w:type="spellEnd"/>
       <w:r>
@@ -23373,6 +23359,458 @@
         </w:rPr>
         <w:t xml:space="preserve"> kali.</w:t>
       </w:r>
+    </w:p>
+    <w:p>
+      <w:pPr>
+        <w:jc w:val="both"/>
+        <w:rPr>
+          <w:rFonts w:ascii="Times New Roman" w:hAnsi="Times New Roman" w:cs="Times New Roman"/>
+          <w:lang w:val="en-GB"/>
+        </w:rPr>
+      </w:pPr>
+    </w:p>
+    <w:p>
+      <w:pPr>
+        <w:jc w:val="both"/>
+        <w:rPr>
+          <w:rFonts w:ascii="Times New Roman" w:hAnsi="Times New Roman" w:cs="Times New Roman"/>
+          <w:lang w:val="en-GB"/>
+        </w:rPr>
+      </w:pPr>
+      <w:r>
+        <w:rPr>
+          <w:rFonts w:ascii="Times New Roman" w:hAnsi="Times New Roman" w:cs="Times New Roman"/>
+          <w:lang w:val="en-GB"/>
+        </w:rPr>
+        <w:t xml:space="preserve">23. </w:t>
+      </w:r>
+      <w:proofErr w:type="spellStart"/>
+      <w:r>
+        <w:rPr>
+          <w:rFonts w:ascii="Times New Roman" w:hAnsi="Times New Roman" w:cs="Times New Roman"/>
+          <w:lang w:val="en-GB"/>
+        </w:rPr>
+        <w:t>Membuat</w:t>
+      </w:r>
+      <w:proofErr w:type="spellEnd"/>
+      <w:r>
+        <w:rPr>
+          <w:rFonts w:ascii="Times New Roman" w:hAnsi="Times New Roman" w:cs="Times New Roman"/>
+          <w:lang w:val="en-GB"/>
+        </w:rPr>
+        <w:t xml:space="preserve"> </w:t>
+      </w:r>
+      <w:r>
+        <w:rPr>
+          <w:rFonts w:ascii="Times New Roman" w:hAnsi="Times New Roman" w:cs="Times New Roman"/>
+          <w:lang w:val="en-GB"/>
+        </w:rPr>
+        <w:t>Main App Files</w:t>
+      </w:r>
+    </w:p>
+    <w:p>
+      <w:pPr>
+        <w:jc w:val="both"/>
+      </w:pPr>
+      <w:r>
+        <w:rPr>
+          <w:rFonts w:ascii="Times New Roman" w:hAnsi="Times New Roman" w:cs="Times New Roman"/>
+          <w:lang w:val="en-GB"/>
+        </w:rPr>
+        <w:t xml:space="preserve">File : </w:t>
+      </w:r>
+      <w:proofErr w:type="spellStart"/>
+      <w:r>
+        <w:t>src</w:t>
+      </w:r>
+      <w:proofErr w:type="spellEnd"/>
+      <w:r>
+        <w:t>/</w:t>
+      </w:r>
+      <w:proofErr w:type="spellStart"/>
+      <w:r>
+        <w:t>app.module.ts</w:t>
+      </w:r>
+      <w:proofErr w:type="spellEnd"/>
+    </w:p>
+    <w:p>
+      <w:pPr>
+        <w:jc w:val="both"/>
+      </w:pPr>
+      <w:r>
+        <w:rPr>
+          <w:noProof/>
+        </w:rPr>
+        <w:drawing>
+          <wp:inline distT="0" distB="0" distL="0" distR="0" wp14:anchorId="59B79F5C" wp14:editId="2D323A8E">
+            <wp:extent cx="5731510" cy="3222625"/>
+            <wp:effectExtent l="0" t="0" r="2540" b="0"/>
+            <wp:docPr id="586069679" name="Picture 1"/>
+            <wp:cNvGraphicFramePr>
+              <a:graphicFrameLocks xmlns:a="http://schemas.openxmlformats.org/drawingml/2006/main" noChangeAspect="1"/>
+            </wp:cNvGraphicFramePr>
+            <a:graphic xmlns:a="http://schemas.openxmlformats.org/drawingml/2006/main">
+              <a:graphicData uri="http://schemas.openxmlformats.org/drawingml/2006/picture">
+                <pic:pic xmlns:pic="http://schemas.openxmlformats.org/drawingml/2006/picture">
+                  <pic:nvPicPr>
+                    <pic:cNvPr id="586069679" name=""/>
+                    <pic:cNvPicPr/>
+                  </pic:nvPicPr>
+                  <pic:blipFill>
+                    <a:blip r:embed="rId27"/>
+                    <a:stretch>
+                      <a:fillRect/>
+                    </a:stretch>
+                  </pic:blipFill>
+                  <pic:spPr>
+                    <a:xfrm>
+                      <a:off x="0" y="0"/>
+                      <a:ext cx="5731510" cy="3222625"/>
+                    </a:xfrm>
+                    <a:prstGeom prst="rect">
+                      <a:avLst/>
+                    </a:prstGeom>
+                  </pic:spPr>
+                </pic:pic>
+              </a:graphicData>
+            </a:graphic>
+          </wp:inline>
+        </w:drawing>
+      </w:r>
+    </w:p>
+    <w:p>
+      <w:pPr>
+        <w:jc w:val="both"/>
+      </w:pPr>
+      <w:proofErr w:type="spellStart"/>
+      <w:r>
+        <w:t>Titik</w:t>
+      </w:r>
+      <w:proofErr w:type="spellEnd"/>
+      <w:r>
+        <w:t xml:space="preserve"> Awal (Entry Point): Saat </w:t>
+      </w:r>
+      <w:proofErr w:type="spellStart"/>
+      <w:r>
+        <w:t>aplikasi</w:t>
+      </w:r>
+      <w:proofErr w:type="spellEnd"/>
+      <w:r>
+        <w:t xml:space="preserve"> </w:t>
+      </w:r>
+      <w:proofErr w:type="spellStart"/>
+      <w:r>
+        <w:t>dijalankan</w:t>
+      </w:r>
+      <w:proofErr w:type="spellEnd"/>
+      <w:r>
+        <w:t xml:space="preserve">, </w:t>
+      </w:r>
+      <w:proofErr w:type="spellStart"/>
+      <w:r>
+        <w:t>NestJS</w:t>
+      </w:r>
+      <w:proofErr w:type="spellEnd"/>
+      <w:r>
+        <w:t xml:space="preserve"> </w:t>
+      </w:r>
+      <w:proofErr w:type="spellStart"/>
+      <w:r>
+        <w:t>pertama</w:t>
+      </w:r>
+      <w:proofErr w:type="spellEnd"/>
+      <w:r>
+        <w:t xml:space="preserve"> kali </w:t>
+      </w:r>
+      <w:proofErr w:type="spellStart"/>
+      <w:r>
+        <w:t>akan</w:t>
+      </w:r>
+      <w:proofErr w:type="spellEnd"/>
+      <w:r>
+        <w:t xml:space="preserve"> </w:t>
+      </w:r>
+      <w:proofErr w:type="spellStart"/>
+      <w:r>
+        <w:t>mencari</w:t>
+      </w:r>
+      <w:proofErr w:type="spellEnd"/>
+      <w:r>
+        <w:t xml:space="preserve"> </w:t>
+      </w:r>
+      <w:proofErr w:type="spellStart"/>
+      <w:r>
+        <w:t>AppModule</w:t>
+      </w:r>
+      <w:proofErr w:type="spellEnd"/>
+      <w:r>
+        <w:t xml:space="preserve">. Jika </w:t>
+      </w:r>
+      <w:proofErr w:type="spellStart"/>
+      <w:r>
+        <w:t>suatu</w:t>
+      </w:r>
+      <w:proofErr w:type="spellEnd"/>
+      <w:r>
+        <w:t xml:space="preserve"> </w:t>
+      </w:r>
+      <w:proofErr w:type="spellStart"/>
+      <w:r>
+        <w:t>modul</w:t>
+      </w:r>
+      <w:proofErr w:type="spellEnd"/>
+      <w:r>
+        <w:t xml:space="preserve"> (</w:t>
+      </w:r>
+      <w:proofErr w:type="spellStart"/>
+      <w:r>
+        <w:t>misal</w:t>
+      </w:r>
+      <w:proofErr w:type="spellEnd"/>
+      <w:r>
+        <w:t xml:space="preserve">: </w:t>
+      </w:r>
+      <w:proofErr w:type="spellStart"/>
+      <w:r>
+        <w:t>KategoriModule</w:t>
+      </w:r>
+      <w:proofErr w:type="spellEnd"/>
+      <w:r>
+        <w:t xml:space="preserve">) </w:t>
+      </w:r>
+      <w:proofErr w:type="spellStart"/>
+      <w:r>
+        <w:t>tidak</w:t>
+      </w:r>
+      <w:proofErr w:type="spellEnd"/>
+      <w:r>
+        <w:t xml:space="preserve"> </w:t>
+      </w:r>
+      <w:proofErr w:type="spellStart"/>
+      <w:r>
+        <w:t>terdaftar</w:t>
+      </w:r>
+      <w:proofErr w:type="spellEnd"/>
+      <w:r>
+        <w:t xml:space="preserve"> di </w:t>
+      </w:r>
+      <w:proofErr w:type="spellStart"/>
+      <w:r>
+        <w:t>sini</w:t>
+      </w:r>
+      <w:proofErr w:type="spellEnd"/>
+      <w:r>
+        <w:t xml:space="preserve">, </w:t>
+      </w:r>
+      <w:proofErr w:type="spellStart"/>
+      <w:r>
+        <w:t>maka</w:t>
+      </w:r>
+      <w:proofErr w:type="spellEnd"/>
+      <w:r>
+        <w:t xml:space="preserve"> </w:t>
+      </w:r>
+      <w:proofErr w:type="spellStart"/>
+      <w:r>
+        <w:t>fitur</w:t>
+      </w:r>
+      <w:proofErr w:type="spellEnd"/>
+      <w:r>
+        <w:t xml:space="preserve"> </w:t>
+      </w:r>
+      <w:proofErr w:type="spellStart"/>
+      <w:r>
+        <w:t>kategori</w:t>
+      </w:r>
+      <w:proofErr w:type="spellEnd"/>
+      <w:r>
+        <w:t xml:space="preserve"> </w:t>
+      </w:r>
+      <w:proofErr w:type="spellStart"/>
+      <w:r>
+        <w:t>tersebut</w:t>
+      </w:r>
+      <w:proofErr w:type="spellEnd"/>
+      <w:r>
+        <w:t xml:space="preserve"> </w:t>
+      </w:r>
+      <w:proofErr w:type="spellStart"/>
+      <w:r>
+        <w:t>tidak</w:t>
+      </w:r>
+      <w:proofErr w:type="spellEnd"/>
+      <w:r>
+        <w:t xml:space="preserve"> </w:t>
+      </w:r>
+      <w:proofErr w:type="spellStart"/>
+      <w:r>
+        <w:t>akan</w:t>
+      </w:r>
+      <w:proofErr w:type="spellEnd"/>
+      <w:r>
+        <w:t xml:space="preserve"> </w:t>
+      </w:r>
+      <w:proofErr w:type="spellStart"/>
+      <w:r>
+        <w:t>pernah</w:t>
+      </w:r>
+      <w:proofErr w:type="spellEnd"/>
+      <w:r>
+        <w:t xml:space="preserve"> </w:t>
+      </w:r>
+      <w:proofErr w:type="spellStart"/>
+      <w:r>
+        <w:t>bisa</w:t>
+      </w:r>
+      <w:proofErr w:type="spellEnd"/>
+      <w:r>
+        <w:t xml:space="preserve"> </w:t>
+      </w:r>
+      <w:proofErr w:type="spellStart"/>
+      <w:r>
+        <w:t>diakses</w:t>
+      </w:r>
+      <w:proofErr w:type="spellEnd"/>
+      <w:r>
+        <w:t xml:space="preserve"> oleh </w:t>
+      </w:r>
+      <w:proofErr w:type="spellStart"/>
+      <w:r>
+        <w:t>pengguna</w:t>
+      </w:r>
+      <w:proofErr w:type="spellEnd"/>
+      <w:r>
+        <w:t>.</w:t>
+      </w:r>
+    </w:p>
+    <w:p>
+      <w:pPr>
+        <w:jc w:val="both"/>
+      </w:pPr>
+      <w:proofErr w:type="spellStart"/>
+      <w:r>
+        <w:t>Manajemen</w:t>
+      </w:r>
+      <w:proofErr w:type="spellEnd"/>
+      <w:r>
+        <w:t xml:space="preserve"> </w:t>
+      </w:r>
+      <w:proofErr w:type="spellStart"/>
+      <w:r>
+        <w:t>Koneksi</w:t>
+      </w:r>
+      <w:proofErr w:type="spellEnd"/>
+      <w:r>
+        <w:t xml:space="preserve">: </w:t>
+      </w:r>
+      <w:proofErr w:type="spellStart"/>
+      <w:r>
+        <w:t>M</w:t>
+      </w:r>
+      <w:r>
+        <w:t>emastikan</w:t>
+      </w:r>
+      <w:proofErr w:type="spellEnd"/>
+      <w:r>
+        <w:t xml:space="preserve"> </w:t>
+      </w:r>
+      <w:proofErr w:type="spellStart"/>
+      <w:r>
+        <w:t>bahwa</w:t>
+      </w:r>
+      <w:proofErr w:type="spellEnd"/>
+      <w:r>
+        <w:t xml:space="preserve"> </w:t>
+      </w:r>
+      <w:proofErr w:type="spellStart"/>
+      <w:r>
+        <w:t>sebelum</w:t>
+      </w:r>
+      <w:proofErr w:type="spellEnd"/>
+      <w:r>
+        <w:t xml:space="preserve"> </w:t>
+      </w:r>
+      <w:proofErr w:type="spellStart"/>
+      <w:r>
+        <w:t>fitur</w:t>
+      </w:r>
+      <w:proofErr w:type="spellEnd"/>
+      <w:r>
+        <w:t xml:space="preserve"> </w:t>
+      </w:r>
+      <w:proofErr w:type="spellStart"/>
+      <w:r>
+        <w:t>Kategori</w:t>
+      </w:r>
+      <w:proofErr w:type="spellEnd"/>
+      <w:r>
+        <w:t xml:space="preserve"> </w:t>
+      </w:r>
+      <w:proofErr w:type="spellStart"/>
+      <w:r>
+        <w:t>jalan</w:t>
+      </w:r>
+      <w:proofErr w:type="spellEnd"/>
+      <w:r>
+        <w:t xml:space="preserve">, </w:t>
+      </w:r>
+      <w:proofErr w:type="spellStart"/>
+      <w:r>
+        <w:t>pengaturan</w:t>
+      </w:r>
+      <w:proofErr w:type="spellEnd"/>
+      <w:r>
+        <w:t xml:space="preserve"> </w:t>
+      </w:r>
+      <w:proofErr w:type="spellStart"/>
+      <w:r>
+        <w:t>dari</w:t>
+      </w:r>
+      <w:proofErr w:type="spellEnd"/>
+      <w:r>
+        <w:t xml:space="preserve"> .env dan </w:t>
+      </w:r>
+      <w:proofErr w:type="spellStart"/>
+      <w:r>
+        <w:t>koneksi</w:t>
+      </w:r>
+      <w:proofErr w:type="spellEnd"/>
+      <w:r>
+        <w:t xml:space="preserve"> Database </w:t>
+      </w:r>
+      <w:proofErr w:type="spellStart"/>
+      <w:r>
+        <w:t>sudah</w:t>
+      </w:r>
+      <w:proofErr w:type="spellEnd"/>
+      <w:r>
+        <w:t xml:space="preserve"> </w:t>
+      </w:r>
+      <w:proofErr w:type="spellStart"/>
+      <w:r>
+        <w:t>siap</w:t>
+      </w:r>
+      <w:proofErr w:type="spellEnd"/>
+      <w:r>
+        <w:t xml:space="preserve"> </w:t>
+      </w:r>
+      <w:proofErr w:type="spellStart"/>
+      <w:r>
+        <w:t>digunakan</w:t>
+      </w:r>
+      <w:proofErr w:type="spellEnd"/>
+      <w:r>
+        <w:t>.</w:t>
+      </w:r>
+    </w:p>
+    <w:p>
+      <w:pPr>
+        <w:jc w:val="both"/>
+        <w:rPr>
+          <w:rFonts w:ascii="Times New Roman" w:hAnsi="Times New Roman" w:cs="Times New Roman"/>
+          <w:lang w:val="en-GB"/>
+        </w:rPr>
+      </w:pPr>
     </w:p>
     <w:sectPr>
       <w:pgSz w:w="11906" w:h="16838"/>

</xml_diff>

<commit_message>
Membuat file app.service.ts pada folder src
</commit_message>
<xml_diff>
--- a/dokumentasi/24382001P_Lorensius Firngadi_IF 23 E_Dokumentasi.docx
+++ b/dokumentasi/24382001P_Lorensius Firngadi_IF 23 E_Dokumentasi.docx
@@ -23801,6 +23801,1035 @@
       <w:proofErr w:type="spellEnd"/>
       <w:r>
         <w:t>.</w:t>
+      </w:r>
+    </w:p>
+    <w:p>
+      <w:pPr>
+        <w:jc w:val="both"/>
+      </w:pPr>
+    </w:p>
+    <w:p>
+      <w:pPr>
+        <w:jc w:val="both"/>
+      </w:pPr>
+      <w:r>
+        <w:t xml:space="preserve">24. </w:t>
+      </w:r>
+      <w:proofErr w:type="spellStart"/>
+      <w:r>
+        <w:t>Membuat</w:t>
+      </w:r>
+      <w:proofErr w:type="spellEnd"/>
+      <w:r>
+        <w:t xml:space="preserve"> file </w:t>
+      </w:r>
+      <w:r>
+        <w:t>App Controller</w:t>
+      </w:r>
+    </w:p>
+    <w:p>
+      <w:pPr>
+        <w:jc w:val="both"/>
+      </w:pPr>
+      <w:r>
+        <w:t xml:space="preserve">File : </w:t>
+      </w:r>
+      <w:proofErr w:type="spellStart"/>
+      <w:r>
+        <w:t>src</w:t>
+      </w:r>
+      <w:proofErr w:type="spellEnd"/>
+      <w:r>
+        <w:t>/</w:t>
+      </w:r>
+      <w:proofErr w:type="spellStart"/>
+      <w:r>
+        <w:t>app.controller.ts</w:t>
+      </w:r>
+      <w:proofErr w:type="spellEnd"/>
+    </w:p>
+    <w:p>
+      <w:pPr>
+        <w:jc w:val="both"/>
+      </w:pPr>
+      <w:r>
+        <w:rPr>
+          <w:noProof/>
+        </w:rPr>
+        <w:lastRenderedPageBreak/>
+        <w:drawing>
+          <wp:inline distT="0" distB="0" distL="0" distR="0" wp14:anchorId="37DC2092" wp14:editId="6B737D01">
+            <wp:extent cx="5731510" cy="3222625"/>
+            <wp:effectExtent l="0" t="0" r="2540" b="0"/>
+            <wp:docPr id="105752143" name="Picture 1"/>
+            <wp:cNvGraphicFramePr>
+              <a:graphicFrameLocks xmlns:a="http://schemas.openxmlformats.org/drawingml/2006/main" noChangeAspect="1"/>
+            </wp:cNvGraphicFramePr>
+            <a:graphic xmlns:a="http://schemas.openxmlformats.org/drawingml/2006/main">
+              <a:graphicData uri="http://schemas.openxmlformats.org/drawingml/2006/picture">
+                <pic:pic xmlns:pic="http://schemas.openxmlformats.org/drawingml/2006/picture">
+                  <pic:nvPicPr>
+                    <pic:cNvPr id="105752143" name=""/>
+                    <pic:cNvPicPr/>
+                  </pic:nvPicPr>
+                  <pic:blipFill>
+                    <a:blip r:embed="rId28"/>
+                    <a:stretch>
+                      <a:fillRect/>
+                    </a:stretch>
+                  </pic:blipFill>
+                  <pic:spPr>
+                    <a:xfrm>
+                      <a:off x="0" y="0"/>
+                      <a:ext cx="5731510" cy="3222625"/>
+                    </a:xfrm>
+                    <a:prstGeom prst="rect">
+                      <a:avLst/>
+                    </a:prstGeom>
+                  </pic:spPr>
+                </pic:pic>
+              </a:graphicData>
+            </a:graphic>
+          </wp:inline>
+        </w:drawing>
+      </w:r>
+    </w:p>
+    <w:p>
+      <w:pPr>
+        <w:jc w:val="both"/>
+      </w:pPr>
+      <w:r>
+        <w:t xml:space="preserve">@Controller: </w:t>
+      </w:r>
+      <w:proofErr w:type="spellStart"/>
+      <w:r>
+        <w:t>merespons</w:t>
+      </w:r>
+      <w:proofErr w:type="spellEnd"/>
+      <w:r>
+        <w:t xml:space="preserve"> </w:t>
+      </w:r>
+      <w:proofErr w:type="spellStart"/>
+      <w:r>
+        <w:t>siapapun</w:t>
+      </w:r>
+      <w:proofErr w:type="spellEnd"/>
+      <w:r>
+        <w:t xml:space="preserve"> yang </w:t>
+      </w:r>
+      <w:proofErr w:type="spellStart"/>
+      <w:r>
+        <w:t>mengakses</w:t>
+      </w:r>
+      <w:proofErr w:type="spellEnd"/>
+      <w:r>
+        <w:t xml:space="preserve"> </w:t>
+      </w:r>
+      <w:proofErr w:type="spellStart"/>
+      <w:r>
+        <w:t>alamat</w:t>
+      </w:r>
+      <w:proofErr w:type="spellEnd"/>
+      <w:r>
+        <w:t xml:space="preserve"> </w:t>
+      </w:r>
+      <w:proofErr w:type="spellStart"/>
+      <w:r>
+        <w:t>dasar</w:t>
+      </w:r>
+      <w:proofErr w:type="spellEnd"/>
+      <w:r>
+        <w:t xml:space="preserve"> </w:t>
+      </w:r>
+      <w:proofErr w:type="spellStart"/>
+      <w:r>
+        <w:t>aplikasi</w:t>
+      </w:r>
+      <w:proofErr w:type="spellEnd"/>
+      <w:r>
+        <w:t xml:space="preserve"> (</w:t>
+      </w:r>
+      <w:proofErr w:type="spellStart"/>
+      <w:r>
+        <w:t>contoh</w:t>
+      </w:r>
+      <w:proofErr w:type="spellEnd"/>
+      <w:r>
+        <w:t>: localhost:3000/).</w:t>
+      </w:r>
+    </w:p>
+    <w:p>
+      <w:pPr>
+        <w:jc w:val="both"/>
+      </w:pPr>
+      <w:r>
+        <w:t xml:space="preserve">@Get: Ketika </w:t>
+      </w:r>
+      <w:proofErr w:type="spellStart"/>
+      <w:r>
+        <w:t>ada</w:t>
+      </w:r>
+      <w:proofErr w:type="spellEnd"/>
+      <w:r>
+        <w:t xml:space="preserve"> </w:t>
+      </w:r>
+      <w:proofErr w:type="spellStart"/>
+      <w:r>
+        <w:t>pengguna</w:t>
+      </w:r>
+      <w:proofErr w:type="spellEnd"/>
+      <w:r>
+        <w:t xml:space="preserve"> yang </w:t>
+      </w:r>
+      <w:proofErr w:type="spellStart"/>
+      <w:r>
+        <w:t>datang</w:t>
+      </w:r>
+      <w:proofErr w:type="spellEnd"/>
+      <w:r>
+        <w:t xml:space="preserve"> </w:t>
+      </w:r>
+      <w:proofErr w:type="spellStart"/>
+      <w:r>
+        <w:t>berkunjung</w:t>
+      </w:r>
+      <w:proofErr w:type="spellEnd"/>
+      <w:r>
+        <w:t xml:space="preserve"> (</w:t>
+      </w:r>
+      <w:proofErr w:type="spellStart"/>
+      <w:r>
+        <w:t>melakukan</w:t>
+      </w:r>
+      <w:proofErr w:type="spellEnd"/>
+      <w:r>
+        <w:t xml:space="preserve"> </w:t>
+      </w:r>
+      <w:proofErr w:type="spellStart"/>
+      <w:r>
+        <w:t>permintaan</w:t>
+      </w:r>
+      <w:proofErr w:type="spellEnd"/>
+      <w:r>
+        <w:t xml:space="preserve"> GET),  </w:t>
+      </w:r>
+      <w:proofErr w:type="spellStart"/>
+      <w:r>
+        <w:t>ini</w:t>
+      </w:r>
+      <w:proofErr w:type="spellEnd"/>
+      <w:r>
+        <w:t xml:space="preserve"> </w:t>
+      </w:r>
+      <w:proofErr w:type="spellStart"/>
+      <w:r>
+        <w:t>akan</w:t>
+      </w:r>
+      <w:proofErr w:type="spellEnd"/>
+      <w:r>
+        <w:t xml:space="preserve"> </w:t>
+      </w:r>
+      <w:proofErr w:type="spellStart"/>
+      <w:r>
+        <w:t>langsung</w:t>
+      </w:r>
+      <w:proofErr w:type="spellEnd"/>
+      <w:r>
+        <w:t xml:space="preserve"> </w:t>
+      </w:r>
+      <w:proofErr w:type="spellStart"/>
+      <w:r>
+        <w:t>bereaksi</w:t>
+      </w:r>
+      <w:proofErr w:type="spellEnd"/>
+      <w:r>
+        <w:t>.</w:t>
+      </w:r>
+    </w:p>
+    <w:p>
+      <w:pPr>
+        <w:jc w:val="both"/>
+      </w:pPr>
+      <w:proofErr w:type="spellStart"/>
+      <w:r>
+        <w:t>Bertanya</w:t>
+      </w:r>
+      <w:proofErr w:type="spellEnd"/>
+      <w:r>
+        <w:t xml:space="preserve"> </w:t>
+      </w:r>
+      <w:proofErr w:type="spellStart"/>
+      <w:r>
+        <w:t>ke</w:t>
+      </w:r>
+      <w:proofErr w:type="spellEnd"/>
+      <w:r>
+        <w:t xml:space="preserve"> </w:t>
+      </w:r>
+      <w:proofErr w:type="spellStart"/>
+      <w:r>
+        <w:t>Asisten</w:t>
+      </w:r>
+      <w:proofErr w:type="spellEnd"/>
+      <w:r>
+        <w:t xml:space="preserve"> (</w:t>
+      </w:r>
+      <w:proofErr w:type="spellStart"/>
+      <w:r>
+        <w:t>AppService</w:t>
+      </w:r>
+      <w:proofErr w:type="spellEnd"/>
+      <w:r>
+        <w:t xml:space="preserve">): </w:t>
+      </w:r>
+      <w:proofErr w:type="spellStart"/>
+      <w:r>
+        <w:t>Petugas</w:t>
+      </w:r>
+      <w:proofErr w:type="spellEnd"/>
+      <w:r>
+        <w:t xml:space="preserve"> </w:t>
+      </w:r>
+      <w:proofErr w:type="spellStart"/>
+      <w:r>
+        <w:t>resepsionis</w:t>
+      </w:r>
+      <w:proofErr w:type="spellEnd"/>
+      <w:r>
+        <w:t xml:space="preserve"> </w:t>
+      </w:r>
+      <w:proofErr w:type="spellStart"/>
+      <w:r>
+        <w:t>ini</w:t>
+      </w:r>
+      <w:proofErr w:type="spellEnd"/>
+      <w:r>
+        <w:t xml:space="preserve"> </w:t>
+      </w:r>
+      <w:proofErr w:type="spellStart"/>
+      <w:r>
+        <w:t>tidak</w:t>
+      </w:r>
+      <w:proofErr w:type="spellEnd"/>
+      <w:r>
+        <w:t xml:space="preserve"> </w:t>
+      </w:r>
+      <w:proofErr w:type="spellStart"/>
+      <w:r>
+        <w:t>membuat</w:t>
+      </w:r>
+      <w:proofErr w:type="spellEnd"/>
+      <w:r>
+        <w:t xml:space="preserve"> </w:t>
+      </w:r>
+      <w:proofErr w:type="spellStart"/>
+      <w:r>
+        <w:t>jawaban</w:t>
+      </w:r>
+      <w:proofErr w:type="spellEnd"/>
+      <w:r>
+        <w:t xml:space="preserve"> </w:t>
+      </w:r>
+      <w:proofErr w:type="spellStart"/>
+      <w:r>
+        <w:t>sendiri</w:t>
+      </w:r>
+      <w:proofErr w:type="spellEnd"/>
+      <w:r>
+        <w:t xml:space="preserve">. Dia </w:t>
+      </w:r>
+      <w:proofErr w:type="spellStart"/>
+      <w:r>
+        <w:t>bertanya</w:t>
+      </w:r>
+      <w:proofErr w:type="spellEnd"/>
+      <w:r>
+        <w:t xml:space="preserve"> </w:t>
+      </w:r>
+      <w:proofErr w:type="spellStart"/>
+      <w:r>
+        <w:t>kepada</w:t>
+      </w:r>
+      <w:proofErr w:type="spellEnd"/>
+      <w:r>
+        <w:t xml:space="preserve"> </w:t>
+      </w:r>
+      <w:proofErr w:type="spellStart"/>
+      <w:r>
+        <w:t>asistennya</w:t>
+      </w:r>
+      <w:proofErr w:type="spellEnd"/>
+      <w:r>
+        <w:t xml:space="preserve"> (</w:t>
+      </w:r>
+      <w:proofErr w:type="spellStart"/>
+      <w:r>
+        <w:t>AppService</w:t>
+      </w:r>
+      <w:proofErr w:type="spellEnd"/>
+      <w:r>
+        <w:t xml:space="preserve">) </w:t>
+      </w:r>
+      <w:proofErr w:type="spellStart"/>
+      <w:r>
+        <w:t>untuk</w:t>
+      </w:r>
+      <w:proofErr w:type="spellEnd"/>
+      <w:r>
+        <w:t xml:space="preserve"> </w:t>
+      </w:r>
+      <w:proofErr w:type="spellStart"/>
+      <w:r>
+        <w:t>mendapatkan</w:t>
+      </w:r>
+      <w:proofErr w:type="spellEnd"/>
+      <w:r>
+        <w:t xml:space="preserve"> </w:t>
+      </w:r>
+      <w:proofErr w:type="spellStart"/>
+      <w:r>
+        <w:t>pesan</w:t>
+      </w:r>
+      <w:proofErr w:type="spellEnd"/>
+      <w:r>
+        <w:t xml:space="preserve"> </w:t>
+      </w:r>
+      <w:proofErr w:type="spellStart"/>
+      <w:r>
+        <w:t>sapaan</w:t>
+      </w:r>
+      <w:proofErr w:type="spellEnd"/>
+      <w:r>
+        <w:t>.</w:t>
+      </w:r>
+    </w:p>
+    <w:p>
+      <w:pPr>
+        <w:jc w:val="both"/>
+      </w:pPr>
+      <w:proofErr w:type="spellStart"/>
+      <w:r>
+        <w:t>Memberikan</w:t>
+      </w:r>
+      <w:proofErr w:type="spellEnd"/>
+      <w:r>
+        <w:t xml:space="preserve"> </w:t>
+      </w:r>
+      <w:proofErr w:type="spellStart"/>
+      <w:r>
+        <w:t>Jawaban</w:t>
+      </w:r>
+      <w:proofErr w:type="spellEnd"/>
+      <w:r>
+        <w:t xml:space="preserve"> (</w:t>
+      </w:r>
+      <w:proofErr w:type="spellStart"/>
+      <w:r>
+        <w:t>getHello</w:t>
+      </w:r>
+      <w:proofErr w:type="spellEnd"/>
+      <w:r>
+        <w:t xml:space="preserve">): Hasil </w:t>
+      </w:r>
+      <w:proofErr w:type="spellStart"/>
+      <w:r>
+        <w:t>jawaban</w:t>
+      </w:r>
+      <w:proofErr w:type="spellEnd"/>
+      <w:r>
+        <w:t xml:space="preserve"> </w:t>
+      </w:r>
+      <w:proofErr w:type="spellStart"/>
+      <w:r>
+        <w:t>dari</w:t>
+      </w:r>
+      <w:proofErr w:type="spellEnd"/>
+      <w:r>
+        <w:t xml:space="preserve"> </w:t>
+      </w:r>
+      <w:proofErr w:type="spellStart"/>
+      <w:r>
+        <w:t>asisten</w:t>
+      </w:r>
+      <w:proofErr w:type="spellEnd"/>
+      <w:r>
+        <w:t xml:space="preserve"> ("Hello World!") </w:t>
+      </w:r>
+      <w:proofErr w:type="spellStart"/>
+      <w:r>
+        <w:t>kemudian</w:t>
+      </w:r>
+      <w:proofErr w:type="spellEnd"/>
+      <w:r>
+        <w:t xml:space="preserve"> </w:t>
+      </w:r>
+      <w:proofErr w:type="spellStart"/>
+      <w:r>
+        <w:t>diberikan</w:t>
+      </w:r>
+      <w:proofErr w:type="spellEnd"/>
+      <w:r>
+        <w:t xml:space="preserve"> </w:t>
+      </w:r>
+      <w:proofErr w:type="spellStart"/>
+      <w:r>
+        <w:t>kembali</w:t>
+      </w:r>
+      <w:proofErr w:type="spellEnd"/>
+      <w:r>
+        <w:t xml:space="preserve"> </w:t>
+      </w:r>
+      <w:proofErr w:type="spellStart"/>
+      <w:r>
+        <w:t>kepada</w:t>
+      </w:r>
+      <w:proofErr w:type="spellEnd"/>
+      <w:r>
+        <w:t xml:space="preserve"> </w:t>
+      </w:r>
+      <w:proofErr w:type="spellStart"/>
+      <w:r>
+        <w:t>pengguna</w:t>
+      </w:r>
+      <w:proofErr w:type="spellEnd"/>
+      <w:r>
+        <w:t xml:space="preserve"> </w:t>
+      </w:r>
+      <w:proofErr w:type="spellStart"/>
+      <w:r>
+        <w:t>sebagai</w:t>
+      </w:r>
+      <w:proofErr w:type="spellEnd"/>
+      <w:r>
+        <w:t xml:space="preserve"> </w:t>
+      </w:r>
+      <w:proofErr w:type="spellStart"/>
+      <w:r>
+        <w:t>tanda</w:t>
+      </w:r>
+      <w:proofErr w:type="spellEnd"/>
+      <w:r>
+        <w:t xml:space="preserve"> </w:t>
+      </w:r>
+      <w:proofErr w:type="spellStart"/>
+      <w:r>
+        <w:t>bahwa</w:t>
+      </w:r>
+      <w:proofErr w:type="spellEnd"/>
+      <w:r>
+        <w:t xml:space="preserve"> </w:t>
+      </w:r>
+      <w:proofErr w:type="spellStart"/>
+      <w:r>
+        <w:t>aplikasi</w:t>
+      </w:r>
+      <w:proofErr w:type="spellEnd"/>
+      <w:r>
+        <w:t xml:space="preserve"> </w:t>
+      </w:r>
+      <w:proofErr w:type="spellStart"/>
+      <w:r>
+        <w:t>sudah</w:t>
+      </w:r>
+      <w:proofErr w:type="spellEnd"/>
+      <w:r>
+        <w:t xml:space="preserve"> </w:t>
+      </w:r>
+      <w:proofErr w:type="spellStart"/>
+      <w:r>
+        <w:t>aktif</w:t>
+      </w:r>
+      <w:proofErr w:type="spellEnd"/>
+      <w:r>
+        <w:t xml:space="preserve"> dan </w:t>
+      </w:r>
+      <w:proofErr w:type="spellStart"/>
+      <w:r>
+        <w:t>berjalan</w:t>
+      </w:r>
+      <w:proofErr w:type="spellEnd"/>
+      <w:r>
+        <w:t xml:space="preserve"> normal.</w:t>
+      </w:r>
+    </w:p>
+    <w:p>
+      <w:pPr>
+        <w:jc w:val="both"/>
+      </w:pPr>
+      <w:r>
+        <w:t xml:space="preserve">Kode </w:t>
+      </w:r>
+      <w:proofErr w:type="spellStart"/>
+      <w:r>
+        <w:t>ini</w:t>
+      </w:r>
+      <w:proofErr w:type="spellEnd"/>
+      <w:r>
+        <w:t xml:space="preserve"> </w:t>
+      </w:r>
+      <w:proofErr w:type="spellStart"/>
+      <w:r>
+        <w:t>adalah</w:t>
+      </w:r>
+      <w:proofErr w:type="spellEnd"/>
+      <w:r>
+        <w:t xml:space="preserve"> </w:t>
+      </w:r>
+      <w:proofErr w:type="spellStart"/>
+      <w:r>
+        <w:t>cara</w:t>
+      </w:r>
+      <w:proofErr w:type="spellEnd"/>
+      <w:r>
+        <w:t xml:space="preserve"> </w:t>
+      </w:r>
+      <w:proofErr w:type="spellStart"/>
+      <w:r>
+        <w:t>aplikasi</w:t>
+      </w:r>
+      <w:proofErr w:type="spellEnd"/>
+      <w:r>
+        <w:t xml:space="preserve"> </w:t>
+      </w:r>
+      <w:proofErr w:type="spellStart"/>
+      <w:r>
+        <w:t>untuk</w:t>
+      </w:r>
+      <w:proofErr w:type="spellEnd"/>
+      <w:r>
+        <w:t xml:space="preserve"> </w:t>
+      </w:r>
+      <w:proofErr w:type="spellStart"/>
+      <w:r>
+        <w:t>menyapa</w:t>
+      </w:r>
+      <w:proofErr w:type="spellEnd"/>
+      <w:r>
+        <w:t xml:space="preserve"> </w:t>
+      </w:r>
+      <w:proofErr w:type="spellStart"/>
+      <w:r>
+        <w:t>pengunjung</w:t>
+      </w:r>
+      <w:proofErr w:type="spellEnd"/>
+      <w:r>
+        <w:t xml:space="preserve"> </w:t>
+      </w:r>
+      <w:proofErr w:type="spellStart"/>
+      <w:r>
+        <w:t>pertama</w:t>
+      </w:r>
+      <w:proofErr w:type="spellEnd"/>
+      <w:r>
+        <w:t xml:space="preserve"> kali dan </w:t>
+      </w:r>
+      <w:proofErr w:type="spellStart"/>
+      <w:r>
+        <w:t>memastikan</w:t>
+      </w:r>
+      <w:proofErr w:type="spellEnd"/>
+      <w:r>
+        <w:t xml:space="preserve"> </w:t>
+      </w:r>
+      <w:proofErr w:type="spellStart"/>
+      <w:r>
+        <w:t>bahwa</w:t>
+      </w:r>
+      <w:proofErr w:type="spellEnd"/>
+      <w:r>
+        <w:t xml:space="preserve">  </w:t>
+      </w:r>
+      <w:proofErr w:type="spellStart"/>
+      <w:r>
+        <w:t>aplikasi</w:t>
+      </w:r>
+      <w:proofErr w:type="spellEnd"/>
+      <w:r>
+        <w:t xml:space="preserve">  </w:t>
+      </w:r>
+      <w:proofErr w:type="spellStart"/>
+      <w:r>
+        <w:t>sudah</w:t>
+      </w:r>
+      <w:proofErr w:type="spellEnd"/>
+      <w:r>
+        <w:t xml:space="preserve"> </w:t>
+      </w:r>
+      <w:proofErr w:type="spellStart"/>
+      <w:r>
+        <w:t>terbuka</w:t>
+      </w:r>
+      <w:proofErr w:type="spellEnd"/>
+      <w:r>
+        <w:t xml:space="preserve"> dan </w:t>
+      </w:r>
+      <w:proofErr w:type="spellStart"/>
+      <w:r>
+        <w:t>siap</w:t>
+      </w:r>
+      <w:proofErr w:type="spellEnd"/>
+      <w:r>
+        <w:t xml:space="preserve"> </w:t>
+      </w:r>
+      <w:proofErr w:type="spellStart"/>
+      <w:r>
+        <w:t>digunakan</w:t>
+      </w:r>
+      <w:proofErr w:type="spellEnd"/>
+      <w:r>
+        <w:t>.</w:t>
+      </w:r>
+    </w:p>
+    <w:p>
+      <w:pPr>
+        <w:jc w:val="both"/>
+        <w:rPr>
+          <w:rFonts w:ascii="Times New Roman" w:hAnsi="Times New Roman" w:cs="Times New Roman"/>
+          <w:lang w:val="en-GB"/>
+        </w:rPr>
+      </w:pPr>
+    </w:p>
+    <w:p>
+      <w:pPr>
+        <w:jc w:val="both"/>
+        <w:rPr>
+          <w:rFonts w:ascii="Times New Roman" w:hAnsi="Times New Roman" w:cs="Times New Roman"/>
+          <w:lang w:val="en-GB"/>
+        </w:rPr>
+      </w:pPr>
+      <w:r>
+        <w:rPr>
+          <w:rFonts w:ascii="Times New Roman" w:hAnsi="Times New Roman" w:cs="Times New Roman"/>
+          <w:lang w:val="en-GB"/>
+        </w:rPr>
+        <w:t xml:space="preserve">25. </w:t>
+      </w:r>
+      <w:proofErr w:type="spellStart"/>
+      <w:r>
+        <w:rPr>
+          <w:rFonts w:ascii="Times New Roman" w:hAnsi="Times New Roman" w:cs="Times New Roman"/>
+          <w:lang w:val="en-GB"/>
+        </w:rPr>
+        <w:t>Membuat</w:t>
+      </w:r>
+      <w:proofErr w:type="spellEnd"/>
+      <w:r>
+        <w:rPr>
+          <w:rFonts w:ascii="Times New Roman" w:hAnsi="Times New Roman" w:cs="Times New Roman"/>
+          <w:lang w:val="en-GB"/>
+        </w:rPr>
+        <w:t xml:space="preserve"> </w:t>
+      </w:r>
+      <w:r>
+        <w:rPr>
+          <w:rFonts w:ascii="Times New Roman" w:hAnsi="Times New Roman" w:cs="Times New Roman"/>
+          <w:lang w:val="en-GB"/>
+        </w:rPr>
+        <w:t>App Service</w:t>
+      </w:r>
+    </w:p>
+    <w:p>
+      <w:pPr>
+        <w:jc w:val="both"/>
+      </w:pPr>
+      <w:r>
+        <w:rPr>
+          <w:rFonts w:ascii="Times New Roman" w:hAnsi="Times New Roman" w:cs="Times New Roman"/>
+          <w:lang w:val="en-GB"/>
+        </w:rPr>
+        <w:t xml:space="preserve">File : </w:t>
+      </w:r>
+      <w:proofErr w:type="spellStart"/>
+      <w:r>
+        <w:t>src</w:t>
+      </w:r>
+      <w:proofErr w:type="spellEnd"/>
+      <w:r>
+        <w:t>/</w:t>
+      </w:r>
+      <w:proofErr w:type="spellStart"/>
+      <w:r>
+        <w:t>app.service.ts</w:t>
+      </w:r>
+      <w:proofErr w:type="spellEnd"/>
+    </w:p>
+    <w:p>
+      <w:pPr>
+        <w:jc w:val="both"/>
+      </w:pPr>
+      <w:r>
+        <w:rPr>
+          <w:noProof/>
+        </w:rPr>
+        <w:lastRenderedPageBreak/>
+        <w:drawing>
+          <wp:inline distT="0" distB="0" distL="0" distR="0" wp14:anchorId="61DA5980" wp14:editId="2499B775">
+            <wp:extent cx="5731510" cy="3222625"/>
+            <wp:effectExtent l="0" t="0" r="2540" b="0"/>
+            <wp:docPr id="793115963" name="Picture 1"/>
+            <wp:cNvGraphicFramePr>
+              <a:graphicFrameLocks xmlns:a="http://schemas.openxmlformats.org/drawingml/2006/main" noChangeAspect="1"/>
+            </wp:cNvGraphicFramePr>
+            <a:graphic xmlns:a="http://schemas.openxmlformats.org/drawingml/2006/main">
+              <a:graphicData uri="http://schemas.openxmlformats.org/drawingml/2006/picture">
+                <pic:pic xmlns:pic="http://schemas.openxmlformats.org/drawingml/2006/picture">
+                  <pic:nvPicPr>
+                    <pic:cNvPr id="793115963" name=""/>
+                    <pic:cNvPicPr/>
+                  </pic:nvPicPr>
+                  <pic:blipFill>
+                    <a:blip r:embed="rId29"/>
+                    <a:stretch>
+                      <a:fillRect/>
+                    </a:stretch>
+                  </pic:blipFill>
+                  <pic:spPr>
+                    <a:xfrm>
+                      <a:off x="0" y="0"/>
+                      <a:ext cx="5731510" cy="3222625"/>
+                    </a:xfrm>
+                    <a:prstGeom prst="rect">
+                      <a:avLst/>
+                    </a:prstGeom>
+                  </pic:spPr>
+                </pic:pic>
+              </a:graphicData>
+            </a:graphic>
+          </wp:inline>
+        </w:drawing>
+      </w:r>
+    </w:p>
+    <w:p>
+      <w:pPr>
+        <w:jc w:val="both"/>
+      </w:pPr>
+      <w:r>
+        <w:t>@Injectable()</w:t>
+      </w:r>
+      <w:r>
+        <w:t xml:space="preserve"> </w:t>
+      </w:r>
+      <w:r>
+        <w:t>:</w:t>
+      </w:r>
+      <w:r>
+        <w:t xml:space="preserve"> </w:t>
+      </w:r>
+      <w:proofErr w:type="spellStart"/>
+      <w:r>
+        <w:t>sebuah</w:t>
+      </w:r>
+      <w:proofErr w:type="spellEnd"/>
+      <w:r>
+        <w:t xml:space="preserve"> </w:t>
+      </w:r>
+      <w:proofErr w:type="spellStart"/>
+      <w:r>
+        <w:t>layanan</w:t>
+      </w:r>
+      <w:proofErr w:type="spellEnd"/>
+      <w:r>
+        <w:t xml:space="preserve"> (service) yang </w:t>
+      </w:r>
+      <w:proofErr w:type="spellStart"/>
+      <w:r>
+        <w:t>bisa</w:t>
+      </w:r>
+      <w:proofErr w:type="spellEnd"/>
+      <w:r>
+        <w:t xml:space="preserve"> </w:t>
+      </w:r>
+      <w:proofErr w:type="spellStart"/>
+      <w:r>
+        <w:t>dipanggil</w:t>
+      </w:r>
+      <w:proofErr w:type="spellEnd"/>
+      <w:r>
+        <w:t xml:space="preserve"> oleh </w:t>
+      </w:r>
+      <w:proofErr w:type="spellStart"/>
+      <w:r>
+        <w:t>bagian</w:t>
+      </w:r>
+      <w:proofErr w:type="spellEnd"/>
+      <w:r>
+        <w:t xml:space="preserve"> lain (</w:t>
+      </w:r>
+      <w:proofErr w:type="spellStart"/>
+      <w:r>
+        <w:t>seperti</w:t>
+      </w:r>
+      <w:proofErr w:type="spellEnd"/>
+      <w:r>
+        <w:t xml:space="preserve"> Controller) </w:t>
+      </w:r>
+      <w:proofErr w:type="spellStart"/>
+      <w:r>
+        <w:t>kapanpun</w:t>
+      </w:r>
+      <w:proofErr w:type="spellEnd"/>
+      <w:r>
+        <w:t xml:space="preserve"> </w:t>
+      </w:r>
+      <w:proofErr w:type="spellStart"/>
+      <w:r>
+        <w:t>dibutuhkan</w:t>
+      </w:r>
+      <w:proofErr w:type="spellEnd"/>
+      <w:r>
+        <w:t>.</w:t>
+      </w:r>
+    </w:p>
+    <w:p>
+      <w:pPr>
+        <w:jc w:val="both"/>
+      </w:pPr>
+      <w:r>
+        <w:t xml:space="preserve">class </w:t>
+      </w:r>
+      <w:proofErr w:type="spellStart"/>
+      <w:r>
+        <w:t>AppService</w:t>
+      </w:r>
+      <w:proofErr w:type="spellEnd"/>
+      <w:r>
+        <w:t xml:space="preserve"> (Pusat Logika):</w:t>
+      </w:r>
+      <w:r>
+        <w:t xml:space="preserve"> </w:t>
+      </w:r>
+      <w:proofErr w:type="spellStart"/>
+      <w:r>
+        <w:t>menuliskan</w:t>
+      </w:r>
+      <w:proofErr w:type="spellEnd"/>
+      <w:r>
+        <w:t xml:space="preserve"> </w:t>
+      </w:r>
+      <w:proofErr w:type="spellStart"/>
+      <w:r>
+        <w:t>apa</w:t>
+      </w:r>
+      <w:proofErr w:type="spellEnd"/>
+      <w:r>
+        <w:t xml:space="preserve"> yang </w:t>
+      </w:r>
+      <w:proofErr w:type="spellStart"/>
+      <w:r>
+        <w:t>sebenarnya</w:t>
+      </w:r>
+      <w:proofErr w:type="spellEnd"/>
+      <w:r>
+        <w:t xml:space="preserve"> </w:t>
+      </w:r>
+      <w:proofErr w:type="spellStart"/>
+      <w:r>
+        <w:t>harus</w:t>
+      </w:r>
+      <w:proofErr w:type="spellEnd"/>
+      <w:r>
+        <w:t xml:space="preserve"> </w:t>
+      </w:r>
+      <w:proofErr w:type="spellStart"/>
+      <w:r>
+        <w:t>dilakukan</w:t>
+      </w:r>
+      <w:proofErr w:type="spellEnd"/>
+      <w:r>
+        <w:t xml:space="preserve"> oleh </w:t>
+      </w:r>
+      <w:proofErr w:type="spellStart"/>
+      <w:r>
+        <w:t>aplikasi</w:t>
+      </w:r>
+      <w:proofErr w:type="spellEnd"/>
+      <w:r>
+        <w:t xml:space="preserve">. </w:t>
+      </w:r>
+    </w:p>
+    <w:p>
+      <w:pPr>
+        <w:jc w:val="both"/>
+      </w:pPr>
+      <w:proofErr w:type="spellStart"/>
+      <w:r>
+        <w:t>getHello</w:t>
+      </w:r>
+      <w:proofErr w:type="spellEnd"/>
+      <w:r>
+        <w:t>() (</w:t>
+      </w:r>
+      <w:proofErr w:type="spellStart"/>
+      <w:r>
+        <w:t>Tugas</w:t>
+      </w:r>
+      <w:proofErr w:type="spellEnd"/>
+      <w:r>
+        <w:t xml:space="preserve"> </w:t>
+      </w:r>
+      <w:proofErr w:type="spellStart"/>
+      <w:r>
+        <w:t>Spesifik</w:t>
+      </w:r>
+      <w:proofErr w:type="spellEnd"/>
+      <w:r>
+        <w:t>):</w:t>
+      </w:r>
+      <w:r>
+        <w:t xml:space="preserve"> </w:t>
+      </w:r>
+      <w:proofErr w:type="spellStart"/>
+      <w:r>
+        <w:t>memberikan</w:t>
+      </w:r>
+      <w:proofErr w:type="spellEnd"/>
+      <w:r>
+        <w:t xml:space="preserve"> </w:t>
+      </w:r>
+      <w:proofErr w:type="spellStart"/>
+      <w:r>
+        <w:t>sebaris</w:t>
+      </w:r>
+      <w:proofErr w:type="spellEnd"/>
+      <w:r>
+        <w:t xml:space="preserve"> </w:t>
+      </w:r>
+      <w:proofErr w:type="spellStart"/>
+      <w:r>
+        <w:t>kalimat</w:t>
+      </w:r>
+      <w:proofErr w:type="spellEnd"/>
+      <w:r>
+        <w:t xml:space="preserve"> </w:t>
+      </w:r>
+      <w:proofErr w:type="spellStart"/>
+      <w:r>
+        <w:t>sapaan</w:t>
+      </w:r>
+      <w:proofErr w:type="spellEnd"/>
+      <w:r>
+        <w:t xml:space="preserve">: "Welcome to </w:t>
+      </w:r>
+      <w:proofErr w:type="spellStart"/>
+      <w:r>
+        <w:t>SigerSync</w:t>
+      </w:r>
+      <w:proofErr w:type="spellEnd"/>
+      <w:r>
+        <w:t xml:space="preserve"> Backend Microservices API!".</w:t>
+      </w:r>
+    </w:p>
+    <w:p>
+      <w:pPr>
+        <w:jc w:val="both"/>
+      </w:pPr>
+    </w:p>
+    <w:p>
+      <w:pPr>
+        <w:jc w:val="both"/>
+      </w:pPr>
+      <w:r>
+        <w:t xml:space="preserve">26. </w:t>
       </w:r>
     </w:p>
     <w:p>

</xml_diff>

<commit_message>
Membuat file main.ts pada backend
</commit_message>
<xml_diff>
--- a/dokumentasi/24382001P_Lorensius Firngadi_IF 23 E_Dokumentasi.docx
+++ b/dokumentasi/24382001P_Lorensius Firngadi_IF 23 E_Dokumentasi.docx
@@ -24831,15 +24831,609 @@
       <w:r>
         <w:t xml:space="preserve">26. </w:t>
       </w:r>
-    </w:p>
-    <w:p>
-      <w:pPr>
-        <w:jc w:val="both"/>
-        <w:rPr>
-          <w:rFonts w:ascii="Times New Roman" w:hAnsi="Times New Roman" w:cs="Times New Roman"/>
-          <w:lang w:val="en-GB"/>
-        </w:rPr>
-      </w:pPr>
+      <w:proofErr w:type="spellStart"/>
+      <w:r>
+        <w:t>Membuat</w:t>
+      </w:r>
+      <w:proofErr w:type="spellEnd"/>
+      <w:r>
+        <w:t xml:space="preserve"> </w:t>
+      </w:r>
+      <w:r>
+        <w:t>Main Entry Point</w:t>
+      </w:r>
+    </w:p>
+    <w:p>
+      <w:pPr>
+        <w:jc w:val="both"/>
+      </w:pPr>
+      <w:r>
+        <w:t xml:space="preserve">File : </w:t>
+      </w:r>
+      <w:proofErr w:type="spellStart"/>
+      <w:r>
+        <w:t>src</w:t>
+      </w:r>
+      <w:proofErr w:type="spellEnd"/>
+      <w:r>
+        <w:t>/</w:t>
+      </w:r>
+      <w:proofErr w:type="spellStart"/>
+      <w:r>
+        <w:t>main.ts</w:t>
+      </w:r>
+      <w:proofErr w:type="spellEnd"/>
+    </w:p>
+    <w:p>
+      <w:pPr>
+        <w:jc w:val="both"/>
+      </w:pPr>
+      <w:r>
+        <w:rPr>
+          <w:noProof/>
+        </w:rPr>
+        <w:lastRenderedPageBreak/>
+        <w:drawing>
+          <wp:inline distT="0" distB="0" distL="0" distR="0" wp14:anchorId="7C242A04" wp14:editId="4DB8798C">
+            <wp:extent cx="5731510" cy="3222625"/>
+            <wp:effectExtent l="0" t="0" r="2540" b="0"/>
+            <wp:docPr id="1155238988" name="Picture 1"/>
+            <wp:cNvGraphicFramePr>
+              <a:graphicFrameLocks xmlns:a="http://schemas.openxmlformats.org/drawingml/2006/main" noChangeAspect="1"/>
+            </wp:cNvGraphicFramePr>
+            <a:graphic xmlns:a="http://schemas.openxmlformats.org/drawingml/2006/main">
+              <a:graphicData uri="http://schemas.openxmlformats.org/drawingml/2006/picture">
+                <pic:pic xmlns:pic="http://schemas.openxmlformats.org/drawingml/2006/picture">
+                  <pic:nvPicPr>
+                    <pic:cNvPr id="1155238988" name=""/>
+                    <pic:cNvPicPr/>
+                  </pic:nvPicPr>
+                  <pic:blipFill>
+                    <a:blip r:embed="rId30"/>
+                    <a:stretch>
+                      <a:fillRect/>
+                    </a:stretch>
+                  </pic:blipFill>
+                  <pic:spPr>
+                    <a:xfrm>
+                      <a:off x="0" y="0"/>
+                      <a:ext cx="5731510" cy="3222625"/>
+                    </a:xfrm>
+                    <a:prstGeom prst="rect">
+                      <a:avLst/>
+                    </a:prstGeom>
+                  </pic:spPr>
+                </pic:pic>
+              </a:graphicData>
+            </a:graphic>
+          </wp:inline>
+        </w:drawing>
+      </w:r>
+    </w:p>
+    <w:p>
+      <w:pPr>
+        <w:jc w:val="both"/>
+      </w:pPr>
+      <w:proofErr w:type="spellStart"/>
+      <w:r>
+        <w:t>main.ts</w:t>
+      </w:r>
+      <w:proofErr w:type="spellEnd"/>
+      <w:r>
+        <w:t xml:space="preserve"> </w:t>
+      </w:r>
+      <w:proofErr w:type="spellStart"/>
+      <w:r>
+        <w:t>untuk</w:t>
+      </w:r>
+      <w:proofErr w:type="spellEnd"/>
+      <w:r>
+        <w:t xml:space="preserve"> </w:t>
+      </w:r>
+      <w:proofErr w:type="spellStart"/>
+      <w:r>
+        <w:t>menyalakan</w:t>
+      </w:r>
+      <w:proofErr w:type="spellEnd"/>
+      <w:r>
+        <w:t xml:space="preserve"> </w:t>
+      </w:r>
+      <w:proofErr w:type="spellStart"/>
+      <w:r>
+        <w:t>mesin</w:t>
+      </w:r>
+      <w:proofErr w:type="spellEnd"/>
+      <w:r>
+        <w:t xml:space="preserve"> </w:t>
+      </w:r>
+      <w:proofErr w:type="spellStart"/>
+      <w:r>
+        <w:t>aplikasi</w:t>
+      </w:r>
+      <w:proofErr w:type="spellEnd"/>
+      <w:r>
+        <w:t xml:space="preserve">. </w:t>
+      </w:r>
+      <w:proofErr w:type="spellStart"/>
+      <w:r>
+        <w:t>Tanpa</w:t>
+      </w:r>
+      <w:proofErr w:type="spellEnd"/>
+      <w:r>
+        <w:t xml:space="preserve"> file </w:t>
+      </w:r>
+      <w:proofErr w:type="spellStart"/>
+      <w:r>
+        <w:t>ini</w:t>
+      </w:r>
+      <w:proofErr w:type="spellEnd"/>
+      <w:r>
+        <w:t xml:space="preserve">, </w:t>
+      </w:r>
+      <w:proofErr w:type="spellStart"/>
+      <w:r>
+        <w:t>semua</w:t>
+      </w:r>
+      <w:proofErr w:type="spellEnd"/>
+      <w:r>
+        <w:t xml:space="preserve"> </w:t>
+      </w:r>
+      <w:proofErr w:type="spellStart"/>
+      <w:r>
+        <w:t>kode</w:t>
+      </w:r>
+      <w:proofErr w:type="spellEnd"/>
+      <w:r>
+        <w:t xml:space="preserve"> yang </w:t>
+      </w:r>
+      <w:proofErr w:type="spellStart"/>
+      <w:r>
+        <w:t>sudah</w:t>
+      </w:r>
+      <w:proofErr w:type="spellEnd"/>
+      <w:r>
+        <w:t xml:space="preserve"> </w:t>
+      </w:r>
+      <w:r>
+        <w:t>di</w:t>
+      </w:r>
+      <w:r>
+        <w:t xml:space="preserve"> buat </w:t>
+      </w:r>
+      <w:proofErr w:type="spellStart"/>
+      <w:r>
+        <w:t>hanyalah</w:t>
+      </w:r>
+      <w:proofErr w:type="spellEnd"/>
+      <w:r>
+        <w:t xml:space="preserve"> </w:t>
+      </w:r>
+      <w:proofErr w:type="spellStart"/>
+      <w:r>
+        <w:t>tumpukan</w:t>
+      </w:r>
+      <w:proofErr w:type="spellEnd"/>
+      <w:r>
+        <w:t xml:space="preserve"> tulisan yang </w:t>
+      </w:r>
+      <w:proofErr w:type="spellStart"/>
+      <w:r>
+        <w:t>mati</w:t>
+      </w:r>
+      <w:proofErr w:type="spellEnd"/>
+      <w:r>
+        <w:t>.</w:t>
+      </w:r>
+    </w:p>
+    <w:p>
+      <w:pPr>
+        <w:jc w:val="both"/>
+      </w:pPr>
+      <w:r>
+        <w:t xml:space="preserve">Ada 3 </w:t>
+      </w:r>
+      <w:proofErr w:type="spellStart"/>
+      <w:r>
+        <w:t>tugas</w:t>
+      </w:r>
+      <w:proofErr w:type="spellEnd"/>
+      <w:r>
+        <w:t xml:space="preserve"> </w:t>
+      </w:r>
+      <w:proofErr w:type="spellStart"/>
+      <w:r>
+        <w:t>utama</w:t>
+      </w:r>
+      <w:proofErr w:type="spellEnd"/>
+      <w:r>
+        <w:t xml:space="preserve"> yang </w:t>
+      </w:r>
+      <w:proofErr w:type="spellStart"/>
+      <w:r>
+        <w:t>dilakukan</w:t>
+      </w:r>
+      <w:proofErr w:type="spellEnd"/>
+      <w:r>
+        <w:t xml:space="preserve"> file </w:t>
+      </w:r>
+      <w:proofErr w:type="spellStart"/>
+      <w:r>
+        <w:t>ini</w:t>
+      </w:r>
+      <w:proofErr w:type="spellEnd"/>
+      <w:r>
+        <w:t>:</w:t>
+      </w:r>
+    </w:p>
+    <w:p>
+      <w:pPr>
+        <w:jc w:val="both"/>
+      </w:pPr>
+      <w:proofErr w:type="spellStart"/>
+      <w:r>
+        <w:t>Menyalakan</w:t>
+      </w:r>
+      <w:proofErr w:type="spellEnd"/>
+      <w:r>
+        <w:t xml:space="preserve"> </w:t>
+      </w:r>
+      <w:proofErr w:type="spellStart"/>
+      <w:r>
+        <w:t>Mesin</w:t>
+      </w:r>
+      <w:proofErr w:type="spellEnd"/>
+      <w:r>
+        <w:t>:</w:t>
+      </w:r>
+      <w:r>
+        <w:t xml:space="preserve"> </w:t>
+      </w:r>
+      <w:proofErr w:type="spellStart"/>
+      <w:r>
+        <w:t>mengambil</w:t>
+      </w:r>
+      <w:proofErr w:type="spellEnd"/>
+      <w:r>
+        <w:t xml:space="preserve"> </w:t>
+      </w:r>
+      <w:proofErr w:type="spellStart"/>
+      <w:r>
+        <w:t>seluruh</w:t>
+      </w:r>
+      <w:proofErr w:type="spellEnd"/>
+      <w:r>
+        <w:t xml:space="preserve"> </w:t>
+      </w:r>
+      <w:proofErr w:type="spellStart"/>
+      <w:r>
+        <w:t>rancangan</w:t>
+      </w:r>
+      <w:proofErr w:type="spellEnd"/>
+      <w:r>
+        <w:t xml:space="preserve"> </w:t>
+      </w:r>
+      <w:proofErr w:type="spellStart"/>
+      <w:r>
+        <w:t>aplikasi</w:t>
+      </w:r>
+      <w:proofErr w:type="spellEnd"/>
+      <w:r>
+        <w:t xml:space="preserve"> (</w:t>
+      </w:r>
+      <w:proofErr w:type="spellStart"/>
+      <w:r>
+        <w:t>AppModule</w:t>
+      </w:r>
+      <w:proofErr w:type="spellEnd"/>
+      <w:r>
+        <w:t xml:space="preserve">) dan </w:t>
+      </w:r>
+      <w:proofErr w:type="spellStart"/>
+      <w:r>
+        <w:t>menghidupkannya</w:t>
+      </w:r>
+      <w:proofErr w:type="spellEnd"/>
+      <w:r>
+        <w:t xml:space="preserve"> agar </w:t>
+      </w:r>
+      <w:proofErr w:type="spellStart"/>
+      <w:r>
+        <w:t>bisa</w:t>
+      </w:r>
+      <w:proofErr w:type="spellEnd"/>
+      <w:r>
+        <w:t xml:space="preserve"> </w:t>
+      </w:r>
+      <w:proofErr w:type="spellStart"/>
+      <w:r>
+        <w:t>berjalan</w:t>
+      </w:r>
+      <w:proofErr w:type="spellEnd"/>
+      <w:r>
+        <w:t xml:space="preserve"> di </w:t>
+      </w:r>
+      <w:proofErr w:type="spellStart"/>
+      <w:r>
+        <w:t>komputer</w:t>
+      </w:r>
+      <w:proofErr w:type="spellEnd"/>
+      <w:r>
+        <w:t>/server.</w:t>
+      </w:r>
+    </w:p>
+    <w:p>
+      <w:pPr>
+        <w:jc w:val="both"/>
+      </w:pPr>
+      <w:proofErr w:type="spellStart"/>
+      <w:r>
+        <w:t>Memasang</w:t>
+      </w:r>
+      <w:proofErr w:type="spellEnd"/>
+      <w:r>
+        <w:t xml:space="preserve"> </w:t>
+      </w:r>
+      <w:proofErr w:type="spellStart"/>
+      <w:r>
+        <w:t>Saringan</w:t>
+      </w:r>
+      <w:proofErr w:type="spellEnd"/>
+      <w:r>
+        <w:t xml:space="preserve"> </w:t>
+      </w:r>
+      <w:proofErr w:type="spellStart"/>
+      <w:r>
+        <w:t>Keamanan</w:t>
+      </w:r>
+      <w:proofErr w:type="spellEnd"/>
+      <w:r>
+        <w:t xml:space="preserve"> (Filter):  </w:t>
+      </w:r>
+      <w:proofErr w:type="spellStart"/>
+      <w:r>
+        <w:t>otomatis</w:t>
+      </w:r>
+      <w:proofErr w:type="spellEnd"/>
+      <w:r>
+        <w:t xml:space="preserve"> (</w:t>
+      </w:r>
+      <w:proofErr w:type="spellStart"/>
+      <w:r>
+        <w:t>ValidationPipe</w:t>
+      </w:r>
+      <w:proofErr w:type="spellEnd"/>
+      <w:r>
+        <w:t>)</w:t>
+      </w:r>
+      <w:r>
+        <w:t xml:space="preserve">, </w:t>
+      </w:r>
+      <w:proofErr w:type="spellStart"/>
+      <w:r>
+        <w:t>memeriksa</w:t>
+      </w:r>
+      <w:proofErr w:type="spellEnd"/>
+      <w:r>
+        <w:t xml:space="preserve"> </w:t>
+      </w:r>
+      <w:proofErr w:type="spellStart"/>
+      <w:r>
+        <w:t>setiap</w:t>
+      </w:r>
+      <w:proofErr w:type="spellEnd"/>
+      <w:r>
+        <w:t xml:space="preserve"> data yang </w:t>
+      </w:r>
+      <w:proofErr w:type="spellStart"/>
+      <w:r>
+        <w:t>dikirim</w:t>
+      </w:r>
+      <w:proofErr w:type="spellEnd"/>
+      <w:r>
+        <w:t xml:space="preserve"> </w:t>
+      </w:r>
+      <w:proofErr w:type="spellStart"/>
+      <w:r>
+        <w:t>pengguna</w:t>
+      </w:r>
+      <w:proofErr w:type="spellEnd"/>
+      <w:r>
+        <w:t xml:space="preserve">. Jika </w:t>
+      </w:r>
+      <w:proofErr w:type="spellStart"/>
+      <w:r>
+        <w:t>datanya</w:t>
+      </w:r>
+      <w:proofErr w:type="spellEnd"/>
+      <w:r>
+        <w:t xml:space="preserve"> </w:t>
+      </w:r>
+      <w:proofErr w:type="spellStart"/>
+      <w:r>
+        <w:t>aneh</w:t>
+      </w:r>
+      <w:proofErr w:type="spellEnd"/>
+      <w:r>
+        <w:t xml:space="preserve">, salah format, </w:t>
+      </w:r>
+      <w:proofErr w:type="spellStart"/>
+      <w:r>
+        <w:t>atau</w:t>
+      </w:r>
+      <w:proofErr w:type="spellEnd"/>
+      <w:r>
+        <w:t xml:space="preserve"> </w:t>
+      </w:r>
+      <w:proofErr w:type="spellStart"/>
+      <w:r>
+        <w:t>mencurigakan</w:t>
+      </w:r>
+      <w:proofErr w:type="spellEnd"/>
+      <w:r>
+        <w:t xml:space="preserve">, </w:t>
+      </w:r>
+      <w:proofErr w:type="spellStart"/>
+      <w:r>
+        <w:t>ini</w:t>
+      </w:r>
+      <w:proofErr w:type="spellEnd"/>
+      <w:r>
+        <w:t xml:space="preserve"> </w:t>
+      </w:r>
+      <w:proofErr w:type="spellStart"/>
+      <w:r>
+        <w:t>akan</w:t>
+      </w:r>
+      <w:proofErr w:type="spellEnd"/>
+      <w:r>
+        <w:t xml:space="preserve"> </w:t>
+      </w:r>
+      <w:proofErr w:type="spellStart"/>
+      <w:r>
+        <w:t>langsung</w:t>
+      </w:r>
+      <w:proofErr w:type="spellEnd"/>
+      <w:r>
+        <w:t xml:space="preserve"> </w:t>
+      </w:r>
+      <w:proofErr w:type="spellStart"/>
+      <w:r>
+        <w:t>menolaknya</w:t>
+      </w:r>
+      <w:proofErr w:type="spellEnd"/>
+      <w:r>
+        <w:t xml:space="preserve"> </w:t>
+      </w:r>
+      <w:proofErr w:type="spellStart"/>
+      <w:r>
+        <w:t>sebelum</w:t>
+      </w:r>
+      <w:proofErr w:type="spellEnd"/>
+      <w:r>
+        <w:t xml:space="preserve"> </w:t>
+      </w:r>
+      <w:proofErr w:type="spellStart"/>
+      <w:r>
+        <w:t>masuk</w:t>
+      </w:r>
+      <w:proofErr w:type="spellEnd"/>
+      <w:r>
+        <w:t xml:space="preserve"> </w:t>
+      </w:r>
+      <w:proofErr w:type="spellStart"/>
+      <w:r>
+        <w:t>ke</w:t>
+      </w:r>
+      <w:proofErr w:type="spellEnd"/>
+      <w:r>
+        <w:t xml:space="preserve"> </w:t>
+      </w:r>
+      <w:proofErr w:type="spellStart"/>
+      <w:r>
+        <w:t>dalam</w:t>
+      </w:r>
+      <w:proofErr w:type="spellEnd"/>
+      <w:r>
+        <w:t xml:space="preserve"> </w:t>
+      </w:r>
+      <w:proofErr w:type="spellStart"/>
+      <w:r>
+        <w:t>sistem</w:t>
+      </w:r>
+      <w:proofErr w:type="spellEnd"/>
+      <w:r>
+        <w:t>.</w:t>
+      </w:r>
+    </w:p>
+    <w:p>
+      <w:pPr>
+        <w:jc w:val="both"/>
+      </w:pPr>
+      <w:proofErr w:type="spellStart"/>
+      <w:r>
+        <w:t>Membuka</w:t>
+      </w:r>
+      <w:proofErr w:type="spellEnd"/>
+      <w:r>
+        <w:t xml:space="preserve"> Pintu Akses (Port): </w:t>
+      </w:r>
+      <w:proofErr w:type="spellStart"/>
+      <w:r>
+        <w:t>menentukan</w:t>
+      </w:r>
+      <w:proofErr w:type="spellEnd"/>
+      <w:r>
+        <w:t xml:space="preserve"> Port mana </w:t>
+      </w:r>
+      <w:proofErr w:type="spellStart"/>
+      <w:r>
+        <w:t>aplikasi</w:t>
+      </w:r>
+      <w:proofErr w:type="spellEnd"/>
+      <w:r>
+        <w:t xml:space="preserve"> </w:t>
+      </w:r>
+      <w:proofErr w:type="spellStart"/>
+      <w:r>
+        <w:t>ini</w:t>
+      </w:r>
+      <w:proofErr w:type="spellEnd"/>
+      <w:r>
+        <w:t xml:space="preserve"> </w:t>
+      </w:r>
+      <w:proofErr w:type="spellStart"/>
+      <w:r>
+        <w:t>bisa</w:t>
+      </w:r>
+      <w:proofErr w:type="spellEnd"/>
+      <w:r>
+        <w:t xml:space="preserve"> </w:t>
+      </w:r>
+      <w:proofErr w:type="spellStart"/>
+      <w:r>
+        <w:t>dikunjungi</w:t>
+      </w:r>
+      <w:proofErr w:type="spellEnd"/>
+      <w:r>
+        <w:t xml:space="preserve"> (</w:t>
+      </w:r>
+      <w:proofErr w:type="spellStart"/>
+      <w:r>
+        <w:t>biasanya</w:t>
+      </w:r>
+      <w:proofErr w:type="spellEnd"/>
+      <w:r>
+        <w:t xml:space="preserve"> </w:t>
+      </w:r>
+      <w:proofErr w:type="spellStart"/>
+      <w:r>
+        <w:t>nomor</w:t>
+      </w:r>
+      <w:proofErr w:type="spellEnd"/>
+      <w:r>
+        <w:t xml:space="preserve"> 3000). </w:t>
+      </w:r>
+    </w:p>
+    <w:p>
+      <w:pPr>
+        <w:jc w:val="both"/>
+      </w:pPr>
+    </w:p>
+    <w:p>
+      <w:pPr>
+        <w:jc w:val="both"/>
+        <w:rPr>
+          <w:rFonts w:ascii="Times New Roman" w:hAnsi="Times New Roman" w:cs="Times New Roman"/>
+          <w:lang w:val="en-GB"/>
+        </w:rPr>
+      </w:pPr>
+      <w:r>
+        <w:rPr>
+          <w:rFonts w:ascii="Times New Roman" w:hAnsi="Times New Roman" w:cs="Times New Roman"/>
+          <w:lang w:val="en-GB"/>
+        </w:rPr>
+        <w:t xml:space="preserve">27. </w:t>
+      </w:r>
     </w:p>
     <w:sectPr>
       <w:pgSz w:w="11906" w:h="16838"/>

</xml_diff>

<commit_message>
Menghapus variabel prisma yang tidak terpakai pada sigersync-backend\src\services\kategori\kategori.service.spec.ts
</commit_message>
<xml_diff>
--- a/dokumentasi/24382001P_Lorensius Firngadi_IF 23 E_Dokumentasi.docx
+++ b/dokumentasi/24382001P_Lorensius Firngadi_IF 23 E_Dokumentasi.docx
@@ -28631,6 +28631,29 @@
         <w:t>kategori</w:t>
       </w:r>
       <w:proofErr w:type="spellEnd"/>
+      <w:r>
+        <w:rPr>
+          <w:rFonts w:ascii="Times New Roman" w:hAnsi="Times New Roman" w:cs="Times New Roman"/>
+          <w:lang w:val="en-GB"/>
+        </w:rPr>
+        <w:t>\</w:t>
+      </w:r>
+      <w:proofErr w:type="spellStart"/>
+      <w:r>
+        <w:rPr>
+          <w:rFonts w:ascii="Times New Roman" w:hAnsi="Times New Roman" w:cs="Times New Roman"/>
+          <w:lang w:val="en-GB"/>
+        </w:rPr>
+        <w:t>kategori</w:t>
+      </w:r>
+      <w:r>
+        <w:rPr>
+          <w:rFonts w:ascii="Times New Roman" w:hAnsi="Times New Roman" w:cs="Times New Roman"/>
+          <w:lang w:val="en-GB"/>
+        </w:rPr>
+        <w:t>.service.ts</w:t>
+      </w:r>
+      <w:proofErr w:type="spellEnd"/>
     </w:p>
     <w:p>
       <w:pPr>
@@ -30869,6 +30892,448 @@
           <w:lang w:val="en-GB"/>
         </w:rPr>
         <w:t>.</w:t>
+      </w:r>
+    </w:p>
+    <w:p>
+      <w:pPr>
+        <w:jc w:val="both"/>
+        <w:rPr>
+          <w:rFonts w:ascii="Times New Roman" w:hAnsi="Times New Roman" w:cs="Times New Roman"/>
+          <w:lang w:val="en-GB"/>
+        </w:rPr>
+      </w:pPr>
+    </w:p>
+    <w:p>
+      <w:pPr>
+        <w:jc w:val="both"/>
+        <w:rPr>
+          <w:rFonts w:ascii="Times New Roman" w:hAnsi="Times New Roman" w:cs="Times New Roman"/>
+          <w:lang w:val="en-GB"/>
+        </w:rPr>
+      </w:pPr>
+      <w:r>
+        <w:rPr>
+          <w:rFonts w:ascii="Times New Roman" w:hAnsi="Times New Roman" w:cs="Times New Roman"/>
+          <w:lang w:val="en-GB"/>
+        </w:rPr>
+        <w:t xml:space="preserve">29. Update file </w:t>
+      </w:r>
+      <w:proofErr w:type="spellStart"/>
+      <w:proofErr w:type="gramStart"/>
+      <w:r>
+        <w:rPr>
+          <w:rFonts w:ascii="Times New Roman" w:hAnsi="Times New Roman" w:cs="Times New Roman"/>
+          <w:lang w:val="en-GB"/>
+        </w:rPr>
+        <w:t>Kategori.service.spec</w:t>
+      </w:r>
+      <w:proofErr w:type="gramEnd"/>
+      <w:r>
+        <w:rPr>
+          <w:rFonts w:ascii="Times New Roman" w:hAnsi="Times New Roman" w:cs="Times New Roman"/>
+          <w:lang w:val="en-GB"/>
+        </w:rPr>
+        <w:t>.ts</w:t>
+      </w:r>
+      <w:proofErr w:type="spellEnd"/>
+    </w:p>
+    <w:p>
+      <w:pPr>
+        <w:jc w:val="both"/>
+        <w:rPr>
+          <w:rFonts w:ascii="Times New Roman" w:hAnsi="Times New Roman" w:cs="Times New Roman"/>
+          <w:lang w:val="en-GB"/>
+        </w:rPr>
+      </w:pPr>
+      <w:proofErr w:type="gramStart"/>
+      <w:r>
+        <w:rPr>
+          <w:rFonts w:ascii="Times New Roman" w:hAnsi="Times New Roman" w:cs="Times New Roman"/>
+          <w:lang w:val="en-GB"/>
+        </w:rPr>
+        <w:t>File :</w:t>
+      </w:r>
+      <w:proofErr w:type="gramEnd"/>
+      <w:r>
+        <w:rPr>
+          <w:rFonts w:ascii="Times New Roman" w:hAnsi="Times New Roman" w:cs="Times New Roman"/>
+          <w:lang w:val="en-GB"/>
+        </w:rPr>
+        <w:t xml:space="preserve"> </w:t>
+      </w:r>
+      <w:proofErr w:type="spellStart"/>
+      <w:r>
+        <w:rPr>
+          <w:rFonts w:ascii="Times New Roman" w:hAnsi="Times New Roman" w:cs="Times New Roman"/>
+          <w:lang w:val="en-GB"/>
+        </w:rPr>
+        <w:t>sigersync</w:t>
+      </w:r>
+      <w:proofErr w:type="spellEnd"/>
+      <w:r>
+        <w:rPr>
+          <w:rFonts w:ascii="Times New Roman" w:hAnsi="Times New Roman" w:cs="Times New Roman"/>
+          <w:lang w:val="en-GB"/>
+        </w:rPr>
+        <w:t>-backend</w:t>
+      </w:r>
+      <w:r>
+        <w:rPr>
+          <w:rFonts w:ascii="Times New Roman" w:hAnsi="Times New Roman" w:cs="Times New Roman"/>
+          <w:lang w:val="en-GB"/>
+        </w:rPr>
+        <w:t>\</w:t>
+      </w:r>
+      <w:proofErr w:type="spellStart"/>
+      <w:r>
+        <w:rPr>
+          <w:rFonts w:ascii="Times New Roman" w:hAnsi="Times New Roman" w:cs="Times New Roman"/>
+          <w:lang w:val="en-GB"/>
+        </w:rPr>
+        <w:t>src</w:t>
+      </w:r>
+      <w:proofErr w:type="spellEnd"/>
+      <w:r>
+        <w:rPr>
+          <w:rFonts w:ascii="Times New Roman" w:hAnsi="Times New Roman" w:cs="Times New Roman"/>
+          <w:lang w:val="en-GB"/>
+        </w:rPr>
+        <w:t>\services\</w:t>
+      </w:r>
+      <w:proofErr w:type="spellStart"/>
+      <w:r>
+        <w:rPr>
+          <w:rFonts w:ascii="Times New Roman" w:hAnsi="Times New Roman" w:cs="Times New Roman"/>
+          <w:lang w:val="en-GB"/>
+        </w:rPr>
+        <w:t>kategori</w:t>
+      </w:r>
+      <w:proofErr w:type="spellEnd"/>
+      <w:r>
+        <w:rPr>
+          <w:rFonts w:ascii="Times New Roman" w:hAnsi="Times New Roman" w:cs="Times New Roman"/>
+          <w:lang w:val="en-GB"/>
+        </w:rPr>
+        <w:t>\</w:t>
+      </w:r>
+      <w:proofErr w:type="spellStart"/>
+      <w:r>
+        <w:rPr>
+          <w:rFonts w:ascii="Times New Roman" w:hAnsi="Times New Roman" w:cs="Times New Roman"/>
+          <w:lang w:val="en-GB"/>
+        </w:rPr>
+        <w:t>kategori</w:t>
+      </w:r>
+      <w:r>
+        <w:rPr>
+          <w:rFonts w:ascii="Times New Roman" w:hAnsi="Times New Roman" w:cs="Times New Roman"/>
+          <w:lang w:val="en-GB"/>
+        </w:rPr>
+        <w:t>.service.spec.ts</w:t>
+      </w:r>
+      <w:proofErr w:type="spellEnd"/>
+    </w:p>
+    <w:p>
+      <w:pPr>
+        <w:jc w:val="both"/>
+        <w:rPr>
+          <w:rFonts w:ascii="Times New Roman" w:hAnsi="Times New Roman" w:cs="Times New Roman"/>
+          <w:lang w:val="en-GB"/>
+        </w:rPr>
+      </w:pPr>
+      <w:r>
+        <w:rPr>
+          <w:noProof/>
+        </w:rPr>
+        <w:drawing>
+          <wp:inline distT="0" distB="0" distL="0" distR="0" wp14:anchorId="674A1009" wp14:editId="1E3D3824">
+            <wp:extent cx="5731510" cy="3222625"/>
+            <wp:effectExtent l="0" t="0" r="2540" b="0"/>
+            <wp:docPr id="123974750" name="Picture 1"/>
+            <wp:cNvGraphicFramePr>
+              <a:graphicFrameLocks xmlns:a="http://schemas.openxmlformats.org/drawingml/2006/main" noChangeAspect="1"/>
+            </wp:cNvGraphicFramePr>
+            <a:graphic xmlns:a="http://schemas.openxmlformats.org/drawingml/2006/main">
+              <a:graphicData uri="http://schemas.openxmlformats.org/drawingml/2006/picture">
+                <pic:pic xmlns:pic="http://schemas.openxmlformats.org/drawingml/2006/picture">
+                  <pic:nvPicPr>
+                    <pic:cNvPr id="123974750" name=""/>
+                    <pic:cNvPicPr/>
+                  </pic:nvPicPr>
+                  <pic:blipFill>
+                    <a:blip r:embed="rId33"/>
+                    <a:stretch>
+                      <a:fillRect/>
+                    </a:stretch>
+                  </pic:blipFill>
+                  <pic:spPr>
+                    <a:xfrm>
+                      <a:off x="0" y="0"/>
+                      <a:ext cx="5731510" cy="3222625"/>
+                    </a:xfrm>
+                    <a:prstGeom prst="rect">
+                      <a:avLst/>
+                    </a:prstGeom>
+                  </pic:spPr>
+                </pic:pic>
+              </a:graphicData>
+            </a:graphic>
+          </wp:inline>
+        </w:drawing>
+      </w:r>
+    </w:p>
+    <w:p>
+      <w:pPr>
+        <w:jc w:val="both"/>
+        <w:rPr>
+          <w:rFonts w:ascii="Times New Roman" w:hAnsi="Times New Roman" w:cs="Times New Roman"/>
+          <w:lang w:val="en-GB"/>
+        </w:rPr>
+      </w:pPr>
+      <w:r>
+        <w:rPr>
+          <w:rFonts w:ascii="Times New Roman" w:hAnsi="Times New Roman" w:cs="Times New Roman"/>
+          <w:lang w:val="en-GB"/>
+        </w:rPr>
+        <w:t xml:space="preserve">Hapus </w:t>
+      </w:r>
+      <w:proofErr w:type="spellStart"/>
+      <w:r>
+        <w:rPr>
+          <w:rFonts w:ascii="Times New Roman" w:hAnsi="Times New Roman" w:cs="Times New Roman"/>
+          <w:lang w:val="en-GB"/>
+        </w:rPr>
+        <w:t>variabel</w:t>
+      </w:r>
+      <w:proofErr w:type="spellEnd"/>
+      <w:r>
+        <w:rPr>
+          <w:rFonts w:ascii="Times New Roman" w:hAnsi="Times New Roman" w:cs="Times New Roman"/>
+          <w:lang w:val="en-GB"/>
+        </w:rPr>
+        <w:t xml:space="preserve"> </w:t>
+      </w:r>
+      <w:proofErr w:type="spellStart"/>
+      <w:r>
+        <w:rPr>
+          <w:rFonts w:ascii="Times New Roman" w:hAnsi="Times New Roman" w:cs="Times New Roman"/>
+          <w:lang w:val="en-GB"/>
+        </w:rPr>
+        <w:t>prisma</w:t>
+      </w:r>
+      <w:proofErr w:type="spellEnd"/>
+      <w:r>
+        <w:rPr>
+          <w:rFonts w:ascii="Times New Roman" w:hAnsi="Times New Roman" w:cs="Times New Roman"/>
+          <w:lang w:val="en-GB"/>
+        </w:rPr>
+        <w:t xml:space="preserve"> yang </w:t>
+      </w:r>
+      <w:proofErr w:type="spellStart"/>
+      <w:r>
+        <w:rPr>
+          <w:rFonts w:ascii="Times New Roman" w:hAnsi="Times New Roman" w:cs="Times New Roman"/>
+          <w:lang w:val="en-GB"/>
+        </w:rPr>
+        <w:t>tidak</w:t>
+      </w:r>
+      <w:proofErr w:type="spellEnd"/>
+      <w:r>
+        <w:rPr>
+          <w:rFonts w:ascii="Times New Roman" w:hAnsi="Times New Roman" w:cs="Times New Roman"/>
+          <w:lang w:val="en-GB"/>
+        </w:rPr>
+        <w:t xml:space="preserve"> </w:t>
+      </w:r>
+      <w:proofErr w:type="spellStart"/>
+      <w:r>
+        <w:rPr>
+          <w:rFonts w:ascii="Times New Roman" w:hAnsi="Times New Roman" w:cs="Times New Roman"/>
+          <w:lang w:val="en-GB"/>
+        </w:rPr>
+        <w:t>terpakai</w:t>
+      </w:r>
+      <w:proofErr w:type="spellEnd"/>
+      <w:r>
+        <w:rPr>
+          <w:rFonts w:ascii="Times New Roman" w:hAnsi="Times New Roman" w:cs="Times New Roman"/>
+          <w:lang w:val="en-GB"/>
+        </w:rPr>
+        <w:t>:</w:t>
+      </w:r>
+    </w:p>
+    <w:p>
+      <w:pPr>
+        <w:jc w:val="both"/>
+        <w:rPr>
+          <w:rFonts w:ascii="Times New Roman" w:hAnsi="Times New Roman" w:cs="Times New Roman"/>
+          <w:lang w:val="en-GB"/>
+        </w:rPr>
+      </w:pPr>
+      <w:r>
+        <w:rPr>
+          <w:rFonts w:ascii="Times New Roman" w:hAnsi="Times New Roman" w:cs="Times New Roman"/>
+          <w:lang w:val="en-GB"/>
+        </w:rPr>
+        <w:t xml:space="preserve">- let service: </w:t>
+      </w:r>
+      <w:proofErr w:type="spellStart"/>
+      <w:r>
+        <w:rPr>
+          <w:rFonts w:ascii="Times New Roman" w:hAnsi="Times New Roman" w:cs="Times New Roman"/>
+          <w:lang w:val="en-GB"/>
+        </w:rPr>
+        <w:t>KategoriService</w:t>
+      </w:r>
+      <w:proofErr w:type="spellEnd"/>
+      <w:r>
+        <w:rPr>
+          <w:rFonts w:ascii="Times New Roman" w:hAnsi="Times New Roman" w:cs="Times New Roman"/>
+          <w:lang w:val="en-GB"/>
+        </w:rPr>
+        <w:t>;</w:t>
+      </w:r>
+    </w:p>
+    <w:p>
+      <w:pPr>
+        <w:jc w:val="both"/>
+        <w:rPr>
+          <w:rFonts w:ascii="Times New Roman" w:hAnsi="Times New Roman" w:cs="Times New Roman"/>
+          <w:lang w:val="en-GB"/>
+        </w:rPr>
+      </w:pPr>
+      <w:r>
+        <w:rPr>
+          <w:rFonts w:ascii="Times New Roman" w:hAnsi="Times New Roman" w:cs="Times New Roman"/>
+          <w:lang w:val="en-GB"/>
+        </w:rPr>
+        <w:t>-</w:t>
+      </w:r>
+      <w:r>
+        <w:rPr>
+          <w:rFonts w:ascii="Times New Roman" w:hAnsi="Times New Roman" w:cs="Times New Roman"/>
+          <w:lang w:val="en-GB"/>
+        </w:rPr>
+        <w:t xml:space="preserve"> </w:t>
+      </w:r>
+      <w:r>
+        <w:rPr>
+          <w:rFonts w:ascii="Times New Roman" w:hAnsi="Times New Roman" w:cs="Times New Roman"/>
+          <w:lang w:val="en-GB"/>
+        </w:rPr>
+        <w:t xml:space="preserve">let </w:t>
+      </w:r>
+      <w:proofErr w:type="spellStart"/>
+      <w:r>
+        <w:rPr>
+          <w:rFonts w:ascii="Times New Roman" w:hAnsi="Times New Roman" w:cs="Times New Roman"/>
+          <w:lang w:val="en-GB"/>
+        </w:rPr>
+        <w:t>prisma</w:t>
+      </w:r>
+      <w:proofErr w:type="spellEnd"/>
+      <w:r>
+        <w:rPr>
+          <w:rFonts w:ascii="Times New Roman" w:hAnsi="Times New Roman" w:cs="Times New Roman"/>
+          <w:lang w:val="en-GB"/>
+        </w:rPr>
+        <w:t xml:space="preserve">: </w:t>
+      </w:r>
+      <w:proofErr w:type="spellStart"/>
+      <w:r>
+        <w:rPr>
+          <w:rFonts w:ascii="Times New Roman" w:hAnsi="Times New Roman" w:cs="Times New Roman"/>
+          <w:lang w:val="en-GB"/>
+        </w:rPr>
+        <w:t>PrismaService</w:t>
+      </w:r>
+      <w:proofErr w:type="spellEnd"/>
+      <w:r>
+        <w:rPr>
+          <w:rFonts w:ascii="Times New Roman" w:hAnsi="Times New Roman" w:cs="Times New Roman"/>
+          <w:lang w:val="en-GB"/>
+        </w:rPr>
+        <w:t>;</w:t>
+      </w:r>
+    </w:p>
+    <w:p>
+      <w:pPr>
+        <w:jc w:val="both"/>
+        <w:rPr>
+          <w:rFonts w:ascii="Times New Roman" w:hAnsi="Times New Roman" w:cs="Times New Roman"/>
+          <w:lang w:val="en-GB"/>
+        </w:rPr>
+      </w:pPr>
+      <w:r>
+        <w:rPr>
+          <w:rFonts w:ascii="Times New Roman" w:hAnsi="Times New Roman" w:cs="Times New Roman"/>
+          <w:lang w:val="en-GB"/>
+        </w:rPr>
+        <w:t xml:space="preserve">- </w:t>
+      </w:r>
+      <w:proofErr w:type="spellStart"/>
+      <w:r>
+        <w:rPr>
+          <w:rFonts w:ascii="Times New Roman" w:hAnsi="Times New Roman" w:cs="Times New Roman"/>
+          <w:lang w:val="en-GB"/>
+        </w:rPr>
+        <w:t>prisma</w:t>
+      </w:r>
+      <w:proofErr w:type="spellEnd"/>
+      <w:r>
+        <w:rPr>
+          <w:rFonts w:ascii="Times New Roman" w:hAnsi="Times New Roman" w:cs="Times New Roman"/>
+          <w:lang w:val="en-GB"/>
+        </w:rPr>
+        <w:t xml:space="preserve"> = </w:t>
+      </w:r>
+      <w:proofErr w:type="spellStart"/>
+      <w:r>
+        <w:rPr>
+          <w:rFonts w:ascii="Times New Roman" w:hAnsi="Times New Roman" w:cs="Times New Roman"/>
+          <w:lang w:val="en-GB"/>
+        </w:rPr>
+        <w:t>module.get</w:t>
+      </w:r>
+      <w:proofErr w:type="spellEnd"/>
+      <w:r>
+        <w:rPr>
+          <w:rFonts w:ascii="Times New Roman" w:hAnsi="Times New Roman" w:cs="Times New Roman"/>
+          <w:lang w:val="en-GB"/>
+        </w:rPr>
+        <w:t>&lt;</w:t>
+      </w:r>
+      <w:proofErr w:type="spellStart"/>
+      <w:r>
+        <w:rPr>
+          <w:rFonts w:ascii="Times New Roman" w:hAnsi="Times New Roman" w:cs="Times New Roman"/>
+          <w:lang w:val="en-GB"/>
+        </w:rPr>
+        <w:t>PrismaService</w:t>
+      </w:r>
+      <w:proofErr w:type="spellEnd"/>
+      <w:r>
+        <w:rPr>
+          <w:rFonts w:ascii="Times New Roman" w:hAnsi="Times New Roman" w:cs="Times New Roman"/>
+          <w:lang w:val="en-GB"/>
+        </w:rPr>
+        <w:t>&gt;(</w:t>
+      </w:r>
+      <w:proofErr w:type="spellStart"/>
+      <w:r>
+        <w:rPr>
+          <w:rFonts w:ascii="Times New Roman" w:hAnsi="Times New Roman" w:cs="Times New Roman"/>
+          <w:lang w:val="en-GB"/>
+        </w:rPr>
+        <w:t>PrismaService</w:t>
+      </w:r>
+      <w:proofErr w:type="spellEnd"/>
+      <w:r>
+        <w:rPr>
+          <w:rFonts w:ascii="Times New Roman" w:hAnsi="Times New Roman" w:cs="Times New Roman"/>
+          <w:lang w:val="en-GB"/>
+        </w:rPr>
+        <w:t>);</w:t>
       </w:r>
     </w:p>
     <w:sectPr>

</xml_diff>

<commit_message>
Membuat file .eslintrc.js pada folder sigersync-backend\ .eslintrc.js
</commit_message>
<xml_diff>
--- a/dokumentasi/24382001P_Lorensius Firngadi_IF 23 E_Dokumentasi.docx
+++ b/dokumentasi/24382001P_Lorensius Firngadi_IF 23 E_Dokumentasi.docx
@@ -31336,6 +31336,1078 @@
         <w:t>);</w:t>
       </w:r>
     </w:p>
+    <w:p>
+      <w:pPr>
+        <w:jc w:val="both"/>
+        <w:rPr>
+          <w:rFonts w:ascii="Times New Roman" w:hAnsi="Times New Roman" w:cs="Times New Roman"/>
+          <w:lang w:val="en-GB"/>
+        </w:rPr>
+      </w:pPr>
+      <w:r>
+        <w:rPr>
+          <w:rFonts w:ascii="Times New Roman" w:hAnsi="Times New Roman" w:cs="Times New Roman"/>
+          <w:lang w:val="en-GB"/>
+        </w:rPr>
+        <w:lastRenderedPageBreak/>
+        <w:t xml:space="preserve">30. </w:t>
+      </w:r>
+      <w:proofErr w:type="spellStart"/>
+      <w:r>
+        <w:rPr>
+          <w:rFonts w:ascii="Times New Roman" w:hAnsi="Times New Roman" w:cs="Times New Roman"/>
+          <w:lang w:val="en-GB"/>
+        </w:rPr>
+        <w:t>Membuat</w:t>
+      </w:r>
+      <w:proofErr w:type="spellEnd"/>
+      <w:r>
+        <w:rPr>
+          <w:rFonts w:ascii="Times New Roman" w:hAnsi="Times New Roman" w:cs="Times New Roman"/>
+          <w:lang w:val="en-GB"/>
+        </w:rPr>
+        <w:t xml:space="preserve"> </w:t>
+      </w:r>
+      <w:proofErr w:type="gramStart"/>
+      <w:r>
+        <w:rPr>
+          <w:rFonts w:ascii="Times New Roman" w:hAnsi="Times New Roman" w:cs="Times New Roman"/>
+          <w:lang w:val="en-GB"/>
+        </w:rPr>
+        <w:t>File .</w:t>
+      </w:r>
+      <w:proofErr w:type="gramEnd"/>
+      <w:r>
+        <w:rPr>
+          <w:rFonts w:ascii="Times New Roman" w:hAnsi="Times New Roman" w:cs="Times New Roman"/>
+          <w:lang w:val="en-GB"/>
+        </w:rPr>
+        <w:t>eslintrc.js</w:t>
+      </w:r>
+    </w:p>
+    <w:p>
+      <w:pPr>
+        <w:jc w:val="both"/>
+        <w:rPr>
+          <w:rFonts w:ascii="Times New Roman" w:hAnsi="Times New Roman" w:cs="Times New Roman"/>
+          <w:lang w:val="en-GB"/>
+        </w:rPr>
+      </w:pPr>
+      <w:proofErr w:type="gramStart"/>
+      <w:r>
+        <w:rPr>
+          <w:rFonts w:ascii="Times New Roman" w:hAnsi="Times New Roman" w:cs="Times New Roman"/>
+          <w:lang w:val="en-GB"/>
+        </w:rPr>
+        <w:t>File :</w:t>
+      </w:r>
+      <w:proofErr w:type="gramEnd"/>
+      <w:r>
+        <w:rPr>
+          <w:rFonts w:ascii="Times New Roman" w:hAnsi="Times New Roman" w:cs="Times New Roman"/>
+          <w:lang w:val="en-GB"/>
+        </w:rPr>
+        <w:t xml:space="preserve"> </w:t>
+      </w:r>
+      <w:proofErr w:type="spellStart"/>
+      <w:r>
+        <w:rPr>
+          <w:rFonts w:ascii="Times New Roman" w:hAnsi="Times New Roman" w:cs="Times New Roman"/>
+          <w:lang w:val="en-GB"/>
+        </w:rPr>
+        <w:t>sigersync</w:t>
+      </w:r>
+      <w:proofErr w:type="spellEnd"/>
+      <w:r>
+        <w:rPr>
+          <w:rFonts w:ascii="Times New Roman" w:hAnsi="Times New Roman" w:cs="Times New Roman"/>
+          <w:lang w:val="en-GB"/>
+        </w:rPr>
+        <w:t>-backend</w:t>
+      </w:r>
+      <w:proofErr w:type="gramStart"/>
+      <w:r>
+        <w:rPr>
+          <w:rFonts w:ascii="Times New Roman" w:hAnsi="Times New Roman" w:cs="Times New Roman"/>
+          <w:lang w:val="en-GB"/>
+        </w:rPr>
+        <w:t>\</w:t>
+      </w:r>
+      <w:r>
+        <w:t xml:space="preserve"> </w:t>
+      </w:r>
+      <w:r>
+        <w:rPr>
+          <w:rFonts w:ascii="Times New Roman" w:hAnsi="Times New Roman" w:cs="Times New Roman"/>
+          <w:lang w:val="en-GB"/>
+        </w:rPr>
+        <w:t>.</w:t>
+      </w:r>
+      <w:proofErr w:type="gramEnd"/>
+      <w:r>
+        <w:rPr>
+          <w:rFonts w:ascii="Times New Roman" w:hAnsi="Times New Roman" w:cs="Times New Roman"/>
+          <w:lang w:val="en-GB"/>
+        </w:rPr>
+        <w:t>eslintrc.js</w:t>
+      </w:r>
+    </w:p>
+    <w:p>
+      <w:pPr>
+        <w:jc w:val="both"/>
+        <w:rPr>
+          <w:rFonts w:ascii="Times New Roman" w:hAnsi="Times New Roman" w:cs="Times New Roman"/>
+          <w:lang w:val="en-GB"/>
+        </w:rPr>
+      </w:pPr>
+    </w:p>
+    <w:p>
+      <w:pPr>
+        <w:jc w:val="both"/>
+        <w:rPr>
+          <w:rFonts w:ascii="Times New Roman" w:hAnsi="Times New Roman" w:cs="Times New Roman"/>
+          <w:lang w:val="en-GB"/>
+        </w:rPr>
+      </w:pPr>
+    </w:p>
+    <w:p>
+      <w:pPr>
+        <w:jc w:val="both"/>
+        <w:rPr>
+          <w:rFonts w:ascii="Times New Roman" w:hAnsi="Times New Roman" w:cs="Times New Roman"/>
+          <w:lang w:val="en-GB"/>
+        </w:rPr>
+      </w:pPr>
+      <w:r>
+        <w:rPr>
+          <w:rFonts w:ascii="Times New Roman" w:hAnsi="Times New Roman" w:cs="Times New Roman"/>
+          <w:lang w:val="en-GB"/>
+        </w:rPr>
+        <w:t>F</w:t>
+      </w:r>
+      <w:r>
+        <w:rPr>
+          <w:rFonts w:ascii="Times New Roman" w:hAnsi="Times New Roman" w:cs="Times New Roman"/>
+          <w:lang w:val="en-GB"/>
+        </w:rPr>
+        <w:t xml:space="preserve">ile </w:t>
+      </w:r>
+      <w:proofErr w:type="spellStart"/>
+      <w:r>
+        <w:rPr>
+          <w:rFonts w:ascii="Times New Roman" w:hAnsi="Times New Roman" w:cs="Times New Roman"/>
+          <w:lang w:val="en-GB"/>
+        </w:rPr>
+        <w:t>ini</w:t>
+      </w:r>
+      <w:proofErr w:type="spellEnd"/>
+      <w:r>
+        <w:rPr>
+          <w:rFonts w:ascii="Times New Roman" w:hAnsi="Times New Roman" w:cs="Times New Roman"/>
+          <w:lang w:val="en-GB"/>
+        </w:rPr>
+        <w:t xml:space="preserve"> </w:t>
+      </w:r>
+      <w:proofErr w:type="spellStart"/>
+      <w:r>
+        <w:rPr>
+          <w:rFonts w:ascii="Times New Roman" w:hAnsi="Times New Roman" w:cs="Times New Roman"/>
+          <w:lang w:val="en-GB"/>
+        </w:rPr>
+        <w:t>adalah</w:t>
+      </w:r>
+      <w:proofErr w:type="spellEnd"/>
+      <w:r>
+        <w:rPr>
+          <w:rFonts w:ascii="Times New Roman" w:hAnsi="Times New Roman" w:cs="Times New Roman"/>
+          <w:lang w:val="en-GB"/>
+        </w:rPr>
+        <w:t xml:space="preserve"> </w:t>
+      </w:r>
+      <w:proofErr w:type="spellStart"/>
+      <w:r>
+        <w:rPr>
+          <w:rFonts w:ascii="Times New Roman" w:hAnsi="Times New Roman" w:cs="Times New Roman"/>
+          <w:lang w:val="en-GB"/>
+        </w:rPr>
+        <w:t>konfigurasi</w:t>
+      </w:r>
+      <w:proofErr w:type="spellEnd"/>
+      <w:r>
+        <w:rPr>
+          <w:rFonts w:ascii="Times New Roman" w:hAnsi="Times New Roman" w:cs="Times New Roman"/>
+          <w:lang w:val="en-GB"/>
+        </w:rPr>
+        <w:t xml:space="preserve"> </w:t>
+      </w:r>
+      <w:proofErr w:type="spellStart"/>
+      <w:r>
+        <w:rPr>
+          <w:rFonts w:ascii="Times New Roman" w:hAnsi="Times New Roman" w:cs="Times New Roman"/>
+          <w:lang w:val="en-GB"/>
+        </w:rPr>
+        <w:t>untuk</w:t>
+      </w:r>
+      <w:proofErr w:type="spellEnd"/>
+      <w:r>
+        <w:rPr>
+          <w:rFonts w:ascii="Times New Roman" w:hAnsi="Times New Roman" w:cs="Times New Roman"/>
+          <w:lang w:val="en-GB"/>
+        </w:rPr>
+        <w:t xml:space="preserve"> </w:t>
+      </w:r>
+      <w:proofErr w:type="spellStart"/>
+      <w:r>
+        <w:rPr>
+          <w:rFonts w:ascii="Times New Roman" w:hAnsi="Times New Roman" w:cs="Times New Roman"/>
+          <w:lang w:val="en-GB"/>
+        </w:rPr>
+        <w:t>ESLint</w:t>
+      </w:r>
+      <w:proofErr w:type="spellEnd"/>
+      <w:r>
+        <w:rPr>
+          <w:rFonts w:ascii="Times New Roman" w:hAnsi="Times New Roman" w:cs="Times New Roman"/>
+          <w:lang w:val="en-GB"/>
+        </w:rPr>
+        <w:t xml:space="preserve">, </w:t>
+      </w:r>
+      <w:proofErr w:type="spellStart"/>
+      <w:r>
+        <w:rPr>
+          <w:rFonts w:ascii="Times New Roman" w:hAnsi="Times New Roman" w:cs="Times New Roman"/>
+          <w:lang w:val="en-GB"/>
+        </w:rPr>
+        <w:t>sebuah</w:t>
+      </w:r>
+      <w:proofErr w:type="spellEnd"/>
+      <w:r>
+        <w:rPr>
+          <w:rFonts w:ascii="Times New Roman" w:hAnsi="Times New Roman" w:cs="Times New Roman"/>
+          <w:lang w:val="en-GB"/>
+        </w:rPr>
+        <w:t xml:space="preserve"> </w:t>
+      </w:r>
+      <w:proofErr w:type="spellStart"/>
+      <w:r>
+        <w:rPr>
+          <w:rFonts w:ascii="Times New Roman" w:hAnsi="Times New Roman" w:cs="Times New Roman"/>
+          <w:lang w:val="en-GB"/>
+        </w:rPr>
+        <w:t>alat</w:t>
+      </w:r>
+      <w:proofErr w:type="spellEnd"/>
+      <w:r>
+        <w:rPr>
+          <w:rFonts w:ascii="Times New Roman" w:hAnsi="Times New Roman" w:cs="Times New Roman"/>
+          <w:lang w:val="en-GB"/>
+        </w:rPr>
+        <w:t xml:space="preserve"> linting yang </w:t>
+      </w:r>
+      <w:proofErr w:type="spellStart"/>
+      <w:r>
+        <w:rPr>
+          <w:rFonts w:ascii="Times New Roman" w:hAnsi="Times New Roman" w:cs="Times New Roman"/>
+          <w:lang w:val="en-GB"/>
+        </w:rPr>
+        <w:t>berfungsi</w:t>
+      </w:r>
+      <w:proofErr w:type="spellEnd"/>
+      <w:r>
+        <w:rPr>
+          <w:rFonts w:ascii="Times New Roman" w:hAnsi="Times New Roman" w:cs="Times New Roman"/>
+          <w:lang w:val="en-GB"/>
+        </w:rPr>
+        <w:t xml:space="preserve"> </w:t>
+      </w:r>
+      <w:proofErr w:type="spellStart"/>
+      <w:r>
+        <w:rPr>
+          <w:rFonts w:ascii="Times New Roman" w:hAnsi="Times New Roman" w:cs="Times New Roman"/>
+          <w:lang w:val="en-GB"/>
+        </w:rPr>
+        <w:t>untuk</w:t>
+      </w:r>
+      <w:proofErr w:type="spellEnd"/>
+      <w:r>
+        <w:rPr>
+          <w:rFonts w:ascii="Times New Roman" w:hAnsi="Times New Roman" w:cs="Times New Roman"/>
+          <w:lang w:val="en-GB"/>
+        </w:rPr>
+        <w:t xml:space="preserve"> </w:t>
+      </w:r>
+      <w:proofErr w:type="spellStart"/>
+      <w:r>
+        <w:rPr>
+          <w:rFonts w:ascii="Times New Roman" w:hAnsi="Times New Roman" w:cs="Times New Roman"/>
+          <w:lang w:val="en-GB"/>
+        </w:rPr>
+        <w:t>menganalisis</w:t>
+      </w:r>
+      <w:proofErr w:type="spellEnd"/>
+      <w:r>
+        <w:rPr>
+          <w:rFonts w:ascii="Times New Roman" w:hAnsi="Times New Roman" w:cs="Times New Roman"/>
+          <w:lang w:val="en-GB"/>
+        </w:rPr>
+        <w:t xml:space="preserve"> </w:t>
+      </w:r>
+      <w:proofErr w:type="spellStart"/>
+      <w:r>
+        <w:rPr>
+          <w:rFonts w:ascii="Times New Roman" w:hAnsi="Times New Roman" w:cs="Times New Roman"/>
+          <w:lang w:val="en-GB"/>
+        </w:rPr>
+        <w:t>kode</w:t>
+      </w:r>
+      <w:proofErr w:type="spellEnd"/>
+      <w:r>
+        <w:rPr>
+          <w:rFonts w:ascii="Times New Roman" w:hAnsi="Times New Roman" w:cs="Times New Roman"/>
+          <w:lang w:val="en-GB"/>
+        </w:rPr>
+        <w:t xml:space="preserve"> </w:t>
+      </w:r>
+      <w:proofErr w:type="spellStart"/>
+      <w:r>
+        <w:rPr>
+          <w:rFonts w:ascii="Times New Roman" w:hAnsi="Times New Roman" w:cs="Times New Roman"/>
+          <w:lang w:val="en-GB"/>
+        </w:rPr>
+        <w:t>secara</w:t>
+      </w:r>
+      <w:proofErr w:type="spellEnd"/>
+      <w:r>
+        <w:rPr>
+          <w:rFonts w:ascii="Times New Roman" w:hAnsi="Times New Roman" w:cs="Times New Roman"/>
+          <w:lang w:val="en-GB"/>
+        </w:rPr>
+        <w:t xml:space="preserve"> statis guna </w:t>
+      </w:r>
+      <w:proofErr w:type="spellStart"/>
+      <w:r>
+        <w:rPr>
+          <w:rFonts w:ascii="Times New Roman" w:hAnsi="Times New Roman" w:cs="Times New Roman"/>
+          <w:lang w:val="en-GB"/>
+        </w:rPr>
+        <w:t>menemukan</w:t>
+      </w:r>
+      <w:proofErr w:type="spellEnd"/>
+      <w:r>
+        <w:rPr>
+          <w:rFonts w:ascii="Times New Roman" w:hAnsi="Times New Roman" w:cs="Times New Roman"/>
+          <w:lang w:val="en-GB"/>
+        </w:rPr>
+        <w:t xml:space="preserve"> </w:t>
+      </w:r>
+      <w:proofErr w:type="spellStart"/>
+      <w:r>
+        <w:rPr>
+          <w:rFonts w:ascii="Times New Roman" w:hAnsi="Times New Roman" w:cs="Times New Roman"/>
+          <w:lang w:val="en-GB"/>
+        </w:rPr>
+        <w:t>kesalahan</w:t>
+      </w:r>
+      <w:proofErr w:type="spellEnd"/>
+      <w:r>
+        <w:rPr>
+          <w:rFonts w:ascii="Times New Roman" w:hAnsi="Times New Roman" w:cs="Times New Roman"/>
+          <w:lang w:val="en-GB"/>
+        </w:rPr>
+        <w:t xml:space="preserve"> </w:t>
+      </w:r>
+      <w:proofErr w:type="spellStart"/>
+      <w:r>
+        <w:rPr>
+          <w:rFonts w:ascii="Times New Roman" w:hAnsi="Times New Roman" w:cs="Times New Roman"/>
+          <w:lang w:val="en-GB"/>
+        </w:rPr>
+        <w:t>penulisan</w:t>
+      </w:r>
+      <w:proofErr w:type="spellEnd"/>
+      <w:r>
+        <w:rPr>
+          <w:rFonts w:ascii="Times New Roman" w:hAnsi="Times New Roman" w:cs="Times New Roman"/>
+          <w:lang w:val="en-GB"/>
+        </w:rPr>
+        <w:t xml:space="preserve">, bug, </w:t>
+      </w:r>
+      <w:proofErr w:type="spellStart"/>
+      <w:r>
+        <w:rPr>
+          <w:rFonts w:ascii="Times New Roman" w:hAnsi="Times New Roman" w:cs="Times New Roman"/>
+          <w:lang w:val="en-GB"/>
+        </w:rPr>
+        <w:t>atau</w:t>
+      </w:r>
+      <w:proofErr w:type="spellEnd"/>
+      <w:r>
+        <w:rPr>
+          <w:rFonts w:ascii="Times New Roman" w:hAnsi="Times New Roman" w:cs="Times New Roman"/>
+          <w:lang w:val="en-GB"/>
+        </w:rPr>
+        <w:t xml:space="preserve"> </w:t>
+      </w:r>
+      <w:proofErr w:type="spellStart"/>
+      <w:r>
+        <w:rPr>
+          <w:rFonts w:ascii="Times New Roman" w:hAnsi="Times New Roman" w:cs="Times New Roman"/>
+          <w:lang w:val="en-GB"/>
+        </w:rPr>
+        <w:t>gaya</w:t>
+      </w:r>
+      <w:proofErr w:type="spellEnd"/>
+      <w:r>
+        <w:rPr>
+          <w:rFonts w:ascii="Times New Roman" w:hAnsi="Times New Roman" w:cs="Times New Roman"/>
+          <w:lang w:val="en-GB"/>
+        </w:rPr>
+        <w:t xml:space="preserve"> </w:t>
+      </w:r>
+      <w:proofErr w:type="spellStart"/>
+      <w:r>
+        <w:rPr>
+          <w:rFonts w:ascii="Times New Roman" w:hAnsi="Times New Roman" w:cs="Times New Roman"/>
+          <w:lang w:val="en-GB"/>
+        </w:rPr>
+        <w:t>penulisan</w:t>
+      </w:r>
+      <w:proofErr w:type="spellEnd"/>
+      <w:r>
+        <w:rPr>
+          <w:rFonts w:ascii="Times New Roman" w:hAnsi="Times New Roman" w:cs="Times New Roman"/>
+          <w:lang w:val="en-GB"/>
+        </w:rPr>
+        <w:t xml:space="preserve"> yang </w:t>
+      </w:r>
+      <w:proofErr w:type="spellStart"/>
+      <w:r>
+        <w:rPr>
+          <w:rFonts w:ascii="Times New Roman" w:hAnsi="Times New Roman" w:cs="Times New Roman"/>
+          <w:lang w:val="en-GB"/>
+        </w:rPr>
+        <w:t>tidak</w:t>
+      </w:r>
+      <w:proofErr w:type="spellEnd"/>
+      <w:r>
+        <w:rPr>
+          <w:rFonts w:ascii="Times New Roman" w:hAnsi="Times New Roman" w:cs="Times New Roman"/>
+          <w:lang w:val="en-GB"/>
+        </w:rPr>
+        <w:t xml:space="preserve"> </w:t>
+      </w:r>
+      <w:proofErr w:type="spellStart"/>
+      <w:r>
+        <w:rPr>
+          <w:rFonts w:ascii="Times New Roman" w:hAnsi="Times New Roman" w:cs="Times New Roman"/>
+          <w:lang w:val="en-GB"/>
+        </w:rPr>
+        <w:t>konsisten</w:t>
+      </w:r>
+      <w:proofErr w:type="spellEnd"/>
+    </w:p>
+    <w:p>
+      <w:pPr>
+        <w:jc w:val="both"/>
+        <w:rPr>
+          <w:rFonts w:ascii="Times New Roman" w:hAnsi="Times New Roman" w:cs="Times New Roman"/>
+          <w:lang w:val="en-GB"/>
+        </w:rPr>
+      </w:pPr>
+      <w:proofErr w:type="spellStart"/>
+      <w:r>
+        <w:rPr>
+          <w:rFonts w:ascii="Times New Roman" w:hAnsi="Times New Roman" w:cs="Times New Roman"/>
+          <w:lang w:val="en-GB"/>
+        </w:rPr>
+        <w:t>Fungsi</w:t>
+      </w:r>
+      <w:proofErr w:type="spellEnd"/>
+      <w:r>
+        <w:rPr>
+          <w:rFonts w:ascii="Times New Roman" w:hAnsi="Times New Roman" w:cs="Times New Roman"/>
+          <w:lang w:val="en-GB"/>
+        </w:rPr>
+        <w:t xml:space="preserve"> </w:t>
+      </w:r>
+      <w:proofErr w:type="gramStart"/>
+      <w:r>
+        <w:rPr>
+          <w:rFonts w:ascii="Times New Roman" w:hAnsi="Times New Roman" w:cs="Times New Roman"/>
+          <w:lang w:val="en-GB"/>
+        </w:rPr>
+        <w:t>Utama .</w:t>
+      </w:r>
+      <w:proofErr w:type="gramEnd"/>
+      <w:r>
+        <w:rPr>
+          <w:rFonts w:ascii="Times New Roman" w:hAnsi="Times New Roman" w:cs="Times New Roman"/>
+          <w:lang w:val="en-GB"/>
+        </w:rPr>
+        <w:t>eslintrc.js</w:t>
+      </w:r>
+      <w:r>
+        <w:rPr>
+          <w:rFonts w:ascii="Times New Roman" w:hAnsi="Times New Roman" w:cs="Times New Roman"/>
+          <w:lang w:val="en-GB"/>
+        </w:rPr>
+        <w:t xml:space="preserve"> :</w:t>
+      </w:r>
+    </w:p>
+    <w:p>
+      <w:pPr>
+        <w:pStyle w:val="ListParagraph"/>
+        <w:numPr>
+          <w:ilvl w:val="0"/>
+          <w:numId w:val="25"/>
+        </w:numPr>
+        <w:jc w:val="both"/>
+        <w:rPr>
+          <w:rFonts w:ascii="Times New Roman" w:hAnsi="Times New Roman" w:cs="Times New Roman"/>
+          <w:lang w:val="en-GB"/>
+        </w:rPr>
+      </w:pPr>
+      <w:proofErr w:type="spellStart"/>
+      <w:r>
+        <w:rPr>
+          <w:rFonts w:ascii="Times New Roman" w:hAnsi="Times New Roman" w:cs="Times New Roman"/>
+          <w:lang w:val="en-GB"/>
+        </w:rPr>
+        <w:t>Standarisasi</w:t>
+      </w:r>
+      <w:proofErr w:type="spellEnd"/>
+      <w:r>
+        <w:rPr>
+          <w:rFonts w:ascii="Times New Roman" w:hAnsi="Times New Roman" w:cs="Times New Roman"/>
+          <w:lang w:val="en-GB"/>
+        </w:rPr>
+        <w:t xml:space="preserve"> Kode: </w:t>
+      </w:r>
+      <w:proofErr w:type="spellStart"/>
+      <w:r>
+        <w:rPr>
+          <w:rFonts w:ascii="Times New Roman" w:hAnsi="Times New Roman" w:cs="Times New Roman"/>
+          <w:lang w:val="en-GB"/>
+        </w:rPr>
+        <w:t>Memastikan</w:t>
+      </w:r>
+      <w:proofErr w:type="spellEnd"/>
+      <w:r>
+        <w:rPr>
+          <w:rFonts w:ascii="Times New Roman" w:hAnsi="Times New Roman" w:cs="Times New Roman"/>
+          <w:lang w:val="en-GB"/>
+        </w:rPr>
+        <w:t xml:space="preserve"> </w:t>
+      </w:r>
+      <w:proofErr w:type="spellStart"/>
+      <w:r>
+        <w:rPr>
+          <w:rFonts w:ascii="Times New Roman" w:hAnsi="Times New Roman" w:cs="Times New Roman"/>
+          <w:lang w:val="en-GB"/>
+        </w:rPr>
+        <w:t>semua</w:t>
+      </w:r>
+      <w:proofErr w:type="spellEnd"/>
+      <w:r>
+        <w:rPr>
+          <w:rFonts w:ascii="Times New Roman" w:hAnsi="Times New Roman" w:cs="Times New Roman"/>
+          <w:lang w:val="en-GB"/>
+        </w:rPr>
+        <w:t xml:space="preserve"> developer </w:t>
+      </w:r>
+      <w:proofErr w:type="spellStart"/>
+      <w:r>
+        <w:rPr>
+          <w:rFonts w:ascii="Times New Roman" w:hAnsi="Times New Roman" w:cs="Times New Roman"/>
+          <w:lang w:val="en-GB"/>
+        </w:rPr>
+        <w:t>dalam</w:t>
+      </w:r>
+      <w:proofErr w:type="spellEnd"/>
+      <w:r>
+        <w:rPr>
+          <w:rFonts w:ascii="Times New Roman" w:hAnsi="Times New Roman" w:cs="Times New Roman"/>
+          <w:lang w:val="en-GB"/>
+        </w:rPr>
+        <w:t xml:space="preserve"> </w:t>
+      </w:r>
+      <w:proofErr w:type="spellStart"/>
+      <w:r>
+        <w:rPr>
+          <w:rFonts w:ascii="Times New Roman" w:hAnsi="Times New Roman" w:cs="Times New Roman"/>
+          <w:lang w:val="en-GB"/>
+        </w:rPr>
+        <w:t>tim</w:t>
+      </w:r>
+      <w:proofErr w:type="spellEnd"/>
+      <w:r>
+        <w:rPr>
+          <w:rFonts w:ascii="Times New Roman" w:hAnsi="Times New Roman" w:cs="Times New Roman"/>
+          <w:lang w:val="en-GB"/>
+        </w:rPr>
+        <w:t xml:space="preserve"> </w:t>
+      </w:r>
+      <w:proofErr w:type="spellStart"/>
+      <w:r>
+        <w:rPr>
+          <w:rFonts w:ascii="Times New Roman" w:hAnsi="Times New Roman" w:cs="Times New Roman"/>
+          <w:lang w:val="en-GB"/>
+        </w:rPr>
+        <w:t>menulis</w:t>
+      </w:r>
+      <w:proofErr w:type="spellEnd"/>
+      <w:r>
+        <w:rPr>
+          <w:rFonts w:ascii="Times New Roman" w:hAnsi="Times New Roman" w:cs="Times New Roman"/>
+          <w:lang w:val="en-GB"/>
+        </w:rPr>
+        <w:t xml:space="preserve"> </w:t>
+      </w:r>
+      <w:proofErr w:type="spellStart"/>
+      <w:r>
+        <w:rPr>
+          <w:rFonts w:ascii="Times New Roman" w:hAnsi="Times New Roman" w:cs="Times New Roman"/>
+          <w:lang w:val="en-GB"/>
+        </w:rPr>
+        <w:t>kode</w:t>
+      </w:r>
+      <w:proofErr w:type="spellEnd"/>
+      <w:r>
+        <w:rPr>
+          <w:rFonts w:ascii="Times New Roman" w:hAnsi="Times New Roman" w:cs="Times New Roman"/>
+          <w:lang w:val="en-GB"/>
+        </w:rPr>
+        <w:t xml:space="preserve"> </w:t>
+      </w:r>
+      <w:proofErr w:type="spellStart"/>
+      <w:r>
+        <w:rPr>
+          <w:rFonts w:ascii="Times New Roman" w:hAnsi="Times New Roman" w:cs="Times New Roman"/>
+          <w:lang w:val="en-GB"/>
+        </w:rPr>
+        <w:t>dengan</w:t>
+      </w:r>
+      <w:proofErr w:type="spellEnd"/>
+      <w:r>
+        <w:rPr>
+          <w:rFonts w:ascii="Times New Roman" w:hAnsi="Times New Roman" w:cs="Times New Roman"/>
+          <w:lang w:val="en-GB"/>
+        </w:rPr>
+        <w:t xml:space="preserve"> </w:t>
+      </w:r>
+      <w:proofErr w:type="spellStart"/>
+      <w:r>
+        <w:rPr>
+          <w:rFonts w:ascii="Times New Roman" w:hAnsi="Times New Roman" w:cs="Times New Roman"/>
+          <w:lang w:val="en-GB"/>
+        </w:rPr>
+        <w:t>gaya</w:t>
+      </w:r>
+      <w:proofErr w:type="spellEnd"/>
+      <w:r>
+        <w:rPr>
+          <w:rFonts w:ascii="Times New Roman" w:hAnsi="Times New Roman" w:cs="Times New Roman"/>
+          <w:lang w:val="en-GB"/>
+        </w:rPr>
+        <w:t xml:space="preserve"> yang </w:t>
+      </w:r>
+      <w:proofErr w:type="spellStart"/>
+      <w:r>
+        <w:rPr>
+          <w:rFonts w:ascii="Times New Roman" w:hAnsi="Times New Roman" w:cs="Times New Roman"/>
+          <w:lang w:val="en-GB"/>
+        </w:rPr>
+        <w:t>sama</w:t>
+      </w:r>
+      <w:proofErr w:type="spellEnd"/>
+      <w:r>
+        <w:rPr>
+          <w:rFonts w:ascii="Times New Roman" w:hAnsi="Times New Roman" w:cs="Times New Roman"/>
+          <w:lang w:val="en-GB"/>
+        </w:rPr>
+        <w:t>.</w:t>
+      </w:r>
+    </w:p>
+    <w:p>
+      <w:pPr>
+        <w:pStyle w:val="ListParagraph"/>
+        <w:numPr>
+          <w:ilvl w:val="0"/>
+          <w:numId w:val="25"/>
+        </w:numPr>
+        <w:jc w:val="both"/>
+        <w:rPr>
+          <w:rFonts w:ascii="Times New Roman" w:hAnsi="Times New Roman" w:cs="Times New Roman"/>
+          <w:lang w:val="en-GB"/>
+        </w:rPr>
+      </w:pPr>
+      <w:proofErr w:type="spellStart"/>
+      <w:r>
+        <w:rPr>
+          <w:rFonts w:ascii="Times New Roman" w:hAnsi="Times New Roman" w:cs="Times New Roman"/>
+          <w:lang w:val="en-GB"/>
+        </w:rPr>
+        <w:t>Deteksi</w:t>
+      </w:r>
+      <w:proofErr w:type="spellEnd"/>
+      <w:r>
+        <w:rPr>
+          <w:rFonts w:ascii="Times New Roman" w:hAnsi="Times New Roman" w:cs="Times New Roman"/>
+          <w:lang w:val="en-GB"/>
+        </w:rPr>
+        <w:t xml:space="preserve"> Error: </w:t>
+      </w:r>
+      <w:proofErr w:type="spellStart"/>
+      <w:r>
+        <w:rPr>
+          <w:rFonts w:ascii="Times New Roman" w:hAnsi="Times New Roman" w:cs="Times New Roman"/>
+          <w:lang w:val="en-GB"/>
+        </w:rPr>
+        <w:t>Menemukan</w:t>
+      </w:r>
+      <w:proofErr w:type="spellEnd"/>
+      <w:r>
+        <w:rPr>
+          <w:rFonts w:ascii="Times New Roman" w:hAnsi="Times New Roman" w:cs="Times New Roman"/>
+          <w:lang w:val="en-GB"/>
+        </w:rPr>
+        <w:t xml:space="preserve"> </w:t>
+      </w:r>
+      <w:proofErr w:type="spellStart"/>
+      <w:r>
+        <w:rPr>
+          <w:rFonts w:ascii="Times New Roman" w:hAnsi="Times New Roman" w:cs="Times New Roman"/>
+          <w:lang w:val="en-GB"/>
+        </w:rPr>
+        <w:t>potensi</w:t>
+      </w:r>
+      <w:proofErr w:type="spellEnd"/>
+      <w:r>
+        <w:rPr>
+          <w:rFonts w:ascii="Times New Roman" w:hAnsi="Times New Roman" w:cs="Times New Roman"/>
+          <w:lang w:val="en-GB"/>
+        </w:rPr>
+        <w:t xml:space="preserve"> bug </w:t>
+      </w:r>
+      <w:proofErr w:type="spellStart"/>
+      <w:r>
+        <w:rPr>
+          <w:rFonts w:ascii="Times New Roman" w:hAnsi="Times New Roman" w:cs="Times New Roman"/>
+          <w:lang w:val="en-GB"/>
+        </w:rPr>
+        <w:t>sebelum</w:t>
+      </w:r>
+      <w:proofErr w:type="spellEnd"/>
+      <w:r>
+        <w:rPr>
+          <w:rFonts w:ascii="Times New Roman" w:hAnsi="Times New Roman" w:cs="Times New Roman"/>
+          <w:lang w:val="en-GB"/>
+        </w:rPr>
+        <w:t xml:space="preserve"> </w:t>
+      </w:r>
+      <w:proofErr w:type="spellStart"/>
+      <w:r>
+        <w:rPr>
+          <w:rFonts w:ascii="Times New Roman" w:hAnsi="Times New Roman" w:cs="Times New Roman"/>
+          <w:lang w:val="en-GB"/>
+        </w:rPr>
+        <w:t>kode</w:t>
+      </w:r>
+      <w:proofErr w:type="spellEnd"/>
+      <w:r>
+        <w:rPr>
+          <w:rFonts w:ascii="Times New Roman" w:hAnsi="Times New Roman" w:cs="Times New Roman"/>
+          <w:lang w:val="en-GB"/>
+        </w:rPr>
+        <w:t xml:space="preserve"> </w:t>
+      </w:r>
+      <w:proofErr w:type="spellStart"/>
+      <w:r>
+        <w:rPr>
+          <w:rFonts w:ascii="Times New Roman" w:hAnsi="Times New Roman" w:cs="Times New Roman"/>
+          <w:lang w:val="en-GB"/>
+        </w:rPr>
+        <w:t>dijalankan</w:t>
+      </w:r>
+      <w:proofErr w:type="spellEnd"/>
+      <w:r>
+        <w:rPr>
+          <w:rFonts w:ascii="Times New Roman" w:hAnsi="Times New Roman" w:cs="Times New Roman"/>
+          <w:lang w:val="en-GB"/>
+        </w:rPr>
+        <w:t xml:space="preserve"> (</w:t>
+      </w:r>
+      <w:proofErr w:type="spellStart"/>
+      <w:r>
+        <w:rPr>
+          <w:rFonts w:ascii="Times New Roman" w:hAnsi="Times New Roman" w:cs="Times New Roman"/>
+          <w:lang w:val="en-GB"/>
+        </w:rPr>
+        <w:t>seperti</w:t>
+      </w:r>
+      <w:proofErr w:type="spellEnd"/>
+      <w:r>
+        <w:rPr>
+          <w:rFonts w:ascii="Times New Roman" w:hAnsi="Times New Roman" w:cs="Times New Roman"/>
+          <w:lang w:val="en-GB"/>
+        </w:rPr>
+        <w:t xml:space="preserve"> </w:t>
+      </w:r>
+      <w:proofErr w:type="spellStart"/>
+      <w:r>
+        <w:rPr>
+          <w:rFonts w:ascii="Times New Roman" w:hAnsi="Times New Roman" w:cs="Times New Roman"/>
+          <w:lang w:val="en-GB"/>
+        </w:rPr>
+        <w:t>variabel</w:t>
+      </w:r>
+      <w:proofErr w:type="spellEnd"/>
+      <w:r>
+        <w:rPr>
+          <w:rFonts w:ascii="Times New Roman" w:hAnsi="Times New Roman" w:cs="Times New Roman"/>
+          <w:lang w:val="en-GB"/>
+        </w:rPr>
+        <w:t xml:space="preserve"> yang </w:t>
+      </w:r>
+      <w:proofErr w:type="spellStart"/>
+      <w:r>
+        <w:rPr>
+          <w:rFonts w:ascii="Times New Roman" w:hAnsi="Times New Roman" w:cs="Times New Roman"/>
+          <w:lang w:val="en-GB"/>
+        </w:rPr>
+        <w:t>tidak</w:t>
+      </w:r>
+      <w:proofErr w:type="spellEnd"/>
+      <w:r>
+        <w:rPr>
+          <w:rFonts w:ascii="Times New Roman" w:hAnsi="Times New Roman" w:cs="Times New Roman"/>
+          <w:lang w:val="en-GB"/>
+        </w:rPr>
+        <w:t xml:space="preserve"> </w:t>
+      </w:r>
+      <w:proofErr w:type="spellStart"/>
+      <w:r>
+        <w:rPr>
+          <w:rFonts w:ascii="Times New Roman" w:hAnsi="Times New Roman" w:cs="Times New Roman"/>
+          <w:lang w:val="en-GB"/>
+        </w:rPr>
+        <w:t>terpakai</w:t>
+      </w:r>
+      <w:proofErr w:type="spellEnd"/>
+      <w:r>
+        <w:rPr>
+          <w:rFonts w:ascii="Times New Roman" w:hAnsi="Times New Roman" w:cs="Times New Roman"/>
+          <w:lang w:val="en-GB"/>
+        </w:rPr>
+        <w:t xml:space="preserve"> </w:t>
+      </w:r>
+      <w:proofErr w:type="spellStart"/>
+      <w:r>
+        <w:rPr>
+          <w:rFonts w:ascii="Times New Roman" w:hAnsi="Times New Roman" w:cs="Times New Roman"/>
+          <w:lang w:val="en-GB"/>
+        </w:rPr>
+        <w:t>atau</w:t>
+      </w:r>
+      <w:proofErr w:type="spellEnd"/>
+      <w:r>
+        <w:rPr>
+          <w:rFonts w:ascii="Times New Roman" w:hAnsi="Times New Roman" w:cs="Times New Roman"/>
+          <w:lang w:val="en-GB"/>
+        </w:rPr>
+        <w:t xml:space="preserve"> salah </w:t>
+      </w:r>
+      <w:proofErr w:type="spellStart"/>
+      <w:r>
+        <w:rPr>
+          <w:rFonts w:ascii="Times New Roman" w:hAnsi="Times New Roman" w:cs="Times New Roman"/>
+          <w:lang w:val="en-GB"/>
+        </w:rPr>
+        <w:t>ketik</w:t>
+      </w:r>
+      <w:proofErr w:type="spellEnd"/>
+      <w:r>
+        <w:rPr>
+          <w:rFonts w:ascii="Times New Roman" w:hAnsi="Times New Roman" w:cs="Times New Roman"/>
+          <w:lang w:val="en-GB"/>
+        </w:rPr>
+        <w:t>).</w:t>
+      </w:r>
+    </w:p>
+    <w:p>
+      <w:pPr>
+        <w:pStyle w:val="ListParagraph"/>
+        <w:numPr>
+          <w:ilvl w:val="0"/>
+          <w:numId w:val="25"/>
+        </w:numPr>
+        <w:jc w:val="both"/>
+        <w:rPr>
+          <w:rFonts w:ascii="Times New Roman" w:hAnsi="Times New Roman" w:cs="Times New Roman"/>
+          <w:lang w:val="en-GB"/>
+        </w:rPr>
+      </w:pPr>
+      <w:r>
+        <w:rPr>
+          <w:rFonts w:ascii="Times New Roman" w:hAnsi="Times New Roman" w:cs="Times New Roman"/>
+          <w:lang w:val="en-GB"/>
+        </w:rPr>
+        <w:t xml:space="preserve">Integrasi Prettier: </w:t>
+      </w:r>
+      <w:proofErr w:type="spellStart"/>
+      <w:r>
+        <w:rPr>
+          <w:rFonts w:ascii="Times New Roman" w:hAnsi="Times New Roman" w:cs="Times New Roman"/>
+          <w:lang w:val="en-GB"/>
+        </w:rPr>
+        <w:t>Menggabungkan</w:t>
+      </w:r>
+      <w:proofErr w:type="spellEnd"/>
+      <w:r>
+        <w:rPr>
+          <w:rFonts w:ascii="Times New Roman" w:hAnsi="Times New Roman" w:cs="Times New Roman"/>
+          <w:lang w:val="en-GB"/>
+        </w:rPr>
+        <w:t xml:space="preserve"> </w:t>
+      </w:r>
+      <w:proofErr w:type="spellStart"/>
+      <w:r>
+        <w:rPr>
+          <w:rFonts w:ascii="Times New Roman" w:hAnsi="Times New Roman" w:cs="Times New Roman"/>
+          <w:lang w:val="en-GB"/>
+        </w:rPr>
+        <w:t>aturan</w:t>
+      </w:r>
+      <w:proofErr w:type="spellEnd"/>
+      <w:r>
+        <w:rPr>
+          <w:rFonts w:ascii="Times New Roman" w:hAnsi="Times New Roman" w:cs="Times New Roman"/>
+          <w:lang w:val="en-GB"/>
+        </w:rPr>
+        <w:t xml:space="preserve"> </w:t>
+      </w:r>
+      <w:proofErr w:type="spellStart"/>
+      <w:r>
+        <w:rPr>
+          <w:rFonts w:ascii="Times New Roman" w:hAnsi="Times New Roman" w:cs="Times New Roman"/>
+          <w:lang w:val="en-GB"/>
+        </w:rPr>
+        <w:t>kerapian</w:t>
+      </w:r>
+      <w:proofErr w:type="spellEnd"/>
+      <w:r>
+        <w:rPr>
+          <w:rFonts w:ascii="Times New Roman" w:hAnsi="Times New Roman" w:cs="Times New Roman"/>
+          <w:lang w:val="en-GB"/>
+        </w:rPr>
+        <w:t xml:space="preserve"> </w:t>
+      </w:r>
+      <w:proofErr w:type="spellStart"/>
+      <w:r>
+        <w:rPr>
+          <w:rFonts w:ascii="Times New Roman" w:hAnsi="Times New Roman" w:cs="Times New Roman"/>
+          <w:lang w:val="en-GB"/>
+        </w:rPr>
+        <w:t>kode</w:t>
+      </w:r>
+      <w:proofErr w:type="spellEnd"/>
+      <w:r>
+        <w:rPr>
+          <w:rFonts w:ascii="Times New Roman" w:hAnsi="Times New Roman" w:cs="Times New Roman"/>
+          <w:lang w:val="en-GB"/>
+        </w:rPr>
+        <w:t xml:space="preserve"> (Prettier) </w:t>
+      </w:r>
+      <w:proofErr w:type="spellStart"/>
+      <w:r>
+        <w:rPr>
+          <w:rFonts w:ascii="Times New Roman" w:hAnsi="Times New Roman" w:cs="Times New Roman"/>
+          <w:lang w:val="en-GB"/>
+        </w:rPr>
+        <w:t>dengan</w:t>
+      </w:r>
+      <w:proofErr w:type="spellEnd"/>
+      <w:r>
+        <w:rPr>
+          <w:rFonts w:ascii="Times New Roman" w:hAnsi="Times New Roman" w:cs="Times New Roman"/>
+          <w:lang w:val="en-GB"/>
+        </w:rPr>
+        <w:t xml:space="preserve"> </w:t>
+      </w:r>
+      <w:proofErr w:type="spellStart"/>
+      <w:r>
+        <w:rPr>
+          <w:rFonts w:ascii="Times New Roman" w:hAnsi="Times New Roman" w:cs="Times New Roman"/>
+          <w:lang w:val="en-GB"/>
+        </w:rPr>
+        <w:t>aturan</w:t>
+      </w:r>
+      <w:proofErr w:type="spellEnd"/>
+      <w:r>
+        <w:rPr>
+          <w:rFonts w:ascii="Times New Roman" w:hAnsi="Times New Roman" w:cs="Times New Roman"/>
+          <w:lang w:val="en-GB"/>
+        </w:rPr>
+        <w:t xml:space="preserve"> </w:t>
+      </w:r>
+      <w:proofErr w:type="spellStart"/>
+      <w:r>
+        <w:rPr>
+          <w:rFonts w:ascii="Times New Roman" w:hAnsi="Times New Roman" w:cs="Times New Roman"/>
+          <w:lang w:val="en-GB"/>
+        </w:rPr>
+        <w:t>logika</w:t>
+      </w:r>
+      <w:proofErr w:type="spellEnd"/>
+      <w:r>
+        <w:rPr>
+          <w:rFonts w:ascii="Times New Roman" w:hAnsi="Times New Roman" w:cs="Times New Roman"/>
+          <w:lang w:val="en-GB"/>
+        </w:rPr>
+        <w:t xml:space="preserve"> </w:t>
+      </w:r>
+      <w:proofErr w:type="spellStart"/>
+      <w:r>
+        <w:rPr>
+          <w:rFonts w:ascii="Times New Roman" w:hAnsi="Times New Roman" w:cs="Times New Roman"/>
+          <w:lang w:val="en-GB"/>
+        </w:rPr>
+        <w:t>kode</w:t>
+      </w:r>
+      <w:proofErr w:type="spellEnd"/>
+      <w:r>
+        <w:rPr>
+          <w:rFonts w:ascii="Times New Roman" w:hAnsi="Times New Roman" w:cs="Times New Roman"/>
+          <w:lang w:val="en-GB"/>
+        </w:rPr>
+        <w:t xml:space="preserve"> (</w:t>
+      </w:r>
+      <w:proofErr w:type="spellStart"/>
+      <w:r>
+        <w:rPr>
+          <w:rFonts w:ascii="Times New Roman" w:hAnsi="Times New Roman" w:cs="Times New Roman"/>
+          <w:lang w:val="en-GB"/>
+        </w:rPr>
+        <w:t>ESLint</w:t>
+      </w:r>
+      <w:proofErr w:type="spellEnd"/>
+      <w:r>
+        <w:rPr>
+          <w:rFonts w:ascii="Times New Roman" w:hAnsi="Times New Roman" w:cs="Times New Roman"/>
+          <w:lang w:val="en-GB"/>
+        </w:rPr>
+        <w:t>).</w:t>
+      </w:r>
+    </w:p>
+    <w:p>
+      <w:pPr>
+        <w:jc w:val="both"/>
+        <w:rPr>
+          <w:rFonts w:ascii="Times New Roman" w:hAnsi="Times New Roman" w:cs="Times New Roman"/>
+          <w:lang w:val="en-GB"/>
+        </w:rPr>
+      </w:pPr>
+    </w:p>
     <w:sectPr>
       <w:pgSz w:w="11906" w:h="16838"/>
       <w:pgMar w:top="1440" w:right="1440" w:bottom="1440" w:left="1440" w:header="708" w:footer="708" w:gutter="0"/>
@@ -31688,9 +32760,9 @@
     </w:lvl>
   </w:abstractNum>
   <w:abstractNum w:abstractNumId="3" w15:restartNumberingAfterBreak="0">
-    <w:nsid w:val="181470EA"/>
+    <w:nsid w:val="11E6474A"/>
     <w:multiLevelType w:val="hybridMultilevel"/>
-    <w:tmpl w:val="44EC6C34"/>
+    <w:tmpl w:val="34F067B0"/>
     <w:lvl w:ilvl="0" w:tplc="38090001">
       <w:start w:val="1"/>
       <w:numFmt w:val="bullet"/>
@@ -31801,9 +32873,9 @@
     </w:lvl>
   </w:abstractNum>
   <w:abstractNum w:abstractNumId="4" w15:restartNumberingAfterBreak="0">
-    <w:nsid w:val="1C3848BE"/>
+    <w:nsid w:val="181470EA"/>
     <w:multiLevelType w:val="hybridMultilevel"/>
-    <w:tmpl w:val="DF9AC0B6"/>
+    <w:tmpl w:val="44EC6C34"/>
     <w:lvl w:ilvl="0" w:tplc="38090001">
       <w:start w:val="1"/>
       <w:numFmt w:val="bullet"/>
@@ -31914,9 +32986,9 @@
     </w:lvl>
   </w:abstractNum>
   <w:abstractNum w:abstractNumId="5" w15:restartNumberingAfterBreak="0">
-    <w:nsid w:val="1D7252E9"/>
+    <w:nsid w:val="1C3848BE"/>
     <w:multiLevelType w:val="hybridMultilevel"/>
-    <w:tmpl w:val="DBA26BC8"/>
+    <w:tmpl w:val="DF9AC0B6"/>
     <w:lvl w:ilvl="0" w:tplc="38090001">
       <w:start w:val="1"/>
       <w:numFmt w:val="bullet"/>
@@ -32027,9 +33099,9 @@
     </w:lvl>
   </w:abstractNum>
   <w:abstractNum w:abstractNumId="6" w15:restartNumberingAfterBreak="0">
-    <w:nsid w:val="34990981"/>
+    <w:nsid w:val="1D7252E9"/>
     <w:multiLevelType w:val="hybridMultilevel"/>
-    <w:tmpl w:val="79D8D03C"/>
+    <w:tmpl w:val="DBA26BC8"/>
     <w:lvl w:ilvl="0" w:tplc="38090001">
       <w:start w:val="1"/>
       <w:numFmt w:val="bullet"/>
@@ -32140,9 +33212,9 @@
     </w:lvl>
   </w:abstractNum>
   <w:abstractNum w:abstractNumId="7" w15:restartNumberingAfterBreak="0">
-    <w:nsid w:val="359E1A57"/>
+    <w:nsid w:val="34990981"/>
     <w:multiLevelType w:val="hybridMultilevel"/>
-    <w:tmpl w:val="1B6C6A10"/>
+    <w:tmpl w:val="79D8D03C"/>
     <w:lvl w:ilvl="0" w:tplc="38090001">
       <w:start w:val="1"/>
       <w:numFmt w:val="bullet"/>
@@ -32253,16 +33325,16 @@
     </w:lvl>
   </w:abstractNum>
   <w:abstractNum w:abstractNumId="8" w15:restartNumberingAfterBreak="0">
-    <w:nsid w:val="388329D7"/>
+    <w:nsid w:val="359E1A57"/>
     <w:multiLevelType w:val="hybridMultilevel"/>
-    <w:tmpl w:val="BA56F5D4"/>
+    <w:tmpl w:val="1B6C6A10"/>
     <w:lvl w:ilvl="0" w:tplc="38090001">
       <w:start w:val="1"/>
       <w:numFmt w:val="bullet"/>
       <w:lvlText w:val=""/>
       <w:lvlJc w:val="left"/>
       <w:pPr>
-        <w:ind w:left="1800" w:hanging="360"/>
+        <w:ind w:left="720" w:hanging="360"/>
       </w:pPr>
       <w:rPr>
         <w:rFonts w:ascii="Symbol" w:hAnsi="Symbol" w:hint="default"/>
@@ -32274,7 +33346,7 @@
       <w:lvlText w:val="o"/>
       <w:lvlJc w:val="left"/>
       <w:pPr>
-        <w:ind w:left="2520" w:hanging="360"/>
+        <w:ind w:left="1440" w:hanging="360"/>
       </w:pPr>
       <w:rPr>
         <w:rFonts w:ascii="Courier New" w:hAnsi="Courier New" w:cs="Courier New" w:hint="default"/>
@@ -32286,7 +33358,7 @@
       <w:lvlText w:val=""/>
       <w:lvlJc w:val="left"/>
       <w:pPr>
-        <w:ind w:left="3240" w:hanging="360"/>
+        <w:ind w:left="2160" w:hanging="360"/>
       </w:pPr>
       <w:rPr>
         <w:rFonts w:ascii="Wingdings" w:hAnsi="Wingdings" w:hint="default"/>
@@ -32298,7 +33370,7 @@
       <w:lvlText w:val=""/>
       <w:lvlJc w:val="left"/>
       <w:pPr>
-        <w:ind w:left="3960" w:hanging="360"/>
+        <w:ind w:left="2880" w:hanging="360"/>
       </w:pPr>
       <w:rPr>
         <w:rFonts w:ascii="Symbol" w:hAnsi="Symbol" w:hint="default"/>
@@ -32310,7 +33382,7 @@
       <w:lvlText w:val="o"/>
       <w:lvlJc w:val="left"/>
       <w:pPr>
-        <w:ind w:left="4680" w:hanging="360"/>
+        <w:ind w:left="3600" w:hanging="360"/>
       </w:pPr>
       <w:rPr>
         <w:rFonts w:ascii="Courier New" w:hAnsi="Courier New" w:cs="Courier New" w:hint="default"/>
@@ -32322,7 +33394,7 @@
       <w:lvlText w:val=""/>
       <w:lvlJc w:val="left"/>
       <w:pPr>
-        <w:ind w:left="5400" w:hanging="360"/>
+        <w:ind w:left="4320" w:hanging="360"/>
       </w:pPr>
       <w:rPr>
         <w:rFonts w:ascii="Wingdings" w:hAnsi="Wingdings" w:hint="default"/>
@@ -32334,7 +33406,7 @@
       <w:lvlText w:val=""/>
       <w:lvlJc w:val="left"/>
       <w:pPr>
-        <w:ind w:left="6120" w:hanging="360"/>
+        <w:ind w:left="5040" w:hanging="360"/>
       </w:pPr>
       <w:rPr>
         <w:rFonts w:ascii="Symbol" w:hAnsi="Symbol" w:hint="default"/>
@@ -32346,7 +33418,7 @@
       <w:lvlText w:val="o"/>
       <w:lvlJc w:val="left"/>
       <w:pPr>
-        <w:ind w:left="6840" w:hanging="360"/>
+        <w:ind w:left="5760" w:hanging="360"/>
       </w:pPr>
       <w:rPr>
         <w:rFonts w:ascii="Courier New" w:hAnsi="Courier New" w:cs="Courier New" w:hint="default"/>
@@ -32358,7 +33430,7 @@
       <w:lvlText w:val=""/>
       <w:lvlJc w:val="left"/>
       <w:pPr>
-        <w:ind w:left="7560" w:hanging="360"/>
+        <w:ind w:left="6480" w:hanging="360"/>
       </w:pPr>
       <w:rPr>
         <w:rFonts w:ascii="Wingdings" w:hAnsi="Wingdings" w:hint="default"/>
@@ -32366,6 +33438,119 @@
     </w:lvl>
   </w:abstractNum>
   <w:abstractNum w:abstractNumId="9" w15:restartNumberingAfterBreak="0">
+    <w:nsid w:val="388329D7"/>
+    <w:multiLevelType w:val="hybridMultilevel"/>
+    <w:tmpl w:val="BA56F5D4"/>
+    <w:lvl w:ilvl="0" w:tplc="38090001">
+      <w:start w:val="1"/>
+      <w:numFmt w:val="bullet"/>
+      <w:lvlText w:val=""/>
+      <w:lvlJc w:val="left"/>
+      <w:pPr>
+        <w:ind w:left="1800" w:hanging="360"/>
+      </w:pPr>
+      <w:rPr>
+        <w:rFonts w:ascii="Symbol" w:hAnsi="Symbol" w:hint="default"/>
+      </w:rPr>
+    </w:lvl>
+    <w:lvl w:ilvl="1" w:tplc="38090003" w:tentative="1">
+      <w:start w:val="1"/>
+      <w:numFmt w:val="bullet"/>
+      <w:lvlText w:val="o"/>
+      <w:lvlJc w:val="left"/>
+      <w:pPr>
+        <w:ind w:left="2520" w:hanging="360"/>
+      </w:pPr>
+      <w:rPr>
+        <w:rFonts w:ascii="Courier New" w:hAnsi="Courier New" w:cs="Courier New" w:hint="default"/>
+      </w:rPr>
+    </w:lvl>
+    <w:lvl w:ilvl="2" w:tplc="38090005" w:tentative="1">
+      <w:start w:val="1"/>
+      <w:numFmt w:val="bullet"/>
+      <w:lvlText w:val=""/>
+      <w:lvlJc w:val="left"/>
+      <w:pPr>
+        <w:ind w:left="3240" w:hanging="360"/>
+      </w:pPr>
+      <w:rPr>
+        <w:rFonts w:ascii="Wingdings" w:hAnsi="Wingdings" w:hint="default"/>
+      </w:rPr>
+    </w:lvl>
+    <w:lvl w:ilvl="3" w:tplc="38090001" w:tentative="1">
+      <w:start w:val="1"/>
+      <w:numFmt w:val="bullet"/>
+      <w:lvlText w:val=""/>
+      <w:lvlJc w:val="left"/>
+      <w:pPr>
+        <w:ind w:left="3960" w:hanging="360"/>
+      </w:pPr>
+      <w:rPr>
+        <w:rFonts w:ascii="Symbol" w:hAnsi="Symbol" w:hint="default"/>
+      </w:rPr>
+    </w:lvl>
+    <w:lvl w:ilvl="4" w:tplc="38090003" w:tentative="1">
+      <w:start w:val="1"/>
+      <w:numFmt w:val="bullet"/>
+      <w:lvlText w:val="o"/>
+      <w:lvlJc w:val="left"/>
+      <w:pPr>
+        <w:ind w:left="4680" w:hanging="360"/>
+      </w:pPr>
+      <w:rPr>
+        <w:rFonts w:ascii="Courier New" w:hAnsi="Courier New" w:cs="Courier New" w:hint="default"/>
+      </w:rPr>
+    </w:lvl>
+    <w:lvl w:ilvl="5" w:tplc="38090005" w:tentative="1">
+      <w:start w:val="1"/>
+      <w:numFmt w:val="bullet"/>
+      <w:lvlText w:val=""/>
+      <w:lvlJc w:val="left"/>
+      <w:pPr>
+        <w:ind w:left="5400" w:hanging="360"/>
+      </w:pPr>
+      <w:rPr>
+        <w:rFonts w:ascii="Wingdings" w:hAnsi="Wingdings" w:hint="default"/>
+      </w:rPr>
+    </w:lvl>
+    <w:lvl w:ilvl="6" w:tplc="38090001" w:tentative="1">
+      <w:start w:val="1"/>
+      <w:numFmt w:val="bullet"/>
+      <w:lvlText w:val=""/>
+      <w:lvlJc w:val="left"/>
+      <w:pPr>
+        <w:ind w:left="6120" w:hanging="360"/>
+      </w:pPr>
+      <w:rPr>
+        <w:rFonts w:ascii="Symbol" w:hAnsi="Symbol" w:hint="default"/>
+      </w:rPr>
+    </w:lvl>
+    <w:lvl w:ilvl="7" w:tplc="38090003" w:tentative="1">
+      <w:start w:val="1"/>
+      <w:numFmt w:val="bullet"/>
+      <w:lvlText w:val="o"/>
+      <w:lvlJc w:val="left"/>
+      <w:pPr>
+        <w:ind w:left="6840" w:hanging="360"/>
+      </w:pPr>
+      <w:rPr>
+        <w:rFonts w:ascii="Courier New" w:hAnsi="Courier New" w:cs="Courier New" w:hint="default"/>
+      </w:rPr>
+    </w:lvl>
+    <w:lvl w:ilvl="8" w:tplc="38090005" w:tentative="1">
+      <w:start w:val="1"/>
+      <w:numFmt w:val="bullet"/>
+      <w:lvlText w:val=""/>
+      <w:lvlJc w:val="left"/>
+      <w:pPr>
+        <w:ind w:left="7560" w:hanging="360"/>
+      </w:pPr>
+      <w:rPr>
+        <w:rFonts w:ascii="Wingdings" w:hAnsi="Wingdings" w:hint="default"/>
+      </w:rPr>
+    </w:lvl>
+  </w:abstractNum>
+  <w:abstractNum w:abstractNumId="10" w15:restartNumberingAfterBreak="0">
     <w:nsid w:val="3D313D23"/>
     <w:multiLevelType w:val="multilevel"/>
     <w:tmpl w:val="6EFC356C"/>
@@ -32482,7 +33667,7 @@
       </w:pPr>
     </w:lvl>
   </w:abstractNum>
-  <w:abstractNum w:abstractNumId="10" w15:restartNumberingAfterBreak="0">
+  <w:abstractNum w:abstractNumId="11" w15:restartNumberingAfterBreak="0">
     <w:nsid w:val="440A7A99"/>
     <w:multiLevelType w:val="hybridMultilevel"/>
     <w:tmpl w:val="251C05F6"/>
@@ -32595,7 +33780,7 @@
       </w:rPr>
     </w:lvl>
   </w:abstractNum>
-  <w:abstractNum w:abstractNumId="11" w15:restartNumberingAfterBreak="0">
+  <w:abstractNum w:abstractNumId="12" w15:restartNumberingAfterBreak="0">
     <w:nsid w:val="4453613F"/>
     <w:multiLevelType w:val="hybridMultilevel"/>
     <w:tmpl w:val="DDEA1E44"/>
@@ -32708,7 +33893,7 @@
       </w:rPr>
     </w:lvl>
   </w:abstractNum>
-  <w:abstractNum w:abstractNumId="12" w15:restartNumberingAfterBreak="0">
+  <w:abstractNum w:abstractNumId="13" w15:restartNumberingAfterBreak="0">
     <w:nsid w:val="46125112"/>
     <w:multiLevelType w:val="hybridMultilevel"/>
     <w:tmpl w:val="B87CE464"/>
@@ -32821,7 +34006,7 @@
       </w:rPr>
     </w:lvl>
   </w:abstractNum>
-  <w:abstractNum w:abstractNumId="13" w15:restartNumberingAfterBreak="0">
+  <w:abstractNum w:abstractNumId="14" w15:restartNumberingAfterBreak="0">
     <w:nsid w:val="54237FD4"/>
     <w:multiLevelType w:val="hybridMultilevel"/>
     <w:tmpl w:val="65E0B44E"/>
@@ -32934,7 +34119,7 @@
       </w:rPr>
     </w:lvl>
   </w:abstractNum>
-  <w:abstractNum w:abstractNumId="14" w15:restartNumberingAfterBreak="0">
+  <w:abstractNum w:abstractNumId="15" w15:restartNumberingAfterBreak="0">
     <w:nsid w:val="5899391A"/>
     <w:multiLevelType w:val="hybridMultilevel"/>
     <w:tmpl w:val="A74802F8"/>
@@ -33047,7 +34232,7 @@
       </w:rPr>
     </w:lvl>
   </w:abstractNum>
-  <w:abstractNum w:abstractNumId="15" w15:restartNumberingAfterBreak="0">
+  <w:abstractNum w:abstractNumId="16" w15:restartNumberingAfterBreak="0">
     <w:nsid w:val="5F5E67A4"/>
     <w:multiLevelType w:val="hybridMultilevel"/>
     <w:tmpl w:val="A15E462E"/>
@@ -33160,7 +34345,7 @@
       </w:rPr>
     </w:lvl>
   </w:abstractNum>
-  <w:abstractNum w:abstractNumId="16" w15:restartNumberingAfterBreak="0">
+  <w:abstractNum w:abstractNumId="17" w15:restartNumberingAfterBreak="0">
     <w:nsid w:val="64A022BC"/>
     <w:multiLevelType w:val="hybridMultilevel"/>
     <w:tmpl w:val="7466E2BA"/>
@@ -33273,7 +34458,7 @@
       </w:rPr>
     </w:lvl>
   </w:abstractNum>
-  <w:abstractNum w:abstractNumId="17" w15:restartNumberingAfterBreak="0">
+  <w:abstractNum w:abstractNumId="18" w15:restartNumberingAfterBreak="0">
     <w:nsid w:val="66174883"/>
     <w:multiLevelType w:val="hybridMultilevel"/>
     <w:tmpl w:val="893AFE4A"/>
@@ -33386,7 +34571,7 @@
       </w:rPr>
     </w:lvl>
   </w:abstractNum>
-  <w:abstractNum w:abstractNumId="18" w15:restartNumberingAfterBreak="0">
+  <w:abstractNum w:abstractNumId="19" w15:restartNumberingAfterBreak="0">
     <w:nsid w:val="673C435B"/>
     <w:multiLevelType w:val="hybridMultilevel"/>
     <w:tmpl w:val="846CCAA0"/>
@@ -33499,7 +34684,7 @@
       </w:rPr>
     </w:lvl>
   </w:abstractNum>
-  <w:abstractNum w:abstractNumId="19" w15:restartNumberingAfterBreak="0">
+  <w:abstractNum w:abstractNumId="20" w15:restartNumberingAfterBreak="0">
     <w:nsid w:val="6940157E"/>
     <w:multiLevelType w:val="hybridMultilevel"/>
     <w:tmpl w:val="7BDC1468"/>
@@ -33612,7 +34797,7 @@
       </w:rPr>
     </w:lvl>
   </w:abstractNum>
-  <w:abstractNum w:abstractNumId="20" w15:restartNumberingAfterBreak="0">
+  <w:abstractNum w:abstractNumId="21" w15:restartNumberingAfterBreak="0">
     <w:nsid w:val="6CA82C32"/>
     <w:multiLevelType w:val="hybridMultilevel"/>
     <w:tmpl w:val="70B2C61C"/>
@@ -33724,7 +34909,7 @@
       </w:rPr>
     </w:lvl>
   </w:abstractNum>
-  <w:abstractNum w:abstractNumId="21" w15:restartNumberingAfterBreak="0">
+  <w:abstractNum w:abstractNumId="22" w15:restartNumberingAfterBreak="0">
     <w:nsid w:val="70DA279A"/>
     <w:multiLevelType w:val="hybridMultilevel"/>
     <w:tmpl w:val="D42C1A14"/>
@@ -33837,7 +35022,7 @@
       </w:rPr>
     </w:lvl>
   </w:abstractNum>
-  <w:abstractNum w:abstractNumId="22" w15:restartNumberingAfterBreak="0">
+  <w:abstractNum w:abstractNumId="23" w15:restartNumberingAfterBreak="0">
     <w:nsid w:val="737805E1"/>
     <w:multiLevelType w:val="hybridMultilevel"/>
     <w:tmpl w:val="8DF2E322"/>
@@ -33950,7 +35135,7 @@
       </w:rPr>
     </w:lvl>
   </w:abstractNum>
-  <w:abstractNum w:abstractNumId="23" w15:restartNumberingAfterBreak="0">
+  <w:abstractNum w:abstractNumId="24" w15:restartNumberingAfterBreak="0">
     <w:nsid w:val="77500013"/>
     <w:multiLevelType w:val="hybridMultilevel"/>
     <w:tmpl w:val="FF669F16"/>
@@ -34064,76 +35249,79 @@
     </w:lvl>
   </w:abstractNum>
   <w:num w:numId="1" w16cid:durableId="517813677">
-    <w:abstractNumId w:val="18"/>
+    <w:abstractNumId w:val="19"/>
   </w:num>
   <w:num w:numId="2" w16cid:durableId="857735407">
-    <w:abstractNumId w:val="20"/>
+    <w:abstractNumId w:val="21"/>
   </w:num>
   <w:num w:numId="3" w16cid:durableId="134505">
+    <w:abstractNumId w:val="8"/>
+  </w:num>
+  <w:num w:numId="4" w16cid:durableId="1666083322">
+    <w:abstractNumId w:val="23"/>
+  </w:num>
+  <w:num w:numId="5" w16cid:durableId="864251512">
     <w:abstractNumId w:val="7"/>
   </w:num>
-  <w:num w:numId="4" w16cid:durableId="1666083322">
-    <w:abstractNumId w:val="22"/>
-  </w:num>
-  <w:num w:numId="5" w16cid:durableId="864251512">
-    <w:abstractNumId w:val="6"/>
-  </w:num>
   <w:num w:numId="6" w16cid:durableId="1060862237">
-    <w:abstractNumId w:val="3"/>
+    <w:abstractNumId w:val="4"/>
   </w:num>
   <w:num w:numId="7" w16cid:durableId="1772166354">
-    <w:abstractNumId w:val="16"/>
+    <w:abstractNumId w:val="17"/>
   </w:num>
   <w:num w:numId="8" w16cid:durableId="71900298">
     <w:abstractNumId w:val="0"/>
   </w:num>
   <w:num w:numId="9" w16cid:durableId="641693388">
-    <w:abstractNumId w:val="11"/>
+    <w:abstractNumId w:val="12"/>
   </w:num>
   <w:num w:numId="10" w16cid:durableId="1858039568">
     <w:abstractNumId w:val="2"/>
   </w:num>
   <w:num w:numId="11" w16cid:durableId="1497767422">
-    <w:abstractNumId w:val="10"/>
+    <w:abstractNumId w:val="11"/>
   </w:num>
   <w:num w:numId="12" w16cid:durableId="999893496">
+    <w:abstractNumId w:val="15"/>
+  </w:num>
+  <w:num w:numId="13" w16cid:durableId="412312991">
     <w:abstractNumId w:val="14"/>
   </w:num>
-  <w:num w:numId="13" w16cid:durableId="412312991">
-    <w:abstractNumId w:val="13"/>
-  </w:num>
   <w:num w:numId="14" w16cid:durableId="1754665889">
-    <w:abstractNumId w:val="9"/>
+    <w:abstractNumId w:val="10"/>
   </w:num>
   <w:num w:numId="15" w16cid:durableId="2050910441">
     <w:abstractNumId w:val="1"/>
   </w:num>
   <w:num w:numId="16" w16cid:durableId="329871718">
-    <w:abstractNumId w:val="8"/>
+    <w:abstractNumId w:val="9"/>
   </w:num>
   <w:num w:numId="17" w16cid:durableId="1931544041">
-    <w:abstractNumId w:val="19"/>
+    <w:abstractNumId w:val="20"/>
   </w:num>
   <w:num w:numId="18" w16cid:durableId="1840581647">
-    <w:abstractNumId w:val="15"/>
+    <w:abstractNumId w:val="16"/>
   </w:num>
   <w:num w:numId="19" w16cid:durableId="624821090">
-    <w:abstractNumId w:val="21"/>
+    <w:abstractNumId w:val="22"/>
   </w:num>
   <w:num w:numId="20" w16cid:durableId="574389871">
-    <w:abstractNumId w:val="12"/>
+    <w:abstractNumId w:val="13"/>
   </w:num>
   <w:num w:numId="21" w16cid:durableId="1843472793">
+    <w:abstractNumId w:val="6"/>
+  </w:num>
+  <w:num w:numId="22" w16cid:durableId="2139372750">
+    <w:abstractNumId w:val="18"/>
+  </w:num>
+  <w:num w:numId="23" w16cid:durableId="1044020341">
+    <w:abstractNumId w:val="24"/>
+  </w:num>
+  <w:num w:numId="24" w16cid:durableId="1102727456">
     <w:abstractNumId w:val="5"/>
   </w:num>
-  <w:num w:numId="22" w16cid:durableId="2139372750">
-    <w:abstractNumId w:val="17"/>
-  </w:num>
-  <w:num w:numId="23" w16cid:durableId="1044020341">
-    <w:abstractNumId w:val="23"/>
-  </w:num>
-  <w:num w:numId="24" w16cid:durableId="1102727456">
-    <w:abstractNumId w:val="4"/>
+  <w:num w:numId="25" w16cid:durableId="612443238">
+    <w:abstractNumId w:val="3"/>
   </w:num>
 </w:numbering>
 </file>

</xml_diff>

<commit_message>
Update file word dokumentasi membuat komponen di Apidog
</commit_message>
<xml_diff>
--- a/dokumentasi/24382001P_Lorensius Firngadi_IF 23 E_Dokumentasi.docx
+++ b/dokumentasi/24382001P_Lorensius Firngadi_IF 23 E_Dokumentasi.docx
@@ -31612,28 +31612,7 @@
           <w:rFonts w:ascii="Times New Roman" w:hAnsi="Times New Roman" w:cs="Times New Roman"/>
           <w:lang w:val="en-GB"/>
         </w:rPr>
-        <w:t>3</w:t>
-      </w:r>
-      <w:r>
-        <w:rPr>
-          <w:rFonts w:ascii="Times New Roman" w:hAnsi="Times New Roman" w:cs="Times New Roman"/>
-          <w:lang w:val="en-GB"/>
-        </w:rPr>
-        <w:t>1</w:t>
-      </w:r>
-      <w:r>
-        <w:rPr>
-          <w:rFonts w:ascii="Times New Roman" w:hAnsi="Times New Roman" w:cs="Times New Roman"/>
-          <w:lang w:val="en-GB"/>
-        </w:rPr>
-        <w:t xml:space="preserve">. </w:t>
-      </w:r>
-      <w:r>
-        <w:rPr>
-          <w:rFonts w:ascii="Times New Roman" w:hAnsi="Times New Roman" w:cs="Times New Roman"/>
-          <w:lang w:val="en-GB"/>
-        </w:rPr>
-        <w:t xml:space="preserve">Update </w:t>
+        <w:t xml:space="preserve">31. Update </w:t>
       </w:r>
       <w:r>
         <w:rPr>
@@ -32340,7 +32319,6 @@
         <w:jc w:val="both"/>
         <w:rPr>
           <w:rFonts w:ascii="Times New Roman" w:hAnsi="Times New Roman" w:cs="Times New Roman"/>
-          <w:lang w:val="en-GB"/>
         </w:rPr>
       </w:pPr>
       <w:r>
@@ -32481,6 +32459,2671 @@
           <w:rFonts w:ascii="Times New Roman" w:hAnsi="Times New Roman" w:cs="Times New Roman"/>
         </w:rPr>
         <w:t xml:space="preserve"> </w:t>
+      </w:r>
+    </w:p>
+    <w:p>
+      <w:pPr>
+        <w:jc w:val="both"/>
+        <w:rPr>
+          <w:rFonts w:ascii="Times New Roman" w:hAnsi="Times New Roman" w:cs="Times New Roman"/>
+        </w:rPr>
+      </w:pPr>
+    </w:p>
+    <w:p>
+      <w:pPr>
+        <w:jc w:val="both"/>
+        <w:rPr>
+          <w:rFonts w:ascii="Times New Roman" w:hAnsi="Times New Roman" w:cs="Times New Roman"/>
+        </w:rPr>
+      </w:pPr>
+      <w:r>
+        <w:rPr>
+          <w:rFonts w:ascii="Times New Roman" w:hAnsi="Times New Roman" w:cs="Times New Roman"/>
+        </w:rPr>
+        <w:t xml:space="preserve">34. </w:t>
+      </w:r>
+      <w:proofErr w:type="spellStart"/>
+      <w:r>
+        <w:rPr>
+          <w:rFonts w:ascii="Times New Roman" w:hAnsi="Times New Roman" w:cs="Times New Roman"/>
+        </w:rPr>
+        <w:t>Membuat</w:t>
+      </w:r>
+      <w:proofErr w:type="spellEnd"/>
+      <w:r>
+        <w:rPr>
+          <w:rFonts w:ascii="Times New Roman" w:hAnsi="Times New Roman" w:cs="Times New Roman"/>
+        </w:rPr>
+        <w:t xml:space="preserve"> API di </w:t>
+      </w:r>
+      <w:proofErr w:type="spellStart"/>
+      <w:r>
+        <w:rPr>
+          <w:rFonts w:ascii="Times New Roman" w:hAnsi="Times New Roman" w:cs="Times New Roman"/>
+        </w:rPr>
+        <w:t>Apidog</w:t>
+      </w:r>
+      <w:proofErr w:type="spellEnd"/>
+    </w:p>
+    <w:p>
+      <w:pPr>
+        <w:jc w:val="both"/>
+        <w:rPr>
+          <w:rFonts w:ascii="Times New Roman" w:hAnsi="Times New Roman" w:cs="Times New Roman"/>
+          <w:lang w:val="en-GB"/>
+        </w:rPr>
+      </w:pPr>
+      <w:r>
+        <w:rPr>
+          <w:noProof/>
+        </w:rPr>
+        <w:lastRenderedPageBreak/>
+        <w:drawing>
+          <wp:inline distT="0" distB="0" distL="0" distR="0" wp14:anchorId="766BC755" wp14:editId="2D214467">
+            <wp:extent cx="5731510" cy="3222625"/>
+            <wp:effectExtent l="0" t="0" r="2540" b="0"/>
+            <wp:docPr id="475410164" name="Picture 1"/>
+            <wp:cNvGraphicFramePr>
+              <a:graphicFrameLocks xmlns:a="http://schemas.openxmlformats.org/drawingml/2006/main" noChangeAspect="1"/>
+            </wp:cNvGraphicFramePr>
+            <a:graphic xmlns:a="http://schemas.openxmlformats.org/drawingml/2006/main">
+              <a:graphicData uri="http://schemas.openxmlformats.org/drawingml/2006/picture">
+                <pic:pic xmlns:pic="http://schemas.openxmlformats.org/drawingml/2006/picture">
+                  <pic:nvPicPr>
+                    <pic:cNvPr id="475410164" name=""/>
+                    <pic:cNvPicPr/>
+                  </pic:nvPicPr>
+                  <pic:blipFill>
+                    <a:blip r:embed="rId38"/>
+                    <a:stretch>
+                      <a:fillRect/>
+                    </a:stretch>
+                  </pic:blipFill>
+                  <pic:spPr>
+                    <a:xfrm>
+                      <a:off x="0" y="0"/>
+                      <a:ext cx="5731510" cy="3222625"/>
+                    </a:xfrm>
+                    <a:prstGeom prst="rect">
+                      <a:avLst/>
+                    </a:prstGeom>
+                  </pic:spPr>
+                </pic:pic>
+              </a:graphicData>
+            </a:graphic>
+          </wp:inline>
+        </w:drawing>
+      </w:r>
+    </w:p>
+    <w:p>
+      <w:pPr>
+        <w:contextualSpacing/>
+        <w:jc w:val="both"/>
+        <w:rPr>
+          <w:rFonts w:ascii="Times New Roman" w:hAnsi="Times New Roman" w:cs="Times New Roman"/>
+        </w:rPr>
+      </w:pPr>
+      <w:proofErr w:type="spellStart"/>
+      <w:r>
+        <w:rPr>
+          <w:rFonts w:ascii="Times New Roman" w:hAnsi="Times New Roman" w:cs="Times New Roman"/>
+        </w:rPr>
+        <w:t>Setelah</w:t>
+      </w:r>
+      <w:proofErr w:type="spellEnd"/>
+      <w:r>
+        <w:rPr>
+          <w:rFonts w:ascii="Times New Roman" w:hAnsi="Times New Roman" w:cs="Times New Roman"/>
+        </w:rPr>
+        <w:t xml:space="preserve"> </w:t>
+      </w:r>
+      <w:proofErr w:type="spellStart"/>
+      <w:r>
+        <w:rPr>
+          <w:rFonts w:ascii="Times New Roman" w:hAnsi="Times New Roman" w:cs="Times New Roman"/>
+        </w:rPr>
+        <w:t>semua</w:t>
+      </w:r>
+      <w:proofErr w:type="spellEnd"/>
+      <w:r>
+        <w:rPr>
+          <w:rFonts w:ascii="Times New Roman" w:hAnsi="Times New Roman" w:cs="Times New Roman"/>
+        </w:rPr>
+        <w:t xml:space="preserve"> </w:t>
+      </w:r>
+      <w:proofErr w:type="spellStart"/>
+      <w:r>
+        <w:rPr>
+          <w:rFonts w:ascii="Times New Roman" w:hAnsi="Times New Roman" w:cs="Times New Roman"/>
+        </w:rPr>
+        <w:t>komponen</w:t>
+      </w:r>
+      <w:proofErr w:type="spellEnd"/>
+      <w:r>
+        <w:rPr>
+          <w:rFonts w:ascii="Times New Roman" w:hAnsi="Times New Roman" w:cs="Times New Roman"/>
+        </w:rPr>
+        <w:t xml:space="preserve"> </w:t>
+      </w:r>
+      <w:proofErr w:type="spellStart"/>
+      <w:r>
+        <w:rPr>
+          <w:rFonts w:ascii="Times New Roman" w:hAnsi="Times New Roman" w:cs="Times New Roman"/>
+        </w:rPr>
+        <w:t>tersebut</w:t>
+      </w:r>
+      <w:proofErr w:type="spellEnd"/>
+      <w:r>
+        <w:rPr>
+          <w:rFonts w:ascii="Times New Roman" w:hAnsi="Times New Roman" w:cs="Times New Roman"/>
+        </w:rPr>
+        <w:t xml:space="preserve"> </w:t>
+      </w:r>
+      <w:proofErr w:type="spellStart"/>
+      <w:r>
+        <w:rPr>
+          <w:rFonts w:ascii="Times New Roman" w:hAnsi="Times New Roman" w:cs="Times New Roman"/>
+        </w:rPr>
+        <w:t>dibuat</w:t>
+      </w:r>
+      <w:proofErr w:type="spellEnd"/>
+      <w:r>
+        <w:rPr>
+          <w:rFonts w:ascii="Times New Roman" w:hAnsi="Times New Roman" w:cs="Times New Roman"/>
+        </w:rPr>
+        <w:t xml:space="preserve"> (</w:t>
+      </w:r>
+      <w:proofErr w:type="spellStart"/>
+      <w:r>
+        <w:rPr>
+          <w:rFonts w:ascii="Times New Roman" w:hAnsi="Times New Roman" w:cs="Times New Roman"/>
+        </w:rPr>
+        <w:t>mulai</w:t>
+      </w:r>
+      <w:proofErr w:type="spellEnd"/>
+      <w:r>
+        <w:rPr>
+          <w:rFonts w:ascii="Times New Roman" w:hAnsi="Times New Roman" w:cs="Times New Roman"/>
+        </w:rPr>
+        <w:t xml:space="preserve"> </w:t>
+      </w:r>
+      <w:proofErr w:type="spellStart"/>
+      <w:r>
+        <w:rPr>
+          <w:rFonts w:ascii="Times New Roman" w:hAnsi="Times New Roman" w:cs="Times New Roman"/>
+        </w:rPr>
+        <w:t>dari</w:t>
+      </w:r>
+      <w:proofErr w:type="spellEnd"/>
+      <w:r>
+        <w:rPr>
+          <w:rFonts w:ascii="Times New Roman" w:hAnsi="Times New Roman" w:cs="Times New Roman"/>
+        </w:rPr>
+        <w:t xml:space="preserve"> coding database, </w:t>
+      </w:r>
+      <w:proofErr w:type="spellStart"/>
+      <w:r>
+        <w:rPr>
+          <w:rFonts w:ascii="Times New Roman" w:hAnsi="Times New Roman" w:cs="Times New Roman"/>
+        </w:rPr>
+        <w:t>logika</w:t>
+      </w:r>
+      <w:proofErr w:type="spellEnd"/>
+      <w:r>
+        <w:rPr>
+          <w:rFonts w:ascii="Times New Roman" w:hAnsi="Times New Roman" w:cs="Times New Roman"/>
+        </w:rPr>
+        <w:t xml:space="preserve"> </w:t>
+      </w:r>
+      <w:proofErr w:type="spellStart"/>
+      <w:r>
+        <w:rPr>
+          <w:rFonts w:ascii="Times New Roman" w:hAnsi="Times New Roman" w:cs="Times New Roman"/>
+        </w:rPr>
+        <w:t>bisnis</w:t>
+      </w:r>
+      <w:proofErr w:type="spellEnd"/>
+      <w:r>
+        <w:rPr>
+          <w:rFonts w:ascii="Times New Roman" w:hAnsi="Times New Roman" w:cs="Times New Roman"/>
+        </w:rPr>
+        <w:t xml:space="preserve">, </w:t>
+      </w:r>
+      <w:proofErr w:type="spellStart"/>
+      <w:r>
+        <w:rPr>
+          <w:rFonts w:ascii="Times New Roman" w:hAnsi="Times New Roman" w:cs="Times New Roman"/>
+        </w:rPr>
+        <w:t>hingga</w:t>
+      </w:r>
+      <w:proofErr w:type="spellEnd"/>
+      <w:r>
+        <w:rPr>
+          <w:rFonts w:ascii="Times New Roman" w:hAnsi="Times New Roman" w:cs="Times New Roman"/>
+        </w:rPr>
+        <w:t xml:space="preserve"> </w:t>
+      </w:r>
+      <w:proofErr w:type="spellStart"/>
+      <w:r>
+        <w:rPr>
+          <w:rFonts w:ascii="Times New Roman" w:hAnsi="Times New Roman" w:cs="Times New Roman"/>
+        </w:rPr>
+        <w:t>alat</w:t>
+      </w:r>
+      <w:proofErr w:type="spellEnd"/>
+      <w:r>
+        <w:rPr>
+          <w:rFonts w:ascii="Times New Roman" w:hAnsi="Times New Roman" w:cs="Times New Roman"/>
+        </w:rPr>
+        <w:t xml:space="preserve"> testing), </w:t>
+      </w:r>
+      <w:proofErr w:type="spellStart"/>
+      <w:r>
+        <w:rPr>
+          <w:rFonts w:ascii="Times New Roman" w:hAnsi="Times New Roman" w:cs="Times New Roman"/>
+        </w:rPr>
+        <w:t>kegunaan</w:t>
+      </w:r>
+      <w:proofErr w:type="spellEnd"/>
+      <w:r>
+        <w:rPr>
+          <w:rFonts w:ascii="Times New Roman" w:hAnsi="Times New Roman" w:cs="Times New Roman"/>
+        </w:rPr>
+        <w:t xml:space="preserve"> </w:t>
+      </w:r>
+      <w:proofErr w:type="spellStart"/>
+      <w:r>
+        <w:rPr>
+          <w:rFonts w:ascii="Times New Roman" w:hAnsi="Times New Roman" w:cs="Times New Roman"/>
+        </w:rPr>
+        <w:t>atau</w:t>
+      </w:r>
+      <w:proofErr w:type="spellEnd"/>
+      <w:r>
+        <w:rPr>
+          <w:rFonts w:ascii="Times New Roman" w:hAnsi="Times New Roman" w:cs="Times New Roman"/>
+        </w:rPr>
+        <w:t xml:space="preserve"> </w:t>
+      </w:r>
+      <w:proofErr w:type="spellStart"/>
+      <w:r>
+        <w:rPr>
+          <w:rFonts w:ascii="Times New Roman" w:hAnsi="Times New Roman" w:cs="Times New Roman"/>
+        </w:rPr>
+        <w:t>manfaat</w:t>
+      </w:r>
+      <w:proofErr w:type="spellEnd"/>
+      <w:r>
+        <w:rPr>
+          <w:rFonts w:ascii="Times New Roman" w:hAnsi="Times New Roman" w:cs="Times New Roman"/>
+        </w:rPr>
+        <w:t xml:space="preserve"> </w:t>
+      </w:r>
+      <w:proofErr w:type="spellStart"/>
+      <w:r>
+        <w:rPr>
+          <w:rFonts w:ascii="Times New Roman" w:hAnsi="Times New Roman" w:cs="Times New Roman"/>
+        </w:rPr>
+        <w:t>keseluruhannya</w:t>
+      </w:r>
+      <w:proofErr w:type="spellEnd"/>
+      <w:r>
+        <w:rPr>
+          <w:rFonts w:ascii="Times New Roman" w:hAnsi="Times New Roman" w:cs="Times New Roman"/>
+        </w:rPr>
+        <w:t xml:space="preserve"> </w:t>
+      </w:r>
+      <w:proofErr w:type="spellStart"/>
+      <w:r>
+        <w:rPr>
+          <w:rFonts w:ascii="Times New Roman" w:hAnsi="Times New Roman" w:cs="Times New Roman"/>
+        </w:rPr>
+        <w:t>bagi</w:t>
+      </w:r>
+      <w:proofErr w:type="spellEnd"/>
+      <w:r>
+        <w:rPr>
+          <w:rFonts w:ascii="Times New Roman" w:hAnsi="Times New Roman" w:cs="Times New Roman"/>
+        </w:rPr>
+        <w:t xml:space="preserve"> Developer </w:t>
+      </w:r>
+      <w:proofErr w:type="spellStart"/>
+      <w:r>
+        <w:rPr>
+          <w:rFonts w:ascii="Times New Roman" w:hAnsi="Times New Roman" w:cs="Times New Roman"/>
+        </w:rPr>
+        <w:t>adalah</w:t>
+      </w:r>
+      <w:proofErr w:type="spellEnd"/>
+      <w:r>
+        <w:rPr>
+          <w:rFonts w:ascii="Times New Roman" w:hAnsi="Times New Roman" w:cs="Times New Roman"/>
+        </w:rPr>
+        <w:t>:</w:t>
+      </w:r>
+    </w:p>
+    <w:p>
+      <w:pPr>
+        <w:contextualSpacing/>
+        <w:jc w:val="both"/>
+        <w:rPr>
+          <w:rFonts w:ascii="Times New Roman" w:hAnsi="Times New Roman" w:cs="Times New Roman"/>
+        </w:rPr>
+      </w:pPr>
+      <w:r>
+        <w:rPr>
+          <w:rFonts w:ascii="Times New Roman" w:hAnsi="Times New Roman" w:cs="Times New Roman"/>
+        </w:rPr>
+        <w:t xml:space="preserve">1. </w:t>
+      </w:r>
+      <w:r>
+        <w:rPr>
+          <w:rFonts w:ascii="Times New Roman" w:hAnsi="Times New Roman" w:cs="Times New Roman"/>
+        </w:rPr>
+        <w:t xml:space="preserve"> </w:t>
+      </w:r>
+      <w:proofErr w:type="spellStart"/>
+      <w:r>
+        <w:rPr>
+          <w:rFonts w:ascii="Times New Roman" w:hAnsi="Times New Roman" w:cs="Times New Roman"/>
+        </w:rPr>
+        <w:t>Memastikan</w:t>
+      </w:r>
+      <w:proofErr w:type="spellEnd"/>
+      <w:r>
+        <w:rPr>
+          <w:rFonts w:ascii="Times New Roman" w:hAnsi="Times New Roman" w:cs="Times New Roman"/>
+        </w:rPr>
+        <w:t xml:space="preserve"> </w:t>
+      </w:r>
+      <w:proofErr w:type="spellStart"/>
+      <w:r>
+        <w:rPr>
+          <w:rFonts w:ascii="Times New Roman" w:hAnsi="Times New Roman" w:cs="Times New Roman"/>
+        </w:rPr>
+        <w:t>Sistem</w:t>
+      </w:r>
+      <w:proofErr w:type="spellEnd"/>
+      <w:r>
+        <w:rPr>
+          <w:rFonts w:ascii="Times New Roman" w:hAnsi="Times New Roman" w:cs="Times New Roman"/>
+        </w:rPr>
+        <w:t xml:space="preserve"> </w:t>
+      </w:r>
+      <w:proofErr w:type="spellStart"/>
+      <w:r>
+        <w:rPr>
+          <w:rFonts w:ascii="Times New Roman" w:hAnsi="Times New Roman" w:cs="Times New Roman"/>
+        </w:rPr>
+        <w:t>Berjalan</w:t>
+      </w:r>
+      <w:proofErr w:type="spellEnd"/>
+      <w:r>
+        <w:rPr>
+          <w:rFonts w:ascii="Times New Roman" w:hAnsi="Times New Roman" w:cs="Times New Roman"/>
+        </w:rPr>
+        <w:t xml:space="preserve"> Sesuai </w:t>
+      </w:r>
+      <w:proofErr w:type="spellStart"/>
+      <w:r>
+        <w:rPr>
+          <w:rFonts w:ascii="Times New Roman" w:hAnsi="Times New Roman" w:cs="Times New Roman"/>
+        </w:rPr>
+        <w:t>Rencana</w:t>
+      </w:r>
+      <w:proofErr w:type="spellEnd"/>
+      <w:r>
+        <w:rPr>
+          <w:rFonts w:ascii="Times New Roman" w:hAnsi="Times New Roman" w:cs="Times New Roman"/>
+        </w:rPr>
+        <w:t xml:space="preserve"> (</w:t>
+      </w:r>
+      <w:proofErr w:type="spellStart"/>
+      <w:r>
+        <w:rPr>
+          <w:rFonts w:ascii="Times New Roman" w:hAnsi="Times New Roman" w:cs="Times New Roman"/>
+        </w:rPr>
+        <w:t>Validasi</w:t>
+      </w:r>
+      <w:proofErr w:type="spellEnd"/>
+      <w:r>
+        <w:rPr>
+          <w:rFonts w:ascii="Times New Roman" w:hAnsi="Times New Roman" w:cs="Times New Roman"/>
+        </w:rPr>
+        <w:t>)</w:t>
+      </w:r>
+    </w:p>
+    <w:p>
+      <w:pPr>
+        <w:ind w:left="284"/>
+        <w:contextualSpacing/>
+        <w:jc w:val="both"/>
+        <w:rPr>
+          <w:rFonts w:ascii="Times New Roman" w:hAnsi="Times New Roman" w:cs="Times New Roman"/>
+        </w:rPr>
+      </w:pPr>
+      <w:proofErr w:type="spellStart"/>
+      <w:r>
+        <w:rPr>
+          <w:rFonts w:ascii="Times New Roman" w:hAnsi="Times New Roman" w:cs="Times New Roman"/>
+        </w:rPr>
+        <w:t>Dengan</w:t>
+      </w:r>
+      <w:proofErr w:type="spellEnd"/>
+      <w:r>
+        <w:rPr>
+          <w:rFonts w:ascii="Times New Roman" w:hAnsi="Times New Roman" w:cs="Times New Roman"/>
+        </w:rPr>
+        <w:t> </w:t>
+      </w:r>
+      <w:proofErr w:type="spellStart"/>
+      <w:r>
+        <w:rPr>
+          <w:rFonts w:ascii="Times New Roman" w:hAnsi="Times New Roman" w:cs="Times New Roman"/>
+        </w:rPr>
+        <w:t>Apidog</w:t>
+      </w:r>
+      <w:proofErr w:type="spellEnd"/>
+      <w:r>
+        <w:rPr>
+          <w:rFonts w:ascii="Times New Roman" w:hAnsi="Times New Roman" w:cs="Times New Roman"/>
+        </w:rPr>
+        <w:t xml:space="preserve">, </w:t>
+      </w:r>
+      <w:proofErr w:type="spellStart"/>
+      <w:r>
+        <w:rPr>
+          <w:rFonts w:ascii="Times New Roman" w:hAnsi="Times New Roman" w:cs="Times New Roman"/>
+        </w:rPr>
+        <w:t>bisa</w:t>
+      </w:r>
+      <w:proofErr w:type="spellEnd"/>
+      <w:r>
+        <w:rPr>
+          <w:rFonts w:ascii="Times New Roman" w:hAnsi="Times New Roman" w:cs="Times New Roman"/>
+        </w:rPr>
+        <w:t xml:space="preserve"> </w:t>
+      </w:r>
+      <w:proofErr w:type="spellStart"/>
+      <w:r>
+        <w:rPr>
+          <w:rFonts w:ascii="Times New Roman" w:hAnsi="Times New Roman" w:cs="Times New Roman"/>
+        </w:rPr>
+        <w:t>membuktikan</w:t>
+      </w:r>
+      <w:proofErr w:type="spellEnd"/>
+      <w:r>
+        <w:rPr>
+          <w:rFonts w:ascii="Times New Roman" w:hAnsi="Times New Roman" w:cs="Times New Roman"/>
+        </w:rPr>
+        <w:t xml:space="preserve"> </w:t>
+      </w:r>
+      <w:proofErr w:type="spellStart"/>
+      <w:r>
+        <w:rPr>
+          <w:rFonts w:ascii="Times New Roman" w:hAnsi="Times New Roman" w:cs="Times New Roman"/>
+        </w:rPr>
+        <w:t>bahwa</w:t>
+      </w:r>
+      <w:proofErr w:type="spellEnd"/>
+      <w:r>
+        <w:rPr>
+          <w:rFonts w:ascii="Times New Roman" w:hAnsi="Times New Roman" w:cs="Times New Roman"/>
+        </w:rPr>
+        <w:t xml:space="preserve"> coding yang </w:t>
+      </w:r>
+      <w:proofErr w:type="spellStart"/>
+      <w:r>
+        <w:rPr>
+          <w:rFonts w:ascii="Times New Roman" w:hAnsi="Times New Roman" w:cs="Times New Roman"/>
+        </w:rPr>
+        <w:t>tulis</w:t>
+      </w:r>
+      <w:proofErr w:type="spellEnd"/>
+      <w:r>
+        <w:rPr>
+          <w:rFonts w:ascii="Times New Roman" w:hAnsi="Times New Roman" w:cs="Times New Roman"/>
+        </w:rPr>
+        <w:t xml:space="preserve"> di </w:t>
+      </w:r>
+      <w:proofErr w:type="spellStart"/>
+      <w:r>
+        <w:rPr>
+          <w:rFonts w:ascii="Times New Roman" w:hAnsi="Times New Roman" w:cs="Times New Roman"/>
+        </w:rPr>
+        <w:t>NestJS</w:t>
+      </w:r>
+      <w:proofErr w:type="spellEnd"/>
+      <w:r>
+        <w:rPr>
+          <w:rFonts w:ascii="Times New Roman" w:hAnsi="Times New Roman" w:cs="Times New Roman"/>
+        </w:rPr>
+        <w:t> </w:t>
+      </w:r>
+      <w:proofErr w:type="spellStart"/>
+      <w:r>
+        <w:rPr>
+          <w:rFonts w:ascii="Times New Roman" w:hAnsi="Times New Roman" w:cs="Times New Roman"/>
+        </w:rPr>
+        <w:t>benar-benar</w:t>
+      </w:r>
+      <w:proofErr w:type="spellEnd"/>
+      <w:r>
+        <w:rPr>
+          <w:rFonts w:ascii="Times New Roman" w:hAnsi="Times New Roman" w:cs="Times New Roman"/>
+        </w:rPr>
+        <w:t xml:space="preserve"> </w:t>
+      </w:r>
+      <w:proofErr w:type="spellStart"/>
+      <w:r>
+        <w:rPr>
+          <w:rFonts w:ascii="Times New Roman" w:hAnsi="Times New Roman" w:cs="Times New Roman"/>
+        </w:rPr>
+        <w:t>bekerja</w:t>
+      </w:r>
+      <w:proofErr w:type="spellEnd"/>
+      <w:r>
+        <w:rPr>
+          <w:rFonts w:ascii="Times New Roman" w:hAnsi="Times New Roman" w:cs="Times New Roman"/>
+        </w:rPr>
+        <w:t>.</w:t>
+      </w:r>
+    </w:p>
+    <w:p>
+      <w:pPr>
+        <w:numPr>
+          <w:ilvl w:val="0"/>
+          <w:numId w:val="26"/>
+        </w:numPr>
+        <w:ind w:left="709"/>
+        <w:contextualSpacing/>
+        <w:jc w:val="both"/>
+        <w:rPr>
+          <w:rFonts w:ascii="Times New Roman" w:hAnsi="Times New Roman" w:cs="Times New Roman"/>
+        </w:rPr>
+      </w:pPr>
+      <w:proofErr w:type="spellStart"/>
+      <w:r>
+        <w:rPr>
+          <w:rFonts w:ascii="Times New Roman" w:hAnsi="Times New Roman" w:cs="Times New Roman"/>
+          <w:i/>
+          <w:iCs/>
+        </w:rPr>
+        <w:t>Tanpa</w:t>
+      </w:r>
+      <w:proofErr w:type="spellEnd"/>
+      <w:r>
+        <w:rPr>
+          <w:rFonts w:ascii="Times New Roman" w:hAnsi="Times New Roman" w:cs="Times New Roman"/>
+          <w:i/>
+          <w:iCs/>
+        </w:rPr>
+        <w:t xml:space="preserve"> </w:t>
+      </w:r>
+      <w:proofErr w:type="spellStart"/>
+      <w:r>
+        <w:rPr>
+          <w:rFonts w:ascii="Times New Roman" w:hAnsi="Times New Roman" w:cs="Times New Roman"/>
+          <w:i/>
+          <w:iCs/>
+        </w:rPr>
+        <w:t>Apidog</w:t>
+      </w:r>
+      <w:proofErr w:type="spellEnd"/>
+      <w:r>
+        <w:rPr>
+          <w:rFonts w:ascii="Times New Roman" w:hAnsi="Times New Roman" w:cs="Times New Roman"/>
+          <w:i/>
+          <w:iCs/>
+        </w:rPr>
+        <w:t>:</w:t>
+      </w:r>
+      <w:r>
+        <w:rPr>
+          <w:rFonts w:ascii="Times New Roman" w:hAnsi="Times New Roman" w:cs="Times New Roman"/>
+        </w:rPr>
+        <w:t xml:space="preserve"> </w:t>
+      </w:r>
+      <w:proofErr w:type="spellStart"/>
+      <w:r>
+        <w:rPr>
+          <w:rFonts w:ascii="Times New Roman" w:hAnsi="Times New Roman" w:cs="Times New Roman"/>
+        </w:rPr>
+        <w:t>hanya</w:t>
+      </w:r>
+      <w:proofErr w:type="spellEnd"/>
+      <w:r>
+        <w:rPr>
+          <w:rFonts w:ascii="Times New Roman" w:hAnsi="Times New Roman" w:cs="Times New Roman"/>
+        </w:rPr>
+        <w:t xml:space="preserve"> </w:t>
+      </w:r>
+      <w:proofErr w:type="spellStart"/>
+      <w:r>
+        <w:rPr>
+          <w:rFonts w:ascii="Times New Roman" w:hAnsi="Times New Roman" w:cs="Times New Roman"/>
+        </w:rPr>
+        <w:t>menebak-nebak</w:t>
+      </w:r>
+      <w:proofErr w:type="spellEnd"/>
+      <w:r>
+        <w:rPr>
+          <w:rFonts w:ascii="Times New Roman" w:hAnsi="Times New Roman" w:cs="Times New Roman"/>
+        </w:rPr>
+        <w:t xml:space="preserve"> </w:t>
+      </w:r>
+      <w:proofErr w:type="spellStart"/>
+      <w:r>
+        <w:rPr>
+          <w:rFonts w:ascii="Times New Roman" w:hAnsi="Times New Roman" w:cs="Times New Roman"/>
+        </w:rPr>
+        <w:t>apakah</w:t>
+      </w:r>
+      <w:proofErr w:type="spellEnd"/>
+      <w:r>
+        <w:rPr>
+          <w:rFonts w:ascii="Times New Roman" w:hAnsi="Times New Roman" w:cs="Times New Roman"/>
+        </w:rPr>
+        <w:t xml:space="preserve"> data </w:t>
+      </w:r>
+      <w:proofErr w:type="spellStart"/>
+      <w:r>
+        <w:rPr>
+          <w:rFonts w:ascii="Times New Roman" w:hAnsi="Times New Roman" w:cs="Times New Roman"/>
+        </w:rPr>
+        <w:t>masuk</w:t>
+      </w:r>
+      <w:proofErr w:type="spellEnd"/>
+      <w:r>
+        <w:rPr>
+          <w:rFonts w:ascii="Times New Roman" w:hAnsi="Times New Roman" w:cs="Times New Roman"/>
+        </w:rPr>
+        <w:t xml:space="preserve"> </w:t>
+      </w:r>
+      <w:proofErr w:type="spellStart"/>
+      <w:r>
+        <w:rPr>
+          <w:rFonts w:ascii="Times New Roman" w:hAnsi="Times New Roman" w:cs="Times New Roman"/>
+        </w:rPr>
+        <w:t>ke</w:t>
+      </w:r>
+      <w:proofErr w:type="spellEnd"/>
+      <w:r>
+        <w:rPr>
+          <w:rFonts w:ascii="Times New Roman" w:hAnsi="Times New Roman" w:cs="Times New Roman"/>
+        </w:rPr>
+        <w:t xml:space="preserve"> database </w:t>
+      </w:r>
+      <w:proofErr w:type="spellStart"/>
+      <w:r>
+        <w:rPr>
+          <w:rFonts w:ascii="Times New Roman" w:hAnsi="Times New Roman" w:cs="Times New Roman"/>
+        </w:rPr>
+        <w:t>atau</w:t>
+      </w:r>
+      <w:proofErr w:type="spellEnd"/>
+      <w:r>
+        <w:rPr>
+          <w:rFonts w:ascii="Times New Roman" w:hAnsi="Times New Roman" w:cs="Times New Roman"/>
+        </w:rPr>
+        <w:t xml:space="preserve"> </w:t>
+      </w:r>
+      <w:proofErr w:type="spellStart"/>
+      <w:r>
+        <w:rPr>
+          <w:rFonts w:ascii="Times New Roman" w:hAnsi="Times New Roman" w:cs="Times New Roman"/>
+        </w:rPr>
+        <w:t>tidak</w:t>
+      </w:r>
+      <w:proofErr w:type="spellEnd"/>
+      <w:r>
+        <w:rPr>
+          <w:rFonts w:ascii="Times New Roman" w:hAnsi="Times New Roman" w:cs="Times New Roman"/>
+        </w:rPr>
+        <w:t>.</w:t>
+      </w:r>
+    </w:p>
+    <w:p>
+      <w:pPr>
+        <w:numPr>
+          <w:ilvl w:val="0"/>
+          <w:numId w:val="26"/>
+        </w:numPr>
+        <w:ind w:left="709"/>
+        <w:contextualSpacing/>
+        <w:jc w:val="both"/>
+        <w:rPr>
+          <w:rFonts w:ascii="Times New Roman" w:hAnsi="Times New Roman" w:cs="Times New Roman"/>
+        </w:rPr>
+      </w:pPr>
+      <w:proofErr w:type="spellStart"/>
+      <w:r>
+        <w:rPr>
+          <w:rFonts w:ascii="Times New Roman" w:hAnsi="Times New Roman" w:cs="Times New Roman"/>
+          <w:i/>
+          <w:iCs/>
+        </w:rPr>
+        <w:t>Dengan</w:t>
+      </w:r>
+      <w:proofErr w:type="spellEnd"/>
+      <w:r>
+        <w:rPr>
+          <w:rFonts w:ascii="Times New Roman" w:hAnsi="Times New Roman" w:cs="Times New Roman"/>
+          <w:i/>
+          <w:iCs/>
+        </w:rPr>
+        <w:t xml:space="preserve"> </w:t>
+      </w:r>
+      <w:proofErr w:type="spellStart"/>
+      <w:r>
+        <w:rPr>
+          <w:rFonts w:ascii="Times New Roman" w:hAnsi="Times New Roman" w:cs="Times New Roman"/>
+          <w:i/>
+          <w:iCs/>
+        </w:rPr>
+        <w:t>Apidog</w:t>
+      </w:r>
+      <w:proofErr w:type="spellEnd"/>
+      <w:r>
+        <w:rPr>
+          <w:rFonts w:ascii="Times New Roman" w:hAnsi="Times New Roman" w:cs="Times New Roman"/>
+          <w:i/>
+          <w:iCs/>
+        </w:rPr>
+        <w:t>:</w:t>
+      </w:r>
+      <w:r>
+        <w:rPr>
+          <w:rFonts w:ascii="Times New Roman" w:hAnsi="Times New Roman" w:cs="Times New Roman"/>
+        </w:rPr>
+        <w:t> </w:t>
+      </w:r>
+      <w:proofErr w:type="spellStart"/>
+      <w:r>
+        <w:rPr>
+          <w:rFonts w:ascii="Times New Roman" w:hAnsi="Times New Roman" w:cs="Times New Roman"/>
+        </w:rPr>
+        <w:t>menge</w:t>
+      </w:r>
+      <w:r>
+        <w:rPr>
+          <w:rFonts w:ascii="Times New Roman" w:hAnsi="Times New Roman" w:cs="Times New Roman"/>
+        </w:rPr>
+        <w:t>tahu</w:t>
+      </w:r>
+      <w:proofErr w:type="spellEnd"/>
+      <w:r>
+        <w:rPr>
+          <w:rFonts w:ascii="Times New Roman" w:hAnsi="Times New Roman" w:cs="Times New Roman"/>
+        </w:rPr>
+        <w:t xml:space="preserve"> </w:t>
+      </w:r>
+      <w:proofErr w:type="spellStart"/>
+      <w:r>
+        <w:rPr>
+          <w:rFonts w:ascii="Times New Roman" w:hAnsi="Times New Roman" w:cs="Times New Roman"/>
+        </w:rPr>
+        <w:t>pasti</w:t>
+      </w:r>
+      <w:proofErr w:type="spellEnd"/>
+      <w:r>
+        <w:rPr>
+          <w:rFonts w:ascii="Times New Roman" w:hAnsi="Times New Roman" w:cs="Times New Roman"/>
+        </w:rPr>
+        <w:t xml:space="preserve"> </w:t>
+      </w:r>
+      <w:proofErr w:type="spellStart"/>
+      <w:r>
+        <w:rPr>
+          <w:rFonts w:ascii="Times New Roman" w:hAnsi="Times New Roman" w:cs="Times New Roman"/>
+        </w:rPr>
+        <w:t>bahwa</w:t>
+      </w:r>
+      <w:proofErr w:type="spellEnd"/>
+      <w:r>
+        <w:rPr>
+          <w:rFonts w:ascii="Times New Roman" w:hAnsi="Times New Roman" w:cs="Times New Roman"/>
+        </w:rPr>
+        <w:t xml:space="preserve"> </w:t>
+      </w:r>
+      <w:proofErr w:type="spellStart"/>
+      <w:r>
+        <w:rPr>
+          <w:rFonts w:ascii="Times New Roman" w:hAnsi="Times New Roman" w:cs="Times New Roman"/>
+        </w:rPr>
+        <w:t>jika</w:t>
+      </w:r>
+      <w:proofErr w:type="spellEnd"/>
+      <w:r>
+        <w:rPr>
+          <w:rFonts w:ascii="Times New Roman" w:hAnsi="Times New Roman" w:cs="Times New Roman"/>
+        </w:rPr>
+        <w:t xml:space="preserve"> </w:t>
+      </w:r>
+      <w:proofErr w:type="spellStart"/>
+      <w:r>
+        <w:rPr>
+          <w:rFonts w:ascii="Times New Roman" w:hAnsi="Times New Roman" w:cs="Times New Roman"/>
+        </w:rPr>
+        <w:t>mengirim</w:t>
+      </w:r>
+      <w:proofErr w:type="spellEnd"/>
+      <w:r>
+        <w:rPr>
+          <w:rFonts w:ascii="Times New Roman" w:hAnsi="Times New Roman" w:cs="Times New Roman"/>
+        </w:rPr>
+        <w:t xml:space="preserve"> nama Adventure, </w:t>
+      </w:r>
+      <w:proofErr w:type="spellStart"/>
+      <w:r>
+        <w:rPr>
+          <w:rFonts w:ascii="Times New Roman" w:hAnsi="Times New Roman" w:cs="Times New Roman"/>
+        </w:rPr>
+        <w:t>sistem</w:t>
+      </w:r>
+      <w:proofErr w:type="spellEnd"/>
+      <w:r>
+        <w:rPr>
+          <w:rFonts w:ascii="Times New Roman" w:hAnsi="Times New Roman" w:cs="Times New Roman"/>
+        </w:rPr>
+        <w:t xml:space="preserve"> </w:t>
+      </w:r>
+      <w:proofErr w:type="spellStart"/>
+      <w:r>
+        <w:rPr>
+          <w:rFonts w:ascii="Times New Roman" w:hAnsi="Times New Roman" w:cs="Times New Roman"/>
+        </w:rPr>
+        <w:t>akan</w:t>
+      </w:r>
+      <w:proofErr w:type="spellEnd"/>
+      <w:r>
+        <w:rPr>
+          <w:rFonts w:ascii="Times New Roman" w:hAnsi="Times New Roman" w:cs="Times New Roman"/>
+        </w:rPr>
+        <w:t xml:space="preserve"> </w:t>
+      </w:r>
+      <w:proofErr w:type="spellStart"/>
+      <w:r>
+        <w:rPr>
+          <w:rFonts w:ascii="Times New Roman" w:hAnsi="Times New Roman" w:cs="Times New Roman"/>
+        </w:rPr>
+        <w:t>membalas</w:t>
+      </w:r>
+      <w:proofErr w:type="spellEnd"/>
+      <w:r>
+        <w:rPr>
+          <w:rFonts w:ascii="Times New Roman" w:hAnsi="Times New Roman" w:cs="Times New Roman"/>
+        </w:rPr>
+        <w:t xml:space="preserve"> </w:t>
+      </w:r>
+      <w:proofErr w:type="spellStart"/>
+      <w:r>
+        <w:rPr>
+          <w:rFonts w:ascii="Times New Roman" w:hAnsi="Times New Roman" w:cs="Times New Roman"/>
+        </w:rPr>
+        <w:t>dengan</w:t>
+      </w:r>
+      <w:proofErr w:type="spellEnd"/>
+      <w:r>
+        <w:rPr>
+          <w:rFonts w:ascii="Times New Roman" w:hAnsi="Times New Roman" w:cs="Times New Roman"/>
+        </w:rPr>
+        <w:t xml:space="preserve"> status 201 Created dan data </w:t>
+      </w:r>
+      <w:proofErr w:type="spellStart"/>
+      <w:r>
+        <w:rPr>
+          <w:rFonts w:ascii="Times New Roman" w:hAnsi="Times New Roman" w:cs="Times New Roman"/>
+        </w:rPr>
+        <w:t>tersimpan</w:t>
+      </w:r>
+      <w:proofErr w:type="spellEnd"/>
+      <w:r>
+        <w:rPr>
+          <w:rFonts w:ascii="Times New Roman" w:hAnsi="Times New Roman" w:cs="Times New Roman"/>
+        </w:rPr>
+        <w:t>.</w:t>
+      </w:r>
+    </w:p>
+    <w:p>
+      <w:pPr>
+        <w:contextualSpacing/>
+        <w:jc w:val="both"/>
+        <w:rPr>
+          <w:rFonts w:ascii="Times New Roman" w:hAnsi="Times New Roman" w:cs="Times New Roman"/>
+        </w:rPr>
+      </w:pPr>
+      <w:r>
+        <w:rPr>
+          <w:rFonts w:ascii="Times New Roman" w:hAnsi="Times New Roman" w:cs="Times New Roman"/>
+        </w:rPr>
+        <w:t xml:space="preserve">2. </w:t>
+      </w:r>
+      <w:r>
+        <w:rPr>
+          <w:rFonts w:ascii="Times New Roman" w:hAnsi="Times New Roman" w:cs="Times New Roman"/>
+        </w:rPr>
+        <w:t xml:space="preserve"> </w:t>
+      </w:r>
+      <w:proofErr w:type="spellStart"/>
+      <w:r>
+        <w:rPr>
+          <w:rFonts w:ascii="Times New Roman" w:hAnsi="Times New Roman" w:cs="Times New Roman"/>
+        </w:rPr>
+        <w:t>Mempermudah</w:t>
+      </w:r>
+      <w:proofErr w:type="spellEnd"/>
+      <w:r>
+        <w:rPr>
+          <w:rFonts w:ascii="Times New Roman" w:hAnsi="Times New Roman" w:cs="Times New Roman"/>
+        </w:rPr>
+        <w:t xml:space="preserve"> Kerjasama </w:t>
+      </w:r>
+      <w:proofErr w:type="spellStart"/>
+      <w:r>
+        <w:rPr>
+          <w:rFonts w:ascii="Times New Roman" w:hAnsi="Times New Roman" w:cs="Times New Roman"/>
+        </w:rPr>
+        <w:t>dengan</w:t>
+      </w:r>
+      <w:proofErr w:type="spellEnd"/>
+      <w:r>
+        <w:rPr>
+          <w:rFonts w:ascii="Times New Roman" w:hAnsi="Times New Roman" w:cs="Times New Roman"/>
+        </w:rPr>
+        <w:t xml:space="preserve"> Frontend (</w:t>
+      </w:r>
+      <w:proofErr w:type="spellStart"/>
+      <w:r>
+        <w:rPr>
+          <w:rFonts w:ascii="Times New Roman" w:hAnsi="Times New Roman" w:cs="Times New Roman"/>
+        </w:rPr>
+        <w:t>Dokumentasi</w:t>
+      </w:r>
+      <w:proofErr w:type="spellEnd"/>
+      <w:r>
+        <w:rPr>
+          <w:rFonts w:ascii="Times New Roman" w:hAnsi="Times New Roman" w:cs="Times New Roman"/>
+        </w:rPr>
+        <w:t>)</w:t>
+      </w:r>
+    </w:p>
+    <w:p>
+      <w:pPr>
+        <w:ind w:left="284"/>
+        <w:contextualSpacing/>
+        <w:jc w:val="both"/>
+        <w:rPr>
+          <w:rFonts w:ascii="Times New Roman" w:hAnsi="Times New Roman" w:cs="Times New Roman"/>
+        </w:rPr>
+      </w:pPr>
+      <w:r>
+        <w:rPr>
+          <w:rFonts w:ascii="Times New Roman" w:hAnsi="Times New Roman" w:cs="Times New Roman"/>
+        </w:rPr>
+        <w:t xml:space="preserve">Jika </w:t>
+      </w:r>
+      <w:proofErr w:type="spellStart"/>
+      <w:r>
+        <w:rPr>
+          <w:rFonts w:ascii="Times New Roman" w:hAnsi="Times New Roman" w:cs="Times New Roman"/>
+        </w:rPr>
+        <w:t>nanti</w:t>
+      </w:r>
+      <w:proofErr w:type="spellEnd"/>
+      <w:r>
+        <w:rPr>
+          <w:rFonts w:ascii="Times New Roman" w:hAnsi="Times New Roman" w:cs="Times New Roman"/>
+        </w:rPr>
+        <w:t xml:space="preserve"> </w:t>
+      </w:r>
+      <w:proofErr w:type="spellStart"/>
+      <w:r>
+        <w:rPr>
+          <w:rFonts w:ascii="Times New Roman" w:hAnsi="Times New Roman" w:cs="Times New Roman"/>
+        </w:rPr>
+        <w:t>kita</w:t>
+      </w:r>
+      <w:proofErr w:type="spellEnd"/>
+      <w:r>
+        <w:rPr>
+          <w:rFonts w:ascii="Times New Roman" w:hAnsi="Times New Roman" w:cs="Times New Roman"/>
+        </w:rPr>
+        <w:t xml:space="preserve"> </w:t>
+      </w:r>
+      <w:proofErr w:type="spellStart"/>
+      <w:r>
+        <w:rPr>
+          <w:rFonts w:ascii="Times New Roman" w:hAnsi="Times New Roman" w:cs="Times New Roman"/>
+        </w:rPr>
+        <w:t>bekerja</w:t>
+      </w:r>
+      <w:proofErr w:type="spellEnd"/>
+      <w:r>
+        <w:rPr>
+          <w:rFonts w:ascii="Times New Roman" w:hAnsi="Times New Roman" w:cs="Times New Roman"/>
+        </w:rPr>
+        <w:t xml:space="preserve"> </w:t>
+      </w:r>
+      <w:proofErr w:type="spellStart"/>
+      <w:r>
+        <w:rPr>
+          <w:rFonts w:ascii="Times New Roman" w:hAnsi="Times New Roman" w:cs="Times New Roman"/>
+        </w:rPr>
+        <w:t>dengan</w:t>
+      </w:r>
+      <w:proofErr w:type="spellEnd"/>
+      <w:r>
+        <w:rPr>
+          <w:rFonts w:ascii="Times New Roman" w:hAnsi="Times New Roman" w:cs="Times New Roman"/>
+        </w:rPr>
+        <w:t xml:space="preserve"> </w:t>
+      </w:r>
+      <w:proofErr w:type="spellStart"/>
+      <w:r>
+        <w:rPr>
+          <w:rFonts w:ascii="Times New Roman" w:hAnsi="Times New Roman" w:cs="Times New Roman"/>
+        </w:rPr>
+        <w:t>tim</w:t>
+      </w:r>
+      <w:proofErr w:type="spellEnd"/>
+      <w:r>
+        <w:rPr>
+          <w:rFonts w:ascii="Times New Roman" w:hAnsi="Times New Roman" w:cs="Times New Roman"/>
+        </w:rPr>
+        <w:t xml:space="preserve"> Frontend (orang yang </w:t>
+      </w:r>
+      <w:proofErr w:type="spellStart"/>
+      <w:r>
+        <w:rPr>
+          <w:rFonts w:ascii="Times New Roman" w:hAnsi="Times New Roman" w:cs="Times New Roman"/>
+        </w:rPr>
+        <w:t>membuat</w:t>
+      </w:r>
+      <w:proofErr w:type="spellEnd"/>
+      <w:r>
+        <w:rPr>
+          <w:rFonts w:ascii="Times New Roman" w:hAnsi="Times New Roman" w:cs="Times New Roman"/>
+        </w:rPr>
+        <w:t xml:space="preserve"> </w:t>
+      </w:r>
+      <w:proofErr w:type="spellStart"/>
+      <w:r>
+        <w:rPr>
+          <w:rFonts w:ascii="Times New Roman" w:hAnsi="Times New Roman" w:cs="Times New Roman"/>
+        </w:rPr>
+        <w:t>tampilan</w:t>
+      </w:r>
+      <w:proofErr w:type="spellEnd"/>
+      <w:r>
+        <w:rPr>
+          <w:rFonts w:ascii="Times New Roman" w:hAnsi="Times New Roman" w:cs="Times New Roman"/>
+        </w:rPr>
+        <w:t xml:space="preserve"> Web </w:t>
+      </w:r>
+      <w:proofErr w:type="spellStart"/>
+      <w:r>
+        <w:rPr>
+          <w:rFonts w:ascii="Times New Roman" w:hAnsi="Times New Roman" w:cs="Times New Roman"/>
+        </w:rPr>
+        <w:t>atau</w:t>
+      </w:r>
+      <w:proofErr w:type="spellEnd"/>
+      <w:r>
+        <w:rPr>
+          <w:rFonts w:ascii="Times New Roman" w:hAnsi="Times New Roman" w:cs="Times New Roman"/>
+        </w:rPr>
+        <w:t xml:space="preserve"> Mobile), </w:t>
+      </w:r>
+      <w:proofErr w:type="spellStart"/>
+      <w:r>
+        <w:rPr>
+          <w:rFonts w:ascii="Times New Roman" w:hAnsi="Times New Roman" w:cs="Times New Roman"/>
+        </w:rPr>
+        <w:t>mereka</w:t>
+      </w:r>
+      <w:proofErr w:type="spellEnd"/>
+      <w:r>
+        <w:rPr>
+          <w:rFonts w:ascii="Times New Roman" w:hAnsi="Times New Roman" w:cs="Times New Roman"/>
+        </w:rPr>
+        <w:t xml:space="preserve"> </w:t>
+      </w:r>
+      <w:proofErr w:type="spellStart"/>
+      <w:r>
+        <w:rPr>
+          <w:rFonts w:ascii="Times New Roman" w:hAnsi="Times New Roman" w:cs="Times New Roman"/>
+        </w:rPr>
+        <w:t>tidak</w:t>
+      </w:r>
+      <w:proofErr w:type="spellEnd"/>
+      <w:r>
+        <w:rPr>
+          <w:rFonts w:ascii="Times New Roman" w:hAnsi="Times New Roman" w:cs="Times New Roman"/>
+        </w:rPr>
+        <w:t xml:space="preserve"> </w:t>
+      </w:r>
+      <w:proofErr w:type="spellStart"/>
+      <w:r>
+        <w:rPr>
+          <w:rFonts w:ascii="Times New Roman" w:hAnsi="Times New Roman" w:cs="Times New Roman"/>
+        </w:rPr>
+        <w:t>perlu</w:t>
+      </w:r>
+      <w:proofErr w:type="spellEnd"/>
+      <w:r>
+        <w:rPr>
+          <w:rFonts w:ascii="Times New Roman" w:hAnsi="Times New Roman" w:cs="Times New Roman"/>
+        </w:rPr>
+        <w:t xml:space="preserve"> </w:t>
+      </w:r>
+      <w:proofErr w:type="spellStart"/>
+      <w:r>
+        <w:rPr>
+          <w:rFonts w:ascii="Times New Roman" w:hAnsi="Times New Roman" w:cs="Times New Roman"/>
+        </w:rPr>
+        <w:t>membaca</w:t>
+      </w:r>
+      <w:proofErr w:type="spellEnd"/>
+      <w:r>
+        <w:rPr>
+          <w:rFonts w:ascii="Times New Roman" w:hAnsi="Times New Roman" w:cs="Times New Roman"/>
+        </w:rPr>
+        <w:t xml:space="preserve"> coding </w:t>
+      </w:r>
+      <w:proofErr w:type="spellStart"/>
+      <w:r>
+        <w:rPr>
+          <w:rFonts w:ascii="Times New Roman" w:hAnsi="Times New Roman" w:cs="Times New Roman"/>
+        </w:rPr>
+        <w:t>NestJS</w:t>
+      </w:r>
+      <w:proofErr w:type="spellEnd"/>
+      <w:r>
+        <w:rPr>
+          <w:rFonts w:ascii="Times New Roman" w:hAnsi="Times New Roman" w:cs="Times New Roman"/>
+        </w:rPr>
+        <w:t xml:space="preserve"> yang </w:t>
+      </w:r>
+      <w:proofErr w:type="spellStart"/>
+      <w:r>
+        <w:rPr>
+          <w:rFonts w:ascii="Times New Roman" w:hAnsi="Times New Roman" w:cs="Times New Roman"/>
+        </w:rPr>
+        <w:t>rumit</w:t>
+      </w:r>
+      <w:proofErr w:type="spellEnd"/>
+      <w:r>
+        <w:rPr>
+          <w:rFonts w:ascii="Times New Roman" w:hAnsi="Times New Roman" w:cs="Times New Roman"/>
+        </w:rPr>
+        <w:t>.</w:t>
+      </w:r>
+    </w:p>
+    <w:p>
+      <w:pPr>
+        <w:numPr>
+          <w:ilvl w:val="0"/>
+          <w:numId w:val="27"/>
+        </w:numPr>
+        <w:contextualSpacing/>
+        <w:jc w:val="both"/>
+        <w:rPr>
+          <w:rFonts w:ascii="Times New Roman" w:hAnsi="Times New Roman" w:cs="Times New Roman"/>
+        </w:rPr>
+      </w:pPr>
+      <w:proofErr w:type="spellStart"/>
+      <w:r>
+        <w:rPr>
+          <w:rFonts w:ascii="Times New Roman" w:hAnsi="Times New Roman" w:cs="Times New Roman"/>
+        </w:rPr>
+        <w:t>C</w:t>
+      </w:r>
+      <w:r>
+        <w:rPr>
+          <w:rFonts w:ascii="Times New Roman" w:hAnsi="Times New Roman" w:cs="Times New Roman"/>
+        </w:rPr>
+        <w:t>ukup</w:t>
+      </w:r>
+      <w:proofErr w:type="spellEnd"/>
+      <w:r>
+        <w:rPr>
+          <w:rFonts w:ascii="Times New Roman" w:hAnsi="Times New Roman" w:cs="Times New Roman"/>
+        </w:rPr>
+        <w:t xml:space="preserve"> </w:t>
+      </w:r>
+      <w:proofErr w:type="spellStart"/>
+      <w:r>
+        <w:rPr>
+          <w:rFonts w:ascii="Times New Roman" w:hAnsi="Times New Roman" w:cs="Times New Roman"/>
+        </w:rPr>
+        <w:t>memberikan</w:t>
+      </w:r>
+      <w:proofErr w:type="spellEnd"/>
+      <w:r>
+        <w:rPr>
+          <w:rFonts w:ascii="Times New Roman" w:hAnsi="Times New Roman" w:cs="Times New Roman"/>
+        </w:rPr>
+        <w:t xml:space="preserve"> link/file </w:t>
+      </w:r>
+      <w:proofErr w:type="spellStart"/>
+      <w:r>
+        <w:rPr>
+          <w:rFonts w:ascii="Times New Roman" w:hAnsi="Times New Roman" w:cs="Times New Roman"/>
+        </w:rPr>
+        <w:t>dari</w:t>
+      </w:r>
+      <w:proofErr w:type="spellEnd"/>
+      <w:r>
+        <w:rPr>
+          <w:rFonts w:ascii="Times New Roman" w:hAnsi="Times New Roman" w:cs="Times New Roman"/>
+        </w:rPr>
+        <w:t> </w:t>
+      </w:r>
+      <w:proofErr w:type="spellStart"/>
+      <w:r>
+        <w:rPr>
+          <w:rFonts w:ascii="Times New Roman" w:hAnsi="Times New Roman" w:cs="Times New Roman"/>
+        </w:rPr>
+        <w:t>Apidog</w:t>
+      </w:r>
+      <w:proofErr w:type="spellEnd"/>
+      <w:r>
+        <w:rPr>
+          <w:rFonts w:ascii="Times New Roman" w:hAnsi="Times New Roman" w:cs="Times New Roman"/>
+        </w:rPr>
+        <w:t>.</w:t>
+      </w:r>
+    </w:p>
+    <w:p>
+      <w:pPr>
+        <w:numPr>
+          <w:ilvl w:val="0"/>
+          <w:numId w:val="27"/>
+        </w:numPr>
+        <w:contextualSpacing/>
+        <w:jc w:val="both"/>
+        <w:rPr>
+          <w:rFonts w:ascii="Times New Roman" w:hAnsi="Times New Roman" w:cs="Times New Roman"/>
+        </w:rPr>
+      </w:pPr>
+      <w:proofErr w:type="spellStart"/>
+      <w:r>
+        <w:rPr>
+          <w:rFonts w:ascii="Times New Roman" w:hAnsi="Times New Roman" w:cs="Times New Roman"/>
+        </w:rPr>
+        <w:t>Mereka</w:t>
+      </w:r>
+      <w:proofErr w:type="spellEnd"/>
+      <w:r>
+        <w:rPr>
+          <w:rFonts w:ascii="Times New Roman" w:hAnsi="Times New Roman" w:cs="Times New Roman"/>
+        </w:rPr>
+        <w:t xml:space="preserve"> </w:t>
+      </w:r>
+      <w:proofErr w:type="spellStart"/>
+      <w:r>
+        <w:rPr>
+          <w:rFonts w:ascii="Times New Roman" w:hAnsi="Times New Roman" w:cs="Times New Roman"/>
+        </w:rPr>
+        <w:t>akan</w:t>
+      </w:r>
+      <w:proofErr w:type="spellEnd"/>
+      <w:r>
+        <w:rPr>
+          <w:rFonts w:ascii="Times New Roman" w:hAnsi="Times New Roman" w:cs="Times New Roman"/>
+        </w:rPr>
+        <w:t xml:space="preserve"> </w:t>
+      </w:r>
+      <w:proofErr w:type="spellStart"/>
+      <w:r>
+        <w:rPr>
+          <w:rFonts w:ascii="Times New Roman" w:hAnsi="Times New Roman" w:cs="Times New Roman"/>
+        </w:rPr>
+        <w:t>tahu</w:t>
+      </w:r>
+      <w:proofErr w:type="spellEnd"/>
+      <w:r>
+        <w:rPr>
+          <w:rFonts w:ascii="Times New Roman" w:hAnsi="Times New Roman" w:cs="Times New Roman"/>
+        </w:rPr>
+        <w:t xml:space="preserve">: </w:t>
+      </w:r>
+      <w:proofErr w:type="spellStart"/>
+      <w:r>
+        <w:rPr>
+          <w:rFonts w:ascii="Times New Roman" w:hAnsi="Times New Roman" w:cs="Times New Roman"/>
+        </w:rPr>
+        <w:t>kalau</w:t>
+      </w:r>
+      <w:proofErr w:type="spellEnd"/>
+      <w:r>
+        <w:rPr>
+          <w:rFonts w:ascii="Times New Roman" w:hAnsi="Times New Roman" w:cs="Times New Roman"/>
+        </w:rPr>
+        <w:t xml:space="preserve"> </w:t>
+      </w:r>
+      <w:proofErr w:type="spellStart"/>
+      <w:r>
+        <w:rPr>
+          <w:rFonts w:ascii="Times New Roman" w:hAnsi="Times New Roman" w:cs="Times New Roman"/>
+        </w:rPr>
+        <w:t>mau</w:t>
+      </w:r>
+      <w:proofErr w:type="spellEnd"/>
+      <w:r>
+        <w:rPr>
+          <w:rFonts w:ascii="Times New Roman" w:hAnsi="Times New Roman" w:cs="Times New Roman"/>
+        </w:rPr>
+        <w:t xml:space="preserve"> </w:t>
+      </w:r>
+      <w:proofErr w:type="spellStart"/>
+      <w:r>
+        <w:rPr>
+          <w:rFonts w:ascii="Times New Roman" w:hAnsi="Times New Roman" w:cs="Times New Roman"/>
+        </w:rPr>
+        <w:t>ambil</w:t>
+      </w:r>
+      <w:proofErr w:type="spellEnd"/>
+      <w:r>
+        <w:rPr>
+          <w:rFonts w:ascii="Times New Roman" w:hAnsi="Times New Roman" w:cs="Times New Roman"/>
+        </w:rPr>
+        <w:t xml:space="preserve"> </w:t>
+      </w:r>
+      <w:proofErr w:type="spellStart"/>
+      <w:r>
+        <w:rPr>
+          <w:rFonts w:ascii="Times New Roman" w:hAnsi="Times New Roman" w:cs="Times New Roman"/>
+        </w:rPr>
+        <w:t>semua</w:t>
+      </w:r>
+      <w:proofErr w:type="spellEnd"/>
+      <w:r>
+        <w:rPr>
+          <w:rFonts w:ascii="Times New Roman" w:hAnsi="Times New Roman" w:cs="Times New Roman"/>
+        </w:rPr>
+        <w:t xml:space="preserve"> </w:t>
+      </w:r>
+      <w:proofErr w:type="spellStart"/>
+      <w:r>
+        <w:rPr>
+          <w:rFonts w:ascii="Times New Roman" w:hAnsi="Times New Roman" w:cs="Times New Roman"/>
+        </w:rPr>
+        <w:t>kategori</w:t>
+      </w:r>
+      <w:proofErr w:type="spellEnd"/>
+      <w:r>
+        <w:rPr>
+          <w:rFonts w:ascii="Times New Roman" w:hAnsi="Times New Roman" w:cs="Times New Roman"/>
+        </w:rPr>
+        <w:t xml:space="preserve">, </w:t>
+      </w:r>
+      <w:proofErr w:type="spellStart"/>
+      <w:r>
+        <w:rPr>
+          <w:rFonts w:ascii="Times New Roman" w:hAnsi="Times New Roman" w:cs="Times New Roman"/>
+        </w:rPr>
+        <w:t>harus</w:t>
+      </w:r>
+      <w:proofErr w:type="spellEnd"/>
+      <w:r>
+        <w:rPr>
+          <w:rFonts w:ascii="Times New Roman" w:hAnsi="Times New Roman" w:cs="Times New Roman"/>
+        </w:rPr>
+        <w:t xml:space="preserve"> </w:t>
+      </w:r>
+      <w:proofErr w:type="spellStart"/>
+      <w:r>
+        <w:rPr>
+          <w:rFonts w:ascii="Times New Roman" w:hAnsi="Times New Roman" w:cs="Times New Roman"/>
+        </w:rPr>
+        <w:t>tembak</w:t>
+      </w:r>
+      <w:proofErr w:type="spellEnd"/>
+      <w:r>
+        <w:rPr>
+          <w:rFonts w:ascii="Times New Roman" w:hAnsi="Times New Roman" w:cs="Times New Roman"/>
+        </w:rPr>
+        <w:t xml:space="preserve"> </w:t>
+      </w:r>
+      <w:proofErr w:type="spellStart"/>
+      <w:r>
+        <w:rPr>
+          <w:rFonts w:ascii="Times New Roman" w:hAnsi="Times New Roman" w:cs="Times New Roman"/>
+        </w:rPr>
+        <w:t>ke</w:t>
+      </w:r>
+      <w:proofErr w:type="spellEnd"/>
+      <w:r>
+        <w:rPr>
+          <w:rFonts w:ascii="Times New Roman" w:hAnsi="Times New Roman" w:cs="Times New Roman"/>
+        </w:rPr>
+        <w:t xml:space="preserve"> URL GET /</w:t>
+      </w:r>
+      <w:proofErr w:type="spellStart"/>
+      <w:r>
+        <w:rPr>
+          <w:rFonts w:ascii="Times New Roman" w:hAnsi="Times New Roman" w:cs="Times New Roman"/>
+        </w:rPr>
+        <w:t>kategori</w:t>
+      </w:r>
+      <w:proofErr w:type="spellEnd"/>
+      <w:r>
+        <w:rPr>
+          <w:rFonts w:ascii="Times New Roman" w:hAnsi="Times New Roman" w:cs="Times New Roman"/>
+        </w:rPr>
+        <w:t>."</w:t>
+      </w:r>
+    </w:p>
+    <w:p>
+      <w:pPr>
+        <w:contextualSpacing/>
+        <w:jc w:val="both"/>
+        <w:rPr>
+          <w:rFonts w:ascii="Times New Roman" w:hAnsi="Times New Roman" w:cs="Times New Roman"/>
+        </w:rPr>
+      </w:pPr>
+      <w:r>
+        <w:rPr>
+          <w:rFonts w:ascii="Times New Roman" w:hAnsi="Times New Roman" w:cs="Times New Roman"/>
+        </w:rPr>
+        <w:t xml:space="preserve">3. </w:t>
+      </w:r>
+      <w:r>
+        <w:rPr>
+          <w:rFonts w:ascii="Times New Roman" w:hAnsi="Times New Roman" w:cs="Times New Roman"/>
+        </w:rPr>
+        <w:t xml:space="preserve"> </w:t>
+      </w:r>
+      <w:proofErr w:type="spellStart"/>
+      <w:r>
+        <w:rPr>
+          <w:rFonts w:ascii="Times New Roman" w:hAnsi="Times New Roman" w:cs="Times New Roman"/>
+        </w:rPr>
+        <w:t>Menjaga</w:t>
+      </w:r>
+      <w:proofErr w:type="spellEnd"/>
+      <w:r>
+        <w:rPr>
+          <w:rFonts w:ascii="Times New Roman" w:hAnsi="Times New Roman" w:cs="Times New Roman"/>
+        </w:rPr>
+        <w:t xml:space="preserve"> </w:t>
+      </w:r>
+      <w:proofErr w:type="spellStart"/>
+      <w:r>
+        <w:rPr>
+          <w:rFonts w:ascii="Times New Roman" w:hAnsi="Times New Roman" w:cs="Times New Roman"/>
+        </w:rPr>
+        <w:t>Kualitas</w:t>
+      </w:r>
+      <w:proofErr w:type="spellEnd"/>
+      <w:r>
+        <w:rPr>
+          <w:rFonts w:ascii="Times New Roman" w:hAnsi="Times New Roman" w:cs="Times New Roman"/>
+        </w:rPr>
+        <w:t xml:space="preserve"> dan </w:t>
+      </w:r>
+      <w:proofErr w:type="spellStart"/>
+      <w:r>
+        <w:rPr>
+          <w:rFonts w:ascii="Times New Roman" w:hAnsi="Times New Roman" w:cs="Times New Roman"/>
+        </w:rPr>
+        <w:t>Kebersihan</w:t>
+      </w:r>
+      <w:proofErr w:type="spellEnd"/>
+      <w:r>
+        <w:rPr>
+          <w:rFonts w:ascii="Times New Roman" w:hAnsi="Times New Roman" w:cs="Times New Roman"/>
+        </w:rPr>
+        <w:t xml:space="preserve"> Kode (Professionalism)</w:t>
+      </w:r>
+    </w:p>
+    <w:p>
+      <w:pPr>
+        <w:ind w:left="284"/>
+        <w:contextualSpacing/>
+        <w:jc w:val="both"/>
+        <w:rPr>
+          <w:rFonts w:ascii="Times New Roman" w:hAnsi="Times New Roman" w:cs="Times New Roman"/>
+        </w:rPr>
+      </w:pPr>
+      <w:r>
+        <w:rPr>
+          <w:rFonts w:ascii="Times New Roman" w:hAnsi="Times New Roman" w:cs="Times New Roman"/>
+        </w:rPr>
+        <w:t>Adanya file .eslintrc.js </w:t>
+      </w:r>
+      <w:proofErr w:type="spellStart"/>
+      <w:r>
+        <w:rPr>
+          <w:rFonts w:ascii="Times New Roman" w:hAnsi="Times New Roman" w:cs="Times New Roman"/>
+        </w:rPr>
+        <w:t>memastikan</w:t>
+      </w:r>
+      <w:proofErr w:type="spellEnd"/>
+      <w:r>
+        <w:rPr>
+          <w:rFonts w:ascii="Times New Roman" w:hAnsi="Times New Roman" w:cs="Times New Roman"/>
+        </w:rPr>
+        <w:t xml:space="preserve"> </w:t>
+      </w:r>
+      <w:proofErr w:type="spellStart"/>
+      <w:r>
+        <w:rPr>
+          <w:rFonts w:ascii="Times New Roman" w:hAnsi="Times New Roman" w:cs="Times New Roman"/>
+        </w:rPr>
+        <w:t>kode</w:t>
+      </w:r>
+      <w:proofErr w:type="spellEnd"/>
+      <w:r>
+        <w:rPr>
+          <w:rFonts w:ascii="Times New Roman" w:hAnsi="Times New Roman" w:cs="Times New Roman"/>
+        </w:rPr>
+        <w:t xml:space="preserve"> </w:t>
+      </w:r>
+      <w:proofErr w:type="spellStart"/>
+      <w:r>
+        <w:rPr>
+          <w:rFonts w:ascii="Times New Roman" w:hAnsi="Times New Roman" w:cs="Times New Roman"/>
+        </w:rPr>
+        <w:t>tidak</w:t>
+      </w:r>
+      <w:proofErr w:type="spellEnd"/>
+      <w:r>
+        <w:rPr>
+          <w:rFonts w:ascii="Times New Roman" w:hAnsi="Times New Roman" w:cs="Times New Roman"/>
+        </w:rPr>
+        <w:t xml:space="preserve"> </w:t>
+      </w:r>
+      <w:proofErr w:type="spellStart"/>
+      <w:r>
+        <w:rPr>
+          <w:rFonts w:ascii="Times New Roman" w:hAnsi="Times New Roman" w:cs="Times New Roman"/>
+        </w:rPr>
+        <w:t>berantakan</w:t>
+      </w:r>
+      <w:proofErr w:type="spellEnd"/>
+      <w:r>
+        <w:rPr>
+          <w:rFonts w:ascii="Times New Roman" w:hAnsi="Times New Roman" w:cs="Times New Roman"/>
+        </w:rPr>
+        <w:t>.</w:t>
+      </w:r>
+    </w:p>
+    <w:p>
+      <w:pPr>
+        <w:numPr>
+          <w:ilvl w:val="0"/>
+          <w:numId w:val="28"/>
+        </w:numPr>
+        <w:contextualSpacing/>
+        <w:jc w:val="both"/>
+        <w:rPr>
+          <w:rFonts w:ascii="Times New Roman" w:hAnsi="Times New Roman" w:cs="Times New Roman"/>
+        </w:rPr>
+      </w:pPr>
+      <w:proofErr w:type="spellStart"/>
+      <w:r>
+        <w:rPr>
+          <w:rFonts w:ascii="Times New Roman" w:hAnsi="Times New Roman" w:cs="Times New Roman"/>
+        </w:rPr>
+        <w:t>Membantu</w:t>
+      </w:r>
+      <w:proofErr w:type="spellEnd"/>
+      <w:r>
+        <w:rPr>
+          <w:rFonts w:ascii="Times New Roman" w:hAnsi="Times New Roman" w:cs="Times New Roman"/>
+        </w:rPr>
+        <w:t xml:space="preserve"> </w:t>
+      </w:r>
+      <w:proofErr w:type="spellStart"/>
+      <w:r>
+        <w:rPr>
+          <w:rFonts w:ascii="Times New Roman" w:hAnsi="Times New Roman" w:cs="Times New Roman"/>
+        </w:rPr>
+        <w:t>menghindari</w:t>
+      </w:r>
+      <w:proofErr w:type="spellEnd"/>
+      <w:r>
+        <w:rPr>
+          <w:rFonts w:ascii="Times New Roman" w:hAnsi="Times New Roman" w:cs="Times New Roman"/>
+        </w:rPr>
+        <w:t xml:space="preserve"> bug </w:t>
+      </w:r>
+      <w:proofErr w:type="spellStart"/>
+      <w:r>
+        <w:rPr>
+          <w:rFonts w:ascii="Times New Roman" w:hAnsi="Times New Roman" w:cs="Times New Roman"/>
+        </w:rPr>
+        <w:t>sepele</w:t>
+      </w:r>
+      <w:proofErr w:type="spellEnd"/>
+      <w:r>
+        <w:rPr>
+          <w:rFonts w:ascii="Times New Roman" w:hAnsi="Times New Roman" w:cs="Times New Roman"/>
+        </w:rPr>
+        <w:t xml:space="preserve"> (</w:t>
+      </w:r>
+      <w:proofErr w:type="spellStart"/>
+      <w:r>
+        <w:rPr>
+          <w:rFonts w:ascii="Times New Roman" w:hAnsi="Times New Roman" w:cs="Times New Roman"/>
+        </w:rPr>
+        <w:t>seperti</w:t>
+      </w:r>
+      <w:proofErr w:type="spellEnd"/>
+      <w:r>
+        <w:rPr>
+          <w:rFonts w:ascii="Times New Roman" w:hAnsi="Times New Roman" w:cs="Times New Roman"/>
+        </w:rPr>
+        <w:t xml:space="preserve"> </w:t>
+      </w:r>
+      <w:proofErr w:type="spellStart"/>
+      <w:r>
+        <w:rPr>
+          <w:rFonts w:ascii="Times New Roman" w:hAnsi="Times New Roman" w:cs="Times New Roman"/>
+        </w:rPr>
+        <w:t>variabel</w:t>
+      </w:r>
+      <w:proofErr w:type="spellEnd"/>
+      <w:r>
+        <w:rPr>
+          <w:rFonts w:ascii="Times New Roman" w:hAnsi="Times New Roman" w:cs="Times New Roman"/>
+        </w:rPr>
+        <w:t xml:space="preserve"> yang </w:t>
+      </w:r>
+      <w:proofErr w:type="spellStart"/>
+      <w:r>
+        <w:rPr>
+          <w:rFonts w:ascii="Times New Roman" w:hAnsi="Times New Roman" w:cs="Times New Roman"/>
+        </w:rPr>
+        <w:t>lupa</w:t>
+      </w:r>
+      <w:proofErr w:type="spellEnd"/>
+      <w:r>
+        <w:rPr>
+          <w:rFonts w:ascii="Times New Roman" w:hAnsi="Times New Roman" w:cs="Times New Roman"/>
+        </w:rPr>
+        <w:t xml:space="preserve"> </w:t>
+      </w:r>
+      <w:proofErr w:type="spellStart"/>
+      <w:r>
+        <w:rPr>
+          <w:rFonts w:ascii="Times New Roman" w:hAnsi="Times New Roman" w:cs="Times New Roman"/>
+        </w:rPr>
+        <w:t>dipakai</w:t>
+      </w:r>
+      <w:proofErr w:type="spellEnd"/>
+      <w:r>
+        <w:rPr>
+          <w:rFonts w:ascii="Times New Roman" w:hAnsi="Times New Roman" w:cs="Times New Roman"/>
+        </w:rPr>
+        <w:t>).</w:t>
+      </w:r>
+    </w:p>
+    <w:p>
+      <w:pPr>
+        <w:numPr>
+          <w:ilvl w:val="0"/>
+          <w:numId w:val="28"/>
+        </w:numPr>
+        <w:contextualSpacing/>
+        <w:jc w:val="both"/>
+        <w:rPr>
+          <w:rFonts w:ascii="Times New Roman" w:hAnsi="Times New Roman" w:cs="Times New Roman"/>
+        </w:rPr>
+      </w:pPr>
+      <w:proofErr w:type="spellStart"/>
+      <w:r>
+        <w:rPr>
+          <w:rFonts w:ascii="Times New Roman" w:hAnsi="Times New Roman" w:cs="Times New Roman"/>
+        </w:rPr>
+        <w:t>Membuat</w:t>
+      </w:r>
+      <w:proofErr w:type="spellEnd"/>
+      <w:r>
+        <w:rPr>
+          <w:rFonts w:ascii="Times New Roman" w:hAnsi="Times New Roman" w:cs="Times New Roman"/>
+        </w:rPr>
+        <w:t xml:space="preserve"> </w:t>
+      </w:r>
+      <w:proofErr w:type="spellStart"/>
+      <w:r>
+        <w:rPr>
+          <w:rFonts w:ascii="Times New Roman" w:hAnsi="Times New Roman" w:cs="Times New Roman"/>
+        </w:rPr>
+        <w:t>kode</w:t>
+      </w:r>
+      <w:proofErr w:type="spellEnd"/>
+      <w:r>
+        <w:rPr>
+          <w:rFonts w:ascii="Times New Roman" w:hAnsi="Times New Roman" w:cs="Times New Roman"/>
+        </w:rPr>
+        <w:t xml:space="preserve"> </w:t>
+      </w:r>
+      <w:proofErr w:type="spellStart"/>
+      <w:r>
+        <w:rPr>
+          <w:rFonts w:ascii="Times New Roman" w:hAnsi="Times New Roman" w:cs="Times New Roman"/>
+        </w:rPr>
+        <w:t>terlihat</w:t>
+      </w:r>
+      <w:proofErr w:type="spellEnd"/>
+      <w:r>
+        <w:rPr>
+          <w:rFonts w:ascii="Times New Roman" w:hAnsi="Times New Roman" w:cs="Times New Roman"/>
+        </w:rPr>
+        <w:t xml:space="preserve"> </w:t>
+      </w:r>
+      <w:proofErr w:type="spellStart"/>
+      <w:r>
+        <w:rPr>
+          <w:rFonts w:ascii="Times New Roman" w:hAnsi="Times New Roman" w:cs="Times New Roman"/>
+        </w:rPr>
+        <w:t>profesional</w:t>
+      </w:r>
+      <w:proofErr w:type="spellEnd"/>
+      <w:r>
+        <w:rPr>
+          <w:rFonts w:ascii="Times New Roman" w:hAnsi="Times New Roman" w:cs="Times New Roman"/>
+        </w:rPr>
+        <w:t xml:space="preserve"> </w:t>
+      </w:r>
+      <w:proofErr w:type="spellStart"/>
+      <w:r>
+        <w:rPr>
+          <w:rFonts w:ascii="Times New Roman" w:hAnsi="Times New Roman" w:cs="Times New Roman"/>
+        </w:rPr>
+        <w:t>jika</w:t>
+      </w:r>
+      <w:proofErr w:type="spellEnd"/>
+      <w:r>
+        <w:rPr>
+          <w:rFonts w:ascii="Times New Roman" w:hAnsi="Times New Roman" w:cs="Times New Roman"/>
+        </w:rPr>
+        <w:t xml:space="preserve"> </w:t>
+      </w:r>
+      <w:proofErr w:type="spellStart"/>
+      <w:r>
+        <w:rPr>
+          <w:rFonts w:ascii="Times New Roman" w:hAnsi="Times New Roman" w:cs="Times New Roman"/>
+        </w:rPr>
+        <w:t>dibaca</w:t>
+      </w:r>
+      <w:proofErr w:type="spellEnd"/>
+      <w:r>
+        <w:rPr>
+          <w:rFonts w:ascii="Times New Roman" w:hAnsi="Times New Roman" w:cs="Times New Roman"/>
+        </w:rPr>
+        <w:t xml:space="preserve"> oleh orang lain </w:t>
+      </w:r>
+      <w:proofErr w:type="spellStart"/>
+      <w:r>
+        <w:rPr>
+          <w:rFonts w:ascii="Times New Roman" w:hAnsi="Times New Roman" w:cs="Times New Roman"/>
+        </w:rPr>
+        <w:t>atau</w:t>
+      </w:r>
+      <w:proofErr w:type="spellEnd"/>
+      <w:r>
+        <w:rPr>
+          <w:rFonts w:ascii="Times New Roman" w:hAnsi="Times New Roman" w:cs="Times New Roman"/>
+        </w:rPr>
+        <w:t xml:space="preserve"> </w:t>
+      </w:r>
+      <w:proofErr w:type="spellStart"/>
+      <w:r>
+        <w:rPr>
+          <w:rFonts w:ascii="Times New Roman" w:hAnsi="Times New Roman" w:cs="Times New Roman"/>
+        </w:rPr>
+        <w:t>saat</w:t>
+      </w:r>
+      <w:proofErr w:type="spellEnd"/>
+      <w:r>
+        <w:rPr>
+          <w:rFonts w:ascii="Times New Roman" w:hAnsi="Times New Roman" w:cs="Times New Roman"/>
+        </w:rPr>
+        <w:t xml:space="preserve"> </w:t>
+      </w:r>
+      <w:proofErr w:type="spellStart"/>
+      <w:r>
+        <w:rPr>
+          <w:rFonts w:ascii="Times New Roman" w:hAnsi="Times New Roman" w:cs="Times New Roman"/>
+        </w:rPr>
+        <w:t>melamar</w:t>
+      </w:r>
+      <w:proofErr w:type="spellEnd"/>
+      <w:r>
+        <w:rPr>
+          <w:rFonts w:ascii="Times New Roman" w:hAnsi="Times New Roman" w:cs="Times New Roman"/>
+        </w:rPr>
+        <w:t xml:space="preserve"> </w:t>
+      </w:r>
+      <w:proofErr w:type="spellStart"/>
+      <w:r>
+        <w:rPr>
+          <w:rFonts w:ascii="Times New Roman" w:hAnsi="Times New Roman" w:cs="Times New Roman"/>
+        </w:rPr>
+        <w:t>kerja</w:t>
+      </w:r>
+      <w:proofErr w:type="spellEnd"/>
+      <w:r>
+        <w:rPr>
+          <w:rFonts w:ascii="Times New Roman" w:hAnsi="Times New Roman" w:cs="Times New Roman"/>
+        </w:rPr>
+        <w:t xml:space="preserve">, </w:t>
+      </w:r>
+      <w:proofErr w:type="spellStart"/>
+      <w:r>
+        <w:rPr>
+          <w:rFonts w:ascii="Times New Roman" w:hAnsi="Times New Roman" w:cs="Times New Roman"/>
+        </w:rPr>
+        <w:t>karena</w:t>
+      </w:r>
+      <w:proofErr w:type="spellEnd"/>
+      <w:r>
+        <w:rPr>
+          <w:rFonts w:ascii="Times New Roman" w:hAnsi="Times New Roman" w:cs="Times New Roman"/>
+        </w:rPr>
+        <w:t xml:space="preserve"> </w:t>
+      </w:r>
+      <w:proofErr w:type="spellStart"/>
+      <w:r>
+        <w:rPr>
+          <w:rFonts w:ascii="Times New Roman" w:hAnsi="Times New Roman" w:cs="Times New Roman"/>
+        </w:rPr>
+        <w:t>mengikuti</w:t>
+      </w:r>
+      <w:proofErr w:type="spellEnd"/>
+      <w:r>
+        <w:rPr>
+          <w:rFonts w:ascii="Times New Roman" w:hAnsi="Times New Roman" w:cs="Times New Roman"/>
+        </w:rPr>
+        <w:t xml:space="preserve"> </w:t>
+      </w:r>
+      <w:proofErr w:type="spellStart"/>
+      <w:r>
+        <w:rPr>
+          <w:rFonts w:ascii="Times New Roman" w:hAnsi="Times New Roman" w:cs="Times New Roman"/>
+        </w:rPr>
+        <w:t>standar</w:t>
+      </w:r>
+      <w:proofErr w:type="spellEnd"/>
+      <w:r>
+        <w:rPr>
+          <w:rFonts w:ascii="Times New Roman" w:hAnsi="Times New Roman" w:cs="Times New Roman"/>
+        </w:rPr>
+        <w:t xml:space="preserve"> </w:t>
+      </w:r>
+      <w:proofErr w:type="spellStart"/>
+      <w:r>
+        <w:rPr>
+          <w:rFonts w:ascii="Times New Roman" w:hAnsi="Times New Roman" w:cs="Times New Roman"/>
+        </w:rPr>
+        <w:t>industri</w:t>
+      </w:r>
+      <w:proofErr w:type="spellEnd"/>
+      <w:r>
+        <w:rPr>
+          <w:rFonts w:ascii="Times New Roman" w:hAnsi="Times New Roman" w:cs="Times New Roman"/>
+        </w:rPr>
+        <w:t>.</w:t>
+      </w:r>
+    </w:p>
+    <w:p>
+      <w:pPr>
+        <w:contextualSpacing/>
+        <w:jc w:val="both"/>
+        <w:rPr>
+          <w:rFonts w:ascii="Times New Roman" w:hAnsi="Times New Roman" w:cs="Times New Roman"/>
+        </w:rPr>
+      </w:pPr>
+      <w:r>
+        <w:rPr>
+          <w:rFonts w:ascii="Times New Roman" w:hAnsi="Times New Roman" w:cs="Times New Roman"/>
+        </w:rPr>
+        <w:t xml:space="preserve">4. </w:t>
+      </w:r>
+      <w:r>
+        <w:rPr>
+          <w:rFonts w:ascii="Times New Roman" w:hAnsi="Times New Roman" w:cs="Times New Roman"/>
+        </w:rPr>
+        <w:t xml:space="preserve"> </w:t>
+      </w:r>
+      <w:proofErr w:type="spellStart"/>
+      <w:r>
+        <w:rPr>
+          <w:rFonts w:ascii="Times New Roman" w:hAnsi="Times New Roman" w:cs="Times New Roman"/>
+        </w:rPr>
+        <w:t>Keamanan</w:t>
+      </w:r>
+      <w:proofErr w:type="spellEnd"/>
+      <w:r>
+        <w:rPr>
+          <w:rFonts w:ascii="Times New Roman" w:hAnsi="Times New Roman" w:cs="Times New Roman"/>
+        </w:rPr>
+        <w:t xml:space="preserve"> dan </w:t>
+      </w:r>
+      <w:proofErr w:type="spellStart"/>
+      <w:r>
+        <w:rPr>
+          <w:rFonts w:ascii="Times New Roman" w:hAnsi="Times New Roman" w:cs="Times New Roman"/>
+        </w:rPr>
+        <w:t>Integritas</w:t>
+      </w:r>
+      <w:proofErr w:type="spellEnd"/>
+      <w:r>
+        <w:rPr>
+          <w:rFonts w:ascii="Times New Roman" w:hAnsi="Times New Roman" w:cs="Times New Roman"/>
+        </w:rPr>
+        <w:t xml:space="preserve"> Data (Logika </w:t>
+      </w:r>
+      <w:proofErr w:type="spellStart"/>
+      <w:r>
+        <w:rPr>
+          <w:rFonts w:ascii="Times New Roman" w:hAnsi="Times New Roman" w:cs="Times New Roman"/>
+        </w:rPr>
+        <w:t>Bisnis</w:t>
+      </w:r>
+      <w:proofErr w:type="spellEnd"/>
+      <w:r>
+        <w:rPr>
+          <w:rFonts w:ascii="Times New Roman" w:hAnsi="Times New Roman" w:cs="Times New Roman"/>
+        </w:rPr>
+        <w:t>)</w:t>
+      </w:r>
+    </w:p>
+    <w:p>
+      <w:pPr>
+        <w:ind w:left="284"/>
+        <w:contextualSpacing/>
+        <w:jc w:val="both"/>
+        <w:rPr>
+          <w:rFonts w:ascii="Times New Roman" w:hAnsi="Times New Roman" w:cs="Times New Roman"/>
+        </w:rPr>
+      </w:pPr>
+      <w:r>
+        <w:rPr>
+          <w:rFonts w:ascii="Times New Roman" w:hAnsi="Times New Roman" w:cs="Times New Roman"/>
+        </w:rPr>
+        <w:t xml:space="preserve">Di </w:t>
+      </w:r>
+      <w:proofErr w:type="spellStart"/>
+      <w:r>
+        <w:rPr>
+          <w:rFonts w:ascii="Times New Roman" w:hAnsi="Times New Roman" w:cs="Times New Roman"/>
+        </w:rPr>
+        <w:t>dalam</w:t>
+      </w:r>
+      <w:proofErr w:type="spellEnd"/>
+      <w:r>
+        <w:rPr>
+          <w:rFonts w:ascii="Times New Roman" w:hAnsi="Times New Roman" w:cs="Times New Roman"/>
+        </w:rPr>
+        <w:t> </w:t>
+      </w:r>
+      <w:proofErr w:type="spellStart"/>
+      <w:r>
+        <w:rPr>
+          <w:rFonts w:ascii="Times New Roman" w:hAnsi="Times New Roman" w:cs="Times New Roman"/>
+        </w:rPr>
+        <w:t>KategoriService</w:t>
+      </w:r>
+      <w:proofErr w:type="spellEnd"/>
+      <w:r>
+        <w:rPr>
+          <w:rFonts w:ascii="Times New Roman" w:hAnsi="Times New Roman" w:cs="Times New Roman"/>
+        </w:rPr>
+        <w:t xml:space="preserve">, </w:t>
+      </w:r>
+      <w:proofErr w:type="spellStart"/>
+      <w:r>
+        <w:rPr>
+          <w:rFonts w:ascii="Times New Roman" w:hAnsi="Times New Roman" w:cs="Times New Roman"/>
+        </w:rPr>
+        <w:t>membuat</w:t>
+      </w:r>
+      <w:proofErr w:type="spellEnd"/>
+      <w:r>
+        <w:rPr>
+          <w:rFonts w:ascii="Times New Roman" w:hAnsi="Times New Roman" w:cs="Times New Roman"/>
+        </w:rPr>
+        <w:t xml:space="preserve"> </w:t>
+      </w:r>
+      <w:proofErr w:type="spellStart"/>
+      <w:r>
+        <w:rPr>
+          <w:rFonts w:ascii="Times New Roman" w:hAnsi="Times New Roman" w:cs="Times New Roman"/>
+        </w:rPr>
+        <w:t>validasi</w:t>
+      </w:r>
+      <w:proofErr w:type="spellEnd"/>
+      <w:r>
+        <w:rPr>
+          <w:rFonts w:ascii="Times New Roman" w:hAnsi="Times New Roman" w:cs="Times New Roman"/>
+        </w:rPr>
+        <w:t xml:space="preserve"> agar </w:t>
+      </w:r>
+      <w:proofErr w:type="spellStart"/>
+      <w:r>
+        <w:rPr>
+          <w:rFonts w:ascii="Times New Roman" w:hAnsi="Times New Roman" w:cs="Times New Roman"/>
+        </w:rPr>
+        <w:t>tidak</w:t>
+      </w:r>
+      <w:proofErr w:type="spellEnd"/>
+      <w:r>
+        <w:rPr>
+          <w:rFonts w:ascii="Times New Roman" w:hAnsi="Times New Roman" w:cs="Times New Roman"/>
+        </w:rPr>
+        <w:t xml:space="preserve"> </w:t>
+      </w:r>
+      <w:proofErr w:type="spellStart"/>
+      <w:r>
+        <w:rPr>
+          <w:rFonts w:ascii="Times New Roman" w:hAnsi="Times New Roman" w:cs="Times New Roman"/>
+        </w:rPr>
+        <w:t>ada</w:t>
+      </w:r>
+      <w:proofErr w:type="spellEnd"/>
+      <w:r>
+        <w:rPr>
+          <w:rFonts w:ascii="Times New Roman" w:hAnsi="Times New Roman" w:cs="Times New Roman"/>
+        </w:rPr>
+        <w:t xml:space="preserve"> Nama </w:t>
+      </w:r>
+      <w:proofErr w:type="spellStart"/>
+      <w:r>
+        <w:rPr>
+          <w:rFonts w:ascii="Times New Roman" w:hAnsi="Times New Roman" w:cs="Times New Roman"/>
+        </w:rPr>
+        <w:t>atau</w:t>
+      </w:r>
+      <w:proofErr w:type="spellEnd"/>
+      <w:r>
+        <w:rPr>
+          <w:rFonts w:ascii="Times New Roman" w:hAnsi="Times New Roman" w:cs="Times New Roman"/>
+        </w:rPr>
+        <w:t xml:space="preserve"> Slug yang </w:t>
+      </w:r>
+      <w:proofErr w:type="spellStart"/>
+      <w:r>
+        <w:rPr>
+          <w:rFonts w:ascii="Times New Roman" w:hAnsi="Times New Roman" w:cs="Times New Roman"/>
+        </w:rPr>
+        <w:t>kembar</w:t>
+      </w:r>
+      <w:proofErr w:type="spellEnd"/>
+      <w:r>
+        <w:rPr>
+          <w:rFonts w:ascii="Times New Roman" w:hAnsi="Times New Roman" w:cs="Times New Roman"/>
+        </w:rPr>
+        <w:t>.</w:t>
+      </w:r>
+    </w:p>
+    <w:p>
+      <w:pPr>
+        <w:numPr>
+          <w:ilvl w:val="0"/>
+          <w:numId w:val="29"/>
+        </w:numPr>
+        <w:contextualSpacing/>
+        <w:jc w:val="both"/>
+        <w:rPr>
+          <w:rFonts w:ascii="Times New Roman" w:hAnsi="Times New Roman" w:cs="Times New Roman"/>
+        </w:rPr>
+      </w:pPr>
+      <w:proofErr w:type="spellStart"/>
+      <w:r>
+        <w:rPr>
+          <w:rFonts w:ascii="Times New Roman" w:hAnsi="Times New Roman" w:cs="Times New Roman"/>
+        </w:rPr>
+        <w:t>Kegunaannya</w:t>
+      </w:r>
+      <w:proofErr w:type="spellEnd"/>
+      <w:r>
+        <w:rPr>
+          <w:rFonts w:ascii="Times New Roman" w:hAnsi="Times New Roman" w:cs="Times New Roman"/>
+        </w:rPr>
+        <w:t>: </w:t>
+      </w:r>
+      <w:proofErr w:type="spellStart"/>
+      <w:r>
+        <w:rPr>
+          <w:rFonts w:ascii="Times New Roman" w:hAnsi="Times New Roman" w:cs="Times New Roman"/>
+        </w:rPr>
+        <w:t>Mencegah</w:t>
+      </w:r>
+      <w:proofErr w:type="spellEnd"/>
+      <w:r>
+        <w:rPr>
+          <w:rFonts w:ascii="Times New Roman" w:hAnsi="Times New Roman" w:cs="Times New Roman"/>
+        </w:rPr>
+        <w:t xml:space="preserve"> database </w:t>
+      </w:r>
+      <w:proofErr w:type="spellStart"/>
+      <w:r>
+        <w:rPr>
+          <w:rFonts w:ascii="Times New Roman" w:hAnsi="Times New Roman" w:cs="Times New Roman"/>
+        </w:rPr>
+        <w:t>kacau</w:t>
+      </w:r>
+      <w:proofErr w:type="spellEnd"/>
+      <w:r>
+        <w:rPr>
+          <w:rFonts w:ascii="Times New Roman" w:hAnsi="Times New Roman" w:cs="Times New Roman"/>
+        </w:rPr>
+        <w:t xml:space="preserve"> </w:t>
+      </w:r>
+      <w:proofErr w:type="spellStart"/>
+      <w:r>
+        <w:rPr>
+          <w:rFonts w:ascii="Times New Roman" w:hAnsi="Times New Roman" w:cs="Times New Roman"/>
+        </w:rPr>
+        <w:t>atau</w:t>
+      </w:r>
+      <w:proofErr w:type="spellEnd"/>
+      <w:r>
+        <w:rPr>
+          <w:rFonts w:ascii="Times New Roman" w:hAnsi="Times New Roman" w:cs="Times New Roman"/>
+        </w:rPr>
+        <w:t xml:space="preserve"> error di masa </w:t>
+      </w:r>
+      <w:proofErr w:type="spellStart"/>
+      <w:r>
+        <w:rPr>
+          <w:rFonts w:ascii="Times New Roman" w:hAnsi="Times New Roman" w:cs="Times New Roman"/>
+        </w:rPr>
+        <w:t>depan</w:t>
+      </w:r>
+      <w:proofErr w:type="spellEnd"/>
+      <w:r>
+        <w:rPr>
+          <w:rFonts w:ascii="Times New Roman" w:hAnsi="Times New Roman" w:cs="Times New Roman"/>
+        </w:rPr>
+        <w:t xml:space="preserve"> </w:t>
+      </w:r>
+      <w:proofErr w:type="spellStart"/>
+      <w:r>
+        <w:rPr>
+          <w:rFonts w:ascii="Times New Roman" w:hAnsi="Times New Roman" w:cs="Times New Roman"/>
+        </w:rPr>
+        <w:t>karena</w:t>
+      </w:r>
+      <w:proofErr w:type="spellEnd"/>
+      <w:r>
+        <w:rPr>
+          <w:rFonts w:ascii="Times New Roman" w:hAnsi="Times New Roman" w:cs="Times New Roman"/>
+        </w:rPr>
+        <w:t xml:space="preserve"> </w:t>
+      </w:r>
+      <w:proofErr w:type="spellStart"/>
+      <w:r>
+        <w:rPr>
+          <w:rFonts w:ascii="Times New Roman" w:hAnsi="Times New Roman" w:cs="Times New Roman"/>
+        </w:rPr>
+        <w:t>ada</w:t>
+      </w:r>
+      <w:proofErr w:type="spellEnd"/>
+      <w:r>
+        <w:rPr>
+          <w:rFonts w:ascii="Times New Roman" w:hAnsi="Times New Roman" w:cs="Times New Roman"/>
+        </w:rPr>
+        <w:t xml:space="preserve"> dua </w:t>
+      </w:r>
+      <w:proofErr w:type="spellStart"/>
+      <w:r>
+        <w:rPr>
+          <w:rFonts w:ascii="Times New Roman" w:hAnsi="Times New Roman" w:cs="Times New Roman"/>
+        </w:rPr>
+        <w:t>kategori</w:t>
+      </w:r>
+      <w:proofErr w:type="spellEnd"/>
+      <w:r>
+        <w:rPr>
+          <w:rFonts w:ascii="Times New Roman" w:hAnsi="Times New Roman" w:cs="Times New Roman"/>
+        </w:rPr>
+        <w:t xml:space="preserve"> yang </w:t>
+      </w:r>
+      <w:proofErr w:type="spellStart"/>
+      <w:r>
+        <w:rPr>
+          <w:rFonts w:ascii="Times New Roman" w:hAnsi="Times New Roman" w:cs="Times New Roman"/>
+        </w:rPr>
+        <w:t>identik</w:t>
+      </w:r>
+      <w:proofErr w:type="spellEnd"/>
+      <w:r>
+        <w:rPr>
+          <w:rFonts w:ascii="Times New Roman" w:hAnsi="Times New Roman" w:cs="Times New Roman"/>
+        </w:rPr>
+        <w:t xml:space="preserve"> (</w:t>
+      </w:r>
+      <w:proofErr w:type="spellStart"/>
+      <w:r>
+        <w:rPr>
+          <w:rFonts w:ascii="Times New Roman" w:hAnsi="Times New Roman" w:cs="Times New Roman"/>
+        </w:rPr>
+        <w:t>misal</w:t>
+      </w:r>
+      <w:proofErr w:type="spellEnd"/>
+      <w:r>
+        <w:rPr>
+          <w:rFonts w:ascii="Times New Roman" w:hAnsi="Times New Roman" w:cs="Times New Roman"/>
+        </w:rPr>
+        <w:t xml:space="preserve">: </w:t>
+      </w:r>
+      <w:proofErr w:type="spellStart"/>
+      <w:r>
+        <w:rPr>
+          <w:rFonts w:ascii="Times New Roman" w:hAnsi="Times New Roman" w:cs="Times New Roman"/>
+        </w:rPr>
+        <w:t>ada</w:t>
+      </w:r>
+      <w:proofErr w:type="spellEnd"/>
+      <w:r>
+        <w:rPr>
+          <w:rFonts w:ascii="Times New Roman" w:hAnsi="Times New Roman" w:cs="Times New Roman"/>
+        </w:rPr>
+        <w:t xml:space="preserve"> dua </w:t>
+      </w:r>
+      <w:proofErr w:type="spellStart"/>
+      <w:r>
+        <w:rPr>
+          <w:rFonts w:ascii="Times New Roman" w:hAnsi="Times New Roman" w:cs="Times New Roman"/>
+        </w:rPr>
+        <w:t>kategori</w:t>
+      </w:r>
+      <w:proofErr w:type="spellEnd"/>
+      <w:r>
+        <w:rPr>
+          <w:rFonts w:ascii="Times New Roman" w:hAnsi="Times New Roman" w:cs="Times New Roman"/>
+        </w:rPr>
+        <w:t xml:space="preserve"> Adventure </w:t>
+      </w:r>
+      <w:proofErr w:type="spellStart"/>
+      <w:r>
+        <w:rPr>
+          <w:rFonts w:ascii="Times New Roman" w:hAnsi="Times New Roman" w:cs="Times New Roman"/>
+        </w:rPr>
+        <w:t>dengan</w:t>
+      </w:r>
+      <w:proofErr w:type="spellEnd"/>
+      <w:r>
+        <w:rPr>
+          <w:rFonts w:ascii="Times New Roman" w:hAnsi="Times New Roman" w:cs="Times New Roman"/>
+        </w:rPr>
+        <w:t xml:space="preserve"> URL yang </w:t>
+      </w:r>
+      <w:proofErr w:type="spellStart"/>
+      <w:r>
+        <w:rPr>
+          <w:rFonts w:ascii="Times New Roman" w:hAnsi="Times New Roman" w:cs="Times New Roman"/>
+        </w:rPr>
+        <w:t>sama</w:t>
+      </w:r>
+      <w:proofErr w:type="spellEnd"/>
+      <w:r>
+        <w:rPr>
+          <w:rFonts w:ascii="Times New Roman" w:hAnsi="Times New Roman" w:cs="Times New Roman"/>
+        </w:rPr>
+        <w:t>).</w:t>
+      </w:r>
+    </w:p>
+    <w:p>
+      <w:pPr>
+        <w:contextualSpacing/>
+        <w:jc w:val="both"/>
+        <w:rPr>
+          <w:rFonts w:ascii="Times New Roman" w:hAnsi="Times New Roman" w:cs="Times New Roman"/>
+        </w:rPr>
+      </w:pPr>
+      <w:r>
+        <w:rPr>
+          <w:rFonts w:ascii="Times New Roman" w:hAnsi="Times New Roman" w:cs="Times New Roman"/>
+        </w:rPr>
+        <w:t xml:space="preserve">5. </w:t>
+      </w:r>
+      <w:r>
+        <w:rPr>
+          <w:rFonts w:ascii="Times New Roman" w:hAnsi="Times New Roman" w:cs="Times New Roman"/>
+        </w:rPr>
+        <w:t xml:space="preserve"> </w:t>
+      </w:r>
+      <w:proofErr w:type="spellStart"/>
+      <w:r>
+        <w:rPr>
+          <w:rFonts w:ascii="Times New Roman" w:hAnsi="Times New Roman" w:cs="Times New Roman"/>
+        </w:rPr>
+        <w:t>Efisiensi</w:t>
+      </w:r>
+      <w:proofErr w:type="spellEnd"/>
+      <w:r>
+        <w:rPr>
+          <w:rFonts w:ascii="Times New Roman" w:hAnsi="Times New Roman" w:cs="Times New Roman"/>
+        </w:rPr>
+        <w:t xml:space="preserve"> </w:t>
+      </w:r>
+      <w:proofErr w:type="spellStart"/>
+      <w:r>
+        <w:rPr>
+          <w:rFonts w:ascii="Times New Roman" w:hAnsi="Times New Roman" w:cs="Times New Roman"/>
+        </w:rPr>
+        <w:t>Pengembangan</w:t>
+      </w:r>
+      <w:proofErr w:type="spellEnd"/>
+      <w:r>
+        <w:rPr>
+          <w:rFonts w:ascii="Times New Roman" w:hAnsi="Times New Roman" w:cs="Times New Roman"/>
+        </w:rPr>
+        <w:t xml:space="preserve"> (Prisma Service)</w:t>
+      </w:r>
+    </w:p>
+    <w:p>
+      <w:pPr>
+        <w:ind w:left="284"/>
+        <w:contextualSpacing/>
+        <w:jc w:val="both"/>
+        <w:rPr>
+          <w:rFonts w:ascii="Times New Roman" w:hAnsi="Times New Roman" w:cs="Times New Roman"/>
+        </w:rPr>
+      </w:pPr>
+      <w:proofErr w:type="spellStart"/>
+      <w:r>
+        <w:rPr>
+          <w:rFonts w:ascii="Times New Roman" w:hAnsi="Times New Roman" w:cs="Times New Roman"/>
+        </w:rPr>
+        <w:t>Dengan</w:t>
+      </w:r>
+      <w:proofErr w:type="spellEnd"/>
+      <w:r>
+        <w:rPr>
+          <w:rFonts w:ascii="Times New Roman" w:hAnsi="Times New Roman" w:cs="Times New Roman"/>
+        </w:rPr>
+        <w:t> </w:t>
+      </w:r>
+      <w:proofErr w:type="spellStart"/>
+      <w:r>
+        <w:rPr>
+          <w:rFonts w:ascii="Times New Roman" w:hAnsi="Times New Roman" w:cs="Times New Roman"/>
+        </w:rPr>
+        <w:t>PrismaService</w:t>
+      </w:r>
+      <w:proofErr w:type="spellEnd"/>
+      <w:r>
+        <w:rPr>
+          <w:rFonts w:ascii="Times New Roman" w:hAnsi="Times New Roman" w:cs="Times New Roman"/>
+        </w:rPr>
+        <w:t xml:space="preserve">, </w:t>
+      </w:r>
+      <w:proofErr w:type="spellStart"/>
+      <w:r>
+        <w:rPr>
+          <w:rFonts w:ascii="Times New Roman" w:hAnsi="Times New Roman" w:cs="Times New Roman"/>
+        </w:rPr>
+        <w:t>tidak</w:t>
+      </w:r>
+      <w:proofErr w:type="spellEnd"/>
+      <w:r>
+        <w:rPr>
+          <w:rFonts w:ascii="Times New Roman" w:hAnsi="Times New Roman" w:cs="Times New Roman"/>
+        </w:rPr>
+        <w:t xml:space="preserve"> </w:t>
+      </w:r>
+      <w:proofErr w:type="spellStart"/>
+      <w:r>
+        <w:rPr>
+          <w:rFonts w:ascii="Times New Roman" w:hAnsi="Times New Roman" w:cs="Times New Roman"/>
+        </w:rPr>
+        <w:t>perlu</w:t>
+      </w:r>
+      <w:proofErr w:type="spellEnd"/>
+      <w:r>
+        <w:rPr>
+          <w:rFonts w:ascii="Times New Roman" w:hAnsi="Times New Roman" w:cs="Times New Roman"/>
+        </w:rPr>
+        <w:t xml:space="preserve"> </w:t>
+      </w:r>
+      <w:proofErr w:type="spellStart"/>
+      <w:r>
+        <w:rPr>
+          <w:rFonts w:ascii="Times New Roman" w:hAnsi="Times New Roman" w:cs="Times New Roman"/>
+        </w:rPr>
+        <w:t>menulis</w:t>
+      </w:r>
+      <w:proofErr w:type="spellEnd"/>
+      <w:r>
+        <w:rPr>
+          <w:rFonts w:ascii="Times New Roman" w:hAnsi="Times New Roman" w:cs="Times New Roman"/>
+        </w:rPr>
+        <w:t xml:space="preserve"> </w:t>
+      </w:r>
+      <w:proofErr w:type="spellStart"/>
+      <w:r>
+        <w:rPr>
+          <w:rFonts w:ascii="Times New Roman" w:hAnsi="Times New Roman" w:cs="Times New Roman"/>
+        </w:rPr>
+        <w:t>perintah</w:t>
+      </w:r>
+      <w:proofErr w:type="spellEnd"/>
+      <w:r>
+        <w:rPr>
+          <w:rFonts w:ascii="Times New Roman" w:hAnsi="Times New Roman" w:cs="Times New Roman"/>
+        </w:rPr>
+        <w:t xml:space="preserve"> SQL manual (SELECT * FROM...) yang </w:t>
+      </w:r>
+      <w:proofErr w:type="spellStart"/>
+      <w:r>
+        <w:rPr>
+          <w:rFonts w:ascii="Times New Roman" w:hAnsi="Times New Roman" w:cs="Times New Roman"/>
+        </w:rPr>
+        <w:t>rawan</w:t>
+      </w:r>
+      <w:proofErr w:type="spellEnd"/>
+      <w:r>
+        <w:rPr>
+          <w:rFonts w:ascii="Times New Roman" w:hAnsi="Times New Roman" w:cs="Times New Roman"/>
+        </w:rPr>
+        <w:t xml:space="preserve"> salah </w:t>
+      </w:r>
+      <w:proofErr w:type="spellStart"/>
+      <w:r>
+        <w:rPr>
+          <w:rFonts w:ascii="Times New Roman" w:hAnsi="Times New Roman" w:cs="Times New Roman"/>
+        </w:rPr>
+        <w:t>ketik</w:t>
+      </w:r>
+      <w:proofErr w:type="spellEnd"/>
+      <w:r>
+        <w:rPr>
+          <w:rFonts w:ascii="Times New Roman" w:hAnsi="Times New Roman" w:cs="Times New Roman"/>
+        </w:rPr>
+        <w:t>.</w:t>
+      </w:r>
+    </w:p>
+    <w:p>
+      <w:pPr>
+        <w:numPr>
+          <w:ilvl w:val="0"/>
+          <w:numId w:val="30"/>
+        </w:numPr>
+        <w:contextualSpacing/>
+        <w:jc w:val="both"/>
+        <w:rPr>
+          <w:rFonts w:ascii="Times New Roman" w:hAnsi="Times New Roman" w:cs="Times New Roman"/>
+        </w:rPr>
+      </w:pPr>
+      <w:proofErr w:type="spellStart"/>
+      <w:r>
+        <w:rPr>
+          <w:rFonts w:ascii="Times New Roman" w:hAnsi="Times New Roman" w:cs="Times New Roman"/>
+        </w:rPr>
+        <w:t>Kegunaannya</w:t>
+      </w:r>
+      <w:proofErr w:type="spellEnd"/>
+      <w:r>
+        <w:rPr>
+          <w:rFonts w:ascii="Times New Roman" w:hAnsi="Times New Roman" w:cs="Times New Roman"/>
+        </w:rPr>
+        <w:t>: </w:t>
+      </w:r>
+      <w:proofErr w:type="spellStart"/>
+      <w:r>
+        <w:rPr>
+          <w:rFonts w:ascii="Times New Roman" w:hAnsi="Times New Roman" w:cs="Times New Roman"/>
+        </w:rPr>
+        <w:t>Mempercepat</w:t>
+      </w:r>
+      <w:proofErr w:type="spellEnd"/>
+      <w:r>
+        <w:rPr>
+          <w:rFonts w:ascii="Times New Roman" w:hAnsi="Times New Roman" w:cs="Times New Roman"/>
+        </w:rPr>
+        <w:t xml:space="preserve"> proses coding. Jika </w:t>
+      </w:r>
+      <w:proofErr w:type="spellStart"/>
+      <w:r>
+        <w:rPr>
+          <w:rFonts w:ascii="Times New Roman" w:hAnsi="Times New Roman" w:cs="Times New Roman"/>
+        </w:rPr>
+        <w:t>akan</w:t>
+      </w:r>
+      <w:proofErr w:type="spellEnd"/>
+      <w:r>
+        <w:rPr>
+          <w:rFonts w:ascii="Times New Roman" w:hAnsi="Times New Roman" w:cs="Times New Roman"/>
+        </w:rPr>
+        <w:t xml:space="preserve"> mengubah </w:t>
+      </w:r>
+      <w:proofErr w:type="spellStart"/>
+      <w:r>
+        <w:rPr>
+          <w:rFonts w:ascii="Times New Roman" w:hAnsi="Times New Roman" w:cs="Times New Roman"/>
+        </w:rPr>
+        <w:t>struktur</w:t>
+      </w:r>
+      <w:proofErr w:type="spellEnd"/>
+      <w:r>
+        <w:rPr>
+          <w:rFonts w:ascii="Times New Roman" w:hAnsi="Times New Roman" w:cs="Times New Roman"/>
+        </w:rPr>
+        <w:t xml:space="preserve"> database, Prisma </w:t>
+      </w:r>
+      <w:proofErr w:type="spellStart"/>
+      <w:r>
+        <w:rPr>
+          <w:rFonts w:ascii="Times New Roman" w:hAnsi="Times New Roman" w:cs="Times New Roman"/>
+        </w:rPr>
+        <w:t>akan</w:t>
+      </w:r>
+      <w:proofErr w:type="spellEnd"/>
+      <w:r>
+        <w:rPr>
+          <w:rFonts w:ascii="Times New Roman" w:hAnsi="Times New Roman" w:cs="Times New Roman"/>
+        </w:rPr>
+        <w:t xml:space="preserve"> </w:t>
+      </w:r>
+      <w:proofErr w:type="spellStart"/>
+      <w:r>
+        <w:rPr>
+          <w:rFonts w:ascii="Times New Roman" w:hAnsi="Times New Roman" w:cs="Times New Roman"/>
+        </w:rPr>
+        <w:t>langsung</w:t>
+      </w:r>
+      <w:proofErr w:type="spellEnd"/>
+      <w:r>
+        <w:rPr>
+          <w:rFonts w:ascii="Times New Roman" w:hAnsi="Times New Roman" w:cs="Times New Roman"/>
+        </w:rPr>
+        <w:t xml:space="preserve"> </w:t>
+      </w:r>
+      <w:proofErr w:type="spellStart"/>
+      <w:r>
+        <w:rPr>
+          <w:rFonts w:ascii="Times New Roman" w:hAnsi="Times New Roman" w:cs="Times New Roman"/>
+        </w:rPr>
+        <w:t>memberi</w:t>
+      </w:r>
+      <w:proofErr w:type="spellEnd"/>
+      <w:r>
+        <w:rPr>
+          <w:rFonts w:ascii="Times New Roman" w:hAnsi="Times New Roman" w:cs="Times New Roman"/>
+        </w:rPr>
+        <w:t xml:space="preserve"> </w:t>
+      </w:r>
+      <w:proofErr w:type="spellStart"/>
+      <w:r>
+        <w:rPr>
+          <w:rFonts w:ascii="Times New Roman" w:hAnsi="Times New Roman" w:cs="Times New Roman"/>
+        </w:rPr>
+        <w:t>tahu</w:t>
+      </w:r>
+      <w:proofErr w:type="spellEnd"/>
+      <w:r>
+        <w:rPr>
+          <w:rFonts w:ascii="Times New Roman" w:hAnsi="Times New Roman" w:cs="Times New Roman"/>
+        </w:rPr>
+        <w:t xml:space="preserve"> di </w:t>
+      </w:r>
+      <w:proofErr w:type="spellStart"/>
+      <w:r>
+        <w:rPr>
+          <w:rFonts w:ascii="Times New Roman" w:hAnsi="Times New Roman" w:cs="Times New Roman"/>
+        </w:rPr>
+        <w:t>bagian</w:t>
+      </w:r>
+      <w:proofErr w:type="spellEnd"/>
+      <w:r>
+        <w:rPr>
+          <w:rFonts w:ascii="Times New Roman" w:hAnsi="Times New Roman" w:cs="Times New Roman"/>
+        </w:rPr>
+        <w:t xml:space="preserve"> mana coding yang haru</w:t>
+      </w:r>
+      <w:proofErr w:type="spellStart"/>
+      <w:r>
+        <w:rPr>
+          <w:rFonts w:ascii="Times New Roman" w:hAnsi="Times New Roman" w:cs="Times New Roman"/>
+        </w:rPr>
+        <w:t>s</w:t>
+      </w:r>
+      <w:proofErr w:type="spellEnd"/>
+      <w:r>
+        <w:rPr>
+          <w:rFonts w:ascii="Times New Roman" w:hAnsi="Times New Roman" w:cs="Times New Roman"/>
+        </w:rPr>
+        <w:t xml:space="preserve"> </w:t>
+      </w:r>
+      <w:proofErr w:type="spellStart"/>
+      <w:r>
+        <w:rPr>
+          <w:rFonts w:ascii="Times New Roman" w:hAnsi="Times New Roman" w:cs="Times New Roman"/>
+        </w:rPr>
+        <w:t>diperbaiki</w:t>
+      </w:r>
+      <w:proofErr w:type="spellEnd"/>
+      <w:r>
+        <w:rPr>
+          <w:rFonts w:ascii="Times New Roman" w:hAnsi="Times New Roman" w:cs="Times New Roman"/>
+        </w:rPr>
+        <w:t>.</w:t>
+      </w:r>
+    </w:p>
+    <w:p>
+      <w:pPr>
+        <w:jc w:val="both"/>
+        <w:rPr>
+          <w:rFonts w:ascii="Times New Roman" w:hAnsi="Times New Roman" w:cs="Times New Roman"/>
+          <w:lang w:val="en-GB"/>
+        </w:rPr>
+      </w:pPr>
+      <w:r>
+        <w:rPr>
+          <w:rFonts w:ascii="Times New Roman" w:hAnsi="Times New Roman" w:cs="Times New Roman"/>
+          <w:lang w:val="en-GB"/>
+        </w:rPr>
+        <w:lastRenderedPageBreak/>
+        <w:t xml:space="preserve">35. </w:t>
       </w:r>
     </w:p>
     <w:sectPr>
@@ -34308,6 +36951,155 @@
     </w:lvl>
   </w:abstractNum>
   <w:abstractNum w:abstractNumId="16" w15:restartNumberingAfterBreak="0">
+    <w:nsid w:val="5E8D1190"/>
+    <w:multiLevelType w:val="multilevel"/>
+    <w:tmpl w:val="EE62D8DC"/>
+    <w:lvl w:ilvl="0">
+      <w:start w:val="1"/>
+      <w:numFmt w:val="bullet"/>
+      <w:lvlText w:val=""/>
+      <w:lvlJc w:val="left"/>
+      <w:pPr>
+        <w:tabs>
+          <w:tab w:val="num" w:pos="720"/>
+        </w:tabs>
+        <w:ind w:left="720" w:hanging="360"/>
+      </w:pPr>
+      <w:rPr>
+        <w:rFonts w:ascii="Symbol" w:hAnsi="Symbol" w:hint="default"/>
+        <w:sz w:val="20"/>
+      </w:rPr>
+    </w:lvl>
+    <w:lvl w:ilvl="1" w:tentative="1">
+      <w:start w:val="1"/>
+      <w:numFmt w:val="bullet"/>
+      <w:lvlText w:val="o"/>
+      <w:lvlJc w:val="left"/>
+      <w:pPr>
+        <w:tabs>
+          <w:tab w:val="num" w:pos="1440"/>
+        </w:tabs>
+        <w:ind w:left="1440" w:hanging="360"/>
+      </w:pPr>
+      <w:rPr>
+        <w:rFonts w:ascii="Courier New" w:hAnsi="Courier New" w:hint="default"/>
+        <w:sz w:val="20"/>
+      </w:rPr>
+    </w:lvl>
+    <w:lvl w:ilvl="2" w:tentative="1">
+      <w:start w:val="1"/>
+      <w:numFmt w:val="bullet"/>
+      <w:lvlText w:val=""/>
+      <w:lvlJc w:val="left"/>
+      <w:pPr>
+        <w:tabs>
+          <w:tab w:val="num" w:pos="2160"/>
+        </w:tabs>
+        <w:ind w:left="2160" w:hanging="360"/>
+      </w:pPr>
+      <w:rPr>
+        <w:rFonts w:ascii="Wingdings" w:hAnsi="Wingdings" w:hint="default"/>
+        <w:sz w:val="20"/>
+      </w:rPr>
+    </w:lvl>
+    <w:lvl w:ilvl="3" w:tentative="1">
+      <w:start w:val="1"/>
+      <w:numFmt w:val="bullet"/>
+      <w:lvlText w:val=""/>
+      <w:lvlJc w:val="left"/>
+      <w:pPr>
+        <w:tabs>
+          <w:tab w:val="num" w:pos="2880"/>
+        </w:tabs>
+        <w:ind w:left="2880" w:hanging="360"/>
+      </w:pPr>
+      <w:rPr>
+        <w:rFonts w:ascii="Wingdings" w:hAnsi="Wingdings" w:hint="default"/>
+        <w:sz w:val="20"/>
+      </w:rPr>
+    </w:lvl>
+    <w:lvl w:ilvl="4" w:tentative="1">
+      <w:start w:val="1"/>
+      <w:numFmt w:val="bullet"/>
+      <w:lvlText w:val=""/>
+      <w:lvlJc w:val="left"/>
+      <w:pPr>
+        <w:tabs>
+          <w:tab w:val="num" w:pos="3600"/>
+        </w:tabs>
+        <w:ind w:left="3600" w:hanging="360"/>
+      </w:pPr>
+      <w:rPr>
+        <w:rFonts w:ascii="Wingdings" w:hAnsi="Wingdings" w:hint="default"/>
+        <w:sz w:val="20"/>
+      </w:rPr>
+    </w:lvl>
+    <w:lvl w:ilvl="5" w:tentative="1">
+      <w:start w:val="1"/>
+      <w:numFmt w:val="bullet"/>
+      <w:lvlText w:val=""/>
+      <w:lvlJc w:val="left"/>
+      <w:pPr>
+        <w:tabs>
+          <w:tab w:val="num" w:pos="4320"/>
+        </w:tabs>
+        <w:ind w:left="4320" w:hanging="360"/>
+      </w:pPr>
+      <w:rPr>
+        <w:rFonts w:ascii="Wingdings" w:hAnsi="Wingdings" w:hint="default"/>
+        <w:sz w:val="20"/>
+      </w:rPr>
+    </w:lvl>
+    <w:lvl w:ilvl="6" w:tentative="1">
+      <w:start w:val="1"/>
+      <w:numFmt w:val="bullet"/>
+      <w:lvlText w:val=""/>
+      <w:lvlJc w:val="left"/>
+      <w:pPr>
+        <w:tabs>
+          <w:tab w:val="num" w:pos="5040"/>
+        </w:tabs>
+        <w:ind w:left="5040" w:hanging="360"/>
+      </w:pPr>
+      <w:rPr>
+        <w:rFonts w:ascii="Wingdings" w:hAnsi="Wingdings" w:hint="default"/>
+        <w:sz w:val="20"/>
+      </w:rPr>
+    </w:lvl>
+    <w:lvl w:ilvl="7" w:tentative="1">
+      <w:start w:val="1"/>
+      <w:numFmt w:val="bullet"/>
+      <w:lvlText w:val=""/>
+      <w:lvlJc w:val="left"/>
+      <w:pPr>
+        <w:tabs>
+          <w:tab w:val="num" w:pos="5760"/>
+        </w:tabs>
+        <w:ind w:left="5760" w:hanging="360"/>
+      </w:pPr>
+      <w:rPr>
+        <w:rFonts w:ascii="Wingdings" w:hAnsi="Wingdings" w:hint="default"/>
+        <w:sz w:val="20"/>
+      </w:rPr>
+    </w:lvl>
+    <w:lvl w:ilvl="8" w:tentative="1">
+      <w:start w:val="1"/>
+      <w:numFmt w:val="bullet"/>
+      <w:lvlText w:val=""/>
+      <w:lvlJc w:val="left"/>
+      <w:pPr>
+        <w:tabs>
+          <w:tab w:val="num" w:pos="6480"/>
+        </w:tabs>
+        <w:ind w:left="6480" w:hanging="360"/>
+      </w:pPr>
+      <w:rPr>
+        <w:rFonts w:ascii="Wingdings" w:hAnsi="Wingdings" w:hint="default"/>
+        <w:sz w:val="20"/>
+      </w:rPr>
+    </w:lvl>
+  </w:abstractNum>
+  <w:abstractNum w:abstractNumId="17" w15:restartNumberingAfterBreak="0">
     <w:nsid w:val="5F5E67A4"/>
     <w:multiLevelType w:val="hybridMultilevel"/>
     <w:tmpl w:val="A15E462E"/>
@@ -34420,7 +37212,7 @@
       </w:rPr>
     </w:lvl>
   </w:abstractNum>
-  <w:abstractNum w:abstractNumId="17" w15:restartNumberingAfterBreak="0">
+  <w:abstractNum w:abstractNumId="18" w15:restartNumberingAfterBreak="0">
     <w:nsid w:val="64A022BC"/>
     <w:multiLevelType w:val="hybridMultilevel"/>
     <w:tmpl w:val="7466E2BA"/>
@@ -34533,7 +37325,7 @@
       </w:rPr>
     </w:lvl>
   </w:abstractNum>
-  <w:abstractNum w:abstractNumId="18" w15:restartNumberingAfterBreak="0">
+  <w:abstractNum w:abstractNumId="19" w15:restartNumberingAfterBreak="0">
     <w:nsid w:val="66174883"/>
     <w:multiLevelType w:val="hybridMultilevel"/>
     <w:tmpl w:val="893AFE4A"/>
@@ -34646,7 +37438,7 @@
       </w:rPr>
     </w:lvl>
   </w:abstractNum>
-  <w:abstractNum w:abstractNumId="19" w15:restartNumberingAfterBreak="0">
+  <w:abstractNum w:abstractNumId="20" w15:restartNumberingAfterBreak="0">
     <w:nsid w:val="673C435B"/>
     <w:multiLevelType w:val="hybridMultilevel"/>
     <w:tmpl w:val="846CCAA0"/>
@@ -34759,7 +37551,7 @@
       </w:rPr>
     </w:lvl>
   </w:abstractNum>
-  <w:abstractNum w:abstractNumId="20" w15:restartNumberingAfterBreak="0">
+  <w:abstractNum w:abstractNumId="21" w15:restartNumberingAfterBreak="0">
     <w:nsid w:val="6940157E"/>
     <w:multiLevelType w:val="hybridMultilevel"/>
     <w:tmpl w:val="7BDC1468"/>
@@ -34872,7 +37664,156 @@
       </w:rPr>
     </w:lvl>
   </w:abstractNum>
-  <w:abstractNum w:abstractNumId="21" w15:restartNumberingAfterBreak="0">
+  <w:abstractNum w:abstractNumId="22" w15:restartNumberingAfterBreak="0">
+    <w:nsid w:val="69EC5285"/>
+    <w:multiLevelType w:val="multilevel"/>
+    <w:tmpl w:val="1FC06B40"/>
+    <w:lvl w:ilvl="0">
+      <w:start w:val="1"/>
+      <w:numFmt w:val="bullet"/>
+      <w:lvlText w:val=""/>
+      <w:lvlJc w:val="left"/>
+      <w:pPr>
+        <w:tabs>
+          <w:tab w:val="num" w:pos="720"/>
+        </w:tabs>
+        <w:ind w:left="720" w:hanging="360"/>
+      </w:pPr>
+      <w:rPr>
+        <w:rFonts w:ascii="Symbol" w:hAnsi="Symbol" w:hint="default"/>
+        <w:sz w:val="20"/>
+      </w:rPr>
+    </w:lvl>
+    <w:lvl w:ilvl="1" w:tentative="1">
+      <w:start w:val="1"/>
+      <w:numFmt w:val="bullet"/>
+      <w:lvlText w:val="o"/>
+      <w:lvlJc w:val="left"/>
+      <w:pPr>
+        <w:tabs>
+          <w:tab w:val="num" w:pos="1440"/>
+        </w:tabs>
+        <w:ind w:left="1440" w:hanging="360"/>
+      </w:pPr>
+      <w:rPr>
+        <w:rFonts w:ascii="Courier New" w:hAnsi="Courier New" w:hint="default"/>
+        <w:sz w:val="20"/>
+      </w:rPr>
+    </w:lvl>
+    <w:lvl w:ilvl="2" w:tentative="1">
+      <w:start w:val="1"/>
+      <w:numFmt w:val="bullet"/>
+      <w:lvlText w:val=""/>
+      <w:lvlJc w:val="left"/>
+      <w:pPr>
+        <w:tabs>
+          <w:tab w:val="num" w:pos="2160"/>
+        </w:tabs>
+        <w:ind w:left="2160" w:hanging="360"/>
+      </w:pPr>
+      <w:rPr>
+        <w:rFonts w:ascii="Wingdings" w:hAnsi="Wingdings" w:hint="default"/>
+        <w:sz w:val="20"/>
+      </w:rPr>
+    </w:lvl>
+    <w:lvl w:ilvl="3" w:tentative="1">
+      <w:start w:val="1"/>
+      <w:numFmt w:val="bullet"/>
+      <w:lvlText w:val=""/>
+      <w:lvlJc w:val="left"/>
+      <w:pPr>
+        <w:tabs>
+          <w:tab w:val="num" w:pos="2880"/>
+        </w:tabs>
+        <w:ind w:left="2880" w:hanging="360"/>
+      </w:pPr>
+      <w:rPr>
+        <w:rFonts w:ascii="Wingdings" w:hAnsi="Wingdings" w:hint="default"/>
+        <w:sz w:val="20"/>
+      </w:rPr>
+    </w:lvl>
+    <w:lvl w:ilvl="4" w:tentative="1">
+      <w:start w:val="1"/>
+      <w:numFmt w:val="bullet"/>
+      <w:lvlText w:val=""/>
+      <w:lvlJc w:val="left"/>
+      <w:pPr>
+        <w:tabs>
+          <w:tab w:val="num" w:pos="3600"/>
+        </w:tabs>
+        <w:ind w:left="3600" w:hanging="360"/>
+      </w:pPr>
+      <w:rPr>
+        <w:rFonts w:ascii="Wingdings" w:hAnsi="Wingdings" w:hint="default"/>
+        <w:sz w:val="20"/>
+      </w:rPr>
+    </w:lvl>
+    <w:lvl w:ilvl="5" w:tentative="1">
+      <w:start w:val="1"/>
+      <w:numFmt w:val="bullet"/>
+      <w:lvlText w:val=""/>
+      <w:lvlJc w:val="left"/>
+      <w:pPr>
+        <w:tabs>
+          <w:tab w:val="num" w:pos="4320"/>
+        </w:tabs>
+        <w:ind w:left="4320" w:hanging="360"/>
+      </w:pPr>
+      <w:rPr>
+        <w:rFonts w:ascii="Wingdings" w:hAnsi="Wingdings" w:hint="default"/>
+        <w:sz w:val="20"/>
+      </w:rPr>
+    </w:lvl>
+    <w:lvl w:ilvl="6" w:tentative="1">
+      <w:start w:val="1"/>
+      <w:numFmt w:val="bullet"/>
+      <w:lvlText w:val=""/>
+      <w:lvlJc w:val="left"/>
+      <w:pPr>
+        <w:tabs>
+          <w:tab w:val="num" w:pos="5040"/>
+        </w:tabs>
+        <w:ind w:left="5040" w:hanging="360"/>
+      </w:pPr>
+      <w:rPr>
+        <w:rFonts w:ascii="Wingdings" w:hAnsi="Wingdings" w:hint="default"/>
+        <w:sz w:val="20"/>
+      </w:rPr>
+    </w:lvl>
+    <w:lvl w:ilvl="7" w:tentative="1">
+      <w:start w:val="1"/>
+      <w:numFmt w:val="bullet"/>
+      <w:lvlText w:val=""/>
+      <w:lvlJc w:val="left"/>
+      <w:pPr>
+        <w:tabs>
+          <w:tab w:val="num" w:pos="5760"/>
+        </w:tabs>
+        <w:ind w:left="5760" w:hanging="360"/>
+      </w:pPr>
+      <w:rPr>
+        <w:rFonts w:ascii="Wingdings" w:hAnsi="Wingdings" w:hint="default"/>
+        <w:sz w:val="20"/>
+      </w:rPr>
+    </w:lvl>
+    <w:lvl w:ilvl="8" w:tentative="1">
+      <w:start w:val="1"/>
+      <w:numFmt w:val="bullet"/>
+      <w:lvlText w:val=""/>
+      <w:lvlJc w:val="left"/>
+      <w:pPr>
+        <w:tabs>
+          <w:tab w:val="num" w:pos="6480"/>
+        </w:tabs>
+        <w:ind w:left="6480" w:hanging="360"/>
+      </w:pPr>
+      <w:rPr>
+        <w:rFonts w:ascii="Wingdings" w:hAnsi="Wingdings" w:hint="default"/>
+        <w:sz w:val="20"/>
+      </w:rPr>
+    </w:lvl>
+  </w:abstractNum>
+  <w:abstractNum w:abstractNumId="23" w15:restartNumberingAfterBreak="0">
     <w:nsid w:val="6CA82C32"/>
     <w:multiLevelType w:val="hybridMultilevel"/>
     <w:tmpl w:val="70B2C61C"/>
@@ -34984,7 +37925,156 @@
       </w:rPr>
     </w:lvl>
   </w:abstractNum>
-  <w:abstractNum w:abstractNumId="22" w15:restartNumberingAfterBreak="0">
+  <w:abstractNum w:abstractNumId="24" w15:restartNumberingAfterBreak="0">
+    <w:nsid w:val="70B34734"/>
+    <w:multiLevelType w:val="multilevel"/>
+    <w:tmpl w:val="B0CAE31A"/>
+    <w:lvl w:ilvl="0">
+      <w:start w:val="1"/>
+      <w:numFmt w:val="bullet"/>
+      <w:lvlText w:val=""/>
+      <w:lvlJc w:val="left"/>
+      <w:pPr>
+        <w:tabs>
+          <w:tab w:val="num" w:pos="2160"/>
+        </w:tabs>
+        <w:ind w:left="2160" w:hanging="360"/>
+      </w:pPr>
+      <w:rPr>
+        <w:rFonts w:ascii="Symbol" w:hAnsi="Symbol" w:hint="default"/>
+        <w:sz w:val="20"/>
+      </w:rPr>
+    </w:lvl>
+    <w:lvl w:ilvl="1" w:tentative="1">
+      <w:start w:val="1"/>
+      <w:numFmt w:val="bullet"/>
+      <w:lvlText w:val="o"/>
+      <w:lvlJc w:val="left"/>
+      <w:pPr>
+        <w:tabs>
+          <w:tab w:val="num" w:pos="2880"/>
+        </w:tabs>
+        <w:ind w:left="2880" w:hanging="360"/>
+      </w:pPr>
+      <w:rPr>
+        <w:rFonts w:ascii="Courier New" w:hAnsi="Courier New" w:hint="default"/>
+        <w:sz w:val="20"/>
+      </w:rPr>
+    </w:lvl>
+    <w:lvl w:ilvl="2" w:tentative="1">
+      <w:start w:val="1"/>
+      <w:numFmt w:val="bullet"/>
+      <w:lvlText w:val=""/>
+      <w:lvlJc w:val="left"/>
+      <w:pPr>
+        <w:tabs>
+          <w:tab w:val="num" w:pos="3600"/>
+        </w:tabs>
+        <w:ind w:left="3600" w:hanging="360"/>
+      </w:pPr>
+      <w:rPr>
+        <w:rFonts w:ascii="Wingdings" w:hAnsi="Wingdings" w:hint="default"/>
+        <w:sz w:val="20"/>
+      </w:rPr>
+    </w:lvl>
+    <w:lvl w:ilvl="3" w:tentative="1">
+      <w:start w:val="1"/>
+      <w:numFmt w:val="bullet"/>
+      <w:lvlText w:val=""/>
+      <w:lvlJc w:val="left"/>
+      <w:pPr>
+        <w:tabs>
+          <w:tab w:val="num" w:pos="4320"/>
+        </w:tabs>
+        <w:ind w:left="4320" w:hanging="360"/>
+      </w:pPr>
+      <w:rPr>
+        <w:rFonts w:ascii="Wingdings" w:hAnsi="Wingdings" w:hint="default"/>
+        <w:sz w:val="20"/>
+      </w:rPr>
+    </w:lvl>
+    <w:lvl w:ilvl="4" w:tentative="1">
+      <w:start w:val="1"/>
+      <w:numFmt w:val="bullet"/>
+      <w:lvlText w:val=""/>
+      <w:lvlJc w:val="left"/>
+      <w:pPr>
+        <w:tabs>
+          <w:tab w:val="num" w:pos="5040"/>
+        </w:tabs>
+        <w:ind w:left="5040" w:hanging="360"/>
+      </w:pPr>
+      <w:rPr>
+        <w:rFonts w:ascii="Wingdings" w:hAnsi="Wingdings" w:hint="default"/>
+        <w:sz w:val="20"/>
+      </w:rPr>
+    </w:lvl>
+    <w:lvl w:ilvl="5" w:tentative="1">
+      <w:start w:val="1"/>
+      <w:numFmt w:val="bullet"/>
+      <w:lvlText w:val=""/>
+      <w:lvlJc w:val="left"/>
+      <w:pPr>
+        <w:tabs>
+          <w:tab w:val="num" w:pos="5760"/>
+        </w:tabs>
+        <w:ind w:left="5760" w:hanging="360"/>
+      </w:pPr>
+      <w:rPr>
+        <w:rFonts w:ascii="Wingdings" w:hAnsi="Wingdings" w:hint="default"/>
+        <w:sz w:val="20"/>
+      </w:rPr>
+    </w:lvl>
+    <w:lvl w:ilvl="6" w:tentative="1">
+      <w:start w:val="1"/>
+      <w:numFmt w:val="bullet"/>
+      <w:lvlText w:val=""/>
+      <w:lvlJc w:val="left"/>
+      <w:pPr>
+        <w:tabs>
+          <w:tab w:val="num" w:pos="6480"/>
+        </w:tabs>
+        <w:ind w:left="6480" w:hanging="360"/>
+      </w:pPr>
+      <w:rPr>
+        <w:rFonts w:ascii="Wingdings" w:hAnsi="Wingdings" w:hint="default"/>
+        <w:sz w:val="20"/>
+      </w:rPr>
+    </w:lvl>
+    <w:lvl w:ilvl="7" w:tentative="1">
+      <w:start w:val="1"/>
+      <w:numFmt w:val="bullet"/>
+      <w:lvlText w:val=""/>
+      <w:lvlJc w:val="left"/>
+      <w:pPr>
+        <w:tabs>
+          <w:tab w:val="num" w:pos="7200"/>
+        </w:tabs>
+        <w:ind w:left="7200" w:hanging="360"/>
+      </w:pPr>
+      <w:rPr>
+        <w:rFonts w:ascii="Wingdings" w:hAnsi="Wingdings" w:hint="default"/>
+        <w:sz w:val="20"/>
+      </w:rPr>
+    </w:lvl>
+    <w:lvl w:ilvl="8" w:tentative="1">
+      <w:start w:val="1"/>
+      <w:numFmt w:val="bullet"/>
+      <w:lvlText w:val=""/>
+      <w:lvlJc w:val="left"/>
+      <w:pPr>
+        <w:tabs>
+          <w:tab w:val="num" w:pos="7920"/>
+        </w:tabs>
+        <w:ind w:left="7920" w:hanging="360"/>
+      </w:pPr>
+      <w:rPr>
+        <w:rFonts w:ascii="Wingdings" w:hAnsi="Wingdings" w:hint="default"/>
+        <w:sz w:val="20"/>
+      </w:rPr>
+    </w:lvl>
+  </w:abstractNum>
+  <w:abstractNum w:abstractNumId="25" w15:restartNumberingAfterBreak="0">
     <w:nsid w:val="70DA279A"/>
     <w:multiLevelType w:val="hybridMultilevel"/>
     <w:tmpl w:val="D42C1A14"/>
@@ -35097,7 +38187,7 @@
       </w:rPr>
     </w:lvl>
   </w:abstractNum>
-  <w:abstractNum w:abstractNumId="23" w15:restartNumberingAfterBreak="0">
+  <w:abstractNum w:abstractNumId="26" w15:restartNumberingAfterBreak="0">
     <w:nsid w:val="737805E1"/>
     <w:multiLevelType w:val="hybridMultilevel"/>
     <w:tmpl w:val="8DF2E322"/>
@@ -35210,7 +38300,7 @@
       </w:rPr>
     </w:lvl>
   </w:abstractNum>
-  <w:abstractNum w:abstractNumId="24" w15:restartNumberingAfterBreak="0">
+  <w:abstractNum w:abstractNumId="27" w15:restartNumberingAfterBreak="0">
     <w:nsid w:val="77500013"/>
     <w:multiLevelType w:val="hybridMultilevel"/>
     <w:tmpl w:val="FF669F16"/>
@@ -35323,17 +38413,315 @@
       </w:rPr>
     </w:lvl>
   </w:abstractNum>
+  <w:abstractNum w:abstractNumId="28" w15:restartNumberingAfterBreak="0">
+    <w:nsid w:val="791E40D9"/>
+    <w:multiLevelType w:val="multilevel"/>
+    <w:tmpl w:val="2E167C90"/>
+    <w:lvl w:ilvl="0">
+      <w:start w:val="1"/>
+      <w:numFmt w:val="bullet"/>
+      <w:lvlText w:val=""/>
+      <w:lvlJc w:val="left"/>
+      <w:pPr>
+        <w:tabs>
+          <w:tab w:val="num" w:pos="720"/>
+        </w:tabs>
+        <w:ind w:left="720" w:hanging="360"/>
+      </w:pPr>
+      <w:rPr>
+        <w:rFonts w:ascii="Symbol" w:hAnsi="Symbol" w:hint="default"/>
+        <w:sz w:val="20"/>
+      </w:rPr>
+    </w:lvl>
+    <w:lvl w:ilvl="1" w:tentative="1">
+      <w:start w:val="1"/>
+      <w:numFmt w:val="bullet"/>
+      <w:lvlText w:val="o"/>
+      <w:lvlJc w:val="left"/>
+      <w:pPr>
+        <w:tabs>
+          <w:tab w:val="num" w:pos="1440"/>
+        </w:tabs>
+        <w:ind w:left="1440" w:hanging="360"/>
+      </w:pPr>
+      <w:rPr>
+        <w:rFonts w:ascii="Courier New" w:hAnsi="Courier New" w:hint="default"/>
+        <w:sz w:val="20"/>
+      </w:rPr>
+    </w:lvl>
+    <w:lvl w:ilvl="2" w:tentative="1">
+      <w:start w:val="1"/>
+      <w:numFmt w:val="bullet"/>
+      <w:lvlText w:val=""/>
+      <w:lvlJc w:val="left"/>
+      <w:pPr>
+        <w:tabs>
+          <w:tab w:val="num" w:pos="2160"/>
+        </w:tabs>
+        <w:ind w:left="2160" w:hanging="360"/>
+      </w:pPr>
+      <w:rPr>
+        <w:rFonts w:ascii="Wingdings" w:hAnsi="Wingdings" w:hint="default"/>
+        <w:sz w:val="20"/>
+      </w:rPr>
+    </w:lvl>
+    <w:lvl w:ilvl="3" w:tentative="1">
+      <w:start w:val="1"/>
+      <w:numFmt w:val="bullet"/>
+      <w:lvlText w:val=""/>
+      <w:lvlJc w:val="left"/>
+      <w:pPr>
+        <w:tabs>
+          <w:tab w:val="num" w:pos="2880"/>
+        </w:tabs>
+        <w:ind w:left="2880" w:hanging="360"/>
+      </w:pPr>
+      <w:rPr>
+        <w:rFonts w:ascii="Wingdings" w:hAnsi="Wingdings" w:hint="default"/>
+        <w:sz w:val="20"/>
+      </w:rPr>
+    </w:lvl>
+    <w:lvl w:ilvl="4" w:tentative="1">
+      <w:start w:val="1"/>
+      <w:numFmt w:val="bullet"/>
+      <w:lvlText w:val=""/>
+      <w:lvlJc w:val="left"/>
+      <w:pPr>
+        <w:tabs>
+          <w:tab w:val="num" w:pos="3600"/>
+        </w:tabs>
+        <w:ind w:left="3600" w:hanging="360"/>
+      </w:pPr>
+      <w:rPr>
+        <w:rFonts w:ascii="Wingdings" w:hAnsi="Wingdings" w:hint="default"/>
+        <w:sz w:val="20"/>
+      </w:rPr>
+    </w:lvl>
+    <w:lvl w:ilvl="5" w:tentative="1">
+      <w:start w:val="1"/>
+      <w:numFmt w:val="bullet"/>
+      <w:lvlText w:val=""/>
+      <w:lvlJc w:val="left"/>
+      <w:pPr>
+        <w:tabs>
+          <w:tab w:val="num" w:pos="4320"/>
+        </w:tabs>
+        <w:ind w:left="4320" w:hanging="360"/>
+      </w:pPr>
+      <w:rPr>
+        <w:rFonts w:ascii="Wingdings" w:hAnsi="Wingdings" w:hint="default"/>
+        <w:sz w:val="20"/>
+      </w:rPr>
+    </w:lvl>
+    <w:lvl w:ilvl="6" w:tentative="1">
+      <w:start w:val="1"/>
+      <w:numFmt w:val="bullet"/>
+      <w:lvlText w:val=""/>
+      <w:lvlJc w:val="left"/>
+      <w:pPr>
+        <w:tabs>
+          <w:tab w:val="num" w:pos="5040"/>
+        </w:tabs>
+        <w:ind w:left="5040" w:hanging="360"/>
+      </w:pPr>
+      <w:rPr>
+        <w:rFonts w:ascii="Wingdings" w:hAnsi="Wingdings" w:hint="default"/>
+        <w:sz w:val="20"/>
+      </w:rPr>
+    </w:lvl>
+    <w:lvl w:ilvl="7" w:tentative="1">
+      <w:start w:val="1"/>
+      <w:numFmt w:val="bullet"/>
+      <w:lvlText w:val=""/>
+      <w:lvlJc w:val="left"/>
+      <w:pPr>
+        <w:tabs>
+          <w:tab w:val="num" w:pos="5760"/>
+        </w:tabs>
+        <w:ind w:left="5760" w:hanging="360"/>
+      </w:pPr>
+      <w:rPr>
+        <w:rFonts w:ascii="Wingdings" w:hAnsi="Wingdings" w:hint="default"/>
+        <w:sz w:val="20"/>
+      </w:rPr>
+    </w:lvl>
+    <w:lvl w:ilvl="8" w:tentative="1">
+      <w:start w:val="1"/>
+      <w:numFmt w:val="bullet"/>
+      <w:lvlText w:val=""/>
+      <w:lvlJc w:val="left"/>
+      <w:pPr>
+        <w:tabs>
+          <w:tab w:val="num" w:pos="6480"/>
+        </w:tabs>
+        <w:ind w:left="6480" w:hanging="360"/>
+      </w:pPr>
+      <w:rPr>
+        <w:rFonts w:ascii="Wingdings" w:hAnsi="Wingdings" w:hint="default"/>
+        <w:sz w:val="20"/>
+      </w:rPr>
+    </w:lvl>
+  </w:abstractNum>
+  <w:abstractNum w:abstractNumId="29" w15:restartNumberingAfterBreak="0">
+    <w:nsid w:val="792C5597"/>
+    <w:multiLevelType w:val="multilevel"/>
+    <w:tmpl w:val="AD448956"/>
+    <w:lvl w:ilvl="0">
+      <w:start w:val="1"/>
+      <w:numFmt w:val="bullet"/>
+      <w:lvlText w:val=""/>
+      <w:lvlJc w:val="left"/>
+      <w:pPr>
+        <w:tabs>
+          <w:tab w:val="num" w:pos="720"/>
+        </w:tabs>
+        <w:ind w:left="720" w:hanging="360"/>
+      </w:pPr>
+      <w:rPr>
+        <w:rFonts w:ascii="Symbol" w:hAnsi="Symbol" w:hint="default"/>
+        <w:sz w:val="20"/>
+      </w:rPr>
+    </w:lvl>
+    <w:lvl w:ilvl="1" w:tentative="1">
+      <w:start w:val="1"/>
+      <w:numFmt w:val="bullet"/>
+      <w:lvlText w:val="o"/>
+      <w:lvlJc w:val="left"/>
+      <w:pPr>
+        <w:tabs>
+          <w:tab w:val="num" w:pos="1440"/>
+        </w:tabs>
+        <w:ind w:left="1440" w:hanging="360"/>
+      </w:pPr>
+      <w:rPr>
+        <w:rFonts w:ascii="Courier New" w:hAnsi="Courier New" w:hint="default"/>
+        <w:sz w:val="20"/>
+      </w:rPr>
+    </w:lvl>
+    <w:lvl w:ilvl="2" w:tentative="1">
+      <w:start w:val="1"/>
+      <w:numFmt w:val="bullet"/>
+      <w:lvlText w:val=""/>
+      <w:lvlJc w:val="left"/>
+      <w:pPr>
+        <w:tabs>
+          <w:tab w:val="num" w:pos="2160"/>
+        </w:tabs>
+        <w:ind w:left="2160" w:hanging="360"/>
+      </w:pPr>
+      <w:rPr>
+        <w:rFonts w:ascii="Wingdings" w:hAnsi="Wingdings" w:hint="default"/>
+        <w:sz w:val="20"/>
+      </w:rPr>
+    </w:lvl>
+    <w:lvl w:ilvl="3" w:tentative="1">
+      <w:start w:val="1"/>
+      <w:numFmt w:val="bullet"/>
+      <w:lvlText w:val=""/>
+      <w:lvlJc w:val="left"/>
+      <w:pPr>
+        <w:tabs>
+          <w:tab w:val="num" w:pos="2880"/>
+        </w:tabs>
+        <w:ind w:left="2880" w:hanging="360"/>
+      </w:pPr>
+      <w:rPr>
+        <w:rFonts w:ascii="Wingdings" w:hAnsi="Wingdings" w:hint="default"/>
+        <w:sz w:val="20"/>
+      </w:rPr>
+    </w:lvl>
+    <w:lvl w:ilvl="4" w:tentative="1">
+      <w:start w:val="1"/>
+      <w:numFmt w:val="bullet"/>
+      <w:lvlText w:val=""/>
+      <w:lvlJc w:val="left"/>
+      <w:pPr>
+        <w:tabs>
+          <w:tab w:val="num" w:pos="3600"/>
+        </w:tabs>
+        <w:ind w:left="3600" w:hanging="360"/>
+      </w:pPr>
+      <w:rPr>
+        <w:rFonts w:ascii="Wingdings" w:hAnsi="Wingdings" w:hint="default"/>
+        <w:sz w:val="20"/>
+      </w:rPr>
+    </w:lvl>
+    <w:lvl w:ilvl="5" w:tentative="1">
+      <w:start w:val="1"/>
+      <w:numFmt w:val="bullet"/>
+      <w:lvlText w:val=""/>
+      <w:lvlJc w:val="left"/>
+      <w:pPr>
+        <w:tabs>
+          <w:tab w:val="num" w:pos="4320"/>
+        </w:tabs>
+        <w:ind w:left="4320" w:hanging="360"/>
+      </w:pPr>
+      <w:rPr>
+        <w:rFonts w:ascii="Wingdings" w:hAnsi="Wingdings" w:hint="default"/>
+        <w:sz w:val="20"/>
+      </w:rPr>
+    </w:lvl>
+    <w:lvl w:ilvl="6" w:tentative="1">
+      <w:start w:val="1"/>
+      <w:numFmt w:val="bullet"/>
+      <w:lvlText w:val=""/>
+      <w:lvlJc w:val="left"/>
+      <w:pPr>
+        <w:tabs>
+          <w:tab w:val="num" w:pos="5040"/>
+        </w:tabs>
+        <w:ind w:left="5040" w:hanging="360"/>
+      </w:pPr>
+      <w:rPr>
+        <w:rFonts w:ascii="Wingdings" w:hAnsi="Wingdings" w:hint="default"/>
+        <w:sz w:val="20"/>
+      </w:rPr>
+    </w:lvl>
+    <w:lvl w:ilvl="7" w:tentative="1">
+      <w:start w:val="1"/>
+      <w:numFmt w:val="bullet"/>
+      <w:lvlText w:val=""/>
+      <w:lvlJc w:val="left"/>
+      <w:pPr>
+        <w:tabs>
+          <w:tab w:val="num" w:pos="5760"/>
+        </w:tabs>
+        <w:ind w:left="5760" w:hanging="360"/>
+      </w:pPr>
+      <w:rPr>
+        <w:rFonts w:ascii="Wingdings" w:hAnsi="Wingdings" w:hint="default"/>
+        <w:sz w:val="20"/>
+      </w:rPr>
+    </w:lvl>
+    <w:lvl w:ilvl="8" w:tentative="1">
+      <w:start w:val="1"/>
+      <w:numFmt w:val="bullet"/>
+      <w:lvlText w:val=""/>
+      <w:lvlJc w:val="left"/>
+      <w:pPr>
+        <w:tabs>
+          <w:tab w:val="num" w:pos="6480"/>
+        </w:tabs>
+        <w:ind w:left="6480" w:hanging="360"/>
+      </w:pPr>
+      <w:rPr>
+        <w:rFonts w:ascii="Wingdings" w:hAnsi="Wingdings" w:hint="default"/>
+        <w:sz w:val="20"/>
+      </w:rPr>
+    </w:lvl>
+  </w:abstractNum>
   <w:num w:numId="1" w16cid:durableId="517813677">
-    <w:abstractNumId w:val="19"/>
+    <w:abstractNumId w:val="20"/>
   </w:num>
   <w:num w:numId="2" w16cid:durableId="857735407">
-    <w:abstractNumId w:val="21"/>
+    <w:abstractNumId w:val="23"/>
   </w:num>
   <w:num w:numId="3" w16cid:durableId="134505">
     <w:abstractNumId w:val="8"/>
   </w:num>
   <w:num w:numId="4" w16cid:durableId="1666083322">
-    <w:abstractNumId w:val="23"/>
+    <w:abstractNumId w:val="26"/>
   </w:num>
   <w:num w:numId="5" w16cid:durableId="864251512">
     <w:abstractNumId w:val="7"/>
@@ -35342,7 +38730,7 @@
     <w:abstractNumId w:val="4"/>
   </w:num>
   <w:num w:numId="7" w16cid:durableId="1772166354">
-    <w:abstractNumId w:val="17"/>
+    <w:abstractNumId w:val="18"/>
   </w:num>
   <w:num w:numId="8" w16cid:durableId="71900298">
     <w:abstractNumId w:val="0"/>
@@ -35372,13 +38760,13 @@
     <w:abstractNumId w:val="9"/>
   </w:num>
   <w:num w:numId="17" w16cid:durableId="1931544041">
-    <w:abstractNumId w:val="20"/>
+    <w:abstractNumId w:val="21"/>
   </w:num>
   <w:num w:numId="18" w16cid:durableId="1840581647">
-    <w:abstractNumId w:val="16"/>
+    <w:abstractNumId w:val="17"/>
   </w:num>
   <w:num w:numId="19" w16cid:durableId="624821090">
-    <w:abstractNumId w:val="22"/>
+    <w:abstractNumId w:val="25"/>
   </w:num>
   <w:num w:numId="20" w16cid:durableId="574389871">
     <w:abstractNumId w:val="13"/>
@@ -35387,16 +38775,31 @@
     <w:abstractNumId w:val="6"/>
   </w:num>
   <w:num w:numId="22" w16cid:durableId="2139372750">
-    <w:abstractNumId w:val="18"/>
+    <w:abstractNumId w:val="19"/>
   </w:num>
   <w:num w:numId="23" w16cid:durableId="1044020341">
-    <w:abstractNumId w:val="24"/>
+    <w:abstractNumId w:val="27"/>
   </w:num>
   <w:num w:numId="24" w16cid:durableId="1102727456">
     <w:abstractNumId w:val="5"/>
   </w:num>
   <w:num w:numId="25" w16cid:durableId="612443238">
     <w:abstractNumId w:val="3"/>
+  </w:num>
+  <w:num w:numId="26" w16cid:durableId="284776987">
+    <w:abstractNumId w:val="24"/>
+  </w:num>
+  <w:num w:numId="27" w16cid:durableId="489835617">
+    <w:abstractNumId w:val="29"/>
+  </w:num>
+  <w:num w:numId="28" w16cid:durableId="1979262180">
+    <w:abstractNumId w:val="16"/>
+  </w:num>
+  <w:num w:numId="29" w16cid:durableId="1894072537">
+    <w:abstractNumId w:val="22"/>
+  </w:num>
+  <w:num w:numId="30" w16cid:durableId="161285052">
+    <w:abstractNumId w:val="28"/>
   </w:num>
 </w:numbering>
 </file>

</xml_diff>